<commit_message>
changes I made (broke the system)
</commit_message>
<xml_diff>
--- a/Notes/Worklog.docx
+++ b/Notes/Worklog.docx
@@ -82,10 +82,31 @@
         </w:numPr>
       </w:pPr>
       <w:r>
-        <w:t xml:space="preserve">Some history to this project is that I started it when guiding an undergraduate student through preliminary energy landscape analysis. During this time, we realized that the “perfectly time sychnonised” boards were, in fact, not time synchronised. </w:t>
-      </w:r>
-      <w:r>
-        <w:t xml:space="preserve">ChrisC and I spent several weeks trying to align the board with the associated behavioural videos. That work is detailed in this googledoc: </w:t>
+        <w:t xml:space="preserve">Some history to this project is that I started it when guiding an undergraduate student through preliminary energy landscape analysis. During this time, we realized that the “perfectly time </w:t>
+      </w:r>
+      <w:proofErr w:type="spellStart"/>
+      <w:r>
+        <w:t>sychnonised</w:t>
+      </w:r>
+      <w:proofErr w:type="spellEnd"/>
+      <w:r>
+        <w:t xml:space="preserve">” boards were, in fact, not time synchronised. </w:t>
+      </w:r>
+      <w:proofErr w:type="spellStart"/>
+      <w:r>
+        <w:t>ChrisC</w:t>
+      </w:r>
+      <w:proofErr w:type="spellEnd"/>
+      <w:r>
+        <w:t xml:space="preserve"> and I spent several weeks trying to align the board with the associated behavioural videos. That work is detailed in this </w:t>
+      </w:r>
+      <w:proofErr w:type="spellStart"/>
+      <w:r>
+        <w:t>googledoc</w:t>
+      </w:r>
+      <w:proofErr w:type="spellEnd"/>
+      <w:r>
+        <w:t xml:space="preserve">: </w:t>
       </w:r>
       <w:hyperlink r:id="rId5" w:history="1">
         <w:r>
@@ -220,7 +241,15 @@
       </w:pPr>
       <w:r>
         <w:lastRenderedPageBreak/>
-        <w:t xml:space="preserve">What this tells me is that my next most valuable endeavour is to figure out the alignment from Robin’s camera. Going to have a crack at that this arvo. </w:t>
+        <w:t xml:space="preserve">What this tells me is that my next most valuable endeavour is to figure out the alignment from Robin’s camera. Going to have a crack at that this </w:t>
+      </w:r>
+      <w:proofErr w:type="spellStart"/>
+      <w:r>
+        <w:t>arvo</w:t>
+      </w:r>
+      <w:proofErr w:type="spellEnd"/>
+      <w:r>
+        <w:t xml:space="preserve">. </w:t>
       </w:r>
       <w:r>
         <w:rPr>
@@ -241,6 +270,241 @@
         </mc:AlternateContent>
       </w:r>
     </w:p>
+    <w:p>
+      <w:pPr>
+        <w:pStyle w:val="ListParagraph"/>
+        <w:numPr>
+          <w:ilvl w:val="1"/>
+          <w:numId w:val="1"/>
+        </w:numPr>
+      </w:pPr>
+      <w:r>
+        <w:t>Note that a lot of the code I wrote for the kangaroo data was for accounting the errors in the boards. As far as I can see, these same errors don’t occur in the impala data. However, I left the debug in for the impalas just in case.</w:t>
+      </w:r>
+    </w:p>
+    <w:p>
+      <w:pPr>
+        <w:pStyle w:val="Heading3"/>
+        <w:rPr>
+          <w:rFonts w:cs="Arial"/>
+        </w:rPr>
+      </w:pPr>
+      <w:r>
+        <w:rPr>
+          <w:rFonts w:cs="Arial"/>
+        </w:rPr>
+        <w:t>1</w:t>
+      </w:r>
+      <w:r>
+        <w:rPr>
+          <w:rFonts w:cs="Arial"/>
+        </w:rPr>
+        <w:t>9</w:t>
+      </w:r>
+      <w:r>
+        <w:rPr>
+          <w:rFonts w:cs="Arial"/>
+        </w:rPr>
+        <w:t>/03</w:t>
+      </w:r>
+    </w:p>
+    <w:p>
+      <w:pPr>
+        <w:pStyle w:val="ListParagraph"/>
+        <w:numPr>
+          <w:ilvl w:val="0"/>
+          <w:numId w:val="1"/>
+        </w:numPr>
+      </w:pPr>
+      <w:r>
+        <w:t>I hate myself. Why did I change so many things all at once???</w:t>
+      </w:r>
+    </w:p>
+    <w:p>
+      <w:pPr>
+        <w:pStyle w:val="ListParagraph"/>
+        <w:numPr>
+          <w:ilvl w:val="1"/>
+          <w:numId w:val="1"/>
+        </w:numPr>
+      </w:pPr>
+      <w:r>
+        <w:t>Below is collar 8 video 2 as annotated by Amelia with the old system (looked correct to the video). Now I have to be able to replicate that with my new system.</w:t>
+      </w:r>
+    </w:p>
+    <w:p>
+      <w:r>
+        <w:rPr>
+          <w:noProof/>
+        </w:rPr>
+        <w:drawing>
+          <wp:inline distT="0" distB="0" distL="0" distR="0" wp14:anchorId="454B9EB2" wp14:editId="07CAB30A">
+            <wp:extent cx="6119702" cy="1510820"/>
+            <wp:effectExtent l="0" t="0" r="0" b="0"/>
+            <wp:docPr id="215719713" name="Picture 2"/>
+            <wp:cNvGraphicFramePr>
+              <a:graphicFrameLocks xmlns:a="http://schemas.openxmlformats.org/drawingml/2006/main" noChangeAspect="1"/>
+            </wp:cNvGraphicFramePr>
+            <a:graphic xmlns:a="http://schemas.openxmlformats.org/drawingml/2006/main">
+              <a:graphicData uri="http://schemas.openxmlformats.org/drawingml/2006/picture">
+                <pic:pic xmlns:pic="http://schemas.openxmlformats.org/drawingml/2006/picture">
+                  <pic:nvPicPr>
+                    <pic:cNvPr id="0" name="Picture 2"/>
+                    <pic:cNvPicPr>
+                      <a:picLocks noChangeAspect="1" noChangeArrowheads="1"/>
+                    </pic:cNvPicPr>
+                  </pic:nvPicPr>
+                  <pic:blipFill>
+                    <a:blip r:embed="rId6">
+                      <a:extLst>
+                        <a:ext uri="{28A0092B-C50C-407E-A947-70E740481C1C}">
+                          <a14:useLocalDpi xmlns:a14="http://schemas.microsoft.com/office/drawing/2010/main" val="0"/>
+                        </a:ext>
+                      </a:extLst>
+                    </a:blip>
+                    <a:srcRect/>
+                    <a:stretch>
+                      <a:fillRect/>
+                    </a:stretch>
+                  </pic:blipFill>
+                  <pic:spPr bwMode="auto">
+                    <a:xfrm>
+                      <a:off x="0" y="0"/>
+                      <a:ext cx="6142064" cy="1516341"/>
+                    </a:xfrm>
+                    <a:prstGeom prst="rect">
+                      <a:avLst/>
+                    </a:prstGeom>
+                    <a:noFill/>
+                  </pic:spPr>
+                </pic:pic>
+              </a:graphicData>
+            </a:graphic>
+          </wp:inline>
+        </w:drawing>
+      </w:r>
+    </w:p>
+    <w:p>
+      <w:pPr>
+        <w:pStyle w:val="ListParagraph"/>
+        <w:numPr>
+          <w:ilvl w:val="1"/>
+          <w:numId w:val="1"/>
+        </w:numPr>
+      </w:pPr>
+      <w:r>
+        <w:t>Which I was unable to do</w:t>
+      </w:r>
+      <w:r>
+        <w:t>…</w:t>
+      </w:r>
+      <w:r>
+        <w:t xml:space="preserve"> Which means that, somewhere my new system is breaking. </w:t>
+      </w:r>
+      <w:r>
+        <w:t>Which is actually a good sign… because the error is in my new code, not in the data (flow on implications for why the kangaroo stuff isn’t working).</w:t>
+      </w:r>
+    </w:p>
+    <w:p>
+      <w:pPr>
+        <w:pStyle w:val="ListParagraph"/>
+        <w:numPr>
+          <w:ilvl w:val="0"/>
+          <w:numId w:val="1"/>
+        </w:numPr>
+      </w:pPr>
+      <w:r>
+        <w:t>I need to debug this systematically, working backwards.</w:t>
+      </w:r>
+    </w:p>
+    <w:p>
+      <w:pPr>
+        <w:pStyle w:val="ListParagraph"/>
+        <w:numPr>
+          <w:ilvl w:val="1"/>
+          <w:numId w:val="1"/>
+        </w:numPr>
+      </w:pPr>
+      <w:r>
+        <w:t xml:space="preserve">I reverted all my changes to the plotting method and got the same result. Therefore, either the video times are incorrect or the </w:t>
+      </w:r>
+      <w:proofErr w:type="spellStart"/>
+      <w:r>
+        <w:t>gps</w:t>
+      </w:r>
+      <w:proofErr w:type="spellEnd"/>
+      <w:r>
+        <w:t xml:space="preserve"> times are incorrect.</w:t>
+      </w:r>
+    </w:p>
+    <w:p>
+      <w:pPr>
+        <w:pStyle w:val="ListParagraph"/>
+        <w:numPr>
+          <w:ilvl w:val="1"/>
+          <w:numId w:val="1"/>
+        </w:numPr>
+      </w:pPr>
+      <w:r>
+        <w:t xml:space="preserve">I rechecked the video times and no joy. Therefore, I think the </w:t>
+      </w:r>
+      <w:proofErr w:type="spellStart"/>
+      <w:r>
+        <w:t>gps</w:t>
+      </w:r>
+      <w:proofErr w:type="spellEnd"/>
+      <w:r>
+        <w:t xml:space="preserve"> times are wrong. Going to revert all the work I did yesterday back to the original versions.</w:t>
+      </w:r>
+      <w:r>
+        <w:t xml:space="preserve"> </w:t>
+      </w:r>
+    </w:p>
+    <w:p>
+      <w:pPr>
+        <w:pStyle w:val="ListParagraph"/>
+        <w:numPr>
+          <w:ilvl w:val="2"/>
+          <w:numId w:val="1"/>
+        </w:numPr>
+      </w:pPr>
+      <w:r>
+        <w:sym w:font="Wingdings" w:char="F0E0"/>
+      </w:r>
+      <w:r>
+        <w:t xml:space="preserve"> Note that the kangaroo data had a lot of error not encountered in the impala data (e.g., multiple board resets, skipped reads, incorrect GPS writes, etc). The fact that using the “cleaning code” I wrote for the </w:t>
+      </w:r>
+      <w:proofErr w:type="spellStart"/>
+      <w:r>
+        <w:t>kangies</w:t>
+      </w:r>
+      <w:proofErr w:type="spellEnd"/>
+      <w:r>
+        <w:t xml:space="preserve"> on the impala caused the impala to break indicates that there is something wrong with the cleaning code…</w:t>
+      </w:r>
+    </w:p>
+    <w:p>
+      <w:pPr>
+        <w:pStyle w:val="ListParagraph"/>
+        <w:numPr>
+          <w:ilvl w:val="0"/>
+          <w:numId w:val="1"/>
+        </w:numPr>
+      </w:pPr>
+      <w:r>
+        <w:t>Okay, I’m actually going to revert everything. Back to the very beginning.</w:t>
+      </w:r>
+    </w:p>
+    <w:p>
+      <w:pPr>
+        <w:pStyle w:val="ListParagraph"/>
+        <w:numPr>
+          <w:ilvl w:val="0"/>
+          <w:numId w:val="1"/>
+        </w:numPr>
+      </w:pPr>
+    </w:p>
+    <w:p/>
     <w:sectPr>
       <w:pgSz w:w="12240" w:h="15840"/>
       <w:pgMar w:top="1440" w:right="1440" w:bottom="1440" w:left="1440" w:header="720" w:footer="720" w:gutter="0"/>
@@ -280,7 +544,7 @@
         <w:rFonts w:ascii="Courier New" w:hAnsi="Courier New" w:cs="Courier New" w:hint="default"/>
       </w:rPr>
     </w:lvl>
-    <w:lvl w:ilvl="2" w:tplc="04090005" w:tentative="1">
+    <w:lvl w:ilvl="2" w:tplc="04090005">
       <w:start w:val="1"/>
       <w:numFmt w:val="bullet"/>
       <w:lvlText w:val=""/>

</xml_diff>

<commit_message>
got it working, final notes
</commit_message>
<xml_diff>
--- a/Notes/Worklog.docx
+++ b/Notes/Worklog.docx
@@ -58,10 +58,31 @@
         </w:numPr>
       </w:pPr>
       <w:r>
-        <w:t xml:space="preserve">Some history to this project is that I started it when guiding an undergraduate student through preliminary energy landscape analysis. During this time, we realized that the “perfectly time sychnonised” boards were, in fact, not time synchronised. </w:t>
-      </w:r>
-      <w:r>
-        <w:t xml:space="preserve">ChrisC and I spent several weeks trying to align the board with the associated behavioural videos. That work is detailed in this googledoc: </w:t>
+        <w:t xml:space="preserve">Some history to this project is that I started it when guiding an undergraduate student through preliminary energy landscape analysis. During this time, we realized that the “perfectly time </w:t>
+      </w:r>
+      <w:proofErr w:type="spellStart"/>
+      <w:r>
+        <w:t>sychnonised</w:t>
+      </w:r>
+      <w:proofErr w:type="spellEnd"/>
+      <w:r>
+        <w:t xml:space="preserve">” boards were, in fact, not time synchronised. </w:t>
+      </w:r>
+      <w:proofErr w:type="spellStart"/>
+      <w:r>
+        <w:t>ChrisC</w:t>
+      </w:r>
+      <w:proofErr w:type="spellEnd"/>
+      <w:r>
+        <w:t xml:space="preserve"> and I spent several weeks trying to align the board with the associated behavioural videos. That work is detailed in this </w:t>
+      </w:r>
+      <w:proofErr w:type="spellStart"/>
+      <w:r>
+        <w:t>googledoc</w:t>
+      </w:r>
+      <w:proofErr w:type="spellEnd"/>
+      <w:r>
+        <w:t xml:space="preserve">: </w:t>
       </w:r>
       <w:hyperlink r:id="rId5" w:history="1">
         <w:r>
@@ -196,7 +217,15 @@
       </w:pPr>
       <w:r>
         <w:lastRenderedPageBreak/>
-        <w:t xml:space="preserve">What this tells me is that my next most valuable endeavour is to figure out the alignment from Robin’s camera. Going to have a crack at that this arvo. </w:t>
+        <w:t xml:space="preserve">What this tells me is that my next most valuable endeavour is to figure out the alignment from Robin’s camera. Going to have a crack at that this </w:t>
+      </w:r>
+      <w:proofErr w:type="spellStart"/>
+      <w:r>
+        <w:t>arvo</w:t>
+      </w:r>
+      <w:proofErr w:type="spellEnd"/>
+      <w:r>
+        <w:t xml:space="preserve">. </w:t>
       </w:r>
       <w:r>
         <w:rPr>
@@ -276,7 +305,15 @@
         </w:numPr>
       </w:pPr>
       <w:r>
-        <w:t>Below is collar 8 video 2 as annotated by Amelia with the old system (looked correct to the video). Now I have to be able to replicate that with my new system.</w:t>
+        <w:t xml:space="preserve">Below is collar 8 video 2 as annotated by Amelia with the old system (looked correct to the video). Now I </w:t>
+      </w:r>
+      <w:proofErr w:type="gramStart"/>
+      <w:r>
+        <w:t>have to</w:t>
+      </w:r>
+      <w:proofErr w:type="gramEnd"/>
+      <w:r>
+        <w:t xml:space="preserve"> be able to replicate that with my new system.</w:t>
       </w:r>
     </w:p>
     <w:p>
@@ -349,7 +386,15 @@
         <w:t xml:space="preserve"> Which means that, somewhere my new system is breaking. </w:t>
       </w:r>
       <w:r>
-        <w:t>Which is actually a good sign… because the error is in my new code, not in the data (flow on implications for why the kangaroo stuff isn’t working).</w:t>
+        <w:t xml:space="preserve">Which is </w:t>
+      </w:r>
+      <w:proofErr w:type="gramStart"/>
+      <w:r>
+        <w:t>actually a</w:t>
+      </w:r>
+      <w:proofErr w:type="gramEnd"/>
+      <w:r>
+        <w:t xml:space="preserve"> good sign… because the error is in my new code, not in the data (flow on implications for why the kangaroo stuff isn’t working).</w:t>
       </w:r>
     </w:p>
     <w:p>
@@ -373,7 +418,15 @@
         </w:numPr>
       </w:pPr>
       <w:r>
-        <w:t>I reverted all my changes to the plotting method and got the same result. Therefore, either the video times are incorrect or the gps times are incorrect.</w:t>
+        <w:t xml:space="preserve">I reverted all my changes to the plotting method and got the same result. Therefore, either the video times are incorrect or the </w:t>
+      </w:r>
+      <w:proofErr w:type="spellStart"/>
+      <w:r>
+        <w:t>gps</w:t>
+      </w:r>
+      <w:proofErr w:type="spellEnd"/>
+      <w:r>
+        <w:t xml:space="preserve"> times are incorrect.</w:t>
       </w:r>
     </w:p>
     <w:p>
@@ -385,7 +438,15 @@
         </w:numPr>
       </w:pPr>
       <w:r>
-        <w:t>I rechecked the video times and no joy. Therefore, I think the gps times are wrong. Going to revert all the work I did yesterday back to the original versions.</w:t>
+        <w:t xml:space="preserve">I rechecked the video times and no joy. Therefore, I think the </w:t>
+      </w:r>
+      <w:proofErr w:type="spellStart"/>
+      <w:r>
+        <w:t>gps</w:t>
+      </w:r>
+      <w:proofErr w:type="spellEnd"/>
+      <w:r>
+        <w:t xml:space="preserve"> times are wrong. Going to revert all the work I did yesterday back to the original versions.</w:t>
       </w:r>
       <w:r>
         <w:t xml:space="preserve"> </w:t>
@@ -403,7 +464,15 @@
         <w:sym w:font="Wingdings" w:char="F0E0"/>
       </w:r>
       <w:r>
-        <w:t xml:space="preserve"> Note that the kangaroo data had a lot of error not encountered in the impala data (e.g., multiple board resets, skipped reads, incorrect GPS writes, etc). The fact that using the “cleaning code” I wrote for the kangies on the impala caused the impala to break indicates that there is something wrong with the cleaning code…</w:t>
+        <w:t xml:space="preserve"> Note that the kangaroo data had a lot of error not encountered in the impala data (e.g., multiple board resets, skipped reads, incorrect GPS writes, etc). The fact that using the “cleaning code” I wrote for the </w:t>
+      </w:r>
+      <w:proofErr w:type="spellStart"/>
+      <w:r>
+        <w:t>kangies</w:t>
+      </w:r>
+      <w:proofErr w:type="spellEnd"/>
+      <w:r>
+        <w:t xml:space="preserve"> on the impala caused the impala to break indicates that there is something wrong with the cleaning code…</w:t>
       </w:r>
     </w:p>
     <w:p>
@@ -415,7 +484,15 @@
         </w:numPr>
       </w:pPr>
       <w:r>
-        <w:t>Okay, I’m actually going to revert everything. Back to the very beginning</w:t>
+        <w:t xml:space="preserve">Okay, I’m </w:t>
+      </w:r>
+      <w:proofErr w:type="gramStart"/>
+      <w:r>
+        <w:t>actually going</w:t>
+      </w:r>
+      <w:proofErr w:type="gramEnd"/>
+      <w:r>
+        <w:t xml:space="preserve"> to revert everything. Back to the very beginning</w:t>
       </w:r>
       <w:r>
         <w:t xml:space="preserve"> and check differences along every step of the way</w:t>
@@ -458,8 +535,13 @@
         </w:numPr>
       </w:pPr>
       <w:r>
-        <w:t>Accel stitch: Exactly the same</w:t>
-      </w:r>
+        <w:t xml:space="preserve">Accel stitch: </w:t>
+      </w:r>
+      <w:proofErr w:type="gramStart"/>
+      <w:r>
+        <w:t>Exactly the same</w:t>
+      </w:r>
+      <w:proofErr w:type="gramEnd"/>
     </w:p>
     <w:p>
       <w:pPr>
@@ -470,7 +552,15 @@
         </w:numPr>
       </w:pPr>
       <w:r>
-        <w:t>Old method doesn’t account for the internal clock restarting on the accelerometer but when I more closely investigated, it does restart. There are duplicated values in the timestamps.</w:t>
+        <w:t xml:space="preserve">Old method doesn’t account for the internal clock restarting on the </w:t>
+      </w:r>
+      <w:proofErr w:type="gramStart"/>
+      <w:r>
+        <w:t>accelerometer</w:t>
+      </w:r>
+      <w:proofErr w:type="gramEnd"/>
+      <w:r>
+        <w:t xml:space="preserve"> but when I more closely investigated, it does restart. There are duplicated values in the timestamps.</w:t>
       </w:r>
       <w:r>
         <w:t xml:space="preserve"> </w:t>
@@ -549,8 +639,13 @@
         </w:numPr>
       </w:pPr>
       <w:r>
-        <w:t>Reordered the dataset by the reset events and then removed the misreads where there was an uneven increment between the internal and external times on the gps_board</w:t>
-      </w:r>
+        <w:t xml:space="preserve">Reordered the dataset by the reset events and then removed the misreads where there was an uneven increment between the internal and external times on the </w:t>
+      </w:r>
+      <w:proofErr w:type="spellStart"/>
+      <w:r>
+        <w:t>gps_board</w:t>
+      </w:r>
+      <w:proofErr w:type="spellEnd"/>
     </w:p>
     <w:p>
       <w:pPr>
@@ -605,7 +700,15 @@
         </w:numPr>
       </w:pPr>
       <w:r>
-        <w:t xml:space="preserve">Below confirmed that the gps timestamps stay the same after writing and reading but also </w:t>
+        <w:t xml:space="preserve">Below confirmed that the </w:t>
+      </w:r>
+      <w:proofErr w:type="spellStart"/>
+      <w:r>
+        <w:t>gps</w:t>
+      </w:r>
+      <w:proofErr w:type="spellEnd"/>
+      <w:r>
+        <w:t xml:space="preserve"> timestamps stay the same after writing and reading but also </w:t>
       </w:r>
       <w:r>
         <w:t>convert</w:t>
@@ -768,7 +871,23 @@
         </w:numPr>
       </w:pPr>
       <w:r>
-        <w:t>But somehow they are then getting back mixed together after I combine the accel and gps?</w:t>
+        <w:t xml:space="preserve">But </w:t>
+      </w:r>
+      <w:proofErr w:type="gramStart"/>
+      <w:r>
+        <w:t>somehow</w:t>
+      </w:r>
+      <w:proofErr w:type="gramEnd"/>
+      <w:r>
+        <w:t xml:space="preserve"> they are then getting back mixed together after I combine the accel and </w:t>
+      </w:r>
+      <w:proofErr w:type="spellStart"/>
+      <w:r>
+        <w:t>gps</w:t>
+      </w:r>
+      <w:proofErr w:type="spellEnd"/>
+      <w:r>
+        <w:t>?</w:t>
       </w:r>
     </w:p>
     <w:p>
@@ -909,61 +1028,6 @@
     <w:p>
       <w:pPr>
         <w:pStyle w:val="ListParagraph"/>
-      </w:pPr>
-      <w:r>
-        <w:rPr>
-          <w:noProof/>
-        </w:rPr>
-        <w:drawing>
-          <wp:inline distT="0" distB="0" distL="0" distR="0" wp14:anchorId="6BE9DAAF" wp14:editId="7FC45AD9">
-            <wp:extent cx="3451225" cy="1296658"/>
-            <wp:effectExtent l="0" t="0" r="0" b="0"/>
-            <wp:docPr id="1505177365" name="Picture 8"/>
-            <wp:cNvGraphicFramePr>
-              <a:graphicFrameLocks xmlns:a="http://schemas.openxmlformats.org/drawingml/2006/main" noChangeAspect="1"/>
-            </wp:cNvGraphicFramePr>
-            <a:graphic xmlns:a="http://schemas.openxmlformats.org/drawingml/2006/main">
-              <a:graphicData uri="http://schemas.openxmlformats.org/drawingml/2006/picture">
-                <pic:pic xmlns:pic="http://schemas.openxmlformats.org/drawingml/2006/picture">
-                  <pic:nvPicPr>
-                    <pic:cNvPr id="0" name="Picture 5"/>
-                    <pic:cNvPicPr>
-                      <a:picLocks noChangeAspect="1" noChangeArrowheads="1"/>
-                    </pic:cNvPicPr>
-                  </pic:nvPicPr>
-                  <pic:blipFill>
-                    <a:blip r:embed="rId12" cstate="print">
-                      <a:extLst>
-                        <a:ext uri="{28A0092B-C50C-407E-A947-70E740481C1C}">
-                          <a14:useLocalDpi xmlns:a14="http://schemas.microsoft.com/office/drawing/2010/main" val="0"/>
-                        </a:ext>
-                      </a:extLst>
-                    </a:blip>
-                    <a:srcRect/>
-                    <a:stretch>
-                      <a:fillRect/>
-                    </a:stretch>
-                  </pic:blipFill>
-                  <pic:spPr bwMode="auto">
-                    <a:xfrm>
-                      <a:off x="0" y="0"/>
-                      <a:ext cx="3474762" cy="1305501"/>
-                    </a:xfrm>
-                    <a:prstGeom prst="rect">
-                      <a:avLst/>
-                    </a:prstGeom>
-                    <a:noFill/>
-                  </pic:spPr>
-                </pic:pic>
-              </a:graphicData>
-            </a:graphic>
-          </wp:inline>
-        </w:drawing>
-      </w:r>
-    </w:p>
-    <w:p>
-      <w:pPr>
-        <w:pStyle w:val="ListParagraph"/>
         <w:numPr>
           <w:ilvl w:val="0"/>
           <w:numId w:val="1"/>
@@ -994,7 +1058,7 @@
                     <pic:cNvPicPr/>
                   </pic:nvPicPr>
                   <pic:blipFill>
-                    <a:blip r:embed="rId13"/>
+                    <a:blip r:embed="rId12"/>
                     <a:stretch>
                       <a:fillRect/>
                     </a:stretch>
@@ -1015,7 +1079,21 @@
         </w:drawing>
       </w:r>
     </w:p>
-    <w:p/>
+    <w:p>
+      <w:pPr>
+        <w:pStyle w:val="ListParagraph"/>
+        <w:numPr>
+          <w:ilvl w:val="0"/>
+          <w:numId w:val="1"/>
+        </w:numPr>
+      </w:pPr>
+      <w:r>
+        <w:t>Now going to trial it on the kangaroo data and see whether this new code works</w:t>
+      </w:r>
+      <w:r>
+        <w:t xml:space="preserve"> on that dataset too. </w:t>
+      </w:r>
+    </w:p>
     <w:sectPr>
       <w:pgSz w:w="12240" w:h="15840"/>
       <w:pgMar w:top="1440" w:right="1440" w:bottom="1440" w:left="1440" w:header="720" w:footer="720" w:gutter="0"/>

</xml_diff>

<commit_message>
creating the training data and exploring it
</commit_message>
<xml_diff>
--- a/Notes/Worklog.docx
+++ b/Notes/Worklog.docx
@@ -21,6 +21,9 @@
       <w:r>
         <w:t>The impala data was collected by Chris Clemente, Jasmin Annett, Robin Maag, Chris Bird, and Taylor Dick across 3 field deployments in South Africa: 2024, April 2025, and July 2025.  The idea behind the project was to put our custom-designed collars (including an Artemis board which logged GPS and accelerometer data, as well as a stand-alone Axivity) on impalas, record their behaviours with a drone, and then reconstruct their exact behaviours and paths from the acceleration data. The following document now outlines the analysis of this data by me (Oakleigh Wilson).</w:t>
       </w:r>
+      <w:r>
+        <w:t xml:space="preserve"> Annotations done by Amelia Nelson and data crunching assistance by Ethan Norris.</w:t>
+      </w:r>
     </w:p>
     <w:p>
       <w:pPr>
@@ -54,35 +57,12 @@
         <w:pStyle w:val="ListParagraph"/>
         <w:numPr>
           <w:ilvl w:val="0"/>
-          <w:numId w:val="1"/>
-        </w:numPr>
-      </w:pPr>
-      <w:r>
-        <w:t xml:space="preserve">Some history to this project is that I started it when guiding an undergraduate student through preliminary energy landscape analysis. During this time, we realized that the “perfectly time </w:t>
-      </w:r>
-      <w:proofErr w:type="spellStart"/>
-      <w:r>
-        <w:t>sychnonised</w:t>
-      </w:r>
-      <w:proofErr w:type="spellEnd"/>
-      <w:r>
-        <w:t xml:space="preserve">” boards were, in fact, not time synchronised. </w:t>
-      </w:r>
-      <w:proofErr w:type="spellStart"/>
-      <w:r>
-        <w:t>ChrisC</w:t>
-      </w:r>
-      <w:proofErr w:type="spellEnd"/>
-      <w:r>
-        <w:t xml:space="preserve"> and I spent several weeks trying to align the board with the associated behavioural videos. That work is detailed in this </w:t>
-      </w:r>
-      <w:proofErr w:type="spellStart"/>
-      <w:r>
-        <w:t>googledoc</w:t>
-      </w:r>
-      <w:proofErr w:type="spellEnd"/>
-      <w:r>
-        <w:t xml:space="preserve">: </w:t>
+          <w:numId w:val="2"/>
+        </w:numPr>
+        <w:spacing w:line="276" w:lineRule="auto"/>
+      </w:pPr>
+      <w:r>
+        <w:t xml:space="preserve">Some history to this project is that I started it when guiding an undergraduate student through preliminary energy landscape analysis. During this time, we realized that the “perfectly time sychnonised” boards were, in fact, not time synchronised. ChrisC and I spent several weeks trying to align the board with the associated behavioural videos. That work is detailed in this googledoc: </w:t>
       </w:r>
       <w:hyperlink r:id="rId5" w:history="1">
         <w:r>
@@ -101,8 +81,9 @@
         <w:pStyle w:val="ListParagraph"/>
         <w:numPr>
           <w:ilvl w:val="1"/>
-          <w:numId w:val="1"/>
-        </w:numPr>
+          <w:numId w:val="2"/>
+        </w:numPr>
+        <w:spacing w:line="276" w:lineRule="auto"/>
       </w:pPr>
       <w:r>
         <w:t>Extracting the data from the boards wasn’t straightforward. Once it’s done, it’s easy, but figuring it out for the first time took a lot of trial and error.</w:t>
@@ -113,17 +94,12 @@
         <w:pStyle w:val="ListParagraph"/>
         <w:numPr>
           <w:ilvl w:val="1"/>
-          <w:numId w:val="1"/>
-        </w:numPr>
-      </w:pPr>
-      <w:r>
-        <w:t>The time synchronisation video had been filmed with a camera never used for data collection (thus rendering it useless for time synchronisatio</w:t>
-      </w:r>
-      <w:r>
-        <w:t>n</w:t>
-      </w:r>
-      <w:r>
-        <w:t>)</w:t>
+          <w:numId w:val="2"/>
+        </w:numPr>
+        <w:spacing w:line="276" w:lineRule="auto"/>
+      </w:pPr>
+      <w:r>
+        <w:t>The time synchronisation video had been filmed with a camera never used for data collection (thus rendering it useless for time synchronisation)</w:t>
       </w:r>
     </w:p>
     <w:p>
@@ -131,14 +107,12 @@
         <w:pStyle w:val="ListParagraph"/>
         <w:numPr>
           <w:ilvl w:val="1"/>
-          <w:numId w:val="1"/>
-        </w:numPr>
-      </w:pPr>
-      <w:r>
-        <w:t xml:space="preserve"> </w:t>
-      </w:r>
-      <w:r>
-        <w:t xml:space="preserve">The cameras that were used for data collection all had different ways of encoding the times </w:t>
+          <w:numId w:val="2"/>
+        </w:numPr>
+        <w:spacing w:line="276" w:lineRule="auto"/>
+      </w:pPr>
+      <w:r>
+        <w:t xml:space="preserve"> The cameras that were used for data collection all had different ways of encoding the times </w:t>
       </w:r>
       <w:r>
         <w:sym w:font="Wingdings" w:char="F0E0"/>
@@ -152,8 +126,9 @@
         <w:pStyle w:val="ListParagraph"/>
         <w:numPr>
           <w:ilvl w:val="1"/>
-          <w:numId w:val="1"/>
-        </w:numPr>
+          <w:numId w:val="2"/>
+        </w:numPr>
+        <w:spacing w:line="276" w:lineRule="auto"/>
       </w:pPr>
       <w:r>
         <w:t xml:space="preserve">At the time, I was only able to achieve alignment for the drone videos as their timestamp was recorded in the filename. </w:t>
@@ -164,8 +139,9 @@
         <w:pStyle w:val="ListParagraph"/>
         <w:numPr>
           <w:ilvl w:val="1"/>
-          <w:numId w:val="1"/>
-        </w:numPr>
+          <w:numId w:val="2"/>
+        </w:numPr>
+        <w:spacing w:line="276" w:lineRule="auto"/>
       </w:pPr>
       <w:r>
         <w:t>Amelia Nelson (research assistant) painstakingly annotated every possible second of recorded drone footage. However, even after all her work, due to multiple device failures, this nevertheless resulted in only 2 individuals worth of data… which is insufficient for behavioural analysis.</w:t>
@@ -176,8 +152,9 @@
         <w:pStyle w:val="ListParagraph"/>
         <w:numPr>
           <w:ilvl w:val="1"/>
-          <w:numId w:val="1"/>
-        </w:numPr>
+          <w:numId w:val="2"/>
+        </w:numPr>
+        <w:spacing w:line="276" w:lineRule="auto"/>
       </w:pPr>
       <w:r>
         <w:t>Therefore, many months later, I’m back at it.</w:t>
@@ -188,23 +165,18 @@
         <w:pStyle w:val="ListParagraph"/>
         <w:numPr>
           <w:ilvl w:val="0"/>
-          <w:numId w:val="1"/>
-        </w:numPr>
-      </w:pPr>
-      <w:r>
-        <w:t>First step is for me to get my head around the data that we have.</w:t>
-      </w:r>
-      <w:r>
-        <w:t xml:space="preserve"> </w:t>
+          <w:numId w:val="2"/>
+        </w:numPr>
+        <w:spacing w:line="276" w:lineRule="auto"/>
+      </w:pPr>
+      <w:r>
+        <w:t xml:space="preserve">First step is for me to get my head around the data that we have. </w:t>
       </w:r>
       <w:r>
         <w:sym w:font="Wingdings" w:char="F0E0"/>
       </w:r>
       <w:r>
-        <w:t xml:space="preserve"> Have filled in the metadata sheet in the </w:t>
-      </w:r>
-      <w:r>
-        <w:t>excel sheet in the Notes folder.</w:t>
+        <w:t xml:space="preserve"> Have filled in the metadata sheet in the excel sheet in the Notes folder.</w:t>
       </w:r>
     </w:p>
     <w:p>
@@ -212,20 +184,13 @@
         <w:pStyle w:val="ListParagraph"/>
         <w:numPr>
           <w:ilvl w:val="0"/>
-          <w:numId w:val="1"/>
-        </w:numPr>
+          <w:numId w:val="2"/>
+        </w:numPr>
+        <w:spacing w:line="276" w:lineRule="auto"/>
       </w:pPr>
       <w:r>
         <w:lastRenderedPageBreak/>
-        <w:t xml:space="preserve">What this tells me is that my next most valuable endeavour is to figure out the alignment from Robin’s camera. Going to have a crack at that this </w:t>
-      </w:r>
-      <w:proofErr w:type="spellStart"/>
-      <w:r>
-        <w:t>arvo</w:t>
-      </w:r>
-      <w:proofErr w:type="spellEnd"/>
-      <w:r>
-        <w:t xml:space="preserve">. </w:t>
+        <w:t xml:space="preserve">What this tells me is that my next most valuable endeavour is to figure out the alignment from Robin’s camera. Going to have a crack at that this arvo. </w:t>
       </w:r>
       <w:r>
         <w:rPr>
@@ -251,8 +216,9 @@
         <w:pStyle w:val="ListParagraph"/>
         <w:numPr>
           <w:ilvl w:val="1"/>
-          <w:numId w:val="1"/>
-        </w:numPr>
+          <w:numId w:val="2"/>
+        </w:numPr>
+        <w:spacing w:line="276" w:lineRule="auto"/>
       </w:pPr>
       <w:r>
         <w:t>Note that a lot of the code I wrote for the kangaroo data was for accounting the errors in the boards. As far as I can see, these same errors don’t occur in the impala data. However, I left the debug in for the impalas just in case.</w:t>
@@ -269,19 +235,7 @@
         <w:rPr>
           <w:rFonts w:cs="Arial"/>
         </w:rPr>
-        <w:t>1</w:t>
-      </w:r>
-      <w:r>
-        <w:rPr>
-          <w:rFonts w:cs="Arial"/>
-        </w:rPr>
-        <w:t>9</w:t>
-      </w:r>
-      <w:r>
-        <w:rPr>
-          <w:rFonts w:cs="Arial"/>
-        </w:rPr>
-        <w:t>/03</w:t>
+        <w:t>19/03</w:t>
       </w:r>
     </w:p>
     <w:p>
@@ -289,8 +243,9 @@
         <w:pStyle w:val="ListParagraph"/>
         <w:numPr>
           <w:ilvl w:val="0"/>
-          <w:numId w:val="1"/>
-        </w:numPr>
+          <w:numId w:val="2"/>
+        </w:numPr>
+        <w:spacing w:line="276" w:lineRule="auto"/>
       </w:pPr>
       <w:r>
         <w:t>I hate myself. Why did I change so many things all at once???</w:t>
@@ -301,19 +256,12 @@
         <w:pStyle w:val="ListParagraph"/>
         <w:numPr>
           <w:ilvl w:val="1"/>
-          <w:numId w:val="1"/>
-        </w:numPr>
-      </w:pPr>
-      <w:r>
-        <w:t xml:space="preserve">Below is collar 8 video 2 as annotated by Amelia with the old system (looked correct to the video). Now I </w:t>
-      </w:r>
-      <w:proofErr w:type="gramStart"/>
-      <w:r>
-        <w:t>have to</w:t>
-      </w:r>
-      <w:proofErr w:type="gramEnd"/>
-      <w:r>
-        <w:t xml:space="preserve"> be able to replicate that with my new system.</w:t>
+          <w:numId w:val="2"/>
+        </w:numPr>
+        <w:spacing w:line="276" w:lineRule="auto"/>
+      </w:pPr>
+      <w:r>
+        <w:t>Below is collar 8 video 2 as annotated by Amelia with the old system (looked correct to the video). Now I have to be able to replicate that with my new system.</w:t>
       </w:r>
     </w:p>
     <w:p>
@@ -322,10 +270,10 @@
           <w:noProof/>
         </w:rPr>
         <w:drawing>
-          <wp:inline distT="0" distB="0" distL="0" distR="0" wp14:anchorId="454B9EB2" wp14:editId="07CAB30A">
-            <wp:extent cx="6119702" cy="1510820"/>
+          <wp:inline distT="0" distB="0" distL="0" distR="0" wp14:anchorId="28C88297" wp14:editId="61A3C607">
+            <wp:extent cx="5943600" cy="1471930"/>
             <wp:effectExtent l="0" t="0" r="0" b="0"/>
-            <wp:docPr id="215719713" name="Picture 2"/>
+            <wp:docPr id="297910656" name="Picture 35"/>
             <wp:cNvGraphicFramePr>
               <a:graphicFrameLocks xmlns:a="http://schemas.openxmlformats.org/drawingml/2006/main" noChangeAspect="1"/>
             </wp:cNvGraphicFramePr>
@@ -333,7 +281,7 @@
               <a:graphicData uri="http://schemas.openxmlformats.org/drawingml/2006/picture">
                 <pic:pic xmlns:pic="http://schemas.openxmlformats.org/drawingml/2006/picture">
                   <pic:nvPicPr>
-                    <pic:cNvPr id="0" name="Picture 2"/>
+                    <pic:cNvPr id="0" name="Picture 183"/>
                     <pic:cNvPicPr>
                       <a:picLocks noChangeAspect="1" noChangeArrowheads="1"/>
                     </pic:cNvPicPr>
@@ -354,12 +302,15 @@
                   <pic:spPr bwMode="auto">
                     <a:xfrm>
                       <a:off x="0" y="0"/>
-                      <a:ext cx="6142064" cy="1516341"/>
+                      <a:ext cx="5943600" cy="1471930"/>
                     </a:xfrm>
                     <a:prstGeom prst="rect">
                       <a:avLst/>
                     </a:prstGeom>
                     <a:noFill/>
+                    <a:ln>
+                      <a:noFill/>
+                    </a:ln>
                   </pic:spPr>
                 </pic:pic>
               </a:graphicData>
@@ -373,28 +324,12 @@
         <w:pStyle w:val="ListParagraph"/>
         <w:numPr>
           <w:ilvl w:val="1"/>
-          <w:numId w:val="1"/>
-        </w:numPr>
-      </w:pPr>
-      <w:r>
-        <w:t>Which I was unable to do</w:t>
-      </w:r>
-      <w:r>
-        <w:t>…</w:t>
-      </w:r>
-      <w:r>
-        <w:t xml:space="preserve"> Which means that, somewhere my new system is breaking. </w:t>
-      </w:r>
-      <w:r>
-        <w:t xml:space="preserve">Which is </w:t>
-      </w:r>
-      <w:proofErr w:type="gramStart"/>
-      <w:r>
-        <w:t>actually a</w:t>
-      </w:r>
-      <w:proofErr w:type="gramEnd"/>
-      <w:r>
-        <w:t xml:space="preserve"> good sign… because the error is in my new code, not in the data (flow on implications for why the kangaroo stuff isn’t working).</w:t>
+          <w:numId w:val="2"/>
+        </w:numPr>
+        <w:spacing w:line="276" w:lineRule="auto"/>
+      </w:pPr>
+      <w:r>
+        <w:t>Which I was unable to do… Which means that, somewhere my new system is breaking. Which is actually a good sign… because the error is in my new code, not in the data (flow on implications for why the kangaroo stuff isn’t working).</w:t>
       </w:r>
     </w:p>
     <w:p>
@@ -402,8 +337,9 @@
         <w:pStyle w:val="ListParagraph"/>
         <w:numPr>
           <w:ilvl w:val="0"/>
-          <w:numId w:val="1"/>
-        </w:numPr>
+          <w:numId w:val="2"/>
+        </w:numPr>
+        <w:spacing w:line="276" w:lineRule="auto"/>
       </w:pPr>
       <w:r>
         <w:t>I need to debug this systematically, working backwards.</w:t>
@@ -414,19 +350,12 @@
         <w:pStyle w:val="ListParagraph"/>
         <w:numPr>
           <w:ilvl w:val="1"/>
-          <w:numId w:val="1"/>
-        </w:numPr>
-      </w:pPr>
-      <w:r>
-        <w:t xml:space="preserve">I reverted all my changes to the plotting method and got the same result. Therefore, either the video times are incorrect or the </w:t>
-      </w:r>
-      <w:proofErr w:type="spellStart"/>
-      <w:r>
-        <w:t>gps</w:t>
-      </w:r>
-      <w:proofErr w:type="spellEnd"/>
-      <w:r>
-        <w:t xml:space="preserve"> times are incorrect.</w:t>
+          <w:numId w:val="2"/>
+        </w:numPr>
+        <w:spacing w:line="276" w:lineRule="auto"/>
+      </w:pPr>
+      <w:r>
+        <w:t>I reverted all my changes to the plotting method and got the same result. Therefore, either the video times are incorrect or the gps times are incorrect.</w:t>
       </w:r>
     </w:p>
     <w:p>
@@ -434,22 +363,12 @@
         <w:pStyle w:val="ListParagraph"/>
         <w:numPr>
           <w:ilvl w:val="1"/>
-          <w:numId w:val="1"/>
-        </w:numPr>
-      </w:pPr>
-      <w:r>
-        <w:t xml:space="preserve">I rechecked the video times and no joy. Therefore, I think the </w:t>
-      </w:r>
-      <w:proofErr w:type="spellStart"/>
-      <w:r>
-        <w:t>gps</w:t>
-      </w:r>
-      <w:proofErr w:type="spellEnd"/>
-      <w:r>
-        <w:t xml:space="preserve"> times are wrong. Going to revert all the work I did yesterday back to the original versions.</w:t>
-      </w:r>
-      <w:r>
-        <w:t xml:space="preserve"> </w:t>
+          <w:numId w:val="2"/>
+        </w:numPr>
+        <w:spacing w:line="276" w:lineRule="auto"/>
+      </w:pPr>
+      <w:r>
+        <w:t xml:space="preserve">I rechecked the video times and no joy. Therefore, I think the gps times are wrong. Going to revert all the work I did yesterday back to the original versions. </w:t>
       </w:r>
     </w:p>
     <w:p>
@@ -457,22 +376,15 @@
         <w:pStyle w:val="ListParagraph"/>
         <w:numPr>
           <w:ilvl w:val="2"/>
-          <w:numId w:val="1"/>
-        </w:numPr>
+          <w:numId w:val="2"/>
+        </w:numPr>
+        <w:spacing w:line="276" w:lineRule="auto"/>
       </w:pPr>
       <w:r>
         <w:sym w:font="Wingdings" w:char="F0E0"/>
       </w:r>
       <w:r>
-        <w:t xml:space="preserve"> Note that the kangaroo data had a lot of error not encountered in the impala data (e.g., multiple board resets, skipped reads, incorrect GPS writes, etc). The fact that using the “cleaning code” I wrote for the </w:t>
-      </w:r>
-      <w:proofErr w:type="spellStart"/>
-      <w:r>
-        <w:t>kangies</w:t>
-      </w:r>
-      <w:proofErr w:type="spellEnd"/>
-      <w:r>
-        <w:t xml:space="preserve"> on the impala caused the impala to break indicates that there is something wrong with the cleaning code…</w:t>
+        <w:t xml:space="preserve"> Note that the kangaroo data had a lot of error not encountered in the impala data (e.g., multiple board resets, skipped reads, incorrect GPS writes, etc). The fact that using the “cleaning code” I wrote for the kangies on the impala caused the impala to break indicates that there is something wrong with the cleaning code…</w:t>
       </w:r>
     </w:p>
     <w:p>
@@ -480,25 +392,12 @@
         <w:pStyle w:val="ListParagraph"/>
         <w:numPr>
           <w:ilvl w:val="0"/>
-          <w:numId w:val="1"/>
-        </w:numPr>
-      </w:pPr>
-      <w:r>
-        <w:t xml:space="preserve">Okay, I’m </w:t>
-      </w:r>
-      <w:proofErr w:type="gramStart"/>
-      <w:r>
-        <w:t>actually going</w:t>
-      </w:r>
-      <w:proofErr w:type="gramEnd"/>
-      <w:r>
-        <w:t xml:space="preserve"> to revert everything. Back to the very beginning</w:t>
-      </w:r>
-      <w:r>
-        <w:t xml:space="preserve"> and check differences along every step of the way</w:t>
-      </w:r>
-      <w:r>
-        <w:t>. I created a branch from 5 months ago and will check every step along the way:</w:t>
+          <w:numId w:val="2"/>
+        </w:numPr>
+        <w:spacing w:line="276" w:lineRule="auto"/>
+      </w:pPr>
+      <w:r>
+        <w:t>Okay, I’m actually going to revert everything. Back to the very beginning and check differences along every step of the way. I created a branch from 5 months ago and will check every step along the way:</w:t>
       </w:r>
     </w:p>
     <w:p>
@@ -506,24 +405,13 @@
         <w:pStyle w:val="ListParagraph"/>
         <w:numPr>
           <w:ilvl w:val="1"/>
-          <w:numId w:val="1"/>
-        </w:numPr>
+          <w:numId w:val="2"/>
+        </w:numPr>
+        <w:spacing w:line="276" w:lineRule="auto"/>
       </w:pPr>
       <w:r>
         <w:lastRenderedPageBreak/>
-        <w:t xml:space="preserve">GPS </w:t>
-      </w:r>
-      <w:r>
-        <w:t>stitch</w:t>
-      </w:r>
-      <w:r>
-        <w:t xml:space="preserve">: </w:t>
-      </w:r>
-      <w:r>
-        <w:t xml:space="preserve"> The old version misses the first GPS point for some reason?</w:t>
-      </w:r>
-      <w:r>
-        <w:t xml:space="preserve"> Moved to the new version.</w:t>
+        <w:t>GPS stitch:  The old version misses the first GPS point for some reason? Moved to the new version.</w:t>
       </w:r>
     </w:p>
     <w:p>
@@ -531,39 +419,25 @@
         <w:pStyle w:val="ListParagraph"/>
         <w:numPr>
           <w:ilvl w:val="1"/>
-          <w:numId w:val="1"/>
-        </w:numPr>
-      </w:pPr>
-      <w:r>
-        <w:t xml:space="preserve">Accel stitch: </w:t>
-      </w:r>
-      <w:proofErr w:type="gramStart"/>
-      <w:r>
-        <w:t>Exactly the same</w:t>
-      </w:r>
-      <w:proofErr w:type="gramEnd"/>
+          <w:numId w:val="2"/>
+        </w:numPr>
+        <w:spacing w:line="276" w:lineRule="auto"/>
+      </w:pPr>
+      <w:r>
+        <w:t>Accel stitch: Exactly the same</w:t>
+      </w:r>
     </w:p>
     <w:p>
       <w:pPr>
         <w:pStyle w:val="ListParagraph"/>
         <w:numPr>
           <w:ilvl w:val="1"/>
-          <w:numId w:val="1"/>
-        </w:numPr>
-      </w:pPr>
-      <w:r>
-        <w:t xml:space="preserve">Old method doesn’t account for the internal clock restarting on the </w:t>
-      </w:r>
-      <w:proofErr w:type="gramStart"/>
-      <w:r>
-        <w:t>accelerometer</w:t>
-      </w:r>
-      <w:proofErr w:type="gramEnd"/>
-      <w:r>
-        <w:t xml:space="preserve"> but when I more closely investigated, it does restart. There are duplicated values in the timestamps.</w:t>
-      </w:r>
-      <w:r>
-        <w:t xml:space="preserve"> </w:t>
+          <w:numId w:val="2"/>
+        </w:numPr>
+        <w:spacing w:line="276" w:lineRule="auto"/>
+      </w:pPr>
+      <w:r>
+        <w:t xml:space="preserve">Old method doesn’t account for the internal clock restarting on the accelerometer but when I more closely investigated, it does restart. There are duplicated values in the timestamps. </w:t>
       </w:r>
       <w:r>
         <w:sym w:font="Wingdings" w:char="F0E0"/>
@@ -577,8 +451,9 @@
         <w:pStyle w:val="ListParagraph"/>
         <w:numPr>
           <w:ilvl w:val="1"/>
-          <w:numId w:val="1"/>
-        </w:numPr>
+          <w:numId w:val="2"/>
+        </w:numPr>
+        <w:spacing w:line="276" w:lineRule="auto"/>
       </w:pPr>
       <w:r>
         <w:t>Found a section in the interpolated times where the clock started going backwards presumably because the GPS glitched and went backwards.</w:t>
@@ -594,10 +469,10 @@
           <w:noProof/>
         </w:rPr>
         <w:drawing>
-          <wp:inline distT="0" distB="0" distL="0" distR="0" wp14:anchorId="1C253881" wp14:editId="66EF4B9C">
-            <wp:extent cx="4969565" cy="857462"/>
-            <wp:effectExtent l="0" t="0" r="2540" b="0"/>
-            <wp:docPr id="170760725" name="Picture 1"/>
+          <wp:inline distT="0" distB="0" distL="0" distR="0" wp14:anchorId="2F46B1EC" wp14:editId="38B330B2">
+            <wp:extent cx="4972050" cy="857250"/>
+            <wp:effectExtent l="0" t="0" r="0" b="0"/>
+            <wp:docPr id="1220345178" name="Picture 34"/>
             <wp:cNvGraphicFramePr>
               <a:graphicFrameLocks xmlns:a="http://schemas.openxmlformats.org/drawingml/2006/main" noChangeAspect="1"/>
             </wp:cNvGraphicFramePr>
@@ -605,23 +480,36 @@
               <a:graphicData uri="http://schemas.openxmlformats.org/drawingml/2006/picture">
                 <pic:pic xmlns:pic="http://schemas.openxmlformats.org/drawingml/2006/picture">
                   <pic:nvPicPr>
-                    <pic:cNvPr id="170760725" name=""/>
-                    <pic:cNvPicPr/>
+                    <pic:cNvPr id="0" name="Picture 184"/>
+                    <pic:cNvPicPr>
+                      <a:picLocks noChangeAspect="1" noChangeArrowheads="1"/>
+                    </pic:cNvPicPr>
                   </pic:nvPicPr>
                   <pic:blipFill>
-                    <a:blip r:embed="rId7"/>
+                    <a:blip r:embed="rId7">
+                      <a:extLst>
+                        <a:ext uri="{28A0092B-C50C-407E-A947-70E740481C1C}">
+                          <a14:useLocalDpi xmlns:a14="http://schemas.microsoft.com/office/drawing/2010/main" val="0"/>
+                        </a:ext>
+                      </a:extLst>
+                    </a:blip>
+                    <a:srcRect/>
                     <a:stretch>
                       <a:fillRect/>
                     </a:stretch>
                   </pic:blipFill>
-                  <pic:spPr>
+                  <pic:spPr bwMode="auto">
                     <a:xfrm>
                       <a:off x="0" y="0"/>
-                      <a:ext cx="5019861" cy="866140"/>
+                      <a:ext cx="4972050" cy="857250"/>
                     </a:xfrm>
                     <a:prstGeom prst="rect">
                       <a:avLst/>
                     </a:prstGeom>
+                    <a:noFill/>
+                    <a:ln>
+                      <a:noFill/>
+                    </a:ln>
                   </pic:spPr>
                 </pic:pic>
               </a:graphicData>
@@ -635,17 +523,13 @@
         <w:pStyle w:val="ListParagraph"/>
         <w:numPr>
           <w:ilvl w:val="2"/>
-          <w:numId w:val="1"/>
-        </w:numPr>
-      </w:pPr>
-      <w:r>
-        <w:t xml:space="preserve">Reordered the dataset by the reset events and then removed the misreads where there was an uneven increment between the internal and external times on the </w:t>
-      </w:r>
-      <w:proofErr w:type="spellStart"/>
-      <w:r>
-        <w:t>gps_board</w:t>
-      </w:r>
-      <w:proofErr w:type="spellEnd"/>
+          <w:numId w:val="2"/>
+        </w:numPr>
+        <w:spacing w:line="276" w:lineRule="auto"/>
+      </w:pPr>
+      <w:r>
+        <w:t>Reordered the dataset by the reset events and then removed the misreads where there was an uneven increment between the internal and external times on the gps_board</w:t>
+      </w:r>
     </w:p>
     <w:p>
       <w:pPr>
@@ -658,13 +542,7 @@
         <w:rPr>
           <w:rFonts w:cs="Arial"/>
         </w:rPr>
-        <w:t>30</w:t>
-      </w:r>
-      <w:r>
-        <w:rPr>
-          <w:rFonts w:cs="Arial"/>
-        </w:rPr>
-        <w:t>/03</w:t>
+        <w:t>30/03</w:t>
       </w:r>
     </w:p>
     <w:p>
@@ -672,8 +550,9 @@
         <w:pStyle w:val="ListParagraph"/>
         <w:numPr>
           <w:ilvl w:val="0"/>
-          <w:numId w:val="1"/>
-        </w:numPr>
+          <w:numId w:val="2"/>
+        </w:numPr>
+        <w:spacing w:line="276" w:lineRule="auto"/>
       </w:pPr>
       <w:r>
         <w:t>Have been very busy teaching and submitting other papers. Am now back to working on this and feel like I’m going to suffocate from the stress of it.</w:t>
@@ -684,8 +563,9 @@
         <w:pStyle w:val="ListParagraph"/>
         <w:numPr>
           <w:ilvl w:val="1"/>
-          <w:numId w:val="1"/>
-        </w:numPr>
+          <w:numId w:val="2"/>
+        </w:numPr>
+        <w:spacing w:line="276" w:lineRule="auto"/>
       </w:pPr>
       <w:r>
         <w:t>Something I’m being wary of is the conversion between timestamps.</w:t>
@@ -696,28 +576,12 @@
         <w:pStyle w:val="ListParagraph"/>
         <w:numPr>
           <w:ilvl w:val="1"/>
-          <w:numId w:val="1"/>
-        </w:numPr>
-      </w:pPr>
-      <w:r>
-        <w:t xml:space="preserve">Below confirmed that the </w:t>
-      </w:r>
-      <w:proofErr w:type="spellStart"/>
-      <w:r>
-        <w:t>gps</w:t>
-      </w:r>
-      <w:proofErr w:type="spellEnd"/>
-      <w:r>
-        <w:t xml:space="preserve"> timestamps stay the same after writing and reading but also </w:t>
-      </w:r>
-      <w:r>
-        <w:t>convert</w:t>
-      </w:r>
-      <w:r>
-        <w:t>ed</w:t>
-      </w:r>
-      <w:r>
-        <w:t xml:space="preserve"> everything to numeric to be safe.</w:t>
+          <w:numId w:val="2"/>
+        </w:numPr>
+        <w:spacing w:line="276" w:lineRule="auto"/>
+      </w:pPr>
+      <w:r>
+        <w:t>Below confirmed that the gps timestamps stay the same after writing and reading but also converted everything to numeric to be safe.</w:t>
       </w:r>
     </w:p>
     <w:p>
@@ -726,11 +590,14 @@
         <w:ind w:left="1440"/>
       </w:pPr>
       <w:r>
+        <w:rPr>
+          <w:noProof/>
+        </w:rPr>
         <w:drawing>
-          <wp:inline distT="0" distB="0" distL="0" distR="0" wp14:anchorId="238A972C" wp14:editId="09B3B8D4">
-            <wp:extent cx="2155825" cy="1266458"/>
-            <wp:effectExtent l="0" t="0" r="0" b="0"/>
-            <wp:docPr id="492123530" name="Picture 1"/>
+          <wp:inline distT="0" distB="0" distL="0" distR="0" wp14:anchorId="4624871F" wp14:editId="1CFCFF8E">
+            <wp:extent cx="2152650" cy="1266825"/>
+            <wp:effectExtent l="0" t="0" r="0" b="9525"/>
+            <wp:docPr id="783697103" name="Picture 33"/>
             <wp:cNvGraphicFramePr>
               <a:graphicFrameLocks xmlns:a="http://schemas.openxmlformats.org/drawingml/2006/main" noChangeAspect="1"/>
             </wp:cNvGraphicFramePr>
@@ -738,23 +605,36 @@
               <a:graphicData uri="http://schemas.openxmlformats.org/drawingml/2006/picture">
                 <pic:pic xmlns:pic="http://schemas.openxmlformats.org/drawingml/2006/picture">
                   <pic:nvPicPr>
-                    <pic:cNvPr id="492123530" name=""/>
-                    <pic:cNvPicPr/>
+                    <pic:cNvPr id="0" name="Picture 185"/>
+                    <pic:cNvPicPr>
+                      <a:picLocks noChangeAspect="1" noChangeArrowheads="1"/>
+                    </pic:cNvPicPr>
                   </pic:nvPicPr>
                   <pic:blipFill>
-                    <a:blip r:embed="rId8"/>
+                    <a:blip r:embed="rId8">
+                      <a:extLst>
+                        <a:ext uri="{28A0092B-C50C-407E-A947-70E740481C1C}">
+                          <a14:useLocalDpi xmlns:a14="http://schemas.microsoft.com/office/drawing/2010/main" val="0"/>
+                        </a:ext>
+                      </a:extLst>
+                    </a:blip>
+                    <a:srcRect/>
                     <a:stretch>
                       <a:fillRect/>
                     </a:stretch>
                   </pic:blipFill>
-                  <pic:spPr>
+                  <pic:spPr bwMode="auto">
                     <a:xfrm>
                       <a:off x="0" y="0"/>
-                      <a:ext cx="2161992" cy="1270081"/>
+                      <a:ext cx="2152650" cy="1266825"/>
                     </a:xfrm>
                     <a:prstGeom prst="rect">
                       <a:avLst/>
                     </a:prstGeom>
+                    <a:noFill/>
+                    <a:ln>
+                      <a:noFill/>
+                    </a:ln>
                   </pic:spPr>
                 </pic:pic>
               </a:graphicData>
@@ -768,8 +648,9 @@
         <w:pStyle w:val="ListParagraph"/>
         <w:numPr>
           <w:ilvl w:val="0"/>
-          <w:numId w:val="1"/>
-        </w:numPr>
+          <w:numId w:val="2"/>
+        </w:numPr>
+        <w:spacing w:line="276" w:lineRule="auto"/>
       </w:pPr>
       <w:r>
         <w:t>First thing is to prevent the GPS from going backwards… Began by accounting for the reset events so the times aren’t matched across resets.</w:t>
@@ -785,10 +666,10 @@
           <w:noProof/>
         </w:rPr>
         <w:drawing>
-          <wp:inline distT="0" distB="0" distL="0" distR="0" wp14:anchorId="33A5A03D" wp14:editId="34A8BCE0">
-            <wp:extent cx="2876550" cy="1481106"/>
-            <wp:effectExtent l="0" t="0" r="0" b="5080"/>
-            <wp:docPr id="1953491238" name="Picture 2"/>
+          <wp:inline distT="0" distB="0" distL="0" distR="0" wp14:anchorId="026088AE" wp14:editId="5277F0AB">
+            <wp:extent cx="2876550" cy="1476375"/>
+            <wp:effectExtent l="0" t="0" r="0" b="9525"/>
+            <wp:docPr id="882193636" name="Picture 32"/>
             <wp:cNvGraphicFramePr>
               <a:graphicFrameLocks xmlns:a="http://schemas.openxmlformats.org/drawingml/2006/main" noChangeAspect="1"/>
             </wp:cNvGraphicFramePr>
@@ -817,12 +698,15 @@
                   <pic:spPr bwMode="auto">
                     <a:xfrm>
                       <a:off x="0" y="0"/>
-                      <a:ext cx="2888363" cy="1487188"/>
+                      <a:ext cx="2876550" cy="1476375"/>
                     </a:xfrm>
                     <a:prstGeom prst="rect">
                       <a:avLst/>
                     </a:prstGeom>
                     <a:noFill/>
+                    <a:ln>
+                      <a:noFill/>
+                    </a:ln>
                   </pic:spPr>
                 </pic:pic>
               </a:graphicData>
@@ -836,8 +720,9 @@
         <w:pStyle w:val="ListParagraph"/>
         <w:numPr>
           <w:ilvl w:val="0"/>
-          <w:numId w:val="1"/>
-        </w:numPr>
+          <w:numId w:val="2"/>
+        </w:numPr>
+        <w:spacing w:line="276" w:lineRule="auto"/>
       </w:pPr>
       <w:r>
         <w:lastRenderedPageBreak/>
@@ -867,27 +752,12 @@
         <w:pStyle w:val="ListParagraph"/>
         <w:numPr>
           <w:ilvl w:val="0"/>
-          <w:numId w:val="1"/>
-        </w:numPr>
-      </w:pPr>
-      <w:r>
-        <w:t xml:space="preserve">But </w:t>
-      </w:r>
-      <w:proofErr w:type="gramStart"/>
-      <w:r>
-        <w:t>somehow</w:t>
-      </w:r>
-      <w:proofErr w:type="gramEnd"/>
-      <w:r>
-        <w:t xml:space="preserve"> they are then getting back mixed together after I combine the accel and </w:t>
-      </w:r>
-      <w:proofErr w:type="spellStart"/>
-      <w:r>
-        <w:t>gps</w:t>
-      </w:r>
-      <w:proofErr w:type="spellEnd"/>
-      <w:r>
-        <w:t>?</w:t>
+          <w:numId w:val="2"/>
+        </w:numPr>
+        <w:spacing w:line="276" w:lineRule="auto"/>
+      </w:pPr>
+      <w:r>
+        <w:t>But somehow they are then getting back mixed together after I combine the accel and gps?</w:t>
       </w:r>
     </w:p>
     <w:p>
@@ -895,17 +765,12 @@
         <w:pStyle w:val="ListParagraph"/>
         <w:numPr>
           <w:ilvl w:val="1"/>
-          <w:numId w:val="1"/>
-        </w:numPr>
-      </w:pPr>
-      <w:r>
-        <w:t>I didn’t want to have to do this, but I might have to delete any data from the short reset events</w:t>
-      </w:r>
-      <w:r>
-        <w:t xml:space="preserve"> because they got blended…</w:t>
-      </w:r>
-      <w:r>
-        <w:t xml:space="preserve"> Left is before deletion, right is after.</w:t>
+          <w:numId w:val="2"/>
+        </w:numPr>
+        <w:spacing w:line="276" w:lineRule="auto"/>
+      </w:pPr>
+      <w:r>
+        <w:t>I didn’t want to have to do this, but I might have to delete any data from the short reset events because they got blended… Left is before deletion, right is after.</w:t>
       </w:r>
     </w:p>
     <w:p>
@@ -914,10 +779,10 @@
           <w:noProof/>
         </w:rPr>
         <w:drawing>
-          <wp:inline distT="0" distB="0" distL="0" distR="0" wp14:anchorId="722E1351" wp14:editId="5B0979F8">
-            <wp:extent cx="2538584" cy="953770"/>
-            <wp:effectExtent l="0" t="0" r="0" b="0"/>
-            <wp:docPr id="1340473105" name="Picture 4"/>
+          <wp:inline distT="0" distB="0" distL="0" distR="0" wp14:anchorId="4C683B93" wp14:editId="79F6528C">
+            <wp:extent cx="2543175" cy="952500"/>
+            <wp:effectExtent l="0" t="0" r="9525" b="0"/>
+            <wp:docPr id="1576501082" name="Picture 31"/>
             <wp:cNvGraphicFramePr>
               <a:graphicFrameLocks xmlns:a="http://schemas.openxmlformats.org/drawingml/2006/main" noChangeAspect="1"/>
             </wp:cNvGraphicFramePr>
@@ -925,7 +790,7 @@
               <a:graphicData uri="http://schemas.openxmlformats.org/drawingml/2006/picture">
                 <pic:pic xmlns:pic="http://schemas.openxmlformats.org/drawingml/2006/picture">
                   <pic:nvPicPr>
-                    <pic:cNvPr id="0" name="Picture 3"/>
+                    <pic:cNvPr id="0" name="Picture 4"/>
                     <pic:cNvPicPr>
                       <a:picLocks noChangeAspect="1" noChangeArrowheads="1"/>
                     </pic:cNvPicPr>
@@ -946,12 +811,15 @@
                   <pic:spPr bwMode="auto">
                     <a:xfrm>
                       <a:off x="0" y="0"/>
-                      <a:ext cx="2569013" cy="965202"/>
+                      <a:ext cx="2543175" cy="952500"/>
                     </a:xfrm>
                     <a:prstGeom prst="rect">
                       <a:avLst/>
                     </a:prstGeom>
                     <a:noFill/>
+                    <a:ln>
+                      <a:noFill/>
+                    </a:ln>
                   </pic:spPr>
                 </pic:pic>
               </a:graphicData>
@@ -964,10 +832,10 @@
           <w:noProof/>
         </w:rPr>
         <w:drawing>
-          <wp:inline distT="0" distB="0" distL="0" distR="0" wp14:anchorId="6062439C" wp14:editId="27AFDCC7">
-            <wp:extent cx="2514600" cy="944759"/>
-            <wp:effectExtent l="0" t="0" r="0" b="8255"/>
-            <wp:docPr id="1941172891" name="Picture 6"/>
+          <wp:inline distT="0" distB="0" distL="0" distR="0" wp14:anchorId="55C2515E" wp14:editId="096F7ED6">
+            <wp:extent cx="2514600" cy="942975"/>
+            <wp:effectExtent l="0" t="0" r="0" b="9525"/>
+            <wp:docPr id="1830826063" name="Picture 30"/>
             <wp:cNvGraphicFramePr>
               <a:graphicFrameLocks xmlns:a="http://schemas.openxmlformats.org/drawingml/2006/main" noChangeAspect="1"/>
             </wp:cNvGraphicFramePr>
@@ -975,7 +843,7 @@
               <a:graphicData uri="http://schemas.openxmlformats.org/drawingml/2006/picture">
                 <pic:pic xmlns:pic="http://schemas.openxmlformats.org/drawingml/2006/picture">
                   <pic:nvPicPr>
-                    <pic:cNvPr id="0" name="Picture 4"/>
+                    <pic:cNvPr id="0" name="Picture 6"/>
                     <pic:cNvPicPr>
                       <a:picLocks noChangeAspect="1" noChangeArrowheads="1"/>
                     </pic:cNvPicPr>
@@ -996,7 +864,343 @@
                   <pic:spPr bwMode="auto">
                     <a:xfrm>
                       <a:off x="0" y="0"/>
-                      <a:ext cx="2531979" cy="951289"/>
+                      <a:ext cx="2514600" cy="942975"/>
+                    </a:xfrm>
+                    <a:prstGeom prst="rect">
+                      <a:avLst/>
+                    </a:prstGeom>
+                    <a:noFill/>
+                    <a:ln>
+                      <a:noFill/>
+                    </a:ln>
+                  </pic:spPr>
+                </pic:pic>
+              </a:graphicData>
+            </a:graphic>
+          </wp:inline>
+        </w:drawing>
+      </w:r>
+    </w:p>
+    <w:p>
+      <w:pPr>
+        <w:pStyle w:val="ListParagraph"/>
+        <w:numPr>
+          <w:ilvl w:val="0"/>
+          <w:numId w:val="2"/>
+        </w:numPr>
+        <w:spacing w:line="276" w:lineRule="auto"/>
+      </w:pPr>
+      <w:r>
+        <w:t>This should now mean the data is accurately aligned for interpolation… As far as I can tell, it appears to be…</w:t>
+      </w:r>
+    </w:p>
+    <w:p>
+      <w:pPr>
+        <w:pStyle w:val="ListParagraph"/>
+        <w:numPr>
+          <w:ilvl w:val="0"/>
+          <w:numId w:val="2"/>
+        </w:numPr>
+        <w:spacing w:line="276" w:lineRule="auto"/>
+      </w:pPr>
+      <w:r>
+        <w:t>LADS we did it!!! I got it aligned!</w:t>
+      </w:r>
+    </w:p>
+    <w:p>
+      <w:pPr>
+        <w:pStyle w:val="ListParagraph"/>
+      </w:pPr>
+      <w:r>
+        <w:rPr>
+          <w:noProof/>
+        </w:rPr>
+        <w:drawing>
+          <wp:inline distT="0" distB="0" distL="0" distR="0" wp14:anchorId="1AB86143" wp14:editId="78FAF1A0">
+            <wp:extent cx="5943600" cy="2762250"/>
+            <wp:effectExtent l="0" t="0" r="0" b="0"/>
+            <wp:docPr id="1109290482" name="Picture 29"/>
+            <wp:cNvGraphicFramePr>
+              <a:graphicFrameLocks xmlns:a="http://schemas.openxmlformats.org/drawingml/2006/main" noChangeAspect="1"/>
+            </wp:cNvGraphicFramePr>
+            <a:graphic xmlns:a="http://schemas.openxmlformats.org/drawingml/2006/main">
+              <a:graphicData uri="http://schemas.openxmlformats.org/drawingml/2006/picture">
+                <pic:pic xmlns:pic="http://schemas.openxmlformats.org/drawingml/2006/picture">
+                  <pic:nvPicPr>
+                    <pic:cNvPr id="0" name="Picture 1"/>
+                    <pic:cNvPicPr>
+                      <a:picLocks noChangeAspect="1" noChangeArrowheads="1"/>
+                    </pic:cNvPicPr>
+                  </pic:nvPicPr>
+                  <pic:blipFill>
+                    <a:blip r:embed="rId12">
+                      <a:extLst>
+                        <a:ext uri="{28A0092B-C50C-407E-A947-70E740481C1C}">
+                          <a14:useLocalDpi xmlns:a14="http://schemas.microsoft.com/office/drawing/2010/main" val="0"/>
+                        </a:ext>
+                      </a:extLst>
+                    </a:blip>
+                    <a:srcRect/>
+                    <a:stretch>
+                      <a:fillRect/>
+                    </a:stretch>
+                  </pic:blipFill>
+                  <pic:spPr bwMode="auto">
+                    <a:xfrm>
+                      <a:off x="0" y="0"/>
+                      <a:ext cx="5943600" cy="2762250"/>
+                    </a:xfrm>
+                    <a:prstGeom prst="rect">
+                      <a:avLst/>
+                    </a:prstGeom>
+                    <a:noFill/>
+                    <a:ln>
+                      <a:noFill/>
+                    </a:ln>
+                  </pic:spPr>
+                </pic:pic>
+              </a:graphicData>
+            </a:graphic>
+          </wp:inline>
+        </w:drawing>
+      </w:r>
+    </w:p>
+    <w:p>
+      <w:pPr>
+        <w:pStyle w:val="ListParagraph"/>
+        <w:numPr>
+          <w:ilvl w:val="0"/>
+          <w:numId w:val="2"/>
+        </w:numPr>
+        <w:spacing w:line="276" w:lineRule="auto"/>
+      </w:pPr>
+      <w:r>
+        <w:t xml:space="preserve">Now going to trial it on the kangaroo data and see whether this new code works on that dataset too. </w:t>
+      </w:r>
+      <w:r>
+        <w:sym w:font="Wingdings" w:char="F0E0"/>
+      </w:r>
+      <w:r>
+        <w:t xml:space="preserve"> it didn’t</w:t>
+      </w:r>
+    </w:p>
+    <w:p>
+      <w:pPr>
+        <w:pStyle w:val="Heading3"/>
+        <w:rPr>
+          <w:rFonts w:cs="Arial"/>
+        </w:rPr>
+      </w:pPr>
+      <w:r>
+        <w:rPr>
+          <w:rFonts w:cs="Arial"/>
+        </w:rPr>
+        <w:t>31/03</w:t>
+      </w:r>
+    </w:p>
+    <w:p>
+      <w:pPr>
+        <w:pStyle w:val="ListParagraph"/>
+        <w:numPr>
+          <w:ilvl w:val="0"/>
+          <w:numId w:val="2"/>
+        </w:numPr>
+        <w:spacing w:line="276" w:lineRule="auto"/>
+      </w:pPr>
+      <w:r>
+        <w:t>Today I need to align Robin’s cameras before Amelia gets in. Rush!</w:t>
+      </w:r>
+    </w:p>
+    <w:p>
+      <w:pPr>
+        <w:pStyle w:val="ListParagraph"/>
+        <w:numPr>
+          <w:ilvl w:val="1"/>
+          <w:numId w:val="2"/>
+        </w:numPr>
+        <w:spacing w:line="276" w:lineRule="auto"/>
+      </w:pPr>
+      <w:r>
+        <w:t xml:space="preserve">Wait. Wait. It seems like it might already be aligned? If you watch a video a sufficient number of times, you can gaslight yourself into literally anything. (Robin Vid </w:t>
+      </w:r>
+      <w:r>
+        <w:t>8</w:t>
+      </w:r>
+      <w:r>
+        <w:t xml:space="preserve"> Collar 8 </w:t>
+      </w:r>
+      <w:r>
+        <w:t xml:space="preserve">seems like it might be </w:t>
+      </w:r>
+      <w:r>
+        <w:t>-10</w:t>
+      </w:r>
+      <w:r>
+        <w:t>, Vi</w:t>
+      </w:r>
+      <w:r>
+        <w:t>d 9</w:t>
+      </w:r>
+      <w:r>
+        <w:t xml:space="preserve"> is unusable…</w:t>
+      </w:r>
+      <w:r>
+        <w:t>)</w:t>
+      </w:r>
+    </w:p>
+    <w:p>
+      <w:pPr>
+        <w:pStyle w:val="ListParagraph"/>
+        <w:numPr>
+          <w:ilvl w:val="1"/>
+          <w:numId w:val="2"/>
+        </w:numPr>
+        <w:spacing w:line="276" w:lineRule="auto"/>
+        <w:rPr>
+          <w:highlight w:val="yellow"/>
+        </w:rPr>
+      </w:pPr>
+      <w:r>
+        <w:rPr>
+          <w:highlight w:val="yellow"/>
+        </w:rPr>
+        <w:lastRenderedPageBreak/>
+        <w:t>Noticed that the drone is aligning when I think both the drone and the board are in UTC time. Does this mean that the drone is in UTC (not the assumption I made for the kangaroo data, or that the board is in local time??)</w:t>
+      </w:r>
+    </w:p>
+    <w:p>
+      <w:pPr>
+        <w:pStyle w:val="ListParagraph"/>
+        <w:numPr>
+          <w:ilvl w:val="0"/>
+          <w:numId w:val="2"/>
+        </w:numPr>
+        <w:spacing w:line="276" w:lineRule="auto"/>
+      </w:pPr>
+      <w:r>
+        <w:t>Amazing! So it was aligned and Amelia did a tonne of work on it.</w:t>
+      </w:r>
+    </w:p>
+    <w:p>
+      <w:pPr>
+        <w:pStyle w:val="Heading3"/>
+        <w:rPr>
+          <w:rFonts w:cs="Arial"/>
+        </w:rPr>
+      </w:pPr>
+      <w:r>
+        <w:rPr>
+          <w:rFonts w:cs="Arial"/>
+        </w:rPr>
+        <w:t>0</w:t>
+      </w:r>
+      <w:r>
+        <w:rPr>
+          <w:rFonts w:cs="Arial"/>
+        </w:rPr>
+        <w:t>1/04</w:t>
+      </w:r>
+    </w:p>
+    <w:p>
+      <w:pPr>
+        <w:pStyle w:val="ListParagraph"/>
+        <w:numPr>
+          <w:ilvl w:val="0"/>
+          <w:numId w:val="2"/>
+        </w:numPr>
+      </w:pPr>
+      <w:r>
+        <w:t>I quickly wrote up an instructions doc for how to do the alignment (</w:t>
+      </w:r>
+      <w:hyperlink r:id="rId13" w:history="1">
+        <w:r>
+          <w:rPr>
+            <w:rStyle w:val="Hyperlink"/>
+          </w:rPr>
+          <w:t>VideoAlignment_Instructions.docx</w:t>
+        </w:r>
+      </w:hyperlink>
+      <w:r>
+        <w:t>). Now doing one for sanity checking (</w:t>
+      </w:r>
+      <w:hyperlink r:id="rId14" w:history="1">
+        <w:r>
+          <w:rPr>
+            <w:rStyle w:val="Hyperlink"/>
+          </w:rPr>
+          <w:t>SanityChecking_Instructions.docx</w:t>
+        </w:r>
+      </w:hyperlink>
+      <w:r>
+        <w:t>) while I sanity check Amelia’s annotations so far.</w:t>
+      </w:r>
+    </w:p>
+    <w:p>
+      <w:pPr>
+        <w:pStyle w:val="ListParagraph"/>
+        <w:numPr>
+          <w:ilvl w:val="1"/>
+          <w:numId w:val="2"/>
+        </w:numPr>
+      </w:pPr>
+      <w:r>
+        <w:t>As I was doing this, I found the ones that we did yesterday are scaled incorrectly and have been massively reduced… I vaguely remember that in the code.</w:t>
+      </w:r>
+      <w:r>
+        <w:t xml:space="preserve"> Okay multiplied them by 2048 which brought It back into the correct scale.</w:t>
+      </w:r>
+    </w:p>
+    <w:p>
+      <w:pPr>
+        <w:pStyle w:val="ListParagraph"/>
+        <w:numPr>
+          <w:ilvl w:val="0"/>
+          <w:numId w:val="2"/>
+        </w:numPr>
+      </w:pPr>
+      <w:r>
+        <w:t>This is the data so far.</w:t>
+      </w:r>
+    </w:p>
+    <w:p>
+      <w:r>
+        <w:rPr>
+          <w:noProof/>
+        </w:rPr>
+        <w:drawing>
+          <wp:inline distT="0" distB="0" distL="0" distR="0" wp14:anchorId="0CD36A4C" wp14:editId="784D8C12">
+            <wp:extent cx="6384789" cy="3355340"/>
+            <wp:effectExtent l="0" t="0" r="0" b="0"/>
+            <wp:docPr id="1212934250" name="Picture 2"/>
+            <wp:cNvGraphicFramePr>
+              <a:graphicFrameLocks xmlns:a="http://schemas.openxmlformats.org/drawingml/2006/main" noChangeAspect="1"/>
+            </wp:cNvGraphicFramePr>
+            <a:graphic xmlns:a="http://schemas.openxmlformats.org/drawingml/2006/main">
+              <a:graphicData uri="http://schemas.openxmlformats.org/drawingml/2006/picture">
+                <pic:pic xmlns:pic="http://schemas.openxmlformats.org/drawingml/2006/picture">
+                  <pic:nvPicPr>
+                    <pic:cNvPr id="0" name="Picture 2"/>
+                    <pic:cNvPicPr>
+                      <a:picLocks noChangeAspect="1" noChangeArrowheads="1"/>
+                    </pic:cNvPicPr>
+                  </pic:nvPicPr>
+                  <pic:blipFill>
+                    <a:blip r:embed="rId15" cstate="print">
+                      <a:extLst>
+                        <a:ext uri="{28A0092B-C50C-407E-A947-70E740481C1C}">
+                          <a14:useLocalDpi xmlns:a14="http://schemas.microsoft.com/office/drawing/2010/main" val="0"/>
+                        </a:ext>
+                      </a:extLst>
+                    </a:blip>
+                    <a:srcRect/>
+                    <a:stretch>
+                      <a:fillRect/>
+                    </a:stretch>
+                  </pic:blipFill>
+                  <pic:spPr bwMode="auto">
+                    <a:xfrm>
+                      <a:off x="0" y="0"/>
+                      <a:ext cx="6398641" cy="3362620"/>
                     </a:xfrm>
                     <a:prstGeom prst="rect">
                       <a:avLst/>
@@ -1008,90 +1212,6 @@
             </a:graphic>
           </wp:inline>
         </w:drawing>
-      </w:r>
-    </w:p>
-    <w:p>
-      <w:pPr>
-        <w:pStyle w:val="ListParagraph"/>
-        <w:numPr>
-          <w:ilvl w:val="0"/>
-          <w:numId w:val="1"/>
-        </w:numPr>
-      </w:pPr>
-      <w:r>
-        <w:t>This should now mean the data is accurately aligned for interpolation…</w:t>
-      </w:r>
-      <w:r>
-        <w:t xml:space="preserve"> As far as I can tell, it appears to be…</w:t>
-      </w:r>
-    </w:p>
-    <w:p>
-      <w:pPr>
-        <w:pStyle w:val="ListParagraph"/>
-        <w:numPr>
-          <w:ilvl w:val="0"/>
-          <w:numId w:val="1"/>
-        </w:numPr>
-      </w:pPr>
-      <w:r>
-        <w:t>LADS we did it!!! I got it aligned!</w:t>
-      </w:r>
-    </w:p>
-    <w:p>
-      <w:pPr>
-        <w:pStyle w:val="ListParagraph"/>
-      </w:pPr>
-      <w:r>
-        <w:drawing>
-          <wp:inline distT="0" distB="0" distL="0" distR="0" wp14:anchorId="5FB221D4" wp14:editId="443C0C56">
-            <wp:extent cx="5943600" cy="2759710"/>
-            <wp:effectExtent l="0" t="0" r="0" b="2540"/>
-            <wp:docPr id="2007991877" name="Picture 1"/>
-            <wp:cNvGraphicFramePr>
-              <a:graphicFrameLocks xmlns:a="http://schemas.openxmlformats.org/drawingml/2006/main" noChangeAspect="1"/>
-            </wp:cNvGraphicFramePr>
-            <a:graphic xmlns:a="http://schemas.openxmlformats.org/drawingml/2006/main">
-              <a:graphicData uri="http://schemas.openxmlformats.org/drawingml/2006/picture">
-                <pic:pic xmlns:pic="http://schemas.openxmlformats.org/drawingml/2006/picture">
-                  <pic:nvPicPr>
-                    <pic:cNvPr id="2007991877" name=""/>
-                    <pic:cNvPicPr/>
-                  </pic:nvPicPr>
-                  <pic:blipFill>
-                    <a:blip r:embed="rId12"/>
-                    <a:stretch>
-                      <a:fillRect/>
-                    </a:stretch>
-                  </pic:blipFill>
-                  <pic:spPr>
-                    <a:xfrm>
-                      <a:off x="0" y="0"/>
-                      <a:ext cx="5943600" cy="2759710"/>
-                    </a:xfrm>
-                    <a:prstGeom prst="rect">
-                      <a:avLst/>
-                    </a:prstGeom>
-                  </pic:spPr>
-                </pic:pic>
-              </a:graphicData>
-            </a:graphic>
-          </wp:inline>
-        </w:drawing>
-      </w:r>
-    </w:p>
-    <w:p>
-      <w:pPr>
-        <w:pStyle w:val="ListParagraph"/>
-        <w:numPr>
-          <w:ilvl w:val="0"/>
-          <w:numId w:val="1"/>
-        </w:numPr>
-      </w:pPr>
-      <w:r>
-        <w:t>Now going to trial it on the kangaroo data and see whether this new code works</w:t>
-      </w:r>
-      <w:r>
-        <w:t xml:space="preserve"> on that dataset too. </w:t>
       </w:r>
     </w:p>
     <w:sectPr>
@@ -1219,6 +1339,9 @@
     </w:lvl>
   </w:abstractNum>
   <w:num w:numId="1" w16cid:durableId="2051686407">
+    <w:abstractNumId w:val="0"/>
+  </w:num>
+  <w:num w:numId="2" w16cid:durableId="694502218">
     <w:abstractNumId w:val="0"/>
   </w:num>
 </w:numbering>
@@ -1624,7 +1747,10 @@
   <w:style w:type="paragraph" w:default="1" w:styleId="Normal">
     <w:name w:val="Normal"/>
     <w:qFormat/>
-    <w:rsid w:val="00C462CB"/>
+    <w:rsid w:val="00784FF7"/>
+    <w:pPr>
+      <w:spacing w:line="276" w:lineRule="auto"/>
+    </w:pPr>
     <w:rPr>
       <w:lang w:val="en-GB"/>
     </w:rPr>
@@ -1640,7 +1766,7 @@
     <w:pPr>
       <w:keepNext/>
       <w:keepLines/>
-      <w:spacing w:before="360" w:after="80"/>
+      <w:spacing w:before="360" w:after="80" w:line="278" w:lineRule="auto"/>
       <w:outlineLvl w:val="0"/>
     </w:pPr>
     <w:rPr>
@@ -1662,7 +1788,7 @@
     <w:pPr>
       <w:keepNext/>
       <w:keepLines/>
-      <w:spacing w:before="160" w:after="80"/>
+      <w:spacing w:before="160" w:after="80" w:line="278" w:lineRule="auto"/>
       <w:outlineLvl w:val="1"/>
     </w:pPr>
     <w:rPr>
@@ -1684,7 +1810,7 @@
     <w:pPr>
       <w:keepNext/>
       <w:keepLines/>
-      <w:spacing w:before="160" w:after="80"/>
+      <w:spacing w:before="160" w:after="80" w:line="278" w:lineRule="auto"/>
       <w:outlineLvl w:val="2"/>
     </w:pPr>
     <w:rPr>
@@ -1707,7 +1833,7 @@
     <w:pPr>
       <w:keepNext/>
       <w:keepLines/>
-      <w:spacing w:before="80" w:after="40"/>
+      <w:spacing w:before="80" w:after="40" w:line="278" w:lineRule="auto"/>
       <w:outlineLvl w:val="3"/>
     </w:pPr>
     <w:rPr>
@@ -1730,7 +1856,7 @@
     <w:pPr>
       <w:keepNext/>
       <w:keepLines/>
-      <w:spacing w:before="80" w:after="40"/>
+      <w:spacing w:before="80" w:after="40" w:line="278" w:lineRule="auto"/>
       <w:outlineLvl w:val="4"/>
     </w:pPr>
     <w:rPr>
@@ -1751,7 +1877,7 @@
     <w:pPr>
       <w:keepNext/>
       <w:keepLines/>
-      <w:spacing w:before="40" w:after="0"/>
+      <w:spacing w:before="40" w:after="0" w:line="278" w:lineRule="auto"/>
       <w:outlineLvl w:val="5"/>
     </w:pPr>
     <w:rPr>
@@ -1774,7 +1900,7 @@
     <w:pPr>
       <w:keepNext/>
       <w:keepLines/>
-      <w:spacing w:before="40" w:after="0"/>
+      <w:spacing w:before="40" w:after="0" w:line="278" w:lineRule="auto"/>
       <w:outlineLvl w:val="6"/>
     </w:pPr>
     <w:rPr>
@@ -1795,7 +1921,7 @@
     <w:pPr>
       <w:keepNext/>
       <w:keepLines/>
-      <w:spacing w:after="0"/>
+      <w:spacing w:after="0" w:line="278" w:lineRule="auto"/>
       <w:outlineLvl w:val="7"/>
     </w:pPr>
     <w:rPr>
@@ -1818,7 +1944,7 @@
     <w:pPr>
       <w:keepNext/>
       <w:keepLines/>
-      <w:spacing w:after="0"/>
+      <w:spacing w:after="0" w:line="278" w:lineRule="auto"/>
       <w:outlineLvl w:val="8"/>
     </w:pPr>
     <w:rPr>
@@ -2076,6 +2202,7 @@
     <w:qFormat/>
     <w:rsid w:val="001859AB"/>
     <w:pPr>
+      <w:spacing w:line="278" w:lineRule="auto"/>
       <w:ind w:left="720"/>
       <w:contextualSpacing/>
     </w:pPr>

</xml_diff>

<commit_message>
huge update to the sync station (can now edit already labelled data)
</commit_message>
<xml_diff>
--- a/Notes/Worklog.docx
+++ b/Notes/Worklog.docx
@@ -1168,9 +1168,9 @@
           <w:noProof/>
         </w:rPr>
         <w:drawing>
-          <wp:inline distT="0" distB="0" distL="0" distR="0" wp14:anchorId="0CD36A4C" wp14:editId="784D8C12">
-            <wp:extent cx="6384789" cy="3355340"/>
-            <wp:effectExtent l="0" t="0" r="0" b="0"/>
+          <wp:inline distT="0" distB="0" distL="0" distR="0" wp14:anchorId="0CD36A4C" wp14:editId="704F104C">
+            <wp:extent cx="4035972" cy="2120987"/>
+            <wp:effectExtent l="0" t="0" r="3175" b="0"/>
             <wp:docPr id="1212934250" name="Picture 2"/>
             <wp:cNvGraphicFramePr>
               <a:graphicFrameLocks xmlns:a="http://schemas.openxmlformats.org/drawingml/2006/main" noChangeAspect="1"/>
@@ -1200,7 +1200,7 @@
                   <pic:spPr bwMode="auto">
                     <a:xfrm>
                       <a:off x="0" y="0"/>
-                      <a:ext cx="6398641" cy="3362620"/>
+                      <a:ext cx="4055960" cy="2131491"/>
                     </a:xfrm>
                     <a:prstGeom prst="rect">
                       <a:avLst/>
@@ -1212,6 +1212,900 @@
             </a:graphic>
           </wp:inline>
         </w:drawing>
+      </w:r>
+    </w:p>
+    <w:p>
+      <w:r>
+        <w:rPr>
+          <w:noProof/>
+        </w:rPr>
+        <w:drawing>
+          <wp:inline distT="0" distB="0" distL="0" distR="0" wp14:anchorId="3CA3BCFF" wp14:editId="0BA5E469">
+            <wp:extent cx="4335517" cy="2278405"/>
+            <wp:effectExtent l="0" t="0" r="8255" b="7620"/>
+            <wp:docPr id="136574854" name="Picture 4"/>
+            <wp:cNvGraphicFramePr>
+              <a:graphicFrameLocks xmlns:a="http://schemas.openxmlformats.org/drawingml/2006/main" noChangeAspect="1"/>
+            </wp:cNvGraphicFramePr>
+            <a:graphic xmlns:a="http://schemas.openxmlformats.org/drawingml/2006/main">
+              <a:graphicData uri="http://schemas.openxmlformats.org/drawingml/2006/picture">
+                <pic:pic xmlns:pic="http://schemas.openxmlformats.org/drawingml/2006/picture">
+                  <pic:nvPicPr>
+                    <pic:cNvPr id="0" name="Picture 3"/>
+                    <pic:cNvPicPr>
+                      <a:picLocks noChangeAspect="1" noChangeArrowheads="1"/>
+                    </pic:cNvPicPr>
+                  </pic:nvPicPr>
+                  <pic:blipFill>
+                    <a:blip r:embed="rId16" cstate="print">
+                      <a:extLst>
+                        <a:ext uri="{28A0092B-C50C-407E-A947-70E740481C1C}">
+                          <a14:useLocalDpi xmlns:a14="http://schemas.microsoft.com/office/drawing/2010/main" val="0"/>
+                        </a:ext>
+                      </a:extLst>
+                    </a:blip>
+                    <a:srcRect/>
+                    <a:stretch>
+                      <a:fillRect/>
+                    </a:stretch>
+                  </pic:blipFill>
+                  <pic:spPr bwMode="auto">
+                    <a:xfrm>
+                      <a:off x="0" y="0"/>
+                      <a:ext cx="4360224" cy="2291389"/>
+                    </a:xfrm>
+                    <a:prstGeom prst="rect">
+                      <a:avLst/>
+                    </a:prstGeom>
+                    <a:noFill/>
+                  </pic:spPr>
+                </pic:pic>
+              </a:graphicData>
+            </a:graphic>
+          </wp:inline>
+        </w:drawing>
+      </w:r>
+    </w:p>
+    <w:p>
+      <w:pPr>
+        <w:pStyle w:val="Heading3"/>
+        <w:rPr>
+          <w:rFonts w:cs="Arial"/>
+        </w:rPr>
+      </w:pPr>
+      <w:r>
+        <w:rPr>
+          <w:rFonts w:cs="Arial"/>
+        </w:rPr>
+        <w:lastRenderedPageBreak/>
+        <w:t>0</w:t>
+      </w:r>
+      <w:r>
+        <w:rPr>
+          <w:rFonts w:cs="Arial"/>
+        </w:rPr>
+        <w:t>2</w:t>
+      </w:r>
+      <w:r>
+        <w:rPr>
+          <w:rFonts w:cs="Arial"/>
+        </w:rPr>
+        <w:t>/04</w:t>
+      </w:r>
+    </w:p>
+    <w:p>
+      <w:pPr>
+        <w:pStyle w:val="ListParagraph"/>
+        <w:numPr>
+          <w:ilvl w:val="0"/>
+          <w:numId w:val="2"/>
+        </w:numPr>
+      </w:pPr>
+      <w:r>
+        <w:t>Now I need to manually determine which of the classes I intend to combine.</w:t>
+      </w:r>
+    </w:p>
+    <w:tbl>
+      <w:tblPr>
+        <w:tblStyle w:val="TableGrid"/>
+        <w:tblW w:w="0" w:type="auto"/>
+        <w:tblLook w:val="04A0" w:firstRow="1" w:lastRow="0" w:firstColumn="1" w:lastColumn="0" w:noHBand="0" w:noVBand="1"/>
+      </w:tblPr>
+      <w:tblGrid>
+        <w:gridCol w:w="2690"/>
+        <w:gridCol w:w="2250"/>
+        <w:gridCol w:w="2885"/>
+      </w:tblGrid>
+      <w:tr>
+        <w:tc>
+          <w:tcPr>
+            <w:tcW w:w="2690" w:type="dxa"/>
+          </w:tcPr>
+          <w:p>
+            <w:pPr>
+              <w:rPr>
+                <w:b/>
+                <w:bCs/>
+              </w:rPr>
+            </w:pPr>
+            <w:r>
+              <w:rPr>
+                <w:b/>
+                <w:bCs/>
+              </w:rPr>
+              <w:t>Original Mech</w:t>
+            </w:r>
+          </w:p>
+        </w:tc>
+        <w:tc>
+          <w:tcPr>
+            <w:tcW w:w="2250" w:type="dxa"/>
+          </w:tcPr>
+          <w:p>
+            <w:pPr>
+              <w:rPr>
+                <w:b/>
+                <w:bCs/>
+              </w:rPr>
+            </w:pPr>
+            <w:r>
+              <w:rPr>
+                <w:b/>
+                <w:bCs/>
+              </w:rPr>
+              <w:t>Becomes</w:t>
+            </w:r>
+          </w:p>
+        </w:tc>
+        <w:tc>
+          <w:tcPr>
+            <w:tcW w:w="2885" w:type="dxa"/>
+          </w:tcPr>
+          <w:p>
+            <w:pPr>
+              <w:rPr>
+                <w:b/>
+                <w:bCs/>
+              </w:rPr>
+            </w:pPr>
+            <w:r>
+              <w:rPr>
+                <w:b/>
+                <w:bCs/>
+              </w:rPr>
+              <w:t>Why</w:t>
+            </w:r>
+          </w:p>
+        </w:tc>
+      </w:tr>
+      <w:tr>
+        <w:tc>
+          <w:tcPr>
+            <w:tcW w:w="2690" w:type="dxa"/>
+          </w:tcPr>
+          <w:p>
+            <w:r>
+              <w:t>Foraging_Walking</w:t>
+            </w:r>
+          </w:p>
+        </w:tc>
+        <w:tc>
+          <w:tcPr>
+            <w:tcW w:w="2250" w:type="dxa"/>
+          </w:tcPr>
+          <w:p>
+            <w:r>
+              <w:t>Foraging</w:t>
+            </w:r>
+          </w:p>
+        </w:tc>
+        <w:tc>
+          <w:tcPr>
+            <w:tcW w:w="2885" w:type="dxa"/>
+          </w:tcPr>
+          <w:p>
+            <w:r>
+              <w:t>Similar</w:t>
+            </w:r>
+          </w:p>
+        </w:tc>
+      </w:tr>
+      <w:tr>
+        <w:tc>
+          <w:tcPr>
+            <w:tcW w:w="2690" w:type="dxa"/>
+          </w:tcPr>
+          <w:p>
+            <w:r>
+              <w:t>Walking</w:t>
+            </w:r>
+          </w:p>
+        </w:tc>
+        <w:tc>
+          <w:tcPr>
+            <w:tcW w:w="2250" w:type="dxa"/>
+          </w:tcPr>
+          <w:p>
+            <w:r>
+              <w:t>Walking</w:t>
+            </w:r>
+          </w:p>
+        </w:tc>
+        <w:tc>
+          <w:tcPr>
+            <w:tcW w:w="2885" w:type="dxa"/>
+          </w:tcPr>
+          <w:p/>
+        </w:tc>
+      </w:tr>
+      <w:tr>
+        <w:tc>
+          <w:tcPr>
+            <w:tcW w:w="2690" w:type="dxa"/>
+          </w:tcPr>
+          <w:p>
+            <w:r>
+              <w:t>Standing</w:t>
+            </w:r>
+          </w:p>
+        </w:tc>
+        <w:tc>
+          <w:tcPr>
+            <w:tcW w:w="2250" w:type="dxa"/>
+          </w:tcPr>
+          <w:p>
+            <w:r>
+              <w:t>Standing</w:t>
+            </w:r>
+          </w:p>
+        </w:tc>
+        <w:tc>
+          <w:tcPr>
+            <w:tcW w:w="2885" w:type="dxa"/>
+          </w:tcPr>
+          <w:p/>
+        </w:tc>
+      </w:tr>
+      <w:tr>
+        <w:tc>
+          <w:tcPr>
+            <w:tcW w:w="2690" w:type="dxa"/>
+          </w:tcPr>
+          <w:p>
+            <w:r>
+              <w:t>Scratching</w:t>
+            </w:r>
+          </w:p>
+        </w:tc>
+        <w:tc>
+          <w:tcPr>
+            <w:tcW w:w="2250" w:type="dxa"/>
+          </w:tcPr>
+          <w:p>
+            <w:r>
+              <w:t>Grooming</w:t>
+            </w:r>
+          </w:p>
+        </w:tc>
+        <w:tc>
+          <w:tcPr>
+            <w:tcW w:w="2885" w:type="dxa"/>
+          </w:tcPr>
+          <w:p>
+            <w:r>
+              <w:t>Similar</w:t>
+            </w:r>
+          </w:p>
+        </w:tc>
+      </w:tr>
+      <w:tr>
+        <w:tc>
+          <w:tcPr>
+            <w:tcW w:w="2690" w:type="dxa"/>
+          </w:tcPr>
+          <w:p>
+            <w:r>
+              <w:t>Vigilance</w:t>
+            </w:r>
+          </w:p>
+        </w:tc>
+        <w:tc>
+          <w:tcPr>
+            <w:tcW w:w="2250" w:type="dxa"/>
+          </w:tcPr>
+          <w:p>
+            <w:r>
+              <w:t>Vigilance</w:t>
+            </w:r>
+          </w:p>
+        </w:tc>
+        <w:tc>
+          <w:tcPr>
+            <w:tcW w:w="2885" w:type="dxa"/>
+          </w:tcPr>
+          <w:p/>
+        </w:tc>
+      </w:tr>
+      <w:tr>
+        <w:tc>
+          <w:tcPr>
+            <w:tcW w:w="2690" w:type="dxa"/>
+          </w:tcPr>
+          <w:p>
+            <w:r>
+              <w:t>Grazing_Head_Down</w:t>
+            </w:r>
+          </w:p>
+        </w:tc>
+        <w:tc>
+          <w:tcPr>
+            <w:tcW w:w="2250" w:type="dxa"/>
+          </w:tcPr>
+          <w:p>
+            <w:r>
+              <w:t>Foraging</w:t>
+            </w:r>
+          </w:p>
+        </w:tc>
+        <w:tc>
+          <w:tcPr>
+            <w:tcW w:w="2885" w:type="dxa"/>
+          </w:tcPr>
+          <w:p>
+            <w:r>
+              <w:t>Similar</w:t>
+            </w:r>
+          </w:p>
+        </w:tc>
+      </w:tr>
+      <w:tr>
+        <w:tc>
+          <w:tcPr>
+            <w:tcW w:w="2690" w:type="dxa"/>
+          </w:tcPr>
+          <w:p>
+            <w:r>
+              <w:t>Headbutting</w:t>
+            </w:r>
+          </w:p>
+        </w:tc>
+        <w:tc>
+          <w:tcPr>
+            <w:tcW w:w="2250" w:type="dxa"/>
+          </w:tcPr>
+          <w:p>
+            <w:r>
+              <w:t>Headbutting</w:t>
+            </w:r>
+          </w:p>
+        </w:tc>
+        <w:tc>
+          <w:tcPr>
+            <w:tcW w:w="2885" w:type="dxa"/>
+          </w:tcPr>
+          <w:p/>
+        </w:tc>
+      </w:tr>
+      <w:tr>
+        <w:tc>
+          <w:tcPr>
+            <w:tcW w:w="2690" w:type="dxa"/>
+          </w:tcPr>
+          <w:p>
+            <w:r>
+              <w:t>Grooming</w:t>
+            </w:r>
+          </w:p>
+        </w:tc>
+        <w:tc>
+          <w:tcPr>
+            <w:tcW w:w="2250" w:type="dxa"/>
+          </w:tcPr>
+          <w:p>
+            <w:r>
+              <w:t>Grooming</w:t>
+            </w:r>
+          </w:p>
+        </w:tc>
+        <w:tc>
+          <w:tcPr>
+            <w:tcW w:w="2885" w:type="dxa"/>
+          </w:tcPr>
+          <w:p/>
+        </w:tc>
+      </w:tr>
+      <w:tr>
+        <w:tc>
+          <w:tcPr>
+            <w:tcW w:w="2690" w:type="dxa"/>
+          </w:tcPr>
+          <w:p>
+            <w:r>
+              <w:t>Rapid_Head_Movement</w:t>
+            </w:r>
+          </w:p>
+        </w:tc>
+        <w:tc>
+          <w:tcPr>
+            <w:tcW w:w="2250" w:type="dxa"/>
+          </w:tcPr>
+          <w:p>
+            <w:r>
+              <w:t>Vigilance</w:t>
+            </w:r>
+          </w:p>
+        </w:tc>
+        <w:tc>
+          <w:tcPr>
+            <w:tcW w:w="2885" w:type="dxa"/>
+          </w:tcPr>
+          <w:p>
+            <w:r>
+              <w:t>Similar</w:t>
+            </w:r>
+          </w:p>
+        </w:tc>
+      </w:tr>
+      <w:tr>
+        <w:tc>
+          <w:tcPr>
+            <w:tcW w:w="2690" w:type="dxa"/>
+          </w:tcPr>
+          <w:p>
+            <w:r>
+              <w:t>Drinking</w:t>
+            </w:r>
+          </w:p>
+        </w:tc>
+        <w:tc>
+          <w:tcPr>
+            <w:tcW w:w="2250" w:type="dxa"/>
+          </w:tcPr>
+          <w:p>
+            <w:r>
+              <w:t>Other</w:t>
+            </w:r>
+          </w:p>
+        </w:tc>
+        <w:tc>
+          <w:tcPr>
+            <w:tcW w:w="2885" w:type="dxa"/>
+          </w:tcPr>
+          <w:p>
+            <w:r>
+              <w:t>Not enough samples</w:t>
+            </w:r>
+          </w:p>
+        </w:tc>
+      </w:tr>
+      <w:tr>
+        <w:tc>
+          <w:tcPr>
+            <w:tcW w:w="2690" w:type="dxa"/>
+          </w:tcPr>
+          <w:p>
+            <w:r>
+              <w:t>Rubbing</w:t>
+            </w:r>
+          </w:p>
+        </w:tc>
+        <w:tc>
+          <w:tcPr>
+            <w:tcW w:w="2250" w:type="dxa"/>
+          </w:tcPr>
+          <w:p>
+            <w:r>
+              <w:t xml:space="preserve">Grooming </w:t>
+            </w:r>
+          </w:p>
+        </w:tc>
+        <w:tc>
+          <w:tcPr>
+            <w:tcW w:w="2885" w:type="dxa"/>
+          </w:tcPr>
+          <w:p>
+            <w:r>
+              <w:t>Similar</w:t>
+            </w:r>
+          </w:p>
+        </w:tc>
+      </w:tr>
+      <w:tr>
+        <w:tc>
+          <w:tcPr>
+            <w:tcW w:w="2690" w:type="dxa"/>
+          </w:tcPr>
+          <w:p>
+            <w:r>
+              <w:t>Sprinting/Bounding</w:t>
+            </w:r>
+          </w:p>
+        </w:tc>
+        <w:tc>
+          <w:tcPr>
+            <w:tcW w:w="2250" w:type="dxa"/>
+          </w:tcPr>
+          <w:p>
+            <w:r>
+              <w:t>Sprinting</w:t>
+            </w:r>
+          </w:p>
+        </w:tc>
+        <w:tc>
+          <w:tcPr>
+            <w:tcW w:w="2885" w:type="dxa"/>
+          </w:tcPr>
+          <w:p/>
+        </w:tc>
+      </w:tr>
+      <w:tr>
+        <w:tc>
+          <w:tcPr>
+            <w:tcW w:w="2690" w:type="dxa"/>
+          </w:tcPr>
+          <w:p>
+            <w:r>
+              <w:t>Head_Shake</w:t>
+            </w:r>
+          </w:p>
+        </w:tc>
+        <w:tc>
+          <w:tcPr>
+            <w:tcW w:w="2250" w:type="dxa"/>
+          </w:tcPr>
+          <w:p>
+            <w:r>
+              <w:t>Head_Shake</w:t>
+            </w:r>
+          </w:p>
+        </w:tc>
+        <w:tc>
+          <w:tcPr>
+            <w:tcW w:w="2885" w:type="dxa"/>
+          </w:tcPr>
+          <w:p>
+            <w:r>
+              <w:t>Not enough samples</w:t>
+            </w:r>
+          </w:p>
+        </w:tc>
+      </w:tr>
+      <w:tr>
+        <w:tc>
+          <w:tcPr>
+            <w:tcW w:w="2690" w:type="dxa"/>
+          </w:tcPr>
+          <w:p>
+            <w:r>
+              <w:t>Grazing_Head_Up</w:t>
+            </w:r>
+          </w:p>
+        </w:tc>
+        <w:tc>
+          <w:tcPr>
+            <w:tcW w:w="2250" w:type="dxa"/>
+          </w:tcPr>
+          <w:p>
+            <w:r>
+              <w:t>Foraging</w:t>
+            </w:r>
+          </w:p>
+        </w:tc>
+        <w:tc>
+          <w:tcPr>
+            <w:tcW w:w="2885" w:type="dxa"/>
+          </w:tcPr>
+          <w:p>
+            <w:r>
+              <w:t>Similar</w:t>
+            </w:r>
+          </w:p>
+        </w:tc>
+      </w:tr>
+      <w:tr>
+        <w:tc>
+          <w:tcPr>
+            <w:tcW w:w="2690" w:type="dxa"/>
+          </w:tcPr>
+          <w:p>
+            <w:r>
+              <w:t>Chewing</w:t>
+            </w:r>
+          </w:p>
+        </w:tc>
+        <w:tc>
+          <w:tcPr>
+            <w:tcW w:w="2250" w:type="dxa"/>
+          </w:tcPr>
+          <w:p>
+            <w:r>
+              <w:t>Chewing</w:t>
+            </w:r>
+          </w:p>
+        </w:tc>
+        <w:tc>
+          <w:tcPr>
+            <w:tcW w:w="2885" w:type="dxa"/>
+          </w:tcPr>
+          <w:p/>
+        </w:tc>
+      </w:tr>
+      <w:tr>
+        <w:tc>
+          <w:tcPr>
+            <w:tcW w:w="2690" w:type="dxa"/>
+          </w:tcPr>
+          <w:p>
+            <w:r>
+              <w:t>Trotting</w:t>
+            </w:r>
+          </w:p>
+        </w:tc>
+        <w:tc>
+          <w:tcPr>
+            <w:tcW w:w="2250" w:type="dxa"/>
+          </w:tcPr>
+          <w:p>
+            <w:r>
+              <w:t>Trotting</w:t>
+            </w:r>
+          </w:p>
+        </w:tc>
+        <w:tc>
+          <w:tcPr>
+            <w:tcW w:w="2885" w:type="dxa"/>
+          </w:tcPr>
+          <w:p/>
+        </w:tc>
+      </w:tr>
+      <w:tr>
+        <w:tc>
+          <w:tcPr>
+            <w:tcW w:w="2690" w:type="dxa"/>
+          </w:tcPr>
+          <w:p>
+            <w:r>
+              <w:t>Startle</w:t>
+            </w:r>
+          </w:p>
+        </w:tc>
+        <w:tc>
+          <w:tcPr>
+            <w:tcW w:w="2250" w:type="dxa"/>
+          </w:tcPr>
+          <w:p>
+            <w:r>
+              <w:t>Startle</w:t>
+            </w:r>
+          </w:p>
+        </w:tc>
+        <w:tc>
+          <w:tcPr>
+            <w:tcW w:w="2885" w:type="dxa"/>
+          </w:tcPr>
+          <w:p/>
+        </w:tc>
+      </w:tr>
+      <w:tr>
+        <w:tc>
+          <w:tcPr>
+            <w:tcW w:w="2690" w:type="dxa"/>
+          </w:tcPr>
+          <w:p>
+            <w:r>
+              <w:t>Lowering_Head</w:t>
+            </w:r>
+          </w:p>
+        </w:tc>
+        <w:tc>
+          <w:tcPr>
+            <w:tcW w:w="2250" w:type="dxa"/>
+          </w:tcPr>
+          <w:p>
+            <w:r>
+              <w:t>Other</w:t>
+            </w:r>
+          </w:p>
+        </w:tc>
+        <w:tc>
+          <w:tcPr>
+            <w:tcW w:w="2885" w:type="dxa"/>
+          </w:tcPr>
+          <w:p>
+            <w:r>
+              <w:t>Not enough samples</w:t>
+            </w:r>
+          </w:p>
+        </w:tc>
+      </w:tr>
+      <w:tr>
+        <w:tc>
+          <w:tcPr>
+            <w:tcW w:w="2690" w:type="dxa"/>
+          </w:tcPr>
+          <w:p>
+            <w:r>
+              <w:t>Shake</w:t>
+            </w:r>
+          </w:p>
+        </w:tc>
+        <w:tc>
+          <w:tcPr>
+            <w:tcW w:w="2250" w:type="dxa"/>
+          </w:tcPr>
+          <w:p>
+            <w:r>
+              <w:t>Other</w:t>
+            </w:r>
+          </w:p>
+        </w:tc>
+        <w:tc>
+          <w:tcPr>
+            <w:tcW w:w="2885" w:type="dxa"/>
+          </w:tcPr>
+          <w:p>
+            <w:r>
+              <w:t>Not enough samples</w:t>
+            </w:r>
+          </w:p>
+        </w:tc>
+      </w:tr>
+      <w:tr>
+        <w:tc>
+          <w:tcPr>
+            <w:tcW w:w="2690" w:type="dxa"/>
+          </w:tcPr>
+          <w:p>
+            <w:r>
+              <w:t>Urinating</w:t>
+            </w:r>
+          </w:p>
+        </w:tc>
+        <w:tc>
+          <w:tcPr>
+            <w:tcW w:w="2250" w:type="dxa"/>
+          </w:tcPr>
+          <w:p>
+            <w:r>
+              <w:t>Other</w:t>
+            </w:r>
+          </w:p>
+        </w:tc>
+        <w:tc>
+          <w:tcPr>
+            <w:tcW w:w="2885" w:type="dxa"/>
+          </w:tcPr>
+          <w:p>
+            <w:r>
+              <w:t>Not enough samples</w:t>
+            </w:r>
+          </w:p>
+        </w:tc>
+      </w:tr>
+      <w:tr>
+        <w:tc>
+          <w:tcPr>
+            <w:tcW w:w="2690" w:type="dxa"/>
+          </w:tcPr>
+          <w:p>
+            <w:r>
+              <w:t>Raising_Head</w:t>
+            </w:r>
+          </w:p>
+        </w:tc>
+        <w:tc>
+          <w:tcPr>
+            <w:tcW w:w="2250" w:type="dxa"/>
+          </w:tcPr>
+          <w:p>
+            <w:r>
+              <w:t>Other</w:t>
+            </w:r>
+          </w:p>
+        </w:tc>
+        <w:tc>
+          <w:tcPr>
+            <w:tcW w:w="2885" w:type="dxa"/>
+          </w:tcPr>
+          <w:p>
+            <w:r>
+              <w:t>Not enough samples</w:t>
+            </w:r>
+          </w:p>
+        </w:tc>
+      </w:tr>
+    </w:tbl>
+    <w:p>
+      <w:pPr>
+        <w:pStyle w:val="ListParagraph"/>
+        <w:numPr>
+          <w:ilvl w:val="0"/>
+          <w:numId w:val="2"/>
+        </w:numPr>
+      </w:pPr>
+      <w:r>
+        <w:t xml:space="preserve">I </w:t>
+      </w:r>
+      <w:r>
+        <w:t>won’t</w:t>
+      </w:r>
+      <w:r>
+        <w:t xml:space="preserve"> really know which classes need to be combined until I’ve had a play with the classification performance. Therefore, thinking that maybe I need to experiment with multiple class groupings in the first cross-validation fold.</w:t>
+      </w:r>
+    </w:p>
+    <w:p>
+      <w:pPr>
+        <w:pStyle w:val="ListParagraph"/>
+        <w:numPr>
+          <w:ilvl w:val="0"/>
+          <w:numId w:val="2"/>
+        </w:numPr>
+      </w:pPr>
+      <w:r>
+        <w:t>I’m messing around with a small shiny app for cleaning up the data now. In theory, it will load in each Activity and then you clean any outliers out of the system.</w:t>
+      </w:r>
+      <w:r>
+        <w:t xml:space="preserve"> Unsure where best to put it in the workflow. Might put it directly after the generation of the labelled data csv.</w:t>
+      </w:r>
+      <w:r>
+        <w:t xml:space="preserve"> </w:t>
+      </w:r>
+    </w:p>
+    <w:p>
+      <w:pPr>
+        <w:pStyle w:val="ListParagraph"/>
+        <w:numPr>
+          <w:ilvl w:val="1"/>
+          <w:numId w:val="2"/>
+        </w:numPr>
+      </w:pPr>
+      <w:r>
+        <w:sym w:font="Wingdings" w:char="F0E0"/>
+      </w:r>
+      <w:r>
+        <w:t xml:space="preserve"> am actually now editing the matlab to be able to read annotations if they exist, and then you can override to 0 if </w:t>
+      </w:r>
+      <w:r>
+        <w:t>its an error</w:t>
+      </w:r>
+    </w:p>
+    <w:p>
+      <w:pPr>
+        <w:pStyle w:val="ListParagraph"/>
+        <w:numPr>
+          <w:ilvl w:val="1"/>
+          <w:numId w:val="2"/>
+        </w:numPr>
+      </w:pPr>
+      <w:r>
+        <w:t>This is more work than I bargained for. Ugh.</w:t>
+      </w:r>
+    </w:p>
+    <w:p>
+      <w:pPr>
+        <w:pStyle w:val="ListParagraph"/>
+        <w:numPr>
+          <w:ilvl w:val="1"/>
+          <w:numId w:val="2"/>
+        </w:numPr>
+      </w:pPr>
+      <w:r>
+        <w:t>10</w:t>
+      </w:r>
+      <w:r>
+        <w:t>0 minutes later, I completed that part of the task.</w:t>
+      </w:r>
+    </w:p>
+    <w:p>
+      <w:pPr>
+        <w:pStyle w:val="ListParagraph"/>
+        <w:numPr>
+          <w:ilvl w:val="1"/>
+          <w:numId w:val="2"/>
+        </w:numPr>
+      </w:pPr>
+      <w:r>
+        <w:t>Now to go through and clean all the data</w:t>
       </w:r>
     </w:p>
     <w:sectPr>

</xml_diff>

<commit_message>
adding in the dead reckoning tracks
</commit_message>
<xml_diff>
--- a/Notes/Worklog.docx
+++ b/Notes/Worklog.docx
@@ -4,16 +4,9 @@
   <w:body>
     <w:p>
       <w:pPr>
-        <w:pStyle w:val="Heading1"/>
-        <w:spacing w:before="0"/>
-        <w:rPr>
-          <w:rFonts w:asciiTheme="minorHAnsi" w:hAnsiTheme="minorHAnsi" w:cs="Arial"/>
-        </w:rPr>
-      </w:pPr>
-      <w:r>
-        <w:rPr>
-          <w:rFonts w:asciiTheme="minorHAnsi" w:hAnsiTheme="minorHAnsi" w:cs="Arial"/>
-        </w:rPr>
+        <w:pStyle w:val="Title"/>
+      </w:pPr>
+      <w:r>
         <w:t>Worklog</w:t>
       </w:r>
     </w:p>
@@ -38,6 +31,630 @@
         <w:t>I like to take notes as I work. These are things I observed and decisions I made. It is for my own sake of thinking-out-loud more than anything.</w:t>
       </w:r>
     </w:p>
+    <w:sdt>
+      <w:sdtPr>
+        <w:id w:val="4565996"/>
+        <w:docPartObj>
+          <w:docPartGallery w:val="Table of Contents"/>
+          <w:docPartUnique/>
+        </w:docPartObj>
+      </w:sdtPr>
+      <w:sdtEndPr>
+        <w:rPr>
+          <w:rFonts w:asciiTheme="minorHAnsi" w:eastAsiaTheme="minorHAnsi" w:hAnsiTheme="minorHAnsi" w:cstheme="minorBidi"/>
+          <w:b/>
+          <w:bCs/>
+          <w:noProof/>
+          <w:color w:val="auto"/>
+          <w:kern w:val="2"/>
+          <w:sz w:val="24"/>
+          <w:szCs w:val="24"/>
+          <w:lang w:val="en-GB"/>
+          <w14:ligatures w14:val="standardContextual"/>
+        </w:rPr>
+      </w:sdtEndPr>
+      <w:sdtContent>
+        <w:p>
+          <w:pPr>
+            <w:pStyle w:val="TOCHeading"/>
+          </w:pPr>
+          <w:r>
+            <w:t>Contents</w:t>
+          </w:r>
+        </w:p>
+        <w:p>
+          <w:pPr>
+            <w:pStyle w:val="TOC3"/>
+            <w:tabs>
+              <w:tab w:val="right" w:leader="dot" w:pos="9350"/>
+            </w:tabs>
+            <w:rPr>
+              <w:rFonts w:eastAsiaTheme="minorEastAsia"/>
+              <w:noProof/>
+              <w:lang w:val="en-US"/>
+            </w:rPr>
+          </w:pPr>
+          <w:r>
+            <w:fldChar w:fldCharType="begin"/>
+          </w:r>
+          <w:r>
+            <w:instrText xml:space="preserve"> TOC \o "1-3" \h \z \u </w:instrText>
+          </w:r>
+          <w:r>
+            <w:fldChar w:fldCharType="separate"/>
+          </w:r>
+          <w:hyperlink w:anchor="_Toc226310523" w:history="1">
+            <w:r>
+              <w:rPr>
+                <w:rStyle w:val="Hyperlink"/>
+                <w:rFonts w:cs="Arial"/>
+                <w:noProof/>
+              </w:rPr>
+              <w:t>18/03</w:t>
+            </w:r>
+            <w:r>
+              <w:rPr>
+                <w:noProof/>
+                <w:webHidden/>
+              </w:rPr>
+              <w:tab/>
+            </w:r>
+            <w:r>
+              <w:rPr>
+                <w:noProof/>
+                <w:webHidden/>
+              </w:rPr>
+              <w:fldChar w:fldCharType="begin"/>
+            </w:r>
+            <w:r>
+              <w:rPr>
+                <w:noProof/>
+                <w:webHidden/>
+              </w:rPr>
+              <w:instrText xml:space="preserve"> PAGEREF _Toc226310523 \h </w:instrText>
+            </w:r>
+            <w:r>
+              <w:rPr>
+                <w:noProof/>
+                <w:webHidden/>
+              </w:rPr>
+            </w:r>
+            <w:r>
+              <w:rPr>
+                <w:noProof/>
+                <w:webHidden/>
+              </w:rPr>
+              <w:fldChar w:fldCharType="separate"/>
+            </w:r>
+            <w:r>
+              <w:rPr>
+                <w:noProof/>
+                <w:webHidden/>
+              </w:rPr>
+              <w:t>1</w:t>
+            </w:r>
+            <w:r>
+              <w:rPr>
+                <w:noProof/>
+                <w:webHidden/>
+              </w:rPr>
+              <w:fldChar w:fldCharType="end"/>
+            </w:r>
+          </w:hyperlink>
+        </w:p>
+        <w:p>
+          <w:pPr>
+            <w:pStyle w:val="TOC3"/>
+            <w:tabs>
+              <w:tab w:val="right" w:leader="dot" w:pos="9350"/>
+            </w:tabs>
+            <w:rPr>
+              <w:rFonts w:eastAsiaTheme="minorEastAsia"/>
+              <w:noProof/>
+              <w:lang w:val="en-US"/>
+            </w:rPr>
+          </w:pPr>
+          <w:hyperlink w:anchor="_Toc226310524" w:history="1">
+            <w:r>
+              <w:rPr>
+                <w:rStyle w:val="Hyperlink"/>
+                <w:rFonts w:cs="Arial"/>
+                <w:noProof/>
+              </w:rPr>
+              <w:t>19/03</w:t>
+            </w:r>
+            <w:r>
+              <w:rPr>
+                <w:noProof/>
+                <w:webHidden/>
+              </w:rPr>
+              <w:tab/>
+            </w:r>
+            <w:r>
+              <w:rPr>
+                <w:noProof/>
+                <w:webHidden/>
+              </w:rPr>
+              <w:fldChar w:fldCharType="begin"/>
+            </w:r>
+            <w:r>
+              <w:rPr>
+                <w:noProof/>
+                <w:webHidden/>
+              </w:rPr>
+              <w:instrText xml:space="preserve"> PAGEREF _Toc226310524 \h </w:instrText>
+            </w:r>
+            <w:r>
+              <w:rPr>
+                <w:noProof/>
+                <w:webHidden/>
+              </w:rPr>
+            </w:r>
+            <w:r>
+              <w:rPr>
+                <w:noProof/>
+                <w:webHidden/>
+              </w:rPr>
+              <w:fldChar w:fldCharType="separate"/>
+            </w:r>
+            <w:r>
+              <w:rPr>
+                <w:noProof/>
+                <w:webHidden/>
+              </w:rPr>
+              <w:t>2</w:t>
+            </w:r>
+            <w:r>
+              <w:rPr>
+                <w:noProof/>
+                <w:webHidden/>
+              </w:rPr>
+              <w:fldChar w:fldCharType="end"/>
+            </w:r>
+          </w:hyperlink>
+        </w:p>
+        <w:p>
+          <w:pPr>
+            <w:pStyle w:val="TOC3"/>
+            <w:tabs>
+              <w:tab w:val="right" w:leader="dot" w:pos="9350"/>
+            </w:tabs>
+            <w:rPr>
+              <w:rFonts w:eastAsiaTheme="minorEastAsia"/>
+              <w:noProof/>
+              <w:lang w:val="en-US"/>
+            </w:rPr>
+          </w:pPr>
+          <w:hyperlink w:anchor="_Toc226310525" w:history="1">
+            <w:r>
+              <w:rPr>
+                <w:rStyle w:val="Hyperlink"/>
+                <w:rFonts w:cs="Arial"/>
+                <w:noProof/>
+              </w:rPr>
+              <w:t>30/03</w:t>
+            </w:r>
+            <w:r>
+              <w:rPr>
+                <w:noProof/>
+                <w:webHidden/>
+              </w:rPr>
+              <w:tab/>
+            </w:r>
+            <w:r>
+              <w:rPr>
+                <w:noProof/>
+                <w:webHidden/>
+              </w:rPr>
+              <w:fldChar w:fldCharType="begin"/>
+            </w:r>
+            <w:r>
+              <w:rPr>
+                <w:noProof/>
+                <w:webHidden/>
+              </w:rPr>
+              <w:instrText xml:space="preserve"> PAGEREF _Toc226310525 \h </w:instrText>
+            </w:r>
+            <w:r>
+              <w:rPr>
+                <w:noProof/>
+                <w:webHidden/>
+              </w:rPr>
+            </w:r>
+            <w:r>
+              <w:rPr>
+                <w:noProof/>
+                <w:webHidden/>
+              </w:rPr>
+              <w:fldChar w:fldCharType="separate"/>
+            </w:r>
+            <w:r>
+              <w:rPr>
+                <w:noProof/>
+                <w:webHidden/>
+              </w:rPr>
+              <w:t>3</w:t>
+            </w:r>
+            <w:r>
+              <w:rPr>
+                <w:noProof/>
+                <w:webHidden/>
+              </w:rPr>
+              <w:fldChar w:fldCharType="end"/>
+            </w:r>
+          </w:hyperlink>
+        </w:p>
+        <w:p>
+          <w:pPr>
+            <w:pStyle w:val="TOC3"/>
+            <w:tabs>
+              <w:tab w:val="right" w:leader="dot" w:pos="9350"/>
+            </w:tabs>
+            <w:rPr>
+              <w:rFonts w:eastAsiaTheme="minorEastAsia"/>
+              <w:noProof/>
+              <w:lang w:val="en-US"/>
+            </w:rPr>
+          </w:pPr>
+          <w:hyperlink w:anchor="_Toc226310526" w:history="1">
+            <w:r>
+              <w:rPr>
+                <w:rStyle w:val="Hyperlink"/>
+                <w:rFonts w:cs="Arial"/>
+                <w:noProof/>
+              </w:rPr>
+              <w:t>31/03</w:t>
+            </w:r>
+            <w:r>
+              <w:rPr>
+                <w:noProof/>
+                <w:webHidden/>
+              </w:rPr>
+              <w:tab/>
+            </w:r>
+            <w:r>
+              <w:rPr>
+                <w:noProof/>
+                <w:webHidden/>
+              </w:rPr>
+              <w:fldChar w:fldCharType="begin"/>
+            </w:r>
+            <w:r>
+              <w:rPr>
+                <w:noProof/>
+                <w:webHidden/>
+              </w:rPr>
+              <w:instrText xml:space="preserve"> PAGEREF _Toc226310526 \h </w:instrText>
+            </w:r>
+            <w:r>
+              <w:rPr>
+                <w:noProof/>
+                <w:webHidden/>
+              </w:rPr>
+            </w:r>
+            <w:r>
+              <w:rPr>
+                <w:noProof/>
+                <w:webHidden/>
+              </w:rPr>
+              <w:fldChar w:fldCharType="separate"/>
+            </w:r>
+            <w:r>
+              <w:rPr>
+                <w:noProof/>
+                <w:webHidden/>
+              </w:rPr>
+              <w:t>5</w:t>
+            </w:r>
+            <w:r>
+              <w:rPr>
+                <w:noProof/>
+                <w:webHidden/>
+              </w:rPr>
+              <w:fldChar w:fldCharType="end"/>
+            </w:r>
+          </w:hyperlink>
+        </w:p>
+        <w:p>
+          <w:pPr>
+            <w:pStyle w:val="TOC3"/>
+            <w:tabs>
+              <w:tab w:val="right" w:leader="dot" w:pos="9350"/>
+            </w:tabs>
+            <w:rPr>
+              <w:rFonts w:eastAsiaTheme="minorEastAsia"/>
+              <w:noProof/>
+              <w:lang w:val="en-US"/>
+            </w:rPr>
+          </w:pPr>
+          <w:hyperlink w:anchor="_Toc226310527" w:history="1">
+            <w:r>
+              <w:rPr>
+                <w:rStyle w:val="Hyperlink"/>
+                <w:rFonts w:cs="Arial"/>
+                <w:noProof/>
+              </w:rPr>
+              <w:t>01/04</w:t>
+            </w:r>
+            <w:r>
+              <w:rPr>
+                <w:noProof/>
+                <w:webHidden/>
+              </w:rPr>
+              <w:tab/>
+            </w:r>
+            <w:r>
+              <w:rPr>
+                <w:noProof/>
+                <w:webHidden/>
+              </w:rPr>
+              <w:fldChar w:fldCharType="begin"/>
+            </w:r>
+            <w:r>
+              <w:rPr>
+                <w:noProof/>
+                <w:webHidden/>
+              </w:rPr>
+              <w:instrText xml:space="preserve"> PAGEREF _Toc226310527 \h </w:instrText>
+            </w:r>
+            <w:r>
+              <w:rPr>
+                <w:noProof/>
+                <w:webHidden/>
+              </w:rPr>
+            </w:r>
+            <w:r>
+              <w:rPr>
+                <w:noProof/>
+                <w:webHidden/>
+              </w:rPr>
+              <w:fldChar w:fldCharType="separate"/>
+            </w:r>
+            <w:r>
+              <w:rPr>
+                <w:noProof/>
+                <w:webHidden/>
+              </w:rPr>
+              <w:t>5</w:t>
+            </w:r>
+            <w:r>
+              <w:rPr>
+                <w:noProof/>
+                <w:webHidden/>
+              </w:rPr>
+              <w:fldChar w:fldCharType="end"/>
+            </w:r>
+          </w:hyperlink>
+        </w:p>
+        <w:p>
+          <w:pPr>
+            <w:pStyle w:val="TOC3"/>
+            <w:tabs>
+              <w:tab w:val="right" w:leader="dot" w:pos="9350"/>
+            </w:tabs>
+            <w:rPr>
+              <w:rFonts w:eastAsiaTheme="minorEastAsia"/>
+              <w:noProof/>
+              <w:lang w:val="en-US"/>
+            </w:rPr>
+          </w:pPr>
+          <w:hyperlink w:anchor="_Toc226310528" w:history="1">
+            <w:r>
+              <w:rPr>
+                <w:rStyle w:val="Hyperlink"/>
+                <w:rFonts w:cs="Arial"/>
+                <w:noProof/>
+              </w:rPr>
+              <w:t>02/04</w:t>
+            </w:r>
+            <w:r>
+              <w:rPr>
+                <w:noProof/>
+                <w:webHidden/>
+              </w:rPr>
+              <w:tab/>
+            </w:r>
+            <w:r>
+              <w:rPr>
+                <w:noProof/>
+                <w:webHidden/>
+              </w:rPr>
+              <w:fldChar w:fldCharType="begin"/>
+            </w:r>
+            <w:r>
+              <w:rPr>
+                <w:noProof/>
+                <w:webHidden/>
+              </w:rPr>
+              <w:instrText xml:space="preserve"> PAGEREF _Toc226310528 \h </w:instrText>
+            </w:r>
+            <w:r>
+              <w:rPr>
+                <w:noProof/>
+                <w:webHidden/>
+              </w:rPr>
+            </w:r>
+            <w:r>
+              <w:rPr>
+                <w:noProof/>
+                <w:webHidden/>
+              </w:rPr>
+              <w:fldChar w:fldCharType="separate"/>
+            </w:r>
+            <w:r>
+              <w:rPr>
+                <w:noProof/>
+                <w:webHidden/>
+              </w:rPr>
+              <w:t>6</w:t>
+            </w:r>
+            <w:r>
+              <w:rPr>
+                <w:noProof/>
+                <w:webHidden/>
+              </w:rPr>
+              <w:fldChar w:fldCharType="end"/>
+            </w:r>
+          </w:hyperlink>
+        </w:p>
+        <w:p>
+          <w:pPr>
+            <w:pStyle w:val="TOC3"/>
+            <w:tabs>
+              <w:tab w:val="right" w:leader="dot" w:pos="9350"/>
+            </w:tabs>
+            <w:rPr>
+              <w:rFonts w:eastAsiaTheme="minorEastAsia"/>
+              <w:noProof/>
+              <w:lang w:val="en-US"/>
+            </w:rPr>
+          </w:pPr>
+          <w:hyperlink w:anchor="_Toc226310529" w:history="1">
+            <w:r>
+              <w:rPr>
+                <w:rStyle w:val="Hyperlink"/>
+                <w:rFonts w:cs="Arial"/>
+                <w:noProof/>
+              </w:rPr>
+              <w:t>05/04</w:t>
+            </w:r>
+            <w:r>
+              <w:rPr>
+                <w:noProof/>
+                <w:webHidden/>
+              </w:rPr>
+              <w:tab/>
+            </w:r>
+            <w:r>
+              <w:rPr>
+                <w:noProof/>
+                <w:webHidden/>
+              </w:rPr>
+              <w:fldChar w:fldCharType="begin"/>
+            </w:r>
+            <w:r>
+              <w:rPr>
+                <w:noProof/>
+                <w:webHidden/>
+              </w:rPr>
+              <w:instrText xml:space="preserve"> PAGEREF _Toc226310529 \h </w:instrText>
+            </w:r>
+            <w:r>
+              <w:rPr>
+                <w:noProof/>
+                <w:webHidden/>
+              </w:rPr>
+            </w:r>
+            <w:r>
+              <w:rPr>
+                <w:noProof/>
+                <w:webHidden/>
+              </w:rPr>
+              <w:fldChar w:fldCharType="separate"/>
+            </w:r>
+            <w:r>
+              <w:rPr>
+                <w:noProof/>
+                <w:webHidden/>
+              </w:rPr>
+              <w:t>7</w:t>
+            </w:r>
+            <w:r>
+              <w:rPr>
+                <w:noProof/>
+                <w:webHidden/>
+              </w:rPr>
+              <w:fldChar w:fldCharType="end"/>
+            </w:r>
+          </w:hyperlink>
+        </w:p>
+        <w:p>
+          <w:pPr>
+            <w:pStyle w:val="TOC3"/>
+            <w:tabs>
+              <w:tab w:val="right" w:leader="dot" w:pos="9350"/>
+            </w:tabs>
+            <w:rPr>
+              <w:rFonts w:eastAsiaTheme="minorEastAsia"/>
+              <w:noProof/>
+              <w:lang w:val="en-US"/>
+            </w:rPr>
+          </w:pPr>
+          <w:hyperlink w:anchor="_Toc226310530" w:history="1">
+            <w:r>
+              <w:rPr>
+                <w:rStyle w:val="Hyperlink"/>
+                <w:noProof/>
+              </w:rPr>
+              <w:t>Notes on Dead Reckoning variables</w:t>
+            </w:r>
+            <w:r>
+              <w:rPr>
+                <w:noProof/>
+                <w:webHidden/>
+              </w:rPr>
+              <w:tab/>
+            </w:r>
+            <w:r>
+              <w:rPr>
+                <w:noProof/>
+                <w:webHidden/>
+              </w:rPr>
+              <w:fldChar w:fldCharType="begin"/>
+            </w:r>
+            <w:r>
+              <w:rPr>
+                <w:noProof/>
+                <w:webHidden/>
+              </w:rPr>
+              <w:instrText xml:space="preserve"> PAGEREF _Toc226310530 \h </w:instrText>
+            </w:r>
+            <w:r>
+              <w:rPr>
+                <w:noProof/>
+                <w:webHidden/>
+              </w:rPr>
+            </w:r>
+            <w:r>
+              <w:rPr>
+                <w:noProof/>
+                <w:webHidden/>
+              </w:rPr>
+              <w:fldChar w:fldCharType="separate"/>
+            </w:r>
+            <w:r>
+              <w:rPr>
+                <w:noProof/>
+                <w:webHidden/>
+              </w:rPr>
+              <w:t>8</w:t>
+            </w:r>
+            <w:r>
+              <w:rPr>
+                <w:noProof/>
+                <w:webHidden/>
+              </w:rPr>
+              <w:fldChar w:fldCharType="end"/>
+            </w:r>
+          </w:hyperlink>
+        </w:p>
+        <w:p>
+          <w:pPr>
+            <w:pBdr>
+              <w:bottom w:val="single" w:sz="12" w:space="1" w:color="auto"/>
+            </w:pBdr>
+          </w:pPr>
+          <w:r>
+            <w:rPr>
+              <w:b/>
+              <w:bCs/>
+              <w:noProof/>
+            </w:rPr>
+            <w:fldChar w:fldCharType="end"/>
+          </w:r>
+        </w:p>
+      </w:sdtContent>
+    </w:sdt>
     <w:p>
       <w:pPr>
         <w:pStyle w:val="Heading3"/>
@@ -45,12 +662,14 @@
           <w:rFonts w:cs="Arial"/>
         </w:rPr>
       </w:pPr>
+      <w:bookmarkStart w:id="0" w:name="_Toc226310523"/>
       <w:r>
         <w:rPr>
           <w:rFonts w:cs="Arial"/>
         </w:rPr>
         <w:t>18/03</w:t>
       </w:r>
+      <w:bookmarkEnd w:id="0"/>
     </w:p>
     <w:p>
       <w:pPr>
@@ -62,9 +681,33 @@
         <w:spacing w:line="276" w:lineRule="auto"/>
       </w:pPr>
       <w:r>
-        <w:t xml:space="preserve">Some history to this project is that I started it when guiding an undergraduate student through preliminary energy landscape analysis. During this time, we realized that the “perfectly time sychnonised” boards were, in fact, not time synchronised. ChrisC and I spent several weeks trying to align the board with the associated behavioural videos. That work is detailed in this googledoc: </w:t>
-      </w:r>
-      <w:hyperlink r:id="rId5" w:history="1">
+        <w:t xml:space="preserve">Some history to this project is that I started it when guiding an undergraduate student through preliminary energy landscape analysis. During this time, we realized that the “perfectly time </w:t>
+      </w:r>
+      <w:proofErr w:type="spellStart"/>
+      <w:r>
+        <w:t>sychnonised</w:t>
+      </w:r>
+      <w:proofErr w:type="spellEnd"/>
+      <w:r>
+        <w:t xml:space="preserve">” boards were, in fact, not time synchronised. </w:t>
+      </w:r>
+      <w:proofErr w:type="spellStart"/>
+      <w:r>
+        <w:t>ChrisC</w:t>
+      </w:r>
+      <w:proofErr w:type="spellEnd"/>
+      <w:r>
+        <w:t xml:space="preserve"> and I spent several weeks trying to align the board with the associated behavioural videos. That work is detailed in this </w:t>
+      </w:r>
+      <w:proofErr w:type="spellStart"/>
+      <w:r>
+        <w:t>googledoc</w:t>
+      </w:r>
+      <w:proofErr w:type="spellEnd"/>
+      <w:r>
+        <w:t xml:space="preserve">: </w:t>
+      </w:r>
+      <w:hyperlink r:id="rId6" w:history="1">
         <w:r>
           <w:rPr>
             <w:rStyle w:val="Hyperlink"/>
@@ -112,6 +755,7 @@
         <w:spacing w:line="276" w:lineRule="auto"/>
       </w:pPr>
       <w:r>
+        <w:lastRenderedPageBreak/>
         <w:t xml:space="preserve"> The cameras that were used for data collection all had different ways of encoding the times </w:t>
       </w:r>
       <w:r>
@@ -189,8 +833,15 @@
         <w:spacing w:line="276" w:lineRule="auto"/>
       </w:pPr>
       <w:r>
-        <w:lastRenderedPageBreak/>
-        <w:t xml:space="preserve">What this tells me is that my next most valuable endeavour is to figure out the alignment from Robin’s camera. Going to have a crack at that this arvo. </w:t>
+        <w:t xml:space="preserve">What this tells me is that my next most valuable endeavour is to figure out the alignment from Robin’s camera. Going to have a crack at that this </w:t>
+      </w:r>
+      <w:proofErr w:type="spellStart"/>
+      <w:r>
+        <w:t>arvo</w:t>
+      </w:r>
+      <w:proofErr w:type="spellEnd"/>
+      <w:r>
+        <w:t xml:space="preserve">. </w:t>
       </w:r>
       <w:r>
         <w:rPr>
@@ -231,12 +882,14 @@
           <w:rFonts w:cs="Arial"/>
         </w:rPr>
       </w:pPr>
+      <w:bookmarkStart w:id="1" w:name="_Toc226310524"/>
       <w:r>
         <w:rPr>
           <w:rFonts w:cs="Arial"/>
         </w:rPr>
         <w:t>19/03</w:t>
       </w:r>
+      <w:bookmarkEnd w:id="1"/>
     </w:p>
     <w:p>
       <w:pPr>
@@ -261,7 +914,15 @@
         <w:spacing w:line="276" w:lineRule="auto"/>
       </w:pPr>
       <w:r>
-        <w:t>Below is collar 8 video 2 as annotated by Amelia with the old system (looked correct to the video). Now I have to be able to replicate that with my new system.</w:t>
+        <w:t xml:space="preserve">Below is collar 8 video 2 as annotated by Amelia with the old system (looked correct to the video). Now I </w:t>
+      </w:r>
+      <w:proofErr w:type="gramStart"/>
+      <w:r>
+        <w:t>have to</w:t>
+      </w:r>
+      <w:proofErr w:type="gramEnd"/>
+      <w:r>
+        <w:t xml:space="preserve"> be able to replicate that with my new system.</w:t>
       </w:r>
     </w:p>
     <w:p>
@@ -287,7 +948,7 @@
                     </pic:cNvPicPr>
                   </pic:nvPicPr>
                   <pic:blipFill>
-                    <a:blip r:embed="rId6">
+                    <a:blip r:embed="rId7">
                       <a:extLst>
                         <a:ext uri="{28A0092B-C50C-407E-A947-70E740481C1C}">
                           <a14:useLocalDpi xmlns:a14="http://schemas.microsoft.com/office/drawing/2010/main" val="0"/>
@@ -329,7 +990,15 @@
         <w:spacing w:line="276" w:lineRule="auto"/>
       </w:pPr>
       <w:r>
-        <w:t>Which I was unable to do… Which means that, somewhere my new system is breaking. Which is actually a good sign… because the error is in my new code, not in the data (flow on implications for why the kangaroo stuff isn’t working).</w:t>
+        <w:t xml:space="preserve">Which I was unable to do… Which means that, somewhere my new system is breaking. Which is </w:t>
+      </w:r>
+      <w:proofErr w:type="gramStart"/>
+      <w:r>
+        <w:t>actually a</w:t>
+      </w:r>
+      <w:proofErr w:type="gramEnd"/>
+      <w:r>
+        <w:t xml:space="preserve"> good sign… because the error is in my new code, not in the data (flow on implications for why the kangaroo stuff isn’t working).</w:t>
       </w:r>
     </w:p>
     <w:p>
@@ -355,7 +1024,16 @@
         <w:spacing w:line="276" w:lineRule="auto"/>
       </w:pPr>
       <w:r>
-        <w:t>I reverted all my changes to the plotting method and got the same result. Therefore, either the video times are incorrect or the gps times are incorrect.</w:t>
+        <w:lastRenderedPageBreak/>
+        <w:t xml:space="preserve">I reverted all my changes to the plotting method and got the same result. Therefore, either the video times are incorrect or the </w:t>
+      </w:r>
+      <w:proofErr w:type="spellStart"/>
+      <w:r>
+        <w:t>gps</w:t>
+      </w:r>
+      <w:proofErr w:type="spellEnd"/>
+      <w:r>
+        <w:t xml:space="preserve"> times are incorrect.</w:t>
       </w:r>
     </w:p>
     <w:p>
@@ -368,7 +1046,15 @@
         <w:spacing w:line="276" w:lineRule="auto"/>
       </w:pPr>
       <w:r>
-        <w:t xml:space="preserve">I rechecked the video times and no joy. Therefore, I think the gps times are wrong. Going to revert all the work I did yesterday back to the original versions. </w:t>
+        <w:t xml:space="preserve">I rechecked the video times and no joy. Therefore, I think the </w:t>
+      </w:r>
+      <w:proofErr w:type="spellStart"/>
+      <w:r>
+        <w:t>gps</w:t>
+      </w:r>
+      <w:proofErr w:type="spellEnd"/>
+      <w:r>
+        <w:t xml:space="preserve"> times are wrong. Going to revert all the work I did yesterday back to the original versions. </w:t>
       </w:r>
     </w:p>
     <w:p>
@@ -384,7 +1070,15 @@
         <w:sym w:font="Wingdings" w:char="F0E0"/>
       </w:r>
       <w:r>
-        <w:t xml:space="preserve"> Note that the kangaroo data had a lot of error not encountered in the impala data (e.g., multiple board resets, skipped reads, incorrect GPS writes, etc). The fact that using the “cleaning code” I wrote for the kangies on the impala caused the impala to break indicates that there is something wrong with the cleaning code…</w:t>
+        <w:t xml:space="preserve"> Note that the kangaroo data had a lot of error not encountered in the impala data (e.g., multiple board resets, skipped reads, incorrect GPS writes, etc). The fact that using the “cleaning code” I wrote for the </w:t>
+      </w:r>
+      <w:proofErr w:type="spellStart"/>
+      <w:r>
+        <w:t>kangies</w:t>
+      </w:r>
+      <w:proofErr w:type="spellEnd"/>
+      <w:r>
+        <w:t xml:space="preserve"> on the impala caused the impala to break indicates that there is something wrong with the cleaning code…</w:t>
       </w:r>
     </w:p>
     <w:p>
@@ -397,7 +1091,15 @@
         <w:spacing w:line="276" w:lineRule="auto"/>
       </w:pPr>
       <w:r>
-        <w:t>Okay, I’m actually going to revert everything. Back to the very beginning and check differences along every step of the way. I created a branch from 5 months ago and will check every step along the way:</w:t>
+        <w:t xml:space="preserve">Okay, I’m </w:t>
+      </w:r>
+      <w:proofErr w:type="gramStart"/>
+      <w:r>
+        <w:t>actually going</w:t>
+      </w:r>
+      <w:proofErr w:type="gramEnd"/>
+      <w:r>
+        <w:t xml:space="preserve"> to revert everything. Back to the very beginning and check differences along every step of the way. I created a branch from 5 months ago and will check every step along the way:</w:t>
       </w:r>
     </w:p>
     <w:p>
@@ -410,7 +1112,6 @@
         <w:spacing w:line="276" w:lineRule="auto"/>
       </w:pPr>
       <w:r>
-        <w:lastRenderedPageBreak/>
         <w:t>GPS stitch:  The old version misses the first GPS point for some reason? Moved to the new version.</w:t>
       </w:r>
     </w:p>
@@ -424,8 +1125,13 @@
         <w:spacing w:line="276" w:lineRule="auto"/>
       </w:pPr>
       <w:r>
-        <w:t>Accel stitch: Exactly the same</w:t>
-      </w:r>
+        <w:t xml:space="preserve">Accel stitch: </w:t>
+      </w:r>
+      <w:proofErr w:type="gramStart"/>
+      <w:r>
+        <w:t>Exactly the same</w:t>
+      </w:r>
+      <w:proofErr w:type="gramEnd"/>
     </w:p>
     <w:p>
       <w:pPr>
@@ -437,7 +1143,15 @@
         <w:spacing w:line="276" w:lineRule="auto"/>
       </w:pPr>
       <w:r>
-        <w:t xml:space="preserve">Old method doesn’t account for the internal clock restarting on the accelerometer but when I more closely investigated, it does restart. There are duplicated values in the timestamps. </w:t>
+        <w:t xml:space="preserve">Old method doesn’t account for the internal clock restarting on the </w:t>
+      </w:r>
+      <w:proofErr w:type="gramStart"/>
+      <w:r>
+        <w:t>accelerometer</w:t>
+      </w:r>
+      <w:proofErr w:type="gramEnd"/>
+      <w:r>
+        <w:t xml:space="preserve"> but when I more closely investigated, it does restart. There are duplicated values in the timestamps. </w:t>
       </w:r>
       <w:r>
         <w:sym w:font="Wingdings" w:char="F0E0"/>
@@ -486,7 +1200,7 @@
                     </pic:cNvPicPr>
                   </pic:nvPicPr>
                   <pic:blipFill>
-                    <a:blip r:embed="rId7">
+                    <a:blip r:embed="rId8">
                       <a:extLst>
                         <a:ext uri="{28A0092B-C50C-407E-A947-70E740481C1C}">
                           <a14:useLocalDpi xmlns:a14="http://schemas.microsoft.com/office/drawing/2010/main" val="0"/>
@@ -528,8 +1242,13 @@
         <w:spacing w:line="276" w:lineRule="auto"/>
       </w:pPr>
       <w:r>
-        <w:t>Reordered the dataset by the reset events and then removed the misreads where there was an uneven increment between the internal and external times on the gps_board</w:t>
-      </w:r>
+        <w:t xml:space="preserve">Reordered the dataset by the reset events and then removed the misreads where there was an uneven increment between the internal and external times on the </w:t>
+      </w:r>
+      <w:proofErr w:type="spellStart"/>
+      <w:r>
+        <w:t>gps_board</w:t>
+      </w:r>
+      <w:proofErr w:type="spellEnd"/>
     </w:p>
     <w:p>
       <w:pPr>
@@ -538,12 +1257,14 @@
           <w:rFonts w:cs="Arial"/>
         </w:rPr>
       </w:pPr>
+      <w:bookmarkStart w:id="2" w:name="_Toc226310525"/>
       <w:r>
         <w:rPr>
           <w:rFonts w:cs="Arial"/>
         </w:rPr>
         <w:t>30/03</w:t>
       </w:r>
+      <w:bookmarkEnd w:id="2"/>
     </w:p>
     <w:p>
       <w:pPr>
@@ -581,7 +1302,15 @@
         <w:spacing w:line="276" w:lineRule="auto"/>
       </w:pPr>
       <w:r>
-        <w:t>Below confirmed that the gps timestamps stay the same after writing and reading but also converted everything to numeric to be safe.</w:t>
+        <w:t xml:space="preserve">Below confirmed that the </w:t>
+      </w:r>
+      <w:proofErr w:type="spellStart"/>
+      <w:r>
+        <w:t>gps</w:t>
+      </w:r>
+      <w:proofErr w:type="spellEnd"/>
+      <w:r>
+        <w:t xml:space="preserve"> timestamps stay the same after writing and reading but also converted everything to numeric to be safe.</w:t>
       </w:r>
     </w:p>
     <w:p>
@@ -593,6 +1322,7 @@
         <w:rPr>
           <w:noProof/>
         </w:rPr>
+        <w:lastRenderedPageBreak/>
         <w:drawing>
           <wp:inline distT="0" distB="0" distL="0" distR="0" wp14:anchorId="4624871F" wp14:editId="1CFCFF8E">
             <wp:extent cx="2152650" cy="1266825"/>
@@ -611,7 +1341,7 @@
                     </pic:cNvPicPr>
                   </pic:nvPicPr>
                   <pic:blipFill>
-                    <a:blip r:embed="rId8">
+                    <a:blip r:embed="rId9">
                       <a:extLst>
                         <a:ext uri="{28A0092B-C50C-407E-A947-70E740481C1C}">
                           <a14:useLocalDpi xmlns:a14="http://schemas.microsoft.com/office/drawing/2010/main" val="0"/>
@@ -683,7 +1413,7 @@
                     </pic:cNvPicPr>
                   </pic:nvPicPr>
                   <pic:blipFill>
-                    <a:blip r:embed="rId9" cstate="print">
+                    <a:blip r:embed="rId10" cstate="print">
                       <a:extLst>
                         <a:ext uri="{28A0092B-C50C-407E-A947-70E740481C1C}">
                           <a14:useLocalDpi xmlns:a14="http://schemas.microsoft.com/office/drawing/2010/main" val="0"/>
@@ -725,7 +1455,6 @@
         <w:spacing w:line="276" w:lineRule="auto"/>
       </w:pPr>
       <w:r>
-        <w:lastRenderedPageBreak/>
         <w:t>This immediately showed where the interpolation error came from because all the error arose before the sampling even began (began on 28</w:t>
       </w:r>
       <w:r>
@@ -757,7 +1486,23 @@
         <w:spacing w:line="276" w:lineRule="auto"/>
       </w:pPr>
       <w:r>
-        <w:t>But somehow they are then getting back mixed together after I combine the accel and gps?</w:t>
+        <w:t xml:space="preserve">But </w:t>
+      </w:r>
+      <w:proofErr w:type="gramStart"/>
+      <w:r>
+        <w:t>somehow</w:t>
+      </w:r>
+      <w:proofErr w:type="gramEnd"/>
+      <w:r>
+        <w:t xml:space="preserve"> they are then getting back mixed together after I combine the accel and </w:t>
+      </w:r>
+      <w:proofErr w:type="spellStart"/>
+      <w:r>
+        <w:t>gps</w:t>
+      </w:r>
+      <w:proofErr w:type="spellEnd"/>
+      <w:r>
+        <w:t>?</w:t>
       </w:r>
     </w:p>
     <w:p>
@@ -796,7 +1541,7 @@
                     </pic:cNvPicPr>
                   </pic:nvPicPr>
                   <pic:blipFill>
-                    <a:blip r:embed="rId10" cstate="print">
+                    <a:blip r:embed="rId11" cstate="print">
                       <a:extLst>
                         <a:ext uri="{28A0092B-C50C-407E-A947-70E740481C1C}">
                           <a14:useLocalDpi xmlns:a14="http://schemas.microsoft.com/office/drawing/2010/main" val="0"/>
@@ -849,7 +1594,7 @@
                     </pic:cNvPicPr>
                   </pic:nvPicPr>
                   <pic:blipFill>
-                    <a:blip r:embed="rId11" cstate="print">
+                    <a:blip r:embed="rId12" cstate="print">
                       <a:extLst>
                         <a:ext uri="{28A0092B-C50C-407E-A947-70E740481C1C}">
                           <a14:useLocalDpi xmlns:a14="http://schemas.microsoft.com/office/drawing/2010/main" val="0"/>
@@ -915,6 +1660,7 @@
         <w:rPr>
           <w:noProof/>
         </w:rPr>
+        <w:lastRenderedPageBreak/>
         <w:drawing>
           <wp:inline distT="0" distB="0" distL="0" distR="0" wp14:anchorId="1AB86143" wp14:editId="78FAF1A0">
             <wp:extent cx="5943600" cy="2762250"/>
@@ -933,7 +1679,7 @@
                     </pic:cNvPicPr>
                   </pic:nvPicPr>
                   <pic:blipFill>
-                    <a:blip r:embed="rId12">
+                    <a:blip r:embed="rId13">
                       <a:extLst>
                         <a:ext uri="{28A0092B-C50C-407E-A947-70E740481C1C}">
                           <a14:useLocalDpi xmlns:a14="http://schemas.microsoft.com/office/drawing/2010/main" val="0"/>
@@ -991,12 +1737,14 @@
           <w:rFonts w:cs="Arial"/>
         </w:rPr>
       </w:pPr>
+      <w:bookmarkStart w:id="3" w:name="_Toc226310526"/>
       <w:r>
         <w:rPr>
           <w:rFonts w:cs="Arial"/>
         </w:rPr>
         <w:t>31/03</w:t>
       </w:r>
+      <w:bookmarkEnd w:id="3"/>
     </w:p>
     <w:p>
       <w:pPr>
@@ -1021,7 +1769,23 @@
         <w:spacing w:line="276" w:lineRule="auto"/>
       </w:pPr>
       <w:r>
-        <w:t xml:space="preserve">Wait. Wait. It seems like it might already be aligned? If you watch a video a sufficient number of times, you can gaslight yourself into literally anything. (Robin Vid </w:t>
+        <w:t xml:space="preserve">Wait. Wait. It seems like it might already be </w:t>
+      </w:r>
+      <w:proofErr w:type="gramStart"/>
+      <w:r>
+        <w:t>aligned?</w:t>
+      </w:r>
+      <w:proofErr w:type="gramEnd"/>
+      <w:r>
+        <w:t xml:space="preserve"> If you watch a video </w:t>
+      </w:r>
+      <w:proofErr w:type="gramStart"/>
+      <w:r>
+        <w:t>a sufficient number of</w:t>
+      </w:r>
+      <w:proofErr w:type="gramEnd"/>
+      <w:r>
+        <w:t xml:space="preserve"> times, you can gaslight yourself into literally anything. (Robin Vid </w:t>
       </w:r>
       <w:r>
         <w:t>8</w:t>
@@ -1064,7 +1828,6 @@
         <w:rPr>
           <w:highlight w:val="yellow"/>
         </w:rPr>
-        <w:lastRenderedPageBreak/>
         <w:t>Noticed that the drone is aligning when I think both the drone and the board are in UTC time. Does this mean that the drone is in UTC (not the assumption I made for the kangaroo data, or that the board is in local time??)</w:t>
       </w:r>
     </w:p>
@@ -1078,7 +1841,15 @@
         <w:spacing w:line="276" w:lineRule="auto"/>
       </w:pPr>
       <w:r>
-        <w:t>Amazing! So it was aligned and Amelia did a tonne of work on it.</w:t>
+        <w:t xml:space="preserve">Amazing! </w:t>
+      </w:r>
+      <w:proofErr w:type="gramStart"/>
+      <w:r>
+        <w:t>So</w:t>
+      </w:r>
+      <w:proofErr w:type="gramEnd"/>
+      <w:r>
+        <w:t xml:space="preserve"> it was aligned and Amelia did a tonne of work on it.</w:t>
       </w:r>
     </w:p>
     <w:p>
@@ -1088,6 +1859,7 @@
           <w:rFonts w:cs="Arial"/>
         </w:rPr>
       </w:pPr>
+      <w:bookmarkStart w:id="4" w:name="_Toc226310527"/>
       <w:r>
         <w:rPr>
           <w:rFonts w:cs="Arial"/>
@@ -1100,6 +1872,7 @@
         </w:rPr>
         <w:t>1/04</w:t>
       </w:r>
+      <w:bookmarkEnd w:id="4"/>
     </w:p>
     <w:p>
       <w:pPr>
@@ -1112,7 +1885,7 @@
       <w:r>
         <w:t>I quickly wrote up an instructions doc for how to do the alignment (</w:t>
       </w:r>
-      <w:hyperlink r:id="rId13" w:history="1">
+      <w:hyperlink r:id="rId14" w:history="1">
         <w:r>
           <w:rPr>
             <w:rStyle w:val="Hyperlink"/>
@@ -1123,7 +1896,7 @@
       <w:r>
         <w:t>). Now doing one for sanity checking (</w:t>
       </w:r>
-      <w:hyperlink r:id="rId14" w:history="1">
+      <w:hyperlink r:id="rId15" w:history="1">
         <w:r>
           <w:rPr>
             <w:rStyle w:val="Hyperlink"/>
@@ -1167,6 +1940,7 @@
         <w:rPr>
           <w:noProof/>
         </w:rPr>
+        <w:lastRenderedPageBreak/>
         <w:drawing>
           <wp:inline distT="0" distB="0" distL="0" distR="0" wp14:anchorId="0CD36A4C" wp14:editId="704F104C">
             <wp:extent cx="4035972" cy="2120987"/>
@@ -1185,7 +1959,7 @@
                     </pic:cNvPicPr>
                   </pic:nvPicPr>
                   <pic:blipFill>
-                    <a:blip r:embed="rId15" cstate="print">
+                    <a:blip r:embed="rId16" cstate="print">
                       <a:extLst>
                         <a:ext uri="{28A0092B-C50C-407E-A947-70E740481C1C}">
                           <a14:useLocalDpi xmlns:a14="http://schemas.microsoft.com/office/drawing/2010/main" val="0"/>
@@ -1237,7 +2011,7 @@
                     </pic:cNvPicPr>
                   </pic:nvPicPr>
                   <pic:blipFill>
-                    <a:blip r:embed="rId16" cstate="print">
+                    <a:blip r:embed="rId17" cstate="print">
                       <a:extLst>
                         <a:ext uri="{28A0092B-C50C-407E-A947-70E740481C1C}">
                           <a14:useLocalDpi xmlns:a14="http://schemas.microsoft.com/office/drawing/2010/main" val="0"/>
@@ -1273,11 +2047,11 @@
           <w:rFonts w:cs="Arial"/>
         </w:rPr>
       </w:pPr>
+      <w:bookmarkStart w:id="5" w:name="_Toc226310528"/>
       <w:r>
         <w:rPr>
           <w:rFonts w:cs="Arial"/>
         </w:rPr>
-        <w:lastRenderedPageBreak/>
         <w:t>0</w:t>
       </w:r>
       <w:r>
@@ -1292,6 +2066,7 @@
         </w:rPr>
         <w:t>/04</w:t>
       </w:r>
+      <w:bookmarkEnd w:id="5"/>
     </w:p>
     <w:p>
       <w:pPr>
@@ -1384,9 +2159,11 @@
             <w:tcW w:w="2690" w:type="dxa"/>
           </w:tcPr>
           <w:p>
+            <w:proofErr w:type="spellStart"/>
             <w:r>
               <w:t>Foraging_Walking</w:t>
             </w:r>
+            <w:proofErr w:type="spellEnd"/>
           </w:p>
         </w:tc>
         <w:tc>
@@ -1532,9 +2309,11 @@
             <w:tcW w:w="2690" w:type="dxa"/>
           </w:tcPr>
           <w:p>
+            <w:proofErr w:type="spellStart"/>
             <w:r>
               <w:t>Grazing_Head_Down</w:t>
             </w:r>
+            <w:proofErr w:type="spellEnd"/>
           </w:p>
         </w:tc>
         <w:tc>
@@ -1620,9 +2399,11 @@
             <w:tcW w:w="2690" w:type="dxa"/>
           </w:tcPr>
           <w:p>
+            <w:proofErr w:type="spellStart"/>
             <w:r>
               <w:t>Rapid_Head_Movement</w:t>
             </w:r>
+            <w:proofErr w:type="spellEnd"/>
           </w:p>
         </w:tc>
         <w:tc>
@@ -1744,9 +2525,12 @@
             <w:tcW w:w="2690" w:type="dxa"/>
           </w:tcPr>
           <w:p>
-            <w:r>
+            <w:proofErr w:type="spellStart"/>
+            <w:r>
+              <w:lastRenderedPageBreak/>
               <w:t>Head_Shake</w:t>
             </w:r>
+            <w:proofErr w:type="spellEnd"/>
           </w:p>
         </w:tc>
         <w:tc>
@@ -1754,9 +2538,11 @@
             <w:tcW w:w="2250" w:type="dxa"/>
           </w:tcPr>
           <w:p>
+            <w:proofErr w:type="spellStart"/>
             <w:r>
               <w:t>Head_Shake</w:t>
             </w:r>
+            <w:proofErr w:type="spellEnd"/>
           </w:p>
         </w:tc>
         <w:tc>
@@ -1776,9 +2562,11 @@
             <w:tcW w:w="2690" w:type="dxa"/>
           </w:tcPr>
           <w:p>
+            <w:proofErr w:type="spellStart"/>
             <w:r>
               <w:t>Grazing_Head_Up</w:t>
             </w:r>
+            <w:proofErr w:type="spellEnd"/>
           </w:p>
         </w:tc>
         <w:tc>
@@ -1892,9 +2680,11 @@
             <w:tcW w:w="2690" w:type="dxa"/>
           </w:tcPr>
           <w:p>
+            <w:proofErr w:type="spellStart"/>
             <w:r>
               <w:t>Lowering_Head</w:t>
             </w:r>
+            <w:proofErr w:type="spellEnd"/>
           </w:p>
         </w:tc>
         <w:tc>
@@ -1988,9 +2778,11 @@
             <w:tcW w:w="2690" w:type="dxa"/>
           </w:tcPr>
           <w:p>
+            <w:proofErr w:type="spellStart"/>
             <w:r>
               <w:t>Raising_Head</w:t>
             </w:r>
+            <w:proofErr w:type="spellEnd"/>
           </w:p>
         </w:tc>
         <w:tc>
@@ -2042,72 +2834,1685 @@
         </w:numPr>
       </w:pPr>
       <w:r>
-        <w:t>I’m messing around with a small shiny app for cleaning up the data now. In theory, it will load in each Activity and then you clean any outliers out of the system.</w:t>
-      </w:r>
-      <w:r>
-        <w:t xml:space="preserve"> Unsure where best to put it in the workflow. Might put it directly after the generation of the labelled data csv.</w:t>
+        <w:t xml:space="preserve">I’m messing around with a small shiny app for cleaning up the data now. In theory, it will load in each Activity and then you clean any outliers out of the system. Unsure where best to put it in the workflow. Might put it directly after the generation of the labelled data csv. </w:t>
+      </w:r>
+    </w:p>
+    <w:p>
+      <w:pPr>
+        <w:pStyle w:val="ListParagraph"/>
+        <w:numPr>
+          <w:ilvl w:val="1"/>
+          <w:numId w:val="2"/>
+        </w:numPr>
+      </w:pPr>
+      <w:r>
+        <w:sym w:font="Wingdings" w:char="F0E0"/>
+      </w:r>
+      <w:r>
+        <w:t xml:space="preserve"> am </w:t>
+      </w:r>
+      <w:proofErr w:type="gramStart"/>
+      <w:r>
+        <w:t>actually now</w:t>
+      </w:r>
+      <w:proofErr w:type="gramEnd"/>
+      <w:r>
+        <w:t xml:space="preserve"> editing the </w:t>
+      </w:r>
+      <w:proofErr w:type="spellStart"/>
+      <w:r>
+        <w:t>matlab</w:t>
+      </w:r>
+      <w:proofErr w:type="spellEnd"/>
+      <w:r>
+        <w:t xml:space="preserve"> to be able to read annotations if they exist, and then you can override to 0 if </w:t>
+      </w:r>
+      <w:proofErr w:type="spellStart"/>
+      <w:proofErr w:type="gramStart"/>
+      <w:r>
+        <w:t>its</w:t>
+      </w:r>
+      <w:proofErr w:type="spellEnd"/>
+      <w:proofErr w:type="gramEnd"/>
+      <w:r>
+        <w:t xml:space="preserve"> an error</w:t>
+      </w:r>
+    </w:p>
+    <w:p>
+      <w:pPr>
+        <w:pStyle w:val="ListParagraph"/>
+        <w:numPr>
+          <w:ilvl w:val="1"/>
+          <w:numId w:val="2"/>
+        </w:numPr>
+      </w:pPr>
+      <w:r>
+        <w:t>This is more work than I bargained for. Ugh.</w:t>
+      </w:r>
+    </w:p>
+    <w:p>
+      <w:pPr>
+        <w:pStyle w:val="ListParagraph"/>
+        <w:numPr>
+          <w:ilvl w:val="1"/>
+          <w:numId w:val="2"/>
+        </w:numPr>
+      </w:pPr>
+      <w:r>
+        <w:t>120 minutes later, I completed it.</w:t>
+      </w:r>
+    </w:p>
+    <w:p>
+      <w:pPr>
+        <w:pStyle w:val="ListParagraph"/>
+        <w:numPr>
+          <w:ilvl w:val="1"/>
+          <w:numId w:val="2"/>
+        </w:numPr>
+      </w:pPr>
+      <w:r>
+        <w:t xml:space="preserve">Now to go through and clean all the data… Well, I’ll have to redo it when there’s more data, so this was more just to prove the concept </w:t>
+      </w:r>
+      <w:proofErr w:type="spellStart"/>
+      <w:r>
+        <w:t>tbh</w:t>
+      </w:r>
+      <w:proofErr w:type="spellEnd"/>
+      <w:r>
+        <w:t>.</w:t>
+      </w:r>
+    </w:p>
+    <w:p>
+      <w:pPr>
+        <w:pStyle w:val="Heading3"/>
+        <w:rPr>
+          <w:rFonts w:cs="Arial"/>
+        </w:rPr>
+      </w:pPr>
+      <w:bookmarkStart w:id="6" w:name="_Toc226310529"/>
+      <w:r>
+        <w:rPr>
+          <w:rFonts w:cs="Arial"/>
+        </w:rPr>
+        <w:t>0</w:t>
+      </w:r>
+      <w:r>
+        <w:rPr>
+          <w:rFonts w:cs="Arial"/>
+        </w:rPr>
+        <w:t>5</w:t>
+      </w:r>
+      <w:r>
+        <w:rPr>
+          <w:rFonts w:cs="Arial"/>
+        </w:rPr>
+        <w:t>/04</w:t>
+      </w:r>
+      <w:bookmarkEnd w:id="6"/>
+    </w:p>
+    <w:p>
+      <w:pPr>
+        <w:pStyle w:val="ListParagraph"/>
+        <w:numPr>
+          <w:ilvl w:val="0"/>
+          <w:numId w:val="2"/>
+        </w:numPr>
+      </w:pPr>
+      <w:r>
+        <w:t xml:space="preserve">I have decided I want to lock in and finish this paper before I leave for Germany. </w:t>
+      </w:r>
+    </w:p>
+    <w:p>
+      <w:pPr>
+        <w:pStyle w:val="ListParagraph"/>
+        <w:numPr>
+          <w:ilvl w:val="0"/>
+          <w:numId w:val="2"/>
+        </w:numPr>
+      </w:pPr>
+      <w:r>
+        <w:t xml:space="preserve">I feel </w:t>
+      </w:r>
+      <w:proofErr w:type="gramStart"/>
+      <w:r>
+        <w:t>really unwell</w:t>
+      </w:r>
+      <w:proofErr w:type="gramEnd"/>
+      <w:r>
+        <w:t xml:space="preserve"> but trying to do a little of this before I go to sleep. Trying to get the dead reckoning script set up for Ethan to work on in a fortnight.</w:t>
+      </w:r>
+    </w:p>
+    <w:p>
+      <w:pPr>
+        <w:pStyle w:val="ListParagraph"/>
+        <w:numPr>
+          <w:ilvl w:val="0"/>
+          <w:numId w:val="2"/>
+        </w:numPr>
+        <w:rPr>
+          <w:highlight w:val="yellow"/>
+        </w:rPr>
+      </w:pPr>
+      <w:r>
+        <w:rPr>
+          <w:highlight w:val="yellow"/>
+        </w:rPr>
+        <w:t xml:space="preserve">Quite quickly hit a problem where the calibration event occurred before the first reset, so wasn’t saved </w:t>
+      </w:r>
+      <w:r>
+        <w:rPr>
+          <mc:AlternateContent>
+            <mc:Choice Requires="w16se"/>
+            <mc:Fallback>
+              <w:rFonts w:ascii="Segoe UI Emoji" w:eastAsia="Segoe UI Emoji" w:hAnsi="Segoe UI Emoji" w:cs="Segoe UI Emoji"/>
+            </mc:Fallback>
+          </mc:AlternateContent>
+          <w:highlight w:val="yellow"/>
+        </w:rPr>
+        <mc:AlternateContent>
+          <mc:Choice Requires="w16se">
+            <w16se:symEx w16se:font="Segoe UI Emoji" w16se:char="2639"/>
+          </mc:Choice>
+          <mc:Fallback>
+            <w:t>☹</w:t>
+          </mc:Fallback>
+        </mc:AlternateContent>
+      </w:r>
+      <w:r>
+        <w:rPr>
+          <w:highlight w:val="yellow"/>
+        </w:rPr>
+        <w:t>Unreal. How am I going to extract that if I don’t know the right time</w:t>
+      </w:r>
+      <w:r>
+        <w:rPr>
+          <w:highlight w:val="yellow"/>
+        </w:rPr>
+        <w:t>??</w:t>
+      </w:r>
+    </w:p>
+    <w:p>
+      <w:pPr>
+        <w:pStyle w:val="ListParagraph"/>
+        <w:numPr>
+          <w:ilvl w:val="0"/>
+          <w:numId w:val="2"/>
+        </w:numPr>
+      </w:pPr>
+      <w:r>
+        <w:t>Went and got the chunk from last time I did this (before proper alignment) so I can keep working for now.</w:t>
+      </w:r>
+    </w:p>
+    <w:p>
+      <w:pPr>
+        <w:pStyle w:val="ListParagraph"/>
+        <w:numPr>
+          <w:ilvl w:val="0"/>
+          <w:numId w:val="2"/>
+        </w:numPr>
+      </w:pPr>
+      <w:r>
+        <w:t>This is a segment from day 3 (collar 8). This is even the smoothed value… Clearly not cleaned enough. Need to clean all the data before I calculate any computations on it otherwise it will be totally out…</w:t>
+      </w:r>
+    </w:p>
+    <w:p>
+      <w:pPr>
+        <w:pStyle w:val="ListParagraph"/>
+      </w:pPr>
+      <w:r>
+        <w:rPr>
+          <w:noProof/>
+        </w:rPr>
+        <w:lastRenderedPageBreak/>
+        <w:drawing>
+          <wp:inline distT="0" distB="0" distL="0" distR="0" wp14:anchorId="26A2EFD0" wp14:editId="4E5FFCCF">
+            <wp:extent cx="4819650" cy="2095500"/>
+            <wp:effectExtent l="0" t="0" r="0" b="0"/>
+            <wp:docPr id="1415080213" name="Picture 6"/>
+            <wp:cNvGraphicFramePr>
+              <a:graphicFrameLocks xmlns:a="http://schemas.openxmlformats.org/drawingml/2006/main" noChangeAspect="1"/>
+            </wp:cNvGraphicFramePr>
+            <a:graphic xmlns:a="http://schemas.openxmlformats.org/drawingml/2006/main">
+              <a:graphicData uri="http://schemas.openxmlformats.org/drawingml/2006/picture">
+                <pic:pic xmlns:pic="http://schemas.openxmlformats.org/drawingml/2006/picture">
+                  <pic:nvPicPr>
+                    <pic:cNvPr id="0" name="Picture 4"/>
+                    <pic:cNvPicPr>
+                      <a:picLocks noChangeAspect="1" noChangeArrowheads="1"/>
+                    </pic:cNvPicPr>
+                  </pic:nvPicPr>
+                  <pic:blipFill>
+                    <a:blip r:embed="rId18">
+                      <a:extLst>
+                        <a:ext uri="{28A0092B-C50C-407E-A947-70E740481C1C}">
+                          <a14:useLocalDpi xmlns:a14="http://schemas.microsoft.com/office/drawing/2010/main" val="0"/>
+                        </a:ext>
+                      </a:extLst>
+                    </a:blip>
+                    <a:srcRect/>
+                    <a:stretch>
+                      <a:fillRect/>
+                    </a:stretch>
+                  </pic:blipFill>
+                  <pic:spPr bwMode="auto">
+                    <a:xfrm>
+                      <a:off x="0" y="0"/>
+                      <a:ext cx="4822033" cy="2096536"/>
+                    </a:xfrm>
+                    <a:prstGeom prst="rect">
+                      <a:avLst/>
+                    </a:prstGeom>
+                    <a:noFill/>
+                  </pic:spPr>
+                </pic:pic>
+              </a:graphicData>
+            </a:graphic>
+          </wp:inline>
+        </w:drawing>
+      </w:r>
+    </w:p>
+    <w:p>
+      <w:pPr>
+        <w:pStyle w:val="ListParagraph"/>
+        <w:numPr>
+          <w:ilvl w:val="0"/>
+          <w:numId w:val="2"/>
+        </w:numPr>
+      </w:pPr>
+      <w:r>
+        <w:t xml:space="preserve">In the meantime, I just did a Z score normalisation so I can plot them all on the same axes. The below image is what I </w:t>
+      </w:r>
+      <w:proofErr w:type="gramStart"/>
+      <w:r>
+        <w:t>have to</w:t>
+      </w:r>
+      <w:proofErr w:type="gramEnd"/>
+      <w:r>
+        <w:t xml:space="preserve"> use to figure out the orientation of the collar.</w:t>
+      </w:r>
+    </w:p>
+    <w:p>
+      <w:pPr>
+        <w:pStyle w:val="NormalWeb"/>
+        <w:ind w:left="360"/>
+      </w:pPr>
+      <w:r>
+        <w:rPr>
+          <w:noProof/>
+        </w:rPr>
+        <w:drawing>
+          <wp:inline distT="0" distB="0" distL="0" distR="0" wp14:anchorId="3FA77936" wp14:editId="31A9E172">
+            <wp:extent cx="3213430" cy="1397143"/>
+            <wp:effectExtent l="0" t="0" r="6350" b="0"/>
+            <wp:docPr id="301934781" name="Picture 12"/>
+            <wp:cNvGraphicFramePr>
+              <a:graphicFrameLocks xmlns:a="http://schemas.openxmlformats.org/drawingml/2006/main" noChangeAspect="1"/>
+            </wp:cNvGraphicFramePr>
+            <a:graphic xmlns:a="http://schemas.openxmlformats.org/drawingml/2006/main">
+              <a:graphicData uri="http://schemas.openxmlformats.org/drawingml/2006/picture">
+                <pic:pic xmlns:pic="http://schemas.openxmlformats.org/drawingml/2006/picture">
+                  <pic:nvPicPr>
+                    <pic:cNvPr id="0" name="Picture 5"/>
+                    <pic:cNvPicPr>
+                      <a:picLocks noChangeAspect="1" noChangeArrowheads="1"/>
+                    </pic:cNvPicPr>
+                  </pic:nvPicPr>
+                  <pic:blipFill>
+                    <a:blip r:embed="rId19">
+                      <a:extLst>
+                        <a:ext uri="{28A0092B-C50C-407E-A947-70E740481C1C}">
+                          <a14:useLocalDpi xmlns:a14="http://schemas.microsoft.com/office/drawing/2010/main" val="0"/>
+                        </a:ext>
+                      </a:extLst>
+                    </a:blip>
+                    <a:srcRect/>
+                    <a:stretch>
+                      <a:fillRect/>
+                    </a:stretch>
+                  </pic:blipFill>
+                  <pic:spPr bwMode="auto">
+                    <a:xfrm>
+                      <a:off x="0" y="0"/>
+                      <a:ext cx="3227947" cy="1403455"/>
+                    </a:xfrm>
+                    <a:prstGeom prst="rect">
+                      <a:avLst/>
+                    </a:prstGeom>
+                    <a:noFill/>
+                  </pic:spPr>
+                </pic:pic>
+              </a:graphicData>
+            </a:graphic>
+          </wp:inline>
+        </w:drawing>
+      </w:r>
+    </w:p>
+    <w:tbl>
+      <w:tblPr>
+        <w:tblStyle w:val="TableGridLight"/>
+        <w:tblW w:w="0" w:type="auto"/>
+        <w:tblLayout w:type="fixed"/>
+        <w:tblLook w:val="0000" w:firstRow="0" w:lastRow="0" w:firstColumn="0" w:lastColumn="0" w:noHBand="0" w:noVBand="0"/>
+      </w:tblPr>
+      <w:tblGrid>
+        <w:gridCol w:w="1615"/>
+        <w:gridCol w:w="1115"/>
+      </w:tblGrid>
+      <w:tr>
+        <w:trPr>
+          <w:trHeight w:val="305"/>
+        </w:trPr>
+        <w:tc>
+          <w:tcPr>
+            <w:tcW w:w="1615" w:type="dxa"/>
+          </w:tcPr>
+          <w:p>
+            <w:pPr>
+              <w:autoSpaceDE w:val="0"/>
+              <w:autoSpaceDN w:val="0"/>
+              <w:adjustRightInd w:val="0"/>
+              <w:spacing w:line="240" w:lineRule="auto"/>
+              <w:rPr>
+                <w:rFonts w:ascii="Aptos Narrow" w:hAnsi="Aptos Narrow" w:cs="Aptos Narrow"/>
+                <w:color w:val="000000"/>
+                <w:kern w:val="0"/>
+                <w:sz w:val="22"/>
+                <w:szCs w:val="22"/>
+                <w:lang w:val="en-US"/>
+              </w:rPr>
+            </w:pPr>
+            <w:r>
+              <w:rPr>
+                <w:rFonts w:ascii="Aptos Narrow" w:hAnsi="Aptos Narrow" w:cs="Aptos Narrow"/>
+                <w:color w:val="000000"/>
+                <w:kern w:val="0"/>
+                <w:sz w:val="22"/>
+                <w:szCs w:val="22"/>
+                <w:lang w:val="en-US"/>
+              </w:rPr>
+              <w:t>series</w:t>
+            </w:r>
+          </w:p>
+        </w:tc>
+        <w:tc>
+          <w:tcPr>
+            <w:tcW w:w="1115" w:type="dxa"/>
+          </w:tcPr>
+          <w:p>
+            <w:pPr>
+              <w:autoSpaceDE w:val="0"/>
+              <w:autoSpaceDN w:val="0"/>
+              <w:adjustRightInd w:val="0"/>
+              <w:spacing w:line="240" w:lineRule="auto"/>
+              <w:rPr>
+                <w:rFonts w:ascii="Aptos Narrow" w:hAnsi="Aptos Narrow" w:cs="Aptos Narrow"/>
+                <w:color w:val="000000"/>
+                <w:kern w:val="0"/>
+                <w:sz w:val="22"/>
+                <w:szCs w:val="22"/>
+                <w:lang w:val="en-US"/>
+              </w:rPr>
+            </w:pPr>
+            <w:r>
+              <w:rPr>
+                <w:rFonts w:ascii="Aptos Narrow" w:hAnsi="Aptos Narrow" w:cs="Aptos Narrow"/>
+                <w:color w:val="000000"/>
+                <w:kern w:val="0"/>
+                <w:sz w:val="22"/>
+                <w:szCs w:val="22"/>
+                <w:lang w:val="en-US"/>
+              </w:rPr>
+              <w:t>mean</w:t>
+            </w:r>
+          </w:p>
+        </w:tc>
+      </w:tr>
+      <w:tr>
+        <w:trPr>
+          <w:trHeight w:val="305"/>
+        </w:trPr>
+        <w:tc>
+          <w:tcPr>
+            <w:tcW w:w="1615" w:type="dxa"/>
+          </w:tcPr>
+          <w:p>
+            <w:pPr>
+              <w:autoSpaceDE w:val="0"/>
+              <w:autoSpaceDN w:val="0"/>
+              <w:adjustRightInd w:val="0"/>
+              <w:spacing w:line="240" w:lineRule="auto"/>
+              <w:rPr>
+                <w:rFonts w:ascii="Aptos Narrow" w:hAnsi="Aptos Narrow" w:cs="Aptos Narrow"/>
+                <w:color w:val="000000"/>
+                <w:kern w:val="0"/>
+                <w:sz w:val="22"/>
+                <w:szCs w:val="22"/>
+                <w:lang w:val="en-US"/>
+              </w:rPr>
+            </w:pPr>
+            <w:r>
+              <w:rPr>
+                <w:rFonts w:ascii="Aptos Narrow" w:hAnsi="Aptos Narrow" w:cs="Aptos Narrow"/>
+                <w:color w:val="000000"/>
+                <w:kern w:val="0"/>
+                <w:sz w:val="22"/>
+                <w:szCs w:val="22"/>
+                <w:lang w:val="en-US"/>
+              </w:rPr>
+              <w:t>RawAX.sm</w:t>
+            </w:r>
+          </w:p>
+        </w:tc>
+        <w:tc>
+          <w:tcPr>
+            <w:tcW w:w="1115" w:type="dxa"/>
+          </w:tcPr>
+          <w:p>
+            <w:pPr>
+              <w:autoSpaceDE w:val="0"/>
+              <w:autoSpaceDN w:val="0"/>
+              <w:adjustRightInd w:val="0"/>
+              <w:spacing w:line="240" w:lineRule="auto"/>
+              <w:jc w:val="right"/>
+              <w:rPr>
+                <w:rFonts w:ascii="Aptos Narrow" w:hAnsi="Aptos Narrow" w:cs="Aptos Narrow"/>
+                <w:color w:val="000000"/>
+                <w:kern w:val="0"/>
+                <w:sz w:val="22"/>
+                <w:szCs w:val="22"/>
+                <w:lang w:val="en-US"/>
+              </w:rPr>
+            </w:pPr>
+            <w:r>
+              <w:rPr>
+                <w:rFonts w:ascii="Aptos Narrow" w:hAnsi="Aptos Narrow" w:cs="Aptos Narrow"/>
+                <w:color w:val="000000"/>
+                <w:kern w:val="0"/>
+                <w:sz w:val="22"/>
+                <w:szCs w:val="22"/>
+                <w:lang w:val="en-US"/>
+              </w:rPr>
+              <w:t>-0.83235</w:t>
+            </w:r>
+          </w:p>
+        </w:tc>
+      </w:tr>
+      <w:tr>
+        <w:trPr>
+          <w:trHeight w:val="305"/>
+        </w:trPr>
+        <w:tc>
+          <w:tcPr>
+            <w:tcW w:w="1615" w:type="dxa"/>
+          </w:tcPr>
+          <w:p>
+            <w:pPr>
+              <w:autoSpaceDE w:val="0"/>
+              <w:autoSpaceDN w:val="0"/>
+              <w:adjustRightInd w:val="0"/>
+              <w:spacing w:line="240" w:lineRule="auto"/>
+              <w:rPr>
+                <w:rFonts w:ascii="Aptos Narrow" w:hAnsi="Aptos Narrow" w:cs="Aptos Narrow"/>
+                <w:color w:val="000000"/>
+                <w:kern w:val="0"/>
+                <w:sz w:val="22"/>
+                <w:szCs w:val="22"/>
+                <w:lang w:val="en-US"/>
+              </w:rPr>
+            </w:pPr>
+            <w:r>
+              <w:rPr>
+                <w:rFonts w:ascii="Aptos Narrow" w:hAnsi="Aptos Narrow" w:cs="Aptos Narrow"/>
+                <w:color w:val="000000"/>
+                <w:kern w:val="0"/>
+                <w:sz w:val="22"/>
+                <w:szCs w:val="22"/>
+                <w:lang w:val="en-US"/>
+              </w:rPr>
+              <w:t>RawAY.sm</w:t>
+            </w:r>
+          </w:p>
+        </w:tc>
+        <w:tc>
+          <w:tcPr>
+            <w:tcW w:w="1115" w:type="dxa"/>
+          </w:tcPr>
+          <w:p>
+            <w:pPr>
+              <w:autoSpaceDE w:val="0"/>
+              <w:autoSpaceDN w:val="0"/>
+              <w:adjustRightInd w:val="0"/>
+              <w:spacing w:line="240" w:lineRule="auto"/>
+              <w:jc w:val="right"/>
+              <w:rPr>
+                <w:rFonts w:ascii="Aptos Narrow" w:hAnsi="Aptos Narrow" w:cs="Aptos Narrow"/>
+                <w:color w:val="000000"/>
+                <w:kern w:val="0"/>
+                <w:sz w:val="22"/>
+                <w:szCs w:val="22"/>
+                <w:lang w:val="en-US"/>
+              </w:rPr>
+            </w:pPr>
+            <w:r>
+              <w:rPr>
+                <w:rFonts w:ascii="Aptos Narrow" w:hAnsi="Aptos Narrow" w:cs="Aptos Narrow"/>
+                <w:color w:val="000000"/>
+                <w:kern w:val="0"/>
+                <w:sz w:val="22"/>
+                <w:szCs w:val="22"/>
+                <w:lang w:val="en-US"/>
+              </w:rPr>
+              <w:t>1.88471</w:t>
+            </w:r>
+          </w:p>
+        </w:tc>
+      </w:tr>
+      <w:tr>
+        <w:trPr>
+          <w:trHeight w:val="305"/>
+        </w:trPr>
+        <w:tc>
+          <w:tcPr>
+            <w:tcW w:w="1615" w:type="dxa"/>
+          </w:tcPr>
+          <w:p>
+            <w:pPr>
+              <w:autoSpaceDE w:val="0"/>
+              <w:autoSpaceDN w:val="0"/>
+              <w:adjustRightInd w:val="0"/>
+              <w:spacing w:line="240" w:lineRule="auto"/>
+              <w:rPr>
+                <w:rFonts w:ascii="Aptos Narrow" w:hAnsi="Aptos Narrow" w:cs="Aptos Narrow"/>
+                <w:color w:val="000000"/>
+                <w:kern w:val="0"/>
+                <w:sz w:val="22"/>
+                <w:szCs w:val="22"/>
+                <w:lang w:val="en-US"/>
+              </w:rPr>
+            </w:pPr>
+            <w:r>
+              <w:rPr>
+                <w:rFonts w:ascii="Aptos Narrow" w:hAnsi="Aptos Narrow" w:cs="Aptos Narrow"/>
+                <w:color w:val="000000"/>
+                <w:kern w:val="0"/>
+                <w:sz w:val="22"/>
+                <w:szCs w:val="22"/>
+                <w:lang w:val="en-US"/>
+              </w:rPr>
+              <w:t>RawAZ.sm</w:t>
+            </w:r>
+          </w:p>
+        </w:tc>
+        <w:tc>
+          <w:tcPr>
+            <w:tcW w:w="1115" w:type="dxa"/>
+          </w:tcPr>
+          <w:p>
+            <w:pPr>
+              <w:autoSpaceDE w:val="0"/>
+              <w:autoSpaceDN w:val="0"/>
+              <w:adjustRightInd w:val="0"/>
+              <w:spacing w:line="240" w:lineRule="auto"/>
+              <w:jc w:val="right"/>
+              <w:rPr>
+                <w:rFonts w:ascii="Aptos Narrow" w:hAnsi="Aptos Narrow" w:cs="Aptos Narrow"/>
+                <w:color w:val="000000"/>
+                <w:kern w:val="0"/>
+                <w:sz w:val="22"/>
+                <w:szCs w:val="22"/>
+                <w:lang w:val="en-US"/>
+              </w:rPr>
+            </w:pPr>
+            <w:r>
+              <w:rPr>
+                <w:rFonts w:ascii="Aptos Narrow" w:hAnsi="Aptos Narrow" w:cs="Aptos Narrow"/>
+                <w:color w:val="000000"/>
+                <w:kern w:val="0"/>
+                <w:sz w:val="22"/>
+                <w:szCs w:val="22"/>
+                <w:lang w:val="en-US"/>
+              </w:rPr>
+              <w:t>2.85395</w:t>
+            </w:r>
+          </w:p>
+        </w:tc>
+      </w:tr>
+      <w:tr>
+        <w:trPr>
+          <w:trHeight w:val="305"/>
+        </w:trPr>
+        <w:tc>
+          <w:tcPr>
+            <w:tcW w:w="1615" w:type="dxa"/>
+          </w:tcPr>
+          <w:p>
+            <w:pPr>
+              <w:autoSpaceDE w:val="0"/>
+              <w:autoSpaceDN w:val="0"/>
+              <w:adjustRightInd w:val="0"/>
+              <w:spacing w:line="240" w:lineRule="auto"/>
+              <w:rPr>
+                <w:rFonts w:ascii="Aptos Narrow" w:hAnsi="Aptos Narrow" w:cs="Aptos Narrow"/>
+                <w:color w:val="000000"/>
+                <w:kern w:val="0"/>
+                <w:sz w:val="22"/>
+                <w:szCs w:val="22"/>
+                <w:lang w:val="en-US"/>
+              </w:rPr>
+            </w:pPr>
+            <w:r>
+              <w:rPr>
+                <w:rFonts w:ascii="Aptos Narrow" w:hAnsi="Aptos Narrow" w:cs="Aptos Narrow"/>
+                <w:color w:val="000000"/>
+                <w:kern w:val="0"/>
+                <w:sz w:val="22"/>
+                <w:szCs w:val="22"/>
+                <w:lang w:val="en-US"/>
+              </w:rPr>
+              <w:t>RawMX.sm</w:t>
+            </w:r>
+          </w:p>
+        </w:tc>
+        <w:tc>
+          <w:tcPr>
+            <w:tcW w:w="1115" w:type="dxa"/>
+          </w:tcPr>
+          <w:p>
+            <w:pPr>
+              <w:autoSpaceDE w:val="0"/>
+              <w:autoSpaceDN w:val="0"/>
+              <w:adjustRightInd w:val="0"/>
+              <w:spacing w:line="240" w:lineRule="auto"/>
+              <w:jc w:val="right"/>
+              <w:rPr>
+                <w:rFonts w:ascii="Aptos Narrow" w:hAnsi="Aptos Narrow" w:cs="Aptos Narrow"/>
+                <w:color w:val="000000"/>
+                <w:kern w:val="0"/>
+                <w:sz w:val="22"/>
+                <w:szCs w:val="22"/>
+                <w:lang w:val="en-US"/>
+              </w:rPr>
+            </w:pPr>
+            <w:r>
+              <w:rPr>
+                <w:rFonts w:ascii="Aptos Narrow" w:hAnsi="Aptos Narrow" w:cs="Aptos Narrow"/>
+                <w:color w:val="000000"/>
+                <w:kern w:val="0"/>
+                <w:sz w:val="22"/>
+                <w:szCs w:val="22"/>
+                <w:lang w:val="en-US"/>
+              </w:rPr>
+              <w:t>-272.433</w:t>
+            </w:r>
+          </w:p>
+        </w:tc>
+      </w:tr>
+      <w:tr>
+        <w:trPr>
+          <w:trHeight w:val="305"/>
+        </w:trPr>
+        <w:tc>
+          <w:tcPr>
+            <w:tcW w:w="1615" w:type="dxa"/>
+          </w:tcPr>
+          <w:p>
+            <w:pPr>
+              <w:autoSpaceDE w:val="0"/>
+              <w:autoSpaceDN w:val="0"/>
+              <w:adjustRightInd w:val="0"/>
+              <w:spacing w:line="240" w:lineRule="auto"/>
+              <w:rPr>
+                <w:rFonts w:ascii="Aptos Narrow" w:hAnsi="Aptos Narrow" w:cs="Aptos Narrow"/>
+                <w:color w:val="000000"/>
+                <w:kern w:val="0"/>
+                <w:sz w:val="22"/>
+                <w:szCs w:val="22"/>
+                <w:lang w:val="en-US"/>
+              </w:rPr>
+            </w:pPr>
+            <w:r>
+              <w:rPr>
+                <w:rFonts w:ascii="Aptos Narrow" w:hAnsi="Aptos Narrow" w:cs="Aptos Narrow"/>
+                <w:color w:val="000000"/>
+                <w:kern w:val="0"/>
+                <w:sz w:val="22"/>
+                <w:szCs w:val="22"/>
+                <w:lang w:val="en-US"/>
+              </w:rPr>
+              <w:t>RawMY.sm</w:t>
+            </w:r>
+          </w:p>
+        </w:tc>
+        <w:tc>
+          <w:tcPr>
+            <w:tcW w:w="1115" w:type="dxa"/>
+          </w:tcPr>
+          <w:p>
+            <w:pPr>
+              <w:autoSpaceDE w:val="0"/>
+              <w:autoSpaceDN w:val="0"/>
+              <w:adjustRightInd w:val="0"/>
+              <w:spacing w:line="240" w:lineRule="auto"/>
+              <w:jc w:val="right"/>
+              <w:rPr>
+                <w:rFonts w:ascii="Aptos Narrow" w:hAnsi="Aptos Narrow" w:cs="Aptos Narrow"/>
+                <w:color w:val="000000"/>
+                <w:kern w:val="0"/>
+                <w:sz w:val="22"/>
+                <w:szCs w:val="22"/>
+                <w:lang w:val="en-US"/>
+              </w:rPr>
+            </w:pPr>
+            <w:r>
+              <w:rPr>
+                <w:rFonts w:ascii="Aptos Narrow" w:hAnsi="Aptos Narrow" w:cs="Aptos Narrow"/>
+                <w:color w:val="000000"/>
+                <w:kern w:val="0"/>
+                <w:sz w:val="22"/>
+                <w:szCs w:val="22"/>
+                <w:lang w:val="en-US"/>
+              </w:rPr>
+              <w:t>255.0555</w:t>
+            </w:r>
+          </w:p>
+        </w:tc>
+      </w:tr>
+      <w:tr>
+        <w:trPr>
+          <w:trHeight w:val="305"/>
+        </w:trPr>
+        <w:tc>
+          <w:tcPr>
+            <w:tcW w:w="1615" w:type="dxa"/>
+          </w:tcPr>
+          <w:p>
+            <w:pPr>
+              <w:autoSpaceDE w:val="0"/>
+              <w:autoSpaceDN w:val="0"/>
+              <w:adjustRightInd w:val="0"/>
+              <w:spacing w:line="240" w:lineRule="auto"/>
+              <w:rPr>
+                <w:rFonts w:ascii="Aptos Narrow" w:hAnsi="Aptos Narrow" w:cs="Aptos Narrow"/>
+                <w:color w:val="000000"/>
+                <w:kern w:val="0"/>
+                <w:sz w:val="22"/>
+                <w:szCs w:val="22"/>
+                <w:lang w:val="en-US"/>
+              </w:rPr>
+            </w:pPr>
+            <w:r>
+              <w:rPr>
+                <w:rFonts w:ascii="Aptos Narrow" w:hAnsi="Aptos Narrow" w:cs="Aptos Narrow"/>
+                <w:color w:val="000000"/>
+                <w:kern w:val="0"/>
+                <w:sz w:val="22"/>
+                <w:szCs w:val="22"/>
+                <w:lang w:val="en-US"/>
+              </w:rPr>
+              <w:t>RawMZ.sm</w:t>
+            </w:r>
+          </w:p>
+        </w:tc>
+        <w:tc>
+          <w:tcPr>
+            <w:tcW w:w="1115" w:type="dxa"/>
+          </w:tcPr>
+          <w:p>
+            <w:pPr>
+              <w:autoSpaceDE w:val="0"/>
+              <w:autoSpaceDN w:val="0"/>
+              <w:adjustRightInd w:val="0"/>
+              <w:spacing w:line="240" w:lineRule="auto"/>
+              <w:jc w:val="right"/>
+              <w:rPr>
+                <w:rFonts w:ascii="Aptos Narrow" w:hAnsi="Aptos Narrow" w:cs="Aptos Narrow"/>
+                <w:color w:val="000000"/>
+                <w:kern w:val="0"/>
+                <w:sz w:val="22"/>
+                <w:szCs w:val="22"/>
+                <w:lang w:val="en-US"/>
+              </w:rPr>
+            </w:pPr>
+            <w:r>
+              <w:rPr>
+                <w:rFonts w:ascii="Aptos Narrow" w:hAnsi="Aptos Narrow" w:cs="Aptos Narrow"/>
+                <w:color w:val="000000"/>
+                <w:kern w:val="0"/>
+                <w:sz w:val="22"/>
+                <w:szCs w:val="22"/>
+                <w:lang w:val="en-US"/>
+              </w:rPr>
+              <w:t>-176.346</w:t>
+            </w:r>
+          </w:p>
+        </w:tc>
+      </w:tr>
+      <w:tr>
+        <w:trPr>
+          <w:trHeight w:val="305"/>
+        </w:trPr>
+        <w:tc>
+          <w:tcPr>
+            <w:tcW w:w="1615" w:type="dxa"/>
+          </w:tcPr>
+          <w:p>
+            <w:pPr>
+              <w:autoSpaceDE w:val="0"/>
+              <w:autoSpaceDN w:val="0"/>
+              <w:adjustRightInd w:val="0"/>
+              <w:spacing w:line="240" w:lineRule="auto"/>
+              <w:rPr>
+                <w:rFonts w:ascii="Aptos Narrow" w:hAnsi="Aptos Narrow" w:cs="Aptos Narrow"/>
+                <w:color w:val="000000"/>
+                <w:kern w:val="0"/>
+                <w:sz w:val="22"/>
+                <w:szCs w:val="22"/>
+                <w:lang w:val="en-US"/>
+              </w:rPr>
+            </w:pPr>
+            <w:r>
+              <w:rPr>
+                <w:rFonts w:ascii="Aptos Narrow" w:hAnsi="Aptos Narrow" w:cs="Aptos Narrow"/>
+                <w:color w:val="000000"/>
+                <w:kern w:val="0"/>
+                <w:sz w:val="22"/>
+                <w:szCs w:val="22"/>
+                <w:lang w:val="en-US"/>
+              </w:rPr>
+              <w:t>pitch</w:t>
+            </w:r>
+          </w:p>
+        </w:tc>
+        <w:tc>
+          <w:tcPr>
+            <w:tcW w:w="1115" w:type="dxa"/>
+          </w:tcPr>
+          <w:p>
+            <w:pPr>
+              <w:autoSpaceDE w:val="0"/>
+              <w:autoSpaceDN w:val="0"/>
+              <w:adjustRightInd w:val="0"/>
+              <w:spacing w:line="240" w:lineRule="auto"/>
+              <w:jc w:val="right"/>
+              <w:rPr>
+                <w:rFonts w:ascii="Aptos Narrow" w:hAnsi="Aptos Narrow" w:cs="Aptos Narrow"/>
+                <w:color w:val="000000"/>
+                <w:kern w:val="0"/>
+                <w:sz w:val="22"/>
+                <w:szCs w:val="22"/>
+                <w:lang w:val="en-US"/>
+              </w:rPr>
+            </w:pPr>
+            <w:r>
+              <w:rPr>
+                <w:rFonts w:ascii="Aptos Narrow" w:hAnsi="Aptos Narrow" w:cs="Aptos Narrow"/>
+                <w:color w:val="000000"/>
+                <w:kern w:val="0"/>
+                <w:sz w:val="22"/>
+                <w:szCs w:val="22"/>
+                <w:lang w:val="en-US"/>
+              </w:rPr>
+              <w:t>13.67805</w:t>
+            </w:r>
+          </w:p>
+        </w:tc>
+      </w:tr>
+    </w:tbl>
+    <w:p>
+      <w:pPr>
+        <w:pStyle w:val="ListParagraph"/>
+        <w:numPr>
+          <w:ilvl w:val="1"/>
+          <w:numId w:val="2"/>
+        </w:numPr>
+        <w:rPr>
+          <w:lang w:val="en-US"/>
+        </w:rPr>
+      </w:pPr>
+      <w:r>
+        <w:t>So, from my understanding… (</w:t>
+      </w:r>
+      <w:r>
+        <w:t xml:space="preserve">Refer to the next section below </w:t>
+      </w:r>
+      <w:r>
+        <w:sym w:font="Wingdings" w:char="F0E0"/>
       </w:r>
       <w:r>
         <w:t xml:space="preserve"> </w:t>
       </w:r>
-    </w:p>
-    <w:p>
-      <w:pPr>
-        <w:pStyle w:val="ListParagraph"/>
-        <w:numPr>
-          <w:ilvl w:val="1"/>
-          <w:numId w:val="2"/>
-        </w:numPr>
-      </w:pPr>
-      <w:r>
-        <w:sym w:font="Wingdings" w:char="F0E0"/>
-      </w:r>
-      <w:r>
-        <w:t xml:space="preserve"> am actually now editing the matlab to be able to read annotations if they exist, and then you can override to 0 if </w:t>
-      </w:r>
-      <w:r>
-        <w:t>its an error</w:t>
-      </w:r>
-    </w:p>
-    <w:p>
-      <w:pPr>
-        <w:pStyle w:val="ListParagraph"/>
-        <w:numPr>
-          <w:ilvl w:val="1"/>
-          <w:numId w:val="2"/>
-        </w:numPr>
-      </w:pPr>
-      <w:r>
-        <w:t>This is more work than I bargained for. Ugh.</w:t>
-      </w:r>
-    </w:p>
-    <w:p>
-      <w:pPr>
-        <w:pStyle w:val="ListParagraph"/>
-        <w:numPr>
-          <w:ilvl w:val="1"/>
-          <w:numId w:val="2"/>
-        </w:numPr>
-      </w:pPr>
-      <w:r>
-        <w:t>10</w:t>
-      </w:r>
-      <w:r>
-        <w:t>0 minutes later, I completed that part of the task.</w:t>
-      </w:r>
-    </w:p>
-    <w:p>
-      <w:pPr>
-        <w:pStyle w:val="ListParagraph"/>
-        <w:numPr>
-          <w:ilvl w:val="1"/>
-          <w:numId w:val="2"/>
-        </w:numPr>
-      </w:pPr>
-      <w:r>
-        <w:t>Now to go through and clean all the data</w:t>
-      </w:r>
-    </w:p>
+      <w:r>
+        <w:t>notes I wrote previously</w:t>
+      </w:r>
+      <w:r>
+        <w:t xml:space="preserve"> and copied over from the Mobile Biomechanics Lab </w:t>
+      </w:r>
+      <w:proofErr w:type="spellStart"/>
+      <w:r>
+        <w:t>github</w:t>
+      </w:r>
+      <w:proofErr w:type="spellEnd"/>
+      <w:r>
+        <w:t>)</w:t>
+      </w:r>
+    </w:p>
+    <w:p>
+      <w:pPr>
+        <w:pStyle w:val="ListParagraph"/>
+        <w:numPr>
+          <w:ilvl w:val="2"/>
+          <w:numId w:val="2"/>
+        </w:numPr>
+        <w:rPr>
+          <w:lang w:val="en-US"/>
+        </w:rPr>
+      </w:pPr>
+      <w:r>
+        <w:rPr>
+          <w:bdr w:val="none" w:sz="0" w:space="0" w:color="auto" w:frame="1"/>
+          <w:lang w:val="en-US"/>
+        </w:rPr>
+        <w:t xml:space="preserve">Using these </w:t>
+      </w:r>
+      <w:r>
+        <w:rPr>
+          <w:bdr w:val="none" w:sz="0" w:space="0" w:color="auto" w:frame="1"/>
+          <w:lang w:val="en-US"/>
+        </w:rPr>
+        <w:t xml:space="preserve">variables, I can </w:t>
+      </w:r>
+      <w:r>
+        <w:rPr>
+          <w:bdr w:val="none" w:sz="0" w:space="0" w:color="auto" w:frame="1"/>
+          <w:lang w:val="en-US"/>
+        </w:rPr>
+        <w:t>see that…</w:t>
+      </w:r>
+      <w:r>
+        <w:rPr>
+          <w:bdr w:val="none" w:sz="0" w:space="0" w:color="auto" w:frame="1"/>
+          <w:lang w:val="en-US"/>
+        </w:rPr>
+        <w:t xml:space="preserve"> Not much, </w:t>
+      </w:r>
+      <w:proofErr w:type="spellStart"/>
+      <w:r>
+        <w:rPr>
+          <w:bdr w:val="none" w:sz="0" w:space="0" w:color="auto" w:frame="1"/>
+          <w:lang w:val="en-US"/>
+        </w:rPr>
+        <w:t>tbh</w:t>
+      </w:r>
+      <w:proofErr w:type="spellEnd"/>
+      <w:r>
+        <w:rPr>
+          <w:bdr w:val="none" w:sz="0" w:space="0" w:color="auto" w:frame="1"/>
+          <w:lang w:val="en-US"/>
+        </w:rPr>
+        <w:t>.</w:t>
+      </w:r>
+    </w:p>
+    <w:p>
+      <w:pPr>
+        <w:pStyle w:val="ListParagraph"/>
+        <w:numPr>
+          <w:ilvl w:val="2"/>
+          <w:numId w:val="2"/>
+        </w:numPr>
+        <w:rPr>
+          <w:lang w:val="en-US"/>
+        </w:rPr>
+      </w:pPr>
+      <w:r>
+        <w:rPr>
+          <w:lang w:val="en-US"/>
+        </w:rPr>
+        <w:t>In the NED (North-East-Down) frame, static accelerometer readings reflect gravity (≈</w:t>
+      </w:r>
+      <w:r>
+        <w:rPr>
+          <w:lang w:val="en-US"/>
+        </w:rPr>
+        <w:t>1 G</w:t>
+      </w:r>
+      <w:r>
+        <w:rPr>
+          <w:lang w:val="en-US"/>
+        </w:rPr>
+        <w:t xml:space="preserve"> downward = +Z in NED).</w:t>
+      </w:r>
+      <w:r>
+        <w:rPr>
+          <w:lang w:val="en-US"/>
+        </w:rPr>
+        <w:t xml:space="preserve"> </w:t>
+      </w:r>
+      <w:proofErr w:type="gramStart"/>
+      <w:r>
+        <w:rPr>
+          <w:lang w:val="en-US"/>
+        </w:rPr>
+        <w:t>So</w:t>
+      </w:r>
+      <w:proofErr w:type="gramEnd"/>
+      <w:r>
+        <w:rPr>
+          <w:lang w:val="en-US"/>
+        </w:rPr>
+        <w:t xml:space="preserve"> this might be NED with a lot of </w:t>
+      </w:r>
+      <w:proofErr w:type="gramStart"/>
+      <w:r>
+        <w:rPr>
+          <w:lang w:val="en-US"/>
+        </w:rPr>
+        <w:t>roll</w:t>
+      </w:r>
+      <w:proofErr w:type="gramEnd"/>
+      <w:r>
+        <w:rPr>
+          <w:lang w:val="en-US"/>
+        </w:rPr>
+        <w:t>… could also be NWD?</w:t>
+      </w:r>
+    </w:p>
+    <w:p>
+      <w:pPr>
+        <w:rPr>
+          <w:lang w:val="en-US"/>
+        </w:rPr>
+      </w:pPr>
+      <w:r>
+        <w:rPr>
+          <w:lang w:val="en-US"/>
+        </w:rPr>
+        <w:lastRenderedPageBreak/>
+        <w:drawing>
+          <wp:inline distT="0" distB="0" distL="0" distR="0" wp14:anchorId="1340ADFE" wp14:editId="6FBADE05">
+            <wp:extent cx="5943600" cy="5108575"/>
+            <wp:effectExtent l="0" t="0" r="0" b="0"/>
+            <wp:docPr id="103678012" name="Picture 1"/>
+            <wp:cNvGraphicFramePr>
+              <a:graphicFrameLocks xmlns:a="http://schemas.openxmlformats.org/drawingml/2006/main" noChangeAspect="1"/>
+            </wp:cNvGraphicFramePr>
+            <a:graphic xmlns:a="http://schemas.openxmlformats.org/drawingml/2006/main">
+              <a:graphicData uri="http://schemas.openxmlformats.org/drawingml/2006/picture">
+                <pic:pic xmlns:pic="http://schemas.openxmlformats.org/drawingml/2006/picture">
+                  <pic:nvPicPr>
+                    <pic:cNvPr id="103678012" name=""/>
+                    <pic:cNvPicPr/>
+                  </pic:nvPicPr>
+                  <pic:blipFill>
+                    <a:blip r:embed="rId20"/>
+                    <a:stretch>
+                      <a:fillRect/>
+                    </a:stretch>
+                  </pic:blipFill>
+                  <pic:spPr>
+                    <a:xfrm>
+                      <a:off x="0" y="0"/>
+                      <a:ext cx="5943600" cy="5108575"/>
+                    </a:xfrm>
+                    <a:prstGeom prst="rect">
+                      <a:avLst/>
+                    </a:prstGeom>
+                  </pic:spPr>
+                </pic:pic>
+              </a:graphicData>
+            </a:graphic>
+          </wp:inline>
+        </w:drawing>
+      </w:r>
+    </w:p>
+    <w:p>
+      <w:pPr>
+        <w:rPr>
+          <w:lang w:val="en-US"/>
+        </w:rPr>
+      </w:pPr>
+    </w:p>
+    <w:p>
+      <w:pPr>
+        <w:rPr>
+          <w:lang w:val="en-US"/>
+        </w:rPr>
+      </w:pPr>
+    </w:p>
+    <w:p>
+      <w:pPr>
+        <w:rPr>
+          <w:lang w:val="en-US"/>
+        </w:rPr>
+      </w:pPr>
+    </w:p>
+    <w:p>
+      <w:pPr>
+        <w:pStyle w:val="Heading3"/>
+      </w:pPr>
+      <w:bookmarkStart w:id="7" w:name="_Toc226310530"/>
+      <w:r>
+        <w:t>Notes on Dead Reckoning variables</w:t>
+      </w:r>
+      <w:bookmarkEnd w:id="7"/>
+    </w:p>
+    <w:p>
+      <w:pPr>
+        <w:rPr>
+          <w:lang w:val="en-US"/>
+        </w:rPr>
+      </w:pPr>
+      <w:r>
+        <w:rPr>
+          <w:lang w:val="en-US"/>
+        </w:rPr>
+        <w:t xml:space="preserve">This function takes as input: </w:t>
+      </w:r>
+    </w:p>
+    <w:p>
+      <w:pPr>
+        <w:pStyle w:val="ListParagraph"/>
+        <w:numPr>
+          <w:ilvl w:val="0"/>
+          <w:numId w:val="2"/>
+        </w:numPr>
+        <w:rPr>
+          <w:lang w:val="en-US"/>
+        </w:rPr>
+      </w:pPr>
+      <w:r>
+        <w:rPr>
+          <w:lang w:val="en-US"/>
+        </w:rPr>
+        <w:t>Raw tri-axial magnetometer data (</w:t>
+      </w:r>
+      <w:proofErr w:type="spellStart"/>
+      <w:r>
+        <w:rPr>
+          <w:lang w:val="en-US"/>
+        </w:rPr>
+        <w:t>mag.</w:t>
+      </w:r>
+      <w:proofErr w:type="gramStart"/>
+      <w:r>
+        <w:rPr>
+          <w:lang w:val="en-US"/>
+        </w:rPr>
+        <w:t>x,y</w:t>
+      </w:r>
+      <w:proofErr w:type="gramEnd"/>
+      <w:r>
+        <w:rPr>
+          <w:lang w:val="en-US"/>
+        </w:rPr>
+        <w:t>,z</w:t>
+      </w:r>
+      <w:proofErr w:type="spellEnd"/>
+      <w:r>
+        <w:rPr>
+          <w:lang w:val="en-US"/>
+        </w:rPr>
+        <w:t>)</w:t>
+      </w:r>
+    </w:p>
+    <w:p>
+      <w:pPr>
+        <w:pStyle w:val="ListParagraph"/>
+        <w:numPr>
+          <w:ilvl w:val="0"/>
+          <w:numId w:val="2"/>
+        </w:numPr>
+        <w:rPr>
+          <w:lang w:val="en-US"/>
+        </w:rPr>
+      </w:pPr>
+      <w:r>
+        <w:rPr>
+          <w:lang w:val="en-US"/>
+        </w:rPr>
+        <w:t>Tri-axial static acceleration data (</w:t>
+      </w:r>
+      <w:proofErr w:type="spellStart"/>
+      <w:r>
+        <w:rPr>
+          <w:lang w:val="en-US"/>
+        </w:rPr>
+        <w:t>acc.</w:t>
+      </w:r>
+      <w:proofErr w:type="gramStart"/>
+      <w:r>
+        <w:rPr>
+          <w:lang w:val="en-US"/>
+        </w:rPr>
+        <w:t>x,y</w:t>
+      </w:r>
+      <w:proofErr w:type="gramEnd"/>
+      <w:r>
+        <w:rPr>
+          <w:lang w:val="en-US"/>
+        </w:rPr>
+        <w:t>,z</w:t>
+      </w:r>
+      <w:proofErr w:type="spellEnd"/>
+      <w:r>
+        <w:rPr>
+          <w:lang w:val="en-US"/>
+        </w:rPr>
+        <w:t>) (the smoothed values)</w:t>
+      </w:r>
+    </w:p>
+    <w:p>
+      <w:pPr>
+        <w:pStyle w:val="ListParagraph"/>
+        <w:numPr>
+          <w:ilvl w:val="0"/>
+          <w:numId w:val="2"/>
+        </w:numPr>
+        <w:rPr>
+          <w:lang w:val="en-US"/>
+        </w:rPr>
+      </w:pPr>
+      <w:r>
+        <w:rPr>
+          <w:lang w:val="en-US"/>
+        </w:rPr>
+        <w:t>Marked events data (ME) specifying the period of the magnetic calibration period (as denoted by ‘M’ - any other input signifies data acquisition not part of calibration procedure)</w:t>
+      </w:r>
+    </w:p>
+    <w:p>
+      <w:pPr>
+        <w:pStyle w:val="ListParagraph"/>
+        <w:numPr>
+          <w:ilvl w:val="0"/>
+          <w:numId w:val="2"/>
+        </w:numPr>
+        <w:rPr>
+          <w:lang w:val="en-US"/>
+        </w:rPr>
+      </w:pPr>
+      <w:r>
+        <w:rPr>
+          <w:lang w:val="en-US"/>
+        </w:rPr>
+        <w:lastRenderedPageBreak/>
+        <w:t>Method of correction: default 3. * For rotated ellipsoids use method = 2 (more influenced by noise or more spherical) or method = 3 (default). For simple orthogonal re-scaling use method = 1. For non-rotated ellipsoids use method = 4, 5 (x &amp; y axis equal), 6 (x &amp; z axis equal), 7 (y &amp; z axis are equal) or 8 (spherical data).</w:t>
+      </w:r>
+    </w:p>
+    <w:p>
+      <w:pPr>
+        <w:pStyle w:val="ListParagraph"/>
+        <w:numPr>
+          <w:ilvl w:val="0"/>
+          <w:numId w:val="2"/>
+        </w:numPr>
+        <w:rPr>
+          <w:lang w:val="en-US"/>
+        </w:rPr>
+      </w:pPr>
+      <w:r>
+        <w:rPr>
+          <w:lang w:val="en-US"/>
+        </w:rPr>
+        <w:t>Use 3 if a good calibration period is present. If the calibration period is not great (only ‘some’ of a sphere is covered when calibrating), then use method = 1.</w:t>
+      </w:r>
+    </w:p>
+    <w:p>
+      <w:pPr>
+        <w:pStyle w:val="ListParagraph"/>
+        <w:numPr>
+          <w:ilvl w:val="0"/>
+          <w:numId w:val="2"/>
+        </w:numPr>
+        <w:rPr>
+          <w:lang w:val="en-US"/>
+        </w:rPr>
+      </w:pPr>
+      <w:r>
+        <w:rPr>
+          <w:lang w:val="en-US"/>
+        </w:rPr>
+        <w:t xml:space="preserve">Estimated pitch offset: Approximately how much was it rotated by? * algorithm = “standard” (standard </w:t>
+      </w:r>
+      <w:proofErr w:type="spellStart"/>
+      <w:r>
+        <w:rPr>
+          <w:lang w:val="en-US"/>
+        </w:rPr>
+        <w:t>euler</w:t>
+      </w:r>
+      <w:proofErr w:type="spellEnd"/>
+      <w:r>
+        <w:rPr>
+          <w:lang w:val="en-US"/>
+        </w:rPr>
+        <w:t xml:space="preserve"> angle approach) or “SAAM” (using quaternions)</w:t>
+      </w:r>
+    </w:p>
+    <w:p>
+      <w:r>
+        <w:rPr>
+          <w:lang w:val="en-US"/>
+        </w:rPr>
+        <w:t xml:space="preserve">We have most of these variables available in the data already, but there are some that we </w:t>
+      </w:r>
+      <w:proofErr w:type="gramStart"/>
+      <w:r>
+        <w:rPr>
+          <w:lang w:val="en-US"/>
+        </w:rPr>
+        <w:t>have to</w:t>
+      </w:r>
+      <w:proofErr w:type="gramEnd"/>
+      <w:r>
+        <w:rPr>
+          <w:lang w:val="en-US"/>
+        </w:rPr>
+        <w:t xml:space="preserve"> figure out. </w:t>
+      </w:r>
+      <w:r>
+        <w:t xml:space="preserve">To understand the reference coordinate system for this analysis, firstly we </w:t>
+      </w:r>
+      <w:proofErr w:type="gramStart"/>
+      <w:r>
+        <w:t>have to</w:t>
+      </w:r>
+      <w:proofErr w:type="gramEnd"/>
+      <w:r>
+        <w:t xml:space="preserve"> understand what the axes represent. This analysis system assumes the North-East-Down (NED) system where the X axis will be the surge (forward and back, North and South), Y will be the sway (side to side, East and West), and Z will be heave (up and down).</w:t>
+      </w:r>
+    </w:p>
+    <w:p>
+      <w:pPr>
+        <w:jc w:val="center"/>
+        <w:rPr>
+          <w:lang w:val="en-US"/>
+        </w:rPr>
+      </w:pPr>
+      <w:r>
+        <w:rPr>
+          <w:noProof/>
+        </w:rPr>
+        <w:drawing>
+          <wp:inline distT="0" distB="0" distL="0" distR="0" wp14:anchorId="58B5C0DB" wp14:editId="122C0A50">
+            <wp:extent cx="3400425" cy="1743808"/>
+            <wp:effectExtent l="0" t="0" r="0" b="8890"/>
+            <wp:docPr id="1563100451" name="Picture 8" descr="Linking axes to biology"/>
+            <wp:cNvGraphicFramePr>
+              <a:graphicFrameLocks xmlns:a="http://schemas.openxmlformats.org/drawingml/2006/main" noChangeAspect="1"/>
+            </wp:cNvGraphicFramePr>
+            <a:graphic xmlns:a="http://schemas.openxmlformats.org/drawingml/2006/main">
+              <a:graphicData uri="http://schemas.openxmlformats.org/drawingml/2006/picture">
+                <pic:pic xmlns:pic="http://schemas.openxmlformats.org/drawingml/2006/picture">
+                  <pic:nvPicPr>
+                    <pic:cNvPr id="0" name="Picture 27" descr="Linking axes to biology"/>
+                    <pic:cNvPicPr>
+                      <a:picLocks noChangeAspect="1" noChangeArrowheads="1"/>
+                    </pic:cNvPicPr>
+                  </pic:nvPicPr>
+                  <pic:blipFill rotWithShape="1">
+                    <a:blip r:embed="rId21" cstate="print">
+                      <a:extLst>
+                        <a:ext uri="{28A0092B-C50C-407E-A947-70E740481C1C}">
+                          <a14:useLocalDpi xmlns:a14="http://schemas.microsoft.com/office/drawing/2010/main" val="0"/>
+                        </a:ext>
+                      </a:extLst>
+                    </a:blip>
+                    <a:srcRect t="9471" b="3933"/>
+                    <a:stretch>
+                      <a:fillRect/>
+                    </a:stretch>
+                  </pic:blipFill>
+                  <pic:spPr bwMode="auto">
+                    <a:xfrm>
+                      <a:off x="0" y="0"/>
+                      <a:ext cx="3403428" cy="1745348"/>
+                    </a:xfrm>
+                    <a:prstGeom prst="rect">
+                      <a:avLst/>
+                    </a:prstGeom>
+                    <a:noFill/>
+                    <a:ln>
+                      <a:noFill/>
+                    </a:ln>
+                    <a:extLst>
+                      <a:ext uri="{53640926-AAD7-44D8-BBD7-CCE9431645EC}">
+                        <a14:shadowObscured xmlns:a14="http://schemas.microsoft.com/office/drawing/2010/main"/>
+                      </a:ext>
+                    </a:extLst>
+                  </pic:spPr>
+                </pic:pic>
+              </a:graphicData>
+            </a:graphic>
+          </wp:inline>
+        </w:drawing>
+      </w:r>
+    </w:p>
+    <w:p>
+      <w:r>
+        <w:t>We then need to orient this accelerometer inside of the broader world. We do this by describing the compass direction of each axis. To conceptualise this, think of your hand as a practice accelerometer. Make a gum pointer finger with the middle finger extended as well such that the 3 digits will be at right angles from each other. The index finger represents the X axis, the middle finger is the Y axis, and the thumb is the X axis.</w:t>
+      </w:r>
+    </w:p>
+    <w:p>
+      <w:pPr>
+        <w:jc w:val="center"/>
+      </w:pPr>
+      <w:r>
+        <w:rPr>
+          <w:noProof/>
+        </w:rPr>
+        <w:drawing>
+          <wp:inline distT="0" distB="0" distL="0" distR="0" wp14:anchorId="3BDC6625" wp14:editId="58A6CDA5">
+            <wp:extent cx="2901938" cy="1714500"/>
+            <wp:effectExtent l="0" t="0" r="0" b="0"/>
+            <wp:docPr id="1656144157" name="Picture 9" descr="Using your hand to determine orientation"/>
+            <wp:cNvGraphicFramePr>
+              <a:graphicFrameLocks xmlns:a="http://schemas.openxmlformats.org/drawingml/2006/main" noChangeAspect="1"/>
+            </wp:cNvGraphicFramePr>
+            <a:graphic xmlns:a="http://schemas.openxmlformats.org/drawingml/2006/main">
+              <a:graphicData uri="http://schemas.openxmlformats.org/drawingml/2006/picture">
+                <pic:pic xmlns:pic="http://schemas.openxmlformats.org/drawingml/2006/picture">
+                  <pic:nvPicPr>
+                    <pic:cNvPr id="0" name="Picture 29" descr="Using your hand to determine orientation"/>
+                    <pic:cNvPicPr>
+                      <a:picLocks noChangeAspect="1" noChangeArrowheads="1"/>
+                    </pic:cNvPicPr>
+                  </pic:nvPicPr>
+                  <pic:blipFill>
+                    <a:blip r:embed="rId22" cstate="print">
+                      <a:extLst>
+                        <a:ext uri="{28A0092B-C50C-407E-A947-70E740481C1C}">
+                          <a14:useLocalDpi xmlns:a14="http://schemas.microsoft.com/office/drawing/2010/main" val="0"/>
+                        </a:ext>
+                      </a:extLst>
+                    </a:blip>
+                    <a:srcRect/>
+                    <a:stretch>
+                      <a:fillRect/>
+                    </a:stretch>
+                  </pic:blipFill>
+                  <pic:spPr bwMode="auto">
+                    <a:xfrm>
+                      <a:off x="0" y="0"/>
+                      <a:ext cx="2909912" cy="1719211"/>
+                    </a:xfrm>
+                    <a:prstGeom prst="rect">
+                      <a:avLst/>
+                    </a:prstGeom>
+                    <a:noFill/>
+                    <a:ln>
+                      <a:noFill/>
+                    </a:ln>
+                  </pic:spPr>
+                </pic:pic>
+              </a:graphicData>
+            </a:graphic>
+          </wp:inline>
+        </w:drawing>
+      </w:r>
+    </w:p>
+    <w:p>
+      <w:pPr>
+        <w:rPr>
+          <w:lang w:val="en-US"/>
+        </w:rPr>
+      </w:pPr>
+      <w:r>
+        <w:rPr>
+          <w:lang w:val="en-US"/>
+        </w:rPr>
+        <w:lastRenderedPageBreak/>
+        <w:t xml:space="preserve">In the above image we </w:t>
+      </w:r>
+      <w:proofErr w:type="gramStart"/>
+      <w:r>
+        <w:rPr>
+          <w:lang w:val="en-US"/>
+        </w:rPr>
+        <w:t>have imagined</w:t>
+      </w:r>
+      <w:proofErr w:type="gramEnd"/>
+      <w:r>
+        <w:rPr>
+          <w:lang w:val="en-US"/>
+        </w:rPr>
+        <w:t xml:space="preserve"> a compass. We then </w:t>
+      </w:r>
+      <w:proofErr w:type="gramStart"/>
+      <w:r>
+        <w:rPr>
+          <w:lang w:val="en-US"/>
+        </w:rPr>
+        <w:t>have to</w:t>
+      </w:r>
+      <w:proofErr w:type="gramEnd"/>
+      <w:r>
+        <w:rPr>
+          <w:lang w:val="en-US"/>
+        </w:rPr>
+        <w:t xml:space="preserve"> describe the direction of the 3 axes (fingers) according to these compass directions in the order of X, Y, Z. In this case it will therefore be North for X, East for Y, and Up for Z. The coordinate system would therefore be North-East-Up (NEU). In total, there </w:t>
+      </w:r>
+      <w:proofErr w:type="gramStart"/>
+      <w:r>
+        <w:rPr>
+          <w:lang w:val="en-US"/>
+        </w:rPr>
+        <w:t>48</w:t>
+      </w:r>
+      <w:proofErr w:type="gramEnd"/>
+      <w:r>
+        <w:rPr>
+          <w:lang w:val="en-US"/>
+        </w:rPr>
+        <w:t xml:space="preserve"> possible combinations of coordinate frame configurations.</w:t>
+      </w:r>
+    </w:p>
+    <w:p>
+      <w:pPr>
+        <w:rPr>
+          <w:lang w:val="en-US"/>
+        </w:rPr>
+      </w:pPr>
+      <w:r>
+        <w:rPr>
+          <w:lang w:val="en-US"/>
+        </w:rPr>
+        <w:t xml:space="preserve">The default orientation of the Gundog system is North-East-Down (NED) where the axes readings would be X = 0, Y = 0, and Z = -1. Before we could use data from our hand </w:t>
+      </w:r>
+      <w:proofErr w:type="gramStart"/>
+      <w:r>
+        <w:rPr>
+          <w:lang w:val="en-US"/>
+        </w:rPr>
+        <w:t>accelerometer</w:t>
+      </w:r>
+      <w:proofErr w:type="gramEnd"/>
+      <w:r>
+        <w:rPr>
+          <w:lang w:val="en-US"/>
+        </w:rPr>
+        <w:t xml:space="preserve"> we would have to flip it upside down. Some devices may have a different local coordinate frame, e.g., the END (East-North-Down) coordinate system </w:t>
+      </w:r>
+      <w:proofErr w:type="gramStart"/>
+      <w:r>
+        <w:rPr>
+          <w:lang w:val="en-US"/>
+        </w:rPr>
+        <w:t>assume</w:t>
+      </w:r>
+      <w:proofErr w:type="gramEnd"/>
+      <w:r>
+        <w:rPr>
+          <w:lang w:val="en-US"/>
+        </w:rPr>
+        <w:t xml:space="preserve"> the surge dimension of movement is represented by the z-channel, and the sway and heave dimension, by the x- and y-channels, respectively. Providing the original coordinate system allows the Gundogs system to convert your local system to the global system. The </w:t>
+      </w:r>
+      <w:proofErr w:type="spellStart"/>
+      <w:r>
+        <w:rPr>
+          <w:lang w:val="en-US"/>
+        </w:rPr>
+        <w:t>Gundog.Compass</w:t>
+      </w:r>
+      <w:proofErr w:type="spellEnd"/>
+      <w:r>
+        <w:rPr>
+          <w:lang w:val="en-US"/>
+        </w:rPr>
+        <w:t xml:space="preserve"> function comes with three inputs to allow the user to transform their device’s coordinate frame into the NED that the specific Direction Cosine Matrix (DCM) and quaternion augmentation uses to compute </w:t>
+      </w:r>
+      <w:proofErr w:type="gramStart"/>
+      <w:r>
+        <w:rPr>
+          <w:lang w:val="en-US"/>
+        </w:rPr>
+        <w:t>angles:‘</w:t>
+      </w:r>
+      <w:proofErr w:type="spellStart"/>
+      <w:r>
+        <w:rPr>
+          <w:lang w:val="en-US"/>
+        </w:rPr>
+        <w:t>acc.ref.frame</w:t>
+      </w:r>
+      <w:proofErr w:type="spellEnd"/>
+      <w:r>
+        <w:rPr>
+          <w:lang w:val="en-US"/>
+        </w:rPr>
+        <w:t>’, ‘</w:t>
+      </w:r>
+      <w:proofErr w:type="spellStart"/>
+      <w:r>
+        <w:rPr>
+          <w:lang w:val="en-US"/>
+        </w:rPr>
+        <w:t>positive.g</w:t>
+      </w:r>
+      <w:proofErr w:type="spellEnd"/>
+      <w:proofErr w:type="gramEnd"/>
+      <w:r>
+        <w:rPr>
+          <w:lang w:val="en-US"/>
+        </w:rPr>
+        <w:t>’, and ‘</w:t>
+      </w:r>
+      <w:proofErr w:type="spellStart"/>
+      <w:proofErr w:type="gramStart"/>
+      <w:r>
+        <w:rPr>
+          <w:lang w:val="en-US"/>
+        </w:rPr>
+        <w:t>mag.ref.frame</w:t>
+      </w:r>
+      <w:proofErr w:type="spellEnd"/>
+      <w:proofErr w:type="gramEnd"/>
+      <w:r>
+        <w:rPr>
+          <w:lang w:val="en-US"/>
+        </w:rPr>
+        <w:t>’</w:t>
+      </w:r>
+    </w:p>
+    <w:p/>
     <w:sectPr>
       <w:pgSz w:w="12240" w:h="15840"/>
       <w:pgMar w:top="1440" w:right="1440" w:bottom="1440" w:left="1440" w:header="720" w:footer="720" w:gutter="0"/>
@@ -2159,7 +4564,7 @@
         <w:rFonts w:ascii="Wingdings" w:hAnsi="Wingdings" w:hint="default"/>
       </w:rPr>
     </w:lvl>
-    <w:lvl w:ilvl="3" w:tplc="04090001" w:tentative="1">
+    <w:lvl w:ilvl="3" w:tplc="04090001">
       <w:start w:val="1"/>
       <w:numFmt w:val="bullet"/>
       <w:lvlText w:val=""/>
@@ -2849,7 +5254,6 @@
   <w:style w:type="character" w:default="1" w:styleId="DefaultParagraphFont">
     <w:name w:val="Default Paragraph Font"/>
     <w:uiPriority w:val="1"/>
-    <w:semiHidden/>
     <w:unhideWhenUsed/>
   </w:style>
   <w:style w:type="table" w:default="1" w:styleId="TableNormal">
@@ -3204,6 +5608,145 @@
       </w:tblBorders>
     </w:tblPr>
   </w:style>
+  <w:style w:type="paragraph" w:styleId="NormalWeb">
+    <w:name w:val="Normal (Web)"/>
+    <w:basedOn w:val="Normal"/>
+    <w:uiPriority w:val="99"/>
+    <w:semiHidden/>
+    <w:unhideWhenUsed/>
+    <w:rsid w:val="00E42DF7"/>
+    <w:pPr>
+      <w:spacing w:before="100" w:beforeAutospacing="1" w:after="100" w:afterAutospacing="1" w:line="240" w:lineRule="auto"/>
+    </w:pPr>
+    <w:rPr>
+      <w:rFonts w:ascii="Times New Roman" w:eastAsia="Times New Roman" w:hAnsi="Times New Roman" w:cs="Times New Roman"/>
+      <w:kern w:val="0"/>
+      <w:lang w:val="en-US"/>
+      <w14:ligatures w14:val="none"/>
+    </w:rPr>
+  </w:style>
+  <w:style w:type="paragraph" w:styleId="TOCHeading">
+    <w:name w:val="TOC Heading"/>
+    <w:basedOn w:val="Heading1"/>
+    <w:next w:val="Normal"/>
+    <w:uiPriority w:val="39"/>
+    <w:unhideWhenUsed/>
+    <w:qFormat/>
+    <w:rsid w:val="00E42DF7"/>
+    <w:pPr>
+      <w:spacing w:before="240" w:after="0" w:line="259" w:lineRule="auto"/>
+      <w:outlineLvl w:val="9"/>
+    </w:pPr>
+    <w:rPr>
+      <w:kern w:val="0"/>
+      <w:sz w:val="32"/>
+      <w:szCs w:val="32"/>
+      <w:lang w:val="en-US"/>
+      <w14:ligatures w14:val="none"/>
+    </w:rPr>
+  </w:style>
+  <w:style w:type="paragraph" w:styleId="TOC1">
+    <w:name w:val="toc 1"/>
+    <w:basedOn w:val="Normal"/>
+    <w:next w:val="Normal"/>
+    <w:autoRedefine/>
+    <w:uiPriority w:val="39"/>
+    <w:unhideWhenUsed/>
+    <w:rsid w:val="00E42DF7"/>
+    <w:pPr>
+      <w:spacing w:after="100"/>
+    </w:pPr>
+  </w:style>
+  <w:style w:type="paragraph" w:styleId="TOC3">
+    <w:name w:val="toc 3"/>
+    <w:basedOn w:val="Normal"/>
+    <w:next w:val="Normal"/>
+    <w:autoRedefine/>
+    <w:uiPriority w:val="39"/>
+    <w:unhideWhenUsed/>
+    <w:rsid w:val="00E42DF7"/>
+    <w:pPr>
+      <w:spacing w:after="100"/>
+      <w:ind w:left="480"/>
+    </w:pPr>
+  </w:style>
+  <w:style w:type="paragraph" w:styleId="HTMLPreformatted">
+    <w:name w:val="HTML Preformatted"/>
+    <w:basedOn w:val="Normal"/>
+    <w:link w:val="HTMLPreformattedChar"/>
+    <w:uiPriority w:val="99"/>
+    <w:semiHidden/>
+    <w:unhideWhenUsed/>
+    <w:rsid w:val="00171F82"/>
+    <w:pPr>
+      <w:tabs>
+        <w:tab w:val="left" w:pos="916"/>
+        <w:tab w:val="left" w:pos="1832"/>
+        <w:tab w:val="left" w:pos="2748"/>
+        <w:tab w:val="left" w:pos="3664"/>
+        <w:tab w:val="left" w:pos="4580"/>
+        <w:tab w:val="left" w:pos="5496"/>
+        <w:tab w:val="left" w:pos="6412"/>
+        <w:tab w:val="left" w:pos="7328"/>
+        <w:tab w:val="left" w:pos="8244"/>
+        <w:tab w:val="left" w:pos="9160"/>
+        <w:tab w:val="left" w:pos="10076"/>
+        <w:tab w:val="left" w:pos="10992"/>
+        <w:tab w:val="left" w:pos="11908"/>
+        <w:tab w:val="left" w:pos="12824"/>
+        <w:tab w:val="left" w:pos="13740"/>
+        <w:tab w:val="left" w:pos="14656"/>
+      </w:tabs>
+      <w:spacing w:after="0" w:line="240" w:lineRule="auto"/>
+    </w:pPr>
+    <w:rPr>
+      <w:rFonts w:ascii="Courier New" w:eastAsia="Times New Roman" w:hAnsi="Courier New" w:cs="Courier New"/>
+      <w:kern w:val="0"/>
+      <w:sz w:val="20"/>
+      <w:szCs w:val="20"/>
+      <w:lang w:val="en-US"/>
+      <w14:ligatures w14:val="none"/>
+    </w:rPr>
+  </w:style>
+  <w:style w:type="character" w:customStyle="1" w:styleId="HTMLPreformattedChar">
+    <w:name w:val="HTML Preformatted Char"/>
+    <w:basedOn w:val="DefaultParagraphFont"/>
+    <w:link w:val="HTMLPreformatted"/>
+    <w:uiPriority w:val="99"/>
+    <w:semiHidden/>
+    <w:rsid w:val="00171F82"/>
+    <w:rPr>
+      <w:rFonts w:ascii="Courier New" w:eastAsia="Times New Roman" w:hAnsi="Courier New" w:cs="Courier New"/>
+      <w:kern w:val="0"/>
+      <w:sz w:val="20"/>
+      <w:szCs w:val="20"/>
+      <w14:ligatures w14:val="none"/>
+    </w:rPr>
+  </w:style>
+  <w:style w:type="character" w:customStyle="1" w:styleId="gnj4oy0ck5b">
+    <w:name w:val="gnj4oy0ck5b"/>
+    <w:basedOn w:val="DefaultParagraphFont"/>
+    <w:rsid w:val="00171F82"/>
+  </w:style>
+  <w:style w:type="table" w:styleId="TableGridLight">
+    <w:name w:val="Grid Table Light"/>
+    <w:basedOn w:val="TableNormal"/>
+    <w:uiPriority w:val="40"/>
+    <w:rsid w:val="000C2D12"/>
+    <w:pPr>
+      <w:spacing w:after="0" w:line="240" w:lineRule="auto"/>
+    </w:pPr>
+    <w:tblPr>
+      <w:tblBorders>
+        <w:top w:val="single" w:sz="4" w:space="0" w:color="BFBFBF" w:themeColor="background1" w:themeShade="BF"/>
+        <w:left w:val="single" w:sz="4" w:space="0" w:color="BFBFBF" w:themeColor="background1" w:themeShade="BF"/>
+        <w:bottom w:val="single" w:sz="4" w:space="0" w:color="BFBFBF" w:themeColor="background1" w:themeShade="BF"/>
+        <w:right w:val="single" w:sz="4" w:space="0" w:color="BFBFBF" w:themeColor="background1" w:themeShade="BF"/>
+        <w:insideH w:val="single" w:sz="4" w:space="0" w:color="BFBFBF" w:themeColor="background1" w:themeShade="BF"/>
+        <w:insideV w:val="single" w:sz="4" w:space="0" w:color="BFBFBF" w:themeColor="background1" w:themeShade="BF"/>
+      </w:tblBorders>
+    </w:tblPr>
+  </w:style>
 </w:styles>
 </file>
 
@@ -3520,4 +6063,16 @@
     </a:ext>
   </a:extLst>
 </a:theme>
+</file>
+
+<file path=customXml/item1.xml><?xml version="1.0" encoding="utf-8"?>
+<b:Sources xmlns:b="http://schemas.openxmlformats.org/officeDocument/2006/bibliography" xmlns="http://schemas.openxmlformats.org/officeDocument/2006/bibliography" SelectedStyle="\APASixthEditionOfficeOnline.xsl" StyleName="APA" Version="6"/>
+</file>
+
+<file path=customXml/itemProps1.xml><?xml version="1.0" encoding="utf-8"?>
+<ds:datastoreItem xmlns:ds="http://schemas.openxmlformats.org/officeDocument/2006/customXml" ds:itemID="{BF6BEBFF-0080-4AE7-8B2F-79C044B4447B}">
+  <ds:schemaRefs>
+    <ds:schemaRef ds:uri="http://schemas.openxmlformats.org/officeDocument/2006/bibliography"/>
+  </ds:schemaRefs>
+</ds:datastoreItem>
 </file>
</xml_diff>

<commit_message>
updated to prepare for dead reckoning
</commit_message>
<xml_diff>
--- a/Notes/Worklog.docx
+++ b/Notes/Worklog.docx
@@ -12,7 +12,33 @@
     </w:p>
     <w:p>
       <w:r>
-        <w:t>The impala data was collected by Chris Clemente, Jasmin Annett, Robin Maag, Chris Bird, and Taylor Dick across 3 field deployments in South Africa: 2024, April 2025, and July 2025.  The idea behind the project was to put our custom-designed collars (including an Artemis board which logged GPS and accelerometer data, as well as a stand-alone Axivity) on impalas, record their behaviours with a drone, and then reconstruct their exact behaviours and paths from the acceleration data. The following document now outlines the analysis of this data by me (Oakleigh Wilson).</w:t>
+        <w:t xml:space="preserve">The impala data was collected by Chris Clemente, Jasmin Annett, Robin Maag, Chris Bird, and Taylor Dick across 3 field deployments in South Africa: 2024, April 2025, and July 2025.  The idea behind the project was to put our custom-designed collars (including an Artemis board which logged GPS and accelerometer data, as well as a stand-alone </w:t>
+      </w:r>
+      <w:proofErr w:type="spellStart"/>
+      <w:r>
+        <w:t>Axivity</w:t>
+      </w:r>
+      <w:proofErr w:type="spellEnd"/>
+      <w:r>
+        <w:t>) on impalas, record their behaviours with a drone, and then reconstruct their exact behaviours and paths from the acceleration data.</w:t>
+      </w:r>
+      <w:r>
+        <w:t xml:space="preserve"> Luke Jessup and Jojo Schultz begun the process of understanding the dead reckoning workflow.</w:t>
+      </w:r>
+      <w:r>
+        <w:t xml:space="preserve"> The following document now outlines the </w:t>
+      </w:r>
+      <w:r>
+        <w:t xml:space="preserve">application of the dead reckoning </w:t>
+      </w:r>
+      <w:r>
+        <w:t xml:space="preserve">analysis </w:t>
+      </w:r>
+      <w:r>
+        <w:t xml:space="preserve">as well as behavioural model </w:t>
+      </w:r>
+      <w:r>
+        <w:t>by me (Oakleigh Wilson).</w:t>
       </w:r>
       <w:r>
         <w:t xml:space="preserve"> Annotations done by Amelia Nelson and data crunching assistance by Ethan Norris.</w:t>
@@ -31,632 +57,6 @@
         <w:t>I like to take notes as I work. These are things I observed and decisions I made. It is for my own sake of thinking-out-loud more than anything.</w:t>
       </w:r>
     </w:p>
-    <w:sdt>
-      <w:sdtPr>
-        <w:rPr>
-          <w:rFonts w:asciiTheme="minorHAnsi" w:eastAsiaTheme="minorHAnsi" w:hAnsiTheme="minorHAnsi" w:cstheme="minorBidi"/>
-          <w:color w:val="auto"/>
-          <w:kern w:val="2"/>
-          <w:sz w:val="24"/>
-          <w:szCs w:val="24"/>
-          <w:lang w:val="en-GB"/>
-          <w14:ligatures w14:val="standardContextual"/>
-        </w:rPr>
-        <w:id w:val="4565996"/>
-        <w:docPartObj>
-          <w:docPartGallery w:val="Table of Contents"/>
-          <w:docPartUnique/>
-        </w:docPartObj>
-      </w:sdtPr>
-      <w:sdtEndPr>
-        <w:rPr>
-          <w:b/>
-          <w:bCs/>
-          <w:noProof/>
-        </w:rPr>
-      </w:sdtEndPr>
-      <w:sdtContent>
-        <w:p>
-          <w:pPr>
-            <w:pStyle w:val="TOCHeading"/>
-          </w:pPr>
-          <w:r>
-            <w:t>Contents</w:t>
-          </w:r>
-        </w:p>
-        <w:p>
-          <w:pPr>
-            <w:pStyle w:val="TOC3"/>
-            <w:tabs>
-              <w:tab w:val="right" w:leader="dot" w:pos="9350"/>
-            </w:tabs>
-            <w:rPr>
-              <w:rFonts w:eastAsiaTheme="minorEastAsia"/>
-              <w:noProof/>
-              <w:lang w:val="en-US"/>
-            </w:rPr>
-          </w:pPr>
-          <w:r>
-            <w:fldChar w:fldCharType="begin"/>
-          </w:r>
-          <w:r>
-            <w:instrText xml:space="preserve"> TOC \o "1-3" \h \z \u </w:instrText>
-          </w:r>
-          <w:r>
-            <w:fldChar w:fldCharType="separate"/>
-          </w:r>
-          <w:hyperlink w:anchor="_Toc226310523" w:history="1">
-            <w:r>
-              <w:rPr>
-                <w:rStyle w:val="Hyperlink"/>
-                <w:rFonts w:cs="Arial"/>
-                <w:noProof/>
-              </w:rPr>
-              <w:t>18/03</w:t>
-            </w:r>
-            <w:r>
-              <w:rPr>
-                <w:noProof/>
-                <w:webHidden/>
-              </w:rPr>
-              <w:tab/>
-            </w:r>
-            <w:r>
-              <w:rPr>
-                <w:noProof/>
-                <w:webHidden/>
-              </w:rPr>
-              <w:fldChar w:fldCharType="begin"/>
-            </w:r>
-            <w:r>
-              <w:rPr>
-                <w:noProof/>
-                <w:webHidden/>
-              </w:rPr>
-              <w:instrText xml:space="preserve"> PAGEREF _Toc226310523 \h </w:instrText>
-            </w:r>
-            <w:r>
-              <w:rPr>
-                <w:noProof/>
-                <w:webHidden/>
-              </w:rPr>
-            </w:r>
-            <w:r>
-              <w:rPr>
-                <w:noProof/>
-                <w:webHidden/>
-              </w:rPr>
-              <w:fldChar w:fldCharType="separate"/>
-            </w:r>
-            <w:r>
-              <w:rPr>
-                <w:noProof/>
-                <w:webHidden/>
-              </w:rPr>
-              <w:t>1</w:t>
-            </w:r>
-            <w:r>
-              <w:rPr>
-                <w:noProof/>
-                <w:webHidden/>
-              </w:rPr>
-              <w:fldChar w:fldCharType="end"/>
-            </w:r>
-          </w:hyperlink>
-        </w:p>
-        <w:p>
-          <w:pPr>
-            <w:pStyle w:val="TOC3"/>
-            <w:tabs>
-              <w:tab w:val="right" w:leader="dot" w:pos="9350"/>
-            </w:tabs>
-            <w:rPr>
-              <w:rFonts w:eastAsiaTheme="minorEastAsia"/>
-              <w:noProof/>
-              <w:lang w:val="en-US"/>
-            </w:rPr>
-          </w:pPr>
-          <w:hyperlink w:anchor="_Toc226310524" w:history="1">
-            <w:r>
-              <w:rPr>
-                <w:rStyle w:val="Hyperlink"/>
-                <w:rFonts w:cs="Arial"/>
-                <w:noProof/>
-              </w:rPr>
-              <w:t>19/03</w:t>
-            </w:r>
-            <w:r>
-              <w:rPr>
-                <w:noProof/>
-                <w:webHidden/>
-              </w:rPr>
-              <w:tab/>
-            </w:r>
-            <w:r>
-              <w:rPr>
-                <w:noProof/>
-                <w:webHidden/>
-              </w:rPr>
-              <w:fldChar w:fldCharType="begin"/>
-            </w:r>
-            <w:r>
-              <w:rPr>
-                <w:noProof/>
-                <w:webHidden/>
-              </w:rPr>
-              <w:instrText xml:space="preserve"> PAGEREF _Toc226310524 \h </w:instrText>
-            </w:r>
-            <w:r>
-              <w:rPr>
-                <w:noProof/>
-                <w:webHidden/>
-              </w:rPr>
-            </w:r>
-            <w:r>
-              <w:rPr>
-                <w:noProof/>
-                <w:webHidden/>
-              </w:rPr>
-              <w:fldChar w:fldCharType="separate"/>
-            </w:r>
-            <w:r>
-              <w:rPr>
-                <w:noProof/>
-                <w:webHidden/>
-              </w:rPr>
-              <w:t>2</w:t>
-            </w:r>
-            <w:r>
-              <w:rPr>
-                <w:noProof/>
-                <w:webHidden/>
-              </w:rPr>
-              <w:fldChar w:fldCharType="end"/>
-            </w:r>
-          </w:hyperlink>
-        </w:p>
-        <w:p>
-          <w:pPr>
-            <w:pStyle w:val="TOC3"/>
-            <w:tabs>
-              <w:tab w:val="right" w:leader="dot" w:pos="9350"/>
-            </w:tabs>
-            <w:rPr>
-              <w:rFonts w:eastAsiaTheme="minorEastAsia"/>
-              <w:noProof/>
-              <w:lang w:val="en-US"/>
-            </w:rPr>
-          </w:pPr>
-          <w:hyperlink w:anchor="_Toc226310525" w:history="1">
-            <w:r>
-              <w:rPr>
-                <w:rStyle w:val="Hyperlink"/>
-                <w:rFonts w:cs="Arial"/>
-                <w:noProof/>
-              </w:rPr>
-              <w:t>30/03</w:t>
-            </w:r>
-            <w:r>
-              <w:rPr>
-                <w:noProof/>
-                <w:webHidden/>
-              </w:rPr>
-              <w:tab/>
-            </w:r>
-            <w:r>
-              <w:rPr>
-                <w:noProof/>
-                <w:webHidden/>
-              </w:rPr>
-              <w:fldChar w:fldCharType="begin"/>
-            </w:r>
-            <w:r>
-              <w:rPr>
-                <w:noProof/>
-                <w:webHidden/>
-              </w:rPr>
-              <w:instrText xml:space="preserve"> PAGEREF _Toc226310525 \h </w:instrText>
-            </w:r>
-            <w:r>
-              <w:rPr>
-                <w:noProof/>
-                <w:webHidden/>
-              </w:rPr>
-            </w:r>
-            <w:r>
-              <w:rPr>
-                <w:noProof/>
-                <w:webHidden/>
-              </w:rPr>
-              <w:fldChar w:fldCharType="separate"/>
-            </w:r>
-            <w:r>
-              <w:rPr>
-                <w:noProof/>
-                <w:webHidden/>
-              </w:rPr>
-              <w:t>3</w:t>
-            </w:r>
-            <w:r>
-              <w:rPr>
-                <w:noProof/>
-                <w:webHidden/>
-              </w:rPr>
-              <w:fldChar w:fldCharType="end"/>
-            </w:r>
-          </w:hyperlink>
-        </w:p>
-        <w:p>
-          <w:pPr>
-            <w:pStyle w:val="TOC3"/>
-            <w:tabs>
-              <w:tab w:val="right" w:leader="dot" w:pos="9350"/>
-            </w:tabs>
-            <w:rPr>
-              <w:rFonts w:eastAsiaTheme="minorEastAsia"/>
-              <w:noProof/>
-              <w:lang w:val="en-US"/>
-            </w:rPr>
-          </w:pPr>
-          <w:hyperlink w:anchor="_Toc226310526" w:history="1">
-            <w:r>
-              <w:rPr>
-                <w:rStyle w:val="Hyperlink"/>
-                <w:rFonts w:cs="Arial"/>
-                <w:noProof/>
-              </w:rPr>
-              <w:t>31/03</w:t>
-            </w:r>
-            <w:r>
-              <w:rPr>
-                <w:noProof/>
-                <w:webHidden/>
-              </w:rPr>
-              <w:tab/>
-            </w:r>
-            <w:r>
-              <w:rPr>
-                <w:noProof/>
-                <w:webHidden/>
-              </w:rPr>
-              <w:fldChar w:fldCharType="begin"/>
-            </w:r>
-            <w:r>
-              <w:rPr>
-                <w:noProof/>
-                <w:webHidden/>
-              </w:rPr>
-              <w:instrText xml:space="preserve"> PAGEREF _Toc226310526 \h </w:instrText>
-            </w:r>
-            <w:r>
-              <w:rPr>
-                <w:noProof/>
-                <w:webHidden/>
-              </w:rPr>
-            </w:r>
-            <w:r>
-              <w:rPr>
-                <w:noProof/>
-                <w:webHidden/>
-              </w:rPr>
-              <w:fldChar w:fldCharType="separate"/>
-            </w:r>
-            <w:r>
-              <w:rPr>
-                <w:noProof/>
-                <w:webHidden/>
-              </w:rPr>
-              <w:t>5</w:t>
-            </w:r>
-            <w:r>
-              <w:rPr>
-                <w:noProof/>
-                <w:webHidden/>
-              </w:rPr>
-              <w:fldChar w:fldCharType="end"/>
-            </w:r>
-          </w:hyperlink>
-        </w:p>
-        <w:p>
-          <w:pPr>
-            <w:pStyle w:val="TOC3"/>
-            <w:tabs>
-              <w:tab w:val="right" w:leader="dot" w:pos="9350"/>
-            </w:tabs>
-            <w:rPr>
-              <w:rFonts w:eastAsiaTheme="minorEastAsia"/>
-              <w:noProof/>
-              <w:lang w:val="en-US"/>
-            </w:rPr>
-          </w:pPr>
-          <w:hyperlink w:anchor="_Toc226310527" w:history="1">
-            <w:r>
-              <w:rPr>
-                <w:rStyle w:val="Hyperlink"/>
-                <w:rFonts w:cs="Arial"/>
-                <w:noProof/>
-              </w:rPr>
-              <w:t>01/04</w:t>
-            </w:r>
-            <w:r>
-              <w:rPr>
-                <w:noProof/>
-                <w:webHidden/>
-              </w:rPr>
-              <w:tab/>
-            </w:r>
-            <w:r>
-              <w:rPr>
-                <w:noProof/>
-                <w:webHidden/>
-              </w:rPr>
-              <w:fldChar w:fldCharType="begin"/>
-            </w:r>
-            <w:r>
-              <w:rPr>
-                <w:noProof/>
-                <w:webHidden/>
-              </w:rPr>
-              <w:instrText xml:space="preserve"> PAGEREF _Toc226310527 \h </w:instrText>
-            </w:r>
-            <w:r>
-              <w:rPr>
-                <w:noProof/>
-                <w:webHidden/>
-              </w:rPr>
-            </w:r>
-            <w:r>
-              <w:rPr>
-                <w:noProof/>
-                <w:webHidden/>
-              </w:rPr>
-              <w:fldChar w:fldCharType="separate"/>
-            </w:r>
-            <w:r>
-              <w:rPr>
-                <w:noProof/>
-                <w:webHidden/>
-              </w:rPr>
-              <w:t>5</w:t>
-            </w:r>
-            <w:r>
-              <w:rPr>
-                <w:noProof/>
-                <w:webHidden/>
-              </w:rPr>
-              <w:fldChar w:fldCharType="end"/>
-            </w:r>
-          </w:hyperlink>
-        </w:p>
-        <w:p>
-          <w:pPr>
-            <w:pStyle w:val="TOC3"/>
-            <w:tabs>
-              <w:tab w:val="right" w:leader="dot" w:pos="9350"/>
-            </w:tabs>
-            <w:rPr>
-              <w:rFonts w:eastAsiaTheme="minorEastAsia"/>
-              <w:noProof/>
-              <w:lang w:val="en-US"/>
-            </w:rPr>
-          </w:pPr>
-          <w:hyperlink w:anchor="_Toc226310528" w:history="1">
-            <w:r>
-              <w:rPr>
-                <w:rStyle w:val="Hyperlink"/>
-                <w:rFonts w:cs="Arial"/>
-                <w:noProof/>
-              </w:rPr>
-              <w:t>02/04</w:t>
-            </w:r>
-            <w:r>
-              <w:rPr>
-                <w:noProof/>
-                <w:webHidden/>
-              </w:rPr>
-              <w:tab/>
-            </w:r>
-            <w:r>
-              <w:rPr>
-                <w:noProof/>
-                <w:webHidden/>
-              </w:rPr>
-              <w:fldChar w:fldCharType="begin"/>
-            </w:r>
-            <w:r>
-              <w:rPr>
-                <w:noProof/>
-                <w:webHidden/>
-              </w:rPr>
-              <w:instrText xml:space="preserve"> PAGEREF _Toc226310528 \h </w:instrText>
-            </w:r>
-            <w:r>
-              <w:rPr>
-                <w:noProof/>
-                <w:webHidden/>
-              </w:rPr>
-            </w:r>
-            <w:r>
-              <w:rPr>
-                <w:noProof/>
-                <w:webHidden/>
-              </w:rPr>
-              <w:fldChar w:fldCharType="separate"/>
-            </w:r>
-            <w:r>
-              <w:rPr>
-                <w:noProof/>
-                <w:webHidden/>
-              </w:rPr>
-              <w:t>6</w:t>
-            </w:r>
-            <w:r>
-              <w:rPr>
-                <w:noProof/>
-                <w:webHidden/>
-              </w:rPr>
-              <w:fldChar w:fldCharType="end"/>
-            </w:r>
-          </w:hyperlink>
-        </w:p>
-        <w:p>
-          <w:pPr>
-            <w:pStyle w:val="TOC3"/>
-            <w:tabs>
-              <w:tab w:val="right" w:leader="dot" w:pos="9350"/>
-            </w:tabs>
-            <w:rPr>
-              <w:rFonts w:eastAsiaTheme="minorEastAsia"/>
-              <w:noProof/>
-              <w:lang w:val="en-US"/>
-            </w:rPr>
-          </w:pPr>
-          <w:hyperlink w:anchor="_Toc226310529" w:history="1">
-            <w:r>
-              <w:rPr>
-                <w:rStyle w:val="Hyperlink"/>
-                <w:rFonts w:cs="Arial"/>
-                <w:noProof/>
-              </w:rPr>
-              <w:t>05/04</w:t>
-            </w:r>
-            <w:r>
-              <w:rPr>
-                <w:noProof/>
-                <w:webHidden/>
-              </w:rPr>
-              <w:tab/>
-            </w:r>
-            <w:r>
-              <w:rPr>
-                <w:noProof/>
-                <w:webHidden/>
-              </w:rPr>
-              <w:fldChar w:fldCharType="begin"/>
-            </w:r>
-            <w:r>
-              <w:rPr>
-                <w:noProof/>
-                <w:webHidden/>
-              </w:rPr>
-              <w:instrText xml:space="preserve"> PAGEREF _Toc226310529 \h </w:instrText>
-            </w:r>
-            <w:r>
-              <w:rPr>
-                <w:noProof/>
-                <w:webHidden/>
-              </w:rPr>
-            </w:r>
-            <w:r>
-              <w:rPr>
-                <w:noProof/>
-                <w:webHidden/>
-              </w:rPr>
-              <w:fldChar w:fldCharType="separate"/>
-            </w:r>
-            <w:r>
-              <w:rPr>
-                <w:noProof/>
-                <w:webHidden/>
-              </w:rPr>
-              <w:t>7</w:t>
-            </w:r>
-            <w:r>
-              <w:rPr>
-                <w:noProof/>
-                <w:webHidden/>
-              </w:rPr>
-              <w:fldChar w:fldCharType="end"/>
-            </w:r>
-          </w:hyperlink>
-        </w:p>
-        <w:p>
-          <w:pPr>
-            <w:pStyle w:val="TOC3"/>
-            <w:tabs>
-              <w:tab w:val="right" w:leader="dot" w:pos="9350"/>
-            </w:tabs>
-            <w:rPr>
-              <w:rFonts w:eastAsiaTheme="minorEastAsia"/>
-              <w:noProof/>
-              <w:lang w:val="en-US"/>
-            </w:rPr>
-          </w:pPr>
-          <w:hyperlink w:anchor="_Toc226310530" w:history="1">
-            <w:r>
-              <w:rPr>
-                <w:rStyle w:val="Hyperlink"/>
-                <w:noProof/>
-              </w:rPr>
-              <w:t>Notes on Dead Reckoning variables</w:t>
-            </w:r>
-            <w:r>
-              <w:rPr>
-                <w:noProof/>
-                <w:webHidden/>
-              </w:rPr>
-              <w:tab/>
-            </w:r>
-            <w:r>
-              <w:rPr>
-                <w:noProof/>
-                <w:webHidden/>
-              </w:rPr>
-              <w:fldChar w:fldCharType="begin"/>
-            </w:r>
-            <w:r>
-              <w:rPr>
-                <w:noProof/>
-                <w:webHidden/>
-              </w:rPr>
-              <w:instrText xml:space="preserve"> PAGEREF _Toc226310530 \h </w:instrText>
-            </w:r>
-            <w:r>
-              <w:rPr>
-                <w:noProof/>
-                <w:webHidden/>
-              </w:rPr>
-            </w:r>
-            <w:r>
-              <w:rPr>
-                <w:noProof/>
-                <w:webHidden/>
-              </w:rPr>
-              <w:fldChar w:fldCharType="separate"/>
-            </w:r>
-            <w:r>
-              <w:rPr>
-                <w:noProof/>
-                <w:webHidden/>
-              </w:rPr>
-              <w:t>8</w:t>
-            </w:r>
-            <w:r>
-              <w:rPr>
-                <w:noProof/>
-                <w:webHidden/>
-              </w:rPr>
-              <w:fldChar w:fldCharType="end"/>
-            </w:r>
-          </w:hyperlink>
-        </w:p>
-        <w:p>
-          <w:pPr>
-            <w:pBdr>
-              <w:bottom w:val="single" w:sz="12" w:space="1" w:color="auto"/>
-            </w:pBdr>
-          </w:pPr>
-          <w:r>
-            <w:rPr>
-              <w:b/>
-              <w:bCs/>
-              <w:noProof/>
-            </w:rPr>
-            <w:fldChar w:fldCharType="end"/>
-          </w:r>
-        </w:p>
-      </w:sdtContent>
-    </w:sdt>
     <w:p>
       <w:pPr>
         <w:pStyle w:val="Heading3"/>
@@ -664,14 +64,12 @@
           <w:rFonts w:cs="Arial"/>
         </w:rPr>
       </w:pPr>
-      <w:bookmarkStart w:id="0" w:name="_Toc226310523"/>
       <w:r>
         <w:rPr>
           <w:rFonts w:cs="Arial"/>
         </w:rPr>
         <w:t>18/03</w:t>
       </w:r>
-      <w:bookmarkEnd w:id="0"/>
     </w:p>
     <w:p>
       <w:pPr>
@@ -683,9 +81,31 @@
         <w:spacing w:line="276" w:lineRule="auto"/>
       </w:pPr>
       <w:r>
-        <w:t xml:space="preserve">Some history to this project is that I started it when guiding an undergraduate student through preliminary energy landscape analysis. During this time, we realized that the “perfectly time sychnonised” boards were, in fact, not time synchronised. ChrisC and I spent several weeks trying to align the board with the associated behavioural videos. That work is detailed in this googledoc: </w:t>
-      </w:r>
-      <w:hyperlink r:id="rId6" w:history="1">
+        <w:t xml:space="preserve">Some history to this project is that I started it when guiding an undergraduate student through preliminary energy landscape analysis. During this time, we realized that the “perfectly time </w:t>
+      </w:r>
+      <w:r>
+        <w:t>synchronised</w:t>
+      </w:r>
+      <w:r>
+        <w:t xml:space="preserve">” boards were, in fact, not time synchronised. </w:t>
+      </w:r>
+      <w:proofErr w:type="spellStart"/>
+      <w:r>
+        <w:t>ChrisC</w:t>
+      </w:r>
+      <w:proofErr w:type="spellEnd"/>
+      <w:r>
+        <w:t xml:space="preserve"> and I spent several weeks trying to align the board with the associated behavioural videos. That work is detailed in this </w:t>
+      </w:r>
+      <w:proofErr w:type="spellStart"/>
+      <w:r>
+        <w:t>googledoc</w:t>
+      </w:r>
+      <w:proofErr w:type="spellEnd"/>
+      <w:r>
+        <w:t xml:space="preserve">: </w:t>
+      </w:r>
+      <w:hyperlink r:id="rId8" w:history="1">
         <w:r>
           <w:rPr>
             <w:rStyle w:val="Hyperlink"/>
@@ -733,7 +153,6 @@
         <w:spacing w:line="276" w:lineRule="auto"/>
       </w:pPr>
       <w:r>
-        <w:lastRenderedPageBreak/>
         <w:t xml:space="preserve"> The cameras that were used for data collection all had different ways of encoding the times </w:t>
       </w:r>
       <w:r>
@@ -811,7 +230,15 @@
         <w:spacing w:line="276" w:lineRule="auto"/>
       </w:pPr>
       <w:r>
-        <w:t xml:space="preserve">What this tells me is that my next most valuable endeavour is to figure out the alignment from Robin’s camera. Going to have a crack at that this arvo. </w:t>
+        <w:t xml:space="preserve">What this tells me is that my next most valuable endeavour is to figure out the alignment from Robin’s camera. Going to have a crack at that this </w:t>
+      </w:r>
+      <w:proofErr w:type="spellStart"/>
+      <w:r>
+        <w:t>arvo</w:t>
+      </w:r>
+      <w:proofErr w:type="spellEnd"/>
+      <w:r>
+        <w:t xml:space="preserve">. </w:t>
       </w:r>
       <w:r>
         <w:rPr>
@@ -852,14 +279,13 @@
           <w:rFonts w:cs="Arial"/>
         </w:rPr>
       </w:pPr>
-      <w:bookmarkStart w:id="1" w:name="_Toc226310524"/>
       <w:r>
         <w:rPr>
           <w:rFonts w:cs="Arial"/>
         </w:rPr>
+        <w:lastRenderedPageBreak/>
         <w:t>19/03</w:t>
       </w:r>
-      <w:bookmarkEnd w:id="1"/>
     </w:p>
     <w:p>
       <w:pPr>
@@ -884,7 +310,15 @@
         <w:spacing w:line="276" w:lineRule="auto"/>
       </w:pPr>
       <w:r>
-        <w:t>Below is collar 8 video 2 as annotated by Amelia with the old system (looked correct to the video). Now I have to be able to replicate that with my new system.</w:t>
+        <w:t xml:space="preserve">Below is collar 8 video 2 as annotated by Amelia with the old system (looked correct to the video). Now I </w:t>
+      </w:r>
+      <w:proofErr w:type="gramStart"/>
+      <w:r>
+        <w:t>have to</w:t>
+      </w:r>
+      <w:proofErr w:type="gramEnd"/>
+      <w:r>
+        <w:t xml:space="preserve"> be able to replicate that with my new system.</w:t>
       </w:r>
     </w:p>
     <w:p>
@@ -910,7 +344,7 @@
                     </pic:cNvPicPr>
                   </pic:nvPicPr>
                   <pic:blipFill>
-                    <a:blip r:embed="rId7">
+                    <a:blip r:embed="rId9">
                       <a:extLst>
                         <a:ext uri="{28A0092B-C50C-407E-A947-70E740481C1C}">
                           <a14:useLocalDpi xmlns:a14="http://schemas.microsoft.com/office/drawing/2010/main" val="0"/>
@@ -952,7 +386,15 @@
         <w:spacing w:line="276" w:lineRule="auto"/>
       </w:pPr>
       <w:r>
-        <w:t>Which I was unable to do… Which means that, somewhere my new system is breaking. Which is actually a good sign… because the error is in my new code, not in the data (flow on implications for why the kangaroo stuff isn’t working).</w:t>
+        <w:t xml:space="preserve">Which I was unable to do… Which means that, somewhere my new system is breaking. Which is </w:t>
+      </w:r>
+      <w:proofErr w:type="gramStart"/>
+      <w:r>
+        <w:t>actually a</w:t>
+      </w:r>
+      <w:proofErr w:type="gramEnd"/>
+      <w:r>
+        <w:t xml:space="preserve"> good sign… because the error is in my new code, not in the data (flow on implications for why the kangaroo stuff isn’t working).</w:t>
       </w:r>
     </w:p>
     <w:p>
@@ -978,8 +420,15 @@
         <w:spacing w:line="276" w:lineRule="auto"/>
       </w:pPr>
       <w:r>
-        <w:lastRenderedPageBreak/>
-        <w:t>I reverted all my changes to the plotting method and got the same result. Therefore, either the video times are incorrect or the gps times are incorrect.</w:t>
+        <w:t xml:space="preserve">I reverted all my changes to the plotting method and got the same result. Therefore, either the video times are incorrect or the </w:t>
+      </w:r>
+      <w:proofErr w:type="spellStart"/>
+      <w:r>
+        <w:t>gps</w:t>
+      </w:r>
+      <w:proofErr w:type="spellEnd"/>
+      <w:r>
+        <w:t xml:space="preserve"> times are incorrect.</w:t>
       </w:r>
     </w:p>
     <w:p>
@@ -992,7 +441,15 @@
         <w:spacing w:line="276" w:lineRule="auto"/>
       </w:pPr>
       <w:r>
-        <w:t xml:space="preserve">I rechecked the video times and no joy. Therefore, I think the gps times are wrong. Going to revert all the work I did yesterday back to the original versions. </w:t>
+        <w:t xml:space="preserve">I rechecked the video times and no joy. Therefore, I think the </w:t>
+      </w:r>
+      <w:proofErr w:type="spellStart"/>
+      <w:r>
+        <w:t>gps</w:t>
+      </w:r>
+      <w:proofErr w:type="spellEnd"/>
+      <w:r>
+        <w:t xml:space="preserve"> times are wrong. Going to revert all the work I did yesterday back to the original versions. </w:t>
       </w:r>
     </w:p>
     <w:p>
@@ -1008,7 +465,15 @@
         <w:sym w:font="Wingdings" w:char="F0E0"/>
       </w:r>
       <w:r>
-        <w:t xml:space="preserve"> Note that the kangaroo data had a lot of error not encountered in the impala data (e.g., multiple board resets, skipped reads, incorrect GPS writes, etc). The fact that using the “cleaning code” I wrote for the kangies on the impala caused the impala to break indicates that there is something wrong with the cleaning code…</w:t>
+        <w:t xml:space="preserve"> Note that the kangaroo data had a lot of error not encountered in the impala data (e.g., multiple board resets, skipped reads, incorrect GPS writes, etc). The fact that using the “cleaning code” I wrote for the </w:t>
+      </w:r>
+      <w:proofErr w:type="spellStart"/>
+      <w:r>
+        <w:t>kangies</w:t>
+      </w:r>
+      <w:proofErr w:type="spellEnd"/>
+      <w:r>
+        <w:t xml:space="preserve"> on the impala caused the impala to break indicates that there is something wrong with the cleaning code…</w:t>
       </w:r>
     </w:p>
     <w:p>
@@ -1021,7 +486,15 @@
         <w:spacing w:line="276" w:lineRule="auto"/>
       </w:pPr>
       <w:r>
-        <w:t>Okay, I’m actually going to revert everything. Back to the very beginning and check differences along every step of the way. I created a branch from 5 months ago and will check every step along the way:</w:t>
+        <w:t xml:space="preserve">Okay, I’m </w:t>
+      </w:r>
+      <w:proofErr w:type="gramStart"/>
+      <w:r>
+        <w:t>actually going</w:t>
+      </w:r>
+      <w:proofErr w:type="gramEnd"/>
+      <w:r>
+        <w:t xml:space="preserve"> to revert everything. Back to the very beginning and check differences along every step of the way. I created a branch from 5 months ago and will check every step along the way:</w:t>
       </w:r>
     </w:p>
     <w:p>
@@ -1047,8 +520,13 @@
         <w:spacing w:line="276" w:lineRule="auto"/>
       </w:pPr>
       <w:r>
-        <w:t>Accel stitch: Exactly the same</w:t>
-      </w:r>
+        <w:t xml:space="preserve">Accel stitch: </w:t>
+      </w:r>
+      <w:proofErr w:type="gramStart"/>
+      <w:r>
+        <w:t>Exactly the same</w:t>
+      </w:r>
+      <w:proofErr w:type="gramEnd"/>
     </w:p>
     <w:p>
       <w:pPr>
@@ -1060,7 +538,15 @@
         <w:spacing w:line="276" w:lineRule="auto"/>
       </w:pPr>
       <w:r>
-        <w:t xml:space="preserve">Old method doesn’t account for the internal clock restarting on the accelerometer but when I more closely investigated, it does restart. There are duplicated values in the timestamps. </w:t>
+        <w:t xml:space="preserve">Old method doesn’t account for the internal clock restarting on the </w:t>
+      </w:r>
+      <w:proofErr w:type="gramStart"/>
+      <w:r>
+        <w:t>accelerometer</w:t>
+      </w:r>
+      <w:proofErr w:type="gramEnd"/>
+      <w:r>
+        <w:t xml:space="preserve"> but when I more closely investigated, it does restart. There are duplicated values in the timestamps. </w:t>
       </w:r>
       <w:r>
         <w:sym w:font="Wingdings" w:char="F0E0"/>
@@ -1109,7 +595,7 @@
                     </pic:cNvPicPr>
                   </pic:nvPicPr>
                   <pic:blipFill>
-                    <a:blip r:embed="rId8">
+                    <a:blip r:embed="rId10">
                       <a:extLst>
                         <a:ext uri="{28A0092B-C50C-407E-A947-70E740481C1C}">
                           <a14:useLocalDpi xmlns:a14="http://schemas.microsoft.com/office/drawing/2010/main" val="0"/>
@@ -1151,8 +637,14 @@
         <w:spacing w:line="276" w:lineRule="auto"/>
       </w:pPr>
       <w:r>
-        <w:t>Reordered the dataset by the reset events and then removed the misreads where there was an uneven increment between the internal and external times on the gps_board</w:t>
-      </w:r>
+        <w:lastRenderedPageBreak/>
+        <w:t xml:space="preserve">Reordered the dataset by the reset events and then removed the misreads where there was an uneven increment between the internal and external times on the </w:t>
+      </w:r>
+      <w:proofErr w:type="spellStart"/>
+      <w:r>
+        <w:t>gps_board</w:t>
+      </w:r>
+      <w:proofErr w:type="spellEnd"/>
     </w:p>
     <w:p>
       <w:pPr>
@@ -1161,14 +653,12 @@
           <w:rFonts w:cs="Arial"/>
         </w:rPr>
       </w:pPr>
-      <w:bookmarkStart w:id="2" w:name="_Toc226310525"/>
       <w:r>
         <w:rPr>
           <w:rFonts w:cs="Arial"/>
         </w:rPr>
         <w:t>30/03</w:t>
       </w:r>
-      <w:bookmarkEnd w:id="2"/>
     </w:p>
     <w:p>
       <w:pPr>
@@ -1206,7 +696,15 @@
         <w:spacing w:line="276" w:lineRule="auto"/>
       </w:pPr>
       <w:r>
-        <w:t>Below confirmed that the gps timestamps stay the same after writing and reading but also converted everything to numeric to be safe.</w:t>
+        <w:t xml:space="preserve">Below confirmed that the </w:t>
+      </w:r>
+      <w:proofErr w:type="spellStart"/>
+      <w:r>
+        <w:t>gps</w:t>
+      </w:r>
+      <w:proofErr w:type="spellEnd"/>
+      <w:r>
+        <w:t xml:space="preserve"> timestamps stay the same after writing and reading but also converted everything to numeric to be safe.</w:t>
       </w:r>
     </w:p>
     <w:p>
@@ -1218,7 +716,6 @@
         <w:rPr>
           <w:noProof/>
         </w:rPr>
-        <w:lastRenderedPageBreak/>
         <w:drawing>
           <wp:inline distT="0" distB="0" distL="0" distR="0" wp14:anchorId="4624871F" wp14:editId="1CFCFF8E">
             <wp:extent cx="2152650" cy="1266825"/>
@@ -1237,7 +734,7 @@
                     </pic:cNvPicPr>
                   </pic:nvPicPr>
                   <pic:blipFill>
-                    <a:blip r:embed="rId9">
+                    <a:blip r:embed="rId11">
                       <a:extLst>
                         <a:ext uri="{28A0092B-C50C-407E-A947-70E740481C1C}">
                           <a14:useLocalDpi xmlns:a14="http://schemas.microsoft.com/office/drawing/2010/main" val="0"/>
@@ -1309,7 +806,7 @@
                     </pic:cNvPicPr>
                   </pic:nvPicPr>
                   <pic:blipFill>
-                    <a:blip r:embed="rId10" cstate="print">
+                    <a:blip r:embed="rId12" cstate="print">
                       <a:extLst>
                         <a:ext uri="{28A0092B-C50C-407E-A947-70E740481C1C}">
                           <a14:useLocalDpi xmlns:a14="http://schemas.microsoft.com/office/drawing/2010/main" val="0"/>
@@ -1382,7 +879,23 @@
         <w:spacing w:line="276" w:lineRule="auto"/>
       </w:pPr>
       <w:r>
-        <w:t>But somehow they are then getting back mixed together after I combine the accel and gps?</w:t>
+        <w:t xml:space="preserve">But </w:t>
+      </w:r>
+      <w:proofErr w:type="gramStart"/>
+      <w:r>
+        <w:t>somehow</w:t>
+      </w:r>
+      <w:proofErr w:type="gramEnd"/>
+      <w:r>
+        <w:t xml:space="preserve"> they are then getting back mixed together after I combine the accel and </w:t>
+      </w:r>
+      <w:proofErr w:type="spellStart"/>
+      <w:r>
+        <w:t>gps</w:t>
+      </w:r>
+      <w:proofErr w:type="spellEnd"/>
+      <w:r>
+        <w:t>?</w:t>
       </w:r>
     </w:p>
     <w:p>
@@ -1421,7 +934,7 @@
                     </pic:cNvPicPr>
                   </pic:nvPicPr>
                   <pic:blipFill>
-                    <a:blip r:embed="rId11" cstate="print">
+                    <a:blip r:embed="rId13" cstate="print">
                       <a:extLst>
                         <a:ext uri="{28A0092B-C50C-407E-A947-70E740481C1C}">
                           <a14:useLocalDpi xmlns:a14="http://schemas.microsoft.com/office/drawing/2010/main" val="0"/>
@@ -1474,7 +987,7 @@
                     </pic:cNvPicPr>
                   </pic:nvPicPr>
                   <pic:blipFill>
-                    <a:blip r:embed="rId12" cstate="print">
+                    <a:blip r:embed="rId14" cstate="print">
                       <a:extLst>
                         <a:ext uri="{28A0092B-C50C-407E-A947-70E740481C1C}">
                           <a14:useLocalDpi xmlns:a14="http://schemas.microsoft.com/office/drawing/2010/main" val="0"/>
@@ -1559,7 +1072,7 @@
                     </pic:cNvPicPr>
                   </pic:nvPicPr>
                   <pic:blipFill>
-                    <a:blip r:embed="rId13">
+                    <a:blip r:embed="rId15">
                       <a:extLst>
                         <a:ext uri="{28A0092B-C50C-407E-A947-70E740481C1C}">
                           <a14:useLocalDpi xmlns:a14="http://schemas.microsoft.com/office/drawing/2010/main" val="0"/>
@@ -1617,14 +1130,12 @@
           <w:rFonts w:cs="Arial"/>
         </w:rPr>
       </w:pPr>
-      <w:bookmarkStart w:id="3" w:name="_Toc226310526"/>
       <w:r>
         <w:rPr>
           <w:rFonts w:cs="Arial"/>
         </w:rPr>
         <w:t>31/03</w:t>
       </w:r>
-      <w:bookmarkEnd w:id="3"/>
     </w:p>
     <w:p>
       <w:pPr>
@@ -1649,7 +1160,23 @@
         <w:spacing w:line="276" w:lineRule="auto"/>
       </w:pPr>
       <w:r>
-        <w:t xml:space="preserve">Wait. Wait. It seems like it might already be aligned? If you watch a video a sufficient number of times, you can gaslight yourself into literally anything. (Robin Vid </w:t>
+        <w:t xml:space="preserve">Wait. Wait. It seems like it might already be </w:t>
+      </w:r>
+      <w:proofErr w:type="gramStart"/>
+      <w:r>
+        <w:t>aligned?</w:t>
+      </w:r>
+      <w:proofErr w:type="gramEnd"/>
+      <w:r>
+        <w:t xml:space="preserve"> If you watch a video </w:t>
+      </w:r>
+      <w:proofErr w:type="gramStart"/>
+      <w:r>
+        <w:t>a sufficient number of</w:t>
+      </w:r>
+      <w:proofErr w:type="gramEnd"/>
+      <w:r>
+        <w:t xml:space="preserve"> times, you can gaslight yourself into literally anything. (Robin Vid </w:t>
       </w:r>
       <w:r>
         <w:t>8</w:t>
@@ -1705,7 +1232,15 @@
         <w:spacing w:line="276" w:lineRule="auto"/>
       </w:pPr>
       <w:r>
-        <w:t>Amazing! So it was aligned and Amelia did a tonne of work on it.</w:t>
+        <w:t xml:space="preserve">Amazing! </w:t>
+      </w:r>
+      <w:proofErr w:type="gramStart"/>
+      <w:r>
+        <w:t>So</w:t>
+      </w:r>
+      <w:proofErr w:type="gramEnd"/>
+      <w:r>
+        <w:t xml:space="preserve"> it was aligned and Amelia did a tonne of work on it.</w:t>
       </w:r>
     </w:p>
     <w:p>
@@ -1715,7 +1250,6 @@
           <w:rFonts w:cs="Arial"/>
         </w:rPr>
       </w:pPr>
-      <w:bookmarkStart w:id="4" w:name="_Toc226310527"/>
       <w:r>
         <w:rPr>
           <w:rFonts w:cs="Arial"/>
@@ -1728,7 +1262,6 @@
         </w:rPr>
         <w:t>1/04</w:t>
       </w:r>
-      <w:bookmarkEnd w:id="4"/>
     </w:p>
     <w:p>
       <w:pPr>
@@ -1741,7 +1274,7 @@
       <w:r>
         <w:t>I quickly wrote up an instructions doc for how to do the alignment (</w:t>
       </w:r>
-      <w:hyperlink r:id="rId14" w:history="1">
+      <w:hyperlink r:id="rId16" w:history="1">
         <w:r>
           <w:rPr>
             <w:rStyle w:val="Hyperlink"/>
@@ -1752,7 +1285,7 @@
       <w:r>
         <w:t>). Now doing one for sanity checking (</w:t>
       </w:r>
-      <w:hyperlink r:id="rId15" w:history="1">
+      <w:hyperlink r:id="rId17" w:history="1">
         <w:r>
           <w:rPr>
             <w:rStyle w:val="Hyperlink"/>
@@ -1798,9 +1331,9 @@
         </w:rPr>
         <w:lastRenderedPageBreak/>
         <w:drawing>
-          <wp:inline distT="0" distB="0" distL="0" distR="0" wp14:anchorId="0CD36A4C" wp14:editId="704F104C">
-            <wp:extent cx="4035972" cy="2120987"/>
-            <wp:effectExtent l="0" t="0" r="3175" b="0"/>
+          <wp:inline distT="0" distB="0" distL="0" distR="0" wp14:anchorId="0CD36A4C" wp14:editId="5953D242">
+            <wp:extent cx="3358055" cy="1764727"/>
+            <wp:effectExtent l="0" t="0" r="0" b="6985"/>
             <wp:docPr id="1212934250" name="Picture 2"/>
             <wp:cNvGraphicFramePr>
               <a:graphicFrameLocks xmlns:a="http://schemas.openxmlformats.org/drawingml/2006/main" noChangeAspect="1"/>
@@ -1815,7 +1348,7 @@
                     </pic:cNvPicPr>
                   </pic:nvPicPr>
                   <pic:blipFill>
-                    <a:blip r:embed="rId16" cstate="print">
+                    <a:blip r:embed="rId18" cstate="print">
                       <a:extLst>
                         <a:ext uri="{28A0092B-C50C-407E-A947-70E740481C1C}">
                           <a14:useLocalDpi xmlns:a14="http://schemas.microsoft.com/office/drawing/2010/main" val="0"/>
@@ -1830,7 +1363,7 @@
                   <pic:spPr bwMode="auto">
                     <a:xfrm>
                       <a:off x="0" y="0"/>
-                      <a:ext cx="4055960" cy="2131491"/>
+                      <a:ext cx="3391238" cy="1782165"/>
                     </a:xfrm>
                     <a:prstGeom prst="rect">
                       <a:avLst/>
@@ -1843,16 +1376,14 @@
           </wp:inline>
         </w:drawing>
       </w:r>
-    </w:p>
-    <w:p>
       <w:r>
         <w:rPr>
           <w:noProof/>
         </w:rPr>
         <w:drawing>
-          <wp:inline distT="0" distB="0" distL="0" distR="0" wp14:anchorId="3CA3BCFF" wp14:editId="0BA5E469">
-            <wp:extent cx="4335517" cy="2278405"/>
-            <wp:effectExtent l="0" t="0" r="8255" b="7620"/>
+          <wp:inline distT="0" distB="0" distL="0" distR="0" wp14:anchorId="3CA3BCFF" wp14:editId="62652FBD">
+            <wp:extent cx="3389586" cy="1781298"/>
+            <wp:effectExtent l="0" t="0" r="1905" b="0"/>
             <wp:docPr id="136574854" name="Picture 4"/>
             <wp:cNvGraphicFramePr>
               <a:graphicFrameLocks xmlns:a="http://schemas.openxmlformats.org/drawingml/2006/main" noChangeAspect="1"/>
@@ -1867,7 +1398,7 @@
                     </pic:cNvPicPr>
                   </pic:nvPicPr>
                   <pic:blipFill>
-                    <a:blip r:embed="rId17" cstate="print">
+                    <a:blip r:embed="rId19" cstate="print">
                       <a:extLst>
                         <a:ext uri="{28A0092B-C50C-407E-A947-70E740481C1C}">
                           <a14:useLocalDpi xmlns:a14="http://schemas.microsoft.com/office/drawing/2010/main" val="0"/>
@@ -1882,7 +1413,7 @@
                   <pic:spPr bwMode="auto">
                     <a:xfrm>
                       <a:off x="0" y="0"/>
-                      <a:ext cx="4360224" cy="2291389"/>
+                      <a:ext cx="3414755" cy="1794525"/>
                     </a:xfrm>
                     <a:prstGeom prst="rect">
                       <a:avLst/>
@@ -1903,14 +1434,12 @@
           <w:rFonts w:cs="Arial"/>
         </w:rPr>
       </w:pPr>
-      <w:bookmarkStart w:id="5" w:name="_Toc226310528"/>
       <w:r>
         <w:rPr>
           <w:rFonts w:cs="Arial"/>
         </w:rPr>
         <w:t>02/04</w:t>
       </w:r>
-      <w:bookmarkEnd w:id="5"/>
     </w:p>
     <w:p>
       <w:pPr>
@@ -1928,6 +1457,7 @@
       <w:tblPr>
         <w:tblStyle w:val="TableGrid"/>
         <w:tblW w:w="0" w:type="auto"/>
+        <w:jc w:val="center"/>
         <w:tblLook w:val="04A0" w:firstRow="1" w:lastRow="0" w:firstColumn="1" w:lastColumn="0" w:noHBand="0" w:noVBand="1"/>
       </w:tblPr>
       <w:tblGrid>
@@ -1936,6 +1466,9 @@
         <w:gridCol w:w="2885"/>
       </w:tblGrid>
       <w:tr>
+        <w:trPr>
+          <w:jc w:val="center"/>
+        </w:trPr>
         <w:tc>
           <w:tcPr>
             <w:tcW w:w="2690" w:type="dxa"/>
@@ -1998,14 +1531,19 @@
         </w:tc>
       </w:tr>
       <w:tr>
+        <w:trPr>
+          <w:jc w:val="center"/>
+        </w:trPr>
         <w:tc>
           <w:tcPr>
             <w:tcW w:w="2690" w:type="dxa"/>
           </w:tcPr>
           <w:p>
+            <w:proofErr w:type="spellStart"/>
             <w:r>
               <w:t>Foraging_Walking</w:t>
             </w:r>
+            <w:proofErr w:type="spellEnd"/>
           </w:p>
         </w:tc>
         <w:tc>
@@ -2030,6 +1568,9 @@
         </w:tc>
       </w:tr>
       <w:tr>
+        <w:trPr>
+          <w:jc w:val="center"/>
+        </w:trPr>
         <w:tc>
           <w:tcPr>
             <w:tcW w:w="2690" w:type="dxa"/>
@@ -2058,6 +1599,9 @@
         </w:tc>
       </w:tr>
       <w:tr>
+        <w:trPr>
+          <w:jc w:val="center"/>
+        </w:trPr>
         <w:tc>
           <w:tcPr>
             <w:tcW w:w="2690" w:type="dxa"/>
@@ -2086,6 +1630,9 @@
         </w:tc>
       </w:tr>
       <w:tr>
+        <w:trPr>
+          <w:jc w:val="center"/>
+        </w:trPr>
         <w:tc>
           <w:tcPr>
             <w:tcW w:w="2690" w:type="dxa"/>
@@ -2118,6 +1665,9 @@
         </w:tc>
       </w:tr>
       <w:tr>
+        <w:trPr>
+          <w:jc w:val="center"/>
+        </w:trPr>
         <w:tc>
           <w:tcPr>
             <w:tcW w:w="2690" w:type="dxa"/>
@@ -2146,14 +1696,19 @@
         </w:tc>
       </w:tr>
       <w:tr>
+        <w:trPr>
+          <w:jc w:val="center"/>
+        </w:trPr>
         <w:tc>
           <w:tcPr>
             <w:tcW w:w="2690" w:type="dxa"/>
           </w:tcPr>
           <w:p>
+            <w:proofErr w:type="spellStart"/>
             <w:r>
               <w:t>Grazing_Head_Down</w:t>
             </w:r>
+            <w:proofErr w:type="spellEnd"/>
           </w:p>
         </w:tc>
         <w:tc>
@@ -2178,6 +1733,9 @@
         </w:tc>
       </w:tr>
       <w:tr>
+        <w:trPr>
+          <w:jc w:val="center"/>
+        </w:trPr>
         <w:tc>
           <w:tcPr>
             <w:tcW w:w="2690" w:type="dxa"/>
@@ -2206,6 +1764,9 @@
         </w:tc>
       </w:tr>
       <w:tr>
+        <w:trPr>
+          <w:jc w:val="center"/>
+        </w:trPr>
         <w:tc>
           <w:tcPr>
             <w:tcW w:w="2690" w:type="dxa"/>
@@ -2234,14 +1795,19 @@
         </w:tc>
       </w:tr>
       <w:tr>
+        <w:trPr>
+          <w:jc w:val="center"/>
+        </w:trPr>
         <w:tc>
           <w:tcPr>
             <w:tcW w:w="2690" w:type="dxa"/>
           </w:tcPr>
           <w:p>
+            <w:proofErr w:type="spellStart"/>
             <w:r>
               <w:t>Rapid_Head_Movement</w:t>
             </w:r>
+            <w:proofErr w:type="spellEnd"/>
           </w:p>
         </w:tc>
         <w:tc>
@@ -2266,6 +1832,9 @@
         </w:tc>
       </w:tr>
       <w:tr>
+        <w:trPr>
+          <w:jc w:val="center"/>
+        </w:trPr>
         <w:tc>
           <w:tcPr>
             <w:tcW w:w="2690" w:type="dxa"/>
@@ -2298,6 +1867,9 @@
         </w:tc>
       </w:tr>
       <w:tr>
+        <w:trPr>
+          <w:jc w:val="center"/>
+        </w:trPr>
         <w:tc>
           <w:tcPr>
             <w:tcW w:w="2690" w:type="dxa"/>
@@ -2330,6 +1902,9 @@
         </w:tc>
       </w:tr>
       <w:tr>
+        <w:trPr>
+          <w:jc w:val="center"/>
+        </w:trPr>
         <w:tc>
           <w:tcPr>
             <w:tcW w:w="2690" w:type="dxa"/>
@@ -2358,25 +1933,31 @@
         </w:tc>
       </w:tr>
       <w:tr>
+        <w:trPr>
+          <w:jc w:val="center"/>
+        </w:trPr>
         <w:tc>
           <w:tcPr>
             <w:tcW w:w="2690" w:type="dxa"/>
           </w:tcPr>
           <w:p>
-            <w:r>
-              <w:lastRenderedPageBreak/>
-              <w:t>Head_Shake</w:t>
-            </w:r>
-          </w:p>
-        </w:tc>
-        <w:tc>
-          <w:tcPr>
-            <w:tcW w:w="2250" w:type="dxa"/>
-          </w:tcPr>
-          <w:p>
+            <w:proofErr w:type="spellStart"/>
             <w:r>
               <w:t>Head_Shake</w:t>
             </w:r>
+            <w:proofErr w:type="spellEnd"/>
+          </w:p>
+        </w:tc>
+        <w:tc>
+          <w:tcPr>
+            <w:tcW w:w="2250" w:type="dxa"/>
+          </w:tcPr>
+          <w:p>
+            <w:proofErr w:type="spellStart"/>
+            <w:r>
+              <w:t>Head_Shake</w:t>
+            </w:r>
+            <w:proofErr w:type="spellEnd"/>
           </w:p>
         </w:tc>
         <w:tc>
@@ -2391,14 +1972,19 @@
         </w:tc>
       </w:tr>
       <w:tr>
+        <w:trPr>
+          <w:jc w:val="center"/>
+        </w:trPr>
         <w:tc>
           <w:tcPr>
             <w:tcW w:w="2690" w:type="dxa"/>
           </w:tcPr>
           <w:p>
+            <w:proofErr w:type="spellStart"/>
             <w:r>
               <w:t>Grazing_Head_Up</w:t>
             </w:r>
+            <w:proofErr w:type="spellEnd"/>
           </w:p>
         </w:tc>
         <w:tc>
@@ -2423,6 +2009,9 @@
         </w:tc>
       </w:tr>
       <w:tr>
+        <w:trPr>
+          <w:jc w:val="center"/>
+        </w:trPr>
         <w:tc>
           <w:tcPr>
             <w:tcW w:w="2690" w:type="dxa"/>
@@ -2451,6 +2040,9 @@
         </w:tc>
       </w:tr>
       <w:tr>
+        <w:trPr>
+          <w:jc w:val="center"/>
+        </w:trPr>
         <w:tc>
           <w:tcPr>
             <w:tcW w:w="2690" w:type="dxa"/>
@@ -2479,6 +2071,9 @@
         </w:tc>
       </w:tr>
       <w:tr>
+        <w:trPr>
+          <w:jc w:val="center"/>
+        </w:trPr>
         <w:tc>
           <w:tcPr>
             <w:tcW w:w="2690" w:type="dxa"/>
@@ -2507,14 +2102,19 @@
         </w:tc>
       </w:tr>
       <w:tr>
+        <w:trPr>
+          <w:jc w:val="center"/>
+        </w:trPr>
         <w:tc>
           <w:tcPr>
             <w:tcW w:w="2690" w:type="dxa"/>
           </w:tcPr>
           <w:p>
+            <w:proofErr w:type="spellStart"/>
             <w:r>
               <w:t>Lowering_Head</w:t>
             </w:r>
+            <w:proofErr w:type="spellEnd"/>
           </w:p>
         </w:tc>
         <w:tc>
@@ -2539,6 +2139,9 @@
         </w:tc>
       </w:tr>
       <w:tr>
+        <w:trPr>
+          <w:jc w:val="center"/>
+        </w:trPr>
         <w:tc>
           <w:tcPr>
             <w:tcW w:w="2690" w:type="dxa"/>
@@ -2571,6 +2174,9 @@
         </w:tc>
       </w:tr>
       <w:tr>
+        <w:trPr>
+          <w:jc w:val="center"/>
+        </w:trPr>
         <w:tc>
           <w:tcPr>
             <w:tcW w:w="2690" w:type="dxa"/>
@@ -2603,14 +2209,19 @@
         </w:tc>
       </w:tr>
       <w:tr>
+        <w:trPr>
+          <w:jc w:val="center"/>
+        </w:trPr>
         <w:tc>
           <w:tcPr>
             <w:tcW w:w="2690" w:type="dxa"/>
           </w:tcPr>
           <w:p>
+            <w:proofErr w:type="spellStart"/>
             <w:r>
               <w:t>Raising_Head</w:t>
             </w:r>
+            <w:proofErr w:type="spellEnd"/>
           </w:p>
         </w:tc>
         <w:tc>
@@ -2674,10 +2285,37 @@
         </w:numPr>
       </w:pPr>
       <w:r>
+        <w:lastRenderedPageBreak/>
         <w:sym w:font="Wingdings" w:char="F0E0"/>
       </w:r>
       <w:r>
-        <w:t xml:space="preserve"> am actually now editing the matlab to be able to read annotations if they exist, and then you can override to 0 if its an error</w:t>
+        <w:t xml:space="preserve"> am </w:t>
+      </w:r>
+      <w:proofErr w:type="gramStart"/>
+      <w:r>
+        <w:t>actually now</w:t>
+      </w:r>
+      <w:proofErr w:type="gramEnd"/>
+      <w:r>
+        <w:t xml:space="preserve"> editing the </w:t>
+      </w:r>
+      <w:proofErr w:type="spellStart"/>
+      <w:r>
+        <w:t>matlab</w:t>
+      </w:r>
+      <w:proofErr w:type="spellEnd"/>
+      <w:r>
+        <w:t xml:space="preserve"> to be able to read annotations if they exist, and then you can override to 0 if </w:t>
+      </w:r>
+      <w:proofErr w:type="spellStart"/>
+      <w:proofErr w:type="gramStart"/>
+      <w:r>
+        <w:t>its</w:t>
+      </w:r>
+      <w:proofErr w:type="spellEnd"/>
+      <w:proofErr w:type="gramEnd"/>
+      <w:r>
+        <w:t xml:space="preserve"> an error</w:t>
       </w:r>
     </w:p>
     <w:p>
@@ -2713,7 +2351,15 @@
         </w:numPr>
       </w:pPr>
       <w:r>
-        <w:t>Now to go through and clean all the data… Well, I’ll have to redo it when there’s more data, so this was more just to prove the concept tbh.</w:t>
+        <w:t xml:space="preserve">Now to go through and clean all the data… Well, I’ll have to redo it when there’s more data, so this was more just to prove the concept </w:t>
+      </w:r>
+      <w:proofErr w:type="spellStart"/>
+      <w:r>
+        <w:t>tbh</w:t>
+      </w:r>
+      <w:proofErr w:type="spellEnd"/>
+      <w:r>
+        <w:t>.</w:t>
       </w:r>
     </w:p>
     <w:p>
@@ -2723,14 +2369,12 @@
           <w:rFonts w:cs="Arial"/>
         </w:rPr>
       </w:pPr>
-      <w:bookmarkStart w:id="6" w:name="_Toc226310529"/>
       <w:r>
         <w:rPr>
           <w:rFonts w:cs="Arial"/>
         </w:rPr>
         <w:t>05/04</w:t>
       </w:r>
-      <w:bookmarkEnd w:id="6"/>
     </w:p>
     <w:p>
       <w:pPr>
@@ -2753,7 +2397,15 @@
         </w:numPr>
       </w:pPr>
       <w:r>
-        <w:t>I feel really unwell but trying to do a little of this before I go to sleep. Trying to get the dead reckoning script set up for Ethan to work on in a fortnight.</w:t>
+        <w:t xml:space="preserve">I feel </w:t>
+      </w:r>
+      <w:proofErr w:type="gramStart"/>
+      <w:r>
+        <w:t>really unwell</w:t>
+      </w:r>
+      <w:proofErr w:type="gramEnd"/>
+      <w:r>
+        <w:t xml:space="preserve"> but trying to do a little of this before I go to sleep. Trying to get the dead reckoning script set up for Ethan to work on in a fortnight.</w:t>
       </w:r>
     </w:p>
     <w:p>
@@ -2832,12 +2484,12 @@
     <w:p>
       <w:pPr>
         <w:pStyle w:val="ListParagraph"/>
+        <w:jc w:val="center"/>
       </w:pPr>
       <w:r>
         <w:rPr>
           <w:noProof/>
         </w:rPr>
-        <w:lastRenderedPageBreak/>
         <w:drawing>
           <wp:inline distT="0" distB="0" distL="0" distR="0" wp14:anchorId="26A2EFD0" wp14:editId="4E5FFCCF">
             <wp:extent cx="4819650" cy="2095500"/>
@@ -2856,7 +2508,7 @@
                     </pic:cNvPicPr>
                   </pic:nvPicPr>
                   <pic:blipFill>
-                    <a:blip r:embed="rId18">
+                    <a:blip r:embed="rId20">
                       <a:extLst>
                         <a:ext uri="{28A0092B-C50C-407E-A947-70E740481C1C}">
                           <a14:useLocalDpi xmlns:a14="http://schemas.microsoft.com/office/drawing/2010/main" val="0"/>
@@ -2894,13 +2546,22 @@
         </w:numPr>
       </w:pPr>
       <w:r>
-        <w:t>In the meantime, I just did a Z score normalisation so I can plot them all on the same axes. The below image is what I have to use to figure out the orientation of the collar.</w:t>
+        <w:t xml:space="preserve">In the meantime, I just did a Z score normalisation so I can plot them all on the same axes. The below image is what I </w:t>
+      </w:r>
+      <w:proofErr w:type="gramStart"/>
+      <w:r>
+        <w:t>have to</w:t>
+      </w:r>
+      <w:proofErr w:type="gramEnd"/>
+      <w:r>
+        <w:t xml:space="preserve"> use to figure out the orientation of the collar.</w:t>
       </w:r>
     </w:p>
     <w:p>
       <w:pPr>
         <w:pStyle w:val="NormalWeb"/>
         <w:ind w:left="360"/>
+        <w:jc w:val="center"/>
       </w:pPr>
       <w:r>
         <w:rPr>
@@ -2924,7 +2585,7 @@
                     </pic:cNvPicPr>
                   </pic:nvPicPr>
                   <pic:blipFill>
-                    <a:blip r:embed="rId19">
+                    <a:blip r:embed="rId21">
                       <a:extLst>
                         <a:ext uri="{28A0092B-C50C-407E-A947-70E740481C1C}">
                           <a14:useLocalDpi xmlns:a14="http://schemas.microsoft.com/office/drawing/2010/main" val="0"/>
@@ -2957,6 +2618,7 @@
       <w:tblPr>
         <w:tblStyle w:val="TableGridLight"/>
         <w:tblW w:w="0" w:type="auto"/>
+        <w:jc w:val="center"/>
         <w:tblLayout w:type="fixed"/>
         <w:tblLook w:val="0000" w:firstRow="0" w:lastRow="0" w:firstColumn="0" w:lastColumn="0" w:noHBand="0" w:noVBand="0"/>
       </w:tblPr>
@@ -2967,6 +2629,7 @@
       <w:tr>
         <w:trPr>
           <w:trHeight w:val="305"/>
+          <w:jc w:val="center"/>
         </w:trPr>
         <w:tc>
           <w:tcPr>
@@ -3036,6 +2699,7 @@
       <w:tr>
         <w:trPr>
           <w:trHeight w:val="305"/>
+          <w:jc w:val="center"/>
         </w:trPr>
         <w:tc>
           <w:tcPr>
@@ -3106,6 +2770,7 @@
       <w:tr>
         <w:trPr>
           <w:trHeight w:val="305"/>
+          <w:jc w:val="center"/>
         </w:trPr>
         <w:tc>
           <w:tcPr>
@@ -3176,6 +2841,7 @@
       <w:tr>
         <w:trPr>
           <w:trHeight w:val="305"/>
+          <w:jc w:val="center"/>
         </w:trPr>
         <w:tc>
           <w:tcPr>
@@ -3205,6 +2871,7 @@
                 <w:szCs w:val="22"/>
                 <w:lang w:val="en-US"/>
               </w:rPr>
+              <w:lastRenderedPageBreak/>
               <w:t>RawAZ.sm</w:t>
             </w:r>
           </w:p>
@@ -3246,6 +2913,7 @@
       <w:tr>
         <w:trPr>
           <w:trHeight w:val="305"/>
+          <w:jc w:val="center"/>
         </w:trPr>
         <w:tc>
           <w:tcPr>
@@ -3316,6 +2984,7 @@
       <w:tr>
         <w:trPr>
           <w:trHeight w:val="305"/>
+          <w:jc w:val="center"/>
         </w:trPr>
         <w:tc>
           <w:tcPr>
@@ -3386,6 +3055,7 @@
       <w:tr>
         <w:trPr>
           <w:trHeight w:val="305"/>
+          <w:jc w:val="center"/>
         </w:trPr>
         <w:tc>
           <w:tcPr>
@@ -3456,6 +3126,7 @@
       <w:tr>
         <w:trPr>
           <w:trHeight w:val="305"/>
+          <w:jc w:val="center"/>
         </w:trPr>
         <w:tc>
           <w:tcPr>
@@ -3551,8 +3222,22 @@
         <w:t>notes I wrote previously</w:t>
       </w:r>
       <w:r>
-        <w:t xml:space="preserve"> and copied over from the Mobile Biomechanics Lab github</w:t>
-      </w:r>
+        <w:t xml:space="preserve"> and copied over from the </w:t>
+      </w:r>
+      <w:hyperlink r:id="rId22" w:history="1">
+        <w:r>
+          <w:rPr>
+            <w:rStyle w:val="Hyperlink"/>
+          </w:rPr>
+          <w:t xml:space="preserve">Mobile Biomechanics Lab </w:t>
+        </w:r>
+        <w:r>
+          <w:rPr>
+            <w:rStyle w:val="Hyperlink"/>
+          </w:rPr>
+          <w:t>GitHub</w:t>
+        </w:r>
+      </w:hyperlink>
       <w:r>
         <w:t>)</w:t>
       </w:r>
@@ -3594,7 +3279,23 @@
           <w:bdr w:val="none" w:sz="0" w:space="0" w:color="auto" w:frame="1"/>
           <w:lang w:val="en-US"/>
         </w:rPr>
-        <w:t xml:space="preserve"> Not much, tbh.</w:t>
+        <w:t xml:space="preserve"> Not much, </w:t>
+      </w:r>
+      <w:proofErr w:type="spellStart"/>
+      <w:r>
+        <w:rPr>
+          <w:bdr w:val="none" w:sz="0" w:space="0" w:color="auto" w:frame="1"/>
+          <w:lang w:val="en-US"/>
+        </w:rPr>
+        <w:t>tbh</w:t>
+      </w:r>
+      <w:proofErr w:type="spellEnd"/>
+      <w:r>
+        <w:rPr>
+          <w:bdr w:val="none" w:sz="0" w:space="0" w:color="auto" w:frame="1"/>
+          <w:lang w:val="en-US"/>
+        </w:rPr>
+        <w:t>.</w:t>
       </w:r>
     </w:p>
     <w:p>
@@ -3630,11 +3331,40 @@
         <w:rPr>
           <w:lang w:val="en-US"/>
         </w:rPr>
-        <w:t xml:space="preserve"> So this might be NED with a lot of roll… could also be NWD?</w:t>
-      </w:r>
-    </w:p>
-    <w:p>
-      <w:pPr>
+        <w:t xml:space="preserve"> </w:t>
+      </w:r>
+      <w:proofErr w:type="gramStart"/>
+      <w:r>
+        <w:rPr>
+          <w:lang w:val="en-US"/>
+        </w:rPr>
+        <w:t>So</w:t>
+      </w:r>
+      <w:proofErr w:type="gramEnd"/>
+      <w:r>
+        <w:rPr>
+          <w:lang w:val="en-US"/>
+        </w:rPr>
+        <w:t xml:space="preserve"> this might be NED with a lot of </w:t>
+      </w:r>
+      <w:proofErr w:type="gramStart"/>
+      <w:r>
+        <w:rPr>
+          <w:lang w:val="en-US"/>
+        </w:rPr>
+        <w:t>roll</w:t>
+      </w:r>
+      <w:proofErr w:type="gramEnd"/>
+      <w:r>
+        <w:rPr>
+          <w:lang w:val="en-US"/>
+        </w:rPr>
+        <w:t>… could also be NWD?</w:t>
+      </w:r>
+    </w:p>
+    <w:p>
+      <w:pPr>
+        <w:jc w:val="center"/>
         <w:rPr>
           <w:lang w:val="en-US"/>
         </w:rPr>
@@ -3644,7 +3374,6 @@
           <w:noProof/>
           <w:lang w:val="en-US"/>
         </w:rPr>
-        <w:lastRenderedPageBreak/>
         <w:drawing>
           <wp:inline distT="0" distB="0" distL="0" distR="0" wp14:anchorId="1340ADFE" wp14:editId="6FBADE05">
             <wp:extent cx="5943600" cy="5108575"/>
@@ -3661,7 +3390,7 @@
                     <pic:cNvPicPr/>
                   </pic:nvPicPr>
                   <pic:blipFill>
-                    <a:blip r:embed="rId20"/>
+                    <a:blip r:embed="rId23"/>
                     <a:stretch>
                       <a:fillRect/>
                     </a:stretch>
@@ -3686,11 +3415,9 @@
       <w:pPr>
         <w:pStyle w:val="Heading3"/>
       </w:pPr>
-      <w:bookmarkStart w:id="7" w:name="_Toc226310530"/>
       <w:r>
         <w:t>Notes on Dead Reckoning variables</w:t>
       </w:r>
-      <w:bookmarkEnd w:id="7"/>
     </w:p>
     <w:p>
       <w:pPr>
@@ -3720,7 +3447,35 @@
         <w:rPr>
           <w:lang w:val="en-US"/>
         </w:rPr>
-        <w:t>Raw tri-axial magnetometer data (mag.x,y,z)</w:t>
+        <w:t>Raw tri-axial magnetometer data (</w:t>
+      </w:r>
+      <w:proofErr w:type="spellStart"/>
+      <w:r>
+        <w:rPr>
+          <w:lang w:val="en-US"/>
+        </w:rPr>
+        <w:t>mag.</w:t>
+      </w:r>
+      <w:proofErr w:type="gramStart"/>
+      <w:r>
+        <w:rPr>
+          <w:lang w:val="en-US"/>
+        </w:rPr>
+        <w:t>x,y</w:t>
+      </w:r>
+      <w:proofErr w:type="gramEnd"/>
+      <w:r>
+        <w:rPr>
+          <w:lang w:val="en-US"/>
+        </w:rPr>
+        <w:t>,z</w:t>
+      </w:r>
+      <w:proofErr w:type="spellEnd"/>
+      <w:r>
+        <w:rPr>
+          <w:lang w:val="en-US"/>
+        </w:rPr>
+        <w:t>)</w:t>
       </w:r>
     </w:p>
     <w:p>
@@ -3738,7 +3493,35 @@
         <w:rPr>
           <w:lang w:val="en-US"/>
         </w:rPr>
-        <w:t>Tri-axial static acceleration data (acc.x,y,z) (the smoothed values)</w:t>
+        <w:t>Tri-axial static acceleration data (</w:t>
+      </w:r>
+      <w:proofErr w:type="spellStart"/>
+      <w:r>
+        <w:rPr>
+          <w:lang w:val="en-US"/>
+        </w:rPr>
+        <w:t>acc.</w:t>
+      </w:r>
+      <w:proofErr w:type="gramStart"/>
+      <w:r>
+        <w:rPr>
+          <w:lang w:val="en-US"/>
+        </w:rPr>
+        <w:t>x,y</w:t>
+      </w:r>
+      <w:proofErr w:type="gramEnd"/>
+      <w:r>
+        <w:rPr>
+          <w:lang w:val="en-US"/>
+        </w:rPr>
+        <w:t>,z</w:t>
+      </w:r>
+      <w:proofErr w:type="spellEnd"/>
+      <w:r>
+        <w:rPr>
+          <w:lang w:val="en-US"/>
+        </w:rPr>
+        <w:t>) (the smoothed values)</w:t>
       </w:r>
     </w:p>
     <w:p>
@@ -3756,6 +3539,7 @@
         <w:rPr>
           <w:lang w:val="en-US"/>
         </w:rPr>
+        <w:lastRenderedPageBreak/>
         <w:t>Marked events data (ME) specifying the period of the magnetic calibration period (as denoted by ‘M’ - any other input signifies data acquisition not part of calibration procedure)</w:t>
       </w:r>
     </w:p>
@@ -3810,19 +3594,54 @@
         <w:rPr>
           <w:lang w:val="en-US"/>
         </w:rPr>
-        <w:lastRenderedPageBreak/>
-        <w:t>Estimated pitch offset: Approximately how much was it rotated by? * algorithm = “standard” (standard euler angle approach) or “SAAM” (using quaternions)</w:t>
-      </w:r>
-    </w:p>
-    <w:p>
-      <w:r>
-        <w:rPr>
-          <w:lang w:val="en-US"/>
-        </w:rPr>
-        <w:t xml:space="preserve">We have most of these variables available in the data already, but there are some that we have to figure out. </w:t>
-      </w:r>
-      <w:r>
-        <w:t>To understand the reference coordinate system for this analysis, firstly we have to understand what the axes represent. This analysis system assumes the North-East-Down (NED) system where the X axis will be the surge (forward and back, North and South), Y will be the sway (side to side, East and West), and Z will be heave (up and down).</w:t>
+        <w:t xml:space="preserve">Estimated pitch offset: Approximately how much was it rotated by? * algorithm = “standard” (standard </w:t>
+      </w:r>
+      <w:proofErr w:type="spellStart"/>
+      <w:r>
+        <w:rPr>
+          <w:lang w:val="en-US"/>
+        </w:rPr>
+        <w:t>euler</w:t>
+      </w:r>
+      <w:proofErr w:type="spellEnd"/>
+      <w:r>
+        <w:rPr>
+          <w:lang w:val="en-US"/>
+        </w:rPr>
+        <w:t xml:space="preserve"> angle approach) or “SAAM” (using quaternions)</w:t>
+      </w:r>
+    </w:p>
+    <w:p>
+      <w:r>
+        <w:rPr>
+          <w:lang w:val="en-US"/>
+        </w:rPr>
+        <w:t xml:space="preserve">We have most of these variables available in the data already, but there are some that we </w:t>
+      </w:r>
+      <w:proofErr w:type="gramStart"/>
+      <w:r>
+        <w:rPr>
+          <w:lang w:val="en-US"/>
+        </w:rPr>
+        <w:t>have to</w:t>
+      </w:r>
+      <w:proofErr w:type="gramEnd"/>
+      <w:r>
+        <w:rPr>
+          <w:lang w:val="en-US"/>
+        </w:rPr>
+        <w:t xml:space="preserve"> figure out. </w:t>
+      </w:r>
+      <w:r>
+        <w:t xml:space="preserve">To understand the reference coordinate system for this analysis, firstly we </w:t>
+      </w:r>
+      <w:proofErr w:type="gramStart"/>
+      <w:r>
+        <w:t>have to</w:t>
+      </w:r>
+      <w:proofErr w:type="gramEnd"/>
+      <w:r>
+        <w:t xml:space="preserve"> understand what the axes represent. This analysis system assumes the North-East-Down (NED) system where the X axis will be the surge (forward and back, North and South), Y will be the sway (side to side, East and West), and Z will be heave (up and down).</w:t>
       </w:r>
     </w:p>
     <w:p>
@@ -3837,7 +3656,7 @@
           <w:noProof/>
         </w:rPr>
         <w:drawing>
-          <wp:inline distT="0" distB="0" distL="0" distR="0" wp14:anchorId="58B5C0DB" wp14:editId="45D8CDF4">
+          <wp:inline distT="0" distB="0" distL="0" distR="0" wp14:anchorId="58B5C0DB" wp14:editId="388D1A8A">
             <wp:extent cx="3400425" cy="1743808"/>
             <wp:effectExtent l="0" t="0" r="0" b="8890"/>
             <wp:docPr id="1563100451" name="Picture 8" descr="Linking axes to biology"/>
@@ -3854,7 +3673,7 @@
                     </pic:cNvPicPr>
                   </pic:nvPicPr>
                   <pic:blipFill rotWithShape="1">
-                    <a:blip r:embed="rId21" cstate="print">
+                    <a:blip r:embed="rId24" cstate="print">
                       <a:extLst>
                         <a:ext uri="{28A0092B-C50C-407E-A947-70E740481C1C}">
                           <a14:useLocalDpi xmlns:a14="http://schemas.microsoft.com/office/drawing/2010/main" val="0"/>
@@ -3905,7 +3724,7 @@
           <w:noProof/>
         </w:rPr>
         <w:drawing>
-          <wp:inline distT="0" distB="0" distL="0" distR="0" wp14:anchorId="3BDC6625" wp14:editId="7A270431">
+          <wp:inline distT="0" distB="0" distL="0" distR="0" wp14:anchorId="3BDC6625" wp14:editId="17EEA06C">
             <wp:extent cx="2901938" cy="1714500"/>
             <wp:effectExtent l="0" t="0" r="0" b="0"/>
             <wp:docPr id="1656144157" name="Picture 9" descr="Using your hand to determine orientation"/>
@@ -3922,7 +3741,7 @@
                     </pic:cNvPicPr>
                   </pic:nvPicPr>
                   <pic:blipFill>
-                    <a:blip r:embed="rId22" cstate="print">
+                    <a:blip r:embed="rId25" cstate="print">
                       <a:extLst>
                         <a:ext uri="{28A0092B-C50C-407E-A947-70E740481C1C}">
                           <a14:useLocalDpi xmlns:a14="http://schemas.microsoft.com/office/drawing/2010/main" val="0"/>
@@ -3964,7 +3783,56 @@
         <w:rPr>
           <w:lang w:val="en-US"/>
         </w:rPr>
-        <w:t>In the above image we have imagined a compass. We then have to describe the direction of the 3 axes (fingers) according to these compass directions in the order of X, Y, Z. In this case it will therefore be North for X, East for Y, and Up for Z. The coordinate system would therefore be North-East-Up (NEU). In total, there 48 possible combinations of coordinate frame configurations.</w:t>
+        <w:t xml:space="preserve">In the above image we </w:t>
+      </w:r>
+      <w:proofErr w:type="gramStart"/>
+      <w:r>
+        <w:rPr>
+          <w:lang w:val="en-US"/>
+        </w:rPr>
+        <w:t>have imagined</w:t>
+      </w:r>
+      <w:proofErr w:type="gramEnd"/>
+      <w:r>
+        <w:rPr>
+          <w:lang w:val="en-US"/>
+        </w:rPr>
+        <w:t xml:space="preserve"> a compass. We then </w:t>
+      </w:r>
+      <w:proofErr w:type="gramStart"/>
+      <w:r>
+        <w:rPr>
+          <w:lang w:val="en-US"/>
+        </w:rPr>
+        <w:t>have to</w:t>
+      </w:r>
+      <w:proofErr w:type="gramEnd"/>
+      <w:r>
+        <w:rPr>
+          <w:lang w:val="en-US"/>
+        </w:rPr>
+        <w:t xml:space="preserve"> describe the direction of the 3 axes (fingers) according to these compass directions in the order of X, Y, Z. In this case it will therefore be </w:t>
+      </w:r>
+      <w:r>
+        <w:rPr>
+          <w:lang w:val="en-US"/>
+        </w:rPr>
+        <w:lastRenderedPageBreak/>
+        <w:t xml:space="preserve">North for X, East for Y, and Up for Z. The coordinate system would therefore be North-East-Up (NEU). In total, there </w:t>
+      </w:r>
+      <w:proofErr w:type="gramStart"/>
+      <w:r>
+        <w:rPr>
+          <w:lang w:val="en-US"/>
+        </w:rPr>
+        <w:t>48</w:t>
+      </w:r>
+      <w:proofErr w:type="gramEnd"/>
+      <w:r>
+        <w:rPr>
+          <w:lang w:val="en-US"/>
+        </w:rPr>
+        <w:t xml:space="preserve"> possible combinations of coordinate frame configurations.</w:t>
       </w:r>
     </w:p>
     <w:p>
@@ -3979,12 +3847,99 @@
         </w:rPr>
         <w:t xml:space="preserve">The default orientation of the Gundog system is North-East-Down (NED) where the axes readings would be X = 0, Y = 0, and Z = -1. Before we could use data from our hand </w:t>
       </w:r>
-      <w:r>
-        <w:rPr>
-          <w:lang w:val="en-US"/>
-        </w:rPr>
-        <w:lastRenderedPageBreak/>
-        <w:t>accelerometer we would have to flip it upside down. Some devices may have a different local coordinate frame, e.g., the END (East-North-Down) coordinate system assume the surge dimension of movement is represented by the z-channel, and the sway and heave dimension, by the x- and y-channels, respectively. Providing the original coordinate system allows the Gundogs system to convert your local system to the global system. The Gundog.Compass function comes with three inputs to allow the user to transform their device’s coordinate frame into the NED that the specific Direction Cosine Matrix (DCM) and quaternion augmentation uses to compute angles:‘acc.ref.frame’, ‘positive.g’, and ‘mag.ref.frame’</w:t>
+      <w:proofErr w:type="gramStart"/>
+      <w:r>
+        <w:rPr>
+          <w:lang w:val="en-US"/>
+        </w:rPr>
+        <w:t>accelerometer</w:t>
+      </w:r>
+      <w:proofErr w:type="gramEnd"/>
+      <w:r>
+        <w:rPr>
+          <w:lang w:val="en-US"/>
+        </w:rPr>
+        <w:t xml:space="preserve"> we would have to flip it upside down. Some devices may have a different local coordinate frame, e.g., the END (East-North-Down) coordinate system </w:t>
+      </w:r>
+      <w:proofErr w:type="gramStart"/>
+      <w:r>
+        <w:rPr>
+          <w:lang w:val="en-US"/>
+        </w:rPr>
+        <w:t>assume</w:t>
+      </w:r>
+      <w:proofErr w:type="gramEnd"/>
+      <w:r>
+        <w:rPr>
+          <w:lang w:val="en-US"/>
+        </w:rPr>
+        <w:t xml:space="preserve"> the surge dimension of movement is represented by the z-channel, and the sway and heave dimension, by the x- and y-channels, respectively. Providing the original coordinate system allows the Gundogs system to convert your local system to the global system. The </w:t>
+      </w:r>
+      <w:proofErr w:type="spellStart"/>
+      <w:r>
+        <w:rPr>
+          <w:lang w:val="en-US"/>
+        </w:rPr>
+        <w:t>Gundog.Compass</w:t>
+      </w:r>
+      <w:proofErr w:type="spellEnd"/>
+      <w:r>
+        <w:rPr>
+          <w:lang w:val="en-US"/>
+        </w:rPr>
+        <w:t xml:space="preserve"> function comes with three inputs to allow the user to transform their device’s coordinate frame into the NED that the specific Direction Cosine Matrix (DCM) and quaternion augmentation uses to compute </w:t>
+      </w:r>
+      <w:proofErr w:type="gramStart"/>
+      <w:r>
+        <w:rPr>
+          <w:lang w:val="en-US"/>
+        </w:rPr>
+        <w:t>angles:‘</w:t>
+      </w:r>
+      <w:proofErr w:type="spellStart"/>
+      <w:r>
+        <w:rPr>
+          <w:lang w:val="en-US"/>
+        </w:rPr>
+        <w:t>acc.ref.frame</w:t>
+      </w:r>
+      <w:proofErr w:type="spellEnd"/>
+      <w:r>
+        <w:rPr>
+          <w:lang w:val="en-US"/>
+        </w:rPr>
+        <w:t>’, ‘</w:t>
+      </w:r>
+      <w:proofErr w:type="spellStart"/>
+      <w:r>
+        <w:rPr>
+          <w:lang w:val="en-US"/>
+        </w:rPr>
+        <w:t>positive.g</w:t>
+      </w:r>
+      <w:proofErr w:type="spellEnd"/>
+      <w:proofErr w:type="gramEnd"/>
+      <w:r>
+        <w:rPr>
+          <w:lang w:val="en-US"/>
+        </w:rPr>
+        <w:t>’, and ‘</w:t>
+      </w:r>
+      <w:proofErr w:type="spellStart"/>
+      <w:proofErr w:type="gramStart"/>
+      <w:r>
+        <w:rPr>
+          <w:lang w:val="en-US"/>
+        </w:rPr>
+        <w:t>mag.ref.frame</w:t>
+      </w:r>
+      <w:proofErr w:type="spellEnd"/>
+      <w:proofErr w:type="gramEnd"/>
+      <w:r>
+        <w:rPr>
+          <w:lang w:val="en-US"/>
+        </w:rPr>
+        <w:t>’</w:t>
       </w:r>
     </w:p>
     <w:p>
@@ -3998,13 +3953,7 @@
         <w:rPr>
           <w:rFonts w:cs="Arial"/>
         </w:rPr>
-        <w:t>14</w:t>
-      </w:r>
-      <w:r>
-        <w:rPr>
-          <w:rFonts w:cs="Arial"/>
-        </w:rPr>
-        <w:t>/04</w:t>
+        <w:t>14/04</w:t>
       </w:r>
     </w:p>
     <w:p>
@@ -4030,7 +3979,7 @@
       <w:r>
         <w:t xml:space="preserve">I am now working in the </w:t>
       </w:r>
-      <w:hyperlink r:id="rId23" w:history="1">
+      <w:hyperlink r:id="rId26" w:history="1">
         <w:r>
           <w:rPr>
             <w:rStyle w:val="Hyperlink"/>
@@ -4047,7 +3996,7 @@
       <w:r>
         <w:t xml:space="preserve"> </w:t>
       </w:r>
-      <w:hyperlink r:id="rId24" w:history="1">
+      <w:hyperlink r:id="rId27" w:history="1">
         <w:r>
           <w:rPr>
             <w:rStyle w:val="Hyperlink"/>
@@ -4056,7 +4005,15 @@
         </w:r>
       </w:hyperlink>
       <w:r>
-        <w:t xml:space="preserve"> which Jojo and Luke originally developed. I know that the test trial should result in multiple rectangles but my current trials are getting waves…</w:t>
+        <w:t xml:space="preserve"> which Jojo and Luke originally developed. I know that the test trial should result in multiple </w:t>
+      </w:r>
+      <w:proofErr w:type="gramStart"/>
+      <w:r>
+        <w:t>rectangles</w:t>
+      </w:r>
+      <w:proofErr w:type="gramEnd"/>
+      <w:r>
+        <w:t xml:space="preserve"> but my current trials are getting waves…</w:t>
       </w:r>
       <w:r>
         <w:t xml:space="preserve"> I am now playing around with the different orientations until I get something good.</w:t>
@@ -4077,9 +4034,2049 @@
         <w:t>This approach ended up being futile so my next step is to go back to Jojo’s original code and look for differences line by line.</w:t>
       </w:r>
     </w:p>
+    <w:p>
+      <w:pPr>
+        <w:pStyle w:val="Heading3"/>
+        <w:rPr>
+          <w:rFonts w:cs="Arial"/>
+        </w:rPr>
+      </w:pPr>
+      <w:r>
+        <w:rPr>
+          <w:rFonts w:cs="Arial"/>
+        </w:rPr>
+        <w:t>20</w:t>
+      </w:r>
+      <w:r>
+        <w:rPr>
+          <w:rFonts w:cs="Arial"/>
+        </w:rPr>
+        <w:t>/0</w:t>
+      </w:r>
+      <w:r>
+        <w:rPr>
+          <w:rFonts w:cs="Arial"/>
+        </w:rPr>
+        <w:t>4</w:t>
+      </w:r>
+    </w:p>
+    <w:p>
+      <w:pPr>
+        <w:pStyle w:val="ListParagraph"/>
+        <w:numPr>
+          <w:ilvl w:val="0"/>
+          <w:numId w:val="2"/>
+        </w:numPr>
+      </w:pPr>
+      <w:r>
+        <w:t xml:space="preserve">Last week ended up being completely devoted to figuring out what the problem with the kangaroo collars was. After many – many – hours of effort by Chris Bird and </w:t>
+      </w:r>
+      <w:proofErr w:type="gramStart"/>
+      <w:r>
+        <w:t>I</w:t>
+      </w:r>
+      <w:proofErr w:type="gramEnd"/>
+      <w:r>
+        <w:t>, he determined that the devices were repeatedly pausing (so the internal clock not incrementing and no samples being taken) which is why the GPS and accel were out of alignment. Thank goodness this didn’t happen with the impala data (we checked). Therefore, this week, I can return to this analysis.</w:t>
+      </w:r>
+    </w:p>
+    <w:p>
+      <w:pPr>
+        <w:pStyle w:val="ListParagraph"/>
+        <w:numPr>
+          <w:ilvl w:val="0"/>
+          <w:numId w:val="2"/>
+        </w:numPr>
+      </w:pPr>
+      <w:r>
+        <w:t>I went back to the flat data collected by Luke &amp; Jojo, and, using my existing code, tried to replicate walking around the football field. (following image) and it was way off. At least this is a good sign. I have done something completely wrong.</w:t>
+      </w:r>
+    </w:p>
+    <w:p>
+      <w:pPr>
+        <w:jc w:val="center"/>
+        <w:rPr>
+          <w:lang w:val="en-US"/>
+        </w:rPr>
+      </w:pPr>
+      <w:r>
+        <w:rPr>
+          <w:lang w:val="en-US"/>
+        </w:rPr>
+        <w:lastRenderedPageBreak/>
+        <w:drawing>
+          <wp:inline distT="0" distB="0" distL="0" distR="0" wp14:anchorId="13E62DCE" wp14:editId="7BFBDDDB">
+            <wp:extent cx="3629025" cy="3629025"/>
+            <wp:effectExtent l="0" t="0" r="0" b="9525"/>
+            <wp:docPr id="1210988288" name="Picture 3"/>
+            <wp:cNvGraphicFramePr>
+              <a:graphicFrameLocks xmlns:a="http://schemas.openxmlformats.org/drawingml/2006/main" noChangeAspect="1"/>
+            </wp:cNvGraphicFramePr>
+            <a:graphic xmlns:a="http://schemas.openxmlformats.org/drawingml/2006/main">
+              <a:graphicData uri="http://schemas.openxmlformats.org/drawingml/2006/picture">
+                <pic:pic xmlns:pic="http://schemas.openxmlformats.org/drawingml/2006/picture">
+                  <pic:nvPicPr>
+                    <pic:cNvPr id="0" name="Picture 8"/>
+                    <pic:cNvPicPr>
+                      <a:picLocks noChangeAspect="1" noChangeArrowheads="1"/>
+                    </pic:cNvPicPr>
+                  </pic:nvPicPr>
+                  <pic:blipFill>
+                    <a:blip r:embed="rId28">
+                      <a:extLst>
+                        <a:ext uri="{28A0092B-C50C-407E-A947-70E740481C1C}">
+                          <a14:useLocalDpi xmlns:a14="http://schemas.microsoft.com/office/drawing/2010/main" val="0"/>
+                        </a:ext>
+                      </a:extLst>
+                    </a:blip>
+                    <a:srcRect/>
+                    <a:stretch>
+                      <a:fillRect/>
+                    </a:stretch>
+                  </pic:blipFill>
+                  <pic:spPr bwMode="auto">
+                    <a:xfrm>
+                      <a:off x="0" y="0"/>
+                      <a:ext cx="3629025" cy="3629025"/>
+                    </a:xfrm>
+                    <a:prstGeom prst="rect">
+                      <a:avLst/>
+                    </a:prstGeom>
+                    <a:noFill/>
+                    <a:ln>
+                      <a:noFill/>
+                    </a:ln>
+                  </pic:spPr>
+                </pic:pic>
+              </a:graphicData>
+            </a:graphic>
+          </wp:inline>
+        </w:drawing>
+      </w:r>
+    </w:p>
+    <w:p>
+      <w:pPr>
+        <w:pStyle w:val="ListParagraph"/>
+        <w:numPr>
+          <w:ilvl w:val="0"/>
+          <w:numId w:val="2"/>
+        </w:numPr>
+        <w:rPr>
+          <w:lang w:val="en-US"/>
+        </w:rPr>
+      </w:pPr>
+      <w:r>
+        <w:rPr>
+          <w:lang w:val="en-US"/>
+        </w:rPr>
+        <w:t xml:space="preserve">Working through this is very frustrating and making me depressed again… I don’t have their original </w:t>
+      </w:r>
+      <w:proofErr w:type="gramStart"/>
+      <w:r>
+        <w:rPr>
+          <w:lang w:val="en-US"/>
+        </w:rPr>
+        <w:t>data</w:t>
+      </w:r>
+      <w:proofErr w:type="gramEnd"/>
+      <w:r>
+        <w:rPr>
+          <w:lang w:val="en-US"/>
+        </w:rPr>
+        <w:t xml:space="preserve"> and it is very hard to make sense of their original mess of code but here we go. </w:t>
+      </w:r>
+    </w:p>
+    <w:p>
+      <w:pPr>
+        <w:pStyle w:val="ListParagraph"/>
+        <w:numPr>
+          <w:ilvl w:val="0"/>
+          <w:numId w:val="2"/>
+        </w:numPr>
+        <w:rPr>
+          <w:lang w:val="en-US"/>
+        </w:rPr>
+      </w:pPr>
+      <w:proofErr w:type="gramStart"/>
+      <w:r>
+        <w:rPr>
+          <w:lang w:val="en-US"/>
+        </w:rPr>
+        <w:t>Have</w:t>
+      </w:r>
+      <w:proofErr w:type="gramEnd"/>
+      <w:r>
+        <w:rPr>
+          <w:lang w:val="en-US"/>
+        </w:rPr>
+        <w:t xml:space="preserve"> gone right back to basics and am working through Jojo/Luke code.</w:t>
+      </w:r>
+    </w:p>
+    <w:p>
+      <w:pPr>
+        <w:pStyle w:val="ListParagraph"/>
+        <w:numPr>
+          <w:ilvl w:val="1"/>
+          <w:numId w:val="2"/>
+        </w:numPr>
+        <w:rPr>
+          <w:lang w:val="en-US"/>
+        </w:rPr>
+      </w:pPr>
+      <w:r>
+        <w:rPr>
+          <w:lang w:val="en-US"/>
+        </w:rPr>
+        <w:t xml:space="preserve">I found their original </w:t>
+      </w:r>
+      <w:proofErr w:type="gramStart"/>
+      <w:r>
+        <w:rPr>
+          <w:lang w:val="en-US"/>
+        </w:rPr>
+        <w:t>data</w:t>
+      </w:r>
+      <w:proofErr w:type="gramEnd"/>
+      <w:r>
+        <w:rPr>
+          <w:lang w:val="en-US"/>
+        </w:rPr>
+        <w:t xml:space="preserve"> and </w:t>
+      </w:r>
+      <w:r>
+        <w:rPr>
+          <w:lang w:val="en-US"/>
+        </w:rPr>
+        <w:t>it</w:t>
+      </w:r>
+      <w:r>
+        <w:rPr>
+          <w:lang w:val="en-US"/>
+        </w:rPr>
+        <w:t xml:space="preserve"> works </w:t>
+      </w:r>
+      <w:r>
+        <w:rPr>
+          <w:lang w:val="en-US"/>
+        </w:rPr>
+        <w:t>perfectly</w:t>
+      </w:r>
+      <w:r>
+        <w:rPr>
+          <w:lang w:val="en-US"/>
+        </w:rPr>
+        <w:t xml:space="preserve">. So now I need to remove all variation </w:t>
+      </w:r>
+      <w:r>
+        <w:rPr>
+          <w:lang w:val="en-US"/>
+        </w:rPr>
+        <w:t>between</w:t>
+      </w:r>
+      <w:r>
+        <w:rPr>
+          <w:lang w:val="en-US"/>
+        </w:rPr>
+        <w:t xml:space="preserve"> </w:t>
+      </w:r>
+      <w:proofErr w:type="gramStart"/>
+      <w:r>
+        <w:rPr>
+          <w:lang w:val="en-US"/>
+        </w:rPr>
+        <w:t>theirs</w:t>
+      </w:r>
+      <w:proofErr w:type="gramEnd"/>
+      <w:r>
+        <w:rPr>
+          <w:lang w:val="en-US"/>
+        </w:rPr>
+        <w:t xml:space="preserve"> and mine until I can reliably replicate it.</w:t>
+      </w:r>
+    </w:p>
+    <w:p>
+      <w:pPr>
+        <w:pStyle w:val="ListParagraph"/>
+        <w:numPr>
+          <w:ilvl w:val="1"/>
+          <w:numId w:val="2"/>
+        </w:numPr>
+        <w:rPr>
+          <w:lang w:val="en-US"/>
+        </w:rPr>
+      </w:pPr>
+      <w:r>
+        <w:rPr>
+          <w:lang w:val="en-US"/>
+        </w:rPr>
+        <w:t xml:space="preserve">Found the error – or at least one of them. My magnetometer has not been scaled in the same way as theirs has. </w:t>
+      </w:r>
+    </w:p>
+    <w:p>
+      <w:pPr>
+        <w:rPr>
+          <w:lang w:val="en-US"/>
+        </w:rPr>
+      </w:pPr>
+      <w:r>
+        <w:rPr>
+          <w:lang w:val="en-US"/>
+        </w:rPr>
+        <w:t xml:space="preserve">Their data: </w:t>
+      </w:r>
+    </w:p>
+    <w:p>
+      <w:pPr>
+        <w:rPr>
+          <w:lang w:val="en-US"/>
+        </w:rPr>
+      </w:pPr>
+      <w:r>
+        <w:rPr>
+          <w:lang w:val="en-US"/>
+        </w:rPr>
+        <w:drawing>
+          <wp:inline distT="0" distB="0" distL="0" distR="0" wp14:anchorId="62D53E0D" wp14:editId="2892914D">
+            <wp:extent cx="6858000" cy="870585"/>
+            <wp:effectExtent l="0" t="0" r="0" b="5715"/>
+            <wp:docPr id="1834524787" name="Picture 1"/>
+            <wp:cNvGraphicFramePr>
+              <a:graphicFrameLocks xmlns:a="http://schemas.openxmlformats.org/drawingml/2006/main" noChangeAspect="1"/>
+            </wp:cNvGraphicFramePr>
+            <a:graphic xmlns:a="http://schemas.openxmlformats.org/drawingml/2006/main">
+              <a:graphicData uri="http://schemas.openxmlformats.org/drawingml/2006/picture">
+                <pic:pic xmlns:pic="http://schemas.openxmlformats.org/drawingml/2006/picture">
+                  <pic:nvPicPr>
+                    <pic:cNvPr id="1834524787" name=""/>
+                    <pic:cNvPicPr/>
+                  </pic:nvPicPr>
+                  <pic:blipFill>
+                    <a:blip r:embed="rId29"/>
+                    <a:stretch>
+                      <a:fillRect/>
+                    </a:stretch>
+                  </pic:blipFill>
+                  <pic:spPr>
+                    <a:xfrm>
+                      <a:off x="0" y="0"/>
+                      <a:ext cx="6858000" cy="870585"/>
+                    </a:xfrm>
+                    <a:prstGeom prst="rect">
+                      <a:avLst/>
+                    </a:prstGeom>
+                  </pic:spPr>
+                </pic:pic>
+              </a:graphicData>
+            </a:graphic>
+          </wp:inline>
+        </w:drawing>
+      </w:r>
+    </w:p>
+    <w:p>
+      <w:pPr>
+        <w:rPr>
+          <w:lang w:val="en-US"/>
+        </w:rPr>
+      </w:pPr>
+      <w:r>
+        <w:rPr>
+          <w:lang w:val="en-US"/>
+        </w:rPr>
+        <w:t>My data:</w:t>
+      </w:r>
+    </w:p>
+    <w:p>
+      <w:pPr>
+        <w:rPr>
+          <w:lang w:val="en-US"/>
+        </w:rPr>
+      </w:pPr>
+      <w:r>
+        <w:rPr>
+          <w:lang w:val="en-US"/>
+        </w:rPr>
+        <w:drawing>
+          <wp:inline distT="0" distB="0" distL="0" distR="0" wp14:anchorId="626CD6E7" wp14:editId="63635BAB">
+            <wp:extent cx="6858000" cy="730885"/>
+            <wp:effectExtent l="0" t="0" r="0" b="0"/>
+            <wp:docPr id="1483337835" name="Picture 1"/>
+            <wp:cNvGraphicFramePr>
+              <a:graphicFrameLocks xmlns:a="http://schemas.openxmlformats.org/drawingml/2006/main" noChangeAspect="1"/>
+            </wp:cNvGraphicFramePr>
+            <a:graphic xmlns:a="http://schemas.openxmlformats.org/drawingml/2006/main">
+              <a:graphicData uri="http://schemas.openxmlformats.org/drawingml/2006/picture">
+                <pic:pic xmlns:pic="http://schemas.openxmlformats.org/drawingml/2006/picture">
+                  <pic:nvPicPr>
+                    <pic:cNvPr id="1483337835" name=""/>
+                    <pic:cNvPicPr/>
+                  </pic:nvPicPr>
+                  <pic:blipFill>
+                    <a:blip r:embed="rId30"/>
+                    <a:stretch>
+                      <a:fillRect/>
+                    </a:stretch>
+                  </pic:blipFill>
+                  <pic:spPr>
+                    <a:xfrm>
+                      <a:off x="0" y="0"/>
+                      <a:ext cx="6858000" cy="730885"/>
+                    </a:xfrm>
+                    <a:prstGeom prst="rect">
+                      <a:avLst/>
+                    </a:prstGeom>
+                  </pic:spPr>
+                </pic:pic>
+              </a:graphicData>
+            </a:graphic>
+          </wp:inline>
+        </w:drawing>
+      </w:r>
+    </w:p>
+    <w:p>
+      <w:pPr>
+        <w:pStyle w:val="ListParagraph"/>
+        <w:numPr>
+          <w:ilvl w:val="1"/>
+          <w:numId w:val="2"/>
+        </w:numPr>
+        <w:rPr>
+          <w:lang w:val="en-US"/>
+        </w:rPr>
+      </w:pPr>
+      <w:r>
+        <w:rPr>
+          <w:lang w:val="en-US"/>
+        </w:rPr>
+        <w:t xml:space="preserve">I went through in detail and found that my conversion for my magnetometer </w:t>
+      </w:r>
+      <w:proofErr w:type="gramStart"/>
+      <w:r>
+        <w:rPr>
+          <w:lang w:val="en-US"/>
+        </w:rPr>
+        <w:t>are</w:t>
+      </w:r>
+      <w:proofErr w:type="gramEnd"/>
+      <w:r>
+        <w:rPr>
+          <w:lang w:val="en-US"/>
+        </w:rPr>
+        <w:t xml:space="preserve"> off… After aligning them exactly between the GPS points, </w:t>
+      </w:r>
+      <w:r>
+        <w:rPr>
+          <w:highlight w:val="yellow"/>
+          <w:lang w:val="en-US"/>
+        </w:rPr>
+        <w:t xml:space="preserve">I </w:t>
+      </w:r>
+      <w:r>
+        <w:rPr>
+          <w:highlight w:val="yellow"/>
+          <w:lang w:val="en-US"/>
+        </w:rPr>
+        <w:t xml:space="preserve">figured out that I needed to multiply </w:t>
+      </w:r>
+      <w:r>
+        <w:rPr>
+          <w:highlight w:val="yellow"/>
+          <w:lang w:val="en-US"/>
+        </w:rPr>
+        <w:t xml:space="preserve">the magnetometer </w:t>
+      </w:r>
+      <w:r>
+        <w:rPr>
+          <w:highlight w:val="yellow"/>
+          <w:lang w:val="en-US"/>
+        </w:rPr>
+        <w:t xml:space="preserve">by 0.15 to give me what </w:t>
+      </w:r>
+      <w:proofErr w:type="spellStart"/>
+      <w:r>
+        <w:rPr>
+          <w:highlight w:val="yellow"/>
+          <w:lang w:val="en-US"/>
+        </w:rPr>
+        <w:t>jojo</w:t>
+      </w:r>
+      <w:proofErr w:type="spellEnd"/>
+      <w:r>
+        <w:rPr>
+          <w:highlight w:val="yellow"/>
+          <w:lang w:val="en-US"/>
+        </w:rPr>
+        <w:t xml:space="preserve"> had</w:t>
+      </w:r>
+      <w:r>
+        <w:rPr>
+          <w:lang w:val="en-US"/>
+        </w:rPr>
+        <w:t>. So…</w:t>
+      </w:r>
+    </w:p>
+    <w:p>
+      <w:pPr>
+        <w:pStyle w:val="ListParagraph"/>
+        <w:ind w:left="2160"/>
+        <w:rPr>
+          <w:sz w:val="20"/>
+          <w:szCs w:val="20"/>
+          <w:lang w:val="en-US"/>
+        </w:rPr>
+      </w:pPr>
+      <w:proofErr w:type="spellStart"/>
+      <w:proofErr w:type="gramStart"/>
+      <w:r>
+        <w:rPr>
+          <w:sz w:val="20"/>
+          <w:szCs w:val="20"/>
+          <w:lang w:val="en-US"/>
+        </w:rPr>
+        <w:t>mine.flat</w:t>
+      </w:r>
+      <w:proofErr w:type="spellEnd"/>
+      <w:proofErr w:type="gramEnd"/>
+      <w:r>
+        <w:rPr>
+          <w:sz w:val="20"/>
+          <w:szCs w:val="20"/>
+          <w:lang w:val="en-US"/>
+        </w:rPr>
+        <w:t xml:space="preserve">[, </w:t>
+      </w:r>
+      <w:proofErr w:type="gramStart"/>
+      <w:r>
+        <w:rPr>
+          <w:sz w:val="20"/>
+          <w:szCs w:val="20"/>
+          <w:lang w:val="en-US"/>
+        </w:rPr>
+        <w:t>c(</w:t>
+      </w:r>
+      <w:proofErr w:type="gramEnd"/>
+      <w:r>
+        <w:rPr>
+          <w:sz w:val="20"/>
+          <w:szCs w:val="20"/>
+          <w:lang w:val="en-US"/>
+        </w:rPr>
+        <w:t>"</w:t>
+      </w:r>
+      <w:proofErr w:type="spellStart"/>
+      <w:r>
+        <w:rPr>
+          <w:sz w:val="20"/>
+          <w:szCs w:val="20"/>
+          <w:lang w:val="en-US"/>
+        </w:rPr>
+        <w:t>RawAX</w:t>
+      </w:r>
+      <w:proofErr w:type="spellEnd"/>
+      <w:r>
+        <w:rPr>
+          <w:sz w:val="20"/>
+          <w:szCs w:val="20"/>
+          <w:lang w:val="en-US"/>
+        </w:rPr>
+        <w:t>", "RawAY", "</w:t>
+      </w:r>
+      <w:proofErr w:type="spellStart"/>
+      <w:r>
+        <w:rPr>
+          <w:sz w:val="20"/>
+          <w:szCs w:val="20"/>
+          <w:lang w:val="en-US"/>
+        </w:rPr>
+        <w:t>RawAZ</w:t>
+      </w:r>
+      <w:proofErr w:type="spellEnd"/>
+      <w:r>
+        <w:rPr>
+          <w:sz w:val="20"/>
+          <w:szCs w:val="20"/>
+          <w:lang w:val="en-US"/>
+        </w:rPr>
+        <w:t xml:space="preserve">")] &lt;- </w:t>
+      </w:r>
+      <w:proofErr w:type="spellStart"/>
+      <w:proofErr w:type="gramStart"/>
+      <w:r>
+        <w:rPr>
+          <w:sz w:val="20"/>
+          <w:szCs w:val="20"/>
+          <w:lang w:val="en-US"/>
+        </w:rPr>
+        <w:t>mine.flat</w:t>
+      </w:r>
+      <w:proofErr w:type="spellEnd"/>
+      <w:proofErr w:type="gramEnd"/>
+      <w:r>
+        <w:rPr>
+          <w:sz w:val="20"/>
+          <w:szCs w:val="20"/>
+          <w:lang w:val="en-US"/>
+        </w:rPr>
+        <w:t xml:space="preserve">[, </w:t>
+      </w:r>
+      <w:proofErr w:type="gramStart"/>
+      <w:r>
+        <w:rPr>
+          <w:sz w:val="20"/>
+          <w:szCs w:val="20"/>
+          <w:lang w:val="en-US"/>
+        </w:rPr>
+        <w:t>c(</w:t>
+      </w:r>
+      <w:proofErr w:type="gramEnd"/>
+      <w:r>
+        <w:rPr>
+          <w:sz w:val="20"/>
+          <w:szCs w:val="20"/>
+          <w:lang w:val="en-US"/>
+        </w:rPr>
+        <w:t>"</w:t>
+      </w:r>
+      <w:proofErr w:type="spellStart"/>
+      <w:r>
+        <w:rPr>
+          <w:sz w:val="20"/>
+          <w:szCs w:val="20"/>
+          <w:lang w:val="en-US"/>
+        </w:rPr>
+        <w:t>RawAX</w:t>
+      </w:r>
+      <w:proofErr w:type="spellEnd"/>
+      <w:r>
+        <w:rPr>
+          <w:sz w:val="20"/>
+          <w:szCs w:val="20"/>
+          <w:lang w:val="en-US"/>
+        </w:rPr>
+        <w:t>", "RawAY", "</w:t>
+      </w:r>
+      <w:proofErr w:type="spellStart"/>
+      <w:r>
+        <w:rPr>
+          <w:sz w:val="20"/>
+          <w:szCs w:val="20"/>
+          <w:lang w:val="en-US"/>
+        </w:rPr>
+        <w:t>RawAZ</w:t>
+      </w:r>
+      <w:proofErr w:type="spellEnd"/>
+      <w:r>
+        <w:rPr>
+          <w:sz w:val="20"/>
+          <w:szCs w:val="20"/>
+          <w:lang w:val="en-US"/>
+        </w:rPr>
+        <w:t>")] / 2048</w:t>
+      </w:r>
+    </w:p>
+    <w:p>
+      <w:pPr>
+        <w:pStyle w:val="ListParagraph"/>
+        <w:ind w:left="2160"/>
+        <w:rPr>
+          <w:sz w:val="20"/>
+          <w:szCs w:val="20"/>
+          <w:lang w:val="en-US"/>
+        </w:rPr>
+      </w:pPr>
+      <w:proofErr w:type="spellStart"/>
+      <w:proofErr w:type="gramStart"/>
+      <w:r>
+        <w:rPr>
+          <w:sz w:val="20"/>
+          <w:szCs w:val="20"/>
+          <w:lang w:val="en-US"/>
+        </w:rPr>
+        <w:t>mine.flat</w:t>
+      </w:r>
+      <w:proofErr w:type="spellEnd"/>
+      <w:proofErr w:type="gramEnd"/>
+      <w:r>
+        <w:rPr>
+          <w:sz w:val="20"/>
+          <w:szCs w:val="20"/>
+          <w:lang w:val="en-US"/>
+        </w:rPr>
+        <w:t xml:space="preserve">[, </w:t>
+      </w:r>
+      <w:proofErr w:type="gramStart"/>
+      <w:r>
+        <w:rPr>
+          <w:sz w:val="20"/>
+          <w:szCs w:val="20"/>
+          <w:lang w:val="en-US"/>
+        </w:rPr>
+        <w:t>c(</w:t>
+      </w:r>
+      <w:proofErr w:type="gramEnd"/>
+      <w:r>
+        <w:rPr>
+          <w:sz w:val="20"/>
+          <w:szCs w:val="20"/>
+          <w:lang w:val="en-US"/>
+        </w:rPr>
+        <w:t>"</w:t>
+      </w:r>
+      <w:proofErr w:type="spellStart"/>
+      <w:r>
+        <w:rPr>
+          <w:sz w:val="20"/>
+          <w:szCs w:val="20"/>
+          <w:lang w:val="en-US"/>
+        </w:rPr>
+        <w:t>RawMX</w:t>
+      </w:r>
+      <w:proofErr w:type="spellEnd"/>
+      <w:r>
+        <w:rPr>
+          <w:sz w:val="20"/>
+          <w:szCs w:val="20"/>
+          <w:lang w:val="en-US"/>
+        </w:rPr>
+        <w:t>", "</w:t>
+      </w:r>
+      <w:proofErr w:type="spellStart"/>
+      <w:r>
+        <w:rPr>
+          <w:sz w:val="20"/>
+          <w:szCs w:val="20"/>
+          <w:lang w:val="en-US"/>
+        </w:rPr>
+        <w:t>RawMY</w:t>
+      </w:r>
+      <w:proofErr w:type="spellEnd"/>
+      <w:r>
+        <w:rPr>
+          <w:sz w:val="20"/>
+          <w:szCs w:val="20"/>
+          <w:lang w:val="en-US"/>
+        </w:rPr>
+        <w:t>", "</w:t>
+      </w:r>
+      <w:proofErr w:type="spellStart"/>
+      <w:r>
+        <w:rPr>
+          <w:sz w:val="20"/>
+          <w:szCs w:val="20"/>
+          <w:lang w:val="en-US"/>
+        </w:rPr>
+        <w:t>RawMZ</w:t>
+      </w:r>
+      <w:proofErr w:type="spellEnd"/>
+      <w:r>
+        <w:rPr>
+          <w:sz w:val="20"/>
+          <w:szCs w:val="20"/>
+          <w:lang w:val="en-US"/>
+        </w:rPr>
+        <w:t xml:space="preserve">")] &lt;- </w:t>
+      </w:r>
+      <w:proofErr w:type="spellStart"/>
+      <w:proofErr w:type="gramStart"/>
+      <w:r>
+        <w:rPr>
+          <w:sz w:val="20"/>
+          <w:szCs w:val="20"/>
+          <w:lang w:val="en-US"/>
+        </w:rPr>
+        <w:t>mine.flat</w:t>
+      </w:r>
+      <w:proofErr w:type="spellEnd"/>
+      <w:proofErr w:type="gramEnd"/>
+      <w:r>
+        <w:rPr>
+          <w:sz w:val="20"/>
+          <w:szCs w:val="20"/>
+          <w:lang w:val="en-US"/>
+        </w:rPr>
+        <w:t xml:space="preserve">[, </w:t>
+      </w:r>
+      <w:proofErr w:type="gramStart"/>
+      <w:r>
+        <w:rPr>
+          <w:sz w:val="20"/>
+          <w:szCs w:val="20"/>
+          <w:lang w:val="en-US"/>
+        </w:rPr>
+        <w:t>c(</w:t>
+      </w:r>
+      <w:proofErr w:type="gramEnd"/>
+      <w:r>
+        <w:rPr>
+          <w:sz w:val="20"/>
+          <w:szCs w:val="20"/>
+          <w:lang w:val="en-US"/>
+        </w:rPr>
+        <w:t>"</w:t>
+      </w:r>
+      <w:proofErr w:type="spellStart"/>
+      <w:r>
+        <w:rPr>
+          <w:sz w:val="20"/>
+          <w:szCs w:val="20"/>
+          <w:lang w:val="en-US"/>
+        </w:rPr>
+        <w:t>RawMX</w:t>
+      </w:r>
+      <w:proofErr w:type="spellEnd"/>
+      <w:r>
+        <w:rPr>
+          <w:sz w:val="20"/>
+          <w:szCs w:val="20"/>
+          <w:lang w:val="en-US"/>
+        </w:rPr>
+        <w:t>", "</w:t>
+      </w:r>
+      <w:proofErr w:type="spellStart"/>
+      <w:r>
+        <w:rPr>
+          <w:sz w:val="20"/>
+          <w:szCs w:val="20"/>
+          <w:lang w:val="en-US"/>
+        </w:rPr>
+        <w:t>RawMY</w:t>
+      </w:r>
+      <w:proofErr w:type="spellEnd"/>
+      <w:r>
+        <w:rPr>
+          <w:sz w:val="20"/>
+          <w:szCs w:val="20"/>
+          <w:lang w:val="en-US"/>
+        </w:rPr>
+        <w:t>", "</w:t>
+      </w:r>
+      <w:proofErr w:type="spellStart"/>
+      <w:r>
+        <w:rPr>
+          <w:sz w:val="20"/>
+          <w:szCs w:val="20"/>
+          <w:lang w:val="en-US"/>
+        </w:rPr>
+        <w:t>RawMZ</w:t>
+      </w:r>
+      <w:proofErr w:type="spellEnd"/>
+      <w:r>
+        <w:rPr>
+          <w:sz w:val="20"/>
+          <w:szCs w:val="20"/>
+          <w:lang w:val="en-US"/>
+        </w:rPr>
+        <w:t>")] * 0.15</w:t>
+      </w:r>
+    </w:p>
+    <w:p>
+      <w:pPr>
+        <w:pStyle w:val="ListParagraph"/>
+        <w:ind w:left="2160"/>
+        <w:rPr>
+          <w:sz w:val="20"/>
+          <w:szCs w:val="20"/>
+          <w:lang w:val="en-US"/>
+        </w:rPr>
+      </w:pPr>
+      <w:proofErr w:type="spellStart"/>
+      <w:r>
+        <w:rPr>
+          <w:sz w:val="20"/>
+          <w:szCs w:val="20"/>
+          <w:lang w:val="en-US"/>
+        </w:rPr>
+        <w:lastRenderedPageBreak/>
+        <w:t>jojo_df</w:t>
+      </w:r>
+      <w:proofErr w:type="spellEnd"/>
+      <w:r>
+        <w:rPr>
+          <w:sz w:val="20"/>
+          <w:szCs w:val="20"/>
+          <w:lang w:val="en-US"/>
+        </w:rPr>
+        <w:t xml:space="preserve"> &lt;- </w:t>
+      </w:r>
+      <w:proofErr w:type="spellStart"/>
+      <w:proofErr w:type="gramStart"/>
+      <w:r>
+        <w:rPr>
+          <w:sz w:val="20"/>
+          <w:szCs w:val="20"/>
+          <w:lang w:val="en-US"/>
+        </w:rPr>
+        <w:t>df.flat</w:t>
+      </w:r>
+      <w:proofErr w:type="spellEnd"/>
+      <w:proofErr w:type="gramEnd"/>
+      <w:r>
+        <w:rPr>
+          <w:sz w:val="20"/>
+          <w:szCs w:val="20"/>
+          <w:lang w:val="en-US"/>
+        </w:rPr>
+        <w:t>[1:77009</w:t>
+      </w:r>
+      <w:proofErr w:type="gramStart"/>
+      <w:r>
+        <w:rPr>
+          <w:sz w:val="20"/>
+          <w:szCs w:val="20"/>
+          <w:lang w:val="en-US"/>
+        </w:rPr>
+        <w:t>, ]</w:t>
+      </w:r>
+      <w:proofErr w:type="gramEnd"/>
+    </w:p>
+    <w:p>
+      <w:pPr>
+        <w:pStyle w:val="ListParagraph"/>
+        <w:ind w:left="2160"/>
+        <w:rPr>
+          <w:sz w:val="20"/>
+          <w:szCs w:val="20"/>
+          <w:lang w:val="en-US"/>
+        </w:rPr>
+      </w:pPr>
+      <w:proofErr w:type="spellStart"/>
+      <w:r>
+        <w:rPr>
+          <w:sz w:val="20"/>
+          <w:szCs w:val="20"/>
+          <w:lang w:val="en-US"/>
+        </w:rPr>
+        <w:t>oak_df</w:t>
+      </w:r>
+      <w:proofErr w:type="spellEnd"/>
+      <w:r>
+        <w:rPr>
+          <w:sz w:val="20"/>
+          <w:szCs w:val="20"/>
+          <w:lang w:val="en-US"/>
+        </w:rPr>
+        <w:t xml:space="preserve"> &lt;- </w:t>
+      </w:r>
+      <w:proofErr w:type="spellStart"/>
+      <w:proofErr w:type="gramStart"/>
+      <w:r>
+        <w:rPr>
+          <w:sz w:val="20"/>
+          <w:szCs w:val="20"/>
+          <w:lang w:val="en-US"/>
+        </w:rPr>
+        <w:t>mine.flat</w:t>
+      </w:r>
+      <w:proofErr w:type="spellEnd"/>
+      <w:proofErr w:type="gramEnd"/>
+      <w:r>
+        <w:rPr>
+          <w:sz w:val="20"/>
+          <w:szCs w:val="20"/>
+          <w:lang w:val="en-US"/>
+        </w:rPr>
+        <w:t>[3064:80072</w:t>
+      </w:r>
+      <w:proofErr w:type="gramStart"/>
+      <w:r>
+        <w:rPr>
+          <w:sz w:val="20"/>
+          <w:szCs w:val="20"/>
+          <w:lang w:val="en-US"/>
+        </w:rPr>
+        <w:t>, ]</w:t>
+      </w:r>
+      <w:proofErr w:type="gramEnd"/>
+    </w:p>
+    <w:p>
+      <w:pPr>
+        <w:pStyle w:val="ListParagraph"/>
+        <w:numPr>
+          <w:ilvl w:val="1"/>
+          <w:numId w:val="2"/>
+        </w:numPr>
+        <w:rPr>
+          <w:lang w:val="en-US"/>
+        </w:rPr>
+      </w:pPr>
+      <w:r>
+        <w:rPr>
+          <w:lang w:val="en-US"/>
+        </w:rPr>
+        <w:t xml:space="preserve">OMG! That was the only correction I needed and now it aligns beautifully and looks </w:t>
+      </w:r>
+      <w:proofErr w:type="gramStart"/>
+      <w:r>
+        <w:rPr>
+          <w:lang w:val="en-US"/>
+        </w:rPr>
+        <w:t>exactly the same</w:t>
+      </w:r>
+      <w:proofErr w:type="gramEnd"/>
+      <w:r>
+        <w:rPr>
+          <w:lang w:val="en-US"/>
+        </w:rPr>
+        <w:t>!</w:t>
+      </w:r>
+      <w:r>
+        <w:rPr>
+          <w:lang w:val="en-US"/>
+        </w:rPr>
+        <w:t xml:space="preserve"> Now to figure out when it isn’t flat.</w:t>
+      </w:r>
+    </w:p>
+    <w:p>
+      <w:pPr>
+        <w:pStyle w:val="ListParagraph"/>
+        <w:numPr>
+          <w:ilvl w:val="0"/>
+          <w:numId w:val="2"/>
+        </w:numPr>
+        <w:rPr>
+          <w:lang w:val="en-US"/>
+        </w:rPr>
+      </w:pPr>
+      <w:r>
+        <w:rPr>
+          <w:lang w:val="en-US"/>
+        </w:rPr>
+        <w:t>The flat results on the left and the 45 degrees on the right…</w:t>
+      </w:r>
+    </w:p>
+    <w:p>
+      <w:pPr>
+        <w:rPr>
+          <w:lang w:val="en-US"/>
+        </w:rPr>
+      </w:pPr>
+      <w:r>
+        <w:rPr>
+          <w:lang w:val="en-US"/>
+        </w:rPr>
+        <w:drawing>
+          <wp:inline distT="0" distB="0" distL="0" distR="0" wp14:anchorId="5E8377E6" wp14:editId="7D4B0DCE">
+            <wp:extent cx="3286664" cy="2726714"/>
+            <wp:effectExtent l="0" t="0" r="9525" b="0"/>
+            <wp:docPr id="507799098" name="Picture 1"/>
+            <wp:cNvGraphicFramePr>
+              <a:graphicFrameLocks xmlns:a="http://schemas.openxmlformats.org/drawingml/2006/main" noChangeAspect="1"/>
+            </wp:cNvGraphicFramePr>
+            <a:graphic xmlns:a="http://schemas.openxmlformats.org/drawingml/2006/main">
+              <a:graphicData uri="http://schemas.openxmlformats.org/drawingml/2006/picture">
+                <pic:pic xmlns:pic="http://schemas.openxmlformats.org/drawingml/2006/picture">
+                  <pic:nvPicPr>
+                    <pic:cNvPr id="507799098" name=""/>
+                    <pic:cNvPicPr/>
+                  </pic:nvPicPr>
+                  <pic:blipFill>
+                    <a:blip r:embed="rId31"/>
+                    <a:stretch>
+                      <a:fillRect/>
+                    </a:stretch>
+                  </pic:blipFill>
+                  <pic:spPr>
+                    <a:xfrm>
+                      <a:off x="0" y="0"/>
+                      <a:ext cx="3306150" cy="2742880"/>
+                    </a:xfrm>
+                    <a:prstGeom prst="rect">
+                      <a:avLst/>
+                    </a:prstGeom>
+                  </pic:spPr>
+                </pic:pic>
+              </a:graphicData>
+            </a:graphic>
+          </wp:inline>
+        </w:drawing>
+      </w:r>
+      <w:r>
+        <w:rPr>
+          <w:lang w:val="en-US"/>
+        </w:rPr>
+        <w:drawing>
+          <wp:inline distT="0" distB="0" distL="0" distR="0" wp14:anchorId="7B03E3B1" wp14:editId="33B84F57">
+            <wp:extent cx="3234905" cy="2677182"/>
+            <wp:effectExtent l="0" t="0" r="3810" b="8890"/>
+            <wp:docPr id="897151981" name="Picture 1"/>
+            <wp:cNvGraphicFramePr>
+              <a:graphicFrameLocks xmlns:a="http://schemas.openxmlformats.org/drawingml/2006/main" noChangeAspect="1"/>
+            </wp:cNvGraphicFramePr>
+            <a:graphic xmlns:a="http://schemas.openxmlformats.org/drawingml/2006/main">
+              <a:graphicData uri="http://schemas.openxmlformats.org/drawingml/2006/picture">
+                <pic:pic xmlns:pic="http://schemas.openxmlformats.org/drawingml/2006/picture">
+                  <pic:nvPicPr>
+                    <pic:cNvPr id="897151981" name=""/>
+                    <pic:cNvPicPr/>
+                  </pic:nvPicPr>
+                  <pic:blipFill>
+                    <a:blip r:embed="rId32"/>
+                    <a:stretch>
+                      <a:fillRect/>
+                    </a:stretch>
+                  </pic:blipFill>
+                  <pic:spPr>
+                    <a:xfrm>
+                      <a:off x="0" y="0"/>
+                      <a:ext cx="3245524" cy="2685970"/>
+                    </a:xfrm>
+                    <a:prstGeom prst="rect">
+                      <a:avLst/>
+                    </a:prstGeom>
+                  </pic:spPr>
+                </pic:pic>
+              </a:graphicData>
+            </a:graphic>
+          </wp:inline>
+        </w:drawing>
+      </w:r>
+    </w:p>
+    <w:p>
+      <w:pPr>
+        <w:pStyle w:val="ListParagraph"/>
+        <w:numPr>
+          <w:ilvl w:val="0"/>
+          <w:numId w:val="2"/>
+        </w:numPr>
+        <w:rPr>
+          <w:lang w:val="en-US"/>
+        </w:rPr>
+      </w:pPr>
+      <w:r>
+        <w:rPr>
+          <w:lang w:val="en-US"/>
+        </w:rPr>
+        <w:t xml:space="preserve">Excellent. I am now confident that I </w:t>
+      </w:r>
+      <w:proofErr w:type="gramStart"/>
+      <w:r>
+        <w:rPr>
+          <w:lang w:val="en-US"/>
+        </w:rPr>
+        <w:t>have an understanding of</w:t>
+      </w:r>
+      <w:proofErr w:type="gramEnd"/>
+      <w:r>
+        <w:rPr>
+          <w:lang w:val="en-US"/>
+        </w:rPr>
+        <w:t xml:space="preserve"> how this works and how to use it. I now want to expand the workflow to be used on the impala data. </w:t>
+      </w:r>
+      <w:r>
+        <w:rPr>
+          <w:lang w:val="en-US"/>
+        </w:rPr>
+        <w:t>The hardest part of this is probably</w:t>
+      </w:r>
+      <w:r>
+        <w:rPr>
+          <w:lang w:val="en-US"/>
+        </w:rPr>
+        <w:t>:</w:t>
+      </w:r>
+    </w:p>
+    <w:p>
+      <w:pPr>
+        <w:pStyle w:val="ListParagraph"/>
+        <w:numPr>
+          <w:ilvl w:val="0"/>
+          <w:numId w:val="3"/>
+        </w:numPr>
+        <w:rPr>
+          <w:lang w:val="en-US"/>
+        </w:rPr>
+      </w:pPr>
+      <w:r>
+        <w:rPr>
+          <w:lang w:val="en-US"/>
+        </w:rPr>
+        <w:t>F</w:t>
+      </w:r>
+      <w:r>
+        <w:rPr>
+          <w:lang w:val="en-US"/>
+        </w:rPr>
+        <w:t xml:space="preserve">iguring out the correct orientation of the devices and whether the accel and mag are in the same orientation… </w:t>
+      </w:r>
+    </w:p>
+    <w:p>
+      <w:pPr>
+        <w:pStyle w:val="ListParagraph"/>
+        <w:numPr>
+          <w:ilvl w:val="1"/>
+          <w:numId w:val="2"/>
+        </w:numPr>
+        <w:rPr>
+          <w:lang w:val="en-US"/>
+        </w:rPr>
+      </w:pPr>
+      <w:r>
+        <w:rPr>
+          <w:lang w:val="en-US"/>
+        </w:rPr>
+        <w:t xml:space="preserve">I think I should presume that they’re not. That is, </w:t>
+      </w:r>
+      <w:proofErr w:type="spellStart"/>
+      <w:proofErr w:type="gramStart"/>
+      <w:r>
+        <w:rPr>
+          <w:lang w:val="en-US"/>
+        </w:rPr>
+        <w:t>jojo</w:t>
+      </w:r>
+      <w:proofErr w:type="spellEnd"/>
+      <w:proofErr w:type="gramEnd"/>
+      <w:r>
+        <w:rPr>
+          <w:lang w:val="en-US"/>
+        </w:rPr>
+        <w:t xml:space="preserve"> figured out that the </w:t>
+      </w:r>
+      <w:r>
+        <w:rPr>
+          <w:lang w:val="en-US"/>
+        </w:rPr>
+        <w:t>accel was NED and the mag was NWU. Whatever my accel orientation is determined to be, the mag will probably be an equivalent rotation.</w:t>
+      </w:r>
+    </w:p>
+    <w:p>
+      <w:pPr>
+        <w:pStyle w:val="ListParagraph"/>
+        <w:numPr>
+          <w:ilvl w:val="0"/>
+          <w:numId w:val="3"/>
+        </w:numPr>
+        <w:rPr>
+          <w:lang w:val="en-US"/>
+        </w:rPr>
+      </w:pPr>
+      <w:r>
+        <w:rPr>
+          <w:lang w:val="en-US"/>
+        </w:rPr>
+        <w:t>Extracting the calibration periods</w:t>
+      </w:r>
+    </w:p>
+    <w:p>
+      <w:pPr>
+        <w:pStyle w:val="ListParagraph"/>
+        <w:numPr>
+          <w:ilvl w:val="1"/>
+          <w:numId w:val="2"/>
+        </w:numPr>
+        <w:rPr>
+          <w:lang w:val="en-US"/>
+        </w:rPr>
+      </w:pPr>
+      <w:r>
+        <w:rPr>
+          <w:lang w:val="en-US"/>
+        </w:rPr>
+        <w:t>I previously altered my workflow such that it discarded all data before the first sat hit. However</w:t>
+      </w:r>
+      <w:r>
+        <w:rPr>
+          <w:lang w:val="en-US"/>
+        </w:rPr>
+        <w:t>,</w:t>
+      </w:r>
+      <w:r>
+        <w:rPr>
+          <w:lang w:val="en-US"/>
+        </w:rPr>
+        <w:t xml:space="preserve"> I subsequently </w:t>
+      </w:r>
+      <w:proofErr w:type="spellStart"/>
+      <w:r>
+        <w:rPr>
+          <w:lang w:val="en-US"/>
+        </w:rPr>
+        <w:t>realised</w:t>
+      </w:r>
+      <w:proofErr w:type="spellEnd"/>
+      <w:r>
+        <w:rPr>
+          <w:lang w:val="en-US"/>
+        </w:rPr>
+        <w:t xml:space="preserve"> that this discarded the calibration event. Therefore, I need to rework the impala alignment flow.</w:t>
+      </w:r>
+    </w:p>
+    <w:p>
+      <w:pPr>
+        <w:pStyle w:val="ListParagraph"/>
+        <w:numPr>
+          <w:ilvl w:val="0"/>
+          <w:numId w:val="2"/>
+        </w:numPr>
+        <w:rPr>
+          <w:lang w:val="en-US"/>
+        </w:rPr>
+      </w:pPr>
+      <w:r>
+        <w:rPr>
+          <w:lang w:val="en-US"/>
+        </w:rPr>
+        <w:t xml:space="preserve">By a stroke of good thinking, </w:t>
+      </w:r>
+      <w:r>
+        <w:rPr>
+          <w:lang w:val="en-US"/>
+        </w:rPr>
+        <w:t xml:space="preserve">Jaz </w:t>
+      </w:r>
+      <w:proofErr w:type="spellStart"/>
+      <w:r>
+        <w:rPr>
+          <w:lang w:val="en-US"/>
+        </w:rPr>
+        <w:t>realised</w:t>
+      </w:r>
+      <w:proofErr w:type="spellEnd"/>
+      <w:r>
+        <w:rPr>
+          <w:lang w:val="en-US"/>
+        </w:rPr>
+        <w:t xml:space="preserve"> the orientation</w:t>
+      </w:r>
+      <w:r>
+        <w:rPr>
+          <w:lang w:val="en-US"/>
+        </w:rPr>
+        <w:t xml:space="preserve"> of the </w:t>
+      </w:r>
+      <w:proofErr w:type="spellStart"/>
+      <w:r>
+        <w:rPr>
+          <w:lang w:val="en-US"/>
+        </w:rPr>
+        <w:t>accels</w:t>
+      </w:r>
+      <w:proofErr w:type="spellEnd"/>
+      <w:r>
+        <w:rPr>
+          <w:lang w:val="en-US"/>
+        </w:rPr>
+        <w:t xml:space="preserve"> are</w:t>
+      </w:r>
+      <w:r>
+        <w:rPr>
+          <w:lang w:val="en-US"/>
+        </w:rPr>
+        <w:t xml:space="preserve"> written on the </w:t>
+      </w:r>
+      <w:r>
+        <w:rPr>
+          <w:lang w:val="en-US"/>
+        </w:rPr>
+        <w:t>devices. Therefore, we were able to determine the orientations directly.</w:t>
+      </w:r>
+      <w:r>
+        <w:rPr>
+          <w:lang w:val="en-US"/>
+        </w:rPr>
+        <w:t xml:space="preserve"> Photo below for reference.</w:t>
+      </w:r>
+    </w:p>
+    <w:p>
+      <w:pPr>
+        <w:jc w:val="center"/>
+        <w:rPr>
+          <w:lang w:val="en-US"/>
+        </w:rPr>
+      </w:pPr>
+      <w:r>
+        <w:rPr>
+          <w:noProof/>
+          <w:lang w:val="en-US"/>
+        </w:rPr>
+        <w:drawing>
+          <wp:inline distT="0" distB="0" distL="0" distR="0" wp14:anchorId="1CF6F8FB" wp14:editId="5B67970B">
+            <wp:extent cx="2094614" cy="1689192"/>
+            <wp:effectExtent l="0" t="0" r="1270" b="6350"/>
+            <wp:docPr id="2003906759" name="Picture 11"/>
+            <wp:cNvGraphicFramePr>
+              <a:graphicFrameLocks xmlns:a="http://schemas.openxmlformats.org/drawingml/2006/main" noChangeAspect="1"/>
+            </wp:cNvGraphicFramePr>
+            <a:graphic xmlns:a="http://schemas.openxmlformats.org/drawingml/2006/main">
+              <a:graphicData uri="http://schemas.openxmlformats.org/drawingml/2006/picture">
+                <pic:pic xmlns:pic="http://schemas.openxmlformats.org/drawingml/2006/picture">
+                  <pic:nvPicPr>
+                    <pic:cNvPr id="0" name="Picture 5"/>
+                    <pic:cNvPicPr>
+                      <a:picLocks noChangeAspect="1" noChangeArrowheads="1"/>
+                    </pic:cNvPicPr>
+                  </pic:nvPicPr>
+                  <pic:blipFill rotWithShape="1">
+                    <a:blip r:embed="rId33" cstate="print">
+                      <a:extLst>
+                        <a:ext uri="{28A0092B-C50C-407E-A947-70E740481C1C}">
+                          <a14:useLocalDpi xmlns:a14="http://schemas.microsoft.com/office/drawing/2010/main" val="0"/>
+                        </a:ext>
+                      </a:extLst>
+                    </a:blip>
+                    <a:srcRect l="17887" t="35455" r="20530" b="27298"/>
+                    <a:stretch>
+                      <a:fillRect/>
+                    </a:stretch>
+                  </pic:blipFill>
+                  <pic:spPr bwMode="auto">
+                    <a:xfrm>
+                      <a:off x="0" y="0"/>
+                      <a:ext cx="2110686" cy="1702153"/>
+                    </a:xfrm>
+                    <a:prstGeom prst="rect">
+                      <a:avLst/>
+                    </a:prstGeom>
+                    <a:noFill/>
+                    <a:ln>
+                      <a:noFill/>
+                    </a:ln>
+                    <a:extLst>
+                      <a:ext uri="{53640926-AAD7-44D8-BBD7-CCE9431645EC}">
+                        <a14:shadowObscured xmlns:a14="http://schemas.microsoft.com/office/drawing/2010/main"/>
+                      </a:ext>
+                    </a:extLst>
+                  </pic:spPr>
+                </pic:pic>
+              </a:graphicData>
+            </a:graphic>
+          </wp:inline>
+        </w:drawing>
+      </w:r>
+      <w:r>
+        <w:rPr>
+          <w:noProof/>
+          <w:lang w:val="en-US"/>
+        </w:rPr>
+        <w:drawing>
+          <wp:inline distT="0" distB="0" distL="0" distR="0" wp14:anchorId="5013C8EE" wp14:editId="7381F381">
+            <wp:extent cx="2445488" cy="1688416"/>
+            <wp:effectExtent l="0" t="0" r="0" b="7620"/>
+            <wp:docPr id="1735754819" name="Picture 13"/>
+            <wp:cNvGraphicFramePr>
+              <a:graphicFrameLocks xmlns:a="http://schemas.openxmlformats.org/drawingml/2006/main" noChangeAspect="1"/>
+            </wp:cNvGraphicFramePr>
+            <a:graphic xmlns:a="http://schemas.openxmlformats.org/drawingml/2006/main">
+              <a:graphicData uri="http://schemas.openxmlformats.org/drawingml/2006/picture">
+                <pic:pic xmlns:pic="http://schemas.openxmlformats.org/drawingml/2006/picture">
+                  <pic:nvPicPr>
+                    <pic:cNvPr id="0" name="Picture 6"/>
+                    <pic:cNvPicPr>
+                      <a:picLocks noChangeAspect="1" noChangeArrowheads="1"/>
+                    </pic:cNvPicPr>
+                  </pic:nvPicPr>
+                  <pic:blipFill rotWithShape="1">
+                    <a:blip r:embed="rId34" cstate="print">
+                      <a:extLst>
+                        <a:ext uri="{28A0092B-C50C-407E-A947-70E740481C1C}">
+                          <a14:useLocalDpi xmlns:a14="http://schemas.microsoft.com/office/drawing/2010/main" val="0"/>
+                        </a:ext>
+                      </a:extLst>
+                    </a:blip>
+                    <a:srcRect t="22496" b="25519"/>
+                    <a:stretch>
+                      <a:fillRect/>
+                    </a:stretch>
+                  </pic:blipFill>
+                  <pic:spPr bwMode="auto">
+                    <a:xfrm>
+                      <a:off x="0" y="0"/>
+                      <a:ext cx="2461106" cy="1699199"/>
+                    </a:xfrm>
+                    <a:prstGeom prst="rect">
+                      <a:avLst/>
+                    </a:prstGeom>
+                    <a:noFill/>
+                    <a:ln>
+                      <a:noFill/>
+                    </a:ln>
+                    <a:extLst>
+                      <a:ext uri="{53640926-AAD7-44D8-BBD7-CCE9431645EC}">
+                        <a14:shadowObscured xmlns:a14="http://schemas.microsoft.com/office/drawing/2010/main"/>
+                      </a:ext>
+                    </a:extLst>
+                  </pic:spPr>
+                </pic:pic>
+              </a:graphicData>
+            </a:graphic>
+          </wp:inline>
+        </w:drawing>
+      </w:r>
+    </w:p>
+    <w:p>
+      <w:pPr>
+        <w:jc w:val="center"/>
+        <w:rPr>
+          <w:lang w:val="en-US"/>
+        </w:rPr>
+      </w:pPr>
+      <w:r>
+        <w:rPr>
+          <w:lang w:val="en-US"/>
+        </w:rPr>
+        <w:lastRenderedPageBreak/>
+        <w:drawing>
+          <wp:inline distT="0" distB="0" distL="0" distR="0" wp14:anchorId="701B2334" wp14:editId="51033066">
+            <wp:extent cx="3370521" cy="2395255"/>
+            <wp:effectExtent l="0" t="0" r="1905" b="5080"/>
+            <wp:docPr id="835938930" name="Picture 15"/>
+            <wp:cNvGraphicFramePr>
+              <a:graphicFrameLocks xmlns:a="http://schemas.openxmlformats.org/drawingml/2006/main" noChangeAspect="1"/>
+            </wp:cNvGraphicFramePr>
+            <a:graphic xmlns:a="http://schemas.openxmlformats.org/drawingml/2006/main">
+              <a:graphicData uri="http://schemas.openxmlformats.org/drawingml/2006/picture">
+                <pic:pic xmlns:pic="http://schemas.openxmlformats.org/drawingml/2006/picture">
+                  <pic:nvPicPr>
+                    <pic:cNvPr id="0" name="Picture 45"/>
+                    <pic:cNvPicPr>
+                      <a:picLocks noChangeAspect="1" noChangeArrowheads="1"/>
+                    </pic:cNvPicPr>
+                  </pic:nvPicPr>
+                  <pic:blipFill>
+                    <a:blip r:embed="rId35" cstate="print">
+                      <a:extLst>
+                        <a:ext uri="{28A0092B-C50C-407E-A947-70E740481C1C}">
+                          <a14:useLocalDpi xmlns:a14="http://schemas.microsoft.com/office/drawing/2010/main" val="0"/>
+                        </a:ext>
+                      </a:extLst>
+                    </a:blip>
+                    <a:srcRect/>
+                    <a:stretch>
+                      <a:fillRect/>
+                    </a:stretch>
+                  </pic:blipFill>
+                  <pic:spPr bwMode="auto">
+                    <a:xfrm>
+                      <a:off x="0" y="0"/>
+                      <a:ext cx="3379491" cy="2401629"/>
+                    </a:xfrm>
+                    <a:prstGeom prst="rect">
+                      <a:avLst/>
+                    </a:prstGeom>
+                    <a:noFill/>
+                    <a:ln>
+                      <a:noFill/>
+                    </a:ln>
+                  </pic:spPr>
+                </pic:pic>
+              </a:graphicData>
+            </a:graphic>
+          </wp:inline>
+        </w:drawing>
+      </w:r>
+    </w:p>
+    <w:p>
+      <w:pPr>
+        <w:pStyle w:val="ListParagraph"/>
+        <w:numPr>
+          <w:ilvl w:val="0"/>
+          <w:numId w:val="2"/>
+        </w:numPr>
+        <w:rPr>
+          <w:lang w:val="en-US"/>
+        </w:rPr>
+      </w:pPr>
+      <w:r>
+        <w:rPr>
+          <w:lang w:val="en-US"/>
+        </w:rPr>
+        <w:t>I now need to apply the DR code with predicted orientation to a sample of the impala data and see how we go. Pray for me</w:t>
+      </w:r>
+      <w:r>
+        <w:rPr>
+          <w:lang w:val="en-US"/>
+        </w:rPr>
+        <w:t>.</w:t>
+      </w:r>
+    </w:p>
+    <w:p>
+      <w:pPr>
+        <w:ind w:left="360"/>
+        <w:rPr>
+          <w:lang w:val="en-US"/>
+        </w:rPr>
+      </w:pPr>
+      <w:sdt>
+        <w:sdtPr>
+          <w:rPr>
+            <w:lang w:val="en-US"/>
+          </w:rPr>
+          <w:id w:val="1988664188"/>
+          <w14:checkbox>
+            <w14:checked w14:val="1"/>
+            <w14:checkedState w14:val="2612" w14:font="MS Gothic"/>
+            <w14:uncheckedState w14:val="2610" w14:font="MS Gothic"/>
+          </w14:checkbox>
+        </w:sdtPr>
+        <w:sdtContent>
+          <w:r>
+            <w:rPr>
+              <w:rFonts w:ascii="MS Gothic" w:eastAsia="MS Gothic" w:hAnsi="MS Gothic" w:hint="eastAsia"/>
+              <w:lang w:val="en-US"/>
+            </w:rPr>
+            <w:t>☒</w:t>
+          </w:r>
+        </w:sdtContent>
+      </w:sdt>
+      <w:r>
+        <w:rPr>
+          <w:lang w:val="en-US"/>
+        </w:rPr>
+        <w:t>Ensure the calibration event is saved separately during the data reading process</w:t>
+      </w:r>
+    </w:p>
+    <w:p>
+      <w:pPr>
+        <w:pStyle w:val="ListParagraph"/>
+        <w:numPr>
+          <w:ilvl w:val="1"/>
+          <w:numId w:val="2"/>
+        </w:numPr>
+        <w:rPr>
+          <w:lang w:val="en-US"/>
+        </w:rPr>
+      </w:pPr>
+      <w:r>
+        <w:rPr>
+          <w:lang w:val="en-US"/>
+        </w:rPr>
+        <w:t>Changing workflow to retain all reset events instead of only the longest ones.</w:t>
+      </w:r>
+    </w:p>
+    <w:p>
+      <w:pPr>
+        <w:pStyle w:val="ListParagraph"/>
+        <w:numPr>
+          <w:ilvl w:val="1"/>
+          <w:numId w:val="2"/>
+        </w:numPr>
+        <w:rPr>
+          <w:lang w:val="en-US"/>
+        </w:rPr>
+      </w:pPr>
+      <w:r>
+        <w:rPr>
+          <w:lang w:val="en-US"/>
+        </w:rPr>
+        <w:t xml:space="preserve">Was having an issue where there were a lot of unmatched </w:t>
+      </w:r>
+      <w:proofErr w:type="spellStart"/>
+      <w:r>
+        <w:rPr>
+          <w:lang w:val="en-US"/>
+        </w:rPr>
+        <w:t>gps</w:t>
+      </w:r>
+      <w:proofErr w:type="spellEnd"/>
+      <w:r>
+        <w:rPr>
+          <w:lang w:val="en-US"/>
+        </w:rPr>
+        <w:t xml:space="preserve"> pings. </w:t>
+      </w:r>
+      <w:r>
+        <w:rPr>
+          <w:lang w:val="en-US"/>
+        </w:rPr>
+        <w:t xml:space="preserve">Fixed this by switching the order of the </w:t>
+      </w:r>
+      <w:proofErr w:type="spellStart"/>
+      <w:r>
+        <w:rPr>
+          <w:lang w:val="en-US"/>
+        </w:rPr>
+        <w:t>kets</w:t>
+      </w:r>
+      <w:proofErr w:type="spellEnd"/>
+      <w:r>
+        <w:rPr>
+          <w:lang w:val="en-US"/>
+        </w:rPr>
+        <w:t xml:space="preserve"> for the rolling join. But I nearly kms before figuring that out.</w:t>
+      </w:r>
+    </w:p>
+    <w:p>
+      <w:pPr>
+        <w:pStyle w:val="ListParagraph"/>
+        <w:numPr>
+          <w:ilvl w:val="1"/>
+          <w:numId w:val="2"/>
+        </w:numPr>
+        <w:rPr>
+          <w:lang w:val="en-US"/>
+        </w:rPr>
+      </w:pPr>
+      <w:r>
+        <w:rPr>
+          <w:noProof/>
+          <w:lang w:val="en-US"/>
+        </w:rPr>
+        <w:drawing>
+          <wp:inline distT="0" distB="0" distL="0" distR="0" wp14:anchorId="331B779D" wp14:editId="76714818">
+            <wp:extent cx="4359349" cy="1509338"/>
+            <wp:effectExtent l="0" t="0" r="3175" b="0"/>
+            <wp:docPr id="1837522495" name="Picture 17"/>
+            <wp:cNvGraphicFramePr>
+              <a:graphicFrameLocks xmlns:a="http://schemas.openxmlformats.org/drawingml/2006/main" noChangeAspect="1"/>
+            </wp:cNvGraphicFramePr>
+            <a:graphic xmlns:a="http://schemas.openxmlformats.org/drawingml/2006/main">
+              <a:graphicData uri="http://schemas.openxmlformats.org/drawingml/2006/picture">
+                <pic:pic xmlns:pic="http://schemas.openxmlformats.org/drawingml/2006/picture">
+                  <pic:nvPicPr>
+                    <pic:cNvPr id="0" name="Picture 7"/>
+                    <pic:cNvPicPr>
+                      <a:picLocks noChangeAspect="1" noChangeArrowheads="1"/>
+                    </pic:cNvPicPr>
+                  </pic:nvPicPr>
+                  <pic:blipFill>
+                    <a:blip r:embed="rId36">
+                      <a:extLst>
+                        <a:ext uri="{28A0092B-C50C-407E-A947-70E740481C1C}">
+                          <a14:useLocalDpi xmlns:a14="http://schemas.microsoft.com/office/drawing/2010/main" val="0"/>
+                        </a:ext>
+                      </a:extLst>
+                    </a:blip>
+                    <a:srcRect/>
+                    <a:stretch>
+                      <a:fillRect/>
+                    </a:stretch>
+                  </pic:blipFill>
+                  <pic:spPr bwMode="auto">
+                    <a:xfrm>
+                      <a:off x="0" y="0"/>
+                      <a:ext cx="4371164" cy="1513429"/>
+                    </a:xfrm>
+                    <a:prstGeom prst="rect">
+                      <a:avLst/>
+                    </a:prstGeom>
+                    <a:noFill/>
+                  </pic:spPr>
+                </pic:pic>
+              </a:graphicData>
+            </a:graphic>
+          </wp:inline>
+        </w:drawing>
+      </w:r>
+    </w:p>
+    <w:p>
+      <w:pPr>
+        <w:pStyle w:val="ListParagraph"/>
+        <w:numPr>
+          <w:ilvl w:val="1"/>
+          <w:numId w:val="2"/>
+        </w:numPr>
+        <w:rPr>
+          <w:lang w:val="en-US"/>
+        </w:rPr>
+      </w:pPr>
+      <w:r>
+        <w:rPr>
+          <w:lang w:val="en-US"/>
+        </w:rPr>
+        <w:t xml:space="preserve">We </w:t>
+      </w:r>
+      <w:proofErr w:type="gramStart"/>
+      <w:r>
+        <w:rPr>
+          <w:lang w:val="en-US"/>
+        </w:rPr>
+        <w:t>cooking</w:t>
+      </w:r>
+      <w:proofErr w:type="gramEnd"/>
+      <w:r>
+        <w:rPr>
+          <w:lang w:val="en-US"/>
+        </w:rPr>
+        <w:t xml:space="preserve"> with gas again.</w:t>
+      </w:r>
+    </w:p>
+    <w:p>
+      <w:pPr>
+        <w:pStyle w:val="ListParagraph"/>
+        <w:numPr>
+          <w:ilvl w:val="0"/>
+          <w:numId w:val="2"/>
+        </w:numPr>
+        <w:rPr>
+          <w:lang w:val="en-US"/>
+        </w:rPr>
+      </w:pPr>
+      <w:r>
+        <w:rPr>
+          <w:lang w:val="en-US"/>
+        </w:rPr>
+        <w:t xml:space="preserve">Okay now I’m finally up to the part where I </w:t>
+      </w:r>
+      <w:proofErr w:type="gramStart"/>
+      <w:r>
+        <w:rPr>
+          <w:lang w:val="en-US"/>
+        </w:rPr>
+        <w:t>have to</w:t>
+      </w:r>
+      <w:proofErr w:type="gramEnd"/>
+      <w:r>
+        <w:rPr>
+          <w:lang w:val="en-US"/>
+        </w:rPr>
+        <w:t xml:space="preserve"> decide the orientation of the device. Oh no.</w:t>
+      </w:r>
+    </w:p>
+    <w:p>
+      <w:pPr>
+        <w:pStyle w:val="ListParagraph"/>
+        <w:numPr>
+          <w:ilvl w:val="1"/>
+          <w:numId w:val="2"/>
+        </w:numPr>
+        <w:rPr>
+          <w:lang w:val="en-US"/>
+        </w:rPr>
+      </w:pPr>
+      <w:r>
+        <w:rPr>
+          <w:lang w:val="en-US"/>
+        </w:rPr>
+        <w:t>This is the GPS I’m aiming for…</w:t>
+      </w:r>
+    </w:p>
+    <w:p>
+      <w:pPr>
+        <w:ind w:left="1080"/>
+        <w:jc w:val="center"/>
+        <w:rPr>
+          <w:lang w:val="en-US"/>
+        </w:rPr>
+      </w:pPr>
+      <w:r>
+        <w:rPr>
+          <w:noProof/>
+          <w:lang w:val="en-US"/>
+        </w:rPr>
+        <w:drawing>
+          <wp:inline distT="0" distB="0" distL="0" distR="0" wp14:anchorId="0EFDA96F" wp14:editId="418BD9AA">
+            <wp:extent cx="4165616" cy="1442262"/>
+            <wp:effectExtent l="0" t="0" r="6350" b="5715"/>
+            <wp:docPr id="933813678" name="Picture 19"/>
+            <wp:cNvGraphicFramePr>
+              <a:graphicFrameLocks xmlns:a="http://schemas.openxmlformats.org/drawingml/2006/main" noChangeAspect="1"/>
+            </wp:cNvGraphicFramePr>
+            <a:graphic xmlns:a="http://schemas.openxmlformats.org/drawingml/2006/main">
+              <a:graphicData uri="http://schemas.openxmlformats.org/drawingml/2006/picture">
+                <pic:pic xmlns:pic="http://schemas.openxmlformats.org/drawingml/2006/picture">
+                  <pic:nvPicPr>
+                    <pic:cNvPr id="0" name="Picture 8"/>
+                    <pic:cNvPicPr>
+                      <a:picLocks noChangeAspect="1" noChangeArrowheads="1"/>
+                    </pic:cNvPicPr>
+                  </pic:nvPicPr>
+                  <pic:blipFill>
+                    <a:blip r:embed="rId37">
+                      <a:extLst>
+                        <a:ext uri="{28A0092B-C50C-407E-A947-70E740481C1C}">
+                          <a14:useLocalDpi xmlns:a14="http://schemas.microsoft.com/office/drawing/2010/main" val="0"/>
+                        </a:ext>
+                      </a:extLst>
+                    </a:blip>
+                    <a:srcRect/>
+                    <a:stretch>
+                      <a:fillRect/>
+                    </a:stretch>
+                  </pic:blipFill>
+                  <pic:spPr bwMode="auto">
+                    <a:xfrm>
+                      <a:off x="0" y="0"/>
+                      <a:ext cx="4186631" cy="1449538"/>
+                    </a:xfrm>
+                    <a:prstGeom prst="rect">
+                      <a:avLst/>
+                    </a:prstGeom>
+                    <a:noFill/>
+                  </pic:spPr>
+                </pic:pic>
+              </a:graphicData>
+            </a:graphic>
+          </wp:inline>
+        </w:drawing>
+      </w:r>
+    </w:p>
+    <w:p>
+      <w:pPr>
+        <w:pStyle w:val="ListParagraph"/>
+        <w:numPr>
+          <w:ilvl w:val="1"/>
+          <w:numId w:val="2"/>
+        </w:numPr>
+        <w:rPr>
+          <w:lang w:val="en-US"/>
+        </w:rPr>
+      </w:pPr>
+      <w:r>
+        <w:rPr>
+          <w:lang w:val="en-US"/>
+        </w:rPr>
+        <w:t>Trial and error time:</w:t>
+      </w:r>
+    </w:p>
+    <w:p>
+      <w:pPr>
+        <w:pStyle w:val="ListParagraph"/>
+        <w:numPr>
+          <w:ilvl w:val="2"/>
+          <w:numId w:val="2"/>
+        </w:numPr>
+        <w:rPr>
+          <w:lang w:val="en-US"/>
+        </w:rPr>
+      </w:pPr>
+      <w:r>
+        <w:rPr>
+          <w:lang w:val="en-US"/>
+        </w:rPr>
+        <w:t xml:space="preserve">Down, East, North </w:t>
+      </w:r>
+      <w:r>
+        <w:rPr>
+          <w:lang w:val="en-US"/>
+        </w:rPr>
+        <w:sym w:font="Wingdings" w:char="F0E0"/>
+      </w:r>
+      <w:r>
+        <w:rPr>
+          <w:lang w:val="en-US"/>
+        </w:rPr>
+        <w:t xml:space="preserve"> </w:t>
+      </w:r>
+      <w:r>
+        <w:rPr>
+          <w:lang w:val="en-US"/>
+        </w:rPr>
+        <w:t>unacceptable</w:t>
+      </w:r>
+    </w:p>
+    <w:p>
+      <w:pPr>
+        <w:ind w:left="1800"/>
+        <w:rPr>
+          <w:lang w:val="en-US"/>
+        </w:rPr>
+      </w:pPr>
+      <w:r>
+        <w:rPr>
+          <w:lang w:val="en-US"/>
+        </w:rPr>
+        <w:lastRenderedPageBreak/>
+        <w:drawing>
+          <wp:inline distT="0" distB="0" distL="0" distR="0" wp14:anchorId="4DADB1F9" wp14:editId="7B4F91FF">
+            <wp:extent cx="2849526" cy="2399934"/>
+            <wp:effectExtent l="0" t="0" r="8255" b="635"/>
+            <wp:docPr id="2131009183" name="Picture 1"/>
+            <wp:cNvGraphicFramePr>
+              <a:graphicFrameLocks xmlns:a="http://schemas.openxmlformats.org/drawingml/2006/main" noChangeAspect="1"/>
+            </wp:cNvGraphicFramePr>
+            <a:graphic xmlns:a="http://schemas.openxmlformats.org/drawingml/2006/main">
+              <a:graphicData uri="http://schemas.openxmlformats.org/drawingml/2006/picture">
+                <pic:pic xmlns:pic="http://schemas.openxmlformats.org/drawingml/2006/picture">
+                  <pic:nvPicPr>
+                    <pic:cNvPr id="2131009183" name=""/>
+                    <pic:cNvPicPr/>
+                  </pic:nvPicPr>
+                  <pic:blipFill>
+                    <a:blip r:embed="rId38"/>
+                    <a:stretch>
+                      <a:fillRect/>
+                    </a:stretch>
+                  </pic:blipFill>
+                  <pic:spPr>
+                    <a:xfrm>
+                      <a:off x="0" y="0"/>
+                      <a:ext cx="2854852" cy="2404420"/>
+                    </a:xfrm>
+                    <a:prstGeom prst="rect">
+                      <a:avLst/>
+                    </a:prstGeom>
+                  </pic:spPr>
+                </pic:pic>
+              </a:graphicData>
+            </a:graphic>
+          </wp:inline>
+        </w:drawing>
+      </w:r>
+    </w:p>
+    <w:p>
+      <w:pPr>
+        <w:ind w:left="360"/>
+        <w:rPr>
+          <w:lang w:val="en-US"/>
+        </w:rPr>
+      </w:pPr>
+    </w:p>
+    <w:p>
+      <w:pPr>
+        <w:rPr>
+          <w:lang w:val="en-US"/>
+        </w:rPr>
+      </w:pPr>
+    </w:p>
+    <w:p>
+      <w:pPr>
+        <w:rPr>
+          <w:lang w:val="en-US"/>
+        </w:rPr>
+      </w:pPr>
+    </w:p>
+    <w:p>
+      <w:pPr>
+        <w:rPr>
+          <w:lang w:val="en-US"/>
+        </w:rPr>
+      </w:pPr>
+    </w:p>
+    <w:p>
+      <w:pPr>
+        <w:rPr>
+          <w:lang w:val="en-US"/>
+        </w:rPr>
+      </w:pPr>
+    </w:p>
+    <w:p>
+      <w:pPr>
+        <w:rPr>
+          <w:lang w:val="en-US"/>
+        </w:rPr>
+      </w:pPr>
+    </w:p>
+    <w:p>
+      <w:pPr>
+        <w:rPr>
+          <w:lang w:val="en-US"/>
+        </w:rPr>
+      </w:pPr>
+    </w:p>
+    <w:p>
+      <w:pPr>
+        <w:rPr>
+          <w:lang w:val="en-US"/>
+        </w:rPr>
+      </w:pPr>
+    </w:p>
+    <w:p>
+      <w:pPr>
+        <w:rPr>
+          <w:lang w:val="en-US"/>
+        </w:rPr>
+      </w:pPr>
+      <w:r>
+        <w:rPr>
+          <w:highlight w:val="yellow"/>
+          <w:lang w:val="en-US"/>
+        </w:rPr>
+        <w:t>I still need to clean the outliers. There are a bunch of random misreads I have not accounted for.</w:t>
+      </w:r>
+    </w:p>
     <w:sectPr>
+      <w:headerReference w:type="default" r:id="rId39"/>
       <w:pgSz w:w="12240" w:h="15840"/>
-      <w:pgMar w:top="1440" w:right="1440" w:bottom="1440" w:left="1440" w:header="720" w:footer="720" w:gutter="0"/>
+      <w:pgMar w:top="720" w:right="720" w:bottom="720" w:left="720" w:header="720" w:footer="720" w:gutter="0"/>
       <w:cols w:space="720"/>
       <w:docGrid w:linePitch="360"/>
     </w:sectPr>
@@ -4087,9 +6084,162 @@
 </w:document>
 </file>
 
+<file path=word/endnotes.xml><?xml version="1.0" encoding="utf-8"?>
+<w:endnotes xmlns:wpc="http://schemas.microsoft.com/office/word/2010/wordprocessingCanvas" xmlns:cx="http://schemas.microsoft.com/office/drawing/2014/chartex" xmlns:cx1="http://schemas.microsoft.com/office/drawing/2015/9/8/chartex" xmlns:cx2="http://schemas.microsoft.com/office/drawing/2015/10/21/chartex" xmlns:cx3="http://schemas.microsoft.com/office/drawing/2016/5/9/chartex" xmlns:cx4="http://schemas.microsoft.com/office/drawing/2016/5/10/chartex" xmlns:cx5="http://schemas.microsoft.com/office/drawing/2016/5/11/chartex" xmlns:cx6="http://schemas.microsoft.com/office/drawing/2016/5/12/chartex" xmlns:cx7="http://schemas.microsoft.com/office/drawing/2016/5/13/chartex" xmlns:cx8="http://schemas.microsoft.com/office/drawing/2016/5/14/chartex" xmlns:mc="http://schemas.openxmlformats.org/markup-compatibility/2006" xmlns:aink="http://schemas.microsoft.com/office/drawing/2016/ink" xmlns:am3d="http://schemas.microsoft.com/office/drawing/2017/model3d" xmlns:o="urn:schemas-microsoft-com:office:office" xmlns:oel="http://schemas.microsoft.com/office/2019/extlst" xmlns:r="http://schemas.openxmlformats.org/officeDocument/2006/relationships" xmlns:m="http://schemas.openxmlformats.org/officeDocument/2006/math" xmlns:v="urn:schemas-microsoft-com:vml" xmlns:wp14="http://schemas.microsoft.com/office/word/2010/wordprocessingDrawing" xmlns:wp="http://schemas.openxmlformats.org/drawingml/2006/wordprocessingDrawing" xmlns:w10="urn:schemas-microsoft-com:office:word" xmlns:w="http://schemas.openxmlformats.org/wordprocessingml/2006/main" xmlns:w14="http://schemas.microsoft.com/office/word/2010/wordml" xmlns:w15="http://schemas.microsoft.com/office/word/2012/wordml" xmlns:w16cex="http://schemas.microsoft.com/office/word/2018/wordml/cex" xmlns:w16cid="http://schemas.microsoft.com/office/word/2016/wordml/cid" xmlns:w16="http://schemas.microsoft.com/office/word/2018/wordml" xmlns:w16du="http://schemas.microsoft.com/office/word/2023/wordml/word16du" xmlns:w16sdtdh="http://schemas.microsoft.com/office/word/2020/wordml/sdtdatahash" xmlns:w16sdtfl="http://schemas.microsoft.com/office/word/2024/wordml/sdtformatlock" xmlns:w16se="http://schemas.microsoft.com/office/word/2015/wordml/symex" xmlns:wpg="http://schemas.microsoft.com/office/word/2010/wordprocessingGroup" xmlns:wpi="http://schemas.microsoft.com/office/word/2010/wordprocessingInk" xmlns:wne="http://schemas.microsoft.com/office/word/2006/wordml" xmlns:wps="http://schemas.microsoft.com/office/word/2010/wordprocessingShape" mc:Ignorable="w14 w15 w16se w16cid w16 w16cex w16sdtdh w16sdtfl w16du wp14">
+  <w:endnote w:type="separator" w:id="-1">
+    <w:p>
+      <w:pPr>
+        <w:spacing w:after="0" w:line="240" w:lineRule="auto"/>
+      </w:pPr>
+      <w:r>
+        <w:separator/>
+      </w:r>
+    </w:p>
+  </w:endnote>
+  <w:endnote w:type="continuationSeparator" w:id="0">
+    <w:p>
+      <w:pPr>
+        <w:spacing w:after="0" w:line="240" w:lineRule="auto"/>
+      </w:pPr>
+      <w:r>
+        <w:continuationSeparator/>
+      </w:r>
+    </w:p>
+  </w:endnote>
+</w:endnotes>
+</file>
+
+<file path=word/footnotes.xml><?xml version="1.0" encoding="utf-8"?>
+<w:footnotes xmlns:wpc="http://schemas.microsoft.com/office/word/2010/wordprocessingCanvas" xmlns:cx="http://schemas.microsoft.com/office/drawing/2014/chartex" xmlns:cx1="http://schemas.microsoft.com/office/drawing/2015/9/8/chartex" xmlns:cx2="http://schemas.microsoft.com/office/drawing/2015/10/21/chartex" xmlns:cx3="http://schemas.microsoft.com/office/drawing/2016/5/9/chartex" xmlns:cx4="http://schemas.microsoft.com/office/drawing/2016/5/10/chartex" xmlns:cx5="http://schemas.microsoft.com/office/drawing/2016/5/11/chartex" xmlns:cx6="http://schemas.microsoft.com/office/drawing/2016/5/12/chartex" xmlns:cx7="http://schemas.microsoft.com/office/drawing/2016/5/13/chartex" xmlns:cx8="http://schemas.microsoft.com/office/drawing/2016/5/14/chartex" xmlns:mc="http://schemas.openxmlformats.org/markup-compatibility/2006" xmlns:aink="http://schemas.microsoft.com/office/drawing/2016/ink" xmlns:am3d="http://schemas.microsoft.com/office/drawing/2017/model3d" xmlns:o="urn:schemas-microsoft-com:office:office" xmlns:oel="http://schemas.microsoft.com/office/2019/extlst" xmlns:r="http://schemas.openxmlformats.org/officeDocument/2006/relationships" xmlns:m="http://schemas.openxmlformats.org/officeDocument/2006/math" xmlns:v="urn:schemas-microsoft-com:vml" xmlns:wp14="http://schemas.microsoft.com/office/word/2010/wordprocessingDrawing" xmlns:wp="http://schemas.openxmlformats.org/drawingml/2006/wordprocessingDrawing" xmlns:w10="urn:schemas-microsoft-com:office:word" xmlns:w="http://schemas.openxmlformats.org/wordprocessingml/2006/main" xmlns:w14="http://schemas.microsoft.com/office/word/2010/wordml" xmlns:w15="http://schemas.microsoft.com/office/word/2012/wordml" xmlns:w16cex="http://schemas.microsoft.com/office/word/2018/wordml/cex" xmlns:w16cid="http://schemas.microsoft.com/office/word/2016/wordml/cid" xmlns:w16="http://schemas.microsoft.com/office/word/2018/wordml" xmlns:w16du="http://schemas.microsoft.com/office/word/2023/wordml/word16du" xmlns:w16sdtdh="http://schemas.microsoft.com/office/word/2020/wordml/sdtdatahash" xmlns:w16sdtfl="http://schemas.microsoft.com/office/word/2024/wordml/sdtformatlock" xmlns:w16se="http://schemas.microsoft.com/office/word/2015/wordml/symex" xmlns:wpg="http://schemas.microsoft.com/office/word/2010/wordprocessingGroup" xmlns:wpi="http://schemas.microsoft.com/office/word/2010/wordprocessingInk" xmlns:wne="http://schemas.microsoft.com/office/word/2006/wordml" xmlns:wps="http://schemas.microsoft.com/office/word/2010/wordprocessingShape" mc:Ignorable="w14 w15 w16se w16cid w16 w16cex w16sdtdh w16sdtfl w16du wp14">
+  <w:footnote w:type="separator" w:id="-1">
+    <w:p>
+      <w:pPr>
+        <w:spacing w:after="0" w:line="240" w:lineRule="auto"/>
+      </w:pPr>
+      <w:r>
+        <w:separator/>
+      </w:r>
+    </w:p>
+  </w:footnote>
+  <w:footnote w:type="continuationSeparator" w:id="0">
+    <w:p>
+      <w:pPr>
+        <w:spacing w:after="0" w:line="240" w:lineRule="auto"/>
+      </w:pPr>
+      <w:r>
+        <w:continuationSeparator/>
+      </w:r>
+    </w:p>
+  </w:footnote>
+</w:footnotes>
+</file>
+
+<file path=word/header1.xml><?xml version="1.0" encoding="utf-8"?>
+<w:hdr xmlns:wpc="http://schemas.microsoft.com/office/word/2010/wordprocessingCanvas" xmlns:cx="http://schemas.microsoft.com/office/drawing/2014/chartex" xmlns:cx1="http://schemas.microsoft.com/office/drawing/2015/9/8/chartex" xmlns:cx2="http://schemas.microsoft.com/office/drawing/2015/10/21/chartex" xmlns:cx3="http://schemas.microsoft.com/office/drawing/2016/5/9/chartex" xmlns:cx4="http://schemas.microsoft.com/office/drawing/2016/5/10/chartex" xmlns:cx5="http://schemas.microsoft.com/office/drawing/2016/5/11/chartex" xmlns:cx6="http://schemas.microsoft.com/office/drawing/2016/5/12/chartex" xmlns:cx7="http://schemas.microsoft.com/office/drawing/2016/5/13/chartex" xmlns:cx8="http://schemas.microsoft.com/office/drawing/2016/5/14/chartex" xmlns:mc="http://schemas.openxmlformats.org/markup-compatibility/2006" xmlns:aink="http://schemas.microsoft.com/office/drawing/2016/ink" xmlns:am3d="http://schemas.microsoft.com/office/drawing/2017/model3d" xmlns:o="urn:schemas-microsoft-com:office:office" xmlns:oel="http://schemas.microsoft.com/office/2019/extlst" xmlns:r="http://schemas.openxmlformats.org/officeDocument/2006/relationships" xmlns:m="http://schemas.openxmlformats.org/officeDocument/2006/math" xmlns:v="urn:schemas-microsoft-com:vml" xmlns:wp14="http://schemas.microsoft.com/office/word/2010/wordprocessingDrawing" xmlns:wp="http://schemas.openxmlformats.org/drawingml/2006/wordprocessingDrawing" xmlns:w10="urn:schemas-microsoft-com:office:word" xmlns:w="http://schemas.openxmlformats.org/wordprocessingml/2006/main" xmlns:w14="http://schemas.microsoft.com/office/word/2010/wordml" xmlns:w15="http://schemas.microsoft.com/office/word/2012/wordml" xmlns:w16cex="http://schemas.microsoft.com/office/word/2018/wordml/cex" xmlns:w16cid="http://schemas.microsoft.com/office/word/2016/wordml/cid" xmlns:w16="http://schemas.microsoft.com/office/word/2018/wordml" xmlns:w16du="http://schemas.microsoft.com/office/word/2023/wordml/word16du" xmlns:w16sdtdh="http://schemas.microsoft.com/office/word/2020/wordml/sdtdatahash" xmlns:w16sdtfl="http://schemas.microsoft.com/office/word/2024/wordml/sdtformatlock" xmlns:w16se="http://schemas.microsoft.com/office/word/2015/wordml/symex" xmlns:wpg="http://schemas.microsoft.com/office/word/2010/wordprocessingGroup" xmlns:wpi="http://schemas.microsoft.com/office/word/2010/wordprocessingInk" xmlns:wne="http://schemas.microsoft.com/office/word/2006/wordml" xmlns:wps="http://schemas.microsoft.com/office/word/2010/wordprocessingShape" mc:Ignorable="w14 w15 w16se w16cid w16 w16cex w16sdtdh w16sdtfl w16du wp14">
+  <w:p>
+    <w:pPr>
+      <w:pStyle w:val="Header"/>
+      <w:jc w:val="right"/>
+    </w:pPr>
+    <w:r>
+      <w:t>Oakleigh Wilson Impala Project Worklog</w:t>
+    </w:r>
+  </w:p>
+</w:hdr>
+</file>
+
 <file path=word/numbering.xml><?xml version="1.0" encoding="utf-8"?>
 <w:numbering xmlns:wpc="http://schemas.microsoft.com/office/word/2010/wordprocessingCanvas" xmlns:cx="http://schemas.microsoft.com/office/drawing/2014/chartex" xmlns:cx1="http://schemas.microsoft.com/office/drawing/2015/9/8/chartex" xmlns:cx2="http://schemas.microsoft.com/office/drawing/2015/10/21/chartex" xmlns:cx3="http://schemas.microsoft.com/office/drawing/2016/5/9/chartex" xmlns:cx4="http://schemas.microsoft.com/office/drawing/2016/5/10/chartex" xmlns:cx5="http://schemas.microsoft.com/office/drawing/2016/5/11/chartex" xmlns:cx6="http://schemas.microsoft.com/office/drawing/2016/5/12/chartex" xmlns:cx7="http://schemas.microsoft.com/office/drawing/2016/5/13/chartex" xmlns:cx8="http://schemas.microsoft.com/office/drawing/2016/5/14/chartex" xmlns:mc="http://schemas.openxmlformats.org/markup-compatibility/2006" xmlns:aink="http://schemas.microsoft.com/office/drawing/2016/ink" xmlns:am3d="http://schemas.microsoft.com/office/drawing/2017/model3d" xmlns:o="urn:schemas-microsoft-com:office:office" xmlns:oel="http://schemas.microsoft.com/office/2019/extlst" xmlns:r="http://schemas.openxmlformats.org/officeDocument/2006/relationships" xmlns:m="http://schemas.openxmlformats.org/officeDocument/2006/math" xmlns:v="urn:schemas-microsoft-com:vml" xmlns:wp14="http://schemas.microsoft.com/office/word/2010/wordprocessingDrawing" xmlns:wp="http://schemas.openxmlformats.org/drawingml/2006/wordprocessingDrawing" xmlns:w10="urn:schemas-microsoft-com:office:word" xmlns:w="http://schemas.openxmlformats.org/wordprocessingml/2006/main" xmlns:w14="http://schemas.microsoft.com/office/word/2010/wordml" xmlns:w15="http://schemas.microsoft.com/office/word/2012/wordml" xmlns:w16cex="http://schemas.microsoft.com/office/word/2018/wordml/cex" xmlns:w16cid="http://schemas.microsoft.com/office/word/2016/wordml/cid" xmlns:w16="http://schemas.microsoft.com/office/word/2018/wordml" xmlns:w16du="http://schemas.microsoft.com/office/word/2023/wordml/word16du" xmlns:w16sdtdh="http://schemas.microsoft.com/office/word/2020/wordml/sdtdatahash" xmlns:w16sdtfl="http://schemas.microsoft.com/office/word/2024/wordml/sdtformatlock" xmlns:w16se="http://schemas.microsoft.com/office/word/2015/wordml/symex" xmlns:wpg="http://schemas.microsoft.com/office/word/2010/wordprocessingGroup" xmlns:wpi="http://schemas.microsoft.com/office/word/2010/wordprocessingInk" xmlns:wne="http://schemas.microsoft.com/office/word/2006/wordml" xmlns:wps="http://schemas.microsoft.com/office/word/2010/wordprocessingShape" mc:Ignorable="w14 w15 w16se w16cid w16 w16cex w16sdtdh w16sdtfl w16du wp14">
   <w:abstractNum w:abstractNumId="0" w15:restartNumberingAfterBreak="0">
+    <w:nsid w:val="49452693"/>
+    <w:multiLevelType w:val="hybridMultilevel"/>
+    <w:tmpl w:val="954C1696"/>
+    <w:lvl w:ilvl="0" w:tplc="0409000F">
+      <w:start w:val="1"/>
+      <w:numFmt w:val="decimal"/>
+      <w:lvlText w:val="%1."/>
+      <w:lvlJc w:val="left"/>
+      <w:pPr>
+        <w:ind w:left="1080" w:hanging="360"/>
+      </w:pPr>
+      <w:rPr>
+        <w:rFonts w:hint="default"/>
+      </w:rPr>
+    </w:lvl>
+    <w:lvl w:ilvl="1" w:tplc="04090019" w:tentative="1">
+      <w:start w:val="1"/>
+      <w:numFmt w:val="lowerLetter"/>
+      <w:lvlText w:val="%2."/>
+      <w:lvlJc w:val="left"/>
+      <w:pPr>
+        <w:ind w:left="1800" w:hanging="360"/>
+      </w:pPr>
+    </w:lvl>
+    <w:lvl w:ilvl="2" w:tplc="0409001B" w:tentative="1">
+      <w:start w:val="1"/>
+      <w:numFmt w:val="lowerRoman"/>
+      <w:lvlText w:val="%3."/>
+      <w:lvlJc w:val="right"/>
+      <w:pPr>
+        <w:ind w:left="2520" w:hanging="180"/>
+      </w:pPr>
+    </w:lvl>
+    <w:lvl w:ilvl="3" w:tplc="0409000F" w:tentative="1">
+      <w:start w:val="1"/>
+      <w:numFmt w:val="decimal"/>
+      <w:lvlText w:val="%4."/>
+      <w:lvlJc w:val="left"/>
+      <w:pPr>
+        <w:ind w:left="3240" w:hanging="360"/>
+      </w:pPr>
+    </w:lvl>
+    <w:lvl w:ilvl="4" w:tplc="04090019" w:tentative="1">
+      <w:start w:val="1"/>
+      <w:numFmt w:val="lowerLetter"/>
+      <w:lvlText w:val="%5."/>
+      <w:lvlJc w:val="left"/>
+      <w:pPr>
+        <w:ind w:left="3960" w:hanging="360"/>
+      </w:pPr>
+    </w:lvl>
+    <w:lvl w:ilvl="5" w:tplc="0409001B" w:tentative="1">
+      <w:start w:val="1"/>
+      <w:numFmt w:val="lowerRoman"/>
+      <w:lvlText w:val="%6."/>
+      <w:lvlJc w:val="right"/>
+      <w:pPr>
+        <w:ind w:left="4680" w:hanging="180"/>
+      </w:pPr>
+    </w:lvl>
+    <w:lvl w:ilvl="6" w:tplc="0409000F" w:tentative="1">
+      <w:start w:val="1"/>
+      <w:numFmt w:val="decimal"/>
+      <w:lvlText w:val="%7."/>
+      <w:lvlJc w:val="left"/>
+      <w:pPr>
+        <w:ind w:left="5400" w:hanging="360"/>
+      </w:pPr>
+    </w:lvl>
+    <w:lvl w:ilvl="7" w:tplc="04090019" w:tentative="1">
+      <w:start w:val="1"/>
+      <w:numFmt w:val="lowerLetter"/>
+      <w:lvlText w:val="%8."/>
+      <w:lvlJc w:val="left"/>
+      <w:pPr>
+        <w:ind w:left="6120" w:hanging="360"/>
+      </w:pPr>
+    </w:lvl>
+    <w:lvl w:ilvl="8" w:tplc="0409001B" w:tentative="1">
+      <w:start w:val="1"/>
+      <w:numFmt w:val="lowerRoman"/>
+      <w:lvlText w:val="%9."/>
+      <w:lvlJc w:val="right"/>
+      <w:pPr>
+        <w:ind w:left="6840" w:hanging="180"/>
+      </w:pPr>
+    </w:lvl>
+  </w:abstractNum>
+  <w:abstractNum w:abstractNumId="1" w15:restartNumberingAfterBreak="0">
     <w:nsid w:val="4ED74C8D"/>
     <w:multiLevelType w:val="hybridMultilevel"/>
     <w:tmpl w:val="D6702326"/>
@@ -4202,9 +6352,12 @@
     </w:lvl>
   </w:abstractNum>
   <w:num w:numId="1" w16cid:durableId="2051686407">
-    <w:abstractNumId w:val="0"/>
+    <w:abstractNumId w:val="1"/>
   </w:num>
   <w:num w:numId="2" w16cid:durableId="694502218">
+    <w:abstractNumId w:val="1"/>
+  </w:num>
+  <w:num w:numId="3" w16cid:durableId="1691952218">
     <w:abstractNumId w:val="0"/>
   </w:num>
 </w:numbering>
@@ -4818,7 +6971,6 @@
   <w:style w:type="character" w:default="1" w:styleId="DefaultParagraphFont">
     <w:name w:val="Default Paragraph Font"/>
     <w:uiPriority w:val="1"/>
-    <w:semiHidden/>
     <w:unhideWhenUsed/>
   </w:style>
   <w:style w:type="table" w:default="1" w:styleId="TableNormal">
@@ -5312,6 +7464,56 @@
       </w:tblBorders>
     </w:tblPr>
   </w:style>
+  <w:style w:type="paragraph" w:styleId="Header">
+    <w:name w:val="header"/>
+    <w:basedOn w:val="Normal"/>
+    <w:link w:val="HeaderChar"/>
+    <w:uiPriority w:val="99"/>
+    <w:unhideWhenUsed/>
+    <w:rsid w:val="003E414C"/>
+    <w:pPr>
+      <w:tabs>
+        <w:tab w:val="center" w:pos="4680"/>
+        <w:tab w:val="right" w:pos="9360"/>
+      </w:tabs>
+      <w:spacing w:after="0" w:line="240" w:lineRule="auto"/>
+    </w:pPr>
+  </w:style>
+  <w:style w:type="character" w:customStyle="1" w:styleId="HeaderChar">
+    <w:name w:val="Header Char"/>
+    <w:basedOn w:val="DefaultParagraphFont"/>
+    <w:link w:val="Header"/>
+    <w:uiPriority w:val="99"/>
+    <w:rsid w:val="003E414C"/>
+    <w:rPr>
+      <w:lang w:val="en-GB"/>
+    </w:rPr>
+  </w:style>
+  <w:style w:type="paragraph" w:styleId="Footer">
+    <w:name w:val="footer"/>
+    <w:basedOn w:val="Normal"/>
+    <w:link w:val="FooterChar"/>
+    <w:uiPriority w:val="99"/>
+    <w:unhideWhenUsed/>
+    <w:rsid w:val="003E414C"/>
+    <w:pPr>
+      <w:tabs>
+        <w:tab w:val="center" w:pos="4680"/>
+        <w:tab w:val="right" w:pos="9360"/>
+      </w:tabs>
+      <w:spacing w:after="0" w:line="240" w:lineRule="auto"/>
+    </w:pPr>
+  </w:style>
+  <w:style w:type="character" w:customStyle="1" w:styleId="FooterChar">
+    <w:name w:val="Footer Char"/>
+    <w:basedOn w:val="DefaultParagraphFont"/>
+    <w:link w:val="Footer"/>
+    <w:uiPriority w:val="99"/>
+    <w:rsid w:val="003E414C"/>
+    <w:rPr>
+      <w:lang w:val="en-GB"/>
+    </w:rPr>
+  </w:style>
 </w:styles>
 </file>
 

</xml_diff>

<commit_message>
fixing the alignment for backwards interpolation
</commit_message>
<xml_diff>
--- a/Notes/Worklog.docx
+++ b/Notes/Worklog.docx
@@ -310,15 +310,7 @@
         <w:spacing w:line="276" w:lineRule="auto"/>
       </w:pPr>
       <w:r>
-        <w:t xml:space="preserve">Below is collar 8 video 2 as annotated by Amelia with the old system (looked correct to the video). Now I </w:t>
-      </w:r>
-      <w:proofErr w:type="gramStart"/>
-      <w:r>
-        <w:t>have to</w:t>
-      </w:r>
-      <w:proofErr w:type="gramEnd"/>
-      <w:r>
-        <w:t xml:space="preserve"> be able to replicate that with my new system.</w:t>
+        <w:t>Below is collar 8 video 2 as annotated by Amelia with the old system (looked correct to the video). Now I have to be able to replicate that with my new system.</w:t>
       </w:r>
     </w:p>
     <w:p>
@@ -386,15 +378,7 @@
         <w:spacing w:line="276" w:lineRule="auto"/>
       </w:pPr>
       <w:r>
-        <w:t xml:space="preserve">Which I was unable to do… Which means that, somewhere my new system is breaking. Which is </w:t>
-      </w:r>
-      <w:proofErr w:type="gramStart"/>
-      <w:r>
-        <w:t>actually a</w:t>
-      </w:r>
-      <w:proofErr w:type="gramEnd"/>
-      <w:r>
-        <w:t xml:space="preserve"> good sign… because the error is in my new code, not in the data (flow on implications for why the kangaroo stuff isn’t working).</w:t>
+        <w:t>Which I was unable to do… Which means that, somewhere my new system is breaking. Which is actually a good sign… because the error is in my new code, not in the data (flow on implications for why the kangaroo stuff isn’t working).</w:t>
       </w:r>
     </w:p>
     <w:p>
@@ -486,15 +470,7 @@
         <w:spacing w:line="276" w:lineRule="auto"/>
       </w:pPr>
       <w:r>
-        <w:t xml:space="preserve">Okay, I’m </w:t>
-      </w:r>
-      <w:proofErr w:type="gramStart"/>
-      <w:r>
-        <w:t>actually going</w:t>
-      </w:r>
-      <w:proofErr w:type="gramEnd"/>
-      <w:r>
-        <w:t xml:space="preserve"> to revert everything. Back to the very beginning and check differences along every step of the way. I created a branch from 5 months ago and will check every step along the way:</w:t>
+        <w:t>Okay, I’m actually going to revert everything. Back to the very beginning and check differences along every step of the way. I created a branch from 5 months ago and will check every step along the way:</w:t>
       </w:r>
     </w:p>
     <w:p>
@@ -520,13 +496,8 @@
         <w:spacing w:line="276" w:lineRule="auto"/>
       </w:pPr>
       <w:r>
-        <w:t xml:space="preserve">Accel stitch: </w:t>
-      </w:r>
-      <w:proofErr w:type="gramStart"/>
-      <w:r>
-        <w:t>Exactly the same</w:t>
-      </w:r>
-      <w:proofErr w:type="gramEnd"/>
+        <w:t>Accel stitch: Exactly the same</w:t>
+      </w:r>
     </w:p>
     <w:p>
       <w:pPr>
@@ -538,15 +509,7 @@
         <w:spacing w:line="276" w:lineRule="auto"/>
       </w:pPr>
       <w:r>
-        <w:t xml:space="preserve">Old method doesn’t account for the internal clock restarting on the </w:t>
-      </w:r>
-      <w:proofErr w:type="gramStart"/>
-      <w:r>
-        <w:t>accelerometer</w:t>
-      </w:r>
-      <w:proofErr w:type="gramEnd"/>
-      <w:r>
-        <w:t xml:space="preserve"> but when I more closely investigated, it does restart. There are duplicated values in the timestamps. </w:t>
+        <w:t xml:space="preserve">Old method doesn’t account for the internal clock restarting on the accelerometer but when I more closely investigated, it does restart. There are duplicated values in the timestamps. </w:t>
       </w:r>
       <w:r>
         <w:sym w:font="Wingdings" w:char="F0E0"/>
@@ -879,15 +842,7 @@
         <w:spacing w:line="276" w:lineRule="auto"/>
       </w:pPr>
       <w:r>
-        <w:t xml:space="preserve">But </w:t>
-      </w:r>
-      <w:proofErr w:type="gramStart"/>
-      <w:r>
-        <w:t>somehow</w:t>
-      </w:r>
-      <w:proofErr w:type="gramEnd"/>
-      <w:r>
-        <w:t xml:space="preserve"> they are then getting back mixed together after I combine the accel and </w:t>
+        <w:t xml:space="preserve">But somehow they are then getting back mixed together after I combine the accel and </w:t>
       </w:r>
       <w:proofErr w:type="spellStart"/>
       <w:r>
@@ -1160,23 +1115,7 @@
         <w:spacing w:line="276" w:lineRule="auto"/>
       </w:pPr>
       <w:r>
-        <w:t xml:space="preserve">Wait. Wait. It seems like it might already be </w:t>
-      </w:r>
-      <w:proofErr w:type="gramStart"/>
-      <w:r>
-        <w:t>aligned?</w:t>
-      </w:r>
-      <w:proofErr w:type="gramEnd"/>
-      <w:r>
-        <w:t xml:space="preserve"> If you watch a video </w:t>
-      </w:r>
-      <w:proofErr w:type="gramStart"/>
-      <w:r>
-        <w:t>a sufficient number of</w:t>
-      </w:r>
-      <w:proofErr w:type="gramEnd"/>
-      <w:r>
-        <w:t xml:space="preserve"> times, you can gaslight yourself into literally anything. (Robin Vid </w:t>
+        <w:t xml:space="preserve">Wait. Wait. It seems like it might already be aligned? If you watch a video a sufficient number of times, you can gaslight yourself into literally anything. (Robin Vid </w:t>
       </w:r>
       <w:r>
         <w:t>8</w:t>
@@ -1232,15 +1171,7 @@
         <w:spacing w:line="276" w:lineRule="auto"/>
       </w:pPr>
       <w:r>
-        <w:t xml:space="preserve">Amazing! </w:t>
-      </w:r>
-      <w:proofErr w:type="gramStart"/>
-      <w:r>
-        <w:t>So</w:t>
-      </w:r>
-      <w:proofErr w:type="gramEnd"/>
-      <w:r>
-        <w:t xml:space="preserve"> it was aligned and Amelia did a tonne of work on it.</w:t>
+        <w:t>Amazing! So it was aligned and Amelia did a tonne of work on it.</w:t>
       </w:r>
     </w:p>
     <w:p>
@@ -1331,9 +1262,9 @@
         </w:rPr>
         <w:lastRenderedPageBreak/>
         <w:drawing>
-          <wp:inline distT="0" distB="0" distL="0" distR="0" wp14:anchorId="0CD36A4C" wp14:editId="5953D242">
-            <wp:extent cx="3358055" cy="1764727"/>
-            <wp:effectExtent l="0" t="0" r="0" b="6985"/>
+          <wp:inline distT="0" distB="0" distL="0" distR="0" wp14:anchorId="0CD36A4C" wp14:editId="6D95756A">
+            <wp:extent cx="6559236" cy="3447013"/>
+            <wp:effectExtent l="0" t="0" r="0" b="1270"/>
             <wp:docPr id="1212934250" name="Picture 2"/>
             <wp:cNvGraphicFramePr>
               <a:graphicFrameLocks xmlns:a="http://schemas.openxmlformats.org/drawingml/2006/main" noChangeAspect="1"/>
@@ -1363,7 +1294,7 @@
                   <pic:spPr bwMode="auto">
                     <a:xfrm>
                       <a:off x="0" y="0"/>
-                      <a:ext cx="3391238" cy="1782165"/>
+                      <a:ext cx="6655180" cy="3497433"/>
                     </a:xfrm>
                     <a:prstGeom prst="rect">
                       <a:avLst/>
@@ -1381,9 +1312,9 @@
           <w:noProof/>
         </w:rPr>
         <w:drawing>
-          <wp:inline distT="0" distB="0" distL="0" distR="0" wp14:anchorId="3CA3BCFF" wp14:editId="62652FBD">
-            <wp:extent cx="3389586" cy="1781298"/>
-            <wp:effectExtent l="0" t="0" r="1905" b="0"/>
+          <wp:inline distT="0" distB="0" distL="0" distR="0" wp14:anchorId="3CA3BCFF" wp14:editId="2619DD8C">
+            <wp:extent cx="6486808" cy="3408954"/>
+            <wp:effectExtent l="0" t="0" r="0" b="1270"/>
             <wp:docPr id="136574854" name="Picture 4"/>
             <wp:cNvGraphicFramePr>
               <a:graphicFrameLocks xmlns:a="http://schemas.openxmlformats.org/drawingml/2006/main" noChangeAspect="1"/>
@@ -1413,7 +1344,7 @@
                   <pic:spPr bwMode="auto">
                     <a:xfrm>
                       <a:off x="0" y="0"/>
-                      <a:ext cx="3414755" cy="1794525"/>
+                      <a:ext cx="6551092" cy="3442737"/>
                     </a:xfrm>
                     <a:prstGeom prst="rect">
                       <a:avLst/>
@@ -1674,6 +1605,7 @@
           </w:tcPr>
           <w:p>
             <w:r>
+              <w:lastRenderedPageBreak/>
               <w:t>Vigilance</w:t>
             </w:r>
           </w:p>
@@ -2285,19 +2217,10 @@
         </w:numPr>
       </w:pPr>
       <w:r>
-        <w:lastRenderedPageBreak/>
         <w:sym w:font="Wingdings" w:char="F0E0"/>
       </w:r>
       <w:r>
-        <w:t xml:space="preserve"> am </w:t>
-      </w:r>
-      <w:proofErr w:type="gramStart"/>
-      <w:r>
-        <w:t>actually now</w:t>
-      </w:r>
-      <w:proofErr w:type="gramEnd"/>
-      <w:r>
-        <w:t xml:space="preserve"> editing the </w:t>
+        <w:t xml:space="preserve"> am actually now editing the </w:t>
       </w:r>
       <w:proofErr w:type="spellStart"/>
       <w:r>
@@ -2308,12 +2231,10 @@
         <w:t xml:space="preserve"> to be able to read annotations if they exist, and then you can override to 0 if </w:t>
       </w:r>
       <w:proofErr w:type="spellStart"/>
-      <w:proofErr w:type="gramStart"/>
       <w:r>
         <w:t>its</w:t>
       </w:r>
       <w:proofErr w:type="spellEnd"/>
-      <w:proofErr w:type="gramEnd"/>
       <w:r>
         <w:t xml:space="preserve"> an error</w:t>
       </w:r>
@@ -2397,15 +2318,7 @@
         </w:numPr>
       </w:pPr>
       <w:r>
-        <w:t xml:space="preserve">I feel </w:t>
-      </w:r>
-      <w:proofErr w:type="gramStart"/>
-      <w:r>
-        <w:t>really unwell</w:t>
-      </w:r>
-      <w:proofErr w:type="gramEnd"/>
-      <w:r>
-        <w:t xml:space="preserve"> but trying to do a little of this before I go to sleep. Trying to get the dead reckoning script set up for Ethan to work on in a fortnight.</w:t>
+        <w:t>I feel really unwell but trying to do a little of this before I go to sleep. Trying to get the dead reckoning script set up for Ethan to work on in a fortnight.</w:t>
       </w:r>
     </w:p>
     <w:p>
@@ -2490,6 +2403,7 @@
         <w:rPr>
           <w:noProof/>
         </w:rPr>
+        <w:lastRenderedPageBreak/>
         <w:drawing>
           <wp:inline distT="0" distB="0" distL="0" distR="0" wp14:anchorId="26A2EFD0" wp14:editId="4E5FFCCF">
             <wp:extent cx="4819650" cy="2095500"/>
@@ -2546,15 +2460,7 @@
         </w:numPr>
       </w:pPr>
       <w:r>
-        <w:t xml:space="preserve">In the meantime, I just did a Z score normalisation so I can plot them all on the same axes. The below image is what I </w:t>
-      </w:r>
-      <w:proofErr w:type="gramStart"/>
-      <w:r>
-        <w:t>have to</w:t>
-      </w:r>
-      <w:proofErr w:type="gramEnd"/>
-      <w:r>
-        <w:t xml:space="preserve"> use to figure out the orientation of the collar.</w:t>
+        <w:t>In the meantime, I just did a Z score normalisation so I can plot them all on the same axes. The below image is what I have to use to figure out the orientation of the collar.</w:t>
       </w:r>
     </w:p>
     <w:p>
@@ -2871,7 +2777,6 @@
                 <w:szCs w:val="22"/>
                 <w:lang w:val="en-US"/>
               </w:rPr>
-              <w:lastRenderedPageBreak/>
               <w:t>RawAZ.sm</w:t>
             </w:r>
           </w:p>
@@ -3331,35 +3236,7 @@
         <w:rPr>
           <w:lang w:val="en-US"/>
         </w:rPr>
-        <w:t xml:space="preserve"> </w:t>
-      </w:r>
-      <w:proofErr w:type="gramStart"/>
-      <w:r>
-        <w:rPr>
-          <w:lang w:val="en-US"/>
-        </w:rPr>
-        <w:t>So</w:t>
-      </w:r>
-      <w:proofErr w:type="gramEnd"/>
-      <w:r>
-        <w:rPr>
-          <w:lang w:val="en-US"/>
-        </w:rPr>
-        <w:t xml:space="preserve"> this might be NED with a lot of </w:t>
-      </w:r>
-      <w:proofErr w:type="gramStart"/>
-      <w:r>
-        <w:rPr>
-          <w:lang w:val="en-US"/>
-        </w:rPr>
-        <w:t>roll</w:t>
-      </w:r>
-      <w:proofErr w:type="gramEnd"/>
-      <w:r>
-        <w:rPr>
-          <w:lang w:val="en-US"/>
-        </w:rPr>
-        <w:t>… could also be NWD?</w:t>
+        <w:t xml:space="preserve"> So this might be NED with a lot of roll… could also be NWD?</w:t>
       </w:r>
     </w:p>
     <w:p>
@@ -3374,6 +3251,7 @@
           <w:noProof/>
           <w:lang w:val="en-US"/>
         </w:rPr>
+        <w:lastRenderedPageBreak/>
         <w:drawing>
           <wp:inline distT="0" distB="0" distL="0" distR="0" wp14:anchorId="1340ADFE" wp14:editId="6FBADE05">
             <wp:extent cx="5943600" cy="5108575"/>
@@ -3454,21 +3332,7 @@
         <w:rPr>
           <w:lang w:val="en-US"/>
         </w:rPr>
-        <w:t>mag.</w:t>
-      </w:r>
-      <w:proofErr w:type="gramStart"/>
-      <w:r>
-        <w:rPr>
-          <w:lang w:val="en-US"/>
-        </w:rPr>
-        <w:t>x,y</w:t>
-      </w:r>
-      <w:proofErr w:type="gramEnd"/>
-      <w:r>
-        <w:rPr>
-          <w:lang w:val="en-US"/>
-        </w:rPr>
-        <w:t>,z</w:t>
+        <w:t>mag.x,y,z</w:t>
       </w:r>
       <w:proofErr w:type="spellEnd"/>
       <w:r>
@@ -3500,21 +3364,7 @@
         <w:rPr>
           <w:lang w:val="en-US"/>
         </w:rPr>
-        <w:t>acc.</w:t>
-      </w:r>
-      <w:proofErr w:type="gramStart"/>
-      <w:r>
-        <w:rPr>
-          <w:lang w:val="en-US"/>
-        </w:rPr>
-        <w:t>x,y</w:t>
-      </w:r>
-      <w:proofErr w:type="gramEnd"/>
-      <w:r>
-        <w:rPr>
-          <w:lang w:val="en-US"/>
-        </w:rPr>
-        <w:t>,z</w:t>
+        <w:t>acc.x,y,z</w:t>
       </w:r>
       <w:proofErr w:type="spellEnd"/>
       <w:r>
@@ -3539,109 +3389,90 @@
         <w:rPr>
           <w:lang w:val="en-US"/>
         </w:rPr>
+        <w:t>Marked events data (ME) specifying the period of the magnetic calibration period (as denoted by ‘M’ - any other input signifies data acquisition not part of calibration procedure)</w:t>
+      </w:r>
+    </w:p>
+    <w:p>
+      <w:pPr>
+        <w:pStyle w:val="ListParagraph"/>
+        <w:numPr>
+          <w:ilvl w:val="0"/>
+          <w:numId w:val="2"/>
+        </w:numPr>
+        <w:rPr>
+          <w:lang w:val="en-US"/>
+        </w:rPr>
+      </w:pPr>
+      <w:r>
+        <w:rPr>
+          <w:lang w:val="en-US"/>
+        </w:rPr>
+        <w:t>Method of correction: default 3. * For rotated ellipsoids use method = 2 (more influenced by noise or more spherical) or method = 3 (default). For simple orthogonal re-scaling use method = 1. For non-rotated ellipsoids use method = 4, 5 (x &amp; y axis equal), 6 (x &amp; z axis equal), 7 (y &amp; z axis are equal) or 8 (spherical data).</w:t>
+      </w:r>
+    </w:p>
+    <w:p>
+      <w:pPr>
+        <w:pStyle w:val="ListParagraph"/>
+        <w:numPr>
+          <w:ilvl w:val="0"/>
+          <w:numId w:val="2"/>
+        </w:numPr>
+        <w:rPr>
+          <w:lang w:val="en-US"/>
+        </w:rPr>
+      </w:pPr>
+      <w:r>
+        <w:rPr>
+          <w:lang w:val="en-US"/>
+        </w:rPr>
+        <w:t>Use 3 if a good calibration period is present. If the calibration period is not great (only ‘some’ of a sphere is covered when calibrating), then use method = 1.</w:t>
+      </w:r>
+    </w:p>
+    <w:p>
+      <w:pPr>
+        <w:pStyle w:val="ListParagraph"/>
+        <w:numPr>
+          <w:ilvl w:val="0"/>
+          <w:numId w:val="2"/>
+        </w:numPr>
+        <w:rPr>
+          <w:lang w:val="en-US"/>
+        </w:rPr>
+      </w:pPr>
+      <w:r>
+        <w:rPr>
+          <w:lang w:val="en-US"/>
+        </w:rPr>
+        <w:t xml:space="preserve">Estimated pitch offset: Approximately how much was it rotated by? * algorithm = “standard” (standard </w:t>
+      </w:r>
+      <w:proofErr w:type="spellStart"/>
+      <w:r>
+        <w:rPr>
+          <w:lang w:val="en-US"/>
+        </w:rPr>
+        <w:t>euler</w:t>
+      </w:r>
+      <w:proofErr w:type="spellEnd"/>
+      <w:r>
+        <w:rPr>
+          <w:lang w:val="en-US"/>
+        </w:rPr>
+        <w:t xml:space="preserve"> angle approach) or “SAAM” (using quaternions)</w:t>
+      </w:r>
+    </w:p>
+    <w:p>
+      <w:r>
+        <w:rPr>
+          <w:lang w:val="en-US"/>
+        </w:rPr>
+        <w:t xml:space="preserve">We have most of these variables available in the data already, but there are some that we have to figure out. </w:t>
+      </w:r>
+      <w:r>
+        <w:t xml:space="preserve">To understand the reference coordinate system for this analysis, firstly we have to understand what </w:t>
+      </w:r>
+      <w:r>
         <w:lastRenderedPageBreak/>
-        <w:t>Marked events data (ME) specifying the period of the magnetic calibration period (as denoted by ‘M’ - any other input signifies data acquisition not part of calibration procedure)</w:t>
-      </w:r>
-    </w:p>
-    <w:p>
-      <w:pPr>
-        <w:pStyle w:val="ListParagraph"/>
-        <w:numPr>
-          <w:ilvl w:val="0"/>
-          <w:numId w:val="2"/>
-        </w:numPr>
-        <w:rPr>
-          <w:lang w:val="en-US"/>
-        </w:rPr>
-      </w:pPr>
-      <w:r>
-        <w:rPr>
-          <w:lang w:val="en-US"/>
-        </w:rPr>
-        <w:t>Method of correction: default 3. * For rotated ellipsoids use method = 2 (more influenced by noise or more spherical) or method = 3 (default). For simple orthogonal re-scaling use method = 1. For non-rotated ellipsoids use method = 4, 5 (x &amp; y axis equal), 6 (x &amp; z axis equal), 7 (y &amp; z axis are equal) or 8 (spherical data).</w:t>
-      </w:r>
-    </w:p>
-    <w:p>
-      <w:pPr>
-        <w:pStyle w:val="ListParagraph"/>
-        <w:numPr>
-          <w:ilvl w:val="0"/>
-          <w:numId w:val="2"/>
-        </w:numPr>
-        <w:rPr>
-          <w:lang w:val="en-US"/>
-        </w:rPr>
-      </w:pPr>
-      <w:r>
-        <w:rPr>
-          <w:lang w:val="en-US"/>
-        </w:rPr>
-        <w:t>Use 3 if a good calibration period is present. If the calibration period is not great (only ‘some’ of a sphere is covered when calibrating), then use method = 1.</w:t>
-      </w:r>
-    </w:p>
-    <w:p>
-      <w:pPr>
-        <w:pStyle w:val="ListParagraph"/>
-        <w:numPr>
-          <w:ilvl w:val="0"/>
-          <w:numId w:val="2"/>
-        </w:numPr>
-        <w:rPr>
-          <w:lang w:val="en-US"/>
-        </w:rPr>
-      </w:pPr>
-      <w:r>
-        <w:rPr>
-          <w:lang w:val="en-US"/>
-        </w:rPr>
-        <w:t xml:space="preserve">Estimated pitch offset: Approximately how much was it rotated by? * algorithm = “standard” (standard </w:t>
-      </w:r>
-      <w:proofErr w:type="spellStart"/>
-      <w:r>
-        <w:rPr>
-          <w:lang w:val="en-US"/>
-        </w:rPr>
-        <w:t>euler</w:t>
-      </w:r>
-      <w:proofErr w:type="spellEnd"/>
-      <w:r>
-        <w:rPr>
-          <w:lang w:val="en-US"/>
-        </w:rPr>
-        <w:t xml:space="preserve"> angle approach) or “SAAM” (using quaternions)</w:t>
-      </w:r>
-    </w:p>
-    <w:p>
-      <w:r>
-        <w:rPr>
-          <w:lang w:val="en-US"/>
-        </w:rPr>
-        <w:t xml:space="preserve">We have most of these variables available in the data already, but there are some that we </w:t>
-      </w:r>
-      <w:proofErr w:type="gramStart"/>
-      <w:r>
-        <w:rPr>
-          <w:lang w:val="en-US"/>
-        </w:rPr>
-        <w:t>have to</w:t>
-      </w:r>
-      <w:proofErr w:type="gramEnd"/>
-      <w:r>
-        <w:rPr>
-          <w:lang w:val="en-US"/>
-        </w:rPr>
-        <w:t xml:space="preserve"> figure out. </w:t>
-      </w:r>
-      <w:r>
-        <w:t xml:space="preserve">To understand the reference coordinate system for this analysis, firstly we </w:t>
-      </w:r>
-      <w:proofErr w:type="gramStart"/>
-      <w:r>
-        <w:t>have to</w:t>
-      </w:r>
-      <w:proofErr w:type="gramEnd"/>
-      <w:r>
-        <w:t xml:space="preserve"> understand what the axes represent. This analysis system assumes the North-East-Down (NED) system where the X axis will be the surge (forward and back, North and South), Y will be the sway (side to side, East and West), and Z will be heave (up and down).</w:t>
+        <w:t>the axes represent. This analysis system assumes the North-East-Down (NED) system where the X axis will be the surge (forward and back, North and South), Y will be the sway (side to side, East and West), and Z will be heave (up and down).</w:t>
       </w:r>
     </w:p>
     <w:p>
@@ -3656,7 +3487,7 @@
           <w:noProof/>
         </w:rPr>
         <w:drawing>
-          <wp:inline distT="0" distB="0" distL="0" distR="0" wp14:anchorId="58B5C0DB" wp14:editId="388D1A8A">
+          <wp:inline distT="0" distB="0" distL="0" distR="0" wp14:anchorId="58B5C0DB" wp14:editId="59A0A9F0">
             <wp:extent cx="3400425" cy="1743808"/>
             <wp:effectExtent l="0" t="0" r="0" b="8890"/>
             <wp:docPr id="1563100451" name="Picture 8" descr="Linking axes to biology"/>
@@ -3724,7 +3555,7 @@
           <w:noProof/>
         </w:rPr>
         <w:drawing>
-          <wp:inline distT="0" distB="0" distL="0" distR="0" wp14:anchorId="3BDC6625" wp14:editId="17EEA06C">
+          <wp:inline distT="0" distB="0" distL="0" distR="0" wp14:anchorId="3BDC6625" wp14:editId="02F705A8">
             <wp:extent cx="2901938" cy="1714500"/>
             <wp:effectExtent l="0" t="0" r="0" b="0"/>
             <wp:docPr id="1656144157" name="Picture 9" descr="Using your hand to determine orientation"/>
@@ -3783,176 +3614,90 @@
         <w:rPr>
           <w:lang w:val="en-US"/>
         </w:rPr>
-        <w:t xml:space="preserve">In the above image we </w:t>
-      </w:r>
-      <w:proofErr w:type="gramStart"/>
-      <w:r>
-        <w:rPr>
-          <w:lang w:val="en-US"/>
-        </w:rPr>
-        <w:t>have imagined</w:t>
-      </w:r>
-      <w:proofErr w:type="gramEnd"/>
-      <w:r>
-        <w:rPr>
-          <w:lang w:val="en-US"/>
-        </w:rPr>
-        <w:t xml:space="preserve"> a compass. We then </w:t>
-      </w:r>
-      <w:proofErr w:type="gramStart"/>
-      <w:r>
-        <w:rPr>
-          <w:lang w:val="en-US"/>
-        </w:rPr>
-        <w:t>have to</w:t>
-      </w:r>
-      <w:proofErr w:type="gramEnd"/>
-      <w:r>
-        <w:rPr>
-          <w:lang w:val="en-US"/>
-        </w:rPr>
-        <w:t xml:space="preserve"> describe the direction of the 3 axes (fingers) according to these compass directions in the order of X, Y, Z. In this case it will therefore be </w:t>
-      </w:r>
-      <w:r>
-        <w:rPr>
-          <w:lang w:val="en-US"/>
+        <w:t>In the above image we have imagined a compass. We then have to describe the direction of the 3 axes (fingers) according to these compass directions in the order of X, Y, Z. In this case it will therefore be North for X, East for Y, and Up for Z. The coordinate system would therefore be North-East-Up (NEU). In total, there 48 possible combinations of coordinate frame configurations.</w:t>
+      </w:r>
+    </w:p>
+    <w:p>
+      <w:pPr>
+        <w:rPr>
+          <w:lang w:val="en-US"/>
+        </w:rPr>
+      </w:pPr>
+      <w:r>
+        <w:rPr>
+          <w:lang w:val="en-US"/>
+        </w:rPr>
+        <w:t xml:space="preserve">The default orientation of the Gundog system is North-East-Down (NED) where the axes readings would be X = 0, Y = 0, and Z = -1. Before we could use data from our hand accelerometer we would have to flip it upside down. Some devices may have a different local coordinate frame, e.g., the END (East-North-Down) coordinate system assume the surge dimension of movement is represented by the z-channel, and the sway and heave dimension, by the x- and y-channels, respectively. Providing the original coordinate system allows the Gundogs system to convert your local system to the global system. The </w:t>
+      </w:r>
+      <w:proofErr w:type="spellStart"/>
+      <w:r>
+        <w:rPr>
+          <w:lang w:val="en-US"/>
+        </w:rPr>
+        <w:t>Gundog.Compass</w:t>
+      </w:r>
+      <w:proofErr w:type="spellEnd"/>
+      <w:r>
+        <w:rPr>
+          <w:lang w:val="en-US"/>
+        </w:rPr>
+        <w:t xml:space="preserve"> function comes with three inputs to allow the user to transform their device’s coordinate frame into the NED that the specific Direction Cosine Matrix (DCM) and quaternion augmentation uses to compute angles:‘</w:t>
+      </w:r>
+      <w:proofErr w:type="spellStart"/>
+      <w:r>
+        <w:rPr>
+          <w:lang w:val="en-US"/>
+        </w:rPr>
+        <w:t>acc.ref.frame</w:t>
+      </w:r>
+      <w:proofErr w:type="spellEnd"/>
+      <w:r>
+        <w:rPr>
+          <w:lang w:val="en-US"/>
+        </w:rPr>
+        <w:t>’, ‘</w:t>
+      </w:r>
+      <w:proofErr w:type="spellStart"/>
+      <w:r>
+        <w:rPr>
+          <w:lang w:val="en-US"/>
+        </w:rPr>
+        <w:t>positive.g</w:t>
+      </w:r>
+      <w:proofErr w:type="spellEnd"/>
+      <w:r>
+        <w:rPr>
+          <w:lang w:val="en-US"/>
+        </w:rPr>
+        <w:t>’, and ‘</w:t>
+      </w:r>
+      <w:proofErr w:type="spellStart"/>
+      <w:r>
+        <w:rPr>
+          <w:lang w:val="en-US"/>
+        </w:rPr>
+        <w:t>mag.ref.frame</w:t>
+      </w:r>
+      <w:proofErr w:type="spellEnd"/>
+      <w:r>
+        <w:rPr>
+          <w:lang w:val="en-US"/>
+        </w:rPr>
+        <w:t>’</w:t>
+      </w:r>
+    </w:p>
+    <w:p>
+      <w:pPr>
+        <w:pStyle w:val="Heading3"/>
+        <w:rPr>
+          <w:rFonts w:cs="Arial"/>
+        </w:rPr>
+      </w:pPr>
+      <w:r>
+        <w:rPr>
+          <w:rFonts w:cs="Arial"/>
         </w:rPr>
         <w:lastRenderedPageBreak/>
-        <w:t xml:space="preserve">North for X, East for Y, and Up for Z. The coordinate system would therefore be North-East-Up (NEU). In total, there </w:t>
-      </w:r>
-      <w:proofErr w:type="gramStart"/>
-      <w:r>
-        <w:rPr>
-          <w:lang w:val="en-US"/>
-        </w:rPr>
-        <w:t>48</w:t>
-      </w:r>
-      <w:proofErr w:type="gramEnd"/>
-      <w:r>
-        <w:rPr>
-          <w:lang w:val="en-US"/>
-        </w:rPr>
-        <w:t xml:space="preserve"> possible combinations of coordinate frame configurations.</w:t>
-      </w:r>
-    </w:p>
-    <w:p>
-      <w:pPr>
-        <w:rPr>
-          <w:lang w:val="en-US"/>
-        </w:rPr>
-      </w:pPr>
-      <w:r>
-        <w:rPr>
-          <w:lang w:val="en-US"/>
-        </w:rPr>
-        <w:t xml:space="preserve">The default orientation of the Gundog system is North-East-Down (NED) where the axes readings would be X = 0, Y = 0, and Z = -1. Before we could use data from our hand </w:t>
-      </w:r>
-      <w:proofErr w:type="gramStart"/>
-      <w:r>
-        <w:rPr>
-          <w:lang w:val="en-US"/>
-        </w:rPr>
-        <w:t>accelerometer</w:t>
-      </w:r>
-      <w:proofErr w:type="gramEnd"/>
-      <w:r>
-        <w:rPr>
-          <w:lang w:val="en-US"/>
-        </w:rPr>
-        <w:t xml:space="preserve"> we would have to flip it upside down. Some devices may have a different local coordinate frame, e.g., the END (East-North-Down) coordinate system </w:t>
-      </w:r>
-      <w:proofErr w:type="gramStart"/>
-      <w:r>
-        <w:rPr>
-          <w:lang w:val="en-US"/>
-        </w:rPr>
-        <w:t>assume</w:t>
-      </w:r>
-      <w:proofErr w:type="gramEnd"/>
-      <w:r>
-        <w:rPr>
-          <w:lang w:val="en-US"/>
-        </w:rPr>
-        <w:t xml:space="preserve"> the surge dimension of movement is represented by the z-channel, and the sway and heave dimension, by the x- and y-channels, respectively. Providing the original coordinate system allows the Gundogs system to convert your local system to the global system. The </w:t>
-      </w:r>
-      <w:proofErr w:type="spellStart"/>
-      <w:r>
-        <w:rPr>
-          <w:lang w:val="en-US"/>
-        </w:rPr>
-        <w:t>Gundog.Compass</w:t>
-      </w:r>
-      <w:proofErr w:type="spellEnd"/>
-      <w:r>
-        <w:rPr>
-          <w:lang w:val="en-US"/>
-        </w:rPr>
-        <w:t xml:space="preserve"> function comes with three inputs to allow the user to transform their device’s coordinate frame into the NED that the specific Direction Cosine Matrix (DCM) and quaternion augmentation uses to compute </w:t>
-      </w:r>
-      <w:proofErr w:type="gramStart"/>
-      <w:r>
-        <w:rPr>
-          <w:lang w:val="en-US"/>
-        </w:rPr>
-        <w:t>angles:‘</w:t>
-      </w:r>
-      <w:proofErr w:type="spellStart"/>
-      <w:r>
-        <w:rPr>
-          <w:lang w:val="en-US"/>
-        </w:rPr>
-        <w:t>acc.ref.frame</w:t>
-      </w:r>
-      <w:proofErr w:type="spellEnd"/>
-      <w:r>
-        <w:rPr>
-          <w:lang w:val="en-US"/>
-        </w:rPr>
-        <w:t>’, ‘</w:t>
-      </w:r>
-      <w:proofErr w:type="spellStart"/>
-      <w:r>
-        <w:rPr>
-          <w:lang w:val="en-US"/>
-        </w:rPr>
-        <w:t>positive.g</w:t>
-      </w:r>
-      <w:proofErr w:type="spellEnd"/>
-      <w:proofErr w:type="gramEnd"/>
-      <w:r>
-        <w:rPr>
-          <w:lang w:val="en-US"/>
-        </w:rPr>
-        <w:t>’, and ‘</w:t>
-      </w:r>
-      <w:proofErr w:type="spellStart"/>
-      <w:proofErr w:type="gramStart"/>
-      <w:r>
-        <w:rPr>
-          <w:lang w:val="en-US"/>
-        </w:rPr>
-        <w:t>mag.ref.frame</w:t>
-      </w:r>
-      <w:proofErr w:type="spellEnd"/>
-      <w:proofErr w:type="gramEnd"/>
-      <w:r>
-        <w:rPr>
-          <w:lang w:val="en-US"/>
-        </w:rPr>
-        <w:t>’</w:t>
-      </w:r>
-    </w:p>
-    <w:p>
-      <w:pPr>
-        <w:pStyle w:val="Heading3"/>
-        <w:rPr>
-          <w:rFonts w:cs="Arial"/>
-        </w:rPr>
-      </w:pPr>
-      <w:r>
-        <w:rPr>
-          <w:rFonts w:cs="Arial"/>
-        </w:rPr>
         <w:t>14/04</w:t>
       </w:r>
     </w:p>
@@ -4005,15 +3750,7 @@
         </w:r>
       </w:hyperlink>
       <w:r>
-        <w:t xml:space="preserve"> which Jojo and Luke originally developed. I know that the test trial should result in multiple </w:t>
-      </w:r>
-      <w:proofErr w:type="gramStart"/>
-      <w:r>
-        <w:t>rectangles</w:t>
-      </w:r>
-      <w:proofErr w:type="gramEnd"/>
-      <w:r>
-        <w:t xml:space="preserve"> but my current trials are getting waves…</w:t>
+        <w:t xml:space="preserve"> which Jojo and Luke originally developed. I know that the test trial should result in multiple rectangles but my current trials are getting waves…</w:t>
       </w:r>
       <w:r>
         <w:t xml:space="preserve"> I am now playing around with the different orientations until I get something good.</w:t>
@@ -4045,19 +3782,7 @@
         <w:rPr>
           <w:rFonts w:cs="Arial"/>
         </w:rPr>
-        <w:t>20</w:t>
-      </w:r>
-      <w:r>
-        <w:rPr>
-          <w:rFonts w:cs="Arial"/>
-        </w:rPr>
-        <w:t>/0</w:t>
-      </w:r>
-      <w:r>
-        <w:rPr>
-          <w:rFonts w:cs="Arial"/>
-        </w:rPr>
-        <w:t>4</w:t>
+        <w:t>20/04</w:t>
       </w:r>
     </w:p>
     <w:p>
@@ -4069,15 +3794,7 @@
         </w:numPr>
       </w:pPr>
       <w:r>
-        <w:t xml:space="preserve">Last week ended up being completely devoted to figuring out what the problem with the kangaroo collars was. After many – many – hours of effort by Chris Bird and </w:t>
-      </w:r>
-      <w:proofErr w:type="gramStart"/>
-      <w:r>
-        <w:t>I</w:t>
-      </w:r>
-      <w:proofErr w:type="gramEnd"/>
-      <w:r>
-        <w:t>, he determined that the devices were repeatedly pausing (so the internal clock not incrementing and no samples being taken) which is why the GPS and accel were out of alignment. Thank goodness this didn’t happen with the impala data (we checked). Therefore, this week, I can return to this analysis.</w:t>
+        <w:t>Last week ended up being completely devoted to figuring out what the problem with the kangaroo collars was. After many – many – hours of effort by Chris Bird and I, he determined that the devices were repeatedly pausing (so the internal clock not incrementing and no samples being taken) which is why the GPS and accel were out of alignment. Thank goodness this didn’t happen with the impala data (we checked). Therefore, this week, I can return to this analysis.</w:t>
       </w:r>
     </w:p>
     <w:p>
@@ -4101,9 +3818,9 @@
       </w:pPr>
       <w:r>
         <w:rPr>
-          <w:lang w:val="en-US"/>
-        </w:rPr>
-        <w:lastRenderedPageBreak/>
+          <w:noProof/>
+          <w:lang w:val="en-US"/>
+        </w:rPr>
         <w:drawing>
           <wp:inline distT="0" distB="0" distL="0" distR="0" wp14:anchorId="13E62DCE" wp14:editId="7BFBDDDB">
             <wp:extent cx="3629025" cy="3629025"/>
@@ -4169,21 +3886,7 @@
         <w:rPr>
           <w:lang w:val="en-US"/>
         </w:rPr>
-        <w:t xml:space="preserve">Working through this is very frustrating and making me depressed again… I don’t have their original </w:t>
-      </w:r>
-      <w:proofErr w:type="gramStart"/>
-      <w:r>
-        <w:rPr>
-          <w:lang w:val="en-US"/>
-        </w:rPr>
-        <w:t>data</w:t>
-      </w:r>
-      <w:proofErr w:type="gramEnd"/>
-      <w:r>
-        <w:rPr>
-          <w:lang w:val="en-US"/>
-        </w:rPr>
-        <w:t xml:space="preserve"> and it is very hard to make sense of their original mess of code but here we go. </w:t>
+        <w:t xml:space="preserve">Working through this is very frustrating and making me depressed again… I don’t have their original data and it is very hard to make sense of their original mess of code but here we go. </w:t>
       </w:r>
     </w:p>
     <w:p>
@@ -4197,19 +3900,12 @@
           <w:lang w:val="en-US"/>
         </w:rPr>
       </w:pPr>
-      <w:proofErr w:type="gramStart"/>
-      <w:r>
-        <w:rPr>
-          <w:lang w:val="en-US"/>
-        </w:rPr>
-        <w:t>Have</w:t>
-      </w:r>
-      <w:proofErr w:type="gramEnd"/>
-      <w:r>
-        <w:rPr>
-          <w:lang w:val="en-US"/>
-        </w:rPr>
-        <w:t xml:space="preserve"> gone right back to basics and am working through Jojo/Luke code.</w:t>
+      <w:r>
+        <w:rPr>
+          <w:lang w:val="en-US"/>
+        </w:rPr>
+        <w:lastRenderedPageBreak/>
+        <w:t>Have gone right back to basics and am working through Jojo/Luke code.</w:t>
       </w:r>
     </w:p>
     <w:p>
@@ -4227,21 +3923,7 @@
         <w:rPr>
           <w:lang w:val="en-US"/>
         </w:rPr>
-        <w:t xml:space="preserve">I found their original </w:t>
-      </w:r>
-      <w:proofErr w:type="gramStart"/>
-      <w:r>
-        <w:rPr>
-          <w:lang w:val="en-US"/>
-        </w:rPr>
-        <w:t>data</w:t>
-      </w:r>
-      <w:proofErr w:type="gramEnd"/>
-      <w:r>
-        <w:rPr>
-          <w:lang w:val="en-US"/>
-        </w:rPr>
-        <w:t xml:space="preserve"> and </w:t>
+        <w:t xml:space="preserve">I found their original data and </w:t>
       </w:r>
       <w:r>
         <w:rPr>
@@ -4277,21 +3959,7 @@
         <w:rPr>
           <w:lang w:val="en-US"/>
         </w:rPr>
-        <w:t xml:space="preserve"> </w:t>
-      </w:r>
-      <w:proofErr w:type="gramStart"/>
-      <w:r>
-        <w:rPr>
-          <w:lang w:val="en-US"/>
-        </w:rPr>
-        <w:t>theirs</w:t>
-      </w:r>
-      <w:proofErr w:type="gramEnd"/>
-      <w:r>
-        <w:rPr>
-          <w:lang w:val="en-US"/>
-        </w:rPr>
-        <w:t xml:space="preserve"> and mine until I can reliably replicate it.</w:t>
+        <w:t xml:space="preserve"> theirs and mine until I can reliably replicate it.</w:t>
       </w:r>
     </w:p>
     <w:p>
@@ -4333,6 +4001,7 @@
       </w:pPr>
       <w:r>
         <w:rPr>
+          <w:noProof/>
           <w:lang w:val="en-US"/>
         </w:rPr>
         <w:drawing>
@@ -4393,6 +4062,7 @@
       </w:pPr>
       <w:r>
         <w:rPr>
+          <w:noProof/>
           <w:lang w:val="en-US"/>
         </w:rPr>
         <w:drawing>
@@ -4447,21 +4117,7 @@
         <w:rPr>
           <w:lang w:val="en-US"/>
         </w:rPr>
-        <w:t xml:space="preserve">I went through in detail and found that my conversion for my magnetometer </w:t>
-      </w:r>
-      <w:proofErr w:type="gramStart"/>
-      <w:r>
-        <w:rPr>
-          <w:lang w:val="en-US"/>
-        </w:rPr>
-        <w:t>are</w:t>
-      </w:r>
-      <w:proofErr w:type="gramEnd"/>
-      <w:r>
-        <w:rPr>
-          <w:lang w:val="en-US"/>
-        </w:rPr>
-        <w:t xml:space="preserve"> off… After aligning them exactly between the GPS points, </w:t>
+        <w:t xml:space="preserve">I went through in detail and found that my conversion for my magnetometer are off… After aligning them exactly between the GPS points, </w:t>
       </w:r>
       <w:r>
         <w:rPr>
@@ -4525,7 +4181,6 @@
         </w:rPr>
       </w:pPr>
       <w:proofErr w:type="spellStart"/>
-      <w:proofErr w:type="gramStart"/>
       <w:r>
         <w:rPr>
           <w:sz w:val="20"/>
@@ -4535,32 +4190,31 @@
         <w:t>mine.flat</w:t>
       </w:r>
       <w:proofErr w:type="spellEnd"/>
-      <w:proofErr w:type="gramEnd"/>
       <w:r>
         <w:rPr>
           <w:sz w:val="20"/>
           <w:szCs w:val="20"/>
           <w:lang w:val="en-US"/>
         </w:rPr>
-        <w:t xml:space="preserve">[, </w:t>
-      </w:r>
-      <w:proofErr w:type="gramStart"/>
+        <w:t>[, c("</w:t>
+      </w:r>
+      <w:proofErr w:type="spellStart"/>
       <w:r>
         <w:rPr>
           <w:sz w:val="20"/>
           <w:szCs w:val="20"/>
           <w:lang w:val="en-US"/>
         </w:rPr>
-        <w:t>c(</w:t>
-      </w:r>
-      <w:proofErr w:type="gramEnd"/>
+        <w:t>RawAX</w:t>
+      </w:r>
+      <w:proofErr w:type="spellEnd"/>
       <w:r>
         <w:rPr>
           <w:sz w:val="20"/>
           <w:szCs w:val="20"/>
           <w:lang w:val="en-US"/>
         </w:rPr>
-        <w:t>"</w:t>
+        <w:t>", "RawAY", "</w:t>
       </w:r>
       <w:proofErr w:type="spellStart"/>
       <w:r>
@@ -4569,7 +4223,7 @@
           <w:szCs w:val="20"/>
           <w:lang w:val="en-US"/>
         </w:rPr>
-        <w:t>RawAX</w:t>
+        <w:t>RawAZ</w:t>
       </w:r>
       <w:proofErr w:type="spellEnd"/>
       <w:r>
@@ -4578,7 +4232,7 @@
           <w:szCs w:val="20"/>
           <w:lang w:val="en-US"/>
         </w:rPr>
-        <w:t>", "RawAY", "</w:t>
+        <w:t xml:space="preserve">")] &lt;- </w:t>
       </w:r>
       <w:proofErr w:type="spellStart"/>
       <w:r>
@@ -4587,7 +4241,7 @@
           <w:szCs w:val="20"/>
           <w:lang w:val="en-US"/>
         </w:rPr>
-        <w:t>RawAZ</w:t>
+        <w:t>mine.flat</w:t>
       </w:r>
       <w:proofErr w:type="spellEnd"/>
       <w:r>
@@ -4596,130 +4250,126 @@
           <w:szCs w:val="20"/>
           <w:lang w:val="en-US"/>
         </w:rPr>
-        <w:t xml:space="preserve">")] &lt;- </w:t>
+        <w:t>[, c("</w:t>
       </w:r>
       <w:proofErr w:type="spellStart"/>
-      <w:proofErr w:type="gramStart"/>
       <w:r>
         <w:rPr>
           <w:sz w:val="20"/>
           <w:szCs w:val="20"/>
           <w:lang w:val="en-US"/>
         </w:rPr>
-        <w:t>mine.flat</w:t>
+        <w:t>RawAX</w:t>
       </w:r>
       <w:proofErr w:type="spellEnd"/>
-      <w:proofErr w:type="gramEnd"/>
       <w:r>
         <w:rPr>
           <w:sz w:val="20"/>
           <w:szCs w:val="20"/>
           <w:lang w:val="en-US"/>
         </w:rPr>
-        <w:t xml:space="preserve">[, </w:t>
-      </w:r>
-      <w:proofErr w:type="gramStart"/>
+        <w:t>", "RawAY", "</w:t>
+      </w:r>
+      <w:proofErr w:type="spellStart"/>
       <w:r>
         <w:rPr>
           <w:sz w:val="20"/>
           <w:szCs w:val="20"/>
           <w:lang w:val="en-US"/>
         </w:rPr>
-        <w:t>c(</w:t>
-      </w:r>
-      <w:proofErr w:type="gramEnd"/>
+        <w:t>RawAZ</w:t>
+      </w:r>
+      <w:proofErr w:type="spellEnd"/>
       <w:r>
         <w:rPr>
           <w:sz w:val="20"/>
           <w:szCs w:val="20"/>
           <w:lang w:val="en-US"/>
         </w:rPr>
-        <w:t>"</w:t>
-      </w:r>
-      <w:proofErr w:type="spellStart"/>
-      <w:r>
+        <w:t>")] / 2048</w:t>
+      </w:r>
+    </w:p>
+    <w:p>
+      <w:pPr>
+        <w:pStyle w:val="ListParagraph"/>
+        <w:ind w:left="2160"/>
         <w:rPr>
           <w:sz w:val="20"/>
           <w:szCs w:val="20"/>
           <w:lang w:val="en-US"/>
         </w:rPr>
-        <w:t>RawAX</w:t>
-      </w:r>
-      <w:proofErr w:type="spellEnd"/>
+      </w:pPr>
+      <w:proofErr w:type="spellStart"/>
       <w:r>
         <w:rPr>
           <w:sz w:val="20"/>
           <w:szCs w:val="20"/>
           <w:lang w:val="en-US"/>
         </w:rPr>
-        <w:t>", "RawAY", "</w:t>
-      </w:r>
-      <w:proofErr w:type="spellStart"/>
+        <w:t>mine.flat</w:t>
+      </w:r>
+      <w:proofErr w:type="spellEnd"/>
       <w:r>
         <w:rPr>
           <w:sz w:val="20"/>
           <w:szCs w:val="20"/>
           <w:lang w:val="en-US"/>
         </w:rPr>
-        <w:t>RawAZ</w:t>
-      </w:r>
-      <w:proofErr w:type="spellEnd"/>
+        <w:t>[, c("</w:t>
+      </w:r>
+      <w:proofErr w:type="spellStart"/>
       <w:r>
         <w:rPr>
           <w:sz w:val="20"/>
           <w:szCs w:val="20"/>
           <w:lang w:val="en-US"/>
         </w:rPr>
-        <w:t>")] / 2048</w:t>
-      </w:r>
-    </w:p>
-    <w:p>
-      <w:pPr>
-        <w:pStyle w:val="ListParagraph"/>
-        <w:ind w:left="2160"/>
+        <w:t>RawMX</w:t>
+      </w:r>
+      <w:proofErr w:type="spellEnd"/>
+      <w:r>
         <w:rPr>
           <w:sz w:val="20"/>
           <w:szCs w:val="20"/>
           <w:lang w:val="en-US"/>
         </w:rPr>
-      </w:pPr>
+        <w:t>", "</w:t>
+      </w:r>
       <w:proofErr w:type="spellStart"/>
-      <w:proofErr w:type="gramStart"/>
       <w:r>
         <w:rPr>
           <w:sz w:val="20"/>
           <w:szCs w:val="20"/>
           <w:lang w:val="en-US"/>
         </w:rPr>
-        <w:t>mine.flat</w:t>
+        <w:t>RawMY</w:t>
       </w:r>
       <w:proofErr w:type="spellEnd"/>
-      <w:proofErr w:type="gramEnd"/>
       <w:r>
         <w:rPr>
           <w:sz w:val="20"/>
           <w:szCs w:val="20"/>
           <w:lang w:val="en-US"/>
         </w:rPr>
-        <w:t xml:space="preserve">[, </w:t>
-      </w:r>
-      <w:proofErr w:type="gramStart"/>
+        <w:t>", "</w:t>
+      </w:r>
+      <w:proofErr w:type="spellStart"/>
       <w:r>
         <w:rPr>
           <w:sz w:val="20"/>
           <w:szCs w:val="20"/>
           <w:lang w:val="en-US"/>
         </w:rPr>
-        <w:t>c(</w:t>
-      </w:r>
-      <w:proofErr w:type="gramEnd"/>
+        <w:t>RawMZ</w:t>
+      </w:r>
+      <w:proofErr w:type="spellEnd"/>
       <w:r>
         <w:rPr>
           <w:sz w:val="20"/>
           <w:szCs w:val="20"/>
           <w:lang w:val="en-US"/>
         </w:rPr>
-        <w:t>"</w:t>
+        <w:t xml:space="preserve">")] &lt;- </w:t>
       </w:r>
       <w:proofErr w:type="spellStart"/>
       <w:r>
@@ -4728,7 +4378,7 @@
           <w:szCs w:val="20"/>
           <w:lang w:val="en-US"/>
         </w:rPr>
-        <w:t>RawMX</w:t>
+        <w:t>mine.flat</w:t>
       </w:r>
       <w:proofErr w:type="spellEnd"/>
       <w:r>
@@ -4737,7 +4387,7 @@
           <w:szCs w:val="20"/>
           <w:lang w:val="en-US"/>
         </w:rPr>
-        <w:t>", "</w:t>
+        <w:t>[, c("</w:t>
       </w:r>
       <w:proofErr w:type="spellStart"/>
       <w:r>
@@ -4746,7 +4396,7 @@
           <w:szCs w:val="20"/>
           <w:lang w:val="en-US"/>
         </w:rPr>
-        <w:t>RawMY</w:t>
+        <w:t>RawMX</w:t>
       </w:r>
       <w:proofErr w:type="spellEnd"/>
       <w:r>
@@ -4764,7 +4414,7 @@
           <w:szCs w:val="20"/>
           <w:lang w:val="en-US"/>
         </w:rPr>
-        <w:t>RawMZ</w:t>
+        <w:t>RawMY</w:t>
       </w:r>
       <w:proofErr w:type="spellEnd"/>
       <w:r>
@@ -4773,82 +4423,84 @@
           <w:szCs w:val="20"/>
           <w:lang w:val="en-US"/>
         </w:rPr>
-        <w:t xml:space="preserve">")] &lt;- </w:t>
+        <w:t>", "</w:t>
       </w:r>
       <w:proofErr w:type="spellStart"/>
-      <w:proofErr w:type="gramStart"/>
       <w:r>
         <w:rPr>
           <w:sz w:val="20"/>
           <w:szCs w:val="20"/>
           <w:lang w:val="en-US"/>
         </w:rPr>
-        <w:t>mine.flat</w:t>
+        <w:t>RawMZ</w:t>
       </w:r>
       <w:proofErr w:type="spellEnd"/>
-      <w:proofErr w:type="gramEnd"/>
       <w:r>
         <w:rPr>
           <w:sz w:val="20"/>
           <w:szCs w:val="20"/>
           <w:lang w:val="en-US"/>
         </w:rPr>
-        <w:t xml:space="preserve">[, </w:t>
-      </w:r>
-      <w:proofErr w:type="gramStart"/>
-      <w:r>
+        <w:t>")] * 0.15</w:t>
+      </w:r>
+    </w:p>
+    <w:p>
+      <w:pPr>
+        <w:pStyle w:val="ListParagraph"/>
+        <w:ind w:left="2160"/>
         <w:rPr>
           <w:sz w:val="20"/>
           <w:szCs w:val="20"/>
           <w:lang w:val="en-US"/>
         </w:rPr>
-        <w:t>c(</w:t>
-      </w:r>
-      <w:proofErr w:type="gramEnd"/>
+      </w:pPr>
+      <w:proofErr w:type="spellStart"/>
       <w:r>
         <w:rPr>
           <w:sz w:val="20"/>
           <w:szCs w:val="20"/>
           <w:lang w:val="en-US"/>
         </w:rPr>
-        <w:t>"</w:t>
-      </w:r>
-      <w:proofErr w:type="spellStart"/>
+        <w:t>jojo_df</w:t>
+      </w:r>
+      <w:proofErr w:type="spellEnd"/>
       <w:r>
         <w:rPr>
           <w:sz w:val="20"/>
           <w:szCs w:val="20"/>
           <w:lang w:val="en-US"/>
         </w:rPr>
-        <w:t>RawMX</w:t>
-      </w:r>
-      <w:proofErr w:type="spellEnd"/>
+        <w:t xml:space="preserve"> &lt;- </w:t>
+      </w:r>
+      <w:proofErr w:type="spellStart"/>
       <w:r>
         <w:rPr>
           <w:sz w:val="20"/>
           <w:szCs w:val="20"/>
           <w:lang w:val="en-US"/>
         </w:rPr>
-        <w:t>", "</w:t>
-      </w:r>
-      <w:proofErr w:type="spellStart"/>
+        <w:t>df.flat</w:t>
+      </w:r>
+      <w:proofErr w:type="spellEnd"/>
       <w:r>
         <w:rPr>
           <w:sz w:val="20"/>
           <w:szCs w:val="20"/>
           <w:lang w:val="en-US"/>
         </w:rPr>
-        <w:t>RawMY</w:t>
-      </w:r>
-      <w:proofErr w:type="spellEnd"/>
-      <w:r>
+        <w:t>[1:77009, ]</w:t>
+      </w:r>
+    </w:p>
+    <w:p>
+      <w:pPr>
+        <w:pStyle w:val="ListParagraph"/>
+        <w:ind w:left="2160"/>
         <w:rPr>
           <w:sz w:val="20"/>
           <w:szCs w:val="20"/>
           <w:lang w:val="en-US"/>
         </w:rPr>
-        <w:t>", "</w:t>
-      </w:r>
+      </w:pPr>
       <w:proofErr w:type="spellStart"/>
       <w:r>
         <w:rPr>
@@ -4856,7 +4508,7 @@
           <w:szCs w:val="20"/>
           <w:lang w:val="en-US"/>
         </w:rPr>
-        <w:t>RawMZ</w:t>
+        <w:t>oak_df</w:t>
       </w:r>
       <w:proofErr w:type="spellEnd"/>
       <w:r>
@@ -4865,127 +4517,26 @@
           <w:szCs w:val="20"/>
           <w:lang w:val="en-US"/>
         </w:rPr>
-        <w:t>")] * 0.15</w:t>
-      </w:r>
-    </w:p>
-    <w:p>
-      <w:pPr>
-        <w:pStyle w:val="ListParagraph"/>
-        <w:ind w:left="2160"/>
+        <w:t xml:space="preserve"> &lt;- </w:t>
+      </w:r>
+      <w:proofErr w:type="spellStart"/>
+      <w:r>
         <w:rPr>
           <w:sz w:val="20"/>
           <w:szCs w:val="20"/>
           <w:lang w:val="en-US"/>
         </w:rPr>
-      </w:pPr>
-      <w:proofErr w:type="spellStart"/>
+        <w:t>mine.flat</w:t>
+      </w:r>
+      <w:proofErr w:type="spellEnd"/>
       <w:r>
         <w:rPr>
           <w:sz w:val="20"/>
           <w:szCs w:val="20"/>
           <w:lang w:val="en-US"/>
         </w:rPr>
-        <w:lastRenderedPageBreak/>
-        <w:t>jojo_df</w:t>
-      </w:r>
-      <w:proofErr w:type="spellEnd"/>
-      <w:r>
-        <w:rPr>
-          <w:sz w:val="20"/>
-          <w:szCs w:val="20"/>
-          <w:lang w:val="en-US"/>
-        </w:rPr>
-        <w:t xml:space="preserve"> &lt;- </w:t>
-      </w:r>
-      <w:proofErr w:type="spellStart"/>
-      <w:proofErr w:type="gramStart"/>
-      <w:r>
-        <w:rPr>
-          <w:sz w:val="20"/>
-          <w:szCs w:val="20"/>
-          <w:lang w:val="en-US"/>
-        </w:rPr>
-        <w:t>df.flat</w:t>
-      </w:r>
-      <w:proofErr w:type="spellEnd"/>
-      <w:proofErr w:type="gramEnd"/>
-      <w:r>
-        <w:rPr>
-          <w:sz w:val="20"/>
-          <w:szCs w:val="20"/>
-          <w:lang w:val="en-US"/>
-        </w:rPr>
-        <w:t>[1:77009</w:t>
-      </w:r>
-      <w:proofErr w:type="gramStart"/>
-      <w:r>
-        <w:rPr>
-          <w:sz w:val="20"/>
-          <w:szCs w:val="20"/>
-          <w:lang w:val="en-US"/>
-        </w:rPr>
-        <w:t>, ]</w:t>
-      </w:r>
-      <w:proofErr w:type="gramEnd"/>
-    </w:p>
-    <w:p>
-      <w:pPr>
-        <w:pStyle w:val="ListParagraph"/>
-        <w:ind w:left="2160"/>
-        <w:rPr>
-          <w:sz w:val="20"/>
-          <w:szCs w:val="20"/>
-          <w:lang w:val="en-US"/>
-        </w:rPr>
-      </w:pPr>
-      <w:proofErr w:type="spellStart"/>
-      <w:r>
-        <w:rPr>
-          <w:sz w:val="20"/>
-          <w:szCs w:val="20"/>
-          <w:lang w:val="en-US"/>
-        </w:rPr>
-        <w:t>oak_df</w:t>
-      </w:r>
-      <w:proofErr w:type="spellEnd"/>
-      <w:r>
-        <w:rPr>
-          <w:sz w:val="20"/>
-          <w:szCs w:val="20"/>
-          <w:lang w:val="en-US"/>
-        </w:rPr>
-        <w:t xml:space="preserve"> &lt;- </w:t>
-      </w:r>
-      <w:proofErr w:type="spellStart"/>
-      <w:proofErr w:type="gramStart"/>
-      <w:r>
-        <w:rPr>
-          <w:sz w:val="20"/>
-          <w:szCs w:val="20"/>
-          <w:lang w:val="en-US"/>
-        </w:rPr>
-        <w:t>mine.flat</w:t>
-      </w:r>
-      <w:proofErr w:type="spellEnd"/>
-      <w:proofErr w:type="gramEnd"/>
-      <w:r>
-        <w:rPr>
-          <w:sz w:val="20"/>
-          <w:szCs w:val="20"/>
-          <w:lang w:val="en-US"/>
-        </w:rPr>
-        <w:t>[3064:80072</w:t>
-      </w:r>
-      <w:proofErr w:type="gramStart"/>
-      <w:r>
-        <w:rPr>
-          <w:sz w:val="20"/>
-          <w:szCs w:val="20"/>
-          <w:lang w:val="en-US"/>
-        </w:rPr>
-        <w:t>, ]</w:t>
-      </w:r>
-      <w:proofErr w:type="gramEnd"/>
+        <w:t>[3064:80072, ]</w:t>
+      </w:r>
     </w:p>
     <w:p>
       <w:pPr>
@@ -5002,21 +4553,7 @@
         <w:rPr>
           <w:lang w:val="en-US"/>
         </w:rPr>
-        <w:t xml:space="preserve">OMG! That was the only correction I needed and now it aligns beautifully and looks </w:t>
-      </w:r>
-      <w:proofErr w:type="gramStart"/>
-      <w:r>
-        <w:rPr>
-          <w:lang w:val="en-US"/>
-        </w:rPr>
-        <w:t>exactly the same</w:t>
-      </w:r>
-      <w:proofErr w:type="gramEnd"/>
-      <w:r>
-        <w:rPr>
-          <w:lang w:val="en-US"/>
-        </w:rPr>
-        <w:t>!</w:t>
+        <w:t>OMG! That was the only correction I needed and now it aligns beautifully and looks exactly the same!</w:t>
       </w:r>
       <w:r>
         <w:rPr>
@@ -5051,6 +4588,7 @@
       </w:pPr>
       <w:r>
         <w:rPr>
+          <w:noProof/>
           <w:lang w:val="en-US"/>
         </w:rPr>
         <w:drawing>
@@ -5091,6 +4629,7 @@
       </w:r>
       <w:r>
         <w:rPr>
+          <w:noProof/>
           <w:lang w:val="en-US"/>
         </w:rPr>
         <w:drawing>
@@ -5145,21 +4684,8 @@
         <w:rPr>
           <w:lang w:val="en-US"/>
         </w:rPr>
-        <w:t xml:space="preserve">Excellent. I am now confident that I </w:t>
-      </w:r>
-      <w:proofErr w:type="gramStart"/>
-      <w:r>
-        <w:rPr>
-          <w:lang w:val="en-US"/>
-        </w:rPr>
-        <w:t>have an understanding of</w:t>
-      </w:r>
-      <w:proofErr w:type="gramEnd"/>
-      <w:r>
-        <w:rPr>
-          <w:lang w:val="en-US"/>
-        </w:rPr>
-        <w:t xml:space="preserve"> how this works and how to use it. I now want to expand the workflow to be used on the impala data. </w:t>
+        <w:lastRenderedPageBreak/>
+        <w:t xml:space="preserve">Excellent. I am now confident that I have an understanding of how this works and how to use it. I now want to expand the workflow to be used on the impala data. </w:t>
       </w:r>
       <w:r>
         <w:rPr>
@@ -5216,7 +4742,6 @@
         <w:t xml:space="preserve">I think I should presume that they’re not. That is, </w:t>
       </w:r>
       <w:proofErr w:type="spellStart"/>
-      <w:proofErr w:type="gramStart"/>
       <w:r>
         <w:rPr>
           <w:lang w:val="en-US"/>
@@ -5224,7 +4749,6 @@
         <w:t>jojo</w:t>
       </w:r>
       <w:proofErr w:type="spellEnd"/>
-      <w:proofErr w:type="gramEnd"/>
       <w:r>
         <w:rPr>
           <w:lang w:val="en-US"/>
@@ -5511,9 +5035,9 @@
       </w:pPr>
       <w:r>
         <w:rPr>
-          <w:lang w:val="en-US"/>
-        </w:rPr>
-        <w:lastRenderedPageBreak/>
+          <w:noProof/>
+          <w:lang w:val="en-US"/>
+        </w:rPr>
         <w:drawing>
           <wp:inline distT="0" distB="0" distL="0" distR="0" wp14:anchorId="701B2334" wp14:editId="51033066">
             <wp:extent cx="3370521" cy="2395255"/>
@@ -5710,6 +5234,7 @@
           <w:noProof/>
           <w:lang w:val="en-US"/>
         </w:rPr>
+        <w:lastRenderedPageBreak/>
         <w:drawing>
           <wp:inline distT="0" distB="0" distL="0" distR="0" wp14:anchorId="331B779D" wp14:editId="76714818">
             <wp:extent cx="4359349" cy="1509338"/>
@@ -5772,21 +5297,7 @@
         <w:rPr>
           <w:lang w:val="en-US"/>
         </w:rPr>
-        <w:t xml:space="preserve">We </w:t>
-      </w:r>
-      <w:proofErr w:type="gramStart"/>
-      <w:r>
-        <w:rPr>
-          <w:lang w:val="en-US"/>
-        </w:rPr>
-        <w:t>cooking</w:t>
-      </w:r>
-      <w:proofErr w:type="gramEnd"/>
-      <w:r>
-        <w:rPr>
-          <w:lang w:val="en-US"/>
-        </w:rPr>
-        <w:t xml:space="preserve"> with gas again.</w:t>
+        <w:t>We cooking with gas again.</w:t>
       </w:r>
     </w:p>
     <w:p>
@@ -5804,21 +5315,7 @@
         <w:rPr>
           <w:lang w:val="en-US"/>
         </w:rPr>
-        <w:t xml:space="preserve">Okay now I’m finally up to the part where I </w:t>
-      </w:r>
-      <w:proofErr w:type="gramStart"/>
-      <w:r>
-        <w:rPr>
-          <w:lang w:val="en-US"/>
-        </w:rPr>
-        <w:t>have to</w:t>
-      </w:r>
-      <w:proofErr w:type="gramEnd"/>
-      <w:r>
-        <w:rPr>
-          <w:lang w:val="en-US"/>
-        </w:rPr>
-        <w:t xml:space="preserve"> decide the orientation of the device. Oh no.</w:t>
+        <w:t>Okay now I’m finally up to the part where I have to decide the orientation of the device. Oh no.</w:t>
       </w:r>
     </w:p>
     <w:p>
@@ -5901,45 +5398,55 @@
     </w:p>
     <w:p>
       <w:pPr>
-        <w:pStyle w:val="ListParagraph"/>
-        <w:numPr>
-          <w:ilvl w:val="1"/>
-          <w:numId w:val="2"/>
-        </w:numPr>
-        <w:rPr>
-          <w:lang w:val="en-US"/>
-        </w:rPr>
-      </w:pPr>
-      <w:r>
-        <w:rPr>
-          <w:lang w:val="en-US"/>
-        </w:rPr>
-        <w:t>Trial and error time:</w:t>
-      </w:r>
-    </w:p>
-    <w:p>
-      <w:pPr>
-        <w:pStyle w:val="ListParagraph"/>
-        <w:numPr>
-          <w:ilvl w:val="2"/>
-          <w:numId w:val="2"/>
-        </w:numPr>
-        <w:rPr>
-          <w:lang w:val="en-US"/>
-        </w:rPr>
-      </w:pPr>
-      <w:r>
-        <w:rPr>
-          <w:lang w:val="en-US"/>
-        </w:rPr>
-        <w:t xml:space="preserve">Down, East, North </w:t>
-      </w:r>
-      <w:r>
-        <w:rPr>
-          <w:lang w:val="en-US"/>
-        </w:rPr>
-        <w:sym w:font="Wingdings" w:char="F0E0"/>
-      </w:r>
+        <w:pStyle w:val="Heading3"/>
+        <w:rPr>
+          <w:lang w:val="en-US"/>
+        </w:rPr>
+      </w:pPr>
+      <w:r>
+        <w:rPr>
+          <w:lang w:val="en-US"/>
+        </w:rPr>
+        <w:t>22/04</w:t>
+      </w:r>
+    </w:p>
+    <w:p>
+      <w:pPr>
+        <w:pStyle w:val="ListParagraph"/>
+        <w:numPr>
+          <w:ilvl w:val="0"/>
+          <w:numId w:val="2"/>
+        </w:numPr>
+        <w:rPr>
+          <w:lang w:val="en-US"/>
+        </w:rPr>
+      </w:pPr>
+      <w:r>
+        <w:rPr>
+          <w:lang w:val="en-US"/>
+        </w:rPr>
+        <w:t xml:space="preserve">Yesterday I walked the collar around in the approximate correct orientation. </w:t>
+      </w:r>
+      <w:r>
+        <w:rPr>
+          <w:lang w:val="en-US"/>
+        </w:rPr>
+        <w:t>Unfortunately,</w:t>
+      </w:r>
+      <w:r>
+        <w:rPr>
+          <w:lang w:val="en-US"/>
+        </w:rPr>
+        <w:t xml:space="preserve"> I didn’t wait long enough to get a proper </w:t>
+      </w:r>
+      <w:proofErr w:type="spellStart"/>
+      <w:r>
+        <w:rPr>
+          <w:lang w:val="en-US"/>
+        </w:rPr>
+        <w:t>gps</w:t>
+      </w:r>
+      <w:proofErr w:type="spellEnd"/>
       <w:r>
         <w:rPr>
           <w:lang w:val="en-US"/>
@@ -5950,26 +5457,55 @@
         <w:rPr>
           <w:lang w:val="en-US"/>
         </w:rPr>
-        <w:t>unacceptable</w:t>
-      </w:r>
-    </w:p>
-    <w:p>
-      <w:pPr>
-        <w:ind w:left="1800"/>
-        <w:rPr>
-          <w:lang w:val="en-US"/>
-        </w:rPr>
-      </w:pPr>
-      <w:r>
-        <w:rPr>
-          <w:lang w:val="en-US"/>
-        </w:rPr>
-        <w:lastRenderedPageBreak/>
+        <w:t>hit but</w:t>
+      </w:r>
+      <w:r>
+        <w:rPr>
+          <w:lang w:val="en-US"/>
+        </w:rPr>
+        <w:t xml:space="preserve"> otherwise collected data from 3 conditions (flat collar, 45</w:t>
+      </w:r>
+      <w:r>
+        <w:rPr>
+          <w:lang w:val="en-US"/>
+        </w:rPr>
+        <w:t>-degree</w:t>
+      </w:r>
+      <w:r>
+        <w:rPr>
+          <w:lang w:val="en-US"/>
+        </w:rPr>
+        <w:t xml:space="preserve"> pitched collar, and messed up variable collar as an impala simulation</w:t>
+      </w:r>
+      <w:r>
+        <w:rPr>
+          <w:lang w:val="en-US"/>
+        </w:rPr>
+        <w:t>)</w:t>
+      </w:r>
+      <w:r>
+        <w:rPr>
+          <w:lang w:val="en-US"/>
+        </w:rPr>
+        <w:t>. Today I am trying to reconstruct the paths.</w:t>
+      </w:r>
+    </w:p>
+    <w:p>
+      <w:pPr>
+        <w:pStyle w:val="NormalWeb"/>
+        <w:spacing w:before="0" w:beforeAutospacing="0" w:after="0" w:afterAutospacing="0"/>
+        <w:ind w:left="360"/>
+        <w:jc w:val="center"/>
+      </w:pPr>
+      <w:r>
+        <w:rPr>
+          <w:noProof/>
+        </w:rPr>
         <w:drawing>
-          <wp:inline distT="0" distB="0" distL="0" distR="0" wp14:anchorId="4DADB1F9" wp14:editId="7B4F91FF">
-            <wp:extent cx="2849526" cy="2399934"/>
-            <wp:effectExtent l="0" t="0" r="8255" b="635"/>
-            <wp:docPr id="2131009183" name="Picture 1"/>
+          <wp:inline distT="0" distB="0" distL="0" distR="0" wp14:anchorId="6C5F30F1" wp14:editId="37EDD6A4">
+            <wp:extent cx="946150" cy="1261533"/>
+            <wp:effectExtent l="0" t="0" r="6350" b="0"/>
+            <wp:docPr id="255715726" name="Picture 2"/>
             <wp:cNvGraphicFramePr>
               <a:graphicFrameLocks xmlns:a="http://schemas.openxmlformats.org/drawingml/2006/main" noChangeAspect="1"/>
             </wp:cNvGraphicFramePr>
@@ -5977,11 +5513,188 @@
               <a:graphicData uri="http://schemas.openxmlformats.org/drawingml/2006/picture">
                 <pic:pic xmlns:pic="http://schemas.openxmlformats.org/drawingml/2006/picture">
                   <pic:nvPicPr>
-                    <pic:cNvPr id="2131009183" name=""/>
+                    <pic:cNvPr id="0" name="Picture 1"/>
+                    <pic:cNvPicPr>
+                      <a:picLocks noChangeAspect="1" noChangeArrowheads="1"/>
+                    </pic:cNvPicPr>
+                  </pic:nvPicPr>
+                  <pic:blipFill>
+                    <a:blip r:embed="rId38" cstate="print">
+                      <a:extLst>
+                        <a:ext uri="{28A0092B-C50C-407E-A947-70E740481C1C}">
+                          <a14:useLocalDpi xmlns:a14="http://schemas.microsoft.com/office/drawing/2010/main" val="0"/>
+                        </a:ext>
+                      </a:extLst>
+                    </a:blip>
+                    <a:srcRect/>
+                    <a:stretch>
+                      <a:fillRect/>
+                    </a:stretch>
+                  </pic:blipFill>
+                  <pic:spPr bwMode="auto">
+                    <a:xfrm>
+                      <a:off x="0" y="0"/>
+                      <a:ext cx="951305" cy="1268406"/>
+                    </a:xfrm>
+                    <a:prstGeom prst="rect">
+                      <a:avLst/>
+                    </a:prstGeom>
+                    <a:noFill/>
+                    <a:ln>
+                      <a:noFill/>
+                    </a:ln>
+                  </pic:spPr>
+                </pic:pic>
+              </a:graphicData>
+            </a:graphic>
+          </wp:inline>
+        </w:drawing>
+      </w:r>
+    </w:p>
+    <w:p>
+      <w:pPr>
+        <w:pStyle w:val="ListParagraph"/>
+        <w:numPr>
+          <w:ilvl w:val="1"/>
+          <w:numId w:val="2"/>
+        </w:numPr>
+        <w:rPr>
+          <w:lang w:val="en-US"/>
+        </w:rPr>
+      </w:pPr>
+      <w:r>
+        <w:rPr>
+          <w:lang w:val="en-US"/>
+        </w:rPr>
+        <w:t xml:space="preserve">Based on my best understanding of the collar orientation, I believe the collar should be: </w:t>
+      </w:r>
+      <w:r>
+        <w:rPr>
+          <w:lang w:val="en-US"/>
+        </w:rPr>
+        <w:t>X heave, Y sway, Z surge</w:t>
+      </w:r>
+      <w:r>
+        <w:rPr>
+          <w:lang w:val="en-US"/>
+        </w:rPr>
+        <w:t>. Therefore. That would translate to an orientation of… Down, West, North (DWN)</w:t>
+      </w:r>
+      <w:r>
+        <w:rPr>
+          <w:lang w:val="en-US"/>
+        </w:rPr>
+        <w:t>. According to the notes it should be END though.</w:t>
+      </w:r>
+    </w:p>
+    <w:p>
+      <w:pPr>
+        <w:pStyle w:val="ListParagraph"/>
+        <w:numPr>
+          <w:ilvl w:val="1"/>
+          <w:numId w:val="2"/>
+        </w:numPr>
+        <w:rPr>
+          <w:lang w:val="en-US"/>
+        </w:rPr>
+      </w:pPr>
+      <w:r>
+        <w:rPr>
+          <w:lang w:val="en-US"/>
+        </w:rPr>
+        <w:t xml:space="preserve">If the original collar trials had an acc of NED and a mag of NWU then… I need to reverse the Y and Z directions for the mag of the true collar orientation. So would be… DES. </w:t>
+      </w:r>
+    </w:p>
+    <w:p>
+      <w:pPr>
+        <w:pStyle w:val="ListParagraph"/>
+        <w:numPr>
+          <w:ilvl w:val="2"/>
+          <w:numId w:val="2"/>
+        </w:numPr>
+        <w:rPr>
+          <w:lang w:val="en-US"/>
+        </w:rPr>
+      </w:pPr>
+      <w:r>
+        <w:rPr>
+          <w:lang w:val="en-US"/>
+        </w:rPr>
+        <w:t>Okay that was appalling and not close at all. NED, NWU was much closer.</w:t>
+      </w:r>
+    </w:p>
+    <w:p>
+      <w:pPr>
+        <w:pStyle w:val="ListParagraph"/>
+        <w:numPr>
+          <w:ilvl w:val="2"/>
+          <w:numId w:val="2"/>
+        </w:numPr>
+        <w:rPr>
+          <w:lang w:val="en-US"/>
+        </w:rPr>
+      </w:pPr>
+      <w:r>
+        <w:rPr>
+          <w:lang w:val="en-US"/>
+        </w:rPr>
+        <w:t xml:space="preserve">Need to use the method = 1 because we didn’t get proper calibration data. </w:t>
+      </w:r>
+    </w:p>
+    <w:p>
+      <w:pPr>
+        <w:rPr>
+          <w:lang w:val="en-US"/>
+        </w:rPr>
+      </w:pPr>
+      <w:r>
+        <w:rPr>
+          <w:lang w:val="en-US"/>
+        </w:rPr>
+        <w:t xml:space="preserve">Closest 45 degrees and then the same settings on the variable… (even holding the pitch and roll constant from the stable trial). HUH. This is not good. What am I doing wrong? Going to repeat trials tomorrow but over a longer distance so that we guarantee a GPS hit and I can scale these in more </w:t>
+      </w:r>
+      <w:r>
+        <w:rPr>
+          <w:lang w:val="en-US"/>
+        </w:rPr>
+        <w:t>appropriately</w:t>
+      </w:r>
+      <w:r>
+        <w:rPr>
+          <w:lang w:val="en-US"/>
+        </w:rPr>
+        <w:t xml:space="preserve">. </w:t>
+      </w:r>
+    </w:p>
+    <w:p>
+      <w:pPr>
+        <w:jc w:val="center"/>
+        <w:rPr>
+          <w:lang w:val="en-US"/>
+        </w:rPr>
+      </w:pPr>
+      <w:r>
+        <w:rPr>
+          <w:lang w:val="en-US"/>
+        </w:rPr>
+        <w:lastRenderedPageBreak/>
+        <w:drawing>
+          <wp:inline distT="0" distB="0" distL="0" distR="0" wp14:anchorId="1C10A757" wp14:editId="7F4E5576">
+            <wp:extent cx="2749550" cy="2278817"/>
+            <wp:effectExtent l="0" t="0" r="0" b="7620"/>
+            <wp:docPr id="477780780" name="Picture 1"/>
+            <wp:cNvGraphicFramePr>
+              <a:graphicFrameLocks xmlns:a="http://schemas.openxmlformats.org/drawingml/2006/main" noChangeAspect="1"/>
+            </wp:cNvGraphicFramePr>
+            <a:graphic xmlns:a="http://schemas.openxmlformats.org/drawingml/2006/main">
+              <a:graphicData uri="http://schemas.openxmlformats.org/drawingml/2006/picture">
+                <pic:pic xmlns:pic="http://schemas.openxmlformats.org/drawingml/2006/picture">
+                  <pic:nvPicPr>
+                    <pic:cNvPr id="477780780" name=""/>
                     <pic:cNvPicPr/>
                   </pic:nvPicPr>
                   <pic:blipFill>
-                    <a:blip r:embed="rId38"/>
+                    <a:blip r:embed="rId39"/>
                     <a:stretch>
                       <a:fillRect/>
                     </a:stretch>
@@ -5989,7 +5702,7 @@
                   <pic:spPr>
                     <a:xfrm>
                       <a:off x="0" y="0"/>
-                      <a:ext cx="2854852" cy="2404420"/>
+                      <a:ext cx="2758718" cy="2286415"/>
                     </a:xfrm>
                     <a:prstGeom prst="rect">
                       <a:avLst/>
@@ -6001,10 +5714,505 @@
           </wp:inline>
         </w:drawing>
       </w:r>
-    </w:p>
-    <w:p>
-      <w:pPr>
-        <w:ind w:left="360"/>
+      <w:r>
+        <w:rPr>
+          <w:lang w:val="en-US"/>
+        </w:rPr>
+        <w:drawing>
+          <wp:inline distT="0" distB="0" distL="0" distR="0" wp14:anchorId="1ECE9820" wp14:editId="0FAE01F0">
+            <wp:extent cx="2787650" cy="2299295"/>
+            <wp:effectExtent l="0" t="0" r="0" b="6350"/>
+            <wp:docPr id="1271361890" name="Picture 1"/>
+            <wp:cNvGraphicFramePr>
+              <a:graphicFrameLocks xmlns:a="http://schemas.openxmlformats.org/drawingml/2006/main" noChangeAspect="1"/>
+            </wp:cNvGraphicFramePr>
+            <a:graphic xmlns:a="http://schemas.openxmlformats.org/drawingml/2006/main">
+              <a:graphicData uri="http://schemas.openxmlformats.org/drawingml/2006/picture">
+                <pic:pic xmlns:pic="http://schemas.openxmlformats.org/drawingml/2006/picture">
+                  <pic:nvPicPr>
+                    <pic:cNvPr id="1271361890" name=""/>
+                    <pic:cNvPicPr/>
+                  </pic:nvPicPr>
+                  <pic:blipFill>
+                    <a:blip r:embed="rId40"/>
+                    <a:stretch>
+                      <a:fillRect/>
+                    </a:stretch>
+                  </pic:blipFill>
+                  <pic:spPr>
+                    <a:xfrm>
+                      <a:off x="0" y="0"/>
+                      <a:ext cx="2796522" cy="2306613"/>
+                    </a:xfrm>
+                    <a:prstGeom prst="rect">
+                      <a:avLst/>
+                    </a:prstGeom>
+                  </pic:spPr>
+                </pic:pic>
+              </a:graphicData>
+            </a:graphic>
+          </wp:inline>
+        </w:drawing>
+      </w:r>
+    </w:p>
+    <w:p>
+      <w:pPr>
+        <w:pStyle w:val="ListParagraph"/>
+        <w:numPr>
+          <w:ilvl w:val="1"/>
+          <w:numId w:val="2"/>
+        </w:numPr>
+        <w:rPr>
+          <w:lang w:val="en-US"/>
+        </w:rPr>
+      </w:pPr>
+      <w:r>
+        <w:rPr>
+          <w:lang w:val="en-US"/>
+        </w:rPr>
+        <w:t xml:space="preserve">For now I am going to go back to debugging whatever was wrong with the files that Ethan identified yesterday. </w:t>
+      </w:r>
+      <w:r>
+        <w:rPr>
+          <w:lang w:val="en-US"/>
+        </w:rPr>
+        <w:sym w:font="Wingdings" w:char="F0E0"/>
+      </w:r>
+      <w:r>
+        <w:rPr>
+          <w:lang w:val="en-US"/>
+        </w:rPr>
+        <w:t xml:space="preserve"> Issue was that calibration event could not be found. </w:t>
+      </w:r>
+    </w:p>
+    <w:p>
+      <w:pPr>
+        <w:pStyle w:val="ListParagraph"/>
+        <w:numPr>
+          <w:ilvl w:val="2"/>
+          <w:numId w:val="2"/>
+        </w:numPr>
+        <w:rPr>
+          <w:lang w:val="en-US"/>
+        </w:rPr>
+      </w:pPr>
+      <w:r>
+        <w:rPr>
+          <w:lang w:val="en-US"/>
+        </w:rPr>
+        <w:t xml:space="preserve">Basically, the calibration event occurs at </w:t>
+      </w:r>
+      <w:r>
+        <w:rPr>
+          <w:lang w:val="en-US"/>
+        </w:rPr>
+        <w:t>28.06.24 18:16:00</w:t>
+      </w:r>
+      <w:r>
+        <w:rPr>
+          <w:lang w:val="en-US"/>
+        </w:rPr>
+        <w:t xml:space="preserve"> local time but the first recorded </w:t>
+      </w:r>
+      <w:proofErr w:type="spellStart"/>
+      <w:r>
+        <w:rPr>
+          <w:lang w:val="en-US"/>
+        </w:rPr>
+        <w:t>gps</w:t>
+      </w:r>
+      <w:proofErr w:type="spellEnd"/>
+      <w:r>
+        <w:rPr>
+          <w:lang w:val="en-US"/>
+        </w:rPr>
+        <w:t xml:space="preserve"> time is </w:t>
+      </w:r>
+      <w:r>
+        <w:rPr>
+          <w:lang w:val="en-US"/>
+        </w:rPr>
+        <w:t>"2024-06-28 16:28:48 UTC"</w:t>
+      </w:r>
+      <w:r>
+        <w:rPr>
+          <w:lang w:val="en-US"/>
+        </w:rPr>
+        <w:t xml:space="preserve"> (about 10 minutes after). Jaz says its not possible for the calibration event to have occurred before the first ping… but shit happens. That would certainly be the most parsimonious solution. But I will manually search for it</w:t>
+      </w:r>
+      <w:r>
+        <w:rPr>
+          <w:lang w:val="en-US"/>
+        </w:rPr>
+        <w:t xml:space="preserve"> in the acceleration data</w:t>
+      </w:r>
+      <w:r>
+        <w:rPr>
+          <w:lang w:val="en-US"/>
+        </w:rPr>
+        <w:t xml:space="preserve"> anyway</w:t>
+      </w:r>
+      <w:r>
+        <w:rPr>
+          <w:lang w:val="en-US"/>
+        </w:rPr>
+        <w:t xml:space="preserve"> in case something has gone wrong.</w:t>
+      </w:r>
+    </w:p>
+    <w:p>
+      <w:pPr>
+        <w:pStyle w:val="ListParagraph"/>
+        <w:numPr>
+          <w:ilvl w:val="3"/>
+          <w:numId w:val="2"/>
+        </w:numPr>
+        <w:rPr>
+          <w:lang w:val="en-US"/>
+        </w:rPr>
+      </w:pPr>
+      <w:r>
+        <w:rPr>
+          <w:lang w:val="en-US"/>
+        </w:rPr>
+        <w:t xml:space="preserve">Turns out this is needle in a haystack </w:t>
+      </w:r>
+      <w:proofErr w:type="spellStart"/>
+      <w:r>
+        <w:rPr>
+          <w:lang w:val="en-US"/>
+        </w:rPr>
+        <w:t>behaviour</w:t>
+      </w:r>
+      <w:proofErr w:type="spellEnd"/>
+      <w:r>
+        <w:rPr>
+          <w:lang w:val="en-US"/>
+        </w:rPr>
+        <w:t>.</w:t>
+      </w:r>
+    </w:p>
+    <w:p>
+      <w:pPr>
+        <w:pStyle w:val="ListParagraph"/>
+        <w:numPr>
+          <w:ilvl w:val="1"/>
+          <w:numId w:val="2"/>
+        </w:numPr>
+        <w:rPr>
+          <w:lang w:val="en-US"/>
+        </w:rPr>
+      </w:pPr>
+      <w:r>
+        <w:rPr>
+          <w:lang w:val="en-US"/>
+        </w:rPr>
+        <w:t>The first data recorded by the accelerometer apparently starts just after midnight UTC. Which is only reasonable if it was in Australia, which it wasn’t.</w:t>
+      </w:r>
+    </w:p>
+    <w:p>
+      <w:pPr>
+        <w:pStyle w:val="ListParagraph"/>
+        <w:numPr>
+          <w:ilvl w:val="2"/>
+          <w:numId w:val="2"/>
+        </w:numPr>
+        <w:rPr>
+          <w:lang w:val="en-US"/>
+        </w:rPr>
+      </w:pPr>
+      <w:r>
+        <w:rPr>
+          <w:lang w:val="en-US"/>
+        </w:rPr>
+        <w:t>Found that the accel was getting inappropriately cropped to start on the 30</w:t>
+      </w:r>
+      <w:r>
+        <w:rPr>
+          <w:vertAlign w:val="superscript"/>
+          <w:lang w:val="en-US"/>
+        </w:rPr>
+        <w:t>th</w:t>
+      </w:r>
+      <w:r>
+        <w:rPr>
+          <w:lang w:val="en-US"/>
+        </w:rPr>
+        <w:t xml:space="preserve"> not the 28</w:t>
+      </w:r>
+      <w:r>
+        <w:rPr>
+          <w:vertAlign w:val="superscript"/>
+          <w:lang w:val="en-US"/>
+        </w:rPr>
+        <w:t>th</w:t>
+      </w:r>
+      <w:r>
+        <w:rPr>
+          <w:lang w:val="en-US"/>
+        </w:rPr>
+        <w:t xml:space="preserve"> (first </w:t>
+      </w:r>
+      <w:proofErr w:type="spellStart"/>
+      <w:r>
+        <w:rPr>
+          <w:lang w:val="en-US"/>
+        </w:rPr>
+        <w:t>gps</w:t>
+      </w:r>
+      <w:proofErr w:type="spellEnd"/>
+      <w:r>
+        <w:rPr>
+          <w:lang w:val="en-US"/>
+        </w:rPr>
+        <w:t xml:space="preserve"> hit)</w:t>
+      </w:r>
+    </w:p>
+    <w:p>
+      <w:pPr>
+        <w:pStyle w:val="ListParagraph"/>
+        <w:numPr>
+          <w:ilvl w:val="2"/>
+          <w:numId w:val="2"/>
+        </w:numPr>
+        <w:rPr>
+          <w:lang w:val="en-US"/>
+        </w:rPr>
+      </w:pPr>
+      <w:r>
+        <w:rPr>
+          <w:lang w:val="en-US"/>
+        </w:rPr>
+        <w:t xml:space="preserve">Yep. Even when I don’t crop the accel, the interpolation sends it forward in time from the first </w:t>
+      </w:r>
+      <w:proofErr w:type="spellStart"/>
+      <w:r>
+        <w:rPr>
+          <w:lang w:val="en-US"/>
+        </w:rPr>
+        <w:t>gps</w:t>
+      </w:r>
+      <w:proofErr w:type="spellEnd"/>
+      <w:r>
+        <w:rPr>
+          <w:lang w:val="en-US"/>
+        </w:rPr>
+        <w:t xml:space="preserve"> hit. Interesting. </w:t>
+      </w:r>
+      <w:r>
+        <w:rPr>
+          <w:lang w:val="en-US"/>
+        </w:rPr>
+        <w:t xml:space="preserve">Where the time jumps backwards in the first </w:t>
+      </w:r>
+      <w:proofErr w:type="spellStart"/>
+      <w:r>
+        <w:rPr>
+          <w:lang w:val="en-US"/>
+        </w:rPr>
+        <w:t>gps</w:t>
+      </w:r>
+      <w:proofErr w:type="spellEnd"/>
+      <w:r>
+        <w:rPr>
+          <w:lang w:val="en-US"/>
+        </w:rPr>
+        <w:t xml:space="preserve"> hit. So what the heck went wrong with the reverse interpolation?</w:t>
+      </w:r>
+    </w:p>
+    <w:p>
+      <w:pPr>
+        <w:pStyle w:val="ListParagraph"/>
+        <w:numPr>
+          <w:ilvl w:val="2"/>
+          <w:numId w:val="2"/>
+        </w:numPr>
+        <w:rPr>
+          <w:lang w:val="en-US"/>
+        </w:rPr>
+      </w:pPr>
+      <w:r>
+        <w:rPr>
+          <w:lang w:val="en-US"/>
+        </w:rPr>
+        <w:t xml:space="preserve">RTC accel (left) and the </w:t>
+      </w:r>
+      <w:proofErr w:type="spellStart"/>
+      <w:r>
+        <w:rPr>
+          <w:lang w:val="en-US"/>
+        </w:rPr>
+        <w:t>gps</w:t>
+      </w:r>
+      <w:proofErr w:type="spellEnd"/>
+      <w:r>
+        <w:rPr>
+          <w:lang w:val="en-US"/>
+        </w:rPr>
+        <w:t xml:space="preserve"> times look correct, however the conversion to the </w:t>
+      </w:r>
+      <w:proofErr w:type="spellStart"/>
+      <w:r>
+        <w:rPr>
+          <w:lang w:val="en-US"/>
+        </w:rPr>
+        <w:t>gps</w:t>
+      </w:r>
+      <w:proofErr w:type="spellEnd"/>
+      <w:r>
+        <w:rPr>
+          <w:lang w:val="en-US"/>
+        </w:rPr>
+        <w:t xml:space="preserve"> time using interpolation is way out (right) where it jumps several days. </w:t>
+      </w:r>
+    </w:p>
+    <w:p>
+      <w:pPr>
+        <w:ind w:left="1800"/>
+        <w:rPr>
+          <w:lang w:val="en-US"/>
+        </w:rPr>
+      </w:pPr>
+      <w:r>
+        <w:rPr>
+          <w:noProof/>
+          <w:lang w:val="en-US"/>
+        </w:rPr>
+        <w:drawing>
+          <wp:inline distT="0" distB="0" distL="0" distR="0" wp14:anchorId="614306F7" wp14:editId="42520405">
+            <wp:extent cx="2790749" cy="966241"/>
+            <wp:effectExtent l="0" t="0" r="0" b="5715"/>
+            <wp:docPr id="1765769323" name="Picture 10"/>
+            <wp:cNvGraphicFramePr>
+              <a:graphicFrameLocks xmlns:a="http://schemas.openxmlformats.org/drawingml/2006/main" noChangeAspect="1"/>
+            </wp:cNvGraphicFramePr>
+            <a:graphic xmlns:a="http://schemas.openxmlformats.org/drawingml/2006/main">
+              <a:graphicData uri="http://schemas.openxmlformats.org/drawingml/2006/picture">
+                <pic:pic xmlns:pic="http://schemas.openxmlformats.org/drawingml/2006/picture">
+                  <pic:nvPicPr>
+                    <pic:cNvPr id="0" name="Picture 5"/>
+                    <pic:cNvPicPr>
+                      <a:picLocks noChangeAspect="1" noChangeArrowheads="1"/>
+                    </pic:cNvPicPr>
+                  </pic:nvPicPr>
+                  <pic:blipFill>
+                    <a:blip r:embed="rId41" cstate="print">
+                      <a:extLst>
+                        <a:ext uri="{28A0092B-C50C-407E-A947-70E740481C1C}">
+                          <a14:useLocalDpi xmlns:a14="http://schemas.microsoft.com/office/drawing/2010/main" val="0"/>
+                        </a:ext>
+                      </a:extLst>
+                    </a:blip>
+                    <a:srcRect/>
+                    <a:stretch>
+                      <a:fillRect/>
+                    </a:stretch>
+                  </pic:blipFill>
+                  <pic:spPr bwMode="auto">
+                    <a:xfrm>
+                      <a:off x="0" y="0"/>
+                      <a:ext cx="2810990" cy="973249"/>
+                    </a:xfrm>
+                    <a:prstGeom prst="rect">
+                      <a:avLst/>
+                    </a:prstGeom>
+                    <a:noFill/>
+                  </pic:spPr>
+                </pic:pic>
+              </a:graphicData>
+            </a:graphic>
+          </wp:inline>
+        </w:drawing>
+      </w:r>
+      <w:r>
+        <w:rPr>
+          <w:noProof/>
+          <w:lang w:val="en-US"/>
+        </w:rPr>
+        <w:drawing>
+          <wp:inline distT="0" distB="0" distL="0" distR="0" wp14:anchorId="2D2DE666" wp14:editId="75955986">
+            <wp:extent cx="2801721" cy="970040"/>
+            <wp:effectExtent l="0" t="0" r="0" b="1905"/>
+            <wp:docPr id="1691180380" name="Picture 8"/>
+            <wp:cNvGraphicFramePr>
+              <a:graphicFrameLocks xmlns:a="http://schemas.openxmlformats.org/drawingml/2006/main" noChangeAspect="1"/>
+            </wp:cNvGraphicFramePr>
+            <a:graphic xmlns:a="http://schemas.openxmlformats.org/drawingml/2006/main">
+              <a:graphicData uri="http://schemas.openxmlformats.org/drawingml/2006/picture">
+                <pic:pic xmlns:pic="http://schemas.openxmlformats.org/drawingml/2006/picture">
+                  <pic:nvPicPr>
+                    <pic:cNvPr id="0" name="Picture 4"/>
+                    <pic:cNvPicPr>
+                      <a:picLocks noChangeAspect="1" noChangeArrowheads="1"/>
+                    </pic:cNvPicPr>
+                  </pic:nvPicPr>
+                  <pic:blipFill>
+                    <a:blip r:embed="rId42" cstate="print">
+                      <a:extLst>
+                        <a:ext uri="{28A0092B-C50C-407E-A947-70E740481C1C}">
+                          <a14:useLocalDpi xmlns:a14="http://schemas.microsoft.com/office/drawing/2010/main" val="0"/>
+                        </a:ext>
+                      </a:extLst>
+                    </a:blip>
+                    <a:srcRect/>
+                    <a:stretch>
+                      <a:fillRect/>
+                    </a:stretch>
+                  </pic:blipFill>
+                  <pic:spPr bwMode="auto">
+                    <a:xfrm>
+                      <a:off x="0" y="0"/>
+                      <a:ext cx="2848264" cy="986155"/>
+                    </a:xfrm>
+                    <a:prstGeom prst="rect">
+                      <a:avLst/>
+                    </a:prstGeom>
+                    <a:noFill/>
+                  </pic:spPr>
+                </pic:pic>
+              </a:graphicData>
+            </a:graphic>
+          </wp:inline>
+        </w:drawing>
+      </w:r>
+    </w:p>
+    <w:p>
+      <w:pPr>
+        <w:pStyle w:val="ListParagraph"/>
+        <w:numPr>
+          <w:ilvl w:val="1"/>
+          <w:numId w:val="2"/>
+        </w:numPr>
+        <w:rPr>
+          <w:lang w:val="en-US"/>
+        </w:rPr>
+      </w:pPr>
+      <w:r>
+        <w:rPr>
+          <w:lang w:val="en-US"/>
+        </w:rPr>
+        <w:t xml:space="preserve">Changed the way backwards times were calculated and it got back into alignment. </w:t>
+      </w:r>
+    </w:p>
+    <w:p>
+      <w:pPr>
+        <w:pStyle w:val="ListParagraph"/>
+        <w:numPr>
+          <w:ilvl w:val="0"/>
+          <w:numId w:val="2"/>
+        </w:numPr>
+        <w:rPr>
+          <w:lang w:val="en-US"/>
+        </w:rPr>
+      </w:pPr>
+      <w:r>
+        <w:rPr>
+          <w:lang w:val="en-US"/>
+        </w:rPr>
+        <w:t>Once I confirmed that the calibration was extractable, I automated this stage for every collar.</w:t>
+      </w:r>
+    </w:p>
+    <w:p>
+      <w:pPr>
         <w:rPr>
           <w:lang w:val="en-US"/>
         </w:rPr>
@@ -6074,7 +6282,7 @@
       </w:r>
     </w:p>
     <w:sectPr>
-      <w:headerReference w:type="default" r:id="rId39"/>
+      <w:headerReference w:type="default" r:id="rId43"/>
       <w:pgSz w:w="12240" w:h="15840"/>
       <w:pgMar w:top="720" w:right="720" w:bottom="720" w:left="720" w:header="720" w:footer="720" w:gutter="0"/>
       <w:cols w:space="720"/>
@@ -6971,6 +7179,7 @@
   <w:style w:type="character" w:default="1" w:styleId="DefaultParagraphFont">
     <w:name w:val="Default Paragraph Font"/>
     <w:uiPriority w:val="1"/>
+    <w:semiHidden/>
     <w:unhideWhenUsed/>
   </w:style>
   <w:style w:type="table" w:default="1" w:styleId="TableNormal">
@@ -7329,7 +7538,6 @@
     <w:name w:val="Normal (Web)"/>
     <w:basedOn w:val="Normal"/>
     <w:uiPriority w:val="99"/>
-    <w:semiHidden/>
     <w:unhideWhenUsed/>
     <w:rsid w:val="00E42DF7"/>
     <w:pPr>

</xml_diff>

<commit_message>
playing with variables and creating a worked example
</commit_message>
<xml_diff>
--- a/Notes/Worklog.docx
+++ b/Notes/Worklog.docx
@@ -3674,7 +3674,7 @@
           <w:noProof/>
         </w:rPr>
         <w:drawing>
-          <wp:inline distT="0" distB="0" distL="0" distR="0" wp14:anchorId="58B5C0DB" wp14:editId="449DCD3B">
+          <wp:inline distT="0" distB="0" distL="0" distR="0" wp14:anchorId="58B5C0DB" wp14:editId="0E7E9E3A">
             <wp:extent cx="3400425" cy="1743808"/>
             <wp:effectExtent l="0" t="0" r="0" b="8890"/>
             <wp:docPr id="1563100451" name="Picture 8" descr="Linking axes to biology"/>
@@ -3742,7 +3742,7 @@
           <w:noProof/>
         </w:rPr>
         <w:drawing>
-          <wp:inline distT="0" distB="0" distL="0" distR="0" wp14:anchorId="3BDC6625" wp14:editId="015C14FD">
+          <wp:inline distT="0" distB="0" distL="0" distR="0" wp14:anchorId="3BDC6625" wp14:editId="4C204EDF">
             <wp:extent cx="2901938" cy="1714500"/>
             <wp:effectExtent l="0" t="0" r="0" b="0"/>
             <wp:docPr id="1656144157" name="Picture 9" descr="Using your hand to determine orientation"/>
@@ -6430,7 +6430,19 @@
         <w:rPr>
           <w:lang w:val="en-US"/>
         </w:rPr>
-        <w:t xml:space="preserve"> not possible for the calibration event to have occurred before the first ping… but shit happens. That would certainly be the most parsimonious solution. But I will manually search for it</w:t>
+        <w:t xml:space="preserve"> not possible for the calibration event to have occurred before the first ping… but </w:t>
+      </w:r>
+      <w:r>
+        <w:rPr>
+          <w:lang w:val="en-US"/>
+        </w:rPr>
+        <w:t>stuff</w:t>
+      </w:r>
+      <w:r>
+        <w:rPr>
+          <w:lang w:val="en-US"/>
+        </w:rPr>
+        <w:t xml:space="preserve"> happens. That would certainly be the most parsimonious solution. But I will manually search for it</w:t>
       </w:r>
       <w:r>
         <w:rPr>
@@ -8303,14 +8315,7 @@
             <w:rStyle w:val="Hyperlink"/>
             <w:lang w:val="en-US"/>
           </w:rPr>
-          <w:t>https://invensens</w:t>
-        </w:r>
-        <w:r>
-          <w:rPr>
-            <w:rStyle w:val="Hyperlink"/>
-            <w:lang w:val="en-US"/>
-          </w:rPr>
-          <w:t>e.tdk.com/wp-content/uploads/2024/03/DS-000189-ICM-20948-v1.6.pdf</w:t>
+          <w:t>https://invensense.tdk.com/wp-content/uploads/2024/03/DS-000189-ICM-20948-v1.6.pdf</w:t>
         </w:r>
       </w:hyperlink>
       <w:r>
@@ -12249,6 +12254,7 @@
     <w:p>
       <w:pPr>
         <w:ind w:left="360"/>
+        <w:jc w:val="center"/>
         <w:rPr>
           <w:b/>
           <w:bCs/>
@@ -12259,11 +12265,10 @@
         <w:rPr>
           <w:noProof/>
         </w:rPr>
-        <w:lastRenderedPageBreak/>
         <w:drawing>
-          <wp:inline distT="0" distB="0" distL="0" distR="0" wp14:anchorId="10F5F18D" wp14:editId="75859C85">
-            <wp:extent cx="6466114" cy="4628061"/>
-            <wp:effectExtent l="0" t="0" r="0" b="1270"/>
+          <wp:inline distT="0" distB="0" distL="0" distR="0" wp14:anchorId="10F5F18D" wp14:editId="519F0B5E">
+            <wp:extent cx="3458216" cy="2475186"/>
+            <wp:effectExtent l="0" t="0" r="0" b="1905"/>
             <wp:docPr id="384827682" name="Picture 1"/>
             <wp:cNvGraphicFramePr>
               <a:graphicFrameLocks xmlns:a="http://schemas.openxmlformats.org/drawingml/2006/main" noChangeAspect="1"/>
@@ -12284,7 +12289,7 @@
                   <pic:spPr>
                     <a:xfrm>
                       <a:off x="0" y="0"/>
-                      <a:ext cx="6482342" cy="4639676"/>
+                      <a:ext cx="3480398" cy="2491063"/>
                     </a:xfrm>
                     <a:prstGeom prst="rect">
                       <a:avLst/>
@@ -12312,6 +12317,7 @@
         <w:rPr>
           <w:lang w:val="en-US"/>
         </w:rPr>
+        <w:lastRenderedPageBreak/>
         <w:t xml:space="preserve">I have put message in chat to get </w:t>
       </w:r>
       <w:proofErr w:type="spellStart"/>
@@ -12580,7 +12586,6 @@
           <w:noProof/>
           <w:lang w:val="en-US"/>
         </w:rPr>
-        <w:lastRenderedPageBreak/>
         <w:drawing>
           <wp:inline distT="0" distB="0" distL="0" distR="0" wp14:anchorId="179C742E" wp14:editId="3526751C">
             <wp:extent cx="4489314" cy="2028825"/>
@@ -12792,7 +12797,15 @@
           <w:highlight w:val="cyan"/>
           <w:lang w:val="en-US"/>
         </w:rPr>
-        <w:t>In that static accelerometer region it's likely just measuring gravity, but if the rotation of the collar isn't pointing the right way it will see that as an acceleration in the wrong direction and pick that up as movement”</w:t>
+        <w:t xml:space="preserve">In that static accelerometer region it's likely just measuring gravity, but if the rotation of the collar isn't pointing the right way it will see that as an acceleration in the </w:t>
+      </w:r>
+      <w:r>
+        <w:rPr>
+          <w:highlight w:val="cyan"/>
+          <w:lang w:val="en-US"/>
+        </w:rPr>
+        <w:lastRenderedPageBreak/>
+        <w:t>wrong direction and pick that up as movement”</w:t>
       </w:r>
       <w:r>
         <w:rPr>
@@ -12998,7 +13011,6 @@
         <w:rPr>
           <w:lang w:val="en-US"/>
         </w:rPr>
-        <w:lastRenderedPageBreak/>
         <w:t xml:space="preserve">Note that this will be easier once I have built the </w:t>
       </w:r>
       <w:proofErr w:type="spellStart"/>
@@ -13332,6 +13344,7 @@
           <w:noProof/>
           <w:lang w:val="en-US"/>
         </w:rPr>
+        <w:lastRenderedPageBreak/>
         <w:drawing>
           <wp:inline distT="0" distB="0" distL="0" distR="0" wp14:anchorId="1BABE6AD" wp14:editId="59048EE3">
             <wp:extent cx="2851150" cy="2382294"/>
@@ -13380,19 +13393,7 @@
         <w:rPr>
           <w:rFonts w:cs="Arial"/>
         </w:rPr>
-        <w:t>07</w:t>
-      </w:r>
-      <w:r>
-        <w:rPr>
-          <w:rFonts w:cs="Arial"/>
-        </w:rPr>
-        <w:t>/0</w:t>
-      </w:r>
-      <w:r>
-        <w:rPr>
-          <w:rFonts w:cs="Arial"/>
-        </w:rPr>
-        <w:t>5</w:t>
+        <w:t>07/05</w:t>
       </w:r>
     </w:p>
     <w:p>
@@ -13440,7 +13441,6 @@
         <w:rPr>
           <w:noProof/>
         </w:rPr>
-        <w:lastRenderedPageBreak/>
         <w:drawing>
           <wp:inline distT="0" distB="0" distL="0" distR="0" wp14:anchorId="2EE48A98" wp14:editId="50652237">
             <wp:extent cx="2755534" cy="1831729"/>
@@ -13804,6 +13804,7 @@
         <w:rPr>
           <w:lang w:val="en-US"/>
         </w:rPr>
+        <w:lastRenderedPageBreak/>
         <w:t>Found</w:t>
       </w:r>
       <w:proofErr w:type="gramEnd"/>
@@ -13919,9 +13920,9 @@
       </w:pPr>
       <w:r>
         <w:rPr>
-          <w:lang w:val="en-US"/>
-        </w:rPr>
-        <w:lastRenderedPageBreak/>
+          <w:noProof/>
+          <w:lang w:val="en-US"/>
+        </w:rPr>
         <w:drawing>
           <wp:inline distT="0" distB="0" distL="0" distR="0" wp14:anchorId="6C3EAFDB" wp14:editId="2E546024">
             <wp:extent cx="6858000" cy="2821940"/>
@@ -14084,8 +14085,9 @@
           <w:noProof/>
           <w:lang w:val="en-US"/>
         </w:rPr>
+        <w:lastRenderedPageBreak/>
         <w:drawing>
-          <wp:inline distT="0" distB="0" distL="0" distR="0" wp14:anchorId="5A369B01" wp14:editId="190E4D8C">
+          <wp:inline distT="0" distB="0" distL="0" distR="0" wp14:anchorId="5A369B01" wp14:editId="5EE9D86A">
             <wp:extent cx="3370239" cy="2741078"/>
             <wp:effectExtent l="0" t="0" r="1905" b="2540"/>
             <wp:docPr id="745835413" name="Picture 11"/>
@@ -14135,6 +14137,24 @@
       <w:pPr>
         <w:pStyle w:val="ListParagraph"/>
         <w:numPr>
+          <w:ilvl w:val="0"/>
+          <w:numId w:val="2"/>
+        </w:numPr>
+        <w:rPr>
+          <w:lang w:val="en-US"/>
+        </w:rPr>
+      </w:pPr>
+      <w:r>
+        <w:rPr>
+          <w:lang w:val="en-US"/>
+        </w:rPr>
+        <w:t>Note that this also gives us the noise bandwidth of 10Hz</w:t>
+      </w:r>
+    </w:p>
+    <w:p>
+      <w:pPr>
+        <w:pStyle w:val="ListParagraph"/>
+        <w:numPr>
           <w:ilvl w:val="1"/>
           <w:numId w:val="2"/>
         </w:numPr>
@@ -14268,16 +14288,7 @@
           <w:iCs/>
           <w:lang w:val="en-US"/>
         </w:rPr>
-        <w:t xml:space="preserve">. But comparing subsets with GPS pre-correction will help debug if chosen orientation was correct. The patterns and directions of travel should be similar even if scale is not when </w:t>
-      </w:r>
-      <w:r>
-        <w:rPr>
-          <w:i/>
-          <w:iCs/>
-          <w:lang w:val="en-US"/>
-        </w:rPr>
-        <w:lastRenderedPageBreak/>
-        <w:t xml:space="preserve">compared to GPS. I had some lions where I had to 'figure' out the orientation post release. But visually it should be easy to decipher the </w:t>
+        <w:t xml:space="preserve">. But comparing subsets with GPS pre-correction will help debug if chosen orientation was correct. The patterns and directions of travel should be similar even if scale is not when compared to GPS. I had some lions where I had to 'figure' out the orientation post release. But visually it should be easy to decipher the </w:t>
       </w:r>
       <w:r>
         <w:rPr>
@@ -14438,6 +14449,7 @@
         <w:rPr>
           <w:noProof/>
         </w:rPr>
+        <w:lastRenderedPageBreak/>
         <w:drawing>
           <wp:inline distT="0" distB="0" distL="0" distR="0" wp14:anchorId="2FFBE73A" wp14:editId="2DD9D372">
             <wp:extent cx="3357245" cy="2784143"/>
@@ -14637,167 +14649,138 @@
         <w:t>WNU</w:t>
       </w:r>
     </w:p>
-    <w:tbl>
-      <w:tblPr>
-        <w:tblStyle w:val="TableGrid"/>
-        <w:tblW w:w="0" w:type="auto"/>
+    <w:p>
+      <w:pPr>
+        <w:pStyle w:val="ListParagraph"/>
+        <w:numPr>
+          <w:ilvl w:val="2"/>
+          <w:numId w:val="2"/>
+        </w:numPr>
+        <w:rPr>
+          <w:lang w:val="en-US"/>
+        </w:rPr>
+      </w:pPr>
+      <w:r>
+        <w:rPr>
+          <w:lang w:val="en-US"/>
+        </w:rPr>
+        <w:t>Guessing and checking with Chis Bird eventually generated the below which he thought was the closest… I wasn’t really convinced.</w:t>
+      </w:r>
+    </w:p>
+    <w:p>
+      <w:pPr>
+        <w:pStyle w:val="ListParagraph"/>
+        <w:numPr>
+          <w:ilvl w:val="3"/>
+          <w:numId w:val="2"/>
+        </w:numPr>
+        <w:rPr>
+          <w:lang w:val="en-US"/>
+        </w:rPr>
+      </w:pPr>
+      <w:proofErr w:type="spellStart"/>
+      <w:r>
+        <w:rPr>
+          <w:lang w:val="en-US"/>
+        </w:rPr>
+        <w:t>acc_orientation</w:t>
+      </w:r>
+      <w:proofErr w:type="spellEnd"/>
+      <w:r>
+        <w:rPr>
+          <w:lang w:val="en-US"/>
+        </w:rPr>
+        <w:t xml:space="preserve"> &lt;- "NWU</w:t>
+      </w:r>
+      <w:proofErr w:type="gramStart"/>
+      <w:r>
+        <w:rPr>
+          <w:lang w:val="en-US"/>
+        </w:rPr>
+        <w:t xml:space="preserve">",   </w:t>
+      </w:r>
+      <w:proofErr w:type="spellStart"/>
+      <w:proofErr w:type="gramEnd"/>
+      <w:r>
+        <w:rPr>
+          <w:lang w:val="en-US"/>
+        </w:rPr>
+        <w:t>mag_orientation</w:t>
+      </w:r>
+      <w:proofErr w:type="spellEnd"/>
+      <w:r>
+        <w:rPr>
+          <w:lang w:val="en-US"/>
+        </w:rPr>
+        <w:t xml:space="preserve"> &lt;- "NED</w:t>
+      </w:r>
+      <w:proofErr w:type="gramStart"/>
+      <w:r>
+        <w:rPr>
+          <w:lang w:val="en-US"/>
+        </w:rPr>
+        <w:t xml:space="preserve">",   </w:t>
+      </w:r>
+      <w:proofErr w:type="spellStart"/>
+      <w:proofErr w:type="gramEnd"/>
+      <w:r>
+        <w:rPr>
+          <w:lang w:val="en-US"/>
+        </w:rPr>
+        <w:t>gravity_direction</w:t>
+      </w:r>
+      <w:proofErr w:type="spellEnd"/>
+      <w:r>
+        <w:rPr>
+          <w:lang w:val="en-US"/>
+        </w:rPr>
+        <w:t xml:space="preserve"> &lt;- "down</w:t>
+      </w:r>
+      <w:proofErr w:type="gramStart"/>
+      <w:r>
+        <w:rPr>
+          <w:lang w:val="en-US"/>
+        </w:rPr>
+        <w:t xml:space="preserve">",   </w:t>
+      </w:r>
+      <w:proofErr w:type="gramEnd"/>
+      <w:r>
+        <w:rPr>
+          <w:lang w:val="en-US"/>
+        </w:rPr>
+        <w:t xml:space="preserve">pitch &lt;- </w:t>
+      </w:r>
+      <w:proofErr w:type="gramStart"/>
+      <w:r>
+        <w:rPr>
+          <w:lang w:val="en-US"/>
+        </w:rPr>
+        <w:t>0#-</w:t>
+      </w:r>
+      <w:proofErr w:type="gramEnd"/>
+      <w:r>
+        <w:rPr>
+          <w:lang w:val="en-US"/>
+        </w:rPr>
+        <w:t>48</w:t>
+      </w:r>
+    </w:p>
+    <w:p>
+      <w:pPr>
         <w:jc w:val="center"/>
-        <w:tblLook w:val="04A0" w:firstRow="1" w:lastRow="0" w:firstColumn="1" w:lastColumn="0" w:noHBand="0" w:noVBand="1"/>
-      </w:tblPr>
-      <w:tblGrid>
-        <w:gridCol w:w="933"/>
-        <w:gridCol w:w="2127"/>
-        <w:gridCol w:w="1800"/>
-      </w:tblGrid>
-      <w:tr>
-        <w:trPr>
-          <w:jc w:val="center"/>
-        </w:trPr>
-        <w:tc>
-          <w:tcPr>
-            <w:tcW w:w="933" w:type="dxa"/>
-          </w:tcPr>
-          <w:p>
-            <w:r>
-              <w:t xml:space="preserve">X </w:t>
-            </w:r>
-            <w:proofErr w:type="spellStart"/>
-            <w:r>
-              <w:t>acc</w:t>
-            </w:r>
-            <w:proofErr w:type="spellEnd"/>
-          </w:p>
-        </w:tc>
-        <w:tc>
-          <w:tcPr>
-            <w:tcW w:w="2127" w:type="dxa"/>
-          </w:tcPr>
-          <w:p>
-            <w:r>
-              <w:t>Side to side</w:t>
-            </w:r>
-          </w:p>
-        </w:tc>
-        <w:tc>
-          <w:tcPr>
-            <w:tcW w:w="1800" w:type="dxa"/>
-          </w:tcPr>
-          <w:p>
-            <w:r>
-              <w:t>Sway</w:t>
-            </w:r>
-          </w:p>
-        </w:tc>
-      </w:tr>
-      <w:tr>
-        <w:trPr>
-          <w:jc w:val="center"/>
-        </w:trPr>
-        <w:tc>
-          <w:tcPr>
-            <w:tcW w:w="933" w:type="dxa"/>
-          </w:tcPr>
-          <w:p>
-            <w:r>
-              <w:t>Z</w:t>
-            </w:r>
-            <w:r>
-              <w:t xml:space="preserve"> </w:t>
-            </w:r>
-            <w:proofErr w:type="spellStart"/>
-            <w:r>
-              <w:t>acc</w:t>
-            </w:r>
-            <w:proofErr w:type="spellEnd"/>
-          </w:p>
-        </w:tc>
-        <w:tc>
-          <w:tcPr>
-            <w:tcW w:w="2127" w:type="dxa"/>
-          </w:tcPr>
-          <w:p>
-            <w:r>
-              <w:t>Up and down</w:t>
-            </w:r>
-          </w:p>
-        </w:tc>
-        <w:tc>
-          <w:tcPr>
-            <w:tcW w:w="1800" w:type="dxa"/>
-          </w:tcPr>
-          <w:p>
-            <w:r>
-              <w:t>Heave</w:t>
-            </w:r>
-          </w:p>
-        </w:tc>
-      </w:tr>
-      <w:tr>
-        <w:trPr>
-          <w:jc w:val="center"/>
-        </w:trPr>
-        <w:tc>
-          <w:tcPr>
-            <w:tcW w:w="933" w:type="dxa"/>
-          </w:tcPr>
-          <w:p>
-            <w:r>
-              <w:t>Y</w:t>
-            </w:r>
-            <w:r>
-              <w:t xml:space="preserve"> </w:t>
-            </w:r>
-            <w:proofErr w:type="spellStart"/>
-            <w:r>
-              <w:t>acc</w:t>
-            </w:r>
-            <w:proofErr w:type="spellEnd"/>
-          </w:p>
-        </w:tc>
-        <w:tc>
-          <w:tcPr>
-            <w:tcW w:w="2127" w:type="dxa"/>
-          </w:tcPr>
-          <w:p>
-            <w:r>
-              <w:t>Forward and back</w:t>
-            </w:r>
-          </w:p>
-        </w:tc>
-        <w:tc>
-          <w:tcPr>
-            <w:tcW w:w="1800" w:type="dxa"/>
-          </w:tcPr>
-          <w:p>
-            <w:r>
-              <w:t>Surge</w:t>
-            </w:r>
-          </w:p>
-        </w:tc>
-      </w:tr>
-    </w:tbl>
-    <w:p>
-      <w:pPr>
-        <w:rPr>
-          <w:lang w:val="en-US"/>
-        </w:rPr>
-      </w:pPr>
-    </w:p>
-    <w:p>
-      <w:pPr>
-        <w:rPr>
-          <w:lang w:val="en-US"/>
-        </w:rPr>
-      </w:pPr>
-      <w:r>
-        <w:rPr>
-          <w:lang w:val="en-US"/>
-        </w:rPr>
-        <w:lastRenderedPageBreak/>
+        <w:rPr>
+          <w:lang w:val="en-US"/>
+        </w:rPr>
+      </w:pPr>
+      <w:r>
+        <w:rPr>
+          <w:noProof/>
+          <w:lang w:val="en-US"/>
+        </w:rPr>
         <w:drawing>
-          <wp:inline distT="0" distB="0" distL="0" distR="0" wp14:anchorId="5E38BB50" wp14:editId="1E22ED77">
-            <wp:extent cx="6858000" cy="5801360"/>
-            <wp:effectExtent l="0" t="0" r="0" b="8890"/>
+          <wp:inline distT="0" distB="0" distL="0" distR="0" wp14:anchorId="5E38BB50" wp14:editId="4782C31E">
+            <wp:extent cx="4114047" cy="3480179"/>
+            <wp:effectExtent l="0" t="0" r="1270" b="6350"/>
             <wp:docPr id="1547548967" name="Picture 1"/>
             <wp:cNvGraphicFramePr>
               <a:graphicFrameLocks xmlns:a="http://schemas.openxmlformats.org/drawingml/2006/main" noChangeAspect="1"/>
@@ -14818,7 +14801,7 @@
                   <pic:spPr>
                     <a:xfrm>
                       <a:off x="0" y="0"/>
-                      <a:ext cx="6858000" cy="5801360"/>
+                      <a:ext cx="4142714" cy="3504429"/>
                     </a:xfrm>
                     <a:prstGeom prst="rect">
                       <a:avLst/>
@@ -14833,182 +14816,86 @@
     </w:p>
     <w:p>
       <w:pPr>
-        <w:rPr>
-          <w:lang w:val="en-US"/>
-        </w:rPr>
-      </w:pPr>
-      <w:proofErr w:type="spellStart"/>
-      <w:r>
-        <w:rPr>
-          <w:lang w:val="en-US"/>
-        </w:rPr>
-        <w:t>acc_orientation</w:t>
-      </w:r>
-      <w:proofErr w:type="spellEnd"/>
-      <w:r>
-        <w:rPr>
-          <w:lang w:val="en-US"/>
-        </w:rPr>
-        <w:t xml:space="preserve"> &lt;- "NWU"</w:t>
-      </w:r>
-    </w:p>
-    <w:p>
-      <w:pPr>
-        <w:rPr>
-          <w:lang w:val="en-US"/>
-        </w:rPr>
-      </w:pPr>
-      <w:r>
-        <w:rPr>
-          <w:lang w:val="en-US"/>
-        </w:rPr>
-        <w:t xml:space="preserve">  </w:t>
-      </w:r>
-      <w:proofErr w:type="spellStart"/>
-      <w:r>
-        <w:rPr>
-          <w:lang w:val="en-US"/>
-        </w:rPr>
-        <w:t>mag_orientation</w:t>
-      </w:r>
-      <w:proofErr w:type="spellEnd"/>
-      <w:r>
-        <w:rPr>
-          <w:lang w:val="en-US"/>
-        </w:rPr>
-        <w:t xml:space="preserve"> &lt;- "NED"</w:t>
-      </w:r>
-    </w:p>
-    <w:p>
-      <w:pPr>
-        <w:rPr>
-          <w:lang w:val="en-US"/>
-        </w:rPr>
-      </w:pPr>
-      <w:r>
-        <w:rPr>
-          <w:lang w:val="en-US"/>
-        </w:rPr>
-        <w:t xml:space="preserve">  </w:t>
-      </w:r>
-      <w:proofErr w:type="spellStart"/>
-      <w:r>
-        <w:rPr>
-          <w:lang w:val="en-US"/>
-        </w:rPr>
-        <w:t>gravity_direction</w:t>
-      </w:r>
-      <w:proofErr w:type="spellEnd"/>
-      <w:r>
-        <w:rPr>
-          <w:lang w:val="en-US"/>
-        </w:rPr>
-        <w:t xml:space="preserve"> &lt;- "down"</w:t>
-      </w:r>
-    </w:p>
-    <w:p>
-      <w:pPr>
-        <w:rPr>
-          <w:lang w:val="en-US"/>
-        </w:rPr>
-      </w:pPr>
-      <w:r>
-        <w:rPr>
-          <w:lang w:val="en-US"/>
-        </w:rPr>
-        <w:t xml:space="preserve">  pitch &lt;- </w:t>
+        <w:pStyle w:val="ListParagraph"/>
+        <w:numPr>
+          <w:ilvl w:val="1"/>
+          <w:numId w:val="2"/>
+        </w:numPr>
+        <w:rPr>
+          <w:lang w:val="en-US"/>
+        </w:rPr>
+      </w:pPr>
+      <w:r>
+        <w:rPr>
+          <w:lang w:val="en-US"/>
+        </w:rPr>
+        <w:t xml:space="preserve">I think </w:t>
+      </w:r>
+      <w:r>
+        <w:rPr>
+          <w:lang w:val="en-US"/>
+        </w:rPr>
+        <w:t xml:space="preserve">it might be time </w:t>
+      </w:r>
+      <w:r>
+        <w:rPr>
+          <w:lang w:val="en-US"/>
+        </w:rPr>
+        <w:t xml:space="preserve">to ask Gunner for </w:t>
       </w:r>
       <w:proofErr w:type="gramStart"/>
       <w:r>
         <w:rPr>
           <w:lang w:val="en-US"/>
         </w:rPr>
-        <w:t>0#-</w:t>
+        <w:t>help?</w:t>
       </w:r>
       <w:proofErr w:type="gramEnd"/>
       <w:r>
         <w:rPr>
           <w:lang w:val="en-US"/>
         </w:rPr>
-        <w:t>48</w:t>
-      </w:r>
-    </w:p>
-    <w:p>
-      <w:pPr>
-        <w:rPr>
-          <w:lang w:val="en-US"/>
-        </w:rPr>
-      </w:pPr>
-    </w:p>
-    <w:p>
-      <w:pPr>
-        <w:rPr>
-          <w:lang w:val="en-US"/>
-        </w:rPr>
-      </w:pPr>
-    </w:p>
-    <w:p>
-      <w:pPr>
-        <w:rPr>
-          <w:lang w:val="en-US"/>
-        </w:rPr>
-      </w:pPr>
-    </w:p>
-    <w:p>
-      <w:pPr>
-        <w:rPr>
-          <w:lang w:val="en-US"/>
-        </w:rPr>
-      </w:pPr>
-    </w:p>
-    <w:p>
-      <w:pPr>
-        <w:rPr>
-          <w:lang w:val="en-US"/>
-        </w:rPr>
-      </w:pPr>
-    </w:p>
-    <w:p>
-      <w:pPr>
-        <w:rPr>
-          <w:lang w:val="en-US"/>
-        </w:rPr>
-      </w:pPr>
-    </w:p>
-    <w:p>
-      <w:pPr>
-        <w:rPr>
-          <w:lang w:val="en-US"/>
-        </w:rPr>
-      </w:pPr>
-    </w:p>
-    <w:p>
-      <w:pPr>
-        <w:rPr>
-          <w:lang w:val="en-US"/>
-        </w:rPr>
-      </w:pPr>
-    </w:p>
-    <w:p>
-      <w:pPr>
-        <w:rPr>
-          <w:lang w:val="en-US"/>
-        </w:rPr>
-      </w:pPr>
-    </w:p>
-    <w:p>
-      <w:pPr>
-        <w:rPr>
-          <w:lang w:val="en-US"/>
-        </w:rPr>
-      </w:pPr>
-    </w:p>
-    <w:p>
-      <w:pPr>
-        <w:rPr>
-          <w:lang w:val="en-US"/>
-        </w:rPr>
-      </w:pPr>
+        <w:t xml:space="preserve"> </w:t>
+      </w:r>
+      <w:r>
+        <w:rPr>
+          <w:lang w:val="en-US"/>
+        </w:rPr>
+        <w:t>I’m going</w:t>
+      </w:r>
+      <w:r>
+        <w:rPr>
+          <w:lang w:val="en-US"/>
+        </w:rPr>
+        <w:t xml:space="preserve"> to write an email tomorrow.</w:t>
+      </w:r>
+    </w:p>
+    <w:p>
+      <w:pPr>
+        <w:pStyle w:val="Heading3"/>
+        <w:rPr>
+          <w:rFonts w:cs="Arial"/>
+        </w:rPr>
+      </w:pPr>
+      <w:r>
+        <w:rPr>
+          <w:rFonts w:cs="Arial"/>
+        </w:rPr>
+        <w:lastRenderedPageBreak/>
+        <w:t>0</w:t>
+      </w:r>
+      <w:r>
+        <w:rPr>
+          <w:rFonts w:cs="Arial"/>
+        </w:rPr>
+        <w:t>8</w:t>
+      </w:r>
+      <w:r>
+        <w:rPr>
+          <w:rFonts w:cs="Arial"/>
+        </w:rPr>
+        <w:t>/05</w:t>
+      </w:r>
     </w:p>
     <w:p>
       <w:pPr>
@@ -15018,112 +14905,21 @@
           <w:numId w:val="2"/>
         </w:numPr>
         <w:rPr>
-          <w:highlight w:val="yellow"/>
-          <w:lang w:val="en-US"/>
-        </w:rPr>
-      </w:pPr>
-      <w:r>
-        <w:rPr>
-          <w:highlight w:val="yellow"/>
-          <w:lang w:val="en-US"/>
-        </w:rPr>
-        <w:t xml:space="preserve">What am I doing with my life? We are meant to be using the GPS to correct the error in the </w:t>
-      </w:r>
-      <w:proofErr w:type="gramStart"/>
-      <w:r>
-        <w:rPr>
-          <w:highlight w:val="yellow"/>
-          <w:lang w:val="en-US"/>
-        </w:rPr>
-        <w:t>DR</w:t>
-      </w:r>
-      <w:proofErr w:type="gramEnd"/>
-      <w:r>
-        <w:rPr>
-          <w:highlight w:val="yellow"/>
-          <w:lang w:val="en-US"/>
-        </w:rPr>
-        <w:t xml:space="preserve"> but the GPS itself is </w:t>
-      </w:r>
-      <w:r>
-        <w:rPr>
-          <w:highlight w:val="yellow"/>
-          <w:lang w:val="en-US"/>
-        </w:rPr>
-        <w:t xml:space="preserve">very noisy and has a lot of </w:t>
-      </w:r>
-      <w:proofErr w:type="gramStart"/>
-      <w:r>
-        <w:rPr>
-          <w:highlight w:val="yellow"/>
-          <w:lang w:val="en-US"/>
-        </w:rPr>
-        <w:t>error</w:t>
-      </w:r>
-      <w:proofErr w:type="gramEnd"/>
-      <w:r>
-        <w:rPr>
-          <w:highlight w:val="yellow"/>
-          <w:lang w:val="en-US"/>
-        </w:rPr>
-        <w:t xml:space="preserve">. </w:t>
-      </w:r>
-      <w:r>
-        <w:rPr>
-          <w:highlight w:val="yellow"/>
-          <w:lang w:val="en-US"/>
-        </w:rPr>
-        <w:t>So how am I meant to estimate the true performance? Almost needs to be circular correction…</w:t>
-      </w:r>
-      <w:r>
-        <w:rPr>
-          <w:highlight w:val="yellow"/>
-          <w:lang w:val="en-US"/>
-        </w:rPr>
-        <w:t xml:space="preserve"> Ask Gunner.</w:t>
-      </w:r>
-    </w:p>
-    <w:p>
-      <w:pPr>
-        <w:rPr>
-          <w:lang w:val="en-US"/>
-        </w:rPr>
-      </w:pPr>
-    </w:p>
-    <w:p>
-      <w:pPr>
-        <w:rPr>
-          <w:lang w:val="en-US"/>
-        </w:rPr>
-      </w:pPr>
-    </w:p>
-    <w:p>
-      <w:pPr>
-        <w:rPr>
-          <w:lang w:val="en-US"/>
-        </w:rPr>
-      </w:pPr>
-    </w:p>
-    <w:p>
-      <w:pPr>
-        <w:rPr>
-          <w:lang w:val="en-US"/>
-        </w:rPr>
-      </w:pPr>
-    </w:p>
-    <w:p>
-      <w:pPr>
-        <w:rPr>
-          <w:lang w:val="en-US"/>
-        </w:rPr>
-      </w:pPr>
-    </w:p>
-    <w:p>
-      <w:pPr>
-        <w:rPr>
-          <w:lang w:val="en-US"/>
-        </w:rPr>
-      </w:pPr>
+          <w:lang w:val="en-US"/>
+        </w:rPr>
+      </w:pPr>
+      <w:r>
+        <w:rPr>
+          <w:lang w:val="en-US"/>
+        </w:rPr>
+        <w:t>I wrote up a massive email and document. In the process of which I experimented with more variables and got it closer by switching the method of compass from 3 to 2 (better for when there is a lot of noise)</w:t>
+      </w:r>
+      <w:r>
+        <w:rPr>
+          <w:lang w:val="en-US"/>
+        </w:rPr>
+        <w:t xml:space="preserve"> and better calculated the pitch from walking only events.</w:t>
+      </w:r>
     </w:p>
     <w:p>
       <w:pPr>
@@ -15133,49 +14929,114 @@
           <w:numId w:val="2"/>
         </w:numPr>
         <w:rPr>
-          <w:highlight w:val="yellow"/>
-          <w:lang w:val="en-US"/>
-        </w:rPr>
-      </w:pPr>
-      <w:r>
-        <w:rPr>
-          <w:highlight w:val="yellow"/>
-          <w:lang w:val="en-US"/>
-        </w:rPr>
-        <w:t xml:space="preserve">I also remembered that he said something about 40Hz lion movement being overkill, which made me think I should </w:t>
-      </w:r>
-      <w:proofErr w:type="spellStart"/>
-      <w:r>
-        <w:rPr>
-          <w:highlight w:val="yellow"/>
-          <w:lang w:val="en-US"/>
-        </w:rPr>
-        <w:t>summarise</w:t>
-      </w:r>
-      <w:proofErr w:type="spellEnd"/>
-      <w:r>
-        <w:rPr>
-          <w:highlight w:val="yellow"/>
-          <w:lang w:val="en-US"/>
-        </w:rPr>
-        <w:t xml:space="preserve"> it to 1 second </w:t>
-      </w:r>
-      <w:proofErr w:type="gramStart"/>
-      <w:r>
-        <w:rPr>
-          <w:highlight w:val="yellow"/>
-          <w:lang w:val="en-US"/>
-        </w:rPr>
-        <w:t>averages</w:t>
-      </w:r>
-      <w:proofErr w:type="gramEnd"/>
-      <w:r>
-        <w:rPr>
-          <w:highlight w:val="yellow"/>
-          <w:lang w:val="en-US"/>
-        </w:rPr>
-        <w:t>?</w:t>
-      </w:r>
+          <w:lang w:val="en-US"/>
+        </w:rPr>
+      </w:pPr>
+      <w:r>
+        <w:rPr>
+          <w:lang w:val="en-US"/>
+        </w:rPr>
+        <w:t xml:space="preserve">See the </w:t>
+      </w:r>
+      <w:r>
+        <w:rPr>
+          <w:lang w:val="en-US"/>
+        </w:rPr>
+        <w:t xml:space="preserve">“FiguringOutOrientation.docx” and </w:t>
+      </w:r>
+      <w:r>
+        <w:rPr>
+          <w:lang w:val="en-US"/>
+        </w:rPr>
+        <w:t>email to him for more information.</w:t>
+      </w:r>
+    </w:p>
+    <w:p>
+      <w:pPr>
+        <w:jc w:val="center"/>
+        <w:rPr>
+          <w:lang w:val="en-US"/>
+        </w:rPr>
+      </w:pPr>
+      <w:r>
+        <w:drawing>
+          <wp:inline distT="0" distB="0" distL="0" distR="0" wp14:anchorId="3AF1AF19" wp14:editId="64D73369">
+            <wp:extent cx="4601472" cy="3811979"/>
+            <wp:effectExtent l="0" t="0" r="8890" b="0"/>
+            <wp:docPr id="486162867" name="Picture 1"/>
+            <wp:cNvGraphicFramePr>
+              <a:graphicFrameLocks xmlns:a="http://schemas.openxmlformats.org/drawingml/2006/main" noChangeAspect="1"/>
+            </wp:cNvGraphicFramePr>
+            <a:graphic xmlns:a="http://schemas.openxmlformats.org/drawingml/2006/main">
+              <a:graphicData uri="http://schemas.openxmlformats.org/drawingml/2006/picture">
+                <pic:pic xmlns:pic="http://schemas.openxmlformats.org/drawingml/2006/picture">
+                  <pic:nvPicPr>
+                    <pic:cNvPr id="486162867" name=""/>
+                    <pic:cNvPicPr/>
+                  </pic:nvPicPr>
+                  <pic:blipFill>
+                    <a:blip r:embed="rId82"/>
+                    <a:stretch>
+                      <a:fillRect/>
+                    </a:stretch>
+                  </pic:blipFill>
+                  <pic:spPr>
+                    <a:xfrm>
+                      <a:off x="0" y="0"/>
+                      <a:ext cx="4613818" cy="3822207"/>
+                    </a:xfrm>
+                    <a:prstGeom prst="rect">
+                      <a:avLst/>
+                    </a:prstGeom>
+                  </pic:spPr>
+                </pic:pic>
+              </a:graphicData>
+            </a:graphic>
+          </wp:inline>
+        </w:drawing>
+      </w:r>
+    </w:p>
+    <w:p>
+      <w:pPr>
+        <w:rPr>
+          <w:lang w:val="en-US"/>
+        </w:rPr>
+      </w:pPr>
+    </w:p>
+    <w:p>
+      <w:pPr>
+        <w:rPr>
+          <w:lang w:val="en-US"/>
+        </w:rPr>
+      </w:pPr>
+    </w:p>
+    <w:p>
+      <w:pPr>
+        <w:rPr>
+          <w:lang w:val="en-US"/>
+        </w:rPr>
+      </w:pPr>
+    </w:p>
+    <w:p>
+      <w:pPr>
+        <w:rPr>
+          <w:lang w:val="en-US"/>
+        </w:rPr>
+      </w:pPr>
+    </w:p>
+    <w:p>
+      <w:pPr>
+        <w:rPr>
+          <w:lang w:val="en-US"/>
+        </w:rPr>
+      </w:pPr>
+    </w:p>
+    <w:p>
+      <w:pPr>
+        <w:rPr>
+          <w:lang w:val="en-US"/>
+        </w:rPr>
+      </w:pPr>
     </w:p>
     <w:p>
       <w:pPr>
@@ -15195,36 +15056,178 @@
       <w:pPr>
         <w:pStyle w:val="ListParagraph"/>
         <w:numPr>
-          <w:ilvl w:val="1"/>
+          <w:ilvl w:val="0"/>
           <w:numId w:val="2"/>
         </w:numPr>
         <w:rPr>
-          <w:lang w:val="en-US"/>
-        </w:rPr>
-      </w:pPr>
-      <w:r>
-        <w:rPr>
-          <w:lang w:val="en-US"/>
-        </w:rPr>
-        <w:t xml:space="preserve">I think I might be close enough to ask Gunner for help </w:t>
+          <w:highlight w:val="yellow"/>
+          <w:lang w:val="en-US"/>
+        </w:rPr>
+      </w:pPr>
+      <w:r>
+        <w:rPr>
+          <w:highlight w:val="yellow"/>
+          <w:lang w:val="en-US"/>
+        </w:rPr>
+        <w:t xml:space="preserve">What am I doing with my life? We are meant to be using the GPS to correct the error in the </w:t>
       </w:r>
       <w:proofErr w:type="gramStart"/>
       <w:r>
         <w:rPr>
-          <w:lang w:val="en-US"/>
-        </w:rPr>
-        <w:t>now</w:t>
-      </w:r>
-      <w:r>
-        <w:rPr>
+          <w:highlight w:val="yellow"/>
+          <w:lang w:val="en-US"/>
+        </w:rPr>
+        <w:t>DR</w:t>
+      </w:r>
+      <w:proofErr w:type="gramEnd"/>
+      <w:r>
+        <w:rPr>
+          <w:highlight w:val="yellow"/>
+          <w:lang w:val="en-US"/>
+        </w:rPr>
+        <w:t xml:space="preserve"> but the GPS itself is </w:t>
+      </w:r>
+      <w:r>
+        <w:rPr>
+          <w:highlight w:val="yellow"/>
+          <w:lang w:val="en-US"/>
+        </w:rPr>
+        <w:t xml:space="preserve">very noisy and has a lot of </w:t>
+      </w:r>
+      <w:proofErr w:type="gramStart"/>
+      <w:r>
+        <w:rPr>
+          <w:highlight w:val="yellow"/>
+          <w:lang w:val="en-US"/>
+        </w:rPr>
+        <w:t>error</w:t>
+      </w:r>
+      <w:proofErr w:type="gramEnd"/>
+      <w:r>
+        <w:rPr>
+          <w:highlight w:val="yellow"/>
+          <w:lang w:val="en-US"/>
+        </w:rPr>
+        <w:t xml:space="preserve">. </w:t>
+      </w:r>
+      <w:r>
+        <w:rPr>
+          <w:highlight w:val="yellow"/>
+          <w:lang w:val="en-US"/>
+        </w:rPr>
+        <w:t>So how am I meant to estimate the true performance? Almost needs to be circular correction…</w:t>
+      </w:r>
+      <w:r>
+        <w:rPr>
+          <w:highlight w:val="yellow"/>
+          <w:lang w:val="en-US"/>
+        </w:rPr>
+        <w:t xml:space="preserve"> Ask Gunner.</w:t>
+      </w:r>
+    </w:p>
+    <w:p>
+      <w:pPr>
+        <w:rPr>
+          <w:lang w:val="en-US"/>
+        </w:rPr>
+      </w:pPr>
+    </w:p>
+    <w:p>
+      <w:pPr>
+        <w:rPr>
+          <w:lang w:val="en-US"/>
+        </w:rPr>
+      </w:pPr>
+    </w:p>
+    <w:p>
+      <w:pPr>
+        <w:rPr>
+          <w:lang w:val="en-US"/>
+        </w:rPr>
+      </w:pPr>
+    </w:p>
+    <w:p>
+      <w:pPr>
+        <w:rPr>
+          <w:lang w:val="en-US"/>
+        </w:rPr>
+      </w:pPr>
+    </w:p>
+    <w:p>
+      <w:pPr>
+        <w:rPr>
+          <w:lang w:val="en-US"/>
+        </w:rPr>
+      </w:pPr>
+    </w:p>
+    <w:p>
+      <w:pPr>
+        <w:rPr>
+          <w:lang w:val="en-US"/>
+        </w:rPr>
+      </w:pPr>
+    </w:p>
+    <w:p>
+      <w:pPr>
+        <w:pStyle w:val="ListParagraph"/>
+        <w:numPr>
+          <w:ilvl w:val="0"/>
+          <w:numId w:val="2"/>
+        </w:numPr>
+        <w:rPr>
+          <w:highlight w:val="yellow"/>
+          <w:lang w:val="en-US"/>
+        </w:rPr>
+      </w:pPr>
+      <w:r>
+        <w:rPr>
+          <w:highlight w:val="yellow"/>
+          <w:lang w:val="en-US"/>
+        </w:rPr>
+        <w:t xml:space="preserve">I also remembered that he said something about 40Hz lion movement being overkill, which made me think I should </w:t>
+      </w:r>
+      <w:proofErr w:type="spellStart"/>
+      <w:r>
+        <w:rPr>
+          <w:highlight w:val="yellow"/>
+          <w:lang w:val="en-US"/>
+        </w:rPr>
+        <w:t>summarise</w:t>
+      </w:r>
+      <w:proofErr w:type="spellEnd"/>
+      <w:r>
+        <w:rPr>
+          <w:highlight w:val="yellow"/>
+          <w:lang w:val="en-US"/>
+        </w:rPr>
+        <w:t xml:space="preserve"> it to 1 second </w:t>
+      </w:r>
+      <w:proofErr w:type="gramStart"/>
+      <w:r>
+        <w:rPr>
+          <w:highlight w:val="yellow"/>
+          <w:lang w:val="en-US"/>
+        </w:rPr>
+        <w:t>averages</w:t>
+      </w:r>
+      <w:proofErr w:type="gramEnd"/>
+      <w:r>
+        <w:rPr>
+          <w:highlight w:val="yellow"/>
           <w:lang w:val="en-US"/>
         </w:rPr>
         <w:t>?</w:t>
       </w:r>
-      <w:proofErr w:type="gramEnd"/>
+    </w:p>
+    <w:p>
+      <w:pPr>
+        <w:rPr>
+          <w:lang w:val="en-US"/>
+        </w:rPr>
+      </w:pPr>
     </w:p>
     <w:sectPr>
-      <w:headerReference w:type="default" r:id="rId82"/>
+      <w:headerReference w:type="default" r:id="rId83"/>
       <w:pgSz w:w="12240" w:h="15840"/>
       <w:pgMar w:top="720" w:right="720" w:bottom="720" w:left="720" w:header="720" w:footer="720" w:gutter="0"/>
       <w:cols w:space="720"/>
@@ -16120,6 +16123,7 @@
   <w:style w:type="character" w:default="1" w:styleId="DefaultParagraphFont">
     <w:name w:val="Default Paragraph Font"/>
     <w:uiPriority w:val="1"/>
+    <w:semiHidden/>
     <w:unhideWhenUsed/>
   </w:style>
   <w:style w:type="table" w:default="1" w:styleId="TableNormal">

</xml_diff>

<commit_message>
generating bonus training data
</commit_message>
<xml_diff>
--- a/Notes/Worklog.docx
+++ b/Notes/Worklog.docx
@@ -12,15 +12,7 @@
     </w:p>
     <w:p>
       <w:r>
-        <w:t xml:space="preserve">The impala data was collected by Chris Clemente, Jasmin Annett, Robin Maag, Chris Bird, and Taylor Dick across 3 field deployments in South Africa: 2024, April 2025, and July 2025.  The idea behind the project was to put our custom-designed collars (including an Artemis board which logged GPS and accelerometer data, as well as a stand-alone </w:t>
-      </w:r>
-      <w:proofErr w:type="spellStart"/>
-      <w:r>
-        <w:t>Axivity</w:t>
-      </w:r>
-      <w:proofErr w:type="spellEnd"/>
-      <w:r>
-        <w:t>) on impalas, record their behaviours with a drone, and then reconstruct their exact behaviours and paths from the acceleration data.</w:t>
+        <w:t>The impala data was collected by Chris Clemente, Jasmin Annett, Robin Maag, Chris Bird, and Taylor Dick across 3 field deployments in South Africa: 2024, April 2025, and July 2025.  The idea behind the project was to put our custom-designed collars (including an Artemis board which logged GPS and accelerometer data, as well as a stand-alone Axivity) on impalas, record their behaviours with a drone, and then reconstruct their exact behaviours and paths from the acceleration data.</w:t>
       </w:r>
       <w:r>
         <w:t xml:space="preserve"> Luke Jessup and Jojo Schultz begun the process of understanding the dead reckoning workflow.</w:t>
@@ -95,23 +87,7 @@
         <w:t>synchronised</w:t>
       </w:r>
       <w:r>
-        <w:t xml:space="preserve">” boards were, in fact, not time synchronised. </w:t>
-      </w:r>
-      <w:proofErr w:type="spellStart"/>
-      <w:r>
-        <w:t>ChrisC</w:t>
-      </w:r>
-      <w:proofErr w:type="spellEnd"/>
-      <w:r>
-        <w:t xml:space="preserve"> and I spent several weeks trying to align the board with the associated behavioural videos. That work is detailed in this </w:t>
-      </w:r>
-      <w:proofErr w:type="spellStart"/>
-      <w:r>
-        <w:t>googledoc</w:t>
-      </w:r>
-      <w:proofErr w:type="spellEnd"/>
-      <w:r>
-        <w:t xml:space="preserve">: </w:t>
+        <w:t xml:space="preserve">” boards were, in fact, not time synchronised. ChrisC and I spent several weeks trying to align the board with the associated behavioural videos. That work is detailed in this googledoc: </w:t>
       </w:r>
       <w:hyperlink r:id="rId8" w:history="1">
         <w:r>
@@ -238,15 +214,7 @@
         <w:spacing w:line="276" w:lineRule="auto"/>
       </w:pPr>
       <w:r>
-        <w:t xml:space="preserve">What this tells me is that my next most valuable endeavour is to figure out the alignment from Robin’s camera. Going to have a crack at that this </w:t>
-      </w:r>
-      <w:proofErr w:type="spellStart"/>
-      <w:r>
-        <w:t>arvo</w:t>
-      </w:r>
-      <w:proofErr w:type="spellEnd"/>
-      <w:r>
-        <w:t xml:space="preserve">. </w:t>
+        <w:t xml:space="preserve">What this tells me is that my next most valuable endeavour is to figure out the alignment from Robin’s camera. Going to have a crack at that this arvo. </w:t>
       </w:r>
       <w:r>
         <w:rPr>
@@ -323,6 +291,9 @@
     </w:p>
     <w:p>
       <w:r>
+        <w:rPr>
+          <w:noProof/>
+        </w:rPr>
         <w:drawing>
           <wp:inline distT="0" distB="0" distL="0" distR="0" wp14:anchorId="28C88297" wp14:editId="61A3C607">
             <wp:extent cx="5943600" cy="1471930"/>
@@ -409,15 +380,7 @@
         <w:spacing w:line="276" w:lineRule="auto"/>
       </w:pPr>
       <w:r>
-        <w:t xml:space="preserve">I reverted all my changes to the plotting method and got the same result. Therefore, either the video times are incorrect or the </w:t>
-      </w:r>
-      <w:proofErr w:type="spellStart"/>
-      <w:r>
-        <w:t>gps</w:t>
-      </w:r>
-      <w:proofErr w:type="spellEnd"/>
-      <w:r>
-        <w:t xml:space="preserve"> times are incorrect.</w:t>
+        <w:t>I reverted all my changes to the plotting method and got the same result. Therefore, either the video times are incorrect or the gps times are incorrect.</w:t>
       </w:r>
     </w:p>
     <w:p>
@@ -430,15 +393,7 @@
         <w:spacing w:line="276" w:lineRule="auto"/>
       </w:pPr>
       <w:r>
-        <w:t xml:space="preserve">I rechecked the video times and no joy. Therefore, I think the </w:t>
-      </w:r>
-      <w:proofErr w:type="spellStart"/>
-      <w:r>
-        <w:t>gps</w:t>
-      </w:r>
-      <w:proofErr w:type="spellEnd"/>
-      <w:r>
-        <w:t xml:space="preserve"> times are wrong. Going to revert all the work I did yesterday back to the original versions. </w:t>
+        <w:t xml:space="preserve">I rechecked the video times and no joy. Therefore, I think the gps times are wrong. Going to revert all the work I did yesterday back to the original versions. </w:t>
       </w:r>
     </w:p>
     <w:p>
@@ -454,15 +409,7 @@
         <w:sym w:font="Wingdings" w:char="F0E0"/>
       </w:r>
       <w:r>
-        <w:t xml:space="preserve"> Note that the kangaroo data had a lot of error not encountered in the impala data (e.g., multiple board resets, skipped reads, incorrect GPS writes, etc). The fact that using the “cleaning code” I wrote for the </w:t>
-      </w:r>
-      <w:proofErr w:type="spellStart"/>
-      <w:r>
-        <w:t>kangies</w:t>
-      </w:r>
-      <w:proofErr w:type="spellEnd"/>
-      <w:r>
-        <w:t xml:space="preserve"> on the impala caused the impala to break indicates that there is something wrong with the cleaning code…</w:t>
+        <w:t xml:space="preserve"> Note that the kangaroo data had a lot of error not encountered in the impala data (e.g., multiple board resets, skipped reads, incorrect GPS writes, etc). The fact that using the “cleaning code” I wrote for the kangies on the impala caused the impala to break indicates that there is something wrong with the cleaning code…</w:t>
       </w:r>
     </w:p>
     <w:p>
@@ -542,6 +489,9 @@
         <w:ind w:left="1440"/>
       </w:pPr>
       <w:r>
+        <w:rPr>
+          <w:noProof/>
+        </w:rPr>
         <w:lastRenderedPageBreak/>
         <w:drawing>
           <wp:inline distT="0" distB="0" distL="0" distR="0" wp14:anchorId="2F46B1EC" wp14:editId="38B330B2">
@@ -603,13 +553,8 @@
         <w:spacing w:line="276" w:lineRule="auto"/>
       </w:pPr>
       <w:r>
-        <w:t xml:space="preserve">Reordered the dataset by the reset events and then removed the misreads where there was an uneven increment between the internal and external times on the </w:t>
-      </w:r>
-      <w:proofErr w:type="spellStart"/>
-      <w:r>
-        <w:t>gps_board</w:t>
-      </w:r>
-      <w:proofErr w:type="spellEnd"/>
+        <w:t>Reordered the dataset by the reset events and then removed the misreads where there was an uneven increment between the internal and external times on the gps_board</w:t>
+      </w:r>
     </w:p>
     <w:p>
       <w:pPr>
@@ -661,15 +606,7 @@
         <w:spacing w:line="276" w:lineRule="auto"/>
       </w:pPr>
       <w:r>
-        <w:t xml:space="preserve">Below confirmed that the </w:t>
-      </w:r>
-      <w:proofErr w:type="spellStart"/>
-      <w:r>
-        <w:t>gps</w:t>
-      </w:r>
-      <w:proofErr w:type="spellEnd"/>
-      <w:r>
-        <w:t xml:space="preserve"> timestamps stay the same after writing and reading but also converted everything to numeric to be safe.</w:t>
+        <w:t>Below confirmed that the gps timestamps stay the same after writing and reading but also converted everything to numeric to be safe.</w:t>
       </w:r>
     </w:p>
     <w:p>
@@ -678,6 +615,9 @@
         <w:ind w:left="1440"/>
       </w:pPr>
       <w:r>
+        <w:rPr>
+          <w:noProof/>
+        </w:rPr>
         <w:drawing>
           <wp:inline distT="0" distB="0" distL="0" distR="0" wp14:anchorId="4624871F" wp14:editId="1CFCFF8E">
             <wp:extent cx="2152650" cy="1266825"/>
@@ -747,6 +687,9 @@
         <w:jc w:val="center"/>
       </w:pPr>
       <w:r>
+        <w:rPr>
+          <w:noProof/>
+        </w:rPr>
         <w:drawing>
           <wp:inline distT="0" distB="0" distL="0" distR="0" wp14:anchorId="026088AE" wp14:editId="5277F0AB">
             <wp:extent cx="2876550" cy="1476375"/>
@@ -838,15 +781,7 @@
         <w:spacing w:line="276" w:lineRule="auto"/>
       </w:pPr>
       <w:r>
-        <w:t xml:space="preserve">But somehow they are then getting back mixed together after I combine the accel and </w:t>
-      </w:r>
-      <w:proofErr w:type="spellStart"/>
-      <w:r>
-        <w:t>gps</w:t>
-      </w:r>
-      <w:proofErr w:type="spellEnd"/>
-      <w:r>
-        <w:t>?</w:t>
+        <w:t>But somehow they are then getting back mixed together after I combine the accel and gps?</w:t>
       </w:r>
     </w:p>
     <w:p>
@@ -864,6 +799,9 @@
     </w:p>
     <w:p>
       <w:r>
+        <w:rPr>
+          <w:noProof/>
+        </w:rPr>
         <w:drawing>
           <wp:inline distT="0" distB="0" distL="0" distR="0" wp14:anchorId="4C683B93" wp14:editId="79F6528C">
             <wp:extent cx="2543175" cy="952500"/>
@@ -914,6 +852,9 @@
         </w:drawing>
       </w:r>
       <w:r>
+        <w:rPr>
+          <w:noProof/>
+        </w:rPr>
         <w:drawing>
           <wp:inline distT="0" distB="0" distL="0" distR="0" wp14:anchorId="55C2515E" wp14:editId="096F7ED6">
             <wp:extent cx="2514600" cy="942975"/>
@@ -996,6 +937,9 @@
         <w:pStyle w:val="ListParagraph"/>
       </w:pPr>
       <w:r>
+        <w:rPr>
+          <w:noProof/>
+        </w:rPr>
         <w:drawing>
           <wp:inline distT="0" distB="0" distL="0" distR="0" wp14:anchorId="1AB86143" wp14:editId="78FAF1A0">
             <wp:extent cx="5943600" cy="2762250"/>
@@ -1374,6 +1318,9 @@
         <w:jc w:val="center"/>
       </w:pPr>
       <w:r>
+        <w:rPr>
+          <w:noProof/>
+        </w:rPr>
         <w:drawing>
           <wp:inline distT="0" distB="0" distL="0" distR="0" wp14:anchorId="26A2EFD0" wp14:editId="07A69780">
             <wp:extent cx="3286125" cy="1428750"/>
@@ -1444,6 +1391,7 @@
       </w:pPr>
       <w:r>
         <w:rPr>
+          <w:noProof/>
           <w:lang w:val="en-GB"/>
         </w:rPr>
         <w:drawing>
@@ -2109,21 +2057,7 @@
         <w:rPr>
           <w:bdr w:val="none" w:sz="0" w:space="0" w:color="auto" w:frame="1"/>
         </w:rPr>
-        <w:t xml:space="preserve"> Not much, </w:t>
-      </w:r>
-      <w:proofErr w:type="spellStart"/>
-      <w:r>
-        <w:rPr>
-          <w:bdr w:val="none" w:sz="0" w:space="0" w:color="auto" w:frame="1"/>
-        </w:rPr>
-        <w:t>tbh</w:t>
-      </w:r>
-      <w:proofErr w:type="spellEnd"/>
-      <w:r>
-        <w:rPr>
-          <w:bdr w:val="none" w:sz="0" w:space="0" w:color="auto" w:frame="1"/>
-        </w:rPr>
-        <w:t>.</w:t>
+        <w:t xml:space="preserve"> Not much, tbh.</w:t>
       </w:r>
     </w:p>
     <w:p>
@@ -2152,6 +2086,9 @@
         <w:jc w:val="center"/>
       </w:pPr>
       <w:r>
+        <w:rPr>
+          <w:noProof/>
+        </w:rPr>
         <w:lastRenderedPageBreak/>
         <w:drawing>
           <wp:inline distT="0" distB="0" distL="0" distR="0" wp14:anchorId="1340ADFE" wp14:editId="366E189D">
@@ -2221,15 +2158,7 @@
         </w:numPr>
       </w:pPr>
       <w:r>
-        <w:t>Raw tri-axial magnetometer data (</w:t>
-      </w:r>
-      <w:proofErr w:type="spellStart"/>
-      <w:r>
-        <w:t>mag.x,y,z</w:t>
-      </w:r>
-      <w:proofErr w:type="spellEnd"/>
-      <w:r>
-        <w:t>)</w:t>
+        <w:t>Raw tri-axial magnetometer data (mag.x,y,z)</w:t>
       </w:r>
     </w:p>
     <w:p>
@@ -2241,15 +2170,7 @@
         </w:numPr>
       </w:pPr>
       <w:r>
-        <w:t>Tri-axial static acceleration data (</w:t>
-      </w:r>
-      <w:proofErr w:type="spellStart"/>
-      <w:r>
-        <w:t>acc.x,y,z</w:t>
-      </w:r>
-      <w:proofErr w:type="spellEnd"/>
-      <w:r>
-        <w:t>) (the smoothed values)</w:t>
+        <w:t>Tri-axial static acceleration data (acc.x,y,z) (the smoothed values)</w:t>
       </w:r>
     </w:p>
     <w:p>
@@ -2297,15 +2218,7 @@
         </w:numPr>
       </w:pPr>
       <w:r>
-        <w:t xml:space="preserve">Estimated pitch offset: Approximately how much was it rotated by? * algorithm = “standard” (standard </w:t>
-      </w:r>
-      <w:proofErr w:type="spellStart"/>
-      <w:r>
-        <w:t>euler</w:t>
-      </w:r>
-      <w:proofErr w:type="spellEnd"/>
-      <w:r>
-        <w:t xml:space="preserve"> angle approach) or “SAAM” (using quaternions)</w:t>
+        <w:t>Estimated pitch offset: Approximately how much was it rotated by? * algorithm = “standard” (standard euler angle approach) or “SAAM” (using quaternions)</w:t>
       </w:r>
     </w:p>
     <w:p>
@@ -2318,8 +2231,11 @@
         <w:jc w:val="center"/>
       </w:pPr>
       <w:r>
+        <w:rPr>
+          <w:noProof/>
+        </w:rPr>
         <w:drawing>
-          <wp:inline distT="0" distB="0" distL="0" distR="0" wp14:anchorId="58B5C0DB" wp14:editId="02992A11">
+          <wp:inline distT="0" distB="0" distL="0" distR="0" wp14:anchorId="58B5C0DB" wp14:editId="7E01DED2">
             <wp:extent cx="3400425" cy="1743808"/>
             <wp:effectExtent l="0" t="0" r="0" b="8890"/>
             <wp:docPr id="1563100451" name="Picture 8" descr="Linking axes to biology"/>
@@ -2387,8 +2303,11 @@
         <w:jc w:val="center"/>
       </w:pPr>
       <w:r>
+        <w:rPr>
+          <w:noProof/>
+        </w:rPr>
         <w:drawing>
-          <wp:inline distT="0" distB="0" distL="0" distR="0" wp14:anchorId="3BDC6625" wp14:editId="1FC5CEBF">
+          <wp:inline distT="0" distB="0" distL="0" distR="0" wp14:anchorId="3BDC6625" wp14:editId="04CB156E">
             <wp:extent cx="2901938" cy="1714500"/>
             <wp:effectExtent l="0" t="0" r="0" b="0"/>
             <wp:docPr id="1656144157" name="Picture 9" descr="Using your hand to determine orientation"/>
@@ -2444,39 +2363,7 @@
     </w:p>
     <w:p>
       <w:r>
-        <w:t xml:space="preserve">The default orientation of the Gundog system is North-East-Down (NED) where the axes readings would be X = 0, Y = 0, and Z = -1. Before we could use data from our hand accelerometer we would have to flip it upside down. Some devices may have a different local coordinate frame, e.g., the END (East-North-Down) coordinate system assume the surge dimension of movement is represented by the z-channel, and the sway and heave dimension, by the x- and y-channels, respectively. Providing the original coordinate system allows the Gundogs system to convert your local system to the global system. The </w:t>
-      </w:r>
-      <w:proofErr w:type="spellStart"/>
-      <w:r>
-        <w:t>Gundog.Compass</w:t>
-      </w:r>
-      <w:proofErr w:type="spellEnd"/>
-      <w:r>
-        <w:t xml:space="preserve"> function comes with three inputs to allow the user to transform their device’s coordinate frame into the NED that the specific Direction Cosine Matrix (DCM) and quaternion augmentation uses to compute angles:‘</w:t>
-      </w:r>
-      <w:proofErr w:type="spellStart"/>
-      <w:r>
-        <w:t>acc.ref.frame</w:t>
-      </w:r>
-      <w:proofErr w:type="spellEnd"/>
-      <w:r>
-        <w:t>’, ‘</w:t>
-      </w:r>
-      <w:proofErr w:type="spellStart"/>
-      <w:r>
-        <w:t>positive.g</w:t>
-      </w:r>
-      <w:proofErr w:type="spellEnd"/>
-      <w:r>
-        <w:t>’, and ‘</w:t>
-      </w:r>
-      <w:proofErr w:type="spellStart"/>
-      <w:r>
-        <w:t>mag.ref.frame</w:t>
-      </w:r>
-      <w:proofErr w:type="spellEnd"/>
-      <w:r>
-        <w:t>’</w:t>
+        <w:t>The default orientation of the Gundog system is North-East-Down (NED) where the axes readings would be X = 0, Y = 0, and Z = -1. Before we could use data from our hand accelerometer we would have to flip it upside down. Some devices may have a different local coordinate frame, e.g., the END (East-North-Down) coordinate system assume the surge dimension of movement is represented by the z-channel, and the sway and heave dimension, by the x- and y-channels, respectively. Providing the original coordinate system allows the Gundogs system to convert your local system to the global system. The Gundog.Compass function comes with three inputs to allow the user to transform their device’s coordinate frame into the NED that the specific Direction Cosine Matrix (DCM) and quaternion augmentation uses to compute angles:‘acc.ref.frame’, ‘positive.g’, and ‘mag.ref.frame’</w:t>
       </w:r>
     </w:p>
     <w:p>
@@ -2607,6 +2494,9 @@
         <w:jc w:val="center"/>
       </w:pPr>
       <w:r>
+        <w:rPr>
+          <w:noProof/>
+        </w:rPr>
         <w:drawing>
           <wp:inline distT="0" distB="0" distL="0" distR="0" wp14:anchorId="13E62DCE" wp14:editId="61FFBE20">
             <wp:extent cx="3629025" cy="1847850"/>
@@ -2735,6 +2625,9 @@
     </w:p>
     <w:p>
       <w:r>
+        <w:rPr>
+          <w:noProof/>
+        </w:rPr>
         <w:drawing>
           <wp:inline distT="0" distB="0" distL="0" distR="0" wp14:anchorId="62D53E0D" wp14:editId="2892914D">
             <wp:extent cx="6858000" cy="870585"/>
@@ -2779,6 +2672,9 @@
     </w:p>
     <w:p>
       <w:r>
+        <w:rPr>
+          <w:noProof/>
+        </w:rPr>
         <w:drawing>
           <wp:inline distT="0" distB="0" distL="0" distR="0" wp14:anchorId="626CD6E7" wp14:editId="63635BAB">
             <wp:extent cx="6858000" cy="730885"/>
@@ -2849,21 +2745,7 @@
         <w:rPr>
           <w:highlight w:val="yellow"/>
         </w:rPr>
-        <w:t xml:space="preserve">by 0.15 to give me what </w:t>
-      </w:r>
-      <w:proofErr w:type="spellStart"/>
-      <w:r>
-        <w:rPr>
-          <w:highlight w:val="yellow"/>
-        </w:rPr>
-        <w:t>jojo</w:t>
-      </w:r>
-      <w:proofErr w:type="spellEnd"/>
-      <w:r>
-        <w:rPr>
-          <w:highlight w:val="yellow"/>
-        </w:rPr>
-        <w:t xml:space="preserve"> had</w:t>
+        <w:t>by 0.15 to give me what jojo had</w:t>
       </w:r>
       <w:r>
         <w:t>. So…</w:t>
@@ -2878,323 +2760,63 @@
           <w:szCs w:val="20"/>
         </w:rPr>
       </w:pPr>
-      <w:proofErr w:type="spellStart"/>
       <w:r>
         <w:rPr>
           <w:sz w:val="20"/>
           <w:szCs w:val="20"/>
         </w:rPr>
-        <w:t>mine.flat</w:t>
-      </w:r>
-      <w:proofErr w:type="spellEnd"/>
-      <w:r>
+        <w:t>mine.flat[, c("RawAX", "RawAY", "RawAZ")] &lt;- mine.flat[, c("RawAX", "RawAY", "RawAZ")] / 2048</w:t>
+      </w:r>
+    </w:p>
+    <w:p>
+      <w:pPr>
+        <w:pStyle w:val="ListParagraph"/>
+        <w:ind w:left="2160"/>
         <w:rPr>
           <w:sz w:val="20"/>
           <w:szCs w:val="20"/>
         </w:rPr>
-        <w:t>[, c("</w:t>
-      </w:r>
-      <w:proofErr w:type="spellStart"/>
+      </w:pPr>
       <w:r>
         <w:rPr>
           <w:sz w:val="20"/>
           <w:szCs w:val="20"/>
         </w:rPr>
-        <w:t>RawAX</w:t>
-      </w:r>
-      <w:proofErr w:type="spellEnd"/>
-      <w:r>
+        <w:t>mine.flat[, c("RawMX", "RawMY", "RawMZ")] &lt;- mine.flat[, c("RawMX", "RawMY", "RawMZ")] * 0.15</w:t>
+      </w:r>
+    </w:p>
+    <w:p>
+      <w:pPr>
+        <w:pStyle w:val="ListParagraph"/>
+        <w:ind w:left="2160"/>
         <w:rPr>
           <w:sz w:val="20"/>
           <w:szCs w:val="20"/>
         </w:rPr>
-        <w:t>", "RawAY", "</w:t>
-      </w:r>
-      <w:proofErr w:type="spellStart"/>
+      </w:pPr>
       <w:r>
         <w:rPr>
           <w:sz w:val="20"/>
           <w:szCs w:val="20"/>
         </w:rPr>
-        <w:t>RawAZ</w:t>
-      </w:r>
-      <w:proofErr w:type="spellEnd"/>
-      <w:r>
+        <w:t>jojo_df &lt;- df.flat[1:77009, ]</w:t>
+      </w:r>
+    </w:p>
+    <w:p>
+      <w:pPr>
+        <w:pStyle w:val="ListParagraph"/>
+        <w:ind w:left="2160"/>
         <w:rPr>
           <w:sz w:val="20"/>
           <w:szCs w:val="20"/>
         </w:rPr>
-        <w:t xml:space="preserve">")] &lt;- </w:t>
-      </w:r>
-      <w:proofErr w:type="spellStart"/>
+      </w:pPr>
       <w:r>
         <w:rPr>
           <w:sz w:val="20"/>
           <w:szCs w:val="20"/>
         </w:rPr>
-        <w:t>mine.flat</w:t>
-      </w:r>
-      <w:proofErr w:type="spellEnd"/>
-      <w:r>
-        <w:rPr>
-          <w:sz w:val="20"/>
-          <w:szCs w:val="20"/>
-        </w:rPr>
-        <w:t>[, c("</w:t>
-      </w:r>
-      <w:proofErr w:type="spellStart"/>
-      <w:r>
-        <w:rPr>
-          <w:sz w:val="20"/>
-          <w:szCs w:val="20"/>
-        </w:rPr>
-        <w:t>RawAX</w:t>
-      </w:r>
-      <w:proofErr w:type="spellEnd"/>
-      <w:r>
-        <w:rPr>
-          <w:sz w:val="20"/>
-          <w:szCs w:val="20"/>
-        </w:rPr>
-        <w:t>", "RawAY", "</w:t>
-      </w:r>
-      <w:proofErr w:type="spellStart"/>
-      <w:r>
-        <w:rPr>
-          <w:sz w:val="20"/>
-          <w:szCs w:val="20"/>
-        </w:rPr>
-        <w:t>RawAZ</w:t>
-      </w:r>
-      <w:proofErr w:type="spellEnd"/>
-      <w:r>
-        <w:rPr>
-          <w:sz w:val="20"/>
-          <w:szCs w:val="20"/>
-        </w:rPr>
-        <w:t>")] / 2048</w:t>
-      </w:r>
-    </w:p>
-    <w:p>
-      <w:pPr>
-        <w:pStyle w:val="ListParagraph"/>
-        <w:ind w:left="2160"/>
-        <w:rPr>
-          <w:sz w:val="20"/>
-          <w:szCs w:val="20"/>
-        </w:rPr>
-      </w:pPr>
-      <w:proofErr w:type="spellStart"/>
-      <w:r>
-        <w:rPr>
-          <w:sz w:val="20"/>
-          <w:szCs w:val="20"/>
-        </w:rPr>
-        <w:t>mine.flat</w:t>
-      </w:r>
-      <w:proofErr w:type="spellEnd"/>
-      <w:r>
-        <w:rPr>
-          <w:sz w:val="20"/>
-          <w:szCs w:val="20"/>
-        </w:rPr>
-        <w:t>[, c("</w:t>
-      </w:r>
-      <w:proofErr w:type="spellStart"/>
-      <w:r>
-        <w:rPr>
-          <w:sz w:val="20"/>
-          <w:szCs w:val="20"/>
-        </w:rPr>
-        <w:t>RawMX</w:t>
-      </w:r>
-      <w:proofErr w:type="spellEnd"/>
-      <w:r>
-        <w:rPr>
-          <w:sz w:val="20"/>
-          <w:szCs w:val="20"/>
-        </w:rPr>
-        <w:t>", "</w:t>
-      </w:r>
-      <w:proofErr w:type="spellStart"/>
-      <w:r>
-        <w:rPr>
-          <w:sz w:val="20"/>
-          <w:szCs w:val="20"/>
-        </w:rPr>
-        <w:t>RawMY</w:t>
-      </w:r>
-      <w:proofErr w:type="spellEnd"/>
-      <w:r>
-        <w:rPr>
-          <w:sz w:val="20"/>
-          <w:szCs w:val="20"/>
-        </w:rPr>
-        <w:t>", "</w:t>
-      </w:r>
-      <w:proofErr w:type="spellStart"/>
-      <w:r>
-        <w:rPr>
-          <w:sz w:val="20"/>
-          <w:szCs w:val="20"/>
-        </w:rPr>
-        <w:t>RawMZ</w:t>
-      </w:r>
-      <w:proofErr w:type="spellEnd"/>
-      <w:r>
-        <w:rPr>
-          <w:sz w:val="20"/>
-          <w:szCs w:val="20"/>
-        </w:rPr>
-        <w:t xml:space="preserve">")] &lt;- </w:t>
-      </w:r>
-      <w:proofErr w:type="spellStart"/>
-      <w:r>
-        <w:rPr>
-          <w:sz w:val="20"/>
-          <w:szCs w:val="20"/>
-        </w:rPr>
-        <w:t>mine.flat</w:t>
-      </w:r>
-      <w:proofErr w:type="spellEnd"/>
-      <w:r>
-        <w:rPr>
-          <w:sz w:val="20"/>
-          <w:szCs w:val="20"/>
-        </w:rPr>
-        <w:t>[, c("</w:t>
-      </w:r>
-      <w:proofErr w:type="spellStart"/>
-      <w:r>
-        <w:rPr>
-          <w:sz w:val="20"/>
-          <w:szCs w:val="20"/>
-        </w:rPr>
-        <w:t>RawMX</w:t>
-      </w:r>
-      <w:proofErr w:type="spellEnd"/>
-      <w:r>
-        <w:rPr>
-          <w:sz w:val="20"/>
-          <w:szCs w:val="20"/>
-        </w:rPr>
-        <w:t>", "</w:t>
-      </w:r>
-      <w:proofErr w:type="spellStart"/>
-      <w:r>
-        <w:rPr>
-          <w:sz w:val="20"/>
-          <w:szCs w:val="20"/>
-        </w:rPr>
-        <w:t>RawMY</w:t>
-      </w:r>
-      <w:proofErr w:type="spellEnd"/>
-      <w:r>
-        <w:rPr>
-          <w:sz w:val="20"/>
-          <w:szCs w:val="20"/>
-        </w:rPr>
-        <w:t>", "</w:t>
-      </w:r>
-      <w:proofErr w:type="spellStart"/>
-      <w:r>
-        <w:rPr>
-          <w:sz w:val="20"/>
-          <w:szCs w:val="20"/>
-        </w:rPr>
-        <w:t>RawMZ</w:t>
-      </w:r>
-      <w:proofErr w:type="spellEnd"/>
-      <w:r>
-        <w:rPr>
-          <w:sz w:val="20"/>
-          <w:szCs w:val="20"/>
-        </w:rPr>
-        <w:t>")] * 0.15</w:t>
-      </w:r>
-    </w:p>
-    <w:p>
-      <w:pPr>
-        <w:pStyle w:val="ListParagraph"/>
-        <w:ind w:left="2160"/>
-        <w:rPr>
-          <w:sz w:val="20"/>
-          <w:szCs w:val="20"/>
-        </w:rPr>
-      </w:pPr>
-      <w:proofErr w:type="spellStart"/>
-      <w:r>
-        <w:rPr>
-          <w:sz w:val="20"/>
-          <w:szCs w:val="20"/>
-        </w:rPr>
-        <w:t>jojo_df</w:t>
-      </w:r>
-      <w:proofErr w:type="spellEnd"/>
-      <w:r>
-        <w:rPr>
-          <w:sz w:val="20"/>
-          <w:szCs w:val="20"/>
-        </w:rPr>
-        <w:t xml:space="preserve"> &lt;- </w:t>
-      </w:r>
-      <w:proofErr w:type="spellStart"/>
-      <w:r>
-        <w:rPr>
-          <w:sz w:val="20"/>
-          <w:szCs w:val="20"/>
-        </w:rPr>
-        <w:t>df.flat</w:t>
-      </w:r>
-      <w:proofErr w:type="spellEnd"/>
-      <w:r>
-        <w:rPr>
-          <w:sz w:val="20"/>
-          <w:szCs w:val="20"/>
-        </w:rPr>
-        <w:t>[1:77009, ]</w:t>
-      </w:r>
-    </w:p>
-    <w:p>
-      <w:pPr>
-        <w:pStyle w:val="ListParagraph"/>
-        <w:ind w:left="2160"/>
-        <w:rPr>
-          <w:sz w:val="20"/>
-          <w:szCs w:val="20"/>
-        </w:rPr>
-      </w:pPr>
-      <w:proofErr w:type="spellStart"/>
-      <w:r>
-        <w:rPr>
-          <w:sz w:val="20"/>
-          <w:szCs w:val="20"/>
-        </w:rPr>
-        <w:t>oak_df</w:t>
-      </w:r>
-      <w:proofErr w:type="spellEnd"/>
-      <w:r>
-        <w:rPr>
-          <w:sz w:val="20"/>
-          <w:szCs w:val="20"/>
-        </w:rPr>
-        <w:t xml:space="preserve"> &lt;- </w:t>
-      </w:r>
-      <w:proofErr w:type="spellStart"/>
-      <w:r>
-        <w:rPr>
-          <w:sz w:val="20"/>
-          <w:szCs w:val="20"/>
-        </w:rPr>
-        <w:t>mine.flat</w:t>
-      </w:r>
-      <w:proofErr w:type="spellEnd"/>
-      <w:r>
-        <w:rPr>
-          <w:sz w:val="20"/>
-          <w:szCs w:val="20"/>
-        </w:rPr>
-        <w:t>[3064:80072, ]</w:t>
+        <w:t>oak_df &lt;- mine.flat[3064:80072, ]</w:t>
       </w:r>
     </w:p>
     <w:p>
@@ -3227,6 +2849,9 @@
     </w:p>
     <w:p>
       <w:r>
+        <w:rPr>
+          <w:noProof/>
+        </w:rPr>
         <w:drawing>
           <wp:inline distT="0" distB="0" distL="0" distR="0" wp14:anchorId="5E8377E6" wp14:editId="7D4B0DCE">
             <wp:extent cx="3286664" cy="2726714"/>
@@ -3264,6 +2889,9 @@
         </w:drawing>
       </w:r>
       <w:r>
+        <w:rPr>
+          <w:noProof/>
+        </w:rPr>
         <w:drawing>
           <wp:inline distT="0" distB="0" distL="0" distR="0" wp14:anchorId="7B03E3B1" wp14:editId="33B84F57">
             <wp:extent cx="3234905" cy="2677182"/>
@@ -3343,15 +2971,7 @@
         </w:numPr>
       </w:pPr>
       <w:r>
-        <w:t xml:space="preserve">I think I should presume that they’re not. That is, </w:t>
-      </w:r>
-      <w:proofErr w:type="spellStart"/>
-      <w:r>
-        <w:t>jojo</w:t>
-      </w:r>
-      <w:proofErr w:type="spellEnd"/>
-      <w:r>
-        <w:t xml:space="preserve"> figured out that the </w:t>
+        <w:t xml:space="preserve">I think I should presume that they’re not. That is, jojo figured out that the </w:t>
       </w:r>
       <w:r>
         <w:t>accel was NED and the mag was NWU. Whatever my accel orientation is determined to be, the mag will probably be an equivalent rotation.</w:t>
@@ -3408,15 +3028,7 @@
         <w:t xml:space="preserve"> the orientation</w:t>
       </w:r>
       <w:r>
-        <w:t xml:space="preserve"> of the </w:t>
-      </w:r>
-      <w:proofErr w:type="spellStart"/>
-      <w:r>
-        <w:t>accels</w:t>
-      </w:r>
-      <w:proofErr w:type="spellEnd"/>
-      <w:r>
-        <w:t xml:space="preserve"> are</w:t>
+        <w:t xml:space="preserve"> of the accels are</w:t>
       </w:r>
       <w:r>
         <w:t xml:space="preserve"> written on the </w:t>
@@ -3433,6 +3045,9 @@
         <w:jc w:val="center"/>
       </w:pPr>
       <w:r>
+        <w:rPr>
+          <w:noProof/>
+        </w:rPr>
         <w:drawing>
           <wp:inline distT="0" distB="0" distL="0" distR="0" wp14:anchorId="1CF6F8FB" wp14:editId="5B67970B">
             <wp:extent cx="2094614" cy="1689192"/>
@@ -3488,6 +3103,9 @@
         </w:drawing>
       </w:r>
       <w:r>
+        <w:rPr>
+          <w:noProof/>
+        </w:rPr>
         <w:drawing>
           <wp:inline distT="0" distB="0" distL="0" distR="0" wp14:anchorId="5013C8EE" wp14:editId="7381F381">
             <wp:extent cx="2445488" cy="1688416"/>
@@ -3548,6 +3166,9 @@
         <w:jc w:val="center"/>
       </w:pPr>
       <w:r>
+        <w:rPr>
+          <w:noProof/>
+        </w:rPr>
         <w:lastRenderedPageBreak/>
         <w:drawing>
           <wp:inline distT="0" distB="0" distL="0" distR="0" wp14:anchorId="701B2334" wp14:editId="51033066">
@@ -3661,26 +3282,10 @@
         </w:numPr>
       </w:pPr>
       <w:r>
-        <w:t xml:space="preserve">Was having an issue where there were a lot of unmatched </w:t>
-      </w:r>
-      <w:proofErr w:type="spellStart"/>
-      <w:r>
-        <w:t>gps</w:t>
-      </w:r>
-      <w:proofErr w:type="spellEnd"/>
-      <w:r>
-        <w:t xml:space="preserve"> pings. </w:t>
-      </w:r>
-      <w:r>
-        <w:t xml:space="preserve">Fixed this by switching the order of the </w:t>
-      </w:r>
-      <w:proofErr w:type="spellStart"/>
-      <w:r>
-        <w:t>kets</w:t>
-      </w:r>
-      <w:proofErr w:type="spellEnd"/>
-      <w:r>
-        <w:t xml:space="preserve"> for the rolling join. But I nearly kms before figuring that out.</w:t>
+        <w:t xml:space="preserve">Was having an issue where there were a lot of unmatched gps pings. </w:t>
+      </w:r>
+      <w:r>
+        <w:t>Fixed this by switching the order of the kets for the rolling join. But I nearly kms before figuring that out.</w:t>
       </w:r>
     </w:p>
     <w:p>
@@ -3692,6 +3297,9 @@
         </w:numPr>
       </w:pPr>
       <w:r>
+        <w:rPr>
+          <w:noProof/>
+        </w:rPr>
         <w:drawing>
           <wp:inline distT="0" distB="0" distL="0" distR="0" wp14:anchorId="331B779D" wp14:editId="76714818">
             <wp:extent cx="4359349" cy="1509338"/>
@@ -3781,6 +3389,9 @@
         <w:jc w:val="center"/>
       </w:pPr>
       <w:r>
+        <w:rPr>
+          <w:noProof/>
+        </w:rPr>
         <w:drawing>
           <wp:inline distT="0" distB="0" distL="0" distR="0" wp14:anchorId="0EFDA96F" wp14:editId="418BD9AA">
             <wp:extent cx="4165616" cy="1442262"/>
@@ -3851,15 +3462,7 @@
         <w:t>Unfortunately,</w:t>
       </w:r>
       <w:r>
-        <w:t xml:space="preserve"> I didn’t wait long enough to get a proper </w:t>
-      </w:r>
-      <w:proofErr w:type="spellStart"/>
-      <w:r>
-        <w:t>gps</w:t>
-      </w:r>
-      <w:proofErr w:type="spellEnd"/>
-      <w:r>
-        <w:t xml:space="preserve"> </w:t>
+        <w:t xml:space="preserve"> I didn’t wait long enough to get a proper gps </w:t>
       </w:r>
       <w:r>
         <w:t>hit but</w:t>
@@ -3896,6 +3499,7 @@
       </w:pPr>
       <w:r>
         <w:rPr>
+          <w:noProof/>
           <w:lang w:val="en-GB"/>
         </w:rPr>
         <w:drawing>
@@ -3972,15 +3576,7 @@
         </w:numPr>
       </w:pPr>
       <w:r>
-        <w:t xml:space="preserve">If the original collar trials had an </w:t>
-      </w:r>
-      <w:proofErr w:type="spellStart"/>
-      <w:r>
-        <w:t>acc</w:t>
-      </w:r>
-      <w:proofErr w:type="spellEnd"/>
-      <w:r>
-        <w:t xml:space="preserve"> of NED and a mag of NWU then… I need to reverse the Y and Z directions for the mag of the true collar orientation. So would be… DES. </w:t>
+        <w:t xml:space="preserve">If the original collar trials had an acc of NED and a mag of NWU then… I need to reverse the Y and Z directions for the mag of the true collar orientation. So would be… DES. </w:t>
       </w:r>
     </w:p>
     <w:p>
@@ -4023,6 +3619,9 @@
         <w:jc w:val="center"/>
       </w:pPr>
       <w:r>
+        <w:rPr>
+          <w:noProof/>
+        </w:rPr>
         <w:drawing>
           <wp:inline distT="0" distB="0" distL="0" distR="0" wp14:anchorId="1C10A757" wp14:editId="7F4E5576">
             <wp:extent cx="2749550" cy="2278817"/>
@@ -4060,6 +3659,9 @@
         </w:drawing>
       </w:r>
       <w:r>
+        <w:rPr>
+          <w:noProof/>
+        </w:rPr>
         <w:drawing>
           <wp:inline distT="0" distB="0" distL="0" distR="0" wp14:anchorId="1ECE9820" wp14:editId="0FAE01F0">
             <wp:extent cx="2787650" cy="2299295"/>
@@ -4124,23 +3726,7 @@
         </w:numPr>
       </w:pPr>
       <w:r>
-        <w:t xml:space="preserve">Basically, the calibration event occurs at 28.06.24 18:16:00 local time but the first recorded </w:t>
-      </w:r>
-      <w:proofErr w:type="spellStart"/>
-      <w:r>
-        <w:t>gps</w:t>
-      </w:r>
-      <w:proofErr w:type="spellEnd"/>
-      <w:r>
-        <w:t xml:space="preserve"> time is "2024-06-28 16:28:48 UTC" (about 10 minutes after). Jaz says </w:t>
-      </w:r>
-      <w:proofErr w:type="spellStart"/>
-      <w:r>
-        <w:t>its</w:t>
-      </w:r>
-      <w:proofErr w:type="spellEnd"/>
-      <w:r>
-        <w:t xml:space="preserve"> not possible for the calibration event to have occurred before the first ping… but </w:t>
+        <w:t xml:space="preserve">Basically, the calibration event occurs at 28.06.24 18:16:00 local time but the first recorded gps time is "2024-06-28 16:28:48 UTC" (about 10 minutes after). Jaz says its not possible for the calibration event to have occurred before the first ping… but </w:t>
       </w:r>
       <w:r>
         <w:t>stuff</w:t>
@@ -4210,15 +3796,7 @@
         <w:t>th</w:t>
       </w:r>
       <w:r>
-        <w:t xml:space="preserve"> (first </w:t>
-      </w:r>
-      <w:proofErr w:type="spellStart"/>
-      <w:r>
-        <w:t>gps</w:t>
-      </w:r>
-      <w:proofErr w:type="spellEnd"/>
-      <w:r>
-        <w:t xml:space="preserve"> hit)</w:t>
+        <w:t xml:space="preserve"> (first gps hit)</w:t>
       </w:r>
     </w:p>
     <w:p>
@@ -4230,26 +3808,10 @@
         </w:numPr>
       </w:pPr>
       <w:r>
-        <w:t xml:space="preserve">Yep. Even when I don’t crop the accel, the interpolation sends it forward in time from the first </w:t>
-      </w:r>
-      <w:proofErr w:type="spellStart"/>
-      <w:r>
-        <w:t>gps</w:t>
-      </w:r>
-      <w:proofErr w:type="spellEnd"/>
-      <w:r>
-        <w:t xml:space="preserve"> hit. Interesting. </w:t>
-      </w:r>
-      <w:r>
-        <w:t xml:space="preserve">Where the time jumps backwards in the first </w:t>
-      </w:r>
-      <w:proofErr w:type="spellStart"/>
-      <w:r>
-        <w:t>gps</w:t>
-      </w:r>
-      <w:proofErr w:type="spellEnd"/>
-      <w:r>
-        <w:t xml:space="preserve"> hit. So what the heck went wrong with the reverse interpolation?</w:t>
+        <w:t xml:space="preserve">Yep. Even when I don’t crop the accel, the interpolation sends it forward in time from the first gps hit. Interesting. </w:t>
+      </w:r>
+      <w:r>
+        <w:t>Where the time jumps backwards in the first gps hit. So what the heck went wrong with the reverse interpolation?</w:t>
       </w:r>
     </w:p>
     <w:p>
@@ -4261,23 +3823,7 @@
         </w:numPr>
       </w:pPr>
       <w:r>
-        <w:t xml:space="preserve">RTC accel (left) and the </w:t>
-      </w:r>
-      <w:proofErr w:type="spellStart"/>
-      <w:r>
-        <w:t>gps</w:t>
-      </w:r>
-      <w:proofErr w:type="spellEnd"/>
-      <w:r>
-        <w:t xml:space="preserve"> times look correct, however the conversion to the </w:t>
-      </w:r>
-      <w:proofErr w:type="spellStart"/>
-      <w:r>
-        <w:t>gps</w:t>
-      </w:r>
-      <w:proofErr w:type="spellEnd"/>
-      <w:r>
-        <w:t xml:space="preserve"> time using interpolation is way out (right) where it jumps several days. </w:t>
+        <w:t xml:space="preserve">RTC accel (left) and the gps times look correct, however the conversion to the gps time using interpolation is way out (right) where it jumps several days. </w:t>
       </w:r>
     </w:p>
     <w:p>
@@ -4285,6 +3831,9 @@
         <w:ind w:left="1800"/>
       </w:pPr>
       <w:r>
+        <w:rPr>
+          <w:noProof/>
+        </w:rPr>
         <w:drawing>
           <wp:inline distT="0" distB="0" distL="0" distR="0" wp14:anchorId="614306F7" wp14:editId="42520405">
             <wp:extent cx="2790749" cy="966241"/>
@@ -4332,6 +3881,9 @@
         </w:drawing>
       </w:r>
       <w:r>
+        <w:rPr>
+          <w:noProof/>
+        </w:rPr>
         <w:drawing>
           <wp:inline distT="0" distB="0" distL="0" distR="0" wp14:anchorId="2D2DE666" wp14:editId="75955986">
             <wp:extent cx="2801721" cy="970040"/>
@@ -4432,23 +3984,7 @@
         </w:numPr>
       </w:pPr>
       <w:r>
-        <w:t xml:space="preserve">Ah. </w:t>
-      </w:r>
-      <w:proofErr w:type="spellStart"/>
-      <w:r>
-        <w:t>So.</w:t>
-      </w:r>
-      <w:proofErr w:type="spellEnd"/>
-      <w:r>
-        <w:t xml:space="preserve"> The GPS only had 1 reset but the accel had 2 and it cropped the accel too small… </w:t>
-      </w:r>
-      <w:proofErr w:type="spellStart"/>
-      <w:r>
-        <w:t>So.</w:t>
-      </w:r>
-      <w:proofErr w:type="spellEnd"/>
-      <w:r>
-        <w:t xml:space="preserve"> That is an issue. I have to change my joining logic.</w:t>
+        <w:t>Ah. So. The GPS only had 1 reset but the accel had 2 and it cropped the accel too small… So. That is an issue. I have to change my joining logic.</w:t>
       </w:r>
     </w:p>
     <w:p>
@@ -4460,23 +3996,7 @@
         </w:numPr>
       </w:pPr>
       <w:r>
-        <w:t xml:space="preserve">Changed the </w:t>
-      </w:r>
-      <w:proofErr w:type="spellStart"/>
-      <w:r>
-        <w:t>gps</w:t>
-      </w:r>
-      <w:proofErr w:type="spellEnd"/>
-      <w:r>
-        <w:t xml:space="preserve"> </w:t>
-      </w:r>
-      <w:proofErr w:type="spellStart"/>
-      <w:r>
-        <w:t>reset_events</w:t>
-      </w:r>
-      <w:proofErr w:type="spellEnd"/>
-      <w:r>
-        <w:t xml:space="preserve"> manually over to the longest accel sampling period number.</w:t>
+        <w:t>Changed the gps reset_events manually over to the longest accel sampling period number.</w:t>
       </w:r>
     </w:p>
     <w:p>
@@ -4511,13 +4031,8 @@
           <w:numId w:val="2"/>
         </w:numPr>
       </w:pPr>
-      <w:proofErr w:type="spellStart"/>
-      <w:r>
-        <w:t>Jk</w:t>
-      </w:r>
-      <w:proofErr w:type="spellEnd"/>
-      <w:r>
-        <w:t>. The next collar ran into a new problem. It never ends with this BS.</w:t>
+      <w:r>
+        <w:t>Jk. The next collar ran into a new problem. It never ends with this BS.</w:t>
       </w:r>
     </w:p>
     <w:p>
@@ -4540,6 +4055,9 @@
     </w:p>
     <w:p>
       <w:r>
+        <w:rPr>
+          <w:noProof/>
+        </w:rPr>
         <w:drawing>
           <wp:inline distT="0" distB="0" distL="0" distR="0" wp14:anchorId="377498D4" wp14:editId="0303A175">
             <wp:extent cx="3321170" cy="1149890"/>
@@ -4590,6 +4108,9 @@
         <w:t xml:space="preserve"> </w:t>
       </w:r>
       <w:r>
+        <w:rPr>
+          <w:noProof/>
+        </w:rPr>
         <w:drawing>
           <wp:inline distT="0" distB="0" distL="0" distR="0" wp14:anchorId="1CFB0D7E" wp14:editId="728B8D9C">
             <wp:extent cx="3312543" cy="1146902"/>
@@ -4661,15 +4182,7 @@
         </w:numPr>
       </w:pPr>
       <w:r>
-        <w:t xml:space="preserve">So am I meant to remove these files or not? When I leave them in, there’s issues. When I take them out, it works… But they </w:t>
-      </w:r>
-      <w:proofErr w:type="spellStart"/>
-      <w:r>
-        <w:t>seeeeeem</w:t>
-      </w:r>
-      <w:proofErr w:type="spellEnd"/>
-      <w:r>
-        <w:t xml:space="preserve"> like they’re correct</w:t>
+        <w:t>So am I meant to remove these files or not? When I leave them in, there’s issues. When I take them out, it works… But they seeeeeem like they’re correct</w:t>
       </w:r>
       <w:r>
         <w:t>? Until we understand how they got there, I’m reluctant to do anything</w:t>
@@ -4719,6 +4232,9 @@
         <w:jc w:val="center"/>
       </w:pPr>
       <w:r>
+        <w:rPr>
+          <w:noProof/>
+        </w:rPr>
         <w:drawing>
           <wp:inline distT="0" distB="0" distL="0" distR="0" wp14:anchorId="695B377C" wp14:editId="32B1E25C">
             <wp:extent cx="3240897" cy="1000065"/>
@@ -4766,6 +4282,9 @@
         </w:drawing>
       </w:r>
       <w:r>
+        <w:rPr>
+          <w:noProof/>
+        </w:rPr>
         <w:drawing>
           <wp:inline distT="0" distB="0" distL="0" distR="0" wp14:anchorId="35C95DA9" wp14:editId="6EF40B38">
             <wp:extent cx="3103065" cy="957533"/>
@@ -4830,6 +4349,9 @@
         <w:jc w:val="center"/>
       </w:pPr>
       <w:r>
+        <w:rPr>
+          <w:noProof/>
+        </w:rPr>
         <w:drawing>
           <wp:inline distT="0" distB="0" distL="0" distR="0" wp14:anchorId="77E4C3CF" wp14:editId="3FC51E13">
             <wp:extent cx="948906" cy="978387"/>
@@ -4893,6 +4415,9 @@
         <w:jc w:val="center"/>
       </w:pPr>
       <w:r>
+        <w:rPr>
+          <w:noProof/>
+        </w:rPr>
         <w:drawing>
           <wp:inline distT="0" distB="0" distL="0" distR="0" wp14:anchorId="2EFC3CDA" wp14:editId="73E69678">
             <wp:extent cx="2132380" cy="1865415"/>
@@ -4950,6 +4475,9 @@
         <w:jc w:val="center"/>
       </w:pPr>
       <w:r>
+        <w:rPr>
+          <w:noProof/>
+        </w:rPr>
         <w:drawing>
           <wp:inline distT="0" distB="0" distL="0" distR="0" wp14:anchorId="78AFFE58" wp14:editId="173C4AAD">
             <wp:extent cx="2725333" cy="1123950"/>
@@ -5055,15 +4583,7 @@
         </w:numPr>
       </w:pPr>
       <w:r>
-        <w:t xml:space="preserve">“good mag </w:t>
-      </w:r>
-      <w:proofErr w:type="spellStart"/>
-      <w:r>
-        <w:t>cal</w:t>
-      </w:r>
-      <w:proofErr w:type="spellEnd"/>
-      <w:r>
-        <w:t xml:space="preserve"> (ensure not wearing watches /have phones/any magnetic interfering stuff on person etc. nearby when doing this)”</w:t>
+        <w:t>“good mag cal (ensure not wearing watches /have phones/any magnetic interfering stuff on person etc. nearby when doing this)”</w:t>
       </w:r>
     </w:p>
     <w:p>
@@ -5075,23 +4595,7 @@
         </w:numPr>
       </w:pPr>
       <w:r>
-        <w:t xml:space="preserve">“In terms of movement bouts, the simple approach would be to use some sort of acceleration magnitude threshold (e.g. </w:t>
-      </w:r>
-      <w:proofErr w:type="spellStart"/>
-      <w:r>
-        <w:t>VeDBA</w:t>
-      </w:r>
-      <w:proofErr w:type="spellEnd"/>
-      <w:r>
-        <w:t xml:space="preserve">)... but for example, something like a kangaroo should be very obvious with jumping behaviour that should come out in acceleration traces as clear stylised patterns which could be manually discerned or via machine learning if you were able to do some </w:t>
-      </w:r>
-      <w:proofErr w:type="spellStart"/>
-      <w:r>
-        <w:t>groundtruthing</w:t>
-      </w:r>
-      <w:proofErr w:type="spellEnd"/>
-      <w:r>
-        <w:t xml:space="preserve"> of behaviours during the data acquisition period.” </w:t>
+        <w:t xml:space="preserve">“In terms of movement bouts, the simple approach would be to use some sort of acceleration magnitude threshold (e.g. VeDBA)... but for example, something like a kangaroo should be very obvious with jumping behaviour that should come out in acceleration traces as clear stylised patterns which could be manually discerned or via machine learning if you were able to do some groundtruthing of behaviours during the data acquisition period.” </w:t>
       </w:r>
       <w:r>
         <w:sym w:font="Wingdings" w:char="F0E0"/>
@@ -5121,29 +4625,13 @@
         </w:numPr>
       </w:pPr>
       <w:r>
-        <w:t xml:space="preserve">“When the penguin is walking, the tag will be nearly vertical, while during swimming, it will be more horizontal. In both cases, the tag’s coordinate frame relative to the penguin’s natural movement (and the ground or water surface) will be different. To ensure accurate heading calculations, I would need to define different tag coordinate systems for walking and swimming and compute the heading separately for each period—on land and at sea—otherwise, my dead-reckoned (DR) tracks could be very </w:t>
-      </w:r>
-      <w:proofErr w:type="spellStart"/>
-      <w:r>
-        <w:t>innacurate</w:t>
-      </w:r>
-      <w:proofErr w:type="spellEnd"/>
-      <w:r>
-        <w:t xml:space="preserve">.” </w:t>
+        <w:t xml:space="preserve">“When the penguin is walking, the tag will be nearly vertical, while during swimming, it will be more horizontal. In both cases, the tag’s coordinate frame relative to the penguin’s natural movement (and the ground or water surface) will be different. To ensure accurate heading calculations, I would need to define different tag coordinate systems for walking and swimming and compute the heading separately for each period—on land and at sea—otherwise, my dead-reckoned (DR) tracks could be very innacurate.” </w:t>
       </w:r>
       <w:r>
         <w:sym w:font="Wingdings" w:char="F0E0"/>
       </w:r>
       <w:r>
-        <w:t xml:space="preserve"> no WONDER my flippy </w:t>
-      </w:r>
-      <w:proofErr w:type="spellStart"/>
-      <w:r>
-        <w:t>flippy</w:t>
-      </w:r>
-      <w:proofErr w:type="spellEnd"/>
-      <w:r>
-        <w:t xml:space="preserve"> stuff doesn’t work.</w:t>
+        <w:t xml:space="preserve"> no WONDER my flippy flippy stuff doesn’t work.</w:t>
       </w:r>
     </w:p>
     <w:p>
@@ -5155,15 +4643,7 @@
         </w:numPr>
       </w:pPr>
       <w:r>
-        <w:t xml:space="preserve">“If you know there’s a specific yaw offset in the tag placement, you can specify it in the compass function. If you’re unsure, you could compare the heading correction factors from </w:t>
-      </w:r>
-      <w:proofErr w:type="spellStart"/>
-      <w:r>
-        <w:t>Gundog.Tracks</w:t>
-      </w:r>
-      <w:proofErr w:type="spellEnd"/>
-      <w:r>
-        <w:t>. If the headings are consistently biased in one direction, it could indicate a tag yaw offset or the need for magnetic declination adjustment. But again, if the tag’s yaw offset is minor and consistent, it’s not essential to correct this, as the dead-reckoned track will be consistently biased (in theory, the patterns and scales of tortuosity between GPS points should remain the same, just directionally offset somewhat), and the track segments get rotated when corrected with their endpoint GPS fixes during the correction process anyway.”</w:t>
+        <w:t>“If you know there’s a specific yaw offset in the tag placement, you can specify it in the compass function. If you’re unsure, you could compare the heading correction factors from Gundog.Tracks. If the headings are consistently biased in one direction, it could indicate a tag yaw offset or the need for magnetic declination adjustment. But again, if the tag’s yaw offset is minor and consistent, it’s not essential to correct this, as the dead-reckoned track will be consistently biased (in theory, the patterns and scales of tortuosity between GPS points should remain the same, just directionally offset somewhat), and the track segments get rotated when corrected with their endpoint GPS fixes during the correction process anyway.”</w:t>
       </w:r>
     </w:p>
     <w:p>
@@ -5175,31 +4655,7 @@
         </w:numPr>
       </w:pPr>
       <w:r>
-        <w:t xml:space="preserve">“What I suggest is to first run the compass function without any offsets applied to derive the pitch and roll angles. Then, determine the mean values of both during periods where you believe the animal and collar are in a normal position, such as during low-activity, steady-state </w:t>
-      </w:r>
-      <w:proofErr w:type="spellStart"/>
-      <w:r>
-        <w:t>behavior</w:t>
-      </w:r>
-      <w:proofErr w:type="spellEnd"/>
-      <w:r>
-        <w:t>. Once you have these values, re-run the function and input them as the '</w:t>
-      </w:r>
-      <w:proofErr w:type="spellStart"/>
-      <w:r>
-        <w:t>pitch.offset</w:t>
-      </w:r>
-      <w:proofErr w:type="spellEnd"/>
-      <w:r>
-        <w:t>' and '</w:t>
-      </w:r>
-      <w:proofErr w:type="spellStart"/>
-      <w:r>
-        <w:t>roll.offset</w:t>
-      </w:r>
-      <w:proofErr w:type="spellEnd"/>
-      <w:r>
-        <w:t>' parameters.”</w:t>
+        <w:t>“What I suggest is to first run the compass function without any offsets applied to derive the pitch and roll angles. Then, determine the mean values of both during periods where you believe the animal and collar are in a normal position, such as during low-activity, steady-state behavior. Once you have these values, re-run the function and input them as the 'pitch.offset' and 'roll.offset' parameters.”</w:t>
       </w:r>
     </w:p>
     <w:p>
@@ -5211,15 +4667,7 @@
         </w:numPr>
       </w:pPr>
       <w:r>
-        <w:t xml:space="preserve">“if you supply a positive pitch offset value of 45°, this reflects that the device is pitched up by 45° from the level, and the function will de-rotate the supplied (smoothed) </w:t>
-      </w:r>
-      <w:proofErr w:type="spellStart"/>
-      <w:r>
-        <w:t>acc</w:t>
-      </w:r>
-      <w:proofErr w:type="spellEnd"/>
-      <w:r>
-        <w:t xml:space="preserve"> and mag (normalised) values by this amount. Similarly, a positive roll value indicates a rightward tilt (bank angle), and a positive yaw value represents a clockwise rotational offset”</w:t>
+        <w:t>“if you supply a positive pitch offset value of 45°, this reflects that the device is pitched up by 45° from the level, and the function will de-rotate the supplied (smoothed) acc and mag (normalised) values by this amount. Similarly, a positive roll value indicates a rightward tilt (bank angle), and a positive yaw value represents a clockwise rotational offset”</w:t>
       </w:r>
     </w:p>
     <w:p>
@@ -5261,95 +4709,7 @@
         </w:numPr>
       </w:pPr>
       <w:r>
-        <w:t xml:space="preserve">“The short answer is, yes - if a wrong ref frame was chosen then DR path </w:t>
-      </w:r>
-      <w:proofErr w:type="spellStart"/>
-      <w:r>
-        <w:t>wil</w:t>
-      </w:r>
-      <w:proofErr w:type="spellEnd"/>
-      <w:r>
-        <w:t xml:space="preserve"> be </w:t>
-      </w:r>
-      <w:proofErr w:type="spellStart"/>
-      <w:r>
-        <w:t>innacurate</w:t>
-      </w:r>
-      <w:proofErr w:type="spellEnd"/>
-      <w:r>
-        <w:t xml:space="preserve">. But comparing subsets with GPS pre-correction will help debug if chosen orientation was correct. The patterns and directions of travel should be similar even if scale is not when compared to GPS. I had some lions where I had to 'figure' out the orientation post release. But visually it should be easy to decipher the heave axis of </w:t>
-      </w:r>
-      <w:proofErr w:type="spellStart"/>
-      <w:r>
-        <w:t>movmement</w:t>
-      </w:r>
-      <w:proofErr w:type="spellEnd"/>
-      <w:r>
-        <w:t xml:space="preserve"> in </w:t>
-      </w:r>
-      <w:proofErr w:type="spellStart"/>
-      <w:r>
-        <w:t>acc</w:t>
-      </w:r>
-      <w:proofErr w:type="spellEnd"/>
-      <w:r>
-        <w:t xml:space="preserve"> and mag (</w:t>
-      </w:r>
-      <w:proofErr w:type="spellStart"/>
-      <w:r>
-        <w:t>acc</w:t>
-      </w:r>
-      <w:proofErr w:type="spellEnd"/>
-      <w:r>
-        <w:t xml:space="preserve"> will be the one closest to +/-1 g most of the time, and mag will the one changing the least)... In terms of deciphering the </w:t>
-      </w:r>
-      <w:proofErr w:type="spellStart"/>
-      <w:r>
-        <w:t>acc</w:t>
-      </w:r>
-      <w:proofErr w:type="spellEnd"/>
-      <w:r>
-        <w:t xml:space="preserve">/mag surge and sway dimensions, this may be more challenging. But for the </w:t>
-      </w:r>
-      <w:proofErr w:type="spellStart"/>
-      <w:r>
-        <w:t>acc</w:t>
-      </w:r>
-      <w:proofErr w:type="spellEnd"/>
-      <w:r>
-        <w:t xml:space="preserve">, you would expect greater variation in surge dimension because they stick their head to ground to forage and then stick their head back up when travelling and </w:t>
-      </w:r>
-      <w:proofErr w:type="spellStart"/>
-      <w:r>
-        <w:t>vigalence</w:t>
-      </w:r>
-      <w:proofErr w:type="spellEnd"/>
-      <w:r>
-        <w:t xml:space="preserve">, so that may help. If mag is different orientation set up to </w:t>
-      </w:r>
-      <w:proofErr w:type="spellStart"/>
-      <w:r>
-        <w:t>acc</w:t>
-      </w:r>
-      <w:proofErr w:type="spellEnd"/>
-      <w:r>
-        <w:t xml:space="preserve">, then </w:t>
-      </w:r>
-      <w:proofErr w:type="spellStart"/>
-      <w:r>
-        <w:t>its</w:t>
-      </w:r>
-      <w:proofErr w:type="spellEnd"/>
-      <w:r>
-        <w:t xml:space="preserve"> worth just checking if you switch the surge/sway orientations then which one produces most </w:t>
-      </w:r>
-      <w:proofErr w:type="spellStart"/>
-      <w:r>
-        <w:t>realsitic</w:t>
-      </w:r>
-      <w:proofErr w:type="spellEnd"/>
-      <w:r>
-        <w:t xml:space="preserve"> DR track relative to GPS... by deciphering the heave axis and dimension of measured g, you already have homed in on just a few possible orientations it could be...”</w:t>
+        <w:t>“The short answer is, yes - if a wrong ref frame was chosen then DR path wil be innacurate. But comparing subsets with GPS pre-correction will help debug if chosen orientation was correct. The patterns and directions of travel should be similar even if scale is not when compared to GPS. I had some lions where I had to 'figure' out the orientation post release. But visually it should be easy to decipher the heave axis of movmement in acc and mag (acc will be the one closest to +/-1 g most of the time, and mag will the one changing the least)... In terms of deciphering the acc/mag surge and sway dimensions, this may be more challenging. But for the acc, you would expect greater variation in surge dimension because they stick their head to ground to forage and then stick their head back up when travelling and vigalence, so that may help. If mag is different orientation set up to acc, then its worth just checking if you switch the surge/sway orientations then which one produces most realsitic DR track relative to GPS... by deciphering the heave axis and dimension of measured g, you already have homed in on just a few possible orientations it could be...”</w:t>
       </w:r>
     </w:p>
     <w:p>
@@ -5411,16 +4771,8 @@
           <w:rPr>
             <w:rStyle w:val="Hyperlink"/>
           </w:rPr>
-          <w:t xml:space="preserve">Dead-reckoning animal movements in R: a reappraisal using </w:t>
+          <w:t>Dead-reckoning animal movements in R: a reappraisal using Gundog.Tracks</w:t>
         </w:r>
-        <w:proofErr w:type="spellStart"/>
-        <w:r>
-          <w:rPr>
-            <w:rStyle w:val="Hyperlink"/>
-          </w:rPr>
-          <w:t>Gundog.Tracks</w:t>
-        </w:r>
-        <w:proofErr w:type="spellEnd"/>
       </w:hyperlink>
       <w:r>
         <w:t xml:space="preserve"> </w:t>
@@ -5481,28 +4833,36 @@
           <w:rFonts w:ascii="Cambria Math" w:hAnsi="Cambria Math"/>
         </w:rPr>
       </w:pPr>
-      <w:proofErr w:type="spellStart"/>
       <w:r>
         <w:rPr>
           <w:rFonts w:ascii="Cambria Math" w:hAnsi="Cambria Math"/>
         </w:rPr>
-        <w:t>Gundog.Tracks</w:t>
-      </w:r>
-      <w:proofErr w:type="spellEnd"/>
+        <w:t>Gundog.Tracks(TS, h, v, elv</w:t>
+      </w:r>
+      <w:r>
+        <w:rPr>
+          <w:rFonts w:ascii="Cambria Math" w:hAnsi="Cambria Math" w:cs="Arial"/>
+        </w:rPr>
+        <w:t> </w:t>
+      </w:r>
       <w:r>
         <w:rPr>
           <w:rFonts w:ascii="Cambria Math" w:hAnsi="Cambria Math"/>
         </w:rPr>
-        <w:t xml:space="preserve">(TS, h, v, </w:t>
-      </w:r>
-      <w:proofErr w:type="spellStart"/>
+        <w:t>=</w:t>
+      </w:r>
+      <w:r>
+        <w:rPr>
+          <w:rFonts w:ascii="Cambria Math" w:hAnsi="Cambria Math" w:cs="Arial"/>
+        </w:rPr>
+        <w:t> </w:t>
+      </w:r>
       <w:r>
         <w:rPr>
           <w:rFonts w:ascii="Cambria Math" w:hAnsi="Cambria Math"/>
         </w:rPr>
-        <w:t>elv</w:t>
-      </w:r>
-      <w:proofErr w:type="spellEnd"/>
+        <w:t>0, p</w:t>
+      </w:r>
       <w:r>
         <w:rPr>
           <w:rFonts w:ascii="Cambria Math" w:hAnsi="Cambria Math" w:cs="Arial"/>
@@ -5525,7 +4885,7 @@
         <w:rPr>
           <w:rFonts w:ascii="Cambria Math" w:hAnsi="Cambria Math"/>
         </w:rPr>
-        <w:t>0, p</w:t>
+        <w:t>NULL, cs</w:t>
       </w:r>
       <w:r>
         <w:rPr>
@@ -5549,7 +4909,7 @@
         <w:rPr>
           <w:rFonts w:ascii="Cambria Math" w:hAnsi="Cambria Math"/>
         </w:rPr>
-        <w:t>NULL, cs</w:t>
+        <w:t>NULL, ch</w:t>
       </w:r>
       <w:r>
         <w:rPr>
@@ -5573,16 +4933,20 @@
         <w:rPr>
           <w:rFonts w:ascii="Cambria Math" w:hAnsi="Cambria Math"/>
         </w:rPr>
-        <w:t xml:space="preserve">NULL, </w:t>
-      </w:r>
-      <w:proofErr w:type="spellStart"/>
+        <w:t>NULL, m</w:t>
+      </w:r>
+      <w:r>
+        <w:rPr>
+          <w:rFonts w:ascii="Cambria Math" w:hAnsi="Cambria Math" w:cs="Arial"/>
+        </w:rPr>
+        <w:t> </w:t>
+      </w:r>
       <w:r>
         <w:rPr>
           <w:rFonts w:ascii="Cambria Math" w:hAnsi="Cambria Math"/>
         </w:rPr>
-        <w:t>ch</w:t>
-      </w:r>
-      <w:proofErr w:type="spellEnd"/>
+        <w:t>=</w:t>
+      </w:r>
       <w:r>
         <w:rPr>
           <w:rFonts w:ascii="Cambria Math" w:hAnsi="Cambria Math" w:cs="Arial"/>
@@ -5593,6 +4957,18 @@
         <w:rPr>
           <w:rFonts w:ascii="Cambria Math" w:hAnsi="Cambria Math"/>
         </w:rPr>
+        <w:t>1, c</w:t>
+      </w:r>
+      <w:r>
+        <w:rPr>
+          <w:rFonts w:ascii="Cambria Math" w:hAnsi="Cambria Math" w:cs="Arial"/>
+        </w:rPr>
+        <w:t> </w:t>
+      </w:r>
+      <w:r>
+        <w:rPr>
+          <w:rFonts w:ascii="Cambria Math" w:hAnsi="Cambria Math"/>
+        </w:rPr>
         <w:t>=</w:t>
       </w:r>
       <w:r>
@@ -5605,7 +4981,7 @@
         <w:rPr>
           <w:rFonts w:ascii="Cambria Math" w:hAnsi="Cambria Math"/>
         </w:rPr>
-        <w:t>NULL, m</w:t>
+        <w:t>0, ME</w:t>
       </w:r>
       <w:r>
         <w:rPr>
@@ -5629,7 +5005,7 @@
         <w:rPr>
           <w:rFonts w:ascii="Cambria Math" w:hAnsi="Cambria Math"/>
         </w:rPr>
-        <w:t>1, c</w:t>
+        <w:t>1, lo</w:t>
       </w:r>
       <w:r>
         <w:rPr>
@@ -5653,7 +5029,7 @@
         <w:rPr>
           <w:rFonts w:ascii="Cambria Math" w:hAnsi="Cambria Math"/>
         </w:rPr>
-        <w:t>0, ME</w:t>
+        <w:t>0, la</w:t>
       </w:r>
       <w:r>
         <w:rPr>
@@ -5677,7 +5053,7 @@
         <w:rPr>
           <w:rFonts w:ascii="Cambria Math" w:hAnsi="Cambria Math"/>
         </w:rPr>
-        <w:t>1, lo</w:t>
+        <w:t>0, VP.lon</w:t>
       </w:r>
       <w:r>
         <w:rPr>
@@ -5701,7 +5077,7 @@
         <w:rPr>
           <w:rFonts w:ascii="Cambria Math" w:hAnsi="Cambria Math"/>
         </w:rPr>
-        <w:t>0, la</w:t>
+        <w:t>NULL, VP.lat</w:t>
       </w:r>
       <w:r>
         <w:rPr>
@@ -5725,16 +5101,20 @@
         <w:rPr>
           <w:rFonts w:ascii="Cambria Math" w:hAnsi="Cambria Math"/>
         </w:rPr>
-        <w:t xml:space="preserve">0, </w:t>
-      </w:r>
-      <w:proofErr w:type="spellStart"/>
+        <w:t>NULL, VP.ME</w:t>
+      </w:r>
+      <w:r>
+        <w:rPr>
+          <w:rFonts w:ascii="Cambria Math" w:hAnsi="Cambria Math" w:cs="Arial"/>
+        </w:rPr>
+        <w:t> </w:t>
+      </w:r>
       <w:r>
         <w:rPr>
           <w:rFonts w:ascii="Cambria Math" w:hAnsi="Cambria Math"/>
         </w:rPr>
-        <w:t>VP.lon</w:t>
-      </w:r>
-      <w:proofErr w:type="spellEnd"/>
+        <w:t>=</w:t>
+      </w:r>
       <w:r>
         <w:rPr>
           <w:rFonts w:ascii="Cambria Math" w:hAnsi="Cambria Math" w:cs="Arial"/>
@@ -5745,6 +5125,18 @@
         <w:rPr>
           <w:rFonts w:ascii="Cambria Math" w:hAnsi="Cambria Math"/>
         </w:rPr>
+        <w:t>FALSE, method</w:t>
+      </w:r>
+      <w:r>
+        <w:rPr>
+          <w:rFonts w:ascii="Cambria Math" w:hAnsi="Cambria Math" w:cs="Arial"/>
+        </w:rPr>
+        <w:t> </w:t>
+      </w:r>
+      <w:r>
+        <w:rPr>
+          <w:rFonts w:ascii="Cambria Math" w:hAnsi="Cambria Math"/>
+        </w:rPr>
         <w:t>=</w:t>
       </w:r>
       <w:r>
@@ -5757,16 +5149,20 @@
         <w:rPr>
           <w:rFonts w:ascii="Cambria Math" w:hAnsi="Cambria Math"/>
         </w:rPr>
-        <w:t xml:space="preserve">NULL, </w:t>
-      </w:r>
-      <w:proofErr w:type="spellStart"/>
+        <w:t>NULL, thresh</w:t>
+      </w:r>
+      <w:r>
+        <w:rPr>
+          <w:rFonts w:ascii="Cambria Math" w:hAnsi="Cambria Math" w:cs="Arial"/>
+        </w:rPr>
+        <w:t> </w:t>
+      </w:r>
       <w:r>
         <w:rPr>
           <w:rFonts w:ascii="Cambria Math" w:hAnsi="Cambria Math"/>
         </w:rPr>
-        <w:t>VP.lat</w:t>
-      </w:r>
-      <w:proofErr w:type="spellEnd"/>
+        <w:t>=</w:t>
+      </w:r>
       <w:r>
         <w:rPr>
           <w:rFonts w:ascii="Cambria Math" w:hAnsi="Cambria Math" w:cs="Arial"/>
@@ -5777,100 +5173,8 @@
         <w:rPr>
           <w:rFonts w:ascii="Cambria Math" w:hAnsi="Cambria Math"/>
         </w:rPr>
-        <w:t>=</w:t>
-      </w:r>
-      <w:r>
-        <w:rPr>
-          <w:rFonts w:ascii="Cambria Math" w:hAnsi="Cambria Math" w:cs="Arial"/>
-        </w:rPr>
-        <w:t> </w:t>
-      </w:r>
-      <w:r>
-        <w:rPr>
-          <w:rFonts w:ascii="Cambria Math" w:hAnsi="Cambria Math"/>
-        </w:rPr>
-        <w:t>NULL, VP.ME</w:t>
-      </w:r>
-      <w:r>
-        <w:rPr>
-          <w:rFonts w:ascii="Cambria Math" w:hAnsi="Cambria Math" w:cs="Arial"/>
-        </w:rPr>
-        <w:t> </w:t>
-      </w:r>
-      <w:r>
-        <w:rPr>
-          <w:rFonts w:ascii="Cambria Math" w:hAnsi="Cambria Math"/>
-        </w:rPr>
-        <w:t>=</w:t>
-      </w:r>
-      <w:r>
-        <w:rPr>
-          <w:rFonts w:ascii="Cambria Math" w:hAnsi="Cambria Math" w:cs="Arial"/>
-        </w:rPr>
-        <w:t> </w:t>
-      </w:r>
-      <w:r>
-        <w:rPr>
-          <w:rFonts w:ascii="Cambria Math" w:hAnsi="Cambria Math"/>
-        </w:rPr>
-        <w:t>FALSE, method</w:t>
-      </w:r>
-      <w:r>
-        <w:rPr>
-          <w:rFonts w:ascii="Cambria Math" w:hAnsi="Cambria Math" w:cs="Arial"/>
-        </w:rPr>
-        <w:t> </w:t>
-      </w:r>
-      <w:r>
-        <w:rPr>
-          <w:rFonts w:ascii="Cambria Math" w:hAnsi="Cambria Math"/>
-        </w:rPr>
-        <w:t>=</w:t>
-      </w:r>
-      <w:r>
-        <w:rPr>
-          <w:rFonts w:ascii="Cambria Math" w:hAnsi="Cambria Math" w:cs="Arial"/>
-        </w:rPr>
-        <w:t> </w:t>
-      </w:r>
-      <w:r>
-        <w:rPr>
-          <w:rFonts w:ascii="Cambria Math" w:hAnsi="Cambria Math"/>
-        </w:rPr>
-        <w:t>NULL, thresh</w:t>
-      </w:r>
-      <w:r>
-        <w:rPr>
-          <w:rFonts w:ascii="Cambria Math" w:hAnsi="Cambria Math" w:cs="Arial"/>
-        </w:rPr>
-        <w:t> </w:t>
-      </w:r>
-      <w:r>
-        <w:rPr>
-          <w:rFonts w:ascii="Cambria Math" w:hAnsi="Cambria Math"/>
-        </w:rPr>
-        <w:t>=</w:t>
-      </w:r>
-      <w:r>
-        <w:rPr>
-          <w:rFonts w:ascii="Cambria Math" w:hAnsi="Cambria Math" w:cs="Arial"/>
-        </w:rPr>
-        <w:t> </w:t>
-      </w:r>
-      <w:r>
-        <w:rPr>
-          <w:rFonts w:ascii="Cambria Math" w:hAnsi="Cambria Math"/>
-        </w:rPr>
-        <w:t xml:space="preserve">1, </w:t>
-      </w:r>
-      <w:proofErr w:type="spellStart"/>
-      <w:r>
-        <w:rPr>
-          <w:rFonts w:ascii="Cambria Math" w:hAnsi="Cambria Math"/>
-        </w:rPr>
-        <w:t>dist.step</w:t>
-      </w:r>
-      <w:proofErr w:type="spellEnd"/>
+        <w:t>1, dist.step</w:t>
+      </w:r>
       <w:r>
         <w:rPr>
           <w:rFonts w:ascii="Cambria Math" w:hAnsi="Cambria Math" w:cs="Arial"/>
@@ -6058,15 +5362,7 @@
         <w:sym w:font="Wingdings" w:char="F0E0"/>
       </w:r>
       <w:r>
-        <w:t xml:space="preserve"> okay, </w:t>
-      </w:r>
-      <w:proofErr w:type="spellStart"/>
-      <w:r>
-        <w:t>nevermind</w:t>
-      </w:r>
-      <w:proofErr w:type="spellEnd"/>
-      <w:r>
-        <w:t>, we aren’t high frequency enough for this to matter</w:t>
+        <w:t xml:space="preserve"> okay, nevermind, we aren’t high frequency enough for this to matter</w:t>
       </w:r>
     </w:p>
     <w:p>
@@ -6105,15 +5401,7 @@
         <w:ind w:left="1080"/>
       </w:pPr>
       <w:r>
-        <w:t xml:space="preserve">Within </w:t>
-      </w:r>
-      <w:proofErr w:type="spellStart"/>
-      <w:r>
-        <w:t>Gundog.Tracks</w:t>
-      </w:r>
-      <w:proofErr w:type="spellEnd"/>
-      <w:r>
-        <w:t>, the user can modulate m, c and ME values to switch between predetermined speed (m</w:t>
+        <w:t>Within Gundog.Tracks, the user can modulate m, c and ME values to switch between predetermined speed (m</w:t>
       </w:r>
       <w:r>
         <w:rPr>
@@ -6219,15 +5507,7 @@
         <w:ind w:left="1080"/>
       </w:pPr>
       <w:r>
-        <w:t xml:space="preserve">Here an </w:t>
-      </w:r>
-      <w:proofErr w:type="spellStart"/>
-      <w:r>
-        <w:t>an</w:t>
-      </w:r>
-      <w:proofErr w:type="spellEnd"/>
-      <w:r>
-        <w:t xml:space="preserve"> example from his data that shows the expected error… if he’s using it in the paper then it must be considered good:</w:t>
+        <w:t>Here an an example from his data that shows the expected error… if he’s using it in the paper then it must be considered good:</w:t>
       </w:r>
     </w:p>
     <w:p>
@@ -6235,6 +5515,9 @@
         <w:jc w:val="center"/>
       </w:pPr>
       <w:r>
+        <w:rPr>
+          <w:noProof/>
+        </w:rPr>
         <w:drawing>
           <wp:inline distT="0" distB="0" distL="0" distR="0" wp14:anchorId="2297B6E0" wp14:editId="5DC98267">
             <wp:extent cx="2747335" cy="2362200"/>
@@ -6285,6 +5568,9 @@
         </w:drawing>
       </w:r>
       <w:r>
+        <w:rPr>
+          <w:noProof/>
+        </w:rPr>
         <w:drawing>
           <wp:inline distT="0" distB="0" distL="0" distR="0" wp14:anchorId="778DD631" wp14:editId="175F0C44">
             <wp:extent cx="2333625" cy="2420271"/>
@@ -6403,21 +5689,7 @@
         <w:rPr>
           <w:highlight w:val="yellow"/>
         </w:rPr>
-        <w:t xml:space="preserve">Should I be </w:t>
-      </w:r>
-      <w:proofErr w:type="spellStart"/>
-      <w:r>
-        <w:rPr>
-          <w:highlight w:val="yellow"/>
-        </w:rPr>
-        <w:t>downsampling</w:t>
-      </w:r>
-      <w:proofErr w:type="spellEnd"/>
-      <w:r>
-        <w:rPr>
-          <w:highlight w:val="yellow"/>
-        </w:rPr>
-        <w:t xml:space="preserve"> my accelerometer? Have I missed that?</w:t>
+        <w:t>Should I be downsampling my accelerometer? Have I missed that?</w:t>
       </w:r>
     </w:p>
     <w:p>
@@ -6535,15 +5807,7 @@
         <w:ind w:left="1080"/>
       </w:pPr>
       <w:r>
-        <w:t xml:space="preserve">We recommend implementing a running mean (cf. Eq. 1, R1:4) to raw </w:t>
-      </w:r>
-      <w:proofErr w:type="spellStart"/>
-      <w:r>
-        <w:t>VeDBA</w:t>
-      </w:r>
-      <w:proofErr w:type="spellEnd"/>
-      <w:r>
-        <w:t xml:space="preserve"> values to ensure that both acceleration and deceleration components of a stride cycle are incorporated together per unit time and to reduce the magnitude of small temporal spikes</w:t>
+        <w:t>We recommend implementing a running mean (cf. Eq. 1, R1:4) to raw VeDBA values to ensure that both acceleration and deceleration components of a stride cycle are incorporated together per unit time and to reduce the magnitude of small temporal spikes</w:t>
       </w:r>
     </w:p>
     <w:p>
@@ -6722,6 +5986,9 @@
         <w:jc w:val="center"/>
       </w:pPr>
       <w:r>
+        <w:rPr>
+          <w:noProof/>
+        </w:rPr>
         <w:drawing>
           <wp:inline distT="0" distB="0" distL="0" distR="0" wp14:anchorId="593273F3" wp14:editId="4F19CD56">
             <wp:extent cx="4927600" cy="1676400"/>
@@ -6831,6 +6098,9 @@
         <w:jc w:val="center"/>
       </w:pPr>
       <w:r>
+        <w:rPr>
+          <w:noProof/>
+        </w:rPr>
         <w:lastRenderedPageBreak/>
         <w:drawing>
           <wp:inline distT="0" distB="0" distL="0" distR="0" wp14:anchorId="18761DBC" wp14:editId="065F80D4">
@@ -6905,13 +6175,8 @@
           </w:tcPr>
           <w:p>
             <w:r>
-              <w:t xml:space="preserve">X </w:t>
+              <w:t>X acc</w:t>
             </w:r>
-            <w:proofErr w:type="spellStart"/>
-            <w:r>
-              <w:t>acc</w:t>
-            </w:r>
-            <w:proofErr w:type="spellEnd"/>
           </w:p>
         </w:tc>
         <w:tc>
@@ -6955,13 +6220,8 @@
           </w:tcPr>
           <w:p>
             <w:r>
-              <w:t xml:space="preserve">Y </w:t>
+              <w:t>Y acc</w:t>
             </w:r>
-            <w:proofErr w:type="spellStart"/>
-            <w:r>
-              <w:t>acc</w:t>
-            </w:r>
-            <w:proofErr w:type="spellEnd"/>
           </w:p>
         </w:tc>
         <w:tc>
@@ -7005,13 +6265,8 @@
           </w:tcPr>
           <w:p>
             <w:r>
-              <w:t xml:space="preserve">Z </w:t>
+              <w:t>Z acc</w:t>
             </w:r>
-            <w:proofErr w:type="spellStart"/>
-            <w:r>
-              <w:t>acc</w:t>
-            </w:r>
-            <w:proofErr w:type="spellEnd"/>
           </w:p>
         </w:tc>
         <w:tc>
@@ -7179,15 +6434,7 @@
         </w:numPr>
       </w:pPr>
       <w:r>
-        <w:t>I then tried to verify this by looking at the accelerometer data when the animal was standing up (ground-</w:t>
-      </w:r>
-      <w:proofErr w:type="spellStart"/>
-      <w:r>
-        <w:t>truthed</w:t>
-      </w:r>
-      <w:proofErr w:type="spellEnd"/>
-      <w:r>
-        <w:t xml:space="preserve"> with video). Red is X, Blue is Y, Green is Z. When the animal is standing up, the X axis has close to 0 gravity. The gravity is shared over the Y and Z, with the most on the Z. This indicates that the collar is tipped forwards. </w:t>
+        <w:t xml:space="preserve">I then tried to verify this by looking at the accelerometer data when the animal was standing up (ground-truthed with video). Red is X, Blue is Y, Green is Z. When the animal is standing up, the X axis has close to 0 gravity. The gravity is shared over the Y and Z, with the most on the Z. This indicates that the collar is tipped forwards. </w:t>
       </w:r>
     </w:p>
     <w:p>
@@ -7195,6 +6442,9 @@
         <w:jc w:val="center"/>
       </w:pPr>
       <w:r>
+        <w:rPr>
+          <w:noProof/>
+        </w:rPr>
         <w:drawing>
           <wp:inline distT="0" distB="0" distL="0" distR="0" wp14:anchorId="18DDFC17" wp14:editId="171CC53E">
             <wp:extent cx="4931492" cy="1677725"/>
@@ -7343,15 +6593,7 @@
         </w:numPr>
       </w:pPr>
       <w:r>
-        <w:t xml:space="preserve">Therefore, I propose the orientation is: </w:t>
-      </w:r>
-      <w:proofErr w:type="spellStart"/>
-      <w:r>
-        <w:t>acc</w:t>
-      </w:r>
-      <w:proofErr w:type="spellEnd"/>
-      <w:r>
-        <w:t xml:space="preserve"> EUS, mag EDN, gravity down, and a pitch forward of about 48 degrees…</w:t>
+        <w:t>Therefore, I propose the orientation is: acc EUS, mag EDN, gravity down, and a pitch forward of about 48 degrees…</w:t>
       </w:r>
     </w:p>
     <w:p>
@@ -7372,6 +6614,9 @@
         <w:jc w:val="center"/>
       </w:pPr>
       <w:r>
+        <w:rPr>
+          <w:noProof/>
+        </w:rPr>
         <w:lastRenderedPageBreak/>
         <w:drawing>
           <wp:inline distT="0" distB="0" distL="0" distR="0" wp14:anchorId="71D766C5" wp14:editId="3D52BA60">
@@ -7487,6 +6732,9 @@
         <w:jc w:val="center"/>
       </w:pPr>
       <w:r>
+        <w:rPr>
+          <w:noProof/>
+        </w:rPr>
         <w:drawing>
           <wp:inline distT="0" distB="0" distL="0" distR="0" wp14:anchorId="30C8FAE7" wp14:editId="506C422B">
             <wp:extent cx="2656552" cy="2562096"/>
@@ -7620,15 +6868,7 @@
         <w:t>I have seen information about the Median Filter come up</w:t>
       </w:r>
       <w:r>
-        <w:t xml:space="preserve">… </w:t>
-      </w:r>
-      <w:proofErr w:type="spellStart"/>
-      <w:r>
-        <w:t>trialing</w:t>
-      </w:r>
-      <w:proofErr w:type="spellEnd"/>
-      <w:r>
-        <w:t xml:space="preserve"> that now.</w:t>
+        <w:t>… trialing that now.</w:t>
       </w:r>
     </w:p>
     <w:p>
@@ -7648,6 +6888,9 @@
         <w:jc w:val="center"/>
       </w:pPr>
       <w:r>
+        <w:rPr>
+          <w:noProof/>
+        </w:rPr>
         <w:drawing>
           <wp:inline distT="0" distB="0" distL="0" distR="0" wp14:anchorId="49F2B9D8" wp14:editId="06A7D6C7">
             <wp:extent cx="2518914" cy="856950"/>
@@ -7695,6 +6938,9 @@
         </w:drawing>
       </w:r>
       <w:r>
+        <w:rPr>
+          <w:noProof/>
+        </w:rPr>
         <w:drawing>
           <wp:inline distT="0" distB="0" distL="0" distR="0" wp14:anchorId="5912487A" wp14:editId="6907E238">
             <wp:extent cx="2579299" cy="877494"/>
@@ -7747,6 +6993,9 @@
         <w:jc w:val="center"/>
       </w:pPr>
       <w:r>
+        <w:rPr>
+          <w:noProof/>
+        </w:rPr>
         <w:drawing>
           <wp:inline distT="0" distB="0" distL="0" distR="0" wp14:anchorId="37AEADBE" wp14:editId="37A86CF9">
             <wp:extent cx="2307436" cy="785004"/>
@@ -7794,6 +7043,9 @@
         </w:drawing>
       </w:r>
       <w:r>
+        <w:rPr>
+          <w:noProof/>
+        </w:rPr>
         <w:drawing>
           <wp:inline distT="0" distB="0" distL="0" distR="0" wp14:anchorId="670A114F" wp14:editId="19E90FD8">
             <wp:extent cx="2449902" cy="833472"/>
@@ -7859,6 +7111,9 @@
         <w:jc w:val="center"/>
       </w:pPr>
       <w:r>
+        <w:rPr>
+          <w:noProof/>
+        </w:rPr>
         <w:drawing>
           <wp:inline distT="0" distB="0" distL="0" distR="0" wp14:anchorId="4983CDA7" wp14:editId="41F3FEAB">
             <wp:extent cx="5272202" cy="1793636"/>
@@ -7926,6 +7181,9 @@
         <w:jc w:val="center"/>
       </w:pPr>
       <w:r>
+        <w:rPr>
+          <w:noProof/>
+        </w:rPr>
         <mc:AlternateContent>
           <mc:Choice Requires="wps">
             <w:drawing>
@@ -7999,6 +7257,9 @@
         </mc:AlternateContent>
       </w:r>
       <w:r>
+        <w:rPr>
+          <w:noProof/>
+        </w:rPr>
         <w:drawing>
           <wp:inline distT="0" distB="0" distL="0" distR="0" wp14:anchorId="3F531540" wp14:editId="6EBB7AFF">
             <wp:extent cx="5122545" cy="2076450"/>
@@ -8117,6 +7378,9 @@
         </w:rPr>
       </w:pPr>
       <w:r>
+        <w:rPr>
+          <w:noProof/>
+        </w:rPr>
         <w:drawing>
           <wp:inline distT="0" distB="0" distL="0" distR="0" wp14:anchorId="10F5F18D" wp14:editId="519F0B5E">
             <wp:extent cx="3458216" cy="2475186"/>
@@ -8163,15 +7427,7 @@
         </w:numPr>
       </w:pPr>
       <w:r>
-        <w:t xml:space="preserve">I have put message in chat to get </w:t>
-      </w:r>
-      <w:proofErr w:type="spellStart"/>
-      <w:r>
-        <w:t>ChrisB</w:t>
-      </w:r>
-      <w:proofErr w:type="spellEnd"/>
-      <w:r>
-        <w:t xml:space="preserve"> thoughts but in the meantime I will work towards what I think the next step will be: finding all the misread sections and removing them. Similar to the kangaroo data (though that’s worse), we have to go through and chop up the data into good sections with NA’s in between</w:t>
+        <w:t>I have put message in chat to get ChrisB thoughts but in the meantime I will work towards what I think the next step will be: finding all the misread sections and removing them. Similar to the kangaroo data (though that’s worse), we have to go through and chop up the data into good sections with NA’s in between</w:t>
       </w:r>
       <w:r>
         <w:t>?</w:t>
@@ -8258,6 +7514,9 @@
         <w:jc w:val="center"/>
       </w:pPr>
       <w:r>
+        <w:rPr>
+          <w:noProof/>
+        </w:rPr>
         <w:drawing>
           <wp:inline distT="0" distB="0" distL="0" distR="0" wp14:anchorId="179C742E" wp14:editId="3526751C">
             <wp:extent cx="4489314" cy="2028825"/>
@@ -8326,6 +7585,9 @@
         <w:jc w:val="center"/>
       </w:pPr>
       <w:r>
+        <w:rPr>
+          <w:noProof/>
+        </w:rPr>
         <w:drawing>
           <wp:inline distT="0" distB="0" distL="0" distR="0" wp14:anchorId="561FE1A2" wp14:editId="7CF4F3A7">
             <wp:extent cx="4405957" cy="2155248"/>
@@ -8372,15 +7634,7 @@
         </w:numPr>
       </w:pPr>
       <w:r>
-        <w:t xml:space="preserve">Then </w:t>
-      </w:r>
-      <w:proofErr w:type="spellStart"/>
-      <w:r>
-        <w:t>ChrisB</w:t>
-      </w:r>
-      <w:proofErr w:type="spellEnd"/>
-      <w:r>
-        <w:t xml:space="preserve"> pointed out that this was happening over hours not minutes, and is therefore more likely to be sleeping. He said “</w:t>
+        <w:t>Then ChrisB pointed out that this was happening over hours not minutes, and is therefore more likely to be sleeping. He said “</w:t>
       </w:r>
       <w:r>
         <w:rPr>
@@ -8389,15 +7643,7 @@
         <w:t>In that static accelerometer region it's likely just measuring gravity, but if the rotation of the collar isn't pointing the right way it will see that as an acceleration in the wrong direction and pick that up as movement”</w:t>
       </w:r>
       <w:r>
-        <w:t xml:space="preserve">. </w:t>
-      </w:r>
-      <w:proofErr w:type="spellStart"/>
-      <w:r>
-        <w:t>Ahhhh</w:t>
-      </w:r>
-      <w:proofErr w:type="spellEnd"/>
-      <w:r>
-        <w:t xml:space="preserve"> brilliant man has saved me once again. So if I can detect that as sleeping then I can set to no movement and no DR during that period. </w:t>
+        <w:t xml:space="preserve">. Ahhhh brilliant man has saved me once again. So if I can detect that as sleeping then I can set to no movement and no DR during that period. </w:t>
       </w:r>
     </w:p>
     <w:p>
@@ -8423,6 +7669,9 @@
         <w:jc w:val="center"/>
       </w:pPr>
       <w:r>
+        <w:rPr>
+          <w:noProof/>
+        </w:rPr>
         <w:drawing>
           <wp:inline distT="0" distB="0" distL="0" distR="0" wp14:anchorId="121F9FD6" wp14:editId="7D0112EC">
             <wp:extent cx="2354239" cy="1508230"/>
@@ -8470,6 +7719,9 @@
         </w:drawing>
       </w:r>
       <w:r>
+        <w:rPr>
+          <w:noProof/>
+        </w:rPr>
         <w:drawing>
           <wp:inline distT="0" distB="0" distL="0" distR="0" wp14:anchorId="0F4741C4" wp14:editId="2A3445CD">
             <wp:extent cx="3036626" cy="1413084"/>
@@ -8538,15 +7790,7 @@
         <w:sym w:font="Wingdings" w:char="F0E0"/>
       </w:r>
       <w:r>
-        <w:t xml:space="preserve"> </w:t>
-      </w:r>
-      <w:proofErr w:type="spellStart"/>
-      <w:r>
-        <w:t>ifelse</w:t>
-      </w:r>
-      <w:proofErr w:type="spellEnd"/>
-      <w:r>
-        <w:t>(VDBA.sm &gt; 0.015, 0, 1) &amp; most common level in 60 seconds (3000 samples)</w:t>
+        <w:t xml:space="preserve"> ifelse(VDBA.sm &gt; 0.015, 0, 1) &amp; most common level in 60 seconds (3000 samples)</w:t>
       </w:r>
       <w:r>
         <w:t>)</w:t>
@@ -8564,15 +7808,7 @@
         <w:t xml:space="preserve">Testing that </w:t>
       </w:r>
       <w:r>
-        <w:t xml:space="preserve">however showed no difference and the </w:t>
-      </w:r>
-      <w:proofErr w:type="spellStart"/>
-      <w:r>
-        <w:t>gps</w:t>
-      </w:r>
-      <w:proofErr w:type="spellEnd"/>
-      <w:r>
-        <w:t xml:space="preserve"> is moving consistently through the period???</w:t>
+        <w:t>however showed no difference and the gps is moving consistently through the period???</w:t>
       </w:r>
     </w:p>
     <w:p>
@@ -8580,6 +7816,9 @@
         <w:pStyle w:val="ListParagraph"/>
       </w:pPr>
       <w:r>
+        <w:rPr>
+          <w:noProof/>
+        </w:rPr>
         <w:drawing>
           <wp:inline distT="0" distB="0" distL="0" distR="0" wp14:anchorId="0653604C" wp14:editId="684FE08B">
             <wp:extent cx="2859206" cy="1330522"/>
@@ -8627,6 +7866,9 @@
         </w:drawing>
       </w:r>
       <w:r>
+        <w:rPr>
+          <w:noProof/>
+        </w:rPr>
         <w:drawing>
           <wp:inline distT="0" distB="0" distL="0" distR="0" wp14:anchorId="07617C9B" wp14:editId="5A178273">
             <wp:extent cx="2936652" cy="1366561"/>
@@ -8731,6 +7973,9 @@
         <w:jc w:val="center"/>
       </w:pPr>
       <w:r>
+        <w:rPr>
+          <w:noProof/>
+        </w:rPr>
         <w:drawing>
           <wp:inline distT="0" distB="0" distL="0" distR="0" wp14:anchorId="1BABE6AD" wp14:editId="59048EE3">
             <wp:extent cx="2851150" cy="2382294"/>
@@ -8803,15 +8048,7 @@
         </w:numPr>
       </w:pPr>
       <w:r>
-        <w:t xml:space="preserve">Firstly I continued with the cleaning by adding a lowpass </w:t>
-      </w:r>
-      <w:proofErr w:type="spellStart"/>
-      <w:r>
-        <w:t>butterworth</w:t>
-      </w:r>
-      <w:proofErr w:type="spellEnd"/>
-      <w:r>
-        <w:t xml:space="preserve"> filter with a cutoff of 10Hz. The results of the 3 steps of smoothing shown in right plot below.</w:t>
+        <w:t>Firstly I continued with the cleaning by adding a lowpass butterworth filter with a cutoff of 10Hz. The results of the 3 steps of smoothing shown in right plot below.</w:t>
       </w:r>
     </w:p>
     <w:p>
@@ -8819,6 +8056,9 @@
         <w:jc w:val="center"/>
       </w:pPr>
       <w:r>
+        <w:rPr>
+          <w:noProof/>
+        </w:rPr>
         <w:drawing>
           <wp:inline distT="0" distB="0" distL="0" distR="0" wp14:anchorId="2EE48A98" wp14:editId="50652237">
             <wp:extent cx="2755534" cy="1831729"/>
@@ -8866,6 +8106,9 @@
         </w:drawing>
       </w:r>
       <w:r>
+        <w:rPr>
+          <w:noProof/>
+        </w:rPr>
         <w:drawing>
           <wp:inline distT="0" distB="0" distL="0" distR="0" wp14:anchorId="6AE11778" wp14:editId="203BEB71">
             <wp:extent cx="2721935" cy="1809395"/>
@@ -8940,15 +8183,7 @@
         <w:t>For example, in this case, there are 2 stationary periods where there should be no GPS changes.</w:t>
       </w:r>
       <w:r>
-        <w:t xml:space="preserve"> The dark blue dots in the </w:t>
-      </w:r>
-      <w:proofErr w:type="spellStart"/>
-      <w:r>
-        <w:t>gps</w:t>
-      </w:r>
-      <w:proofErr w:type="spellEnd"/>
-      <w:r>
-        <w:t xml:space="preserve"> graph right show the stationary periods. The green dots are what got fed to the spline and the red is the spline path.</w:t>
+        <w:t xml:space="preserve"> The dark blue dots in the gps graph right show the stationary periods. The green dots are what got fed to the spline and the red is the spline path.</w:t>
       </w:r>
       <w:r>
         <w:t xml:space="preserve"> Note there are only 2 black dots because all the stationary got grouped.</w:t>
@@ -8959,6 +8194,9 @@
         <w:jc w:val="center"/>
       </w:pPr>
       <w:r>
+        <w:rPr>
+          <w:noProof/>
+        </w:rPr>
         <w:lastRenderedPageBreak/>
         <w:drawing>
           <wp:inline distT="0" distB="0" distL="0" distR="0" wp14:anchorId="40446698" wp14:editId="16FE6B86">
@@ -9007,6 +8245,9 @@
         </w:drawing>
       </w:r>
       <w:r>
+        <w:rPr>
+          <w:noProof/>
+        </w:rPr>
         <w:drawing>
           <wp:inline distT="0" distB="0" distL="0" distR="0" wp14:anchorId="6120FC7D" wp14:editId="124504EB">
             <wp:extent cx="2392326" cy="1284332"/>
@@ -9086,6 +8327,9 @@
         <w:jc w:val="center"/>
       </w:pPr>
       <w:r>
+        <w:rPr>
+          <w:noProof/>
+        </w:rPr>
         <w:drawing>
           <wp:inline distT="0" distB="0" distL="0" distR="0" wp14:anchorId="1C7629D8" wp14:editId="43D74DB3">
             <wp:extent cx="5712650" cy="2211185"/>
@@ -9150,6 +8394,9 @@
     </w:p>
     <w:p>
       <w:r>
+        <w:rPr>
+          <w:noProof/>
+        </w:rPr>
         <w:drawing>
           <wp:inline distT="0" distB="0" distL="0" distR="0" wp14:anchorId="6C3EAFDB" wp14:editId="2E546024">
             <wp:extent cx="6858000" cy="2821940"/>
@@ -9196,15 +8443,7 @@
         </w:numPr>
       </w:pPr>
       <w:r>
-        <w:t xml:space="preserve">Then </w:t>
-      </w:r>
-      <w:proofErr w:type="spellStart"/>
-      <w:r>
-        <w:t>ChrisB</w:t>
-      </w:r>
-      <w:proofErr w:type="spellEnd"/>
-      <w:r>
-        <w:t xml:space="preserve"> helped me for a few hours, figuring out many things. For example, he found that everything was scaled by 4 because the settings of the accelerometer weren’t what I thought. (They were 16 for the kangaroos but 4 for the impala) </w:t>
+        <w:t xml:space="preserve">Then ChrisB helped me for a few hours, figuring out many things. For example, he found that everything was scaled by 4 because the settings of the accelerometer weren’t what I thought. (They were 16 for the kangaroos but 4 for the impala) </w:t>
       </w:r>
     </w:p>
     <w:p>
@@ -9226,8 +8465,11 @@
         <w:jc w:val="center"/>
       </w:pPr>
       <w:r>
+        <w:rPr>
+          <w:noProof/>
+        </w:rPr>
         <w:drawing>
-          <wp:inline distT="0" distB="0" distL="0" distR="0" wp14:anchorId="5A369B01" wp14:editId="7FEF70C2">
+          <wp:inline distT="0" distB="0" distL="0" distR="0" wp14:anchorId="5A369B01" wp14:editId="7F51EBAC">
             <wp:extent cx="3370239" cy="2741078"/>
             <wp:effectExtent l="0" t="0" r="1905" b="2540"/>
             <wp:docPr id="745835413" name="Picture 11"/>
@@ -9294,15 +8536,7 @@
         </w:numPr>
       </w:pPr>
       <w:r>
-        <w:t xml:space="preserve">Chris Bird also doesn’t believe in tilt-corrected accelerometer based DR and thinks we should have to use the gyroscope (pronounced </w:t>
-      </w:r>
-      <w:proofErr w:type="spellStart"/>
-      <w:r>
-        <w:t>guyroscope</w:t>
-      </w:r>
-      <w:proofErr w:type="spellEnd"/>
-      <w:r>
-        <w:t>… as I learnt today)</w:t>
+        <w:t>Chris Bird also doesn’t believe in tilt-corrected accelerometer based DR and thinks we should have to use the gyroscope (pronounced guyroscope… as I learnt today)</w:t>
       </w:r>
     </w:p>
     <w:p>
@@ -9346,39 +8580,7 @@
           <w:i/>
           <w:iCs/>
         </w:rPr>
-        <w:t xml:space="preserve">The short answer is, yes - if a wrong ref frame was chosen then DR path </w:t>
-      </w:r>
-      <w:proofErr w:type="spellStart"/>
-      <w:r>
-        <w:rPr>
-          <w:i/>
-          <w:iCs/>
-        </w:rPr>
-        <w:t>wil</w:t>
-      </w:r>
-      <w:proofErr w:type="spellEnd"/>
-      <w:r>
-        <w:rPr>
-          <w:i/>
-          <w:iCs/>
-        </w:rPr>
-        <w:t xml:space="preserve"> be </w:t>
-      </w:r>
-      <w:proofErr w:type="spellStart"/>
-      <w:r>
-        <w:rPr>
-          <w:i/>
-          <w:iCs/>
-        </w:rPr>
-        <w:t>innacurate</w:t>
-      </w:r>
-      <w:proofErr w:type="spellEnd"/>
-      <w:r>
-        <w:rPr>
-          <w:i/>
-          <w:iCs/>
-        </w:rPr>
-        <w:t xml:space="preserve">. But comparing subsets with GPS pre-correction will help debug if chosen orientation was correct. The patterns and directions of travel should be similar even if scale is not when compared to GPS. I had some lions where I had to 'figure' out the orientation post release. But visually it should be easy to decipher the </w:t>
+        <w:t xml:space="preserve">The short answer is, yes - if a wrong ref frame was chosen then DR path wil be innacurate. But comparing subsets with GPS pre-correction will help debug if chosen orientation was correct. The patterns and directions of travel should be similar even if scale is not when compared to GPS. I had some lions where I had to 'figure' out the orientation post release. But visually it should be easy to decipher the </w:t>
       </w:r>
       <w:r>
         <w:rPr>
@@ -9386,164 +8588,44 @@
           <w:iCs/>
           <w:highlight w:val="green"/>
         </w:rPr>
-        <w:t xml:space="preserve">heave axis of </w:t>
-      </w:r>
-      <w:proofErr w:type="spellStart"/>
+        <w:t>heave axis of movmement</w:t>
+      </w:r>
+      <w:r>
+        <w:rPr>
+          <w:i/>
+          <w:iCs/>
+        </w:rPr>
+        <w:t xml:space="preserve"> in acc and mag (</w:t>
+      </w:r>
       <w:r>
         <w:rPr>
           <w:i/>
           <w:iCs/>
           <w:highlight w:val="green"/>
         </w:rPr>
-        <w:t>movmement</w:t>
-      </w:r>
-      <w:proofErr w:type="spellEnd"/>
+        <w:t>acc will be the one closest to +/-1 g most of the time, and mag will the one changing the least</w:t>
+      </w:r>
       <w:r>
         <w:rPr>
           <w:i/>
           <w:iCs/>
         </w:rPr>
-        <w:t xml:space="preserve"> in </w:t>
-      </w:r>
-      <w:proofErr w:type="spellStart"/>
-      <w:r>
-        <w:rPr>
-          <w:i/>
-          <w:iCs/>
-        </w:rPr>
-        <w:t>acc</w:t>
-      </w:r>
-      <w:proofErr w:type="spellEnd"/>
-      <w:r>
-        <w:rPr>
-          <w:i/>
-          <w:iCs/>
-        </w:rPr>
-        <w:t xml:space="preserve"> and mag (</w:t>
-      </w:r>
-      <w:proofErr w:type="spellStart"/>
-      <w:r>
-        <w:rPr>
-          <w:i/>
-          <w:iCs/>
-          <w:highlight w:val="green"/>
-        </w:rPr>
-        <w:t>acc</w:t>
-      </w:r>
-      <w:proofErr w:type="spellEnd"/>
-      <w:r>
-        <w:rPr>
-          <w:i/>
-          <w:iCs/>
-          <w:highlight w:val="green"/>
-        </w:rPr>
-        <w:t xml:space="preserve"> will be the one closest to +/-1 g most of the time, and mag will the one changing the least</w:t>
-      </w:r>
-      <w:r>
-        <w:rPr>
-          <w:i/>
-          <w:iCs/>
-        </w:rPr>
-        <w:t xml:space="preserve">)... In terms of deciphering the </w:t>
-      </w:r>
-      <w:proofErr w:type="spellStart"/>
-      <w:r>
-        <w:rPr>
-          <w:i/>
-          <w:iCs/>
-        </w:rPr>
-        <w:t>acc</w:t>
-      </w:r>
-      <w:proofErr w:type="spellEnd"/>
-      <w:r>
-        <w:rPr>
-          <w:i/>
-          <w:iCs/>
-        </w:rPr>
-        <w:t xml:space="preserve">/mag surge and sway dimensions, this may be more challenging. But for the </w:t>
-      </w:r>
-      <w:proofErr w:type="spellStart"/>
+        <w:t xml:space="preserve">)... In terms of deciphering the acc/mag surge and sway dimensions, this may be more challenging. But for the </w:t>
+      </w:r>
       <w:r>
         <w:rPr>
           <w:i/>
           <w:iCs/>
           <w:highlight w:val="yellow"/>
         </w:rPr>
-        <w:t>acc</w:t>
-      </w:r>
-      <w:proofErr w:type="spellEnd"/>
+        <w:t>acc, you would expect greater variation in surge dimension because they stick their head to ground to forage and then stick their head back up when travelling and vigalence</w:t>
+      </w:r>
       <w:r>
         <w:rPr>
           <w:i/>
           <w:iCs/>
-          <w:highlight w:val="yellow"/>
-        </w:rPr>
-        <w:t xml:space="preserve">, you would expect greater variation in surge dimension because they stick their head to ground to forage and then stick their head back up when travelling and </w:t>
-      </w:r>
-      <w:proofErr w:type="spellStart"/>
-      <w:r>
-        <w:rPr>
-          <w:i/>
-          <w:iCs/>
-          <w:highlight w:val="yellow"/>
-        </w:rPr>
-        <w:t>vigalence</w:t>
-      </w:r>
-      <w:proofErr w:type="spellEnd"/>
-      <w:r>
-        <w:rPr>
-          <w:i/>
-          <w:iCs/>
-        </w:rPr>
-        <w:t xml:space="preserve">, so that may help. If mag is different orientation set up to </w:t>
-      </w:r>
-      <w:proofErr w:type="spellStart"/>
-      <w:r>
-        <w:rPr>
-          <w:i/>
-          <w:iCs/>
-        </w:rPr>
-        <w:t>acc</w:t>
-      </w:r>
-      <w:proofErr w:type="spellEnd"/>
-      <w:r>
-        <w:rPr>
-          <w:i/>
-          <w:iCs/>
-        </w:rPr>
-        <w:t xml:space="preserve">, then </w:t>
-      </w:r>
-      <w:proofErr w:type="spellStart"/>
-      <w:r>
-        <w:rPr>
-          <w:i/>
-          <w:iCs/>
-        </w:rPr>
-        <w:t>its</w:t>
-      </w:r>
-      <w:proofErr w:type="spellEnd"/>
-      <w:r>
-        <w:rPr>
-          <w:i/>
-          <w:iCs/>
-        </w:rPr>
-        <w:t xml:space="preserve"> worth just checking if you switch the surge/sway orientations then which one produces most </w:t>
-      </w:r>
-      <w:proofErr w:type="spellStart"/>
-      <w:r>
-        <w:rPr>
-          <w:i/>
-          <w:iCs/>
-        </w:rPr>
-        <w:t>realsitic</w:t>
-      </w:r>
-      <w:proofErr w:type="spellEnd"/>
-      <w:r>
-        <w:rPr>
-          <w:i/>
-          <w:iCs/>
-        </w:rPr>
-        <w:t xml:space="preserve"> DR track relative to GPS... by deciphering the heave axis and dimension of measured g, you already have homed in on just a few possible orientations it could be...</w:t>
+        </w:rPr>
+        <w:t>, so that may help. If mag is different orientation set up to acc, then its worth just checking if you switch the surge/sway orientations then which one produces most realsitic DR track relative to GPS... by deciphering the heave axis and dimension of measured g, you already have homed in on just a few possible orientations it could be...</w:t>
       </w:r>
     </w:p>
     <w:p>
@@ -9564,6 +8646,9 @@
     </w:p>
     <w:p>
       <w:r>
+        <w:rPr>
+          <w:noProof/>
+        </w:rPr>
         <w:lastRenderedPageBreak/>
         <w:drawing>
           <wp:inline distT="0" distB="0" distL="0" distR="0" wp14:anchorId="2FFBE73A" wp14:editId="2DD9D372">
@@ -9589,6 +8674,9 @@
         <w:t xml:space="preserve"> </w:t>
       </w:r>
       <w:r>
+        <w:rPr>
+          <w:noProof/>
+        </w:rPr>
         <w:drawing>
           <wp:inline distT="0" distB="0" distL="0" distR="0" wp14:anchorId="7FA8B3B3" wp14:editId="587C394B">
             <wp:extent cx="3179928" cy="2811439"/>
@@ -9723,29 +8811,8 @@
           <w:numId w:val="2"/>
         </w:numPr>
       </w:pPr>
-      <w:proofErr w:type="spellStart"/>
-      <w:r>
-        <w:t>acc_orientation</w:t>
-      </w:r>
-      <w:proofErr w:type="spellEnd"/>
-      <w:r>
-        <w:t xml:space="preserve"> &lt;- "NWU",   </w:t>
-      </w:r>
-      <w:proofErr w:type="spellStart"/>
-      <w:r>
-        <w:t>mag_orientation</w:t>
-      </w:r>
-      <w:proofErr w:type="spellEnd"/>
-      <w:r>
-        <w:t xml:space="preserve"> &lt;- "NED",   </w:t>
-      </w:r>
-      <w:proofErr w:type="spellStart"/>
-      <w:r>
-        <w:t>gravity_direction</w:t>
-      </w:r>
-      <w:proofErr w:type="spellEnd"/>
-      <w:r>
-        <w:t xml:space="preserve"> &lt;- "down",   pitch &lt;- 0#-48</w:t>
+      <w:r>
+        <w:t>acc_orientation &lt;- "NWU",   mag_orientation &lt;- "NED",   gravity_direction &lt;- "down",   pitch &lt;- 0#-48</w:t>
       </w:r>
     </w:p>
     <w:p>
@@ -9753,6 +8820,9 @@
         <w:jc w:val="center"/>
       </w:pPr>
       <w:r>
+        <w:rPr>
+          <w:noProof/>
+        </w:rPr>
         <w:drawing>
           <wp:inline distT="0" distB="0" distL="0" distR="0" wp14:anchorId="5E38BB50" wp14:editId="4782C31E">
             <wp:extent cx="4114047" cy="3480179"/>
@@ -9867,6 +8937,9 @@
         <w:jc w:val="center"/>
       </w:pPr>
       <w:r>
+        <w:rPr>
+          <w:noProof/>
+        </w:rPr>
         <w:drawing>
           <wp:inline distT="0" distB="0" distL="0" distR="0" wp14:anchorId="3AF1AF19" wp14:editId="2D5960D2">
             <wp:extent cx="3591283" cy="2975113"/>
@@ -9909,13 +8982,7 @@
         <w:pStyle w:val="Heading2"/>
       </w:pPr>
       <w:r>
-        <w:t>Rescaling</w:t>
-      </w:r>
-      <w:r>
-        <w:t xml:space="preserve"> and Reorienting</w:t>
-      </w:r>
-      <w:r>
-        <w:t xml:space="preserve"> the Data</w:t>
+        <w:t>Checking Data Scale and Orientation</w:t>
       </w:r>
     </w:p>
     <w:p>
@@ -9929,13 +8996,7 @@
         <w:rPr>
           <w:rFonts w:cs="Arial"/>
         </w:rPr>
-        <w:t>12</w:t>
-      </w:r>
-      <w:r>
-        <w:rPr>
-          <w:rFonts w:cs="Arial"/>
-        </w:rPr>
-        <w:t>/05</w:t>
+        <w:t>12/05</w:t>
       </w:r>
     </w:p>
     <w:p>
@@ -9970,6 +9031,9 @@
     </w:p>
     <w:p>
       <w:r>
+        <w:rPr>
+          <w:noProof/>
+        </w:rPr>
         <w:lastRenderedPageBreak/>
         <w:drawing>
           <wp:inline distT="0" distB="0" distL="0" distR="0" wp14:anchorId="4C419327" wp14:editId="372DED40">
@@ -10018,6 +9082,9 @@
         </w:drawing>
       </w:r>
       <w:r>
+        <w:rPr>
+          <w:noProof/>
+        </w:rPr>
         <w:drawing>
           <wp:inline distT="0" distB="0" distL="0" distR="0" wp14:anchorId="2F1DAD17" wp14:editId="32F7A418">
             <wp:extent cx="3456264" cy="2293319"/>
@@ -10068,19 +9135,14 @@
     <w:p/>
     <w:p>
       <w:r>
-        <w:t>X = "salmon", Y = "turquoise", Z = "</w:t>
-      </w:r>
-      <w:proofErr w:type="spellStart"/>
-      <w:r>
-        <w:t>darkblue</w:t>
-      </w:r>
-      <w:proofErr w:type="spellEnd"/>
-      <w:r>
-        <w:t>"</w:t>
-      </w:r>
-    </w:p>
-    <w:p>
-      <w:r>
+        <w:t>X = "salmon", Y = "turquoise", Z = "darkblue"</w:t>
+      </w:r>
+    </w:p>
+    <w:p>
+      <w:r>
+        <w:rPr>
+          <w:noProof/>
+        </w:rPr>
         <w:drawing>
           <wp:inline distT="0" distB="0" distL="0" distR="0" wp14:anchorId="1B572D8E" wp14:editId="12928803">
             <wp:extent cx="3162300" cy="1000870"/>
@@ -10128,6 +9190,9 @@
         </w:drawing>
       </w:r>
       <w:r>
+        <w:rPr>
+          <w:noProof/>
+        </w:rPr>
         <w:drawing>
           <wp:inline distT="0" distB="0" distL="0" distR="0" wp14:anchorId="4D374CBE" wp14:editId="29DA9275">
             <wp:extent cx="3086100" cy="976753"/>
@@ -10177,6 +9242,9 @@
     </w:p>
     <w:p>
       <w:r>
+        <w:rPr>
+          <w:noProof/>
+        </w:rPr>
         <w:drawing>
           <wp:inline distT="0" distB="0" distL="0" distR="0" wp14:anchorId="0AA52F70" wp14:editId="280AB6D7">
             <wp:extent cx="3162300" cy="1000870"/>
@@ -10224,6 +9292,9 @@
         </w:drawing>
       </w:r>
       <w:r>
+        <w:rPr>
+          <w:noProof/>
+        </w:rPr>
         <w:drawing>
           <wp:inline distT="0" distB="0" distL="0" distR="0" wp14:anchorId="5B1F0BFB" wp14:editId="724FE38D">
             <wp:extent cx="3124200" cy="988812"/>
@@ -10273,6 +9344,9 @@
     </w:p>
     <w:p>
       <w:r>
+        <w:rPr>
+          <w:noProof/>
+        </w:rPr>
         <w:drawing>
           <wp:inline distT="0" distB="0" distL="0" distR="0" wp14:anchorId="2E6FF7A5" wp14:editId="601B91B5">
             <wp:extent cx="3067050" cy="970724"/>
@@ -10320,6 +9394,9 @@
         </w:drawing>
       </w:r>
       <w:r>
+        <w:rPr>
+          <w:noProof/>
+        </w:rPr>
         <w:drawing>
           <wp:inline distT="0" distB="0" distL="0" distR="0" wp14:anchorId="696AFA0D" wp14:editId="363CE60E">
             <wp:extent cx="3067050" cy="970723"/>
@@ -10396,6 +9473,7 @@
       </w:pPr>
       <w:r>
         <w:rPr>
+          <w:noProof/>
           <w:lang w:val="en-GB"/>
         </w:rPr>
         <w:drawing>
@@ -10545,23 +9623,7 @@
           <w:rFonts w:asciiTheme="minorHAnsi" w:hAnsiTheme="minorHAnsi"/>
           <w:lang w:val="en-GB"/>
         </w:rPr>
-        <w:t xml:space="preserve">Plotted it to see what units the devices are in and holy fuck, why are they all different??? What evil tomfoolery is this?????? Messaged </w:t>
-      </w:r>
-      <w:proofErr w:type="spellStart"/>
-      <w:r>
-        <w:rPr>
-          <w:rFonts w:asciiTheme="minorHAnsi" w:hAnsiTheme="minorHAnsi"/>
-          <w:lang w:val="en-GB"/>
-        </w:rPr>
-        <w:t>ChrisB</w:t>
-      </w:r>
-      <w:proofErr w:type="spellEnd"/>
-      <w:r>
-        <w:rPr>
-          <w:rFonts w:asciiTheme="minorHAnsi" w:hAnsiTheme="minorHAnsi"/>
-          <w:lang w:val="en-GB"/>
-        </w:rPr>
-        <w:t xml:space="preserve"> to ask what the heck is going on.</w:t>
+        <w:t>Plotted it to see what units the devices are in and holy fuck, why are they all different??? What evil tomfoolery is this?????? Messaged ChrisB to ask what the heck is going on.</w:t>
       </w:r>
     </w:p>
     <w:p>
@@ -10574,6 +9636,7 @@
       </w:pPr>
       <w:r>
         <w:rPr>
+          <w:noProof/>
           <w:lang w:val="en-GB"/>
         </w:rPr>
         <w:drawing>
@@ -10614,6 +9677,7 @@
       </w:r>
       <w:r>
         <w:rPr>
+          <w:noProof/>
           <w:lang w:val="en-GB"/>
         </w:rPr>
         <w:drawing>
@@ -10777,6 +9841,7 @@
       <w:r>
         <w:rPr>
           <w:rFonts w:asciiTheme="minorHAnsi" w:hAnsiTheme="minorHAnsi"/>
+          <w:noProof/>
           <w:lang w:val="en-GB"/>
         </w:rPr>
         <w:drawing>
@@ -10860,46 +9925,21 @@
           <w:rFonts w:asciiTheme="minorHAnsi" w:hAnsiTheme="minorHAnsi"/>
           <w:lang w:val="en-GB"/>
         </w:rPr>
-        <w:t xml:space="preserve">Basically I found that there are 3 settings. Either the device is already in G (either 16 or 4) or its in raw units and has to be converted. The cropping at 4g means I am going to have to match and join it to the </w:t>
-      </w:r>
-      <w:proofErr w:type="spellStart"/>
+        <w:t xml:space="preserve">Basically I found that there are 3 settings. Either the device is already in G (either 16 or 4) or its in raw units and has to be converted. The cropping at 4g means I am going to have to match and join it to the Axivity </w:t>
+      </w:r>
+      <w:r>
+        <w:rPr>
+          <w:rFonts w:ascii="Segoe UI Emoji" w:hAnsi="Segoe UI Emoji" w:cs="Segoe UI Emoji"/>
+          <w:lang w:val="en-GB"/>
+        </w:rPr>
+        <w:t>😢</w:t>
+      </w:r>
       <w:r>
         <w:rPr>
           <w:rFonts w:asciiTheme="minorHAnsi" w:hAnsiTheme="minorHAnsi"/>
           <w:lang w:val="en-GB"/>
         </w:rPr>
-        <w:t>Axivity</w:t>
-      </w:r>
-      <w:proofErr w:type="spellEnd"/>
-      <w:r>
-        <w:rPr>
-          <w:rFonts w:asciiTheme="minorHAnsi" w:hAnsiTheme="minorHAnsi"/>
-          <w:lang w:val="en-GB"/>
-        </w:rPr>
-        <w:t xml:space="preserve"> </w:t>
-      </w:r>
-      <w:r>
-        <w:rPr>
-          <w:rFonts w:ascii="Segoe UI Emoji" w:hAnsi="Segoe UI Emoji" w:cs="Segoe UI Emoji"/>
-          <w:lang w:val="en-GB"/>
-        </w:rPr>
-        <w:t>😢</w:t>
-      </w:r>
-      <w:proofErr w:type="spellStart"/>
-      <w:r>
-        <w:rPr>
-          <w:rFonts w:asciiTheme="minorHAnsi" w:hAnsiTheme="minorHAnsi"/>
-          <w:lang w:val="en-GB"/>
-        </w:rPr>
-        <w:t>ChrisC</w:t>
-      </w:r>
-      <w:proofErr w:type="spellEnd"/>
-      <w:r>
-        <w:rPr>
-          <w:rFonts w:asciiTheme="minorHAnsi" w:hAnsiTheme="minorHAnsi"/>
-          <w:lang w:val="en-GB"/>
-        </w:rPr>
-        <w:t xml:space="preserve"> says this code exists and already works… but I’ve heard that often enough to know that means “this will be hard”.</w:t>
+        <w:t>ChrisC says this code exists and already works… but I’ve heard that often enough to know that means “this will be hard”.</w:t>
       </w:r>
     </w:p>
     <w:tbl>
@@ -10972,7 +10012,6 @@
                 <w14:ligatures w14:val="none"/>
               </w:rPr>
             </w:pPr>
-            <w:proofErr w:type="spellStart"/>
             <w:r>
               <w:rPr>
                 <w:rFonts w:ascii="Aptos Narrow" w:eastAsia="Times New Roman" w:hAnsi="Aptos Narrow" w:cs="Times New Roman"/>
@@ -10985,7 +10024,6 @@
               </w:rPr>
               <w:t>avg_hz</w:t>
             </w:r>
-            <w:proofErr w:type="spellEnd"/>
           </w:p>
         </w:tc>
         <w:tc>
@@ -11007,7 +10045,6 @@
                 <w14:ligatures w14:val="none"/>
               </w:rPr>
             </w:pPr>
-            <w:proofErr w:type="spellStart"/>
             <w:r>
               <w:rPr>
                 <w:rFonts w:ascii="Aptos Narrow" w:eastAsia="Times New Roman" w:hAnsi="Aptos Narrow" w:cs="Times New Roman"/>
@@ -11020,7 +10057,6 @@
               </w:rPr>
               <w:t>Acc_Conv</w:t>
             </w:r>
-            <w:proofErr w:type="spellEnd"/>
           </w:p>
         </w:tc>
         <w:tc>
@@ -11042,7 +10078,6 @@
                 <w14:ligatures w14:val="none"/>
               </w:rPr>
             </w:pPr>
-            <w:proofErr w:type="spellStart"/>
             <w:r>
               <w:rPr>
                 <w:rFonts w:ascii="Aptos Narrow" w:eastAsia="Times New Roman" w:hAnsi="Aptos Narrow" w:cs="Times New Roman"/>
@@ -11055,7 +10090,6 @@
               </w:rPr>
               <w:t>Mag_Conv</w:t>
             </w:r>
-            <w:proofErr w:type="spellEnd"/>
           </w:p>
         </w:tc>
       </w:tr>
@@ -12444,29 +11478,22 @@
     <w:p>
       <w:pPr>
         <w:pStyle w:val="NormalWeb"/>
+        <w:numPr>
+          <w:ilvl w:val="0"/>
+          <w:numId w:val="2"/>
+        </w:numPr>
         <w:rPr>
           <w:rFonts w:asciiTheme="minorHAnsi" w:hAnsiTheme="minorHAnsi"/>
           <w:lang w:val="en-GB"/>
         </w:rPr>
       </w:pPr>
-    </w:p>
-    <w:p>
-      <w:pPr>
-        <w:pStyle w:val="NormalWeb"/>
+      <w:r>
         <w:rPr>
           <w:rFonts w:asciiTheme="minorHAnsi" w:hAnsiTheme="minorHAnsi"/>
           <w:lang w:val="en-GB"/>
         </w:rPr>
-      </w:pPr>
-    </w:p>
-    <w:p>
-      <w:pPr>
-        <w:pStyle w:val="NormalWeb"/>
-        <w:rPr>
-          <w:rFonts w:asciiTheme="minorHAnsi" w:hAnsiTheme="minorHAnsi"/>
-          <w:lang w:val="en-GB"/>
-        </w:rPr>
-      </w:pPr>
+        <w:t>Tried to figure out the orientation of each of the devices by plotting some random bits of it and seeing whether they all had the same basic patterns.</w:t>
+      </w:r>
     </w:p>
     <w:p>
       <w:pPr>
@@ -12476,18 +11503,1246 @@
           <w:numId w:val="2"/>
         </w:numPr>
         <w:rPr>
-          <w:rFonts w:asciiTheme="minorHAnsi" w:hAnsiTheme="minorHAnsi"/>
+          <w:rFonts w:ascii="Arial" w:hAnsi="Arial" w:cs="Arial"/>
           <w:lang w:val="en-GB"/>
         </w:rPr>
       </w:pPr>
       <w:r>
         <w:rPr>
-          <w:rFonts w:asciiTheme="minorHAnsi" w:hAnsiTheme="minorHAnsi"/>
-          <w:lang w:val="en-GB"/>
-        </w:rPr>
-        <w:t>Tasks:</w:t>
-      </w:r>
-    </w:p>
+          <w:rFonts w:ascii="Arial" w:hAnsi="Arial" w:cs="Arial"/>
+        </w:rPr>
+        <w:t>Manually plotted and explored each collar. Kept notes here.</w:t>
+      </w:r>
+    </w:p>
+    <w:tbl>
+      <w:tblPr>
+        <w:tblStyle w:val="TableGrid"/>
+        <w:tblW w:w="10885" w:type="dxa"/>
+        <w:tblLayout w:type="fixed"/>
+        <w:tblLook w:val="04A0" w:firstRow="1" w:lastRow="0" w:firstColumn="1" w:lastColumn="0" w:noHBand="0" w:noVBand="1"/>
+      </w:tblPr>
+      <w:tblGrid>
+        <w:gridCol w:w="1296"/>
+        <w:gridCol w:w="1296"/>
+        <w:gridCol w:w="1296"/>
+        <w:gridCol w:w="1296"/>
+        <w:gridCol w:w="5701"/>
+      </w:tblGrid>
+      <w:tr>
+        <w:tc>
+          <w:tcPr>
+            <w:tcW w:w="1296" w:type="dxa"/>
+          </w:tcPr>
+          <w:p>
+            <w:pPr>
+              <w:rPr>
+                <w:b/>
+                <w:bCs/>
+              </w:rPr>
+            </w:pPr>
+            <w:r>
+              <w:rPr>
+                <w:b/>
+                <w:bCs/>
+              </w:rPr>
+              <w:t>Collar</w:t>
+            </w:r>
+          </w:p>
+        </w:tc>
+        <w:tc>
+          <w:tcPr>
+            <w:tcW w:w="1296" w:type="dxa"/>
+          </w:tcPr>
+          <w:p>
+            <w:pPr>
+              <w:rPr>
+                <w:b/>
+                <w:bCs/>
+              </w:rPr>
+            </w:pPr>
+            <w:r>
+              <w:rPr>
+                <w:b/>
+                <w:bCs/>
+              </w:rPr>
+              <w:t>Mean X</w:t>
+            </w:r>
+          </w:p>
+        </w:tc>
+        <w:tc>
+          <w:tcPr>
+            <w:tcW w:w="1296" w:type="dxa"/>
+          </w:tcPr>
+          <w:p>
+            <w:pPr>
+              <w:rPr>
+                <w:b/>
+                <w:bCs/>
+              </w:rPr>
+            </w:pPr>
+            <w:r>
+              <w:rPr>
+                <w:b/>
+                <w:bCs/>
+              </w:rPr>
+              <w:t>Mean Y</w:t>
+            </w:r>
+          </w:p>
+        </w:tc>
+        <w:tc>
+          <w:tcPr>
+            <w:tcW w:w="1296" w:type="dxa"/>
+          </w:tcPr>
+          <w:p>
+            <w:pPr>
+              <w:rPr>
+                <w:b/>
+                <w:bCs/>
+              </w:rPr>
+            </w:pPr>
+            <w:r>
+              <w:rPr>
+                <w:b/>
+                <w:bCs/>
+              </w:rPr>
+              <w:t>Mean Z</w:t>
+            </w:r>
+          </w:p>
+        </w:tc>
+        <w:tc>
+          <w:tcPr>
+            <w:tcW w:w="5701" w:type="dxa"/>
+          </w:tcPr>
+          <w:p>
+            <w:pPr>
+              <w:rPr>
+                <w:b/>
+                <w:bCs/>
+              </w:rPr>
+            </w:pPr>
+            <w:r>
+              <w:rPr>
+                <w:b/>
+                <w:bCs/>
+              </w:rPr>
+              <w:t>Screenshot</w:t>
+            </w:r>
+          </w:p>
+        </w:tc>
+      </w:tr>
+      <w:tr>
+        <w:tc>
+          <w:tcPr>
+            <w:tcW w:w="1296" w:type="dxa"/>
+          </w:tcPr>
+          <w:p>
+            <w:r>
+              <w:t>12</w:t>
+            </w:r>
+          </w:p>
+        </w:tc>
+        <w:tc>
+          <w:tcPr>
+            <w:tcW w:w="1296" w:type="dxa"/>
+          </w:tcPr>
+          <w:p>
+            <w:r>
+              <w:t>-1.714332</w:t>
+            </w:r>
+          </w:p>
+        </w:tc>
+        <w:tc>
+          <w:tcPr>
+            <w:tcW w:w="1296" w:type="dxa"/>
+          </w:tcPr>
+          <w:p>
+            <w:r>
+              <w:t>0.691165</w:t>
+            </w:r>
+          </w:p>
+        </w:tc>
+        <w:tc>
+          <w:tcPr>
+            <w:tcW w:w="1296" w:type="dxa"/>
+          </w:tcPr>
+          <w:p>
+            <w:pPr>
+              <w:spacing w:after="160" w:line="278" w:lineRule="auto"/>
+            </w:pPr>
+            <w:r>
+              <w:t>2.963385</w:t>
+            </w:r>
+          </w:p>
+        </w:tc>
+        <w:tc>
+          <w:tcPr>
+            <w:tcW w:w="5701" w:type="dxa"/>
+          </w:tcPr>
+          <w:p>
+            <w:r>
+              <w:rPr>
+                <w:noProof/>
+              </w:rPr>
+              <w:drawing>
+                <wp:inline distT="0" distB="0" distL="0" distR="0" wp14:anchorId="5BD7CC8E" wp14:editId="46856F03">
+                  <wp:extent cx="1828800" cy="1076603"/>
+                  <wp:effectExtent l="0" t="0" r="0" b="9525"/>
+                  <wp:docPr id="772148784" name="Picture 6"/>
+                  <wp:cNvGraphicFramePr>
+                    <a:graphicFrameLocks xmlns:a="http://schemas.openxmlformats.org/drawingml/2006/main" noChangeAspect="1"/>
+                  </wp:cNvGraphicFramePr>
+                  <a:graphic xmlns:a="http://schemas.openxmlformats.org/drawingml/2006/main">
+                    <a:graphicData uri="http://schemas.openxmlformats.org/drawingml/2006/picture">
+                      <pic:pic xmlns:pic="http://schemas.openxmlformats.org/drawingml/2006/picture">
+                        <pic:nvPicPr>
+                          <pic:cNvPr id="0" name="Picture 4"/>
+                          <pic:cNvPicPr>
+                            <a:picLocks noChangeAspect="1" noChangeArrowheads="1"/>
+                          </pic:cNvPicPr>
+                        </pic:nvPicPr>
+                        <pic:blipFill>
+                          <a:blip r:embed="rId93" cstate="print">
+                            <a:extLst>
+                              <a:ext uri="{28A0092B-C50C-407E-A947-70E740481C1C}">
+                                <a14:useLocalDpi xmlns:a14="http://schemas.microsoft.com/office/drawing/2010/main" val="0"/>
+                              </a:ext>
+                            </a:extLst>
+                          </a:blip>
+                          <a:srcRect/>
+                          <a:stretch>
+                            <a:fillRect/>
+                          </a:stretch>
+                        </pic:blipFill>
+                        <pic:spPr bwMode="auto">
+                          <a:xfrm>
+                            <a:off x="0" y="0"/>
+                            <a:ext cx="1839622" cy="1082974"/>
+                          </a:xfrm>
+                          <a:prstGeom prst="rect">
+                            <a:avLst/>
+                          </a:prstGeom>
+                          <a:noFill/>
+                        </pic:spPr>
+                      </pic:pic>
+                    </a:graphicData>
+                  </a:graphic>
+                </wp:inline>
+              </w:drawing>
+            </w:r>
+          </w:p>
+          <w:p>
+            <w:r>
+              <w:t>accel_data[1445000:1452000]</w:t>
+            </w:r>
+          </w:p>
+        </w:tc>
+      </w:tr>
+      <w:tr>
+        <w:tc>
+          <w:tcPr>
+            <w:tcW w:w="1296" w:type="dxa"/>
+          </w:tcPr>
+          <w:p>
+            <w:r>
+              <w:t>2</w:t>
+            </w:r>
+          </w:p>
+        </w:tc>
+        <w:tc>
+          <w:tcPr>
+            <w:tcW w:w="1296" w:type="dxa"/>
+          </w:tcPr>
+          <w:p>
+            <w:r>
+              <w:t>-0.0630</w:t>
+            </w:r>
+          </w:p>
+        </w:tc>
+        <w:tc>
+          <w:tcPr>
+            <w:tcW w:w="1296" w:type="dxa"/>
+          </w:tcPr>
+          <w:p>
+            <w:r>
+              <w:t>0.83789</w:t>
+            </w:r>
+          </w:p>
+        </w:tc>
+        <w:tc>
+          <w:tcPr>
+            <w:tcW w:w="1296" w:type="dxa"/>
+          </w:tcPr>
+          <w:p>
+            <w:r>
+              <w:t>2.9980</w:t>
+            </w:r>
+          </w:p>
+        </w:tc>
+        <w:tc>
+          <w:tcPr>
+            <w:tcW w:w="5701" w:type="dxa"/>
+          </w:tcPr>
+          <w:p>
+            <w:r>
+              <w:rPr>
+                <w:noProof/>
+              </w:rPr>
+              <w:drawing>
+                <wp:inline distT="0" distB="0" distL="0" distR="0" wp14:anchorId="2E4298EB" wp14:editId="00F29498">
+                  <wp:extent cx="1925053" cy="1133267"/>
+                  <wp:effectExtent l="0" t="0" r="0" b="0"/>
+                  <wp:docPr id="1453398962" name="Picture 8"/>
+                  <wp:cNvGraphicFramePr>
+                    <a:graphicFrameLocks xmlns:a="http://schemas.openxmlformats.org/drawingml/2006/main" noChangeAspect="1"/>
+                  </wp:cNvGraphicFramePr>
+                  <a:graphic xmlns:a="http://schemas.openxmlformats.org/drawingml/2006/main">
+                    <a:graphicData uri="http://schemas.openxmlformats.org/drawingml/2006/picture">
+                      <pic:pic xmlns:pic="http://schemas.openxmlformats.org/drawingml/2006/picture">
+                        <pic:nvPicPr>
+                          <pic:cNvPr id="0" name="Picture 5"/>
+                          <pic:cNvPicPr>
+                            <a:picLocks noChangeAspect="1" noChangeArrowheads="1"/>
+                          </pic:cNvPicPr>
+                        </pic:nvPicPr>
+                        <pic:blipFill>
+                          <a:blip r:embed="rId94" cstate="print">
+                            <a:extLst>
+                              <a:ext uri="{28A0092B-C50C-407E-A947-70E740481C1C}">
+                                <a14:useLocalDpi xmlns:a14="http://schemas.microsoft.com/office/drawing/2010/main" val="0"/>
+                              </a:ext>
+                            </a:extLst>
+                          </a:blip>
+                          <a:srcRect/>
+                          <a:stretch>
+                            <a:fillRect/>
+                          </a:stretch>
+                        </pic:blipFill>
+                        <pic:spPr bwMode="auto">
+                          <a:xfrm>
+                            <a:off x="0" y="0"/>
+                            <a:ext cx="1941130" cy="1142732"/>
+                          </a:xfrm>
+                          <a:prstGeom prst="rect">
+                            <a:avLst/>
+                          </a:prstGeom>
+                          <a:noFill/>
+                        </pic:spPr>
+                      </pic:pic>
+                    </a:graphicData>
+                  </a:graphic>
+                </wp:inline>
+              </w:drawing>
+            </w:r>
+          </w:p>
+          <w:p>
+            <w:r>
+              <w:t>accel_data[1660000:1670000]</w:t>
+            </w:r>
+          </w:p>
+        </w:tc>
+      </w:tr>
+      <w:tr>
+        <w:tc>
+          <w:tcPr>
+            <w:tcW w:w="1296" w:type="dxa"/>
+          </w:tcPr>
+          <w:p>
+            <w:r>
+              <w:t>3</w:t>
+            </w:r>
+          </w:p>
+        </w:tc>
+        <w:tc>
+          <w:tcPr>
+            <w:tcW w:w="1296" w:type="dxa"/>
+          </w:tcPr>
+          <w:p>
+            <w:r>
+              <w:t>-0.498123</w:t>
+            </w:r>
+          </w:p>
+        </w:tc>
+        <w:tc>
+          <w:tcPr>
+            <w:tcW w:w="1296" w:type="dxa"/>
+          </w:tcPr>
+          <w:p>
+            <w:r>
+              <w:t>0.1800641</w:t>
+            </w:r>
+          </w:p>
+        </w:tc>
+        <w:tc>
+          <w:tcPr>
+            <w:tcW w:w="1296" w:type="dxa"/>
+          </w:tcPr>
+          <w:p>
+            <w:r>
+              <w:t>0.7116897</w:t>
+            </w:r>
+          </w:p>
+        </w:tc>
+        <w:tc>
+          <w:tcPr>
+            <w:tcW w:w="5701" w:type="dxa"/>
+          </w:tcPr>
+          <w:p>
+            <w:r>
+              <w:rPr>
+                <w:noProof/>
+              </w:rPr>
+              <w:drawing>
+                <wp:inline distT="0" distB="0" distL="0" distR="0" wp14:anchorId="02A3B905" wp14:editId="71412BF0">
+                  <wp:extent cx="2002900" cy="1179095"/>
+                  <wp:effectExtent l="0" t="0" r="0" b="2540"/>
+                  <wp:docPr id="2046908007" name="Picture 10"/>
+                  <wp:cNvGraphicFramePr>
+                    <a:graphicFrameLocks xmlns:a="http://schemas.openxmlformats.org/drawingml/2006/main" noChangeAspect="1"/>
+                  </wp:cNvGraphicFramePr>
+                  <a:graphic xmlns:a="http://schemas.openxmlformats.org/drawingml/2006/main">
+                    <a:graphicData uri="http://schemas.openxmlformats.org/drawingml/2006/picture">
+                      <pic:pic xmlns:pic="http://schemas.openxmlformats.org/drawingml/2006/picture">
+                        <pic:nvPicPr>
+                          <pic:cNvPr id="0" name="Picture 6"/>
+                          <pic:cNvPicPr>
+                            <a:picLocks noChangeAspect="1" noChangeArrowheads="1"/>
+                          </pic:cNvPicPr>
+                        </pic:nvPicPr>
+                        <pic:blipFill>
+                          <a:blip r:embed="rId95" cstate="print">
+                            <a:extLst>
+                              <a:ext uri="{28A0092B-C50C-407E-A947-70E740481C1C}">
+                                <a14:useLocalDpi xmlns:a14="http://schemas.microsoft.com/office/drawing/2010/main" val="0"/>
+                              </a:ext>
+                            </a:extLst>
+                          </a:blip>
+                          <a:srcRect/>
+                          <a:stretch>
+                            <a:fillRect/>
+                          </a:stretch>
+                        </pic:blipFill>
+                        <pic:spPr bwMode="auto">
+                          <a:xfrm>
+                            <a:off x="0" y="0"/>
+                            <a:ext cx="2014251" cy="1185777"/>
+                          </a:xfrm>
+                          <a:prstGeom prst="rect">
+                            <a:avLst/>
+                          </a:prstGeom>
+                          <a:noFill/>
+                        </pic:spPr>
+                      </pic:pic>
+                    </a:graphicData>
+                  </a:graphic>
+                </wp:inline>
+              </w:drawing>
+            </w:r>
+          </w:p>
+          <w:p>
+            <w:r>
+              <w:t>accel_data[90000:91000]</w:t>
+            </w:r>
+          </w:p>
+        </w:tc>
+      </w:tr>
+      <w:tr>
+        <w:tc>
+          <w:tcPr>
+            <w:tcW w:w="1296" w:type="dxa"/>
+          </w:tcPr>
+          <w:p>
+            <w:r>
+              <w:t>5</w:t>
+            </w:r>
+          </w:p>
+        </w:tc>
+        <w:tc>
+          <w:tcPr>
+            <w:tcW w:w="1296" w:type="dxa"/>
+          </w:tcPr>
+          <w:p>
+            <w:r>
+              <w:t>-1.2077</w:t>
+            </w:r>
+          </w:p>
+        </w:tc>
+        <w:tc>
+          <w:tcPr>
+            <w:tcW w:w="1296" w:type="dxa"/>
+          </w:tcPr>
+          <w:p>
+            <w:r>
+              <w:t>0.76058</w:t>
+            </w:r>
+          </w:p>
+        </w:tc>
+        <w:tc>
+          <w:tcPr>
+            <w:tcW w:w="1296" w:type="dxa"/>
+          </w:tcPr>
+          <w:p>
+            <w:r>
+              <w:t>3.1759</w:t>
+            </w:r>
+          </w:p>
+        </w:tc>
+        <w:tc>
+          <w:tcPr>
+            <w:tcW w:w="5701" w:type="dxa"/>
+          </w:tcPr>
+          <w:p>
+            <w:r>
+              <w:rPr>
+                <w:noProof/>
+              </w:rPr>
+              <w:drawing>
+                <wp:inline distT="0" distB="0" distL="0" distR="0" wp14:anchorId="6598C927" wp14:editId="7A8A135A">
+                  <wp:extent cx="1880271" cy="1106905"/>
+                  <wp:effectExtent l="0" t="0" r="5715" b="0"/>
+                  <wp:docPr id="748194637" name="Picture 12"/>
+                  <wp:cNvGraphicFramePr>
+                    <a:graphicFrameLocks xmlns:a="http://schemas.openxmlformats.org/drawingml/2006/main" noChangeAspect="1"/>
+                  </wp:cNvGraphicFramePr>
+                  <a:graphic xmlns:a="http://schemas.openxmlformats.org/drawingml/2006/main">
+                    <a:graphicData uri="http://schemas.openxmlformats.org/drawingml/2006/picture">
+                      <pic:pic xmlns:pic="http://schemas.openxmlformats.org/drawingml/2006/picture">
+                        <pic:nvPicPr>
+                          <pic:cNvPr id="0" name="Picture 7"/>
+                          <pic:cNvPicPr>
+                            <a:picLocks noChangeAspect="1" noChangeArrowheads="1"/>
+                          </pic:cNvPicPr>
+                        </pic:nvPicPr>
+                        <pic:blipFill>
+                          <a:blip r:embed="rId96" cstate="print">
+                            <a:extLst>
+                              <a:ext uri="{28A0092B-C50C-407E-A947-70E740481C1C}">
+                                <a14:useLocalDpi xmlns:a14="http://schemas.microsoft.com/office/drawing/2010/main" val="0"/>
+                              </a:ext>
+                            </a:extLst>
+                          </a:blip>
+                          <a:srcRect/>
+                          <a:stretch>
+                            <a:fillRect/>
+                          </a:stretch>
+                        </pic:blipFill>
+                        <pic:spPr bwMode="auto">
+                          <a:xfrm>
+                            <a:off x="0" y="0"/>
+                            <a:ext cx="1892683" cy="1114212"/>
+                          </a:xfrm>
+                          <a:prstGeom prst="rect">
+                            <a:avLst/>
+                          </a:prstGeom>
+                          <a:noFill/>
+                        </pic:spPr>
+                      </pic:pic>
+                    </a:graphicData>
+                  </a:graphic>
+                </wp:inline>
+              </w:drawing>
+            </w:r>
+          </w:p>
+        </w:tc>
+      </w:tr>
+      <w:tr>
+        <w:tc>
+          <w:tcPr>
+            <w:tcW w:w="1296" w:type="dxa"/>
+          </w:tcPr>
+          <w:p>
+            <w:r>
+              <w:lastRenderedPageBreak/>
+              <w:t>6</w:t>
+            </w:r>
+          </w:p>
+        </w:tc>
+        <w:tc>
+          <w:tcPr>
+            <w:tcW w:w="1296" w:type="dxa"/>
+          </w:tcPr>
+          <w:p>
+            <w:r>
+              <w:t>-0.2416</w:t>
+            </w:r>
+          </w:p>
+        </w:tc>
+        <w:tc>
+          <w:tcPr>
+            <w:tcW w:w="1296" w:type="dxa"/>
+          </w:tcPr>
+          <w:p>
+            <w:pPr>
+              <w:jc w:val="center"/>
+            </w:pPr>
+            <w:r>
+              <w:t>1.2828</w:t>
+            </w:r>
+          </w:p>
+        </w:tc>
+        <w:tc>
+          <w:tcPr>
+            <w:tcW w:w="1296" w:type="dxa"/>
+          </w:tcPr>
+          <w:p>
+            <w:r>
+              <w:t>3.0252</w:t>
+            </w:r>
+          </w:p>
+        </w:tc>
+        <w:tc>
+          <w:tcPr>
+            <w:tcW w:w="5701" w:type="dxa"/>
+          </w:tcPr>
+          <w:p>
+            <w:r>
+              <w:rPr>
+                <w:noProof/>
+              </w:rPr>
+              <w:drawing>
+                <wp:inline distT="0" distB="0" distL="0" distR="0" wp14:anchorId="43D768C6" wp14:editId="01C2FF04">
+                  <wp:extent cx="1876425" cy="1104640"/>
+                  <wp:effectExtent l="0" t="0" r="0" b="635"/>
+                  <wp:docPr id="278740402" name="Picture 14"/>
+                  <wp:cNvGraphicFramePr>
+                    <a:graphicFrameLocks xmlns:a="http://schemas.openxmlformats.org/drawingml/2006/main" noChangeAspect="1"/>
+                  </wp:cNvGraphicFramePr>
+                  <a:graphic xmlns:a="http://schemas.openxmlformats.org/drawingml/2006/main">
+                    <a:graphicData uri="http://schemas.openxmlformats.org/drawingml/2006/picture">
+                      <pic:pic xmlns:pic="http://schemas.openxmlformats.org/drawingml/2006/picture">
+                        <pic:nvPicPr>
+                          <pic:cNvPr id="0" name="Picture 8"/>
+                          <pic:cNvPicPr>
+                            <a:picLocks noChangeAspect="1" noChangeArrowheads="1"/>
+                          </pic:cNvPicPr>
+                        </pic:nvPicPr>
+                        <pic:blipFill>
+                          <a:blip r:embed="rId97" cstate="print">
+                            <a:extLst>
+                              <a:ext uri="{28A0092B-C50C-407E-A947-70E740481C1C}">
+                                <a14:useLocalDpi xmlns:a14="http://schemas.microsoft.com/office/drawing/2010/main" val="0"/>
+                              </a:ext>
+                            </a:extLst>
+                          </a:blip>
+                          <a:srcRect/>
+                          <a:stretch>
+                            <a:fillRect/>
+                          </a:stretch>
+                        </pic:blipFill>
+                        <pic:spPr bwMode="auto">
+                          <a:xfrm>
+                            <a:off x="0" y="0"/>
+                            <a:ext cx="1882321" cy="1108111"/>
+                          </a:xfrm>
+                          <a:prstGeom prst="rect">
+                            <a:avLst/>
+                          </a:prstGeom>
+                          <a:noFill/>
+                        </pic:spPr>
+                      </pic:pic>
+                    </a:graphicData>
+                  </a:graphic>
+                </wp:inline>
+              </w:drawing>
+            </w:r>
+          </w:p>
+        </w:tc>
+      </w:tr>
+      <w:tr>
+        <w:tc>
+          <w:tcPr>
+            <w:tcW w:w="1296" w:type="dxa"/>
+          </w:tcPr>
+          <w:p>
+            <w:r>
+              <w:t>7</w:t>
+            </w:r>
+          </w:p>
+        </w:tc>
+        <w:tc>
+          <w:tcPr>
+            <w:tcW w:w="1296" w:type="dxa"/>
+          </w:tcPr>
+          <w:p>
+            <w:r>
+              <w:t>-1.8772</w:t>
+            </w:r>
+          </w:p>
+        </w:tc>
+        <w:tc>
+          <w:tcPr>
+            <w:tcW w:w="1296" w:type="dxa"/>
+          </w:tcPr>
+          <w:p>
+            <w:pPr>
+              <w:jc w:val="center"/>
+            </w:pPr>
+            <w:r>
+              <w:t>1.5167</w:t>
+            </w:r>
+          </w:p>
+        </w:tc>
+        <w:tc>
+          <w:tcPr>
+            <w:tcW w:w="1296" w:type="dxa"/>
+          </w:tcPr>
+          <w:p>
+            <w:r>
+              <w:t>2.5114</w:t>
+            </w:r>
+          </w:p>
+        </w:tc>
+        <w:tc>
+          <w:tcPr>
+            <w:tcW w:w="5701" w:type="dxa"/>
+          </w:tcPr>
+          <w:p>
+            <w:r>
+              <w:rPr>
+                <w:noProof/>
+              </w:rPr>
+              <w:drawing>
+                <wp:inline distT="0" distB="0" distL="0" distR="0" wp14:anchorId="2AF32AE2" wp14:editId="29AC6030">
+                  <wp:extent cx="1757648" cy="1034716"/>
+                  <wp:effectExtent l="0" t="0" r="0" b="0"/>
+                  <wp:docPr id="569086714" name="Picture 16"/>
+                  <wp:cNvGraphicFramePr>
+                    <a:graphicFrameLocks xmlns:a="http://schemas.openxmlformats.org/drawingml/2006/main" noChangeAspect="1"/>
+                  </wp:cNvGraphicFramePr>
+                  <a:graphic xmlns:a="http://schemas.openxmlformats.org/drawingml/2006/main">
+                    <a:graphicData uri="http://schemas.openxmlformats.org/drawingml/2006/picture">
+                      <pic:pic xmlns:pic="http://schemas.openxmlformats.org/drawingml/2006/picture">
+                        <pic:nvPicPr>
+                          <pic:cNvPr id="0" name="Picture 9"/>
+                          <pic:cNvPicPr>
+                            <a:picLocks noChangeAspect="1" noChangeArrowheads="1"/>
+                          </pic:cNvPicPr>
+                        </pic:nvPicPr>
+                        <pic:blipFill>
+                          <a:blip r:embed="rId98" cstate="print">
+                            <a:extLst>
+                              <a:ext uri="{28A0092B-C50C-407E-A947-70E740481C1C}">
+                                <a14:useLocalDpi xmlns:a14="http://schemas.microsoft.com/office/drawing/2010/main" val="0"/>
+                              </a:ext>
+                            </a:extLst>
+                          </a:blip>
+                          <a:srcRect/>
+                          <a:stretch>
+                            <a:fillRect/>
+                          </a:stretch>
+                        </pic:blipFill>
+                        <pic:spPr bwMode="auto">
+                          <a:xfrm>
+                            <a:off x="0" y="0"/>
+                            <a:ext cx="1772649" cy="1043547"/>
+                          </a:xfrm>
+                          <a:prstGeom prst="rect">
+                            <a:avLst/>
+                          </a:prstGeom>
+                          <a:noFill/>
+                        </pic:spPr>
+                      </pic:pic>
+                    </a:graphicData>
+                  </a:graphic>
+                </wp:inline>
+              </w:drawing>
+            </w:r>
+          </w:p>
+        </w:tc>
+      </w:tr>
+      <w:tr>
+        <w:tc>
+          <w:tcPr>
+            <w:tcW w:w="1296" w:type="dxa"/>
+          </w:tcPr>
+          <w:p>
+            <w:r>
+              <w:t>8</w:t>
+            </w:r>
+          </w:p>
+        </w:tc>
+        <w:tc>
+          <w:tcPr>
+            <w:tcW w:w="1296" w:type="dxa"/>
+          </w:tcPr>
+          <w:p>
+            <w:r>
+              <w:t>-0.1593</w:t>
+            </w:r>
+          </w:p>
+        </w:tc>
+        <w:tc>
+          <w:tcPr>
+            <w:tcW w:w="1296" w:type="dxa"/>
+          </w:tcPr>
+          <w:p>
+            <w:pPr>
+              <w:jc w:val="center"/>
+            </w:pPr>
+            <w:r>
+              <w:t>0.2151</w:t>
+            </w:r>
+          </w:p>
+        </w:tc>
+        <w:tc>
+          <w:tcPr>
+            <w:tcW w:w="1296" w:type="dxa"/>
+          </w:tcPr>
+          <w:p>
+            <w:r>
+              <w:t>0.7584</w:t>
+            </w:r>
+          </w:p>
+        </w:tc>
+        <w:tc>
+          <w:tcPr>
+            <w:tcW w:w="5701" w:type="dxa"/>
+          </w:tcPr>
+          <w:p>
+            <w:r>
+              <w:rPr>
+                <w:noProof/>
+              </w:rPr>
+              <w:drawing>
+                <wp:inline distT="0" distB="0" distL="0" distR="0" wp14:anchorId="7A2E1EAD" wp14:editId="745AFE27">
+                  <wp:extent cx="1949116" cy="1147433"/>
+                  <wp:effectExtent l="0" t="0" r="0" b="0"/>
+                  <wp:docPr id="762796319" name="Picture 18"/>
+                  <wp:cNvGraphicFramePr>
+                    <a:graphicFrameLocks xmlns:a="http://schemas.openxmlformats.org/drawingml/2006/main" noChangeAspect="1"/>
+                  </wp:cNvGraphicFramePr>
+                  <a:graphic xmlns:a="http://schemas.openxmlformats.org/drawingml/2006/main">
+                    <a:graphicData uri="http://schemas.openxmlformats.org/drawingml/2006/picture">
+                      <pic:pic xmlns:pic="http://schemas.openxmlformats.org/drawingml/2006/picture">
+                        <pic:nvPicPr>
+                          <pic:cNvPr id="0" name="Picture 10"/>
+                          <pic:cNvPicPr>
+                            <a:picLocks noChangeAspect="1" noChangeArrowheads="1"/>
+                          </pic:cNvPicPr>
+                        </pic:nvPicPr>
+                        <pic:blipFill>
+                          <a:blip r:embed="rId99" cstate="print">
+                            <a:extLst>
+                              <a:ext uri="{28A0092B-C50C-407E-A947-70E740481C1C}">
+                                <a14:useLocalDpi xmlns:a14="http://schemas.microsoft.com/office/drawing/2010/main" val="0"/>
+                              </a:ext>
+                            </a:extLst>
+                          </a:blip>
+                          <a:srcRect/>
+                          <a:stretch>
+                            <a:fillRect/>
+                          </a:stretch>
+                        </pic:blipFill>
+                        <pic:spPr bwMode="auto">
+                          <a:xfrm>
+                            <a:off x="0" y="0"/>
+                            <a:ext cx="1955603" cy="1151252"/>
+                          </a:xfrm>
+                          <a:prstGeom prst="rect">
+                            <a:avLst/>
+                          </a:prstGeom>
+                          <a:noFill/>
+                        </pic:spPr>
+                      </pic:pic>
+                    </a:graphicData>
+                  </a:graphic>
+                </wp:inline>
+              </w:drawing>
+            </w:r>
+          </w:p>
+        </w:tc>
+      </w:tr>
+      <w:tr>
+        <w:tc>
+          <w:tcPr>
+            <w:tcW w:w="1296" w:type="dxa"/>
+          </w:tcPr>
+          <w:p>
+            <w:r>
+              <w:t>11</w:t>
+            </w:r>
+          </w:p>
+        </w:tc>
+        <w:tc>
+          <w:tcPr>
+            <w:tcW w:w="1296" w:type="dxa"/>
+          </w:tcPr>
+          <w:p>
+            <w:r>
+              <w:t>-0.5326</w:t>
+            </w:r>
+          </w:p>
+        </w:tc>
+        <w:tc>
+          <w:tcPr>
+            <w:tcW w:w="1296" w:type="dxa"/>
+          </w:tcPr>
+          <w:p>
+            <w:pPr>
+              <w:jc w:val="center"/>
+            </w:pPr>
+            <w:r>
+              <w:t>1.0954</w:t>
+            </w:r>
+          </w:p>
+        </w:tc>
+        <w:tc>
+          <w:tcPr>
+            <w:tcW w:w="1296" w:type="dxa"/>
+          </w:tcPr>
+          <w:p>
+            <w:r>
+              <w:t>3.10699</w:t>
+            </w:r>
+          </w:p>
+        </w:tc>
+        <w:tc>
+          <w:tcPr>
+            <w:tcW w:w="5701" w:type="dxa"/>
+          </w:tcPr>
+          <w:p>
+            <w:pPr>
+              <w:rPr>
+                <w:noProof/>
+              </w:rPr>
+            </w:pPr>
+            <w:r>
+              <w:rPr>
+                <w:noProof/>
+              </w:rPr>
+              <w:drawing>
+                <wp:inline distT="0" distB="0" distL="0" distR="0" wp14:anchorId="191BC9BC" wp14:editId="3D79C9BA">
+                  <wp:extent cx="1876926" cy="1104935"/>
+                  <wp:effectExtent l="0" t="0" r="9525" b="0"/>
+                  <wp:docPr id="1615121948" name="Picture 22"/>
+                  <wp:cNvGraphicFramePr>
+                    <a:graphicFrameLocks xmlns:a="http://schemas.openxmlformats.org/drawingml/2006/main" noChangeAspect="1"/>
+                  </wp:cNvGraphicFramePr>
+                  <a:graphic xmlns:a="http://schemas.openxmlformats.org/drawingml/2006/main">
+                    <a:graphicData uri="http://schemas.openxmlformats.org/drawingml/2006/picture">
+                      <pic:pic xmlns:pic="http://schemas.openxmlformats.org/drawingml/2006/picture">
+                        <pic:nvPicPr>
+                          <pic:cNvPr id="0" name="Picture 12"/>
+                          <pic:cNvPicPr>
+                            <a:picLocks noChangeAspect="1" noChangeArrowheads="1"/>
+                          </pic:cNvPicPr>
+                        </pic:nvPicPr>
+                        <pic:blipFill>
+                          <a:blip r:embed="rId100" cstate="print">
+                            <a:extLst>
+                              <a:ext uri="{28A0092B-C50C-407E-A947-70E740481C1C}">
+                                <a14:useLocalDpi xmlns:a14="http://schemas.microsoft.com/office/drawing/2010/main" val="0"/>
+                              </a:ext>
+                            </a:extLst>
+                          </a:blip>
+                          <a:srcRect/>
+                          <a:stretch>
+                            <a:fillRect/>
+                          </a:stretch>
+                        </pic:blipFill>
+                        <pic:spPr bwMode="auto">
+                          <a:xfrm>
+                            <a:off x="0" y="0"/>
+                            <a:ext cx="1888035" cy="1111475"/>
+                          </a:xfrm>
+                          <a:prstGeom prst="rect">
+                            <a:avLst/>
+                          </a:prstGeom>
+                          <a:noFill/>
+                        </pic:spPr>
+                      </pic:pic>
+                    </a:graphicData>
+                  </a:graphic>
+                </wp:inline>
+              </w:drawing>
+            </w:r>
+          </w:p>
+          <w:p>
+            <w:pPr>
+              <w:rPr>
+                <w:noProof/>
+              </w:rPr>
+            </w:pPr>
+            <w:r>
+              <w:rPr>
+                <w:noProof/>
+              </w:rPr>
+              <w:t>There are also brief sections of this trace where the collar enters an unfamiliar orientation. (As per below where the Y axis has more acceleration than the Z axis)</w:t>
+            </w:r>
+          </w:p>
+          <w:p>
+            <w:pPr>
+              <w:rPr>
+                <w:noProof/>
+              </w:rPr>
+            </w:pPr>
+            <w:r>
+              <w:rPr>
+                <w:noProof/>
+              </w:rPr>
+              <w:drawing>
+                <wp:inline distT="0" distB="0" distL="0" distR="0" wp14:anchorId="3D169D4C" wp14:editId="5615F6D6">
+                  <wp:extent cx="1804737" cy="1062438"/>
+                  <wp:effectExtent l="0" t="0" r="5080" b="4445"/>
+                  <wp:docPr id="635702047" name="Picture 20"/>
+                  <wp:cNvGraphicFramePr>
+                    <a:graphicFrameLocks xmlns:a="http://schemas.openxmlformats.org/drawingml/2006/main" noChangeAspect="1"/>
+                  </wp:cNvGraphicFramePr>
+                  <a:graphic xmlns:a="http://schemas.openxmlformats.org/drawingml/2006/main">
+                    <a:graphicData uri="http://schemas.openxmlformats.org/drawingml/2006/picture">
+                      <pic:pic xmlns:pic="http://schemas.openxmlformats.org/drawingml/2006/picture">
+                        <pic:nvPicPr>
+                          <pic:cNvPr id="0" name="Picture 11"/>
+                          <pic:cNvPicPr>
+                            <a:picLocks noChangeAspect="1" noChangeArrowheads="1"/>
+                          </pic:cNvPicPr>
+                        </pic:nvPicPr>
+                        <pic:blipFill>
+                          <a:blip r:embed="rId101" cstate="print">
+                            <a:extLst>
+                              <a:ext uri="{28A0092B-C50C-407E-A947-70E740481C1C}">
+                                <a14:useLocalDpi xmlns:a14="http://schemas.microsoft.com/office/drawing/2010/main" val="0"/>
+                              </a:ext>
+                            </a:extLst>
+                          </a:blip>
+                          <a:srcRect/>
+                          <a:stretch>
+                            <a:fillRect/>
+                          </a:stretch>
+                        </pic:blipFill>
+                        <pic:spPr bwMode="auto">
+                          <a:xfrm>
+                            <a:off x="0" y="0"/>
+                            <a:ext cx="1818288" cy="1070416"/>
+                          </a:xfrm>
+                          <a:prstGeom prst="rect">
+                            <a:avLst/>
+                          </a:prstGeom>
+                          <a:noFill/>
+                        </pic:spPr>
+                      </pic:pic>
+                    </a:graphicData>
+                  </a:graphic>
+                </wp:inline>
+              </w:drawing>
+            </w:r>
+          </w:p>
+        </w:tc>
+      </w:tr>
+      <w:tr>
+        <w:tc>
+          <w:tcPr>
+            <w:tcW w:w="1296" w:type="dxa"/>
+          </w:tcPr>
+          <w:p>
+            <w:r>
+              <w:t>14</w:t>
+            </w:r>
+          </w:p>
+        </w:tc>
+        <w:tc>
+          <w:tcPr>
+            <w:tcW w:w="1296" w:type="dxa"/>
+          </w:tcPr>
+          <w:p>
+            <w:r>
+              <w:t>-1.805006</w:t>
+            </w:r>
+          </w:p>
+        </w:tc>
+        <w:tc>
+          <w:tcPr>
+            <w:tcW w:w="1296" w:type="dxa"/>
+          </w:tcPr>
+          <w:p>
+            <w:pPr>
+              <w:jc w:val="center"/>
+            </w:pPr>
+            <w:r>
+              <w:t>1.146673</w:t>
+            </w:r>
+          </w:p>
+        </w:tc>
+        <w:tc>
+          <w:tcPr>
+            <w:tcW w:w="1296" w:type="dxa"/>
+          </w:tcPr>
+          <w:p>
+            <w:r>
+              <w:t>2.655918</w:t>
+            </w:r>
+          </w:p>
+        </w:tc>
+        <w:tc>
+          <w:tcPr>
+            <w:tcW w:w="5701" w:type="dxa"/>
+          </w:tcPr>
+          <w:p>
+            <w:pPr>
+              <w:rPr>
+                <w:noProof/>
+              </w:rPr>
+            </w:pPr>
+            <w:r>
+              <w:rPr>
+                <w:noProof/>
+              </w:rPr>
+              <w:drawing>
+                <wp:inline distT="0" distB="0" distL="0" distR="0" wp14:anchorId="5859934D" wp14:editId="6F43311E">
+                  <wp:extent cx="1880272" cy="1106905"/>
+                  <wp:effectExtent l="0" t="0" r="5715" b="0"/>
+                  <wp:docPr id="1876972035" name="Picture 24"/>
+                  <wp:cNvGraphicFramePr>
+                    <a:graphicFrameLocks xmlns:a="http://schemas.openxmlformats.org/drawingml/2006/main" noChangeAspect="1"/>
+                  </wp:cNvGraphicFramePr>
+                  <a:graphic xmlns:a="http://schemas.openxmlformats.org/drawingml/2006/main">
+                    <a:graphicData uri="http://schemas.openxmlformats.org/drawingml/2006/picture">
+                      <pic:pic xmlns:pic="http://schemas.openxmlformats.org/drawingml/2006/picture">
+                        <pic:nvPicPr>
+                          <pic:cNvPr id="0" name="Picture 13"/>
+                          <pic:cNvPicPr>
+                            <a:picLocks noChangeAspect="1" noChangeArrowheads="1"/>
+                          </pic:cNvPicPr>
+                        </pic:nvPicPr>
+                        <pic:blipFill>
+                          <a:blip r:embed="rId102" cstate="print">
+                            <a:extLst>
+                              <a:ext uri="{28A0092B-C50C-407E-A947-70E740481C1C}">
+                                <a14:useLocalDpi xmlns:a14="http://schemas.microsoft.com/office/drawing/2010/main" val="0"/>
+                              </a:ext>
+                            </a:extLst>
+                          </a:blip>
+                          <a:srcRect/>
+                          <a:stretch>
+                            <a:fillRect/>
+                          </a:stretch>
+                        </pic:blipFill>
+                        <pic:spPr bwMode="auto">
+                          <a:xfrm>
+                            <a:off x="0" y="0"/>
+                            <a:ext cx="1891933" cy="1113770"/>
+                          </a:xfrm>
+                          <a:prstGeom prst="rect">
+                            <a:avLst/>
+                          </a:prstGeom>
+                          <a:noFill/>
+                        </pic:spPr>
+                      </pic:pic>
+                    </a:graphicData>
+                  </a:graphic>
+                </wp:inline>
+              </w:drawing>
+            </w:r>
+          </w:p>
+        </w:tc>
+      </w:tr>
+      <w:tr>
+        <w:tc>
+          <w:tcPr>
+            <w:tcW w:w="1296" w:type="dxa"/>
+          </w:tcPr>
+          <w:p>
+            <w:r>
+              <w:t>15</w:t>
+            </w:r>
+          </w:p>
+        </w:tc>
+        <w:tc>
+          <w:tcPr>
+            <w:tcW w:w="1296" w:type="dxa"/>
+          </w:tcPr>
+          <w:p>
+            <w:r>
+              <w:t>-0.458570</w:t>
+            </w:r>
+          </w:p>
+        </w:tc>
+        <w:tc>
+          <w:tcPr>
+            <w:tcW w:w="1296" w:type="dxa"/>
+          </w:tcPr>
+          <w:p>
+            <w:pPr>
+              <w:jc w:val="center"/>
+            </w:pPr>
+            <w:r>
+              <w:t>0.311943</w:t>
+            </w:r>
+          </w:p>
+        </w:tc>
+        <w:tc>
+          <w:tcPr>
+            <w:tcW w:w="1296" w:type="dxa"/>
+          </w:tcPr>
+          <w:p>
+            <w:r>
+              <w:t>0.62460</w:t>
+            </w:r>
+          </w:p>
+        </w:tc>
+        <w:tc>
+          <w:tcPr>
+            <w:tcW w:w="5701" w:type="dxa"/>
+          </w:tcPr>
+          <w:p>
+            <w:pPr>
+              <w:rPr>
+                <w:noProof/>
+              </w:rPr>
+            </w:pPr>
+            <w:r>
+              <w:rPr>
+                <w:noProof/>
+              </w:rPr>
+              <w:drawing>
+                <wp:inline distT="0" distB="0" distL="0" distR="0" wp14:anchorId="3FDA309F" wp14:editId="52A510FE">
+                  <wp:extent cx="1798522" cy="1058779"/>
+                  <wp:effectExtent l="0" t="0" r="0" b="8255"/>
+                  <wp:docPr id="117028847" name="Picture 26"/>
+                  <wp:cNvGraphicFramePr>
+                    <a:graphicFrameLocks xmlns:a="http://schemas.openxmlformats.org/drawingml/2006/main" noChangeAspect="1"/>
+                  </wp:cNvGraphicFramePr>
+                  <a:graphic xmlns:a="http://schemas.openxmlformats.org/drawingml/2006/main">
+                    <a:graphicData uri="http://schemas.openxmlformats.org/drawingml/2006/picture">
+                      <pic:pic xmlns:pic="http://schemas.openxmlformats.org/drawingml/2006/picture">
+                        <pic:nvPicPr>
+                          <pic:cNvPr id="0" name="Picture 14"/>
+                          <pic:cNvPicPr>
+                            <a:picLocks noChangeAspect="1" noChangeArrowheads="1"/>
+                          </pic:cNvPicPr>
+                        </pic:nvPicPr>
+                        <pic:blipFill>
+                          <a:blip r:embed="rId103" cstate="print">
+                            <a:extLst>
+                              <a:ext uri="{28A0092B-C50C-407E-A947-70E740481C1C}">
+                                <a14:useLocalDpi xmlns:a14="http://schemas.microsoft.com/office/drawing/2010/main" val="0"/>
+                              </a:ext>
+                            </a:extLst>
+                          </a:blip>
+                          <a:srcRect/>
+                          <a:stretch>
+                            <a:fillRect/>
+                          </a:stretch>
+                        </pic:blipFill>
+                        <pic:spPr bwMode="auto">
+                          <a:xfrm>
+                            <a:off x="0" y="0"/>
+                            <a:ext cx="1803884" cy="1061936"/>
+                          </a:xfrm>
+                          <a:prstGeom prst="rect">
+                            <a:avLst/>
+                          </a:prstGeom>
+                          <a:noFill/>
+                        </pic:spPr>
+                      </pic:pic>
+                    </a:graphicData>
+                  </a:graphic>
+                </wp:inline>
+              </w:drawing>
+            </w:r>
+          </w:p>
+        </w:tc>
+      </w:tr>
+    </w:tbl>
     <w:p>
       <w:pPr>
         <w:pStyle w:val="NormalWeb"/>
@@ -12505,23 +12760,8 @@
           <w:rFonts w:asciiTheme="minorHAnsi" w:hAnsiTheme="minorHAnsi"/>
           <w:lang w:val="en-GB"/>
         </w:rPr>
-        <w:t xml:space="preserve">Convert all the </w:t>
-      </w:r>
-      <w:proofErr w:type="spellStart"/>
-      <w:r>
-        <w:rPr>
-          <w:rFonts w:asciiTheme="minorHAnsi" w:hAnsiTheme="minorHAnsi"/>
-          <w:lang w:val="en-GB"/>
-        </w:rPr>
-        <w:t>accels</w:t>
-      </w:r>
-      <w:proofErr w:type="spellEnd"/>
-      <w:r>
-        <w:rPr>
-          <w:rFonts w:asciiTheme="minorHAnsi" w:hAnsiTheme="minorHAnsi"/>
-          <w:lang w:val="en-GB"/>
-        </w:rPr>
-        <w:t xml:space="preserve"> to g force and mag units</w:t>
+        <w:lastRenderedPageBreak/>
+        <w:t>Okay cool, from that I conclude they are mostly in the same orientation for most of the same time, so I can skip the reorientation step.</w:t>
       </w:r>
     </w:p>
     <w:p>
@@ -12541,39 +12781,225 @@
           <w:rFonts w:asciiTheme="minorHAnsi" w:hAnsiTheme="minorHAnsi"/>
           <w:lang w:val="en-GB"/>
         </w:rPr>
-        <w:t xml:space="preserve">Join the cropped 4g </w:t>
-      </w:r>
-      <w:proofErr w:type="spellStart"/>
-      <w:r>
+        <w:t>Therefore, I went through and made sure they’re now on the same scale (other than the ones that capped at 4g and therefore have to be matched with the Axivity before behavioural and VDBA analysis). I then re-extracted the training data for those periods based on the times of the original unsmoothed data. That code is now running. I will check the output tomorrow.</w:t>
+      </w:r>
+    </w:p>
+    <w:p>
+      <w:pPr>
+        <w:pStyle w:val="Heading3"/>
+        <w:rPr>
+          <w:rFonts w:cs="Arial"/>
+        </w:rPr>
+      </w:pPr>
+      <w:r>
+        <w:rPr>
+          <w:rFonts w:cs="Arial"/>
+        </w:rPr>
+        <w:t>1</w:t>
+      </w:r>
+      <w:r>
+        <w:rPr>
+          <w:rFonts w:cs="Arial"/>
+        </w:rPr>
+        <w:t>4</w:t>
+      </w:r>
+      <w:r>
+        <w:rPr>
+          <w:rFonts w:cs="Arial"/>
+        </w:rPr>
+        <w:t>/05</w:t>
+      </w:r>
+    </w:p>
+    <w:p>
+      <w:pPr>
+        <w:pStyle w:val="NormalWeb"/>
+        <w:numPr>
+          <w:ilvl w:val="0"/>
+          <w:numId w:val="2"/>
+        </w:numPr>
         <w:rPr>
           <w:rFonts w:asciiTheme="minorHAnsi" w:hAnsiTheme="minorHAnsi"/>
           <w:lang w:val="en-GB"/>
         </w:rPr>
-        <w:t>accels</w:t>
-      </w:r>
-      <w:proofErr w:type="spellEnd"/>
+      </w:pPr>
       <w:r>
         <w:rPr>
           <w:rFonts w:asciiTheme="minorHAnsi" w:hAnsiTheme="minorHAnsi"/>
           <w:lang w:val="en-GB"/>
         </w:rPr>
-        <w:t xml:space="preserve"> with the </w:t>
-      </w:r>
-      <w:proofErr w:type="spellStart"/>
+        <w:t>After all that conversion work, it wasn’t correct</w:t>
+      </w:r>
       <w:r>
         <w:rPr>
           <w:rFonts w:asciiTheme="minorHAnsi" w:hAnsiTheme="minorHAnsi"/>
           <w:lang w:val="en-GB"/>
         </w:rPr>
-        <w:t>axivity</w:t>
-      </w:r>
-      <w:proofErr w:type="spellEnd"/>
-      <w:r>
+        <w:t xml:space="preserve">… They did need to be divided after all. Weird? Message CB and he said that things can change or if it reset/rebooted it might have gone back to default. Whatevvvvvvver man. I can’t keep up with all this. Converted everything to the right scale for real now and then proceeded. </w:t>
+      </w:r>
+    </w:p>
+    <w:p>
+      <w:pPr>
+        <w:pStyle w:val="Heading2"/>
+      </w:pPr>
+      <w:r>
+        <w:t>Boosting Training Data</w:t>
+      </w:r>
+    </w:p>
+    <w:p>
+      <w:pPr>
+        <w:pStyle w:val="NormalWeb"/>
+        <w:numPr>
+          <w:ilvl w:val="0"/>
+          <w:numId w:val="2"/>
+        </w:numPr>
         <w:rPr>
           <w:rFonts w:asciiTheme="minorHAnsi" w:hAnsiTheme="minorHAnsi"/>
           <w:lang w:val="en-GB"/>
         </w:rPr>
-        <w:t xml:space="preserve"> uncropped data to complete the peaks</w:t>
+      </w:pPr>
+      <w:r>
+        <w:rPr>
+          <w:rFonts w:asciiTheme="minorHAnsi" w:hAnsiTheme="minorHAnsi"/>
+          <w:lang w:val="en-GB"/>
+        </w:rPr>
+        <w:t>System of extracting data looks good, so will continue this way</w:t>
+      </w:r>
+      <w:r>
+        <w:rPr>
+          <w:rFonts w:asciiTheme="minorHAnsi" w:hAnsiTheme="minorHAnsi"/>
+          <w:lang w:val="en-GB"/>
+        </w:rPr>
+        <w:t xml:space="preserve"> via the matlab.</w:t>
+      </w:r>
+    </w:p>
+    <w:p>
+      <w:pPr>
+        <w:pStyle w:val="NormalWeb"/>
+        <w:numPr>
+          <w:ilvl w:val="0"/>
+          <w:numId w:val="2"/>
+        </w:numPr>
+        <w:rPr>
+          <w:rFonts w:asciiTheme="minorHAnsi" w:hAnsiTheme="minorHAnsi"/>
+          <w:lang w:val="en-GB"/>
+        </w:rPr>
+      </w:pPr>
+      <w:r>
+        <w:rPr>
+          <w:rFonts w:asciiTheme="minorHAnsi" w:hAnsiTheme="minorHAnsi"/>
+          <w:lang w:val="en-GB"/>
+        </w:rPr>
+        <w:t>Locking in for an hour lets see how I go.</w:t>
+      </w:r>
+    </w:p>
+    <w:p>
+      <w:pPr>
+        <w:pStyle w:val="NormalWeb"/>
+        <w:jc w:val="center"/>
+        <w:rPr>
+          <w:rFonts w:asciiTheme="minorHAnsi" w:hAnsiTheme="minorHAnsi"/>
+          <w:lang w:val="en-GB"/>
+        </w:rPr>
+      </w:pPr>
+      <w:r>
+        <w:rPr>
+          <w:rFonts w:asciiTheme="minorHAnsi" w:hAnsiTheme="minorHAnsi"/>
+          <w:noProof/>
+          <w:lang w:val="en-GB"/>
+        </w:rPr>
+        <w:drawing>
+          <wp:inline distT="0" distB="0" distL="0" distR="0" wp14:anchorId="607AAA5E" wp14:editId="0D97BBEC">
+            <wp:extent cx="6181725" cy="3971212"/>
+            <wp:effectExtent l="0" t="0" r="0" b="0"/>
+            <wp:docPr id="274177336" name="Picture 5"/>
+            <wp:cNvGraphicFramePr>
+              <a:graphicFrameLocks xmlns:a="http://schemas.openxmlformats.org/drawingml/2006/main" noChangeAspect="1"/>
+            </wp:cNvGraphicFramePr>
+            <a:graphic xmlns:a="http://schemas.openxmlformats.org/drawingml/2006/main">
+              <a:graphicData uri="http://schemas.openxmlformats.org/drawingml/2006/picture">
+                <pic:pic xmlns:pic="http://schemas.openxmlformats.org/drawingml/2006/picture">
+                  <pic:nvPicPr>
+                    <pic:cNvPr id="0" name="Picture 3"/>
+                    <pic:cNvPicPr>
+                      <a:picLocks noChangeAspect="1" noChangeArrowheads="1"/>
+                    </pic:cNvPicPr>
+                  </pic:nvPicPr>
+                  <pic:blipFill>
+                    <a:blip r:embed="rId104">
+                      <a:extLst>
+                        <a:ext uri="{28A0092B-C50C-407E-A947-70E740481C1C}">
+                          <a14:useLocalDpi xmlns:a14="http://schemas.microsoft.com/office/drawing/2010/main" val="0"/>
+                        </a:ext>
+                      </a:extLst>
+                    </a:blip>
+                    <a:srcRect/>
+                    <a:stretch>
+                      <a:fillRect/>
+                    </a:stretch>
+                  </pic:blipFill>
+                  <pic:spPr bwMode="auto">
+                    <a:xfrm>
+                      <a:off x="0" y="0"/>
+                      <a:ext cx="6188865" cy="3975799"/>
+                    </a:xfrm>
+                    <a:prstGeom prst="rect">
+                      <a:avLst/>
+                    </a:prstGeom>
+                    <a:noFill/>
+                  </pic:spPr>
+                </pic:pic>
+              </a:graphicData>
+            </a:graphic>
+          </wp:inline>
+        </w:drawing>
+      </w:r>
+    </w:p>
+    <w:p>
+      <w:pPr>
+        <w:pStyle w:val="NormalWeb"/>
+        <w:rPr>
+          <w:rFonts w:asciiTheme="minorHAnsi" w:hAnsiTheme="minorHAnsi"/>
+          <w:lang w:val="en-GB"/>
+        </w:rPr>
+      </w:pPr>
+    </w:p>
+    <w:p>
+      <w:pPr>
+        <w:pStyle w:val="NormalWeb"/>
+        <w:rPr>
+          <w:rFonts w:asciiTheme="minorHAnsi" w:hAnsiTheme="minorHAnsi"/>
+          <w:lang w:val="en-GB"/>
+        </w:rPr>
+      </w:pPr>
+    </w:p>
+    <w:p>
+      <w:pPr>
+        <w:pStyle w:val="NormalWeb"/>
+        <w:rPr>
+          <w:rFonts w:asciiTheme="minorHAnsi" w:hAnsiTheme="minorHAnsi"/>
+          <w:lang w:val="en-GB"/>
+        </w:rPr>
+      </w:pPr>
+    </w:p>
+    <w:p>
+      <w:pPr>
+        <w:pStyle w:val="NormalWeb"/>
+        <w:numPr>
+          <w:ilvl w:val="0"/>
+          <w:numId w:val="2"/>
+        </w:numPr>
+        <w:rPr>
+          <w:rFonts w:asciiTheme="minorHAnsi" w:hAnsiTheme="minorHAnsi"/>
+          <w:lang w:val="en-GB"/>
+        </w:rPr>
+      </w:pPr>
+      <w:r>
+        <w:rPr>
+          <w:rFonts w:asciiTheme="minorHAnsi" w:hAnsiTheme="minorHAnsi"/>
+          <w:lang w:val="en-GB"/>
+        </w:rPr>
+        <w:lastRenderedPageBreak/>
+        <w:t>Tasks:</w:t>
       </w:r>
     </w:p>
     <w:p>
@@ -12585,12 +13011,84 @@
         </w:numPr>
         <w:rPr>
           <w:rFonts w:asciiTheme="minorHAnsi" w:hAnsiTheme="minorHAnsi"/>
+          <w:strike/>
           <w:lang w:val="en-GB"/>
         </w:rPr>
       </w:pPr>
       <w:r>
         <w:rPr>
           <w:rFonts w:asciiTheme="minorHAnsi" w:hAnsiTheme="minorHAnsi"/>
+          <w:strike/>
+          <w:lang w:val="en-GB"/>
+        </w:rPr>
+        <w:t>Convert all the accels to g force and mag units</w:t>
+      </w:r>
+    </w:p>
+    <w:p>
+      <w:pPr>
+        <w:pStyle w:val="NormalWeb"/>
+        <w:numPr>
+          <w:ilvl w:val="1"/>
+          <w:numId w:val="2"/>
+        </w:numPr>
+        <w:rPr>
+          <w:rFonts w:asciiTheme="minorHAnsi" w:hAnsiTheme="minorHAnsi"/>
+          <w:strike/>
+          <w:lang w:val="en-GB"/>
+        </w:rPr>
+      </w:pPr>
+      <w:r>
+        <w:rPr>
+          <w:rFonts w:asciiTheme="minorHAnsi" w:hAnsiTheme="minorHAnsi"/>
+          <w:lang w:val="en-GB"/>
+        </w:rPr>
+        <w:t>Standardise orientation so all devices roughly the same</w:t>
+      </w:r>
+      <w:r>
+        <w:rPr>
+          <w:rFonts w:asciiTheme="minorHAnsi" w:hAnsiTheme="minorHAnsi"/>
+          <w:lang w:val="en-GB"/>
+        </w:rPr>
+        <w:t xml:space="preserve"> (make it the same as the top image)</w:t>
+      </w:r>
+    </w:p>
+    <w:p>
+      <w:pPr>
+        <w:pStyle w:val="NormalWeb"/>
+        <w:numPr>
+          <w:ilvl w:val="1"/>
+          <w:numId w:val="2"/>
+        </w:numPr>
+        <w:rPr>
+          <w:rFonts w:asciiTheme="minorHAnsi" w:hAnsiTheme="minorHAnsi"/>
+          <w:lang w:val="en-GB"/>
+        </w:rPr>
+      </w:pPr>
+      <w:r>
+        <w:rPr>
+          <w:rFonts w:asciiTheme="minorHAnsi" w:hAnsiTheme="minorHAnsi"/>
+          <w:lang w:val="en-GB"/>
+        </w:rPr>
+        <w:t>Join the cropped 4g accels with the axivity uncropped data to complete the peaks</w:t>
+      </w:r>
+    </w:p>
+    <w:p>
+      <w:pPr>
+        <w:pStyle w:val="NormalWeb"/>
+        <w:numPr>
+          <w:ilvl w:val="1"/>
+          <w:numId w:val="2"/>
+        </w:numPr>
+        <w:rPr>
+          <w:rFonts w:asciiTheme="minorHAnsi" w:hAnsiTheme="minorHAnsi"/>
+          <w:strike/>
+          <w:lang w:val="en-GB"/>
+        </w:rPr>
+      </w:pPr>
+      <w:r>
+        <w:rPr>
+          <w:rFonts w:asciiTheme="minorHAnsi" w:hAnsiTheme="minorHAnsi"/>
+          <w:strike/>
           <w:lang w:val="en-GB"/>
         </w:rPr>
         <w:t>Smooth and filter the data</w:t>
@@ -12782,7 +13280,7 @@
       </w:pPr>
     </w:p>
     <w:sectPr>
-      <w:headerReference w:type="default" r:id="rId93"/>
+      <w:headerReference w:type="default" r:id="rId105"/>
       <w:pgSz w:w="12240" w:h="15840"/>
       <w:pgMar w:top="720" w:right="720" w:bottom="720" w:left="720" w:header="720" w:footer="720" w:gutter="0"/>
       <w:cols w:space="720"/>
@@ -13678,6 +14176,7 @@
   <w:style w:type="character" w:default="1" w:styleId="DefaultParagraphFont">
     <w:name w:val="Default Paragraph Font"/>
     <w:uiPriority w:val="1"/>
+    <w:semiHidden/>
     <w:unhideWhenUsed/>
   </w:style>
   <w:style w:type="table" w:default="1" w:styleId="TableNormal">

</xml_diff>

<commit_message>
boosting training data (something went wrong after round 2 matlab cleaning)
</commit_message>
<xml_diff>
--- a/Notes/Worklog.docx
+++ b/Notes/Worklog.docx
@@ -12842,7 +12842,33 @@
         <w:pStyle w:val="Heading2"/>
       </w:pPr>
       <w:r>
-        <w:t>Boosting Training Data</w:t>
+        <w:t>Training the model</w:t>
+      </w:r>
+    </w:p>
+    <w:p>
+      <w:pPr>
+        <w:pStyle w:val="Heading3"/>
+        <w:rPr>
+          <w:rFonts w:cs="Arial"/>
+        </w:rPr>
+      </w:pPr>
+      <w:r>
+        <w:rPr>
+          <w:rFonts w:cs="Arial"/>
+        </w:rPr>
+        <w:t>1</w:t>
+      </w:r>
+      <w:r>
+        <w:rPr>
+          <w:rFonts w:cs="Arial"/>
+        </w:rPr>
+        <w:t>5</w:t>
+      </w:r>
+      <w:r>
+        <w:rPr>
+          <w:rFonts w:cs="Arial"/>
+        </w:rPr>
+        <w:t>/05</w:t>
       </w:r>
     </w:p>
     <w:p>
@@ -12862,34 +12888,35 @@
           <w:rFonts w:asciiTheme="minorHAnsi" w:hAnsiTheme="minorHAnsi"/>
           <w:lang w:val="en-GB"/>
         </w:rPr>
-        <w:t>System of extracting data looks good, so will continue this way</w:t>
+        <w:t xml:space="preserve">Yesterday I extracted a tonne of data and checked it all. </w:t>
       </w:r>
       <w:r>
         <w:rPr>
           <w:rFonts w:asciiTheme="minorHAnsi" w:hAnsiTheme="minorHAnsi"/>
           <w:lang w:val="en-GB"/>
         </w:rPr>
-        <w:t xml:space="preserve"> via the matlab.</w:t>
-      </w:r>
-    </w:p>
-    <w:p>
-      <w:pPr>
-        <w:pStyle w:val="NormalWeb"/>
-        <w:numPr>
-          <w:ilvl w:val="0"/>
-          <w:numId w:val="2"/>
-        </w:numPr>
+        <w:t>Looks mostly good</w:t>
+      </w:r>
+      <w:r>
         <w:rPr>
           <w:rFonts w:asciiTheme="minorHAnsi" w:hAnsiTheme="minorHAnsi"/>
           <w:lang w:val="en-GB"/>
         </w:rPr>
-      </w:pPr>
+        <w:t>.</w:t>
+      </w:r>
       <w:r>
         <w:rPr>
           <w:rFonts w:asciiTheme="minorHAnsi" w:hAnsiTheme="minorHAnsi"/>
           <w:lang w:val="en-GB"/>
         </w:rPr>
-        <w:t>Locking in for an hour lets see how I go.</w:t>
+        <w:t xml:space="preserve"> Some errors I can see, but these will be cleaned out in the next step of the second matlab</w:t>
+      </w:r>
+      <w:r>
+        <w:rPr>
+          <w:rFonts w:asciiTheme="minorHAnsi" w:hAnsiTheme="minorHAnsi"/>
+          <w:lang w:val="en-GB"/>
+        </w:rPr>
+        <w:t>… Which, now I think about it, should be done before I stitch back to the original behaviours… Going to rearrange the code now.</w:t>
       </w:r>
     </w:p>
     <w:p>
@@ -12908,10 +12935,10 @@
           <w:lang w:val="en-GB"/>
         </w:rPr>
         <w:drawing>
-          <wp:inline distT="0" distB="0" distL="0" distR="0" wp14:anchorId="607AAA5E" wp14:editId="0D97BBEC">
-            <wp:extent cx="6181725" cy="3971212"/>
+          <wp:inline distT="0" distB="0" distL="0" distR="0" wp14:anchorId="49B9F991" wp14:editId="182F336B">
+            <wp:extent cx="6829425" cy="2344707"/>
             <wp:effectExtent l="0" t="0" r="0" b="0"/>
-            <wp:docPr id="274177336" name="Picture 5"/>
+            <wp:docPr id="319207565" name="Picture 9"/>
             <wp:cNvGraphicFramePr>
               <a:graphicFrameLocks xmlns:a="http://schemas.openxmlformats.org/drawingml/2006/main" noChangeAspect="1"/>
             </wp:cNvGraphicFramePr>
@@ -12919,7 +12946,7 @@
               <a:graphicData uri="http://schemas.openxmlformats.org/drawingml/2006/picture">
                 <pic:pic xmlns:pic="http://schemas.openxmlformats.org/drawingml/2006/picture">
                   <pic:nvPicPr>
-                    <pic:cNvPr id="0" name="Picture 3"/>
+                    <pic:cNvPr id="0" name="Picture 5"/>
                     <pic:cNvPicPr>
                       <a:picLocks noChangeAspect="1" noChangeArrowheads="1"/>
                     </pic:cNvPicPr>
@@ -12940,7 +12967,7 @@
                   <pic:spPr bwMode="auto">
                     <a:xfrm>
                       <a:off x="0" y="0"/>
-                      <a:ext cx="6188865" cy="3975799"/>
+                      <a:ext cx="6869343" cy="2358412"/>
                     </a:xfrm>
                     <a:prstGeom prst="rect">
                       <a:avLst/>
@@ -12962,6 +12989,104 @@
           <w:lang w:val="en-GB"/>
         </w:rPr>
       </w:pPr>
+      <w:r>
+        <w:rPr>
+          <w:rFonts w:asciiTheme="minorHAnsi" w:hAnsiTheme="minorHAnsi"/>
+          <w:noProof/>
+          <w:lang w:val="en-GB"/>
+        </w:rPr>
+        <w:lastRenderedPageBreak/>
+        <w:drawing>
+          <wp:inline distT="0" distB="0" distL="0" distR="0" wp14:anchorId="10F17514" wp14:editId="0878E058">
+            <wp:extent cx="6959234" cy="4505325"/>
+            <wp:effectExtent l="0" t="0" r="0" b="0"/>
+            <wp:docPr id="655845867" name="Picture 7"/>
+            <wp:cNvGraphicFramePr>
+              <a:graphicFrameLocks xmlns:a="http://schemas.openxmlformats.org/drawingml/2006/main" noChangeAspect="1"/>
+            </wp:cNvGraphicFramePr>
+            <a:graphic xmlns:a="http://schemas.openxmlformats.org/drawingml/2006/main">
+              <a:graphicData uri="http://schemas.openxmlformats.org/drawingml/2006/picture">
+                <pic:pic xmlns:pic="http://schemas.openxmlformats.org/drawingml/2006/picture">
+                  <pic:nvPicPr>
+                    <pic:cNvPr id="0" name="Picture 4"/>
+                    <pic:cNvPicPr>
+                      <a:picLocks noChangeAspect="1" noChangeArrowheads="1"/>
+                    </pic:cNvPicPr>
+                  </pic:nvPicPr>
+                  <pic:blipFill>
+                    <a:blip r:embed="rId105">
+                      <a:extLst>
+                        <a:ext uri="{28A0092B-C50C-407E-A947-70E740481C1C}">
+                          <a14:useLocalDpi xmlns:a14="http://schemas.microsoft.com/office/drawing/2010/main" val="0"/>
+                        </a:ext>
+                      </a:extLst>
+                    </a:blip>
+                    <a:srcRect/>
+                    <a:stretch>
+                      <a:fillRect/>
+                    </a:stretch>
+                  </pic:blipFill>
+                  <pic:spPr bwMode="auto">
+                    <a:xfrm>
+                      <a:off x="0" y="0"/>
+                      <a:ext cx="6985704" cy="4522461"/>
+                    </a:xfrm>
+                    <a:prstGeom prst="rect">
+                      <a:avLst/>
+                    </a:prstGeom>
+                    <a:noFill/>
+                  </pic:spPr>
+                </pic:pic>
+              </a:graphicData>
+            </a:graphic>
+          </wp:inline>
+        </w:drawing>
+      </w:r>
+    </w:p>
+    <w:p>
+      <w:pPr>
+        <w:pStyle w:val="NormalWeb"/>
+        <w:rPr>
+          <w:rFonts w:asciiTheme="minorHAnsi" w:hAnsiTheme="minorHAnsi"/>
+          <w:lang w:val="en-GB"/>
+        </w:rPr>
+      </w:pPr>
+    </w:p>
+    <w:p>
+      <w:pPr>
+        <w:pStyle w:val="NormalWeb"/>
+        <w:rPr>
+          <w:rFonts w:asciiTheme="minorHAnsi" w:hAnsiTheme="minorHAnsi"/>
+          <w:lang w:val="en-GB"/>
+        </w:rPr>
+      </w:pPr>
+    </w:p>
+    <w:p>
+      <w:pPr>
+        <w:pStyle w:val="NormalWeb"/>
+        <w:rPr>
+          <w:rFonts w:asciiTheme="minorHAnsi" w:hAnsiTheme="minorHAnsi"/>
+          <w:lang w:val="en-GB"/>
+        </w:rPr>
+      </w:pPr>
+    </w:p>
+    <w:p>
+      <w:pPr>
+        <w:pStyle w:val="NormalWeb"/>
+        <w:rPr>
+          <w:rFonts w:asciiTheme="minorHAnsi" w:hAnsiTheme="minorHAnsi"/>
+          <w:lang w:val="en-GB"/>
+        </w:rPr>
+      </w:pPr>
+    </w:p>
+    <w:p>
+      <w:pPr>
+        <w:pStyle w:val="NormalWeb"/>
+        <w:rPr>
+          <w:rFonts w:asciiTheme="minorHAnsi" w:hAnsiTheme="minorHAnsi"/>
+          <w:lang w:val="en-GB"/>
+        </w:rPr>
+      </w:pPr>
     </w:p>
     <w:p>
       <w:pPr>
@@ -12998,7 +13123,6 @@
           <w:rFonts w:asciiTheme="minorHAnsi" w:hAnsiTheme="minorHAnsi"/>
           <w:lang w:val="en-GB"/>
         </w:rPr>
-        <w:lastRenderedPageBreak/>
         <w:t>Tasks:</w:t>
       </w:r>
     </w:p>
@@ -13280,7 +13404,7 @@
       </w:pPr>
     </w:p>
     <w:sectPr>
-      <w:headerReference w:type="default" r:id="rId105"/>
+      <w:headerReference w:type="default" r:id="rId106"/>
       <w:pgSz w:w="12240" w:h="15840"/>
       <w:pgMar w:top="720" w:right="720" w:bottom="720" w:left="720" w:header="720" w:footer="720" w:gutter="0"/>
       <w:cols w:space="720"/>

</xml_diff>

<commit_message>
code for cleaning the training data
</commit_message>
<xml_diff>
--- a/Notes/Worklog.docx
+++ b/Notes/Worklog.docx
@@ -12,7 +12,15 @@
     </w:p>
     <w:p>
       <w:r>
-        <w:t>The impala data was collected by Chris Clemente, Jasmin Annett, Robin Maag, Chris Bird, and Taylor Dick across 3 field deployments in South Africa: 2024, April 2025, and July 2025.  The idea behind the project was to put our custom-designed collars (including an Artemis board which logged GPS and accelerometer data, as well as a stand-alone Axivity) on impalas, record their behaviours with a drone, and then reconstruct their exact behaviours and paths from the acceleration data.</w:t>
+        <w:t xml:space="preserve">The impala data was collected by Chris Clemente, Jasmin Annett, Robin Maag, Chris Bird, and Taylor Dick across 3 field deployments in South Africa: 2024, April 2025, and July 2025.  The idea behind the project was to put our custom-designed collars (including an Artemis board which logged GPS and accelerometer data, as well as a stand-alone </w:t>
+      </w:r>
+      <w:proofErr w:type="spellStart"/>
+      <w:r>
+        <w:t>Axivity</w:t>
+      </w:r>
+      <w:proofErr w:type="spellEnd"/>
+      <w:r>
+        <w:t>) on impalas, record their behaviours with a drone, and then reconstruct their exact behaviours and paths from the acceleration data.</w:t>
       </w:r>
       <w:r>
         <w:t xml:space="preserve"> Luke Jessup and Jojo Schultz begun the process of understanding the dead reckoning workflow.</w:t>
@@ -87,7 +95,23 @@
         <w:t>synchronised</w:t>
       </w:r>
       <w:r>
-        <w:t xml:space="preserve">” boards were, in fact, not time synchronised. ChrisC and I spent several weeks trying to align the board with the associated behavioural videos. That work is detailed in this googledoc: </w:t>
+        <w:t xml:space="preserve">” boards were, in fact, not time synchronised. </w:t>
+      </w:r>
+      <w:proofErr w:type="spellStart"/>
+      <w:r>
+        <w:t>ChrisC</w:t>
+      </w:r>
+      <w:proofErr w:type="spellEnd"/>
+      <w:r>
+        <w:t xml:space="preserve"> and I spent several weeks trying to align the board with the associated behavioural videos. That work is detailed in this </w:t>
+      </w:r>
+      <w:proofErr w:type="spellStart"/>
+      <w:r>
+        <w:t>googledoc</w:t>
+      </w:r>
+      <w:proofErr w:type="spellEnd"/>
+      <w:r>
+        <w:t xml:space="preserve">: </w:t>
       </w:r>
       <w:hyperlink r:id="rId8" w:history="1">
         <w:r>
@@ -214,7 +238,15 @@
         <w:spacing w:line="276" w:lineRule="auto"/>
       </w:pPr>
       <w:r>
-        <w:t xml:space="preserve">What this tells me is that my next most valuable endeavour is to figure out the alignment from Robin’s camera. Going to have a crack at that this arvo. </w:t>
+        <w:t xml:space="preserve">What this tells me is that my next most valuable endeavour is to figure out the alignment from Robin’s camera. Going to have a crack at that this </w:t>
+      </w:r>
+      <w:proofErr w:type="spellStart"/>
+      <w:r>
+        <w:t>arvo</w:t>
+      </w:r>
+      <w:proofErr w:type="spellEnd"/>
+      <w:r>
+        <w:t xml:space="preserve">. </w:t>
       </w:r>
       <w:r>
         <w:rPr>
@@ -286,7 +318,15 @@
         <w:spacing w:line="276" w:lineRule="auto"/>
       </w:pPr>
       <w:r>
-        <w:t>Below is collar 8 video 2 as annotated by Amelia with the old system (looked correct to the video). Now I have to be able to replicate that with my new system.</w:t>
+        <w:t xml:space="preserve">Below is collar 8 video 2 as annotated by Amelia with the old system (looked correct to the video). Now I </w:t>
+      </w:r>
+      <w:proofErr w:type="gramStart"/>
+      <w:r>
+        <w:t>have to</w:t>
+      </w:r>
+      <w:proofErr w:type="gramEnd"/>
+      <w:r>
+        <w:t xml:space="preserve"> be able to replicate that with my new system.</w:t>
       </w:r>
     </w:p>
     <w:p>
@@ -354,7 +394,15 @@
         <w:spacing w:line="276" w:lineRule="auto"/>
       </w:pPr>
       <w:r>
-        <w:t>Which I was unable to do… Which means that, somewhere my new system is breaking. Which is actually a good sign… because the error is in my new code, not in the data (flow on implications for why the kangaroo stuff isn’t working).</w:t>
+        <w:t xml:space="preserve">Which I was unable to do… Which means that, somewhere my new system is breaking. Which is </w:t>
+      </w:r>
+      <w:proofErr w:type="gramStart"/>
+      <w:r>
+        <w:t>actually a</w:t>
+      </w:r>
+      <w:proofErr w:type="gramEnd"/>
+      <w:r>
+        <w:t xml:space="preserve"> good sign… because the error is in my new code, not in the data (flow on implications for why the kangaroo stuff isn’t working).</w:t>
       </w:r>
     </w:p>
     <w:p>
@@ -380,7 +428,15 @@
         <w:spacing w:line="276" w:lineRule="auto"/>
       </w:pPr>
       <w:r>
-        <w:t>I reverted all my changes to the plotting method and got the same result. Therefore, either the video times are incorrect or the gps times are incorrect.</w:t>
+        <w:t xml:space="preserve">I reverted all my changes to the plotting method and got the same result. Therefore, either the video times are incorrect or the </w:t>
+      </w:r>
+      <w:proofErr w:type="spellStart"/>
+      <w:r>
+        <w:t>gps</w:t>
+      </w:r>
+      <w:proofErr w:type="spellEnd"/>
+      <w:r>
+        <w:t xml:space="preserve"> times are incorrect.</w:t>
       </w:r>
     </w:p>
     <w:p>
@@ -393,7 +449,15 @@
         <w:spacing w:line="276" w:lineRule="auto"/>
       </w:pPr>
       <w:r>
-        <w:t xml:space="preserve">I rechecked the video times and no joy. Therefore, I think the gps times are wrong. Going to revert all the work I did yesterday back to the original versions. </w:t>
+        <w:t xml:space="preserve">I rechecked the video times and no joy. Therefore, I think the </w:t>
+      </w:r>
+      <w:proofErr w:type="spellStart"/>
+      <w:r>
+        <w:t>gps</w:t>
+      </w:r>
+      <w:proofErr w:type="spellEnd"/>
+      <w:r>
+        <w:t xml:space="preserve"> times are wrong. Going to revert all the work I did yesterday back to the original versions. </w:t>
       </w:r>
     </w:p>
     <w:p>
@@ -409,7 +473,15 @@
         <w:sym w:font="Wingdings" w:char="F0E0"/>
       </w:r>
       <w:r>
-        <w:t xml:space="preserve"> Note that the kangaroo data had a lot of error not encountered in the impala data (e.g., multiple board resets, skipped reads, incorrect GPS writes, etc). The fact that using the “cleaning code” I wrote for the kangies on the impala caused the impala to break indicates that there is something wrong with the cleaning code…</w:t>
+        <w:t xml:space="preserve"> Note that the kangaroo data had a lot of error not encountered in the impala data (e.g., multiple board resets, skipped reads, incorrect GPS writes, etc). The fact that using the “cleaning code” I wrote for the </w:t>
+      </w:r>
+      <w:proofErr w:type="spellStart"/>
+      <w:r>
+        <w:t>kangies</w:t>
+      </w:r>
+      <w:proofErr w:type="spellEnd"/>
+      <w:r>
+        <w:t xml:space="preserve"> on the impala caused the impala to break indicates that there is something wrong with the cleaning code…</w:t>
       </w:r>
     </w:p>
     <w:p>
@@ -422,7 +494,15 @@
         <w:spacing w:line="276" w:lineRule="auto"/>
       </w:pPr>
       <w:r>
-        <w:t>Okay, I’m actually going to revert everything. Back to the very beginning and check differences along every step of the way. I created a branch from 5 months ago and will check every step along the way:</w:t>
+        <w:t xml:space="preserve">Okay, I’m </w:t>
+      </w:r>
+      <w:proofErr w:type="gramStart"/>
+      <w:r>
+        <w:t>actually going</w:t>
+      </w:r>
+      <w:proofErr w:type="gramEnd"/>
+      <w:r>
+        <w:t xml:space="preserve"> to revert everything. Back to the very beginning and check differences along every step of the way. I created a branch from 5 months ago and will check every step along the way:</w:t>
       </w:r>
     </w:p>
     <w:p>
@@ -448,8 +528,13 @@
         <w:spacing w:line="276" w:lineRule="auto"/>
       </w:pPr>
       <w:r>
-        <w:t>Accel stitch: Exactly the same</w:t>
-      </w:r>
+        <w:t xml:space="preserve">Accel stitch: </w:t>
+      </w:r>
+      <w:proofErr w:type="gramStart"/>
+      <w:r>
+        <w:t>Exactly the same</w:t>
+      </w:r>
+      <w:proofErr w:type="gramEnd"/>
     </w:p>
     <w:p>
       <w:pPr>
@@ -461,7 +546,15 @@
         <w:spacing w:line="276" w:lineRule="auto"/>
       </w:pPr>
       <w:r>
-        <w:t xml:space="preserve">Old method doesn’t account for the internal clock restarting on the accelerometer but when I more closely investigated, it does restart. There are duplicated values in the timestamps. </w:t>
+        <w:t xml:space="preserve">Old method doesn’t account for the internal clock restarting on the </w:t>
+      </w:r>
+      <w:proofErr w:type="gramStart"/>
+      <w:r>
+        <w:t>accelerometer</w:t>
+      </w:r>
+      <w:proofErr w:type="gramEnd"/>
+      <w:r>
+        <w:t xml:space="preserve"> but when I more closely investigated, it does restart. There are duplicated values in the timestamps. </w:t>
       </w:r>
       <w:r>
         <w:sym w:font="Wingdings" w:char="F0E0"/>
@@ -553,8 +646,13 @@
         <w:spacing w:line="276" w:lineRule="auto"/>
       </w:pPr>
       <w:r>
-        <w:t>Reordered the dataset by the reset events and then removed the misreads where there was an uneven increment between the internal and external times on the gps_board</w:t>
-      </w:r>
+        <w:t xml:space="preserve">Reordered the dataset by the reset events and then removed the misreads where there was an uneven increment between the internal and external times on the </w:t>
+      </w:r>
+      <w:proofErr w:type="spellStart"/>
+      <w:r>
+        <w:t>gps_board</w:t>
+      </w:r>
+      <w:proofErr w:type="spellEnd"/>
     </w:p>
     <w:p>
       <w:pPr>
@@ -606,7 +704,15 @@
         <w:spacing w:line="276" w:lineRule="auto"/>
       </w:pPr>
       <w:r>
-        <w:t>Below confirmed that the gps timestamps stay the same after writing and reading but also converted everything to numeric to be safe.</w:t>
+        <w:t xml:space="preserve">Below confirmed that the </w:t>
+      </w:r>
+      <w:proofErr w:type="spellStart"/>
+      <w:r>
+        <w:t>gps</w:t>
+      </w:r>
+      <w:proofErr w:type="spellEnd"/>
+      <w:r>
+        <w:t xml:space="preserve"> timestamps stay the same after writing and reading but also converted everything to numeric to be safe.</w:t>
       </w:r>
     </w:p>
     <w:p>
@@ -781,7 +887,23 @@
         <w:spacing w:line="276" w:lineRule="auto"/>
       </w:pPr>
       <w:r>
-        <w:t>But somehow they are then getting back mixed together after I combine the accel and gps?</w:t>
+        <w:t xml:space="preserve">But </w:t>
+      </w:r>
+      <w:proofErr w:type="gramStart"/>
+      <w:r>
+        <w:t>somehow</w:t>
+      </w:r>
+      <w:proofErr w:type="gramEnd"/>
+      <w:r>
+        <w:t xml:space="preserve"> they are then getting back mixed together after I combine the accel and </w:t>
+      </w:r>
+      <w:proofErr w:type="spellStart"/>
+      <w:r>
+        <w:t>gps</w:t>
+      </w:r>
+      <w:proofErr w:type="spellEnd"/>
+      <w:r>
+        <w:t>?</w:t>
       </w:r>
     </w:p>
     <w:p>
@@ -1046,7 +1168,15 @@
         <w:spacing w:line="276" w:lineRule="auto"/>
       </w:pPr>
       <w:r>
-        <w:t xml:space="preserve">Wait. Wait. It seems like it might already be aligned? If you watch a video a sufficient number of times, you can gaslight yourself into literally anything. (Robin Vid </w:t>
+        <w:t xml:space="preserve">Wait. Wait. It seems like it might already be aligned? If you watch a video </w:t>
+      </w:r>
+      <w:proofErr w:type="gramStart"/>
+      <w:r>
+        <w:t>a sufficient number of</w:t>
+      </w:r>
+      <w:proofErr w:type="gramEnd"/>
+      <w:r>
+        <w:t xml:space="preserve"> times, you can gaslight yourself into literally anything. (Robin Vid </w:t>
       </w:r>
       <w:r>
         <w:t>8</w:t>
@@ -1120,7 +1250,15 @@
         <w:spacing w:line="276" w:lineRule="auto"/>
       </w:pPr>
       <w:r>
-        <w:t>Amazing! So it was aligned and Amelia did a tonne of work on it.</w:t>
+        <w:t xml:space="preserve">Amazing! </w:t>
+      </w:r>
+      <w:proofErr w:type="gramStart"/>
+      <w:r>
+        <w:t>So</w:t>
+      </w:r>
+      <w:proofErr w:type="gramEnd"/>
+      <w:r>
+        <w:t xml:space="preserve"> it was aligned and Amelia did a tonne of work on it.</w:t>
       </w:r>
     </w:p>
     <w:p>
@@ -1236,7 +1374,15 @@
       </w:pPr>
       <w:r>
         <w:lastRenderedPageBreak/>
-        <w:t>I feel really unwell but trying to do a little of this before I go to sleep. Trying to get the dead reckoning script set up for Ethan to work on in a fortnight.</w:t>
+        <w:t xml:space="preserve">I feel </w:t>
+      </w:r>
+      <w:proofErr w:type="gramStart"/>
+      <w:r>
+        <w:t>really unwell</w:t>
+      </w:r>
+      <w:proofErr w:type="gramEnd"/>
+      <w:r>
+        <w:t xml:space="preserve"> but trying to do a little of this before I go to sleep. Trying to get the dead reckoning script set up for Ethan to work on in a fortnight.</w:t>
       </w:r>
     </w:p>
     <w:p>
@@ -1377,7 +1523,15 @@
         </w:numPr>
       </w:pPr>
       <w:r>
-        <w:t>In the meantime, I just did a Z score normalisation so I can plot them all on the same axes. The below image is what I have to use to figure out the orientation of the collar.</w:t>
+        <w:t xml:space="preserve">In the meantime, I just did a Z score normalisation so I can plot them all on the same axes. The below image is what I </w:t>
+      </w:r>
+      <w:proofErr w:type="gramStart"/>
+      <w:r>
+        <w:t>have to</w:t>
+      </w:r>
+      <w:proofErr w:type="gramEnd"/>
+      <w:r>
+        <w:t xml:space="preserve"> use to figure out the orientation of the collar.</w:t>
       </w:r>
     </w:p>
     <w:p>
@@ -2057,7 +2211,21 @@
         <w:rPr>
           <w:bdr w:val="none" w:sz="0" w:space="0" w:color="auto" w:frame="1"/>
         </w:rPr>
-        <w:t xml:space="preserve"> Not much, tbh.</w:t>
+        <w:t xml:space="preserve"> Not much, </w:t>
+      </w:r>
+      <w:proofErr w:type="spellStart"/>
+      <w:r>
+        <w:rPr>
+          <w:bdr w:val="none" w:sz="0" w:space="0" w:color="auto" w:frame="1"/>
+        </w:rPr>
+        <w:t>tbh</w:t>
+      </w:r>
+      <w:proofErr w:type="spellEnd"/>
+      <w:r>
+        <w:rPr>
+          <w:bdr w:val="none" w:sz="0" w:space="0" w:color="auto" w:frame="1"/>
+        </w:rPr>
+        <w:t>.</w:t>
       </w:r>
     </w:p>
     <w:p>
@@ -2078,7 +2246,23 @@
         <w:t xml:space="preserve"> downward = +Z in NED).</w:t>
       </w:r>
       <w:r>
-        <w:t xml:space="preserve"> So this might be NED with a lot of roll… could also be NWD?</w:t>
+        <w:t xml:space="preserve"> </w:t>
+      </w:r>
+      <w:proofErr w:type="gramStart"/>
+      <w:r>
+        <w:t>So</w:t>
+      </w:r>
+      <w:proofErr w:type="gramEnd"/>
+      <w:r>
+        <w:t xml:space="preserve"> this might be NED with a lot of </w:t>
+      </w:r>
+      <w:proofErr w:type="gramStart"/>
+      <w:r>
+        <w:t>roll</w:t>
+      </w:r>
+      <w:proofErr w:type="gramEnd"/>
+      <w:r>
+        <w:t>… could also be NWD?</w:t>
       </w:r>
     </w:p>
     <w:p>
@@ -2158,7 +2342,23 @@
         </w:numPr>
       </w:pPr>
       <w:r>
-        <w:t>Raw tri-axial magnetometer data (mag.x,y,z)</w:t>
+        <w:t>Raw tri-axial magnetometer data (</w:t>
+      </w:r>
+      <w:proofErr w:type="spellStart"/>
+      <w:r>
+        <w:t>mag.</w:t>
+      </w:r>
+      <w:proofErr w:type="gramStart"/>
+      <w:r>
+        <w:t>x,y</w:t>
+      </w:r>
+      <w:proofErr w:type="gramEnd"/>
+      <w:r>
+        <w:t>,z</w:t>
+      </w:r>
+      <w:proofErr w:type="spellEnd"/>
+      <w:r>
+        <w:t>)</w:t>
       </w:r>
     </w:p>
     <w:p>
@@ -2170,7 +2370,23 @@
         </w:numPr>
       </w:pPr>
       <w:r>
-        <w:t>Tri-axial static acceleration data (acc.x,y,z) (the smoothed values)</w:t>
+        <w:t>Tri-axial static acceleration data (</w:t>
+      </w:r>
+      <w:proofErr w:type="spellStart"/>
+      <w:r>
+        <w:t>acc.</w:t>
+      </w:r>
+      <w:proofErr w:type="gramStart"/>
+      <w:r>
+        <w:t>x,y</w:t>
+      </w:r>
+      <w:proofErr w:type="gramEnd"/>
+      <w:r>
+        <w:t>,z</w:t>
+      </w:r>
+      <w:proofErr w:type="spellEnd"/>
+      <w:r>
+        <w:t>) (the smoothed values)</w:t>
       </w:r>
     </w:p>
     <w:p>
@@ -2218,12 +2434,36 @@
         </w:numPr>
       </w:pPr>
       <w:r>
-        <w:t>Estimated pitch offset: Approximately how much was it rotated by? * algorithm = “standard” (standard euler angle approach) or “SAAM” (using quaternions)</w:t>
-      </w:r>
-    </w:p>
-    <w:p>
-      <w:r>
-        <w:t>We have most of these variables available in the data already, but there are some that we have to figure out. To understand the reference coordinate system for this analysis, firstly we have to understand what the axes represent. This analysis system assumes the North-East-Down (NED) system where the X axis will be the surge (forward and back, North and South), Y will be the sway (side to side, East and West), and Z will be heave (up and down).</w:t>
+        <w:t xml:space="preserve">Estimated pitch offset: Approximately how much was it rotated by? * algorithm = “standard” (standard </w:t>
+      </w:r>
+      <w:proofErr w:type="spellStart"/>
+      <w:r>
+        <w:t>euler</w:t>
+      </w:r>
+      <w:proofErr w:type="spellEnd"/>
+      <w:r>
+        <w:t xml:space="preserve"> angle approach) or “SAAM” (using quaternions)</w:t>
+      </w:r>
+    </w:p>
+    <w:p>
+      <w:r>
+        <w:t xml:space="preserve">We have most of these variables available in the data already, but there are some that we </w:t>
+      </w:r>
+      <w:proofErr w:type="gramStart"/>
+      <w:r>
+        <w:t>have to</w:t>
+      </w:r>
+      <w:proofErr w:type="gramEnd"/>
+      <w:r>
+        <w:t xml:space="preserve"> figure out. To understand the reference coordinate system for this analysis, firstly we </w:t>
+      </w:r>
+      <w:proofErr w:type="gramStart"/>
+      <w:r>
+        <w:t>have to</w:t>
+      </w:r>
+      <w:proofErr w:type="gramEnd"/>
+      <w:r>
+        <w:t xml:space="preserve"> understand what the axes represent. This analysis system assumes the North-East-Down (NED) system where the X axis will be the surge (forward and back, North and South), Y will be the sway (side to side, East and West), and Z will be heave (up and down).</w:t>
       </w:r>
     </w:p>
     <w:p>
@@ -2358,12 +2598,69 @@
     </w:p>
     <w:p>
       <w:r>
-        <w:t>In the above image we have imagined a compass. We then have to describe the direction of the 3 axes (fingers) according to these compass directions in the order of X, Y, Z. In this case it will therefore be North for X, East for Y, and Up for Z. The coordinate system would therefore be North-East-Up (NEU). In total, there 48 possible combinations of coordinate frame configurations.</w:t>
-      </w:r>
-    </w:p>
-    <w:p>
-      <w:r>
-        <w:t>The default orientation of the Gundog system is North-East-Down (NED) where the axes readings would be X = 0, Y = 0, and Z = -1. Before we could use data from our hand accelerometer we would have to flip it upside down. Some devices may have a different local coordinate frame, e.g., the END (East-North-Down) coordinate system assume the surge dimension of movement is represented by the z-channel, and the sway and heave dimension, by the x- and y-channels, respectively. Providing the original coordinate system allows the Gundogs system to convert your local system to the global system. The Gundog.Compass function comes with three inputs to allow the user to transform their device’s coordinate frame into the NED that the specific Direction Cosine Matrix (DCM) and quaternion augmentation uses to compute angles:‘acc.ref.frame’, ‘positive.g’, and ‘mag.ref.frame’</w:t>
+        <w:t xml:space="preserve">In the above image we have imagined a compass. We then </w:t>
+      </w:r>
+      <w:proofErr w:type="gramStart"/>
+      <w:r>
+        <w:t>have to</w:t>
+      </w:r>
+      <w:proofErr w:type="gramEnd"/>
+      <w:r>
+        <w:t xml:space="preserve"> describe the direction of the 3 axes (fingers) according to these compass directions in the order of X, Y, Z. In this case it will therefore be North for X, East for Y, and Up for Z. The coordinate system would therefore be North-East-Up (NEU). In total, there 48 possible combinations of coordinate frame configurations.</w:t>
+      </w:r>
+    </w:p>
+    <w:p>
+      <w:r>
+        <w:t xml:space="preserve">The default orientation of the Gundog system is North-East-Down (NED) where the axes readings would be X = 0, Y = 0, and Z = -1. Before we could use data from our hand </w:t>
+      </w:r>
+      <w:proofErr w:type="gramStart"/>
+      <w:r>
+        <w:t>accelerometer</w:t>
+      </w:r>
+      <w:proofErr w:type="gramEnd"/>
+      <w:r>
+        <w:t xml:space="preserve"> we would have to flip it upside down. Some devices may have a different local coordinate frame, e.g., the END (East-North-Down) coordinate system assume the surge dimension of movement is represented by the z-channel, and the sway and heave dimension, by the x- and y-channels, respectively. Providing the original coordinate system allows the Gundogs system to convert your local system to the global system. The </w:t>
+      </w:r>
+      <w:proofErr w:type="spellStart"/>
+      <w:r>
+        <w:t>Gundog.Compass</w:t>
+      </w:r>
+      <w:proofErr w:type="spellEnd"/>
+      <w:r>
+        <w:t xml:space="preserve"> function comes with three inputs to allow the user to transform their device’s coordinate frame into the NED that the specific Direction Cosine Matrix (DCM) and quaternion augmentation uses to compute </w:t>
+      </w:r>
+      <w:proofErr w:type="gramStart"/>
+      <w:r>
+        <w:t>angles:‘</w:t>
+      </w:r>
+      <w:proofErr w:type="spellStart"/>
+      <w:r>
+        <w:t>acc.ref.frame</w:t>
+      </w:r>
+      <w:proofErr w:type="spellEnd"/>
+      <w:proofErr w:type="gramEnd"/>
+      <w:r>
+        <w:t>’, ‘</w:t>
+      </w:r>
+      <w:proofErr w:type="spellStart"/>
+      <w:proofErr w:type="gramStart"/>
+      <w:r>
+        <w:t>positive.g</w:t>
+      </w:r>
+      <w:proofErr w:type="spellEnd"/>
+      <w:proofErr w:type="gramEnd"/>
+      <w:r>
+        <w:t>’, and ‘</w:t>
+      </w:r>
+      <w:proofErr w:type="spellStart"/>
+      <w:proofErr w:type="gramStart"/>
+      <w:r>
+        <w:t>mag.ref.frame</w:t>
+      </w:r>
+      <w:proofErr w:type="spellEnd"/>
+      <w:proofErr w:type="gramEnd"/>
+      <w:r>
+        <w:t>’</w:t>
       </w:r>
     </w:p>
     <w:p>
@@ -2429,7 +2726,15 @@
         </w:r>
       </w:hyperlink>
       <w:r>
-        <w:t xml:space="preserve"> which Jojo and Luke originally developed. I know that the test trial should result in multiple rectangles but my current trials are getting waves…</w:t>
+        <w:t xml:space="preserve"> which Jojo and Luke originally developed. I know that the test trial should result in multiple </w:t>
+      </w:r>
+      <w:proofErr w:type="gramStart"/>
+      <w:r>
+        <w:t>rectangles</w:t>
+      </w:r>
+      <w:proofErr w:type="gramEnd"/>
+      <w:r>
+        <w:t xml:space="preserve"> but my current trials are getting waves…</w:t>
       </w:r>
       <w:r>
         <w:t xml:space="preserve"> I am now playing around with the different orientations until I get something good.</w:t>
@@ -2444,7 +2749,15 @@
         </w:numPr>
       </w:pPr>
       <w:r>
-        <w:t>This approach ended up being futile so my next step is to go back to Jojo’s original code and look for differences line by line.</w:t>
+        <w:t xml:space="preserve">This approach ended up being </w:t>
+      </w:r>
+      <w:proofErr w:type="gramStart"/>
+      <w:r>
+        <w:t>futile</w:t>
+      </w:r>
+      <w:proofErr w:type="gramEnd"/>
+      <w:r>
+        <w:t xml:space="preserve"> so my next step is to go back to Jojo’s original code and look for differences line by line.</w:t>
       </w:r>
     </w:p>
     <w:p>
@@ -2561,7 +2874,15 @@
         </w:numPr>
       </w:pPr>
       <w:r>
-        <w:t xml:space="preserve">Working through this is very frustrating and making me depressed again… I don’t have their original data and it is very hard to make sense of their original mess of code but here we go. </w:t>
+        <w:t xml:space="preserve">Working through this is very frustrating and making me depressed again… I don’t have their original </w:t>
+      </w:r>
+      <w:proofErr w:type="gramStart"/>
+      <w:r>
+        <w:t>data</w:t>
+      </w:r>
+      <w:proofErr w:type="gramEnd"/>
+      <w:r>
+        <w:t xml:space="preserve"> and it is very hard to make sense of their original mess of code but here we go. </w:t>
       </w:r>
     </w:p>
     <w:p>
@@ -2585,7 +2906,15 @@
         </w:numPr>
       </w:pPr>
       <w:r>
-        <w:t xml:space="preserve">I found their original data and </w:t>
+        <w:t xml:space="preserve">I found their original </w:t>
+      </w:r>
+      <w:proofErr w:type="gramStart"/>
+      <w:r>
+        <w:t>data</w:t>
+      </w:r>
+      <w:proofErr w:type="gramEnd"/>
+      <w:r>
+        <w:t xml:space="preserve"> and </w:t>
       </w:r>
       <w:r>
         <w:t>it</w:t>
@@ -2721,7 +3050,15 @@
         </w:numPr>
       </w:pPr>
       <w:r>
-        <w:t xml:space="preserve">I went through in detail and found that my conversion for my magnetometer are off… After aligning them exactly between the GPS points, </w:t>
+        <w:t xml:space="preserve">I went through in detail and found that my conversion for my magnetometer </w:t>
+      </w:r>
+      <w:proofErr w:type="gramStart"/>
+      <w:r>
+        <w:t>are</w:t>
+      </w:r>
+      <w:proofErr w:type="gramEnd"/>
+      <w:r>
+        <w:t xml:space="preserve"> off… After aligning them exactly between the GPS points, </w:t>
       </w:r>
       <w:r>
         <w:rPr>
@@ -2745,7 +3082,21 @@
         <w:rPr>
           <w:highlight w:val="yellow"/>
         </w:rPr>
-        <w:t>by 0.15 to give me what jojo had</w:t>
+        <w:t xml:space="preserve">by 0.15 to give me what </w:t>
+      </w:r>
+      <w:proofErr w:type="spellStart"/>
+      <w:r>
+        <w:rPr>
+          <w:highlight w:val="yellow"/>
+        </w:rPr>
+        <w:t>jojo</w:t>
+      </w:r>
+      <w:proofErr w:type="spellEnd"/>
+      <w:r>
+        <w:rPr>
+          <w:highlight w:val="yellow"/>
+        </w:rPr>
+        <w:t xml:space="preserve"> had</w:t>
       </w:r>
       <w:r>
         <w:t>. So…</w:t>
@@ -2760,12 +3111,137 @@
           <w:szCs w:val="20"/>
         </w:rPr>
       </w:pPr>
+      <w:proofErr w:type="spellStart"/>
+      <w:proofErr w:type="gramStart"/>
       <w:r>
         <w:rPr>
           <w:sz w:val="20"/>
           <w:szCs w:val="20"/>
         </w:rPr>
-        <w:t>mine.flat[, c("RawAX", "RawAY", "RawAZ")] &lt;- mine.flat[, c("RawAX", "RawAY", "RawAZ")] / 2048</w:t>
+        <w:t>mine.flat</w:t>
+      </w:r>
+      <w:proofErr w:type="spellEnd"/>
+      <w:proofErr w:type="gramEnd"/>
+      <w:r>
+        <w:rPr>
+          <w:sz w:val="20"/>
+          <w:szCs w:val="20"/>
+        </w:rPr>
+        <w:t xml:space="preserve">[, </w:t>
+      </w:r>
+      <w:proofErr w:type="gramStart"/>
+      <w:r>
+        <w:rPr>
+          <w:sz w:val="20"/>
+          <w:szCs w:val="20"/>
+        </w:rPr>
+        <w:t>c(</w:t>
+      </w:r>
+      <w:proofErr w:type="gramEnd"/>
+      <w:r>
+        <w:rPr>
+          <w:sz w:val="20"/>
+          <w:szCs w:val="20"/>
+        </w:rPr>
+        <w:t>"</w:t>
+      </w:r>
+      <w:proofErr w:type="spellStart"/>
+      <w:r>
+        <w:rPr>
+          <w:sz w:val="20"/>
+          <w:szCs w:val="20"/>
+        </w:rPr>
+        <w:t>RawAX</w:t>
+      </w:r>
+      <w:proofErr w:type="spellEnd"/>
+      <w:r>
+        <w:rPr>
+          <w:sz w:val="20"/>
+          <w:szCs w:val="20"/>
+        </w:rPr>
+        <w:t>", "RawAY", "</w:t>
+      </w:r>
+      <w:proofErr w:type="spellStart"/>
+      <w:r>
+        <w:rPr>
+          <w:sz w:val="20"/>
+          <w:szCs w:val="20"/>
+        </w:rPr>
+        <w:t>RawAZ</w:t>
+      </w:r>
+      <w:proofErr w:type="spellEnd"/>
+      <w:r>
+        <w:rPr>
+          <w:sz w:val="20"/>
+          <w:szCs w:val="20"/>
+        </w:rPr>
+        <w:t xml:space="preserve">")] &lt;- </w:t>
+      </w:r>
+      <w:proofErr w:type="spellStart"/>
+      <w:proofErr w:type="gramStart"/>
+      <w:r>
+        <w:rPr>
+          <w:sz w:val="20"/>
+          <w:szCs w:val="20"/>
+        </w:rPr>
+        <w:t>mine.flat</w:t>
+      </w:r>
+      <w:proofErr w:type="spellEnd"/>
+      <w:proofErr w:type="gramEnd"/>
+      <w:r>
+        <w:rPr>
+          <w:sz w:val="20"/>
+          <w:szCs w:val="20"/>
+        </w:rPr>
+        <w:t xml:space="preserve">[, </w:t>
+      </w:r>
+      <w:proofErr w:type="gramStart"/>
+      <w:r>
+        <w:rPr>
+          <w:sz w:val="20"/>
+          <w:szCs w:val="20"/>
+        </w:rPr>
+        <w:t>c(</w:t>
+      </w:r>
+      <w:proofErr w:type="gramEnd"/>
+      <w:r>
+        <w:rPr>
+          <w:sz w:val="20"/>
+          <w:szCs w:val="20"/>
+        </w:rPr>
+        <w:t>"</w:t>
+      </w:r>
+      <w:proofErr w:type="spellStart"/>
+      <w:r>
+        <w:rPr>
+          <w:sz w:val="20"/>
+          <w:szCs w:val="20"/>
+        </w:rPr>
+        <w:t>RawAX</w:t>
+      </w:r>
+      <w:proofErr w:type="spellEnd"/>
+      <w:r>
+        <w:rPr>
+          <w:sz w:val="20"/>
+          <w:szCs w:val="20"/>
+        </w:rPr>
+        <w:t>", "RawAY", "</w:t>
+      </w:r>
+      <w:proofErr w:type="spellStart"/>
+      <w:r>
+        <w:rPr>
+          <w:sz w:val="20"/>
+          <w:szCs w:val="20"/>
+        </w:rPr>
+        <w:t>RawAZ</w:t>
+      </w:r>
+      <w:proofErr w:type="spellEnd"/>
+      <w:r>
+        <w:rPr>
+          <w:sz w:val="20"/>
+          <w:szCs w:val="20"/>
+        </w:rPr>
+        <w:t>")] / 2048</w:t>
       </w:r>
     </w:p>
     <w:p>
@@ -2777,12 +3253,169 @@
           <w:szCs w:val="20"/>
         </w:rPr>
       </w:pPr>
+      <w:proofErr w:type="spellStart"/>
+      <w:proofErr w:type="gramStart"/>
       <w:r>
         <w:rPr>
           <w:sz w:val="20"/>
           <w:szCs w:val="20"/>
         </w:rPr>
-        <w:t>mine.flat[, c("RawMX", "RawMY", "RawMZ")] &lt;- mine.flat[, c("RawMX", "RawMY", "RawMZ")] * 0.15</w:t>
+        <w:t>mine.flat</w:t>
+      </w:r>
+      <w:proofErr w:type="spellEnd"/>
+      <w:proofErr w:type="gramEnd"/>
+      <w:r>
+        <w:rPr>
+          <w:sz w:val="20"/>
+          <w:szCs w:val="20"/>
+        </w:rPr>
+        <w:t xml:space="preserve">[, </w:t>
+      </w:r>
+      <w:proofErr w:type="gramStart"/>
+      <w:r>
+        <w:rPr>
+          <w:sz w:val="20"/>
+          <w:szCs w:val="20"/>
+        </w:rPr>
+        <w:t>c(</w:t>
+      </w:r>
+      <w:proofErr w:type="gramEnd"/>
+      <w:r>
+        <w:rPr>
+          <w:sz w:val="20"/>
+          <w:szCs w:val="20"/>
+        </w:rPr>
+        <w:t>"</w:t>
+      </w:r>
+      <w:proofErr w:type="spellStart"/>
+      <w:r>
+        <w:rPr>
+          <w:sz w:val="20"/>
+          <w:szCs w:val="20"/>
+        </w:rPr>
+        <w:t>RawMX</w:t>
+      </w:r>
+      <w:proofErr w:type="spellEnd"/>
+      <w:r>
+        <w:rPr>
+          <w:sz w:val="20"/>
+          <w:szCs w:val="20"/>
+        </w:rPr>
+        <w:t>", "</w:t>
+      </w:r>
+      <w:proofErr w:type="spellStart"/>
+      <w:r>
+        <w:rPr>
+          <w:sz w:val="20"/>
+          <w:szCs w:val="20"/>
+        </w:rPr>
+        <w:t>RawMY</w:t>
+      </w:r>
+      <w:proofErr w:type="spellEnd"/>
+      <w:r>
+        <w:rPr>
+          <w:sz w:val="20"/>
+          <w:szCs w:val="20"/>
+        </w:rPr>
+        <w:t>", "</w:t>
+      </w:r>
+      <w:proofErr w:type="spellStart"/>
+      <w:r>
+        <w:rPr>
+          <w:sz w:val="20"/>
+          <w:szCs w:val="20"/>
+        </w:rPr>
+        <w:t>RawMZ</w:t>
+      </w:r>
+      <w:proofErr w:type="spellEnd"/>
+      <w:r>
+        <w:rPr>
+          <w:sz w:val="20"/>
+          <w:szCs w:val="20"/>
+        </w:rPr>
+        <w:t xml:space="preserve">")] &lt;- </w:t>
+      </w:r>
+      <w:proofErr w:type="spellStart"/>
+      <w:proofErr w:type="gramStart"/>
+      <w:r>
+        <w:rPr>
+          <w:sz w:val="20"/>
+          <w:szCs w:val="20"/>
+        </w:rPr>
+        <w:t>mine.flat</w:t>
+      </w:r>
+      <w:proofErr w:type="spellEnd"/>
+      <w:proofErr w:type="gramEnd"/>
+      <w:r>
+        <w:rPr>
+          <w:sz w:val="20"/>
+          <w:szCs w:val="20"/>
+        </w:rPr>
+        <w:t xml:space="preserve">[, </w:t>
+      </w:r>
+      <w:proofErr w:type="gramStart"/>
+      <w:r>
+        <w:rPr>
+          <w:sz w:val="20"/>
+          <w:szCs w:val="20"/>
+        </w:rPr>
+        <w:t>c(</w:t>
+      </w:r>
+      <w:proofErr w:type="gramEnd"/>
+      <w:r>
+        <w:rPr>
+          <w:sz w:val="20"/>
+          <w:szCs w:val="20"/>
+        </w:rPr>
+        <w:t>"</w:t>
+      </w:r>
+      <w:proofErr w:type="spellStart"/>
+      <w:r>
+        <w:rPr>
+          <w:sz w:val="20"/>
+          <w:szCs w:val="20"/>
+        </w:rPr>
+        <w:t>RawMX</w:t>
+      </w:r>
+      <w:proofErr w:type="spellEnd"/>
+      <w:r>
+        <w:rPr>
+          <w:sz w:val="20"/>
+          <w:szCs w:val="20"/>
+        </w:rPr>
+        <w:t>", "</w:t>
+      </w:r>
+      <w:proofErr w:type="spellStart"/>
+      <w:r>
+        <w:rPr>
+          <w:sz w:val="20"/>
+          <w:szCs w:val="20"/>
+        </w:rPr>
+        <w:t>RawMY</w:t>
+      </w:r>
+      <w:proofErr w:type="spellEnd"/>
+      <w:r>
+        <w:rPr>
+          <w:sz w:val="20"/>
+          <w:szCs w:val="20"/>
+        </w:rPr>
+        <w:t>", "</w:t>
+      </w:r>
+      <w:proofErr w:type="spellStart"/>
+      <w:r>
+        <w:rPr>
+          <w:sz w:val="20"/>
+          <w:szCs w:val="20"/>
+        </w:rPr>
+        <w:t>RawMZ</w:t>
+      </w:r>
+      <w:proofErr w:type="spellEnd"/>
+      <w:r>
+        <w:rPr>
+          <w:sz w:val="20"/>
+          <w:szCs w:val="20"/>
+        </w:rPr>
+        <w:t>")] * 0.15</w:t>
       </w:r>
     </w:p>
     <w:p>
@@ -2794,13 +3427,49 @@
           <w:szCs w:val="20"/>
         </w:rPr>
       </w:pPr>
+      <w:proofErr w:type="spellStart"/>
       <w:r>
         <w:rPr>
           <w:sz w:val="20"/>
           <w:szCs w:val="20"/>
         </w:rPr>
-        <w:t>jojo_df &lt;- df.flat[1:77009, ]</w:t>
-      </w:r>
+        <w:t>jojo_df</w:t>
+      </w:r>
+      <w:proofErr w:type="spellEnd"/>
+      <w:r>
+        <w:rPr>
+          <w:sz w:val="20"/>
+          <w:szCs w:val="20"/>
+        </w:rPr>
+        <w:t xml:space="preserve"> &lt;- </w:t>
+      </w:r>
+      <w:proofErr w:type="spellStart"/>
+      <w:proofErr w:type="gramStart"/>
+      <w:r>
+        <w:rPr>
+          <w:sz w:val="20"/>
+          <w:szCs w:val="20"/>
+        </w:rPr>
+        <w:t>df.flat</w:t>
+      </w:r>
+      <w:proofErr w:type="spellEnd"/>
+      <w:proofErr w:type="gramEnd"/>
+      <w:r>
+        <w:rPr>
+          <w:sz w:val="20"/>
+          <w:szCs w:val="20"/>
+        </w:rPr>
+        <w:t>[1:77009</w:t>
+      </w:r>
+      <w:proofErr w:type="gramStart"/>
+      <w:r>
+        <w:rPr>
+          <w:sz w:val="20"/>
+          <w:szCs w:val="20"/>
+        </w:rPr>
+        <w:t>, ]</w:t>
+      </w:r>
+      <w:proofErr w:type="gramEnd"/>
     </w:p>
     <w:p>
       <w:pPr>
@@ -2811,13 +3480,49 @@
           <w:szCs w:val="20"/>
         </w:rPr>
       </w:pPr>
+      <w:proofErr w:type="spellStart"/>
       <w:r>
         <w:rPr>
           <w:sz w:val="20"/>
           <w:szCs w:val="20"/>
         </w:rPr>
-        <w:t>oak_df &lt;- mine.flat[3064:80072, ]</w:t>
-      </w:r>
+        <w:t>oak_df</w:t>
+      </w:r>
+      <w:proofErr w:type="spellEnd"/>
+      <w:r>
+        <w:rPr>
+          <w:sz w:val="20"/>
+          <w:szCs w:val="20"/>
+        </w:rPr>
+        <w:t xml:space="preserve"> &lt;- </w:t>
+      </w:r>
+      <w:proofErr w:type="spellStart"/>
+      <w:proofErr w:type="gramStart"/>
+      <w:r>
+        <w:rPr>
+          <w:sz w:val="20"/>
+          <w:szCs w:val="20"/>
+        </w:rPr>
+        <w:t>mine.flat</w:t>
+      </w:r>
+      <w:proofErr w:type="spellEnd"/>
+      <w:proofErr w:type="gramEnd"/>
+      <w:r>
+        <w:rPr>
+          <w:sz w:val="20"/>
+          <w:szCs w:val="20"/>
+        </w:rPr>
+        <w:t>[3064:80072</w:t>
+      </w:r>
+      <w:proofErr w:type="gramStart"/>
+      <w:r>
+        <w:rPr>
+          <w:sz w:val="20"/>
+          <w:szCs w:val="20"/>
+        </w:rPr>
+        <w:t>, ]</w:t>
+      </w:r>
+      <w:proofErr w:type="gramEnd"/>
     </w:p>
     <w:p>
       <w:pPr>
@@ -2829,7 +3534,15 @@
       </w:pPr>
       <w:r>
         <w:lastRenderedPageBreak/>
-        <w:t>OMG! That was the only correction I needed and now it aligns beautifully and looks exactly the same!</w:t>
+        <w:t xml:space="preserve">OMG! That was the only correction I needed and now it aligns beautifully and looks </w:t>
+      </w:r>
+      <w:proofErr w:type="gramStart"/>
+      <w:r>
+        <w:t>exactly the same</w:t>
+      </w:r>
+      <w:proofErr w:type="gramEnd"/>
+      <w:r>
+        <w:t>!</w:t>
       </w:r>
       <w:r>
         <w:t xml:space="preserve"> Now to figure out when it isn’t flat.</w:t>
@@ -2938,7 +3651,15 @@
         </w:numPr>
       </w:pPr>
       <w:r>
-        <w:t xml:space="preserve">Excellent. I am now confident that I have an understanding of how this works and how to use it. I now want to expand the workflow to be used on the impala data. </w:t>
+        <w:t xml:space="preserve">Excellent. I am now confident that I </w:t>
+      </w:r>
+      <w:proofErr w:type="gramStart"/>
+      <w:r>
+        <w:t>have an understanding of</w:t>
+      </w:r>
+      <w:proofErr w:type="gramEnd"/>
+      <w:r>
+        <w:t xml:space="preserve"> how this works and how to use it. I now want to expand the workflow to be used on the impala data. </w:t>
       </w:r>
       <w:r>
         <w:t>The hardest part of this is probably</w:t>
@@ -2971,7 +3692,15 @@
         </w:numPr>
       </w:pPr>
       <w:r>
-        <w:t xml:space="preserve">I think I should presume that they’re not. That is, jojo figured out that the </w:t>
+        <w:t xml:space="preserve">I think I should presume that they’re not. That is, </w:t>
+      </w:r>
+      <w:proofErr w:type="spellStart"/>
+      <w:r>
+        <w:t>jojo</w:t>
+      </w:r>
+      <w:proofErr w:type="spellEnd"/>
+      <w:r>
+        <w:t xml:space="preserve"> figured out that the </w:t>
       </w:r>
       <w:r>
         <w:t>accel was NED and the mag was NWU. Whatever my accel orientation is determined to be, the mag will probably be an equivalent rotation.</w:t>
@@ -3028,7 +3757,15 @@
         <w:t xml:space="preserve"> the orientation</w:t>
       </w:r>
       <w:r>
-        <w:t xml:space="preserve"> of the accels are</w:t>
+        <w:t xml:space="preserve"> of the </w:t>
+      </w:r>
+      <w:proofErr w:type="spellStart"/>
+      <w:r>
+        <w:t>accels</w:t>
+      </w:r>
+      <w:proofErr w:type="spellEnd"/>
+      <w:r>
+        <w:t xml:space="preserve"> are</w:t>
       </w:r>
       <w:r>
         <w:t xml:space="preserve"> written on the </w:t>
@@ -3282,10 +4019,26 @@
         </w:numPr>
       </w:pPr>
       <w:r>
-        <w:t xml:space="preserve">Was having an issue where there were a lot of unmatched gps pings. </w:t>
-      </w:r>
-      <w:r>
-        <w:t>Fixed this by switching the order of the kets for the rolling join. But I nearly kms before figuring that out.</w:t>
+        <w:t xml:space="preserve">Was having an issue where there were a lot of unmatched </w:t>
+      </w:r>
+      <w:proofErr w:type="spellStart"/>
+      <w:r>
+        <w:t>gps</w:t>
+      </w:r>
+      <w:proofErr w:type="spellEnd"/>
+      <w:r>
+        <w:t xml:space="preserve"> pings. </w:t>
+      </w:r>
+      <w:r>
+        <w:t xml:space="preserve">Fixed this by switching the order of the </w:t>
+      </w:r>
+      <w:proofErr w:type="spellStart"/>
+      <w:r>
+        <w:t>kets</w:t>
+      </w:r>
+      <w:proofErr w:type="spellEnd"/>
+      <w:r>
+        <w:t xml:space="preserve"> for the rolling join. But I nearly kms before figuring that out.</w:t>
       </w:r>
     </w:p>
     <w:p>
@@ -3356,7 +4109,15 @@
         </w:numPr>
       </w:pPr>
       <w:r>
-        <w:t>We cooking with gas again.</w:t>
+        <w:t xml:space="preserve">We </w:t>
+      </w:r>
+      <w:proofErr w:type="gramStart"/>
+      <w:r>
+        <w:t>cooking</w:t>
+      </w:r>
+      <w:proofErr w:type="gramEnd"/>
+      <w:r>
+        <w:t xml:space="preserve"> with gas again.</w:t>
       </w:r>
     </w:p>
     <w:p>
@@ -3368,7 +4129,15 @@
         </w:numPr>
       </w:pPr>
       <w:r>
-        <w:t>Okay now I’m finally up to the part where I have to decide the orientation of the device. Oh no.</w:t>
+        <w:t xml:space="preserve">Okay now I’m finally up to the part where I </w:t>
+      </w:r>
+      <w:proofErr w:type="gramStart"/>
+      <w:r>
+        <w:t>have to</w:t>
+      </w:r>
+      <w:proofErr w:type="gramEnd"/>
+      <w:r>
+        <w:t xml:space="preserve"> decide the orientation of the device. Oh no.</w:t>
       </w:r>
     </w:p>
     <w:p>
@@ -3462,7 +4231,15 @@
         <w:t>Unfortunately,</w:t>
       </w:r>
       <w:r>
-        <w:t xml:space="preserve"> I didn’t wait long enough to get a proper gps </w:t>
+        <w:t xml:space="preserve"> I didn’t wait long enough to get a proper </w:t>
+      </w:r>
+      <w:proofErr w:type="spellStart"/>
+      <w:r>
+        <w:t>gps</w:t>
+      </w:r>
+      <w:proofErr w:type="spellEnd"/>
+      <w:r>
+        <w:t xml:space="preserve"> </w:t>
       </w:r>
       <w:r>
         <w:t>hit but</w:t>
@@ -3561,7 +4338,15 @@
         </w:numPr>
       </w:pPr>
       <w:r>
-        <w:t>Based on my best understanding of the collar orientation, I believe the collar should be: X heave, Y sway, Z surge. Therefore. That would translate to an orientation of… Down, West, North (DWN)</w:t>
+        <w:t xml:space="preserve">Based on my best understanding of the collar orientation, I believe the collar should </w:t>
+      </w:r>
+      <w:proofErr w:type="gramStart"/>
+      <w:r>
+        <w:t>be:</w:t>
+      </w:r>
+      <w:proofErr w:type="gramEnd"/>
+      <w:r>
+        <w:t xml:space="preserve"> X heave, Y sway, Z surge. Therefore. That would translate to an orientation of… Down, West, North (DWN)</w:t>
       </w:r>
       <w:r>
         <w:t>. According to the notes it should be END though.</w:t>
@@ -3576,7 +4361,15 @@
         </w:numPr>
       </w:pPr>
       <w:r>
-        <w:t xml:space="preserve">If the original collar trials had an acc of NED and a mag of NWU then… I need to reverse the Y and Z directions for the mag of the true collar orientation. So would be… DES. </w:t>
+        <w:t xml:space="preserve">If the original collar trials had an </w:t>
+      </w:r>
+      <w:proofErr w:type="spellStart"/>
+      <w:r>
+        <w:t>acc</w:t>
+      </w:r>
+      <w:proofErr w:type="spellEnd"/>
+      <w:r>
+        <w:t xml:space="preserve"> of NED and a mag of NWU then… I need to reverse the Y and Z directions for the mag of the true collar orientation. So would be… DES. </w:t>
       </w:r>
     </w:p>
     <w:p>
@@ -3708,7 +4501,15 @@
         </w:numPr>
       </w:pPr>
       <w:r>
-        <w:t xml:space="preserve">For now I am going to go back to debugging whatever was wrong with the files that Ethan identified yesterday. </w:t>
+        <w:t xml:space="preserve">For </w:t>
+      </w:r>
+      <w:proofErr w:type="gramStart"/>
+      <w:r>
+        <w:t>now</w:t>
+      </w:r>
+      <w:proofErr w:type="gramEnd"/>
+      <w:r>
+        <w:t xml:space="preserve"> I am going to go back to debugging whatever was wrong with the files that Ethan identified yesterday. </w:t>
       </w:r>
       <w:r>
         <w:sym w:font="Wingdings" w:char="F0E0"/>
@@ -3726,7 +4527,23 @@
         </w:numPr>
       </w:pPr>
       <w:r>
-        <w:t xml:space="preserve">Basically, the calibration event occurs at 28.06.24 18:16:00 local time but the first recorded gps time is "2024-06-28 16:28:48 UTC" (about 10 minutes after). Jaz says its not possible for the calibration event to have occurred before the first ping… but </w:t>
+        <w:t xml:space="preserve">Basically, the calibration event occurs at 28.06.24 18:16:00 local time but the first recorded </w:t>
+      </w:r>
+      <w:proofErr w:type="spellStart"/>
+      <w:r>
+        <w:t>gps</w:t>
+      </w:r>
+      <w:proofErr w:type="spellEnd"/>
+      <w:r>
+        <w:t xml:space="preserve"> time is "2024-06-28 16:28:48 UTC" (about 10 minutes after). Jaz says </w:t>
+      </w:r>
+      <w:proofErr w:type="spellStart"/>
+      <w:r>
+        <w:t>its</w:t>
+      </w:r>
+      <w:proofErr w:type="spellEnd"/>
+      <w:r>
+        <w:t xml:space="preserve"> not possible for the calibration event to have occurred before the first ping… but </w:t>
       </w:r>
       <w:r>
         <w:t>stuff</w:t>
@@ -3796,7 +4613,15 @@
         <w:t>th</w:t>
       </w:r>
       <w:r>
-        <w:t xml:space="preserve"> (first gps hit)</w:t>
+        <w:t xml:space="preserve"> (first </w:t>
+      </w:r>
+      <w:proofErr w:type="spellStart"/>
+      <w:r>
+        <w:t>gps</w:t>
+      </w:r>
+      <w:proofErr w:type="spellEnd"/>
+      <w:r>
+        <w:t xml:space="preserve"> hit)</w:t>
       </w:r>
     </w:p>
     <w:p>
@@ -3808,10 +4633,34 @@
         </w:numPr>
       </w:pPr>
       <w:r>
-        <w:t xml:space="preserve">Yep. Even when I don’t crop the accel, the interpolation sends it forward in time from the first gps hit. Interesting. </w:t>
-      </w:r>
-      <w:r>
-        <w:t>Where the time jumps backwards in the first gps hit. So what the heck went wrong with the reverse interpolation?</w:t>
+        <w:t xml:space="preserve">Yep. Even when I don’t crop the accel, the interpolation sends it forward in time from the first </w:t>
+      </w:r>
+      <w:proofErr w:type="spellStart"/>
+      <w:r>
+        <w:t>gps</w:t>
+      </w:r>
+      <w:proofErr w:type="spellEnd"/>
+      <w:r>
+        <w:t xml:space="preserve"> hit. Interesting. </w:t>
+      </w:r>
+      <w:r>
+        <w:t xml:space="preserve">Where the time jumps backwards in the first </w:t>
+      </w:r>
+      <w:proofErr w:type="spellStart"/>
+      <w:r>
+        <w:t>gps</w:t>
+      </w:r>
+      <w:proofErr w:type="spellEnd"/>
+      <w:r>
+        <w:t xml:space="preserve"> hit. </w:t>
+      </w:r>
+      <w:proofErr w:type="gramStart"/>
+      <w:r>
+        <w:t>So</w:t>
+      </w:r>
+      <w:proofErr w:type="gramEnd"/>
+      <w:r>
+        <w:t xml:space="preserve"> what the heck went wrong with the reverse interpolation?</w:t>
       </w:r>
     </w:p>
     <w:p>
@@ -3823,7 +4672,23 @@
         </w:numPr>
       </w:pPr>
       <w:r>
-        <w:t xml:space="preserve">RTC accel (left) and the gps times look correct, however the conversion to the gps time using interpolation is way out (right) where it jumps several days. </w:t>
+        <w:t xml:space="preserve">RTC accel (left) and the </w:t>
+      </w:r>
+      <w:proofErr w:type="spellStart"/>
+      <w:r>
+        <w:t>gps</w:t>
+      </w:r>
+      <w:proofErr w:type="spellEnd"/>
+      <w:r>
+        <w:t xml:space="preserve"> times look correct, however the conversion to the </w:t>
+      </w:r>
+      <w:proofErr w:type="spellStart"/>
+      <w:r>
+        <w:t>gps</w:t>
+      </w:r>
+      <w:proofErr w:type="spellEnd"/>
+      <w:r>
+        <w:t xml:space="preserve"> time using interpolation is way out (right) where it jumps several days. </w:t>
       </w:r>
     </w:p>
     <w:p>
@@ -3940,7 +4805,15 @@
         </w:numPr>
       </w:pPr>
       <w:r>
-        <w:t xml:space="preserve">Changed the way backwards times were calculated and it got back into alignment. </w:t>
+        <w:t xml:space="preserve">Changed the way backwards times were </w:t>
+      </w:r>
+      <w:proofErr w:type="gramStart"/>
+      <w:r>
+        <w:t>calculated</w:t>
+      </w:r>
+      <w:proofErr w:type="gramEnd"/>
+      <w:r>
+        <w:t xml:space="preserve"> and it got back into alignment. </w:t>
       </w:r>
     </w:p>
     <w:p>
@@ -3972,7 +4845,15 @@
         </w:numPr>
       </w:pPr>
       <w:r>
-        <w:t xml:space="preserve">I was meant to run the loop overnight but the code failed on the second line… killing myself. </w:t>
+        <w:t xml:space="preserve">I was meant to run the loop </w:t>
+      </w:r>
+      <w:proofErr w:type="gramStart"/>
+      <w:r>
+        <w:t>overnight</w:t>
+      </w:r>
+      <w:proofErr w:type="gramEnd"/>
+      <w:r>
+        <w:t xml:space="preserve"> but the code failed on the second line… killing myself. </w:t>
       </w:r>
     </w:p>
     <w:p>
@@ -3984,7 +4865,31 @@
         </w:numPr>
       </w:pPr>
       <w:r>
-        <w:t>Ah. So. The GPS only had 1 reset but the accel had 2 and it cropped the accel too small… So. That is an issue. I have to change my joining logic.</w:t>
+        <w:t xml:space="preserve">Ah. </w:t>
+      </w:r>
+      <w:proofErr w:type="spellStart"/>
+      <w:r>
+        <w:t>So.</w:t>
+      </w:r>
+      <w:proofErr w:type="spellEnd"/>
+      <w:r>
+        <w:t xml:space="preserve"> The GPS only had 1 reset but the accel had 2 and it cropped the accel too small… </w:t>
+      </w:r>
+      <w:proofErr w:type="spellStart"/>
+      <w:r>
+        <w:t>So.</w:t>
+      </w:r>
+      <w:proofErr w:type="spellEnd"/>
+      <w:r>
+        <w:t xml:space="preserve"> That is an issue. I </w:t>
+      </w:r>
+      <w:proofErr w:type="gramStart"/>
+      <w:r>
+        <w:t>have to</w:t>
+      </w:r>
+      <w:proofErr w:type="gramEnd"/>
+      <w:r>
+        <w:t xml:space="preserve"> change my joining logic.</w:t>
       </w:r>
     </w:p>
     <w:p>
@@ -3996,7 +4901,23 @@
         </w:numPr>
       </w:pPr>
       <w:r>
-        <w:t>Changed the gps reset_events manually over to the longest accel sampling period number.</w:t>
+        <w:t xml:space="preserve">Changed the </w:t>
+      </w:r>
+      <w:proofErr w:type="spellStart"/>
+      <w:r>
+        <w:t>gps</w:t>
+      </w:r>
+      <w:proofErr w:type="spellEnd"/>
+      <w:r>
+        <w:t xml:space="preserve"> </w:t>
+      </w:r>
+      <w:proofErr w:type="spellStart"/>
+      <w:r>
+        <w:t>reset_events</w:t>
+      </w:r>
+      <w:proofErr w:type="spellEnd"/>
+      <w:r>
+        <w:t xml:space="preserve"> manually over to the longest accel sampling period number.</w:t>
       </w:r>
     </w:p>
     <w:p>
@@ -4031,8 +4952,13 @@
           <w:numId w:val="2"/>
         </w:numPr>
       </w:pPr>
-      <w:r>
-        <w:t>Jk. The next collar ran into a new problem. It never ends with this BS.</w:t>
+      <w:proofErr w:type="spellStart"/>
+      <w:r>
+        <w:t>Jk</w:t>
+      </w:r>
+      <w:proofErr w:type="spellEnd"/>
+      <w:r>
+        <w:t>. The next collar ran into a new problem. It never ends with this BS.</w:t>
       </w:r>
     </w:p>
     <w:p>
@@ -4044,10 +4970,23 @@
         </w:numPr>
       </w:pPr>
       <w:r>
-        <w:t xml:space="preserve">While I can’t (so far) find any errors in Collar_12, the calibration period it extracted does not look like a calibration event… However the second calibration event (from after deployment --- does turn out perfectly… And the interpolation seems like it checks out. </w:t>
-      </w:r>
-      <w:r>
-        <w:t>So idk what to think. I might just use the latter calibration</w:t>
+        <w:t xml:space="preserve">While I can’t (so far) find any errors in Collar_12, the calibration period it extracted does not look like a calibration event… </w:t>
+      </w:r>
+      <w:proofErr w:type="gramStart"/>
+      <w:r>
+        <w:t>However</w:t>
+      </w:r>
+      <w:proofErr w:type="gramEnd"/>
+      <w:r>
+        <w:t xml:space="preserve"> the second calibration event (from after deployment --- does turn out perfectly… And the interpolation seems like it checks out. </w:t>
+      </w:r>
+      <w:proofErr w:type="gramStart"/>
+      <w:r>
+        <w:t>So</w:t>
+      </w:r>
+      <w:proofErr w:type="gramEnd"/>
+      <w:r>
+        <w:t xml:space="preserve"> idk what to think. I might just use the latter calibration</w:t>
       </w:r>
       <w:r>
         <w:t>?</w:t>
@@ -4181,8 +5120,29 @@
           <w:numId w:val="2"/>
         </w:numPr>
       </w:pPr>
-      <w:r>
-        <w:t>So am I meant to remove these files or not? When I leave them in, there’s issues. When I take them out, it works… But they seeeeeem like they’re correct</w:t>
+      <w:proofErr w:type="gramStart"/>
+      <w:r>
+        <w:t>So</w:t>
+      </w:r>
+      <w:proofErr w:type="gramEnd"/>
+      <w:r>
+        <w:t xml:space="preserve"> am I meant to remove these files or not? When I leave them in, there’s issues. When I take them out, it works… But they </w:t>
+      </w:r>
+      <w:proofErr w:type="spellStart"/>
+      <w:r>
+        <w:t>seeeeeem</w:t>
+      </w:r>
+      <w:proofErr w:type="spellEnd"/>
+      <w:r>
+        <w:t xml:space="preserve"> like </w:t>
+      </w:r>
+      <w:proofErr w:type="gramStart"/>
+      <w:r>
+        <w:t>they’re</w:t>
+      </w:r>
+      <w:proofErr w:type="gramEnd"/>
+      <w:r>
+        <w:t xml:space="preserve"> correct</w:t>
       </w:r>
       <w:r>
         <w:t>? Until we understand how they got there, I’m reluctant to do anything</w:t>
@@ -4407,7 +5367,15 @@
         </w:numPr>
       </w:pPr>
       <w:r>
-        <w:t>This was the route I actually walked:</w:t>
+        <w:t xml:space="preserve">This was the route I </w:t>
+      </w:r>
+      <w:proofErr w:type="gramStart"/>
+      <w:r>
+        <w:t>actually walked</w:t>
+      </w:r>
+      <w:proofErr w:type="gramEnd"/>
+      <w:r>
+        <w:t>:</w:t>
       </w:r>
     </w:p>
     <w:p>
@@ -4583,7 +5551,23 @@
         </w:numPr>
       </w:pPr>
       <w:r>
-        <w:t>“good mag cal (ensure not wearing watches /have phones/any magnetic interfering stuff on person etc. nearby when doing this)”</w:t>
+        <w:t>“</w:t>
+      </w:r>
+      <w:proofErr w:type="gramStart"/>
+      <w:r>
+        <w:t>good</w:t>
+      </w:r>
+      <w:proofErr w:type="gramEnd"/>
+      <w:r>
+        <w:t xml:space="preserve"> mag </w:t>
+      </w:r>
+      <w:proofErr w:type="spellStart"/>
+      <w:r>
+        <w:t>cal</w:t>
+      </w:r>
+      <w:proofErr w:type="spellEnd"/>
+      <w:r>
+        <w:t xml:space="preserve"> (ensure not wearing watches /have phones/any magnetic interfering stuff on person etc. nearby when doing this)”</w:t>
       </w:r>
     </w:p>
     <w:p>
@@ -4595,7 +5579,23 @@
         </w:numPr>
       </w:pPr>
       <w:r>
-        <w:t xml:space="preserve">“In terms of movement bouts, the simple approach would be to use some sort of acceleration magnitude threshold (e.g. VeDBA)... but for example, something like a kangaroo should be very obvious with jumping behaviour that should come out in acceleration traces as clear stylised patterns which could be manually discerned or via machine learning if you were able to do some groundtruthing of behaviours during the data acquisition period.” </w:t>
+        <w:t xml:space="preserve">“In terms of movement bouts, the simple approach would be to use some sort of acceleration magnitude threshold (e.g. </w:t>
+      </w:r>
+      <w:proofErr w:type="spellStart"/>
+      <w:r>
+        <w:t>VeDBA</w:t>
+      </w:r>
+      <w:proofErr w:type="spellEnd"/>
+      <w:r>
+        <w:t xml:space="preserve">)... but for example, something like a kangaroo should be very obvious with jumping behaviour that should come out in acceleration traces as clear stylised patterns which could be manually discerned or via machine learning if you were able to do some </w:t>
+      </w:r>
+      <w:proofErr w:type="spellStart"/>
+      <w:r>
+        <w:t>groundtruthing</w:t>
+      </w:r>
+      <w:proofErr w:type="spellEnd"/>
+      <w:r>
+        <w:t xml:space="preserve"> of behaviours during the data acquisition period.” </w:t>
       </w:r>
       <w:r>
         <w:sym w:font="Wingdings" w:char="F0E0"/>
@@ -4625,13 +5625,29 @@
         </w:numPr>
       </w:pPr>
       <w:r>
-        <w:t xml:space="preserve">“When the penguin is walking, the tag will be nearly vertical, while during swimming, it will be more horizontal. In both cases, the tag’s coordinate frame relative to the penguin’s natural movement (and the ground or water surface) will be different. To ensure accurate heading calculations, I would need to define different tag coordinate systems for walking and swimming and compute the heading separately for each period—on land and at sea—otherwise, my dead-reckoned (DR) tracks could be very innacurate.” </w:t>
+        <w:t xml:space="preserve">“When the penguin is walking, the tag will be nearly vertical, while during swimming, it will be more horizontal. In both cases, the tag’s coordinate frame relative to the penguin’s natural movement (and the ground or water surface) will be different. To ensure accurate heading calculations, I would need to define different tag coordinate systems for walking and swimming and compute the heading separately for each period—on land and at sea—otherwise, my dead-reckoned (DR) tracks could be very </w:t>
+      </w:r>
+      <w:proofErr w:type="spellStart"/>
+      <w:r>
+        <w:t>innacurate</w:t>
+      </w:r>
+      <w:proofErr w:type="spellEnd"/>
+      <w:r>
+        <w:t xml:space="preserve">.” </w:t>
       </w:r>
       <w:r>
         <w:sym w:font="Wingdings" w:char="F0E0"/>
       </w:r>
       <w:r>
-        <w:t xml:space="preserve"> no WONDER my flippy flippy stuff doesn’t work.</w:t>
+        <w:t xml:space="preserve"> no WONDER my flippy </w:t>
+      </w:r>
+      <w:proofErr w:type="spellStart"/>
+      <w:r>
+        <w:t>flippy</w:t>
+      </w:r>
+      <w:proofErr w:type="spellEnd"/>
+      <w:r>
+        <w:t xml:space="preserve"> stuff doesn’t work.</w:t>
       </w:r>
     </w:p>
     <w:p>
@@ -4643,7 +5659,15 @@
         </w:numPr>
       </w:pPr>
       <w:r>
-        <w:t>“If you know there’s a specific yaw offset in the tag placement, you can specify it in the compass function. If you’re unsure, you could compare the heading correction factors from Gundog.Tracks. If the headings are consistently biased in one direction, it could indicate a tag yaw offset or the need for magnetic declination adjustment. But again, if the tag’s yaw offset is minor and consistent, it’s not essential to correct this, as the dead-reckoned track will be consistently biased (in theory, the patterns and scales of tortuosity between GPS points should remain the same, just directionally offset somewhat), and the track segments get rotated when corrected with their endpoint GPS fixes during the correction process anyway.”</w:t>
+        <w:t xml:space="preserve">“If you know there’s a specific yaw offset in the tag placement, you can specify it in the compass function. If you’re unsure, you could compare the heading correction factors from </w:t>
+      </w:r>
+      <w:proofErr w:type="spellStart"/>
+      <w:r>
+        <w:t>Gundog.Tracks</w:t>
+      </w:r>
+      <w:proofErr w:type="spellEnd"/>
+      <w:r>
+        <w:t>. If the headings are consistently biased in one direction, it could indicate a tag yaw offset or the need for magnetic declination adjustment. But again, if the tag’s yaw offset is minor and consistent, it’s not essential to correct this, as the dead-reckoned track will be consistently biased (in theory, the patterns and scales of tortuosity between GPS points should remain the same, just directionally offset somewhat), and the track segments get rotated when corrected with their endpoint GPS fixes during the correction process anyway.”</w:t>
       </w:r>
     </w:p>
     <w:p>
@@ -4655,7 +5679,35 @@
         </w:numPr>
       </w:pPr>
       <w:r>
-        <w:t>“What I suggest is to first run the compass function without any offsets applied to derive the pitch and roll angles. Then, determine the mean values of both during periods where you believe the animal and collar are in a normal position, such as during low-activity, steady-state behavior. Once you have these values, re-run the function and input them as the 'pitch.offset' and 'roll.offset' parameters.”</w:t>
+        <w:t xml:space="preserve">“What I suggest is to first run the compass function without any offsets applied to derive the pitch and roll angles. Then, determine the mean values of both during periods where you believe the animal and collar are in a normal position, such as during low-activity, steady-state </w:t>
+      </w:r>
+      <w:proofErr w:type="spellStart"/>
+      <w:r>
+        <w:t>behavior</w:t>
+      </w:r>
+      <w:proofErr w:type="spellEnd"/>
+      <w:r>
+        <w:t>. Once you have these values, re-run the function and input them as the '</w:t>
+      </w:r>
+      <w:proofErr w:type="spellStart"/>
+      <w:proofErr w:type="gramStart"/>
+      <w:r>
+        <w:t>pitch.offset</w:t>
+      </w:r>
+      <w:proofErr w:type="spellEnd"/>
+      <w:proofErr w:type="gramEnd"/>
+      <w:r>
+        <w:t>' and '</w:t>
+      </w:r>
+      <w:proofErr w:type="spellStart"/>
+      <w:proofErr w:type="gramStart"/>
+      <w:r>
+        <w:t>roll.offset</w:t>
+      </w:r>
+      <w:proofErr w:type="spellEnd"/>
+      <w:proofErr w:type="gramEnd"/>
+      <w:r>
+        <w:t>' parameters.”</w:t>
       </w:r>
     </w:p>
     <w:p>
@@ -4667,7 +5719,23 @@
         </w:numPr>
       </w:pPr>
       <w:r>
-        <w:t>“if you supply a positive pitch offset value of 45°, this reflects that the device is pitched up by 45° from the level, and the function will de-rotate the supplied (smoothed) acc and mag (normalised) values by this amount. Similarly, a positive roll value indicates a rightward tilt (bank angle), and a positive yaw value represents a clockwise rotational offset”</w:t>
+        <w:t>“</w:t>
+      </w:r>
+      <w:proofErr w:type="gramStart"/>
+      <w:r>
+        <w:t>if</w:t>
+      </w:r>
+      <w:proofErr w:type="gramEnd"/>
+      <w:r>
+        <w:t xml:space="preserve"> you supply a positive pitch offset value of 45°, this reflects that the device is pitched up by 45° from the level, and the function will de-rotate the supplied (smoothed) </w:t>
+      </w:r>
+      <w:proofErr w:type="spellStart"/>
+      <w:r>
+        <w:t>acc</w:t>
+      </w:r>
+      <w:proofErr w:type="spellEnd"/>
+      <w:r>
+        <w:t xml:space="preserve"> and mag (normalised) values by this amount. Similarly, a positive roll value indicates a rightward tilt (bank angle), and a positive yaw value represents a clockwise rotational offset”</w:t>
       </w:r>
     </w:p>
     <w:p>
@@ -4709,7 +5777,103 @@
         </w:numPr>
       </w:pPr>
       <w:r>
-        <w:t>“The short answer is, yes - if a wrong ref frame was chosen then DR path wil be innacurate. But comparing subsets with GPS pre-correction will help debug if chosen orientation was correct. The patterns and directions of travel should be similar even if scale is not when compared to GPS. I had some lions where I had to 'figure' out the orientation post release. But visually it should be easy to decipher the heave axis of movmement in acc and mag (acc will be the one closest to +/-1 g most of the time, and mag will the one changing the least)... In terms of deciphering the acc/mag surge and sway dimensions, this may be more challenging. But for the acc, you would expect greater variation in surge dimension because they stick their head to ground to forage and then stick their head back up when travelling and vigalence, so that may help. If mag is different orientation set up to acc, then its worth just checking if you switch the surge/sway orientations then which one produces most realsitic DR track relative to GPS... by deciphering the heave axis and dimension of measured g, you already have homed in on just a few possible orientations it could be...”</w:t>
+        <w:t xml:space="preserve">“The short answer is, yes - if a wrong ref frame was chosen then DR path </w:t>
+      </w:r>
+      <w:proofErr w:type="spellStart"/>
+      <w:r>
+        <w:t>wil</w:t>
+      </w:r>
+      <w:proofErr w:type="spellEnd"/>
+      <w:r>
+        <w:t xml:space="preserve"> be </w:t>
+      </w:r>
+      <w:proofErr w:type="spellStart"/>
+      <w:r>
+        <w:t>innacurate</w:t>
+      </w:r>
+      <w:proofErr w:type="spellEnd"/>
+      <w:r>
+        <w:t xml:space="preserve">. But comparing subsets with GPS pre-correction will help debug if chosen orientation was correct. The patterns and directions of travel should be similar even if scale is not when compared to GPS. I had some lions where I had to 'figure' out the orientation post release. But visually it should be easy to decipher the heave axis of </w:t>
+      </w:r>
+      <w:proofErr w:type="spellStart"/>
+      <w:r>
+        <w:t>movmement</w:t>
+      </w:r>
+      <w:proofErr w:type="spellEnd"/>
+      <w:r>
+        <w:t xml:space="preserve"> in </w:t>
+      </w:r>
+      <w:proofErr w:type="spellStart"/>
+      <w:r>
+        <w:t>acc</w:t>
+      </w:r>
+      <w:proofErr w:type="spellEnd"/>
+      <w:r>
+        <w:t xml:space="preserve"> and mag (</w:t>
+      </w:r>
+      <w:proofErr w:type="spellStart"/>
+      <w:r>
+        <w:t>acc</w:t>
+      </w:r>
+      <w:proofErr w:type="spellEnd"/>
+      <w:r>
+        <w:t xml:space="preserve"> will be the one closest to +/-1 g most of the time, and mag will the one changing the </w:t>
+      </w:r>
+      <w:proofErr w:type="gramStart"/>
+      <w:r>
+        <w:t>least)...</w:t>
+      </w:r>
+      <w:proofErr w:type="gramEnd"/>
+      <w:r>
+        <w:t xml:space="preserve"> In terms of deciphering the </w:t>
+      </w:r>
+      <w:proofErr w:type="spellStart"/>
+      <w:r>
+        <w:t>acc</w:t>
+      </w:r>
+      <w:proofErr w:type="spellEnd"/>
+      <w:r>
+        <w:t xml:space="preserve">/mag surge and sway dimensions, this may be more challenging. But for the </w:t>
+      </w:r>
+      <w:proofErr w:type="spellStart"/>
+      <w:r>
+        <w:t>acc</w:t>
+      </w:r>
+      <w:proofErr w:type="spellEnd"/>
+      <w:r>
+        <w:t xml:space="preserve">, you would expect greater variation in surge dimension because they stick their head to ground to forage and then stick their head back up when travelling and </w:t>
+      </w:r>
+      <w:proofErr w:type="spellStart"/>
+      <w:r>
+        <w:t>vigalence</w:t>
+      </w:r>
+      <w:proofErr w:type="spellEnd"/>
+      <w:r>
+        <w:t xml:space="preserve">, so that may help. If mag is different orientation set up to </w:t>
+      </w:r>
+      <w:proofErr w:type="spellStart"/>
+      <w:r>
+        <w:t>acc</w:t>
+      </w:r>
+      <w:proofErr w:type="spellEnd"/>
+      <w:r>
+        <w:t xml:space="preserve">, then </w:t>
+      </w:r>
+      <w:proofErr w:type="spellStart"/>
+      <w:r>
+        <w:t>its</w:t>
+      </w:r>
+      <w:proofErr w:type="spellEnd"/>
+      <w:r>
+        <w:t xml:space="preserve"> worth just checking if you switch the surge/sway orientations then which one produces most </w:t>
+      </w:r>
+      <w:proofErr w:type="spellStart"/>
+      <w:r>
+        <w:t>realsitic</w:t>
+      </w:r>
+      <w:proofErr w:type="spellEnd"/>
+      <w:r>
+        <w:t xml:space="preserve"> DR track relative to GPS... by deciphering the heave axis and dimension of measured g, you already have homed in on just a few possible orientations it could be...”</w:t>
       </w:r>
     </w:p>
     <w:p>
@@ -4771,8 +5935,16 @@
           <w:rPr>
             <w:rStyle w:val="Hyperlink"/>
           </w:rPr>
-          <w:t>Dead-reckoning animal movements in R: a reappraisal using Gundog.Tracks</w:t>
+          <w:t xml:space="preserve">Dead-reckoning animal movements in R: a reappraisal using </w:t>
         </w:r>
+        <w:proofErr w:type="spellStart"/>
+        <w:r>
+          <w:rPr>
+            <w:rStyle w:val="Hyperlink"/>
+          </w:rPr>
+          <w:t>Gundog.Tracks</w:t>
+        </w:r>
+        <w:proofErr w:type="spellEnd"/>
       </w:hyperlink>
       <w:r>
         <w:t xml:space="preserve"> </w:t>
@@ -4833,12 +6005,28 @@
           <w:rFonts w:ascii="Cambria Math" w:hAnsi="Cambria Math"/>
         </w:rPr>
       </w:pPr>
+      <w:proofErr w:type="spellStart"/>
       <w:r>
         <w:rPr>
           <w:rFonts w:ascii="Cambria Math" w:hAnsi="Cambria Math"/>
         </w:rPr>
-        <w:t>Gundog.Tracks(TS, h, v, elv</w:t>
-      </w:r>
+        <w:t>Gundog.Tracks</w:t>
+      </w:r>
+      <w:proofErr w:type="spellEnd"/>
+      <w:r>
+        <w:rPr>
+          <w:rFonts w:ascii="Cambria Math" w:hAnsi="Cambria Math"/>
+        </w:rPr>
+        <w:t xml:space="preserve">(TS, h, v, </w:t>
+      </w:r>
+      <w:proofErr w:type="spellStart"/>
+      <w:r>
+        <w:rPr>
+          <w:rFonts w:ascii="Cambria Math" w:hAnsi="Cambria Math"/>
+        </w:rPr>
+        <w:t>elv</w:t>
+      </w:r>
+      <w:proofErr w:type="spellEnd"/>
       <w:r>
         <w:rPr>
           <w:rFonts w:ascii="Cambria Math" w:hAnsi="Cambria Math" w:cs="Arial"/>
@@ -4909,8 +6097,16 @@
         <w:rPr>
           <w:rFonts w:ascii="Cambria Math" w:hAnsi="Cambria Math"/>
         </w:rPr>
-        <w:t>NULL, ch</w:t>
-      </w:r>
+        <w:t xml:space="preserve">NULL, </w:t>
+      </w:r>
+      <w:proofErr w:type="spellStart"/>
+      <w:r>
+        <w:rPr>
+          <w:rFonts w:ascii="Cambria Math" w:hAnsi="Cambria Math"/>
+        </w:rPr>
+        <w:t>ch</w:t>
+      </w:r>
+      <w:proofErr w:type="spellEnd"/>
       <w:r>
         <w:rPr>
           <w:rFonts w:ascii="Cambria Math" w:hAnsi="Cambria Math" w:cs="Arial"/>
@@ -5053,8 +6249,16 @@
         <w:rPr>
           <w:rFonts w:ascii="Cambria Math" w:hAnsi="Cambria Math"/>
         </w:rPr>
-        <w:t>0, VP.lon</w:t>
-      </w:r>
+        <w:t xml:space="preserve">0, </w:t>
+      </w:r>
+      <w:proofErr w:type="spellStart"/>
+      <w:r>
+        <w:rPr>
+          <w:rFonts w:ascii="Cambria Math" w:hAnsi="Cambria Math"/>
+        </w:rPr>
+        <w:t>VP.lon</w:t>
+      </w:r>
+      <w:proofErr w:type="spellEnd"/>
       <w:r>
         <w:rPr>
           <w:rFonts w:ascii="Cambria Math" w:hAnsi="Cambria Math" w:cs="Arial"/>
@@ -5077,8 +6281,16 @@
         <w:rPr>
           <w:rFonts w:ascii="Cambria Math" w:hAnsi="Cambria Math"/>
         </w:rPr>
-        <w:t>NULL, VP.lat</w:t>
-      </w:r>
+        <w:t xml:space="preserve">NULL, </w:t>
+      </w:r>
+      <w:proofErr w:type="spellStart"/>
+      <w:r>
+        <w:rPr>
+          <w:rFonts w:ascii="Cambria Math" w:hAnsi="Cambria Math"/>
+        </w:rPr>
+        <w:t>VP.lat</w:t>
+      </w:r>
+      <w:proofErr w:type="spellEnd"/>
       <w:r>
         <w:rPr>
           <w:rFonts w:ascii="Cambria Math" w:hAnsi="Cambria Math" w:cs="Arial"/>
@@ -5173,8 +6385,16 @@
         <w:rPr>
           <w:rFonts w:ascii="Cambria Math" w:hAnsi="Cambria Math"/>
         </w:rPr>
-        <w:t>1, dist.step</w:t>
-      </w:r>
+        <w:t xml:space="preserve">1, </w:t>
+      </w:r>
+      <w:proofErr w:type="spellStart"/>
+      <w:r>
+        <w:rPr>
+          <w:rFonts w:ascii="Cambria Math" w:hAnsi="Cambria Math"/>
+        </w:rPr>
+        <w:t>dist.step</w:t>
+      </w:r>
+      <w:proofErr w:type="spellEnd"/>
       <w:r>
         <w:rPr>
           <w:rFonts w:ascii="Cambria Math" w:hAnsi="Cambria Math" w:cs="Arial"/>
@@ -5314,7 +6534,15 @@
         <w:ind w:left="2520"/>
       </w:pPr>
       <w:r>
-        <w:t xml:space="preserve">The user may also opt to supply a ‘marked events’ (ME) vector (a marked event is a term we use that refers to a number of sequential (in time) data points within a </w:t>
+        <w:t xml:space="preserve">The user may also opt to supply a ‘marked events’ (ME) vector (a marked event is a term we use that refers to </w:t>
+      </w:r>
+      <w:proofErr w:type="gramStart"/>
+      <w:r>
+        <w:t>a number of</w:t>
+      </w:r>
+      <w:proofErr w:type="gramEnd"/>
+      <w:r>
+        <w:t xml:space="preserve"> sequential (in time) data points within a </w:t>
       </w:r>
       <w:r>
         <w:lastRenderedPageBreak/>
@@ -5362,7 +6590,15 @@
         <w:sym w:font="Wingdings" w:char="F0E0"/>
       </w:r>
       <w:r>
-        <w:t xml:space="preserve"> okay, nevermind, we aren’t high frequency enough for this to matter</w:t>
+        <w:t xml:space="preserve"> okay, </w:t>
+      </w:r>
+      <w:proofErr w:type="spellStart"/>
+      <w:r>
+        <w:t>nevermind</w:t>
+      </w:r>
+      <w:proofErr w:type="spellEnd"/>
+      <w:r>
+        <w:t>, we aren’t high frequency enough for this to matter</w:t>
       </w:r>
     </w:p>
     <w:p>
@@ -5401,7 +6637,15 @@
         <w:ind w:left="1080"/>
       </w:pPr>
       <w:r>
-        <w:t>Within Gundog.Tracks, the user can modulate m, c and ME values to switch between predetermined speed (m</w:t>
+        <w:t xml:space="preserve">Within </w:t>
+      </w:r>
+      <w:proofErr w:type="spellStart"/>
+      <w:r>
+        <w:t>Gundog.Tracks</w:t>
+      </w:r>
+      <w:proofErr w:type="spellEnd"/>
+      <w:r>
+        <w:t>, the user can modulate m, c and ME values to switch between predetermined speed (m</w:t>
       </w:r>
       <w:r>
         <w:rPr>
@@ -5507,7 +6751,15 @@
         <w:ind w:left="1080"/>
       </w:pPr>
       <w:r>
-        <w:t>Here an an example from his data that shows the expected error… if he’s using it in the paper then it must be considered good:</w:t>
+        <w:t xml:space="preserve">Here an </w:t>
+      </w:r>
+      <w:proofErr w:type="spellStart"/>
+      <w:r>
+        <w:t>an</w:t>
+      </w:r>
+      <w:proofErr w:type="spellEnd"/>
+      <w:r>
+        <w:t xml:space="preserve"> example from his data that shows the expected error… if he’s using it in the paper then it must be considered good:</w:t>
       </w:r>
     </w:p>
     <w:p>
@@ -5689,7 +6941,21 @@
         <w:rPr>
           <w:highlight w:val="yellow"/>
         </w:rPr>
-        <w:t>Should I be downsampling my accelerometer? Have I missed that?</w:t>
+        <w:t xml:space="preserve">Should I be </w:t>
+      </w:r>
+      <w:proofErr w:type="spellStart"/>
+      <w:r>
+        <w:rPr>
+          <w:highlight w:val="yellow"/>
+        </w:rPr>
+        <w:t>downsampling</w:t>
+      </w:r>
+      <w:proofErr w:type="spellEnd"/>
+      <w:r>
+        <w:rPr>
+          <w:highlight w:val="yellow"/>
+        </w:rPr>
+        <w:t xml:space="preserve"> my accelerometer? Have I missed that?</w:t>
       </w:r>
     </w:p>
     <w:p>
@@ -5807,7 +7073,15 @@
         <w:ind w:left="1080"/>
       </w:pPr>
       <w:r>
-        <w:t>We recommend implementing a running mean (cf. Eq. 1, R1:4) to raw VeDBA values to ensure that both acceleration and deceleration components of a stride cycle are incorporated together per unit time and to reduce the magnitude of small temporal spikes</w:t>
+        <w:t xml:space="preserve">We recommend implementing a running mean (cf. Eq. 1, R1:4) to raw </w:t>
+      </w:r>
+      <w:proofErr w:type="spellStart"/>
+      <w:r>
+        <w:t>VeDBA</w:t>
+      </w:r>
+      <w:proofErr w:type="spellEnd"/>
+      <w:r>
+        <w:t xml:space="preserve"> values to ensure that both acceleration and deceleration components of a stride cycle are incorporated together per unit time and to reduce the magnitude of small temporal spikes</w:t>
       </w:r>
     </w:p>
     <w:p>
@@ -5975,7 +7249,15 @@
         </w:numPr>
       </w:pPr>
       <w:r>
-        <w:t xml:space="preserve">For example, day 3 of the impala data GPS was below… surely this is starring at least a bit? I have no reason to think these are super high precision actually. </w:t>
+        <w:t xml:space="preserve">For example, day 3 of the impala data GPS was below… surely this is starring at least a bit? I have no reason to think these are super high </w:t>
+      </w:r>
+      <w:proofErr w:type="gramStart"/>
+      <w:r>
+        <w:t>precision actually</w:t>
+      </w:r>
+      <w:proofErr w:type="gramEnd"/>
+      <w:r>
+        <w:t xml:space="preserve">. </w:t>
       </w:r>
       <w:r>
         <w:t>I should smooth these as per usual.</w:t>
@@ -6048,7 +7330,15 @@
         <w:t>More importantly, I need to figure out the orientation.</w:t>
       </w:r>
       <w:r>
-        <w:t xml:space="preserve"> So from Gunner’s paper, the z axis should be +1 when the device is completely flat. I need to figure out what it is for us…</w:t>
+        <w:t xml:space="preserve"> </w:t>
+      </w:r>
+      <w:proofErr w:type="gramStart"/>
+      <w:r>
+        <w:t>So</w:t>
+      </w:r>
+      <w:proofErr w:type="gramEnd"/>
+      <w:r>
+        <w:t xml:space="preserve"> from Gunner’s paper, the z axis should be +1 when the device is completely flat. I need to figure out what it is for us…</w:t>
       </w:r>
     </w:p>
     <w:p>
@@ -6075,7 +7365,15 @@
         <w:t>JUST REALISED I can use the data that Amelia already annotated rather than searching through!</w:t>
       </w:r>
       <w:r>
-        <w:t xml:space="preserve"> So in the walking data (left) and vigilance data (right) from Collar 8</w:t>
+        <w:t xml:space="preserve"> </w:t>
+      </w:r>
+      <w:proofErr w:type="gramStart"/>
+      <w:r>
+        <w:t>So</w:t>
+      </w:r>
+      <w:proofErr w:type="gramEnd"/>
+      <w:r>
+        <w:t xml:space="preserve"> in the walking data (left) and vigilance data (right) from Collar 8</w:t>
       </w:r>
       <w:r>
         <w:t>!</w:t>
@@ -6175,8 +7473,13 @@
           </w:tcPr>
           <w:p>
             <w:r>
-              <w:t>X acc</w:t>
+              <w:t xml:space="preserve">X </w:t>
             </w:r>
+            <w:proofErr w:type="spellStart"/>
+            <w:r>
+              <w:t>acc</w:t>
+            </w:r>
+            <w:proofErr w:type="spellEnd"/>
           </w:p>
         </w:tc>
         <w:tc>
@@ -6220,8 +7523,13 @@
           </w:tcPr>
           <w:p>
             <w:r>
-              <w:t>Y acc</w:t>
+              <w:t xml:space="preserve">Y </w:t>
             </w:r>
+            <w:proofErr w:type="spellStart"/>
+            <w:r>
+              <w:t>acc</w:t>
+            </w:r>
+            <w:proofErr w:type="spellEnd"/>
           </w:p>
         </w:tc>
         <w:tc>
@@ -6265,8 +7573,13 @@
           </w:tcPr>
           <w:p>
             <w:r>
-              <w:t>Z acc</w:t>
+              <w:t xml:space="preserve">Z </w:t>
             </w:r>
+            <w:proofErr w:type="spellStart"/>
+            <w:r>
+              <w:t>acc</w:t>
+            </w:r>
+            <w:proofErr w:type="spellEnd"/>
           </w:p>
         </w:tc>
         <w:tc>
@@ -6434,7 +7747,15 @@
         </w:numPr>
       </w:pPr>
       <w:r>
-        <w:t xml:space="preserve">I then tried to verify this by looking at the accelerometer data when the animal was standing up (ground-truthed with video). Red is X, Blue is Y, Green is Z. When the animal is standing up, the X axis has close to 0 gravity. The gravity is shared over the Y and Z, with the most on the Z. This indicates that the collar is tipped forwards. </w:t>
+        <w:t>I then tried to verify this by looking at the accelerometer data when the animal was standing up (ground-</w:t>
+      </w:r>
+      <w:proofErr w:type="spellStart"/>
+      <w:r>
+        <w:t>truthed</w:t>
+      </w:r>
+      <w:proofErr w:type="spellEnd"/>
+      <w:r>
+        <w:t xml:space="preserve"> with video). Red is X, Blue is Y, Green is Z. When the animal is standing up, the X axis has close to 0 gravity. The gravity is shared over the Y and Z, with the most on the Z. This indicates that the collar is tipped forwards. </w:t>
       </w:r>
     </w:p>
     <w:p>
@@ -6593,7 +7914,15 @@
         </w:numPr>
       </w:pPr>
       <w:r>
-        <w:t>Therefore, I propose the orientation is: acc EUS, mag EDN, gravity down, and a pitch forward of about 48 degrees…</w:t>
+        <w:t xml:space="preserve">Therefore, I propose the orientation is: </w:t>
+      </w:r>
+      <w:proofErr w:type="spellStart"/>
+      <w:r>
+        <w:t>acc</w:t>
+      </w:r>
+      <w:proofErr w:type="spellEnd"/>
+      <w:r>
+        <w:t xml:space="preserve"> EUS, mag EDN, gravity down, and a pitch forward of about 48 degrees…</w:t>
       </w:r>
     </w:p>
     <w:p>
@@ -6676,7 +8005,15 @@
         </w:numPr>
       </w:pPr>
       <w:r>
-        <w:t>No. I need to lock in and do what needs to be done which is actually clean the data and get rid of the massive misreads. Because errors are cumulative, my assumption that these errors wouldn’t affect it are probably wrong.</w:t>
+        <w:t xml:space="preserve">No. I need to lock in and do what needs to be done which is </w:t>
+      </w:r>
+      <w:proofErr w:type="gramStart"/>
+      <w:r>
+        <w:t>actually clean</w:t>
+      </w:r>
+      <w:proofErr w:type="gramEnd"/>
+      <w:r>
+        <w:t xml:space="preserve"> the data and get rid of the massive misreads. Because errors are cumulative, my assumption that these errors wouldn’t affect it are probably wrong.</w:t>
       </w:r>
     </w:p>
     <w:p>
@@ -6795,7 +8132,15 @@
         </w:numPr>
       </w:pPr>
       <w:r>
-        <w:t xml:space="preserve">Happy birthday to me. Also, today is the day that I try removing outliers from the impala data – something I should have done over a month ago. Of course it could never work when there are such large errors throughout </w:t>
+        <w:t xml:space="preserve">Happy birthday to me. Also, today is the day that I try removing outliers from the impala data – something I should have done over a month ago. </w:t>
+      </w:r>
+      <w:proofErr w:type="gramStart"/>
+      <w:r>
+        <w:t>Of course</w:t>
+      </w:r>
+      <w:proofErr w:type="gramEnd"/>
+      <w:r>
+        <w:t xml:space="preserve"> it could never work when there are such large errors throughout </w:t>
       </w:r>
       <w:r>
         <w:rPr>
@@ -6824,9 +8169,14 @@
           <w:numId w:val="2"/>
         </w:numPr>
       </w:pPr>
+      <w:proofErr w:type="gramStart"/>
       <w:r>
         <w:lastRenderedPageBreak/>
-        <w:t xml:space="preserve">Often I see people using </w:t>
+        <w:t>Often</w:t>
+      </w:r>
+      <w:proofErr w:type="gramEnd"/>
+      <w:r>
+        <w:t xml:space="preserve"> I see people using </w:t>
       </w:r>
       <w:r>
         <w:t>Butterworth</w:t>
@@ -6868,7 +8218,15 @@
         <w:t>I have seen information about the Median Filter come up</w:t>
       </w:r>
       <w:r>
-        <w:t>… trialing that now.</w:t>
+        <w:t xml:space="preserve">… </w:t>
+      </w:r>
+      <w:proofErr w:type="spellStart"/>
+      <w:r>
+        <w:t>trialing</w:t>
+      </w:r>
+      <w:proofErr w:type="spellEnd"/>
+      <w:r>
+        <w:t xml:space="preserve"> that now.</w:t>
       </w:r>
     </w:p>
     <w:p>
@@ -7101,8 +8459,13 @@
           <w:numId w:val="2"/>
         </w:numPr>
       </w:pPr>
-      <w:r>
-        <w:t>Similarly it occurred to me that I should be cleaning my GPS of noise after all:</w:t>
+      <w:proofErr w:type="gramStart"/>
+      <w:r>
+        <w:t>Similarly</w:t>
+      </w:r>
+      <w:proofErr w:type="gramEnd"/>
+      <w:r>
+        <w:t xml:space="preserve"> it occurred to me that I should be cleaning my GPS of noise after all:</w:t>
       </w:r>
     </w:p>
     <w:p>
@@ -7173,7 +8536,15 @@
         <w:t>Now when I run my DR code</w:t>
       </w:r>
       <w:r>
-        <w:t>… for the first time, I’m actually within spitting distance. Though I do note something funny in my IMU data (circled in yellow).</w:t>
+        <w:t xml:space="preserve">… for the first time, I’m </w:t>
+      </w:r>
+      <w:proofErr w:type="gramStart"/>
+      <w:r>
+        <w:t>actually within</w:t>
+      </w:r>
+      <w:proofErr w:type="gramEnd"/>
+      <w:r>
+        <w:t xml:space="preserve"> spitting distance. Though I do note something funny in my IMU data (circled in yellow).</w:t>
       </w:r>
     </w:p>
     <w:p>
@@ -7330,7 +8701,15 @@
         </w:numPr>
       </w:pPr>
       <w:r>
-        <w:t>What am I going to do about that funny section? I’m going to find it in the data and plot that time period to see whether it looks obviously weird.</w:t>
+        <w:t xml:space="preserve">What am I going to do about that funny section? I’m going to find it in the data and plot that </w:t>
+      </w:r>
+      <w:proofErr w:type="gramStart"/>
+      <w:r>
+        <w:t>time period</w:t>
+      </w:r>
+      <w:proofErr w:type="gramEnd"/>
+      <w:r>
+        <w:t xml:space="preserve"> to see whether it looks obviously weird.</w:t>
       </w:r>
     </w:p>
     <w:p>
@@ -7427,7 +8806,47 @@
         </w:numPr>
       </w:pPr>
       <w:r>
-        <w:t>I have put message in chat to get ChrisB thoughts but in the meantime I will work towards what I think the next step will be: finding all the misread sections and removing them. Similar to the kangaroo data (though that’s worse), we have to go through and chop up the data into good sections with NA’s in between</w:t>
+        <w:t xml:space="preserve">I have put message in chat to get </w:t>
+      </w:r>
+      <w:proofErr w:type="spellStart"/>
+      <w:r>
+        <w:t>ChrisB</w:t>
+      </w:r>
+      <w:proofErr w:type="spellEnd"/>
+      <w:r>
+        <w:t xml:space="preserve"> thoughts but in the </w:t>
+      </w:r>
+      <w:proofErr w:type="gramStart"/>
+      <w:r>
+        <w:t>meantime</w:t>
+      </w:r>
+      <w:proofErr w:type="gramEnd"/>
+      <w:r>
+        <w:t xml:space="preserve"> I will work towards what I think the next step will be: finding all the misread sections and removing them. </w:t>
+      </w:r>
+      <w:proofErr w:type="gramStart"/>
+      <w:r>
+        <w:t>Similar to</w:t>
+      </w:r>
+      <w:proofErr w:type="gramEnd"/>
+      <w:r>
+        <w:t xml:space="preserve"> the kangaroo data (though that’s worse), we </w:t>
+      </w:r>
+      <w:proofErr w:type="gramStart"/>
+      <w:r>
+        <w:t>have to</w:t>
+      </w:r>
+      <w:proofErr w:type="gramEnd"/>
+      <w:r>
+        <w:t xml:space="preserve"> go through and chop up the data into good sections with </w:t>
+      </w:r>
+      <w:proofErr w:type="gramStart"/>
+      <w:r>
+        <w:t>NA’s</w:t>
+      </w:r>
+      <w:proofErr w:type="gramEnd"/>
+      <w:r>
+        <w:t xml:space="preserve"> in between</w:t>
       </w:r>
       <w:r>
         <w:t>?</w:t>
@@ -7634,7 +9053,31 @@
         </w:numPr>
       </w:pPr>
       <w:r>
-        <w:t>Then ChrisB pointed out that this was happening over hours not minutes, and is therefore more likely to be sleeping. He said “</w:t>
+        <w:t xml:space="preserve">Then </w:t>
+      </w:r>
+      <w:proofErr w:type="spellStart"/>
+      <w:r>
+        <w:t>ChrisB</w:t>
+      </w:r>
+      <w:proofErr w:type="spellEnd"/>
+      <w:r>
+        <w:t xml:space="preserve"> pointed out that this was happening over hours not </w:t>
+      </w:r>
+      <w:proofErr w:type="gramStart"/>
+      <w:r>
+        <w:t>minutes, and</w:t>
+      </w:r>
+      <w:proofErr w:type="gramEnd"/>
+      <w:r>
+        <w:t xml:space="preserve"> is therefore more likely to be sleeping. He </w:t>
+      </w:r>
+      <w:proofErr w:type="gramStart"/>
+      <w:r>
+        <w:t>said</w:t>
+      </w:r>
+      <w:proofErr w:type="gramEnd"/>
+      <w:r>
+        <w:t xml:space="preserve"> “</w:t>
       </w:r>
       <w:r>
         <w:rPr>
@@ -7643,7 +9086,23 @@
         <w:t>In that static accelerometer region it's likely just measuring gravity, but if the rotation of the collar isn't pointing the right way it will see that as an acceleration in the wrong direction and pick that up as movement”</w:t>
       </w:r>
       <w:r>
-        <w:t xml:space="preserve">. Ahhhh brilliant man has saved me once again. So if I can detect that as sleeping then I can set to no movement and no DR during that period. </w:t>
+        <w:t xml:space="preserve">. </w:t>
+      </w:r>
+      <w:proofErr w:type="spellStart"/>
+      <w:r>
+        <w:t>Ahhhh</w:t>
+      </w:r>
+      <w:proofErr w:type="spellEnd"/>
+      <w:r>
+        <w:t xml:space="preserve"> brilliant man has saved me once again. </w:t>
+      </w:r>
+      <w:proofErr w:type="gramStart"/>
+      <w:r>
+        <w:t>So</w:t>
+      </w:r>
+      <w:proofErr w:type="gramEnd"/>
+      <w:r>
+        <w:t xml:space="preserve"> if I can detect that as sleeping then I can set to no movement and no DR during that period. </w:t>
       </w:r>
     </w:p>
     <w:p>
@@ -7658,7 +9117,15 @@
         <w:t>Back to what I was doing detecting the flat bits…</w:t>
       </w:r>
       <w:r>
-        <w:t xml:space="preserve"> The way I did that in my VDBA paper was that I found a place where the standard deviation wasn’t changing. So I will try that again</w:t>
+        <w:t xml:space="preserve"> The way I did that in my VDBA paper was that I found a place where the standard deviation wasn’t changing. </w:t>
+      </w:r>
+      <w:proofErr w:type="gramStart"/>
+      <w:r>
+        <w:t>So</w:t>
+      </w:r>
+      <w:proofErr w:type="gramEnd"/>
+      <w:r>
+        <w:t xml:space="preserve"> I will try that again</w:t>
       </w:r>
       <w:r>
         <w:t>…</w:t>
@@ -7790,7 +9257,20 @@
         <w:sym w:font="Wingdings" w:char="F0E0"/>
       </w:r>
       <w:r>
-        <w:t xml:space="preserve"> ifelse(VDBA.sm &gt; 0.015, 0, 1) &amp; most common level in 60 seconds (3000 samples)</w:t>
+        <w:t xml:space="preserve"> </w:t>
+      </w:r>
+      <w:proofErr w:type="spellStart"/>
+      <w:proofErr w:type="gramStart"/>
+      <w:r>
+        <w:t>ifelse</w:t>
+      </w:r>
+      <w:proofErr w:type="spellEnd"/>
+      <w:r>
+        <w:t>(</w:t>
+      </w:r>
+      <w:proofErr w:type="gramEnd"/>
+      <w:r>
+        <w:t>VDBA.sm &gt; 0.015, 0, 1) &amp; most common level in 60 seconds (3000 samples)</w:t>
       </w:r>
       <w:r>
         <w:t>)</w:t>
@@ -7808,7 +9288,15 @@
         <w:t xml:space="preserve">Testing that </w:t>
       </w:r>
       <w:r>
-        <w:t>however showed no difference and the gps is moving consistently through the period???</w:t>
+        <w:t xml:space="preserve">however showed no difference and the </w:t>
+      </w:r>
+      <w:proofErr w:type="spellStart"/>
+      <w:r>
+        <w:t>gps</w:t>
+      </w:r>
+      <w:proofErr w:type="spellEnd"/>
+      <w:r>
+        <w:t xml:space="preserve"> is moving consistently through the period???</w:t>
       </w:r>
     </w:p>
     <w:p>
@@ -7929,7 +9417,15 @@
         <w:t>I then isolated just the part where my accel says the GPS isn’t moving…</w:t>
       </w:r>
       <w:r>
-        <w:t xml:space="preserve"> and still got a displacement of 30m with the smoothed values for the black part of the line. The total “distance” looks like maybe 50 – and that’s after smoothing. So I think I’m going to have to add a step where if the animal hasn’t moved, take the average value. (Like I did for the koalas)</w:t>
+        <w:t xml:space="preserve"> and still got a displacement of 30m with the smoothed values for the black part of the line. The total “distance” looks like maybe 50 – and that’s after smoothing. </w:t>
+      </w:r>
+      <w:proofErr w:type="gramStart"/>
+      <w:r>
+        <w:t>So</w:t>
+      </w:r>
+      <w:proofErr w:type="gramEnd"/>
+      <w:r>
+        <w:t xml:space="preserve"> I think I’m going to have to add a step where if the animal hasn’t moved, take the average value. (Like I did for the koalas)</w:t>
       </w:r>
       <w:r>
         <w:t xml:space="preserve">. </w:t>
@@ -8047,8 +9543,21 @@
           <w:numId w:val="2"/>
         </w:numPr>
       </w:pPr>
-      <w:r>
-        <w:t>Firstly I continued with the cleaning by adding a lowpass butterworth filter with a cutoff of 10Hz. The results of the 3 steps of smoothing shown in right plot below.</w:t>
+      <w:proofErr w:type="gramStart"/>
+      <w:r>
+        <w:t>Firstly</w:t>
+      </w:r>
+      <w:proofErr w:type="gramEnd"/>
+      <w:r>
+        <w:t xml:space="preserve"> I continued with the cleaning by adding a lowpass </w:t>
+      </w:r>
+      <w:proofErr w:type="spellStart"/>
+      <w:r>
+        <w:t>butterworth</w:t>
+      </w:r>
+      <w:proofErr w:type="spellEnd"/>
+      <w:r>
+        <w:t xml:space="preserve"> filter with a cutoff of 10Hz. The results of the 3 steps of smoothing shown in right plot below.</w:t>
       </w:r>
     </w:p>
     <w:p>
@@ -8183,10 +9692,26 @@
         <w:t>For example, in this case, there are 2 stationary periods where there should be no GPS changes.</w:t>
       </w:r>
       <w:r>
-        <w:t xml:space="preserve"> The dark blue dots in the gps graph right show the stationary periods. The green dots are what got fed to the spline and the red is the spline path.</w:t>
-      </w:r>
-      <w:r>
-        <w:t xml:space="preserve"> Note there are only 2 black dots because all the stationary got grouped.</w:t>
+        <w:t xml:space="preserve"> The dark blue dots in the </w:t>
+      </w:r>
+      <w:proofErr w:type="spellStart"/>
+      <w:r>
+        <w:t>gps</w:t>
+      </w:r>
+      <w:proofErr w:type="spellEnd"/>
+      <w:r>
+        <w:t xml:space="preserve"> graph right show the stationary periods. The green dots are what got fed to the spline and the red is the spline path.</w:t>
+      </w:r>
+      <w:r>
+        <w:t xml:space="preserve"> Note there are only 2 black dots because all the </w:t>
+      </w:r>
+      <w:proofErr w:type="gramStart"/>
+      <w:r>
+        <w:t>stationary</w:t>
+      </w:r>
+      <w:proofErr w:type="gramEnd"/>
+      <w:r>
+        <w:t xml:space="preserve"> got grouped.</w:t>
       </w:r>
     </w:p>
     <w:p>
@@ -8443,7 +9968,15 @@
         </w:numPr>
       </w:pPr>
       <w:r>
-        <w:t xml:space="preserve">Then ChrisB helped me for a few hours, figuring out many things. For example, he found that everything was scaled by 4 because the settings of the accelerometer weren’t what I thought. (They were 16 for the kangaroos but 4 for the impala) </w:t>
+        <w:t xml:space="preserve">Then </w:t>
+      </w:r>
+      <w:proofErr w:type="spellStart"/>
+      <w:r>
+        <w:t>ChrisB</w:t>
+      </w:r>
+      <w:proofErr w:type="spellEnd"/>
+      <w:r>
+        <w:t xml:space="preserve"> helped me for a few hours, figuring out many things. For example, he found that everything was scaled by 4 because the settings of the accelerometer weren’t what I thought. (They were 16 for the kangaroos but 4 for the impala) </w:t>
       </w:r>
     </w:p>
     <w:p>
@@ -8536,7 +10069,23 @@
         </w:numPr>
       </w:pPr>
       <w:r>
-        <w:t>Chris Bird also doesn’t believe in tilt-corrected accelerometer based DR and thinks we should have to use the gyroscope (pronounced guyroscope… as I learnt today)</w:t>
+        <w:t xml:space="preserve">Chris Bird also doesn’t believe in tilt-corrected </w:t>
+      </w:r>
+      <w:proofErr w:type="gramStart"/>
+      <w:r>
+        <w:t>accelerometer based</w:t>
+      </w:r>
+      <w:proofErr w:type="gramEnd"/>
+      <w:r>
+        <w:t xml:space="preserve"> DR and thinks we should have to use the gyroscope (pronounced </w:t>
+      </w:r>
+      <w:proofErr w:type="spellStart"/>
+      <w:r>
+        <w:t>guyroscope</w:t>
+      </w:r>
+      <w:proofErr w:type="spellEnd"/>
+      <w:r>
+        <w:t>… as I learnt today)</w:t>
       </w:r>
     </w:p>
     <w:p>
@@ -8580,7 +10129,39 @@
           <w:i/>
           <w:iCs/>
         </w:rPr>
-        <w:t xml:space="preserve">The short answer is, yes - if a wrong ref frame was chosen then DR path wil be innacurate. But comparing subsets with GPS pre-correction will help debug if chosen orientation was correct. The patterns and directions of travel should be similar even if scale is not when compared to GPS. I had some lions where I had to 'figure' out the orientation post release. But visually it should be easy to decipher the </w:t>
+        <w:t xml:space="preserve">The short answer is, yes - if a wrong ref frame was chosen then DR path </w:t>
+      </w:r>
+      <w:proofErr w:type="spellStart"/>
+      <w:r>
+        <w:rPr>
+          <w:i/>
+          <w:iCs/>
+        </w:rPr>
+        <w:t>wil</w:t>
+      </w:r>
+      <w:proofErr w:type="spellEnd"/>
+      <w:r>
+        <w:rPr>
+          <w:i/>
+          <w:iCs/>
+        </w:rPr>
+        <w:t xml:space="preserve"> be </w:t>
+      </w:r>
+      <w:proofErr w:type="spellStart"/>
+      <w:r>
+        <w:rPr>
+          <w:i/>
+          <w:iCs/>
+        </w:rPr>
+        <w:t>innacurate</w:t>
+      </w:r>
+      <w:proofErr w:type="spellEnd"/>
+      <w:r>
+        <w:rPr>
+          <w:i/>
+          <w:iCs/>
+        </w:rPr>
+        <w:t xml:space="preserve">. But comparing subsets with GPS pre-correction will help debug if chosen orientation was correct. The patterns and directions of travel should be similar even if scale is not when compared to GPS. I had some lions where I had to 'figure' out the orientation post release. But visually it should be easy to decipher the </w:t>
       </w:r>
       <w:r>
         <w:rPr>
@@ -8588,44 +10169,181 @@
           <w:iCs/>
           <w:highlight w:val="green"/>
         </w:rPr>
-        <w:t>heave axis of movmement</w:t>
-      </w:r>
-      <w:r>
-        <w:rPr>
-          <w:i/>
-          <w:iCs/>
-        </w:rPr>
-        <w:t xml:space="preserve"> in acc and mag (</w:t>
-      </w:r>
+        <w:t xml:space="preserve">heave axis of </w:t>
+      </w:r>
+      <w:proofErr w:type="spellStart"/>
       <w:r>
         <w:rPr>
           <w:i/>
           <w:iCs/>
           <w:highlight w:val="green"/>
         </w:rPr>
-        <w:t>acc will be the one closest to +/-1 g most of the time, and mag will the one changing the least</w:t>
-      </w:r>
+        <w:t>movmement</w:t>
+      </w:r>
+      <w:proofErr w:type="spellEnd"/>
       <w:r>
         <w:rPr>
           <w:i/>
           <w:iCs/>
         </w:rPr>
-        <w:t xml:space="preserve">)... In terms of deciphering the acc/mag surge and sway dimensions, this may be more challenging. But for the </w:t>
-      </w:r>
+        <w:t xml:space="preserve"> in </w:t>
+      </w:r>
+      <w:proofErr w:type="spellStart"/>
+      <w:r>
+        <w:rPr>
+          <w:i/>
+          <w:iCs/>
+        </w:rPr>
+        <w:t>acc</w:t>
+      </w:r>
+      <w:proofErr w:type="spellEnd"/>
+      <w:r>
+        <w:rPr>
+          <w:i/>
+          <w:iCs/>
+        </w:rPr>
+        <w:t xml:space="preserve"> and mag (</w:t>
+      </w:r>
+      <w:proofErr w:type="spellStart"/>
+      <w:r>
+        <w:rPr>
+          <w:i/>
+          <w:iCs/>
+          <w:highlight w:val="green"/>
+        </w:rPr>
+        <w:t>acc</w:t>
+      </w:r>
+      <w:proofErr w:type="spellEnd"/>
+      <w:r>
+        <w:rPr>
+          <w:i/>
+          <w:iCs/>
+          <w:highlight w:val="green"/>
+        </w:rPr>
+        <w:t xml:space="preserve"> will be the one closest to +/-1 g most of the time, and mag will the one changing the </w:t>
+      </w:r>
+      <w:proofErr w:type="gramStart"/>
+      <w:r>
+        <w:rPr>
+          <w:i/>
+          <w:iCs/>
+          <w:highlight w:val="green"/>
+        </w:rPr>
+        <w:t>least</w:t>
+      </w:r>
+      <w:r>
+        <w:rPr>
+          <w:i/>
+          <w:iCs/>
+        </w:rPr>
+        <w:t>)...</w:t>
+      </w:r>
+      <w:proofErr w:type="gramEnd"/>
+      <w:r>
+        <w:rPr>
+          <w:i/>
+          <w:iCs/>
+        </w:rPr>
+        <w:t xml:space="preserve"> In terms of deciphering the </w:t>
+      </w:r>
+      <w:proofErr w:type="spellStart"/>
+      <w:r>
+        <w:rPr>
+          <w:i/>
+          <w:iCs/>
+        </w:rPr>
+        <w:t>acc</w:t>
+      </w:r>
+      <w:proofErr w:type="spellEnd"/>
+      <w:r>
+        <w:rPr>
+          <w:i/>
+          <w:iCs/>
+        </w:rPr>
+        <w:t xml:space="preserve">/mag surge and sway dimensions, this may be more challenging. But for the </w:t>
+      </w:r>
+      <w:proofErr w:type="spellStart"/>
       <w:r>
         <w:rPr>
           <w:i/>
           <w:iCs/>
           <w:highlight w:val="yellow"/>
         </w:rPr>
-        <w:t>acc, you would expect greater variation in surge dimension because they stick their head to ground to forage and then stick their head back up when travelling and vigalence</w:t>
-      </w:r>
+        <w:t>acc</w:t>
+      </w:r>
+      <w:proofErr w:type="spellEnd"/>
       <w:r>
         <w:rPr>
           <w:i/>
           <w:iCs/>
-        </w:rPr>
-        <w:t>, so that may help. If mag is different orientation set up to acc, then its worth just checking if you switch the surge/sway orientations then which one produces most realsitic DR track relative to GPS... by deciphering the heave axis and dimension of measured g, you already have homed in on just a few possible orientations it could be...</w:t>
+          <w:highlight w:val="yellow"/>
+        </w:rPr>
+        <w:t xml:space="preserve">, you would expect greater variation in surge dimension because they stick their head to ground to forage and then stick their head back up when travelling and </w:t>
+      </w:r>
+      <w:proofErr w:type="spellStart"/>
+      <w:r>
+        <w:rPr>
+          <w:i/>
+          <w:iCs/>
+          <w:highlight w:val="yellow"/>
+        </w:rPr>
+        <w:t>vigalence</w:t>
+      </w:r>
+      <w:proofErr w:type="spellEnd"/>
+      <w:r>
+        <w:rPr>
+          <w:i/>
+          <w:iCs/>
+        </w:rPr>
+        <w:t xml:space="preserve">, so that may help. If mag is different orientation set up to </w:t>
+      </w:r>
+      <w:proofErr w:type="spellStart"/>
+      <w:r>
+        <w:rPr>
+          <w:i/>
+          <w:iCs/>
+        </w:rPr>
+        <w:t>acc</w:t>
+      </w:r>
+      <w:proofErr w:type="spellEnd"/>
+      <w:r>
+        <w:rPr>
+          <w:i/>
+          <w:iCs/>
+        </w:rPr>
+        <w:t xml:space="preserve">, then </w:t>
+      </w:r>
+      <w:proofErr w:type="spellStart"/>
+      <w:r>
+        <w:rPr>
+          <w:i/>
+          <w:iCs/>
+        </w:rPr>
+        <w:t>its</w:t>
+      </w:r>
+      <w:proofErr w:type="spellEnd"/>
+      <w:r>
+        <w:rPr>
+          <w:i/>
+          <w:iCs/>
+        </w:rPr>
+        <w:t xml:space="preserve"> worth just checking if you switch the surge/sway orientations then which one produces most </w:t>
+      </w:r>
+      <w:proofErr w:type="spellStart"/>
+      <w:r>
+        <w:rPr>
+          <w:i/>
+          <w:iCs/>
+        </w:rPr>
+        <w:t>realsitic</w:t>
+      </w:r>
+      <w:proofErr w:type="spellEnd"/>
+      <w:r>
+        <w:rPr>
+          <w:i/>
+          <w:iCs/>
+        </w:rPr>
+        <w:t xml:space="preserve"> DR track relative to GPS... by deciphering the heave axis and dimension of measured g, you already have homed in on just a few possible orientations it could be...</w:t>
       </w:r>
     </w:p>
     <w:p>
@@ -8707,7 +10425,15 @@
         </w:numPr>
       </w:pPr>
       <w:r>
-        <w:t xml:space="preserve">From these graphs I can guess that the heave axis is the Z axis. The Surge is the Y. And therefore the sway is the X. </w:t>
+        <w:t xml:space="preserve">From these graphs I can guess that the heave axis is the Z axis. The Surge is the Y. And </w:t>
+      </w:r>
+      <w:proofErr w:type="gramStart"/>
+      <w:r>
+        <w:t>therefore</w:t>
+      </w:r>
+      <w:proofErr w:type="gramEnd"/>
+      <w:r>
+        <w:t xml:space="preserve"> the sway is the X. </w:t>
       </w:r>
     </w:p>
     <w:p>
@@ -8811,8 +10537,47 @@
           <w:numId w:val="2"/>
         </w:numPr>
       </w:pPr>
-      <w:r>
-        <w:t>acc_orientation &lt;- "NWU",   mag_orientation &lt;- "NED",   gravity_direction &lt;- "down",   pitch &lt;- 0#-48</w:t>
+      <w:proofErr w:type="spellStart"/>
+      <w:r>
+        <w:t>acc_orientation</w:t>
+      </w:r>
+      <w:proofErr w:type="spellEnd"/>
+      <w:r>
+        <w:t xml:space="preserve"> &lt;- "NWU</w:t>
+      </w:r>
+      <w:proofErr w:type="gramStart"/>
+      <w:r>
+        <w:t xml:space="preserve">",   </w:t>
+      </w:r>
+      <w:proofErr w:type="spellStart"/>
+      <w:proofErr w:type="gramEnd"/>
+      <w:r>
+        <w:t>mag_orientation</w:t>
+      </w:r>
+      <w:proofErr w:type="spellEnd"/>
+      <w:r>
+        <w:t xml:space="preserve"> &lt;- "NED</w:t>
+      </w:r>
+      <w:proofErr w:type="gramStart"/>
+      <w:r>
+        <w:t xml:space="preserve">",   </w:t>
+      </w:r>
+      <w:proofErr w:type="spellStart"/>
+      <w:proofErr w:type="gramEnd"/>
+      <w:r>
+        <w:t>gravity_direction</w:t>
+      </w:r>
+      <w:proofErr w:type="spellEnd"/>
+      <w:r>
+        <w:t xml:space="preserve"> &lt;- "down</w:t>
+      </w:r>
+      <w:proofErr w:type="gramStart"/>
+      <w:r>
+        <w:t xml:space="preserve">",   </w:t>
+      </w:r>
+      <w:proofErr w:type="gramEnd"/>
+      <w:r>
+        <w:t>pitch &lt;- 0#-48</w:t>
       </w:r>
     </w:p>
     <w:p>
@@ -9008,7 +10773,15 @@
         </w:numPr>
       </w:pPr>
       <w:r>
-        <w:t xml:space="preserve">Amelia has officially finished annotating all the labelable data but… unfortunately, it really just isn’t that much data. I’m going to need to generate more of it. Specifically, I want to know the difference between head up and head down behaviours to improve upon the DR. </w:t>
+        <w:t xml:space="preserve">Amelia has officially finished annotating all the labelable data but… unfortunately, it </w:t>
+      </w:r>
+      <w:proofErr w:type="gramStart"/>
+      <w:r>
+        <w:t>really just</w:t>
+      </w:r>
+      <w:proofErr w:type="gramEnd"/>
+      <w:r>
+        <w:t xml:space="preserve"> isn’t that much data. I’m going to need to generate more of it. Specifically, I want to know the difference between head up and head down behaviours to improve upon the DR. </w:t>
       </w:r>
       <w:r>
         <w:t xml:space="preserve">Below is what we have so far… Today I am going to try to get Ethan to increase it by finding new samples by blind searching. </w:t>
@@ -9022,8 +10795,13 @@
           <w:numId w:val="2"/>
         </w:numPr>
       </w:pPr>
-      <w:r>
-        <w:t>Specifically I want specific behaviours. Will make a guide to them so he knows what to look for</w:t>
+      <w:proofErr w:type="gramStart"/>
+      <w:r>
+        <w:t>Specifically</w:t>
+      </w:r>
+      <w:proofErr w:type="gramEnd"/>
+      <w:r>
+        <w:t xml:space="preserve"> I want specific behaviours. Will make a guide to them so he knows what to look for</w:t>
       </w:r>
       <w:r>
         <w:t>…. Those are on the next pages.</w:t>
@@ -9135,7 +10913,15 @@
     <w:p/>
     <w:p>
       <w:r>
-        <w:t>X = "salmon", Y = "turquoise", Z = "darkblue"</w:t>
+        <w:t>X = "salmon", Y = "turquoise", Z = "</w:t>
+      </w:r>
+      <w:proofErr w:type="spellStart"/>
+      <w:r>
+        <w:t>darkblue</w:t>
+      </w:r>
+      <w:proofErr w:type="spellEnd"/>
+      <w:r>
+        <w:t>"</w:t>
       </w:r>
     </w:p>
     <w:p>
@@ -9556,6 +11342,7 @@
           <w:lang w:val="en-GB"/>
         </w:rPr>
       </w:pPr>
+      <w:proofErr w:type="gramStart"/>
       <w:r>
         <w:rPr>
           <w:rFonts w:asciiTheme="minorHAnsi" w:hAnsiTheme="minorHAnsi"/>
@@ -9563,14 +11350,23 @@
           <w:lang w:val="en-GB"/>
         </w:rPr>
         <w:lastRenderedPageBreak/>
-        <w:t>However…</w:t>
-      </w:r>
+        <w:t>However</w:t>
+      </w:r>
+      <w:proofErr w:type="gramEnd"/>
       <w:r>
         <w:rPr>
           <w:rFonts w:asciiTheme="minorHAnsi" w:hAnsiTheme="minorHAnsi"/>
           <w:highlight w:val="yellow"/>
           <w:lang w:val="en-GB"/>
         </w:rPr>
+        <w:t>…</w:t>
+      </w:r>
+      <w:r>
+        <w:rPr>
+          <w:rFonts w:asciiTheme="minorHAnsi" w:hAnsiTheme="minorHAnsi"/>
+          <w:highlight w:val="yellow"/>
+          <w:lang w:val="en-GB"/>
+        </w:rPr>
         <w:t xml:space="preserve"> just a heads up, it seems that the devices were all scaled differently. Lmao</w:t>
       </w:r>
       <w:r>
@@ -9578,7 +11374,23 @@
           <w:rFonts w:asciiTheme="minorHAnsi" w:hAnsiTheme="minorHAnsi"/>
           <w:lang w:val="en-GB"/>
         </w:rPr>
-        <w:t>. This will need to be controlled for in both behaviour searching and the dead reckoning.</w:t>
+        <w:t xml:space="preserve">. This will need to be controlled for in both </w:t>
+      </w:r>
+      <w:proofErr w:type="gramStart"/>
+      <w:r>
+        <w:rPr>
+          <w:rFonts w:asciiTheme="minorHAnsi" w:hAnsiTheme="minorHAnsi"/>
+          <w:lang w:val="en-GB"/>
+        </w:rPr>
+        <w:t>behaviour</w:t>
+      </w:r>
+      <w:proofErr w:type="gramEnd"/>
+      <w:r>
+        <w:rPr>
+          <w:rFonts w:asciiTheme="minorHAnsi" w:hAnsiTheme="minorHAnsi"/>
+          <w:lang w:val="en-GB"/>
+        </w:rPr>
+        <w:t xml:space="preserve"> searching and the dead reckoning.</w:t>
       </w:r>
     </w:p>
     <w:p>
@@ -9623,7 +11435,23 @@
           <w:rFonts w:asciiTheme="minorHAnsi" w:hAnsiTheme="minorHAnsi"/>
           <w:lang w:val="en-GB"/>
         </w:rPr>
-        <w:t>Plotted it to see what units the devices are in and holy fuck, why are they all different??? What evil tomfoolery is this?????? Messaged ChrisB to ask what the heck is going on.</w:t>
+        <w:t xml:space="preserve">Plotted it to see what units the devices are in and holy fuck, why are they all different??? What evil tomfoolery is this?????? Messaged </w:t>
+      </w:r>
+      <w:proofErr w:type="spellStart"/>
+      <w:r>
+        <w:rPr>
+          <w:rFonts w:asciiTheme="minorHAnsi" w:hAnsiTheme="minorHAnsi"/>
+          <w:lang w:val="en-GB"/>
+        </w:rPr>
+        <w:t>ChrisB</w:t>
+      </w:r>
+      <w:proofErr w:type="spellEnd"/>
+      <w:r>
+        <w:rPr>
+          <w:rFonts w:asciiTheme="minorHAnsi" w:hAnsiTheme="minorHAnsi"/>
+          <w:lang w:val="en-GB"/>
+        </w:rPr>
+        <w:t xml:space="preserve"> to ask what the heck is going on.</w:t>
       </w:r>
     </w:p>
     <w:p>
@@ -9826,7 +11654,23 @@
           <w:rFonts w:asciiTheme="minorHAnsi" w:hAnsiTheme="minorHAnsi"/>
           <w:lang w:val="en-GB"/>
         </w:rPr>
-        <w:t xml:space="preserve"> Except not all collars have it… and, on closer inspection, it’s clearly not true. These are the settings as reported by the config files but we can clearly see this is not the case in the graphs from yesterday. </w:t>
+        <w:t xml:space="preserve"> Except not all collars have it… and, on closer inspection, it’s clearly not true. These are the settings as reported by the config </w:t>
+      </w:r>
+      <w:proofErr w:type="gramStart"/>
+      <w:r>
+        <w:rPr>
+          <w:rFonts w:asciiTheme="minorHAnsi" w:hAnsiTheme="minorHAnsi"/>
+          <w:lang w:val="en-GB"/>
+        </w:rPr>
+        <w:t>files</w:t>
+      </w:r>
+      <w:proofErr w:type="gramEnd"/>
+      <w:r>
+        <w:rPr>
+          <w:rFonts w:asciiTheme="minorHAnsi" w:hAnsiTheme="minorHAnsi"/>
+          <w:lang w:val="en-GB"/>
+        </w:rPr>
+        <w:t xml:space="preserve"> but we can clearly see this is not the case in the graphs from yesterday. </w:t>
       </w:r>
     </w:p>
     <w:p>
@@ -9920,12 +11764,53 @@
           <w:lang w:val="en-GB"/>
         </w:rPr>
       </w:pPr>
+      <w:proofErr w:type="gramStart"/>
       <w:r>
         <w:rPr>
           <w:rFonts w:asciiTheme="minorHAnsi" w:hAnsiTheme="minorHAnsi"/>
           <w:lang w:val="en-GB"/>
         </w:rPr>
-        <w:t xml:space="preserve">Basically I found that there are 3 settings. Either the device is already in G (either 16 or 4) or its in raw units and has to be converted. The cropping at 4g means I am going to have to match and join it to the Axivity </w:t>
+        <w:t>Basically</w:t>
+      </w:r>
+      <w:proofErr w:type="gramEnd"/>
+      <w:r>
+        <w:rPr>
+          <w:rFonts w:asciiTheme="minorHAnsi" w:hAnsiTheme="minorHAnsi"/>
+          <w:lang w:val="en-GB"/>
+        </w:rPr>
+        <w:t xml:space="preserve"> I found that there are 3 settings. Either the device is already in G (either 16 or 4) or its in raw units and </w:t>
+      </w:r>
+      <w:proofErr w:type="gramStart"/>
+      <w:r>
+        <w:rPr>
+          <w:rFonts w:asciiTheme="minorHAnsi" w:hAnsiTheme="minorHAnsi"/>
+          <w:lang w:val="en-GB"/>
+        </w:rPr>
+        <w:t>has to</w:t>
+      </w:r>
+      <w:proofErr w:type="gramEnd"/>
+      <w:r>
+        <w:rPr>
+          <w:rFonts w:asciiTheme="minorHAnsi" w:hAnsiTheme="minorHAnsi"/>
+          <w:lang w:val="en-GB"/>
+        </w:rPr>
+        <w:t xml:space="preserve"> be converted. The cropping at 4g means I am going to have to match and join it to the </w:t>
+      </w:r>
+      <w:proofErr w:type="spellStart"/>
+      <w:r>
+        <w:rPr>
+          <w:rFonts w:asciiTheme="minorHAnsi" w:hAnsiTheme="minorHAnsi"/>
+          <w:lang w:val="en-GB"/>
+        </w:rPr>
+        <w:t>Axivity</w:t>
+      </w:r>
+      <w:proofErr w:type="spellEnd"/>
+      <w:r>
+        <w:rPr>
+          <w:rFonts w:asciiTheme="minorHAnsi" w:hAnsiTheme="minorHAnsi"/>
+          <w:lang w:val="en-GB"/>
+        </w:rPr>
+        <w:t xml:space="preserve"> </w:t>
       </w:r>
       <w:r>
         <w:rPr>
@@ -9934,12 +11819,21 @@
         </w:rPr>
         <w:t>😢</w:t>
       </w:r>
+      <w:proofErr w:type="spellStart"/>
       <w:r>
         <w:rPr>
           <w:rFonts w:asciiTheme="minorHAnsi" w:hAnsiTheme="minorHAnsi"/>
           <w:lang w:val="en-GB"/>
         </w:rPr>
-        <w:t>ChrisC says this code exists and already works… but I’ve heard that often enough to know that means “this will be hard”.</w:t>
+        <w:t>ChrisC</w:t>
+      </w:r>
+      <w:proofErr w:type="spellEnd"/>
+      <w:r>
+        <w:rPr>
+          <w:rFonts w:asciiTheme="minorHAnsi" w:hAnsiTheme="minorHAnsi"/>
+          <w:lang w:val="en-GB"/>
+        </w:rPr>
+        <w:t xml:space="preserve"> says this code exists and already works… but I’ve heard that often enough to know that means “this will be hard”.</w:t>
       </w:r>
     </w:p>
     <w:tbl>
@@ -10012,6 +11906,7 @@
                 <w14:ligatures w14:val="none"/>
               </w:rPr>
             </w:pPr>
+            <w:proofErr w:type="spellStart"/>
             <w:r>
               <w:rPr>
                 <w:rFonts w:ascii="Aptos Narrow" w:eastAsia="Times New Roman" w:hAnsi="Aptos Narrow" w:cs="Times New Roman"/>
@@ -10024,6 +11919,7 @@
               </w:rPr>
               <w:t>avg_hz</w:t>
             </w:r>
+            <w:proofErr w:type="spellEnd"/>
           </w:p>
         </w:tc>
         <w:tc>
@@ -10045,6 +11941,7 @@
                 <w14:ligatures w14:val="none"/>
               </w:rPr>
             </w:pPr>
+            <w:proofErr w:type="spellStart"/>
             <w:r>
               <w:rPr>
                 <w:rFonts w:ascii="Aptos Narrow" w:eastAsia="Times New Roman" w:hAnsi="Aptos Narrow" w:cs="Times New Roman"/>
@@ -10057,6 +11954,7 @@
               </w:rPr>
               <w:t>Acc_Conv</w:t>
             </w:r>
+            <w:proofErr w:type="spellEnd"/>
           </w:p>
         </w:tc>
         <w:tc>
@@ -10078,6 +11976,7 @@
                 <w14:ligatures w14:val="none"/>
               </w:rPr>
             </w:pPr>
+            <w:proofErr w:type="spellStart"/>
             <w:r>
               <w:rPr>
                 <w:rFonts w:ascii="Aptos Narrow" w:eastAsia="Times New Roman" w:hAnsi="Aptos Narrow" w:cs="Times New Roman"/>
@@ -10090,6 +11989,7 @@
               </w:rPr>
               <w:t>Mag_Conv</w:t>
             </w:r>
+            <w:proofErr w:type="spellEnd"/>
           </w:p>
         </w:tc>
       </w:tr>
@@ -11731,8 +13631,21 @@
             </w:r>
           </w:p>
           <w:p>
+            <w:proofErr w:type="spellStart"/>
             <w:r>
-              <w:t>accel_data[1445000:1452000]</w:t>
+              <w:t>accel_</w:t>
+            </w:r>
+            <w:proofErr w:type="gramStart"/>
+            <w:r>
+              <w:t>data</w:t>
+            </w:r>
+            <w:proofErr w:type="spellEnd"/>
+            <w:r>
+              <w:t>[</w:t>
+            </w:r>
+            <w:proofErr w:type="gramEnd"/>
+            <w:r>
+              <w:t>1445000:1452000]</w:t>
             </w:r>
           </w:p>
         </w:tc>
@@ -11835,8 +13748,21 @@
             </w:r>
           </w:p>
           <w:p>
+            <w:proofErr w:type="spellStart"/>
             <w:r>
-              <w:t>accel_data[1660000:1670000]</w:t>
+              <w:t>accel_</w:t>
+            </w:r>
+            <w:proofErr w:type="gramStart"/>
+            <w:r>
+              <w:t>data</w:t>
+            </w:r>
+            <w:proofErr w:type="spellEnd"/>
+            <w:r>
+              <w:t>[</w:t>
+            </w:r>
+            <w:proofErr w:type="gramEnd"/>
+            <w:r>
+              <w:t>1660000:1670000]</w:t>
             </w:r>
           </w:p>
         </w:tc>
@@ -11939,8 +13865,21 @@
             </w:r>
           </w:p>
           <w:p>
+            <w:proofErr w:type="spellStart"/>
             <w:r>
-              <w:t>accel_data[90000:91000]</w:t>
+              <w:t>accel_</w:t>
+            </w:r>
+            <w:proofErr w:type="gramStart"/>
+            <w:r>
+              <w:t>data</w:t>
+            </w:r>
+            <w:proofErr w:type="spellEnd"/>
+            <w:r>
+              <w:t>[</w:t>
+            </w:r>
+            <w:proofErr w:type="gramEnd"/>
+            <w:r>
+              <w:t>90000:91000]</w:t>
             </w:r>
           </w:p>
         </w:tc>
@@ -12781,7 +14720,39 @@
           <w:rFonts w:asciiTheme="minorHAnsi" w:hAnsiTheme="minorHAnsi"/>
           <w:lang w:val="en-GB"/>
         </w:rPr>
-        <w:t>Therefore, I went through and made sure they’re now on the same scale (other than the ones that capped at 4g and therefore have to be matched with the Axivity before behavioural and VDBA analysis). I then re-extracted the training data for those periods based on the times of the original unsmoothed data. That code is now running. I will check the output tomorrow.</w:t>
+        <w:t xml:space="preserve">Therefore, I went through and made sure they’re now on the same scale (other than the ones that capped at 4g and therefore </w:t>
+      </w:r>
+      <w:proofErr w:type="gramStart"/>
+      <w:r>
+        <w:rPr>
+          <w:rFonts w:asciiTheme="minorHAnsi" w:hAnsiTheme="minorHAnsi"/>
+          <w:lang w:val="en-GB"/>
+        </w:rPr>
+        <w:t>have to</w:t>
+      </w:r>
+      <w:proofErr w:type="gramEnd"/>
+      <w:r>
+        <w:rPr>
+          <w:rFonts w:asciiTheme="minorHAnsi" w:hAnsiTheme="minorHAnsi"/>
+          <w:lang w:val="en-GB"/>
+        </w:rPr>
+        <w:t xml:space="preserve"> be matched with the </w:t>
+      </w:r>
+      <w:proofErr w:type="spellStart"/>
+      <w:r>
+        <w:rPr>
+          <w:rFonts w:asciiTheme="minorHAnsi" w:hAnsiTheme="minorHAnsi"/>
+          <w:lang w:val="en-GB"/>
+        </w:rPr>
+        <w:t>Axivity</w:t>
+      </w:r>
+      <w:proofErr w:type="spellEnd"/>
+      <w:r>
+        <w:rPr>
+          <w:rFonts w:asciiTheme="minorHAnsi" w:hAnsiTheme="minorHAnsi"/>
+          <w:lang w:val="en-GB"/>
+        </w:rPr>
+        <w:t xml:space="preserve"> before behavioural and VDBA analysis). I then re-extracted the training data for those periods based on the times of the original unsmoothed data. That code is now running. I will check the output tomorrow.</w:t>
       </w:r>
     </w:p>
     <w:p>
@@ -12834,7 +14805,23 @@
           <w:rFonts w:asciiTheme="minorHAnsi" w:hAnsiTheme="minorHAnsi"/>
           <w:lang w:val="en-GB"/>
         </w:rPr>
-        <w:t xml:space="preserve">… They did need to be divided after all. Weird? Message CB and he said that things can change or if it reset/rebooted it might have gone back to default. Whatevvvvvvver man. I can’t keep up with all this. Converted everything to the right scale for real now and then proceeded. </w:t>
+        <w:t xml:space="preserve">… They did need to be divided after all. Weird? Message CB and he said that things can change or if it reset/rebooted it might have gone back to default. </w:t>
+      </w:r>
+      <w:proofErr w:type="spellStart"/>
+      <w:r>
+        <w:rPr>
+          <w:rFonts w:asciiTheme="minorHAnsi" w:hAnsiTheme="minorHAnsi"/>
+          <w:lang w:val="en-GB"/>
+        </w:rPr>
+        <w:t>Whatevvvvvvver</w:t>
+      </w:r>
+      <w:proofErr w:type="spellEnd"/>
+      <w:r>
+        <w:rPr>
+          <w:rFonts w:asciiTheme="minorHAnsi" w:hAnsiTheme="minorHAnsi"/>
+          <w:lang w:val="en-GB"/>
+        </w:rPr>
+        <w:t xml:space="preserve"> man. I can’t keep up with all this. Converted everything to the right scale for real now and then proceeded. </w:t>
       </w:r>
     </w:p>
     <w:p>
@@ -12909,8 +14896,17 @@
           <w:rFonts w:asciiTheme="minorHAnsi" w:hAnsiTheme="minorHAnsi"/>
           <w:lang w:val="en-GB"/>
         </w:rPr>
-        <w:t xml:space="preserve"> Some errors I can see, but these will be cleaned out in the next step of the second matlab</w:t>
-      </w:r>
+        <w:t xml:space="preserve"> Some errors I can see, but these will be cleaned out in the next step of the second </w:t>
+      </w:r>
+      <w:proofErr w:type="spellStart"/>
+      <w:r>
+        <w:rPr>
+          <w:rFonts w:asciiTheme="minorHAnsi" w:hAnsiTheme="minorHAnsi"/>
+          <w:lang w:val="en-GB"/>
+        </w:rPr>
+        <w:t>matlab</w:t>
+      </w:r>
+      <w:proofErr w:type="spellEnd"/>
       <w:r>
         <w:rPr>
           <w:rFonts w:asciiTheme="minorHAnsi" w:hAnsiTheme="minorHAnsi"/>
@@ -12935,9 +14931,9 @@
           <w:lang w:val="en-GB"/>
         </w:rPr>
         <w:drawing>
-          <wp:inline distT="0" distB="0" distL="0" distR="0" wp14:anchorId="49B9F991" wp14:editId="182F336B">
-            <wp:extent cx="6829425" cy="2344707"/>
-            <wp:effectExtent l="0" t="0" r="0" b="0"/>
+          <wp:inline distT="0" distB="0" distL="0" distR="0" wp14:anchorId="49B9F991" wp14:editId="0D170072">
+            <wp:extent cx="4371975" cy="1501005"/>
+            <wp:effectExtent l="0" t="0" r="0" b="4445"/>
             <wp:docPr id="319207565" name="Picture 9"/>
             <wp:cNvGraphicFramePr>
               <a:graphicFrameLocks xmlns:a="http://schemas.openxmlformats.org/drawingml/2006/main" noChangeAspect="1"/>
@@ -12952,7 +14948,7 @@
                     </pic:cNvPicPr>
                   </pic:nvPicPr>
                   <pic:blipFill>
-                    <a:blip r:embed="rId104">
+                    <a:blip r:embed="rId104" cstate="print">
                       <a:extLst>
                         <a:ext uri="{28A0092B-C50C-407E-A947-70E740481C1C}">
                           <a14:useLocalDpi xmlns:a14="http://schemas.microsoft.com/office/drawing/2010/main" val="0"/>
@@ -12967,7 +14963,7 @@
                   <pic:spPr bwMode="auto">
                     <a:xfrm>
                       <a:off x="0" y="0"/>
-                      <a:ext cx="6869343" cy="2358412"/>
+                      <a:ext cx="4472482" cy="1535511"/>
                     </a:xfrm>
                     <a:prstGeom prst="rect">
                       <a:avLst/>
@@ -12980,26 +14976,16 @@
           </wp:inline>
         </w:drawing>
       </w:r>
-    </w:p>
-    <w:p>
-      <w:pPr>
-        <w:pStyle w:val="NormalWeb"/>
-        <w:rPr>
-          <w:rFonts w:asciiTheme="minorHAnsi" w:hAnsiTheme="minorHAnsi"/>
-          <w:lang w:val="en-GB"/>
-        </w:rPr>
-      </w:pPr>
       <w:r>
         <w:rPr>
           <w:rFonts w:asciiTheme="minorHAnsi" w:hAnsiTheme="minorHAnsi"/>
           <w:noProof/>
           <w:lang w:val="en-GB"/>
         </w:rPr>
-        <w:lastRenderedPageBreak/>
         <w:drawing>
-          <wp:inline distT="0" distB="0" distL="0" distR="0" wp14:anchorId="10F17514" wp14:editId="0878E058">
-            <wp:extent cx="6959234" cy="4505325"/>
-            <wp:effectExtent l="0" t="0" r="0" b="0"/>
+          <wp:inline distT="0" distB="0" distL="0" distR="0" wp14:anchorId="10F17514" wp14:editId="4D1E16BC">
+            <wp:extent cx="2381250" cy="1541593"/>
+            <wp:effectExtent l="0" t="0" r="0" b="1905"/>
             <wp:docPr id="655845867" name="Picture 7"/>
             <wp:cNvGraphicFramePr>
               <a:graphicFrameLocks xmlns:a="http://schemas.openxmlformats.org/drawingml/2006/main" noChangeAspect="1"/>
@@ -13014,7 +15000,7 @@
                     </pic:cNvPicPr>
                   </pic:nvPicPr>
                   <pic:blipFill>
-                    <a:blip r:embed="rId105">
+                    <a:blip r:embed="rId105" cstate="print">
                       <a:extLst>
                         <a:ext uri="{28A0092B-C50C-407E-A947-70E740481C1C}">
                           <a14:useLocalDpi xmlns:a14="http://schemas.microsoft.com/office/drawing/2010/main" val="0"/>
@@ -13029,7 +15015,7 @@
                   <pic:spPr bwMode="auto">
                     <a:xfrm>
                       <a:off x="0" y="0"/>
-                      <a:ext cx="6985704" cy="4522461"/>
+                      <a:ext cx="2414643" cy="1563211"/>
                     </a:xfrm>
                     <a:prstGeom prst="rect">
                       <a:avLst/>
@@ -13046,65 +15032,103 @@
     <w:p>
       <w:pPr>
         <w:pStyle w:val="NormalWeb"/>
+        <w:numPr>
+          <w:ilvl w:val="0"/>
+          <w:numId w:val="2"/>
+        </w:numPr>
         <w:rPr>
           <w:rFonts w:asciiTheme="minorHAnsi" w:hAnsiTheme="minorHAnsi"/>
           <w:lang w:val="en-GB"/>
         </w:rPr>
       </w:pPr>
-    </w:p>
-    <w:p>
-      <w:pPr>
-        <w:pStyle w:val="NormalWeb"/>
+      <w:r>
         <w:rPr>
           <w:rFonts w:asciiTheme="minorHAnsi" w:hAnsiTheme="minorHAnsi"/>
           <w:lang w:val="en-GB"/>
         </w:rPr>
-      </w:pPr>
-    </w:p>
-    <w:p>
-      <w:pPr>
-        <w:pStyle w:val="NormalWeb"/>
+        <w:t xml:space="preserve">Well… I’m not sure what I did, but I completely messed it up and the data is unusable now. </w:t>
+      </w:r>
+      <w:r>
         <w:rPr>
           <w:rFonts w:asciiTheme="minorHAnsi" w:hAnsiTheme="minorHAnsi"/>
           <w:lang w:val="en-GB"/>
         </w:rPr>
-      </w:pPr>
-    </w:p>
-    <w:p>
-      <w:pPr>
-        <w:pStyle w:val="NormalWeb"/>
+        <w:t>Fortunately,</w:t>
+      </w:r>
+      <w:r>
         <w:rPr>
           <w:rFonts w:asciiTheme="minorHAnsi" w:hAnsiTheme="minorHAnsi"/>
           <w:lang w:val="en-GB"/>
         </w:rPr>
-      </w:pPr>
-    </w:p>
-    <w:p>
-      <w:pPr>
-        <w:pStyle w:val="NormalWeb"/>
+        <w:t xml:space="preserve"> I still have all the original files, so nothing that can’t be undone, but I really don’t know how I cooked it so badly. Trying to find the bug in my workflow now…?</w:t>
+      </w:r>
+      <w:r>
         <w:rPr>
           <w:rFonts w:asciiTheme="minorHAnsi" w:hAnsiTheme="minorHAnsi"/>
           <w:lang w:val="en-GB"/>
         </w:rPr>
-      </w:pPr>
+        <w:t xml:space="preserve"> But otherwise, other things I noticed:</w:t>
+      </w:r>
     </w:p>
     <w:p>
       <w:pPr>
         <w:pStyle w:val="NormalWeb"/>
+        <w:numPr>
+          <w:ilvl w:val="1"/>
+          <w:numId w:val="2"/>
+        </w:numPr>
         <w:rPr>
           <w:rFonts w:asciiTheme="minorHAnsi" w:hAnsiTheme="minorHAnsi"/>
           <w:lang w:val="en-GB"/>
         </w:rPr>
       </w:pPr>
-    </w:p>
-    <w:p>
-      <w:pPr>
-        <w:pStyle w:val="NormalWeb"/>
+      <w:r>
         <w:rPr>
           <w:rFonts w:asciiTheme="minorHAnsi" w:hAnsiTheme="minorHAnsi"/>
           <w:lang w:val="en-GB"/>
         </w:rPr>
-      </w:pPr>
+        <w:t>Split out “Vibrating” as its own event because it looked weird.</w:t>
+      </w:r>
+    </w:p>
+    <w:p>
+      <w:pPr>
+        <w:pStyle w:val="NormalWeb"/>
+        <w:numPr>
+          <w:ilvl w:val="1"/>
+          <w:numId w:val="2"/>
+        </w:numPr>
+        <w:rPr>
+          <w:rFonts w:asciiTheme="minorHAnsi" w:hAnsiTheme="minorHAnsi"/>
+          <w:lang w:val="en-GB"/>
+        </w:rPr>
+      </w:pPr>
+      <w:r>
+        <w:rPr>
+          <w:rFonts w:asciiTheme="minorHAnsi" w:hAnsiTheme="minorHAnsi"/>
+          <w:lang w:val="en-GB"/>
+        </w:rPr>
+        <w:t>Couldn’t find much head up foraging</w:t>
+      </w:r>
+    </w:p>
+    <w:p>
+      <w:pPr>
+        <w:pStyle w:val="NormalWeb"/>
+        <w:numPr>
+          <w:ilvl w:val="1"/>
+          <w:numId w:val="2"/>
+        </w:numPr>
+        <w:rPr>
+          <w:rFonts w:asciiTheme="minorHAnsi" w:hAnsiTheme="minorHAnsi"/>
+          <w:lang w:val="en-GB"/>
+        </w:rPr>
+      </w:pPr>
+      <w:r>
+        <w:rPr>
+          <w:rFonts w:asciiTheme="minorHAnsi" w:hAnsiTheme="minorHAnsi"/>
+          <w:lang w:val="en-GB"/>
+        </w:rPr>
+        <w:t>Not a lot of sleeping, weirdly…</w:t>
+      </w:r>
     </w:p>
     <w:p>
       <w:pPr>
@@ -13123,6 +15147,462 @@
           <w:rFonts w:asciiTheme="minorHAnsi" w:hAnsiTheme="minorHAnsi"/>
           <w:lang w:val="en-GB"/>
         </w:rPr>
+        <w:t xml:space="preserve">Okay I fixed the error but there are still problems with the annotations… I think I should sort them into their final group before I clean them. Ugh. Back to the beginning! </w:t>
+      </w:r>
+      <w:proofErr w:type="gramStart"/>
+      <w:r>
+        <w:rPr>
+          <w:rFonts w:asciiTheme="minorHAnsi" w:hAnsiTheme="minorHAnsi"/>
+          <w:lang w:val="en-GB"/>
+        </w:rPr>
+        <w:t>As long as</w:t>
+      </w:r>
+      <w:proofErr w:type="gramEnd"/>
+      <w:r>
+        <w:rPr>
+          <w:rFonts w:asciiTheme="minorHAnsi" w:hAnsiTheme="minorHAnsi"/>
+          <w:lang w:val="en-GB"/>
+        </w:rPr>
+        <w:t xml:space="preserve"> this is complete by the end of the day and I’m generating features over night, I think I can afford to lose an entire day on the task… In the scheme of things. </w:t>
+      </w:r>
+    </w:p>
+    <w:p>
+      <w:pPr>
+        <w:pStyle w:val="NormalWeb"/>
+        <w:numPr>
+          <w:ilvl w:val="0"/>
+          <w:numId w:val="2"/>
+        </w:numPr>
+        <w:rPr>
+          <w:rFonts w:asciiTheme="minorHAnsi" w:hAnsiTheme="minorHAnsi"/>
+          <w:lang w:val="en-GB"/>
+        </w:rPr>
+      </w:pPr>
+      <w:r>
+        <w:rPr>
+          <w:rFonts w:asciiTheme="minorHAnsi" w:hAnsiTheme="minorHAnsi"/>
+          <w:lang w:val="en-GB"/>
+        </w:rPr>
+        <w:t>About to crash out and give up, this is so frustrating.</w:t>
+      </w:r>
+    </w:p>
+    <w:p>
+      <w:pPr>
+        <w:pStyle w:val="NormalWeb"/>
+        <w:numPr>
+          <w:ilvl w:val="0"/>
+          <w:numId w:val="2"/>
+        </w:numPr>
+        <w:rPr>
+          <w:rFonts w:asciiTheme="minorHAnsi" w:hAnsiTheme="minorHAnsi"/>
+          <w:lang w:val="en-GB"/>
+        </w:rPr>
+      </w:pPr>
+      <w:r>
+        <w:rPr>
+          <w:rFonts w:asciiTheme="minorHAnsi" w:hAnsiTheme="minorHAnsi"/>
+          <w:lang w:val="en-GB"/>
+        </w:rPr>
+        <w:lastRenderedPageBreak/>
+        <w:t xml:space="preserve">For example, this behaviour has sometimes been labelled as foraging, sometimes as walking… It is </w:t>
+      </w:r>
+      <w:proofErr w:type="gramStart"/>
+      <w:r>
+        <w:rPr>
+          <w:rFonts w:asciiTheme="minorHAnsi" w:hAnsiTheme="minorHAnsi"/>
+          <w:lang w:val="en-GB"/>
+        </w:rPr>
+        <w:t>really unclear</w:t>
+      </w:r>
+      <w:proofErr w:type="gramEnd"/>
+      <w:r>
+        <w:rPr>
+          <w:rFonts w:asciiTheme="minorHAnsi" w:hAnsiTheme="minorHAnsi"/>
+          <w:lang w:val="en-GB"/>
+        </w:rPr>
+        <w:t xml:space="preserve"> what it should be. </w:t>
+      </w:r>
+      <w:proofErr w:type="gramStart"/>
+      <w:r>
+        <w:rPr>
+          <w:rFonts w:asciiTheme="minorHAnsi" w:hAnsiTheme="minorHAnsi"/>
+          <w:lang w:val="en-GB"/>
+        </w:rPr>
+        <w:t>So</w:t>
+      </w:r>
+      <w:proofErr w:type="gramEnd"/>
+      <w:r>
+        <w:rPr>
+          <w:rFonts w:asciiTheme="minorHAnsi" w:hAnsiTheme="minorHAnsi"/>
+          <w:lang w:val="en-GB"/>
+        </w:rPr>
+        <w:t xml:space="preserve"> it is </w:t>
+      </w:r>
+      <w:proofErr w:type="gramStart"/>
+      <w:r>
+        <w:rPr>
+          <w:rFonts w:asciiTheme="minorHAnsi" w:hAnsiTheme="minorHAnsi"/>
+          <w:lang w:val="en-GB"/>
+        </w:rPr>
+        <w:t>definitely going</w:t>
+      </w:r>
+      <w:proofErr w:type="gramEnd"/>
+      <w:r>
+        <w:rPr>
+          <w:rFonts w:asciiTheme="minorHAnsi" w:hAnsiTheme="minorHAnsi"/>
+          <w:lang w:val="en-GB"/>
+        </w:rPr>
+        <w:t xml:space="preserve"> to be mixed up in the analysis. My DR is going to need some hard bounds about head up/down, and then leave the VDBA to figure it out?</w:t>
+      </w:r>
+    </w:p>
+    <w:p>
+      <w:pPr>
+        <w:pStyle w:val="NormalWeb"/>
+        <w:jc w:val="center"/>
+        <w:rPr>
+          <w:rFonts w:asciiTheme="minorHAnsi" w:hAnsiTheme="minorHAnsi"/>
+          <w:lang w:val="en-GB"/>
+        </w:rPr>
+      </w:pPr>
+      <w:r>
+        <w:rPr>
+          <w:rFonts w:asciiTheme="minorHAnsi" w:hAnsiTheme="minorHAnsi"/>
+          <w:lang w:val="en-GB"/>
+        </w:rPr>
+        <w:drawing>
+          <wp:inline distT="0" distB="0" distL="0" distR="0" wp14:anchorId="55AABF99" wp14:editId="60A5335A">
+            <wp:extent cx="4895850" cy="1224869"/>
+            <wp:effectExtent l="0" t="0" r="0" b="0"/>
+            <wp:docPr id="186135668" name="Picture 1"/>
+            <wp:cNvGraphicFramePr>
+              <a:graphicFrameLocks xmlns:a="http://schemas.openxmlformats.org/drawingml/2006/main" noChangeAspect="1"/>
+            </wp:cNvGraphicFramePr>
+            <a:graphic xmlns:a="http://schemas.openxmlformats.org/drawingml/2006/main">
+              <a:graphicData uri="http://schemas.openxmlformats.org/drawingml/2006/picture">
+                <pic:pic xmlns:pic="http://schemas.openxmlformats.org/drawingml/2006/picture">
+                  <pic:nvPicPr>
+                    <pic:cNvPr id="186135668" name=""/>
+                    <pic:cNvPicPr/>
+                  </pic:nvPicPr>
+                  <pic:blipFill rotWithShape="1">
+                    <a:blip r:embed="rId106"/>
+                    <a:srcRect t="2701"/>
+                    <a:stretch>
+                      <a:fillRect/>
+                    </a:stretch>
+                  </pic:blipFill>
+                  <pic:spPr bwMode="auto">
+                    <a:xfrm>
+                      <a:off x="0" y="0"/>
+                      <a:ext cx="4908467" cy="1228026"/>
+                    </a:xfrm>
+                    <a:prstGeom prst="rect">
+                      <a:avLst/>
+                    </a:prstGeom>
+                    <a:ln>
+                      <a:noFill/>
+                    </a:ln>
+                    <a:extLst>
+                      <a:ext uri="{53640926-AAD7-44D8-BBD7-CCE9431645EC}">
+                        <a14:shadowObscured xmlns:a14="http://schemas.microsoft.com/office/drawing/2010/main"/>
+                      </a:ext>
+                    </a:extLst>
+                  </pic:spPr>
+                </pic:pic>
+              </a:graphicData>
+            </a:graphic>
+          </wp:inline>
+        </w:drawing>
+      </w:r>
+    </w:p>
+    <w:p>
+      <w:pPr>
+        <w:pStyle w:val="NormalWeb"/>
+        <w:numPr>
+          <w:ilvl w:val="0"/>
+          <w:numId w:val="2"/>
+        </w:numPr>
+        <w:rPr>
+          <w:rFonts w:asciiTheme="minorHAnsi" w:hAnsiTheme="minorHAnsi"/>
+          <w:lang w:val="en-GB"/>
+        </w:rPr>
+      </w:pPr>
+      <w:r>
+        <w:rPr>
+          <w:rFonts w:asciiTheme="minorHAnsi" w:hAnsiTheme="minorHAnsi"/>
+          <w:lang w:val="en-GB"/>
+        </w:rPr>
+        <w:t>The result I ended up with… is not perfect but I genuinely cannot go back through all of that again. Just going to call it for now and see how I go.</w:t>
+      </w:r>
+    </w:p>
+    <w:p>
+      <w:pPr>
+        <w:pStyle w:val="NormalWeb"/>
+        <w:jc w:val="center"/>
+        <w:rPr>
+          <w:rFonts w:asciiTheme="minorHAnsi" w:hAnsiTheme="minorHAnsi"/>
+          <w:lang w:val="en-GB"/>
+        </w:rPr>
+      </w:pPr>
+      <w:r>
+        <w:rPr>
+          <w:rFonts w:asciiTheme="minorHAnsi" w:hAnsiTheme="minorHAnsi"/>
+          <w:noProof/>
+          <w:lang w:val="en-GB"/>
+        </w:rPr>
+        <w:drawing>
+          <wp:inline distT="0" distB="0" distL="0" distR="0" wp14:anchorId="60978016" wp14:editId="588F9105">
+            <wp:extent cx="4485592" cy="2285202"/>
+            <wp:effectExtent l="0" t="0" r="0" b="1270"/>
+            <wp:docPr id="650409044" name="Picture 11"/>
+            <wp:cNvGraphicFramePr>
+              <a:graphicFrameLocks xmlns:a="http://schemas.openxmlformats.org/drawingml/2006/main" noChangeAspect="1"/>
+            </wp:cNvGraphicFramePr>
+            <a:graphic xmlns:a="http://schemas.openxmlformats.org/drawingml/2006/main">
+              <a:graphicData uri="http://schemas.openxmlformats.org/drawingml/2006/picture">
+                <pic:pic xmlns:pic="http://schemas.openxmlformats.org/drawingml/2006/picture">
+                  <pic:nvPicPr>
+                    <pic:cNvPr id="0" name="Picture 6"/>
+                    <pic:cNvPicPr>
+                      <a:picLocks noChangeAspect="1" noChangeArrowheads="1"/>
+                    </pic:cNvPicPr>
+                  </pic:nvPicPr>
+                  <pic:blipFill>
+                    <a:blip r:embed="rId107" cstate="print">
+                      <a:extLst>
+                        <a:ext uri="{28A0092B-C50C-407E-A947-70E740481C1C}">
+                          <a14:useLocalDpi xmlns:a14="http://schemas.microsoft.com/office/drawing/2010/main" val="0"/>
+                        </a:ext>
+                      </a:extLst>
+                    </a:blip>
+                    <a:srcRect/>
+                    <a:stretch>
+                      <a:fillRect/>
+                    </a:stretch>
+                  </pic:blipFill>
+                  <pic:spPr bwMode="auto">
+                    <a:xfrm>
+                      <a:off x="0" y="0"/>
+                      <a:ext cx="4509436" cy="2297350"/>
+                    </a:xfrm>
+                    <a:prstGeom prst="rect">
+                      <a:avLst/>
+                    </a:prstGeom>
+                    <a:noFill/>
+                  </pic:spPr>
+                </pic:pic>
+              </a:graphicData>
+            </a:graphic>
+          </wp:inline>
+        </w:drawing>
+      </w:r>
+    </w:p>
+    <w:p>
+      <w:pPr>
+        <w:pStyle w:val="NormalWeb"/>
+        <w:jc w:val="center"/>
+        <w:rPr>
+          <w:rFonts w:asciiTheme="minorHAnsi" w:hAnsiTheme="minorHAnsi"/>
+          <w:lang w:val="en-GB"/>
+        </w:rPr>
+      </w:pPr>
+      <w:r>
+        <w:rPr>
+          <w:rFonts w:asciiTheme="minorHAnsi" w:hAnsiTheme="minorHAnsi"/>
+          <w:noProof/>
+          <w:lang w:val="en-GB"/>
+        </w:rPr>
+        <w:drawing>
+          <wp:inline distT="0" distB="0" distL="0" distR="0" wp14:anchorId="19B94A13" wp14:editId="41FC2095">
+            <wp:extent cx="4857260" cy="2679256"/>
+            <wp:effectExtent l="0" t="0" r="635" b="6985"/>
+            <wp:docPr id="2052926174" name="Picture 13"/>
+            <wp:cNvGraphicFramePr>
+              <a:graphicFrameLocks xmlns:a="http://schemas.openxmlformats.org/drawingml/2006/main" noChangeAspect="1"/>
+            </wp:cNvGraphicFramePr>
+            <a:graphic xmlns:a="http://schemas.openxmlformats.org/drawingml/2006/main">
+              <a:graphicData uri="http://schemas.openxmlformats.org/drawingml/2006/picture">
+                <pic:pic xmlns:pic="http://schemas.openxmlformats.org/drawingml/2006/picture">
+                  <pic:nvPicPr>
+                    <pic:cNvPr id="0" name="Picture 7"/>
+                    <pic:cNvPicPr>
+                      <a:picLocks noChangeAspect="1" noChangeArrowheads="1"/>
+                    </pic:cNvPicPr>
+                  </pic:nvPicPr>
+                  <pic:blipFill>
+                    <a:blip r:embed="rId108">
+                      <a:extLst>
+                        <a:ext uri="{28A0092B-C50C-407E-A947-70E740481C1C}">
+                          <a14:useLocalDpi xmlns:a14="http://schemas.microsoft.com/office/drawing/2010/main" val="0"/>
+                        </a:ext>
+                      </a:extLst>
+                    </a:blip>
+                    <a:srcRect/>
+                    <a:stretch>
+                      <a:fillRect/>
+                    </a:stretch>
+                  </pic:blipFill>
+                  <pic:spPr bwMode="auto">
+                    <a:xfrm>
+                      <a:off x="0" y="0"/>
+                      <a:ext cx="4875095" cy="2689094"/>
+                    </a:xfrm>
+                    <a:prstGeom prst="rect">
+                      <a:avLst/>
+                    </a:prstGeom>
+                    <a:noFill/>
+                  </pic:spPr>
+                </pic:pic>
+              </a:graphicData>
+            </a:graphic>
+          </wp:inline>
+        </w:drawing>
+      </w:r>
+    </w:p>
+    <w:p>
+      <w:pPr>
+        <w:pStyle w:val="NormalWeb"/>
+        <w:rPr>
+          <w:rFonts w:asciiTheme="minorHAnsi" w:hAnsiTheme="minorHAnsi"/>
+          <w:lang w:val="en-GB"/>
+        </w:rPr>
+      </w:pPr>
+    </w:p>
+    <w:p>
+      <w:pPr>
+        <w:pStyle w:val="NormalWeb"/>
+        <w:rPr>
+          <w:rFonts w:asciiTheme="minorHAnsi" w:hAnsiTheme="minorHAnsi"/>
+          <w:lang w:val="en-GB"/>
+        </w:rPr>
+      </w:pPr>
+    </w:p>
+    <w:p>
+      <w:pPr>
+        <w:pStyle w:val="NormalWeb"/>
+        <w:rPr>
+          <w:rFonts w:asciiTheme="minorHAnsi" w:hAnsiTheme="minorHAnsi"/>
+          <w:lang w:val="en-GB"/>
+        </w:rPr>
+      </w:pPr>
+    </w:p>
+    <w:p>
+      <w:pPr>
+        <w:pStyle w:val="NormalWeb"/>
+        <w:numPr>
+          <w:ilvl w:val="0"/>
+          <w:numId w:val="2"/>
+        </w:numPr>
+        <w:rPr>
+          <w:rFonts w:asciiTheme="minorHAnsi" w:hAnsiTheme="minorHAnsi"/>
+          <w:lang w:val="en-GB"/>
+        </w:rPr>
+      </w:pPr>
+      <w:r>
+        <w:rPr>
+          <w:rFonts w:asciiTheme="minorHAnsi" w:hAnsiTheme="minorHAnsi"/>
+          <w:lang w:val="en-GB"/>
+        </w:rPr>
+        <w:lastRenderedPageBreak/>
+        <w:t xml:space="preserve">Need to build in some cleaning logic for when the collars flip… </w:t>
+      </w:r>
+      <w:proofErr w:type="spellStart"/>
+      <w:r>
+        <w:rPr>
+          <w:rFonts w:asciiTheme="minorHAnsi" w:hAnsiTheme="minorHAnsi"/>
+          <w:lang w:val="en-GB"/>
+        </w:rPr>
+        <w:t>ie</w:t>
+      </w:r>
+      <w:proofErr w:type="spellEnd"/>
+      <w:r>
+        <w:rPr>
+          <w:rFonts w:asciiTheme="minorHAnsi" w:hAnsiTheme="minorHAnsi"/>
+          <w:lang w:val="en-GB"/>
+        </w:rPr>
+        <w:t xml:space="preserve">. When the Y axis is on average higher than the Z axis, </w:t>
+      </w:r>
+      <w:r>
+        <w:rPr>
+          <w:rFonts w:asciiTheme="minorHAnsi" w:hAnsiTheme="minorHAnsi"/>
+          <w:lang w:val="en-GB"/>
+        </w:rPr>
+        <w:t>remove as a collar flip.</w:t>
+      </w:r>
+    </w:p>
+    <w:p>
+      <w:pPr>
+        <w:pStyle w:val="NormalWeb"/>
+        <w:numPr>
+          <w:ilvl w:val="0"/>
+          <w:numId w:val="2"/>
+        </w:numPr>
+        <w:rPr>
+          <w:rFonts w:asciiTheme="minorHAnsi" w:hAnsiTheme="minorHAnsi"/>
+          <w:lang w:val="en-GB"/>
+        </w:rPr>
+      </w:pPr>
+      <w:r>
+        <w:rPr>
+          <w:rFonts w:asciiTheme="minorHAnsi" w:hAnsiTheme="minorHAnsi"/>
+          <w:lang w:val="en-GB"/>
+        </w:rPr>
+        <w:t xml:space="preserve">And then logic the dead reckoning based on the behavioural analysis. </w:t>
+      </w:r>
+    </w:p>
+    <w:p>
+      <w:pPr>
+        <w:pStyle w:val="NormalWeb"/>
+        <w:rPr>
+          <w:rFonts w:asciiTheme="minorHAnsi" w:hAnsiTheme="minorHAnsi"/>
+          <w:lang w:val="en-GB"/>
+        </w:rPr>
+      </w:pPr>
+    </w:p>
+    <w:p>
+      <w:pPr>
+        <w:pStyle w:val="NormalWeb"/>
+        <w:rPr>
+          <w:rFonts w:asciiTheme="minorHAnsi" w:hAnsiTheme="minorHAnsi"/>
+          <w:lang w:val="en-GB"/>
+        </w:rPr>
+      </w:pPr>
+    </w:p>
+    <w:p>
+      <w:pPr>
+        <w:pStyle w:val="NormalWeb"/>
+        <w:rPr>
+          <w:rFonts w:asciiTheme="minorHAnsi" w:hAnsiTheme="minorHAnsi"/>
+          <w:lang w:val="en-GB"/>
+        </w:rPr>
+      </w:pPr>
+    </w:p>
+    <w:p>
+      <w:pPr>
+        <w:pStyle w:val="NormalWeb"/>
+        <w:rPr>
+          <w:rFonts w:asciiTheme="minorHAnsi" w:hAnsiTheme="minorHAnsi"/>
+          <w:lang w:val="en-GB"/>
+        </w:rPr>
+      </w:pPr>
+    </w:p>
+    <w:p>
+      <w:pPr>
+        <w:pStyle w:val="NormalWeb"/>
+        <w:numPr>
+          <w:ilvl w:val="0"/>
+          <w:numId w:val="2"/>
+        </w:numPr>
+        <w:rPr>
+          <w:rFonts w:asciiTheme="minorHAnsi" w:hAnsiTheme="minorHAnsi"/>
+          <w:lang w:val="en-GB"/>
+        </w:rPr>
+      </w:pPr>
+      <w:r>
+        <w:rPr>
+          <w:rFonts w:asciiTheme="minorHAnsi" w:hAnsiTheme="minorHAnsi"/>
+          <w:lang w:val="en-GB"/>
+        </w:rPr>
         <w:t>Tasks:</w:t>
       </w:r>
     </w:p>
@@ -13145,7 +15625,25 @@
           <w:strike/>
           <w:lang w:val="en-GB"/>
         </w:rPr>
-        <w:t>Convert all the accels to g force and mag units</w:t>
+        <w:t xml:space="preserve">Convert all the </w:t>
+      </w:r>
+      <w:proofErr w:type="spellStart"/>
+      <w:r>
+        <w:rPr>
+          <w:rFonts w:asciiTheme="minorHAnsi" w:hAnsiTheme="minorHAnsi"/>
+          <w:strike/>
+          <w:lang w:val="en-GB"/>
+        </w:rPr>
+        <w:t>accels</w:t>
+      </w:r>
+      <w:proofErr w:type="spellEnd"/>
+      <w:r>
+        <w:rPr>
+          <w:rFonts w:asciiTheme="minorHAnsi" w:hAnsiTheme="minorHAnsi"/>
+          <w:strike/>
+          <w:lang w:val="en-GB"/>
+        </w:rPr>
+        <w:t xml:space="preserve"> to g force and mag units</w:t>
       </w:r>
     </w:p>
     <w:p>
@@ -13193,7 +15691,39 @@
           <w:rFonts w:asciiTheme="minorHAnsi" w:hAnsiTheme="minorHAnsi"/>
           <w:lang w:val="en-GB"/>
         </w:rPr>
-        <w:t>Join the cropped 4g accels with the axivity uncropped data to complete the peaks</w:t>
+        <w:t xml:space="preserve">Join the cropped 4g </w:t>
+      </w:r>
+      <w:proofErr w:type="spellStart"/>
+      <w:r>
+        <w:rPr>
+          <w:rFonts w:asciiTheme="minorHAnsi" w:hAnsiTheme="minorHAnsi"/>
+          <w:lang w:val="en-GB"/>
+        </w:rPr>
+        <w:t>accels</w:t>
+      </w:r>
+      <w:proofErr w:type="spellEnd"/>
+      <w:r>
+        <w:rPr>
+          <w:rFonts w:asciiTheme="minorHAnsi" w:hAnsiTheme="minorHAnsi"/>
+          <w:lang w:val="en-GB"/>
+        </w:rPr>
+        <w:t xml:space="preserve"> with the </w:t>
+      </w:r>
+      <w:proofErr w:type="spellStart"/>
+      <w:r>
+        <w:rPr>
+          <w:rFonts w:asciiTheme="minorHAnsi" w:hAnsiTheme="minorHAnsi"/>
+          <w:lang w:val="en-GB"/>
+        </w:rPr>
+        <w:t>axivity</w:t>
+      </w:r>
+      <w:proofErr w:type="spellEnd"/>
+      <w:r>
+        <w:rPr>
+          <w:rFonts w:asciiTheme="minorHAnsi" w:hAnsiTheme="minorHAnsi"/>
+          <w:lang w:val="en-GB"/>
+        </w:rPr>
+        <w:t xml:space="preserve"> uncropped data to complete the peaks</w:t>
       </w:r>
     </w:p>
     <w:p>
@@ -13235,7 +15765,23 @@
           <w:rFonts w:asciiTheme="minorHAnsi" w:hAnsiTheme="minorHAnsi"/>
           <w:lang w:val="en-GB"/>
         </w:rPr>
-        <w:t>Re-extract all of the training data from the newly standardised data</w:t>
+        <w:t xml:space="preserve">Re-extract </w:t>
+      </w:r>
+      <w:proofErr w:type="gramStart"/>
+      <w:r>
+        <w:rPr>
+          <w:rFonts w:asciiTheme="minorHAnsi" w:hAnsiTheme="minorHAnsi"/>
+          <w:lang w:val="en-GB"/>
+        </w:rPr>
+        <w:t>all of</w:t>
+      </w:r>
+      <w:proofErr w:type="gramEnd"/>
+      <w:r>
+        <w:rPr>
+          <w:rFonts w:asciiTheme="minorHAnsi" w:hAnsiTheme="minorHAnsi"/>
+          <w:lang w:val="en-GB"/>
+        </w:rPr>
+        <w:t xml:space="preserve"> the training data from the newly standardised data</w:t>
       </w:r>
     </w:p>
     <w:p>
@@ -13351,7 +15897,22 @@
         <w:rPr>
           <w:highlight w:val="yellow"/>
         </w:rPr>
-        <w:t xml:space="preserve">What am I doing with my life? We are meant to be using the GPS to correct the error in the DR but the GPS itself is </w:t>
+        <w:lastRenderedPageBreak/>
+        <w:t xml:space="preserve">What am I doing with my life? We are meant to be using the GPS to correct the error in the </w:t>
+      </w:r>
+      <w:proofErr w:type="gramStart"/>
+      <w:r>
+        <w:rPr>
+          <w:highlight w:val="yellow"/>
+        </w:rPr>
+        <w:t>DR</w:t>
+      </w:r>
+      <w:proofErr w:type="gramEnd"/>
+      <w:r>
+        <w:rPr>
+          <w:highlight w:val="yellow"/>
+        </w:rPr>
+        <w:t xml:space="preserve"> but the GPS itself is </w:t>
       </w:r>
       <w:r>
         <w:rPr>
@@ -13404,7 +15965,7 @@
       </w:pPr>
     </w:p>
     <w:sectPr>
-      <w:headerReference w:type="default" r:id="rId106"/>
+      <w:headerReference w:type="default" r:id="rId109"/>
       <w:pgSz w:w="12240" w:h="15840"/>
       <w:pgMar w:top="720" w:right="720" w:bottom="720" w:left="720" w:header="720" w:footer="720" w:gutter="0"/>
       <w:cols w:space="720"/>

</xml_diff>

<commit_message>
adding header information to many of the scripts
</commit_message>
<xml_diff>
--- a/Notes/Worklog.docx
+++ b/Notes/Worklog.docx
@@ -12,15 +12,7 @@
     </w:p>
     <w:p>
       <w:r>
-        <w:t xml:space="preserve">The impala data was collected by Chris Clemente, Jasmin Annett, Robin Maag, Chris Bird, and Taylor Dick across 3 field deployments in South Africa: 2024, April 2025, and July 2025.  The idea behind the project was to put our custom-designed collars (including an Artemis board which logged GPS and accelerometer data, as well as a stand-alone </w:t>
-      </w:r>
-      <w:proofErr w:type="spellStart"/>
-      <w:r>
-        <w:t>Axivity</w:t>
-      </w:r>
-      <w:proofErr w:type="spellEnd"/>
-      <w:r>
-        <w:t>) on impalas, record their behaviours with a drone, and then reconstruct their exact behaviours and paths from the acceleration data.</w:t>
+        <w:t>The impala data was collected by Chris Clemente, Jasmin Annett, Robin Maag, Chris Bird, and Taylor Dick across 3 field deployments in South Africa: 2024, April 2025, and July 2025.  The idea behind the project was to put our custom-designed collars (including an Artemis board which logged GPS and accelerometer data, as well as a stand-alone Axivity) on impalas, record their behaviours with a drone, and then reconstruct their exact behaviours and paths from the acceleration data.</w:t>
       </w:r>
       <w:r>
         <w:t xml:space="preserve"> Luke Jessup and Jojo Schultz begun the process of understanding the dead reckoning workflow.</w:t>
@@ -95,23 +87,7 @@
         <w:t>synchronised</w:t>
       </w:r>
       <w:r>
-        <w:t xml:space="preserve">” boards were, in fact, not time synchronised. </w:t>
-      </w:r>
-      <w:proofErr w:type="spellStart"/>
-      <w:r>
-        <w:t>ChrisC</w:t>
-      </w:r>
-      <w:proofErr w:type="spellEnd"/>
-      <w:r>
-        <w:t xml:space="preserve"> and I spent several weeks trying to align the board with the associated behavioural videos. That work is detailed in this </w:t>
-      </w:r>
-      <w:proofErr w:type="spellStart"/>
-      <w:r>
-        <w:t>googledoc</w:t>
-      </w:r>
-      <w:proofErr w:type="spellEnd"/>
-      <w:r>
-        <w:t xml:space="preserve">: </w:t>
+        <w:t xml:space="preserve">” boards were, in fact, not time synchronised. ChrisC and I spent several weeks trying to align the board with the associated behavioural videos. That work is detailed in this googledoc: </w:t>
       </w:r>
       <w:hyperlink r:id="rId8" w:history="1">
         <w:r>
@@ -238,15 +214,7 @@
         <w:spacing w:line="276" w:lineRule="auto"/>
       </w:pPr>
       <w:r>
-        <w:t xml:space="preserve">What this tells me is that my next most valuable endeavour is to figure out the alignment from Robin’s camera. Going to have a crack at that this </w:t>
-      </w:r>
-      <w:proofErr w:type="spellStart"/>
-      <w:r>
-        <w:t>arvo</w:t>
-      </w:r>
-      <w:proofErr w:type="spellEnd"/>
-      <w:r>
-        <w:t xml:space="preserve">. </w:t>
+        <w:t xml:space="preserve">What this tells me is that my next most valuable endeavour is to figure out the alignment from Robin’s camera. Going to have a crack at that this arvo. </w:t>
       </w:r>
       <w:r>
         <w:rPr>
@@ -318,15 +286,7 @@
         <w:spacing w:line="276" w:lineRule="auto"/>
       </w:pPr>
       <w:r>
-        <w:t xml:space="preserve">Below is collar 8 video 2 as annotated by Amelia with the old system (looked correct to the video). Now I </w:t>
-      </w:r>
-      <w:proofErr w:type="gramStart"/>
-      <w:r>
-        <w:t>have to</w:t>
-      </w:r>
-      <w:proofErr w:type="gramEnd"/>
-      <w:r>
-        <w:t xml:space="preserve"> be able to replicate that with my new system.</w:t>
+        <w:t>Below is collar 8 video 2 as annotated by Amelia with the old system (looked correct to the video). Now I have to be able to replicate that with my new system.</w:t>
       </w:r>
     </w:p>
     <w:p>
@@ -394,15 +354,7 @@
         <w:spacing w:line="276" w:lineRule="auto"/>
       </w:pPr>
       <w:r>
-        <w:t xml:space="preserve">Which I was unable to do… Which means that, somewhere my new system is breaking. Which is </w:t>
-      </w:r>
-      <w:proofErr w:type="gramStart"/>
-      <w:r>
-        <w:t>actually a</w:t>
-      </w:r>
-      <w:proofErr w:type="gramEnd"/>
-      <w:r>
-        <w:t xml:space="preserve"> good sign… because the error is in my new code, not in the data (flow on implications for why the kangaroo stuff isn’t working).</w:t>
+        <w:t>Which I was unable to do… Which means that, somewhere my new system is breaking. Which is actually a good sign… because the error is in my new code, not in the data (flow on implications for why the kangaroo stuff isn’t working).</w:t>
       </w:r>
     </w:p>
     <w:p>
@@ -428,15 +380,7 @@
         <w:spacing w:line="276" w:lineRule="auto"/>
       </w:pPr>
       <w:r>
-        <w:t xml:space="preserve">I reverted all my changes to the plotting method and got the same result. Therefore, either the video times are incorrect or the </w:t>
-      </w:r>
-      <w:proofErr w:type="spellStart"/>
-      <w:r>
-        <w:t>gps</w:t>
-      </w:r>
-      <w:proofErr w:type="spellEnd"/>
-      <w:r>
-        <w:t xml:space="preserve"> times are incorrect.</w:t>
+        <w:t>I reverted all my changes to the plotting method and got the same result. Therefore, either the video times are incorrect or the gps times are incorrect.</w:t>
       </w:r>
     </w:p>
     <w:p>
@@ -449,15 +393,7 @@
         <w:spacing w:line="276" w:lineRule="auto"/>
       </w:pPr>
       <w:r>
-        <w:t xml:space="preserve">I rechecked the video times and no joy. Therefore, I think the </w:t>
-      </w:r>
-      <w:proofErr w:type="spellStart"/>
-      <w:r>
-        <w:t>gps</w:t>
-      </w:r>
-      <w:proofErr w:type="spellEnd"/>
-      <w:r>
-        <w:t xml:space="preserve"> times are wrong. Going to revert all the work I did yesterday back to the original versions. </w:t>
+        <w:t xml:space="preserve">I rechecked the video times and no joy. Therefore, I think the gps times are wrong. Going to revert all the work I did yesterday back to the original versions. </w:t>
       </w:r>
     </w:p>
     <w:p>
@@ -473,15 +409,7 @@
         <w:sym w:font="Wingdings" w:char="F0E0"/>
       </w:r>
       <w:r>
-        <w:t xml:space="preserve"> Note that the kangaroo data had a lot of error not encountered in the impala data (e.g., multiple board resets, skipped reads, incorrect GPS writes, etc). The fact that using the “cleaning code” I wrote for the </w:t>
-      </w:r>
-      <w:proofErr w:type="spellStart"/>
-      <w:r>
-        <w:t>kangies</w:t>
-      </w:r>
-      <w:proofErr w:type="spellEnd"/>
-      <w:r>
-        <w:t xml:space="preserve"> on the impala caused the impala to break indicates that there is something wrong with the cleaning code…</w:t>
+        <w:t xml:space="preserve"> Note that the kangaroo data had a lot of error not encountered in the impala data (e.g., multiple board resets, skipped reads, incorrect GPS writes, etc). The fact that using the “cleaning code” I wrote for the kangies on the impala caused the impala to break indicates that there is something wrong with the cleaning code…</w:t>
       </w:r>
     </w:p>
     <w:p>
@@ -494,15 +422,7 @@
         <w:spacing w:line="276" w:lineRule="auto"/>
       </w:pPr>
       <w:r>
-        <w:t xml:space="preserve">Okay, I’m </w:t>
-      </w:r>
-      <w:proofErr w:type="gramStart"/>
-      <w:r>
-        <w:t>actually going</w:t>
-      </w:r>
-      <w:proofErr w:type="gramEnd"/>
-      <w:r>
-        <w:t xml:space="preserve"> to revert everything. Back to the very beginning and check differences along every step of the way. I created a branch from 5 months ago and will check every step along the way:</w:t>
+        <w:t>Okay, I’m actually going to revert everything. Back to the very beginning and check differences along every step of the way. I created a branch from 5 months ago and will check every step along the way:</w:t>
       </w:r>
     </w:p>
     <w:p>
@@ -528,13 +448,8 @@
         <w:spacing w:line="276" w:lineRule="auto"/>
       </w:pPr>
       <w:r>
-        <w:t xml:space="preserve">Accel stitch: </w:t>
-      </w:r>
-      <w:proofErr w:type="gramStart"/>
-      <w:r>
-        <w:t>Exactly the same</w:t>
-      </w:r>
-      <w:proofErr w:type="gramEnd"/>
+        <w:t>Accel stitch: Exactly the same</w:t>
+      </w:r>
     </w:p>
     <w:p>
       <w:pPr>
@@ -546,15 +461,7 @@
         <w:spacing w:line="276" w:lineRule="auto"/>
       </w:pPr>
       <w:r>
-        <w:t xml:space="preserve">Old method doesn’t account for the internal clock restarting on the </w:t>
-      </w:r>
-      <w:proofErr w:type="gramStart"/>
-      <w:r>
-        <w:t>accelerometer</w:t>
-      </w:r>
-      <w:proofErr w:type="gramEnd"/>
-      <w:r>
-        <w:t xml:space="preserve"> but when I more closely investigated, it does restart. There are duplicated values in the timestamps. </w:t>
+        <w:t xml:space="preserve">Old method doesn’t account for the internal clock restarting on the accelerometer but when I more closely investigated, it does restart. There are duplicated values in the timestamps. </w:t>
       </w:r>
       <w:r>
         <w:sym w:font="Wingdings" w:char="F0E0"/>
@@ -646,13 +553,8 @@
         <w:spacing w:line="276" w:lineRule="auto"/>
       </w:pPr>
       <w:r>
-        <w:t xml:space="preserve">Reordered the dataset by the reset events and then removed the misreads where there was an uneven increment between the internal and external times on the </w:t>
-      </w:r>
-      <w:proofErr w:type="spellStart"/>
-      <w:r>
-        <w:t>gps_board</w:t>
-      </w:r>
-      <w:proofErr w:type="spellEnd"/>
+        <w:t>Reordered the dataset by the reset events and then removed the misreads where there was an uneven increment between the internal and external times on the gps_board</w:t>
+      </w:r>
     </w:p>
     <w:p>
       <w:pPr>
@@ -704,15 +606,7 @@
         <w:spacing w:line="276" w:lineRule="auto"/>
       </w:pPr>
       <w:r>
-        <w:t xml:space="preserve">Below confirmed that the </w:t>
-      </w:r>
-      <w:proofErr w:type="spellStart"/>
-      <w:r>
-        <w:t>gps</w:t>
-      </w:r>
-      <w:proofErr w:type="spellEnd"/>
-      <w:r>
-        <w:t xml:space="preserve"> timestamps stay the same after writing and reading but also converted everything to numeric to be safe.</w:t>
+        <w:t>Below confirmed that the gps timestamps stay the same after writing and reading but also converted everything to numeric to be safe.</w:t>
       </w:r>
     </w:p>
     <w:p>
@@ -887,23 +781,7 @@
         <w:spacing w:line="276" w:lineRule="auto"/>
       </w:pPr>
       <w:r>
-        <w:t xml:space="preserve">But </w:t>
-      </w:r>
-      <w:proofErr w:type="gramStart"/>
-      <w:r>
-        <w:t>somehow</w:t>
-      </w:r>
-      <w:proofErr w:type="gramEnd"/>
-      <w:r>
-        <w:t xml:space="preserve"> they are then getting back mixed together after I combine the accel and </w:t>
-      </w:r>
-      <w:proofErr w:type="spellStart"/>
-      <w:r>
-        <w:t>gps</w:t>
-      </w:r>
-      <w:proofErr w:type="spellEnd"/>
-      <w:r>
-        <w:t>?</w:t>
+        <w:t>But somehow they are then getting back mixed together after I combine the accel and gps?</w:t>
       </w:r>
     </w:p>
     <w:p>
@@ -1168,15 +1046,7 @@
         <w:spacing w:line="276" w:lineRule="auto"/>
       </w:pPr>
       <w:r>
-        <w:t xml:space="preserve">Wait. Wait. It seems like it might already be aligned? If you watch a video </w:t>
-      </w:r>
-      <w:proofErr w:type="gramStart"/>
-      <w:r>
-        <w:t>a sufficient number of</w:t>
-      </w:r>
-      <w:proofErr w:type="gramEnd"/>
-      <w:r>
-        <w:t xml:space="preserve"> times, you can gaslight yourself into literally anything. (Robin Vid </w:t>
+        <w:t xml:space="preserve">Wait. Wait. It seems like it might already be aligned? If you watch a video a sufficient number of times, you can gaslight yourself into literally anything. (Robin Vid </w:t>
       </w:r>
       <w:r>
         <w:t>8</w:t>
@@ -1250,15 +1120,7 @@
         <w:spacing w:line="276" w:lineRule="auto"/>
       </w:pPr>
       <w:r>
-        <w:t xml:space="preserve">Amazing! </w:t>
-      </w:r>
-      <w:proofErr w:type="gramStart"/>
-      <w:r>
-        <w:t>So</w:t>
-      </w:r>
-      <w:proofErr w:type="gramEnd"/>
-      <w:r>
-        <w:t xml:space="preserve"> it was aligned and Amelia did a tonne of work on it.</w:t>
+        <w:t>Amazing! So it was aligned and Amelia did a tonne of work on it.</w:t>
       </w:r>
     </w:p>
     <w:p>
@@ -1374,15 +1236,7 @@
       </w:pPr>
       <w:r>
         <w:lastRenderedPageBreak/>
-        <w:t xml:space="preserve">I feel </w:t>
-      </w:r>
-      <w:proofErr w:type="gramStart"/>
-      <w:r>
-        <w:t>really unwell</w:t>
-      </w:r>
-      <w:proofErr w:type="gramEnd"/>
-      <w:r>
-        <w:t xml:space="preserve"> but trying to do a little of this before I go to sleep. Trying to get the dead reckoning script set up for Ethan to work on in a fortnight.</w:t>
+        <w:t>I feel really unwell but trying to do a little of this before I go to sleep. Trying to get the dead reckoning script set up for Ethan to work on in a fortnight.</w:t>
       </w:r>
     </w:p>
     <w:p>
@@ -1523,15 +1377,7 @@
         </w:numPr>
       </w:pPr>
       <w:r>
-        <w:t xml:space="preserve">In the meantime, I just did a Z score normalisation so I can plot them all on the same axes. The below image is what I </w:t>
-      </w:r>
-      <w:proofErr w:type="gramStart"/>
-      <w:r>
-        <w:t>have to</w:t>
-      </w:r>
-      <w:proofErr w:type="gramEnd"/>
-      <w:r>
-        <w:t xml:space="preserve"> use to figure out the orientation of the collar.</w:t>
+        <w:t>In the meantime, I just did a Z score normalisation so I can plot them all on the same axes. The below image is what I have to use to figure out the orientation of the collar.</w:t>
       </w:r>
     </w:p>
     <w:p>
@@ -2211,21 +2057,7 @@
         <w:rPr>
           <w:bdr w:val="none" w:sz="0" w:space="0" w:color="auto" w:frame="1"/>
         </w:rPr>
-        <w:t xml:space="preserve"> Not much, </w:t>
-      </w:r>
-      <w:proofErr w:type="spellStart"/>
-      <w:r>
-        <w:rPr>
-          <w:bdr w:val="none" w:sz="0" w:space="0" w:color="auto" w:frame="1"/>
-        </w:rPr>
-        <w:t>tbh</w:t>
-      </w:r>
-      <w:proofErr w:type="spellEnd"/>
-      <w:r>
-        <w:rPr>
-          <w:bdr w:val="none" w:sz="0" w:space="0" w:color="auto" w:frame="1"/>
-        </w:rPr>
-        <w:t>.</w:t>
+        <w:t xml:space="preserve"> Not much, tbh.</w:t>
       </w:r>
     </w:p>
     <w:p>
@@ -2246,23 +2078,7 @@
         <w:t xml:space="preserve"> downward = +Z in NED).</w:t>
       </w:r>
       <w:r>
-        <w:t xml:space="preserve"> </w:t>
-      </w:r>
-      <w:proofErr w:type="gramStart"/>
-      <w:r>
-        <w:t>So</w:t>
-      </w:r>
-      <w:proofErr w:type="gramEnd"/>
-      <w:r>
-        <w:t xml:space="preserve"> this might be NED with a lot of </w:t>
-      </w:r>
-      <w:proofErr w:type="gramStart"/>
-      <w:r>
-        <w:t>roll</w:t>
-      </w:r>
-      <w:proofErr w:type="gramEnd"/>
-      <w:r>
-        <w:t>… could also be NWD?</w:t>
+        <w:t xml:space="preserve"> So this might be NED with a lot of roll… could also be NWD?</w:t>
       </w:r>
     </w:p>
     <w:p>
@@ -2342,23 +2158,7 @@
         </w:numPr>
       </w:pPr>
       <w:r>
-        <w:t>Raw tri-axial magnetometer data (</w:t>
-      </w:r>
-      <w:proofErr w:type="spellStart"/>
-      <w:r>
-        <w:t>mag.</w:t>
-      </w:r>
-      <w:proofErr w:type="gramStart"/>
-      <w:r>
-        <w:t>x,y</w:t>
-      </w:r>
-      <w:proofErr w:type="gramEnd"/>
-      <w:r>
-        <w:t>,z</w:t>
-      </w:r>
-      <w:proofErr w:type="spellEnd"/>
-      <w:r>
-        <w:t>)</w:t>
+        <w:t>Raw tri-axial magnetometer data (mag.x,y,z)</w:t>
       </w:r>
     </w:p>
     <w:p>
@@ -2370,23 +2170,7 @@
         </w:numPr>
       </w:pPr>
       <w:r>
-        <w:t>Tri-axial static acceleration data (</w:t>
-      </w:r>
-      <w:proofErr w:type="spellStart"/>
-      <w:r>
-        <w:t>acc.</w:t>
-      </w:r>
-      <w:proofErr w:type="gramStart"/>
-      <w:r>
-        <w:t>x,y</w:t>
-      </w:r>
-      <w:proofErr w:type="gramEnd"/>
-      <w:r>
-        <w:t>,z</w:t>
-      </w:r>
-      <w:proofErr w:type="spellEnd"/>
-      <w:r>
-        <w:t>) (the smoothed values)</w:t>
+        <w:t>Tri-axial static acceleration data (acc.x,y,z) (the smoothed values)</w:t>
       </w:r>
     </w:p>
     <w:p>
@@ -2434,36 +2218,12 @@
         </w:numPr>
       </w:pPr>
       <w:r>
-        <w:t xml:space="preserve">Estimated pitch offset: Approximately how much was it rotated by? * algorithm = “standard” (standard </w:t>
-      </w:r>
-      <w:proofErr w:type="spellStart"/>
-      <w:r>
-        <w:t>euler</w:t>
-      </w:r>
-      <w:proofErr w:type="spellEnd"/>
-      <w:r>
-        <w:t xml:space="preserve"> angle approach) or “SAAM” (using quaternions)</w:t>
-      </w:r>
-    </w:p>
-    <w:p>
-      <w:r>
-        <w:t xml:space="preserve">We have most of these variables available in the data already, but there are some that we </w:t>
-      </w:r>
-      <w:proofErr w:type="gramStart"/>
-      <w:r>
-        <w:t>have to</w:t>
-      </w:r>
-      <w:proofErr w:type="gramEnd"/>
-      <w:r>
-        <w:t xml:space="preserve"> figure out. To understand the reference coordinate system for this analysis, firstly we </w:t>
-      </w:r>
-      <w:proofErr w:type="gramStart"/>
-      <w:r>
-        <w:t>have to</w:t>
-      </w:r>
-      <w:proofErr w:type="gramEnd"/>
-      <w:r>
-        <w:t xml:space="preserve"> understand what the axes represent. This analysis system assumes the North-East-Down (NED) system where the X axis will be the surge (forward and back, North and South), Y will be the sway (side to side, East and West), and Z will be heave (up and down).</w:t>
+        <w:t>Estimated pitch offset: Approximately how much was it rotated by? * algorithm = “standard” (standard euler angle approach) or “SAAM” (using quaternions)</w:t>
+      </w:r>
+    </w:p>
+    <w:p>
+      <w:r>
+        <w:t>We have most of these variables available in the data already, but there are some that we have to figure out. To understand the reference coordinate system for this analysis, firstly we have to understand what the axes represent. This analysis system assumes the North-East-Down (NED) system where the X axis will be the surge (forward and back, North and South), Y will be the sway (side to side, East and West), and Z will be heave (up and down).</w:t>
       </w:r>
     </w:p>
     <w:p>
@@ -2475,7 +2235,7 @@
           <w:noProof/>
         </w:rPr>
         <w:drawing>
-          <wp:inline distT="0" distB="0" distL="0" distR="0" wp14:anchorId="58B5C0DB" wp14:editId="7E01DED2">
+          <wp:inline distT="0" distB="0" distL="0" distR="0" wp14:anchorId="58B5C0DB" wp14:editId="33D1C6B4">
             <wp:extent cx="3400425" cy="1743808"/>
             <wp:effectExtent l="0" t="0" r="0" b="8890"/>
             <wp:docPr id="1563100451" name="Picture 8" descr="Linking axes to biology"/>
@@ -2547,7 +2307,7 @@
           <w:noProof/>
         </w:rPr>
         <w:drawing>
-          <wp:inline distT="0" distB="0" distL="0" distR="0" wp14:anchorId="3BDC6625" wp14:editId="04CB156E">
+          <wp:inline distT="0" distB="0" distL="0" distR="0" wp14:anchorId="3BDC6625" wp14:editId="451E3B32">
             <wp:extent cx="2901938" cy="1714500"/>
             <wp:effectExtent l="0" t="0" r="0" b="0"/>
             <wp:docPr id="1656144157" name="Picture 9" descr="Using your hand to determine orientation"/>
@@ -2598,69 +2358,12 @@
     </w:p>
     <w:p>
       <w:r>
-        <w:t xml:space="preserve">In the above image we have imagined a compass. We then </w:t>
-      </w:r>
-      <w:proofErr w:type="gramStart"/>
-      <w:r>
-        <w:t>have to</w:t>
-      </w:r>
-      <w:proofErr w:type="gramEnd"/>
-      <w:r>
-        <w:t xml:space="preserve"> describe the direction of the 3 axes (fingers) according to these compass directions in the order of X, Y, Z. In this case it will therefore be North for X, East for Y, and Up for Z. The coordinate system would therefore be North-East-Up (NEU). In total, there 48 possible combinations of coordinate frame configurations.</w:t>
-      </w:r>
-    </w:p>
-    <w:p>
-      <w:r>
-        <w:t xml:space="preserve">The default orientation of the Gundog system is North-East-Down (NED) where the axes readings would be X = 0, Y = 0, and Z = -1. Before we could use data from our hand </w:t>
-      </w:r>
-      <w:proofErr w:type="gramStart"/>
-      <w:r>
-        <w:t>accelerometer</w:t>
-      </w:r>
-      <w:proofErr w:type="gramEnd"/>
-      <w:r>
-        <w:t xml:space="preserve"> we would have to flip it upside down. Some devices may have a different local coordinate frame, e.g., the END (East-North-Down) coordinate system assume the surge dimension of movement is represented by the z-channel, and the sway and heave dimension, by the x- and y-channels, respectively. Providing the original coordinate system allows the Gundogs system to convert your local system to the global system. The </w:t>
-      </w:r>
-      <w:proofErr w:type="spellStart"/>
-      <w:r>
-        <w:t>Gundog.Compass</w:t>
-      </w:r>
-      <w:proofErr w:type="spellEnd"/>
-      <w:r>
-        <w:t xml:space="preserve"> function comes with three inputs to allow the user to transform their device’s coordinate frame into the NED that the specific Direction Cosine Matrix (DCM) and quaternion augmentation uses to compute </w:t>
-      </w:r>
-      <w:proofErr w:type="gramStart"/>
-      <w:r>
-        <w:t>angles:‘</w:t>
-      </w:r>
-      <w:proofErr w:type="spellStart"/>
-      <w:r>
-        <w:t>acc.ref.frame</w:t>
-      </w:r>
-      <w:proofErr w:type="spellEnd"/>
-      <w:proofErr w:type="gramEnd"/>
-      <w:r>
-        <w:t>’, ‘</w:t>
-      </w:r>
-      <w:proofErr w:type="spellStart"/>
-      <w:proofErr w:type="gramStart"/>
-      <w:r>
-        <w:t>positive.g</w:t>
-      </w:r>
-      <w:proofErr w:type="spellEnd"/>
-      <w:proofErr w:type="gramEnd"/>
-      <w:r>
-        <w:t>’, and ‘</w:t>
-      </w:r>
-      <w:proofErr w:type="spellStart"/>
-      <w:proofErr w:type="gramStart"/>
-      <w:r>
-        <w:t>mag.ref.frame</w:t>
-      </w:r>
-      <w:proofErr w:type="spellEnd"/>
-      <w:proofErr w:type="gramEnd"/>
-      <w:r>
-        <w:t>’</w:t>
+        <w:t>In the above image we have imagined a compass. We then have to describe the direction of the 3 axes (fingers) according to these compass directions in the order of X, Y, Z. In this case it will therefore be North for X, East for Y, and Up for Z. The coordinate system would therefore be North-East-Up (NEU). In total, there 48 possible combinations of coordinate frame configurations.</w:t>
+      </w:r>
+    </w:p>
+    <w:p>
+      <w:r>
+        <w:t>The default orientation of the Gundog system is North-East-Down (NED) where the axes readings would be X = 0, Y = 0, and Z = -1. Before we could use data from our hand accelerometer we would have to flip it upside down. Some devices may have a different local coordinate frame, e.g., the END (East-North-Down) coordinate system assume the surge dimension of movement is represented by the z-channel, and the sway and heave dimension, by the x- and y-channels, respectively. Providing the original coordinate system allows the Gundogs system to convert your local system to the global system. The Gundog.Compass function comes with three inputs to allow the user to transform their device’s coordinate frame into the NED that the specific Direction Cosine Matrix (DCM) and quaternion augmentation uses to compute angles:‘acc.ref.frame’, ‘positive.g’, and ‘mag.ref.frame’</w:t>
       </w:r>
     </w:p>
     <w:p>
@@ -2726,15 +2429,7 @@
         </w:r>
       </w:hyperlink>
       <w:r>
-        <w:t xml:space="preserve"> which Jojo and Luke originally developed. I know that the test trial should result in multiple </w:t>
-      </w:r>
-      <w:proofErr w:type="gramStart"/>
-      <w:r>
-        <w:t>rectangles</w:t>
-      </w:r>
-      <w:proofErr w:type="gramEnd"/>
-      <w:r>
-        <w:t xml:space="preserve"> but my current trials are getting waves…</w:t>
+        <w:t xml:space="preserve"> which Jojo and Luke originally developed. I know that the test trial should result in multiple rectangles but my current trials are getting waves…</w:t>
       </w:r>
       <w:r>
         <w:t xml:space="preserve"> I am now playing around with the different orientations until I get something good.</w:t>
@@ -2749,15 +2444,7 @@
         </w:numPr>
       </w:pPr>
       <w:r>
-        <w:t xml:space="preserve">This approach ended up being </w:t>
-      </w:r>
-      <w:proofErr w:type="gramStart"/>
-      <w:r>
-        <w:t>futile</w:t>
-      </w:r>
-      <w:proofErr w:type="gramEnd"/>
-      <w:r>
-        <w:t xml:space="preserve"> so my next step is to go back to Jojo’s original code and look for differences line by line.</w:t>
+        <w:t>This approach ended up being futile so my next step is to go back to Jojo’s original code and look for differences line by line.</w:t>
       </w:r>
     </w:p>
     <w:p>
@@ -2874,15 +2561,7 @@
         </w:numPr>
       </w:pPr>
       <w:r>
-        <w:t xml:space="preserve">Working through this is very frustrating and making me depressed again… I don’t have their original </w:t>
-      </w:r>
-      <w:proofErr w:type="gramStart"/>
-      <w:r>
-        <w:t>data</w:t>
-      </w:r>
-      <w:proofErr w:type="gramEnd"/>
-      <w:r>
-        <w:t xml:space="preserve"> and it is very hard to make sense of their original mess of code but here we go. </w:t>
+        <w:t xml:space="preserve">Working through this is very frustrating and making me depressed again… I don’t have their original data and it is very hard to make sense of their original mess of code but here we go. </w:t>
       </w:r>
     </w:p>
     <w:p>
@@ -2906,15 +2585,7 @@
         </w:numPr>
       </w:pPr>
       <w:r>
-        <w:t xml:space="preserve">I found their original </w:t>
-      </w:r>
-      <w:proofErr w:type="gramStart"/>
-      <w:r>
-        <w:t>data</w:t>
-      </w:r>
-      <w:proofErr w:type="gramEnd"/>
-      <w:r>
-        <w:t xml:space="preserve"> and </w:t>
+        <w:t xml:space="preserve">I found their original data and </w:t>
       </w:r>
       <w:r>
         <w:t>it</w:t>
@@ -3050,15 +2721,7 @@
         </w:numPr>
       </w:pPr>
       <w:r>
-        <w:t xml:space="preserve">I went through in detail and found that my conversion for my magnetometer </w:t>
-      </w:r>
-      <w:proofErr w:type="gramStart"/>
-      <w:r>
-        <w:t>are</w:t>
-      </w:r>
-      <w:proofErr w:type="gramEnd"/>
-      <w:r>
-        <w:t xml:space="preserve"> off… After aligning them exactly between the GPS points, </w:t>
+        <w:t xml:space="preserve">I went through in detail and found that my conversion for my magnetometer are off… After aligning them exactly between the GPS points, </w:t>
       </w:r>
       <w:r>
         <w:rPr>
@@ -3082,21 +2745,7 @@
         <w:rPr>
           <w:highlight w:val="yellow"/>
         </w:rPr>
-        <w:t xml:space="preserve">by 0.15 to give me what </w:t>
-      </w:r>
-      <w:proofErr w:type="spellStart"/>
-      <w:r>
-        <w:rPr>
-          <w:highlight w:val="yellow"/>
-        </w:rPr>
-        <w:t>jojo</w:t>
-      </w:r>
-      <w:proofErr w:type="spellEnd"/>
-      <w:r>
-        <w:rPr>
-          <w:highlight w:val="yellow"/>
-        </w:rPr>
-        <w:t xml:space="preserve"> had</w:t>
+        <w:t>by 0.15 to give me what jojo had</w:t>
       </w:r>
       <w:r>
         <w:t>. So…</w:t>
@@ -3111,418 +2760,64 @@
           <w:szCs w:val="20"/>
         </w:rPr>
       </w:pPr>
-      <w:proofErr w:type="spellStart"/>
-      <w:proofErr w:type="gramStart"/>
       <w:r>
         <w:rPr>
           <w:sz w:val="20"/>
           <w:szCs w:val="20"/>
         </w:rPr>
-        <w:t>mine.flat</w:t>
-      </w:r>
-      <w:proofErr w:type="spellEnd"/>
-      <w:proofErr w:type="gramEnd"/>
-      <w:r>
+        <w:t>mine.flat[, c("RawAX", "RawAY", "RawAZ")] &lt;- mine.flat[, c("RawAX", "RawAY", "RawAZ")] / 2048</w:t>
+      </w:r>
+    </w:p>
+    <w:p>
+      <w:pPr>
+        <w:pStyle w:val="ListParagraph"/>
+        <w:ind w:left="2160"/>
         <w:rPr>
           <w:sz w:val="20"/>
           <w:szCs w:val="20"/>
         </w:rPr>
-        <w:t xml:space="preserve">[, </w:t>
-      </w:r>
-      <w:proofErr w:type="gramStart"/>
+      </w:pPr>
       <w:r>
         <w:rPr>
           <w:sz w:val="20"/>
           <w:szCs w:val="20"/>
         </w:rPr>
-        <w:t>c(</w:t>
-      </w:r>
-      <w:proofErr w:type="gramEnd"/>
-      <w:r>
+        <w:t>mine.flat[, c("RawMX", "RawMY", "RawMZ")] &lt;- mine.flat[, c("RawMX", "RawMY", "RawMZ")] * 0.15</w:t>
+      </w:r>
+    </w:p>
+    <w:p>
+      <w:pPr>
+        <w:pStyle w:val="ListParagraph"/>
+        <w:ind w:left="2160"/>
         <w:rPr>
           <w:sz w:val="20"/>
           <w:szCs w:val="20"/>
         </w:rPr>
-        <w:t>"</w:t>
-      </w:r>
-      <w:proofErr w:type="spellStart"/>
+      </w:pPr>
       <w:r>
         <w:rPr>
           <w:sz w:val="20"/>
           <w:szCs w:val="20"/>
         </w:rPr>
-        <w:t>RawAX</w:t>
-      </w:r>
-      <w:proofErr w:type="spellEnd"/>
-      <w:r>
+        <w:t>jojo_df &lt;- df.flat[1:77009, ]</w:t>
+      </w:r>
+    </w:p>
+    <w:p>
+      <w:pPr>
+        <w:pStyle w:val="ListParagraph"/>
+        <w:ind w:left="2160"/>
         <w:rPr>
           <w:sz w:val="20"/>
           <w:szCs w:val="20"/>
         </w:rPr>
-        <w:t>", "RawAY", "</w:t>
-      </w:r>
-      <w:proofErr w:type="spellStart"/>
+      </w:pPr>
       <w:r>
         <w:rPr>
           <w:sz w:val="20"/>
           <w:szCs w:val="20"/>
         </w:rPr>
-        <w:t>RawAZ</w:t>
-      </w:r>
-      <w:proofErr w:type="spellEnd"/>
-      <w:r>
-        <w:rPr>
-          <w:sz w:val="20"/>
-          <w:szCs w:val="20"/>
-        </w:rPr>
-        <w:t xml:space="preserve">")] &lt;- </w:t>
-      </w:r>
-      <w:proofErr w:type="spellStart"/>
-      <w:proofErr w:type="gramStart"/>
-      <w:r>
-        <w:rPr>
-          <w:sz w:val="20"/>
-          <w:szCs w:val="20"/>
-        </w:rPr>
-        <w:t>mine.flat</w:t>
-      </w:r>
-      <w:proofErr w:type="spellEnd"/>
-      <w:proofErr w:type="gramEnd"/>
-      <w:r>
-        <w:rPr>
-          <w:sz w:val="20"/>
-          <w:szCs w:val="20"/>
-        </w:rPr>
-        <w:t xml:space="preserve">[, </w:t>
-      </w:r>
-      <w:proofErr w:type="gramStart"/>
-      <w:r>
-        <w:rPr>
-          <w:sz w:val="20"/>
-          <w:szCs w:val="20"/>
-        </w:rPr>
-        <w:t>c(</w:t>
-      </w:r>
-      <w:proofErr w:type="gramEnd"/>
-      <w:r>
-        <w:rPr>
-          <w:sz w:val="20"/>
-          <w:szCs w:val="20"/>
-        </w:rPr>
-        <w:t>"</w:t>
-      </w:r>
-      <w:proofErr w:type="spellStart"/>
-      <w:r>
-        <w:rPr>
-          <w:sz w:val="20"/>
-          <w:szCs w:val="20"/>
-        </w:rPr>
-        <w:t>RawAX</w:t>
-      </w:r>
-      <w:proofErr w:type="spellEnd"/>
-      <w:r>
-        <w:rPr>
-          <w:sz w:val="20"/>
-          <w:szCs w:val="20"/>
-        </w:rPr>
-        <w:t>", "RawAY", "</w:t>
-      </w:r>
-      <w:proofErr w:type="spellStart"/>
-      <w:r>
-        <w:rPr>
-          <w:sz w:val="20"/>
-          <w:szCs w:val="20"/>
-        </w:rPr>
-        <w:t>RawAZ</w:t>
-      </w:r>
-      <w:proofErr w:type="spellEnd"/>
-      <w:r>
-        <w:rPr>
-          <w:sz w:val="20"/>
-          <w:szCs w:val="20"/>
-        </w:rPr>
-        <w:t>")] / 2048</w:t>
-      </w:r>
-    </w:p>
-    <w:p>
-      <w:pPr>
-        <w:pStyle w:val="ListParagraph"/>
-        <w:ind w:left="2160"/>
-        <w:rPr>
-          <w:sz w:val="20"/>
-          <w:szCs w:val="20"/>
-        </w:rPr>
-      </w:pPr>
-      <w:proofErr w:type="spellStart"/>
-      <w:proofErr w:type="gramStart"/>
-      <w:r>
-        <w:rPr>
-          <w:sz w:val="20"/>
-          <w:szCs w:val="20"/>
-        </w:rPr>
-        <w:t>mine.flat</w:t>
-      </w:r>
-      <w:proofErr w:type="spellEnd"/>
-      <w:proofErr w:type="gramEnd"/>
-      <w:r>
-        <w:rPr>
-          <w:sz w:val="20"/>
-          <w:szCs w:val="20"/>
-        </w:rPr>
-        <w:t xml:space="preserve">[, </w:t>
-      </w:r>
-      <w:proofErr w:type="gramStart"/>
-      <w:r>
-        <w:rPr>
-          <w:sz w:val="20"/>
-          <w:szCs w:val="20"/>
-        </w:rPr>
-        <w:t>c(</w:t>
-      </w:r>
-      <w:proofErr w:type="gramEnd"/>
-      <w:r>
-        <w:rPr>
-          <w:sz w:val="20"/>
-          <w:szCs w:val="20"/>
-        </w:rPr>
-        <w:t>"</w:t>
-      </w:r>
-      <w:proofErr w:type="spellStart"/>
-      <w:r>
-        <w:rPr>
-          <w:sz w:val="20"/>
-          <w:szCs w:val="20"/>
-        </w:rPr>
-        <w:t>RawMX</w:t>
-      </w:r>
-      <w:proofErr w:type="spellEnd"/>
-      <w:r>
-        <w:rPr>
-          <w:sz w:val="20"/>
-          <w:szCs w:val="20"/>
-        </w:rPr>
-        <w:t>", "</w:t>
-      </w:r>
-      <w:proofErr w:type="spellStart"/>
-      <w:r>
-        <w:rPr>
-          <w:sz w:val="20"/>
-          <w:szCs w:val="20"/>
-        </w:rPr>
-        <w:t>RawMY</w:t>
-      </w:r>
-      <w:proofErr w:type="spellEnd"/>
-      <w:r>
-        <w:rPr>
-          <w:sz w:val="20"/>
-          <w:szCs w:val="20"/>
-        </w:rPr>
-        <w:t>", "</w:t>
-      </w:r>
-      <w:proofErr w:type="spellStart"/>
-      <w:r>
-        <w:rPr>
-          <w:sz w:val="20"/>
-          <w:szCs w:val="20"/>
-        </w:rPr>
-        <w:t>RawMZ</w:t>
-      </w:r>
-      <w:proofErr w:type="spellEnd"/>
-      <w:r>
-        <w:rPr>
-          <w:sz w:val="20"/>
-          <w:szCs w:val="20"/>
-        </w:rPr>
-        <w:t xml:space="preserve">")] &lt;- </w:t>
-      </w:r>
-      <w:proofErr w:type="spellStart"/>
-      <w:proofErr w:type="gramStart"/>
-      <w:r>
-        <w:rPr>
-          <w:sz w:val="20"/>
-          <w:szCs w:val="20"/>
-        </w:rPr>
-        <w:t>mine.flat</w:t>
-      </w:r>
-      <w:proofErr w:type="spellEnd"/>
-      <w:proofErr w:type="gramEnd"/>
-      <w:r>
-        <w:rPr>
-          <w:sz w:val="20"/>
-          <w:szCs w:val="20"/>
-        </w:rPr>
-        <w:t xml:space="preserve">[, </w:t>
-      </w:r>
-      <w:proofErr w:type="gramStart"/>
-      <w:r>
-        <w:rPr>
-          <w:sz w:val="20"/>
-          <w:szCs w:val="20"/>
-        </w:rPr>
-        <w:t>c(</w:t>
-      </w:r>
-      <w:proofErr w:type="gramEnd"/>
-      <w:r>
-        <w:rPr>
-          <w:sz w:val="20"/>
-          <w:szCs w:val="20"/>
-        </w:rPr>
-        <w:t>"</w:t>
-      </w:r>
-      <w:proofErr w:type="spellStart"/>
-      <w:r>
-        <w:rPr>
-          <w:sz w:val="20"/>
-          <w:szCs w:val="20"/>
-        </w:rPr>
-        <w:t>RawMX</w:t>
-      </w:r>
-      <w:proofErr w:type="spellEnd"/>
-      <w:r>
-        <w:rPr>
-          <w:sz w:val="20"/>
-          <w:szCs w:val="20"/>
-        </w:rPr>
-        <w:t>", "</w:t>
-      </w:r>
-      <w:proofErr w:type="spellStart"/>
-      <w:r>
-        <w:rPr>
-          <w:sz w:val="20"/>
-          <w:szCs w:val="20"/>
-        </w:rPr>
-        <w:t>RawMY</w:t>
-      </w:r>
-      <w:proofErr w:type="spellEnd"/>
-      <w:r>
-        <w:rPr>
-          <w:sz w:val="20"/>
-          <w:szCs w:val="20"/>
-        </w:rPr>
-        <w:t>", "</w:t>
-      </w:r>
-      <w:proofErr w:type="spellStart"/>
-      <w:r>
-        <w:rPr>
-          <w:sz w:val="20"/>
-          <w:szCs w:val="20"/>
-        </w:rPr>
-        <w:t>RawMZ</w:t>
-      </w:r>
-      <w:proofErr w:type="spellEnd"/>
-      <w:r>
-        <w:rPr>
-          <w:sz w:val="20"/>
-          <w:szCs w:val="20"/>
-        </w:rPr>
-        <w:t>")] * 0.15</w:t>
-      </w:r>
-    </w:p>
-    <w:p>
-      <w:pPr>
-        <w:pStyle w:val="ListParagraph"/>
-        <w:ind w:left="2160"/>
-        <w:rPr>
-          <w:sz w:val="20"/>
-          <w:szCs w:val="20"/>
-        </w:rPr>
-      </w:pPr>
-      <w:proofErr w:type="spellStart"/>
-      <w:r>
-        <w:rPr>
-          <w:sz w:val="20"/>
-          <w:szCs w:val="20"/>
-        </w:rPr>
-        <w:t>jojo_df</w:t>
-      </w:r>
-      <w:proofErr w:type="spellEnd"/>
-      <w:r>
-        <w:rPr>
-          <w:sz w:val="20"/>
-          <w:szCs w:val="20"/>
-        </w:rPr>
-        <w:t xml:space="preserve"> &lt;- </w:t>
-      </w:r>
-      <w:proofErr w:type="spellStart"/>
-      <w:proofErr w:type="gramStart"/>
-      <w:r>
-        <w:rPr>
-          <w:sz w:val="20"/>
-          <w:szCs w:val="20"/>
-        </w:rPr>
-        <w:t>df.flat</w:t>
-      </w:r>
-      <w:proofErr w:type="spellEnd"/>
-      <w:proofErr w:type="gramEnd"/>
-      <w:r>
-        <w:rPr>
-          <w:sz w:val="20"/>
-          <w:szCs w:val="20"/>
-        </w:rPr>
-        <w:t>[1:77009</w:t>
-      </w:r>
-      <w:proofErr w:type="gramStart"/>
-      <w:r>
-        <w:rPr>
-          <w:sz w:val="20"/>
-          <w:szCs w:val="20"/>
-        </w:rPr>
-        <w:t>, ]</w:t>
-      </w:r>
-      <w:proofErr w:type="gramEnd"/>
-    </w:p>
-    <w:p>
-      <w:pPr>
-        <w:pStyle w:val="ListParagraph"/>
-        <w:ind w:left="2160"/>
-        <w:rPr>
-          <w:sz w:val="20"/>
-          <w:szCs w:val="20"/>
-        </w:rPr>
-      </w:pPr>
-      <w:proofErr w:type="spellStart"/>
-      <w:r>
-        <w:rPr>
-          <w:sz w:val="20"/>
-          <w:szCs w:val="20"/>
-        </w:rPr>
-        <w:t>oak_df</w:t>
-      </w:r>
-      <w:proofErr w:type="spellEnd"/>
-      <w:r>
-        <w:rPr>
-          <w:sz w:val="20"/>
-          <w:szCs w:val="20"/>
-        </w:rPr>
-        <w:t xml:space="preserve"> &lt;- </w:t>
-      </w:r>
-      <w:proofErr w:type="spellStart"/>
-      <w:proofErr w:type="gramStart"/>
-      <w:r>
-        <w:rPr>
-          <w:sz w:val="20"/>
-          <w:szCs w:val="20"/>
-        </w:rPr>
-        <w:t>mine.flat</w:t>
-      </w:r>
-      <w:proofErr w:type="spellEnd"/>
-      <w:proofErr w:type="gramEnd"/>
-      <w:r>
-        <w:rPr>
-          <w:sz w:val="20"/>
-          <w:szCs w:val="20"/>
-        </w:rPr>
-        <w:t>[3064:80072</w:t>
-      </w:r>
-      <w:proofErr w:type="gramStart"/>
-      <w:r>
-        <w:rPr>
-          <w:sz w:val="20"/>
-          <w:szCs w:val="20"/>
-        </w:rPr>
-        <w:t>, ]</w:t>
-      </w:r>
-      <w:proofErr w:type="gramEnd"/>
+        <w:t>oak_df &lt;- mine.flat[3064:80072, ]</w:t>
+      </w:r>
     </w:p>
     <w:p>
       <w:pPr>
@@ -3534,15 +2829,7 @@
       </w:pPr>
       <w:r>
         <w:lastRenderedPageBreak/>
-        <w:t xml:space="preserve">OMG! That was the only correction I needed and now it aligns beautifully and looks </w:t>
-      </w:r>
-      <w:proofErr w:type="gramStart"/>
-      <w:r>
-        <w:t>exactly the same</w:t>
-      </w:r>
-      <w:proofErr w:type="gramEnd"/>
-      <w:r>
-        <w:t>!</w:t>
+        <w:t>OMG! That was the only correction I needed and now it aligns beautifully and looks exactly the same!</w:t>
       </w:r>
       <w:r>
         <w:t xml:space="preserve"> Now to figure out when it isn’t flat.</w:t>
@@ -3651,15 +2938,7 @@
         </w:numPr>
       </w:pPr>
       <w:r>
-        <w:t xml:space="preserve">Excellent. I am now confident that I </w:t>
-      </w:r>
-      <w:proofErr w:type="gramStart"/>
-      <w:r>
-        <w:t>have an understanding of</w:t>
-      </w:r>
-      <w:proofErr w:type="gramEnd"/>
-      <w:r>
-        <w:t xml:space="preserve"> how this works and how to use it. I now want to expand the workflow to be used on the impala data. </w:t>
+        <w:t xml:space="preserve">Excellent. I am now confident that I have an understanding of how this works and how to use it. I now want to expand the workflow to be used on the impala data. </w:t>
       </w:r>
       <w:r>
         <w:t>The hardest part of this is probably</w:t>
@@ -3692,15 +2971,7 @@
         </w:numPr>
       </w:pPr>
       <w:r>
-        <w:t xml:space="preserve">I think I should presume that they’re not. That is, </w:t>
-      </w:r>
-      <w:proofErr w:type="spellStart"/>
-      <w:r>
-        <w:t>jojo</w:t>
-      </w:r>
-      <w:proofErr w:type="spellEnd"/>
-      <w:r>
-        <w:t xml:space="preserve"> figured out that the </w:t>
+        <w:t xml:space="preserve">I think I should presume that they’re not. That is, jojo figured out that the </w:t>
       </w:r>
       <w:r>
         <w:t>accel was NED and the mag was NWU. Whatever my accel orientation is determined to be, the mag will probably be an equivalent rotation.</w:t>
@@ -3757,15 +3028,7 @@
         <w:t xml:space="preserve"> the orientation</w:t>
       </w:r>
       <w:r>
-        <w:t xml:space="preserve"> of the </w:t>
-      </w:r>
-      <w:proofErr w:type="spellStart"/>
-      <w:r>
-        <w:t>accels</w:t>
-      </w:r>
-      <w:proofErr w:type="spellEnd"/>
-      <w:r>
-        <w:t xml:space="preserve"> are</w:t>
+        <w:t xml:space="preserve"> of the accels are</w:t>
       </w:r>
       <w:r>
         <w:t xml:space="preserve"> written on the </w:t>
@@ -4019,26 +3282,10 @@
         </w:numPr>
       </w:pPr>
       <w:r>
-        <w:t xml:space="preserve">Was having an issue where there were a lot of unmatched </w:t>
-      </w:r>
-      <w:proofErr w:type="spellStart"/>
-      <w:r>
-        <w:t>gps</w:t>
-      </w:r>
-      <w:proofErr w:type="spellEnd"/>
-      <w:r>
-        <w:t xml:space="preserve"> pings. </w:t>
-      </w:r>
-      <w:r>
-        <w:t xml:space="preserve">Fixed this by switching the order of the </w:t>
-      </w:r>
-      <w:proofErr w:type="spellStart"/>
-      <w:r>
-        <w:t>kets</w:t>
-      </w:r>
-      <w:proofErr w:type="spellEnd"/>
-      <w:r>
-        <w:t xml:space="preserve"> for the rolling join. But I nearly kms before figuring that out.</w:t>
+        <w:t xml:space="preserve">Was having an issue where there were a lot of unmatched gps pings. </w:t>
+      </w:r>
+      <w:r>
+        <w:t>Fixed this by switching the order of the kets for the rolling join. But I nearly kms before figuring that out.</w:t>
       </w:r>
     </w:p>
     <w:p>
@@ -4109,15 +3356,7 @@
         </w:numPr>
       </w:pPr>
       <w:r>
-        <w:t xml:space="preserve">We </w:t>
-      </w:r>
-      <w:proofErr w:type="gramStart"/>
-      <w:r>
-        <w:t>cooking</w:t>
-      </w:r>
-      <w:proofErr w:type="gramEnd"/>
-      <w:r>
-        <w:t xml:space="preserve"> with gas again.</w:t>
+        <w:t>We cooking with gas again.</w:t>
       </w:r>
     </w:p>
     <w:p>
@@ -4129,15 +3368,7 @@
         </w:numPr>
       </w:pPr>
       <w:r>
-        <w:t xml:space="preserve">Okay now I’m finally up to the part where I </w:t>
-      </w:r>
-      <w:proofErr w:type="gramStart"/>
-      <w:r>
-        <w:t>have to</w:t>
-      </w:r>
-      <w:proofErr w:type="gramEnd"/>
-      <w:r>
-        <w:t xml:space="preserve"> decide the orientation of the device. Oh no.</w:t>
+        <w:t>Okay now I’m finally up to the part where I have to decide the orientation of the device. Oh no.</w:t>
       </w:r>
     </w:p>
     <w:p>
@@ -4231,15 +3462,7 @@
         <w:t>Unfortunately,</w:t>
       </w:r>
       <w:r>
-        <w:t xml:space="preserve"> I didn’t wait long enough to get a proper </w:t>
-      </w:r>
-      <w:proofErr w:type="spellStart"/>
-      <w:r>
-        <w:t>gps</w:t>
-      </w:r>
-      <w:proofErr w:type="spellEnd"/>
-      <w:r>
-        <w:t xml:space="preserve"> </w:t>
+        <w:t xml:space="preserve"> I didn’t wait long enough to get a proper gps </w:t>
       </w:r>
       <w:r>
         <w:t>hit but</w:t>
@@ -4338,15 +3561,7 @@
         </w:numPr>
       </w:pPr>
       <w:r>
-        <w:t xml:space="preserve">Based on my best understanding of the collar orientation, I believe the collar should </w:t>
-      </w:r>
-      <w:proofErr w:type="gramStart"/>
-      <w:r>
-        <w:t>be:</w:t>
-      </w:r>
-      <w:proofErr w:type="gramEnd"/>
-      <w:r>
-        <w:t xml:space="preserve"> X heave, Y sway, Z surge. Therefore. That would translate to an orientation of… Down, West, North (DWN)</w:t>
+        <w:t>Based on my best understanding of the collar orientation, I believe the collar should be: X heave, Y sway, Z surge. Therefore. That would translate to an orientation of… Down, West, North (DWN)</w:t>
       </w:r>
       <w:r>
         <w:t>. According to the notes it should be END though.</w:t>
@@ -4361,15 +3576,7 @@
         </w:numPr>
       </w:pPr>
       <w:r>
-        <w:t xml:space="preserve">If the original collar trials had an </w:t>
-      </w:r>
-      <w:proofErr w:type="spellStart"/>
-      <w:r>
-        <w:t>acc</w:t>
-      </w:r>
-      <w:proofErr w:type="spellEnd"/>
-      <w:r>
-        <w:t xml:space="preserve"> of NED and a mag of NWU then… I need to reverse the Y and Z directions for the mag of the true collar orientation. So would be… DES. </w:t>
+        <w:t xml:space="preserve">If the original collar trials had an acc of NED and a mag of NWU then… I need to reverse the Y and Z directions for the mag of the true collar orientation. So would be… DES. </w:t>
       </w:r>
     </w:p>
     <w:p>
@@ -4501,15 +3708,7 @@
         </w:numPr>
       </w:pPr>
       <w:r>
-        <w:t xml:space="preserve">For </w:t>
-      </w:r>
-      <w:proofErr w:type="gramStart"/>
-      <w:r>
-        <w:t>now</w:t>
-      </w:r>
-      <w:proofErr w:type="gramEnd"/>
-      <w:r>
-        <w:t xml:space="preserve"> I am going to go back to debugging whatever was wrong with the files that Ethan identified yesterday. </w:t>
+        <w:t xml:space="preserve">For now I am going to go back to debugging whatever was wrong with the files that Ethan identified yesterday. </w:t>
       </w:r>
       <w:r>
         <w:sym w:font="Wingdings" w:char="F0E0"/>
@@ -4527,23 +3726,7 @@
         </w:numPr>
       </w:pPr>
       <w:r>
-        <w:t xml:space="preserve">Basically, the calibration event occurs at 28.06.24 18:16:00 local time but the first recorded </w:t>
-      </w:r>
-      <w:proofErr w:type="spellStart"/>
-      <w:r>
-        <w:t>gps</w:t>
-      </w:r>
-      <w:proofErr w:type="spellEnd"/>
-      <w:r>
-        <w:t xml:space="preserve"> time is "2024-06-28 16:28:48 UTC" (about 10 minutes after). Jaz says </w:t>
-      </w:r>
-      <w:proofErr w:type="spellStart"/>
-      <w:r>
-        <w:t>its</w:t>
-      </w:r>
-      <w:proofErr w:type="spellEnd"/>
-      <w:r>
-        <w:t xml:space="preserve"> not possible for the calibration event to have occurred before the first ping… but </w:t>
+        <w:t xml:space="preserve">Basically, the calibration event occurs at 28.06.24 18:16:00 local time but the first recorded gps time is "2024-06-28 16:28:48 UTC" (about 10 minutes after). Jaz says its not possible for the calibration event to have occurred before the first ping… but </w:t>
       </w:r>
       <w:r>
         <w:t>stuff</w:t>
@@ -4613,15 +3796,7 @@
         <w:t>th</w:t>
       </w:r>
       <w:r>
-        <w:t xml:space="preserve"> (first </w:t>
-      </w:r>
-      <w:proofErr w:type="spellStart"/>
-      <w:r>
-        <w:t>gps</w:t>
-      </w:r>
-      <w:proofErr w:type="spellEnd"/>
-      <w:r>
-        <w:t xml:space="preserve"> hit)</w:t>
+        <w:t xml:space="preserve"> (first gps hit)</w:t>
       </w:r>
     </w:p>
     <w:p>
@@ -4633,34 +3808,10 @@
         </w:numPr>
       </w:pPr>
       <w:r>
-        <w:t xml:space="preserve">Yep. Even when I don’t crop the accel, the interpolation sends it forward in time from the first </w:t>
-      </w:r>
-      <w:proofErr w:type="spellStart"/>
-      <w:r>
-        <w:t>gps</w:t>
-      </w:r>
-      <w:proofErr w:type="spellEnd"/>
-      <w:r>
-        <w:t xml:space="preserve"> hit. Interesting. </w:t>
-      </w:r>
-      <w:r>
-        <w:t xml:space="preserve">Where the time jumps backwards in the first </w:t>
-      </w:r>
-      <w:proofErr w:type="spellStart"/>
-      <w:r>
-        <w:t>gps</w:t>
-      </w:r>
-      <w:proofErr w:type="spellEnd"/>
-      <w:r>
-        <w:t xml:space="preserve"> hit. </w:t>
-      </w:r>
-      <w:proofErr w:type="gramStart"/>
-      <w:r>
-        <w:t>So</w:t>
-      </w:r>
-      <w:proofErr w:type="gramEnd"/>
-      <w:r>
-        <w:t xml:space="preserve"> what the heck went wrong with the reverse interpolation?</w:t>
+        <w:t xml:space="preserve">Yep. Even when I don’t crop the accel, the interpolation sends it forward in time from the first gps hit. Interesting. </w:t>
+      </w:r>
+      <w:r>
+        <w:t>Where the time jumps backwards in the first gps hit. So what the heck went wrong with the reverse interpolation?</w:t>
       </w:r>
     </w:p>
     <w:p>
@@ -4672,23 +3823,7 @@
         </w:numPr>
       </w:pPr>
       <w:r>
-        <w:t xml:space="preserve">RTC accel (left) and the </w:t>
-      </w:r>
-      <w:proofErr w:type="spellStart"/>
-      <w:r>
-        <w:t>gps</w:t>
-      </w:r>
-      <w:proofErr w:type="spellEnd"/>
-      <w:r>
-        <w:t xml:space="preserve"> times look correct, however the conversion to the </w:t>
-      </w:r>
-      <w:proofErr w:type="spellStart"/>
-      <w:r>
-        <w:t>gps</w:t>
-      </w:r>
-      <w:proofErr w:type="spellEnd"/>
-      <w:r>
-        <w:t xml:space="preserve"> time using interpolation is way out (right) where it jumps several days. </w:t>
+        <w:t xml:space="preserve">RTC accel (left) and the gps times look correct, however the conversion to the gps time using interpolation is way out (right) where it jumps several days. </w:t>
       </w:r>
     </w:p>
     <w:p>
@@ -4805,15 +3940,7 @@
         </w:numPr>
       </w:pPr>
       <w:r>
-        <w:t xml:space="preserve">Changed the way backwards times were </w:t>
-      </w:r>
-      <w:proofErr w:type="gramStart"/>
-      <w:r>
-        <w:t>calculated</w:t>
-      </w:r>
-      <w:proofErr w:type="gramEnd"/>
-      <w:r>
-        <w:t xml:space="preserve"> and it got back into alignment. </w:t>
+        <w:t xml:space="preserve">Changed the way backwards times were calculated and it got back into alignment. </w:t>
       </w:r>
     </w:p>
     <w:p>
@@ -4845,15 +3972,7 @@
         </w:numPr>
       </w:pPr>
       <w:r>
-        <w:t xml:space="preserve">I was meant to run the loop </w:t>
-      </w:r>
-      <w:proofErr w:type="gramStart"/>
-      <w:r>
-        <w:t>overnight</w:t>
-      </w:r>
-      <w:proofErr w:type="gramEnd"/>
-      <w:r>
-        <w:t xml:space="preserve"> but the code failed on the second line… killing myself. </w:t>
+        <w:t xml:space="preserve">I was meant to run the loop overnight but the code failed on the second line… killing myself. </w:t>
       </w:r>
     </w:p>
     <w:p>
@@ -4865,31 +3984,7 @@
         </w:numPr>
       </w:pPr>
       <w:r>
-        <w:t xml:space="preserve">Ah. </w:t>
-      </w:r>
-      <w:proofErr w:type="spellStart"/>
-      <w:r>
-        <w:t>So.</w:t>
-      </w:r>
-      <w:proofErr w:type="spellEnd"/>
-      <w:r>
-        <w:t xml:space="preserve"> The GPS only had 1 reset but the accel had 2 and it cropped the accel too small… </w:t>
-      </w:r>
-      <w:proofErr w:type="spellStart"/>
-      <w:r>
-        <w:t>So.</w:t>
-      </w:r>
-      <w:proofErr w:type="spellEnd"/>
-      <w:r>
-        <w:t xml:space="preserve"> That is an issue. I </w:t>
-      </w:r>
-      <w:proofErr w:type="gramStart"/>
-      <w:r>
-        <w:t>have to</w:t>
-      </w:r>
-      <w:proofErr w:type="gramEnd"/>
-      <w:r>
-        <w:t xml:space="preserve"> change my joining logic.</w:t>
+        <w:t>Ah. So. The GPS only had 1 reset but the accel had 2 and it cropped the accel too small… So. That is an issue. I have to change my joining logic.</w:t>
       </w:r>
     </w:p>
     <w:p>
@@ -4901,23 +3996,7 @@
         </w:numPr>
       </w:pPr>
       <w:r>
-        <w:t xml:space="preserve">Changed the </w:t>
-      </w:r>
-      <w:proofErr w:type="spellStart"/>
-      <w:r>
-        <w:t>gps</w:t>
-      </w:r>
-      <w:proofErr w:type="spellEnd"/>
-      <w:r>
-        <w:t xml:space="preserve"> </w:t>
-      </w:r>
-      <w:proofErr w:type="spellStart"/>
-      <w:r>
-        <w:t>reset_events</w:t>
-      </w:r>
-      <w:proofErr w:type="spellEnd"/>
-      <w:r>
-        <w:t xml:space="preserve"> manually over to the longest accel sampling period number.</w:t>
+        <w:t>Changed the gps reset_events manually over to the longest accel sampling period number.</w:t>
       </w:r>
     </w:p>
     <w:p>
@@ -4952,13 +4031,8 @@
           <w:numId w:val="2"/>
         </w:numPr>
       </w:pPr>
-      <w:proofErr w:type="spellStart"/>
-      <w:r>
-        <w:t>Jk</w:t>
-      </w:r>
-      <w:proofErr w:type="spellEnd"/>
-      <w:r>
-        <w:t>. The next collar ran into a new problem. It never ends with this BS.</w:t>
+      <w:r>
+        <w:t>Jk. The next collar ran into a new problem. It never ends with this BS.</w:t>
       </w:r>
     </w:p>
     <w:p>
@@ -4970,23 +4044,10 @@
         </w:numPr>
       </w:pPr>
       <w:r>
-        <w:t xml:space="preserve">While I can’t (so far) find any errors in Collar_12, the calibration period it extracted does not look like a calibration event… </w:t>
-      </w:r>
-      <w:proofErr w:type="gramStart"/>
-      <w:r>
-        <w:t>However</w:t>
-      </w:r>
-      <w:proofErr w:type="gramEnd"/>
-      <w:r>
-        <w:t xml:space="preserve"> the second calibration event (from after deployment --- does turn out perfectly… And the interpolation seems like it checks out. </w:t>
-      </w:r>
-      <w:proofErr w:type="gramStart"/>
-      <w:r>
-        <w:t>So</w:t>
-      </w:r>
-      <w:proofErr w:type="gramEnd"/>
-      <w:r>
-        <w:t xml:space="preserve"> idk what to think. I might just use the latter calibration</w:t>
+        <w:t xml:space="preserve">While I can’t (so far) find any errors in Collar_12, the calibration period it extracted does not look like a calibration event… However the second calibration event (from after deployment --- does turn out perfectly… And the interpolation seems like it checks out. </w:t>
+      </w:r>
+      <w:r>
+        <w:t>So idk what to think. I might just use the latter calibration</w:t>
       </w:r>
       <w:r>
         <w:t>?</w:t>
@@ -5120,29 +4181,8 @@
           <w:numId w:val="2"/>
         </w:numPr>
       </w:pPr>
-      <w:proofErr w:type="gramStart"/>
-      <w:r>
-        <w:t>So</w:t>
-      </w:r>
-      <w:proofErr w:type="gramEnd"/>
-      <w:r>
-        <w:t xml:space="preserve"> am I meant to remove these files or not? When I leave them in, there’s issues. When I take them out, it works… But they </w:t>
-      </w:r>
-      <w:proofErr w:type="spellStart"/>
-      <w:r>
-        <w:t>seeeeeem</w:t>
-      </w:r>
-      <w:proofErr w:type="spellEnd"/>
-      <w:r>
-        <w:t xml:space="preserve"> like </w:t>
-      </w:r>
-      <w:proofErr w:type="gramStart"/>
-      <w:r>
-        <w:t>they’re</w:t>
-      </w:r>
-      <w:proofErr w:type="gramEnd"/>
-      <w:r>
-        <w:t xml:space="preserve"> correct</w:t>
+      <w:r>
+        <w:t>So am I meant to remove these files or not? When I leave them in, there’s issues. When I take them out, it works… But they seeeeeem like they’re correct</w:t>
       </w:r>
       <w:r>
         <w:t>? Until we understand how they got there, I’m reluctant to do anything</w:t>
@@ -5367,15 +4407,7 @@
         </w:numPr>
       </w:pPr>
       <w:r>
-        <w:t xml:space="preserve">This was the route I </w:t>
-      </w:r>
-      <w:proofErr w:type="gramStart"/>
-      <w:r>
-        <w:t>actually walked</w:t>
-      </w:r>
-      <w:proofErr w:type="gramEnd"/>
-      <w:r>
-        <w:t>:</w:t>
+        <w:t>This was the route I actually walked:</w:t>
       </w:r>
     </w:p>
     <w:p>
@@ -5551,23 +4583,7 @@
         </w:numPr>
       </w:pPr>
       <w:r>
-        <w:t>“</w:t>
-      </w:r>
-      <w:proofErr w:type="gramStart"/>
-      <w:r>
-        <w:t>good</w:t>
-      </w:r>
-      <w:proofErr w:type="gramEnd"/>
-      <w:r>
-        <w:t xml:space="preserve"> mag </w:t>
-      </w:r>
-      <w:proofErr w:type="spellStart"/>
-      <w:r>
-        <w:t>cal</w:t>
-      </w:r>
-      <w:proofErr w:type="spellEnd"/>
-      <w:r>
-        <w:t xml:space="preserve"> (ensure not wearing watches /have phones/any magnetic interfering stuff on person etc. nearby when doing this)”</w:t>
+        <w:t>“good mag cal (ensure not wearing watches /have phones/any magnetic interfering stuff on person etc. nearby when doing this)”</w:t>
       </w:r>
     </w:p>
     <w:p>
@@ -5579,23 +4595,7 @@
         </w:numPr>
       </w:pPr>
       <w:r>
-        <w:t xml:space="preserve">“In terms of movement bouts, the simple approach would be to use some sort of acceleration magnitude threshold (e.g. </w:t>
-      </w:r>
-      <w:proofErr w:type="spellStart"/>
-      <w:r>
-        <w:t>VeDBA</w:t>
-      </w:r>
-      <w:proofErr w:type="spellEnd"/>
-      <w:r>
-        <w:t xml:space="preserve">)... but for example, something like a kangaroo should be very obvious with jumping behaviour that should come out in acceleration traces as clear stylised patterns which could be manually discerned or via machine learning if you were able to do some </w:t>
-      </w:r>
-      <w:proofErr w:type="spellStart"/>
-      <w:r>
-        <w:t>groundtruthing</w:t>
-      </w:r>
-      <w:proofErr w:type="spellEnd"/>
-      <w:r>
-        <w:t xml:space="preserve"> of behaviours during the data acquisition period.” </w:t>
+        <w:t xml:space="preserve">“In terms of movement bouts, the simple approach would be to use some sort of acceleration magnitude threshold (e.g. VeDBA)... but for example, something like a kangaroo should be very obvious with jumping behaviour that should come out in acceleration traces as clear stylised patterns which could be manually discerned or via machine learning if you were able to do some groundtruthing of behaviours during the data acquisition period.” </w:t>
       </w:r>
       <w:r>
         <w:sym w:font="Wingdings" w:char="F0E0"/>
@@ -5625,29 +4625,13 @@
         </w:numPr>
       </w:pPr>
       <w:r>
-        <w:t xml:space="preserve">“When the penguin is walking, the tag will be nearly vertical, while during swimming, it will be more horizontal. In both cases, the tag’s coordinate frame relative to the penguin’s natural movement (and the ground or water surface) will be different. To ensure accurate heading calculations, I would need to define different tag coordinate systems for walking and swimming and compute the heading separately for each period—on land and at sea—otherwise, my dead-reckoned (DR) tracks could be very </w:t>
-      </w:r>
-      <w:proofErr w:type="spellStart"/>
-      <w:r>
-        <w:t>innacurate</w:t>
-      </w:r>
-      <w:proofErr w:type="spellEnd"/>
-      <w:r>
-        <w:t xml:space="preserve">.” </w:t>
+        <w:t xml:space="preserve">“When the penguin is walking, the tag will be nearly vertical, while during swimming, it will be more horizontal. In both cases, the tag’s coordinate frame relative to the penguin’s natural movement (and the ground or water surface) will be different. To ensure accurate heading calculations, I would need to define different tag coordinate systems for walking and swimming and compute the heading separately for each period—on land and at sea—otherwise, my dead-reckoned (DR) tracks could be very innacurate.” </w:t>
       </w:r>
       <w:r>
         <w:sym w:font="Wingdings" w:char="F0E0"/>
       </w:r>
       <w:r>
-        <w:t xml:space="preserve"> no WONDER my flippy </w:t>
-      </w:r>
-      <w:proofErr w:type="spellStart"/>
-      <w:r>
-        <w:t>flippy</w:t>
-      </w:r>
-      <w:proofErr w:type="spellEnd"/>
-      <w:r>
-        <w:t xml:space="preserve"> stuff doesn’t work.</w:t>
+        <w:t xml:space="preserve"> no WONDER my flippy flippy stuff doesn’t work.</w:t>
       </w:r>
     </w:p>
     <w:p>
@@ -5659,15 +4643,7 @@
         </w:numPr>
       </w:pPr>
       <w:r>
-        <w:t xml:space="preserve">“If you know there’s a specific yaw offset in the tag placement, you can specify it in the compass function. If you’re unsure, you could compare the heading correction factors from </w:t>
-      </w:r>
-      <w:proofErr w:type="spellStart"/>
-      <w:r>
-        <w:t>Gundog.Tracks</w:t>
-      </w:r>
-      <w:proofErr w:type="spellEnd"/>
-      <w:r>
-        <w:t>. If the headings are consistently biased in one direction, it could indicate a tag yaw offset or the need for magnetic declination adjustment. But again, if the tag’s yaw offset is minor and consistent, it’s not essential to correct this, as the dead-reckoned track will be consistently biased (in theory, the patterns and scales of tortuosity between GPS points should remain the same, just directionally offset somewhat), and the track segments get rotated when corrected with their endpoint GPS fixes during the correction process anyway.”</w:t>
+        <w:t>“If you know there’s a specific yaw offset in the tag placement, you can specify it in the compass function. If you’re unsure, you could compare the heading correction factors from Gundog.Tracks. If the headings are consistently biased in one direction, it could indicate a tag yaw offset or the need for magnetic declination adjustment. But again, if the tag’s yaw offset is minor and consistent, it’s not essential to correct this, as the dead-reckoned track will be consistently biased (in theory, the patterns and scales of tortuosity between GPS points should remain the same, just directionally offset somewhat), and the track segments get rotated when corrected with their endpoint GPS fixes during the correction process anyway.”</w:t>
       </w:r>
     </w:p>
     <w:p>
@@ -5679,35 +4655,7 @@
         </w:numPr>
       </w:pPr>
       <w:r>
-        <w:t xml:space="preserve">“What I suggest is to first run the compass function without any offsets applied to derive the pitch and roll angles. Then, determine the mean values of both during periods where you believe the animal and collar are in a normal position, such as during low-activity, steady-state </w:t>
-      </w:r>
-      <w:proofErr w:type="spellStart"/>
-      <w:r>
-        <w:t>behavior</w:t>
-      </w:r>
-      <w:proofErr w:type="spellEnd"/>
-      <w:r>
-        <w:t>. Once you have these values, re-run the function and input them as the '</w:t>
-      </w:r>
-      <w:proofErr w:type="spellStart"/>
-      <w:proofErr w:type="gramStart"/>
-      <w:r>
-        <w:t>pitch.offset</w:t>
-      </w:r>
-      <w:proofErr w:type="spellEnd"/>
-      <w:proofErr w:type="gramEnd"/>
-      <w:r>
-        <w:t>' and '</w:t>
-      </w:r>
-      <w:proofErr w:type="spellStart"/>
-      <w:proofErr w:type="gramStart"/>
-      <w:r>
-        <w:t>roll.offset</w:t>
-      </w:r>
-      <w:proofErr w:type="spellEnd"/>
-      <w:proofErr w:type="gramEnd"/>
-      <w:r>
-        <w:t>' parameters.”</w:t>
+        <w:t>“What I suggest is to first run the compass function without any offsets applied to derive the pitch and roll angles. Then, determine the mean values of both during periods where you believe the animal and collar are in a normal position, such as during low-activity, steady-state behavior. Once you have these values, re-run the function and input them as the 'pitch.offset' and 'roll.offset' parameters.”</w:t>
       </w:r>
     </w:p>
     <w:p>
@@ -5719,23 +4667,7 @@
         </w:numPr>
       </w:pPr>
       <w:r>
-        <w:t>“</w:t>
-      </w:r>
-      <w:proofErr w:type="gramStart"/>
-      <w:r>
-        <w:t>if</w:t>
-      </w:r>
-      <w:proofErr w:type="gramEnd"/>
-      <w:r>
-        <w:t xml:space="preserve"> you supply a positive pitch offset value of 45°, this reflects that the device is pitched up by 45° from the level, and the function will de-rotate the supplied (smoothed) </w:t>
-      </w:r>
-      <w:proofErr w:type="spellStart"/>
-      <w:r>
-        <w:t>acc</w:t>
-      </w:r>
-      <w:proofErr w:type="spellEnd"/>
-      <w:r>
-        <w:t xml:space="preserve"> and mag (normalised) values by this amount. Similarly, a positive roll value indicates a rightward tilt (bank angle), and a positive yaw value represents a clockwise rotational offset”</w:t>
+        <w:t>“if you supply a positive pitch offset value of 45°, this reflects that the device is pitched up by 45° from the level, and the function will de-rotate the supplied (smoothed) acc and mag (normalised) values by this amount. Similarly, a positive roll value indicates a rightward tilt (bank angle), and a positive yaw value represents a clockwise rotational offset”</w:t>
       </w:r>
     </w:p>
     <w:p>
@@ -5777,103 +4709,7 @@
         </w:numPr>
       </w:pPr>
       <w:r>
-        <w:t xml:space="preserve">“The short answer is, yes - if a wrong ref frame was chosen then DR path </w:t>
-      </w:r>
-      <w:proofErr w:type="spellStart"/>
-      <w:r>
-        <w:t>wil</w:t>
-      </w:r>
-      <w:proofErr w:type="spellEnd"/>
-      <w:r>
-        <w:t xml:space="preserve"> be </w:t>
-      </w:r>
-      <w:proofErr w:type="spellStart"/>
-      <w:r>
-        <w:t>innacurate</w:t>
-      </w:r>
-      <w:proofErr w:type="spellEnd"/>
-      <w:r>
-        <w:t xml:space="preserve">. But comparing subsets with GPS pre-correction will help debug if chosen orientation was correct. The patterns and directions of travel should be similar even if scale is not when compared to GPS. I had some lions where I had to 'figure' out the orientation post release. But visually it should be easy to decipher the heave axis of </w:t>
-      </w:r>
-      <w:proofErr w:type="spellStart"/>
-      <w:r>
-        <w:t>movmement</w:t>
-      </w:r>
-      <w:proofErr w:type="spellEnd"/>
-      <w:r>
-        <w:t xml:space="preserve"> in </w:t>
-      </w:r>
-      <w:proofErr w:type="spellStart"/>
-      <w:r>
-        <w:t>acc</w:t>
-      </w:r>
-      <w:proofErr w:type="spellEnd"/>
-      <w:r>
-        <w:t xml:space="preserve"> and mag (</w:t>
-      </w:r>
-      <w:proofErr w:type="spellStart"/>
-      <w:r>
-        <w:t>acc</w:t>
-      </w:r>
-      <w:proofErr w:type="spellEnd"/>
-      <w:r>
-        <w:t xml:space="preserve"> will be the one closest to +/-1 g most of the time, and mag will the one changing the </w:t>
-      </w:r>
-      <w:proofErr w:type="gramStart"/>
-      <w:r>
-        <w:t>least)...</w:t>
-      </w:r>
-      <w:proofErr w:type="gramEnd"/>
-      <w:r>
-        <w:t xml:space="preserve"> In terms of deciphering the </w:t>
-      </w:r>
-      <w:proofErr w:type="spellStart"/>
-      <w:r>
-        <w:t>acc</w:t>
-      </w:r>
-      <w:proofErr w:type="spellEnd"/>
-      <w:r>
-        <w:t xml:space="preserve">/mag surge and sway dimensions, this may be more challenging. But for the </w:t>
-      </w:r>
-      <w:proofErr w:type="spellStart"/>
-      <w:r>
-        <w:t>acc</w:t>
-      </w:r>
-      <w:proofErr w:type="spellEnd"/>
-      <w:r>
-        <w:t xml:space="preserve">, you would expect greater variation in surge dimension because they stick their head to ground to forage and then stick their head back up when travelling and </w:t>
-      </w:r>
-      <w:proofErr w:type="spellStart"/>
-      <w:r>
-        <w:t>vigalence</w:t>
-      </w:r>
-      <w:proofErr w:type="spellEnd"/>
-      <w:r>
-        <w:t xml:space="preserve">, so that may help. If mag is different orientation set up to </w:t>
-      </w:r>
-      <w:proofErr w:type="spellStart"/>
-      <w:r>
-        <w:t>acc</w:t>
-      </w:r>
-      <w:proofErr w:type="spellEnd"/>
-      <w:r>
-        <w:t xml:space="preserve">, then </w:t>
-      </w:r>
-      <w:proofErr w:type="spellStart"/>
-      <w:r>
-        <w:t>its</w:t>
-      </w:r>
-      <w:proofErr w:type="spellEnd"/>
-      <w:r>
-        <w:t xml:space="preserve"> worth just checking if you switch the surge/sway orientations then which one produces most </w:t>
-      </w:r>
-      <w:proofErr w:type="spellStart"/>
-      <w:r>
-        <w:t>realsitic</w:t>
-      </w:r>
-      <w:proofErr w:type="spellEnd"/>
-      <w:r>
-        <w:t xml:space="preserve"> DR track relative to GPS... by deciphering the heave axis and dimension of measured g, you already have homed in on just a few possible orientations it could be...”</w:t>
+        <w:t>“The short answer is, yes - if a wrong ref frame was chosen then DR path wil be innacurate. But comparing subsets with GPS pre-correction will help debug if chosen orientation was correct. The patterns and directions of travel should be similar even if scale is not when compared to GPS. I had some lions where I had to 'figure' out the orientation post release. But visually it should be easy to decipher the heave axis of movmement in acc and mag (acc will be the one closest to +/-1 g most of the time, and mag will the one changing the least)... In terms of deciphering the acc/mag surge and sway dimensions, this may be more challenging. But for the acc, you would expect greater variation in surge dimension because they stick their head to ground to forage and then stick their head back up when travelling and vigalence, so that may help. If mag is different orientation set up to acc, then its worth just checking if you switch the surge/sway orientations then which one produces most realsitic DR track relative to GPS... by deciphering the heave axis and dimension of measured g, you already have homed in on just a few possible orientations it could be...”</w:t>
       </w:r>
     </w:p>
     <w:p>
@@ -5935,16 +4771,8 @@
           <w:rPr>
             <w:rStyle w:val="Hyperlink"/>
           </w:rPr>
-          <w:t xml:space="preserve">Dead-reckoning animal movements in R: a reappraisal using </w:t>
+          <w:t>Dead-reckoning animal movements in R: a reappraisal using Gundog.Tracks</w:t>
         </w:r>
-        <w:proofErr w:type="spellStart"/>
-        <w:r>
-          <w:rPr>
-            <w:rStyle w:val="Hyperlink"/>
-          </w:rPr>
-          <w:t>Gundog.Tracks</w:t>
-        </w:r>
-        <w:proofErr w:type="spellEnd"/>
       </w:hyperlink>
       <w:r>
         <w:t xml:space="preserve"> </w:t>
@@ -6005,28 +4833,36 @@
           <w:rFonts w:ascii="Cambria Math" w:hAnsi="Cambria Math"/>
         </w:rPr>
       </w:pPr>
-      <w:proofErr w:type="spellStart"/>
       <w:r>
         <w:rPr>
           <w:rFonts w:ascii="Cambria Math" w:hAnsi="Cambria Math"/>
         </w:rPr>
-        <w:t>Gundog.Tracks</w:t>
-      </w:r>
-      <w:proofErr w:type="spellEnd"/>
+        <w:t>Gundog.Tracks(TS, h, v, elv</w:t>
+      </w:r>
+      <w:r>
+        <w:rPr>
+          <w:rFonts w:ascii="Cambria Math" w:hAnsi="Cambria Math" w:cs="Arial"/>
+        </w:rPr>
+        <w:t> </w:t>
+      </w:r>
       <w:r>
         <w:rPr>
           <w:rFonts w:ascii="Cambria Math" w:hAnsi="Cambria Math"/>
         </w:rPr>
-        <w:t xml:space="preserve">(TS, h, v, </w:t>
-      </w:r>
-      <w:proofErr w:type="spellStart"/>
+        <w:t>=</w:t>
+      </w:r>
+      <w:r>
+        <w:rPr>
+          <w:rFonts w:ascii="Cambria Math" w:hAnsi="Cambria Math" w:cs="Arial"/>
+        </w:rPr>
+        <w:t> </w:t>
+      </w:r>
       <w:r>
         <w:rPr>
           <w:rFonts w:ascii="Cambria Math" w:hAnsi="Cambria Math"/>
         </w:rPr>
-        <w:t>elv</w:t>
-      </w:r>
-      <w:proofErr w:type="spellEnd"/>
+        <w:t>0, p</w:t>
+      </w:r>
       <w:r>
         <w:rPr>
           <w:rFonts w:ascii="Cambria Math" w:hAnsi="Cambria Math" w:cs="Arial"/>
@@ -6049,7 +4885,7 @@
         <w:rPr>
           <w:rFonts w:ascii="Cambria Math" w:hAnsi="Cambria Math"/>
         </w:rPr>
-        <w:t>0, p</w:t>
+        <w:t>NULL, cs</w:t>
       </w:r>
       <w:r>
         <w:rPr>
@@ -6073,7 +4909,7 @@
         <w:rPr>
           <w:rFonts w:ascii="Cambria Math" w:hAnsi="Cambria Math"/>
         </w:rPr>
-        <w:t>NULL, cs</w:t>
+        <w:t>NULL, ch</w:t>
       </w:r>
       <w:r>
         <w:rPr>
@@ -6097,16 +4933,20 @@
         <w:rPr>
           <w:rFonts w:ascii="Cambria Math" w:hAnsi="Cambria Math"/>
         </w:rPr>
-        <w:t xml:space="preserve">NULL, </w:t>
-      </w:r>
-      <w:proofErr w:type="spellStart"/>
+        <w:t>NULL, m</w:t>
+      </w:r>
+      <w:r>
+        <w:rPr>
+          <w:rFonts w:ascii="Cambria Math" w:hAnsi="Cambria Math" w:cs="Arial"/>
+        </w:rPr>
+        <w:t> </w:t>
+      </w:r>
       <w:r>
         <w:rPr>
           <w:rFonts w:ascii="Cambria Math" w:hAnsi="Cambria Math"/>
         </w:rPr>
-        <w:t>ch</w:t>
-      </w:r>
-      <w:proofErr w:type="spellEnd"/>
+        <w:t>=</w:t>
+      </w:r>
       <w:r>
         <w:rPr>
           <w:rFonts w:ascii="Cambria Math" w:hAnsi="Cambria Math" w:cs="Arial"/>
@@ -6117,6 +4957,18 @@
         <w:rPr>
           <w:rFonts w:ascii="Cambria Math" w:hAnsi="Cambria Math"/>
         </w:rPr>
+        <w:t>1, c</w:t>
+      </w:r>
+      <w:r>
+        <w:rPr>
+          <w:rFonts w:ascii="Cambria Math" w:hAnsi="Cambria Math" w:cs="Arial"/>
+        </w:rPr>
+        <w:t> </w:t>
+      </w:r>
+      <w:r>
+        <w:rPr>
+          <w:rFonts w:ascii="Cambria Math" w:hAnsi="Cambria Math"/>
+        </w:rPr>
         <w:t>=</w:t>
       </w:r>
       <w:r>
@@ -6129,7 +4981,7 @@
         <w:rPr>
           <w:rFonts w:ascii="Cambria Math" w:hAnsi="Cambria Math"/>
         </w:rPr>
-        <w:t>NULL, m</w:t>
+        <w:t>0, ME</w:t>
       </w:r>
       <w:r>
         <w:rPr>
@@ -6153,7 +5005,7 @@
         <w:rPr>
           <w:rFonts w:ascii="Cambria Math" w:hAnsi="Cambria Math"/>
         </w:rPr>
-        <w:t>1, c</w:t>
+        <w:t>1, lo</w:t>
       </w:r>
       <w:r>
         <w:rPr>
@@ -6177,7 +5029,7 @@
         <w:rPr>
           <w:rFonts w:ascii="Cambria Math" w:hAnsi="Cambria Math"/>
         </w:rPr>
-        <w:t>0, ME</w:t>
+        <w:t>0, la</w:t>
       </w:r>
       <w:r>
         <w:rPr>
@@ -6201,7 +5053,7 @@
         <w:rPr>
           <w:rFonts w:ascii="Cambria Math" w:hAnsi="Cambria Math"/>
         </w:rPr>
-        <w:t>1, lo</w:t>
+        <w:t>0, VP.lon</w:t>
       </w:r>
       <w:r>
         <w:rPr>
@@ -6225,7 +5077,7 @@
         <w:rPr>
           <w:rFonts w:ascii="Cambria Math" w:hAnsi="Cambria Math"/>
         </w:rPr>
-        <w:t>0, la</w:t>
+        <w:t>NULL, VP.lat</w:t>
       </w:r>
       <w:r>
         <w:rPr>
@@ -6249,16 +5101,20 @@
         <w:rPr>
           <w:rFonts w:ascii="Cambria Math" w:hAnsi="Cambria Math"/>
         </w:rPr>
-        <w:t xml:space="preserve">0, </w:t>
-      </w:r>
-      <w:proofErr w:type="spellStart"/>
+        <w:t>NULL, VP.ME</w:t>
+      </w:r>
+      <w:r>
+        <w:rPr>
+          <w:rFonts w:ascii="Cambria Math" w:hAnsi="Cambria Math" w:cs="Arial"/>
+        </w:rPr>
+        <w:t> </w:t>
+      </w:r>
       <w:r>
         <w:rPr>
           <w:rFonts w:ascii="Cambria Math" w:hAnsi="Cambria Math"/>
         </w:rPr>
-        <w:t>VP.lon</w:t>
-      </w:r>
-      <w:proofErr w:type="spellEnd"/>
+        <w:t>=</w:t>
+      </w:r>
       <w:r>
         <w:rPr>
           <w:rFonts w:ascii="Cambria Math" w:hAnsi="Cambria Math" w:cs="Arial"/>
@@ -6269,6 +5125,18 @@
         <w:rPr>
           <w:rFonts w:ascii="Cambria Math" w:hAnsi="Cambria Math"/>
         </w:rPr>
+        <w:t>FALSE, method</w:t>
+      </w:r>
+      <w:r>
+        <w:rPr>
+          <w:rFonts w:ascii="Cambria Math" w:hAnsi="Cambria Math" w:cs="Arial"/>
+        </w:rPr>
+        <w:t> </w:t>
+      </w:r>
+      <w:r>
+        <w:rPr>
+          <w:rFonts w:ascii="Cambria Math" w:hAnsi="Cambria Math"/>
+        </w:rPr>
         <w:t>=</w:t>
       </w:r>
       <w:r>
@@ -6281,16 +5149,20 @@
         <w:rPr>
           <w:rFonts w:ascii="Cambria Math" w:hAnsi="Cambria Math"/>
         </w:rPr>
-        <w:t xml:space="preserve">NULL, </w:t>
-      </w:r>
-      <w:proofErr w:type="spellStart"/>
+        <w:t>NULL, thresh</w:t>
+      </w:r>
+      <w:r>
+        <w:rPr>
+          <w:rFonts w:ascii="Cambria Math" w:hAnsi="Cambria Math" w:cs="Arial"/>
+        </w:rPr>
+        <w:t> </w:t>
+      </w:r>
       <w:r>
         <w:rPr>
           <w:rFonts w:ascii="Cambria Math" w:hAnsi="Cambria Math"/>
         </w:rPr>
-        <w:t>VP.lat</w:t>
-      </w:r>
-      <w:proofErr w:type="spellEnd"/>
+        <w:t>=</w:t>
+      </w:r>
       <w:r>
         <w:rPr>
           <w:rFonts w:ascii="Cambria Math" w:hAnsi="Cambria Math" w:cs="Arial"/>
@@ -6301,100 +5173,8 @@
         <w:rPr>
           <w:rFonts w:ascii="Cambria Math" w:hAnsi="Cambria Math"/>
         </w:rPr>
-        <w:t>=</w:t>
-      </w:r>
-      <w:r>
-        <w:rPr>
-          <w:rFonts w:ascii="Cambria Math" w:hAnsi="Cambria Math" w:cs="Arial"/>
-        </w:rPr>
-        <w:t> </w:t>
-      </w:r>
-      <w:r>
-        <w:rPr>
-          <w:rFonts w:ascii="Cambria Math" w:hAnsi="Cambria Math"/>
-        </w:rPr>
-        <w:t>NULL, VP.ME</w:t>
-      </w:r>
-      <w:r>
-        <w:rPr>
-          <w:rFonts w:ascii="Cambria Math" w:hAnsi="Cambria Math" w:cs="Arial"/>
-        </w:rPr>
-        <w:t> </w:t>
-      </w:r>
-      <w:r>
-        <w:rPr>
-          <w:rFonts w:ascii="Cambria Math" w:hAnsi="Cambria Math"/>
-        </w:rPr>
-        <w:t>=</w:t>
-      </w:r>
-      <w:r>
-        <w:rPr>
-          <w:rFonts w:ascii="Cambria Math" w:hAnsi="Cambria Math" w:cs="Arial"/>
-        </w:rPr>
-        <w:t> </w:t>
-      </w:r>
-      <w:r>
-        <w:rPr>
-          <w:rFonts w:ascii="Cambria Math" w:hAnsi="Cambria Math"/>
-        </w:rPr>
-        <w:t>FALSE, method</w:t>
-      </w:r>
-      <w:r>
-        <w:rPr>
-          <w:rFonts w:ascii="Cambria Math" w:hAnsi="Cambria Math" w:cs="Arial"/>
-        </w:rPr>
-        <w:t> </w:t>
-      </w:r>
-      <w:r>
-        <w:rPr>
-          <w:rFonts w:ascii="Cambria Math" w:hAnsi="Cambria Math"/>
-        </w:rPr>
-        <w:t>=</w:t>
-      </w:r>
-      <w:r>
-        <w:rPr>
-          <w:rFonts w:ascii="Cambria Math" w:hAnsi="Cambria Math" w:cs="Arial"/>
-        </w:rPr>
-        <w:t> </w:t>
-      </w:r>
-      <w:r>
-        <w:rPr>
-          <w:rFonts w:ascii="Cambria Math" w:hAnsi="Cambria Math"/>
-        </w:rPr>
-        <w:t>NULL, thresh</w:t>
-      </w:r>
-      <w:r>
-        <w:rPr>
-          <w:rFonts w:ascii="Cambria Math" w:hAnsi="Cambria Math" w:cs="Arial"/>
-        </w:rPr>
-        <w:t> </w:t>
-      </w:r>
-      <w:r>
-        <w:rPr>
-          <w:rFonts w:ascii="Cambria Math" w:hAnsi="Cambria Math"/>
-        </w:rPr>
-        <w:t>=</w:t>
-      </w:r>
-      <w:r>
-        <w:rPr>
-          <w:rFonts w:ascii="Cambria Math" w:hAnsi="Cambria Math" w:cs="Arial"/>
-        </w:rPr>
-        <w:t> </w:t>
-      </w:r>
-      <w:r>
-        <w:rPr>
-          <w:rFonts w:ascii="Cambria Math" w:hAnsi="Cambria Math"/>
-        </w:rPr>
-        <w:t xml:space="preserve">1, </w:t>
-      </w:r>
-      <w:proofErr w:type="spellStart"/>
-      <w:r>
-        <w:rPr>
-          <w:rFonts w:ascii="Cambria Math" w:hAnsi="Cambria Math"/>
-        </w:rPr>
-        <w:t>dist.step</w:t>
-      </w:r>
-      <w:proofErr w:type="spellEnd"/>
+        <w:t>1, dist.step</w:t>
+      </w:r>
       <w:r>
         <w:rPr>
           <w:rFonts w:ascii="Cambria Math" w:hAnsi="Cambria Math" w:cs="Arial"/>
@@ -6534,15 +5314,7 @@
         <w:ind w:left="2520"/>
       </w:pPr>
       <w:r>
-        <w:t xml:space="preserve">The user may also opt to supply a ‘marked events’ (ME) vector (a marked event is a term we use that refers to </w:t>
-      </w:r>
-      <w:proofErr w:type="gramStart"/>
-      <w:r>
-        <w:t>a number of</w:t>
-      </w:r>
-      <w:proofErr w:type="gramEnd"/>
-      <w:r>
-        <w:t xml:space="preserve"> sequential (in time) data points within a </w:t>
+        <w:t xml:space="preserve">The user may also opt to supply a ‘marked events’ (ME) vector (a marked event is a term we use that refers to a number of sequential (in time) data points within a </w:t>
       </w:r>
       <w:r>
         <w:lastRenderedPageBreak/>
@@ -6590,15 +5362,7 @@
         <w:sym w:font="Wingdings" w:char="F0E0"/>
       </w:r>
       <w:r>
-        <w:t xml:space="preserve"> okay, </w:t>
-      </w:r>
-      <w:proofErr w:type="spellStart"/>
-      <w:r>
-        <w:t>nevermind</w:t>
-      </w:r>
-      <w:proofErr w:type="spellEnd"/>
-      <w:r>
-        <w:t>, we aren’t high frequency enough for this to matter</w:t>
+        <w:t xml:space="preserve"> okay, nevermind, we aren’t high frequency enough for this to matter</w:t>
       </w:r>
     </w:p>
     <w:p>
@@ -6637,15 +5401,7 @@
         <w:ind w:left="1080"/>
       </w:pPr>
       <w:r>
-        <w:t xml:space="preserve">Within </w:t>
-      </w:r>
-      <w:proofErr w:type="spellStart"/>
-      <w:r>
-        <w:t>Gundog.Tracks</w:t>
-      </w:r>
-      <w:proofErr w:type="spellEnd"/>
-      <w:r>
-        <w:t>, the user can modulate m, c and ME values to switch between predetermined speed (m</w:t>
+        <w:t>Within Gundog.Tracks, the user can modulate m, c and ME values to switch between predetermined speed (m</w:t>
       </w:r>
       <w:r>
         <w:rPr>
@@ -6751,15 +5507,7 @@
         <w:ind w:left="1080"/>
       </w:pPr>
       <w:r>
-        <w:t xml:space="preserve">Here an </w:t>
-      </w:r>
-      <w:proofErr w:type="spellStart"/>
-      <w:r>
-        <w:t>an</w:t>
-      </w:r>
-      <w:proofErr w:type="spellEnd"/>
-      <w:r>
-        <w:t xml:space="preserve"> example from his data that shows the expected error… if he’s using it in the paper then it must be considered good:</w:t>
+        <w:t>Here an an example from his data that shows the expected error… if he’s using it in the paper then it must be considered good:</w:t>
       </w:r>
     </w:p>
     <w:p>
@@ -6941,21 +5689,7 @@
         <w:rPr>
           <w:highlight w:val="yellow"/>
         </w:rPr>
-        <w:t xml:space="preserve">Should I be </w:t>
-      </w:r>
-      <w:proofErr w:type="spellStart"/>
-      <w:r>
-        <w:rPr>
-          <w:highlight w:val="yellow"/>
-        </w:rPr>
-        <w:t>downsampling</w:t>
-      </w:r>
-      <w:proofErr w:type="spellEnd"/>
-      <w:r>
-        <w:rPr>
-          <w:highlight w:val="yellow"/>
-        </w:rPr>
-        <w:t xml:space="preserve"> my accelerometer? Have I missed that?</w:t>
+        <w:t>Should I be downsampling my accelerometer? Have I missed that?</w:t>
       </w:r>
     </w:p>
     <w:p>
@@ -7073,15 +5807,7 @@
         <w:ind w:left="1080"/>
       </w:pPr>
       <w:r>
-        <w:t xml:space="preserve">We recommend implementing a running mean (cf. Eq. 1, R1:4) to raw </w:t>
-      </w:r>
-      <w:proofErr w:type="spellStart"/>
-      <w:r>
-        <w:t>VeDBA</w:t>
-      </w:r>
-      <w:proofErr w:type="spellEnd"/>
-      <w:r>
-        <w:t xml:space="preserve"> values to ensure that both acceleration and deceleration components of a stride cycle are incorporated together per unit time and to reduce the magnitude of small temporal spikes</w:t>
+        <w:t>We recommend implementing a running mean (cf. Eq. 1, R1:4) to raw VeDBA values to ensure that both acceleration and deceleration components of a stride cycle are incorporated together per unit time and to reduce the magnitude of small temporal spikes</w:t>
       </w:r>
     </w:p>
     <w:p>
@@ -7249,15 +5975,7 @@
         </w:numPr>
       </w:pPr>
       <w:r>
-        <w:t xml:space="preserve">For example, day 3 of the impala data GPS was below… surely this is starring at least a bit? I have no reason to think these are super high </w:t>
-      </w:r>
-      <w:proofErr w:type="gramStart"/>
-      <w:r>
-        <w:t>precision actually</w:t>
-      </w:r>
-      <w:proofErr w:type="gramEnd"/>
-      <w:r>
-        <w:t xml:space="preserve">. </w:t>
+        <w:t xml:space="preserve">For example, day 3 of the impala data GPS was below… surely this is starring at least a bit? I have no reason to think these are super high precision actually. </w:t>
       </w:r>
       <w:r>
         <w:t>I should smooth these as per usual.</w:t>
@@ -7330,15 +6048,7 @@
         <w:t>More importantly, I need to figure out the orientation.</w:t>
       </w:r>
       <w:r>
-        <w:t xml:space="preserve"> </w:t>
-      </w:r>
-      <w:proofErr w:type="gramStart"/>
-      <w:r>
-        <w:t>So</w:t>
-      </w:r>
-      <w:proofErr w:type="gramEnd"/>
-      <w:r>
-        <w:t xml:space="preserve"> from Gunner’s paper, the z axis should be +1 when the device is completely flat. I need to figure out what it is for us…</w:t>
+        <w:t xml:space="preserve"> So from Gunner’s paper, the z axis should be +1 when the device is completely flat. I need to figure out what it is for us…</w:t>
       </w:r>
     </w:p>
     <w:p>
@@ -7365,15 +6075,7 @@
         <w:t>JUST REALISED I can use the data that Amelia already annotated rather than searching through!</w:t>
       </w:r>
       <w:r>
-        <w:t xml:space="preserve"> </w:t>
-      </w:r>
-      <w:proofErr w:type="gramStart"/>
-      <w:r>
-        <w:t>So</w:t>
-      </w:r>
-      <w:proofErr w:type="gramEnd"/>
-      <w:r>
-        <w:t xml:space="preserve"> in the walking data (left) and vigilance data (right) from Collar 8</w:t>
+        <w:t xml:space="preserve"> So in the walking data (left) and vigilance data (right) from Collar 8</w:t>
       </w:r>
       <w:r>
         <w:t>!</w:t>
@@ -7473,13 +6175,8 @@
           </w:tcPr>
           <w:p>
             <w:r>
-              <w:t xml:space="preserve">X </w:t>
+              <w:t>X acc</w:t>
             </w:r>
-            <w:proofErr w:type="spellStart"/>
-            <w:r>
-              <w:t>acc</w:t>
-            </w:r>
-            <w:proofErr w:type="spellEnd"/>
           </w:p>
         </w:tc>
         <w:tc>
@@ -7523,13 +6220,8 @@
           </w:tcPr>
           <w:p>
             <w:r>
-              <w:t xml:space="preserve">Y </w:t>
+              <w:t>Y acc</w:t>
             </w:r>
-            <w:proofErr w:type="spellStart"/>
-            <w:r>
-              <w:t>acc</w:t>
-            </w:r>
-            <w:proofErr w:type="spellEnd"/>
           </w:p>
         </w:tc>
         <w:tc>
@@ -7573,13 +6265,8 @@
           </w:tcPr>
           <w:p>
             <w:r>
-              <w:t xml:space="preserve">Z </w:t>
+              <w:t>Z acc</w:t>
             </w:r>
-            <w:proofErr w:type="spellStart"/>
-            <w:r>
-              <w:t>acc</w:t>
-            </w:r>
-            <w:proofErr w:type="spellEnd"/>
           </w:p>
         </w:tc>
         <w:tc>
@@ -7747,15 +6434,7 @@
         </w:numPr>
       </w:pPr>
       <w:r>
-        <w:t>I then tried to verify this by looking at the accelerometer data when the animal was standing up (ground-</w:t>
-      </w:r>
-      <w:proofErr w:type="spellStart"/>
-      <w:r>
-        <w:t>truthed</w:t>
-      </w:r>
-      <w:proofErr w:type="spellEnd"/>
-      <w:r>
-        <w:t xml:space="preserve"> with video). Red is X, Blue is Y, Green is Z. When the animal is standing up, the X axis has close to 0 gravity. The gravity is shared over the Y and Z, with the most on the Z. This indicates that the collar is tipped forwards. </w:t>
+        <w:t xml:space="preserve">I then tried to verify this by looking at the accelerometer data when the animal was standing up (ground-truthed with video). Red is X, Blue is Y, Green is Z. When the animal is standing up, the X axis has close to 0 gravity. The gravity is shared over the Y and Z, with the most on the Z. This indicates that the collar is tipped forwards. </w:t>
       </w:r>
     </w:p>
     <w:p>
@@ -7914,15 +6593,7 @@
         </w:numPr>
       </w:pPr>
       <w:r>
-        <w:t xml:space="preserve">Therefore, I propose the orientation is: </w:t>
-      </w:r>
-      <w:proofErr w:type="spellStart"/>
-      <w:r>
-        <w:t>acc</w:t>
-      </w:r>
-      <w:proofErr w:type="spellEnd"/>
-      <w:r>
-        <w:t xml:space="preserve"> EUS, mag EDN, gravity down, and a pitch forward of about 48 degrees…</w:t>
+        <w:t>Therefore, I propose the orientation is: acc EUS, mag EDN, gravity down, and a pitch forward of about 48 degrees…</w:t>
       </w:r>
     </w:p>
     <w:p>
@@ -8005,15 +6676,7 @@
         </w:numPr>
       </w:pPr>
       <w:r>
-        <w:t xml:space="preserve">No. I need to lock in and do what needs to be done which is </w:t>
-      </w:r>
-      <w:proofErr w:type="gramStart"/>
-      <w:r>
-        <w:t>actually clean</w:t>
-      </w:r>
-      <w:proofErr w:type="gramEnd"/>
-      <w:r>
-        <w:t xml:space="preserve"> the data and get rid of the massive misreads. Because errors are cumulative, my assumption that these errors wouldn’t affect it are probably wrong.</w:t>
+        <w:t>No. I need to lock in and do what needs to be done which is actually clean the data and get rid of the massive misreads. Because errors are cumulative, my assumption that these errors wouldn’t affect it are probably wrong.</w:t>
       </w:r>
     </w:p>
     <w:p>
@@ -8132,15 +6795,7 @@
         </w:numPr>
       </w:pPr>
       <w:r>
-        <w:t xml:space="preserve">Happy birthday to me. Also, today is the day that I try removing outliers from the impala data – something I should have done over a month ago. </w:t>
-      </w:r>
-      <w:proofErr w:type="gramStart"/>
-      <w:r>
-        <w:t>Of course</w:t>
-      </w:r>
-      <w:proofErr w:type="gramEnd"/>
-      <w:r>
-        <w:t xml:space="preserve"> it could never work when there are such large errors throughout </w:t>
+        <w:t xml:space="preserve">Happy birthday to me. Also, today is the day that I try removing outliers from the impala data – something I should have done over a month ago. Of course it could never work when there are such large errors throughout </w:t>
       </w:r>
       <w:r>
         <w:rPr>
@@ -8169,14 +6824,9 @@
           <w:numId w:val="2"/>
         </w:numPr>
       </w:pPr>
-      <w:proofErr w:type="gramStart"/>
       <w:r>
         <w:lastRenderedPageBreak/>
-        <w:t>Often</w:t>
-      </w:r>
-      <w:proofErr w:type="gramEnd"/>
-      <w:r>
-        <w:t xml:space="preserve"> I see people using </w:t>
+        <w:t xml:space="preserve">Often I see people using </w:t>
       </w:r>
       <w:r>
         <w:t>Butterworth</w:t>
@@ -8218,15 +6868,7 @@
         <w:t>I have seen information about the Median Filter come up</w:t>
       </w:r>
       <w:r>
-        <w:t xml:space="preserve">… </w:t>
-      </w:r>
-      <w:proofErr w:type="spellStart"/>
-      <w:r>
-        <w:t>trialing</w:t>
-      </w:r>
-      <w:proofErr w:type="spellEnd"/>
-      <w:r>
-        <w:t xml:space="preserve"> that now.</w:t>
+        <w:t>… trialing that now.</w:t>
       </w:r>
     </w:p>
     <w:p>
@@ -8459,13 +7101,8 @@
           <w:numId w:val="2"/>
         </w:numPr>
       </w:pPr>
-      <w:proofErr w:type="gramStart"/>
-      <w:r>
-        <w:t>Similarly</w:t>
-      </w:r>
-      <w:proofErr w:type="gramEnd"/>
-      <w:r>
-        <w:t xml:space="preserve"> it occurred to me that I should be cleaning my GPS of noise after all:</w:t>
+      <w:r>
+        <w:t>Similarly it occurred to me that I should be cleaning my GPS of noise after all:</w:t>
       </w:r>
     </w:p>
     <w:p>
@@ -8536,15 +7173,7 @@
         <w:t>Now when I run my DR code</w:t>
       </w:r>
       <w:r>
-        <w:t xml:space="preserve">… for the first time, I’m </w:t>
-      </w:r>
-      <w:proofErr w:type="gramStart"/>
-      <w:r>
-        <w:t>actually within</w:t>
-      </w:r>
-      <w:proofErr w:type="gramEnd"/>
-      <w:r>
-        <w:t xml:space="preserve"> spitting distance. Though I do note something funny in my IMU data (circled in yellow).</w:t>
+        <w:t>… for the first time, I’m actually within spitting distance. Though I do note something funny in my IMU data (circled in yellow).</w:t>
       </w:r>
     </w:p>
     <w:p>
@@ -8701,15 +7330,7 @@
         </w:numPr>
       </w:pPr>
       <w:r>
-        <w:t xml:space="preserve">What am I going to do about that funny section? I’m going to find it in the data and plot that </w:t>
-      </w:r>
-      <w:proofErr w:type="gramStart"/>
-      <w:r>
-        <w:t>time period</w:t>
-      </w:r>
-      <w:proofErr w:type="gramEnd"/>
-      <w:r>
-        <w:t xml:space="preserve"> to see whether it looks obviously weird.</w:t>
+        <w:t>What am I going to do about that funny section? I’m going to find it in the data and plot that time period to see whether it looks obviously weird.</w:t>
       </w:r>
     </w:p>
     <w:p>
@@ -8806,47 +7427,7 @@
         </w:numPr>
       </w:pPr>
       <w:r>
-        <w:t xml:space="preserve">I have put message in chat to get </w:t>
-      </w:r>
-      <w:proofErr w:type="spellStart"/>
-      <w:r>
-        <w:t>ChrisB</w:t>
-      </w:r>
-      <w:proofErr w:type="spellEnd"/>
-      <w:r>
-        <w:t xml:space="preserve"> thoughts but in the </w:t>
-      </w:r>
-      <w:proofErr w:type="gramStart"/>
-      <w:r>
-        <w:t>meantime</w:t>
-      </w:r>
-      <w:proofErr w:type="gramEnd"/>
-      <w:r>
-        <w:t xml:space="preserve"> I will work towards what I think the next step will be: finding all the misread sections and removing them. </w:t>
-      </w:r>
-      <w:proofErr w:type="gramStart"/>
-      <w:r>
-        <w:t>Similar to</w:t>
-      </w:r>
-      <w:proofErr w:type="gramEnd"/>
-      <w:r>
-        <w:t xml:space="preserve"> the kangaroo data (though that’s worse), we </w:t>
-      </w:r>
-      <w:proofErr w:type="gramStart"/>
-      <w:r>
-        <w:t>have to</w:t>
-      </w:r>
-      <w:proofErr w:type="gramEnd"/>
-      <w:r>
-        <w:t xml:space="preserve"> go through and chop up the data into good sections with </w:t>
-      </w:r>
-      <w:proofErr w:type="gramStart"/>
-      <w:r>
-        <w:t>NA’s</w:t>
-      </w:r>
-      <w:proofErr w:type="gramEnd"/>
-      <w:r>
-        <w:t xml:space="preserve"> in between</w:t>
+        <w:t>I have put message in chat to get ChrisB thoughts but in the meantime I will work towards what I think the next step will be: finding all the misread sections and removing them. Similar to the kangaroo data (though that’s worse), we have to go through and chop up the data into good sections with NA’s in between</w:t>
       </w:r>
       <w:r>
         <w:t>?</w:t>
@@ -9053,31 +7634,7 @@
         </w:numPr>
       </w:pPr>
       <w:r>
-        <w:t xml:space="preserve">Then </w:t>
-      </w:r>
-      <w:proofErr w:type="spellStart"/>
-      <w:r>
-        <w:t>ChrisB</w:t>
-      </w:r>
-      <w:proofErr w:type="spellEnd"/>
-      <w:r>
-        <w:t xml:space="preserve"> pointed out that this was happening over hours not </w:t>
-      </w:r>
-      <w:proofErr w:type="gramStart"/>
-      <w:r>
-        <w:t>minutes, and</w:t>
-      </w:r>
-      <w:proofErr w:type="gramEnd"/>
-      <w:r>
-        <w:t xml:space="preserve"> is therefore more likely to be sleeping. He </w:t>
-      </w:r>
-      <w:proofErr w:type="gramStart"/>
-      <w:r>
-        <w:t>said</w:t>
-      </w:r>
-      <w:proofErr w:type="gramEnd"/>
-      <w:r>
-        <w:t xml:space="preserve"> “</w:t>
+        <w:t>Then ChrisB pointed out that this was happening over hours not minutes, and is therefore more likely to be sleeping. He said “</w:t>
       </w:r>
       <w:r>
         <w:rPr>
@@ -9086,23 +7643,7 @@
         <w:t>In that static accelerometer region it's likely just measuring gravity, but if the rotation of the collar isn't pointing the right way it will see that as an acceleration in the wrong direction and pick that up as movement”</w:t>
       </w:r>
       <w:r>
-        <w:t xml:space="preserve">. </w:t>
-      </w:r>
-      <w:proofErr w:type="spellStart"/>
-      <w:r>
-        <w:t>Ahhhh</w:t>
-      </w:r>
-      <w:proofErr w:type="spellEnd"/>
-      <w:r>
-        <w:t xml:space="preserve"> brilliant man has saved me once again. </w:t>
-      </w:r>
-      <w:proofErr w:type="gramStart"/>
-      <w:r>
-        <w:t>So</w:t>
-      </w:r>
-      <w:proofErr w:type="gramEnd"/>
-      <w:r>
-        <w:t xml:space="preserve"> if I can detect that as sleeping then I can set to no movement and no DR during that period. </w:t>
+        <w:t xml:space="preserve">. Ahhhh brilliant man has saved me once again. So if I can detect that as sleeping then I can set to no movement and no DR during that period. </w:t>
       </w:r>
     </w:p>
     <w:p>
@@ -9117,15 +7658,7 @@
         <w:t>Back to what I was doing detecting the flat bits…</w:t>
       </w:r>
       <w:r>
-        <w:t xml:space="preserve"> The way I did that in my VDBA paper was that I found a place where the standard deviation wasn’t changing. </w:t>
-      </w:r>
-      <w:proofErr w:type="gramStart"/>
-      <w:r>
-        <w:t>So</w:t>
-      </w:r>
-      <w:proofErr w:type="gramEnd"/>
-      <w:r>
-        <w:t xml:space="preserve"> I will try that again</w:t>
+        <w:t xml:space="preserve"> The way I did that in my VDBA paper was that I found a place where the standard deviation wasn’t changing. So I will try that again</w:t>
       </w:r>
       <w:r>
         <w:t>…</w:t>
@@ -9257,20 +7790,7 @@
         <w:sym w:font="Wingdings" w:char="F0E0"/>
       </w:r>
       <w:r>
-        <w:t xml:space="preserve"> </w:t>
-      </w:r>
-      <w:proofErr w:type="spellStart"/>
-      <w:proofErr w:type="gramStart"/>
-      <w:r>
-        <w:t>ifelse</w:t>
-      </w:r>
-      <w:proofErr w:type="spellEnd"/>
-      <w:r>
-        <w:t>(</w:t>
-      </w:r>
-      <w:proofErr w:type="gramEnd"/>
-      <w:r>
-        <w:t>VDBA.sm &gt; 0.015, 0, 1) &amp; most common level in 60 seconds (3000 samples)</w:t>
+        <w:t xml:space="preserve"> ifelse(VDBA.sm &gt; 0.015, 0, 1) &amp; most common level in 60 seconds (3000 samples)</w:t>
       </w:r>
       <w:r>
         <w:t>)</w:t>
@@ -9288,15 +7808,7 @@
         <w:t xml:space="preserve">Testing that </w:t>
       </w:r>
       <w:r>
-        <w:t xml:space="preserve">however showed no difference and the </w:t>
-      </w:r>
-      <w:proofErr w:type="spellStart"/>
-      <w:r>
-        <w:t>gps</w:t>
-      </w:r>
-      <w:proofErr w:type="spellEnd"/>
-      <w:r>
-        <w:t xml:space="preserve"> is moving consistently through the period???</w:t>
+        <w:t>however showed no difference and the gps is moving consistently through the period???</w:t>
       </w:r>
     </w:p>
     <w:p>
@@ -9417,15 +7929,7 @@
         <w:t>I then isolated just the part where my accel says the GPS isn’t moving…</w:t>
       </w:r>
       <w:r>
-        <w:t xml:space="preserve"> and still got a displacement of 30m with the smoothed values for the black part of the line. The total “distance” looks like maybe 50 – and that’s after smoothing. </w:t>
-      </w:r>
-      <w:proofErr w:type="gramStart"/>
-      <w:r>
-        <w:t>So</w:t>
-      </w:r>
-      <w:proofErr w:type="gramEnd"/>
-      <w:r>
-        <w:t xml:space="preserve"> I think I’m going to have to add a step where if the animal hasn’t moved, take the average value. (Like I did for the koalas)</w:t>
+        <w:t xml:space="preserve"> and still got a displacement of 30m with the smoothed values for the black part of the line. The total “distance” looks like maybe 50 – and that’s after smoothing. So I think I’m going to have to add a step where if the animal hasn’t moved, take the average value. (Like I did for the koalas)</w:t>
       </w:r>
       <w:r>
         <w:t xml:space="preserve">. </w:t>
@@ -9543,21 +8047,8 @@
           <w:numId w:val="2"/>
         </w:numPr>
       </w:pPr>
-      <w:proofErr w:type="gramStart"/>
-      <w:r>
-        <w:t>Firstly</w:t>
-      </w:r>
-      <w:proofErr w:type="gramEnd"/>
-      <w:r>
-        <w:t xml:space="preserve"> I continued with the cleaning by adding a lowpass </w:t>
-      </w:r>
-      <w:proofErr w:type="spellStart"/>
-      <w:r>
-        <w:t>butterworth</w:t>
-      </w:r>
-      <w:proofErr w:type="spellEnd"/>
-      <w:r>
-        <w:t xml:space="preserve"> filter with a cutoff of 10Hz. The results of the 3 steps of smoothing shown in right plot below.</w:t>
+      <w:r>
+        <w:t>Firstly I continued with the cleaning by adding a lowpass butterworth filter with a cutoff of 10Hz. The results of the 3 steps of smoothing shown in right plot below.</w:t>
       </w:r>
     </w:p>
     <w:p>
@@ -9692,26 +8183,10 @@
         <w:t>For example, in this case, there are 2 stationary periods where there should be no GPS changes.</w:t>
       </w:r>
       <w:r>
-        <w:t xml:space="preserve"> The dark blue dots in the </w:t>
-      </w:r>
-      <w:proofErr w:type="spellStart"/>
-      <w:r>
-        <w:t>gps</w:t>
-      </w:r>
-      <w:proofErr w:type="spellEnd"/>
-      <w:r>
-        <w:t xml:space="preserve"> graph right show the stationary periods. The green dots are what got fed to the spline and the red is the spline path.</w:t>
-      </w:r>
-      <w:r>
-        <w:t xml:space="preserve"> Note there are only 2 black dots because all the </w:t>
-      </w:r>
-      <w:proofErr w:type="gramStart"/>
-      <w:r>
-        <w:t>stationary</w:t>
-      </w:r>
-      <w:proofErr w:type="gramEnd"/>
-      <w:r>
-        <w:t xml:space="preserve"> got grouped.</w:t>
+        <w:t xml:space="preserve"> The dark blue dots in the gps graph right show the stationary periods. The green dots are what got fed to the spline and the red is the spline path.</w:t>
+      </w:r>
+      <w:r>
+        <w:t xml:space="preserve"> Note there are only 2 black dots because all the stationary got grouped.</w:t>
       </w:r>
     </w:p>
     <w:p>
@@ -9968,15 +8443,7 @@
         </w:numPr>
       </w:pPr>
       <w:r>
-        <w:t xml:space="preserve">Then </w:t>
-      </w:r>
-      <w:proofErr w:type="spellStart"/>
-      <w:r>
-        <w:t>ChrisB</w:t>
-      </w:r>
-      <w:proofErr w:type="spellEnd"/>
-      <w:r>
-        <w:t xml:space="preserve"> helped me for a few hours, figuring out many things. For example, he found that everything was scaled by 4 because the settings of the accelerometer weren’t what I thought. (They were 16 for the kangaroos but 4 for the impala) </w:t>
+        <w:t xml:space="preserve">Then ChrisB helped me for a few hours, figuring out many things. For example, he found that everything was scaled by 4 because the settings of the accelerometer weren’t what I thought. (They were 16 for the kangaroos but 4 for the impala) </w:t>
       </w:r>
     </w:p>
     <w:p>
@@ -10002,7 +8469,7 @@
           <w:noProof/>
         </w:rPr>
         <w:drawing>
-          <wp:inline distT="0" distB="0" distL="0" distR="0" wp14:anchorId="5A369B01" wp14:editId="7F51EBAC">
+          <wp:inline distT="0" distB="0" distL="0" distR="0" wp14:anchorId="5A369B01" wp14:editId="7B88AB3D">
             <wp:extent cx="3370239" cy="2741078"/>
             <wp:effectExtent l="0" t="0" r="1905" b="2540"/>
             <wp:docPr id="745835413" name="Picture 11"/>
@@ -10069,23 +8536,7 @@
         </w:numPr>
       </w:pPr>
       <w:r>
-        <w:t xml:space="preserve">Chris Bird also doesn’t believe in tilt-corrected </w:t>
-      </w:r>
-      <w:proofErr w:type="gramStart"/>
-      <w:r>
-        <w:t>accelerometer based</w:t>
-      </w:r>
-      <w:proofErr w:type="gramEnd"/>
-      <w:r>
-        <w:t xml:space="preserve"> DR and thinks we should have to use the gyroscope (pronounced </w:t>
-      </w:r>
-      <w:proofErr w:type="spellStart"/>
-      <w:r>
-        <w:t>guyroscope</w:t>
-      </w:r>
-      <w:proofErr w:type="spellEnd"/>
-      <w:r>
-        <w:t>… as I learnt today)</w:t>
+        <w:t>Chris Bird also doesn’t believe in tilt-corrected accelerometer based DR and thinks we should have to use the gyroscope (pronounced guyroscope… as I learnt today)</w:t>
       </w:r>
     </w:p>
     <w:p>
@@ -10129,39 +8580,7 @@
           <w:i/>
           <w:iCs/>
         </w:rPr>
-        <w:t xml:space="preserve">The short answer is, yes - if a wrong ref frame was chosen then DR path </w:t>
-      </w:r>
-      <w:proofErr w:type="spellStart"/>
-      <w:r>
-        <w:rPr>
-          <w:i/>
-          <w:iCs/>
-        </w:rPr>
-        <w:t>wil</w:t>
-      </w:r>
-      <w:proofErr w:type="spellEnd"/>
-      <w:r>
-        <w:rPr>
-          <w:i/>
-          <w:iCs/>
-        </w:rPr>
-        <w:t xml:space="preserve"> be </w:t>
-      </w:r>
-      <w:proofErr w:type="spellStart"/>
-      <w:r>
-        <w:rPr>
-          <w:i/>
-          <w:iCs/>
-        </w:rPr>
-        <w:t>innacurate</w:t>
-      </w:r>
-      <w:proofErr w:type="spellEnd"/>
-      <w:r>
-        <w:rPr>
-          <w:i/>
-          <w:iCs/>
-        </w:rPr>
-        <w:t xml:space="preserve">. But comparing subsets with GPS pre-correction will help debug if chosen orientation was correct. The patterns and directions of travel should be similar even if scale is not when compared to GPS. I had some lions where I had to 'figure' out the orientation post release. But visually it should be easy to decipher the </w:t>
+        <w:t xml:space="preserve">The short answer is, yes - if a wrong ref frame was chosen then DR path wil be innacurate. But comparing subsets with GPS pre-correction will help debug if chosen orientation was correct. The patterns and directions of travel should be similar even if scale is not when compared to GPS. I had some lions where I had to 'figure' out the orientation post release. But visually it should be easy to decipher the </w:t>
       </w:r>
       <w:r>
         <w:rPr>
@@ -10169,181 +8588,44 @@
           <w:iCs/>
           <w:highlight w:val="green"/>
         </w:rPr>
-        <w:t xml:space="preserve">heave axis of </w:t>
-      </w:r>
-      <w:proofErr w:type="spellStart"/>
+        <w:t>heave axis of movmement</w:t>
+      </w:r>
+      <w:r>
+        <w:rPr>
+          <w:i/>
+          <w:iCs/>
+        </w:rPr>
+        <w:t xml:space="preserve"> in acc and mag (</w:t>
+      </w:r>
       <w:r>
         <w:rPr>
           <w:i/>
           <w:iCs/>
           <w:highlight w:val="green"/>
         </w:rPr>
-        <w:t>movmement</w:t>
-      </w:r>
-      <w:proofErr w:type="spellEnd"/>
+        <w:t>acc will be the one closest to +/-1 g most of the time, and mag will the one changing the least</w:t>
+      </w:r>
       <w:r>
         <w:rPr>
           <w:i/>
           <w:iCs/>
         </w:rPr>
-        <w:t xml:space="preserve"> in </w:t>
-      </w:r>
-      <w:proofErr w:type="spellStart"/>
-      <w:r>
-        <w:rPr>
-          <w:i/>
-          <w:iCs/>
-        </w:rPr>
-        <w:t>acc</w:t>
-      </w:r>
-      <w:proofErr w:type="spellEnd"/>
-      <w:r>
-        <w:rPr>
-          <w:i/>
-          <w:iCs/>
-        </w:rPr>
-        <w:t xml:space="preserve"> and mag (</w:t>
-      </w:r>
-      <w:proofErr w:type="spellStart"/>
-      <w:r>
-        <w:rPr>
-          <w:i/>
-          <w:iCs/>
-          <w:highlight w:val="green"/>
-        </w:rPr>
-        <w:t>acc</w:t>
-      </w:r>
-      <w:proofErr w:type="spellEnd"/>
-      <w:r>
-        <w:rPr>
-          <w:i/>
-          <w:iCs/>
-          <w:highlight w:val="green"/>
-        </w:rPr>
-        <w:t xml:space="preserve"> will be the one closest to +/-1 g most of the time, and mag will the one changing the </w:t>
-      </w:r>
-      <w:proofErr w:type="gramStart"/>
-      <w:r>
-        <w:rPr>
-          <w:i/>
-          <w:iCs/>
-          <w:highlight w:val="green"/>
-        </w:rPr>
-        <w:t>least</w:t>
-      </w:r>
-      <w:r>
-        <w:rPr>
-          <w:i/>
-          <w:iCs/>
-        </w:rPr>
-        <w:t>)...</w:t>
-      </w:r>
-      <w:proofErr w:type="gramEnd"/>
-      <w:r>
-        <w:rPr>
-          <w:i/>
-          <w:iCs/>
-        </w:rPr>
-        <w:t xml:space="preserve"> In terms of deciphering the </w:t>
-      </w:r>
-      <w:proofErr w:type="spellStart"/>
-      <w:r>
-        <w:rPr>
-          <w:i/>
-          <w:iCs/>
-        </w:rPr>
-        <w:t>acc</w:t>
-      </w:r>
-      <w:proofErr w:type="spellEnd"/>
-      <w:r>
-        <w:rPr>
-          <w:i/>
-          <w:iCs/>
-        </w:rPr>
-        <w:t xml:space="preserve">/mag surge and sway dimensions, this may be more challenging. But for the </w:t>
-      </w:r>
-      <w:proofErr w:type="spellStart"/>
+        <w:t xml:space="preserve">)... In terms of deciphering the acc/mag surge and sway dimensions, this may be more challenging. But for the </w:t>
+      </w:r>
       <w:r>
         <w:rPr>
           <w:i/>
           <w:iCs/>
           <w:highlight w:val="yellow"/>
         </w:rPr>
-        <w:t>acc</w:t>
-      </w:r>
-      <w:proofErr w:type="spellEnd"/>
+        <w:t>acc, you would expect greater variation in surge dimension because they stick their head to ground to forage and then stick their head back up when travelling and vigalence</w:t>
+      </w:r>
       <w:r>
         <w:rPr>
           <w:i/>
           <w:iCs/>
-          <w:highlight w:val="yellow"/>
-        </w:rPr>
-        <w:t xml:space="preserve">, you would expect greater variation in surge dimension because they stick their head to ground to forage and then stick their head back up when travelling and </w:t>
-      </w:r>
-      <w:proofErr w:type="spellStart"/>
-      <w:r>
-        <w:rPr>
-          <w:i/>
-          <w:iCs/>
-          <w:highlight w:val="yellow"/>
-        </w:rPr>
-        <w:t>vigalence</w:t>
-      </w:r>
-      <w:proofErr w:type="spellEnd"/>
-      <w:r>
-        <w:rPr>
-          <w:i/>
-          <w:iCs/>
-        </w:rPr>
-        <w:t xml:space="preserve">, so that may help. If mag is different orientation set up to </w:t>
-      </w:r>
-      <w:proofErr w:type="spellStart"/>
-      <w:r>
-        <w:rPr>
-          <w:i/>
-          <w:iCs/>
-        </w:rPr>
-        <w:t>acc</w:t>
-      </w:r>
-      <w:proofErr w:type="spellEnd"/>
-      <w:r>
-        <w:rPr>
-          <w:i/>
-          <w:iCs/>
-        </w:rPr>
-        <w:t xml:space="preserve">, then </w:t>
-      </w:r>
-      <w:proofErr w:type="spellStart"/>
-      <w:r>
-        <w:rPr>
-          <w:i/>
-          <w:iCs/>
-        </w:rPr>
-        <w:t>its</w:t>
-      </w:r>
-      <w:proofErr w:type="spellEnd"/>
-      <w:r>
-        <w:rPr>
-          <w:i/>
-          <w:iCs/>
-        </w:rPr>
-        <w:t xml:space="preserve"> worth just checking if you switch the surge/sway orientations then which one produces most </w:t>
-      </w:r>
-      <w:proofErr w:type="spellStart"/>
-      <w:r>
-        <w:rPr>
-          <w:i/>
-          <w:iCs/>
-        </w:rPr>
-        <w:t>realsitic</w:t>
-      </w:r>
-      <w:proofErr w:type="spellEnd"/>
-      <w:r>
-        <w:rPr>
-          <w:i/>
-          <w:iCs/>
-        </w:rPr>
-        <w:t xml:space="preserve"> DR track relative to GPS... by deciphering the heave axis and dimension of measured g, you already have homed in on just a few possible orientations it could be...</w:t>
+        </w:rPr>
+        <w:t>, so that may help. If mag is different orientation set up to acc, then its worth just checking if you switch the surge/sway orientations then which one produces most realsitic DR track relative to GPS... by deciphering the heave axis and dimension of measured g, you already have homed in on just a few possible orientations it could be...</w:t>
       </w:r>
     </w:p>
     <w:p>
@@ -10425,15 +8707,7 @@
         </w:numPr>
       </w:pPr>
       <w:r>
-        <w:t xml:space="preserve">From these graphs I can guess that the heave axis is the Z axis. The Surge is the Y. And </w:t>
-      </w:r>
-      <w:proofErr w:type="gramStart"/>
-      <w:r>
-        <w:t>therefore</w:t>
-      </w:r>
-      <w:proofErr w:type="gramEnd"/>
-      <w:r>
-        <w:t xml:space="preserve"> the sway is the X. </w:t>
+        <w:t xml:space="preserve">From these graphs I can guess that the heave axis is the Z axis. The Surge is the Y. And therefore the sway is the X. </w:t>
       </w:r>
     </w:p>
     <w:p>
@@ -10537,47 +8811,8 @@
           <w:numId w:val="2"/>
         </w:numPr>
       </w:pPr>
-      <w:proofErr w:type="spellStart"/>
-      <w:r>
-        <w:t>acc_orientation</w:t>
-      </w:r>
-      <w:proofErr w:type="spellEnd"/>
-      <w:r>
-        <w:t xml:space="preserve"> &lt;- "NWU</w:t>
-      </w:r>
-      <w:proofErr w:type="gramStart"/>
-      <w:r>
-        <w:t xml:space="preserve">",   </w:t>
-      </w:r>
-      <w:proofErr w:type="spellStart"/>
-      <w:proofErr w:type="gramEnd"/>
-      <w:r>
-        <w:t>mag_orientation</w:t>
-      </w:r>
-      <w:proofErr w:type="spellEnd"/>
-      <w:r>
-        <w:t xml:space="preserve"> &lt;- "NED</w:t>
-      </w:r>
-      <w:proofErr w:type="gramStart"/>
-      <w:r>
-        <w:t xml:space="preserve">",   </w:t>
-      </w:r>
-      <w:proofErr w:type="spellStart"/>
-      <w:proofErr w:type="gramEnd"/>
-      <w:r>
-        <w:t>gravity_direction</w:t>
-      </w:r>
-      <w:proofErr w:type="spellEnd"/>
-      <w:r>
-        <w:t xml:space="preserve"> &lt;- "down</w:t>
-      </w:r>
-      <w:proofErr w:type="gramStart"/>
-      <w:r>
-        <w:t xml:space="preserve">",   </w:t>
-      </w:r>
-      <w:proofErr w:type="gramEnd"/>
-      <w:r>
-        <w:t>pitch &lt;- 0#-48</w:t>
+      <w:r>
+        <w:t>acc_orientation &lt;- "NWU",   mag_orientation &lt;- "NED",   gravity_direction &lt;- "down",   pitch &lt;- 0#-48</w:t>
       </w:r>
     </w:p>
     <w:p>
@@ -10773,15 +9008,7 @@
         </w:numPr>
       </w:pPr>
       <w:r>
-        <w:t xml:space="preserve">Amelia has officially finished annotating all the labelable data but… unfortunately, it </w:t>
-      </w:r>
-      <w:proofErr w:type="gramStart"/>
-      <w:r>
-        <w:t>really just</w:t>
-      </w:r>
-      <w:proofErr w:type="gramEnd"/>
-      <w:r>
-        <w:t xml:space="preserve"> isn’t that much data. I’m going to need to generate more of it. Specifically, I want to know the difference between head up and head down behaviours to improve upon the DR. </w:t>
+        <w:t xml:space="preserve">Amelia has officially finished annotating all the labelable data but… unfortunately, it really just isn’t that much data. I’m going to need to generate more of it. Specifically, I want to know the difference between head up and head down behaviours to improve upon the DR. </w:t>
       </w:r>
       <w:r>
         <w:t xml:space="preserve">Below is what we have so far… Today I am going to try to get Ethan to increase it by finding new samples by blind searching. </w:t>
@@ -10795,13 +9022,8 @@
           <w:numId w:val="2"/>
         </w:numPr>
       </w:pPr>
-      <w:proofErr w:type="gramStart"/>
-      <w:r>
-        <w:t>Specifically</w:t>
-      </w:r>
-      <w:proofErr w:type="gramEnd"/>
-      <w:r>
-        <w:t xml:space="preserve"> I want specific behaviours. Will make a guide to them so he knows what to look for</w:t>
+      <w:r>
+        <w:t>Specifically I want specific behaviours. Will make a guide to them so he knows what to look for</w:t>
       </w:r>
       <w:r>
         <w:t>…. Those are on the next pages.</w:t>
@@ -10913,15 +9135,7 @@
     <w:p/>
     <w:p>
       <w:r>
-        <w:t>X = "salmon", Y = "turquoise", Z = "</w:t>
-      </w:r>
-      <w:proofErr w:type="spellStart"/>
-      <w:r>
-        <w:t>darkblue</w:t>
-      </w:r>
-      <w:proofErr w:type="spellEnd"/>
-      <w:r>
-        <w:t>"</w:t>
+        <w:t>X = "salmon", Y = "turquoise", Z = "darkblue"</w:t>
       </w:r>
     </w:p>
     <w:p>
@@ -11342,7 +9556,6 @@
           <w:lang w:val="en-GB"/>
         </w:rPr>
       </w:pPr>
-      <w:proofErr w:type="gramStart"/>
       <w:r>
         <w:rPr>
           <w:rFonts w:asciiTheme="minorHAnsi" w:hAnsiTheme="minorHAnsi"/>
@@ -11350,23 +9563,14 @@
           <w:lang w:val="en-GB"/>
         </w:rPr>
         <w:lastRenderedPageBreak/>
-        <w:t>However</w:t>
-      </w:r>
-      <w:proofErr w:type="gramEnd"/>
+        <w:t>However…</w:t>
+      </w:r>
       <w:r>
         <w:rPr>
           <w:rFonts w:asciiTheme="minorHAnsi" w:hAnsiTheme="minorHAnsi"/>
           <w:highlight w:val="yellow"/>
           <w:lang w:val="en-GB"/>
         </w:rPr>
-        <w:t>…</w:t>
-      </w:r>
-      <w:r>
-        <w:rPr>
-          <w:rFonts w:asciiTheme="minorHAnsi" w:hAnsiTheme="minorHAnsi"/>
-          <w:highlight w:val="yellow"/>
-          <w:lang w:val="en-GB"/>
-        </w:rPr>
         <w:t xml:space="preserve"> just a heads up, it seems that the devices were all scaled differently. Lmao</w:t>
       </w:r>
       <w:r>
@@ -11374,23 +9578,7 @@
           <w:rFonts w:asciiTheme="minorHAnsi" w:hAnsiTheme="minorHAnsi"/>
           <w:lang w:val="en-GB"/>
         </w:rPr>
-        <w:t xml:space="preserve">. This will need to be controlled for in both </w:t>
-      </w:r>
-      <w:proofErr w:type="gramStart"/>
-      <w:r>
-        <w:rPr>
-          <w:rFonts w:asciiTheme="minorHAnsi" w:hAnsiTheme="minorHAnsi"/>
-          <w:lang w:val="en-GB"/>
-        </w:rPr>
-        <w:t>behaviour</w:t>
-      </w:r>
-      <w:proofErr w:type="gramEnd"/>
-      <w:r>
-        <w:rPr>
-          <w:rFonts w:asciiTheme="minorHAnsi" w:hAnsiTheme="minorHAnsi"/>
-          <w:lang w:val="en-GB"/>
-        </w:rPr>
-        <w:t xml:space="preserve"> searching and the dead reckoning.</w:t>
+        <w:t>. This will need to be controlled for in both behaviour searching and the dead reckoning.</w:t>
       </w:r>
     </w:p>
     <w:p>
@@ -11435,23 +9623,7 @@
           <w:rFonts w:asciiTheme="minorHAnsi" w:hAnsiTheme="minorHAnsi"/>
           <w:lang w:val="en-GB"/>
         </w:rPr>
-        <w:t xml:space="preserve">Plotted it to see what units the devices are in and holy fuck, why are they all different??? What evil tomfoolery is this?????? Messaged </w:t>
-      </w:r>
-      <w:proofErr w:type="spellStart"/>
-      <w:r>
-        <w:rPr>
-          <w:rFonts w:asciiTheme="minorHAnsi" w:hAnsiTheme="minorHAnsi"/>
-          <w:lang w:val="en-GB"/>
-        </w:rPr>
-        <w:t>ChrisB</w:t>
-      </w:r>
-      <w:proofErr w:type="spellEnd"/>
-      <w:r>
-        <w:rPr>
-          <w:rFonts w:asciiTheme="minorHAnsi" w:hAnsiTheme="minorHAnsi"/>
-          <w:lang w:val="en-GB"/>
-        </w:rPr>
-        <w:t xml:space="preserve"> to ask what the heck is going on.</w:t>
+        <w:t>Plotted it to see what units the devices are in and holy fuck, why are they all different??? What evil tomfoolery is this?????? Messaged ChrisB to ask what the heck is going on.</w:t>
       </w:r>
     </w:p>
     <w:p>
@@ -11654,23 +9826,7 @@
           <w:rFonts w:asciiTheme="minorHAnsi" w:hAnsiTheme="minorHAnsi"/>
           <w:lang w:val="en-GB"/>
         </w:rPr>
-        <w:t xml:space="preserve"> Except not all collars have it… and, on closer inspection, it’s clearly not true. These are the settings as reported by the config </w:t>
-      </w:r>
-      <w:proofErr w:type="gramStart"/>
-      <w:r>
-        <w:rPr>
-          <w:rFonts w:asciiTheme="minorHAnsi" w:hAnsiTheme="minorHAnsi"/>
-          <w:lang w:val="en-GB"/>
-        </w:rPr>
-        <w:t>files</w:t>
-      </w:r>
-      <w:proofErr w:type="gramEnd"/>
-      <w:r>
-        <w:rPr>
-          <w:rFonts w:asciiTheme="minorHAnsi" w:hAnsiTheme="minorHAnsi"/>
-          <w:lang w:val="en-GB"/>
-        </w:rPr>
-        <w:t xml:space="preserve"> but we can clearly see this is not the case in the graphs from yesterday. </w:t>
+        <w:t xml:space="preserve"> Except not all collars have it… and, on closer inspection, it’s clearly not true. These are the settings as reported by the config files but we can clearly see this is not the case in the graphs from yesterday. </w:t>
       </w:r>
     </w:p>
     <w:p>
@@ -11764,76 +9920,26 @@
           <w:lang w:val="en-GB"/>
         </w:rPr>
       </w:pPr>
-      <w:proofErr w:type="gramStart"/>
       <w:r>
         <w:rPr>
           <w:rFonts w:asciiTheme="minorHAnsi" w:hAnsiTheme="minorHAnsi"/>
           <w:lang w:val="en-GB"/>
         </w:rPr>
-        <w:t>Basically</w:t>
-      </w:r>
-      <w:proofErr w:type="gramEnd"/>
+        <w:t xml:space="preserve">Basically I found that there are 3 settings. Either the device is already in G (either 16 or 4) or its in raw units and has to be converted. The cropping at 4g means I am going to have to match and join it to the Axivity </w:t>
+      </w:r>
+      <w:r>
+        <w:rPr>
+          <w:rFonts w:ascii="Segoe UI Emoji" w:hAnsi="Segoe UI Emoji" w:cs="Segoe UI Emoji"/>
+          <w:lang w:val="en-GB"/>
+        </w:rPr>
+        <w:t>😢</w:t>
+      </w:r>
       <w:r>
         <w:rPr>
           <w:rFonts w:asciiTheme="minorHAnsi" w:hAnsiTheme="minorHAnsi"/>
           <w:lang w:val="en-GB"/>
         </w:rPr>
-        <w:t xml:space="preserve"> I found that there are 3 settings. Either the device is already in G (either 16 or 4) or its in raw units and </w:t>
-      </w:r>
-      <w:proofErr w:type="gramStart"/>
-      <w:r>
-        <w:rPr>
-          <w:rFonts w:asciiTheme="minorHAnsi" w:hAnsiTheme="minorHAnsi"/>
-          <w:lang w:val="en-GB"/>
-        </w:rPr>
-        <w:t>has to</w:t>
-      </w:r>
-      <w:proofErr w:type="gramEnd"/>
-      <w:r>
-        <w:rPr>
-          <w:rFonts w:asciiTheme="minorHAnsi" w:hAnsiTheme="minorHAnsi"/>
-          <w:lang w:val="en-GB"/>
-        </w:rPr>
-        <w:t xml:space="preserve"> be converted. The cropping at 4g means I am going to have to match and join it to the </w:t>
-      </w:r>
-      <w:proofErr w:type="spellStart"/>
-      <w:r>
-        <w:rPr>
-          <w:rFonts w:asciiTheme="minorHAnsi" w:hAnsiTheme="minorHAnsi"/>
-          <w:lang w:val="en-GB"/>
-        </w:rPr>
-        <w:t>Axivity</w:t>
-      </w:r>
-      <w:proofErr w:type="spellEnd"/>
-      <w:r>
-        <w:rPr>
-          <w:rFonts w:asciiTheme="minorHAnsi" w:hAnsiTheme="minorHAnsi"/>
-          <w:lang w:val="en-GB"/>
-        </w:rPr>
-        <w:t xml:space="preserve"> </w:t>
-      </w:r>
-      <w:r>
-        <w:rPr>
-          <w:rFonts w:ascii="Segoe UI Emoji" w:hAnsi="Segoe UI Emoji" w:cs="Segoe UI Emoji"/>
-          <w:lang w:val="en-GB"/>
-        </w:rPr>
-        <w:t>😢</w:t>
-      </w:r>
-      <w:proofErr w:type="spellStart"/>
-      <w:r>
-        <w:rPr>
-          <w:rFonts w:asciiTheme="minorHAnsi" w:hAnsiTheme="minorHAnsi"/>
-          <w:lang w:val="en-GB"/>
-        </w:rPr>
-        <w:t>ChrisC</w:t>
-      </w:r>
-      <w:proofErr w:type="spellEnd"/>
-      <w:r>
-        <w:rPr>
-          <w:rFonts w:asciiTheme="minorHAnsi" w:hAnsiTheme="minorHAnsi"/>
-          <w:lang w:val="en-GB"/>
-        </w:rPr>
-        <w:t xml:space="preserve"> says this code exists and already works… but I’ve heard that often enough to know that means “this will be hard”.</w:t>
+        <w:t>ChrisC says this code exists and already works… but I’ve heard that often enough to know that means “this will be hard”.</w:t>
       </w:r>
     </w:p>
     <w:tbl>
@@ -11906,7 +10012,6 @@
                 <w14:ligatures w14:val="none"/>
               </w:rPr>
             </w:pPr>
-            <w:proofErr w:type="spellStart"/>
             <w:r>
               <w:rPr>
                 <w:rFonts w:ascii="Aptos Narrow" w:eastAsia="Times New Roman" w:hAnsi="Aptos Narrow" w:cs="Times New Roman"/>
@@ -11919,7 +10024,6 @@
               </w:rPr>
               <w:t>avg_hz</w:t>
             </w:r>
-            <w:proofErr w:type="spellEnd"/>
           </w:p>
         </w:tc>
         <w:tc>
@@ -11941,7 +10045,6 @@
                 <w14:ligatures w14:val="none"/>
               </w:rPr>
             </w:pPr>
-            <w:proofErr w:type="spellStart"/>
             <w:r>
               <w:rPr>
                 <w:rFonts w:ascii="Aptos Narrow" w:eastAsia="Times New Roman" w:hAnsi="Aptos Narrow" w:cs="Times New Roman"/>
@@ -11954,7 +10057,6 @@
               </w:rPr>
               <w:t>Acc_Conv</w:t>
             </w:r>
-            <w:proofErr w:type="spellEnd"/>
           </w:p>
         </w:tc>
         <w:tc>
@@ -11976,7 +10078,6 @@
                 <w14:ligatures w14:val="none"/>
               </w:rPr>
             </w:pPr>
-            <w:proofErr w:type="spellStart"/>
             <w:r>
               <w:rPr>
                 <w:rFonts w:ascii="Aptos Narrow" w:eastAsia="Times New Roman" w:hAnsi="Aptos Narrow" w:cs="Times New Roman"/>
@@ -11989,7 +10090,6 @@
               </w:rPr>
               <w:t>Mag_Conv</w:t>
             </w:r>
-            <w:proofErr w:type="spellEnd"/>
           </w:p>
         </w:tc>
       </w:tr>
@@ -13631,21 +11731,8 @@
             </w:r>
           </w:p>
           <w:p>
-            <w:proofErr w:type="spellStart"/>
             <w:r>
-              <w:t>accel_</w:t>
-            </w:r>
-            <w:proofErr w:type="gramStart"/>
-            <w:r>
-              <w:t>data</w:t>
-            </w:r>
-            <w:proofErr w:type="spellEnd"/>
-            <w:r>
-              <w:t>[</w:t>
-            </w:r>
-            <w:proofErr w:type="gramEnd"/>
-            <w:r>
-              <w:t>1445000:1452000]</w:t>
+              <w:t>accel_data[1445000:1452000]</w:t>
             </w:r>
           </w:p>
         </w:tc>
@@ -13748,21 +11835,8 @@
             </w:r>
           </w:p>
           <w:p>
-            <w:proofErr w:type="spellStart"/>
             <w:r>
-              <w:t>accel_</w:t>
-            </w:r>
-            <w:proofErr w:type="gramStart"/>
-            <w:r>
-              <w:t>data</w:t>
-            </w:r>
-            <w:proofErr w:type="spellEnd"/>
-            <w:r>
-              <w:t>[</w:t>
-            </w:r>
-            <w:proofErr w:type="gramEnd"/>
-            <w:r>
-              <w:t>1660000:1670000]</w:t>
+              <w:t>accel_data[1660000:1670000]</w:t>
             </w:r>
           </w:p>
         </w:tc>
@@ -13865,21 +11939,8 @@
             </w:r>
           </w:p>
           <w:p>
-            <w:proofErr w:type="spellStart"/>
             <w:r>
-              <w:t>accel_</w:t>
-            </w:r>
-            <w:proofErr w:type="gramStart"/>
-            <w:r>
-              <w:t>data</w:t>
-            </w:r>
-            <w:proofErr w:type="spellEnd"/>
-            <w:r>
-              <w:t>[</w:t>
-            </w:r>
-            <w:proofErr w:type="gramEnd"/>
-            <w:r>
-              <w:t>90000:91000]</w:t>
+              <w:t>accel_data[90000:91000]</w:t>
             </w:r>
           </w:p>
         </w:tc>
@@ -14720,39 +12781,7 @@
           <w:rFonts w:asciiTheme="minorHAnsi" w:hAnsiTheme="minorHAnsi"/>
           <w:lang w:val="en-GB"/>
         </w:rPr>
-        <w:t xml:space="preserve">Therefore, I went through and made sure they’re now on the same scale (other than the ones that capped at 4g and therefore </w:t>
-      </w:r>
-      <w:proofErr w:type="gramStart"/>
-      <w:r>
-        <w:rPr>
-          <w:rFonts w:asciiTheme="minorHAnsi" w:hAnsiTheme="minorHAnsi"/>
-          <w:lang w:val="en-GB"/>
-        </w:rPr>
-        <w:t>have to</w:t>
-      </w:r>
-      <w:proofErr w:type="gramEnd"/>
-      <w:r>
-        <w:rPr>
-          <w:rFonts w:asciiTheme="minorHAnsi" w:hAnsiTheme="minorHAnsi"/>
-          <w:lang w:val="en-GB"/>
-        </w:rPr>
-        <w:t xml:space="preserve"> be matched with the </w:t>
-      </w:r>
-      <w:proofErr w:type="spellStart"/>
-      <w:r>
-        <w:rPr>
-          <w:rFonts w:asciiTheme="minorHAnsi" w:hAnsiTheme="minorHAnsi"/>
-          <w:lang w:val="en-GB"/>
-        </w:rPr>
-        <w:t>Axivity</w:t>
-      </w:r>
-      <w:proofErr w:type="spellEnd"/>
-      <w:r>
-        <w:rPr>
-          <w:rFonts w:asciiTheme="minorHAnsi" w:hAnsiTheme="minorHAnsi"/>
-          <w:lang w:val="en-GB"/>
-        </w:rPr>
-        <w:t xml:space="preserve"> before behavioural and VDBA analysis). I then re-extracted the training data for those periods based on the times of the original unsmoothed data. That code is now running. I will check the output tomorrow.</w:t>
+        <w:t>Therefore, I went through and made sure they’re now on the same scale (other than the ones that capped at 4g and therefore have to be matched with the Axivity before behavioural and VDBA analysis). I then re-extracted the training data for those periods based on the times of the original unsmoothed data. That code is now running. I will check the output tomorrow.</w:t>
       </w:r>
     </w:p>
     <w:p>
@@ -14805,23 +12834,7 @@
           <w:rFonts w:asciiTheme="minorHAnsi" w:hAnsiTheme="minorHAnsi"/>
           <w:lang w:val="en-GB"/>
         </w:rPr>
-        <w:t xml:space="preserve">… They did need to be divided after all. Weird? Message CB and he said that things can change or if it reset/rebooted it might have gone back to default. </w:t>
-      </w:r>
-      <w:proofErr w:type="spellStart"/>
-      <w:r>
-        <w:rPr>
-          <w:rFonts w:asciiTheme="minorHAnsi" w:hAnsiTheme="minorHAnsi"/>
-          <w:lang w:val="en-GB"/>
-        </w:rPr>
-        <w:t>Whatevvvvvvver</w:t>
-      </w:r>
-      <w:proofErr w:type="spellEnd"/>
-      <w:r>
-        <w:rPr>
-          <w:rFonts w:asciiTheme="minorHAnsi" w:hAnsiTheme="minorHAnsi"/>
-          <w:lang w:val="en-GB"/>
-        </w:rPr>
-        <w:t xml:space="preserve"> man. I can’t keep up with all this. Converted everything to the right scale for real now and then proceeded. </w:t>
+        <w:t xml:space="preserve">… They did need to be divided after all. Weird? Message CB and he said that things can change or if it reset/rebooted it might have gone back to default. Whatevvvvvvver man. I can’t keep up with all this. Converted everything to the right scale for real now and then proceeded. </w:t>
       </w:r>
     </w:p>
     <w:p>
@@ -14896,17 +12909,8 @@
           <w:rFonts w:asciiTheme="minorHAnsi" w:hAnsiTheme="minorHAnsi"/>
           <w:lang w:val="en-GB"/>
         </w:rPr>
-        <w:t xml:space="preserve"> Some errors I can see, but these will be cleaned out in the next step of the second </w:t>
-      </w:r>
-      <w:proofErr w:type="spellStart"/>
-      <w:r>
-        <w:rPr>
-          <w:rFonts w:asciiTheme="minorHAnsi" w:hAnsiTheme="minorHAnsi"/>
-          <w:lang w:val="en-GB"/>
-        </w:rPr>
-        <w:t>matlab</w:t>
-      </w:r>
-      <w:proofErr w:type="spellEnd"/>
+        <w:t xml:space="preserve"> Some errors I can see, but these will be cleaned out in the next step of the second matlab</w:t>
+      </w:r>
       <w:r>
         <w:rPr>
           <w:rFonts w:asciiTheme="minorHAnsi" w:hAnsiTheme="minorHAnsi"/>
@@ -15147,23 +13151,7 @@
           <w:rFonts w:asciiTheme="minorHAnsi" w:hAnsiTheme="minorHAnsi"/>
           <w:lang w:val="en-GB"/>
         </w:rPr>
-        <w:t xml:space="preserve">Okay I fixed the error but there are still problems with the annotations… I think I should sort them into their final group before I clean them. Ugh. Back to the beginning! </w:t>
-      </w:r>
-      <w:proofErr w:type="gramStart"/>
-      <w:r>
-        <w:rPr>
-          <w:rFonts w:asciiTheme="minorHAnsi" w:hAnsiTheme="minorHAnsi"/>
-          <w:lang w:val="en-GB"/>
-        </w:rPr>
-        <w:t>As long as</w:t>
-      </w:r>
-      <w:proofErr w:type="gramEnd"/>
-      <w:r>
-        <w:rPr>
-          <w:rFonts w:asciiTheme="minorHAnsi" w:hAnsiTheme="minorHAnsi"/>
-          <w:lang w:val="en-GB"/>
-        </w:rPr>
-        <w:t xml:space="preserve"> this is complete by the end of the day and I’m generating features over night, I think I can afford to lose an entire day on the task… In the scheme of things. </w:t>
+        <w:t xml:space="preserve">Okay I fixed the error but there are still problems with the annotations… I think I should sort them into their final group before I clean them. Ugh. Back to the beginning! As long as this is complete by the end of the day and I’m generating features over night, I think I can afford to lose an entire day on the task… In the scheme of things. </w:t>
       </w:r>
     </w:p>
     <w:p>
@@ -15204,69 +13192,22 @@
           <w:lang w:val="en-GB"/>
         </w:rPr>
         <w:lastRenderedPageBreak/>
-        <w:t xml:space="preserve">For example, this behaviour has sometimes been labelled as foraging, sometimes as walking… It is </w:t>
-      </w:r>
-      <w:proofErr w:type="gramStart"/>
-      <w:r>
+        <w:t>For example, this behaviour has sometimes been labelled as foraging, sometimes as walking… It is really unclear what it should be. So it is definitely going to be mixed up in the analysis. My DR is going to need some hard bounds about head up/down, and then leave the VDBA to figure it out?</w:t>
+      </w:r>
+    </w:p>
+    <w:p>
+      <w:pPr>
+        <w:pStyle w:val="NormalWeb"/>
+        <w:jc w:val="center"/>
         <w:rPr>
           <w:rFonts w:asciiTheme="minorHAnsi" w:hAnsiTheme="minorHAnsi"/>
           <w:lang w:val="en-GB"/>
         </w:rPr>
-        <w:t>really unclear</w:t>
-      </w:r>
-      <w:proofErr w:type="gramEnd"/>
+      </w:pPr>
       <w:r>
         <w:rPr>
           <w:rFonts w:asciiTheme="minorHAnsi" w:hAnsiTheme="minorHAnsi"/>
-          <w:lang w:val="en-GB"/>
-        </w:rPr>
-        <w:t xml:space="preserve"> what it should be. </w:t>
-      </w:r>
-      <w:proofErr w:type="gramStart"/>
-      <w:r>
-        <w:rPr>
-          <w:rFonts w:asciiTheme="minorHAnsi" w:hAnsiTheme="minorHAnsi"/>
-          <w:lang w:val="en-GB"/>
-        </w:rPr>
-        <w:t>So</w:t>
-      </w:r>
-      <w:proofErr w:type="gramEnd"/>
-      <w:r>
-        <w:rPr>
-          <w:rFonts w:asciiTheme="minorHAnsi" w:hAnsiTheme="minorHAnsi"/>
-          <w:lang w:val="en-GB"/>
-        </w:rPr>
-        <w:t xml:space="preserve"> it is </w:t>
-      </w:r>
-      <w:proofErr w:type="gramStart"/>
-      <w:r>
-        <w:rPr>
-          <w:rFonts w:asciiTheme="minorHAnsi" w:hAnsiTheme="minorHAnsi"/>
-          <w:lang w:val="en-GB"/>
-        </w:rPr>
-        <w:t>definitely going</w:t>
-      </w:r>
-      <w:proofErr w:type="gramEnd"/>
-      <w:r>
-        <w:rPr>
-          <w:rFonts w:asciiTheme="minorHAnsi" w:hAnsiTheme="minorHAnsi"/>
-          <w:lang w:val="en-GB"/>
-        </w:rPr>
-        <w:t xml:space="preserve"> to be mixed up in the analysis. My DR is going to need some hard bounds about head up/down, and then leave the VDBA to figure it out?</w:t>
-      </w:r>
-    </w:p>
-    <w:p>
-      <w:pPr>
-        <w:pStyle w:val="NormalWeb"/>
-        <w:jc w:val="center"/>
-        <w:rPr>
-          <w:rFonts w:asciiTheme="minorHAnsi" w:hAnsiTheme="minorHAnsi"/>
-          <w:lang w:val="en-GB"/>
-        </w:rPr>
-      </w:pPr>
-      <w:r>
-        <w:rPr>
-          <w:rFonts w:asciiTheme="minorHAnsi" w:hAnsiTheme="minorHAnsi"/>
+          <w:noProof/>
           <w:lang w:val="en-GB"/>
         </w:rPr>
         <w:drawing>
@@ -15504,23 +13445,7 @@
           <w:lang w:val="en-GB"/>
         </w:rPr>
         <w:lastRenderedPageBreak/>
-        <w:t xml:space="preserve">Need to build in some cleaning logic for when the collars flip… </w:t>
-      </w:r>
-      <w:proofErr w:type="spellStart"/>
-      <w:r>
-        <w:rPr>
-          <w:rFonts w:asciiTheme="minorHAnsi" w:hAnsiTheme="minorHAnsi"/>
-          <w:lang w:val="en-GB"/>
-        </w:rPr>
-        <w:t>ie</w:t>
-      </w:r>
-      <w:proofErr w:type="spellEnd"/>
-      <w:r>
-        <w:rPr>
-          <w:rFonts w:asciiTheme="minorHAnsi" w:hAnsiTheme="minorHAnsi"/>
-          <w:lang w:val="en-GB"/>
-        </w:rPr>
-        <w:t xml:space="preserve">. When the Y axis is on average higher than the Z axis, </w:t>
+        <w:t xml:space="preserve">Need to build in some cleaning logic for when the collars flip… ie. When the Y axis is on average higher than the Z axis, </w:t>
       </w:r>
       <w:r>
         <w:rPr>
@@ -15552,39 +13477,35 @@
     </w:p>
     <w:p>
       <w:pPr>
-        <w:pStyle w:val="NormalWeb"/>
-        <w:rPr>
-          <w:rFonts w:asciiTheme="minorHAnsi" w:hAnsiTheme="minorHAnsi"/>
-          <w:lang w:val="en-GB"/>
-        </w:rPr>
-      </w:pPr>
-    </w:p>
-    <w:p>
-      <w:pPr>
-        <w:pStyle w:val="NormalWeb"/>
-        <w:rPr>
-          <w:rFonts w:asciiTheme="minorHAnsi" w:hAnsiTheme="minorHAnsi"/>
-          <w:lang w:val="en-GB"/>
-        </w:rPr>
-      </w:pPr>
-    </w:p>
-    <w:p>
-      <w:pPr>
-        <w:pStyle w:val="NormalWeb"/>
-        <w:rPr>
-          <w:rFonts w:asciiTheme="minorHAnsi" w:hAnsiTheme="minorHAnsi"/>
-          <w:lang w:val="en-GB"/>
-        </w:rPr>
-      </w:pPr>
-    </w:p>
-    <w:p>
-      <w:pPr>
-        <w:pStyle w:val="NormalWeb"/>
-        <w:rPr>
-          <w:rFonts w:asciiTheme="minorHAnsi" w:hAnsiTheme="minorHAnsi"/>
-          <w:lang w:val="en-GB"/>
-        </w:rPr>
-      </w:pPr>
+        <w:pStyle w:val="Heading3"/>
+        <w:rPr>
+          <w:rFonts w:cs="Arial"/>
+        </w:rPr>
+      </w:pPr>
+      <w:r>
+        <w:rPr>
+          <w:rFonts w:cs="Arial"/>
+        </w:rPr>
+        <w:t>1</w:t>
+      </w:r>
+      <w:r>
+        <w:rPr>
+          <w:rFonts w:cs="Arial"/>
+        </w:rPr>
+        <w:t>9</w:t>
+      </w:r>
+      <w:r>
+        <w:rPr>
+          <w:rFonts w:cs="Arial"/>
+        </w:rPr>
+        <w:t>/</w:t>
+      </w:r>
+      <w:r>
+        <w:rPr>
+          <w:rFonts w:cs="Arial"/>
+        </w:rPr>
+        <w:t>05</w:t>
+      </w:r>
     </w:p>
     <w:p>
       <w:pPr>
@@ -15603,7 +13524,55 @@
           <w:rFonts w:asciiTheme="minorHAnsi" w:hAnsiTheme="minorHAnsi"/>
           <w:lang w:val="en-GB"/>
         </w:rPr>
-        <w:t>Tasks:</w:t>
+        <w:t>I ran the feature generation last night but forgot to change one of the variables so it only generated 63 features instead of all of them. Ugh. And it took all night so I can’t afford to run it again right now. Have to remember to run it again tonight… In the meantime</w:t>
+      </w:r>
+      <w:r>
+        <w:rPr>
+          <w:rFonts w:asciiTheme="minorHAnsi" w:hAnsiTheme="minorHAnsi"/>
+          <w:lang w:val="en-GB"/>
+        </w:rPr>
+        <w:t>,</w:t>
+      </w:r>
+      <w:r>
+        <w:rPr>
+          <w:rFonts w:asciiTheme="minorHAnsi" w:hAnsiTheme="minorHAnsi"/>
+          <w:lang w:val="en-GB"/>
+        </w:rPr>
+        <w:t xml:space="preserve"> will prepare the next phase of code.</w:t>
+      </w:r>
+    </w:p>
+    <w:p>
+      <w:pPr>
+        <w:pStyle w:val="NormalWeb"/>
+        <w:numPr>
+          <w:ilvl w:val="0"/>
+          <w:numId w:val="2"/>
+        </w:numPr>
+        <w:rPr>
+          <w:rFonts w:asciiTheme="minorHAnsi" w:hAnsiTheme="minorHAnsi"/>
+          <w:lang w:val="en-GB"/>
+        </w:rPr>
+      </w:pPr>
+      <w:r>
+        <w:rPr>
+          <w:rFonts w:asciiTheme="minorHAnsi" w:hAnsiTheme="minorHAnsi"/>
+          <w:lang w:val="en-GB"/>
+        </w:rPr>
+        <w:t>The models are doing reeaaaaallly badly</w:t>
+      </w:r>
+      <w:r>
+        <w:rPr>
+          <w:rFonts w:asciiTheme="minorHAnsi" w:hAnsiTheme="minorHAnsi"/>
+          <w:lang w:val="en-GB"/>
+        </w:rPr>
+        <w:t xml:space="preserve"> with the limited features</w:t>
+      </w:r>
+      <w:r>
+        <w:rPr>
+          <w:rFonts w:asciiTheme="minorHAnsi" w:hAnsiTheme="minorHAnsi"/>
+          <w:lang w:val="en-GB"/>
+        </w:rPr>
+        <w:t xml:space="preserve">. Even the RF only got 26%. </w:t>
       </w:r>
     </w:p>
     <w:p>
@@ -15615,35 +13584,53 @@
         </w:numPr>
         <w:rPr>
           <w:rFonts w:asciiTheme="minorHAnsi" w:hAnsiTheme="minorHAnsi"/>
-          <w:strike/>
           <w:lang w:val="en-GB"/>
         </w:rPr>
       </w:pPr>
       <w:r>
         <w:rPr>
           <w:rFonts w:asciiTheme="minorHAnsi" w:hAnsiTheme="minorHAnsi"/>
-          <w:strike/>
           <w:lang w:val="en-GB"/>
         </w:rPr>
-        <w:t xml:space="preserve">Convert all the </w:t>
-      </w:r>
-      <w:proofErr w:type="spellStart"/>
-      <w:r>
+        <w:t>From what I could see, the confusion between grazing_headlevel and walking was total. I collapsed those classes into one. There was also a lot of confusion between vigilance and vibrating. I also collapsed those categories together as well. I am rerunning the rest of the feature generation overnight and will check again tomorrow.</w:t>
+      </w:r>
+    </w:p>
+    <w:p>
+      <w:pPr>
+        <w:pStyle w:val="NormalWeb"/>
         <w:rPr>
           <w:rFonts w:asciiTheme="minorHAnsi" w:hAnsiTheme="minorHAnsi"/>
-          <w:strike/>
           <w:lang w:val="en-GB"/>
         </w:rPr>
-        <w:t>accels</w:t>
-      </w:r>
-      <w:proofErr w:type="spellEnd"/>
-      <w:r>
+      </w:pPr>
+    </w:p>
+    <w:p>
+      <w:pPr>
+        <w:pStyle w:val="NormalWeb"/>
         <w:rPr>
           <w:rFonts w:asciiTheme="minorHAnsi" w:hAnsiTheme="minorHAnsi"/>
-          <w:strike/>
           <w:lang w:val="en-GB"/>
         </w:rPr>
-        <w:t xml:space="preserve"> to g force and mag units</w:t>
+      </w:pPr>
+    </w:p>
+    <w:p>
+      <w:pPr>
+        <w:pStyle w:val="NormalWeb"/>
+        <w:numPr>
+          <w:ilvl w:val="0"/>
+          <w:numId w:val="2"/>
+        </w:numPr>
+        <w:rPr>
+          <w:rFonts w:asciiTheme="minorHAnsi" w:hAnsiTheme="minorHAnsi"/>
+          <w:lang w:val="en-GB"/>
+        </w:rPr>
+      </w:pPr>
+      <w:r>
+        <w:rPr>
+          <w:rFonts w:asciiTheme="minorHAnsi" w:hAnsiTheme="minorHAnsi"/>
+          <w:lang w:val="en-GB"/>
+        </w:rPr>
+        <w:t>Tasks:</w:t>
       </w:r>
     </w:p>
     <w:p>
@@ -15662,16 +13649,10 @@
       <w:r>
         <w:rPr>
           <w:rFonts w:asciiTheme="minorHAnsi" w:hAnsiTheme="minorHAnsi"/>
+          <w:strike/>
           <w:lang w:val="en-GB"/>
         </w:rPr>
-        <w:t>Standardise orientation so all devices roughly the same</w:t>
-      </w:r>
-      <w:r>
-        <w:rPr>
-          <w:rFonts w:asciiTheme="minorHAnsi" w:hAnsiTheme="minorHAnsi"/>
-          <w:lang w:val="en-GB"/>
-        </w:rPr>
-        <w:t xml:space="preserve"> (make it the same as the top image)</w:t>
+        <w:t>Convert all the accels to g force and mag units</w:t>
       </w:r>
     </w:p>
     <w:p>
@@ -15683,6 +13664,7 @@
         </w:numPr>
         <w:rPr>
           <w:rFonts w:asciiTheme="minorHAnsi" w:hAnsiTheme="minorHAnsi"/>
+          <w:strike/>
           <w:lang w:val="en-GB"/>
         </w:rPr>
       </w:pPr>
@@ -15691,39 +13673,14 @@
           <w:rFonts w:asciiTheme="minorHAnsi" w:hAnsiTheme="minorHAnsi"/>
           <w:lang w:val="en-GB"/>
         </w:rPr>
-        <w:t xml:space="preserve">Join the cropped 4g </w:t>
-      </w:r>
-      <w:proofErr w:type="spellStart"/>
+        <w:t>Standardise orientation so all devices roughly the same</w:t>
+      </w:r>
       <w:r>
         <w:rPr>
           <w:rFonts w:asciiTheme="minorHAnsi" w:hAnsiTheme="minorHAnsi"/>
           <w:lang w:val="en-GB"/>
         </w:rPr>
-        <w:t>accels</w:t>
-      </w:r>
-      <w:proofErr w:type="spellEnd"/>
-      <w:r>
-        <w:rPr>
-          <w:rFonts w:asciiTheme="minorHAnsi" w:hAnsiTheme="minorHAnsi"/>
-          <w:lang w:val="en-GB"/>
-        </w:rPr>
-        <w:t xml:space="preserve"> with the </w:t>
-      </w:r>
-      <w:proofErr w:type="spellStart"/>
-      <w:r>
-        <w:rPr>
-          <w:rFonts w:asciiTheme="minorHAnsi" w:hAnsiTheme="minorHAnsi"/>
-          <w:lang w:val="en-GB"/>
-        </w:rPr>
-        <w:t>axivity</w:t>
-      </w:r>
-      <w:proofErr w:type="spellEnd"/>
-      <w:r>
-        <w:rPr>
-          <w:rFonts w:asciiTheme="minorHAnsi" w:hAnsiTheme="minorHAnsi"/>
-          <w:lang w:val="en-GB"/>
-        </w:rPr>
-        <w:t xml:space="preserve"> uncropped data to complete the peaks</w:t>
+        <w:t xml:space="preserve"> (make it the same as the top image)</w:t>
       </w:r>
     </w:p>
     <w:p>
@@ -15735,17 +13692,15 @@
         </w:numPr>
         <w:rPr>
           <w:rFonts w:asciiTheme="minorHAnsi" w:hAnsiTheme="minorHAnsi"/>
-          <w:strike/>
           <w:lang w:val="en-GB"/>
         </w:rPr>
       </w:pPr>
       <w:r>
         <w:rPr>
           <w:rFonts w:asciiTheme="minorHAnsi" w:hAnsiTheme="minorHAnsi"/>
-          <w:strike/>
           <w:lang w:val="en-GB"/>
         </w:rPr>
-        <w:t>Smooth and filter the data</w:t>
+        <w:t>Join the cropped 4g accels with the axivity uncropped data to complete the peaks</w:t>
       </w:r>
     </w:p>
     <w:p>
@@ -15757,31 +13712,37 @@
         </w:numPr>
         <w:rPr>
           <w:rFonts w:asciiTheme="minorHAnsi" w:hAnsiTheme="minorHAnsi"/>
+          <w:strike/>
           <w:lang w:val="en-GB"/>
         </w:rPr>
       </w:pPr>
       <w:r>
+        <w:rPr>
+          <w:rFonts w:asciiTheme="minorHAnsi" w:hAnsiTheme="minorHAnsi"/>
+          <w:strike/>
+          <w:lang w:val="en-GB"/>
+        </w:rPr>
+        <w:t>Smooth and filter the data</w:t>
+      </w:r>
+    </w:p>
+    <w:p>
+      <w:pPr>
+        <w:pStyle w:val="NormalWeb"/>
+        <w:numPr>
+          <w:ilvl w:val="1"/>
+          <w:numId w:val="2"/>
+        </w:numPr>
         <w:rPr>
           <w:rFonts w:asciiTheme="minorHAnsi" w:hAnsiTheme="minorHAnsi"/>
           <w:lang w:val="en-GB"/>
         </w:rPr>
-        <w:t xml:space="preserve">Re-extract </w:t>
-      </w:r>
-      <w:proofErr w:type="gramStart"/>
+      </w:pPr>
       <w:r>
         <w:rPr>
           <w:rFonts w:asciiTheme="minorHAnsi" w:hAnsiTheme="minorHAnsi"/>
           <w:lang w:val="en-GB"/>
         </w:rPr>
-        <w:t>all of</w:t>
-      </w:r>
-      <w:proofErr w:type="gramEnd"/>
-      <w:r>
-        <w:rPr>
-          <w:rFonts w:asciiTheme="minorHAnsi" w:hAnsiTheme="minorHAnsi"/>
-          <w:lang w:val="en-GB"/>
-        </w:rPr>
-        <w:t xml:space="preserve"> the training data from the newly standardised data</w:t>
+        <w:t>Re-extract all of the training data from the newly standardised data</w:t>
       </w:r>
     </w:p>
     <w:p>
@@ -15897,22 +13858,7 @@
         <w:rPr>
           <w:highlight w:val="yellow"/>
         </w:rPr>
-        <w:lastRenderedPageBreak/>
-        <w:t xml:space="preserve">What am I doing with my life? We are meant to be using the GPS to correct the error in the </w:t>
-      </w:r>
-      <w:proofErr w:type="gramStart"/>
-      <w:r>
-        <w:rPr>
-          <w:highlight w:val="yellow"/>
-        </w:rPr>
-        <w:t>DR</w:t>
-      </w:r>
-      <w:proofErr w:type="gramEnd"/>
-      <w:r>
-        <w:rPr>
-          <w:highlight w:val="yellow"/>
-        </w:rPr>
-        <w:t xml:space="preserve"> but the GPS itself is </w:t>
+        <w:t xml:space="preserve">What am I doing with my life? We are meant to be using the GPS to correct the error in the DR but the GPS itself is </w:t>
       </w:r>
       <w:r>
         <w:rPr>

</xml_diff>

<commit_message>
adding a NN as well as thresholding head up and down
</commit_message>
<xml_diff>
--- a/Notes/Worklog.docx
+++ b/Notes/Worklog.docx
@@ -12,7 +12,15 @@
     </w:p>
     <w:p>
       <w:r>
-        <w:t>The impala data was collected by Chris Clemente, Jasmin Annett, Robin Maag, Chris Bird, and Taylor Dick across 3 field deployments in South Africa: 2024, April 2025, and July 2025.  The idea behind the project was to put our custom-designed collars (including an Artemis board which logged GPS and accelerometer data, as well as a stand-alone Axivity) on impalas, record their behaviours with a drone, and then reconstruct their exact behaviours and paths from the acceleration data.</w:t>
+        <w:t xml:space="preserve">The impala data was collected by Chris Clemente, Jasmin Annett, Robin Maag, Chris Bird, and Taylor Dick across 3 field deployments in South Africa: 2024, April 2025, and July 2025.  The idea behind the project was to put our custom-designed collars (including an Artemis board which logged GPS and accelerometer data, as well as a stand-alone </w:t>
+      </w:r>
+      <w:proofErr w:type="spellStart"/>
+      <w:r>
+        <w:t>Axivity</w:t>
+      </w:r>
+      <w:proofErr w:type="spellEnd"/>
+      <w:r>
+        <w:t>) on impalas, record their behaviours with a drone, and then reconstruct their exact behaviours and paths from the acceleration data.</w:t>
       </w:r>
       <w:r>
         <w:t xml:space="preserve"> Luke Jessup and Jojo Schultz begun the process of understanding the dead reckoning workflow.</w:t>
@@ -38,6 +46,9 @@
     </w:p>
     <w:p>
       <w:pPr>
+        <w:pBdr>
+          <w:bottom w:val="single" w:sz="12" w:space="1" w:color="auto"/>
+        </w:pBdr>
         <w:rPr>
           <w:rFonts w:cs="Arial"/>
         </w:rPr>
@@ -51,11 +62,479 @@
     </w:p>
     <w:p>
       <w:pPr>
+        <w:pBdr>
+          <w:bottom w:val="single" w:sz="12" w:space="1" w:color="auto"/>
+        </w:pBdr>
+        <w:rPr>
+          <w:rFonts w:cs="Arial"/>
+        </w:rPr>
+      </w:pPr>
+    </w:p>
+    <w:p>
+      <w:pPr>
+        <w:pStyle w:val="TOC2"/>
+        <w:tabs>
+          <w:tab w:val="right" w:leader="dot" w:pos="10790"/>
+        </w:tabs>
+        <w:rPr>
+          <w:noProof/>
+        </w:rPr>
+      </w:pPr>
+      <w:r>
+        <w:rPr>
+          <w:rFonts w:cs="Arial"/>
+        </w:rPr>
+        <w:fldChar w:fldCharType="begin"/>
+      </w:r>
+      <w:r>
+        <w:rPr>
+          <w:rFonts w:cs="Arial"/>
+        </w:rPr>
+        <w:instrText xml:space="preserve"> TOC \o "1-2" \h \z \u </w:instrText>
+      </w:r>
+      <w:r>
+        <w:rPr>
+          <w:rFonts w:cs="Arial"/>
+        </w:rPr>
+        <w:fldChar w:fldCharType="separate"/>
+      </w:r>
+      <w:hyperlink w:anchor="_Toc230165018" w:history="1">
+        <w:r>
+          <w:rPr>
+            <w:rStyle w:val="Hyperlink"/>
+            <w:noProof/>
+          </w:rPr>
+          <w:t>Aligning Accel and GPS</w:t>
+        </w:r>
+        <w:r>
+          <w:rPr>
+            <w:noProof/>
+            <w:webHidden/>
+          </w:rPr>
+          <w:tab/>
+        </w:r>
+        <w:r>
+          <w:rPr>
+            <w:noProof/>
+            <w:webHidden/>
+          </w:rPr>
+          <w:fldChar w:fldCharType="begin"/>
+        </w:r>
+        <w:r>
+          <w:rPr>
+            <w:noProof/>
+            <w:webHidden/>
+          </w:rPr>
+          <w:instrText xml:space="preserve"> PAGEREF _Toc230165018 \h </w:instrText>
+        </w:r>
+        <w:r>
+          <w:rPr>
+            <w:noProof/>
+            <w:webHidden/>
+          </w:rPr>
+        </w:r>
+        <w:r>
+          <w:rPr>
+            <w:noProof/>
+            <w:webHidden/>
+          </w:rPr>
+          <w:fldChar w:fldCharType="separate"/>
+        </w:r>
+        <w:r>
+          <w:rPr>
+            <w:noProof/>
+            <w:webHidden/>
+          </w:rPr>
+          <w:t>1</w:t>
+        </w:r>
+        <w:r>
+          <w:rPr>
+            <w:noProof/>
+            <w:webHidden/>
+          </w:rPr>
+          <w:fldChar w:fldCharType="end"/>
+        </w:r>
+      </w:hyperlink>
+    </w:p>
+    <w:p>
+      <w:pPr>
+        <w:pStyle w:val="TOC2"/>
+        <w:tabs>
+          <w:tab w:val="right" w:leader="dot" w:pos="10790"/>
+        </w:tabs>
+        <w:rPr>
+          <w:noProof/>
+        </w:rPr>
+      </w:pPr>
+      <w:hyperlink w:anchor="_Toc230165019" w:history="1">
+        <w:r>
+          <w:rPr>
+            <w:rStyle w:val="Hyperlink"/>
+            <w:noProof/>
+          </w:rPr>
+          <w:t>Dead Reckoning</w:t>
+        </w:r>
+        <w:r>
+          <w:rPr>
+            <w:noProof/>
+            <w:webHidden/>
+          </w:rPr>
+          <w:tab/>
+        </w:r>
+        <w:r>
+          <w:rPr>
+            <w:noProof/>
+            <w:webHidden/>
+          </w:rPr>
+          <w:fldChar w:fldCharType="begin"/>
+        </w:r>
+        <w:r>
+          <w:rPr>
+            <w:noProof/>
+            <w:webHidden/>
+          </w:rPr>
+          <w:instrText xml:space="preserve"> PAGEREF _Toc230165019 \h </w:instrText>
+        </w:r>
+        <w:r>
+          <w:rPr>
+            <w:noProof/>
+            <w:webHidden/>
+          </w:rPr>
+        </w:r>
+        <w:r>
+          <w:rPr>
+            <w:noProof/>
+            <w:webHidden/>
+          </w:rPr>
+          <w:fldChar w:fldCharType="separate"/>
+        </w:r>
+        <w:r>
+          <w:rPr>
+            <w:noProof/>
+            <w:webHidden/>
+          </w:rPr>
+          <w:t>5</w:t>
+        </w:r>
+        <w:r>
+          <w:rPr>
+            <w:noProof/>
+            <w:webHidden/>
+          </w:rPr>
+          <w:fldChar w:fldCharType="end"/>
+        </w:r>
+      </w:hyperlink>
+    </w:p>
+    <w:p>
+      <w:pPr>
+        <w:pStyle w:val="TOC2"/>
+        <w:tabs>
+          <w:tab w:val="right" w:leader="dot" w:pos="10790"/>
+        </w:tabs>
+        <w:rPr>
+          <w:noProof/>
+        </w:rPr>
+      </w:pPr>
+      <w:hyperlink w:anchor="_Toc230165020" w:history="1">
+        <w:r>
+          <w:rPr>
+            <w:rStyle w:val="Hyperlink"/>
+            <w:noProof/>
+          </w:rPr>
+          <w:t>Checking Data Scale and Orientation</w:t>
+        </w:r>
+        <w:r>
+          <w:rPr>
+            <w:noProof/>
+            <w:webHidden/>
+          </w:rPr>
+          <w:tab/>
+        </w:r>
+        <w:r>
+          <w:rPr>
+            <w:noProof/>
+            <w:webHidden/>
+          </w:rPr>
+          <w:fldChar w:fldCharType="begin"/>
+        </w:r>
+        <w:r>
+          <w:rPr>
+            <w:noProof/>
+            <w:webHidden/>
+          </w:rPr>
+          <w:instrText xml:space="preserve"> PAGEREF _Toc230165020 \h </w:instrText>
+        </w:r>
+        <w:r>
+          <w:rPr>
+            <w:noProof/>
+            <w:webHidden/>
+          </w:rPr>
+        </w:r>
+        <w:r>
+          <w:rPr>
+            <w:noProof/>
+            <w:webHidden/>
+          </w:rPr>
+          <w:fldChar w:fldCharType="separate"/>
+        </w:r>
+        <w:r>
+          <w:rPr>
+            <w:noProof/>
+            <w:webHidden/>
+          </w:rPr>
+          <w:t>29</w:t>
+        </w:r>
+        <w:r>
+          <w:rPr>
+            <w:noProof/>
+            <w:webHidden/>
+          </w:rPr>
+          <w:fldChar w:fldCharType="end"/>
+        </w:r>
+      </w:hyperlink>
+    </w:p>
+    <w:p>
+      <w:pPr>
+        <w:pStyle w:val="TOC2"/>
+        <w:tabs>
+          <w:tab w:val="right" w:leader="dot" w:pos="10790"/>
+        </w:tabs>
+        <w:rPr>
+          <w:noProof/>
+        </w:rPr>
+      </w:pPr>
+      <w:hyperlink w:anchor="_Toc230165021" w:history="1">
+        <w:r>
+          <w:rPr>
+            <w:rStyle w:val="Hyperlink"/>
+            <w:noProof/>
+          </w:rPr>
+          <w:t>Training the m</w:t>
+        </w:r>
+        <w:r>
+          <w:rPr>
+            <w:rStyle w:val="Hyperlink"/>
+            <w:noProof/>
+          </w:rPr>
+          <w:t>o</w:t>
+        </w:r>
+        <w:r>
+          <w:rPr>
+            <w:rStyle w:val="Hyperlink"/>
+            <w:noProof/>
+          </w:rPr>
+          <w:t>del</w:t>
+        </w:r>
+        <w:r>
+          <w:rPr>
+            <w:noProof/>
+            <w:webHidden/>
+          </w:rPr>
+          <w:tab/>
+        </w:r>
+        <w:r>
+          <w:rPr>
+            <w:noProof/>
+            <w:webHidden/>
+          </w:rPr>
+          <w:fldChar w:fldCharType="begin"/>
+        </w:r>
+        <w:r>
+          <w:rPr>
+            <w:noProof/>
+            <w:webHidden/>
+          </w:rPr>
+          <w:instrText xml:space="preserve"> PAGEREF _Toc230165021 \h </w:instrText>
+        </w:r>
+        <w:r>
+          <w:rPr>
+            <w:noProof/>
+            <w:webHidden/>
+          </w:rPr>
+        </w:r>
+        <w:r>
+          <w:rPr>
+            <w:noProof/>
+            <w:webHidden/>
+          </w:rPr>
+          <w:fldChar w:fldCharType="separate"/>
+        </w:r>
+        <w:r>
+          <w:rPr>
+            <w:noProof/>
+            <w:webHidden/>
+          </w:rPr>
+          <w:t>33</w:t>
+        </w:r>
+        <w:r>
+          <w:rPr>
+            <w:noProof/>
+            <w:webHidden/>
+          </w:rPr>
+          <w:fldChar w:fldCharType="end"/>
+        </w:r>
+      </w:hyperlink>
+    </w:p>
+    <w:p>
+      <w:pPr>
+        <w:pStyle w:val="TOC2"/>
+        <w:tabs>
+          <w:tab w:val="right" w:leader="dot" w:pos="10790"/>
+        </w:tabs>
+        <w:rPr>
+          <w:noProof/>
+        </w:rPr>
+      </w:pPr>
+      <w:hyperlink w:anchor="_Toc230165022" w:history="1">
+        <w:r>
+          <w:rPr>
+            <w:rStyle w:val="Hyperlink"/>
+            <w:noProof/>
+          </w:rPr>
+          <w:t>Integrating with Dead Reckoning</w:t>
+        </w:r>
+        <w:r>
+          <w:rPr>
+            <w:noProof/>
+            <w:webHidden/>
+          </w:rPr>
+          <w:tab/>
+        </w:r>
+        <w:r>
+          <w:rPr>
+            <w:noProof/>
+            <w:webHidden/>
+          </w:rPr>
+          <w:fldChar w:fldCharType="begin"/>
+        </w:r>
+        <w:r>
+          <w:rPr>
+            <w:noProof/>
+            <w:webHidden/>
+          </w:rPr>
+          <w:instrText xml:space="preserve"> PAGEREF _Toc230165022 \h </w:instrText>
+        </w:r>
+        <w:r>
+          <w:rPr>
+            <w:noProof/>
+            <w:webHidden/>
+          </w:rPr>
+        </w:r>
+        <w:r>
+          <w:rPr>
+            <w:noProof/>
+            <w:webHidden/>
+          </w:rPr>
+          <w:fldChar w:fldCharType="separate"/>
+        </w:r>
+        <w:r>
+          <w:rPr>
+            <w:noProof/>
+            <w:webHidden/>
+          </w:rPr>
+          <w:t>36</w:t>
+        </w:r>
+        <w:r>
+          <w:rPr>
+            <w:noProof/>
+            <w:webHidden/>
+          </w:rPr>
+          <w:fldChar w:fldCharType="end"/>
+        </w:r>
+      </w:hyperlink>
+    </w:p>
+    <w:p>
+      <w:pPr>
+        <w:pStyle w:val="TOC2"/>
+        <w:pBdr>
+          <w:bottom w:val="single" w:sz="12" w:space="1" w:color="auto"/>
+        </w:pBdr>
+        <w:tabs>
+          <w:tab w:val="right" w:leader="dot" w:pos="10790"/>
+        </w:tabs>
+        <w:rPr>
+          <w:noProof/>
+        </w:rPr>
+      </w:pPr>
+      <w:hyperlink w:anchor="_Toc230165023" w:history="1">
+        <w:r>
+          <w:rPr>
+            <w:rStyle w:val="Hyperlink"/>
+            <w:noProof/>
+          </w:rPr>
+          <w:t>What I learnt and Workflow for next time</w:t>
+        </w:r>
+        <w:r>
+          <w:rPr>
+            <w:noProof/>
+            <w:webHidden/>
+          </w:rPr>
+          <w:tab/>
+        </w:r>
+        <w:r>
+          <w:rPr>
+            <w:noProof/>
+            <w:webHidden/>
+          </w:rPr>
+          <w:fldChar w:fldCharType="begin"/>
+        </w:r>
+        <w:r>
+          <w:rPr>
+            <w:noProof/>
+            <w:webHidden/>
+          </w:rPr>
+          <w:instrText xml:space="preserve"> PAGEREF _Toc230165023 \h </w:instrText>
+        </w:r>
+        <w:r>
+          <w:rPr>
+            <w:noProof/>
+            <w:webHidden/>
+          </w:rPr>
+        </w:r>
+        <w:r>
+          <w:rPr>
+            <w:noProof/>
+            <w:webHidden/>
+          </w:rPr>
+          <w:fldChar w:fldCharType="separate"/>
+        </w:r>
+        <w:r>
+          <w:rPr>
+            <w:noProof/>
+            <w:webHidden/>
+          </w:rPr>
+          <w:t>37</w:t>
+        </w:r>
+        <w:r>
+          <w:rPr>
+            <w:noProof/>
+            <w:webHidden/>
+          </w:rPr>
+          <w:fldChar w:fldCharType="end"/>
+        </w:r>
+      </w:hyperlink>
+    </w:p>
+    <w:p>
+      <w:pPr>
+        <w:rPr>
+          <w:rFonts w:cs="Arial"/>
+        </w:rPr>
+      </w:pPr>
+      <w:r>
+        <w:rPr>
+          <w:rFonts w:cs="Arial"/>
+        </w:rPr>
+        <w:fldChar w:fldCharType="end"/>
+      </w:r>
+    </w:p>
+    <w:p>
+      <w:pPr>
         <w:pStyle w:val="Heading2"/>
       </w:pPr>
+      <w:bookmarkStart w:id="0" w:name="_Toc230165018"/>
       <w:r>
         <w:t>Aligning Accel and GPS</w:t>
       </w:r>
+      <w:bookmarkEnd w:id="0"/>
     </w:p>
     <w:p>
       <w:pPr>
@@ -87,7 +566,23 @@
         <w:t>synchronised</w:t>
       </w:r>
       <w:r>
-        <w:t xml:space="preserve">” boards were, in fact, not time synchronised. ChrisC and I spent several weeks trying to align the board with the associated behavioural videos. That work is detailed in this googledoc: </w:t>
+        <w:t xml:space="preserve">” boards were, in fact, not time synchronised. </w:t>
+      </w:r>
+      <w:proofErr w:type="spellStart"/>
+      <w:r>
+        <w:t>ChrisC</w:t>
+      </w:r>
+      <w:proofErr w:type="spellEnd"/>
+      <w:r>
+        <w:t xml:space="preserve"> and I spent several weeks trying to align the board with the associated behavioural videos. That work is detailed in this </w:t>
+      </w:r>
+      <w:proofErr w:type="spellStart"/>
+      <w:r>
+        <w:t>googledoc</w:t>
+      </w:r>
+      <w:proofErr w:type="spellEnd"/>
+      <w:r>
+        <w:t xml:space="preserve">: </w:t>
       </w:r>
       <w:hyperlink r:id="rId8" w:history="1">
         <w:r>
@@ -156,6 +651,7 @@
         <w:spacing w:line="276" w:lineRule="auto"/>
       </w:pPr>
       <w:r>
+        <w:lastRenderedPageBreak/>
         <w:t xml:space="preserve">At the time, I was only able to achieve alignment for the drone videos as their timestamp was recorded in the filename. </w:t>
       </w:r>
     </w:p>
@@ -214,7 +710,15 @@
         <w:spacing w:line="276" w:lineRule="auto"/>
       </w:pPr>
       <w:r>
-        <w:t xml:space="preserve">What this tells me is that my next most valuable endeavour is to figure out the alignment from Robin’s camera. Going to have a crack at that this arvo. </w:t>
+        <w:t xml:space="preserve">What this tells me is that my next most valuable endeavour is to figure out the alignment from Robin’s camera. Going to have a crack at that this </w:t>
+      </w:r>
+      <w:proofErr w:type="spellStart"/>
+      <w:r>
+        <w:t>arvo</w:t>
+      </w:r>
+      <w:proofErr w:type="spellEnd"/>
+      <w:r>
+        <w:t xml:space="preserve">. </w:t>
       </w:r>
       <w:r>
         <w:rPr>
@@ -245,7 +749,6 @@
         <w:spacing w:line="276" w:lineRule="auto"/>
       </w:pPr>
       <w:r>
-        <w:lastRenderedPageBreak/>
         <w:t>Note that a lot of the code I wrote for the kangaroo data was for accounting the errors in the boards. As far as I can see, these same errors don’t occur in the impala data. However, I left the debug in for the impalas just in case.</w:t>
       </w:r>
     </w:p>
@@ -380,7 +883,15 @@
         <w:spacing w:line="276" w:lineRule="auto"/>
       </w:pPr>
       <w:r>
-        <w:t>I reverted all my changes to the plotting method and got the same result. Therefore, either the video times are incorrect or the gps times are incorrect.</w:t>
+        <w:t xml:space="preserve">I reverted all my changes to the plotting method and got the same result. Therefore, either the video times are incorrect or the </w:t>
+      </w:r>
+      <w:proofErr w:type="spellStart"/>
+      <w:r>
+        <w:t>gps</w:t>
+      </w:r>
+      <w:proofErr w:type="spellEnd"/>
+      <w:r>
+        <w:t xml:space="preserve"> times are incorrect.</w:t>
       </w:r>
     </w:p>
     <w:p>
@@ -393,7 +904,15 @@
         <w:spacing w:line="276" w:lineRule="auto"/>
       </w:pPr>
       <w:r>
-        <w:t xml:space="preserve">I rechecked the video times and no joy. Therefore, I think the gps times are wrong. Going to revert all the work I did yesterday back to the original versions. </w:t>
+        <w:t xml:space="preserve">I rechecked the video times and no joy. Therefore, I think the </w:t>
+      </w:r>
+      <w:proofErr w:type="spellStart"/>
+      <w:r>
+        <w:t>gps</w:t>
+      </w:r>
+      <w:proofErr w:type="spellEnd"/>
+      <w:r>
+        <w:t xml:space="preserve"> times are wrong. Going to revert all the work I did yesterday back to the original versions. </w:t>
       </w:r>
     </w:p>
     <w:p>
@@ -409,7 +928,15 @@
         <w:sym w:font="Wingdings" w:char="F0E0"/>
       </w:r>
       <w:r>
-        <w:t xml:space="preserve"> Note that the kangaroo data had a lot of error not encountered in the impala data (e.g., multiple board resets, skipped reads, incorrect GPS writes, etc). The fact that using the “cleaning code” I wrote for the kangies on the impala caused the impala to break indicates that there is something wrong with the cleaning code…</w:t>
+        <w:t xml:space="preserve"> Note that the kangaroo data had a lot of error not encountered in the impala data (e.g., multiple board resets, skipped reads, incorrect GPS writes, etc). The fact that using the “cleaning code” I wrote for the </w:t>
+      </w:r>
+      <w:proofErr w:type="spellStart"/>
+      <w:r>
+        <w:t>kangies</w:t>
+      </w:r>
+      <w:proofErr w:type="spellEnd"/>
+      <w:r>
+        <w:t xml:space="preserve"> on the impala caused the impala to break indicates that there is something wrong with the cleaning code…</w:t>
       </w:r>
     </w:p>
     <w:p>
@@ -435,6 +962,7 @@
         <w:spacing w:line="276" w:lineRule="auto"/>
       </w:pPr>
       <w:r>
+        <w:lastRenderedPageBreak/>
         <w:t>GPS stitch:  The old version misses the first GPS point for some reason? Moved to the new version.</w:t>
       </w:r>
     </w:p>
@@ -492,7 +1020,6 @@
         <w:rPr>
           <w:noProof/>
         </w:rPr>
-        <w:lastRenderedPageBreak/>
         <w:drawing>
           <wp:inline distT="0" distB="0" distL="0" distR="0" wp14:anchorId="2F46B1EC" wp14:editId="38B330B2">
             <wp:extent cx="4972050" cy="857250"/>
@@ -553,8 +1080,13 @@
         <w:spacing w:line="276" w:lineRule="auto"/>
       </w:pPr>
       <w:r>
-        <w:t>Reordered the dataset by the reset events and then removed the misreads where there was an uneven increment between the internal and external times on the gps_board</w:t>
-      </w:r>
+        <w:t xml:space="preserve">Reordered the dataset by the reset events and then removed the misreads where there was an uneven increment between the internal and external times on the </w:t>
+      </w:r>
+      <w:proofErr w:type="spellStart"/>
+      <w:r>
+        <w:t>gps_board</w:t>
+      </w:r>
+      <w:proofErr w:type="spellEnd"/>
     </w:p>
     <w:p>
       <w:pPr>
@@ -606,7 +1138,15 @@
         <w:spacing w:line="276" w:lineRule="auto"/>
       </w:pPr>
       <w:r>
-        <w:t>Below confirmed that the gps timestamps stay the same after writing and reading but also converted everything to numeric to be safe.</w:t>
+        <w:t xml:space="preserve">Below confirmed that the </w:t>
+      </w:r>
+      <w:proofErr w:type="spellStart"/>
+      <w:r>
+        <w:t>gps</w:t>
+      </w:r>
+      <w:proofErr w:type="spellEnd"/>
+      <w:r>
+        <w:t xml:space="preserve"> timestamps stay the same after writing and reading but also converted everything to numeric to be safe.</w:t>
       </w:r>
     </w:p>
     <w:p>
@@ -781,7 +1321,15 @@
         <w:spacing w:line="276" w:lineRule="auto"/>
       </w:pPr>
       <w:r>
-        <w:t>But somehow they are then getting back mixed together after I combine the accel and gps?</w:t>
+        <w:t xml:space="preserve">But somehow they are then getting back mixed together after I combine the accel and </w:t>
+      </w:r>
+      <w:proofErr w:type="spellStart"/>
+      <w:r>
+        <w:t>gps</w:t>
+      </w:r>
+      <w:proofErr w:type="spellEnd"/>
+      <w:r>
+        <w:t>?</w:t>
       </w:r>
     </w:p>
     <w:p>
@@ -794,6 +1342,7 @@
         <w:spacing w:line="276" w:lineRule="auto"/>
       </w:pPr>
       <w:r>
+        <w:lastRenderedPageBreak/>
         <w:t>I didn’t want to have to do this, but I might have to delete any data from the short reset events because they got blended… Left is before deletion, right is after.</w:t>
       </w:r>
     </w:p>
@@ -915,7 +1464,6 @@
         <w:spacing w:line="276" w:lineRule="auto"/>
       </w:pPr>
       <w:r>
-        <w:lastRenderedPageBreak/>
         <w:t>This should now mean the data is accurately aligned for interpolation… As far as I can tell, it appears to be…</w:t>
       </w:r>
     </w:p>
@@ -1186,6 +1734,7 @@
         </w:numPr>
       </w:pPr>
       <w:r>
+        <w:lastRenderedPageBreak/>
         <w:t>As I was doing this, I found the ones that we did yesterday are scaled incorrectly and have been massively reduced… I vaguely remember that in the code.</w:t>
       </w:r>
       <w:r>
@@ -1196,9 +1745,11 @@
       <w:pPr>
         <w:pStyle w:val="Heading2"/>
       </w:pPr>
+      <w:bookmarkStart w:id="1" w:name="_Toc230165019"/>
       <w:r>
         <w:t>Dead Reckoning</w:t>
       </w:r>
+      <w:bookmarkEnd w:id="1"/>
     </w:p>
     <w:p>
       <w:pPr>
@@ -1235,7 +1786,6 @@
         </w:numPr>
       </w:pPr>
       <w:r>
-        <w:lastRenderedPageBreak/>
         <w:t>I feel really unwell but trying to do a little of this before I go to sleep. Trying to get the dead reckoning script set up for Ethan to work on in a fortnight.</w:t>
       </w:r>
     </w:p>
@@ -1998,6 +2548,7 @@
         </w:numPr>
       </w:pPr>
       <w:r>
+        <w:lastRenderedPageBreak/>
         <w:t>So, from my understanding… (</w:t>
       </w:r>
       <w:r>
@@ -2057,7 +2608,21 @@
         <w:rPr>
           <w:bdr w:val="none" w:sz="0" w:space="0" w:color="auto" w:frame="1"/>
         </w:rPr>
-        <w:t xml:space="preserve"> Not much, tbh.</w:t>
+        <w:t xml:space="preserve"> Not much, </w:t>
+      </w:r>
+      <w:proofErr w:type="spellStart"/>
+      <w:r>
+        <w:rPr>
+          <w:bdr w:val="none" w:sz="0" w:space="0" w:color="auto" w:frame="1"/>
+        </w:rPr>
+        <w:t>tbh</w:t>
+      </w:r>
+      <w:proofErr w:type="spellEnd"/>
+      <w:r>
+        <w:rPr>
+          <w:bdr w:val="none" w:sz="0" w:space="0" w:color="auto" w:frame="1"/>
+        </w:rPr>
+        <w:t>.</w:t>
       </w:r>
     </w:p>
     <w:p>
@@ -2089,7 +2654,6 @@
         <w:rPr>
           <w:noProof/>
         </w:rPr>
-        <w:lastRenderedPageBreak/>
         <w:drawing>
           <wp:inline distT="0" distB="0" distL="0" distR="0" wp14:anchorId="1340ADFE" wp14:editId="366E189D">
             <wp:extent cx="3733128" cy="1581150"/>
@@ -2158,7 +2722,15 @@
         </w:numPr>
       </w:pPr>
       <w:r>
-        <w:t>Raw tri-axial magnetometer data (mag.x,y,z)</w:t>
+        <w:t>Raw tri-axial magnetometer data (</w:t>
+      </w:r>
+      <w:proofErr w:type="spellStart"/>
+      <w:r>
+        <w:t>mag.x,y,z</w:t>
+      </w:r>
+      <w:proofErr w:type="spellEnd"/>
+      <w:r>
+        <w:t>)</w:t>
       </w:r>
     </w:p>
     <w:p>
@@ -2170,7 +2742,15 @@
         </w:numPr>
       </w:pPr>
       <w:r>
-        <w:t>Tri-axial static acceleration data (acc.x,y,z) (the smoothed values)</w:t>
+        <w:t>Tri-axial static acceleration data (</w:t>
+      </w:r>
+      <w:proofErr w:type="spellStart"/>
+      <w:r>
+        <w:t>acc.x,y,z</w:t>
+      </w:r>
+      <w:proofErr w:type="spellEnd"/>
+      <w:r>
+        <w:t>) (the smoothed values)</w:t>
       </w:r>
     </w:p>
     <w:p>
@@ -2218,7 +2798,15 @@
         </w:numPr>
       </w:pPr>
       <w:r>
-        <w:t>Estimated pitch offset: Approximately how much was it rotated by? * algorithm = “standard” (standard euler angle approach) or “SAAM” (using quaternions)</w:t>
+        <w:t xml:space="preserve">Estimated pitch offset: Approximately how much was it rotated by? * algorithm = “standard” (standard </w:t>
+      </w:r>
+      <w:proofErr w:type="spellStart"/>
+      <w:r>
+        <w:t>euler</w:t>
+      </w:r>
+      <w:proofErr w:type="spellEnd"/>
+      <w:r>
+        <w:t xml:space="preserve"> angle approach) or “SAAM” (using quaternions)</w:t>
       </w:r>
     </w:p>
     <w:p>
@@ -2234,6 +2822,7 @@
         <w:rPr>
           <w:noProof/>
         </w:rPr>
+        <w:lastRenderedPageBreak/>
         <w:drawing>
           <wp:inline distT="0" distB="0" distL="0" distR="0" wp14:anchorId="58B5C0DB" wp14:editId="33D1C6B4">
             <wp:extent cx="3400425" cy="1743808"/>
@@ -2291,11 +2880,7 @@
     </w:p>
     <w:p>
       <w:r>
-        <w:t xml:space="preserve">We then need to orient this accelerometer inside of the broader world. We do this by describing the compass direction of each axis. To conceptualise this, think of your hand as a practice accelerometer. Make a gum pointer finger with the middle finger extended as well such that the 3 digits will be at right </w:t>
-      </w:r>
-      <w:r>
-        <w:lastRenderedPageBreak/>
-        <w:t>angles from each other. The index finger represents the X axis, the middle finger is the Y axis, and the thumb is the X axis.</w:t>
+        <w:t>We then need to orient this accelerometer inside of the broader world. We do this by describing the compass direction of each axis. To conceptualise this, think of your hand as a practice accelerometer. Make a gum pointer finger with the middle finger extended as well such that the 3 digits will be at right angles from each other. The index finger represents the X axis, the middle finger is the Y axis, and the thumb is the X axis.</w:t>
       </w:r>
     </w:p>
     <w:p>
@@ -2363,7 +2948,39 @@
     </w:p>
     <w:p>
       <w:r>
-        <w:t>The default orientation of the Gundog system is North-East-Down (NED) where the axes readings would be X = 0, Y = 0, and Z = -1. Before we could use data from our hand accelerometer we would have to flip it upside down. Some devices may have a different local coordinate frame, e.g., the END (East-North-Down) coordinate system assume the surge dimension of movement is represented by the z-channel, and the sway and heave dimension, by the x- and y-channels, respectively. Providing the original coordinate system allows the Gundogs system to convert your local system to the global system. The Gundog.Compass function comes with three inputs to allow the user to transform their device’s coordinate frame into the NED that the specific Direction Cosine Matrix (DCM) and quaternion augmentation uses to compute angles:‘acc.ref.frame’, ‘positive.g’, and ‘mag.ref.frame’</w:t>
+        <w:t xml:space="preserve">The default orientation of the Gundog system is North-East-Down (NED) where the axes readings would be X = 0, Y = 0, and Z = -1. Before we could use data from our hand accelerometer we would have to flip it upside down. Some devices may have a different local coordinate frame, e.g., the END (East-North-Down) coordinate system assume the surge dimension of movement is represented by the z-channel, and the sway and heave dimension, by the x- and y-channels, respectively. Providing the original coordinate system allows the Gundogs system to convert your local system to the global system. The </w:t>
+      </w:r>
+      <w:proofErr w:type="spellStart"/>
+      <w:r>
+        <w:t>Gundog.Compass</w:t>
+      </w:r>
+      <w:proofErr w:type="spellEnd"/>
+      <w:r>
+        <w:t xml:space="preserve"> function comes with three inputs to allow the user to transform their device’s coordinate frame into the NED that the specific Direction Cosine Matrix (DCM) and quaternion augmentation uses to compute angles:‘</w:t>
+      </w:r>
+      <w:proofErr w:type="spellStart"/>
+      <w:r>
+        <w:t>acc.ref.frame</w:t>
+      </w:r>
+      <w:proofErr w:type="spellEnd"/>
+      <w:r>
+        <w:t>’, ‘</w:t>
+      </w:r>
+      <w:proofErr w:type="spellStart"/>
+      <w:r>
+        <w:t>positive.g</w:t>
+      </w:r>
+      <w:proofErr w:type="spellEnd"/>
+      <w:r>
+        <w:t>’, and ‘</w:t>
+      </w:r>
+      <w:proofErr w:type="spellStart"/>
+      <w:r>
+        <w:t>mag.ref.frame</w:t>
+      </w:r>
+      <w:proofErr w:type="spellEnd"/>
+      <w:r>
+        <w:t>’</w:t>
       </w:r>
     </w:p>
     <w:p>
@@ -2401,6 +3018,7 @@
         </w:numPr>
       </w:pPr>
       <w:r>
+        <w:lastRenderedPageBreak/>
         <w:t xml:space="preserve">I am now working in the </w:t>
       </w:r>
       <w:hyperlink r:id="rId24" w:history="1">
@@ -2470,11 +3088,7 @@
         </w:numPr>
       </w:pPr>
       <w:r>
-        <w:t xml:space="preserve">Last week ended up being completely devoted to figuring out what the problem with the kangaroo collars was. After many – many – hours of effort by Chris Bird and I, he determined that the devices were repeatedly pausing (so the internal clock not incrementing and no samples being taken) </w:t>
-      </w:r>
-      <w:r>
-        <w:lastRenderedPageBreak/>
-        <w:t>which is why the GPS and accel were out of alignment. Thank goodness this didn’t happen with the impala data (we checked). Therefore, this week, I can return to this analysis.</w:t>
+        <w:t>Last week ended up being completely devoted to figuring out what the problem with the kangaroo collars was. After many – many – hours of effort by Chris Bird and I, he determined that the devices were repeatedly pausing (so the internal clock not incrementing and no samples being taken) which is why the GPS and accel were out of alignment. Thank goodness this didn’t happen with the impala data (we checked). Therefore, this week, I can return to this analysis.</w:t>
       </w:r>
     </w:p>
     <w:p>
@@ -2667,6 +3281,7 @@
     </w:p>
     <w:p>
       <w:r>
+        <w:lastRenderedPageBreak/>
         <w:t>My data:</w:t>
       </w:r>
     </w:p>
@@ -2745,7 +3360,21 @@
         <w:rPr>
           <w:highlight w:val="yellow"/>
         </w:rPr>
-        <w:t>by 0.15 to give me what jojo had</w:t>
+        <w:t xml:space="preserve">by 0.15 to give me what </w:t>
+      </w:r>
+      <w:proofErr w:type="spellStart"/>
+      <w:r>
+        <w:rPr>
+          <w:highlight w:val="yellow"/>
+        </w:rPr>
+        <w:t>jojo</w:t>
+      </w:r>
+      <w:proofErr w:type="spellEnd"/>
+      <w:r>
+        <w:rPr>
+          <w:highlight w:val="yellow"/>
+        </w:rPr>
+        <w:t xml:space="preserve"> had</w:t>
       </w:r>
       <w:r>
         <w:t>. So…</w:t>
@@ -2760,12 +3389,101 @@
           <w:szCs w:val="20"/>
         </w:rPr>
       </w:pPr>
+      <w:proofErr w:type="spellStart"/>
       <w:r>
         <w:rPr>
           <w:sz w:val="20"/>
           <w:szCs w:val="20"/>
         </w:rPr>
-        <w:t>mine.flat[, c("RawAX", "RawAY", "RawAZ")] &lt;- mine.flat[, c("RawAX", "RawAY", "RawAZ")] / 2048</w:t>
+        <w:t>mine.flat</w:t>
+      </w:r>
+      <w:proofErr w:type="spellEnd"/>
+      <w:r>
+        <w:rPr>
+          <w:sz w:val="20"/>
+          <w:szCs w:val="20"/>
+        </w:rPr>
+        <w:t>[, c("</w:t>
+      </w:r>
+      <w:proofErr w:type="spellStart"/>
+      <w:r>
+        <w:rPr>
+          <w:sz w:val="20"/>
+          <w:szCs w:val="20"/>
+        </w:rPr>
+        <w:t>RawAX</w:t>
+      </w:r>
+      <w:proofErr w:type="spellEnd"/>
+      <w:r>
+        <w:rPr>
+          <w:sz w:val="20"/>
+          <w:szCs w:val="20"/>
+        </w:rPr>
+        <w:t>", "RawAY", "</w:t>
+      </w:r>
+      <w:proofErr w:type="spellStart"/>
+      <w:r>
+        <w:rPr>
+          <w:sz w:val="20"/>
+          <w:szCs w:val="20"/>
+        </w:rPr>
+        <w:t>RawAZ</w:t>
+      </w:r>
+      <w:proofErr w:type="spellEnd"/>
+      <w:r>
+        <w:rPr>
+          <w:sz w:val="20"/>
+          <w:szCs w:val="20"/>
+        </w:rPr>
+        <w:t xml:space="preserve">")] &lt;- </w:t>
+      </w:r>
+      <w:proofErr w:type="spellStart"/>
+      <w:r>
+        <w:rPr>
+          <w:sz w:val="20"/>
+          <w:szCs w:val="20"/>
+        </w:rPr>
+        <w:t>mine.flat</w:t>
+      </w:r>
+      <w:proofErr w:type="spellEnd"/>
+      <w:r>
+        <w:rPr>
+          <w:sz w:val="20"/>
+          <w:szCs w:val="20"/>
+        </w:rPr>
+        <w:t>[, c("</w:t>
+      </w:r>
+      <w:proofErr w:type="spellStart"/>
+      <w:r>
+        <w:rPr>
+          <w:sz w:val="20"/>
+          <w:szCs w:val="20"/>
+        </w:rPr>
+        <w:t>RawAX</w:t>
+      </w:r>
+      <w:proofErr w:type="spellEnd"/>
+      <w:r>
+        <w:rPr>
+          <w:sz w:val="20"/>
+          <w:szCs w:val="20"/>
+        </w:rPr>
+        <w:t>", "RawAY", "</w:t>
+      </w:r>
+      <w:proofErr w:type="spellStart"/>
+      <w:r>
+        <w:rPr>
+          <w:sz w:val="20"/>
+          <w:szCs w:val="20"/>
+        </w:rPr>
+        <w:t>RawAZ</w:t>
+      </w:r>
+      <w:proofErr w:type="spellEnd"/>
+      <w:r>
+        <w:rPr>
+          <w:sz w:val="20"/>
+          <w:szCs w:val="20"/>
+        </w:rPr>
+        <w:t>")] / 2048</w:t>
       </w:r>
     </w:p>
     <w:p>
@@ -2777,12 +3495,133 @@
           <w:szCs w:val="20"/>
         </w:rPr>
       </w:pPr>
+      <w:proofErr w:type="spellStart"/>
       <w:r>
         <w:rPr>
           <w:sz w:val="20"/>
           <w:szCs w:val="20"/>
         </w:rPr>
-        <w:t>mine.flat[, c("RawMX", "RawMY", "RawMZ")] &lt;- mine.flat[, c("RawMX", "RawMY", "RawMZ")] * 0.15</w:t>
+        <w:t>mine.flat</w:t>
+      </w:r>
+      <w:proofErr w:type="spellEnd"/>
+      <w:r>
+        <w:rPr>
+          <w:sz w:val="20"/>
+          <w:szCs w:val="20"/>
+        </w:rPr>
+        <w:t>[, c("</w:t>
+      </w:r>
+      <w:proofErr w:type="spellStart"/>
+      <w:r>
+        <w:rPr>
+          <w:sz w:val="20"/>
+          <w:szCs w:val="20"/>
+        </w:rPr>
+        <w:t>RawMX</w:t>
+      </w:r>
+      <w:proofErr w:type="spellEnd"/>
+      <w:r>
+        <w:rPr>
+          <w:sz w:val="20"/>
+          <w:szCs w:val="20"/>
+        </w:rPr>
+        <w:t>", "</w:t>
+      </w:r>
+      <w:proofErr w:type="spellStart"/>
+      <w:r>
+        <w:rPr>
+          <w:sz w:val="20"/>
+          <w:szCs w:val="20"/>
+        </w:rPr>
+        <w:t>RawMY</w:t>
+      </w:r>
+      <w:proofErr w:type="spellEnd"/>
+      <w:r>
+        <w:rPr>
+          <w:sz w:val="20"/>
+          <w:szCs w:val="20"/>
+        </w:rPr>
+        <w:t>", "</w:t>
+      </w:r>
+      <w:proofErr w:type="spellStart"/>
+      <w:r>
+        <w:rPr>
+          <w:sz w:val="20"/>
+          <w:szCs w:val="20"/>
+        </w:rPr>
+        <w:t>RawMZ</w:t>
+      </w:r>
+      <w:proofErr w:type="spellEnd"/>
+      <w:r>
+        <w:rPr>
+          <w:sz w:val="20"/>
+          <w:szCs w:val="20"/>
+        </w:rPr>
+        <w:t xml:space="preserve">")] &lt;- </w:t>
+      </w:r>
+      <w:proofErr w:type="spellStart"/>
+      <w:r>
+        <w:rPr>
+          <w:sz w:val="20"/>
+          <w:szCs w:val="20"/>
+        </w:rPr>
+        <w:t>mine.flat</w:t>
+      </w:r>
+      <w:proofErr w:type="spellEnd"/>
+      <w:r>
+        <w:rPr>
+          <w:sz w:val="20"/>
+          <w:szCs w:val="20"/>
+        </w:rPr>
+        <w:t>[, c("</w:t>
+      </w:r>
+      <w:proofErr w:type="spellStart"/>
+      <w:r>
+        <w:rPr>
+          <w:sz w:val="20"/>
+          <w:szCs w:val="20"/>
+        </w:rPr>
+        <w:t>RawMX</w:t>
+      </w:r>
+      <w:proofErr w:type="spellEnd"/>
+      <w:r>
+        <w:rPr>
+          <w:sz w:val="20"/>
+          <w:szCs w:val="20"/>
+        </w:rPr>
+        <w:t>", "</w:t>
+      </w:r>
+      <w:proofErr w:type="spellStart"/>
+      <w:r>
+        <w:rPr>
+          <w:sz w:val="20"/>
+          <w:szCs w:val="20"/>
+        </w:rPr>
+        <w:t>RawMY</w:t>
+      </w:r>
+      <w:proofErr w:type="spellEnd"/>
+      <w:r>
+        <w:rPr>
+          <w:sz w:val="20"/>
+          <w:szCs w:val="20"/>
+        </w:rPr>
+        <w:t>", "</w:t>
+      </w:r>
+      <w:proofErr w:type="spellStart"/>
+      <w:r>
+        <w:rPr>
+          <w:sz w:val="20"/>
+          <w:szCs w:val="20"/>
+        </w:rPr>
+        <w:t>RawMZ</w:t>
+      </w:r>
+      <w:proofErr w:type="spellEnd"/>
+      <w:r>
+        <w:rPr>
+          <w:sz w:val="20"/>
+          <w:szCs w:val="20"/>
+        </w:rPr>
+        <w:t>")] * 0.15</w:t>
       </w:r>
     </w:p>
     <w:p>
@@ -2794,12 +3633,37 @@
           <w:szCs w:val="20"/>
         </w:rPr>
       </w:pPr>
+      <w:proofErr w:type="spellStart"/>
       <w:r>
         <w:rPr>
           <w:sz w:val="20"/>
           <w:szCs w:val="20"/>
         </w:rPr>
-        <w:t>jojo_df &lt;- df.flat[1:77009, ]</w:t>
+        <w:t>jojo_df</w:t>
+      </w:r>
+      <w:proofErr w:type="spellEnd"/>
+      <w:r>
+        <w:rPr>
+          <w:sz w:val="20"/>
+          <w:szCs w:val="20"/>
+        </w:rPr>
+        <w:t xml:space="preserve"> &lt;- </w:t>
+      </w:r>
+      <w:proofErr w:type="spellStart"/>
+      <w:r>
+        <w:rPr>
+          <w:sz w:val="20"/>
+          <w:szCs w:val="20"/>
+        </w:rPr>
+        <w:t>df.flat</w:t>
+      </w:r>
+      <w:proofErr w:type="spellEnd"/>
+      <w:r>
+        <w:rPr>
+          <w:sz w:val="20"/>
+          <w:szCs w:val="20"/>
+        </w:rPr>
+        <w:t>[1:77009, ]</w:t>
       </w:r>
     </w:p>
     <w:p>
@@ -2811,12 +3675,37 @@
           <w:szCs w:val="20"/>
         </w:rPr>
       </w:pPr>
+      <w:proofErr w:type="spellStart"/>
       <w:r>
         <w:rPr>
           <w:sz w:val="20"/>
           <w:szCs w:val="20"/>
         </w:rPr>
-        <w:t>oak_df &lt;- mine.flat[3064:80072, ]</w:t>
+        <w:t>oak_df</w:t>
+      </w:r>
+      <w:proofErr w:type="spellEnd"/>
+      <w:r>
+        <w:rPr>
+          <w:sz w:val="20"/>
+          <w:szCs w:val="20"/>
+        </w:rPr>
+        <w:t xml:space="preserve"> &lt;- </w:t>
+      </w:r>
+      <w:proofErr w:type="spellStart"/>
+      <w:r>
+        <w:rPr>
+          <w:sz w:val="20"/>
+          <w:szCs w:val="20"/>
+        </w:rPr>
+        <w:t>mine.flat</w:t>
+      </w:r>
+      <w:proofErr w:type="spellEnd"/>
+      <w:r>
+        <w:rPr>
+          <w:sz w:val="20"/>
+          <w:szCs w:val="20"/>
+        </w:rPr>
+        <w:t>[3064:80072, ]</w:t>
       </w:r>
     </w:p>
     <w:p>
@@ -2828,7 +3717,6 @@
         </w:numPr>
       </w:pPr>
       <w:r>
-        <w:lastRenderedPageBreak/>
         <w:t>OMG! That was the only correction I needed and now it aligns beautifully and looks exactly the same!</w:t>
       </w:r>
       <w:r>
@@ -2971,7 +3859,15 @@
         </w:numPr>
       </w:pPr>
       <w:r>
-        <w:t xml:space="preserve">I think I should presume that they’re not. That is, jojo figured out that the </w:t>
+        <w:t xml:space="preserve">I think I should presume that they’re not. That is, </w:t>
+      </w:r>
+      <w:proofErr w:type="spellStart"/>
+      <w:r>
+        <w:t>jojo</w:t>
+      </w:r>
+      <w:proofErr w:type="spellEnd"/>
+      <w:r>
+        <w:t xml:space="preserve"> figured out that the </w:t>
       </w:r>
       <w:r>
         <w:t>accel was NED and the mag was NWU. Whatever my accel orientation is determined to be, the mag will probably be an equivalent rotation.</w:t>
@@ -3016,6 +3912,7 @@
         </w:numPr>
       </w:pPr>
       <w:r>
+        <w:lastRenderedPageBreak/>
         <w:t xml:space="preserve">By a stroke of good thinking, </w:t>
       </w:r>
       <w:r>
@@ -3028,7 +3925,15 @@
         <w:t xml:space="preserve"> the orientation</w:t>
       </w:r>
       <w:r>
-        <w:t xml:space="preserve"> of the accels are</w:t>
+        <w:t xml:space="preserve"> of the </w:t>
+      </w:r>
+      <w:proofErr w:type="spellStart"/>
+      <w:r>
+        <w:t>accels</w:t>
+      </w:r>
+      <w:proofErr w:type="spellEnd"/>
+      <w:r>
+        <w:t xml:space="preserve"> are</w:t>
       </w:r>
       <w:r>
         <w:t xml:space="preserve"> written on the </w:t>
@@ -3169,7 +4074,6 @@
         <w:rPr>
           <w:noProof/>
         </w:rPr>
-        <w:lastRenderedPageBreak/>
         <w:drawing>
           <wp:inline distT="0" distB="0" distL="0" distR="0" wp14:anchorId="701B2334" wp14:editId="51033066">
             <wp:extent cx="3370521" cy="2395255"/>
@@ -3282,10 +4186,26 @@
         </w:numPr>
       </w:pPr>
       <w:r>
-        <w:t xml:space="preserve">Was having an issue where there were a lot of unmatched gps pings. </w:t>
-      </w:r>
-      <w:r>
-        <w:t>Fixed this by switching the order of the kets for the rolling join. But I nearly kms before figuring that out.</w:t>
+        <w:t xml:space="preserve">Was having an issue where there were a lot of unmatched </w:t>
+      </w:r>
+      <w:proofErr w:type="spellStart"/>
+      <w:r>
+        <w:t>gps</w:t>
+      </w:r>
+      <w:proofErr w:type="spellEnd"/>
+      <w:r>
+        <w:t xml:space="preserve"> pings. </w:t>
+      </w:r>
+      <w:r>
+        <w:t xml:space="preserve">Fixed this by switching the order of the </w:t>
+      </w:r>
+      <w:proofErr w:type="spellStart"/>
+      <w:r>
+        <w:t>kets</w:t>
+      </w:r>
+      <w:proofErr w:type="spellEnd"/>
+      <w:r>
+        <w:t xml:space="preserve"> for the rolling join. But I nearly kms before figuring that out.</w:t>
       </w:r>
     </w:p>
     <w:p>
@@ -3392,6 +4312,7 @@
         <w:rPr>
           <w:noProof/>
         </w:rPr>
+        <w:lastRenderedPageBreak/>
         <w:drawing>
           <wp:inline distT="0" distB="0" distL="0" distR="0" wp14:anchorId="0EFDA96F" wp14:editId="418BD9AA">
             <wp:extent cx="4165616" cy="1442262"/>
@@ -3462,17 +4383,21 @@
         <w:t>Unfortunately,</w:t>
       </w:r>
       <w:r>
-        <w:t xml:space="preserve"> I didn’t wait long enough to get a proper gps </w:t>
+        <w:t xml:space="preserve"> I didn’t wait long enough to get a proper </w:t>
+      </w:r>
+      <w:proofErr w:type="spellStart"/>
+      <w:r>
+        <w:t>gps</w:t>
+      </w:r>
+      <w:proofErr w:type="spellEnd"/>
+      <w:r>
+        <w:t xml:space="preserve"> </w:t>
       </w:r>
       <w:r>
         <w:t>hit but</w:t>
       </w:r>
       <w:r>
-        <w:t xml:space="preserve"> otherwise collected data from 3 conditions (flat collar, </w:t>
-      </w:r>
-      <w:r>
-        <w:lastRenderedPageBreak/>
-        <w:t>45</w:t>
+        <w:t xml:space="preserve"> otherwise collected data from 3 conditions (flat collar, 45</w:t>
       </w:r>
       <w:r>
         <w:t>-degree</w:t>
@@ -3576,7 +4501,15 @@
         </w:numPr>
       </w:pPr>
       <w:r>
-        <w:t xml:space="preserve">If the original collar trials had an acc of NED and a mag of NWU then… I need to reverse the Y and Z directions for the mag of the true collar orientation. So would be… DES. </w:t>
+        <w:t xml:space="preserve">If the original collar trials had an </w:t>
+      </w:r>
+      <w:proofErr w:type="spellStart"/>
+      <w:r>
+        <w:t>acc</w:t>
+      </w:r>
+      <w:proofErr w:type="spellEnd"/>
+      <w:r>
+        <w:t xml:space="preserve"> of NED and a mag of NWU then… I need to reverse the Y and Z directions for the mag of the true collar orientation. So would be… DES. </w:t>
       </w:r>
     </w:p>
     <w:p>
@@ -3708,6 +4641,7 @@
         </w:numPr>
       </w:pPr>
       <w:r>
+        <w:lastRenderedPageBreak/>
         <w:t xml:space="preserve">For now I am going to go back to debugging whatever was wrong with the files that Ethan identified yesterday. </w:t>
       </w:r>
       <w:r>
@@ -3726,7 +4660,23 @@
         </w:numPr>
       </w:pPr>
       <w:r>
-        <w:t xml:space="preserve">Basically, the calibration event occurs at 28.06.24 18:16:00 local time but the first recorded gps time is "2024-06-28 16:28:48 UTC" (about 10 minutes after). Jaz says its not possible for the calibration event to have occurred before the first ping… but </w:t>
+        <w:t xml:space="preserve">Basically, the calibration event occurs at 28.06.24 18:16:00 local time but the first recorded </w:t>
+      </w:r>
+      <w:proofErr w:type="spellStart"/>
+      <w:r>
+        <w:t>gps</w:t>
+      </w:r>
+      <w:proofErr w:type="spellEnd"/>
+      <w:r>
+        <w:t xml:space="preserve"> time is "2024-06-28 16:28:48 UTC" (about 10 minutes after). Jaz says </w:t>
+      </w:r>
+      <w:proofErr w:type="spellStart"/>
+      <w:r>
+        <w:t>its</w:t>
+      </w:r>
+      <w:proofErr w:type="spellEnd"/>
+      <w:r>
+        <w:t xml:space="preserve"> not possible for the calibration event to have occurred before the first ping… but </w:t>
       </w:r>
       <w:r>
         <w:t>stuff</w:t>
@@ -3777,7 +4727,6 @@
         </w:numPr>
       </w:pPr>
       <w:r>
-        <w:lastRenderedPageBreak/>
         <w:t>Found that the accel was getting inappropriately cropped to start on the 30</w:t>
       </w:r>
       <w:r>
@@ -3796,7 +4745,15 @@
         <w:t>th</w:t>
       </w:r>
       <w:r>
-        <w:t xml:space="preserve"> (first gps hit)</w:t>
+        <w:t xml:space="preserve"> (first </w:t>
+      </w:r>
+      <w:proofErr w:type="spellStart"/>
+      <w:r>
+        <w:t>gps</w:t>
+      </w:r>
+      <w:proofErr w:type="spellEnd"/>
+      <w:r>
+        <w:t xml:space="preserve"> hit)</w:t>
       </w:r>
     </w:p>
     <w:p>
@@ -3808,10 +4765,26 @@
         </w:numPr>
       </w:pPr>
       <w:r>
-        <w:t xml:space="preserve">Yep. Even when I don’t crop the accel, the interpolation sends it forward in time from the first gps hit. Interesting. </w:t>
-      </w:r>
-      <w:r>
-        <w:t>Where the time jumps backwards in the first gps hit. So what the heck went wrong with the reverse interpolation?</w:t>
+        <w:t xml:space="preserve">Yep. Even when I don’t crop the accel, the interpolation sends it forward in time from the first </w:t>
+      </w:r>
+      <w:proofErr w:type="spellStart"/>
+      <w:r>
+        <w:t>gps</w:t>
+      </w:r>
+      <w:proofErr w:type="spellEnd"/>
+      <w:r>
+        <w:t xml:space="preserve"> hit. Interesting. </w:t>
+      </w:r>
+      <w:r>
+        <w:t xml:space="preserve">Where the time jumps backwards in the first </w:t>
+      </w:r>
+      <w:proofErr w:type="spellStart"/>
+      <w:r>
+        <w:t>gps</w:t>
+      </w:r>
+      <w:proofErr w:type="spellEnd"/>
+      <w:r>
+        <w:t xml:space="preserve"> hit. So what the heck went wrong with the reverse interpolation?</w:t>
       </w:r>
     </w:p>
     <w:p>
@@ -3823,7 +4796,23 @@
         </w:numPr>
       </w:pPr>
       <w:r>
-        <w:t xml:space="preserve">RTC accel (left) and the gps times look correct, however the conversion to the gps time using interpolation is way out (right) where it jumps several days. </w:t>
+        <w:t xml:space="preserve">RTC accel (left) and the </w:t>
+      </w:r>
+      <w:proofErr w:type="spellStart"/>
+      <w:r>
+        <w:t>gps</w:t>
+      </w:r>
+      <w:proofErr w:type="spellEnd"/>
+      <w:r>
+        <w:t xml:space="preserve"> times look correct, however the conversion to the </w:t>
+      </w:r>
+      <w:proofErr w:type="spellStart"/>
+      <w:r>
+        <w:t>gps</w:t>
+      </w:r>
+      <w:proofErr w:type="spellEnd"/>
+      <w:r>
+        <w:t xml:space="preserve"> time using interpolation is way out (right) where it jumps several days. </w:t>
       </w:r>
     </w:p>
     <w:p>
@@ -3984,7 +4973,23 @@
         </w:numPr>
       </w:pPr>
       <w:r>
-        <w:t>Ah. So. The GPS only had 1 reset but the accel had 2 and it cropped the accel too small… So. That is an issue. I have to change my joining logic.</w:t>
+        <w:t xml:space="preserve">Ah. </w:t>
+      </w:r>
+      <w:proofErr w:type="spellStart"/>
+      <w:r>
+        <w:t>So.</w:t>
+      </w:r>
+      <w:proofErr w:type="spellEnd"/>
+      <w:r>
+        <w:t xml:space="preserve"> The GPS only had 1 reset but the accel had 2 and it cropped the accel too small… </w:t>
+      </w:r>
+      <w:proofErr w:type="spellStart"/>
+      <w:r>
+        <w:t>So.</w:t>
+      </w:r>
+      <w:proofErr w:type="spellEnd"/>
+      <w:r>
+        <w:t xml:space="preserve"> That is an issue. I have to change my joining logic.</w:t>
       </w:r>
     </w:p>
     <w:p>
@@ -3996,7 +5001,23 @@
         </w:numPr>
       </w:pPr>
       <w:r>
-        <w:t>Changed the gps reset_events manually over to the longest accel sampling period number.</w:t>
+        <w:t xml:space="preserve">Changed the </w:t>
+      </w:r>
+      <w:proofErr w:type="spellStart"/>
+      <w:r>
+        <w:t>gps</w:t>
+      </w:r>
+      <w:proofErr w:type="spellEnd"/>
+      <w:r>
+        <w:t xml:space="preserve"> </w:t>
+      </w:r>
+      <w:proofErr w:type="spellStart"/>
+      <w:r>
+        <w:t>reset_events</w:t>
+      </w:r>
+      <w:proofErr w:type="spellEnd"/>
+      <w:r>
+        <w:t xml:space="preserve"> manually over to the longest accel sampling period number.</w:t>
       </w:r>
     </w:p>
     <w:p>
@@ -4031,8 +5052,13 @@
           <w:numId w:val="2"/>
         </w:numPr>
       </w:pPr>
-      <w:r>
-        <w:t>Jk. The next collar ran into a new problem. It never ends with this BS.</w:t>
+      <w:proofErr w:type="spellStart"/>
+      <w:r>
+        <w:t>Jk</w:t>
+      </w:r>
+      <w:proofErr w:type="spellEnd"/>
+      <w:r>
+        <w:t>. The next collar ran into a new problem. It never ends with this BS.</w:t>
       </w:r>
     </w:p>
     <w:p>
@@ -4058,6 +5084,7 @@
         <w:rPr>
           <w:noProof/>
         </w:rPr>
+        <w:lastRenderedPageBreak/>
         <w:drawing>
           <wp:inline distT="0" distB="0" distL="0" distR="0" wp14:anchorId="377498D4" wp14:editId="0303A175">
             <wp:extent cx="3321170" cy="1149890"/>
@@ -4182,7 +5209,15 @@
         </w:numPr>
       </w:pPr>
       <w:r>
-        <w:t>So am I meant to remove these files or not? When I leave them in, there’s issues. When I take them out, it works… But they seeeeeem like they’re correct</w:t>
+        <w:t xml:space="preserve">So am I meant to remove these files or not? When I leave them in, there’s issues. When I take them out, it works… But they </w:t>
+      </w:r>
+      <w:proofErr w:type="spellStart"/>
+      <w:r>
+        <w:t>seeeeeem</w:t>
+      </w:r>
+      <w:proofErr w:type="spellEnd"/>
+      <w:r>
+        <w:t xml:space="preserve"> like they’re correct</w:t>
       </w:r>
       <w:r>
         <w:t>? Until we understand how they got there, I’m reluctant to do anything</w:t>
@@ -4193,7 +5228,6 @@
         <w:pStyle w:val="Heading3"/>
       </w:pPr>
       <w:r>
-        <w:lastRenderedPageBreak/>
         <w:t>27/04</w:t>
       </w:r>
     </w:p>
@@ -4464,6 +5498,7 @@
         </w:numPr>
       </w:pPr>
       <w:r>
+        <w:lastRenderedPageBreak/>
         <w:t>The reproduction from the dead reckoning is</w:t>
       </w:r>
       <w:r>
@@ -4547,7 +5582,6 @@
         <w:rPr>
           <w:rFonts w:cs="Arial"/>
         </w:rPr>
-        <w:lastRenderedPageBreak/>
         <w:t>30/04</w:t>
       </w:r>
     </w:p>
@@ -4583,7 +5617,15 @@
         </w:numPr>
       </w:pPr>
       <w:r>
-        <w:t>“good mag cal (ensure not wearing watches /have phones/any magnetic interfering stuff on person etc. nearby when doing this)”</w:t>
+        <w:t xml:space="preserve">“good mag </w:t>
+      </w:r>
+      <w:proofErr w:type="spellStart"/>
+      <w:r>
+        <w:t>cal</w:t>
+      </w:r>
+      <w:proofErr w:type="spellEnd"/>
+      <w:r>
+        <w:t xml:space="preserve"> (ensure not wearing watches /have phones/any magnetic interfering stuff on person etc. nearby when doing this)”</w:t>
       </w:r>
     </w:p>
     <w:p>
@@ -4595,7 +5637,23 @@
         </w:numPr>
       </w:pPr>
       <w:r>
-        <w:t xml:space="preserve">“In terms of movement bouts, the simple approach would be to use some sort of acceleration magnitude threshold (e.g. VeDBA)... but for example, something like a kangaroo should be very obvious with jumping behaviour that should come out in acceleration traces as clear stylised patterns which could be manually discerned or via machine learning if you were able to do some groundtruthing of behaviours during the data acquisition period.” </w:t>
+        <w:t xml:space="preserve">“In terms of movement bouts, the simple approach would be to use some sort of acceleration magnitude threshold (e.g. </w:t>
+      </w:r>
+      <w:proofErr w:type="spellStart"/>
+      <w:r>
+        <w:t>VeDBA</w:t>
+      </w:r>
+      <w:proofErr w:type="spellEnd"/>
+      <w:r>
+        <w:t xml:space="preserve">)... but for example, something like a kangaroo should be very obvious with jumping behaviour that should come out in acceleration traces as clear stylised patterns which could be manually discerned or via machine learning if you were able to do some </w:t>
+      </w:r>
+      <w:proofErr w:type="spellStart"/>
+      <w:r>
+        <w:t>groundtruthing</w:t>
+      </w:r>
+      <w:proofErr w:type="spellEnd"/>
+      <w:r>
+        <w:t xml:space="preserve"> of behaviours during the data acquisition period.” </w:t>
       </w:r>
       <w:r>
         <w:sym w:font="Wingdings" w:char="F0E0"/>
@@ -4625,13 +5683,29 @@
         </w:numPr>
       </w:pPr>
       <w:r>
-        <w:t xml:space="preserve">“When the penguin is walking, the tag will be nearly vertical, while during swimming, it will be more horizontal. In both cases, the tag’s coordinate frame relative to the penguin’s natural movement (and the ground or water surface) will be different. To ensure accurate heading calculations, I would need to define different tag coordinate systems for walking and swimming and compute the heading separately for each period—on land and at sea—otherwise, my dead-reckoned (DR) tracks could be very innacurate.” </w:t>
+        <w:t xml:space="preserve">“When the penguin is walking, the tag will be nearly vertical, while during swimming, it will be more horizontal. In both cases, the tag’s coordinate frame relative to the penguin’s natural movement (and the ground or water surface) will be different. To ensure accurate heading calculations, I would need to define different tag coordinate systems for walking and swimming and compute the heading separately for each period—on land and at sea—otherwise, my dead-reckoned (DR) tracks could be very </w:t>
+      </w:r>
+      <w:proofErr w:type="spellStart"/>
+      <w:r>
+        <w:t>innacurate</w:t>
+      </w:r>
+      <w:proofErr w:type="spellEnd"/>
+      <w:r>
+        <w:t xml:space="preserve">.” </w:t>
       </w:r>
       <w:r>
         <w:sym w:font="Wingdings" w:char="F0E0"/>
       </w:r>
       <w:r>
-        <w:t xml:space="preserve"> no WONDER my flippy flippy stuff doesn’t work.</w:t>
+        <w:t xml:space="preserve"> no WONDER my flippy </w:t>
+      </w:r>
+      <w:proofErr w:type="spellStart"/>
+      <w:r>
+        <w:t>flippy</w:t>
+      </w:r>
+      <w:proofErr w:type="spellEnd"/>
+      <w:r>
+        <w:t xml:space="preserve"> stuff doesn’t work.</w:t>
       </w:r>
     </w:p>
     <w:p>
@@ -4643,7 +5717,19 @@
         </w:numPr>
       </w:pPr>
       <w:r>
-        <w:t>“If you know there’s a specific yaw offset in the tag placement, you can specify it in the compass function. If you’re unsure, you could compare the heading correction factors from Gundog.Tracks. If the headings are consistently biased in one direction, it could indicate a tag yaw offset or the need for magnetic declination adjustment. But again, if the tag’s yaw offset is minor and consistent, it’s not essential to correct this, as the dead-reckoned track will be consistently biased (in theory, the patterns and scales of tortuosity between GPS points should remain the same, just directionally offset somewhat), and the track segments get rotated when corrected with their endpoint GPS fixes during the correction process anyway.”</w:t>
+        <w:t xml:space="preserve">“If you know there’s a specific yaw offset in the tag placement, you can specify it in the compass function. If you’re unsure, you could compare the heading correction factors from </w:t>
+      </w:r>
+      <w:proofErr w:type="spellStart"/>
+      <w:r>
+        <w:t>Gundog.Tracks</w:t>
+      </w:r>
+      <w:proofErr w:type="spellEnd"/>
+      <w:r>
+        <w:t xml:space="preserve">. If the headings are consistently biased in one direction, it could indicate a tag yaw offset or the need for magnetic declination adjustment. But again, if the tag’s yaw offset is minor and consistent, it’s not essential to correct this, as the dead-reckoned track will be consistently biased (in theory, the patterns and scales of tortuosity between GPS points should remain the same, just </w:t>
+      </w:r>
+      <w:r>
+        <w:lastRenderedPageBreak/>
+        <w:t>directionally offset somewhat), and the track segments get rotated when corrected with their endpoint GPS fixes during the correction process anyway.”</w:t>
       </w:r>
     </w:p>
     <w:p>
@@ -4655,7 +5741,31 @@
         </w:numPr>
       </w:pPr>
       <w:r>
-        <w:t>“What I suggest is to first run the compass function without any offsets applied to derive the pitch and roll angles. Then, determine the mean values of both during periods where you believe the animal and collar are in a normal position, such as during low-activity, steady-state behavior. Once you have these values, re-run the function and input them as the 'pitch.offset' and 'roll.offset' parameters.”</w:t>
+        <w:t xml:space="preserve">“What I suggest is to first run the compass function without any offsets applied to derive the pitch and roll angles. Then, determine the mean values of both during periods where you believe the animal and collar are in a normal position, such as during low-activity, steady-state </w:t>
+      </w:r>
+      <w:proofErr w:type="spellStart"/>
+      <w:r>
+        <w:t>behavior</w:t>
+      </w:r>
+      <w:proofErr w:type="spellEnd"/>
+      <w:r>
+        <w:t>. Once you have these values, re-run the function and input them as the '</w:t>
+      </w:r>
+      <w:proofErr w:type="spellStart"/>
+      <w:r>
+        <w:t>pitch.offset</w:t>
+      </w:r>
+      <w:proofErr w:type="spellEnd"/>
+      <w:r>
+        <w:t>' and '</w:t>
+      </w:r>
+      <w:proofErr w:type="spellStart"/>
+      <w:r>
+        <w:t>roll.offset</w:t>
+      </w:r>
+      <w:proofErr w:type="spellEnd"/>
+      <w:r>
+        <w:t>' parameters.”</w:t>
       </w:r>
     </w:p>
     <w:p>
@@ -4667,7 +5777,15 @@
         </w:numPr>
       </w:pPr>
       <w:r>
-        <w:t>“if you supply a positive pitch offset value of 45°, this reflects that the device is pitched up by 45° from the level, and the function will de-rotate the supplied (smoothed) acc and mag (normalised) values by this amount. Similarly, a positive roll value indicates a rightward tilt (bank angle), and a positive yaw value represents a clockwise rotational offset”</w:t>
+        <w:t xml:space="preserve">“if you supply a positive pitch offset value of 45°, this reflects that the device is pitched up by 45° from the level, and the function will de-rotate the supplied (smoothed) </w:t>
+      </w:r>
+      <w:proofErr w:type="spellStart"/>
+      <w:r>
+        <w:t>acc</w:t>
+      </w:r>
+      <w:proofErr w:type="spellEnd"/>
+      <w:r>
+        <w:t xml:space="preserve"> and mag (normalised) values by this amount. Similarly, a positive roll value indicates a rightward tilt (bank angle), and a positive yaw value represents a clockwise rotational offset”</w:t>
       </w:r>
     </w:p>
     <w:p>
@@ -4679,7 +5797,6 @@
         </w:numPr>
       </w:pPr>
       <w:r>
-        <w:lastRenderedPageBreak/>
         <w:t>Luke wrote this: “for the raw files, ~2048 LSB = 1 G, and the magnetometer data has a sensitivity scale factor of 0.15 (</w:t>
       </w:r>
       <w:hyperlink r:id="rId48" w:history="1">
@@ -4709,7 +5826,95 @@
         </w:numPr>
       </w:pPr>
       <w:r>
-        <w:t>“The short answer is, yes - if a wrong ref frame was chosen then DR path wil be innacurate. But comparing subsets with GPS pre-correction will help debug if chosen orientation was correct. The patterns and directions of travel should be similar even if scale is not when compared to GPS. I had some lions where I had to 'figure' out the orientation post release. But visually it should be easy to decipher the heave axis of movmement in acc and mag (acc will be the one closest to +/-1 g most of the time, and mag will the one changing the least)... In terms of deciphering the acc/mag surge and sway dimensions, this may be more challenging. But for the acc, you would expect greater variation in surge dimension because they stick their head to ground to forage and then stick their head back up when travelling and vigalence, so that may help. If mag is different orientation set up to acc, then its worth just checking if you switch the surge/sway orientations then which one produces most realsitic DR track relative to GPS... by deciphering the heave axis and dimension of measured g, you already have homed in on just a few possible orientations it could be...”</w:t>
+        <w:t xml:space="preserve">“The short answer is, yes - if a wrong ref frame was chosen then DR path </w:t>
+      </w:r>
+      <w:proofErr w:type="spellStart"/>
+      <w:r>
+        <w:t>wil</w:t>
+      </w:r>
+      <w:proofErr w:type="spellEnd"/>
+      <w:r>
+        <w:t xml:space="preserve"> be </w:t>
+      </w:r>
+      <w:proofErr w:type="spellStart"/>
+      <w:r>
+        <w:t>innacurate</w:t>
+      </w:r>
+      <w:proofErr w:type="spellEnd"/>
+      <w:r>
+        <w:t xml:space="preserve">. But comparing subsets with GPS pre-correction will help debug if chosen orientation was correct. The patterns and directions of travel should be similar even if scale is not when compared to GPS. I had some lions where I had to 'figure' out the orientation post release. But visually it should be easy to decipher the heave axis of </w:t>
+      </w:r>
+      <w:proofErr w:type="spellStart"/>
+      <w:r>
+        <w:t>movmement</w:t>
+      </w:r>
+      <w:proofErr w:type="spellEnd"/>
+      <w:r>
+        <w:t xml:space="preserve"> in </w:t>
+      </w:r>
+      <w:proofErr w:type="spellStart"/>
+      <w:r>
+        <w:t>acc</w:t>
+      </w:r>
+      <w:proofErr w:type="spellEnd"/>
+      <w:r>
+        <w:t xml:space="preserve"> and mag (</w:t>
+      </w:r>
+      <w:proofErr w:type="spellStart"/>
+      <w:r>
+        <w:t>acc</w:t>
+      </w:r>
+      <w:proofErr w:type="spellEnd"/>
+      <w:r>
+        <w:t xml:space="preserve"> will be the one closest to +/-1 g most of the time, and mag will the one changing the least)... In terms of deciphering the </w:t>
+      </w:r>
+      <w:proofErr w:type="spellStart"/>
+      <w:r>
+        <w:t>acc</w:t>
+      </w:r>
+      <w:proofErr w:type="spellEnd"/>
+      <w:r>
+        <w:t xml:space="preserve">/mag surge and sway dimensions, this may be more challenging. But for the </w:t>
+      </w:r>
+      <w:proofErr w:type="spellStart"/>
+      <w:r>
+        <w:t>acc</w:t>
+      </w:r>
+      <w:proofErr w:type="spellEnd"/>
+      <w:r>
+        <w:t xml:space="preserve">, you would expect greater variation in surge dimension because they stick their head to ground to forage and then stick their head back up when travelling and </w:t>
+      </w:r>
+      <w:proofErr w:type="spellStart"/>
+      <w:r>
+        <w:t>vigalence</w:t>
+      </w:r>
+      <w:proofErr w:type="spellEnd"/>
+      <w:r>
+        <w:t xml:space="preserve">, so that may help. If mag is different orientation set up to </w:t>
+      </w:r>
+      <w:proofErr w:type="spellStart"/>
+      <w:r>
+        <w:t>acc</w:t>
+      </w:r>
+      <w:proofErr w:type="spellEnd"/>
+      <w:r>
+        <w:t xml:space="preserve">, then </w:t>
+      </w:r>
+      <w:proofErr w:type="spellStart"/>
+      <w:r>
+        <w:t>its</w:t>
+      </w:r>
+      <w:proofErr w:type="spellEnd"/>
+      <w:r>
+        <w:t xml:space="preserve"> worth just checking if you switch the surge/sway orientations then which one produces most </w:t>
+      </w:r>
+      <w:proofErr w:type="spellStart"/>
+      <w:r>
+        <w:t>realsitic</w:t>
+      </w:r>
+      <w:proofErr w:type="spellEnd"/>
+      <w:r>
+        <w:t xml:space="preserve"> DR track relative to GPS... by deciphering the heave axis and dimension of measured g, you already have homed in on just a few possible orientations it could be...”</w:t>
       </w:r>
     </w:p>
     <w:p>
@@ -4771,8 +5976,16 @@
           <w:rPr>
             <w:rStyle w:val="Hyperlink"/>
           </w:rPr>
-          <w:t>Dead-reckoning animal movements in R: a reappraisal using Gundog.Tracks</w:t>
+          <w:t xml:space="preserve">Dead-reckoning animal movements in R: a reappraisal using </w:t>
         </w:r>
+        <w:proofErr w:type="spellStart"/>
+        <w:r>
+          <w:rPr>
+            <w:rStyle w:val="Hyperlink"/>
+          </w:rPr>
+          <w:t>Gundog.Tracks</w:t>
+        </w:r>
+        <w:proofErr w:type="spellEnd"/>
       </w:hyperlink>
       <w:r>
         <w:t xml:space="preserve"> </w:t>
@@ -4811,7 +6024,11 @@
         </w:numPr>
       </w:pPr>
       <w:r>
-        <w:t>Dead-reckoning is a method used to reconstruct animal movement paths, based on sequentially integrating the vector of travel from a predetermined position using estimates of heading (also termed ‘bearing’ or ‘yaw’) and speed (and displacement about the vertical axis for 3-D movements), over an elapsed time interval</w:t>
+        <w:t xml:space="preserve">Dead-reckoning is a method used to reconstruct animal movement paths, based on sequentially integrating the vector of travel from a predetermined position using estimates of heading (also </w:t>
+      </w:r>
+      <w:r>
+        <w:lastRenderedPageBreak/>
+        <w:t>termed ‘bearing’ or ‘yaw’) and speed (and displacement about the vertical axis for 3-D movements), over an elapsed time interval</w:t>
       </w:r>
     </w:p>
     <w:p>
@@ -4833,12 +6050,28 @@
           <w:rFonts w:ascii="Cambria Math" w:hAnsi="Cambria Math"/>
         </w:rPr>
       </w:pPr>
+      <w:proofErr w:type="spellStart"/>
       <w:r>
         <w:rPr>
           <w:rFonts w:ascii="Cambria Math" w:hAnsi="Cambria Math"/>
         </w:rPr>
-        <w:t>Gundog.Tracks(TS, h, v, elv</w:t>
-      </w:r>
+        <w:t>Gundog.Tracks</w:t>
+      </w:r>
+      <w:proofErr w:type="spellEnd"/>
+      <w:r>
+        <w:rPr>
+          <w:rFonts w:ascii="Cambria Math" w:hAnsi="Cambria Math"/>
+        </w:rPr>
+        <w:t xml:space="preserve">(TS, h, v, </w:t>
+      </w:r>
+      <w:proofErr w:type="spellStart"/>
+      <w:r>
+        <w:rPr>
+          <w:rFonts w:ascii="Cambria Math" w:hAnsi="Cambria Math"/>
+        </w:rPr>
+        <w:t>elv</w:t>
+      </w:r>
+      <w:proofErr w:type="spellEnd"/>
       <w:r>
         <w:rPr>
           <w:rFonts w:ascii="Cambria Math" w:hAnsi="Cambria Math" w:cs="Arial"/>
@@ -4909,8 +6142,16 @@
         <w:rPr>
           <w:rFonts w:ascii="Cambria Math" w:hAnsi="Cambria Math"/>
         </w:rPr>
-        <w:t>NULL, ch</w:t>
-      </w:r>
+        <w:t xml:space="preserve">NULL, </w:t>
+      </w:r>
+      <w:proofErr w:type="spellStart"/>
+      <w:r>
+        <w:rPr>
+          <w:rFonts w:ascii="Cambria Math" w:hAnsi="Cambria Math"/>
+        </w:rPr>
+        <w:t>ch</w:t>
+      </w:r>
+      <w:proofErr w:type="spellEnd"/>
       <w:r>
         <w:rPr>
           <w:rFonts w:ascii="Cambria Math" w:hAnsi="Cambria Math" w:cs="Arial"/>
@@ -5053,8 +6294,16 @@
         <w:rPr>
           <w:rFonts w:ascii="Cambria Math" w:hAnsi="Cambria Math"/>
         </w:rPr>
-        <w:t>0, VP.lon</w:t>
-      </w:r>
+        <w:t xml:space="preserve">0, </w:t>
+      </w:r>
+      <w:proofErr w:type="spellStart"/>
+      <w:r>
+        <w:rPr>
+          <w:rFonts w:ascii="Cambria Math" w:hAnsi="Cambria Math"/>
+        </w:rPr>
+        <w:t>VP.lon</w:t>
+      </w:r>
+      <w:proofErr w:type="spellEnd"/>
       <w:r>
         <w:rPr>
           <w:rFonts w:ascii="Cambria Math" w:hAnsi="Cambria Math" w:cs="Arial"/>
@@ -5077,8 +6326,16 @@
         <w:rPr>
           <w:rFonts w:ascii="Cambria Math" w:hAnsi="Cambria Math"/>
         </w:rPr>
-        <w:t>NULL, VP.lat</w:t>
-      </w:r>
+        <w:t xml:space="preserve">NULL, </w:t>
+      </w:r>
+      <w:proofErr w:type="spellStart"/>
+      <w:r>
+        <w:rPr>
+          <w:rFonts w:ascii="Cambria Math" w:hAnsi="Cambria Math"/>
+        </w:rPr>
+        <w:t>VP.lat</w:t>
+      </w:r>
+      <w:proofErr w:type="spellEnd"/>
       <w:r>
         <w:rPr>
           <w:rFonts w:ascii="Cambria Math" w:hAnsi="Cambria Math" w:cs="Arial"/>
@@ -5173,8 +6430,16 @@
         <w:rPr>
           <w:rFonts w:ascii="Cambria Math" w:hAnsi="Cambria Math"/>
         </w:rPr>
-        <w:t>1, dist.step</w:t>
-      </w:r>
+        <w:t xml:space="preserve">1, </w:t>
+      </w:r>
+      <w:proofErr w:type="spellStart"/>
+      <w:r>
+        <w:rPr>
+          <w:rFonts w:ascii="Cambria Math" w:hAnsi="Cambria Math"/>
+        </w:rPr>
+        <w:t>dist.step</w:t>
+      </w:r>
+      <w:proofErr w:type="spellEnd"/>
       <w:r>
         <w:rPr>
           <w:rFonts w:ascii="Cambria Math" w:hAnsi="Cambria Math" w:cs="Arial"/>
@@ -5314,11 +6579,7 @@
         <w:ind w:left="2520"/>
       </w:pPr>
       <w:r>
-        <w:t xml:space="preserve">The user may also opt to supply a ‘marked events’ (ME) vector (a marked event is a term we use that refers to a number of sequential (in time) data points within a </w:t>
-      </w:r>
-      <w:r>
-        <w:lastRenderedPageBreak/>
-        <w:t>dataset coded by integer values) to ensure dead-reckoned tracks are not advanced with non-animal movement behaviours.</w:t>
+        <w:t>The user may also opt to supply a ‘marked events’ (ME) vector (a marked event is a term we use that refers to a number of sequential (in time) data points within a dataset coded by integer values) to ensure dead-reckoned tracks are not advanced with non-animal movement behaviours.</w:t>
       </w:r>
     </w:p>
     <w:p>
@@ -5362,7 +6623,15 @@
         <w:sym w:font="Wingdings" w:char="F0E0"/>
       </w:r>
       <w:r>
-        <w:t xml:space="preserve"> okay, nevermind, we aren’t high frequency enough for this to matter</w:t>
+        <w:t xml:space="preserve"> okay, </w:t>
+      </w:r>
+      <w:proofErr w:type="spellStart"/>
+      <w:r>
+        <w:t>nevermind</w:t>
+      </w:r>
+      <w:proofErr w:type="spellEnd"/>
+      <w:r>
+        <w:t>, we aren’t high frequency enough for this to matter</w:t>
       </w:r>
     </w:p>
     <w:p>
@@ -5401,7 +6670,15 @@
         <w:ind w:left="1080"/>
       </w:pPr>
       <w:r>
-        <w:t>Within Gundog.Tracks, the user can modulate m, c and ME values to switch between predetermined speed (m</w:t>
+        <w:t xml:space="preserve">Within </w:t>
+      </w:r>
+      <w:proofErr w:type="spellStart"/>
+      <w:r>
+        <w:t>Gundog.Tracks</w:t>
+      </w:r>
+      <w:proofErr w:type="spellEnd"/>
+      <w:r>
+        <w:t>, the user can modulate m, c and ME values to switch between predetermined speed (m</w:t>
       </w:r>
       <w:r>
         <w:rPr>
@@ -5507,7 +6784,15 @@
         <w:ind w:left="1080"/>
       </w:pPr>
       <w:r>
-        <w:t>Here an an example from his data that shows the expected error… if he’s using it in the paper then it must be considered good:</w:t>
+        <w:t xml:space="preserve">Here an </w:t>
+      </w:r>
+      <w:proofErr w:type="spellStart"/>
+      <w:r>
+        <w:t>an</w:t>
+      </w:r>
+      <w:proofErr w:type="spellEnd"/>
+      <w:r>
+        <w:t xml:space="preserve"> example from his data that shows the expected error… if he’s using it in the paper then it must be considered good:</w:t>
       </w:r>
     </w:p>
     <w:p>
@@ -5631,6 +6916,7 @@
         <w:ind w:left="1080"/>
       </w:pPr>
       <w:r>
+        <w:lastRenderedPageBreak/>
         <w:t>VP error becomes more relevant at smaller scales of assessed movement and this is the reason why VP distance-moved estimates can go from being typically underestimated at low frequencies (due to linear interpolation of tortuous movements) [26, 140, 141] to overestimated at high frequencies [97, 136] and result in highly variable correction factors within the VPC dead-reckoning process</w:t>
       </w:r>
     </w:p>
@@ -5689,7 +6975,21 @@
         <w:rPr>
           <w:highlight w:val="yellow"/>
         </w:rPr>
-        <w:t>Should I be downsampling my accelerometer? Have I missed that?</w:t>
+        <w:t xml:space="preserve">Should I be </w:t>
+      </w:r>
+      <w:proofErr w:type="spellStart"/>
+      <w:r>
+        <w:rPr>
+          <w:highlight w:val="yellow"/>
+        </w:rPr>
+        <w:t>downsampling</w:t>
+      </w:r>
+      <w:proofErr w:type="spellEnd"/>
+      <w:r>
+        <w:rPr>
+          <w:highlight w:val="yellow"/>
+        </w:rPr>
+        <w:t xml:space="preserve"> my accelerometer? Have I missed that?</w:t>
       </w:r>
     </w:p>
     <w:p>
@@ -5715,7 +7015,6 @@
         <w:ind w:left="1800"/>
       </w:pPr>
       <w:r>
-        <w:lastRenderedPageBreak/>
         <w:t>Correct coordinate system axis alignment and suitable calibration of tri-axial magnetometry data are crucial pre-processors, without which, heading estimates would likely incorporate substantial error</w:t>
       </w:r>
     </w:p>
@@ -5807,7 +7106,15 @@
         <w:ind w:left="1080"/>
       </w:pPr>
       <w:r>
-        <w:t>We recommend implementing a running mean (cf. Eq. 1, R1:4) to raw VeDBA values to ensure that both acceleration and deceleration components of a stride cycle are incorporated together per unit time and to reduce the magnitude of small temporal spikes</w:t>
+        <w:t xml:space="preserve">We recommend implementing a running mean (cf. Eq. 1, R1:4) to raw </w:t>
+      </w:r>
+      <w:proofErr w:type="spellStart"/>
+      <w:r>
+        <w:t>VeDBA</w:t>
+      </w:r>
+      <w:proofErr w:type="spellEnd"/>
+      <w:r>
+        <w:t xml:space="preserve"> values to ensure that both acceleration and deceleration components of a stride cycle are incorporated together per unit time and to reduce the magnitude of small temporal spikes</w:t>
       </w:r>
     </w:p>
     <w:p>
@@ -5841,6 +7148,7 @@
         <w:pStyle w:val="Heading4"/>
       </w:pPr>
       <w:r>
+        <w:lastRenderedPageBreak/>
         <w:t>Read the Supplementary information he provided</w:t>
       </w:r>
     </w:p>
@@ -5889,11 +7197,7 @@
         </w:numPr>
       </w:pPr>
       <w:r>
-        <w:t xml:space="preserve">Assuming the magnetometer and accelerometer channels are in alignment, the x-channel magnetometer reading is at a maximum and minimum when the (whole) device (positioned flat) is pointed North and South, respectively. The y-channel is at a maximum when the device is rotated to point West and reads a minimum when the device is pointed East, with the z-channel reading remaining relatively constant. Conversely, the y-axis will read a maximum when the device is pointed East following a 180o inversion, with the z-axis </w:t>
-      </w:r>
-      <w:r>
-        <w:lastRenderedPageBreak/>
-        <w:t xml:space="preserve">reading (though still constant) being lower than the upright condition (in the Northern hemisphere), because the channel is aligned against the downward geomagnetic field vector. </w:t>
+        <w:t xml:space="preserve">Assuming the magnetometer and accelerometer channels are in alignment, the x-channel magnetometer reading is at a maximum and minimum when the (whole) device (positioned flat) is pointed North and South, respectively. The y-channel is at a maximum when the device is rotated to point West and reads a minimum when the device is pointed East, with the z-channel reading remaining relatively constant. Conversely, the y-axis will read a maximum when the device is pointed East following a 180o inversion, with the z-axis reading (though still constant) being lower than the upright condition (in the Northern hemisphere), because the channel is aligned against the downward geomagnetic field vector. </w:t>
       </w:r>
     </w:p>
     <w:p>
@@ -6060,6 +7364,7 @@
         </w:numPr>
       </w:pPr>
       <w:r>
+        <w:lastRenderedPageBreak/>
         <w:t>Based on inspection of the actual collar, looks like the Y axis is completely up, X is side to size, and Z is back and forth. And then the Magnetometer is different in that Y is straight down when flat.</w:t>
       </w:r>
     </w:p>
@@ -6101,7 +7406,6 @@
         <w:rPr>
           <w:noProof/>
         </w:rPr>
-        <w:lastRenderedPageBreak/>
         <w:drawing>
           <wp:inline distT="0" distB="0" distL="0" distR="0" wp14:anchorId="18761DBC" wp14:editId="065F80D4">
             <wp:extent cx="2971935" cy="2424223"/>
@@ -6175,8 +7479,13 @@
           </w:tcPr>
           <w:p>
             <w:r>
-              <w:t>X acc</w:t>
+              <w:t xml:space="preserve">X </w:t>
             </w:r>
+            <w:proofErr w:type="spellStart"/>
+            <w:r>
+              <w:t>acc</w:t>
+            </w:r>
+            <w:proofErr w:type="spellEnd"/>
           </w:p>
         </w:tc>
         <w:tc>
@@ -6220,8 +7529,13 @@
           </w:tcPr>
           <w:p>
             <w:r>
-              <w:t>Y acc</w:t>
+              <w:t xml:space="preserve">Y </w:t>
             </w:r>
+            <w:proofErr w:type="spellStart"/>
+            <w:r>
+              <w:t>acc</w:t>
+            </w:r>
+            <w:proofErr w:type="spellEnd"/>
           </w:p>
         </w:tc>
         <w:tc>
@@ -6265,8 +7579,13 @@
           </w:tcPr>
           <w:p>
             <w:r>
-              <w:t>Z acc</w:t>
+              <w:t xml:space="preserve">Z </w:t>
             </w:r>
+            <w:proofErr w:type="spellStart"/>
+            <w:r>
+              <w:t>acc</w:t>
+            </w:r>
+            <w:proofErr w:type="spellEnd"/>
           </w:p>
         </w:tc>
         <w:tc>
@@ -6434,7 +7753,15 @@
         </w:numPr>
       </w:pPr>
       <w:r>
-        <w:t xml:space="preserve">I then tried to verify this by looking at the accelerometer data when the animal was standing up (ground-truthed with video). Red is X, Blue is Y, Green is Z. When the animal is standing up, the X axis has close to 0 gravity. The gravity is shared over the Y and Z, with the most on the Z. This indicates that the collar is tipped forwards. </w:t>
+        <w:t>I then tried to verify this by looking at the accelerometer data when the animal was standing up (ground-</w:t>
+      </w:r>
+      <w:proofErr w:type="spellStart"/>
+      <w:r>
+        <w:t>truthed</w:t>
+      </w:r>
+      <w:proofErr w:type="spellEnd"/>
+      <w:r>
+        <w:t xml:space="preserve"> with video). Red is X, Blue is Y, Green is Z. When the animal is standing up, the X axis has close to 0 gravity. The gravity is shared over the Y and Z, with the most on the Z. This indicates that the collar is tipped forwards. </w:t>
       </w:r>
     </w:p>
     <w:p>
@@ -6568,6 +7895,7 @@
               </w:tabs>
             </w:pPr>
             <w:r>
+              <w:lastRenderedPageBreak/>
               <w:t>Z</w:t>
             </w:r>
           </w:p>
@@ -6593,7 +7921,15 @@
         </w:numPr>
       </w:pPr>
       <w:r>
-        <w:t>Therefore, I propose the orientation is: acc EUS, mag EDN, gravity down, and a pitch forward of about 48 degrees…</w:t>
+        <w:t xml:space="preserve">Therefore, I propose the orientation is: </w:t>
+      </w:r>
+      <w:proofErr w:type="spellStart"/>
+      <w:r>
+        <w:t>acc</w:t>
+      </w:r>
+      <w:proofErr w:type="spellEnd"/>
+      <w:r>
+        <w:t xml:space="preserve"> EUS, mag EDN, gravity down, and a pitch forward of about 48 degrees…</w:t>
       </w:r>
     </w:p>
     <w:p>
@@ -6617,7 +7953,6 @@
         <w:rPr>
           <w:noProof/>
         </w:rPr>
-        <w:lastRenderedPageBreak/>
         <w:drawing>
           <wp:inline distT="0" distB="0" distL="0" distR="0" wp14:anchorId="71D766C5" wp14:editId="3D52BA60">
             <wp:extent cx="3268958" cy="3036498"/>
@@ -6783,6 +8118,7 @@
         <w:rPr>
           <w:rFonts w:cs="Arial"/>
         </w:rPr>
+        <w:lastRenderedPageBreak/>
         <w:t>05/05</w:t>
       </w:r>
     </w:p>
@@ -6825,7 +8161,6 @@
         </w:numPr>
       </w:pPr>
       <w:r>
-        <w:lastRenderedPageBreak/>
         <w:t xml:space="preserve">Often I see people using </w:t>
       </w:r>
       <w:r>
@@ -6868,7 +8203,15 @@
         <w:t>I have seen information about the Median Filter come up</w:t>
       </w:r>
       <w:r>
-        <w:t>… trialing that now.</w:t>
+        <w:t xml:space="preserve">… </w:t>
+      </w:r>
+      <w:proofErr w:type="spellStart"/>
+      <w:r>
+        <w:t>trialing</w:t>
+      </w:r>
+      <w:proofErr w:type="spellEnd"/>
+      <w:r>
+        <w:t xml:space="preserve"> that now.</w:t>
       </w:r>
     </w:p>
     <w:p>
@@ -7184,6 +8527,7 @@
         <w:rPr>
           <w:noProof/>
         </w:rPr>
+        <w:lastRenderedPageBreak/>
         <mc:AlternateContent>
           <mc:Choice Requires="wps">
             <w:drawing>
@@ -7317,7 +8661,6 @@
         <w:rPr>
           <w:rFonts w:cs="Arial"/>
         </w:rPr>
-        <w:lastRenderedPageBreak/>
         <w:t>06/05</w:t>
       </w:r>
     </w:p>
@@ -7427,7 +8770,15 @@
         </w:numPr>
       </w:pPr>
       <w:r>
-        <w:t>I have put message in chat to get ChrisB thoughts but in the meantime I will work towards what I think the next step will be: finding all the misread sections and removing them. Similar to the kangaroo data (though that’s worse), we have to go through and chop up the data into good sections with NA’s in between</w:t>
+        <w:t xml:space="preserve">I have put message in chat to get </w:t>
+      </w:r>
+      <w:proofErr w:type="spellStart"/>
+      <w:r>
+        <w:t>ChrisB</w:t>
+      </w:r>
+      <w:proofErr w:type="spellEnd"/>
+      <w:r>
+        <w:t xml:space="preserve"> thoughts but in the meantime I will work towards what I think the next step will be: finding all the misread sections and removing them. Similar to the kangaroo data (though that’s worse), we have to go through and chop up the data into good sections with NA’s in between</w:t>
       </w:r>
       <w:r>
         <w:t>?</w:t>
@@ -7517,6 +8868,7 @@
         <w:rPr>
           <w:noProof/>
         </w:rPr>
+        <w:lastRenderedPageBreak/>
         <w:drawing>
           <wp:inline distT="0" distB="0" distL="0" distR="0" wp14:anchorId="179C742E" wp14:editId="3526751C">
             <wp:extent cx="4489314" cy="2028825"/>
@@ -7573,7 +8925,6 @@
         </w:numPr>
       </w:pPr>
       <w:r>
-        <w:lastRenderedPageBreak/>
         <w:t>I pulled out the annotated data that Amelia made and had a look</w:t>
       </w:r>
       <w:r>
@@ -7634,7 +8985,15 @@
         </w:numPr>
       </w:pPr>
       <w:r>
-        <w:t>Then ChrisB pointed out that this was happening over hours not minutes, and is therefore more likely to be sleeping. He said “</w:t>
+        <w:t xml:space="preserve">Then </w:t>
+      </w:r>
+      <w:proofErr w:type="spellStart"/>
+      <w:r>
+        <w:t>ChrisB</w:t>
+      </w:r>
+      <w:proofErr w:type="spellEnd"/>
+      <w:r>
+        <w:t xml:space="preserve"> pointed out that this was happening over hours not minutes, and is therefore more likely to be sleeping. He said “</w:t>
       </w:r>
       <w:r>
         <w:rPr>
@@ -7643,7 +9002,15 @@
         <w:t>In that static accelerometer region it's likely just measuring gravity, but if the rotation of the collar isn't pointing the right way it will see that as an acceleration in the wrong direction and pick that up as movement”</w:t>
       </w:r>
       <w:r>
-        <w:t xml:space="preserve">. Ahhhh brilliant man has saved me once again. So if I can detect that as sleeping then I can set to no movement and no DR during that period. </w:t>
+        <w:t xml:space="preserve">. </w:t>
+      </w:r>
+      <w:proofErr w:type="spellStart"/>
+      <w:r>
+        <w:t>Ahhhh</w:t>
+      </w:r>
+      <w:proofErr w:type="spellEnd"/>
+      <w:r>
+        <w:t xml:space="preserve"> brilliant man has saved me once again. So if I can detect that as sleeping then I can set to no movement and no DR during that period. </w:t>
       </w:r>
     </w:p>
     <w:p>
@@ -7778,6 +9145,7 @@
         </w:numPr>
       </w:pPr>
       <w:r>
+        <w:lastRenderedPageBreak/>
         <w:t>Note that this will be easier once I have built the behavioural detection model.</w:t>
       </w:r>
       <w:r>
@@ -7790,7 +9158,15 @@
         <w:sym w:font="Wingdings" w:char="F0E0"/>
       </w:r>
       <w:r>
-        <w:t xml:space="preserve"> ifelse(VDBA.sm &gt; 0.015, 0, 1) &amp; most common level in 60 seconds (3000 samples)</w:t>
+        <w:t xml:space="preserve"> </w:t>
+      </w:r>
+      <w:proofErr w:type="spellStart"/>
+      <w:r>
+        <w:t>ifelse</w:t>
+      </w:r>
+      <w:proofErr w:type="spellEnd"/>
+      <w:r>
+        <w:t>(VDBA.sm &gt; 0.015, 0, 1) &amp; most common level in 60 seconds (3000 samples)</w:t>
       </w:r>
       <w:r>
         <w:t>)</w:t>
@@ -7808,7 +9184,15 @@
         <w:t xml:space="preserve">Testing that </w:t>
       </w:r>
       <w:r>
-        <w:t>however showed no difference and the gps is moving consistently through the period???</w:t>
+        <w:t xml:space="preserve">however showed no difference and the </w:t>
+      </w:r>
+      <w:proofErr w:type="spellStart"/>
+      <w:r>
+        <w:t>gps</w:t>
+      </w:r>
+      <w:proofErr w:type="spellEnd"/>
+      <w:r>
+        <w:t xml:space="preserve"> is moving consistently through the period???</w:t>
       </w:r>
     </w:p>
     <w:p>
@@ -7925,7 +9309,6 @@
         </w:numPr>
       </w:pPr>
       <w:r>
-        <w:lastRenderedPageBreak/>
         <w:t>I then isolated just the part where my accel says the GPS isn’t moving…</w:t>
       </w:r>
       <w:r>
@@ -8048,7 +9431,15 @@
         </w:numPr>
       </w:pPr>
       <w:r>
-        <w:t>Firstly I continued with the cleaning by adding a lowpass butterworth filter with a cutoff of 10Hz. The results of the 3 steps of smoothing shown in right plot below.</w:t>
+        <w:t xml:space="preserve">Firstly I continued with the cleaning by adding a lowpass </w:t>
+      </w:r>
+      <w:proofErr w:type="spellStart"/>
+      <w:r>
+        <w:t>butterworth</w:t>
+      </w:r>
+      <w:proofErr w:type="spellEnd"/>
+      <w:r>
+        <w:t xml:space="preserve"> filter with a cutoff of 10Hz. The results of the 3 steps of smoothing shown in right plot below.</w:t>
       </w:r>
     </w:p>
     <w:p>
@@ -8059,6 +9450,7 @@
         <w:rPr>
           <w:noProof/>
         </w:rPr>
+        <w:lastRenderedPageBreak/>
         <w:drawing>
           <wp:inline distT="0" distB="0" distL="0" distR="0" wp14:anchorId="2EE48A98" wp14:editId="50652237">
             <wp:extent cx="2755534" cy="1831729"/>
@@ -8183,7 +9575,15 @@
         <w:t>For example, in this case, there are 2 stationary periods where there should be no GPS changes.</w:t>
       </w:r>
       <w:r>
-        <w:t xml:space="preserve"> The dark blue dots in the gps graph right show the stationary periods. The green dots are what got fed to the spline and the red is the spline path.</w:t>
+        <w:t xml:space="preserve"> The dark blue dots in the </w:t>
+      </w:r>
+      <w:proofErr w:type="spellStart"/>
+      <w:r>
+        <w:t>gps</w:t>
+      </w:r>
+      <w:proofErr w:type="spellEnd"/>
+      <w:r>
+        <w:t xml:space="preserve"> graph right show the stationary periods. The green dots are what got fed to the spline and the red is the spline path.</w:t>
       </w:r>
       <w:r>
         <w:t xml:space="preserve"> Note there are only 2 black dots because all the stationary got grouped.</w:t>
@@ -8197,7 +9597,6 @@
         <w:rPr>
           <w:noProof/>
         </w:rPr>
-        <w:lastRenderedPageBreak/>
         <w:drawing>
           <wp:inline distT="0" distB="0" distL="0" distR="0" wp14:anchorId="40446698" wp14:editId="16FE6B86">
             <wp:extent cx="2475659" cy="1329070"/>
@@ -8397,6 +9796,7 @@
         <w:rPr>
           <w:noProof/>
         </w:rPr>
+        <w:lastRenderedPageBreak/>
         <w:drawing>
           <wp:inline distT="0" distB="0" distL="0" distR="0" wp14:anchorId="6C3EAFDB" wp14:editId="2E546024">
             <wp:extent cx="6858000" cy="2821940"/>
@@ -8443,7 +9843,15 @@
         </w:numPr>
       </w:pPr>
       <w:r>
-        <w:t xml:space="preserve">Then ChrisB helped me for a few hours, figuring out many things. For example, he found that everything was scaled by 4 because the settings of the accelerometer weren’t what I thought. (They were 16 for the kangaroos but 4 for the impala) </w:t>
+        <w:t xml:space="preserve">Then </w:t>
+      </w:r>
+      <w:proofErr w:type="spellStart"/>
+      <w:r>
+        <w:t>ChrisB</w:t>
+      </w:r>
+      <w:proofErr w:type="spellEnd"/>
+      <w:r>
+        <w:t xml:space="preserve"> helped me for a few hours, figuring out many things. For example, he found that everything was scaled by 4 because the settings of the accelerometer weren’t what I thought. (They were 16 for the kangaroos but 4 for the impala) </w:t>
       </w:r>
     </w:p>
     <w:p>
@@ -8455,7 +9863,6 @@
         </w:numPr>
       </w:pPr>
       <w:r>
-        <w:lastRenderedPageBreak/>
         <w:t>“Accelerometer scaling of 2048 LSB/g assumes the full-scale range is set to +/-16g. This is (should be) the case for the kangaroo data, but I don’t believe is the case for impala. Impala may have been at +/-4g.” ~ Chris Bird… and see fact sheet below.</w:t>
       </w:r>
     </w:p>
@@ -8536,7 +9943,15 @@
         </w:numPr>
       </w:pPr>
       <w:r>
-        <w:t>Chris Bird also doesn’t believe in tilt-corrected accelerometer based DR and thinks we should have to use the gyroscope (pronounced guyroscope… as I learnt today)</w:t>
+        <w:t xml:space="preserve">Chris Bird also doesn’t believe in tilt-corrected accelerometer based DR and thinks we should have to use the gyroscope (pronounced </w:t>
+      </w:r>
+      <w:proofErr w:type="spellStart"/>
+      <w:r>
+        <w:t>guyroscope</w:t>
+      </w:r>
+      <w:proofErr w:type="spellEnd"/>
+      <w:r>
+        <w:t>… as I learnt today)</w:t>
       </w:r>
     </w:p>
     <w:p>
@@ -8580,7 +9995,47 @@
           <w:i/>
           <w:iCs/>
         </w:rPr>
-        <w:t xml:space="preserve">The short answer is, yes - if a wrong ref frame was chosen then DR path wil be innacurate. But comparing subsets with GPS pre-correction will help debug if chosen orientation was correct. The patterns and directions of travel should be similar even if scale is not when compared to GPS. I had some lions where I had to 'figure' out the orientation post release. But visually it should be easy to decipher the </w:t>
+        <w:t xml:space="preserve">The short answer is, yes - if a wrong ref frame was chosen then DR path </w:t>
+      </w:r>
+      <w:proofErr w:type="spellStart"/>
+      <w:r>
+        <w:rPr>
+          <w:i/>
+          <w:iCs/>
+        </w:rPr>
+        <w:t>wil</w:t>
+      </w:r>
+      <w:proofErr w:type="spellEnd"/>
+      <w:r>
+        <w:rPr>
+          <w:i/>
+          <w:iCs/>
+        </w:rPr>
+        <w:t xml:space="preserve"> be </w:t>
+      </w:r>
+      <w:proofErr w:type="spellStart"/>
+      <w:r>
+        <w:rPr>
+          <w:i/>
+          <w:iCs/>
+        </w:rPr>
+        <w:t>innacurate</w:t>
+      </w:r>
+      <w:proofErr w:type="spellEnd"/>
+      <w:r>
+        <w:rPr>
+          <w:i/>
+          <w:iCs/>
+        </w:rPr>
+        <w:t xml:space="preserve">. But comparing subsets with GPS pre-correction will help debug if chosen orientation was </w:t>
+      </w:r>
+      <w:r>
+        <w:rPr>
+          <w:i/>
+          <w:iCs/>
+        </w:rPr>
+        <w:lastRenderedPageBreak/>
+        <w:t xml:space="preserve">correct. The patterns and directions of travel should be similar even if scale is not when compared to GPS. I had some lions where I had to 'figure' out the orientation post release. But visually it should be easy to decipher the </w:t>
       </w:r>
       <w:r>
         <w:rPr>
@@ -8588,44 +10043,164 @@
           <w:iCs/>
           <w:highlight w:val="green"/>
         </w:rPr>
-        <w:t>heave axis of movmement</w:t>
-      </w:r>
-      <w:r>
-        <w:rPr>
-          <w:i/>
-          <w:iCs/>
-        </w:rPr>
-        <w:t xml:space="preserve"> in acc and mag (</w:t>
-      </w:r>
+        <w:t xml:space="preserve">heave axis of </w:t>
+      </w:r>
+      <w:proofErr w:type="spellStart"/>
       <w:r>
         <w:rPr>
           <w:i/>
           <w:iCs/>
           <w:highlight w:val="green"/>
         </w:rPr>
-        <w:t>acc will be the one closest to +/-1 g most of the time, and mag will the one changing the least</w:t>
-      </w:r>
+        <w:t>movmement</w:t>
+      </w:r>
+      <w:proofErr w:type="spellEnd"/>
       <w:r>
         <w:rPr>
           <w:i/>
           <w:iCs/>
         </w:rPr>
-        <w:t xml:space="preserve">)... In terms of deciphering the acc/mag surge and sway dimensions, this may be more challenging. But for the </w:t>
-      </w:r>
+        <w:t xml:space="preserve"> in </w:t>
+      </w:r>
+      <w:proofErr w:type="spellStart"/>
+      <w:r>
+        <w:rPr>
+          <w:i/>
+          <w:iCs/>
+        </w:rPr>
+        <w:t>acc</w:t>
+      </w:r>
+      <w:proofErr w:type="spellEnd"/>
+      <w:r>
+        <w:rPr>
+          <w:i/>
+          <w:iCs/>
+        </w:rPr>
+        <w:t xml:space="preserve"> and mag (</w:t>
+      </w:r>
+      <w:proofErr w:type="spellStart"/>
+      <w:r>
+        <w:rPr>
+          <w:i/>
+          <w:iCs/>
+          <w:highlight w:val="green"/>
+        </w:rPr>
+        <w:t>acc</w:t>
+      </w:r>
+      <w:proofErr w:type="spellEnd"/>
+      <w:r>
+        <w:rPr>
+          <w:i/>
+          <w:iCs/>
+          <w:highlight w:val="green"/>
+        </w:rPr>
+        <w:t xml:space="preserve"> will be the one closest to +/-1 g most of the time, and mag will the one changing the least</w:t>
+      </w:r>
+      <w:r>
+        <w:rPr>
+          <w:i/>
+          <w:iCs/>
+        </w:rPr>
+        <w:t xml:space="preserve">)... In terms of deciphering the </w:t>
+      </w:r>
+      <w:proofErr w:type="spellStart"/>
+      <w:r>
+        <w:rPr>
+          <w:i/>
+          <w:iCs/>
+        </w:rPr>
+        <w:t>acc</w:t>
+      </w:r>
+      <w:proofErr w:type="spellEnd"/>
+      <w:r>
+        <w:rPr>
+          <w:i/>
+          <w:iCs/>
+        </w:rPr>
+        <w:t xml:space="preserve">/mag surge and sway dimensions, this may be more challenging. But for the </w:t>
+      </w:r>
+      <w:proofErr w:type="spellStart"/>
       <w:r>
         <w:rPr>
           <w:i/>
           <w:iCs/>
           <w:highlight w:val="yellow"/>
         </w:rPr>
-        <w:t>acc, you would expect greater variation in surge dimension because they stick their head to ground to forage and then stick their head back up when travelling and vigalence</w:t>
-      </w:r>
+        <w:t>acc</w:t>
+      </w:r>
+      <w:proofErr w:type="spellEnd"/>
       <w:r>
         <w:rPr>
           <w:i/>
           <w:iCs/>
-        </w:rPr>
-        <w:t>, so that may help. If mag is different orientation set up to acc, then its worth just checking if you switch the surge/sway orientations then which one produces most realsitic DR track relative to GPS... by deciphering the heave axis and dimension of measured g, you already have homed in on just a few possible orientations it could be...</w:t>
+          <w:highlight w:val="yellow"/>
+        </w:rPr>
+        <w:t xml:space="preserve">, you would expect greater variation in surge dimension because they stick their head to ground to forage and then stick their head back up when travelling and </w:t>
+      </w:r>
+      <w:proofErr w:type="spellStart"/>
+      <w:r>
+        <w:rPr>
+          <w:i/>
+          <w:iCs/>
+          <w:highlight w:val="yellow"/>
+        </w:rPr>
+        <w:t>vigalence</w:t>
+      </w:r>
+      <w:proofErr w:type="spellEnd"/>
+      <w:r>
+        <w:rPr>
+          <w:i/>
+          <w:iCs/>
+        </w:rPr>
+        <w:t xml:space="preserve">, so that may help. If mag is different orientation set up to </w:t>
+      </w:r>
+      <w:proofErr w:type="spellStart"/>
+      <w:r>
+        <w:rPr>
+          <w:i/>
+          <w:iCs/>
+        </w:rPr>
+        <w:t>acc</w:t>
+      </w:r>
+      <w:proofErr w:type="spellEnd"/>
+      <w:r>
+        <w:rPr>
+          <w:i/>
+          <w:iCs/>
+        </w:rPr>
+        <w:t xml:space="preserve">, then </w:t>
+      </w:r>
+      <w:proofErr w:type="spellStart"/>
+      <w:r>
+        <w:rPr>
+          <w:i/>
+          <w:iCs/>
+        </w:rPr>
+        <w:t>its</w:t>
+      </w:r>
+      <w:proofErr w:type="spellEnd"/>
+      <w:r>
+        <w:rPr>
+          <w:i/>
+          <w:iCs/>
+        </w:rPr>
+        <w:t xml:space="preserve"> worth just checking if you switch the surge/sway orientations then which one produces most </w:t>
+      </w:r>
+      <w:proofErr w:type="spellStart"/>
+      <w:r>
+        <w:rPr>
+          <w:i/>
+          <w:iCs/>
+        </w:rPr>
+        <w:t>realsitic</w:t>
+      </w:r>
+      <w:proofErr w:type="spellEnd"/>
+      <w:r>
+        <w:rPr>
+          <w:i/>
+          <w:iCs/>
+        </w:rPr>
+        <w:t xml:space="preserve"> DR track relative to GPS... by deciphering the heave axis and dimension of measured g, you already have homed in on just a few possible orientations it could be...</w:t>
       </w:r>
     </w:p>
     <w:p>
@@ -8649,7 +10224,6 @@
         <w:rPr>
           <w:noProof/>
         </w:rPr>
-        <w:lastRenderedPageBreak/>
         <w:drawing>
           <wp:inline distT="0" distB="0" distL="0" distR="0" wp14:anchorId="2FFBE73A" wp14:editId="2DD9D372">
             <wp:extent cx="3357245" cy="2784143"/>
@@ -8811,8 +10385,29 @@
           <w:numId w:val="2"/>
         </w:numPr>
       </w:pPr>
-      <w:r>
-        <w:t>acc_orientation &lt;- "NWU",   mag_orientation &lt;- "NED",   gravity_direction &lt;- "down",   pitch &lt;- 0#-48</w:t>
+      <w:proofErr w:type="spellStart"/>
+      <w:r>
+        <w:t>acc_orientation</w:t>
+      </w:r>
+      <w:proofErr w:type="spellEnd"/>
+      <w:r>
+        <w:t xml:space="preserve"> &lt;- "NWU",   </w:t>
+      </w:r>
+      <w:proofErr w:type="spellStart"/>
+      <w:r>
+        <w:t>mag_orientation</w:t>
+      </w:r>
+      <w:proofErr w:type="spellEnd"/>
+      <w:r>
+        <w:t xml:space="preserve"> &lt;- "NED",   </w:t>
+      </w:r>
+      <w:proofErr w:type="spellStart"/>
+      <w:r>
+        <w:t>gravity_direction</w:t>
+      </w:r>
+      <w:proofErr w:type="spellEnd"/>
+      <w:r>
+        <w:t xml:space="preserve"> &lt;- "down",   pitch &lt;- 0#-48</w:t>
       </w:r>
     </w:p>
     <w:p>
@@ -8823,6 +10418,7 @@
         <w:rPr>
           <w:noProof/>
         </w:rPr>
+        <w:lastRenderedPageBreak/>
         <w:drawing>
           <wp:inline distT="0" distB="0" distL="0" distR="0" wp14:anchorId="5E38BB50" wp14:editId="4782C31E">
             <wp:extent cx="4114047" cy="3480179"/>
@@ -8898,7 +10494,6 @@
         <w:rPr>
           <w:rFonts w:cs="Arial"/>
         </w:rPr>
-        <w:lastRenderedPageBreak/>
         <w:t>08/05</w:t>
       </w:r>
     </w:p>
@@ -8981,9 +10576,12 @@
       <w:pPr>
         <w:pStyle w:val="Heading2"/>
       </w:pPr>
-      <w:r>
+      <w:bookmarkStart w:id="2" w:name="_Toc230165020"/>
+      <w:r>
+        <w:lastRenderedPageBreak/>
         <w:t>Checking Data Scale and Orientation</w:t>
       </w:r>
+      <w:bookmarkEnd w:id="2"/>
     </w:p>
     <w:p>
       <w:pPr>
@@ -9034,7 +10632,6 @@
         <w:rPr>
           <w:noProof/>
         </w:rPr>
-        <w:lastRenderedPageBreak/>
         <w:drawing>
           <wp:inline distT="0" distB="0" distL="0" distR="0" wp14:anchorId="4C419327" wp14:editId="372DED40">
             <wp:extent cx="3347208" cy="2220956"/>
@@ -9135,7 +10732,15 @@
     <w:p/>
     <w:p>
       <w:r>
-        <w:t>X = "salmon", Y = "turquoise", Z = "darkblue"</w:t>
+        <w:t>X = "salmon", Y = "turquoise", Z = "</w:t>
+      </w:r>
+      <w:proofErr w:type="spellStart"/>
+      <w:r>
+        <w:t>darkblue</w:t>
+      </w:r>
+      <w:proofErr w:type="spellEnd"/>
+      <w:r>
+        <w:t>"</w:t>
       </w:r>
     </w:p>
     <w:p>
@@ -9453,6 +11058,7 @@
         </w:numPr>
       </w:pPr>
       <w:r>
+        <w:lastRenderedPageBreak/>
         <w:t>Ethan and I disagreed for a while about which behaviour was what but ultimately, I reali</w:t>
       </w:r>
       <w:r>
@@ -9562,7 +11168,6 @@
           <w:highlight w:val="yellow"/>
           <w:lang w:val="en-GB"/>
         </w:rPr>
-        <w:lastRenderedPageBreak/>
         <w:t>However…</w:t>
       </w:r>
       <w:r>
@@ -9623,7 +11228,23 @@
           <w:rFonts w:asciiTheme="minorHAnsi" w:hAnsiTheme="minorHAnsi"/>
           <w:lang w:val="en-GB"/>
         </w:rPr>
-        <w:t>Plotted it to see what units the devices are in and holy fuck, why are they all different??? What evil tomfoolery is this?????? Messaged ChrisB to ask what the heck is going on.</w:t>
+        <w:t xml:space="preserve">Plotted it to see what units the devices are in and holy fuck, why are they all different??? What evil tomfoolery is this?????? Messaged </w:t>
+      </w:r>
+      <w:proofErr w:type="spellStart"/>
+      <w:r>
+        <w:rPr>
+          <w:rFonts w:asciiTheme="minorHAnsi" w:hAnsiTheme="minorHAnsi"/>
+          <w:lang w:val="en-GB"/>
+        </w:rPr>
+        <w:t>ChrisB</w:t>
+      </w:r>
+      <w:proofErr w:type="spellEnd"/>
+      <w:r>
+        <w:rPr>
+          <w:rFonts w:asciiTheme="minorHAnsi" w:hAnsiTheme="minorHAnsi"/>
+          <w:lang w:val="en-GB"/>
+        </w:rPr>
+        <w:t xml:space="preserve"> to ask what the heck is going on.</w:t>
       </w:r>
     </w:p>
     <w:p>
@@ -9844,6 +11465,7 @@
           <w:noProof/>
           <w:lang w:val="en-GB"/>
         </w:rPr>
+        <w:lastRenderedPageBreak/>
         <w:drawing>
           <wp:inline distT="0" distB="0" distL="0" distR="0" wp14:anchorId="62BF0A53" wp14:editId="21F55117">
             <wp:extent cx="3313783" cy="1504950"/>
@@ -9925,7 +11547,23 @@
           <w:rFonts w:asciiTheme="minorHAnsi" w:hAnsiTheme="minorHAnsi"/>
           <w:lang w:val="en-GB"/>
         </w:rPr>
-        <w:t xml:space="preserve">Basically I found that there are 3 settings. Either the device is already in G (either 16 or 4) or its in raw units and has to be converted. The cropping at 4g means I am going to have to match and join it to the Axivity </w:t>
+        <w:t xml:space="preserve">Basically I found that there are 3 settings. Either the device is already in G (either 16 or 4) or its in raw units and has to be converted. The cropping at 4g means I am going to have to match and join it to the </w:t>
+      </w:r>
+      <w:proofErr w:type="spellStart"/>
+      <w:r>
+        <w:rPr>
+          <w:rFonts w:asciiTheme="minorHAnsi" w:hAnsiTheme="minorHAnsi"/>
+          <w:lang w:val="en-GB"/>
+        </w:rPr>
+        <w:t>Axivity</w:t>
+      </w:r>
+      <w:proofErr w:type="spellEnd"/>
+      <w:r>
+        <w:rPr>
+          <w:rFonts w:asciiTheme="minorHAnsi" w:hAnsiTheme="minorHAnsi"/>
+          <w:lang w:val="en-GB"/>
+        </w:rPr>
+        <w:t xml:space="preserve"> </w:t>
       </w:r>
       <w:r>
         <w:rPr>
@@ -9934,12 +11572,21 @@
         </w:rPr>
         <w:t>😢</w:t>
       </w:r>
+      <w:proofErr w:type="spellStart"/>
       <w:r>
         <w:rPr>
           <w:rFonts w:asciiTheme="minorHAnsi" w:hAnsiTheme="minorHAnsi"/>
           <w:lang w:val="en-GB"/>
         </w:rPr>
-        <w:t>ChrisC says this code exists and already works… but I’ve heard that often enough to know that means “this will be hard”.</w:t>
+        <w:t>ChrisC</w:t>
+      </w:r>
+      <w:proofErr w:type="spellEnd"/>
+      <w:r>
+        <w:rPr>
+          <w:rFonts w:asciiTheme="minorHAnsi" w:hAnsiTheme="minorHAnsi"/>
+          <w:lang w:val="en-GB"/>
+        </w:rPr>
+        <w:t xml:space="preserve"> says this code exists and already works… but I’ve heard that often enough to know that means “this will be hard”.</w:t>
       </w:r>
     </w:p>
     <w:tbl>
@@ -10012,6 +11659,7 @@
                 <w14:ligatures w14:val="none"/>
               </w:rPr>
             </w:pPr>
+            <w:proofErr w:type="spellStart"/>
             <w:r>
               <w:rPr>
                 <w:rFonts w:ascii="Aptos Narrow" w:eastAsia="Times New Roman" w:hAnsi="Aptos Narrow" w:cs="Times New Roman"/>
@@ -10024,6 +11672,7 @@
               </w:rPr>
               <w:t>avg_hz</w:t>
             </w:r>
+            <w:proofErr w:type="spellEnd"/>
           </w:p>
         </w:tc>
         <w:tc>
@@ -10045,6 +11694,7 @@
                 <w14:ligatures w14:val="none"/>
               </w:rPr>
             </w:pPr>
+            <w:proofErr w:type="spellStart"/>
             <w:r>
               <w:rPr>
                 <w:rFonts w:ascii="Aptos Narrow" w:eastAsia="Times New Roman" w:hAnsi="Aptos Narrow" w:cs="Times New Roman"/>
@@ -10057,6 +11707,7 @@
               </w:rPr>
               <w:t>Acc_Conv</w:t>
             </w:r>
+            <w:proofErr w:type="spellEnd"/>
           </w:p>
         </w:tc>
         <w:tc>
@@ -10078,6 +11729,7 @@
                 <w14:ligatures w14:val="none"/>
               </w:rPr>
             </w:pPr>
+            <w:proofErr w:type="spellStart"/>
             <w:r>
               <w:rPr>
                 <w:rFonts w:ascii="Aptos Narrow" w:eastAsia="Times New Roman" w:hAnsi="Aptos Narrow" w:cs="Times New Roman"/>
@@ -10090,6 +11742,7 @@
               </w:rPr>
               <w:t>Mag_Conv</w:t>
             </w:r>
+            <w:proofErr w:type="spellEnd"/>
           </w:p>
         </w:tc>
       </w:tr>
@@ -10265,7 +11918,6 @@
                 <w:lang w:val="en-US"/>
                 <w14:ligatures w14:val="none"/>
               </w:rPr>
-              <w:lastRenderedPageBreak/>
               <w:t>Collar_12</w:t>
             </w:r>
           </w:p>
@@ -11731,8 +13383,13 @@
             </w:r>
           </w:p>
           <w:p>
+            <w:proofErr w:type="spellStart"/>
             <w:r>
-              <w:t>accel_data[1445000:1452000]</w:t>
+              <w:t>accel_data</w:t>
+            </w:r>
+            <w:proofErr w:type="spellEnd"/>
+            <w:r>
+              <w:t>[1445000:1452000]</w:t>
             </w:r>
           </w:p>
         </w:tc>
@@ -11835,8 +13492,13 @@
             </w:r>
           </w:p>
           <w:p>
+            <w:proofErr w:type="spellStart"/>
             <w:r>
-              <w:t>accel_data[1660000:1670000]</w:t>
+              <w:t>accel_data</w:t>
+            </w:r>
+            <w:proofErr w:type="spellEnd"/>
+            <w:r>
+              <w:t>[1660000:1670000]</w:t>
             </w:r>
           </w:p>
         </w:tc>
@@ -11848,6 +13510,7 @@
           </w:tcPr>
           <w:p>
             <w:r>
+              <w:lastRenderedPageBreak/>
               <w:t>3</w:t>
             </w:r>
           </w:p>
@@ -11939,8 +13602,13 @@
             </w:r>
           </w:p>
           <w:p>
+            <w:proofErr w:type="spellStart"/>
             <w:r>
-              <w:t>accel_data[90000:91000]</w:t>
+              <w:t>accel_data</w:t>
+            </w:r>
+            <w:proofErr w:type="spellEnd"/>
+            <w:r>
+              <w:t>[90000:91000]</w:t>
             </w:r>
           </w:p>
         </w:tc>
@@ -12051,7 +13719,6 @@
           </w:tcPr>
           <w:p>
             <w:r>
-              <w:lastRenderedPageBreak/>
               <w:t>6</w:t>
             </w:r>
           </w:p>
@@ -12479,6 +14146,7 @@
               <w:rPr>
                 <w:noProof/>
               </w:rPr>
+              <w:lastRenderedPageBreak/>
               <w:drawing>
                 <wp:inline distT="0" distB="0" distL="0" distR="0" wp14:anchorId="3D169D4C" wp14:editId="5615F6D6">
                   <wp:extent cx="1804737" cy="1062438"/>
@@ -12535,6 +14203,7 @@
           </w:tcPr>
           <w:p>
             <w:r>
+              <w:lastRenderedPageBreak/>
               <w:t>14</w:t>
             </w:r>
           </w:p>
@@ -12760,7 +14429,6 @@
           <w:rFonts w:asciiTheme="minorHAnsi" w:hAnsiTheme="minorHAnsi"/>
           <w:lang w:val="en-GB"/>
         </w:rPr>
-        <w:lastRenderedPageBreak/>
         <w:t>Okay cool, from that I conclude they are mostly in the same orientation for most of the same time, so I can skip the reorientation step.</w:t>
       </w:r>
     </w:p>
@@ -12781,7 +14449,23 @@
           <w:rFonts w:asciiTheme="minorHAnsi" w:hAnsiTheme="minorHAnsi"/>
           <w:lang w:val="en-GB"/>
         </w:rPr>
-        <w:t>Therefore, I went through and made sure they’re now on the same scale (other than the ones that capped at 4g and therefore have to be matched with the Axivity before behavioural and VDBA analysis). I then re-extracted the training data for those periods based on the times of the original unsmoothed data. That code is now running. I will check the output tomorrow.</w:t>
+        <w:t xml:space="preserve">Therefore, I went through and made sure they’re now on the same scale (other than the ones that capped at 4g and therefore have to be matched with the </w:t>
+      </w:r>
+      <w:proofErr w:type="spellStart"/>
+      <w:r>
+        <w:rPr>
+          <w:rFonts w:asciiTheme="minorHAnsi" w:hAnsiTheme="minorHAnsi"/>
+          <w:lang w:val="en-GB"/>
+        </w:rPr>
+        <w:t>Axivity</w:t>
+      </w:r>
+      <w:proofErr w:type="spellEnd"/>
+      <w:r>
+        <w:rPr>
+          <w:rFonts w:asciiTheme="minorHAnsi" w:hAnsiTheme="minorHAnsi"/>
+          <w:lang w:val="en-GB"/>
+        </w:rPr>
+        <w:t xml:space="preserve"> before behavioural and VDBA analysis). I then re-extracted the training data for those periods based on the times of the original unsmoothed data. That code is now running. I will check the output tomorrow.</w:t>
       </w:r>
     </w:p>
     <w:p>
@@ -12834,16 +14518,34 @@
           <w:rFonts w:asciiTheme="minorHAnsi" w:hAnsiTheme="minorHAnsi"/>
           <w:lang w:val="en-GB"/>
         </w:rPr>
-        <w:t xml:space="preserve">… They did need to be divided after all. Weird? Message CB and he said that things can change or if it reset/rebooted it might have gone back to default. Whatevvvvvvver man. I can’t keep up with all this. Converted everything to the right scale for real now and then proceeded. </w:t>
+        <w:t xml:space="preserve">… They did need to be divided after all. Weird? Message CB and he said that things can change or if it reset/rebooted it might have gone back to default. </w:t>
+      </w:r>
+      <w:proofErr w:type="spellStart"/>
+      <w:r>
+        <w:rPr>
+          <w:rFonts w:asciiTheme="minorHAnsi" w:hAnsiTheme="minorHAnsi"/>
+          <w:lang w:val="en-GB"/>
+        </w:rPr>
+        <w:t>Whatevvvvvvver</w:t>
+      </w:r>
+      <w:proofErr w:type="spellEnd"/>
+      <w:r>
+        <w:rPr>
+          <w:rFonts w:asciiTheme="minorHAnsi" w:hAnsiTheme="minorHAnsi"/>
+          <w:lang w:val="en-GB"/>
+        </w:rPr>
+        <w:t xml:space="preserve"> man. I can’t keep up with all this. Converted everything to the right scale for real now and then proceeded. </w:t>
       </w:r>
     </w:p>
     <w:p>
       <w:pPr>
         <w:pStyle w:val="Heading2"/>
       </w:pPr>
+      <w:bookmarkStart w:id="3" w:name="_Toc230165021"/>
       <w:r>
         <w:t>Training the model</w:t>
       </w:r>
+      <w:bookmarkEnd w:id="3"/>
     </w:p>
     <w:p>
       <w:pPr>
@@ -12909,8 +14611,17 @@
           <w:rFonts w:asciiTheme="minorHAnsi" w:hAnsiTheme="minorHAnsi"/>
           <w:lang w:val="en-GB"/>
         </w:rPr>
-        <w:t xml:space="preserve"> Some errors I can see, but these will be cleaned out in the next step of the second matlab</w:t>
-      </w:r>
+        <w:t xml:space="preserve"> Some errors I can see, but these will be cleaned out in the next step of the second </w:t>
+      </w:r>
+      <w:proofErr w:type="spellStart"/>
+      <w:r>
+        <w:rPr>
+          <w:rFonts w:asciiTheme="minorHAnsi" w:hAnsiTheme="minorHAnsi"/>
+          <w:lang w:val="en-GB"/>
+        </w:rPr>
+        <w:t>matlab</w:t>
+      </w:r>
+      <w:proofErr w:type="spellEnd"/>
       <w:r>
         <w:rPr>
           <w:rFonts w:asciiTheme="minorHAnsi" w:hAnsiTheme="minorHAnsi"/>
@@ -12934,6 +14645,7 @@
           <w:noProof/>
           <w:lang w:val="en-GB"/>
         </w:rPr>
+        <w:lastRenderedPageBreak/>
         <w:drawing>
           <wp:inline distT="0" distB="0" distL="0" distR="0" wp14:anchorId="49B9F991" wp14:editId="0D170072">
             <wp:extent cx="4371975" cy="1501005"/>
@@ -13191,7 +14903,6 @@
           <w:rFonts w:asciiTheme="minorHAnsi" w:hAnsiTheme="minorHAnsi"/>
           <w:lang w:val="en-GB"/>
         </w:rPr>
-        <w:lastRenderedPageBreak/>
         <w:t>For example, this behaviour has sometimes been labelled as foraging, sometimes as walking… It is really unclear what it should be. So it is definitely going to be mixed up in the analysis. My DR is going to need some hard bounds about head up/down, and then leave the VDBA to figure it out?</w:t>
       </w:r>
     </w:p>
@@ -13291,10 +15002,11 @@
           <w:noProof/>
           <w:lang w:val="en-GB"/>
         </w:rPr>
+        <w:lastRenderedPageBreak/>
         <w:drawing>
-          <wp:inline distT="0" distB="0" distL="0" distR="0" wp14:anchorId="60978016" wp14:editId="588F9105">
-            <wp:extent cx="4485592" cy="2285202"/>
-            <wp:effectExtent l="0" t="0" r="0" b="1270"/>
+          <wp:inline distT="0" distB="0" distL="0" distR="0" wp14:anchorId="60978016" wp14:editId="731D867D">
+            <wp:extent cx="6020269" cy="3067050"/>
+            <wp:effectExtent l="0" t="0" r="0" b="0"/>
             <wp:docPr id="650409044" name="Picture 11"/>
             <wp:cNvGraphicFramePr>
               <a:graphicFrameLocks xmlns:a="http://schemas.openxmlformats.org/drawingml/2006/main" noChangeAspect="1"/>
@@ -13324,7 +15036,7 @@
                   <pic:spPr bwMode="auto">
                     <a:xfrm>
                       <a:off x="0" y="0"/>
-                      <a:ext cx="4509436" cy="2297350"/>
+                      <a:ext cx="6056738" cy="3085629"/>
                     </a:xfrm>
                     <a:prstGeom prst="rect">
                       <a:avLst/>
@@ -13412,20 +15124,50 @@
     <w:p>
       <w:pPr>
         <w:pStyle w:val="NormalWeb"/>
+        <w:numPr>
+          <w:ilvl w:val="0"/>
+          <w:numId w:val="2"/>
+        </w:numPr>
         <w:rPr>
           <w:rFonts w:asciiTheme="minorHAnsi" w:hAnsiTheme="minorHAnsi"/>
+          <w:highlight w:val="yellow"/>
           <w:lang w:val="en-GB"/>
         </w:rPr>
       </w:pPr>
-    </w:p>
-    <w:p>
-      <w:pPr>
-        <w:pStyle w:val="NormalWeb"/>
+      <w:r>
         <w:rPr>
           <w:rFonts w:asciiTheme="minorHAnsi" w:hAnsiTheme="minorHAnsi"/>
+          <w:highlight w:val="yellow"/>
           <w:lang w:val="en-GB"/>
         </w:rPr>
-      </w:pPr>
+        <w:t xml:space="preserve">Need to build in some cleaning logic for when the collars flip… </w:t>
+      </w:r>
+      <w:proofErr w:type="spellStart"/>
+      <w:r>
+        <w:rPr>
+          <w:rFonts w:asciiTheme="minorHAnsi" w:hAnsiTheme="minorHAnsi"/>
+          <w:highlight w:val="yellow"/>
+          <w:lang w:val="en-GB"/>
+        </w:rPr>
+        <w:t>ie</w:t>
+      </w:r>
+      <w:proofErr w:type="spellEnd"/>
+      <w:r>
+        <w:rPr>
+          <w:rFonts w:asciiTheme="minorHAnsi" w:hAnsiTheme="minorHAnsi"/>
+          <w:highlight w:val="yellow"/>
+          <w:lang w:val="en-GB"/>
+        </w:rPr>
+        <w:t xml:space="preserve">. When the Y axis is on average higher than the Z axis, </w:t>
+      </w:r>
+      <w:r>
+        <w:rPr>
+          <w:rFonts w:asciiTheme="minorHAnsi" w:hAnsiTheme="minorHAnsi"/>
+          <w:highlight w:val="yellow"/>
+          <w:lang w:val="en-GB"/>
+        </w:rPr>
+        <w:t>remove as a collar flip.</w:t>
+      </w:r>
     </w:p>
     <w:p>
       <w:pPr>
@@ -13436,23 +15178,49 @@
         </w:numPr>
         <w:rPr>
           <w:rFonts w:asciiTheme="minorHAnsi" w:hAnsiTheme="minorHAnsi"/>
+          <w:highlight w:val="yellow"/>
           <w:lang w:val="en-GB"/>
         </w:rPr>
       </w:pPr>
       <w:r>
         <w:rPr>
           <w:rFonts w:asciiTheme="minorHAnsi" w:hAnsiTheme="minorHAnsi"/>
+          <w:highlight w:val="yellow"/>
           <w:lang w:val="en-GB"/>
         </w:rPr>
-        <w:lastRenderedPageBreak/>
-        <w:t xml:space="preserve">Need to build in some cleaning logic for when the collars flip… ie. When the Y axis is on average higher than the Z axis, </w:t>
-      </w:r>
-      <w:r>
-        <w:rPr>
-          <w:rFonts w:asciiTheme="minorHAnsi" w:hAnsiTheme="minorHAnsi"/>
-          <w:lang w:val="en-GB"/>
-        </w:rPr>
-        <w:t>remove as a collar flip.</w:t>
+        <w:t xml:space="preserve">And then logic the dead reckoning based on the behavioural analysis. </w:t>
+      </w:r>
+    </w:p>
+    <w:p>
+      <w:pPr>
+        <w:pStyle w:val="Heading3"/>
+        <w:rPr>
+          <w:rFonts w:cs="Arial"/>
+        </w:rPr>
+      </w:pPr>
+      <w:r>
+        <w:rPr>
+          <w:rFonts w:cs="Arial"/>
+        </w:rPr>
+        <w:t>1</w:t>
+      </w:r>
+      <w:r>
+        <w:rPr>
+          <w:rFonts w:cs="Arial"/>
+        </w:rPr>
+        <w:t>9</w:t>
+      </w:r>
+      <w:r>
+        <w:rPr>
+          <w:rFonts w:cs="Arial"/>
+        </w:rPr>
+        <w:t>/</w:t>
+      </w:r>
+      <w:r>
+        <w:rPr>
+          <w:rFonts w:cs="Arial"/>
+        </w:rPr>
+        <w:t>05</w:t>
       </w:r>
     </w:p>
     <w:p>
@@ -13472,39 +15240,21 @@
           <w:rFonts w:asciiTheme="minorHAnsi" w:hAnsiTheme="minorHAnsi"/>
           <w:lang w:val="en-GB"/>
         </w:rPr>
-        <w:t xml:space="preserve">And then logic the dead reckoning based on the behavioural analysis. </w:t>
-      </w:r>
-    </w:p>
-    <w:p>
-      <w:pPr>
-        <w:pStyle w:val="Heading3"/>
-        <w:rPr>
-          <w:rFonts w:cs="Arial"/>
-        </w:rPr>
-      </w:pPr>
-      <w:r>
-        <w:rPr>
-          <w:rFonts w:cs="Arial"/>
-        </w:rPr>
-        <w:t>1</w:t>
-      </w:r>
-      <w:r>
-        <w:rPr>
-          <w:rFonts w:cs="Arial"/>
-        </w:rPr>
-        <w:t>9</w:t>
-      </w:r>
-      <w:r>
-        <w:rPr>
-          <w:rFonts w:cs="Arial"/>
-        </w:rPr>
-        <w:t>/</w:t>
-      </w:r>
-      <w:r>
-        <w:rPr>
-          <w:rFonts w:cs="Arial"/>
-        </w:rPr>
-        <w:t>05</w:t>
+        <w:t>I ran the feature generation last night but forgot to change one of the variables so it only generated 63 features instead of all of them. Ugh. And it took all night so I can’t afford to run it again right now. Have to remember to run it again tonight… In the meantime</w:t>
+      </w:r>
+      <w:r>
+        <w:rPr>
+          <w:rFonts w:asciiTheme="minorHAnsi" w:hAnsiTheme="minorHAnsi"/>
+          <w:lang w:val="en-GB"/>
+        </w:rPr>
+        <w:t>,</w:t>
+      </w:r>
+      <w:r>
+        <w:rPr>
+          <w:rFonts w:asciiTheme="minorHAnsi" w:hAnsiTheme="minorHAnsi"/>
+          <w:lang w:val="en-GB"/>
+        </w:rPr>
+        <w:t xml:space="preserve"> will prepare the next phase of code.</w:t>
       </w:r>
     </w:p>
     <w:p>
@@ -13524,21 +15274,107 @@
           <w:rFonts w:asciiTheme="minorHAnsi" w:hAnsiTheme="minorHAnsi"/>
           <w:lang w:val="en-GB"/>
         </w:rPr>
-        <w:t>I ran the feature generation last night but forgot to change one of the variables so it only generated 63 features instead of all of them. Ugh. And it took all night so I can’t afford to run it again right now. Have to remember to run it again tonight… In the meantime</w:t>
-      </w:r>
+        <w:t xml:space="preserve">The models are doing </w:t>
+      </w:r>
+      <w:proofErr w:type="spellStart"/>
       <w:r>
         <w:rPr>
           <w:rFonts w:asciiTheme="minorHAnsi" w:hAnsiTheme="minorHAnsi"/>
           <w:lang w:val="en-GB"/>
         </w:rPr>
-        <w:t>,</w:t>
-      </w:r>
+        <w:t>reeaaaaallly</w:t>
+      </w:r>
+      <w:proofErr w:type="spellEnd"/>
       <w:r>
         <w:rPr>
           <w:rFonts w:asciiTheme="minorHAnsi" w:hAnsiTheme="minorHAnsi"/>
           <w:lang w:val="en-GB"/>
         </w:rPr>
-        <w:t xml:space="preserve"> will prepare the next phase of code.</w:t>
+        <w:t xml:space="preserve"> badly</w:t>
+      </w:r>
+      <w:r>
+        <w:rPr>
+          <w:rFonts w:asciiTheme="minorHAnsi" w:hAnsiTheme="minorHAnsi"/>
+          <w:lang w:val="en-GB"/>
+        </w:rPr>
+        <w:t xml:space="preserve"> with the limited features</w:t>
+      </w:r>
+      <w:r>
+        <w:rPr>
+          <w:rFonts w:asciiTheme="minorHAnsi" w:hAnsiTheme="minorHAnsi"/>
+          <w:lang w:val="en-GB"/>
+        </w:rPr>
+        <w:t xml:space="preserve">. Even the RF only got 26%. </w:t>
+      </w:r>
+    </w:p>
+    <w:p>
+      <w:pPr>
+        <w:pStyle w:val="NormalWeb"/>
+        <w:numPr>
+          <w:ilvl w:val="1"/>
+          <w:numId w:val="2"/>
+        </w:numPr>
+        <w:rPr>
+          <w:rFonts w:asciiTheme="minorHAnsi" w:hAnsiTheme="minorHAnsi"/>
+          <w:lang w:val="en-GB"/>
+        </w:rPr>
+      </w:pPr>
+      <w:r>
+        <w:rPr>
+          <w:rFonts w:asciiTheme="minorHAnsi" w:hAnsiTheme="minorHAnsi"/>
+          <w:lang w:val="en-GB"/>
+        </w:rPr>
+        <w:t xml:space="preserve">From what I could see, the confusion between </w:t>
+      </w:r>
+      <w:proofErr w:type="spellStart"/>
+      <w:r>
+        <w:rPr>
+          <w:rFonts w:asciiTheme="minorHAnsi" w:hAnsiTheme="minorHAnsi"/>
+          <w:lang w:val="en-GB"/>
+        </w:rPr>
+        <w:t>grazing_headlevel</w:t>
+      </w:r>
+      <w:proofErr w:type="spellEnd"/>
+      <w:r>
+        <w:rPr>
+          <w:rFonts w:asciiTheme="minorHAnsi" w:hAnsiTheme="minorHAnsi"/>
+          <w:lang w:val="en-GB"/>
+        </w:rPr>
+        <w:t xml:space="preserve"> and walking was total. I collapsed those classes into one. There was also a lot of confusion between vigilance and </w:t>
+      </w:r>
+      <w:r>
+        <w:rPr>
+          <w:rFonts w:asciiTheme="minorHAnsi" w:hAnsiTheme="minorHAnsi"/>
+          <w:lang w:val="en-GB"/>
+        </w:rPr>
+        <w:lastRenderedPageBreak/>
+        <w:t>vibrating. I also collapsed those categories together as well. I am rerunning the rest of the feature generation overnight and will check again tomorrow.</w:t>
+      </w:r>
+    </w:p>
+    <w:p>
+      <w:pPr>
+        <w:pStyle w:val="Heading3"/>
+        <w:rPr>
+          <w:rFonts w:cs="Arial"/>
+        </w:rPr>
+      </w:pPr>
+      <w:r>
+        <w:rPr>
+          <w:rFonts w:cs="Arial"/>
+        </w:rPr>
+        <w:t>20</w:t>
+      </w:r>
+      <w:r>
+        <w:rPr>
+          <w:rFonts w:cs="Arial"/>
+        </w:rPr>
+        <w:t>/</w:t>
+      </w:r>
+      <w:r>
+        <w:rPr>
+          <w:rFonts w:cs="Arial"/>
+        </w:rPr>
+        <w:t>05</w:t>
       </w:r>
     </w:p>
     <w:p>
@@ -13548,6 +15384,7 @@
           <w:ilvl w:val="0"/>
           <w:numId w:val="2"/>
         </w:numPr>
+        <w:spacing w:after="0" w:afterAutospacing="0"/>
         <w:rPr>
           <w:rFonts w:asciiTheme="minorHAnsi" w:hAnsiTheme="minorHAnsi"/>
           <w:lang w:val="en-GB"/>
@@ -13558,21 +15395,23 @@
           <w:rFonts w:asciiTheme="minorHAnsi" w:hAnsiTheme="minorHAnsi"/>
           <w:lang w:val="en-GB"/>
         </w:rPr>
-        <w:t>The models are doing reeaaaaallly badly</w:t>
-      </w:r>
+        <w:t xml:space="preserve">Looking at the behavioural model results so far, there is such a massive confusion between some of the classes. Before I collapse the classes, I want to try training a more powerful model: 1) </w:t>
+      </w:r>
+      <w:proofErr w:type="spellStart"/>
       <w:r>
         <w:rPr>
           <w:rFonts w:asciiTheme="minorHAnsi" w:hAnsiTheme="minorHAnsi"/>
           <w:lang w:val="en-GB"/>
         </w:rPr>
-        <w:t xml:space="preserve"> with the limited features</w:t>
-      </w:r>
+        <w:t>XGBoost</w:t>
+      </w:r>
+      <w:proofErr w:type="spellEnd"/>
       <w:r>
         <w:rPr>
           <w:rFonts w:asciiTheme="minorHAnsi" w:hAnsiTheme="minorHAnsi"/>
           <w:lang w:val="en-GB"/>
         </w:rPr>
-        <w:t xml:space="preserve">. Even the RF only got 26%. </w:t>
+        <w:t>, 2) a basic NN.</w:t>
       </w:r>
     </w:p>
     <w:p>
@@ -13582,6 +15421,7 @@
           <w:ilvl w:val="1"/>
           <w:numId w:val="2"/>
         </w:numPr>
+        <w:spacing w:after="0" w:afterAutospacing="0"/>
         <w:rPr>
           <w:rFonts w:asciiTheme="minorHAnsi" w:hAnsiTheme="minorHAnsi"/>
           <w:lang w:val="en-GB"/>
@@ -13592,26 +15432,24 @@
           <w:rFonts w:asciiTheme="minorHAnsi" w:hAnsiTheme="minorHAnsi"/>
           <w:lang w:val="en-GB"/>
         </w:rPr>
-        <w:t>From what I could see, the confusion between grazing_headlevel and walking was total. I collapsed those classes into one. There was also a lot of confusion between vigilance and vibrating. I also collapsed those categories together as well. I am rerunning the rest of the feature generation overnight and will check again tomorrow.</w:t>
-      </w:r>
-    </w:p>
-    <w:p>
-      <w:pPr>
-        <w:pStyle w:val="NormalWeb"/>
+        <w:t xml:space="preserve">The </w:t>
+      </w:r>
+      <w:proofErr w:type="spellStart"/>
+      <w:r>
         <w:rPr>
           <w:rFonts w:asciiTheme="minorHAnsi" w:hAnsiTheme="minorHAnsi"/>
           <w:lang w:val="en-GB"/>
         </w:rPr>
-      </w:pPr>
-    </w:p>
-    <w:p>
-      <w:pPr>
-        <w:pStyle w:val="NormalWeb"/>
+        <w:t>XGBoost</w:t>
+      </w:r>
+      <w:proofErr w:type="spellEnd"/>
+      <w:r>
         <w:rPr>
           <w:rFonts w:asciiTheme="minorHAnsi" w:hAnsiTheme="minorHAnsi"/>
           <w:lang w:val="en-GB"/>
         </w:rPr>
-      </w:pPr>
+        <w:t xml:space="preserve"> is doing terrible, with a below chance performance. I must be doing something wrong in the code…</w:t>
+      </w:r>
     </w:p>
     <w:p>
       <w:pPr>
@@ -13620,6 +15458,7 @@
           <w:ilvl w:val="0"/>
           <w:numId w:val="2"/>
         </w:numPr>
+        <w:spacing w:after="0" w:afterAutospacing="0"/>
         <w:rPr>
           <w:rFonts w:asciiTheme="minorHAnsi" w:hAnsiTheme="minorHAnsi"/>
           <w:lang w:val="en-GB"/>
@@ -13630,7 +15469,23 @@
           <w:rFonts w:asciiTheme="minorHAnsi" w:hAnsiTheme="minorHAnsi"/>
           <w:lang w:val="en-GB"/>
         </w:rPr>
-        <w:t>Tasks:</w:t>
+        <w:t xml:space="preserve">Currently fighting for my life to get </w:t>
+      </w:r>
+      <w:proofErr w:type="spellStart"/>
+      <w:r>
+        <w:rPr>
+          <w:rFonts w:asciiTheme="minorHAnsi" w:hAnsiTheme="minorHAnsi"/>
+          <w:lang w:val="en-GB"/>
+        </w:rPr>
+        <w:t>keras</w:t>
+      </w:r>
+      <w:proofErr w:type="spellEnd"/>
+      <w:r>
+        <w:rPr>
+          <w:rFonts w:asciiTheme="minorHAnsi" w:hAnsiTheme="minorHAnsi"/>
+          <w:lang w:val="en-GB"/>
+        </w:rPr>
+        <w:t xml:space="preserve"> working so I can use deep learning models. I want to try the NN at least once before I move on.</w:t>
       </w:r>
     </w:p>
     <w:p>
@@ -13640,19 +15495,462 @@
           <w:ilvl w:val="1"/>
           <w:numId w:val="2"/>
         </w:numPr>
+        <w:spacing w:after="0" w:afterAutospacing="0"/>
         <w:rPr>
           <w:rFonts w:asciiTheme="minorHAnsi" w:hAnsiTheme="minorHAnsi"/>
-          <w:strike/>
           <w:lang w:val="en-GB"/>
         </w:rPr>
       </w:pPr>
       <w:r>
         <w:rPr>
           <w:rFonts w:asciiTheme="minorHAnsi" w:hAnsiTheme="minorHAnsi"/>
-          <w:strike/>
           <w:lang w:val="en-GB"/>
         </w:rPr>
-        <w:t>Convert all the accels to g force and mag units</w:t>
+        <w:t xml:space="preserve">Gave up on </w:t>
+      </w:r>
+      <w:proofErr w:type="spellStart"/>
+      <w:r>
+        <w:rPr>
+          <w:rFonts w:asciiTheme="minorHAnsi" w:hAnsiTheme="minorHAnsi"/>
+          <w:lang w:val="en-GB"/>
+        </w:rPr>
+        <w:t>keras</w:t>
+      </w:r>
+      <w:proofErr w:type="spellEnd"/>
+      <w:r>
+        <w:rPr>
+          <w:rFonts w:asciiTheme="minorHAnsi" w:hAnsiTheme="minorHAnsi"/>
+          <w:lang w:val="en-GB"/>
+        </w:rPr>
+        <w:t xml:space="preserve"> and used </w:t>
+      </w:r>
+      <w:proofErr w:type="spellStart"/>
+      <w:r>
+        <w:rPr>
+          <w:rFonts w:asciiTheme="minorHAnsi" w:hAnsiTheme="minorHAnsi"/>
+          <w:lang w:val="en-GB"/>
+        </w:rPr>
+        <w:t>neuralnet</w:t>
+      </w:r>
+      <w:proofErr w:type="spellEnd"/>
+      <w:r>
+        <w:rPr>
+          <w:rFonts w:asciiTheme="minorHAnsi" w:hAnsiTheme="minorHAnsi"/>
+          <w:lang w:val="en-GB"/>
+        </w:rPr>
+        <w:t xml:space="preserve"> a simpler version instead.</w:t>
+      </w:r>
+    </w:p>
+    <w:p>
+      <w:pPr>
+        <w:pStyle w:val="NormalWeb"/>
+        <w:spacing w:after="0" w:afterAutospacing="0"/>
+        <w:rPr>
+          <w:rFonts w:asciiTheme="minorHAnsi" w:hAnsiTheme="minorHAnsi"/>
+          <w:lang w:val="en-GB"/>
+        </w:rPr>
+      </w:pPr>
+    </w:p>
+    <w:p>
+      <w:pPr>
+        <w:pStyle w:val="NormalWeb"/>
+        <w:spacing w:after="0" w:afterAutospacing="0"/>
+        <w:rPr>
+          <w:rFonts w:asciiTheme="minorHAnsi" w:hAnsiTheme="minorHAnsi"/>
+          <w:lang w:val="en-GB"/>
+        </w:rPr>
+      </w:pPr>
+    </w:p>
+    <w:p>
+      <w:pPr>
+        <w:pStyle w:val="NormalWeb"/>
+        <w:numPr>
+          <w:ilvl w:val="0"/>
+          <w:numId w:val="2"/>
+        </w:numPr>
+        <w:spacing w:after="0" w:afterAutospacing="0"/>
+        <w:rPr>
+          <w:rFonts w:asciiTheme="minorHAnsi" w:hAnsiTheme="minorHAnsi"/>
+          <w:lang w:val="en-GB"/>
+        </w:rPr>
+      </w:pPr>
+      <w:r>
+        <w:rPr>
+          <w:rFonts w:asciiTheme="minorHAnsi" w:hAnsiTheme="minorHAnsi"/>
+          <w:lang w:val="en-GB"/>
+        </w:rPr>
+        <w:t xml:space="preserve">Head up </w:t>
+      </w:r>
+    </w:p>
+    <w:p>
+      <w:pPr>
+        <w:pStyle w:val="NormalWeb"/>
+        <w:numPr>
+          <w:ilvl w:val="0"/>
+          <w:numId w:val="2"/>
+        </w:numPr>
+        <w:spacing w:after="0" w:afterAutospacing="0"/>
+        <w:rPr>
+          <w:rFonts w:asciiTheme="minorHAnsi" w:hAnsiTheme="minorHAnsi"/>
+          <w:lang w:val="en-GB"/>
+        </w:rPr>
+      </w:pPr>
+    </w:p>
+    <w:p>
+      <w:pPr>
+        <w:pStyle w:val="NormalWeb"/>
+        <w:spacing w:after="0" w:afterAutospacing="0"/>
+        <w:rPr>
+          <w:rFonts w:asciiTheme="minorHAnsi" w:hAnsiTheme="minorHAnsi"/>
+          <w:lang w:val="en-GB"/>
+        </w:rPr>
+      </w:pPr>
+      <w:r>
+        <w:rPr>
+          <w:rFonts w:asciiTheme="minorHAnsi" w:hAnsiTheme="minorHAnsi"/>
+          <w:noProof/>
+          <w:lang w:val="en-GB"/>
+        </w:rPr>
+        <w:drawing>
+          <wp:inline distT="0" distB="0" distL="0" distR="0" wp14:anchorId="0480FAF2" wp14:editId="4F47E85A">
+            <wp:extent cx="6838591" cy="2504273"/>
+            <wp:effectExtent l="0" t="0" r="635" b="0"/>
+            <wp:docPr id="1005067726" name="Picture 3"/>
+            <wp:cNvGraphicFramePr>
+              <a:graphicFrameLocks xmlns:a="http://schemas.openxmlformats.org/drawingml/2006/main" noChangeAspect="1"/>
+            </wp:cNvGraphicFramePr>
+            <a:graphic xmlns:a="http://schemas.openxmlformats.org/drawingml/2006/main">
+              <a:graphicData uri="http://schemas.openxmlformats.org/drawingml/2006/picture">
+                <pic:pic xmlns:pic="http://schemas.openxmlformats.org/drawingml/2006/picture">
+                  <pic:nvPicPr>
+                    <pic:cNvPr id="0" name="Picture 2"/>
+                    <pic:cNvPicPr>
+                      <a:picLocks noChangeAspect="1" noChangeArrowheads="1"/>
+                    </pic:cNvPicPr>
+                  </pic:nvPicPr>
+                  <pic:blipFill>
+                    <a:blip r:embed="rId109">
+                      <a:extLst>
+                        <a:ext uri="{28A0092B-C50C-407E-A947-70E740481C1C}">
+                          <a14:useLocalDpi xmlns:a14="http://schemas.microsoft.com/office/drawing/2010/main" val="0"/>
+                        </a:ext>
+                      </a:extLst>
+                    </a:blip>
+                    <a:srcRect/>
+                    <a:stretch>
+                      <a:fillRect/>
+                    </a:stretch>
+                  </pic:blipFill>
+                  <pic:spPr bwMode="auto">
+                    <a:xfrm>
+                      <a:off x="0" y="0"/>
+                      <a:ext cx="6858562" cy="2511586"/>
+                    </a:xfrm>
+                    <a:prstGeom prst="rect">
+                      <a:avLst/>
+                    </a:prstGeom>
+                    <a:noFill/>
+                  </pic:spPr>
+                </pic:pic>
+              </a:graphicData>
+            </a:graphic>
+          </wp:inline>
+        </w:drawing>
+      </w:r>
+    </w:p>
+    <w:p>
+      <w:pPr>
+        <w:pStyle w:val="NormalWeb"/>
+        <w:spacing w:after="0" w:afterAutospacing="0"/>
+        <w:rPr>
+          <w:rFonts w:asciiTheme="minorHAnsi" w:hAnsiTheme="minorHAnsi"/>
+          <w:lang w:val="en-GB"/>
+        </w:rPr>
+      </w:pPr>
+    </w:p>
+    <w:p>
+      <w:pPr>
+        <w:pStyle w:val="Heading2"/>
+      </w:pPr>
+      <w:bookmarkStart w:id="4" w:name="_Toc230165022"/>
+      <w:r>
+        <w:t>Integrating with Dead Reckoning</w:t>
+      </w:r>
+      <w:bookmarkEnd w:id="4"/>
+    </w:p>
+    <w:p>
+      <w:pPr>
+        <w:pStyle w:val="NormalWeb"/>
+        <w:spacing w:after="0" w:afterAutospacing="0"/>
+        <w:rPr>
+          <w:rFonts w:asciiTheme="minorHAnsi" w:hAnsiTheme="minorHAnsi"/>
+          <w:lang w:val="en-GB"/>
+        </w:rPr>
+      </w:pPr>
+    </w:p>
+    <w:p>
+      <w:pPr>
+        <w:pStyle w:val="NormalWeb"/>
+        <w:numPr>
+          <w:ilvl w:val="0"/>
+          <w:numId w:val="2"/>
+        </w:numPr>
+        <w:spacing w:after="0" w:afterAutospacing="0"/>
+        <w:rPr>
+          <w:rFonts w:asciiTheme="minorHAnsi" w:hAnsiTheme="minorHAnsi"/>
+          <w:lang w:val="en-GB"/>
+        </w:rPr>
+      </w:pPr>
+      <w:r>
+        <w:rPr>
+          <w:rFonts w:asciiTheme="minorHAnsi" w:hAnsiTheme="minorHAnsi"/>
+          <w:lang w:val="en-GB"/>
+        </w:rPr>
+        <w:t>Below are the steps I need to take to integrate into the dead reckoning</w:t>
+      </w:r>
+    </w:p>
+    <w:p>
+      <w:pPr>
+        <w:pStyle w:val="NormalWeb"/>
+        <w:spacing w:before="0" w:beforeAutospacing="0" w:after="0" w:afterAutospacing="0"/>
+        <w:ind w:left="1440"/>
+        <w:rPr>
+          <w:rFonts w:asciiTheme="minorHAnsi" w:hAnsiTheme="minorHAnsi"/>
+          <w:lang w:val="en-GB"/>
+        </w:rPr>
+      </w:pPr>
+      <w:sdt>
+        <w:sdtPr>
+          <w:rPr>
+            <w:rFonts w:asciiTheme="minorHAnsi" w:hAnsiTheme="minorHAnsi"/>
+            <w:lang w:val="en-GB"/>
+          </w:rPr>
+          <w:id w:val="1385289112"/>
+          <w14:checkbox>
+            <w14:checked w14:val="0"/>
+            <w14:checkedState w14:val="2612" w14:font="MS Gothic"/>
+            <w14:uncheckedState w14:val="2610" w14:font="MS Gothic"/>
+          </w14:checkbox>
+        </w:sdtPr>
+        <w:sdtContent>
+          <w:r>
+            <w:rPr>
+              <w:rFonts w:ascii="MS Gothic" w:eastAsia="MS Gothic" w:hAnsi="MS Gothic" w:hint="eastAsia"/>
+              <w:lang w:val="en-GB"/>
+            </w:rPr>
+            <w:t>☐</w:t>
+          </w:r>
+        </w:sdtContent>
+      </w:sdt>
+      <w:r>
+        <w:rPr>
+          <w:rFonts w:asciiTheme="minorHAnsi" w:hAnsiTheme="minorHAnsi"/>
+          <w:lang w:val="en-GB"/>
+        </w:rPr>
+        <w:t>Determine the optimal feature set</w:t>
+      </w:r>
+    </w:p>
+    <w:p>
+      <w:pPr>
+        <w:pStyle w:val="NormalWeb"/>
+        <w:spacing w:before="0" w:beforeAutospacing="0" w:after="0" w:afterAutospacing="0"/>
+        <w:ind w:left="1440"/>
+        <w:rPr>
+          <w:rFonts w:asciiTheme="minorHAnsi" w:hAnsiTheme="minorHAnsi"/>
+          <w:lang w:val="en-GB"/>
+        </w:rPr>
+      </w:pPr>
+      <w:sdt>
+        <w:sdtPr>
+          <w:rPr>
+            <w:rFonts w:asciiTheme="minorHAnsi" w:hAnsiTheme="minorHAnsi"/>
+            <w:lang w:val="en-GB"/>
+          </w:rPr>
+          <w:id w:val="971253991"/>
+          <w14:checkbox>
+            <w14:checked w14:val="0"/>
+            <w14:checkedState w14:val="2612" w14:font="MS Gothic"/>
+            <w14:uncheckedState w14:val="2610" w14:font="MS Gothic"/>
+          </w14:checkbox>
+        </w:sdtPr>
+        <w:sdtContent>
+          <w:r>
+            <w:rPr>
+              <w:rFonts w:ascii="MS Gothic" w:eastAsia="MS Gothic" w:hAnsi="MS Gothic" w:hint="eastAsia"/>
+              <w:lang w:val="en-GB"/>
+            </w:rPr>
+            <w:t>☐</w:t>
+          </w:r>
+        </w:sdtContent>
+      </w:sdt>
+      <w:r>
+        <w:rPr>
+          <w:rFonts w:asciiTheme="minorHAnsi" w:hAnsiTheme="minorHAnsi"/>
+          <w:lang w:val="en-GB"/>
+        </w:rPr>
+        <w:t>Generate optimal features across all of the unlabelled data</w:t>
+      </w:r>
+    </w:p>
+    <w:p>
+      <w:pPr>
+        <w:pStyle w:val="NormalWeb"/>
+        <w:spacing w:before="0" w:beforeAutospacing="0" w:after="0" w:afterAutospacing="0"/>
+        <w:ind w:left="1440"/>
+        <w:rPr>
+          <w:rFonts w:asciiTheme="minorHAnsi" w:hAnsiTheme="minorHAnsi"/>
+          <w:lang w:val="en-GB"/>
+        </w:rPr>
+      </w:pPr>
+      <w:sdt>
+        <w:sdtPr>
+          <w:rPr>
+            <w:rFonts w:asciiTheme="minorHAnsi" w:hAnsiTheme="minorHAnsi"/>
+            <w:lang w:val="en-GB"/>
+          </w:rPr>
+          <w:id w:val="1672905583"/>
+          <w14:checkbox>
+            <w14:checked w14:val="0"/>
+            <w14:checkedState w14:val="2612" w14:font="MS Gothic"/>
+            <w14:uncheckedState w14:val="2610" w14:font="MS Gothic"/>
+          </w14:checkbox>
+        </w:sdtPr>
+        <w:sdtContent>
+          <w:r>
+            <w:rPr>
+              <w:rFonts w:ascii="MS Gothic" w:eastAsia="MS Gothic" w:hAnsi="MS Gothic" w:hint="eastAsia"/>
+              <w:lang w:val="en-GB"/>
+            </w:rPr>
+            <w:t>☐</w:t>
+          </w:r>
+        </w:sdtContent>
+      </w:sdt>
+      <w:r>
+        <w:rPr>
+          <w:rFonts w:asciiTheme="minorHAnsi" w:hAnsiTheme="minorHAnsi"/>
+          <w:lang w:val="en-GB"/>
+        </w:rPr>
+        <w:t>Predict behaviours onto all of the unlabelled data</w:t>
+      </w:r>
+    </w:p>
+    <w:p>
+      <w:pPr>
+        <w:pStyle w:val="NormalWeb"/>
+        <w:spacing w:before="0" w:beforeAutospacing="0" w:after="0" w:afterAutospacing="0"/>
+        <w:ind w:left="1440"/>
+        <w:rPr>
+          <w:rFonts w:asciiTheme="minorHAnsi" w:hAnsiTheme="minorHAnsi"/>
+          <w:lang w:val="en-GB"/>
+        </w:rPr>
+      </w:pPr>
+      <w:sdt>
+        <w:sdtPr>
+          <w:rPr>
+            <w:rFonts w:asciiTheme="minorHAnsi" w:hAnsiTheme="minorHAnsi"/>
+            <w:lang w:val="en-GB"/>
+          </w:rPr>
+          <w:id w:val="-1688670665"/>
+          <w14:checkbox>
+            <w14:checked w14:val="0"/>
+            <w14:checkedState w14:val="2612" w14:font="MS Gothic"/>
+            <w14:uncheckedState w14:val="2610" w14:font="MS Gothic"/>
+          </w14:checkbox>
+        </w:sdtPr>
+        <w:sdtContent>
+          <w:r>
+            <w:rPr>
+              <w:rFonts w:ascii="MS Gothic" w:eastAsia="MS Gothic" w:hAnsi="MS Gothic" w:hint="eastAsia"/>
+              <w:lang w:val="en-GB"/>
+            </w:rPr>
+            <w:t>☐</w:t>
+          </w:r>
+        </w:sdtContent>
+      </w:sdt>
+      <w:r>
+        <w:rPr>
+          <w:rFonts w:asciiTheme="minorHAnsi" w:hAnsiTheme="minorHAnsi"/>
+          <w:lang w:val="en-GB"/>
+        </w:rPr>
+        <w:t>That will take ages, so in the meantime create a simple threshold of head up vs down</w:t>
+      </w:r>
+    </w:p>
+    <w:p>
+      <w:pPr>
+        <w:pStyle w:val="NormalWeb"/>
+        <w:spacing w:before="0" w:beforeAutospacing="0" w:after="0" w:afterAutospacing="0"/>
+        <w:ind w:left="1440"/>
+        <w:rPr>
+          <w:rFonts w:asciiTheme="minorHAnsi" w:hAnsiTheme="minorHAnsi"/>
+          <w:lang w:val="en-GB"/>
+        </w:rPr>
+      </w:pPr>
+      <w:sdt>
+        <w:sdtPr>
+          <w:rPr>
+            <w:rFonts w:asciiTheme="minorHAnsi" w:hAnsiTheme="minorHAnsi"/>
+            <w:lang w:val="en-GB"/>
+          </w:rPr>
+          <w:id w:val="-1991938413"/>
+          <w14:checkbox>
+            <w14:checked w14:val="0"/>
+            <w14:checkedState w14:val="2612" w14:font="MS Gothic"/>
+            <w14:uncheckedState w14:val="2610" w14:font="MS Gothic"/>
+          </w14:checkbox>
+        </w:sdtPr>
+        <w:sdtContent>
+          <w:r>
+            <w:rPr>
+              <w:rFonts w:ascii="MS Gothic" w:eastAsia="MS Gothic" w:hAnsi="MS Gothic" w:hint="eastAsia"/>
+              <w:lang w:val="en-GB"/>
+            </w:rPr>
+            <w:t>☐</w:t>
+          </w:r>
+        </w:sdtContent>
+      </w:sdt>
+      <w:r>
+        <w:rPr>
+          <w:rFonts w:asciiTheme="minorHAnsi" w:hAnsiTheme="minorHAnsi"/>
+          <w:lang w:val="en-GB"/>
+        </w:rPr>
+        <w:t>Separate DR algorithms for when the head is up or down</w:t>
+      </w:r>
+    </w:p>
+    <w:p>
+      <w:pPr>
+        <w:pStyle w:val="NormalWeb"/>
+        <w:spacing w:before="0" w:beforeAutospacing="0"/>
+        <w:rPr>
+          <w:rFonts w:asciiTheme="minorHAnsi" w:hAnsiTheme="minorHAnsi"/>
+          <w:lang w:val="en-GB"/>
+        </w:rPr>
+      </w:pPr>
+    </w:p>
+    <w:p>
+      <w:pPr>
+        <w:pStyle w:val="NormalWeb"/>
+        <w:rPr>
+          <w:rFonts w:asciiTheme="minorHAnsi" w:hAnsiTheme="minorHAnsi"/>
+          <w:lang w:val="en-GB"/>
+        </w:rPr>
+      </w:pPr>
+    </w:p>
+    <w:p>
+      <w:pPr>
+        <w:pStyle w:val="NormalWeb"/>
+        <w:numPr>
+          <w:ilvl w:val="0"/>
+          <w:numId w:val="2"/>
+        </w:numPr>
+        <w:rPr>
+          <w:rFonts w:asciiTheme="minorHAnsi" w:hAnsiTheme="minorHAnsi"/>
+          <w:lang w:val="en-GB"/>
+        </w:rPr>
+      </w:pPr>
+      <w:r>
+        <w:rPr>
+          <w:rFonts w:asciiTheme="minorHAnsi" w:hAnsiTheme="minorHAnsi"/>
+          <w:lang w:val="en-GB"/>
+        </w:rPr>
+        <w:t>Tasks:</w:t>
       </w:r>
     </w:p>
     <w:p>
@@ -13671,16 +15969,28 @@
       <w:r>
         <w:rPr>
           <w:rFonts w:asciiTheme="minorHAnsi" w:hAnsiTheme="minorHAnsi"/>
+          <w:strike/>
           <w:lang w:val="en-GB"/>
         </w:rPr>
-        <w:t>Standardise orientation so all devices roughly the same</w:t>
-      </w:r>
+        <w:t xml:space="preserve">Convert all the </w:t>
+      </w:r>
+      <w:proofErr w:type="spellStart"/>
       <w:r>
         <w:rPr>
           <w:rFonts w:asciiTheme="minorHAnsi" w:hAnsiTheme="minorHAnsi"/>
+          <w:strike/>
           <w:lang w:val="en-GB"/>
         </w:rPr>
-        <w:t xml:space="preserve"> (make it the same as the top image)</w:t>
+        <w:t>accels</w:t>
+      </w:r>
+      <w:proofErr w:type="spellEnd"/>
+      <w:r>
+        <w:rPr>
+          <w:rFonts w:asciiTheme="minorHAnsi" w:hAnsiTheme="minorHAnsi"/>
+          <w:strike/>
+          <w:lang w:val="en-GB"/>
+        </w:rPr>
+        <w:t xml:space="preserve"> to g force and mag units</w:t>
       </w:r>
     </w:p>
     <w:p>
@@ -13692,6 +16002,7 @@
         </w:numPr>
         <w:rPr>
           <w:rFonts w:asciiTheme="minorHAnsi" w:hAnsiTheme="minorHAnsi"/>
+          <w:strike/>
           <w:lang w:val="en-GB"/>
         </w:rPr>
       </w:pPr>
@@ -13700,7 +16011,14 @@
           <w:rFonts w:asciiTheme="minorHAnsi" w:hAnsiTheme="minorHAnsi"/>
           <w:lang w:val="en-GB"/>
         </w:rPr>
-        <w:t>Join the cropped 4g accels with the axivity uncropped data to complete the peaks</w:t>
+        <w:t>Standardise orientation so all devices roughly the same</w:t>
+      </w:r>
+      <w:r>
+        <w:rPr>
+          <w:rFonts w:asciiTheme="minorHAnsi" w:hAnsiTheme="minorHAnsi"/>
+          <w:lang w:val="en-GB"/>
+        </w:rPr>
+        <w:t xml:space="preserve"> (make it the same as the top image)</w:t>
       </w:r>
     </w:p>
     <w:p>
@@ -13712,17 +16030,47 @@
         </w:numPr>
         <w:rPr>
           <w:rFonts w:asciiTheme="minorHAnsi" w:hAnsiTheme="minorHAnsi"/>
-          <w:strike/>
           <w:lang w:val="en-GB"/>
         </w:rPr>
       </w:pPr>
       <w:r>
         <w:rPr>
           <w:rFonts w:asciiTheme="minorHAnsi" w:hAnsiTheme="minorHAnsi"/>
-          <w:strike/>
           <w:lang w:val="en-GB"/>
         </w:rPr>
-        <w:t>Smooth and filter the data</w:t>
+        <w:t xml:space="preserve">Join the cropped 4g </w:t>
+      </w:r>
+      <w:proofErr w:type="spellStart"/>
+      <w:r>
+        <w:rPr>
+          <w:rFonts w:asciiTheme="minorHAnsi" w:hAnsiTheme="minorHAnsi"/>
+          <w:lang w:val="en-GB"/>
+        </w:rPr>
+        <w:t>accels</w:t>
+      </w:r>
+      <w:proofErr w:type="spellEnd"/>
+      <w:r>
+        <w:rPr>
+          <w:rFonts w:asciiTheme="minorHAnsi" w:hAnsiTheme="minorHAnsi"/>
+          <w:lang w:val="en-GB"/>
+        </w:rPr>
+        <w:t xml:space="preserve"> with the </w:t>
+      </w:r>
+      <w:proofErr w:type="spellStart"/>
+      <w:r>
+        <w:rPr>
+          <w:rFonts w:asciiTheme="minorHAnsi" w:hAnsiTheme="minorHAnsi"/>
+          <w:lang w:val="en-GB"/>
+        </w:rPr>
+        <w:t>axivity</w:t>
+      </w:r>
+      <w:proofErr w:type="spellEnd"/>
+      <w:r>
+        <w:rPr>
+          <w:rFonts w:asciiTheme="minorHAnsi" w:hAnsiTheme="minorHAnsi"/>
+          <w:lang w:val="en-GB"/>
+        </w:rPr>
+        <w:t xml:space="preserve"> uncropped data to complete the peaks</w:t>
       </w:r>
     </w:p>
     <w:p>
@@ -13734,15 +16082,17 @@
         </w:numPr>
         <w:rPr>
           <w:rFonts w:asciiTheme="minorHAnsi" w:hAnsiTheme="minorHAnsi"/>
+          <w:strike/>
           <w:lang w:val="en-GB"/>
         </w:rPr>
       </w:pPr>
       <w:r>
         <w:rPr>
           <w:rFonts w:asciiTheme="minorHAnsi" w:hAnsiTheme="minorHAnsi"/>
+          <w:strike/>
           <w:lang w:val="en-GB"/>
         </w:rPr>
-        <w:t>Re-extract all of the training data from the newly standardised data</w:t>
+        <w:t>Smooth and filter the data</w:t>
       </w:r>
     </w:p>
     <w:p>
@@ -13762,6 +16112,26 @@
           <w:rFonts w:asciiTheme="minorHAnsi" w:hAnsiTheme="minorHAnsi"/>
           <w:lang w:val="en-GB"/>
         </w:rPr>
+        <w:t>Re-extract all of the training data from the newly standardised data</w:t>
+      </w:r>
+    </w:p>
+    <w:p>
+      <w:pPr>
+        <w:pStyle w:val="NormalWeb"/>
+        <w:numPr>
+          <w:ilvl w:val="1"/>
+          <w:numId w:val="2"/>
+        </w:numPr>
+        <w:rPr>
+          <w:rFonts w:asciiTheme="minorHAnsi" w:hAnsiTheme="minorHAnsi"/>
+          <w:lang w:val="en-GB"/>
+        </w:rPr>
+      </w:pPr>
+      <w:r>
+        <w:rPr>
+          <w:rFonts w:asciiTheme="minorHAnsi" w:hAnsiTheme="minorHAnsi"/>
+          <w:lang w:val="en-GB"/>
+        </w:rPr>
         <w:t xml:space="preserve">Proceed from there lmao. </w:t>
       </w:r>
     </w:p>
@@ -13788,9 +16158,11 @@
       <w:pPr>
         <w:pStyle w:val="Heading2"/>
       </w:pPr>
+      <w:bookmarkStart w:id="5" w:name="_Toc230165023"/>
       <w:r>
         <w:t>What I learnt and Workflow for next time</w:t>
       </w:r>
+      <w:bookmarkEnd w:id="5"/>
     </w:p>
     <w:p>
       <w:pPr>
@@ -13911,7 +16283,7 @@
       </w:pPr>
     </w:p>
     <w:sectPr>
-      <w:headerReference w:type="default" r:id="rId109"/>
+      <w:headerReference w:type="default" r:id="rId110"/>
       <w:pgSz w:w="12240" w:h="15840"/>
       <w:pgMar w:top="720" w:right="720" w:bottom="720" w:left="720" w:header="720" w:footer="720" w:gutter="0"/>
       <w:cols w:space="720"/>
@@ -15360,6 +17732,19 @@
       <w:color w:val="96607D" w:themeColor="followedHyperlink"/>
       <w:u w:val="single"/>
     </w:rPr>
+  </w:style>
+  <w:style w:type="paragraph" w:styleId="TOC2">
+    <w:name w:val="toc 2"/>
+    <w:basedOn w:val="Normal"/>
+    <w:next w:val="Normal"/>
+    <w:autoRedefine/>
+    <w:uiPriority w:val="39"/>
+    <w:unhideWhenUsed/>
+    <w:rsid w:val="00C74FD2"/>
+    <w:pPr>
+      <w:spacing w:after="100"/>
+      <w:ind w:left="240"/>
+    </w:pPr>
   </w:style>
 </w:styles>
 </file>

</xml_diff>

<commit_message>
smoothing data slightly differently iand adding the Magdwick compass method
</commit_message>
<xml_diff>
--- a/Notes/Worklog.docx
+++ b/Notes/Worklog.docx
@@ -12,15 +12,7 @@
     </w:p>
     <w:p>
       <w:r>
-        <w:t xml:space="preserve">The impala data was collected by Chris Clemente, Jasmin Annett, Robin Maag, Chris Bird, and Taylor Dick across 3 field deployments in South Africa: 2024, April 2025, and July 2025.  The idea behind the project was to put our custom-designed collars (including an Artemis board which logged GPS and accelerometer data, as well as a stand-alone </w:t>
-      </w:r>
-      <w:proofErr w:type="spellStart"/>
-      <w:r>
-        <w:t>Axivity</w:t>
-      </w:r>
-      <w:proofErr w:type="spellEnd"/>
-      <w:r>
-        <w:t>) on impalas, record their behaviours with a drone, and then reconstruct their exact behaviours and paths from the acceleration data.</w:t>
+        <w:t>The impala data was collected by Chris Clemente, Jasmin Annett, Robin Maag, Chris Bird, and Taylor Dick across 3 field deployments in South Africa: 2024, April 2025, and July 2025.  The idea behind the project was to put our custom-designed collars (including an Artemis board which logged GPS and accelerometer data, as well as a stand-alone Axivity) on impalas, record their behaviours with a drone, and then reconstruct their exact behaviours and paths from the acceleration data.</w:t>
       </w:r>
       <w:r>
         <w:t xml:space="preserve"> Luke Jessup and Jojo Schultz begun the process of understanding the dead reckoning workflow.</w:t>
@@ -308,21 +300,7 @@
             <w:rStyle w:val="Hyperlink"/>
             <w:noProof/>
           </w:rPr>
-          <w:t>Training the m</w:t>
-        </w:r>
-        <w:r>
-          <w:rPr>
-            <w:rStyle w:val="Hyperlink"/>
-            <w:noProof/>
-          </w:rPr>
-          <w:t>o</w:t>
-        </w:r>
-        <w:r>
-          <w:rPr>
-            <w:rStyle w:val="Hyperlink"/>
-            <w:noProof/>
-          </w:rPr>
-          <w:t>del</w:t>
+          <w:t>Training the model</w:t>
         </w:r>
         <w:r>
           <w:rPr>
@@ -566,23 +544,7 @@
         <w:t>synchronised</w:t>
       </w:r>
       <w:r>
-        <w:t xml:space="preserve">” boards were, in fact, not time synchronised. </w:t>
-      </w:r>
-      <w:proofErr w:type="spellStart"/>
-      <w:r>
-        <w:t>ChrisC</w:t>
-      </w:r>
-      <w:proofErr w:type="spellEnd"/>
-      <w:r>
-        <w:t xml:space="preserve"> and I spent several weeks trying to align the board with the associated behavioural videos. That work is detailed in this </w:t>
-      </w:r>
-      <w:proofErr w:type="spellStart"/>
-      <w:r>
-        <w:t>googledoc</w:t>
-      </w:r>
-      <w:proofErr w:type="spellEnd"/>
-      <w:r>
-        <w:t xml:space="preserve">: </w:t>
+        <w:t xml:space="preserve">” boards were, in fact, not time synchronised. ChrisC and I spent several weeks trying to align the board with the associated behavioural videos. That work is detailed in this googledoc: </w:t>
       </w:r>
       <w:hyperlink r:id="rId8" w:history="1">
         <w:r>
@@ -710,15 +672,7 @@
         <w:spacing w:line="276" w:lineRule="auto"/>
       </w:pPr>
       <w:r>
-        <w:t xml:space="preserve">What this tells me is that my next most valuable endeavour is to figure out the alignment from Robin’s camera. Going to have a crack at that this </w:t>
-      </w:r>
-      <w:proofErr w:type="spellStart"/>
-      <w:r>
-        <w:t>arvo</w:t>
-      </w:r>
-      <w:proofErr w:type="spellEnd"/>
-      <w:r>
-        <w:t xml:space="preserve">. </w:t>
+        <w:t xml:space="preserve">What this tells me is that my next most valuable endeavour is to figure out the alignment from Robin’s camera. Going to have a crack at that this arvo. </w:t>
       </w:r>
       <w:r>
         <w:rPr>
@@ -883,15 +837,7 @@
         <w:spacing w:line="276" w:lineRule="auto"/>
       </w:pPr>
       <w:r>
-        <w:t xml:space="preserve">I reverted all my changes to the plotting method and got the same result. Therefore, either the video times are incorrect or the </w:t>
-      </w:r>
-      <w:proofErr w:type="spellStart"/>
-      <w:r>
-        <w:t>gps</w:t>
-      </w:r>
-      <w:proofErr w:type="spellEnd"/>
-      <w:r>
-        <w:t xml:space="preserve"> times are incorrect.</w:t>
+        <w:t>I reverted all my changes to the plotting method and got the same result. Therefore, either the video times are incorrect or the gps times are incorrect.</w:t>
       </w:r>
     </w:p>
     <w:p>
@@ -904,15 +850,7 @@
         <w:spacing w:line="276" w:lineRule="auto"/>
       </w:pPr>
       <w:r>
-        <w:t xml:space="preserve">I rechecked the video times and no joy. Therefore, I think the </w:t>
-      </w:r>
-      <w:proofErr w:type="spellStart"/>
-      <w:r>
-        <w:t>gps</w:t>
-      </w:r>
-      <w:proofErr w:type="spellEnd"/>
-      <w:r>
-        <w:t xml:space="preserve"> times are wrong. Going to revert all the work I did yesterday back to the original versions. </w:t>
+        <w:t xml:space="preserve">I rechecked the video times and no joy. Therefore, I think the gps times are wrong. Going to revert all the work I did yesterday back to the original versions. </w:t>
       </w:r>
     </w:p>
     <w:p>
@@ -928,15 +866,7 @@
         <w:sym w:font="Wingdings" w:char="F0E0"/>
       </w:r>
       <w:r>
-        <w:t xml:space="preserve"> Note that the kangaroo data had a lot of error not encountered in the impala data (e.g., multiple board resets, skipped reads, incorrect GPS writes, etc). The fact that using the “cleaning code” I wrote for the </w:t>
-      </w:r>
-      <w:proofErr w:type="spellStart"/>
-      <w:r>
-        <w:t>kangies</w:t>
-      </w:r>
-      <w:proofErr w:type="spellEnd"/>
-      <w:r>
-        <w:t xml:space="preserve"> on the impala caused the impala to break indicates that there is something wrong with the cleaning code…</w:t>
+        <w:t xml:space="preserve"> Note that the kangaroo data had a lot of error not encountered in the impala data (e.g., multiple board resets, skipped reads, incorrect GPS writes, etc). The fact that using the “cleaning code” I wrote for the kangies on the impala caused the impala to break indicates that there is something wrong with the cleaning code…</w:t>
       </w:r>
     </w:p>
     <w:p>
@@ -1080,13 +1010,8 @@
         <w:spacing w:line="276" w:lineRule="auto"/>
       </w:pPr>
       <w:r>
-        <w:t xml:space="preserve">Reordered the dataset by the reset events and then removed the misreads where there was an uneven increment between the internal and external times on the </w:t>
-      </w:r>
-      <w:proofErr w:type="spellStart"/>
-      <w:r>
-        <w:t>gps_board</w:t>
-      </w:r>
-      <w:proofErr w:type="spellEnd"/>
+        <w:t>Reordered the dataset by the reset events and then removed the misreads where there was an uneven increment between the internal and external times on the gps_board</w:t>
+      </w:r>
     </w:p>
     <w:p>
       <w:pPr>
@@ -1138,15 +1063,7 @@
         <w:spacing w:line="276" w:lineRule="auto"/>
       </w:pPr>
       <w:r>
-        <w:t xml:space="preserve">Below confirmed that the </w:t>
-      </w:r>
-      <w:proofErr w:type="spellStart"/>
-      <w:r>
-        <w:t>gps</w:t>
-      </w:r>
-      <w:proofErr w:type="spellEnd"/>
-      <w:r>
-        <w:t xml:space="preserve"> timestamps stay the same after writing and reading but also converted everything to numeric to be safe.</w:t>
+        <w:t>Below confirmed that the gps timestamps stay the same after writing and reading but also converted everything to numeric to be safe.</w:t>
       </w:r>
     </w:p>
     <w:p>
@@ -1321,15 +1238,7 @@
         <w:spacing w:line="276" w:lineRule="auto"/>
       </w:pPr>
       <w:r>
-        <w:t xml:space="preserve">But somehow they are then getting back mixed together after I combine the accel and </w:t>
-      </w:r>
-      <w:proofErr w:type="spellStart"/>
-      <w:r>
-        <w:t>gps</w:t>
-      </w:r>
-      <w:proofErr w:type="spellEnd"/>
-      <w:r>
-        <w:t>?</w:t>
+        <w:t>But somehow they are then getting back mixed together after I combine the accel and gps?</w:t>
       </w:r>
     </w:p>
     <w:p>
@@ -2608,21 +2517,7 @@
         <w:rPr>
           <w:bdr w:val="none" w:sz="0" w:space="0" w:color="auto" w:frame="1"/>
         </w:rPr>
-        <w:t xml:space="preserve"> Not much, </w:t>
-      </w:r>
-      <w:proofErr w:type="spellStart"/>
-      <w:r>
-        <w:rPr>
-          <w:bdr w:val="none" w:sz="0" w:space="0" w:color="auto" w:frame="1"/>
-        </w:rPr>
-        <w:t>tbh</w:t>
-      </w:r>
-      <w:proofErr w:type="spellEnd"/>
-      <w:r>
-        <w:rPr>
-          <w:bdr w:val="none" w:sz="0" w:space="0" w:color="auto" w:frame="1"/>
-        </w:rPr>
-        <w:t>.</w:t>
+        <w:t xml:space="preserve"> Not much, tbh.</w:t>
       </w:r>
     </w:p>
     <w:p>
@@ -2722,15 +2617,7 @@
         </w:numPr>
       </w:pPr>
       <w:r>
-        <w:t>Raw tri-axial magnetometer data (</w:t>
-      </w:r>
-      <w:proofErr w:type="spellStart"/>
-      <w:r>
-        <w:t>mag.x,y,z</w:t>
-      </w:r>
-      <w:proofErr w:type="spellEnd"/>
-      <w:r>
-        <w:t>)</w:t>
+        <w:t>Raw tri-axial magnetometer data (mag.x,y,z)</w:t>
       </w:r>
     </w:p>
     <w:p>
@@ -2742,15 +2629,7 @@
         </w:numPr>
       </w:pPr>
       <w:r>
-        <w:t>Tri-axial static acceleration data (</w:t>
-      </w:r>
-      <w:proofErr w:type="spellStart"/>
-      <w:r>
-        <w:t>acc.x,y,z</w:t>
-      </w:r>
-      <w:proofErr w:type="spellEnd"/>
-      <w:r>
-        <w:t>) (the smoothed values)</w:t>
+        <w:t>Tri-axial static acceleration data (acc.x,y,z) (the smoothed values)</w:t>
       </w:r>
     </w:p>
     <w:p>
@@ -2798,15 +2677,7 @@
         </w:numPr>
       </w:pPr>
       <w:r>
-        <w:t xml:space="preserve">Estimated pitch offset: Approximately how much was it rotated by? * algorithm = “standard” (standard </w:t>
-      </w:r>
-      <w:proofErr w:type="spellStart"/>
-      <w:r>
-        <w:t>euler</w:t>
-      </w:r>
-      <w:proofErr w:type="spellEnd"/>
-      <w:r>
-        <w:t xml:space="preserve"> angle approach) or “SAAM” (using quaternions)</w:t>
+        <w:t>Estimated pitch offset: Approximately how much was it rotated by? * algorithm = “standard” (standard euler angle approach) or “SAAM” (using quaternions)</w:t>
       </w:r>
     </w:p>
     <w:p>
@@ -2824,7 +2695,7 @@
         </w:rPr>
         <w:lastRenderedPageBreak/>
         <w:drawing>
-          <wp:inline distT="0" distB="0" distL="0" distR="0" wp14:anchorId="58B5C0DB" wp14:editId="33D1C6B4">
+          <wp:inline distT="0" distB="0" distL="0" distR="0" wp14:anchorId="58B5C0DB" wp14:editId="584077EA">
             <wp:extent cx="3400425" cy="1743808"/>
             <wp:effectExtent l="0" t="0" r="0" b="8890"/>
             <wp:docPr id="1563100451" name="Picture 8" descr="Linking axes to biology"/>
@@ -2892,7 +2763,7 @@
           <w:noProof/>
         </w:rPr>
         <w:drawing>
-          <wp:inline distT="0" distB="0" distL="0" distR="0" wp14:anchorId="3BDC6625" wp14:editId="451E3B32">
+          <wp:inline distT="0" distB="0" distL="0" distR="0" wp14:anchorId="3BDC6625" wp14:editId="0DCEF959">
             <wp:extent cx="2901938" cy="1714500"/>
             <wp:effectExtent l="0" t="0" r="0" b="0"/>
             <wp:docPr id="1656144157" name="Picture 9" descr="Using your hand to determine orientation"/>
@@ -2948,39 +2819,7 @@
     </w:p>
     <w:p>
       <w:r>
-        <w:t xml:space="preserve">The default orientation of the Gundog system is North-East-Down (NED) where the axes readings would be X = 0, Y = 0, and Z = -1. Before we could use data from our hand accelerometer we would have to flip it upside down. Some devices may have a different local coordinate frame, e.g., the END (East-North-Down) coordinate system assume the surge dimension of movement is represented by the z-channel, and the sway and heave dimension, by the x- and y-channels, respectively. Providing the original coordinate system allows the Gundogs system to convert your local system to the global system. The </w:t>
-      </w:r>
-      <w:proofErr w:type="spellStart"/>
-      <w:r>
-        <w:t>Gundog.Compass</w:t>
-      </w:r>
-      <w:proofErr w:type="spellEnd"/>
-      <w:r>
-        <w:t xml:space="preserve"> function comes with three inputs to allow the user to transform their device’s coordinate frame into the NED that the specific Direction Cosine Matrix (DCM) and quaternion augmentation uses to compute angles:‘</w:t>
-      </w:r>
-      <w:proofErr w:type="spellStart"/>
-      <w:r>
-        <w:t>acc.ref.frame</w:t>
-      </w:r>
-      <w:proofErr w:type="spellEnd"/>
-      <w:r>
-        <w:t>’, ‘</w:t>
-      </w:r>
-      <w:proofErr w:type="spellStart"/>
-      <w:r>
-        <w:t>positive.g</w:t>
-      </w:r>
-      <w:proofErr w:type="spellEnd"/>
-      <w:r>
-        <w:t>’, and ‘</w:t>
-      </w:r>
-      <w:proofErr w:type="spellStart"/>
-      <w:r>
-        <w:t>mag.ref.frame</w:t>
-      </w:r>
-      <w:proofErr w:type="spellEnd"/>
-      <w:r>
-        <w:t>’</w:t>
+        <w:t>The default orientation of the Gundog system is North-East-Down (NED) where the axes readings would be X = 0, Y = 0, and Z = -1. Before we could use data from our hand accelerometer we would have to flip it upside down. Some devices may have a different local coordinate frame, e.g., the END (East-North-Down) coordinate system assume the surge dimension of movement is represented by the z-channel, and the sway and heave dimension, by the x- and y-channels, respectively. Providing the original coordinate system allows the Gundogs system to convert your local system to the global system. The Gundog.Compass function comes with three inputs to allow the user to transform their device’s coordinate frame into the NED that the specific Direction Cosine Matrix (DCM) and quaternion augmentation uses to compute angles:‘acc.ref.frame’, ‘positive.g’, and ‘mag.ref.frame’</w:t>
       </w:r>
     </w:p>
     <w:p>
@@ -3360,21 +3199,7 @@
         <w:rPr>
           <w:highlight w:val="yellow"/>
         </w:rPr>
-        <w:t xml:space="preserve">by 0.15 to give me what </w:t>
-      </w:r>
-      <w:proofErr w:type="spellStart"/>
-      <w:r>
-        <w:rPr>
-          <w:highlight w:val="yellow"/>
-        </w:rPr>
-        <w:t>jojo</w:t>
-      </w:r>
-      <w:proofErr w:type="spellEnd"/>
-      <w:r>
-        <w:rPr>
-          <w:highlight w:val="yellow"/>
-        </w:rPr>
-        <w:t xml:space="preserve"> had</w:t>
+        <w:t>by 0.15 to give me what jojo had</w:t>
       </w:r>
       <w:r>
         <w:t>. So…</w:t>
@@ -3389,323 +3214,63 @@
           <w:szCs w:val="20"/>
         </w:rPr>
       </w:pPr>
-      <w:proofErr w:type="spellStart"/>
       <w:r>
         <w:rPr>
           <w:sz w:val="20"/>
           <w:szCs w:val="20"/>
         </w:rPr>
-        <w:t>mine.flat</w:t>
-      </w:r>
-      <w:proofErr w:type="spellEnd"/>
-      <w:r>
+        <w:t>mine.flat[, c("RawAX", "RawAY", "RawAZ")] &lt;- mine.flat[, c("RawAX", "RawAY", "RawAZ")] / 2048</w:t>
+      </w:r>
+    </w:p>
+    <w:p>
+      <w:pPr>
+        <w:pStyle w:val="ListParagraph"/>
+        <w:ind w:left="2160"/>
         <w:rPr>
           <w:sz w:val="20"/>
           <w:szCs w:val="20"/>
         </w:rPr>
-        <w:t>[, c("</w:t>
-      </w:r>
-      <w:proofErr w:type="spellStart"/>
+      </w:pPr>
       <w:r>
         <w:rPr>
           <w:sz w:val="20"/>
           <w:szCs w:val="20"/>
         </w:rPr>
-        <w:t>RawAX</w:t>
-      </w:r>
-      <w:proofErr w:type="spellEnd"/>
-      <w:r>
+        <w:t>mine.flat[, c("RawMX", "RawMY", "RawMZ")] &lt;- mine.flat[, c("RawMX", "RawMY", "RawMZ")] * 0.15</w:t>
+      </w:r>
+    </w:p>
+    <w:p>
+      <w:pPr>
+        <w:pStyle w:val="ListParagraph"/>
+        <w:ind w:left="2160"/>
         <w:rPr>
           <w:sz w:val="20"/>
           <w:szCs w:val="20"/>
         </w:rPr>
-        <w:t>", "RawAY", "</w:t>
-      </w:r>
-      <w:proofErr w:type="spellStart"/>
+      </w:pPr>
       <w:r>
         <w:rPr>
           <w:sz w:val="20"/>
           <w:szCs w:val="20"/>
         </w:rPr>
-        <w:t>RawAZ</w:t>
-      </w:r>
-      <w:proofErr w:type="spellEnd"/>
-      <w:r>
+        <w:t>jojo_df &lt;- df.flat[1:77009, ]</w:t>
+      </w:r>
+    </w:p>
+    <w:p>
+      <w:pPr>
+        <w:pStyle w:val="ListParagraph"/>
+        <w:ind w:left="2160"/>
         <w:rPr>
           <w:sz w:val="20"/>
           <w:szCs w:val="20"/>
         </w:rPr>
-        <w:t xml:space="preserve">")] &lt;- </w:t>
-      </w:r>
-      <w:proofErr w:type="spellStart"/>
+      </w:pPr>
       <w:r>
         <w:rPr>
           <w:sz w:val="20"/>
           <w:szCs w:val="20"/>
         </w:rPr>
-        <w:t>mine.flat</w:t>
-      </w:r>
-      <w:proofErr w:type="spellEnd"/>
-      <w:r>
-        <w:rPr>
-          <w:sz w:val="20"/>
-          <w:szCs w:val="20"/>
-        </w:rPr>
-        <w:t>[, c("</w:t>
-      </w:r>
-      <w:proofErr w:type="spellStart"/>
-      <w:r>
-        <w:rPr>
-          <w:sz w:val="20"/>
-          <w:szCs w:val="20"/>
-        </w:rPr>
-        <w:t>RawAX</w:t>
-      </w:r>
-      <w:proofErr w:type="spellEnd"/>
-      <w:r>
-        <w:rPr>
-          <w:sz w:val="20"/>
-          <w:szCs w:val="20"/>
-        </w:rPr>
-        <w:t>", "RawAY", "</w:t>
-      </w:r>
-      <w:proofErr w:type="spellStart"/>
-      <w:r>
-        <w:rPr>
-          <w:sz w:val="20"/>
-          <w:szCs w:val="20"/>
-        </w:rPr>
-        <w:t>RawAZ</w:t>
-      </w:r>
-      <w:proofErr w:type="spellEnd"/>
-      <w:r>
-        <w:rPr>
-          <w:sz w:val="20"/>
-          <w:szCs w:val="20"/>
-        </w:rPr>
-        <w:t>")] / 2048</w:t>
-      </w:r>
-    </w:p>
-    <w:p>
-      <w:pPr>
-        <w:pStyle w:val="ListParagraph"/>
-        <w:ind w:left="2160"/>
-        <w:rPr>
-          <w:sz w:val="20"/>
-          <w:szCs w:val="20"/>
-        </w:rPr>
-      </w:pPr>
-      <w:proofErr w:type="spellStart"/>
-      <w:r>
-        <w:rPr>
-          <w:sz w:val="20"/>
-          <w:szCs w:val="20"/>
-        </w:rPr>
-        <w:t>mine.flat</w:t>
-      </w:r>
-      <w:proofErr w:type="spellEnd"/>
-      <w:r>
-        <w:rPr>
-          <w:sz w:val="20"/>
-          <w:szCs w:val="20"/>
-        </w:rPr>
-        <w:t>[, c("</w:t>
-      </w:r>
-      <w:proofErr w:type="spellStart"/>
-      <w:r>
-        <w:rPr>
-          <w:sz w:val="20"/>
-          <w:szCs w:val="20"/>
-        </w:rPr>
-        <w:t>RawMX</w:t>
-      </w:r>
-      <w:proofErr w:type="spellEnd"/>
-      <w:r>
-        <w:rPr>
-          <w:sz w:val="20"/>
-          <w:szCs w:val="20"/>
-        </w:rPr>
-        <w:t>", "</w:t>
-      </w:r>
-      <w:proofErr w:type="spellStart"/>
-      <w:r>
-        <w:rPr>
-          <w:sz w:val="20"/>
-          <w:szCs w:val="20"/>
-        </w:rPr>
-        <w:t>RawMY</w:t>
-      </w:r>
-      <w:proofErr w:type="spellEnd"/>
-      <w:r>
-        <w:rPr>
-          <w:sz w:val="20"/>
-          <w:szCs w:val="20"/>
-        </w:rPr>
-        <w:t>", "</w:t>
-      </w:r>
-      <w:proofErr w:type="spellStart"/>
-      <w:r>
-        <w:rPr>
-          <w:sz w:val="20"/>
-          <w:szCs w:val="20"/>
-        </w:rPr>
-        <w:t>RawMZ</w:t>
-      </w:r>
-      <w:proofErr w:type="spellEnd"/>
-      <w:r>
-        <w:rPr>
-          <w:sz w:val="20"/>
-          <w:szCs w:val="20"/>
-        </w:rPr>
-        <w:t xml:space="preserve">")] &lt;- </w:t>
-      </w:r>
-      <w:proofErr w:type="spellStart"/>
-      <w:r>
-        <w:rPr>
-          <w:sz w:val="20"/>
-          <w:szCs w:val="20"/>
-        </w:rPr>
-        <w:t>mine.flat</w:t>
-      </w:r>
-      <w:proofErr w:type="spellEnd"/>
-      <w:r>
-        <w:rPr>
-          <w:sz w:val="20"/>
-          <w:szCs w:val="20"/>
-        </w:rPr>
-        <w:t>[, c("</w:t>
-      </w:r>
-      <w:proofErr w:type="spellStart"/>
-      <w:r>
-        <w:rPr>
-          <w:sz w:val="20"/>
-          <w:szCs w:val="20"/>
-        </w:rPr>
-        <w:t>RawMX</w:t>
-      </w:r>
-      <w:proofErr w:type="spellEnd"/>
-      <w:r>
-        <w:rPr>
-          <w:sz w:val="20"/>
-          <w:szCs w:val="20"/>
-        </w:rPr>
-        <w:t>", "</w:t>
-      </w:r>
-      <w:proofErr w:type="spellStart"/>
-      <w:r>
-        <w:rPr>
-          <w:sz w:val="20"/>
-          <w:szCs w:val="20"/>
-        </w:rPr>
-        <w:t>RawMY</w:t>
-      </w:r>
-      <w:proofErr w:type="spellEnd"/>
-      <w:r>
-        <w:rPr>
-          <w:sz w:val="20"/>
-          <w:szCs w:val="20"/>
-        </w:rPr>
-        <w:t>", "</w:t>
-      </w:r>
-      <w:proofErr w:type="spellStart"/>
-      <w:r>
-        <w:rPr>
-          <w:sz w:val="20"/>
-          <w:szCs w:val="20"/>
-        </w:rPr>
-        <w:t>RawMZ</w:t>
-      </w:r>
-      <w:proofErr w:type="spellEnd"/>
-      <w:r>
-        <w:rPr>
-          <w:sz w:val="20"/>
-          <w:szCs w:val="20"/>
-        </w:rPr>
-        <w:t>")] * 0.15</w:t>
-      </w:r>
-    </w:p>
-    <w:p>
-      <w:pPr>
-        <w:pStyle w:val="ListParagraph"/>
-        <w:ind w:left="2160"/>
-        <w:rPr>
-          <w:sz w:val="20"/>
-          <w:szCs w:val="20"/>
-        </w:rPr>
-      </w:pPr>
-      <w:proofErr w:type="spellStart"/>
-      <w:r>
-        <w:rPr>
-          <w:sz w:val="20"/>
-          <w:szCs w:val="20"/>
-        </w:rPr>
-        <w:t>jojo_df</w:t>
-      </w:r>
-      <w:proofErr w:type="spellEnd"/>
-      <w:r>
-        <w:rPr>
-          <w:sz w:val="20"/>
-          <w:szCs w:val="20"/>
-        </w:rPr>
-        <w:t xml:space="preserve"> &lt;- </w:t>
-      </w:r>
-      <w:proofErr w:type="spellStart"/>
-      <w:r>
-        <w:rPr>
-          <w:sz w:val="20"/>
-          <w:szCs w:val="20"/>
-        </w:rPr>
-        <w:t>df.flat</w:t>
-      </w:r>
-      <w:proofErr w:type="spellEnd"/>
-      <w:r>
-        <w:rPr>
-          <w:sz w:val="20"/>
-          <w:szCs w:val="20"/>
-        </w:rPr>
-        <w:t>[1:77009, ]</w:t>
-      </w:r>
-    </w:p>
-    <w:p>
-      <w:pPr>
-        <w:pStyle w:val="ListParagraph"/>
-        <w:ind w:left="2160"/>
-        <w:rPr>
-          <w:sz w:val="20"/>
-          <w:szCs w:val="20"/>
-        </w:rPr>
-      </w:pPr>
-      <w:proofErr w:type="spellStart"/>
-      <w:r>
-        <w:rPr>
-          <w:sz w:val="20"/>
-          <w:szCs w:val="20"/>
-        </w:rPr>
-        <w:t>oak_df</w:t>
-      </w:r>
-      <w:proofErr w:type="spellEnd"/>
-      <w:r>
-        <w:rPr>
-          <w:sz w:val="20"/>
-          <w:szCs w:val="20"/>
-        </w:rPr>
-        <w:t xml:space="preserve"> &lt;- </w:t>
-      </w:r>
-      <w:proofErr w:type="spellStart"/>
-      <w:r>
-        <w:rPr>
-          <w:sz w:val="20"/>
-          <w:szCs w:val="20"/>
-        </w:rPr>
-        <w:t>mine.flat</w:t>
-      </w:r>
-      <w:proofErr w:type="spellEnd"/>
-      <w:r>
-        <w:rPr>
-          <w:sz w:val="20"/>
-          <w:szCs w:val="20"/>
-        </w:rPr>
-        <w:t>[3064:80072, ]</w:t>
+        <w:t>oak_df &lt;- mine.flat[3064:80072, ]</w:t>
       </w:r>
     </w:p>
     <w:p>
@@ -3859,15 +3424,7 @@
         </w:numPr>
       </w:pPr>
       <w:r>
-        <w:t xml:space="preserve">I think I should presume that they’re not. That is, </w:t>
-      </w:r>
-      <w:proofErr w:type="spellStart"/>
-      <w:r>
-        <w:t>jojo</w:t>
-      </w:r>
-      <w:proofErr w:type="spellEnd"/>
-      <w:r>
-        <w:t xml:space="preserve"> figured out that the </w:t>
+        <w:t xml:space="preserve">I think I should presume that they’re not. That is, jojo figured out that the </w:t>
       </w:r>
       <w:r>
         <w:t>accel was NED and the mag was NWU. Whatever my accel orientation is determined to be, the mag will probably be an equivalent rotation.</w:t>
@@ -3925,15 +3482,7 @@
         <w:t xml:space="preserve"> the orientation</w:t>
       </w:r>
       <w:r>
-        <w:t xml:space="preserve"> of the </w:t>
-      </w:r>
-      <w:proofErr w:type="spellStart"/>
-      <w:r>
-        <w:t>accels</w:t>
-      </w:r>
-      <w:proofErr w:type="spellEnd"/>
-      <w:r>
-        <w:t xml:space="preserve"> are</w:t>
+        <w:t xml:space="preserve"> of the accels are</w:t>
       </w:r>
       <w:r>
         <w:t xml:space="preserve"> written on the </w:t>
@@ -4186,26 +3735,10 @@
         </w:numPr>
       </w:pPr>
       <w:r>
-        <w:t xml:space="preserve">Was having an issue where there were a lot of unmatched </w:t>
-      </w:r>
-      <w:proofErr w:type="spellStart"/>
-      <w:r>
-        <w:t>gps</w:t>
-      </w:r>
-      <w:proofErr w:type="spellEnd"/>
-      <w:r>
-        <w:t xml:space="preserve"> pings. </w:t>
-      </w:r>
-      <w:r>
-        <w:t xml:space="preserve">Fixed this by switching the order of the </w:t>
-      </w:r>
-      <w:proofErr w:type="spellStart"/>
-      <w:r>
-        <w:t>kets</w:t>
-      </w:r>
-      <w:proofErr w:type="spellEnd"/>
-      <w:r>
-        <w:t xml:space="preserve"> for the rolling join. But I nearly kms before figuring that out.</w:t>
+        <w:t xml:space="preserve">Was having an issue where there were a lot of unmatched gps pings. </w:t>
+      </w:r>
+      <w:r>
+        <w:t>Fixed this by switching the order of the kets for the rolling join. But I nearly kms before figuring that out.</w:t>
       </w:r>
     </w:p>
     <w:p>
@@ -4383,15 +3916,7 @@
         <w:t>Unfortunately,</w:t>
       </w:r>
       <w:r>
-        <w:t xml:space="preserve"> I didn’t wait long enough to get a proper </w:t>
-      </w:r>
-      <w:proofErr w:type="spellStart"/>
-      <w:r>
-        <w:t>gps</w:t>
-      </w:r>
-      <w:proofErr w:type="spellEnd"/>
-      <w:r>
-        <w:t xml:space="preserve"> </w:t>
+        <w:t xml:space="preserve"> I didn’t wait long enough to get a proper gps </w:t>
       </w:r>
       <w:r>
         <w:t>hit but</w:t>
@@ -4501,15 +4026,7 @@
         </w:numPr>
       </w:pPr>
       <w:r>
-        <w:t xml:space="preserve">If the original collar trials had an </w:t>
-      </w:r>
-      <w:proofErr w:type="spellStart"/>
-      <w:r>
-        <w:t>acc</w:t>
-      </w:r>
-      <w:proofErr w:type="spellEnd"/>
-      <w:r>
-        <w:t xml:space="preserve"> of NED and a mag of NWU then… I need to reverse the Y and Z directions for the mag of the true collar orientation. So would be… DES. </w:t>
+        <w:t xml:space="preserve">If the original collar trials had an acc of NED and a mag of NWU then… I need to reverse the Y and Z directions for the mag of the true collar orientation. So would be… DES. </w:t>
       </w:r>
     </w:p>
     <w:p>
@@ -4660,23 +4177,7 @@
         </w:numPr>
       </w:pPr>
       <w:r>
-        <w:t xml:space="preserve">Basically, the calibration event occurs at 28.06.24 18:16:00 local time but the first recorded </w:t>
-      </w:r>
-      <w:proofErr w:type="spellStart"/>
-      <w:r>
-        <w:t>gps</w:t>
-      </w:r>
-      <w:proofErr w:type="spellEnd"/>
-      <w:r>
-        <w:t xml:space="preserve"> time is "2024-06-28 16:28:48 UTC" (about 10 minutes after). Jaz says </w:t>
-      </w:r>
-      <w:proofErr w:type="spellStart"/>
-      <w:r>
-        <w:t>its</w:t>
-      </w:r>
-      <w:proofErr w:type="spellEnd"/>
-      <w:r>
-        <w:t xml:space="preserve"> not possible for the calibration event to have occurred before the first ping… but </w:t>
+        <w:t xml:space="preserve">Basically, the calibration event occurs at 28.06.24 18:16:00 local time but the first recorded gps time is "2024-06-28 16:28:48 UTC" (about 10 minutes after). Jaz says its not possible for the calibration event to have occurred before the first ping… but </w:t>
       </w:r>
       <w:r>
         <w:t>stuff</w:t>
@@ -4745,15 +4246,7 @@
         <w:t>th</w:t>
       </w:r>
       <w:r>
-        <w:t xml:space="preserve"> (first </w:t>
-      </w:r>
-      <w:proofErr w:type="spellStart"/>
-      <w:r>
-        <w:t>gps</w:t>
-      </w:r>
-      <w:proofErr w:type="spellEnd"/>
-      <w:r>
-        <w:t xml:space="preserve"> hit)</w:t>
+        <w:t xml:space="preserve"> (first gps hit)</w:t>
       </w:r>
     </w:p>
     <w:p>
@@ -4765,26 +4258,10 @@
         </w:numPr>
       </w:pPr>
       <w:r>
-        <w:t xml:space="preserve">Yep. Even when I don’t crop the accel, the interpolation sends it forward in time from the first </w:t>
-      </w:r>
-      <w:proofErr w:type="spellStart"/>
-      <w:r>
-        <w:t>gps</w:t>
-      </w:r>
-      <w:proofErr w:type="spellEnd"/>
-      <w:r>
-        <w:t xml:space="preserve"> hit. Interesting. </w:t>
-      </w:r>
-      <w:r>
-        <w:t xml:space="preserve">Where the time jumps backwards in the first </w:t>
-      </w:r>
-      <w:proofErr w:type="spellStart"/>
-      <w:r>
-        <w:t>gps</w:t>
-      </w:r>
-      <w:proofErr w:type="spellEnd"/>
-      <w:r>
-        <w:t xml:space="preserve"> hit. So what the heck went wrong with the reverse interpolation?</w:t>
+        <w:t xml:space="preserve">Yep. Even when I don’t crop the accel, the interpolation sends it forward in time from the first gps hit. Interesting. </w:t>
+      </w:r>
+      <w:r>
+        <w:t>Where the time jumps backwards in the first gps hit. So what the heck went wrong with the reverse interpolation?</w:t>
       </w:r>
     </w:p>
     <w:p>
@@ -4796,23 +4273,7 @@
         </w:numPr>
       </w:pPr>
       <w:r>
-        <w:t xml:space="preserve">RTC accel (left) and the </w:t>
-      </w:r>
-      <w:proofErr w:type="spellStart"/>
-      <w:r>
-        <w:t>gps</w:t>
-      </w:r>
-      <w:proofErr w:type="spellEnd"/>
-      <w:r>
-        <w:t xml:space="preserve"> times look correct, however the conversion to the </w:t>
-      </w:r>
-      <w:proofErr w:type="spellStart"/>
-      <w:r>
-        <w:t>gps</w:t>
-      </w:r>
-      <w:proofErr w:type="spellEnd"/>
-      <w:r>
-        <w:t xml:space="preserve"> time using interpolation is way out (right) where it jumps several days. </w:t>
+        <w:t xml:space="preserve">RTC accel (left) and the gps times look correct, however the conversion to the gps time using interpolation is way out (right) where it jumps several days. </w:t>
       </w:r>
     </w:p>
     <w:p>
@@ -4973,23 +4434,7 @@
         </w:numPr>
       </w:pPr>
       <w:r>
-        <w:t xml:space="preserve">Ah. </w:t>
-      </w:r>
-      <w:proofErr w:type="spellStart"/>
-      <w:r>
-        <w:t>So.</w:t>
-      </w:r>
-      <w:proofErr w:type="spellEnd"/>
-      <w:r>
-        <w:t xml:space="preserve"> The GPS only had 1 reset but the accel had 2 and it cropped the accel too small… </w:t>
-      </w:r>
-      <w:proofErr w:type="spellStart"/>
-      <w:r>
-        <w:t>So.</w:t>
-      </w:r>
-      <w:proofErr w:type="spellEnd"/>
-      <w:r>
-        <w:t xml:space="preserve"> That is an issue. I have to change my joining logic.</w:t>
+        <w:t>Ah. So. The GPS only had 1 reset but the accel had 2 and it cropped the accel too small… So. That is an issue. I have to change my joining logic.</w:t>
       </w:r>
     </w:p>
     <w:p>
@@ -5001,23 +4446,7 @@
         </w:numPr>
       </w:pPr>
       <w:r>
-        <w:t xml:space="preserve">Changed the </w:t>
-      </w:r>
-      <w:proofErr w:type="spellStart"/>
-      <w:r>
-        <w:t>gps</w:t>
-      </w:r>
-      <w:proofErr w:type="spellEnd"/>
-      <w:r>
-        <w:t xml:space="preserve"> </w:t>
-      </w:r>
-      <w:proofErr w:type="spellStart"/>
-      <w:r>
-        <w:t>reset_events</w:t>
-      </w:r>
-      <w:proofErr w:type="spellEnd"/>
-      <w:r>
-        <w:t xml:space="preserve"> manually over to the longest accel sampling period number.</w:t>
+        <w:t>Changed the gps reset_events manually over to the longest accel sampling period number.</w:t>
       </w:r>
     </w:p>
     <w:p>
@@ -5052,13 +4481,8 @@
           <w:numId w:val="2"/>
         </w:numPr>
       </w:pPr>
-      <w:proofErr w:type="spellStart"/>
-      <w:r>
-        <w:t>Jk</w:t>
-      </w:r>
-      <w:proofErr w:type="spellEnd"/>
-      <w:r>
-        <w:t>. The next collar ran into a new problem. It never ends with this BS.</w:t>
+      <w:r>
+        <w:t>Jk. The next collar ran into a new problem. It never ends with this BS.</w:t>
       </w:r>
     </w:p>
     <w:p>
@@ -5209,15 +4633,7 @@
         </w:numPr>
       </w:pPr>
       <w:r>
-        <w:t xml:space="preserve">So am I meant to remove these files or not? When I leave them in, there’s issues. When I take them out, it works… But they </w:t>
-      </w:r>
-      <w:proofErr w:type="spellStart"/>
-      <w:r>
-        <w:t>seeeeeem</w:t>
-      </w:r>
-      <w:proofErr w:type="spellEnd"/>
-      <w:r>
-        <w:t xml:space="preserve"> like they’re correct</w:t>
+        <w:t>So am I meant to remove these files or not? When I leave them in, there’s issues. When I take them out, it works… But they seeeeeem like they’re correct</w:t>
       </w:r>
       <w:r>
         <w:t>? Until we understand how they got there, I’m reluctant to do anything</w:t>
@@ -5617,15 +5033,7 @@
         </w:numPr>
       </w:pPr>
       <w:r>
-        <w:t xml:space="preserve">“good mag </w:t>
-      </w:r>
-      <w:proofErr w:type="spellStart"/>
-      <w:r>
-        <w:t>cal</w:t>
-      </w:r>
-      <w:proofErr w:type="spellEnd"/>
-      <w:r>
-        <w:t xml:space="preserve"> (ensure not wearing watches /have phones/any magnetic interfering stuff on person etc. nearby when doing this)”</w:t>
+        <w:t>“good mag cal (ensure not wearing watches /have phones/any magnetic interfering stuff on person etc. nearby when doing this)”</w:t>
       </w:r>
     </w:p>
     <w:p>
@@ -5637,23 +5045,7 @@
         </w:numPr>
       </w:pPr>
       <w:r>
-        <w:t xml:space="preserve">“In terms of movement bouts, the simple approach would be to use some sort of acceleration magnitude threshold (e.g. </w:t>
-      </w:r>
-      <w:proofErr w:type="spellStart"/>
-      <w:r>
-        <w:t>VeDBA</w:t>
-      </w:r>
-      <w:proofErr w:type="spellEnd"/>
-      <w:r>
-        <w:t xml:space="preserve">)... but for example, something like a kangaroo should be very obvious with jumping behaviour that should come out in acceleration traces as clear stylised patterns which could be manually discerned or via machine learning if you were able to do some </w:t>
-      </w:r>
-      <w:proofErr w:type="spellStart"/>
-      <w:r>
-        <w:t>groundtruthing</w:t>
-      </w:r>
-      <w:proofErr w:type="spellEnd"/>
-      <w:r>
-        <w:t xml:space="preserve"> of behaviours during the data acquisition period.” </w:t>
+        <w:t xml:space="preserve">“In terms of movement bouts, the simple approach would be to use some sort of acceleration magnitude threshold (e.g. VeDBA)... but for example, something like a kangaroo should be very obvious with jumping behaviour that should come out in acceleration traces as clear stylised patterns which could be manually discerned or via machine learning if you were able to do some groundtruthing of behaviours during the data acquisition period.” </w:t>
       </w:r>
       <w:r>
         <w:sym w:font="Wingdings" w:char="F0E0"/>
@@ -5683,29 +5075,13 @@
         </w:numPr>
       </w:pPr>
       <w:r>
-        <w:t xml:space="preserve">“When the penguin is walking, the tag will be nearly vertical, while during swimming, it will be more horizontal. In both cases, the tag’s coordinate frame relative to the penguin’s natural movement (and the ground or water surface) will be different. To ensure accurate heading calculations, I would need to define different tag coordinate systems for walking and swimming and compute the heading separately for each period—on land and at sea—otherwise, my dead-reckoned (DR) tracks could be very </w:t>
-      </w:r>
-      <w:proofErr w:type="spellStart"/>
-      <w:r>
-        <w:t>innacurate</w:t>
-      </w:r>
-      <w:proofErr w:type="spellEnd"/>
-      <w:r>
-        <w:t xml:space="preserve">.” </w:t>
+        <w:t xml:space="preserve">“When the penguin is walking, the tag will be nearly vertical, while during swimming, it will be more horizontal. In both cases, the tag’s coordinate frame relative to the penguin’s natural movement (and the ground or water surface) will be different. To ensure accurate heading calculations, I would need to define different tag coordinate systems for walking and swimming and compute the heading separately for each period—on land and at sea—otherwise, my dead-reckoned (DR) tracks could be very innacurate.” </w:t>
       </w:r>
       <w:r>
         <w:sym w:font="Wingdings" w:char="F0E0"/>
       </w:r>
       <w:r>
-        <w:t xml:space="preserve"> no WONDER my flippy </w:t>
-      </w:r>
-      <w:proofErr w:type="spellStart"/>
-      <w:r>
-        <w:t>flippy</w:t>
-      </w:r>
-      <w:proofErr w:type="spellEnd"/>
-      <w:r>
-        <w:t xml:space="preserve"> stuff doesn’t work.</w:t>
+        <w:t xml:space="preserve"> no WONDER my flippy flippy stuff doesn’t work.</w:t>
       </w:r>
     </w:p>
     <w:p>
@@ -5717,15 +5093,7 @@
         </w:numPr>
       </w:pPr>
       <w:r>
-        <w:t xml:space="preserve">“If you know there’s a specific yaw offset in the tag placement, you can specify it in the compass function. If you’re unsure, you could compare the heading correction factors from </w:t>
-      </w:r>
-      <w:proofErr w:type="spellStart"/>
-      <w:r>
-        <w:t>Gundog.Tracks</w:t>
-      </w:r>
-      <w:proofErr w:type="spellEnd"/>
-      <w:r>
-        <w:t xml:space="preserve">. If the headings are consistently biased in one direction, it could indicate a tag yaw offset or the need for magnetic declination adjustment. But again, if the tag’s yaw offset is minor and consistent, it’s not essential to correct this, as the dead-reckoned track will be consistently biased (in theory, the patterns and scales of tortuosity between GPS points should remain the same, just </w:t>
+        <w:t xml:space="preserve">“If you know there’s a specific yaw offset in the tag placement, you can specify it in the compass function. If you’re unsure, you could compare the heading correction factors from Gundog.Tracks. If the headings are consistently biased in one direction, it could indicate a tag yaw offset or the need for magnetic declination adjustment. But again, if the tag’s yaw offset is minor and consistent, it’s not essential to correct this, as the dead-reckoned track will be consistently biased (in theory, the patterns and scales of tortuosity between GPS points should remain the same, just </w:t>
       </w:r>
       <w:r>
         <w:lastRenderedPageBreak/>
@@ -5741,31 +5109,7 @@
         </w:numPr>
       </w:pPr>
       <w:r>
-        <w:t xml:space="preserve">“What I suggest is to first run the compass function without any offsets applied to derive the pitch and roll angles. Then, determine the mean values of both during periods where you believe the animal and collar are in a normal position, such as during low-activity, steady-state </w:t>
-      </w:r>
-      <w:proofErr w:type="spellStart"/>
-      <w:r>
-        <w:t>behavior</w:t>
-      </w:r>
-      <w:proofErr w:type="spellEnd"/>
-      <w:r>
-        <w:t>. Once you have these values, re-run the function and input them as the '</w:t>
-      </w:r>
-      <w:proofErr w:type="spellStart"/>
-      <w:r>
-        <w:t>pitch.offset</w:t>
-      </w:r>
-      <w:proofErr w:type="spellEnd"/>
-      <w:r>
-        <w:t>' and '</w:t>
-      </w:r>
-      <w:proofErr w:type="spellStart"/>
-      <w:r>
-        <w:t>roll.offset</w:t>
-      </w:r>
-      <w:proofErr w:type="spellEnd"/>
-      <w:r>
-        <w:t>' parameters.”</w:t>
+        <w:t>“What I suggest is to first run the compass function without any offsets applied to derive the pitch and roll angles. Then, determine the mean values of both during periods where you believe the animal and collar are in a normal position, such as during low-activity, steady-state behavior. Once you have these values, re-run the function and input them as the 'pitch.offset' and 'roll.offset' parameters.”</w:t>
       </w:r>
     </w:p>
     <w:p>
@@ -5777,15 +5121,7 @@
         </w:numPr>
       </w:pPr>
       <w:r>
-        <w:t xml:space="preserve">“if you supply a positive pitch offset value of 45°, this reflects that the device is pitched up by 45° from the level, and the function will de-rotate the supplied (smoothed) </w:t>
-      </w:r>
-      <w:proofErr w:type="spellStart"/>
-      <w:r>
-        <w:t>acc</w:t>
-      </w:r>
-      <w:proofErr w:type="spellEnd"/>
-      <w:r>
-        <w:t xml:space="preserve"> and mag (normalised) values by this amount. Similarly, a positive roll value indicates a rightward tilt (bank angle), and a positive yaw value represents a clockwise rotational offset”</w:t>
+        <w:t>“if you supply a positive pitch offset value of 45°, this reflects that the device is pitched up by 45° from the level, and the function will de-rotate the supplied (smoothed) acc and mag (normalised) values by this amount. Similarly, a positive roll value indicates a rightward tilt (bank angle), and a positive yaw value represents a clockwise rotational offset”</w:t>
       </w:r>
     </w:p>
     <w:p>
@@ -5804,7 +5140,19 @@
           <w:rPr>
             <w:rStyle w:val="Hyperlink"/>
           </w:rPr>
-          <w:t>https://invensense.tdk.com/wp-content/uploads/2024/03/DS-000189-ICM-20948-v1.6.pdf</w:t>
+          <w:t>https://invensen</w:t>
+        </w:r>
+        <w:r>
+          <w:rPr>
+            <w:rStyle w:val="Hyperlink"/>
+          </w:rPr>
+          <w:t>s</w:t>
+        </w:r>
+        <w:r>
+          <w:rPr>
+            <w:rStyle w:val="Hyperlink"/>
+          </w:rPr>
+          <w:t>e.tdk.com/wp-content/uploads/2024/03/DS-000189-ICM-20948-v1.6.pdf</w:t>
         </w:r>
       </w:hyperlink>
       <w:r>
@@ -5826,95 +5174,7 @@
         </w:numPr>
       </w:pPr>
       <w:r>
-        <w:t xml:space="preserve">“The short answer is, yes - if a wrong ref frame was chosen then DR path </w:t>
-      </w:r>
-      <w:proofErr w:type="spellStart"/>
-      <w:r>
-        <w:t>wil</w:t>
-      </w:r>
-      <w:proofErr w:type="spellEnd"/>
-      <w:r>
-        <w:t xml:space="preserve"> be </w:t>
-      </w:r>
-      <w:proofErr w:type="spellStart"/>
-      <w:r>
-        <w:t>innacurate</w:t>
-      </w:r>
-      <w:proofErr w:type="spellEnd"/>
-      <w:r>
-        <w:t xml:space="preserve">. But comparing subsets with GPS pre-correction will help debug if chosen orientation was correct. The patterns and directions of travel should be similar even if scale is not when compared to GPS. I had some lions where I had to 'figure' out the orientation post release. But visually it should be easy to decipher the heave axis of </w:t>
-      </w:r>
-      <w:proofErr w:type="spellStart"/>
-      <w:r>
-        <w:t>movmement</w:t>
-      </w:r>
-      <w:proofErr w:type="spellEnd"/>
-      <w:r>
-        <w:t xml:space="preserve"> in </w:t>
-      </w:r>
-      <w:proofErr w:type="spellStart"/>
-      <w:r>
-        <w:t>acc</w:t>
-      </w:r>
-      <w:proofErr w:type="spellEnd"/>
-      <w:r>
-        <w:t xml:space="preserve"> and mag (</w:t>
-      </w:r>
-      <w:proofErr w:type="spellStart"/>
-      <w:r>
-        <w:t>acc</w:t>
-      </w:r>
-      <w:proofErr w:type="spellEnd"/>
-      <w:r>
-        <w:t xml:space="preserve"> will be the one closest to +/-1 g most of the time, and mag will the one changing the least)... In terms of deciphering the </w:t>
-      </w:r>
-      <w:proofErr w:type="spellStart"/>
-      <w:r>
-        <w:t>acc</w:t>
-      </w:r>
-      <w:proofErr w:type="spellEnd"/>
-      <w:r>
-        <w:t xml:space="preserve">/mag surge and sway dimensions, this may be more challenging. But for the </w:t>
-      </w:r>
-      <w:proofErr w:type="spellStart"/>
-      <w:r>
-        <w:t>acc</w:t>
-      </w:r>
-      <w:proofErr w:type="spellEnd"/>
-      <w:r>
-        <w:t xml:space="preserve">, you would expect greater variation in surge dimension because they stick their head to ground to forage and then stick their head back up when travelling and </w:t>
-      </w:r>
-      <w:proofErr w:type="spellStart"/>
-      <w:r>
-        <w:t>vigalence</w:t>
-      </w:r>
-      <w:proofErr w:type="spellEnd"/>
-      <w:r>
-        <w:t xml:space="preserve">, so that may help. If mag is different orientation set up to </w:t>
-      </w:r>
-      <w:proofErr w:type="spellStart"/>
-      <w:r>
-        <w:t>acc</w:t>
-      </w:r>
-      <w:proofErr w:type="spellEnd"/>
-      <w:r>
-        <w:t xml:space="preserve">, then </w:t>
-      </w:r>
-      <w:proofErr w:type="spellStart"/>
-      <w:r>
-        <w:t>its</w:t>
-      </w:r>
-      <w:proofErr w:type="spellEnd"/>
-      <w:r>
-        <w:t xml:space="preserve"> worth just checking if you switch the surge/sway orientations then which one produces most </w:t>
-      </w:r>
-      <w:proofErr w:type="spellStart"/>
-      <w:r>
-        <w:t>realsitic</w:t>
-      </w:r>
-      <w:proofErr w:type="spellEnd"/>
-      <w:r>
-        <w:t xml:space="preserve"> DR track relative to GPS... by deciphering the heave axis and dimension of measured g, you already have homed in on just a few possible orientations it could be...”</w:t>
+        <w:t>“The short answer is, yes - if a wrong ref frame was chosen then DR path wil be innacurate. But comparing subsets with GPS pre-correction will help debug if chosen orientation was correct. The patterns and directions of travel should be similar even if scale is not when compared to GPS. I had some lions where I had to 'figure' out the orientation post release. But visually it should be easy to decipher the heave axis of movmement in acc and mag (acc will be the one closest to +/-1 g most of the time, and mag will the one changing the least)... In terms of deciphering the acc/mag surge and sway dimensions, this may be more challenging. But for the acc, you would expect greater variation in surge dimension because they stick their head to ground to forage and then stick their head back up when travelling and vigalence, so that may help. If mag is different orientation set up to acc, then its worth just checking if you switch the surge/sway orientations then which one produces most realsitic DR track relative to GPS... by deciphering the heave axis and dimension of measured g, you already have homed in on just a few possible orientations it could be...”</w:t>
       </w:r>
     </w:p>
     <w:p>
@@ -5976,16 +5236,8 @@
           <w:rPr>
             <w:rStyle w:val="Hyperlink"/>
           </w:rPr>
-          <w:t xml:space="preserve">Dead-reckoning animal movements in R: a reappraisal using </w:t>
+          <w:t>Dead-reckoning animal movements in R: a reappraisal using Gundog.Tracks</w:t>
         </w:r>
-        <w:proofErr w:type="spellStart"/>
-        <w:r>
-          <w:rPr>
-            <w:rStyle w:val="Hyperlink"/>
-          </w:rPr>
-          <w:t>Gundog.Tracks</w:t>
-        </w:r>
-        <w:proofErr w:type="spellEnd"/>
       </w:hyperlink>
       <w:r>
         <w:t xml:space="preserve"> </w:t>
@@ -6050,28 +5302,36 @@
           <w:rFonts w:ascii="Cambria Math" w:hAnsi="Cambria Math"/>
         </w:rPr>
       </w:pPr>
-      <w:proofErr w:type="spellStart"/>
       <w:r>
         <w:rPr>
           <w:rFonts w:ascii="Cambria Math" w:hAnsi="Cambria Math"/>
         </w:rPr>
-        <w:t>Gundog.Tracks</w:t>
-      </w:r>
-      <w:proofErr w:type="spellEnd"/>
+        <w:t>Gundog.Tracks(TS, h, v, elv</w:t>
+      </w:r>
+      <w:r>
+        <w:rPr>
+          <w:rFonts w:ascii="Cambria Math" w:hAnsi="Cambria Math" w:cs="Arial"/>
+        </w:rPr>
+        <w:t> </w:t>
+      </w:r>
       <w:r>
         <w:rPr>
           <w:rFonts w:ascii="Cambria Math" w:hAnsi="Cambria Math"/>
         </w:rPr>
-        <w:t xml:space="preserve">(TS, h, v, </w:t>
-      </w:r>
-      <w:proofErr w:type="spellStart"/>
+        <w:t>=</w:t>
+      </w:r>
+      <w:r>
+        <w:rPr>
+          <w:rFonts w:ascii="Cambria Math" w:hAnsi="Cambria Math" w:cs="Arial"/>
+        </w:rPr>
+        <w:t> </w:t>
+      </w:r>
       <w:r>
         <w:rPr>
           <w:rFonts w:ascii="Cambria Math" w:hAnsi="Cambria Math"/>
         </w:rPr>
-        <w:t>elv</w:t>
-      </w:r>
-      <w:proofErr w:type="spellEnd"/>
+        <w:t>0, p</w:t>
+      </w:r>
       <w:r>
         <w:rPr>
           <w:rFonts w:ascii="Cambria Math" w:hAnsi="Cambria Math" w:cs="Arial"/>
@@ -6094,7 +5354,7 @@
         <w:rPr>
           <w:rFonts w:ascii="Cambria Math" w:hAnsi="Cambria Math"/>
         </w:rPr>
-        <w:t>0, p</w:t>
+        <w:t>NULL, cs</w:t>
       </w:r>
       <w:r>
         <w:rPr>
@@ -6118,7 +5378,7 @@
         <w:rPr>
           <w:rFonts w:ascii="Cambria Math" w:hAnsi="Cambria Math"/>
         </w:rPr>
-        <w:t>NULL, cs</w:t>
+        <w:t>NULL, ch</w:t>
       </w:r>
       <w:r>
         <w:rPr>
@@ -6142,16 +5402,20 @@
         <w:rPr>
           <w:rFonts w:ascii="Cambria Math" w:hAnsi="Cambria Math"/>
         </w:rPr>
-        <w:t xml:space="preserve">NULL, </w:t>
-      </w:r>
-      <w:proofErr w:type="spellStart"/>
+        <w:t>NULL, m</w:t>
+      </w:r>
+      <w:r>
+        <w:rPr>
+          <w:rFonts w:ascii="Cambria Math" w:hAnsi="Cambria Math" w:cs="Arial"/>
+        </w:rPr>
+        <w:t> </w:t>
+      </w:r>
       <w:r>
         <w:rPr>
           <w:rFonts w:ascii="Cambria Math" w:hAnsi="Cambria Math"/>
         </w:rPr>
-        <w:t>ch</w:t>
-      </w:r>
-      <w:proofErr w:type="spellEnd"/>
+        <w:t>=</w:t>
+      </w:r>
       <w:r>
         <w:rPr>
           <w:rFonts w:ascii="Cambria Math" w:hAnsi="Cambria Math" w:cs="Arial"/>
@@ -6162,6 +5426,18 @@
         <w:rPr>
           <w:rFonts w:ascii="Cambria Math" w:hAnsi="Cambria Math"/>
         </w:rPr>
+        <w:t>1, c</w:t>
+      </w:r>
+      <w:r>
+        <w:rPr>
+          <w:rFonts w:ascii="Cambria Math" w:hAnsi="Cambria Math" w:cs="Arial"/>
+        </w:rPr>
+        <w:t> </w:t>
+      </w:r>
+      <w:r>
+        <w:rPr>
+          <w:rFonts w:ascii="Cambria Math" w:hAnsi="Cambria Math"/>
+        </w:rPr>
         <w:t>=</w:t>
       </w:r>
       <w:r>
@@ -6174,7 +5450,7 @@
         <w:rPr>
           <w:rFonts w:ascii="Cambria Math" w:hAnsi="Cambria Math"/>
         </w:rPr>
-        <w:t>NULL, m</w:t>
+        <w:t>0, ME</w:t>
       </w:r>
       <w:r>
         <w:rPr>
@@ -6198,7 +5474,7 @@
         <w:rPr>
           <w:rFonts w:ascii="Cambria Math" w:hAnsi="Cambria Math"/>
         </w:rPr>
-        <w:t>1, c</w:t>
+        <w:t>1, lo</w:t>
       </w:r>
       <w:r>
         <w:rPr>
@@ -6222,7 +5498,7 @@
         <w:rPr>
           <w:rFonts w:ascii="Cambria Math" w:hAnsi="Cambria Math"/>
         </w:rPr>
-        <w:t>0, ME</w:t>
+        <w:t>0, la</w:t>
       </w:r>
       <w:r>
         <w:rPr>
@@ -6246,7 +5522,7 @@
         <w:rPr>
           <w:rFonts w:ascii="Cambria Math" w:hAnsi="Cambria Math"/>
         </w:rPr>
-        <w:t>1, lo</w:t>
+        <w:t>0, VP.lon</w:t>
       </w:r>
       <w:r>
         <w:rPr>
@@ -6270,7 +5546,7 @@
         <w:rPr>
           <w:rFonts w:ascii="Cambria Math" w:hAnsi="Cambria Math"/>
         </w:rPr>
-        <w:t>0, la</w:t>
+        <w:t>NULL, VP.lat</w:t>
       </w:r>
       <w:r>
         <w:rPr>
@@ -6294,16 +5570,20 @@
         <w:rPr>
           <w:rFonts w:ascii="Cambria Math" w:hAnsi="Cambria Math"/>
         </w:rPr>
-        <w:t xml:space="preserve">0, </w:t>
-      </w:r>
-      <w:proofErr w:type="spellStart"/>
+        <w:t>NULL, VP.ME</w:t>
+      </w:r>
+      <w:r>
+        <w:rPr>
+          <w:rFonts w:ascii="Cambria Math" w:hAnsi="Cambria Math" w:cs="Arial"/>
+        </w:rPr>
+        <w:t> </w:t>
+      </w:r>
       <w:r>
         <w:rPr>
           <w:rFonts w:ascii="Cambria Math" w:hAnsi="Cambria Math"/>
         </w:rPr>
-        <w:t>VP.lon</w:t>
-      </w:r>
-      <w:proofErr w:type="spellEnd"/>
+        <w:t>=</w:t>
+      </w:r>
       <w:r>
         <w:rPr>
           <w:rFonts w:ascii="Cambria Math" w:hAnsi="Cambria Math" w:cs="Arial"/>
@@ -6314,6 +5594,18 @@
         <w:rPr>
           <w:rFonts w:ascii="Cambria Math" w:hAnsi="Cambria Math"/>
         </w:rPr>
+        <w:t>FALSE, method</w:t>
+      </w:r>
+      <w:r>
+        <w:rPr>
+          <w:rFonts w:ascii="Cambria Math" w:hAnsi="Cambria Math" w:cs="Arial"/>
+        </w:rPr>
+        <w:t> </w:t>
+      </w:r>
+      <w:r>
+        <w:rPr>
+          <w:rFonts w:ascii="Cambria Math" w:hAnsi="Cambria Math"/>
+        </w:rPr>
         <w:t>=</w:t>
       </w:r>
       <w:r>
@@ -6326,16 +5618,20 @@
         <w:rPr>
           <w:rFonts w:ascii="Cambria Math" w:hAnsi="Cambria Math"/>
         </w:rPr>
-        <w:t xml:space="preserve">NULL, </w:t>
-      </w:r>
-      <w:proofErr w:type="spellStart"/>
+        <w:t>NULL, thresh</w:t>
+      </w:r>
+      <w:r>
+        <w:rPr>
+          <w:rFonts w:ascii="Cambria Math" w:hAnsi="Cambria Math" w:cs="Arial"/>
+        </w:rPr>
+        <w:t> </w:t>
+      </w:r>
       <w:r>
         <w:rPr>
           <w:rFonts w:ascii="Cambria Math" w:hAnsi="Cambria Math"/>
         </w:rPr>
-        <w:t>VP.lat</w:t>
-      </w:r>
-      <w:proofErr w:type="spellEnd"/>
+        <w:t>=</w:t>
+      </w:r>
       <w:r>
         <w:rPr>
           <w:rFonts w:ascii="Cambria Math" w:hAnsi="Cambria Math" w:cs="Arial"/>
@@ -6346,100 +5642,8 @@
         <w:rPr>
           <w:rFonts w:ascii="Cambria Math" w:hAnsi="Cambria Math"/>
         </w:rPr>
-        <w:t>=</w:t>
-      </w:r>
-      <w:r>
-        <w:rPr>
-          <w:rFonts w:ascii="Cambria Math" w:hAnsi="Cambria Math" w:cs="Arial"/>
-        </w:rPr>
-        <w:t> </w:t>
-      </w:r>
-      <w:r>
-        <w:rPr>
-          <w:rFonts w:ascii="Cambria Math" w:hAnsi="Cambria Math"/>
-        </w:rPr>
-        <w:t>NULL, VP.ME</w:t>
-      </w:r>
-      <w:r>
-        <w:rPr>
-          <w:rFonts w:ascii="Cambria Math" w:hAnsi="Cambria Math" w:cs="Arial"/>
-        </w:rPr>
-        <w:t> </w:t>
-      </w:r>
-      <w:r>
-        <w:rPr>
-          <w:rFonts w:ascii="Cambria Math" w:hAnsi="Cambria Math"/>
-        </w:rPr>
-        <w:t>=</w:t>
-      </w:r>
-      <w:r>
-        <w:rPr>
-          <w:rFonts w:ascii="Cambria Math" w:hAnsi="Cambria Math" w:cs="Arial"/>
-        </w:rPr>
-        <w:t> </w:t>
-      </w:r>
-      <w:r>
-        <w:rPr>
-          <w:rFonts w:ascii="Cambria Math" w:hAnsi="Cambria Math"/>
-        </w:rPr>
-        <w:t>FALSE, method</w:t>
-      </w:r>
-      <w:r>
-        <w:rPr>
-          <w:rFonts w:ascii="Cambria Math" w:hAnsi="Cambria Math" w:cs="Arial"/>
-        </w:rPr>
-        <w:t> </w:t>
-      </w:r>
-      <w:r>
-        <w:rPr>
-          <w:rFonts w:ascii="Cambria Math" w:hAnsi="Cambria Math"/>
-        </w:rPr>
-        <w:t>=</w:t>
-      </w:r>
-      <w:r>
-        <w:rPr>
-          <w:rFonts w:ascii="Cambria Math" w:hAnsi="Cambria Math" w:cs="Arial"/>
-        </w:rPr>
-        <w:t> </w:t>
-      </w:r>
-      <w:r>
-        <w:rPr>
-          <w:rFonts w:ascii="Cambria Math" w:hAnsi="Cambria Math"/>
-        </w:rPr>
-        <w:t>NULL, thresh</w:t>
-      </w:r>
-      <w:r>
-        <w:rPr>
-          <w:rFonts w:ascii="Cambria Math" w:hAnsi="Cambria Math" w:cs="Arial"/>
-        </w:rPr>
-        <w:t> </w:t>
-      </w:r>
-      <w:r>
-        <w:rPr>
-          <w:rFonts w:ascii="Cambria Math" w:hAnsi="Cambria Math"/>
-        </w:rPr>
-        <w:t>=</w:t>
-      </w:r>
-      <w:r>
-        <w:rPr>
-          <w:rFonts w:ascii="Cambria Math" w:hAnsi="Cambria Math" w:cs="Arial"/>
-        </w:rPr>
-        <w:t> </w:t>
-      </w:r>
-      <w:r>
-        <w:rPr>
-          <w:rFonts w:ascii="Cambria Math" w:hAnsi="Cambria Math"/>
-        </w:rPr>
-        <w:t xml:space="preserve">1, </w:t>
-      </w:r>
-      <w:proofErr w:type="spellStart"/>
-      <w:r>
-        <w:rPr>
-          <w:rFonts w:ascii="Cambria Math" w:hAnsi="Cambria Math"/>
-        </w:rPr>
-        <w:t>dist.step</w:t>
-      </w:r>
-      <w:proofErr w:type="spellEnd"/>
+        <w:t>1, dist.step</w:t>
+      </w:r>
       <w:r>
         <w:rPr>
           <w:rFonts w:ascii="Cambria Math" w:hAnsi="Cambria Math" w:cs="Arial"/>
@@ -6623,15 +5827,7 @@
         <w:sym w:font="Wingdings" w:char="F0E0"/>
       </w:r>
       <w:r>
-        <w:t xml:space="preserve"> okay, </w:t>
-      </w:r>
-      <w:proofErr w:type="spellStart"/>
-      <w:r>
-        <w:t>nevermind</w:t>
-      </w:r>
-      <w:proofErr w:type="spellEnd"/>
-      <w:r>
-        <w:t>, we aren’t high frequency enough for this to matter</w:t>
+        <w:t xml:space="preserve"> okay, nevermind, we aren’t high frequency enough for this to matter</w:t>
       </w:r>
     </w:p>
     <w:p>
@@ -6670,15 +5866,7 @@
         <w:ind w:left="1080"/>
       </w:pPr>
       <w:r>
-        <w:t xml:space="preserve">Within </w:t>
-      </w:r>
-      <w:proofErr w:type="spellStart"/>
-      <w:r>
-        <w:t>Gundog.Tracks</w:t>
-      </w:r>
-      <w:proofErr w:type="spellEnd"/>
-      <w:r>
-        <w:t>, the user can modulate m, c and ME values to switch between predetermined speed (m</w:t>
+        <w:t>Within Gundog.Tracks, the user can modulate m, c and ME values to switch between predetermined speed (m</w:t>
       </w:r>
       <w:r>
         <w:rPr>
@@ -6784,15 +5972,7 @@
         <w:ind w:left="1080"/>
       </w:pPr>
       <w:r>
-        <w:t xml:space="preserve">Here an </w:t>
-      </w:r>
-      <w:proofErr w:type="spellStart"/>
-      <w:r>
-        <w:t>an</w:t>
-      </w:r>
-      <w:proofErr w:type="spellEnd"/>
-      <w:r>
-        <w:t xml:space="preserve"> example from his data that shows the expected error… if he’s using it in the paper then it must be considered good:</w:t>
+        <w:t>Here an an example from his data that shows the expected error… if he’s using it in the paper then it must be considered good:</w:t>
       </w:r>
     </w:p>
     <w:p>
@@ -6975,21 +6155,7 @@
         <w:rPr>
           <w:highlight w:val="yellow"/>
         </w:rPr>
-        <w:t xml:space="preserve">Should I be </w:t>
-      </w:r>
-      <w:proofErr w:type="spellStart"/>
-      <w:r>
-        <w:rPr>
-          <w:highlight w:val="yellow"/>
-        </w:rPr>
-        <w:t>downsampling</w:t>
-      </w:r>
-      <w:proofErr w:type="spellEnd"/>
-      <w:r>
-        <w:rPr>
-          <w:highlight w:val="yellow"/>
-        </w:rPr>
-        <w:t xml:space="preserve"> my accelerometer? Have I missed that?</w:t>
+        <w:t>Should I be downsampling my accelerometer? Have I missed that?</w:t>
       </w:r>
     </w:p>
     <w:p>
@@ -7106,15 +6272,7 @@
         <w:ind w:left="1080"/>
       </w:pPr>
       <w:r>
-        <w:t xml:space="preserve">We recommend implementing a running mean (cf. Eq. 1, R1:4) to raw </w:t>
-      </w:r>
-      <w:proofErr w:type="spellStart"/>
-      <w:r>
-        <w:t>VeDBA</w:t>
-      </w:r>
-      <w:proofErr w:type="spellEnd"/>
-      <w:r>
-        <w:t xml:space="preserve"> values to ensure that both acceleration and deceleration components of a stride cycle are incorporated together per unit time and to reduce the magnitude of small temporal spikes</w:t>
+        <w:t>We recommend implementing a running mean (cf. Eq. 1, R1:4) to raw VeDBA values to ensure that both acceleration and deceleration components of a stride cycle are incorporated together per unit time and to reduce the magnitude of small temporal spikes</w:t>
       </w:r>
     </w:p>
     <w:p>
@@ -7479,13 +6637,8 @@
           </w:tcPr>
           <w:p>
             <w:r>
-              <w:t xml:space="preserve">X </w:t>
+              <w:t>X acc</w:t>
             </w:r>
-            <w:proofErr w:type="spellStart"/>
-            <w:r>
-              <w:t>acc</w:t>
-            </w:r>
-            <w:proofErr w:type="spellEnd"/>
           </w:p>
         </w:tc>
         <w:tc>
@@ -7529,13 +6682,8 @@
           </w:tcPr>
           <w:p>
             <w:r>
-              <w:t xml:space="preserve">Y </w:t>
+              <w:t>Y acc</w:t>
             </w:r>
-            <w:proofErr w:type="spellStart"/>
-            <w:r>
-              <w:t>acc</w:t>
-            </w:r>
-            <w:proofErr w:type="spellEnd"/>
           </w:p>
         </w:tc>
         <w:tc>
@@ -7579,13 +6727,8 @@
           </w:tcPr>
           <w:p>
             <w:r>
-              <w:t xml:space="preserve">Z </w:t>
+              <w:t>Z acc</w:t>
             </w:r>
-            <w:proofErr w:type="spellStart"/>
-            <w:r>
-              <w:t>acc</w:t>
-            </w:r>
-            <w:proofErr w:type="spellEnd"/>
           </w:p>
         </w:tc>
         <w:tc>
@@ -7753,15 +6896,7 @@
         </w:numPr>
       </w:pPr>
       <w:r>
-        <w:t>I then tried to verify this by looking at the accelerometer data when the animal was standing up (ground-</w:t>
-      </w:r>
-      <w:proofErr w:type="spellStart"/>
-      <w:r>
-        <w:t>truthed</w:t>
-      </w:r>
-      <w:proofErr w:type="spellEnd"/>
-      <w:r>
-        <w:t xml:space="preserve"> with video). Red is X, Blue is Y, Green is Z. When the animal is standing up, the X axis has close to 0 gravity. The gravity is shared over the Y and Z, with the most on the Z. This indicates that the collar is tipped forwards. </w:t>
+        <w:t xml:space="preserve">I then tried to verify this by looking at the accelerometer data when the animal was standing up (ground-truthed with video). Red is X, Blue is Y, Green is Z. When the animal is standing up, the X axis has close to 0 gravity. The gravity is shared over the Y and Z, with the most on the Z. This indicates that the collar is tipped forwards. </w:t>
       </w:r>
     </w:p>
     <w:p>
@@ -7921,15 +7056,7 @@
         </w:numPr>
       </w:pPr>
       <w:r>
-        <w:t xml:space="preserve">Therefore, I propose the orientation is: </w:t>
-      </w:r>
-      <w:proofErr w:type="spellStart"/>
-      <w:r>
-        <w:t>acc</w:t>
-      </w:r>
-      <w:proofErr w:type="spellEnd"/>
-      <w:r>
-        <w:t xml:space="preserve"> EUS, mag EDN, gravity down, and a pitch forward of about 48 degrees…</w:t>
+        <w:t>Therefore, I propose the orientation is: acc EUS, mag EDN, gravity down, and a pitch forward of about 48 degrees…</w:t>
       </w:r>
     </w:p>
     <w:p>
@@ -8203,15 +7330,7 @@
         <w:t>I have seen information about the Median Filter come up</w:t>
       </w:r>
       <w:r>
-        <w:t xml:space="preserve">… </w:t>
-      </w:r>
-      <w:proofErr w:type="spellStart"/>
-      <w:r>
-        <w:t>trialing</w:t>
-      </w:r>
-      <w:proofErr w:type="spellEnd"/>
-      <w:r>
-        <w:t xml:space="preserve"> that now.</w:t>
+        <w:t>… trialing that now.</w:t>
       </w:r>
     </w:p>
     <w:p>
@@ -8770,15 +7889,7 @@
         </w:numPr>
       </w:pPr>
       <w:r>
-        <w:t xml:space="preserve">I have put message in chat to get </w:t>
-      </w:r>
-      <w:proofErr w:type="spellStart"/>
-      <w:r>
-        <w:t>ChrisB</w:t>
-      </w:r>
-      <w:proofErr w:type="spellEnd"/>
-      <w:r>
-        <w:t xml:space="preserve"> thoughts but in the meantime I will work towards what I think the next step will be: finding all the misread sections and removing them. Similar to the kangaroo data (though that’s worse), we have to go through and chop up the data into good sections with NA’s in between</w:t>
+        <w:t>I have put message in chat to get ChrisB thoughts but in the meantime I will work towards what I think the next step will be: finding all the misread sections and removing them. Similar to the kangaroo data (though that’s worse), we have to go through and chop up the data into good sections with NA’s in between</w:t>
       </w:r>
       <w:r>
         <w:t>?</w:t>
@@ -8985,15 +8096,7 @@
         </w:numPr>
       </w:pPr>
       <w:r>
-        <w:t xml:space="preserve">Then </w:t>
-      </w:r>
-      <w:proofErr w:type="spellStart"/>
-      <w:r>
-        <w:t>ChrisB</w:t>
-      </w:r>
-      <w:proofErr w:type="spellEnd"/>
-      <w:r>
-        <w:t xml:space="preserve"> pointed out that this was happening over hours not minutes, and is therefore more likely to be sleeping. He said “</w:t>
+        <w:t>Then ChrisB pointed out that this was happening over hours not minutes, and is therefore more likely to be sleeping. He said “</w:t>
       </w:r>
       <w:r>
         <w:rPr>
@@ -9002,15 +8105,7 @@
         <w:t>In that static accelerometer region it's likely just measuring gravity, but if the rotation of the collar isn't pointing the right way it will see that as an acceleration in the wrong direction and pick that up as movement”</w:t>
       </w:r>
       <w:r>
-        <w:t xml:space="preserve">. </w:t>
-      </w:r>
-      <w:proofErr w:type="spellStart"/>
-      <w:r>
-        <w:t>Ahhhh</w:t>
-      </w:r>
-      <w:proofErr w:type="spellEnd"/>
-      <w:r>
-        <w:t xml:space="preserve"> brilliant man has saved me once again. So if I can detect that as sleeping then I can set to no movement and no DR during that period. </w:t>
+        <w:t xml:space="preserve">. Ahhhh brilliant man has saved me once again. So if I can detect that as sleeping then I can set to no movement and no DR during that period. </w:t>
       </w:r>
     </w:p>
     <w:p>
@@ -9158,15 +8253,7 @@
         <w:sym w:font="Wingdings" w:char="F0E0"/>
       </w:r>
       <w:r>
-        <w:t xml:space="preserve"> </w:t>
-      </w:r>
-      <w:proofErr w:type="spellStart"/>
-      <w:r>
-        <w:t>ifelse</w:t>
-      </w:r>
-      <w:proofErr w:type="spellEnd"/>
-      <w:r>
-        <w:t>(VDBA.sm &gt; 0.015, 0, 1) &amp; most common level in 60 seconds (3000 samples)</w:t>
+        <w:t xml:space="preserve"> ifelse(VDBA.sm &gt; 0.015, 0, 1) &amp; most common level in 60 seconds (3000 samples)</w:t>
       </w:r>
       <w:r>
         <w:t>)</w:t>
@@ -9184,15 +8271,7 @@
         <w:t xml:space="preserve">Testing that </w:t>
       </w:r>
       <w:r>
-        <w:t xml:space="preserve">however showed no difference and the </w:t>
-      </w:r>
-      <w:proofErr w:type="spellStart"/>
-      <w:r>
-        <w:t>gps</w:t>
-      </w:r>
-      <w:proofErr w:type="spellEnd"/>
-      <w:r>
-        <w:t xml:space="preserve"> is moving consistently through the period???</w:t>
+        <w:t>however showed no difference and the gps is moving consistently through the period???</w:t>
       </w:r>
     </w:p>
     <w:p>
@@ -9431,15 +8510,7 @@
         </w:numPr>
       </w:pPr>
       <w:r>
-        <w:t xml:space="preserve">Firstly I continued with the cleaning by adding a lowpass </w:t>
-      </w:r>
-      <w:proofErr w:type="spellStart"/>
-      <w:r>
-        <w:t>butterworth</w:t>
-      </w:r>
-      <w:proofErr w:type="spellEnd"/>
-      <w:r>
-        <w:t xml:space="preserve"> filter with a cutoff of 10Hz. The results of the 3 steps of smoothing shown in right plot below.</w:t>
+        <w:t>Firstly I continued with the cleaning by adding a lowpass butterworth filter with a cutoff of 10Hz. The results of the 3 steps of smoothing shown in right plot below.</w:t>
       </w:r>
     </w:p>
     <w:p>
@@ -9575,15 +8646,7 @@
         <w:t>For example, in this case, there are 2 stationary periods where there should be no GPS changes.</w:t>
       </w:r>
       <w:r>
-        <w:t xml:space="preserve"> The dark blue dots in the </w:t>
-      </w:r>
-      <w:proofErr w:type="spellStart"/>
-      <w:r>
-        <w:t>gps</w:t>
-      </w:r>
-      <w:proofErr w:type="spellEnd"/>
-      <w:r>
-        <w:t xml:space="preserve"> graph right show the stationary periods. The green dots are what got fed to the spline and the red is the spline path.</w:t>
+        <w:t xml:space="preserve"> The dark blue dots in the gps graph right show the stationary periods. The green dots are what got fed to the spline and the red is the spline path.</w:t>
       </w:r>
       <w:r>
         <w:t xml:space="preserve"> Note there are only 2 black dots because all the stationary got grouped.</w:t>
@@ -9843,15 +8906,7 @@
         </w:numPr>
       </w:pPr>
       <w:r>
-        <w:t xml:space="preserve">Then </w:t>
-      </w:r>
-      <w:proofErr w:type="spellStart"/>
-      <w:r>
-        <w:t>ChrisB</w:t>
-      </w:r>
-      <w:proofErr w:type="spellEnd"/>
-      <w:r>
-        <w:t xml:space="preserve"> helped me for a few hours, figuring out many things. For example, he found that everything was scaled by 4 because the settings of the accelerometer weren’t what I thought. (They were 16 for the kangaroos but 4 for the impala) </w:t>
+        <w:t xml:space="preserve">Then ChrisB helped me for a few hours, figuring out many things. For example, he found that everything was scaled by 4 because the settings of the accelerometer weren’t what I thought. (They were 16 for the kangaroos but 4 for the impala) </w:t>
       </w:r>
     </w:p>
     <w:p>
@@ -9876,7 +8931,7 @@
           <w:noProof/>
         </w:rPr>
         <w:drawing>
-          <wp:inline distT="0" distB="0" distL="0" distR="0" wp14:anchorId="5A369B01" wp14:editId="7B88AB3D">
+          <wp:inline distT="0" distB="0" distL="0" distR="0" wp14:anchorId="5A369B01" wp14:editId="42248354">
             <wp:extent cx="3370239" cy="2741078"/>
             <wp:effectExtent l="0" t="0" r="1905" b="2540"/>
             <wp:docPr id="745835413" name="Picture 11"/>
@@ -9943,15 +8998,7 @@
         </w:numPr>
       </w:pPr>
       <w:r>
-        <w:t xml:space="preserve">Chris Bird also doesn’t believe in tilt-corrected accelerometer based DR and thinks we should have to use the gyroscope (pronounced </w:t>
-      </w:r>
-      <w:proofErr w:type="spellStart"/>
-      <w:r>
-        <w:t>guyroscope</w:t>
-      </w:r>
-      <w:proofErr w:type="spellEnd"/>
-      <w:r>
-        <w:t>… as I learnt today)</w:t>
+        <w:t>Chris Bird also doesn’t believe in tilt-corrected accelerometer based DR and thinks we should have to use the gyroscope (pronounced guyroscope… as I learnt today)</w:t>
       </w:r>
     </w:p>
     <w:p>
@@ -9995,39 +9042,7 @@
           <w:i/>
           <w:iCs/>
         </w:rPr>
-        <w:t xml:space="preserve">The short answer is, yes - if a wrong ref frame was chosen then DR path </w:t>
-      </w:r>
-      <w:proofErr w:type="spellStart"/>
-      <w:r>
-        <w:rPr>
-          <w:i/>
-          <w:iCs/>
-        </w:rPr>
-        <w:t>wil</w:t>
-      </w:r>
-      <w:proofErr w:type="spellEnd"/>
-      <w:r>
-        <w:rPr>
-          <w:i/>
-          <w:iCs/>
-        </w:rPr>
-        <w:t xml:space="preserve"> be </w:t>
-      </w:r>
-      <w:proofErr w:type="spellStart"/>
-      <w:r>
-        <w:rPr>
-          <w:i/>
-          <w:iCs/>
-        </w:rPr>
-        <w:t>innacurate</w:t>
-      </w:r>
-      <w:proofErr w:type="spellEnd"/>
-      <w:r>
-        <w:rPr>
-          <w:i/>
-          <w:iCs/>
-        </w:rPr>
-        <w:t xml:space="preserve">. But comparing subsets with GPS pre-correction will help debug if chosen orientation was </w:t>
+        <w:t xml:space="preserve">The short answer is, yes - if a wrong ref frame was chosen then DR path wil be innacurate. But comparing subsets with GPS pre-correction will help debug if chosen orientation was </w:t>
       </w:r>
       <w:r>
         <w:rPr>
@@ -10043,164 +9058,44 @@
           <w:iCs/>
           <w:highlight w:val="green"/>
         </w:rPr>
-        <w:t xml:space="preserve">heave axis of </w:t>
-      </w:r>
-      <w:proofErr w:type="spellStart"/>
+        <w:t>heave axis of movmement</w:t>
+      </w:r>
+      <w:r>
+        <w:rPr>
+          <w:i/>
+          <w:iCs/>
+        </w:rPr>
+        <w:t xml:space="preserve"> in acc and mag (</w:t>
+      </w:r>
       <w:r>
         <w:rPr>
           <w:i/>
           <w:iCs/>
           <w:highlight w:val="green"/>
         </w:rPr>
-        <w:t>movmement</w:t>
-      </w:r>
-      <w:proofErr w:type="spellEnd"/>
+        <w:t>acc will be the one closest to +/-1 g most of the time, and mag will the one changing the least</w:t>
+      </w:r>
       <w:r>
         <w:rPr>
           <w:i/>
           <w:iCs/>
         </w:rPr>
-        <w:t xml:space="preserve"> in </w:t>
-      </w:r>
-      <w:proofErr w:type="spellStart"/>
-      <w:r>
-        <w:rPr>
-          <w:i/>
-          <w:iCs/>
-        </w:rPr>
-        <w:t>acc</w:t>
-      </w:r>
-      <w:proofErr w:type="spellEnd"/>
-      <w:r>
-        <w:rPr>
-          <w:i/>
-          <w:iCs/>
-        </w:rPr>
-        <w:t xml:space="preserve"> and mag (</w:t>
-      </w:r>
-      <w:proofErr w:type="spellStart"/>
-      <w:r>
-        <w:rPr>
-          <w:i/>
-          <w:iCs/>
-          <w:highlight w:val="green"/>
-        </w:rPr>
-        <w:t>acc</w:t>
-      </w:r>
-      <w:proofErr w:type="spellEnd"/>
-      <w:r>
-        <w:rPr>
-          <w:i/>
-          <w:iCs/>
-          <w:highlight w:val="green"/>
-        </w:rPr>
-        <w:t xml:space="preserve"> will be the one closest to +/-1 g most of the time, and mag will the one changing the least</w:t>
-      </w:r>
-      <w:r>
-        <w:rPr>
-          <w:i/>
-          <w:iCs/>
-        </w:rPr>
-        <w:t xml:space="preserve">)... In terms of deciphering the </w:t>
-      </w:r>
-      <w:proofErr w:type="spellStart"/>
-      <w:r>
-        <w:rPr>
-          <w:i/>
-          <w:iCs/>
-        </w:rPr>
-        <w:t>acc</w:t>
-      </w:r>
-      <w:proofErr w:type="spellEnd"/>
-      <w:r>
-        <w:rPr>
-          <w:i/>
-          <w:iCs/>
-        </w:rPr>
-        <w:t xml:space="preserve">/mag surge and sway dimensions, this may be more challenging. But for the </w:t>
-      </w:r>
-      <w:proofErr w:type="spellStart"/>
+        <w:t xml:space="preserve">)... In terms of deciphering the acc/mag surge and sway dimensions, this may be more challenging. But for the </w:t>
+      </w:r>
       <w:r>
         <w:rPr>
           <w:i/>
           <w:iCs/>
           <w:highlight w:val="yellow"/>
         </w:rPr>
-        <w:t>acc</w:t>
-      </w:r>
-      <w:proofErr w:type="spellEnd"/>
+        <w:t>acc, you would expect greater variation in surge dimension because they stick their head to ground to forage and then stick their head back up when travelling and vigalence</w:t>
+      </w:r>
       <w:r>
         <w:rPr>
           <w:i/>
           <w:iCs/>
-          <w:highlight w:val="yellow"/>
-        </w:rPr>
-        <w:t xml:space="preserve">, you would expect greater variation in surge dimension because they stick their head to ground to forage and then stick their head back up when travelling and </w:t>
-      </w:r>
-      <w:proofErr w:type="spellStart"/>
-      <w:r>
-        <w:rPr>
-          <w:i/>
-          <w:iCs/>
-          <w:highlight w:val="yellow"/>
-        </w:rPr>
-        <w:t>vigalence</w:t>
-      </w:r>
-      <w:proofErr w:type="spellEnd"/>
-      <w:r>
-        <w:rPr>
-          <w:i/>
-          <w:iCs/>
-        </w:rPr>
-        <w:t xml:space="preserve">, so that may help. If mag is different orientation set up to </w:t>
-      </w:r>
-      <w:proofErr w:type="spellStart"/>
-      <w:r>
-        <w:rPr>
-          <w:i/>
-          <w:iCs/>
-        </w:rPr>
-        <w:t>acc</w:t>
-      </w:r>
-      <w:proofErr w:type="spellEnd"/>
-      <w:r>
-        <w:rPr>
-          <w:i/>
-          <w:iCs/>
-        </w:rPr>
-        <w:t xml:space="preserve">, then </w:t>
-      </w:r>
-      <w:proofErr w:type="spellStart"/>
-      <w:r>
-        <w:rPr>
-          <w:i/>
-          <w:iCs/>
-        </w:rPr>
-        <w:t>its</w:t>
-      </w:r>
-      <w:proofErr w:type="spellEnd"/>
-      <w:r>
-        <w:rPr>
-          <w:i/>
-          <w:iCs/>
-        </w:rPr>
-        <w:t xml:space="preserve"> worth just checking if you switch the surge/sway orientations then which one produces most </w:t>
-      </w:r>
-      <w:proofErr w:type="spellStart"/>
-      <w:r>
-        <w:rPr>
-          <w:i/>
-          <w:iCs/>
-        </w:rPr>
-        <w:t>realsitic</w:t>
-      </w:r>
-      <w:proofErr w:type="spellEnd"/>
-      <w:r>
-        <w:rPr>
-          <w:i/>
-          <w:iCs/>
-        </w:rPr>
-        <w:t xml:space="preserve"> DR track relative to GPS... by deciphering the heave axis and dimension of measured g, you already have homed in on just a few possible orientations it could be...</w:t>
+        </w:rPr>
+        <w:t>, so that may help. If mag is different orientation set up to acc, then its worth just checking if you switch the surge/sway orientations then which one produces most realsitic DR track relative to GPS... by deciphering the heave axis and dimension of measured g, you already have homed in on just a few possible orientations it could be...</w:t>
       </w:r>
     </w:p>
     <w:p>
@@ -10385,29 +9280,8 @@
           <w:numId w:val="2"/>
         </w:numPr>
       </w:pPr>
-      <w:proofErr w:type="spellStart"/>
-      <w:r>
-        <w:t>acc_orientation</w:t>
-      </w:r>
-      <w:proofErr w:type="spellEnd"/>
-      <w:r>
-        <w:t xml:space="preserve"> &lt;- "NWU",   </w:t>
-      </w:r>
-      <w:proofErr w:type="spellStart"/>
-      <w:r>
-        <w:t>mag_orientation</w:t>
-      </w:r>
-      <w:proofErr w:type="spellEnd"/>
-      <w:r>
-        <w:t xml:space="preserve"> &lt;- "NED",   </w:t>
-      </w:r>
-      <w:proofErr w:type="spellStart"/>
-      <w:r>
-        <w:t>gravity_direction</w:t>
-      </w:r>
-      <w:proofErr w:type="spellEnd"/>
-      <w:r>
-        <w:t xml:space="preserve"> &lt;- "down",   pitch &lt;- 0#-48</w:t>
+      <w:r>
+        <w:t>acc_orientation &lt;- "NWU",   mag_orientation &lt;- "NED",   gravity_direction &lt;- "down",   pitch &lt;- 0#-48</w:t>
       </w:r>
     </w:p>
     <w:p>
@@ -10732,15 +9606,7 @@
     <w:p/>
     <w:p>
       <w:r>
-        <w:t>X = "salmon", Y = "turquoise", Z = "</w:t>
-      </w:r>
-      <w:proofErr w:type="spellStart"/>
-      <w:r>
-        <w:t>darkblue</w:t>
-      </w:r>
-      <w:proofErr w:type="spellEnd"/>
-      <w:r>
-        <w:t>"</w:t>
+        <w:t>X = "salmon", Y = "turquoise", Z = "darkblue"</w:t>
       </w:r>
     </w:p>
     <w:p>
@@ -11228,23 +10094,7 @@
           <w:rFonts w:asciiTheme="minorHAnsi" w:hAnsiTheme="minorHAnsi"/>
           <w:lang w:val="en-GB"/>
         </w:rPr>
-        <w:t xml:space="preserve">Plotted it to see what units the devices are in and holy fuck, why are they all different??? What evil tomfoolery is this?????? Messaged </w:t>
-      </w:r>
-      <w:proofErr w:type="spellStart"/>
-      <w:r>
-        <w:rPr>
-          <w:rFonts w:asciiTheme="minorHAnsi" w:hAnsiTheme="minorHAnsi"/>
-          <w:lang w:val="en-GB"/>
-        </w:rPr>
-        <w:t>ChrisB</w:t>
-      </w:r>
-      <w:proofErr w:type="spellEnd"/>
-      <w:r>
-        <w:rPr>
-          <w:rFonts w:asciiTheme="minorHAnsi" w:hAnsiTheme="minorHAnsi"/>
-          <w:lang w:val="en-GB"/>
-        </w:rPr>
-        <w:t xml:space="preserve"> to ask what the heck is going on.</w:t>
+        <w:t>Plotted it to see what units the devices are in and holy fuck, why are they all different??? What evil tomfoolery is this?????? Messaged ChrisB to ask what the heck is going on.</w:t>
       </w:r>
     </w:p>
     <w:p>
@@ -11547,46 +10397,21 @@
           <w:rFonts w:asciiTheme="minorHAnsi" w:hAnsiTheme="minorHAnsi"/>
           <w:lang w:val="en-GB"/>
         </w:rPr>
-        <w:t xml:space="preserve">Basically I found that there are 3 settings. Either the device is already in G (either 16 or 4) or its in raw units and has to be converted. The cropping at 4g means I am going to have to match and join it to the </w:t>
-      </w:r>
-      <w:proofErr w:type="spellStart"/>
+        <w:t xml:space="preserve">Basically I found that there are 3 settings. Either the device is already in G (either 16 or 4) or its in raw units and has to be converted. The cropping at 4g means I am going to have to match and join it to the Axivity </w:t>
+      </w:r>
+      <w:r>
+        <w:rPr>
+          <w:rFonts w:ascii="Segoe UI Emoji" w:hAnsi="Segoe UI Emoji" w:cs="Segoe UI Emoji"/>
+          <w:lang w:val="en-GB"/>
+        </w:rPr>
+        <w:t>😢</w:t>
+      </w:r>
       <w:r>
         <w:rPr>
           <w:rFonts w:asciiTheme="minorHAnsi" w:hAnsiTheme="minorHAnsi"/>
           <w:lang w:val="en-GB"/>
         </w:rPr>
-        <w:t>Axivity</w:t>
-      </w:r>
-      <w:proofErr w:type="spellEnd"/>
-      <w:r>
-        <w:rPr>
-          <w:rFonts w:asciiTheme="minorHAnsi" w:hAnsiTheme="minorHAnsi"/>
-          <w:lang w:val="en-GB"/>
-        </w:rPr>
-        <w:t xml:space="preserve"> </w:t>
-      </w:r>
-      <w:r>
-        <w:rPr>
-          <w:rFonts w:ascii="Segoe UI Emoji" w:hAnsi="Segoe UI Emoji" w:cs="Segoe UI Emoji"/>
-          <w:lang w:val="en-GB"/>
-        </w:rPr>
-        <w:t>😢</w:t>
-      </w:r>
-      <w:proofErr w:type="spellStart"/>
-      <w:r>
-        <w:rPr>
-          <w:rFonts w:asciiTheme="minorHAnsi" w:hAnsiTheme="minorHAnsi"/>
-          <w:lang w:val="en-GB"/>
-        </w:rPr>
-        <w:t>ChrisC</w:t>
-      </w:r>
-      <w:proofErr w:type="spellEnd"/>
-      <w:r>
-        <w:rPr>
-          <w:rFonts w:asciiTheme="minorHAnsi" w:hAnsiTheme="minorHAnsi"/>
-          <w:lang w:val="en-GB"/>
-        </w:rPr>
-        <w:t xml:space="preserve"> says this code exists and already works… but I’ve heard that often enough to know that means “this will be hard”.</w:t>
+        <w:t>ChrisC says this code exists and already works… but I’ve heard that often enough to know that means “this will be hard”.</w:t>
       </w:r>
     </w:p>
     <w:tbl>
@@ -11659,7 +10484,6 @@
                 <w14:ligatures w14:val="none"/>
               </w:rPr>
             </w:pPr>
-            <w:proofErr w:type="spellStart"/>
             <w:r>
               <w:rPr>
                 <w:rFonts w:ascii="Aptos Narrow" w:eastAsia="Times New Roman" w:hAnsi="Aptos Narrow" w:cs="Times New Roman"/>
@@ -11672,7 +10496,6 @@
               </w:rPr>
               <w:t>avg_hz</w:t>
             </w:r>
-            <w:proofErr w:type="spellEnd"/>
           </w:p>
         </w:tc>
         <w:tc>
@@ -11694,7 +10517,6 @@
                 <w14:ligatures w14:val="none"/>
               </w:rPr>
             </w:pPr>
-            <w:proofErr w:type="spellStart"/>
             <w:r>
               <w:rPr>
                 <w:rFonts w:ascii="Aptos Narrow" w:eastAsia="Times New Roman" w:hAnsi="Aptos Narrow" w:cs="Times New Roman"/>
@@ -11707,7 +10529,6 @@
               </w:rPr>
               <w:t>Acc_Conv</w:t>
             </w:r>
-            <w:proofErr w:type="spellEnd"/>
           </w:p>
         </w:tc>
         <w:tc>
@@ -11729,7 +10550,6 @@
                 <w14:ligatures w14:val="none"/>
               </w:rPr>
             </w:pPr>
-            <w:proofErr w:type="spellStart"/>
             <w:r>
               <w:rPr>
                 <w:rFonts w:ascii="Aptos Narrow" w:eastAsia="Times New Roman" w:hAnsi="Aptos Narrow" w:cs="Times New Roman"/>
@@ -11742,7 +10562,6 @@
               </w:rPr>
               <w:t>Mag_Conv</w:t>
             </w:r>
-            <w:proofErr w:type="spellEnd"/>
           </w:p>
         </w:tc>
       </w:tr>
@@ -13383,13 +12202,8 @@
             </w:r>
           </w:p>
           <w:p>
-            <w:proofErr w:type="spellStart"/>
             <w:r>
-              <w:t>accel_data</w:t>
-            </w:r>
-            <w:proofErr w:type="spellEnd"/>
-            <w:r>
-              <w:t>[1445000:1452000]</w:t>
+              <w:t>accel_data[1445000:1452000]</w:t>
             </w:r>
           </w:p>
         </w:tc>
@@ -13492,13 +12306,8 @@
             </w:r>
           </w:p>
           <w:p>
-            <w:proofErr w:type="spellStart"/>
             <w:r>
-              <w:t>accel_data</w:t>
-            </w:r>
-            <w:proofErr w:type="spellEnd"/>
-            <w:r>
-              <w:t>[1660000:1670000]</w:t>
+              <w:t>accel_data[1660000:1670000]</w:t>
             </w:r>
           </w:p>
         </w:tc>
@@ -13602,13 +12411,8 @@
             </w:r>
           </w:p>
           <w:p>
-            <w:proofErr w:type="spellStart"/>
             <w:r>
-              <w:t>accel_data</w:t>
-            </w:r>
-            <w:proofErr w:type="spellEnd"/>
-            <w:r>
-              <w:t>[90000:91000]</w:t>
+              <w:t>accel_data[90000:91000]</w:t>
             </w:r>
           </w:p>
         </w:tc>
@@ -14449,24 +13253,71 @@
           <w:rFonts w:asciiTheme="minorHAnsi" w:hAnsiTheme="minorHAnsi"/>
           <w:lang w:val="en-GB"/>
         </w:rPr>
-        <w:t xml:space="preserve">Therefore, I went through and made sure they’re now on the same scale (other than the ones that capped at 4g and therefore have to be matched with the </w:t>
-      </w:r>
-      <w:proofErr w:type="spellStart"/>
-      <w:r>
+        <w:t>Therefore, I went through and made sure they’re now on the same scale (other than the ones that capped at 4g and therefore have to be matched with the Axivity before behavioural and VDBA analysis). I then re-extracted the training data for those periods based on the times of the original unsmoothed data. That code is now running. I will check the output tomorrow.</w:t>
+      </w:r>
+    </w:p>
+    <w:p>
+      <w:pPr>
+        <w:pStyle w:val="Heading3"/>
+        <w:rPr>
+          <w:rFonts w:cs="Arial"/>
+        </w:rPr>
+      </w:pPr>
+      <w:r>
+        <w:rPr>
+          <w:rFonts w:cs="Arial"/>
+        </w:rPr>
+        <w:t>1</w:t>
+      </w:r>
+      <w:r>
+        <w:rPr>
+          <w:rFonts w:cs="Arial"/>
+        </w:rPr>
+        <w:t>4</w:t>
+      </w:r>
+      <w:r>
+        <w:rPr>
+          <w:rFonts w:cs="Arial"/>
+        </w:rPr>
+        <w:t>/05</w:t>
+      </w:r>
+    </w:p>
+    <w:p>
+      <w:pPr>
+        <w:pStyle w:val="NormalWeb"/>
+        <w:numPr>
+          <w:ilvl w:val="0"/>
+          <w:numId w:val="2"/>
+        </w:numPr>
         <w:rPr>
           <w:rFonts w:asciiTheme="minorHAnsi" w:hAnsiTheme="minorHAnsi"/>
           <w:lang w:val="en-GB"/>
         </w:rPr>
-        <w:t>Axivity</w:t>
-      </w:r>
-      <w:proofErr w:type="spellEnd"/>
+      </w:pPr>
       <w:r>
         <w:rPr>
           <w:rFonts w:asciiTheme="minorHAnsi" w:hAnsiTheme="minorHAnsi"/>
           <w:lang w:val="en-GB"/>
         </w:rPr>
-        <w:t xml:space="preserve"> before behavioural and VDBA analysis). I then re-extracted the training data for those periods based on the times of the original unsmoothed data. That code is now running. I will check the output tomorrow.</w:t>
-      </w:r>
+        <w:t>After all that conversion work, it wasn’t correct</w:t>
+      </w:r>
+      <w:r>
+        <w:rPr>
+          <w:rFonts w:asciiTheme="minorHAnsi" w:hAnsiTheme="minorHAnsi"/>
+          <w:lang w:val="en-GB"/>
+        </w:rPr>
+        <w:t xml:space="preserve">… They did need to be divided after all. Weird? Message CB and he said that things can change or if it reset/rebooted it might have gone back to default. Whatevvvvvvver man. I can’t keep up with all this. Converted everything to the right scale for real now and then proceeded. </w:t>
+      </w:r>
+    </w:p>
+    <w:p>
+      <w:pPr>
+        <w:pStyle w:val="Heading2"/>
+      </w:pPr>
+      <w:bookmarkStart w:id="3" w:name="_Toc230165021"/>
+      <w:r>
+        <w:t>Training the model</w:t>
+      </w:r>
+      <w:bookmarkEnd w:id="3"/>
     </w:p>
     <w:p>
       <w:pPr>
@@ -14485,7 +13336,7 @@
         <w:rPr>
           <w:rFonts w:cs="Arial"/>
         </w:rPr>
-        <w:t>4</w:t>
+        <w:t>5</w:t>
       </w:r>
       <w:r>
         <w:rPr>
@@ -14511,117 +13362,29 @@
           <w:rFonts w:asciiTheme="minorHAnsi" w:hAnsiTheme="minorHAnsi"/>
           <w:lang w:val="en-GB"/>
         </w:rPr>
-        <w:t>After all that conversion work, it wasn’t correct</w:t>
+        <w:t xml:space="preserve">Yesterday I extracted a tonne of data and checked it all. </w:t>
       </w:r>
       <w:r>
         <w:rPr>
           <w:rFonts w:asciiTheme="minorHAnsi" w:hAnsiTheme="minorHAnsi"/>
           <w:lang w:val="en-GB"/>
         </w:rPr>
-        <w:t xml:space="preserve">… They did need to be divided after all. Weird? Message CB and he said that things can change or if it reset/rebooted it might have gone back to default. </w:t>
-      </w:r>
-      <w:proofErr w:type="spellStart"/>
+        <w:t>Looks mostly good</w:t>
+      </w:r>
       <w:r>
         <w:rPr>
           <w:rFonts w:asciiTheme="minorHAnsi" w:hAnsiTheme="minorHAnsi"/>
           <w:lang w:val="en-GB"/>
         </w:rPr>
-        <w:t>Whatevvvvvvver</w:t>
-      </w:r>
-      <w:proofErr w:type="spellEnd"/>
+        <w:t>.</w:t>
+      </w:r>
       <w:r>
         <w:rPr>
           <w:rFonts w:asciiTheme="minorHAnsi" w:hAnsiTheme="minorHAnsi"/>
           <w:lang w:val="en-GB"/>
         </w:rPr>
-        <w:t xml:space="preserve"> man. I can’t keep up with all this. Converted everything to the right scale for real now and then proceeded. </w:t>
-      </w:r>
-    </w:p>
-    <w:p>
-      <w:pPr>
-        <w:pStyle w:val="Heading2"/>
-      </w:pPr>
-      <w:bookmarkStart w:id="3" w:name="_Toc230165021"/>
-      <w:r>
-        <w:t>Training the model</w:t>
-      </w:r>
-      <w:bookmarkEnd w:id="3"/>
-    </w:p>
-    <w:p>
-      <w:pPr>
-        <w:pStyle w:val="Heading3"/>
-        <w:rPr>
-          <w:rFonts w:cs="Arial"/>
-        </w:rPr>
-      </w:pPr>
-      <w:r>
-        <w:rPr>
-          <w:rFonts w:cs="Arial"/>
-        </w:rPr>
-        <w:t>1</w:t>
-      </w:r>
-      <w:r>
-        <w:rPr>
-          <w:rFonts w:cs="Arial"/>
-        </w:rPr>
-        <w:t>5</w:t>
-      </w:r>
-      <w:r>
-        <w:rPr>
-          <w:rFonts w:cs="Arial"/>
-        </w:rPr>
-        <w:t>/05</w:t>
-      </w:r>
-    </w:p>
-    <w:p>
-      <w:pPr>
-        <w:pStyle w:val="NormalWeb"/>
-        <w:numPr>
-          <w:ilvl w:val="0"/>
-          <w:numId w:val="2"/>
-        </w:numPr>
-        <w:rPr>
-          <w:rFonts w:asciiTheme="minorHAnsi" w:hAnsiTheme="minorHAnsi"/>
-          <w:lang w:val="en-GB"/>
-        </w:rPr>
-      </w:pPr>
-      <w:r>
-        <w:rPr>
-          <w:rFonts w:asciiTheme="minorHAnsi" w:hAnsiTheme="minorHAnsi"/>
-          <w:lang w:val="en-GB"/>
-        </w:rPr>
-        <w:t xml:space="preserve">Yesterday I extracted a tonne of data and checked it all. </w:t>
-      </w:r>
-      <w:r>
-        <w:rPr>
-          <w:rFonts w:asciiTheme="minorHAnsi" w:hAnsiTheme="minorHAnsi"/>
-          <w:lang w:val="en-GB"/>
-        </w:rPr>
-        <w:t>Looks mostly good</w:t>
-      </w:r>
-      <w:r>
-        <w:rPr>
-          <w:rFonts w:asciiTheme="minorHAnsi" w:hAnsiTheme="minorHAnsi"/>
-          <w:lang w:val="en-GB"/>
-        </w:rPr>
-        <w:t>.</w:t>
-      </w:r>
-      <w:r>
-        <w:rPr>
-          <w:rFonts w:asciiTheme="minorHAnsi" w:hAnsiTheme="minorHAnsi"/>
-          <w:lang w:val="en-GB"/>
-        </w:rPr>
-        <w:t xml:space="preserve"> Some errors I can see, but these will be cleaned out in the next step of the second </w:t>
-      </w:r>
-      <w:proofErr w:type="spellStart"/>
-      <w:r>
-        <w:rPr>
-          <w:rFonts w:asciiTheme="minorHAnsi" w:hAnsiTheme="minorHAnsi"/>
-          <w:lang w:val="en-GB"/>
-        </w:rPr>
-        <w:t>matlab</w:t>
-      </w:r>
-      <w:proofErr w:type="spellEnd"/>
+        <w:t xml:space="preserve"> Some errors I can see, but these will be cleaned out in the next step of the second matlab</w:t>
+      </w:r>
       <w:r>
         <w:rPr>
           <w:rFonts w:asciiTheme="minorHAnsi" w:hAnsiTheme="minorHAnsi"/>
@@ -15140,33 +13903,69 @@
           <w:highlight w:val="yellow"/>
           <w:lang w:val="en-GB"/>
         </w:rPr>
-        <w:t xml:space="preserve">Need to build in some cleaning logic for when the collars flip… </w:t>
-      </w:r>
-      <w:proofErr w:type="spellStart"/>
+        <w:t xml:space="preserve">Need to build in some cleaning logic for when the collars flip… ie. When the Y axis is on average higher than the Z axis, </w:t>
+      </w:r>
       <w:r>
         <w:rPr>
           <w:rFonts w:asciiTheme="minorHAnsi" w:hAnsiTheme="minorHAnsi"/>
           <w:highlight w:val="yellow"/>
           <w:lang w:val="en-GB"/>
         </w:rPr>
-        <w:t>ie</w:t>
-      </w:r>
-      <w:proofErr w:type="spellEnd"/>
-      <w:r>
+        <w:t>remove as a collar flip.</w:t>
+      </w:r>
+    </w:p>
+    <w:p>
+      <w:pPr>
+        <w:pStyle w:val="NormalWeb"/>
+        <w:numPr>
+          <w:ilvl w:val="0"/>
+          <w:numId w:val="2"/>
+        </w:numPr>
         <w:rPr>
           <w:rFonts w:asciiTheme="minorHAnsi" w:hAnsiTheme="minorHAnsi"/>
           <w:highlight w:val="yellow"/>
           <w:lang w:val="en-GB"/>
         </w:rPr>
-        <w:t xml:space="preserve">. When the Y axis is on average higher than the Z axis, </w:t>
-      </w:r>
+      </w:pPr>
       <w:r>
         <w:rPr>
           <w:rFonts w:asciiTheme="minorHAnsi" w:hAnsiTheme="minorHAnsi"/>
           <w:highlight w:val="yellow"/>
           <w:lang w:val="en-GB"/>
         </w:rPr>
-        <w:t>remove as a collar flip.</w:t>
+        <w:t xml:space="preserve">And then logic the dead reckoning based on the behavioural analysis. </w:t>
+      </w:r>
+    </w:p>
+    <w:p>
+      <w:pPr>
+        <w:pStyle w:val="Heading3"/>
+        <w:rPr>
+          <w:rFonts w:cs="Arial"/>
+        </w:rPr>
+      </w:pPr>
+      <w:r>
+        <w:rPr>
+          <w:rFonts w:cs="Arial"/>
+        </w:rPr>
+        <w:t>1</w:t>
+      </w:r>
+      <w:r>
+        <w:rPr>
+          <w:rFonts w:cs="Arial"/>
+        </w:rPr>
+        <w:t>9</w:t>
+      </w:r>
+      <w:r>
+        <w:rPr>
+          <w:rFonts w:cs="Arial"/>
+        </w:rPr>
+        <w:t>/</w:t>
+      </w:r>
+      <w:r>
+        <w:rPr>
+          <w:rFonts w:cs="Arial"/>
+        </w:rPr>
+        <w:t>05</w:t>
       </w:r>
     </w:p>
     <w:p>
@@ -15178,49 +13977,29 @@
         </w:numPr>
         <w:rPr>
           <w:rFonts w:asciiTheme="minorHAnsi" w:hAnsiTheme="minorHAnsi"/>
-          <w:highlight w:val="yellow"/>
           <w:lang w:val="en-GB"/>
         </w:rPr>
       </w:pPr>
       <w:r>
         <w:rPr>
           <w:rFonts w:asciiTheme="minorHAnsi" w:hAnsiTheme="minorHAnsi"/>
-          <w:highlight w:val="yellow"/>
           <w:lang w:val="en-GB"/>
         </w:rPr>
-        <w:t xml:space="preserve">And then logic the dead reckoning based on the behavioural analysis. </w:t>
-      </w:r>
-    </w:p>
-    <w:p>
-      <w:pPr>
-        <w:pStyle w:val="Heading3"/>
-        <w:rPr>
-          <w:rFonts w:cs="Arial"/>
-        </w:rPr>
-      </w:pPr>
-      <w:r>
-        <w:rPr>
-          <w:rFonts w:cs="Arial"/>
-        </w:rPr>
-        <w:t>1</w:t>
-      </w:r>
-      <w:r>
-        <w:rPr>
-          <w:rFonts w:cs="Arial"/>
-        </w:rPr>
-        <w:t>9</w:t>
-      </w:r>
-      <w:r>
-        <w:rPr>
-          <w:rFonts w:cs="Arial"/>
-        </w:rPr>
-        <w:t>/</w:t>
-      </w:r>
-      <w:r>
-        <w:rPr>
-          <w:rFonts w:cs="Arial"/>
-        </w:rPr>
-        <w:t>05</w:t>
+        <w:t>I ran the feature generation last night but forgot to change one of the variables so it only generated 63 features instead of all of them. Ugh. And it took all night so I can’t afford to run it again right now. Have to remember to run it again tonight… In the meantime</w:t>
+      </w:r>
+      <w:r>
+        <w:rPr>
+          <w:rFonts w:asciiTheme="minorHAnsi" w:hAnsiTheme="minorHAnsi"/>
+          <w:lang w:val="en-GB"/>
+        </w:rPr>
+        <w:t>,</w:t>
+      </w:r>
+      <w:r>
+        <w:rPr>
+          <w:rFonts w:asciiTheme="minorHAnsi" w:hAnsiTheme="minorHAnsi"/>
+          <w:lang w:val="en-GB"/>
+        </w:rPr>
+        <w:t xml:space="preserve"> will prepare the next phase of code.</w:t>
       </w:r>
     </w:p>
     <w:p>
@@ -15240,21 +14019,75 @@
           <w:rFonts w:asciiTheme="minorHAnsi" w:hAnsiTheme="minorHAnsi"/>
           <w:lang w:val="en-GB"/>
         </w:rPr>
-        <w:t>I ran the feature generation last night but forgot to change one of the variables so it only generated 63 features instead of all of them. Ugh. And it took all night so I can’t afford to run it again right now. Have to remember to run it again tonight… In the meantime</w:t>
+        <w:t>The models are doing reeaaaaallly badly</w:t>
       </w:r>
       <w:r>
         <w:rPr>
           <w:rFonts w:asciiTheme="minorHAnsi" w:hAnsiTheme="minorHAnsi"/>
           <w:lang w:val="en-GB"/>
         </w:rPr>
-        <w:t>,</w:t>
+        <w:t xml:space="preserve"> with the limited features</w:t>
       </w:r>
       <w:r>
         <w:rPr>
           <w:rFonts w:asciiTheme="minorHAnsi" w:hAnsiTheme="minorHAnsi"/>
           <w:lang w:val="en-GB"/>
         </w:rPr>
-        <w:t xml:space="preserve"> will prepare the next phase of code.</w:t>
+        <w:t xml:space="preserve">. Even the RF only got 26%. </w:t>
+      </w:r>
+    </w:p>
+    <w:p>
+      <w:pPr>
+        <w:pStyle w:val="NormalWeb"/>
+        <w:numPr>
+          <w:ilvl w:val="1"/>
+          <w:numId w:val="2"/>
+        </w:numPr>
+        <w:rPr>
+          <w:rFonts w:asciiTheme="minorHAnsi" w:hAnsiTheme="minorHAnsi"/>
+          <w:lang w:val="en-GB"/>
+        </w:rPr>
+      </w:pPr>
+      <w:r>
+        <w:rPr>
+          <w:rFonts w:asciiTheme="minorHAnsi" w:hAnsiTheme="minorHAnsi"/>
+          <w:lang w:val="en-GB"/>
+        </w:rPr>
+        <w:t xml:space="preserve">From what I could see, the confusion between grazing_headlevel and walking was total. I collapsed those classes into one. There was also a lot of confusion between vigilance and </w:t>
+      </w:r>
+      <w:r>
+        <w:rPr>
+          <w:rFonts w:asciiTheme="minorHAnsi" w:hAnsiTheme="minorHAnsi"/>
+          <w:lang w:val="en-GB"/>
+        </w:rPr>
+        <w:lastRenderedPageBreak/>
+        <w:t>vibrating. I also collapsed those categories together as well. I am rerunning the rest of the feature generation overnight and will check again tomorrow.</w:t>
+      </w:r>
+    </w:p>
+    <w:p>
+      <w:pPr>
+        <w:pStyle w:val="Heading3"/>
+        <w:rPr>
+          <w:rFonts w:cs="Arial"/>
+        </w:rPr>
+      </w:pPr>
+      <w:r>
+        <w:rPr>
+          <w:rFonts w:cs="Arial"/>
+        </w:rPr>
+        <w:t>20</w:t>
+      </w:r>
+      <w:r>
+        <w:rPr>
+          <w:rFonts w:cs="Arial"/>
+        </w:rPr>
+        <w:t>/</w:t>
+      </w:r>
+      <w:r>
+        <w:rPr>
+          <w:rFonts w:cs="Arial"/>
+        </w:rPr>
+        <w:t>05</w:t>
       </w:r>
     </w:p>
     <w:p>
@@ -15264,6 +14097,7 @@
           <w:ilvl w:val="0"/>
           <w:numId w:val="2"/>
         </w:numPr>
+        <w:spacing w:after="0" w:afterAutospacing="0"/>
         <w:rPr>
           <w:rFonts w:asciiTheme="minorHAnsi" w:hAnsiTheme="minorHAnsi"/>
           <w:lang w:val="en-GB"/>
@@ -15274,37 +14108,49 @@
           <w:rFonts w:asciiTheme="minorHAnsi" w:hAnsiTheme="minorHAnsi"/>
           <w:lang w:val="en-GB"/>
         </w:rPr>
-        <w:t xml:space="preserve">The models are doing </w:t>
-      </w:r>
-      <w:proofErr w:type="spellStart"/>
-      <w:r>
+        <w:t>Looking at the behavioural model results so far, there is such a massive confusion between some of the classes. Before I collapse the classes, I want to try training a more powerful model: 1) XGBoost, 2) a basic NN.</w:t>
+      </w:r>
+    </w:p>
+    <w:p>
+      <w:pPr>
+        <w:pStyle w:val="NormalWeb"/>
+        <w:numPr>
+          <w:ilvl w:val="1"/>
+          <w:numId w:val="2"/>
+        </w:numPr>
+        <w:spacing w:after="0" w:afterAutospacing="0"/>
         <w:rPr>
           <w:rFonts w:asciiTheme="minorHAnsi" w:hAnsiTheme="minorHAnsi"/>
           <w:lang w:val="en-GB"/>
         </w:rPr>
-        <w:t>reeaaaaallly</w:t>
-      </w:r>
-      <w:proofErr w:type="spellEnd"/>
+      </w:pPr>
       <w:r>
         <w:rPr>
           <w:rFonts w:asciiTheme="minorHAnsi" w:hAnsiTheme="minorHAnsi"/>
           <w:lang w:val="en-GB"/>
         </w:rPr>
-        <w:t xml:space="preserve"> badly</w:t>
-      </w:r>
-      <w:r>
+        <w:t>The XGBoost is doing terrible, with a below chance performance. I must be doing something wrong in the code…</w:t>
+      </w:r>
+    </w:p>
+    <w:p>
+      <w:pPr>
+        <w:pStyle w:val="NormalWeb"/>
+        <w:numPr>
+          <w:ilvl w:val="0"/>
+          <w:numId w:val="2"/>
+        </w:numPr>
+        <w:spacing w:after="0" w:afterAutospacing="0"/>
         <w:rPr>
           <w:rFonts w:asciiTheme="minorHAnsi" w:hAnsiTheme="minorHAnsi"/>
           <w:lang w:val="en-GB"/>
         </w:rPr>
-        <w:t xml:space="preserve"> with the limited features</w:t>
-      </w:r>
+      </w:pPr>
       <w:r>
         <w:rPr>
           <w:rFonts w:asciiTheme="minorHAnsi" w:hAnsiTheme="minorHAnsi"/>
           <w:lang w:val="en-GB"/>
         </w:rPr>
-        <w:t xml:space="preserve">. Even the RF only got 26%. </w:t>
+        <w:t>Currently fighting for my life to get keras working so I can use deep learning models. I want to try the NN at least once before I move on.</w:t>
       </w:r>
     </w:p>
     <w:p>
@@ -15314,6 +14160,7 @@
           <w:ilvl w:val="1"/>
           <w:numId w:val="2"/>
         </w:numPr>
+        <w:spacing w:after="0" w:afterAutospacing="0"/>
         <w:rPr>
           <w:rFonts w:asciiTheme="minorHAnsi" w:hAnsiTheme="minorHAnsi"/>
           <w:lang w:val="en-GB"/>
@@ -15324,221 +14171,7 @@
           <w:rFonts w:asciiTheme="minorHAnsi" w:hAnsiTheme="minorHAnsi"/>
           <w:lang w:val="en-GB"/>
         </w:rPr>
-        <w:t xml:space="preserve">From what I could see, the confusion between </w:t>
-      </w:r>
-      <w:proofErr w:type="spellStart"/>
-      <w:r>
-        <w:rPr>
-          <w:rFonts w:asciiTheme="minorHAnsi" w:hAnsiTheme="minorHAnsi"/>
-          <w:lang w:val="en-GB"/>
-        </w:rPr>
-        <w:t>grazing_headlevel</w:t>
-      </w:r>
-      <w:proofErr w:type="spellEnd"/>
-      <w:r>
-        <w:rPr>
-          <w:rFonts w:asciiTheme="minorHAnsi" w:hAnsiTheme="minorHAnsi"/>
-          <w:lang w:val="en-GB"/>
-        </w:rPr>
-        <w:t xml:space="preserve"> and walking was total. I collapsed those classes into one. There was also a lot of confusion between vigilance and </w:t>
-      </w:r>
-      <w:r>
-        <w:rPr>
-          <w:rFonts w:asciiTheme="minorHAnsi" w:hAnsiTheme="minorHAnsi"/>
-          <w:lang w:val="en-GB"/>
-        </w:rPr>
-        <w:lastRenderedPageBreak/>
-        <w:t>vibrating. I also collapsed those categories together as well. I am rerunning the rest of the feature generation overnight and will check again tomorrow.</w:t>
-      </w:r>
-    </w:p>
-    <w:p>
-      <w:pPr>
-        <w:pStyle w:val="Heading3"/>
-        <w:rPr>
-          <w:rFonts w:cs="Arial"/>
-        </w:rPr>
-      </w:pPr>
-      <w:r>
-        <w:rPr>
-          <w:rFonts w:cs="Arial"/>
-        </w:rPr>
-        <w:t>20</w:t>
-      </w:r>
-      <w:r>
-        <w:rPr>
-          <w:rFonts w:cs="Arial"/>
-        </w:rPr>
-        <w:t>/</w:t>
-      </w:r>
-      <w:r>
-        <w:rPr>
-          <w:rFonts w:cs="Arial"/>
-        </w:rPr>
-        <w:t>05</w:t>
-      </w:r>
-    </w:p>
-    <w:p>
-      <w:pPr>
-        <w:pStyle w:val="NormalWeb"/>
-        <w:numPr>
-          <w:ilvl w:val="0"/>
-          <w:numId w:val="2"/>
-        </w:numPr>
-        <w:spacing w:after="0" w:afterAutospacing="0"/>
-        <w:rPr>
-          <w:rFonts w:asciiTheme="minorHAnsi" w:hAnsiTheme="minorHAnsi"/>
-          <w:lang w:val="en-GB"/>
-        </w:rPr>
-      </w:pPr>
-      <w:r>
-        <w:rPr>
-          <w:rFonts w:asciiTheme="minorHAnsi" w:hAnsiTheme="minorHAnsi"/>
-          <w:lang w:val="en-GB"/>
-        </w:rPr>
-        <w:t xml:space="preserve">Looking at the behavioural model results so far, there is such a massive confusion between some of the classes. Before I collapse the classes, I want to try training a more powerful model: 1) </w:t>
-      </w:r>
-      <w:proofErr w:type="spellStart"/>
-      <w:r>
-        <w:rPr>
-          <w:rFonts w:asciiTheme="minorHAnsi" w:hAnsiTheme="minorHAnsi"/>
-          <w:lang w:val="en-GB"/>
-        </w:rPr>
-        <w:t>XGBoost</w:t>
-      </w:r>
-      <w:proofErr w:type="spellEnd"/>
-      <w:r>
-        <w:rPr>
-          <w:rFonts w:asciiTheme="minorHAnsi" w:hAnsiTheme="minorHAnsi"/>
-          <w:lang w:val="en-GB"/>
-        </w:rPr>
-        <w:t>, 2) a basic NN.</w:t>
-      </w:r>
-    </w:p>
-    <w:p>
-      <w:pPr>
-        <w:pStyle w:val="NormalWeb"/>
-        <w:numPr>
-          <w:ilvl w:val="1"/>
-          <w:numId w:val="2"/>
-        </w:numPr>
-        <w:spacing w:after="0" w:afterAutospacing="0"/>
-        <w:rPr>
-          <w:rFonts w:asciiTheme="minorHAnsi" w:hAnsiTheme="minorHAnsi"/>
-          <w:lang w:val="en-GB"/>
-        </w:rPr>
-      </w:pPr>
-      <w:r>
-        <w:rPr>
-          <w:rFonts w:asciiTheme="minorHAnsi" w:hAnsiTheme="minorHAnsi"/>
-          <w:lang w:val="en-GB"/>
-        </w:rPr>
-        <w:t xml:space="preserve">The </w:t>
-      </w:r>
-      <w:proofErr w:type="spellStart"/>
-      <w:r>
-        <w:rPr>
-          <w:rFonts w:asciiTheme="minorHAnsi" w:hAnsiTheme="minorHAnsi"/>
-          <w:lang w:val="en-GB"/>
-        </w:rPr>
-        <w:t>XGBoost</w:t>
-      </w:r>
-      <w:proofErr w:type="spellEnd"/>
-      <w:r>
-        <w:rPr>
-          <w:rFonts w:asciiTheme="minorHAnsi" w:hAnsiTheme="minorHAnsi"/>
-          <w:lang w:val="en-GB"/>
-        </w:rPr>
-        <w:t xml:space="preserve"> is doing terrible, with a below chance performance. I must be doing something wrong in the code…</w:t>
-      </w:r>
-    </w:p>
-    <w:p>
-      <w:pPr>
-        <w:pStyle w:val="NormalWeb"/>
-        <w:numPr>
-          <w:ilvl w:val="0"/>
-          <w:numId w:val="2"/>
-        </w:numPr>
-        <w:spacing w:after="0" w:afterAutospacing="0"/>
-        <w:rPr>
-          <w:rFonts w:asciiTheme="minorHAnsi" w:hAnsiTheme="minorHAnsi"/>
-          <w:lang w:val="en-GB"/>
-        </w:rPr>
-      </w:pPr>
-      <w:r>
-        <w:rPr>
-          <w:rFonts w:asciiTheme="minorHAnsi" w:hAnsiTheme="minorHAnsi"/>
-          <w:lang w:val="en-GB"/>
-        </w:rPr>
-        <w:t xml:space="preserve">Currently fighting for my life to get </w:t>
-      </w:r>
-      <w:proofErr w:type="spellStart"/>
-      <w:r>
-        <w:rPr>
-          <w:rFonts w:asciiTheme="minorHAnsi" w:hAnsiTheme="minorHAnsi"/>
-          <w:lang w:val="en-GB"/>
-        </w:rPr>
-        <w:t>keras</w:t>
-      </w:r>
-      <w:proofErr w:type="spellEnd"/>
-      <w:r>
-        <w:rPr>
-          <w:rFonts w:asciiTheme="minorHAnsi" w:hAnsiTheme="minorHAnsi"/>
-          <w:lang w:val="en-GB"/>
-        </w:rPr>
-        <w:t xml:space="preserve"> working so I can use deep learning models. I want to try the NN at least once before I move on.</w:t>
-      </w:r>
-    </w:p>
-    <w:p>
-      <w:pPr>
-        <w:pStyle w:val="NormalWeb"/>
-        <w:numPr>
-          <w:ilvl w:val="1"/>
-          <w:numId w:val="2"/>
-        </w:numPr>
-        <w:spacing w:after="0" w:afterAutospacing="0"/>
-        <w:rPr>
-          <w:rFonts w:asciiTheme="minorHAnsi" w:hAnsiTheme="minorHAnsi"/>
-          <w:lang w:val="en-GB"/>
-        </w:rPr>
-      </w:pPr>
-      <w:r>
-        <w:rPr>
-          <w:rFonts w:asciiTheme="minorHAnsi" w:hAnsiTheme="minorHAnsi"/>
-          <w:lang w:val="en-GB"/>
-        </w:rPr>
-        <w:t xml:space="preserve">Gave up on </w:t>
-      </w:r>
-      <w:proofErr w:type="spellStart"/>
-      <w:r>
-        <w:rPr>
-          <w:rFonts w:asciiTheme="minorHAnsi" w:hAnsiTheme="minorHAnsi"/>
-          <w:lang w:val="en-GB"/>
-        </w:rPr>
-        <w:t>keras</w:t>
-      </w:r>
-      <w:proofErr w:type="spellEnd"/>
-      <w:r>
-        <w:rPr>
-          <w:rFonts w:asciiTheme="minorHAnsi" w:hAnsiTheme="minorHAnsi"/>
-          <w:lang w:val="en-GB"/>
-        </w:rPr>
-        <w:t xml:space="preserve"> and used </w:t>
-      </w:r>
-      <w:proofErr w:type="spellStart"/>
-      <w:r>
-        <w:rPr>
-          <w:rFonts w:asciiTheme="minorHAnsi" w:hAnsiTheme="minorHAnsi"/>
-          <w:lang w:val="en-GB"/>
-        </w:rPr>
-        <w:t>neuralnet</w:t>
-      </w:r>
-      <w:proofErr w:type="spellEnd"/>
-      <w:r>
-        <w:rPr>
-          <w:rFonts w:asciiTheme="minorHAnsi" w:hAnsiTheme="minorHAnsi"/>
-          <w:lang w:val="en-GB"/>
-        </w:rPr>
-        <w:t xml:space="preserve"> a simpler version instead.</w:t>
+        <w:t>Gave up on keras and used neuralnet a simpler version instead.</w:t>
       </w:r>
     </w:p>
     <w:p>
@@ -15672,12 +14305,742 @@
       <w:pPr>
         <w:pStyle w:val="Heading2"/>
       </w:pPr>
-      <w:bookmarkStart w:id="4" w:name="_Toc230165022"/>
-      <w:r>
-        <w:t>Integrating with Dead Reckoning</w:t>
-      </w:r>
-      <w:bookmarkEnd w:id="4"/>
-    </w:p>
+      <w:r>
+        <w:t>Restarting the Dead Reckoning</w:t>
+      </w:r>
+    </w:p>
+    <w:p>
+      <w:pPr>
+        <w:pStyle w:val="Heading3"/>
+      </w:pPr>
+      <w:r>
+        <w:t>21/05</w:t>
+      </w:r>
+    </w:p>
+    <w:p>
+      <w:pPr>
+        <w:pStyle w:val="ListParagraph"/>
+        <w:numPr>
+          <w:ilvl w:val="0"/>
+          <w:numId w:val="2"/>
+        </w:numPr>
+      </w:pPr>
+      <w:r>
+        <w:t>I have been working on the kangaroo data this morning and trying to get the dead reckoning working given the dual constrains of a) no calibration data and, b) broken/discontinuous data. Results so far are trash</w:t>
+      </w:r>
+      <w:r>
+        <w:t>…</w:t>
+      </w:r>
+    </w:p>
+    <w:p>
+      <w:pPr>
+        <w:jc w:val="center"/>
+      </w:pPr>
+      <w:r>
+        <w:lastRenderedPageBreak/>
+        <w:drawing>
+          <wp:inline distT="0" distB="0" distL="0" distR="0" wp14:anchorId="56A11BAE" wp14:editId="272CE5DA">
+            <wp:extent cx="3827721" cy="3141567"/>
+            <wp:effectExtent l="0" t="0" r="1905" b="1905"/>
+            <wp:docPr id="1601674427" name="Picture 1"/>
+            <wp:cNvGraphicFramePr>
+              <a:graphicFrameLocks xmlns:a="http://schemas.openxmlformats.org/drawingml/2006/main" noChangeAspect="1"/>
+            </wp:cNvGraphicFramePr>
+            <a:graphic xmlns:a="http://schemas.openxmlformats.org/drawingml/2006/main">
+              <a:graphicData uri="http://schemas.openxmlformats.org/drawingml/2006/picture">
+                <pic:pic xmlns:pic="http://schemas.openxmlformats.org/drawingml/2006/picture">
+                  <pic:nvPicPr>
+                    <pic:cNvPr id="1601674427" name=""/>
+                    <pic:cNvPicPr/>
+                  </pic:nvPicPr>
+                  <pic:blipFill>
+                    <a:blip r:embed="rId110"/>
+                    <a:stretch>
+                      <a:fillRect/>
+                    </a:stretch>
+                  </pic:blipFill>
+                  <pic:spPr>
+                    <a:xfrm>
+                      <a:off x="0" y="0"/>
+                      <a:ext cx="3831998" cy="3145077"/>
+                    </a:xfrm>
+                    <a:prstGeom prst="rect">
+                      <a:avLst/>
+                    </a:prstGeom>
+                  </pic:spPr>
+                </pic:pic>
+              </a:graphicData>
+            </a:graphic>
+          </wp:inline>
+        </w:drawing>
+      </w:r>
+    </w:p>
+    <w:p>
+      <w:pPr>
+        <w:pStyle w:val="ListParagraph"/>
+        <w:numPr>
+          <w:ilvl w:val="0"/>
+          <w:numId w:val="2"/>
+        </w:numPr>
+      </w:pPr>
+      <w:r>
+        <w:t xml:space="preserve">With so many variables its very hard to determine why these results are so wrong. Going to now go back to the impala data and trial the DR without the calibration (just using the provided quaternions). </w:t>
+      </w:r>
+    </w:p>
+    <w:p>
+      <w:pPr>
+        <w:pStyle w:val="ListParagraph"/>
+        <w:numPr>
+          <w:ilvl w:val="0"/>
+          <w:numId w:val="2"/>
+        </w:numPr>
+      </w:pPr>
+      <w:r>
+        <w:t xml:space="preserve">If this doesn’t work/improve the method on the impala so far, then I am going to switch Dead Reckoning methods. Currently, due to the impala changing head orientation for the two main types of locomotion (walking and grazing/walking), the DR is massively overestimating the distance travelled during grazing (as the forward axis experiences a surge of gravity </w:t>
+      </w:r>
+      <w:r>
+        <w:sym w:font="Wingdings" w:char="F0E0"/>
+      </w:r>
+      <w:r>
+        <w:t xml:space="preserve"> without the gyroscope, this reads as a sprint forward…). While my initial intention was to do DR in iterative stages (head up… head down… head up again, etc…) but it is not at all evident how I would go about that. Instead, it will be easier to switch to a DR approach that natively includes the gyroscope. </w:t>
+      </w:r>
+    </w:p>
+    <w:p>
+      <w:pPr>
+        <w:pStyle w:val="ListParagraph"/>
+        <w:numPr>
+          <w:ilvl w:val="0"/>
+          <w:numId w:val="2"/>
+        </w:numPr>
+        <w:rPr>
+          <w:bCs/>
+        </w:rPr>
+      </w:pPr>
+      <w:r>
+        <w:t>Oh wait hold up!</w:t>
+      </w:r>
+    </w:p>
+    <w:p>
+      <w:pPr>
+        <w:pStyle w:val="ListParagraph"/>
+        <w:numPr>
+          <w:ilvl w:val="1"/>
+          <w:numId w:val="2"/>
+        </w:numPr>
+        <w:rPr>
+          <w:bCs/>
+        </w:rPr>
+      </w:pPr>
+      <w:r>
+        <w:t xml:space="preserve">Chris Bird said that the quaternions in the impala data are yes there but are probably wrong because a library </w:t>
+      </w:r>
+      <w:r>
+        <w:t>wasn’t</w:t>
+      </w:r>
+      <w:r>
+        <w:t xml:space="preserve"> working that he had to fix… </w:t>
+      </w:r>
+    </w:p>
+    <w:p>
+      <w:pPr>
+        <w:pStyle w:val="ListParagraph"/>
+        <w:numPr>
+          <w:ilvl w:val="1"/>
+          <w:numId w:val="2"/>
+        </w:numPr>
+        <w:rPr>
+          <w:bCs/>
+        </w:rPr>
+      </w:pPr>
+      <w:r>
+        <w:t>“</w:t>
+      </w:r>
+      <w:r>
+        <w:rPr>
+          <w:bCs/>
+          <w:i/>
+          <w:iCs/>
+        </w:rPr>
+        <w:t>In original IMU firmware library, setting the digital motion processing (DMP) reverts back to a lower accelerometer full scale range (FSR), despite this being set to +/-16g. This firmware library has since been updated in the kangaroo data, to allow DMP to run at the higher FSR</w:t>
+      </w:r>
+      <w:r>
+        <w:rPr>
+          <w:bCs/>
+          <w:i/>
+          <w:iCs/>
+        </w:rPr>
+        <w:t>” ~ Chris Bird, 2026</w:t>
+      </w:r>
+    </w:p>
+    <w:p>
+      <w:pPr>
+        <w:pStyle w:val="ListParagraph"/>
+        <w:numPr>
+          <w:ilvl w:val="1"/>
+          <w:numId w:val="2"/>
+        </w:numPr>
+        <w:rPr>
+          <w:bCs/>
+        </w:rPr>
+      </w:pPr>
+      <w:r>
+        <w:rPr>
+          <w:bCs/>
+        </w:rPr>
+        <w:t>Never mind then.</w:t>
+      </w:r>
+    </w:p>
+    <w:p>
+      <w:pPr>
+        <w:pStyle w:val="ListParagraph"/>
+        <w:numPr>
+          <w:ilvl w:val="0"/>
+          <w:numId w:val="2"/>
+        </w:numPr>
+        <w:rPr>
+          <w:bCs/>
+        </w:rPr>
+      </w:pPr>
+      <w:r>
+        <w:rPr>
+          <w:bCs/>
+        </w:rPr>
+        <w:t xml:space="preserve">He then went through a few links and found a gyroscope version of dead reckoning. Unfortunately, the package he found is in python. Not in R. </w:t>
+      </w:r>
+    </w:p>
+    <w:p>
+      <w:pPr>
+        <w:pStyle w:val="ListParagraph"/>
+        <w:numPr>
+          <w:ilvl w:val="1"/>
+          <w:numId w:val="2"/>
+        </w:numPr>
+        <w:rPr>
+          <w:bCs/>
+        </w:rPr>
+      </w:pPr>
+      <w:r>
+        <w:rPr>
+          <w:bCs/>
+        </w:rPr>
+        <w:t>Madgwick Orientation Filter</w:t>
+      </w:r>
+      <w:r>
+        <w:rPr>
+          <w:bCs/>
+        </w:rPr>
+        <w:t xml:space="preserve">: </w:t>
+      </w:r>
+      <w:hyperlink r:id="rId111" w:history="1">
+        <w:r>
+          <w:rPr>
+            <w:rStyle w:val="Hyperlink"/>
+            <w:bCs/>
+          </w:rPr>
+          <w:t>https://ahrs.readthedocs.io/en/latest/filters/madgwick.html</w:t>
+        </w:r>
+      </w:hyperlink>
+      <w:r>
+        <w:rPr>
+          <w:bCs/>
+        </w:rPr>
+        <w:t xml:space="preserve"> </w:t>
+      </w:r>
+    </w:p>
+    <w:p>
+      <w:pPr>
+        <w:pStyle w:val="ListParagraph"/>
+        <w:numPr>
+          <w:ilvl w:val="1"/>
+          <w:numId w:val="2"/>
+        </w:numPr>
+        <w:rPr>
+          <w:bCs/>
+        </w:rPr>
+      </w:pPr>
+      <w:r>
+        <w:rPr>
+          <w:bCs/>
+        </w:rPr>
+        <w:t xml:space="preserve">However! I found an R version: </w:t>
+      </w:r>
+      <w:hyperlink r:id="rId112" w:history="1">
+        <w:r>
+          <w:rPr>
+            <w:rStyle w:val="Hyperlink"/>
+            <w:bCs/>
+          </w:rPr>
+          <w:t>https://www.rdocumentation.org/packages/RAHRS/versions/1.0.2/topics/MadgwickAHRS</w:t>
+        </w:r>
+      </w:hyperlink>
+      <w:r>
+        <w:rPr>
+          <w:bCs/>
+        </w:rPr>
+        <w:t xml:space="preserve"> </w:t>
+      </w:r>
+    </w:p>
+    <w:p>
+      <w:pPr>
+        <w:pStyle w:val="ListParagraph"/>
+        <w:numPr>
+          <w:ilvl w:val="2"/>
+          <w:numId w:val="2"/>
+        </w:numPr>
+        <w:rPr>
+          <w:bCs/>
+        </w:rPr>
+      </w:pPr>
+      <w:r>
+        <w:rPr>
+          <w:bCs/>
+        </w:rPr>
+        <w:t>C</w:t>
+      </w:r>
+      <w:r>
+        <w:rPr>
+          <w:bCs/>
+        </w:rPr>
+        <w:t>B</w:t>
+      </w:r>
+      <w:r>
+        <w:rPr>
+          <w:bCs/>
+        </w:rPr>
+        <w:t>: “That’s cheating”</w:t>
+      </w:r>
+    </w:p>
+    <w:p>
+      <w:pPr>
+        <w:pStyle w:val="ListParagraph"/>
+        <w:numPr>
+          <w:ilvl w:val="2"/>
+          <w:numId w:val="2"/>
+        </w:numPr>
+        <w:rPr>
+          <w:bCs/>
+        </w:rPr>
+      </w:pPr>
+      <w:r>
+        <w:rPr>
+          <w:bCs/>
+        </w:rPr>
+        <w:lastRenderedPageBreak/>
+        <w:t>However, it has basically no documentation and looks kind of dodgy. Going to try it quickly and see what it gives me</w:t>
+      </w:r>
+      <w:r>
+        <w:rPr>
+          <w:bCs/>
+        </w:rPr>
+        <w:t xml:space="preserve"> (but using the information from the better documented document to adjust the variables, etc.)</w:t>
+      </w:r>
+    </w:p>
+    <w:p>
+      <w:pPr>
+        <w:pStyle w:val="ListParagraph"/>
+        <w:numPr>
+          <w:ilvl w:val="0"/>
+          <w:numId w:val="2"/>
+        </w:numPr>
+        <w:rPr>
+          <w:bCs/>
+        </w:rPr>
+      </w:pPr>
+      <w:r>
+        <w:rPr>
+          <w:bCs/>
+        </w:rPr>
+        <w:t>Why didn’t gunner just use the gyroscope then???</w:t>
+      </w:r>
+    </w:p>
+    <w:p>
+      <w:pPr>
+        <w:pStyle w:val="ListParagraph"/>
+        <w:numPr>
+          <w:ilvl w:val="1"/>
+          <w:numId w:val="2"/>
+        </w:numPr>
+        <w:rPr>
+          <w:bCs/>
+        </w:rPr>
+      </w:pPr>
+      <w:r>
+        <w:rPr>
+          <w:bCs/>
+        </w:rPr>
+        <w:t>Me: “If the gyroscope is better, why did the ecology papers use the tilt-adjusted accel method in the first place?”</w:t>
+      </w:r>
+    </w:p>
+    <w:p>
+      <w:pPr>
+        <w:pStyle w:val="ListParagraph"/>
+        <w:numPr>
+          <w:ilvl w:val="1"/>
+          <w:numId w:val="2"/>
+        </w:numPr>
+        <w:rPr>
+          <w:bCs/>
+        </w:rPr>
+      </w:pPr>
+      <w:r>
+        <w:rPr>
+          <w:bCs/>
+        </w:rPr>
+        <w:t>CB: “Gyroscopes drift and are more complicated to integrate. When it does work, or when you need it --- like in our case --- it’s more robust… but it is more complicated.”</w:t>
+      </w:r>
+    </w:p>
+    <w:p>
+      <w:pPr>
+        <w:pStyle w:val="ListParagraph"/>
+        <w:numPr>
+          <w:ilvl w:val="0"/>
+          <w:numId w:val="2"/>
+        </w:numPr>
+        <w:rPr>
+          <w:bCs/>
+        </w:rPr>
+      </w:pPr>
+      <w:r>
+        <w:rPr>
+          <w:bCs/>
+        </w:rPr>
+        <w:t xml:space="preserve">SO. It turns out the package I wanted to use has been removed from CRAN because its so broken. </w:t>
+      </w:r>
+      <w:r>
+        <w:rPr>
+          <w:bCs/>
+        </w:rPr>
+        <w:sym w:font="Wingdings" w:char="F0E0"/>
+      </w:r>
+      <w:r>
+        <w:rPr>
+          <w:bCs/>
+        </w:rPr>
+        <w:t xml:space="preserve"> </w:t>
+      </w:r>
+      <w:hyperlink r:id="rId113" w:history="1">
+        <w:r>
+          <w:rPr>
+            <w:rStyle w:val="Hyperlink"/>
+            <w:bCs/>
+          </w:rPr>
+          <w:t>https://cran.r-project.org/web/packages/RAHRS/index.html</w:t>
+        </w:r>
+      </w:hyperlink>
+      <w:r>
+        <w:rPr>
+          <w:bCs/>
+        </w:rPr>
+        <w:t xml:space="preserve"> Therefore I would be forced to revert to using the python version… </w:t>
+      </w:r>
+    </w:p>
+    <w:p>
+      <w:pPr>
+        <w:pStyle w:val="ListParagraph"/>
+        <w:numPr>
+          <w:ilvl w:val="1"/>
+          <w:numId w:val="2"/>
+        </w:numPr>
+        <w:rPr>
+          <w:bCs/>
+        </w:rPr>
+      </w:pPr>
+      <w:r>
+        <w:rPr>
+          <w:bCs/>
+        </w:rPr>
+        <w:t>Before I do this</w:t>
+      </w:r>
+      <w:r>
+        <w:rPr>
+          <w:bCs/>
+        </w:rPr>
+        <w:t>,</w:t>
+      </w:r>
+      <w:r>
+        <w:rPr>
+          <w:bCs/>
+        </w:rPr>
+        <w:t xml:space="preserve"> I’m going to quickly read the other papers though…</w:t>
+      </w:r>
+    </w:p>
+    <w:p>
+      <w:pPr>
+        <w:pStyle w:val="ListParagraph"/>
+        <w:numPr>
+          <w:ilvl w:val="2"/>
+          <w:numId w:val="2"/>
+        </w:numPr>
+        <w:rPr>
+          <w:bCs/>
+        </w:rPr>
+      </w:pPr>
+      <w:r>
+        <w:rPr>
+          <w:bCs/>
+        </w:rPr>
+        <w:t>Reading them confirmed what CB already knew… the animals where there were grazing periods weren’t collared around the neck…</w:t>
+      </w:r>
+    </w:p>
+    <w:p>
+      <w:pPr>
+        <w:ind w:left="1800"/>
+        <w:rPr>
+          <w:bCs/>
+        </w:rPr>
+      </w:pPr>
+      <w:r>
+        <w:rPr>
+          <w:bCs/>
+          <w:highlight w:val="yellow"/>
+        </w:rPr>
+        <w:t xml:space="preserve">INSERT </w:t>
+      </w:r>
+      <w:r>
+        <w:rPr>
+          <w:bCs/>
+          <w:highlight w:val="yellow"/>
+        </w:rPr>
+        <w:t xml:space="preserve">MY </w:t>
+      </w:r>
+      <w:r>
+        <w:rPr>
+          <w:bCs/>
+          <w:highlight w:val="yellow"/>
+        </w:rPr>
+        <w:t>SUMMARY HERE</w:t>
+      </w:r>
+    </w:p>
+    <w:p>
+      <w:pPr>
+        <w:pStyle w:val="ListParagraph"/>
+        <w:numPr>
+          <w:ilvl w:val="0"/>
+          <w:numId w:val="2"/>
+        </w:numPr>
+        <w:rPr>
+          <w:bCs/>
+        </w:rPr>
+      </w:pPr>
+      <w:r>
+        <w:rPr>
+          <w:bCs/>
+        </w:rPr>
+        <w:t xml:space="preserve">Also went back to the beginning of my scripts and ensured that all cleaning and </w:t>
+      </w:r>
+      <w:r>
+        <w:rPr>
+          <w:bCs/>
+        </w:rPr>
+        <w:t>organising</w:t>
+      </w:r>
+      <w:r>
+        <w:rPr>
+          <w:bCs/>
+        </w:rPr>
+        <w:t xml:space="preserve"> was done before they were split into days to make the transfer into python more seamless without data duplication.</w:t>
+      </w:r>
+    </w:p>
+    <w:p>
+      <w:pPr>
+        <w:pStyle w:val="Heading4"/>
+      </w:pPr>
+      <w:r>
+        <w:t xml:space="preserve">Moving to Python to use </w:t>
+      </w:r>
+      <w:r>
+        <w:t>the Madgwick method</w:t>
+      </w:r>
+      <w:r>
+        <w:t xml:space="preserve"> to replace the tilt-adjusting Gundog.Compass (still use Tracks)</w:t>
+      </w:r>
+      <w:r>
+        <w:t xml:space="preserve"> for dead reckoning re-orientation</w:t>
+      </w:r>
+    </w:p>
+    <w:p>
+      <w:pPr>
+        <w:pStyle w:val="ListParagraph"/>
+        <w:numPr>
+          <w:ilvl w:val="0"/>
+          <w:numId w:val="2"/>
+        </w:numPr>
+      </w:pPr>
+      <w:r>
+        <w:t>Divide the gyroscope by 2^15 and then multiply by either [250 or 500] * pi / 180</w:t>
+      </w:r>
+    </w:p>
+    <w:p>
+      <w:pPr>
+        <w:pStyle w:val="ListParagraph"/>
+        <w:numPr>
+          <w:ilvl w:val="0"/>
+          <w:numId w:val="2"/>
+        </w:numPr>
+      </w:pPr>
+      <w:r>
+        <w:t>After all that, I got:</w:t>
+      </w:r>
+    </w:p>
+    <w:p>
+      <w:pPr>
+        <w:jc w:val="center"/>
+      </w:pPr>
+      <w:r>
+        <w:drawing>
+          <wp:inline distT="0" distB="0" distL="0" distR="0" wp14:anchorId="77879F2A" wp14:editId="3F4A5E68">
+            <wp:extent cx="2137144" cy="1811427"/>
+            <wp:effectExtent l="0" t="0" r="0" b="0"/>
+            <wp:docPr id="1978712075" name="Picture 1"/>
+            <wp:cNvGraphicFramePr>
+              <a:graphicFrameLocks xmlns:a="http://schemas.openxmlformats.org/drawingml/2006/main" noChangeAspect="1"/>
+            </wp:cNvGraphicFramePr>
+            <a:graphic xmlns:a="http://schemas.openxmlformats.org/drawingml/2006/main">
+              <a:graphicData uri="http://schemas.openxmlformats.org/drawingml/2006/picture">
+                <pic:pic xmlns:pic="http://schemas.openxmlformats.org/drawingml/2006/picture">
+                  <pic:nvPicPr>
+                    <pic:cNvPr id="1978712075" name=""/>
+                    <pic:cNvPicPr/>
+                  </pic:nvPicPr>
+                  <pic:blipFill>
+                    <a:blip r:embed="rId114"/>
+                    <a:stretch>
+                      <a:fillRect/>
+                    </a:stretch>
+                  </pic:blipFill>
+                  <pic:spPr>
+                    <a:xfrm>
+                      <a:off x="0" y="0"/>
+                      <a:ext cx="2147160" cy="1819917"/>
+                    </a:xfrm>
+                    <a:prstGeom prst="rect">
+                      <a:avLst/>
+                    </a:prstGeom>
+                  </pic:spPr>
+                </pic:pic>
+              </a:graphicData>
+            </a:graphic>
+          </wp:inline>
+        </w:drawing>
+      </w:r>
+    </w:p>
+    <w:p>
+      <w:pPr>
+        <w:pStyle w:val="Heading3"/>
+      </w:pPr>
+      <w:r>
+        <w:t>2</w:t>
+      </w:r>
+      <w:r>
+        <w:t>5</w:t>
+      </w:r>
+      <w:r>
+        <w:t>/05</w:t>
+      </w:r>
+    </w:p>
+    <w:p>
+      <w:pPr>
+        <w:pStyle w:val="ListParagraph"/>
+        <w:numPr>
+          <w:ilvl w:val="0"/>
+          <w:numId w:val="2"/>
+        </w:numPr>
+      </w:pPr>
+      <w:r>
+        <w:t>Holy heck we’re on a countdown now. UUUGGGHHH. Got to figure this out.</w:t>
+      </w:r>
+      <w:r>
+        <w:t xml:space="preserve"> I feel slightly numb to the stress of all this because no matter what I try, it just gets worse. Nevertheless, I feel that I must be on the right path now and am at the very least, moving forwards.</w:t>
+      </w:r>
+    </w:p>
+    <w:p>
+      <w:pPr>
+        <w:pStyle w:val="ListParagraph"/>
+        <w:numPr>
+          <w:ilvl w:val="0"/>
+          <w:numId w:val="2"/>
+        </w:numPr>
+      </w:pPr>
+      <w:r>
+        <w:t>Maybe the axes are wrong? Maybe I have to change which one is the x, y, and z because our device was oriented differently?</w:t>
+      </w:r>
+    </w:p>
+    <w:p>
+      <w:pPr>
+        <w:pStyle w:val="ListParagraph"/>
+        <w:numPr>
+          <w:ilvl w:val="1"/>
+          <w:numId w:val="2"/>
+        </w:numPr>
+      </w:pPr>
+      <w:r>
+        <w:t xml:space="preserve">The Magwick equation assumes NED but I am not in NED. I am in acc = </w:t>
+      </w:r>
+      <w:r>
+        <w:t>"NWU"</w:t>
+      </w:r>
+      <w:r>
+        <w:t xml:space="preserve"> and mag = “NED”.</w:t>
+      </w:r>
+      <w:r>
+        <w:t xml:space="preserve"> (as determined previously by guess and check)</w:t>
+      </w:r>
+    </w:p>
+    <w:p>
+      <w:pPr>
+        <w:pStyle w:val="ListParagraph"/>
+        <w:numPr>
+          <w:ilvl w:val="1"/>
+          <w:numId w:val="2"/>
+        </w:numPr>
+      </w:pPr>
+      <w:r>
+        <w:lastRenderedPageBreak/>
+        <w:t>Therefore,</w:t>
+      </w:r>
+      <w:r>
+        <w:t xml:space="preserve"> </w:t>
+      </w:r>
+      <w:r>
+        <w:t>I need to rotate the axes:</w:t>
+      </w:r>
+    </w:p>
+    <w:p>
+      <w:pPr>
+        <w:pStyle w:val="ListParagraph"/>
+        <w:numPr>
+          <w:ilvl w:val="2"/>
+          <w:numId w:val="2"/>
+        </w:numPr>
+      </w:pPr>
+      <w:r>
+        <w:t>X_NED = X_NWU</w:t>
+      </w:r>
+      <w:r>
+        <w:br/>
+        <w:t>Y_NED = -Y_NWU</w:t>
+      </w:r>
+      <w:r>
+        <w:br/>
+        <w:t>Z_NED = -Z_NWU</w:t>
+      </w:r>
+    </w:p>
+    <w:p>
+      <w:pPr>
+        <w:pStyle w:val="ListParagraph"/>
+        <w:numPr>
+          <w:ilvl w:val="2"/>
+          <w:numId w:val="2"/>
+        </w:numPr>
+      </w:pPr>
+    </w:p>
+    <w:p>
+      <w:pPr>
+        <w:ind w:left="360"/>
+      </w:pPr>
+    </w:p>
+    <w:p/>
+    <w:p/>
     <w:p>
       <w:pPr>
         <w:pStyle w:val="NormalWeb"/>
@@ -15972,126 +15335,76 @@
           <w:strike/>
           <w:lang w:val="en-GB"/>
         </w:rPr>
-        <w:t xml:space="preserve">Convert all the </w:t>
-      </w:r>
-      <w:proofErr w:type="spellStart"/>
-      <w:r>
+        <w:t>Convert all the accels to g force and mag units</w:t>
+      </w:r>
+    </w:p>
+    <w:p>
+      <w:pPr>
+        <w:pStyle w:val="NormalWeb"/>
+        <w:numPr>
+          <w:ilvl w:val="1"/>
+          <w:numId w:val="2"/>
+        </w:numPr>
         <w:rPr>
           <w:rFonts w:asciiTheme="minorHAnsi" w:hAnsiTheme="minorHAnsi"/>
           <w:strike/>
           <w:lang w:val="en-GB"/>
         </w:rPr>
-        <w:t>accels</w:t>
-      </w:r>
-      <w:proofErr w:type="spellEnd"/>
-      <w:r>
+      </w:pPr>
+      <w:r>
+        <w:rPr>
+          <w:rFonts w:asciiTheme="minorHAnsi" w:hAnsiTheme="minorHAnsi"/>
+          <w:lang w:val="en-GB"/>
+        </w:rPr>
+        <w:t>Standardise orientation so all devices roughly the same</w:t>
+      </w:r>
+      <w:r>
+        <w:rPr>
+          <w:rFonts w:asciiTheme="minorHAnsi" w:hAnsiTheme="minorHAnsi"/>
+          <w:lang w:val="en-GB"/>
+        </w:rPr>
+        <w:t xml:space="preserve"> (make it the same as the top image)</w:t>
+      </w:r>
+    </w:p>
+    <w:p>
+      <w:pPr>
+        <w:pStyle w:val="NormalWeb"/>
+        <w:numPr>
+          <w:ilvl w:val="1"/>
+          <w:numId w:val="2"/>
+        </w:numPr>
+        <w:rPr>
+          <w:rFonts w:asciiTheme="minorHAnsi" w:hAnsiTheme="minorHAnsi"/>
+          <w:lang w:val="en-GB"/>
+        </w:rPr>
+      </w:pPr>
+      <w:r>
+        <w:rPr>
+          <w:rFonts w:asciiTheme="minorHAnsi" w:hAnsiTheme="minorHAnsi"/>
+          <w:lang w:val="en-GB"/>
+        </w:rPr>
+        <w:t>Join the cropped 4g accels with the axivity uncropped data to complete the peaks</w:t>
+      </w:r>
+    </w:p>
+    <w:p>
+      <w:pPr>
+        <w:pStyle w:val="NormalWeb"/>
+        <w:numPr>
+          <w:ilvl w:val="1"/>
+          <w:numId w:val="2"/>
+        </w:numPr>
         <w:rPr>
           <w:rFonts w:asciiTheme="minorHAnsi" w:hAnsiTheme="minorHAnsi"/>
           <w:strike/>
           <w:lang w:val="en-GB"/>
         </w:rPr>
-        <w:t xml:space="preserve"> to g force and mag units</w:t>
-      </w:r>
-    </w:p>
-    <w:p>
-      <w:pPr>
-        <w:pStyle w:val="NormalWeb"/>
-        <w:numPr>
-          <w:ilvl w:val="1"/>
-          <w:numId w:val="2"/>
-        </w:numPr>
+      </w:pPr>
+      <w:r>
         <w:rPr>
           <w:rFonts w:asciiTheme="minorHAnsi" w:hAnsiTheme="minorHAnsi"/>
           <w:strike/>
           <w:lang w:val="en-GB"/>
         </w:rPr>
-      </w:pPr>
-      <w:r>
-        <w:rPr>
-          <w:rFonts w:asciiTheme="minorHAnsi" w:hAnsiTheme="minorHAnsi"/>
-          <w:lang w:val="en-GB"/>
-        </w:rPr>
-        <w:t>Standardise orientation so all devices roughly the same</w:t>
-      </w:r>
-      <w:r>
-        <w:rPr>
-          <w:rFonts w:asciiTheme="minorHAnsi" w:hAnsiTheme="minorHAnsi"/>
-          <w:lang w:val="en-GB"/>
-        </w:rPr>
-        <w:t xml:space="preserve"> (make it the same as the top image)</w:t>
-      </w:r>
-    </w:p>
-    <w:p>
-      <w:pPr>
-        <w:pStyle w:val="NormalWeb"/>
-        <w:numPr>
-          <w:ilvl w:val="1"/>
-          <w:numId w:val="2"/>
-        </w:numPr>
-        <w:rPr>
-          <w:rFonts w:asciiTheme="minorHAnsi" w:hAnsiTheme="minorHAnsi"/>
-          <w:lang w:val="en-GB"/>
-        </w:rPr>
-      </w:pPr>
-      <w:r>
-        <w:rPr>
-          <w:rFonts w:asciiTheme="minorHAnsi" w:hAnsiTheme="minorHAnsi"/>
-          <w:lang w:val="en-GB"/>
-        </w:rPr>
-        <w:t xml:space="preserve">Join the cropped 4g </w:t>
-      </w:r>
-      <w:proofErr w:type="spellStart"/>
-      <w:r>
-        <w:rPr>
-          <w:rFonts w:asciiTheme="minorHAnsi" w:hAnsiTheme="minorHAnsi"/>
-          <w:lang w:val="en-GB"/>
-        </w:rPr>
-        <w:t>accels</w:t>
-      </w:r>
-      <w:proofErr w:type="spellEnd"/>
-      <w:r>
-        <w:rPr>
-          <w:rFonts w:asciiTheme="minorHAnsi" w:hAnsiTheme="minorHAnsi"/>
-          <w:lang w:val="en-GB"/>
-        </w:rPr>
-        <w:t xml:space="preserve"> with the </w:t>
-      </w:r>
-      <w:proofErr w:type="spellStart"/>
-      <w:r>
-        <w:rPr>
-          <w:rFonts w:asciiTheme="minorHAnsi" w:hAnsiTheme="minorHAnsi"/>
-          <w:lang w:val="en-GB"/>
-        </w:rPr>
-        <w:t>axivity</w:t>
-      </w:r>
-      <w:proofErr w:type="spellEnd"/>
-      <w:r>
-        <w:rPr>
-          <w:rFonts w:asciiTheme="minorHAnsi" w:hAnsiTheme="minorHAnsi"/>
-          <w:lang w:val="en-GB"/>
-        </w:rPr>
-        <w:t xml:space="preserve"> uncropped data to complete the peaks</w:t>
-      </w:r>
-    </w:p>
-    <w:p>
-      <w:pPr>
-        <w:pStyle w:val="NormalWeb"/>
-        <w:numPr>
-          <w:ilvl w:val="1"/>
-          <w:numId w:val="2"/>
-        </w:numPr>
-        <w:rPr>
-          <w:rFonts w:asciiTheme="minorHAnsi" w:hAnsiTheme="minorHAnsi"/>
-          <w:strike/>
-          <w:lang w:val="en-GB"/>
-        </w:rPr>
-      </w:pPr>
-      <w:r>
-        <w:rPr>
-          <w:rFonts w:asciiTheme="minorHAnsi" w:hAnsiTheme="minorHAnsi"/>
-          <w:strike/>
-          <w:lang w:val="en-GB"/>
-        </w:rPr>
         <w:t>Smooth and filter the data</w:t>
       </w:r>
     </w:p>
@@ -16158,11 +15471,11 @@
       <w:pPr>
         <w:pStyle w:val="Heading2"/>
       </w:pPr>
-      <w:bookmarkStart w:id="5" w:name="_Toc230165023"/>
+      <w:bookmarkStart w:id="4" w:name="_Toc230165023"/>
       <w:r>
         <w:t>What I learnt and Workflow for next time</w:t>
       </w:r>
-      <w:bookmarkEnd w:id="5"/>
+      <w:bookmarkEnd w:id="4"/>
     </w:p>
     <w:p>
       <w:pPr>
@@ -16283,7 +15596,7 @@
       </w:pPr>
     </w:p>
     <w:sectPr>
-      <w:headerReference w:type="default" r:id="rId110"/>
+      <w:headerReference w:type="default" r:id="rId115"/>
       <w:pgSz w:w="12240" w:h="15840"/>
       <w:pgMar w:top="720" w:right="720" w:bottom="720" w:left="720" w:header="720" w:footer="720" w:gutter="0"/>
       <w:cols w:space="720"/>
@@ -16451,7 +15764,7 @@
   <w:abstractNum w:abstractNumId="1" w15:restartNumberingAfterBreak="0">
     <w:nsid w:val="4ED74C8D"/>
     <w:multiLevelType w:val="hybridMultilevel"/>
-    <w:tmpl w:val="3640B7A0"/>
+    <w:tmpl w:val="6D5E0EF4"/>
     <w:lvl w:ilvl="0" w:tplc="F7B6964E">
       <w:numFmt w:val="bullet"/>
       <w:lvlText w:val="-"/>
@@ -17179,7 +16492,6 @@
   <w:style w:type="character" w:default="1" w:styleId="DefaultParagraphFont">
     <w:name w:val="Default Paragraph Font"/>
     <w:uiPriority w:val="1"/>
-    <w:semiHidden/>
     <w:unhideWhenUsed/>
   </w:style>
   <w:style w:type="table" w:default="1" w:styleId="TableNormal">

</xml_diff>

<commit_message>
save point before cleaning and redoing
</commit_message>
<xml_diff>
--- a/Notes/Worklog.docx
+++ b/Notes/Worklog.docx
@@ -9410,9 +9410,9 @@
           <w:noProof/>
         </w:rPr>
         <w:drawing>
-          <wp:inline distT="0" distB="0" distL="0" distR="0" wp14:anchorId="3AF1AF19" wp14:editId="2D5960D2">
-            <wp:extent cx="3591283" cy="2975113"/>
-            <wp:effectExtent l="0" t="0" r="9525" b="0"/>
+          <wp:inline distT="0" distB="0" distL="0" distR="0" wp14:anchorId="3AF1AF19" wp14:editId="4199A72B">
+            <wp:extent cx="4518838" cy="3743525"/>
+            <wp:effectExtent l="0" t="0" r="0" b="9525"/>
             <wp:docPr id="486162867" name="Picture 1"/>
             <wp:cNvGraphicFramePr>
               <a:graphicFrameLocks xmlns:a="http://schemas.openxmlformats.org/drawingml/2006/main" noChangeAspect="1"/>
@@ -9433,7 +9433,7 @@
                   <pic:spPr>
                     <a:xfrm>
                       <a:off x="0" y="0"/>
-                      <a:ext cx="3607603" cy="2988633"/>
+                      <a:ext cx="4546203" cy="3766195"/>
                     </a:xfrm>
                     <a:prstGeom prst="rect">
                       <a:avLst/>
@@ -13007,7 +13007,6 @@
           </w:tcPr>
           <w:p>
             <w:r>
-              <w:lastRenderedPageBreak/>
               <w:t>14</w:t>
             </w:r>
           </w:p>
@@ -14888,9 +14887,9 @@
       </w:pPr>
       <w:r>
         <w:drawing>
-          <wp:inline distT="0" distB="0" distL="0" distR="0" wp14:anchorId="77879F2A" wp14:editId="3F4A5E68">
-            <wp:extent cx="2137144" cy="1811427"/>
-            <wp:effectExtent l="0" t="0" r="0" b="0"/>
+          <wp:inline distT="0" distB="0" distL="0" distR="0" wp14:anchorId="77879F2A" wp14:editId="21874C03">
+            <wp:extent cx="3568535" cy="3024664"/>
+            <wp:effectExtent l="0" t="0" r="0" b="4445"/>
             <wp:docPr id="1978712075" name="Picture 1"/>
             <wp:cNvGraphicFramePr>
               <a:graphicFrameLocks xmlns:a="http://schemas.openxmlformats.org/drawingml/2006/main" noChangeAspect="1"/>
@@ -14911,7 +14910,7 @@
                   <pic:spPr>
                     <a:xfrm>
                       <a:off x="0" y="0"/>
-                      <a:ext cx="2147160" cy="1819917"/>
+                      <a:ext cx="3592435" cy="3044922"/>
                     </a:xfrm>
                     <a:prstGeom prst="rect">
                       <a:avLst/>
@@ -14929,6 +14928,7 @@
         <w:pStyle w:val="Heading3"/>
       </w:pPr>
       <w:r>
+        <w:lastRenderedPageBreak/>
         <w:t>2</w:t>
       </w:r>
       <w:r>
@@ -14995,7 +14995,6 @@
         </w:numPr>
       </w:pPr>
       <w:r>
-        <w:lastRenderedPageBreak/>
         <w:t>Therefore,</w:t>
       </w:r>
       <w:r>
@@ -15029,16 +15028,338 @@
       <w:pPr>
         <w:pStyle w:val="ListParagraph"/>
         <w:numPr>
-          <w:ilvl w:val="2"/>
-          <w:numId w:val="2"/>
-        </w:numPr>
-      </w:pPr>
-    </w:p>
-    <w:p>
-      <w:pPr>
-        <w:ind w:left="360"/>
-      </w:pPr>
-    </w:p>
+          <w:ilvl w:val="0"/>
+          <w:numId w:val="2"/>
+        </w:numPr>
+      </w:pPr>
+      <w:r>
+        <w:t>Wait wait. What am I doing. Stop. What is the problem, what do I have, and what am I doing?</w:t>
+      </w:r>
+    </w:p>
+    <w:p>
+      <w:pPr>
+        <w:pStyle w:val="ListParagraph"/>
+        <w:numPr>
+          <w:ilvl w:val="1"/>
+          <w:numId w:val="2"/>
+        </w:numPr>
+      </w:pPr>
+      <w:r>
+        <w:t>The problem is that I have an animal that changes orientation during 2 forms of locomotion.</w:t>
+      </w:r>
+    </w:p>
+    <w:p>
+      <w:pPr>
+        <w:pStyle w:val="ListParagraph"/>
+        <w:numPr>
+          <w:ilvl w:val="1"/>
+          <w:numId w:val="2"/>
+        </w:numPr>
+      </w:pPr>
+      <w:r>
+        <w:t>Couldn’t I just split the compass section in half?</w:t>
+      </w:r>
+    </w:p>
+    <w:p>
+      <w:pPr>
+        <w:pStyle w:val="Heading3"/>
+      </w:pPr>
+      <w:r>
+        <w:t>26/05</w:t>
+      </w:r>
+    </w:p>
+    <w:p>
+      <w:pPr>
+        <w:pStyle w:val="ListParagraph"/>
+        <w:numPr>
+          <w:ilvl w:val="0"/>
+          <w:numId w:val="2"/>
+        </w:numPr>
+        <w:rPr>
+          <w:highlight w:val="yellow"/>
+        </w:rPr>
+      </w:pPr>
+      <w:r>
+        <w:t>Today CB is coming in and will be able to help with the quaternions</w:t>
+      </w:r>
+      <w:r>
+        <w:t xml:space="preserve">. He says that the quaternions in the impala data might actually be right. Sucks that I COMPLETELY removed them. Going back to the previous step to reinclude. </w:t>
+      </w:r>
+      <w:r>
+        <w:sym w:font="Wingdings" w:char="F0E0"/>
+      </w:r>
+      <w:r>
+        <w:t xml:space="preserve"> </w:t>
+      </w:r>
+      <w:r>
+        <w:t xml:space="preserve">I reincluded them and they were trash lmao. </w:t>
+      </w:r>
+      <w:r>
+        <w:rPr>
+          <w:highlight w:val="yellow"/>
+        </w:rPr>
+        <w:t>I am clearly scaling something completely wrong.</w:t>
+      </w:r>
+    </w:p>
+    <w:p>
+      <w:pPr>
+        <w:pStyle w:val="ListParagraph"/>
+        <w:numPr>
+          <w:ilvl w:val="0"/>
+          <w:numId w:val="2"/>
+        </w:numPr>
+      </w:pPr>
+      <w:r>
+        <w:t xml:space="preserve">Until we have run a test in the field, there is no way of knowing whether the tracks are correct or not. All we have is estimate on estimate with rotating collars. ChrisC wants a hyper-accurate track that has never been done before. I think we should just call it a day. </w:t>
+      </w:r>
+    </w:p>
+    <w:p>
+      <w:pPr>
+        <w:pStyle w:val="ListParagraph"/>
+        <w:numPr>
+          <w:ilvl w:val="0"/>
+          <w:numId w:val="2"/>
+        </w:numPr>
+      </w:pPr>
+      <w:r>
+        <w:t>ChrisC said that I should make a speed distribution of the DR track that we calculated so far and see whether we are getting reasonable speeds</w:t>
+      </w:r>
+      <w:r>
+        <w:t>. If they are reasonable, I am going to call it.</w:t>
+      </w:r>
+    </w:p>
+    <w:p>
+      <w:pPr>
+        <w:pStyle w:val="ListParagraph"/>
+        <w:numPr>
+          <w:ilvl w:val="0"/>
+          <w:numId w:val="2"/>
+        </w:numPr>
+      </w:pPr>
+      <w:r>
+        <w:t>Okay, went to make my old method again and it broke completely. Lmao?</w:t>
+      </w:r>
+      <w:r>
+        <w:t xml:space="preserve"> Back to the beginning to rescale the accels and mags and stuff.</w:t>
+      </w:r>
+    </w:p>
+    <w:p>
+      <w:pPr>
+        <w:pStyle w:val="ListParagraph"/>
+        <w:ind w:left="1440"/>
+      </w:pPr>
+    </w:p>
+    <w:p>
+      <w:pPr>
+        <w:pStyle w:val="ListParagraph"/>
+        <w:ind w:left="1440"/>
+      </w:pPr>
+    </w:p>
+    <w:p>
+      <w:pPr>
+        <w:pStyle w:val="ListParagraph"/>
+        <w:ind w:left="1440"/>
+      </w:pPr>
+    </w:p>
+    <w:p>
+      <w:pPr>
+        <w:pStyle w:val="ListParagraph"/>
+        <w:numPr>
+          <w:ilvl w:val="0"/>
+          <w:numId w:val="2"/>
+        </w:numPr>
+      </w:pPr>
+      <w:r>
+        <w:t>For reference I have put the other methods on the other side</w:t>
+      </w:r>
+    </w:p>
+    <w:p>
+      <w:pPr>
+        <w:pStyle w:val="ListParagraph"/>
+        <w:numPr>
+          <w:ilvl w:val="0"/>
+          <w:numId w:val="2"/>
+        </w:numPr>
+        <w:jc w:val="center"/>
+      </w:pPr>
+      <w:r>
+        <w:rPr>
+          <w:noProof/>
+        </w:rPr>
+        <w:lastRenderedPageBreak/>
+        <w:drawing>
+          <wp:inline distT="0" distB="0" distL="0" distR="0" wp14:anchorId="1B14779E" wp14:editId="093EE0DB">
+            <wp:extent cx="4323816" cy="3581964"/>
+            <wp:effectExtent l="0" t="0" r="635" b="0"/>
+            <wp:docPr id="1052488661" name="Picture 1"/>
+            <wp:cNvGraphicFramePr>
+              <a:graphicFrameLocks xmlns:a="http://schemas.openxmlformats.org/drawingml/2006/main" noChangeAspect="1"/>
+            </wp:cNvGraphicFramePr>
+            <a:graphic xmlns:a="http://schemas.openxmlformats.org/drawingml/2006/main">
+              <a:graphicData uri="http://schemas.openxmlformats.org/drawingml/2006/picture">
+                <pic:pic xmlns:pic="http://schemas.openxmlformats.org/drawingml/2006/picture">
+                  <pic:nvPicPr>
+                    <pic:cNvPr id="486162867" name=""/>
+                    <pic:cNvPicPr/>
+                  </pic:nvPicPr>
+                  <pic:blipFill>
+                    <a:blip r:embed="rId80"/>
+                    <a:stretch>
+                      <a:fillRect/>
+                    </a:stretch>
+                  </pic:blipFill>
+                  <pic:spPr>
+                    <a:xfrm>
+                      <a:off x="0" y="0"/>
+                      <a:ext cx="4359179" cy="3611260"/>
+                    </a:xfrm>
+                    <a:prstGeom prst="rect">
+                      <a:avLst/>
+                    </a:prstGeom>
+                  </pic:spPr>
+                </pic:pic>
+              </a:graphicData>
+            </a:graphic>
+          </wp:inline>
+        </w:drawing>
+      </w:r>
+      <w:r>
+        <w:rPr>
+          <w:noProof/>
+        </w:rPr>
+        <w:drawing>
+          <wp:inline distT="0" distB="0" distL="0" distR="0" wp14:anchorId="08B68DD7" wp14:editId="5E6C2148">
+            <wp:extent cx="4997302" cy="1829998"/>
+            <wp:effectExtent l="0" t="0" r="0" b="0"/>
+            <wp:docPr id="1938956164" name="Picture 3"/>
+            <wp:cNvGraphicFramePr>
+              <a:graphicFrameLocks xmlns:a="http://schemas.openxmlformats.org/drawingml/2006/main" noChangeAspect="1"/>
+            </wp:cNvGraphicFramePr>
+            <a:graphic xmlns:a="http://schemas.openxmlformats.org/drawingml/2006/main">
+              <a:graphicData uri="http://schemas.openxmlformats.org/drawingml/2006/picture">
+                <pic:pic xmlns:pic="http://schemas.openxmlformats.org/drawingml/2006/picture">
+                  <pic:nvPicPr>
+                    <pic:cNvPr id="0" name="Picture 2"/>
+                    <pic:cNvPicPr>
+                      <a:picLocks noChangeAspect="1" noChangeArrowheads="1"/>
+                    </pic:cNvPicPr>
+                  </pic:nvPicPr>
+                  <pic:blipFill>
+                    <a:blip r:embed="rId109">
+                      <a:extLst>
+                        <a:ext uri="{28A0092B-C50C-407E-A947-70E740481C1C}">
+                          <a14:useLocalDpi xmlns:a14="http://schemas.microsoft.com/office/drawing/2010/main" val="0"/>
+                        </a:ext>
+                      </a:extLst>
+                    </a:blip>
+                    <a:srcRect/>
+                    <a:stretch>
+                      <a:fillRect/>
+                    </a:stretch>
+                  </pic:blipFill>
+                  <pic:spPr bwMode="auto">
+                    <a:xfrm>
+                      <a:off x="0" y="0"/>
+                      <a:ext cx="5037738" cy="1844806"/>
+                    </a:xfrm>
+                    <a:prstGeom prst="rect">
+                      <a:avLst/>
+                    </a:prstGeom>
+                    <a:noFill/>
+                  </pic:spPr>
+                </pic:pic>
+              </a:graphicData>
+            </a:graphic>
+          </wp:inline>
+        </w:drawing>
+      </w:r>
+    </w:p>
+    <w:p>
+      <w:pPr>
+        <w:pStyle w:val="ListParagraph"/>
+        <w:numPr>
+          <w:ilvl w:val="0"/>
+          <w:numId w:val="2"/>
+        </w:numPr>
+        <w:jc w:val="center"/>
+      </w:pPr>
+      <w:r>
+        <w:rPr>
+          <w:noProof/>
+        </w:rPr>
+        <w:drawing>
+          <wp:inline distT="0" distB="0" distL="0" distR="0" wp14:anchorId="7545BF7D" wp14:editId="0FD013AD">
+            <wp:extent cx="2747335" cy="2362200"/>
+            <wp:effectExtent l="0" t="0" r="0" b="0"/>
+            <wp:docPr id="1430781228" name="Picture 2" descr="Fig. 3"/>
+            <wp:cNvGraphicFramePr>
+              <a:graphicFrameLocks xmlns:a="http://schemas.openxmlformats.org/drawingml/2006/main" noChangeAspect="1"/>
+            </wp:cNvGraphicFramePr>
+            <a:graphic xmlns:a="http://schemas.openxmlformats.org/drawingml/2006/main">
+              <a:graphicData uri="http://schemas.openxmlformats.org/drawingml/2006/picture">
+                <pic:pic xmlns:pic="http://schemas.openxmlformats.org/drawingml/2006/picture">
+                  <pic:nvPicPr>
+                    <pic:cNvPr id="0" name="Picture 3" descr="Fig. 3"/>
+                    <pic:cNvPicPr>
+                      <a:picLocks noChangeAspect="1" noChangeArrowheads="1"/>
+                    </pic:cNvPicPr>
+                  </pic:nvPicPr>
+                  <pic:blipFill>
+                    <a:blip r:embed="rId50" cstate="print">
+                      <a:extLst>
+                        <a:ext uri="{28A0092B-C50C-407E-A947-70E740481C1C}">
+                          <a14:useLocalDpi xmlns:a14="http://schemas.microsoft.com/office/drawing/2010/main" val="0"/>
+                        </a:ext>
+                      </a:extLst>
+                    </a:blip>
+                    <a:srcRect/>
+                    <a:stretch>
+                      <a:fillRect/>
+                    </a:stretch>
+                  </pic:blipFill>
+                  <pic:spPr bwMode="auto">
+                    <a:xfrm>
+                      <a:off x="0" y="0"/>
+                      <a:ext cx="2758736" cy="2372003"/>
+                    </a:xfrm>
+                    <a:prstGeom prst="rect">
+                      <a:avLst/>
+                    </a:prstGeom>
+                    <a:noFill/>
+                    <a:ln>
+                      <a:noFill/>
+                    </a:ln>
+                  </pic:spPr>
+                </pic:pic>
+              </a:graphicData>
+            </a:graphic>
+          </wp:inline>
+        </w:drawing>
+      </w:r>
+    </w:p>
+    <w:p/>
+    <w:p/>
+    <w:p/>
+    <w:p/>
+    <w:p/>
+    <w:p/>
+    <w:p/>
+    <w:p/>
+    <w:p/>
+    <w:p/>
+    <w:p/>
+    <w:p/>
+    <w:p/>
+    <w:p/>
+    <w:p/>
+    <w:p/>
+    <w:p/>
+    <w:p/>
+    <w:p/>
+    <w:p/>
+    <w:p/>
+    <w:p/>
+    <w:p/>
     <w:p/>
     <w:p/>
     <w:p>

</xml_diff>

<commit_message>
save point (everything is broken)
</commit_message>
<xml_diff>
--- a/Notes/Worklog.docx
+++ b/Notes/Worklog.docx
@@ -15146,6 +15146,33 @@
     <w:p>
       <w:pPr>
         <w:pStyle w:val="ListParagraph"/>
+        <w:numPr>
+          <w:ilvl w:val="1"/>
+          <w:numId w:val="2"/>
+        </w:numPr>
+      </w:pPr>
+      <w:r>
+        <w:t>I am going back to the very beginning</w:t>
+      </w:r>
+      <w:r>
+        <w:t xml:space="preserve"> and saving each change as a new column and then sending it to ChrisB to figure out while I’m away.</w:t>
+      </w:r>
+    </w:p>
+    <w:p>
+      <w:pPr>
+        <w:pStyle w:val="ListParagraph"/>
+        <w:numPr>
+          <w:ilvl w:val="1"/>
+          <w:numId w:val="2"/>
+        </w:numPr>
+      </w:pPr>
+      <w:r>
+        <w:t>Only working with a small part of the data to begin with.</w:t>
+      </w:r>
+    </w:p>
+    <w:p>
+      <w:pPr>
+        <w:pStyle w:val="ListParagraph"/>
         <w:ind w:left="1440"/>
       </w:pPr>
     </w:p>
@@ -15223,121 +15250,7 @@
           </wp:inline>
         </w:drawing>
       </w:r>
-      <w:r>
-        <w:rPr>
-          <w:noProof/>
-        </w:rPr>
-        <w:drawing>
-          <wp:inline distT="0" distB="0" distL="0" distR="0" wp14:anchorId="08B68DD7" wp14:editId="5E6C2148">
-            <wp:extent cx="4997302" cy="1829998"/>
-            <wp:effectExtent l="0" t="0" r="0" b="0"/>
-            <wp:docPr id="1938956164" name="Picture 3"/>
-            <wp:cNvGraphicFramePr>
-              <a:graphicFrameLocks xmlns:a="http://schemas.openxmlformats.org/drawingml/2006/main" noChangeAspect="1"/>
-            </wp:cNvGraphicFramePr>
-            <a:graphic xmlns:a="http://schemas.openxmlformats.org/drawingml/2006/main">
-              <a:graphicData uri="http://schemas.openxmlformats.org/drawingml/2006/picture">
-                <pic:pic xmlns:pic="http://schemas.openxmlformats.org/drawingml/2006/picture">
-                  <pic:nvPicPr>
-                    <pic:cNvPr id="0" name="Picture 2"/>
-                    <pic:cNvPicPr>
-                      <a:picLocks noChangeAspect="1" noChangeArrowheads="1"/>
-                    </pic:cNvPicPr>
-                  </pic:nvPicPr>
-                  <pic:blipFill>
-                    <a:blip r:embed="rId109">
-                      <a:extLst>
-                        <a:ext uri="{28A0092B-C50C-407E-A947-70E740481C1C}">
-                          <a14:useLocalDpi xmlns:a14="http://schemas.microsoft.com/office/drawing/2010/main" val="0"/>
-                        </a:ext>
-                      </a:extLst>
-                    </a:blip>
-                    <a:srcRect/>
-                    <a:stretch>
-                      <a:fillRect/>
-                    </a:stretch>
-                  </pic:blipFill>
-                  <pic:spPr bwMode="auto">
-                    <a:xfrm>
-                      <a:off x="0" y="0"/>
-                      <a:ext cx="5037738" cy="1844806"/>
-                    </a:xfrm>
-                    <a:prstGeom prst="rect">
-                      <a:avLst/>
-                    </a:prstGeom>
-                    <a:noFill/>
-                  </pic:spPr>
-                </pic:pic>
-              </a:graphicData>
-            </a:graphic>
-          </wp:inline>
-        </w:drawing>
-      </w:r>
-    </w:p>
-    <w:p>
-      <w:pPr>
-        <w:pStyle w:val="ListParagraph"/>
-        <w:numPr>
-          <w:ilvl w:val="0"/>
-          <w:numId w:val="2"/>
-        </w:numPr>
-        <w:jc w:val="center"/>
-      </w:pPr>
-      <w:r>
-        <w:rPr>
-          <w:noProof/>
-        </w:rPr>
-        <w:drawing>
-          <wp:inline distT="0" distB="0" distL="0" distR="0" wp14:anchorId="7545BF7D" wp14:editId="0FD013AD">
-            <wp:extent cx="2747335" cy="2362200"/>
-            <wp:effectExtent l="0" t="0" r="0" b="0"/>
-            <wp:docPr id="1430781228" name="Picture 2" descr="Fig. 3"/>
-            <wp:cNvGraphicFramePr>
-              <a:graphicFrameLocks xmlns:a="http://schemas.openxmlformats.org/drawingml/2006/main" noChangeAspect="1"/>
-            </wp:cNvGraphicFramePr>
-            <a:graphic xmlns:a="http://schemas.openxmlformats.org/drawingml/2006/main">
-              <a:graphicData uri="http://schemas.openxmlformats.org/drawingml/2006/picture">
-                <pic:pic xmlns:pic="http://schemas.openxmlformats.org/drawingml/2006/picture">
-                  <pic:nvPicPr>
-                    <pic:cNvPr id="0" name="Picture 3" descr="Fig. 3"/>
-                    <pic:cNvPicPr>
-                      <a:picLocks noChangeAspect="1" noChangeArrowheads="1"/>
-                    </pic:cNvPicPr>
-                  </pic:nvPicPr>
-                  <pic:blipFill>
-                    <a:blip r:embed="rId50" cstate="print">
-                      <a:extLst>
-                        <a:ext uri="{28A0092B-C50C-407E-A947-70E740481C1C}">
-                          <a14:useLocalDpi xmlns:a14="http://schemas.microsoft.com/office/drawing/2010/main" val="0"/>
-                        </a:ext>
-                      </a:extLst>
-                    </a:blip>
-                    <a:srcRect/>
-                    <a:stretch>
-                      <a:fillRect/>
-                    </a:stretch>
-                  </pic:blipFill>
-                  <pic:spPr bwMode="auto">
-                    <a:xfrm>
-                      <a:off x="0" y="0"/>
-                      <a:ext cx="2758736" cy="2372003"/>
-                    </a:xfrm>
-                    <a:prstGeom prst="rect">
-                      <a:avLst/>
-                    </a:prstGeom>
-                    <a:noFill/>
-                    <a:ln>
-                      <a:noFill/>
-                    </a:ln>
-                  </pic:spPr>
-                </pic:pic>
-              </a:graphicData>
-            </a:graphic>
-          </wp:inline>
-        </w:drawing>
-      </w:r>
-    </w:p>
-    <w:p/>
+    </w:p>
     <w:p/>
     <w:p/>
     <w:p/>

</xml_diff>

<commit_message>
restored the worked example based on the old version
</commit_message>
<xml_diff>
--- a/Notes/Worklog.docx
+++ b/Notes/Worklog.docx
@@ -15075,30 +15075,30 @@
           <w:ilvl w:val="0"/>
           <w:numId w:val="2"/>
         </w:numPr>
+      </w:pPr>
+      <w:r>
+        <w:t>Today CB is coming in and will be able to help with the quaternions</w:t>
+      </w:r>
+      <w:r>
+        <w:t xml:space="preserve">. He says that the quaternions in the impala data might actually be right. Sucks that I COMPLETELY removed them. Going back to the previous step to reinclude. </w:t>
+      </w:r>
+      <w:r>
+        <w:sym w:font="Wingdings" w:char="F0E0"/>
+      </w:r>
+      <w:r>
+        <w:t xml:space="preserve"> </w:t>
+      </w:r>
+      <w:r>
+        <w:t>I reincluded them and they were trash lmao</w:t>
+      </w:r>
+      <w:r>
         <w:rPr>
           <w:highlight w:val="yellow"/>
         </w:rPr>
-      </w:pPr>
-      <w:r>
-        <w:t>Today CB is coming in and will be able to help with the quaternions</w:t>
-      </w:r>
-      <w:r>
-        <w:t xml:space="preserve">. He says that the quaternions in the impala data might actually be right. Sucks that I COMPLETELY removed them. Going back to the previous step to reinclude. </w:t>
-      </w:r>
-      <w:r>
-        <w:sym w:font="Wingdings" w:char="F0E0"/>
-      </w:r>
-      <w:r>
-        <w:t xml:space="preserve"> </w:t>
-      </w:r>
-      <w:r>
-        <w:t xml:space="preserve">I reincluded them and they were trash lmao. </w:t>
-      </w:r>
-      <w:r>
-        <w:rPr>
-          <w:highlight w:val="yellow"/>
-        </w:rPr>
-        <w:t>I am clearly scaling something completely wrong.</w:t>
+        <w:t>. I am clearly scaling something completely wrong</w:t>
+      </w:r>
+      <w:r>
+        <w:t>.</w:t>
       </w:r>
     </w:p>
     <w:p>
@@ -15110,7 +15110,10 @@
         </w:numPr>
       </w:pPr>
       <w:r>
-        <w:t xml:space="preserve">Until we have run a test in the field, there is no way of knowing whether the tracks are correct or not. All we have is estimate on estimate with rotating collars. ChrisC wants a hyper-accurate track that has never been done before. I think we should just call it a day. </w:t>
+        <w:t xml:space="preserve">Until we have run a test in the field, there is no way of knowing whether the tracks are correct or not. All we have is estimate on estimate with rotating collars. </w:t>
+      </w:r>
+      <w:r>
+        <w:t>We need to do a test in the field. They are soldering a board now, then I will be able to test it in a few days.</w:t>
       </w:r>
     </w:p>
     <w:p>
@@ -15132,93 +15135,141 @@
       <w:pPr>
         <w:pStyle w:val="ListParagraph"/>
         <w:numPr>
+          <w:ilvl w:val="1"/>
+          <w:numId w:val="2"/>
+        </w:numPr>
+      </w:pPr>
+      <w:r>
+        <w:t>Okay, went to make my old method again and it broke completely. Lmao?</w:t>
+      </w:r>
+      <w:r>
+        <w:t xml:space="preserve"> Back to the beginning to rescale the accels and mags and stuff.</w:t>
+      </w:r>
+    </w:p>
+    <w:p>
+      <w:pPr>
+        <w:pStyle w:val="ListParagraph"/>
+        <w:numPr>
+          <w:ilvl w:val="1"/>
+          <w:numId w:val="2"/>
+        </w:numPr>
+      </w:pPr>
+      <w:r>
+        <w:t>I am going back to the very beginning</w:t>
+      </w:r>
+      <w:r>
+        <w:t xml:space="preserve"> and saving each change as a new column and then sending it to ChrisB to figure out while I’m away.</w:t>
+      </w:r>
+    </w:p>
+    <w:p>
+      <w:pPr>
+        <w:pStyle w:val="ListParagraph"/>
+        <w:numPr>
           <w:ilvl w:val="0"/>
           <w:numId w:val="2"/>
         </w:numPr>
       </w:pPr>
       <w:r>
-        <w:t>Okay, went to make my old method again and it broke completely. Lmao?</w:t>
-      </w:r>
-      <w:r>
-        <w:t xml:space="preserve"> Back to the beginning to rescale the accels and mags and stuff.</w:t>
+        <w:t>God this makes me miserable. I will be so grateful when he finds the solution.</w:t>
       </w:r>
     </w:p>
     <w:p>
       <w:pPr>
         <w:pStyle w:val="ListParagraph"/>
         <w:numPr>
+          <w:ilvl w:val="0"/>
+          <w:numId w:val="2"/>
+        </w:numPr>
+      </w:pPr>
+      <w:r>
+        <w:t>I need to move on to making the behavioural model predictions</w:t>
+      </w:r>
+      <w:r>
+        <w:t xml:space="preserve"> for now.</w:t>
+      </w:r>
+    </w:p>
+    <w:p>
+      <w:pPr>
+        <w:pStyle w:val="Heading3"/>
+      </w:pPr>
+      <w:r>
+        <w:t>2</w:t>
+      </w:r>
+      <w:r>
+        <w:t>7</w:t>
+      </w:r>
+      <w:r>
+        <w:t>/05</w:t>
+      </w:r>
+    </w:p>
+    <w:p>
+      <w:pPr>
+        <w:pStyle w:val="ListParagraph"/>
+        <w:numPr>
+          <w:ilvl w:val="0"/>
+          <w:numId w:val="2"/>
+        </w:numPr>
+      </w:pPr>
+      <w:r>
+        <w:t>Today I am working on reverting everything to get us back to where we were before. Upsetting</w:t>
+      </w:r>
+      <w:r>
+        <w:t xml:space="preserve"> but necessary. Breaking every step into its own function so I can rapidly experiment. I should have done it like this from the beginning on just the minimum section of data. Silly that I didn’t.</w:t>
+      </w:r>
+    </w:p>
+    <w:p>
+      <w:pPr>
+        <w:pStyle w:val="ListParagraph"/>
+        <w:numPr>
+          <w:ilvl w:val="0"/>
+          <w:numId w:val="2"/>
+        </w:numPr>
+      </w:pPr>
+      <w:r>
+        <w:t>I went and found the data from when everything was working to see what the scales were. Confirmed that I previously used 8192 as the accelerometer division factor</w:t>
+      </w:r>
+      <w:r>
+        <w:t>.</w:t>
+      </w:r>
+    </w:p>
+    <w:p>
+      <w:pPr>
+        <w:pStyle w:val="ListParagraph"/>
+        <w:numPr>
+          <w:ilvl w:val="0"/>
+          <w:numId w:val="2"/>
+        </w:numPr>
+      </w:pPr>
+      <w:r>
+        <w:t>Went back to the original data and the original code and got it working. Now I need to increment the old code over to the new code until it works again.</w:t>
+      </w:r>
+    </w:p>
+    <w:p>
+      <w:pPr>
+        <w:pStyle w:val="ListParagraph"/>
+        <w:numPr>
           <w:ilvl w:val="1"/>
           <w:numId w:val="2"/>
         </w:numPr>
       </w:pPr>
       <w:r>
-        <w:t>I am going back to the very beginning</w:t>
-      </w:r>
-      <w:r>
-        <w:t xml:space="preserve"> and saving each change as a new column and then sending it to ChrisB to figure out while I’m away.</w:t>
-      </w:r>
-    </w:p>
-    <w:p>
-      <w:pPr>
-        <w:pStyle w:val="ListParagraph"/>
-        <w:numPr>
-          <w:ilvl w:val="1"/>
-          <w:numId w:val="2"/>
-        </w:numPr>
-      </w:pPr>
-      <w:r>
-        <w:t>Only working with a small part of the data to begin with.</w:t>
-      </w:r>
-    </w:p>
-    <w:p>
-      <w:pPr>
-        <w:pStyle w:val="ListParagraph"/>
-        <w:ind w:left="1440"/>
-      </w:pPr>
-    </w:p>
-    <w:p>
-      <w:pPr>
-        <w:pStyle w:val="ListParagraph"/>
-        <w:ind w:left="1440"/>
-      </w:pPr>
-    </w:p>
-    <w:p>
-      <w:pPr>
-        <w:pStyle w:val="ListParagraph"/>
-        <w:ind w:left="1440"/>
-      </w:pPr>
-    </w:p>
-    <w:p>
-      <w:pPr>
-        <w:pStyle w:val="ListParagraph"/>
-        <w:numPr>
-          <w:ilvl w:val="0"/>
-          <w:numId w:val="2"/>
-        </w:numPr>
-      </w:pPr>
-      <w:r>
-        <w:t>For reference I have put the other methods on the other side</w:t>
-      </w:r>
-    </w:p>
-    <w:p>
-      <w:pPr>
-        <w:pStyle w:val="ListParagraph"/>
-        <w:numPr>
-          <w:ilvl w:val="0"/>
-          <w:numId w:val="2"/>
-        </w:numPr>
+        <w:lastRenderedPageBreak/>
+        <w:t>Holy heck. So there was something wrong with my scaling and my smoothing logic… Now I get these results</w:t>
+      </w:r>
+      <w:r>
+        <w:t>… Which essentially brings us back to where I was before. Okay cool. So now I need to correct it forwards from here with these smoothed values.</w:t>
+      </w:r>
+    </w:p>
+    <w:p>
+      <w:pPr>
         <w:jc w:val="center"/>
       </w:pPr>
       <w:r>
-        <w:rPr>
-          <w:noProof/>
-        </w:rPr>
-        <w:lastRenderedPageBreak/>
         <w:drawing>
-          <wp:inline distT="0" distB="0" distL="0" distR="0" wp14:anchorId="1B14779E" wp14:editId="093EE0DB">
-            <wp:extent cx="4323816" cy="3581964"/>
-            <wp:effectExtent l="0" t="0" r="635" b="0"/>
-            <wp:docPr id="1052488661" name="Picture 1"/>
+          <wp:inline distT="0" distB="0" distL="0" distR="0" wp14:anchorId="722B83CB" wp14:editId="49980AF7">
+            <wp:extent cx="4079019" cy="3461501"/>
+            <wp:effectExtent l="0" t="0" r="0" b="5715"/>
+            <wp:docPr id="689540629" name="Picture 1"/>
             <wp:cNvGraphicFramePr>
               <a:graphicFrameLocks xmlns:a="http://schemas.openxmlformats.org/drawingml/2006/main" noChangeAspect="1"/>
             </wp:cNvGraphicFramePr>
@@ -15226,11 +15277,11 @@
               <a:graphicData uri="http://schemas.openxmlformats.org/drawingml/2006/picture">
                 <pic:pic xmlns:pic="http://schemas.openxmlformats.org/drawingml/2006/picture">
                   <pic:nvPicPr>
-                    <pic:cNvPr id="486162867" name=""/>
+                    <pic:cNvPr id="689540629" name=""/>
                     <pic:cNvPicPr/>
                   </pic:nvPicPr>
                   <pic:blipFill>
-                    <a:blip r:embed="rId80"/>
+                    <a:blip r:embed="rId115"/>
                     <a:stretch>
                       <a:fillRect/>
                     </a:stretch>
@@ -15238,7 +15289,7 @@
                   <pic:spPr>
                     <a:xfrm>
                       <a:off x="0" y="0"/>
-                      <a:ext cx="4359179" cy="3611260"/>
+                      <a:ext cx="4086740" cy="3468053"/>
                     </a:xfrm>
                     <a:prstGeom prst="rect">
                       <a:avLst/>
@@ -15251,6 +15302,84 @@
         </w:drawing>
       </w:r>
     </w:p>
+    <w:p>
+      <w:pPr>
+        <w:pStyle w:val="ListParagraph"/>
+        <w:numPr>
+          <w:ilvl w:val="0"/>
+          <w:numId w:val="2"/>
+        </w:numPr>
+      </w:pPr>
+      <w:r>
+        <w:t xml:space="preserve">Note that I tried to use the quaternion components onboard </w:t>
+      </w:r>
+      <w:r>
+        <w:t xml:space="preserve">but found that they aren’t normalised, which means you can’t calculate the w component (which we don’t have)… so that means we cannnn’t use the </w:t>
+      </w:r>
+      <w:r>
+        <w:t>on board calculated ones</w:t>
+      </w:r>
+      <w:r>
+        <w:t>???? Have messaged Chris to ask.</w:t>
+      </w:r>
+    </w:p>
+    <w:p>
+      <w:pPr>
+        <w:pStyle w:val="ListParagraph"/>
+        <w:numPr>
+          <w:ilvl w:val="1"/>
+          <w:numId w:val="2"/>
+        </w:numPr>
+      </w:pPr>
+      <w:r>
+        <w:t>W</w:t>
+      </w:r>
+      <w:r>
+        <w:t xml:space="preserve">ent back and used the Magdwick again… Got </w:t>
+      </w:r>
+      <w:r>
+        <w:t xml:space="preserve">complete shite </w:t>
+      </w:r>
+      <w:r>
+        <w:t xml:space="preserve">(straight line) </w:t>
+      </w:r>
+      <w:r>
+        <w:t>again…</w:t>
+      </w:r>
+    </w:p>
+    <w:p>
+      <w:pPr>
+        <w:pStyle w:val="ListParagraph"/>
+        <w:numPr>
+          <w:ilvl w:val="0"/>
+          <w:numId w:val="2"/>
+        </w:numPr>
+      </w:pPr>
+      <w:r>
+        <w:t>Leaving the quaternions for now and just focusing on what I got with Gundog.Compass, n</w:t>
+      </w:r>
+      <w:r>
+        <w:t>ow to get an estimate of the speeds.</w:t>
+      </w:r>
+      <w:r>
+        <w:t xml:space="preserve"> If these are reasonable, I’m moving onto behaviours and then finalising for the presentation.</w:t>
+      </w:r>
+    </w:p>
+    <w:p>
+      <w:pPr>
+        <w:pStyle w:val="ListParagraph"/>
+        <w:numPr>
+          <w:ilvl w:val="1"/>
+          <w:numId w:val="2"/>
+        </w:numPr>
+      </w:pPr>
+    </w:p>
+    <w:p>
+      <w:pPr>
+        <w:pStyle w:val="ListParagraph"/>
+        <w:ind w:left="1440"/>
+      </w:pPr>
+    </w:p>
     <w:p/>
     <w:p/>
     <w:p/>
@@ -15258,6 +15387,19 @@
     <w:p/>
     <w:p/>
     <w:p/>
+    <w:p>
+      <w:hyperlink r:id="rId116" w:history="1">
+        <w:r>
+          <w:rPr>
+            <w:rStyle w:val="Hyperlink"/>
+          </w:rPr>
+          <w:t>https://www.linkedin.com/feed/update/urn:li:groupPost:12555223-7464907944896372736/?utm_source=share&amp;utm_medium=member_desktop&amp;rcm=ACoAAD5PrlYBAzjQErdcyNCGxIzkzzEWB0YxR2M</w:t>
+        </w:r>
+      </w:hyperlink>
+      <w:r>
+        <w:t xml:space="preserve"> </w:t>
+      </w:r>
+    </w:p>
     <w:p/>
     <w:p/>
     <w:p/>
@@ -15590,6 +15732,7 @@
           <w:rFonts w:asciiTheme="minorHAnsi" w:hAnsiTheme="minorHAnsi"/>
           <w:lang w:val="en-GB"/>
         </w:rPr>
+        <w:lastRenderedPageBreak/>
         <w:t>Standardise orientation so all devices roughly the same</w:t>
       </w:r>
       <w:r>
@@ -15819,6 +15962,7 @@
         <w:rPr>
           <w:highlight w:val="yellow"/>
         </w:rPr>
+        <w:lastRenderedPageBreak/>
         <w:t>I also remembered that he said something about 40Hz lion movement being overkill, which made me think I should summarise it to 1 second averages?</w:t>
       </w:r>
     </w:p>
@@ -15830,7 +15974,7 @@
       </w:pPr>
     </w:p>
     <w:sectPr>
-      <w:headerReference w:type="default" r:id="rId115"/>
+      <w:headerReference w:type="default" r:id="rId117"/>
       <w:pgSz w:w="12240" w:h="15840"/>
       <w:pgMar w:top="720" w:right="720" w:bottom="720" w:left="720" w:header="720" w:footer="720" w:gutter="0"/>
       <w:cols w:space="720"/>

</xml_diff>

<commit_message>
scaling correctly and generating features from unlabelled data
</commit_message>
<xml_diff>
--- a/Notes/Worklog.docx
+++ b/Notes/Worklog.docx
@@ -15257,7 +15257,13 @@
         <w:t>Holy heck. So there was something wrong with my scaling and my smoothing logic… Now I get these results</w:t>
       </w:r>
       <w:r>
-        <w:t>… Which essentially brings us back to where I was before. Okay cool. So now I need to correct it forwards from here with these smoothed values.</w:t>
+        <w:t xml:space="preserve">… Which essentially brings us back to where I was before. Okay cool. So now I need to correct it forwards from here with these </w:t>
+      </w:r>
+      <w:r>
+        <w:t>correctly scaled/</w:t>
+      </w:r>
+      <w:r>
+        <w:t>smoothed values.</w:t>
       </w:r>
     </w:p>
     <w:p>
@@ -15266,9 +15272,9 @@
       </w:pPr>
       <w:r>
         <w:drawing>
-          <wp:inline distT="0" distB="0" distL="0" distR="0" wp14:anchorId="722B83CB" wp14:editId="49980AF7">
-            <wp:extent cx="4079019" cy="3461501"/>
-            <wp:effectExtent l="0" t="0" r="0" b="5715"/>
+          <wp:inline distT="0" distB="0" distL="0" distR="0" wp14:anchorId="722B83CB" wp14:editId="2676F31C">
+            <wp:extent cx="5087565" cy="2143125"/>
+            <wp:effectExtent l="0" t="0" r="0" b="0"/>
             <wp:docPr id="689540629" name="Picture 1"/>
             <wp:cNvGraphicFramePr>
               <a:graphicFrameLocks xmlns:a="http://schemas.openxmlformats.org/drawingml/2006/main" noChangeAspect="1"/>
@@ -15280,8 +15286,110 @@
                     <pic:cNvPr id="689540629" name=""/>
                     <pic:cNvPicPr/>
                   </pic:nvPicPr>
+                  <pic:blipFill rotWithShape="1">
+                    <a:blip r:embed="rId115"/>
+                    <a:srcRect b="50360"/>
+                    <a:stretch>
+                      <a:fillRect/>
+                    </a:stretch>
+                  </pic:blipFill>
+                  <pic:spPr bwMode="auto">
+                    <a:xfrm>
+                      <a:off x="0" y="0"/>
+                      <a:ext cx="5105188" cy="2150549"/>
+                    </a:xfrm>
+                    <a:prstGeom prst="rect">
+                      <a:avLst/>
+                    </a:prstGeom>
+                    <a:ln>
+                      <a:noFill/>
+                    </a:ln>
+                    <a:extLst>
+                      <a:ext uri="{53640926-AAD7-44D8-BBD7-CCE9431645EC}">
+                        <a14:shadowObscured xmlns:a14="http://schemas.microsoft.com/office/drawing/2010/main"/>
+                      </a:ext>
+                    </a:extLst>
+                  </pic:spPr>
+                </pic:pic>
+              </a:graphicData>
+            </a:graphic>
+          </wp:inline>
+        </w:drawing>
+      </w:r>
+    </w:p>
+    <w:p>
+      <w:pPr>
+        <w:pStyle w:val="ListParagraph"/>
+        <w:numPr>
+          <w:ilvl w:val="0"/>
+          <w:numId w:val="2"/>
+        </w:numPr>
+      </w:pPr>
+      <w:r>
+        <w:t xml:space="preserve">Note that I tried to use the quaternion components onboard </w:t>
+      </w:r>
+      <w:r>
+        <w:t xml:space="preserve">but found that they aren’t normalised, which means you can’t calculate the w component (which we don’t have)… so that means we cannnn’t use the </w:t>
+      </w:r>
+      <w:r>
+        <w:t>on board calculated ones</w:t>
+      </w:r>
+      <w:r>
+        <w:t>???? Have messaged Chris</w:t>
+      </w:r>
+      <w:r>
+        <w:t>B</w:t>
+      </w:r>
+      <w:r>
+        <w:t xml:space="preserve"> to ask.</w:t>
+      </w:r>
+    </w:p>
+    <w:p>
+      <w:pPr>
+        <w:pStyle w:val="ListParagraph"/>
+        <w:numPr>
+          <w:ilvl w:val="1"/>
+          <w:numId w:val="2"/>
+        </w:numPr>
+      </w:pPr>
+      <w:r>
+        <w:t>He responded with a chunk of math… that gave me the following…</w:t>
+      </w:r>
+      <w:r>
+        <w:t xml:space="preserve"> Which isn’t </w:t>
+      </w:r>
+      <w:r>
+        <w:t>right but</w:t>
+      </w:r>
+      <w:r>
+        <w:t xml:space="preserve"> also isn’t completely wrong!</w:t>
+      </w:r>
+      <w:r>
+        <w:t xml:space="preserve"> Yay!</w:t>
+      </w:r>
+    </w:p>
+    <w:p>
+      <w:pPr>
+        <w:jc w:val="center"/>
+      </w:pPr>
+      <w:r>
+        <w:drawing>
+          <wp:inline distT="0" distB="0" distL="0" distR="0" wp14:anchorId="6682595D" wp14:editId="2879E9C4">
+            <wp:extent cx="4829175" cy="2017522"/>
+            <wp:effectExtent l="0" t="0" r="0" b="1905"/>
+            <wp:docPr id="1137280435" name="Picture 1"/>
+            <wp:cNvGraphicFramePr>
+              <a:graphicFrameLocks xmlns:a="http://schemas.openxmlformats.org/drawingml/2006/main" noChangeAspect="1"/>
+            </wp:cNvGraphicFramePr>
+            <a:graphic xmlns:a="http://schemas.openxmlformats.org/drawingml/2006/main">
+              <a:graphicData uri="http://schemas.openxmlformats.org/drawingml/2006/picture">
+                <pic:pic xmlns:pic="http://schemas.openxmlformats.org/drawingml/2006/picture">
+                  <pic:nvPicPr>
+                    <pic:cNvPr id="1137280435" name=""/>
+                    <pic:cNvPicPr/>
+                  </pic:nvPicPr>
                   <pic:blipFill>
-                    <a:blip r:embed="rId115"/>
+                    <a:blip r:embed="rId116"/>
                     <a:stretch>
                       <a:fillRect/>
                     </a:stretch>
@@ -15289,7 +15397,7 @@
                   <pic:spPr>
                     <a:xfrm>
                       <a:off x="0" y="0"/>
-                      <a:ext cx="4086740" cy="3468053"/>
+                      <a:ext cx="4842135" cy="2022936"/>
                     </a:xfrm>
                     <a:prstGeom prst="rect">
                       <a:avLst/>
@@ -15304,6 +15412,20 @@
     </w:p>
     <w:p>
       <w:pPr>
+        <w:pStyle w:val="Heading3"/>
+      </w:pPr>
+      <w:r>
+        <w:t>2</w:t>
+      </w:r>
+      <w:r>
+        <w:t>8</w:t>
+      </w:r>
+      <w:r>
+        <w:t>/05</w:t>
+      </w:r>
+    </w:p>
+    <w:p>
+      <w:pPr>
         <w:pStyle w:val="ListParagraph"/>
         <w:numPr>
           <w:ilvl w:val="0"/>
@@ -15311,74 +15433,144 @@
         </w:numPr>
       </w:pPr>
       <w:r>
-        <w:t xml:space="preserve">Note that I tried to use the quaternion components onboard </w:t>
-      </w:r>
-      <w:r>
-        <w:t xml:space="preserve">but found that they aren’t normalised, which means you can’t calculate the w component (which we don’t have)… so that means we cannnn’t use the </w:t>
-      </w:r>
-      <w:r>
-        <w:t>on board calculated ones</w:t>
-      </w:r>
-      <w:r>
-        <w:t>???? Have messaged Chris to ask.</w:t>
+        <w:t>Assuming that Birdy will figure out the quaternions while I’m away, my task for now is to get the behavioural model working.</w:t>
       </w:r>
     </w:p>
     <w:p>
       <w:pPr>
         <w:pStyle w:val="ListParagraph"/>
         <w:numPr>
+          <w:ilvl w:val="0"/>
+          <w:numId w:val="2"/>
+        </w:numPr>
+      </w:pPr>
+      <w:r>
+        <w:t>I got started on generating the features for the impala deployment data collar 8 – intending this to be my example collar for the conference.</w:t>
+      </w:r>
+    </w:p>
+    <w:p>
+      <w:pPr>
+        <w:ind w:left="360"/>
+      </w:pPr>
+    </w:p>
+    <w:p>
+      <w:pPr>
+        <w:ind w:left="360"/>
+      </w:pPr>
+    </w:p>
+    <w:p>
+      <w:pPr>
+        <w:ind w:left="360"/>
+      </w:pPr>
+    </w:p>
+    <w:p>
+      <w:pPr>
+        <w:ind w:left="360"/>
+      </w:pPr>
+    </w:p>
+    <w:p>
+      <w:pPr>
+        <w:pStyle w:val="ListParagraph"/>
+        <w:numPr>
+          <w:ilvl w:val="0"/>
+          <w:numId w:val="2"/>
+        </w:numPr>
+      </w:pPr>
+      <w:r>
+        <w:lastRenderedPageBreak/>
+        <w:t>Leaving the quaternions for now and just focusing on what I got with Gundog.Compass</w:t>
+      </w:r>
+      <w:r>
+        <w:t>.</w:t>
+      </w:r>
+      <w:r>
+        <w:t xml:space="preserve"> If </w:t>
+      </w:r>
+      <w:r>
+        <w:t>the speed estimates</w:t>
+      </w:r>
+      <w:r>
+        <w:t xml:space="preserve"> are reasonable, I’m moving onto behaviours and then finalising for the presentation.</w:t>
+      </w:r>
+    </w:p>
+    <w:p>
+      <w:pPr>
+        <w:pStyle w:val="ListParagraph"/>
+        <w:numPr>
           <w:ilvl w:val="1"/>
           <w:numId w:val="2"/>
         </w:numPr>
       </w:pPr>
       <w:r>
-        <w:t>W</w:t>
-      </w:r>
-      <w:r>
-        <w:t xml:space="preserve">ent back and used the Magdwick again… Got </w:t>
-      </w:r>
-      <w:r>
-        <w:t xml:space="preserve">complete shite </w:t>
-      </w:r>
-      <w:r>
-        <w:t xml:space="preserve">(straight line) </w:t>
-      </w:r>
-      <w:r>
-        <w:t>again…</w:t>
+        <w:t>The speeds from the moving sections are:</w:t>
+      </w:r>
+    </w:p>
+    <w:p>
+      <w:pPr>
+        <w:pStyle w:val="HTMLPreformatted"/>
+        <w:numPr>
+          <w:ilvl w:val="0"/>
+          <w:numId w:val="2"/>
+        </w:numPr>
+        <w:shd w:val="clear" w:color="auto" w:fill="2D2D2D"/>
+        <w:wordWrap w:val="0"/>
+        <w:spacing w:line="240" w:lineRule="atLeast"/>
+        <w:rPr>
+          <w:rStyle w:val="gbqs1kebk5b"/>
+          <w:rFonts w:ascii="Lucida Console" w:hAnsi="Lucida Console"/>
+          <w:color w:val="CCCCCC"/>
+          <w:bdr w:val="none" w:sz="0" w:space="0" w:color="auto" w:frame="1"/>
+        </w:rPr>
+      </w:pPr>
+      <w:r>
+        <w:rPr>
+          <w:rStyle w:val="gbqs1kebk5b"/>
+          <w:rFonts w:ascii="Lucida Console" w:hAnsi="Lucida Console"/>
+          <w:color w:val="CCCCCC"/>
+          <w:bdr w:val="none" w:sz="0" w:space="0" w:color="auto" w:frame="1"/>
+        </w:rPr>
+        <w:t xml:space="preserve">    Min.  1st Qu.   Median     Mean  3rd Qu.     Max. </w:t>
+      </w:r>
+    </w:p>
+    <w:p>
+      <w:pPr>
+        <w:pStyle w:val="HTMLPreformatted"/>
+        <w:numPr>
+          <w:ilvl w:val="0"/>
+          <w:numId w:val="2"/>
+        </w:numPr>
+        <w:shd w:val="clear" w:color="auto" w:fill="2D2D2D"/>
+        <w:wordWrap w:val="0"/>
+        <w:spacing w:line="240" w:lineRule="atLeast"/>
+        <w:rPr>
+          <w:rFonts w:ascii="Lucida Console" w:hAnsi="Lucida Console"/>
+          <w:color w:val="CCCCCC"/>
+        </w:rPr>
+      </w:pPr>
+      <w:r>
+        <w:rPr>
+          <w:rStyle w:val="gbqs1kebk5b"/>
+          <w:rFonts w:ascii="Lucida Console" w:hAnsi="Lucida Console"/>
+          <w:color w:val="CCCCCC"/>
+          <w:bdr w:val="none" w:sz="0" w:space="0" w:color="auto" w:frame="1"/>
+        </w:rPr>
+        <w:t xml:space="preserve"> 0.00009  0.03132  0.07815  0.18160  0.18677 17.06187 </w:t>
       </w:r>
     </w:p>
     <w:p>
       <w:pPr>
         <w:pStyle w:val="ListParagraph"/>
         <w:numPr>
-          <w:ilvl w:val="0"/>
-          <w:numId w:val="2"/>
-        </w:numPr>
-      </w:pPr>
-      <w:r>
-        <w:t>Leaving the quaternions for now and just focusing on what I got with Gundog.Compass, n</w:t>
-      </w:r>
-      <w:r>
-        <w:t>ow to get an estimate of the speeds.</w:t>
-      </w:r>
-      <w:r>
-        <w:t xml:space="preserve"> If these are reasonable, I’m moving onto behaviours and then finalising for the presentation.</w:t>
-      </w:r>
-    </w:p>
-    <w:p>
-      <w:pPr>
-        <w:pStyle w:val="ListParagraph"/>
-        <w:numPr>
           <w:ilvl w:val="1"/>
           <w:numId w:val="2"/>
         </w:numPr>
       </w:pPr>
-    </w:p>
-    <w:p>
-      <w:pPr>
-        <w:pStyle w:val="ListParagraph"/>
-        <w:ind w:left="1440"/>
-      </w:pPr>
+      <w:r>
+        <w:t>This looks reasonable… lets</w:t>
+      </w:r>
+      <w:r>
+        <w:t xml:space="preserve"> do the next day’s worth of data to see what we get.</w:t>
+      </w:r>
     </w:p>
     <w:p/>
     <w:p/>
@@ -15388,7 +15580,7 @@
     <w:p/>
     <w:p/>
     <w:p>
-      <w:hyperlink r:id="rId116" w:history="1">
+      <w:hyperlink r:id="rId117" w:history="1">
         <w:r>
           <w:rPr>
             <w:rStyle w:val="Hyperlink"/>
@@ -15399,33 +15591,6 @@
       <w:r>
         <w:t xml:space="preserve"> </w:t>
       </w:r>
-    </w:p>
-    <w:p/>
-    <w:p/>
-    <w:p/>
-    <w:p/>
-    <w:p/>
-    <w:p/>
-    <w:p/>
-    <w:p/>
-    <w:p/>
-    <w:p/>
-    <w:p/>
-    <w:p/>
-    <w:p/>
-    <w:p/>
-    <w:p/>
-    <w:p/>
-    <w:p/>
-    <w:p>
-      <w:pPr>
-        <w:pStyle w:val="NormalWeb"/>
-        <w:spacing w:after="0" w:afterAutospacing="0"/>
-        <w:rPr>
-          <w:rFonts w:asciiTheme="minorHAnsi" w:hAnsiTheme="minorHAnsi"/>
-          <w:lang w:val="en-GB"/>
-        </w:rPr>
-      </w:pPr>
     </w:p>
     <w:p>
       <w:pPr>
@@ -15732,7 +15897,6 @@
           <w:rFonts w:asciiTheme="minorHAnsi" w:hAnsiTheme="minorHAnsi"/>
           <w:lang w:val="en-GB"/>
         </w:rPr>
-        <w:lastRenderedPageBreak/>
         <w:t>Standardise orientation so all devices roughly the same</w:t>
       </w:r>
       <w:r>
@@ -15890,91 +16054,9 @@
         <w:t>Remove misreads and noise</w:t>
       </w:r>
     </w:p>
-    <w:p>
-      <w:pPr>
-        <w:pStyle w:val="ListParagraph"/>
-        <w:numPr>
-          <w:ilvl w:val="0"/>
-          <w:numId w:val="2"/>
-        </w:numPr>
-      </w:pPr>
-    </w:p>
     <w:p/>
-    <w:p/>
-    <w:p/>
-    <w:p/>
-    <w:p/>
-    <w:p/>
-    <w:p>
-      <w:pPr>
-        <w:pStyle w:val="ListParagraph"/>
-        <w:numPr>
-          <w:ilvl w:val="0"/>
-          <w:numId w:val="2"/>
-        </w:numPr>
-        <w:rPr>
-          <w:highlight w:val="yellow"/>
-        </w:rPr>
-      </w:pPr>
-      <w:r>
-        <w:rPr>
-          <w:highlight w:val="yellow"/>
-        </w:rPr>
-        <w:t xml:space="preserve">What am I doing with my life? We are meant to be using the GPS to correct the error in the DR but the GPS itself is </w:t>
-      </w:r>
-      <w:r>
-        <w:rPr>
-          <w:highlight w:val="yellow"/>
-        </w:rPr>
-        <w:t xml:space="preserve">very noisy and has a lot of error. </w:t>
-      </w:r>
-      <w:r>
-        <w:rPr>
-          <w:highlight w:val="yellow"/>
-        </w:rPr>
-        <w:t>So how am I meant to estimate the true performance? Almost needs to be circular correction…</w:t>
-      </w:r>
-      <w:r>
-        <w:rPr>
-          <w:highlight w:val="yellow"/>
-        </w:rPr>
-        <w:t xml:space="preserve"> Ask Gunner.</w:t>
-      </w:r>
-    </w:p>
-    <w:p/>
-    <w:p/>
-    <w:p/>
-    <w:p/>
-    <w:p/>
-    <w:p/>
-    <w:p>
-      <w:pPr>
-        <w:pStyle w:val="ListParagraph"/>
-        <w:numPr>
-          <w:ilvl w:val="0"/>
-          <w:numId w:val="2"/>
-        </w:numPr>
-        <w:rPr>
-          <w:highlight w:val="yellow"/>
-        </w:rPr>
-      </w:pPr>
-      <w:r>
-        <w:rPr>
-          <w:highlight w:val="yellow"/>
-        </w:rPr>
-        <w:lastRenderedPageBreak/>
-        <w:t>I also remembered that he said something about 40Hz lion movement being overkill, which made me think I should summarise it to 1 second averages?</w:t>
-      </w:r>
-    </w:p>
-    <w:p>
-      <w:pPr>
-        <w:rPr>
-          <w:lang w:val="en-US"/>
-        </w:rPr>
-      </w:pPr>
-    </w:p>
     <w:sectPr>
-      <w:headerReference w:type="default" r:id="rId117"/>
+      <w:headerReference w:type="default" r:id="rId118"/>
       <w:pgSz w:w="12240" w:h="15840"/>
       <w:pgMar w:top="720" w:right="720" w:bottom="720" w:left="720" w:header="720" w:footer="720" w:gutter="0"/>
       <w:cols w:space="720"/>
@@ -17435,6 +17517,11 @@
       <w:spacing w:after="100"/>
       <w:ind w:left="240"/>
     </w:pPr>
+  </w:style>
+  <w:style w:type="character" w:customStyle="1" w:styleId="gbqs1kebk5b">
+    <w:name w:val="gbqs1kebk5b"/>
+    <w:basedOn w:val="DefaultParagraphFont"/>
+    <w:rsid w:val="00045C9C"/>
   </w:style>
 </w:styles>
 </file>

</xml_diff>

<commit_message>
update the dead reckoning to quaternions method as well as generating features in hour chunks
</commit_message>
<xml_diff>
--- a/Notes/Worklog.docx
+++ b/Notes/Worklog.docx
@@ -12,7 +12,15 @@
     </w:p>
     <w:p>
       <w:r>
-        <w:t>The impala data was collected by Chris Clemente, Jasmin Annett, Robin Maag, Chris Bird, and Taylor Dick across 3 field deployments in South Africa: 2024, April 2025, and July 2025.  The idea behind the project was to put our custom-designed collars (including an Artemis board which logged GPS and accelerometer data, as well as a stand-alone Axivity) on impalas, record their behaviours with a drone, and then reconstruct their exact behaviours and paths from the acceleration data.</w:t>
+        <w:t xml:space="preserve">The impala data was collected by Chris Clemente, Jasmin Annett, Robin Maag, Chris Bird, and Taylor Dick across 3 field deployments in South Africa: 2024, April 2025, and July 2025.  The idea behind the project was to put our custom-designed collars (including an Artemis board which logged GPS and accelerometer data, as well as a stand-alone </w:t>
+      </w:r>
+      <w:proofErr w:type="spellStart"/>
+      <w:r>
+        <w:t>Axivity</w:t>
+      </w:r>
+      <w:proofErr w:type="spellEnd"/>
+      <w:r>
+        <w:t>) on impalas, record their behaviours with a drone, and then reconstruct their exact behaviours and paths from the acceleration data.</w:t>
       </w:r>
       <w:r>
         <w:t xml:space="preserve"> Luke Jessup and Jojo Schultz begun the process of understanding the dead reckoning workflow.</w:t>
@@ -544,7 +552,23 @@
         <w:t>synchronised</w:t>
       </w:r>
       <w:r>
-        <w:t xml:space="preserve">” boards were, in fact, not time synchronised. ChrisC and I spent several weeks trying to align the board with the associated behavioural videos. That work is detailed in this googledoc: </w:t>
+        <w:t xml:space="preserve">” boards were, in fact, not time synchronised. </w:t>
+      </w:r>
+      <w:proofErr w:type="spellStart"/>
+      <w:r>
+        <w:t>ChrisC</w:t>
+      </w:r>
+      <w:proofErr w:type="spellEnd"/>
+      <w:r>
+        <w:t xml:space="preserve"> and I spent several weeks trying to align the board with the associated behavioural videos. That work is detailed in this </w:t>
+      </w:r>
+      <w:proofErr w:type="spellStart"/>
+      <w:r>
+        <w:t>googledoc</w:t>
+      </w:r>
+      <w:proofErr w:type="spellEnd"/>
+      <w:r>
+        <w:t xml:space="preserve">: </w:t>
       </w:r>
       <w:hyperlink r:id="rId8" w:history="1">
         <w:r>
@@ -672,7 +696,15 @@
         <w:spacing w:line="276" w:lineRule="auto"/>
       </w:pPr>
       <w:r>
-        <w:t xml:space="preserve">What this tells me is that my next most valuable endeavour is to figure out the alignment from Robin’s camera. Going to have a crack at that this arvo. </w:t>
+        <w:t xml:space="preserve">What this tells me is that my next most valuable endeavour is to figure out the alignment from Robin’s camera. Going to have a crack at that this </w:t>
+      </w:r>
+      <w:proofErr w:type="spellStart"/>
+      <w:r>
+        <w:t>arvo</w:t>
+      </w:r>
+      <w:proofErr w:type="spellEnd"/>
+      <w:r>
+        <w:t xml:space="preserve">. </w:t>
       </w:r>
       <w:r>
         <w:rPr>
@@ -837,7 +869,15 @@
         <w:spacing w:line="276" w:lineRule="auto"/>
       </w:pPr>
       <w:r>
-        <w:t>I reverted all my changes to the plotting method and got the same result. Therefore, either the video times are incorrect or the gps times are incorrect.</w:t>
+        <w:t xml:space="preserve">I reverted all my changes to the plotting method and got the same result. Therefore, either the video times are incorrect or the </w:t>
+      </w:r>
+      <w:proofErr w:type="spellStart"/>
+      <w:r>
+        <w:t>gps</w:t>
+      </w:r>
+      <w:proofErr w:type="spellEnd"/>
+      <w:r>
+        <w:t xml:space="preserve"> times are incorrect.</w:t>
       </w:r>
     </w:p>
     <w:p>
@@ -850,7 +890,15 @@
         <w:spacing w:line="276" w:lineRule="auto"/>
       </w:pPr>
       <w:r>
-        <w:t xml:space="preserve">I rechecked the video times and no joy. Therefore, I think the gps times are wrong. Going to revert all the work I did yesterday back to the original versions. </w:t>
+        <w:t xml:space="preserve">I rechecked the video times and no joy. Therefore, I think the </w:t>
+      </w:r>
+      <w:proofErr w:type="spellStart"/>
+      <w:r>
+        <w:t>gps</w:t>
+      </w:r>
+      <w:proofErr w:type="spellEnd"/>
+      <w:r>
+        <w:t xml:space="preserve"> times are wrong. Going to revert all the work I did yesterday back to the original versions. </w:t>
       </w:r>
     </w:p>
     <w:p>
@@ -866,7 +914,15 @@
         <w:sym w:font="Wingdings" w:char="F0E0"/>
       </w:r>
       <w:r>
-        <w:t xml:space="preserve"> Note that the kangaroo data had a lot of error not encountered in the impala data (e.g., multiple board resets, skipped reads, incorrect GPS writes, etc). The fact that using the “cleaning code” I wrote for the kangies on the impala caused the impala to break indicates that there is something wrong with the cleaning code…</w:t>
+        <w:t xml:space="preserve"> Note that the kangaroo data had a lot of error not encountered in the impala data (e.g., multiple board resets, skipped reads, incorrect GPS writes, etc). The fact that using the “cleaning code” I wrote for the </w:t>
+      </w:r>
+      <w:proofErr w:type="spellStart"/>
+      <w:r>
+        <w:t>kangies</w:t>
+      </w:r>
+      <w:proofErr w:type="spellEnd"/>
+      <w:r>
+        <w:t xml:space="preserve"> on the impala caused the impala to break indicates that there is something wrong with the cleaning code…</w:t>
       </w:r>
     </w:p>
     <w:p>
@@ -1010,8 +1066,13 @@
         <w:spacing w:line="276" w:lineRule="auto"/>
       </w:pPr>
       <w:r>
-        <w:t>Reordered the dataset by the reset events and then removed the misreads where there was an uneven increment between the internal and external times on the gps_board</w:t>
-      </w:r>
+        <w:t xml:space="preserve">Reordered the dataset by the reset events and then removed the misreads where there was an uneven increment between the internal and external times on the </w:t>
+      </w:r>
+      <w:proofErr w:type="spellStart"/>
+      <w:r>
+        <w:t>gps_board</w:t>
+      </w:r>
+      <w:proofErr w:type="spellEnd"/>
     </w:p>
     <w:p>
       <w:pPr>
@@ -1063,7 +1124,15 @@
         <w:spacing w:line="276" w:lineRule="auto"/>
       </w:pPr>
       <w:r>
-        <w:t>Below confirmed that the gps timestamps stay the same after writing and reading but also converted everything to numeric to be safe.</w:t>
+        <w:t xml:space="preserve">Below confirmed that the </w:t>
+      </w:r>
+      <w:proofErr w:type="spellStart"/>
+      <w:r>
+        <w:t>gps</w:t>
+      </w:r>
+      <w:proofErr w:type="spellEnd"/>
+      <w:r>
+        <w:t xml:space="preserve"> timestamps stay the same after writing and reading but also converted everything to numeric to be safe.</w:t>
       </w:r>
     </w:p>
     <w:p>
@@ -1238,7 +1307,15 @@
         <w:spacing w:line="276" w:lineRule="auto"/>
       </w:pPr>
       <w:r>
-        <w:t>But somehow they are then getting back mixed together after I combine the accel and gps?</w:t>
+        <w:t xml:space="preserve">But somehow they are then getting back mixed together after I combine the accel and </w:t>
+      </w:r>
+      <w:proofErr w:type="spellStart"/>
+      <w:r>
+        <w:t>gps</w:t>
+      </w:r>
+      <w:proofErr w:type="spellEnd"/>
+      <w:r>
+        <w:t>?</w:t>
       </w:r>
     </w:p>
     <w:p>
@@ -2517,7 +2594,21 @@
         <w:rPr>
           <w:bdr w:val="none" w:sz="0" w:space="0" w:color="auto" w:frame="1"/>
         </w:rPr>
-        <w:t xml:space="preserve"> Not much, tbh.</w:t>
+        <w:t xml:space="preserve"> Not much, </w:t>
+      </w:r>
+      <w:proofErr w:type="spellStart"/>
+      <w:r>
+        <w:rPr>
+          <w:bdr w:val="none" w:sz="0" w:space="0" w:color="auto" w:frame="1"/>
+        </w:rPr>
+        <w:t>tbh</w:t>
+      </w:r>
+      <w:proofErr w:type="spellEnd"/>
+      <w:r>
+        <w:rPr>
+          <w:bdr w:val="none" w:sz="0" w:space="0" w:color="auto" w:frame="1"/>
+        </w:rPr>
+        <w:t>.</w:t>
       </w:r>
     </w:p>
     <w:p>
@@ -2617,7 +2708,15 @@
         </w:numPr>
       </w:pPr>
       <w:r>
-        <w:t>Raw tri-axial magnetometer data (mag.x,y,z)</w:t>
+        <w:t>Raw tri-axial magnetometer data (</w:t>
+      </w:r>
+      <w:proofErr w:type="spellStart"/>
+      <w:r>
+        <w:t>mag.x,y,z</w:t>
+      </w:r>
+      <w:proofErr w:type="spellEnd"/>
+      <w:r>
+        <w:t>)</w:t>
       </w:r>
     </w:p>
     <w:p>
@@ -2629,7 +2728,15 @@
         </w:numPr>
       </w:pPr>
       <w:r>
-        <w:t>Tri-axial static acceleration data (acc.x,y,z) (the smoothed values)</w:t>
+        <w:t>Tri-axial static acceleration data (</w:t>
+      </w:r>
+      <w:proofErr w:type="spellStart"/>
+      <w:r>
+        <w:t>acc.x,y,z</w:t>
+      </w:r>
+      <w:proofErr w:type="spellEnd"/>
+      <w:r>
+        <w:t>) (the smoothed values)</w:t>
       </w:r>
     </w:p>
     <w:p>
@@ -2677,7 +2784,15 @@
         </w:numPr>
       </w:pPr>
       <w:r>
-        <w:t>Estimated pitch offset: Approximately how much was it rotated by? * algorithm = “standard” (standard euler angle approach) or “SAAM” (using quaternions)</w:t>
+        <w:t xml:space="preserve">Estimated pitch offset: Approximately how much was it rotated by? * algorithm = “standard” (standard </w:t>
+      </w:r>
+      <w:proofErr w:type="spellStart"/>
+      <w:r>
+        <w:t>euler</w:t>
+      </w:r>
+      <w:proofErr w:type="spellEnd"/>
+      <w:r>
+        <w:t xml:space="preserve"> angle approach) or “SAAM” (using quaternions)</w:t>
       </w:r>
     </w:p>
     <w:p>
@@ -2819,7 +2934,39 @@
     </w:p>
     <w:p>
       <w:r>
-        <w:t>The default orientation of the Gundog system is North-East-Down (NED) where the axes readings would be X = 0, Y = 0, and Z = -1. Before we could use data from our hand accelerometer we would have to flip it upside down. Some devices may have a different local coordinate frame, e.g., the END (East-North-Down) coordinate system assume the surge dimension of movement is represented by the z-channel, and the sway and heave dimension, by the x- and y-channels, respectively. Providing the original coordinate system allows the Gundogs system to convert your local system to the global system. The Gundog.Compass function comes with three inputs to allow the user to transform their device’s coordinate frame into the NED that the specific Direction Cosine Matrix (DCM) and quaternion augmentation uses to compute angles:‘acc.ref.frame’, ‘positive.g’, and ‘mag.ref.frame’</w:t>
+        <w:t xml:space="preserve">The default orientation of the Gundog system is North-East-Down (NED) where the axes readings would be X = 0, Y = 0, and Z = -1. Before we could use data from our hand accelerometer we would have to flip it upside down. Some devices may have a different local coordinate frame, e.g., the END (East-North-Down) coordinate system assume the surge dimension of movement is represented by the z-channel, and the sway and heave dimension, by the x- and y-channels, respectively. Providing the original coordinate system allows the Gundogs system to convert your local system to the global system. The </w:t>
+      </w:r>
+      <w:proofErr w:type="spellStart"/>
+      <w:r>
+        <w:t>Gundog.Compass</w:t>
+      </w:r>
+      <w:proofErr w:type="spellEnd"/>
+      <w:r>
+        <w:t xml:space="preserve"> function comes with three inputs to allow the user to transform their device’s coordinate frame into the NED that the specific Direction Cosine Matrix (DCM) and quaternion augmentation uses to compute angles:‘</w:t>
+      </w:r>
+      <w:proofErr w:type="spellStart"/>
+      <w:r>
+        <w:t>acc.ref.frame</w:t>
+      </w:r>
+      <w:proofErr w:type="spellEnd"/>
+      <w:r>
+        <w:t>’, ‘</w:t>
+      </w:r>
+      <w:proofErr w:type="spellStart"/>
+      <w:r>
+        <w:t>positive.g</w:t>
+      </w:r>
+      <w:proofErr w:type="spellEnd"/>
+      <w:r>
+        <w:t>’, and ‘</w:t>
+      </w:r>
+      <w:proofErr w:type="spellStart"/>
+      <w:r>
+        <w:t>mag.ref.frame</w:t>
+      </w:r>
+      <w:proofErr w:type="spellEnd"/>
+      <w:r>
+        <w:t>’</w:t>
       </w:r>
     </w:p>
     <w:p>
@@ -3199,7 +3346,21 @@
         <w:rPr>
           <w:highlight w:val="yellow"/>
         </w:rPr>
-        <w:t>by 0.15 to give me what jojo had</w:t>
+        <w:t xml:space="preserve">by 0.15 to give me what </w:t>
+      </w:r>
+      <w:proofErr w:type="spellStart"/>
+      <w:r>
+        <w:rPr>
+          <w:highlight w:val="yellow"/>
+        </w:rPr>
+        <w:t>jojo</w:t>
+      </w:r>
+      <w:proofErr w:type="spellEnd"/>
+      <w:r>
+        <w:rPr>
+          <w:highlight w:val="yellow"/>
+        </w:rPr>
+        <w:t xml:space="preserve"> had</w:t>
       </w:r>
       <w:r>
         <w:t>. So…</w:t>
@@ -3214,12 +3375,101 @@
           <w:szCs w:val="20"/>
         </w:rPr>
       </w:pPr>
+      <w:proofErr w:type="spellStart"/>
       <w:r>
         <w:rPr>
           <w:sz w:val="20"/>
           <w:szCs w:val="20"/>
         </w:rPr>
-        <w:t>mine.flat[, c("RawAX", "RawAY", "RawAZ")] &lt;- mine.flat[, c("RawAX", "RawAY", "RawAZ")] / 2048</w:t>
+        <w:t>mine.flat</w:t>
+      </w:r>
+      <w:proofErr w:type="spellEnd"/>
+      <w:r>
+        <w:rPr>
+          <w:sz w:val="20"/>
+          <w:szCs w:val="20"/>
+        </w:rPr>
+        <w:t>[, c("</w:t>
+      </w:r>
+      <w:proofErr w:type="spellStart"/>
+      <w:r>
+        <w:rPr>
+          <w:sz w:val="20"/>
+          <w:szCs w:val="20"/>
+        </w:rPr>
+        <w:t>RawAX</w:t>
+      </w:r>
+      <w:proofErr w:type="spellEnd"/>
+      <w:r>
+        <w:rPr>
+          <w:sz w:val="20"/>
+          <w:szCs w:val="20"/>
+        </w:rPr>
+        <w:t>", "RawAY", "</w:t>
+      </w:r>
+      <w:proofErr w:type="spellStart"/>
+      <w:r>
+        <w:rPr>
+          <w:sz w:val="20"/>
+          <w:szCs w:val="20"/>
+        </w:rPr>
+        <w:t>RawAZ</w:t>
+      </w:r>
+      <w:proofErr w:type="spellEnd"/>
+      <w:r>
+        <w:rPr>
+          <w:sz w:val="20"/>
+          <w:szCs w:val="20"/>
+        </w:rPr>
+        <w:t xml:space="preserve">")] &lt;- </w:t>
+      </w:r>
+      <w:proofErr w:type="spellStart"/>
+      <w:r>
+        <w:rPr>
+          <w:sz w:val="20"/>
+          <w:szCs w:val="20"/>
+        </w:rPr>
+        <w:t>mine.flat</w:t>
+      </w:r>
+      <w:proofErr w:type="spellEnd"/>
+      <w:r>
+        <w:rPr>
+          <w:sz w:val="20"/>
+          <w:szCs w:val="20"/>
+        </w:rPr>
+        <w:t>[, c("</w:t>
+      </w:r>
+      <w:proofErr w:type="spellStart"/>
+      <w:r>
+        <w:rPr>
+          <w:sz w:val="20"/>
+          <w:szCs w:val="20"/>
+        </w:rPr>
+        <w:t>RawAX</w:t>
+      </w:r>
+      <w:proofErr w:type="spellEnd"/>
+      <w:r>
+        <w:rPr>
+          <w:sz w:val="20"/>
+          <w:szCs w:val="20"/>
+        </w:rPr>
+        <w:t>", "RawAY", "</w:t>
+      </w:r>
+      <w:proofErr w:type="spellStart"/>
+      <w:r>
+        <w:rPr>
+          <w:sz w:val="20"/>
+          <w:szCs w:val="20"/>
+        </w:rPr>
+        <w:t>RawAZ</w:t>
+      </w:r>
+      <w:proofErr w:type="spellEnd"/>
+      <w:r>
+        <w:rPr>
+          <w:sz w:val="20"/>
+          <w:szCs w:val="20"/>
+        </w:rPr>
+        <w:t>")] / 2048</w:t>
       </w:r>
     </w:p>
     <w:p>
@@ -3231,12 +3481,133 @@
           <w:szCs w:val="20"/>
         </w:rPr>
       </w:pPr>
+      <w:proofErr w:type="spellStart"/>
       <w:r>
         <w:rPr>
           <w:sz w:val="20"/>
           <w:szCs w:val="20"/>
         </w:rPr>
-        <w:t>mine.flat[, c("RawMX", "RawMY", "RawMZ")] &lt;- mine.flat[, c("RawMX", "RawMY", "RawMZ")] * 0.15</w:t>
+        <w:t>mine.flat</w:t>
+      </w:r>
+      <w:proofErr w:type="spellEnd"/>
+      <w:r>
+        <w:rPr>
+          <w:sz w:val="20"/>
+          <w:szCs w:val="20"/>
+        </w:rPr>
+        <w:t>[, c("</w:t>
+      </w:r>
+      <w:proofErr w:type="spellStart"/>
+      <w:r>
+        <w:rPr>
+          <w:sz w:val="20"/>
+          <w:szCs w:val="20"/>
+        </w:rPr>
+        <w:t>RawMX</w:t>
+      </w:r>
+      <w:proofErr w:type="spellEnd"/>
+      <w:r>
+        <w:rPr>
+          <w:sz w:val="20"/>
+          <w:szCs w:val="20"/>
+        </w:rPr>
+        <w:t>", "</w:t>
+      </w:r>
+      <w:proofErr w:type="spellStart"/>
+      <w:r>
+        <w:rPr>
+          <w:sz w:val="20"/>
+          <w:szCs w:val="20"/>
+        </w:rPr>
+        <w:t>RawMY</w:t>
+      </w:r>
+      <w:proofErr w:type="spellEnd"/>
+      <w:r>
+        <w:rPr>
+          <w:sz w:val="20"/>
+          <w:szCs w:val="20"/>
+        </w:rPr>
+        <w:t>", "</w:t>
+      </w:r>
+      <w:proofErr w:type="spellStart"/>
+      <w:r>
+        <w:rPr>
+          <w:sz w:val="20"/>
+          <w:szCs w:val="20"/>
+        </w:rPr>
+        <w:t>RawMZ</w:t>
+      </w:r>
+      <w:proofErr w:type="spellEnd"/>
+      <w:r>
+        <w:rPr>
+          <w:sz w:val="20"/>
+          <w:szCs w:val="20"/>
+        </w:rPr>
+        <w:t xml:space="preserve">")] &lt;- </w:t>
+      </w:r>
+      <w:proofErr w:type="spellStart"/>
+      <w:r>
+        <w:rPr>
+          <w:sz w:val="20"/>
+          <w:szCs w:val="20"/>
+        </w:rPr>
+        <w:t>mine.flat</w:t>
+      </w:r>
+      <w:proofErr w:type="spellEnd"/>
+      <w:r>
+        <w:rPr>
+          <w:sz w:val="20"/>
+          <w:szCs w:val="20"/>
+        </w:rPr>
+        <w:t>[, c("</w:t>
+      </w:r>
+      <w:proofErr w:type="spellStart"/>
+      <w:r>
+        <w:rPr>
+          <w:sz w:val="20"/>
+          <w:szCs w:val="20"/>
+        </w:rPr>
+        <w:t>RawMX</w:t>
+      </w:r>
+      <w:proofErr w:type="spellEnd"/>
+      <w:r>
+        <w:rPr>
+          <w:sz w:val="20"/>
+          <w:szCs w:val="20"/>
+        </w:rPr>
+        <w:t>", "</w:t>
+      </w:r>
+      <w:proofErr w:type="spellStart"/>
+      <w:r>
+        <w:rPr>
+          <w:sz w:val="20"/>
+          <w:szCs w:val="20"/>
+        </w:rPr>
+        <w:t>RawMY</w:t>
+      </w:r>
+      <w:proofErr w:type="spellEnd"/>
+      <w:r>
+        <w:rPr>
+          <w:sz w:val="20"/>
+          <w:szCs w:val="20"/>
+        </w:rPr>
+        <w:t>", "</w:t>
+      </w:r>
+      <w:proofErr w:type="spellStart"/>
+      <w:r>
+        <w:rPr>
+          <w:sz w:val="20"/>
+          <w:szCs w:val="20"/>
+        </w:rPr>
+        <w:t>RawMZ</w:t>
+      </w:r>
+      <w:proofErr w:type="spellEnd"/>
+      <w:r>
+        <w:rPr>
+          <w:sz w:val="20"/>
+          <w:szCs w:val="20"/>
+        </w:rPr>
+        <w:t>")] * 0.15</w:t>
       </w:r>
     </w:p>
     <w:p>
@@ -3248,12 +3619,37 @@
           <w:szCs w:val="20"/>
         </w:rPr>
       </w:pPr>
+      <w:proofErr w:type="spellStart"/>
       <w:r>
         <w:rPr>
           <w:sz w:val="20"/>
           <w:szCs w:val="20"/>
         </w:rPr>
-        <w:t>jojo_df &lt;- df.flat[1:77009, ]</w:t>
+        <w:t>jojo_df</w:t>
+      </w:r>
+      <w:proofErr w:type="spellEnd"/>
+      <w:r>
+        <w:rPr>
+          <w:sz w:val="20"/>
+          <w:szCs w:val="20"/>
+        </w:rPr>
+        <w:t xml:space="preserve"> &lt;- </w:t>
+      </w:r>
+      <w:proofErr w:type="spellStart"/>
+      <w:r>
+        <w:rPr>
+          <w:sz w:val="20"/>
+          <w:szCs w:val="20"/>
+        </w:rPr>
+        <w:t>df.flat</w:t>
+      </w:r>
+      <w:proofErr w:type="spellEnd"/>
+      <w:r>
+        <w:rPr>
+          <w:sz w:val="20"/>
+          <w:szCs w:val="20"/>
+        </w:rPr>
+        <w:t>[1:77009, ]</w:t>
       </w:r>
     </w:p>
     <w:p>
@@ -3265,12 +3661,37 @@
           <w:szCs w:val="20"/>
         </w:rPr>
       </w:pPr>
+      <w:proofErr w:type="spellStart"/>
       <w:r>
         <w:rPr>
           <w:sz w:val="20"/>
           <w:szCs w:val="20"/>
         </w:rPr>
-        <w:t>oak_df &lt;- mine.flat[3064:80072, ]</w:t>
+        <w:t>oak_df</w:t>
+      </w:r>
+      <w:proofErr w:type="spellEnd"/>
+      <w:r>
+        <w:rPr>
+          <w:sz w:val="20"/>
+          <w:szCs w:val="20"/>
+        </w:rPr>
+        <w:t xml:space="preserve"> &lt;- </w:t>
+      </w:r>
+      <w:proofErr w:type="spellStart"/>
+      <w:r>
+        <w:rPr>
+          <w:sz w:val="20"/>
+          <w:szCs w:val="20"/>
+        </w:rPr>
+        <w:t>mine.flat</w:t>
+      </w:r>
+      <w:proofErr w:type="spellEnd"/>
+      <w:r>
+        <w:rPr>
+          <w:sz w:val="20"/>
+          <w:szCs w:val="20"/>
+        </w:rPr>
+        <w:t>[3064:80072, ]</w:t>
       </w:r>
     </w:p>
     <w:p>
@@ -3424,7 +3845,15 @@
         </w:numPr>
       </w:pPr>
       <w:r>
-        <w:t xml:space="preserve">I think I should presume that they’re not. That is, jojo figured out that the </w:t>
+        <w:t xml:space="preserve">I think I should presume that they’re not. That is, </w:t>
+      </w:r>
+      <w:proofErr w:type="spellStart"/>
+      <w:r>
+        <w:t>jojo</w:t>
+      </w:r>
+      <w:proofErr w:type="spellEnd"/>
+      <w:r>
+        <w:t xml:space="preserve"> figured out that the </w:t>
       </w:r>
       <w:r>
         <w:t>accel was NED and the mag was NWU. Whatever my accel orientation is determined to be, the mag will probably be an equivalent rotation.</w:t>
@@ -3482,7 +3911,15 @@
         <w:t xml:space="preserve"> the orientation</w:t>
       </w:r>
       <w:r>
-        <w:t xml:space="preserve"> of the accels are</w:t>
+        <w:t xml:space="preserve"> of the </w:t>
+      </w:r>
+      <w:proofErr w:type="spellStart"/>
+      <w:r>
+        <w:t>accels</w:t>
+      </w:r>
+      <w:proofErr w:type="spellEnd"/>
+      <w:r>
+        <w:t xml:space="preserve"> are</w:t>
       </w:r>
       <w:r>
         <w:t xml:space="preserve"> written on the </w:t>
@@ -3735,10 +4172,26 @@
         </w:numPr>
       </w:pPr>
       <w:r>
-        <w:t xml:space="preserve">Was having an issue where there were a lot of unmatched gps pings. </w:t>
-      </w:r>
-      <w:r>
-        <w:t>Fixed this by switching the order of the kets for the rolling join. But I nearly kms before figuring that out.</w:t>
+        <w:t xml:space="preserve">Was having an issue where there were a lot of unmatched </w:t>
+      </w:r>
+      <w:proofErr w:type="spellStart"/>
+      <w:r>
+        <w:t>gps</w:t>
+      </w:r>
+      <w:proofErr w:type="spellEnd"/>
+      <w:r>
+        <w:t xml:space="preserve"> pings. </w:t>
+      </w:r>
+      <w:r>
+        <w:t xml:space="preserve">Fixed this by switching the order of the </w:t>
+      </w:r>
+      <w:proofErr w:type="spellStart"/>
+      <w:r>
+        <w:t>kets</w:t>
+      </w:r>
+      <w:proofErr w:type="spellEnd"/>
+      <w:r>
+        <w:t xml:space="preserve"> for the rolling join. But I nearly kms before figuring that out.</w:t>
       </w:r>
     </w:p>
     <w:p>
@@ -3916,7 +4369,15 @@
         <w:t>Unfortunately,</w:t>
       </w:r>
       <w:r>
-        <w:t xml:space="preserve"> I didn’t wait long enough to get a proper gps </w:t>
+        <w:t xml:space="preserve"> I didn’t wait long enough to get a proper </w:t>
+      </w:r>
+      <w:proofErr w:type="spellStart"/>
+      <w:r>
+        <w:t>gps</w:t>
+      </w:r>
+      <w:proofErr w:type="spellEnd"/>
+      <w:r>
+        <w:t xml:space="preserve"> </w:t>
       </w:r>
       <w:r>
         <w:t>hit but</w:t>
@@ -4026,7 +4487,15 @@
         </w:numPr>
       </w:pPr>
       <w:r>
-        <w:t xml:space="preserve">If the original collar trials had an acc of NED and a mag of NWU then… I need to reverse the Y and Z directions for the mag of the true collar orientation. So would be… DES. </w:t>
+        <w:t xml:space="preserve">If the original collar trials had an </w:t>
+      </w:r>
+      <w:proofErr w:type="spellStart"/>
+      <w:r>
+        <w:t>acc</w:t>
+      </w:r>
+      <w:proofErr w:type="spellEnd"/>
+      <w:r>
+        <w:t xml:space="preserve"> of NED and a mag of NWU then… I need to reverse the Y and Z directions for the mag of the true collar orientation. So would be… DES. </w:t>
       </w:r>
     </w:p>
     <w:p>
@@ -4177,7 +4646,23 @@
         </w:numPr>
       </w:pPr>
       <w:r>
-        <w:t xml:space="preserve">Basically, the calibration event occurs at 28.06.24 18:16:00 local time but the first recorded gps time is "2024-06-28 16:28:48 UTC" (about 10 minutes after). Jaz says its not possible for the calibration event to have occurred before the first ping… but </w:t>
+        <w:t xml:space="preserve">Basically, the calibration event occurs at 28.06.24 18:16:00 local time but the first recorded </w:t>
+      </w:r>
+      <w:proofErr w:type="spellStart"/>
+      <w:r>
+        <w:t>gps</w:t>
+      </w:r>
+      <w:proofErr w:type="spellEnd"/>
+      <w:r>
+        <w:t xml:space="preserve"> time is "2024-06-28 16:28:48 UTC" (about 10 minutes after). Jaz says </w:t>
+      </w:r>
+      <w:proofErr w:type="spellStart"/>
+      <w:r>
+        <w:t>its</w:t>
+      </w:r>
+      <w:proofErr w:type="spellEnd"/>
+      <w:r>
+        <w:t xml:space="preserve"> not possible for the calibration event to have occurred before the first ping… but </w:t>
       </w:r>
       <w:r>
         <w:t>stuff</w:t>
@@ -4246,7 +4731,15 @@
         <w:t>th</w:t>
       </w:r>
       <w:r>
-        <w:t xml:space="preserve"> (first gps hit)</w:t>
+        <w:t xml:space="preserve"> (first </w:t>
+      </w:r>
+      <w:proofErr w:type="spellStart"/>
+      <w:r>
+        <w:t>gps</w:t>
+      </w:r>
+      <w:proofErr w:type="spellEnd"/>
+      <w:r>
+        <w:t xml:space="preserve"> hit)</w:t>
       </w:r>
     </w:p>
     <w:p>
@@ -4258,10 +4751,26 @@
         </w:numPr>
       </w:pPr>
       <w:r>
-        <w:t xml:space="preserve">Yep. Even when I don’t crop the accel, the interpolation sends it forward in time from the first gps hit. Interesting. </w:t>
-      </w:r>
-      <w:r>
-        <w:t>Where the time jumps backwards in the first gps hit. So what the heck went wrong with the reverse interpolation?</w:t>
+        <w:t xml:space="preserve">Yep. Even when I don’t crop the accel, the interpolation sends it forward in time from the first </w:t>
+      </w:r>
+      <w:proofErr w:type="spellStart"/>
+      <w:r>
+        <w:t>gps</w:t>
+      </w:r>
+      <w:proofErr w:type="spellEnd"/>
+      <w:r>
+        <w:t xml:space="preserve"> hit. Interesting. </w:t>
+      </w:r>
+      <w:r>
+        <w:t xml:space="preserve">Where the time jumps backwards in the first </w:t>
+      </w:r>
+      <w:proofErr w:type="spellStart"/>
+      <w:r>
+        <w:t>gps</w:t>
+      </w:r>
+      <w:proofErr w:type="spellEnd"/>
+      <w:r>
+        <w:t xml:space="preserve"> hit. So what the heck went wrong with the reverse interpolation?</w:t>
       </w:r>
     </w:p>
     <w:p>
@@ -4273,7 +4782,23 @@
         </w:numPr>
       </w:pPr>
       <w:r>
-        <w:t xml:space="preserve">RTC accel (left) and the gps times look correct, however the conversion to the gps time using interpolation is way out (right) where it jumps several days. </w:t>
+        <w:t xml:space="preserve">RTC accel (left) and the </w:t>
+      </w:r>
+      <w:proofErr w:type="spellStart"/>
+      <w:r>
+        <w:t>gps</w:t>
+      </w:r>
+      <w:proofErr w:type="spellEnd"/>
+      <w:r>
+        <w:t xml:space="preserve"> times look correct, however the conversion to the </w:t>
+      </w:r>
+      <w:proofErr w:type="spellStart"/>
+      <w:r>
+        <w:t>gps</w:t>
+      </w:r>
+      <w:proofErr w:type="spellEnd"/>
+      <w:r>
+        <w:t xml:space="preserve"> time using interpolation is way out (right) where it jumps several days. </w:t>
       </w:r>
     </w:p>
     <w:p>
@@ -4434,7 +4959,23 @@
         </w:numPr>
       </w:pPr>
       <w:r>
-        <w:t>Ah. So. The GPS only had 1 reset but the accel had 2 and it cropped the accel too small… So. That is an issue. I have to change my joining logic.</w:t>
+        <w:t xml:space="preserve">Ah. </w:t>
+      </w:r>
+      <w:proofErr w:type="spellStart"/>
+      <w:r>
+        <w:t>So.</w:t>
+      </w:r>
+      <w:proofErr w:type="spellEnd"/>
+      <w:r>
+        <w:t xml:space="preserve"> The GPS only had 1 reset but the accel had 2 and it cropped the accel too small… </w:t>
+      </w:r>
+      <w:proofErr w:type="spellStart"/>
+      <w:r>
+        <w:t>So.</w:t>
+      </w:r>
+      <w:proofErr w:type="spellEnd"/>
+      <w:r>
+        <w:t xml:space="preserve"> That is an issue. I have to change my joining logic.</w:t>
       </w:r>
     </w:p>
     <w:p>
@@ -4446,7 +4987,23 @@
         </w:numPr>
       </w:pPr>
       <w:r>
-        <w:t>Changed the gps reset_events manually over to the longest accel sampling period number.</w:t>
+        <w:t xml:space="preserve">Changed the </w:t>
+      </w:r>
+      <w:proofErr w:type="spellStart"/>
+      <w:r>
+        <w:t>gps</w:t>
+      </w:r>
+      <w:proofErr w:type="spellEnd"/>
+      <w:r>
+        <w:t xml:space="preserve"> </w:t>
+      </w:r>
+      <w:proofErr w:type="spellStart"/>
+      <w:r>
+        <w:t>reset_events</w:t>
+      </w:r>
+      <w:proofErr w:type="spellEnd"/>
+      <w:r>
+        <w:t xml:space="preserve"> manually over to the longest accel sampling period number.</w:t>
       </w:r>
     </w:p>
     <w:p>
@@ -4481,8 +5038,13 @@
           <w:numId w:val="2"/>
         </w:numPr>
       </w:pPr>
-      <w:r>
-        <w:t>Jk. The next collar ran into a new problem. It never ends with this BS.</w:t>
+      <w:proofErr w:type="spellStart"/>
+      <w:r>
+        <w:t>Jk</w:t>
+      </w:r>
+      <w:proofErr w:type="spellEnd"/>
+      <w:r>
+        <w:t>. The next collar ran into a new problem. It never ends with this BS.</w:t>
       </w:r>
     </w:p>
     <w:p>
@@ -4633,7 +5195,15 @@
         </w:numPr>
       </w:pPr>
       <w:r>
-        <w:t>So am I meant to remove these files or not? When I leave them in, there’s issues. When I take them out, it works… But they seeeeeem like they’re correct</w:t>
+        <w:t xml:space="preserve">So am I meant to remove these files or not? When I leave them in, there’s issues. When I take them out, it works… But they </w:t>
+      </w:r>
+      <w:proofErr w:type="spellStart"/>
+      <w:r>
+        <w:t>seeeeeem</w:t>
+      </w:r>
+      <w:proofErr w:type="spellEnd"/>
+      <w:r>
+        <w:t xml:space="preserve"> like they’re correct</w:t>
       </w:r>
       <w:r>
         <w:t>? Until we understand how they got there, I’m reluctant to do anything</w:t>
@@ -5033,7 +5603,15 @@
         </w:numPr>
       </w:pPr>
       <w:r>
-        <w:t>“good mag cal (ensure not wearing watches /have phones/any magnetic interfering stuff on person etc. nearby when doing this)”</w:t>
+        <w:t xml:space="preserve">“good mag </w:t>
+      </w:r>
+      <w:proofErr w:type="spellStart"/>
+      <w:r>
+        <w:t>cal</w:t>
+      </w:r>
+      <w:proofErr w:type="spellEnd"/>
+      <w:r>
+        <w:t xml:space="preserve"> (ensure not wearing watches /have phones/any magnetic interfering stuff on person etc. nearby when doing this)”</w:t>
       </w:r>
     </w:p>
     <w:p>
@@ -5045,7 +5623,23 @@
         </w:numPr>
       </w:pPr>
       <w:r>
-        <w:t xml:space="preserve">“In terms of movement bouts, the simple approach would be to use some sort of acceleration magnitude threshold (e.g. VeDBA)... but for example, something like a kangaroo should be very obvious with jumping behaviour that should come out in acceleration traces as clear stylised patterns which could be manually discerned or via machine learning if you were able to do some groundtruthing of behaviours during the data acquisition period.” </w:t>
+        <w:t xml:space="preserve">“In terms of movement bouts, the simple approach would be to use some sort of acceleration magnitude threshold (e.g. </w:t>
+      </w:r>
+      <w:proofErr w:type="spellStart"/>
+      <w:r>
+        <w:t>VeDBA</w:t>
+      </w:r>
+      <w:proofErr w:type="spellEnd"/>
+      <w:r>
+        <w:t xml:space="preserve">)... but for example, something like a kangaroo should be very obvious with jumping behaviour that should come out in acceleration traces as clear stylised patterns which could be manually discerned or via machine learning if you were able to do some </w:t>
+      </w:r>
+      <w:proofErr w:type="spellStart"/>
+      <w:r>
+        <w:t>groundtruthing</w:t>
+      </w:r>
+      <w:proofErr w:type="spellEnd"/>
+      <w:r>
+        <w:t xml:space="preserve"> of behaviours during the data acquisition period.” </w:t>
       </w:r>
       <w:r>
         <w:sym w:font="Wingdings" w:char="F0E0"/>
@@ -5075,13 +5669,29 @@
         </w:numPr>
       </w:pPr>
       <w:r>
-        <w:t xml:space="preserve">“When the penguin is walking, the tag will be nearly vertical, while during swimming, it will be more horizontal. In both cases, the tag’s coordinate frame relative to the penguin’s natural movement (and the ground or water surface) will be different. To ensure accurate heading calculations, I would need to define different tag coordinate systems for walking and swimming and compute the heading separately for each period—on land and at sea—otherwise, my dead-reckoned (DR) tracks could be very innacurate.” </w:t>
+        <w:t xml:space="preserve">“When the penguin is walking, the tag will be nearly vertical, while during swimming, it will be more horizontal. In both cases, the tag’s coordinate frame relative to the penguin’s natural movement (and the ground or water surface) will be different. To ensure accurate heading calculations, I would need to define different tag coordinate systems for walking and swimming and compute the heading separately for each period—on land and at sea—otherwise, my dead-reckoned (DR) tracks could be very </w:t>
+      </w:r>
+      <w:proofErr w:type="spellStart"/>
+      <w:r>
+        <w:t>innacurate</w:t>
+      </w:r>
+      <w:proofErr w:type="spellEnd"/>
+      <w:r>
+        <w:t xml:space="preserve">.” </w:t>
       </w:r>
       <w:r>
         <w:sym w:font="Wingdings" w:char="F0E0"/>
       </w:r>
       <w:r>
-        <w:t xml:space="preserve"> no WONDER my flippy flippy stuff doesn’t work.</w:t>
+        <w:t xml:space="preserve"> no WONDER my flippy </w:t>
+      </w:r>
+      <w:proofErr w:type="spellStart"/>
+      <w:r>
+        <w:t>flippy</w:t>
+      </w:r>
+      <w:proofErr w:type="spellEnd"/>
+      <w:r>
+        <w:t xml:space="preserve"> stuff doesn’t work.</w:t>
       </w:r>
     </w:p>
     <w:p>
@@ -5093,7 +5703,15 @@
         </w:numPr>
       </w:pPr>
       <w:r>
-        <w:t xml:space="preserve">“If you know there’s a specific yaw offset in the tag placement, you can specify it in the compass function. If you’re unsure, you could compare the heading correction factors from Gundog.Tracks. If the headings are consistently biased in one direction, it could indicate a tag yaw offset or the need for magnetic declination adjustment. But again, if the tag’s yaw offset is minor and consistent, it’s not essential to correct this, as the dead-reckoned track will be consistently biased (in theory, the patterns and scales of tortuosity between GPS points should remain the same, just </w:t>
+        <w:t xml:space="preserve">“If you know there’s a specific yaw offset in the tag placement, you can specify it in the compass function. If you’re unsure, you could compare the heading correction factors from </w:t>
+      </w:r>
+      <w:proofErr w:type="spellStart"/>
+      <w:r>
+        <w:t>Gundog.Tracks</w:t>
+      </w:r>
+      <w:proofErr w:type="spellEnd"/>
+      <w:r>
+        <w:t xml:space="preserve">. If the headings are consistently biased in one direction, it could indicate a tag yaw offset or the need for magnetic declination adjustment. But again, if the tag’s yaw offset is minor and consistent, it’s not essential to correct this, as the dead-reckoned track will be consistently biased (in theory, the patterns and scales of tortuosity between GPS points should remain the same, just </w:t>
       </w:r>
       <w:r>
         <w:lastRenderedPageBreak/>
@@ -5109,7 +5727,31 @@
         </w:numPr>
       </w:pPr>
       <w:r>
-        <w:t>“What I suggest is to first run the compass function without any offsets applied to derive the pitch and roll angles. Then, determine the mean values of both during periods where you believe the animal and collar are in a normal position, such as during low-activity, steady-state behavior. Once you have these values, re-run the function and input them as the 'pitch.offset' and 'roll.offset' parameters.”</w:t>
+        <w:t xml:space="preserve">“What I suggest is to first run the compass function without any offsets applied to derive the pitch and roll angles. Then, determine the mean values of both during periods where you believe the animal and collar are in a normal position, such as during low-activity, steady-state </w:t>
+      </w:r>
+      <w:proofErr w:type="spellStart"/>
+      <w:r>
+        <w:t>behavior</w:t>
+      </w:r>
+      <w:proofErr w:type="spellEnd"/>
+      <w:r>
+        <w:t>. Once you have these values, re-run the function and input them as the '</w:t>
+      </w:r>
+      <w:proofErr w:type="spellStart"/>
+      <w:r>
+        <w:t>pitch.offset</w:t>
+      </w:r>
+      <w:proofErr w:type="spellEnd"/>
+      <w:r>
+        <w:t>' and '</w:t>
+      </w:r>
+      <w:proofErr w:type="spellStart"/>
+      <w:r>
+        <w:t>roll.offset</w:t>
+      </w:r>
+      <w:proofErr w:type="spellEnd"/>
+      <w:r>
+        <w:t>' parameters.”</w:t>
       </w:r>
     </w:p>
     <w:p>
@@ -5121,7 +5763,15 @@
         </w:numPr>
       </w:pPr>
       <w:r>
-        <w:t>“if you supply a positive pitch offset value of 45°, this reflects that the device is pitched up by 45° from the level, and the function will de-rotate the supplied (smoothed) acc and mag (normalised) values by this amount. Similarly, a positive roll value indicates a rightward tilt (bank angle), and a positive yaw value represents a clockwise rotational offset”</w:t>
+        <w:t xml:space="preserve">“if you supply a positive pitch offset value of 45°, this reflects that the device is pitched up by 45° from the level, and the function will de-rotate the supplied (smoothed) </w:t>
+      </w:r>
+      <w:proofErr w:type="spellStart"/>
+      <w:r>
+        <w:t>acc</w:t>
+      </w:r>
+      <w:proofErr w:type="spellEnd"/>
+      <w:r>
+        <w:t xml:space="preserve"> and mag (normalised) values by this amount. Similarly, a positive roll value indicates a rightward tilt (bank angle), and a positive yaw value represents a clockwise rotational offset”</w:t>
       </w:r>
     </w:p>
     <w:p>
@@ -5174,7 +5824,95 @@
         </w:numPr>
       </w:pPr>
       <w:r>
-        <w:t>“The short answer is, yes - if a wrong ref frame was chosen then DR path wil be innacurate. But comparing subsets with GPS pre-correction will help debug if chosen orientation was correct. The patterns and directions of travel should be similar even if scale is not when compared to GPS. I had some lions where I had to 'figure' out the orientation post release. But visually it should be easy to decipher the heave axis of movmement in acc and mag (acc will be the one closest to +/-1 g most of the time, and mag will the one changing the least)... In terms of deciphering the acc/mag surge and sway dimensions, this may be more challenging. But for the acc, you would expect greater variation in surge dimension because they stick their head to ground to forage and then stick their head back up when travelling and vigalence, so that may help. If mag is different orientation set up to acc, then its worth just checking if you switch the surge/sway orientations then which one produces most realsitic DR track relative to GPS... by deciphering the heave axis and dimension of measured g, you already have homed in on just a few possible orientations it could be...”</w:t>
+        <w:t xml:space="preserve">“The short answer is, yes - if a wrong ref frame was chosen then DR path </w:t>
+      </w:r>
+      <w:proofErr w:type="spellStart"/>
+      <w:r>
+        <w:t>wil</w:t>
+      </w:r>
+      <w:proofErr w:type="spellEnd"/>
+      <w:r>
+        <w:t xml:space="preserve"> be </w:t>
+      </w:r>
+      <w:proofErr w:type="spellStart"/>
+      <w:r>
+        <w:t>innacurate</w:t>
+      </w:r>
+      <w:proofErr w:type="spellEnd"/>
+      <w:r>
+        <w:t xml:space="preserve">. But comparing subsets with GPS pre-correction will help debug if chosen orientation was correct. The patterns and directions of travel should be similar even if scale is not when compared to GPS. I had some lions where I had to 'figure' out the orientation post release. But visually it should be easy to decipher the heave axis of </w:t>
+      </w:r>
+      <w:proofErr w:type="spellStart"/>
+      <w:r>
+        <w:t>movmement</w:t>
+      </w:r>
+      <w:proofErr w:type="spellEnd"/>
+      <w:r>
+        <w:t xml:space="preserve"> in </w:t>
+      </w:r>
+      <w:proofErr w:type="spellStart"/>
+      <w:r>
+        <w:t>acc</w:t>
+      </w:r>
+      <w:proofErr w:type="spellEnd"/>
+      <w:r>
+        <w:t xml:space="preserve"> and mag (</w:t>
+      </w:r>
+      <w:proofErr w:type="spellStart"/>
+      <w:r>
+        <w:t>acc</w:t>
+      </w:r>
+      <w:proofErr w:type="spellEnd"/>
+      <w:r>
+        <w:t xml:space="preserve"> will be the one closest to +/-1 g most of the time, and mag will the one changing the least)... In terms of deciphering the </w:t>
+      </w:r>
+      <w:proofErr w:type="spellStart"/>
+      <w:r>
+        <w:t>acc</w:t>
+      </w:r>
+      <w:proofErr w:type="spellEnd"/>
+      <w:r>
+        <w:t xml:space="preserve">/mag surge and sway dimensions, this may be more challenging. But for the </w:t>
+      </w:r>
+      <w:proofErr w:type="spellStart"/>
+      <w:r>
+        <w:t>acc</w:t>
+      </w:r>
+      <w:proofErr w:type="spellEnd"/>
+      <w:r>
+        <w:t xml:space="preserve">, you would expect greater variation in surge dimension because they stick their head to ground to forage and then stick their head back up when travelling and </w:t>
+      </w:r>
+      <w:proofErr w:type="spellStart"/>
+      <w:r>
+        <w:t>vigalence</w:t>
+      </w:r>
+      <w:proofErr w:type="spellEnd"/>
+      <w:r>
+        <w:t xml:space="preserve">, so that may help. If mag is different orientation set up to </w:t>
+      </w:r>
+      <w:proofErr w:type="spellStart"/>
+      <w:r>
+        <w:t>acc</w:t>
+      </w:r>
+      <w:proofErr w:type="spellEnd"/>
+      <w:r>
+        <w:t xml:space="preserve">, then </w:t>
+      </w:r>
+      <w:proofErr w:type="spellStart"/>
+      <w:r>
+        <w:t>its</w:t>
+      </w:r>
+      <w:proofErr w:type="spellEnd"/>
+      <w:r>
+        <w:t xml:space="preserve"> worth just checking if you switch the surge/sway orientations then which one produces most </w:t>
+      </w:r>
+      <w:proofErr w:type="spellStart"/>
+      <w:r>
+        <w:t>realsitic</w:t>
+      </w:r>
+      <w:proofErr w:type="spellEnd"/>
+      <w:r>
+        <w:t xml:space="preserve"> DR track relative to GPS... by deciphering the heave axis and dimension of measured g, you already have homed in on just a few possible orientations it could be...”</w:t>
       </w:r>
     </w:p>
     <w:p>
@@ -5236,8 +5974,16 @@
           <w:rPr>
             <w:rStyle w:val="Hyperlink"/>
           </w:rPr>
-          <w:t>Dead-reckoning animal movements in R: a reappraisal using Gundog.Tracks</w:t>
+          <w:t xml:space="preserve">Dead-reckoning animal movements in R: a reappraisal using </w:t>
         </w:r>
+        <w:proofErr w:type="spellStart"/>
+        <w:r>
+          <w:rPr>
+            <w:rStyle w:val="Hyperlink"/>
+          </w:rPr>
+          <w:t>Gundog.Tracks</w:t>
+        </w:r>
+        <w:proofErr w:type="spellEnd"/>
       </w:hyperlink>
       <w:r>
         <w:t xml:space="preserve"> </w:t>
@@ -5302,12 +6048,28 @@
           <w:rFonts w:ascii="Cambria Math" w:hAnsi="Cambria Math"/>
         </w:rPr>
       </w:pPr>
+      <w:proofErr w:type="spellStart"/>
       <w:r>
         <w:rPr>
           <w:rFonts w:ascii="Cambria Math" w:hAnsi="Cambria Math"/>
         </w:rPr>
-        <w:t>Gundog.Tracks(TS, h, v, elv</w:t>
-      </w:r>
+        <w:t>Gundog.Tracks</w:t>
+      </w:r>
+      <w:proofErr w:type="spellEnd"/>
+      <w:r>
+        <w:rPr>
+          <w:rFonts w:ascii="Cambria Math" w:hAnsi="Cambria Math"/>
+        </w:rPr>
+        <w:t xml:space="preserve">(TS, h, v, </w:t>
+      </w:r>
+      <w:proofErr w:type="spellStart"/>
+      <w:r>
+        <w:rPr>
+          <w:rFonts w:ascii="Cambria Math" w:hAnsi="Cambria Math"/>
+        </w:rPr>
+        <w:t>elv</w:t>
+      </w:r>
+      <w:proofErr w:type="spellEnd"/>
       <w:r>
         <w:rPr>
           <w:rFonts w:ascii="Cambria Math" w:hAnsi="Cambria Math" w:cs="Arial"/>
@@ -5378,8 +6140,16 @@
         <w:rPr>
           <w:rFonts w:ascii="Cambria Math" w:hAnsi="Cambria Math"/>
         </w:rPr>
-        <w:t>NULL, ch</w:t>
-      </w:r>
+        <w:t xml:space="preserve">NULL, </w:t>
+      </w:r>
+      <w:proofErr w:type="spellStart"/>
+      <w:r>
+        <w:rPr>
+          <w:rFonts w:ascii="Cambria Math" w:hAnsi="Cambria Math"/>
+        </w:rPr>
+        <w:t>ch</w:t>
+      </w:r>
+      <w:proofErr w:type="spellEnd"/>
       <w:r>
         <w:rPr>
           <w:rFonts w:ascii="Cambria Math" w:hAnsi="Cambria Math" w:cs="Arial"/>
@@ -5522,8 +6292,16 @@
         <w:rPr>
           <w:rFonts w:ascii="Cambria Math" w:hAnsi="Cambria Math"/>
         </w:rPr>
-        <w:t>0, VP.lon</w:t>
-      </w:r>
+        <w:t xml:space="preserve">0, </w:t>
+      </w:r>
+      <w:proofErr w:type="spellStart"/>
+      <w:r>
+        <w:rPr>
+          <w:rFonts w:ascii="Cambria Math" w:hAnsi="Cambria Math"/>
+        </w:rPr>
+        <w:t>VP.lon</w:t>
+      </w:r>
+      <w:proofErr w:type="spellEnd"/>
       <w:r>
         <w:rPr>
           <w:rFonts w:ascii="Cambria Math" w:hAnsi="Cambria Math" w:cs="Arial"/>
@@ -5546,8 +6324,16 @@
         <w:rPr>
           <w:rFonts w:ascii="Cambria Math" w:hAnsi="Cambria Math"/>
         </w:rPr>
-        <w:t>NULL, VP.lat</w:t>
-      </w:r>
+        <w:t xml:space="preserve">NULL, </w:t>
+      </w:r>
+      <w:proofErr w:type="spellStart"/>
+      <w:r>
+        <w:rPr>
+          <w:rFonts w:ascii="Cambria Math" w:hAnsi="Cambria Math"/>
+        </w:rPr>
+        <w:t>VP.lat</w:t>
+      </w:r>
+      <w:proofErr w:type="spellEnd"/>
       <w:r>
         <w:rPr>
           <w:rFonts w:ascii="Cambria Math" w:hAnsi="Cambria Math" w:cs="Arial"/>
@@ -5642,8 +6428,16 @@
         <w:rPr>
           <w:rFonts w:ascii="Cambria Math" w:hAnsi="Cambria Math"/>
         </w:rPr>
-        <w:t>1, dist.step</w:t>
-      </w:r>
+        <w:t xml:space="preserve">1, </w:t>
+      </w:r>
+      <w:proofErr w:type="spellStart"/>
+      <w:r>
+        <w:rPr>
+          <w:rFonts w:ascii="Cambria Math" w:hAnsi="Cambria Math"/>
+        </w:rPr>
+        <w:t>dist.step</w:t>
+      </w:r>
+      <w:proofErr w:type="spellEnd"/>
       <w:r>
         <w:rPr>
           <w:rFonts w:ascii="Cambria Math" w:hAnsi="Cambria Math" w:cs="Arial"/>
@@ -5827,7 +6621,15 @@
         <w:sym w:font="Wingdings" w:char="F0E0"/>
       </w:r>
       <w:r>
-        <w:t xml:space="preserve"> okay, nevermind, we aren’t high frequency enough for this to matter</w:t>
+        <w:t xml:space="preserve"> okay, </w:t>
+      </w:r>
+      <w:proofErr w:type="spellStart"/>
+      <w:r>
+        <w:t>nevermind</w:t>
+      </w:r>
+      <w:proofErr w:type="spellEnd"/>
+      <w:r>
+        <w:t>, we aren’t high frequency enough for this to matter</w:t>
       </w:r>
     </w:p>
     <w:p>
@@ -5866,7 +6668,15 @@
         <w:ind w:left="1080"/>
       </w:pPr>
       <w:r>
-        <w:t>Within Gundog.Tracks, the user can modulate m, c and ME values to switch between predetermined speed (m</w:t>
+        <w:t xml:space="preserve">Within </w:t>
+      </w:r>
+      <w:proofErr w:type="spellStart"/>
+      <w:r>
+        <w:t>Gundog.Tracks</w:t>
+      </w:r>
+      <w:proofErr w:type="spellEnd"/>
+      <w:r>
+        <w:t>, the user can modulate m, c and ME values to switch between predetermined speed (m</w:t>
       </w:r>
       <w:r>
         <w:rPr>
@@ -5972,7 +6782,15 @@
         <w:ind w:left="1080"/>
       </w:pPr>
       <w:r>
-        <w:t>Here an an example from his data that shows the expected error… if he’s using it in the paper then it must be considered good:</w:t>
+        <w:t xml:space="preserve">Here an </w:t>
+      </w:r>
+      <w:proofErr w:type="spellStart"/>
+      <w:r>
+        <w:t>an</w:t>
+      </w:r>
+      <w:proofErr w:type="spellEnd"/>
+      <w:r>
+        <w:t xml:space="preserve"> example from his data that shows the expected error… if he’s using it in the paper then it must be considered good:</w:t>
       </w:r>
     </w:p>
     <w:p>
@@ -6155,7 +6973,21 @@
         <w:rPr>
           <w:highlight w:val="yellow"/>
         </w:rPr>
-        <w:t>Should I be downsampling my accelerometer? Have I missed that?</w:t>
+        <w:t xml:space="preserve">Should I be </w:t>
+      </w:r>
+      <w:proofErr w:type="spellStart"/>
+      <w:r>
+        <w:rPr>
+          <w:highlight w:val="yellow"/>
+        </w:rPr>
+        <w:t>downsampling</w:t>
+      </w:r>
+      <w:proofErr w:type="spellEnd"/>
+      <w:r>
+        <w:rPr>
+          <w:highlight w:val="yellow"/>
+        </w:rPr>
+        <w:t xml:space="preserve"> my accelerometer? Have I missed that?</w:t>
       </w:r>
     </w:p>
     <w:p>
@@ -6272,7 +7104,15 @@
         <w:ind w:left="1080"/>
       </w:pPr>
       <w:r>
-        <w:t>We recommend implementing a running mean (cf. Eq. 1, R1:4) to raw VeDBA values to ensure that both acceleration and deceleration components of a stride cycle are incorporated together per unit time and to reduce the magnitude of small temporal spikes</w:t>
+        <w:t xml:space="preserve">We recommend implementing a running mean (cf. Eq. 1, R1:4) to raw </w:t>
+      </w:r>
+      <w:proofErr w:type="spellStart"/>
+      <w:r>
+        <w:t>VeDBA</w:t>
+      </w:r>
+      <w:proofErr w:type="spellEnd"/>
+      <w:r>
+        <w:t xml:space="preserve"> values to ensure that both acceleration and deceleration components of a stride cycle are incorporated together per unit time and to reduce the magnitude of small temporal spikes</w:t>
       </w:r>
     </w:p>
     <w:p>
@@ -6637,8 +7477,13 @@
           </w:tcPr>
           <w:p>
             <w:r>
-              <w:t>X acc</w:t>
+              <w:t xml:space="preserve">X </w:t>
             </w:r>
+            <w:proofErr w:type="spellStart"/>
+            <w:r>
+              <w:t>acc</w:t>
+            </w:r>
+            <w:proofErr w:type="spellEnd"/>
           </w:p>
         </w:tc>
         <w:tc>
@@ -6682,8 +7527,13 @@
           </w:tcPr>
           <w:p>
             <w:r>
-              <w:t>Y acc</w:t>
+              <w:t xml:space="preserve">Y </w:t>
             </w:r>
+            <w:proofErr w:type="spellStart"/>
+            <w:r>
+              <w:t>acc</w:t>
+            </w:r>
+            <w:proofErr w:type="spellEnd"/>
           </w:p>
         </w:tc>
         <w:tc>
@@ -6727,8 +7577,13 @@
           </w:tcPr>
           <w:p>
             <w:r>
-              <w:t>Z acc</w:t>
+              <w:t xml:space="preserve">Z </w:t>
             </w:r>
+            <w:proofErr w:type="spellStart"/>
+            <w:r>
+              <w:t>acc</w:t>
+            </w:r>
+            <w:proofErr w:type="spellEnd"/>
           </w:p>
         </w:tc>
         <w:tc>
@@ -6896,7 +7751,15 @@
         </w:numPr>
       </w:pPr>
       <w:r>
-        <w:t xml:space="preserve">I then tried to verify this by looking at the accelerometer data when the animal was standing up (ground-truthed with video). Red is X, Blue is Y, Green is Z. When the animal is standing up, the X axis has close to 0 gravity. The gravity is shared over the Y and Z, with the most on the Z. This indicates that the collar is tipped forwards. </w:t>
+        <w:t>I then tried to verify this by looking at the accelerometer data when the animal was standing up (ground-</w:t>
+      </w:r>
+      <w:proofErr w:type="spellStart"/>
+      <w:r>
+        <w:t>truthed</w:t>
+      </w:r>
+      <w:proofErr w:type="spellEnd"/>
+      <w:r>
+        <w:t xml:space="preserve"> with video). Red is X, Blue is Y, Green is Z. When the animal is standing up, the X axis has close to 0 gravity. The gravity is shared over the Y and Z, with the most on the Z. This indicates that the collar is tipped forwards. </w:t>
       </w:r>
     </w:p>
     <w:p>
@@ -7056,7 +7919,15 @@
         </w:numPr>
       </w:pPr>
       <w:r>
-        <w:t>Therefore, I propose the orientation is: acc EUS, mag EDN, gravity down, and a pitch forward of about 48 degrees…</w:t>
+        <w:t xml:space="preserve">Therefore, I propose the orientation is: </w:t>
+      </w:r>
+      <w:proofErr w:type="spellStart"/>
+      <w:r>
+        <w:t>acc</w:t>
+      </w:r>
+      <w:proofErr w:type="spellEnd"/>
+      <w:r>
+        <w:t xml:space="preserve"> EUS, mag EDN, gravity down, and a pitch forward of about 48 degrees…</w:t>
       </w:r>
     </w:p>
     <w:p>
@@ -7330,7 +8201,15 @@
         <w:t>I have seen information about the Median Filter come up</w:t>
       </w:r>
       <w:r>
-        <w:t>… trialing that now.</w:t>
+        <w:t xml:space="preserve">… </w:t>
+      </w:r>
+      <w:proofErr w:type="spellStart"/>
+      <w:r>
+        <w:t>trialing</w:t>
+      </w:r>
+      <w:proofErr w:type="spellEnd"/>
+      <w:r>
+        <w:t xml:space="preserve"> that now.</w:t>
       </w:r>
     </w:p>
     <w:p>
@@ -7889,7 +8768,15 @@
         </w:numPr>
       </w:pPr>
       <w:r>
-        <w:t>I have put message in chat to get ChrisB thoughts but in the meantime I will work towards what I think the next step will be: finding all the misread sections and removing them. Similar to the kangaroo data (though that’s worse), we have to go through and chop up the data into good sections with NA’s in between</w:t>
+        <w:t xml:space="preserve">I have put message in chat to get </w:t>
+      </w:r>
+      <w:proofErr w:type="spellStart"/>
+      <w:r>
+        <w:t>ChrisB</w:t>
+      </w:r>
+      <w:proofErr w:type="spellEnd"/>
+      <w:r>
+        <w:t xml:space="preserve"> thoughts but in the meantime I will work towards what I think the next step will be: finding all the misread sections and removing them. Similar to the kangaroo data (though that’s worse), we have to go through and chop up the data into good sections with NA’s in between</w:t>
       </w:r>
       <w:r>
         <w:t>?</w:t>
@@ -8096,7 +8983,15 @@
         </w:numPr>
       </w:pPr>
       <w:r>
-        <w:t>Then ChrisB pointed out that this was happening over hours not minutes, and is therefore more likely to be sleeping. He said “</w:t>
+        <w:t xml:space="preserve">Then </w:t>
+      </w:r>
+      <w:proofErr w:type="spellStart"/>
+      <w:r>
+        <w:t>ChrisB</w:t>
+      </w:r>
+      <w:proofErr w:type="spellEnd"/>
+      <w:r>
+        <w:t xml:space="preserve"> pointed out that this was happening over hours not minutes, and is therefore more likely to be sleeping. He said “</w:t>
       </w:r>
       <w:r>
         <w:rPr>
@@ -8105,7 +9000,15 @@
         <w:t>In that static accelerometer region it's likely just measuring gravity, but if the rotation of the collar isn't pointing the right way it will see that as an acceleration in the wrong direction and pick that up as movement”</w:t>
       </w:r>
       <w:r>
-        <w:t xml:space="preserve">. Ahhhh brilliant man has saved me once again. So if I can detect that as sleeping then I can set to no movement and no DR during that period. </w:t>
+        <w:t xml:space="preserve">. </w:t>
+      </w:r>
+      <w:proofErr w:type="spellStart"/>
+      <w:r>
+        <w:t>Ahhhh</w:t>
+      </w:r>
+      <w:proofErr w:type="spellEnd"/>
+      <w:r>
+        <w:t xml:space="preserve"> brilliant man has saved me once again. So if I can detect that as sleeping then I can set to no movement and no DR during that period. </w:t>
       </w:r>
     </w:p>
     <w:p>
@@ -8253,7 +9156,15 @@
         <w:sym w:font="Wingdings" w:char="F0E0"/>
       </w:r>
       <w:r>
-        <w:t xml:space="preserve"> ifelse(VDBA.sm &gt; 0.015, 0, 1) &amp; most common level in 60 seconds (3000 samples)</w:t>
+        <w:t xml:space="preserve"> </w:t>
+      </w:r>
+      <w:proofErr w:type="spellStart"/>
+      <w:r>
+        <w:t>ifelse</w:t>
+      </w:r>
+      <w:proofErr w:type="spellEnd"/>
+      <w:r>
+        <w:t>(VDBA.sm &gt; 0.015, 0, 1) &amp; most common level in 60 seconds (3000 samples)</w:t>
       </w:r>
       <w:r>
         <w:t>)</w:t>
@@ -8271,7 +9182,15 @@
         <w:t xml:space="preserve">Testing that </w:t>
       </w:r>
       <w:r>
-        <w:t>however showed no difference and the gps is moving consistently through the period???</w:t>
+        <w:t xml:space="preserve">however showed no difference and the </w:t>
+      </w:r>
+      <w:proofErr w:type="spellStart"/>
+      <w:r>
+        <w:t>gps</w:t>
+      </w:r>
+      <w:proofErr w:type="spellEnd"/>
+      <w:r>
+        <w:t xml:space="preserve"> is moving consistently through the period???</w:t>
       </w:r>
     </w:p>
     <w:p>
@@ -8510,7 +9429,15 @@
         </w:numPr>
       </w:pPr>
       <w:r>
-        <w:t>Firstly I continued with the cleaning by adding a lowpass butterworth filter with a cutoff of 10Hz. The results of the 3 steps of smoothing shown in right plot below.</w:t>
+        <w:t xml:space="preserve">Firstly I continued with the cleaning by adding a lowpass </w:t>
+      </w:r>
+      <w:proofErr w:type="spellStart"/>
+      <w:r>
+        <w:t>butterworth</w:t>
+      </w:r>
+      <w:proofErr w:type="spellEnd"/>
+      <w:r>
+        <w:t xml:space="preserve"> filter with a cutoff of 10Hz. The results of the 3 steps of smoothing shown in right plot below.</w:t>
       </w:r>
     </w:p>
     <w:p>
@@ -8646,7 +9573,15 @@
         <w:t>For example, in this case, there are 2 stationary periods where there should be no GPS changes.</w:t>
       </w:r>
       <w:r>
-        <w:t xml:space="preserve"> The dark blue dots in the gps graph right show the stationary periods. The green dots are what got fed to the spline and the red is the spline path.</w:t>
+        <w:t xml:space="preserve"> The dark blue dots in the </w:t>
+      </w:r>
+      <w:proofErr w:type="spellStart"/>
+      <w:r>
+        <w:t>gps</w:t>
+      </w:r>
+      <w:proofErr w:type="spellEnd"/>
+      <w:r>
+        <w:t xml:space="preserve"> graph right show the stationary periods. The green dots are what got fed to the spline and the red is the spline path.</w:t>
       </w:r>
       <w:r>
         <w:t xml:space="preserve"> Note there are only 2 black dots because all the stationary got grouped.</w:t>
@@ -8906,7 +9841,15 @@
         </w:numPr>
       </w:pPr>
       <w:r>
-        <w:t xml:space="preserve">Then ChrisB helped me for a few hours, figuring out many things. For example, he found that everything was scaled by 4 because the settings of the accelerometer weren’t what I thought. (They were 16 for the kangaroos but 4 for the impala) </w:t>
+        <w:t xml:space="preserve">Then </w:t>
+      </w:r>
+      <w:proofErr w:type="spellStart"/>
+      <w:r>
+        <w:t>ChrisB</w:t>
+      </w:r>
+      <w:proofErr w:type="spellEnd"/>
+      <w:r>
+        <w:t xml:space="preserve"> helped me for a few hours, figuring out many things. For example, he found that everything was scaled by 4 because the settings of the accelerometer weren’t what I thought. (They were 16 for the kangaroos but 4 for the impala) </w:t>
       </w:r>
     </w:p>
     <w:p>
@@ -8998,7 +9941,15 @@
         </w:numPr>
       </w:pPr>
       <w:r>
-        <w:t>Chris Bird also doesn’t believe in tilt-corrected accelerometer based DR and thinks we should have to use the gyroscope (pronounced guyroscope… as I learnt today)</w:t>
+        <w:t xml:space="preserve">Chris Bird also doesn’t believe in tilt-corrected accelerometer based DR and thinks we should have to use the gyroscope (pronounced </w:t>
+      </w:r>
+      <w:proofErr w:type="spellStart"/>
+      <w:r>
+        <w:t>guyroscope</w:t>
+      </w:r>
+      <w:proofErr w:type="spellEnd"/>
+      <w:r>
+        <w:t>… as I learnt today)</w:t>
       </w:r>
     </w:p>
     <w:p>
@@ -9042,7 +9993,39 @@
           <w:i/>
           <w:iCs/>
         </w:rPr>
-        <w:t xml:space="preserve">The short answer is, yes - if a wrong ref frame was chosen then DR path wil be innacurate. But comparing subsets with GPS pre-correction will help debug if chosen orientation was </w:t>
+        <w:t xml:space="preserve">The short answer is, yes - if a wrong ref frame was chosen then DR path </w:t>
+      </w:r>
+      <w:proofErr w:type="spellStart"/>
+      <w:r>
+        <w:rPr>
+          <w:i/>
+          <w:iCs/>
+        </w:rPr>
+        <w:t>wil</w:t>
+      </w:r>
+      <w:proofErr w:type="spellEnd"/>
+      <w:r>
+        <w:rPr>
+          <w:i/>
+          <w:iCs/>
+        </w:rPr>
+        <w:t xml:space="preserve"> be </w:t>
+      </w:r>
+      <w:proofErr w:type="spellStart"/>
+      <w:r>
+        <w:rPr>
+          <w:i/>
+          <w:iCs/>
+        </w:rPr>
+        <w:t>innacurate</w:t>
+      </w:r>
+      <w:proofErr w:type="spellEnd"/>
+      <w:r>
+        <w:rPr>
+          <w:i/>
+          <w:iCs/>
+        </w:rPr>
+        <w:t xml:space="preserve">. But comparing subsets with GPS pre-correction will help debug if chosen orientation was </w:t>
       </w:r>
       <w:r>
         <w:rPr>
@@ -9058,44 +10041,164 @@
           <w:iCs/>
           <w:highlight w:val="green"/>
         </w:rPr>
-        <w:t>heave axis of movmement</w:t>
-      </w:r>
-      <w:r>
-        <w:rPr>
-          <w:i/>
-          <w:iCs/>
-        </w:rPr>
-        <w:t xml:space="preserve"> in acc and mag (</w:t>
-      </w:r>
+        <w:t xml:space="preserve">heave axis of </w:t>
+      </w:r>
+      <w:proofErr w:type="spellStart"/>
       <w:r>
         <w:rPr>
           <w:i/>
           <w:iCs/>
           <w:highlight w:val="green"/>
         </w:rPr>
-        <w:t>acc will be the one closest to +/-1 g most of the time, and mag will the one changing the least</w:t>
-      </w:r>
+        <w:t>movmement</w:t>
+      </w:r>
+      <w:proofErr w:type="spellEnd"/>
       <w:r>
         <w:rPr>
           <w:i/>
           <w:iCs/>
         </w:rPr>
-        <w:t xml:space="preserve">)... In terms of deciphering the acc/mag surge and sway dimensions, this may be more challenging. But for the </w:t>
-      </w:r>
+        <w:t xml:space="preserve"> in </w:t>
+      </w:r>
+      <w:proofErr w:type="spellStart"/>
+      <w:r>
+        <w:rPr>
+          <w:i/>
+          <w:iCs/>
+        </w:rPr>
+        <w:t>acc</w:t>
+      </w:r>
+      <w:proofErr w:type="spellEnd"/>
+      <w:r>
+        <w:rPr>
+          <w:i/>
+          <w:iCs/>
+        </w:rPr>
+        <w:t xml:space="preserve"> and mag (</w:t>
+      </w:r>
+      <w:proofErr w:type="spellStart"/>
+      <w:r>
+        <w:rPr>
+          <w:i/>
+          <w:iCs/>
+          <w:highlight w:val="green"/>
+        </w:rPr>
+        <w:t>acc</w:t>
+      </w:r>
+      <w:proofErr w:type="spellEnd"/>
+      <w:r>
+        <w:rPr>
+          <w:i/>
+          <w:iCs/>
+          <w:highlight w:val="green"/>
+        </w:rPr>
+        <w:t xml:space="preserve"> will be the one closest to +/-1 g most of the time, and mag will the one changing the least</w:t>
+      </w:r>
+      <w:r>
+        <w:rPr>
+          <w:i/>
+          <w:iCs/>
+        </w:rPr>
+        <w:t xml:space="preserve">)... In terms of deciphering the </w:t>
+      </w:r>
+      <w:proofErr w:type="spellStart"/>
+      <w:r>
+        <w:rPr>
+          <w:i/>
+          <w:iCs/>
+        </w:rPr>
+        <w:t>acc</w:t>
+      </w:r>
+      <w:proofErr w:type="spellEnd"/>
+      <w:r>
+        <w:rPr>
+          <w:i/>
+          <w:iCs/>
+        </w:rPr>
+        <w:t xml:space="preserve">/mag surge and sway dimensions, this may be more challenging. But for the </w:t>
+      </w:r>
+      <w:proofErr w:type="spellStart"/>
       <w:r>
         <w:rPr>
           <w:i/>
           <w:iCs/>
           <w:highlight w:val="yellow"/>
         </w:rPr>
-        <w:t>acc, you would expect greater variation in surge dimension because they stick their head to ground to forage and then stick their head back up when travelling and vigalence</w:t>
-      </w:r>
+        <w:t>acc</w:t>
+      </w:r>
+      <w:proofErr w:type="spellEnd"/>
       <w:r>
         <w:rPr>
           <w:i/>
           <w:iCs/>
-        </w:rPr>
-        <w:t>, so that may help. If mag is different orientation set up to acc, then its worth just checking if you switch the surge/sway orientations then which one produces most realsitic DR track relative to GPS... by deciphering the heave axis and dimension of measured g, you already have homed in on just a few possible orientations it could be...</w:t>
+          <w:highlight w:val="yellow"/>
+        </w:rPr>
+        <w:t xml:space="preserve">, you would expect greater variation in surge dimension because they stick their head to ground to forage and then stick their head back up when travelling and </w:t>
+      </w:r>
+      <w:proofErr w:type="spellStart"/>
+      <w:r>
+        <w:rPr>
+          <w:i/>
+          <w:iCs/>
+          <w:highlight w:val="yellow"/>
+        </w:rPr>
+        <w:t>vigalence</w:t>
+      </w:r>
+      <w:proofErr w:type="spellEnd"/>
+      <w:r>
+        <w:rPr>
+          <w:i/>
+          <w:iCs/>
+        </w:rPr>
+        <w:t xml:space="preserve">, so that may help. If mag is different orientation set up to </w:t>
+      </w:r>
+      <w:proofErr w:type="spellStart"/>
+      <w:r>
+        <w:rPr>
+          <w:i/>
+          <w:iCs/>
+        </w:rPr>
+        <w:t>acc</w:t>
+      </w:r>
+      <w:proofErr w:type="spellEnd"/>
+      <w:r>
+        <w:rPr>
+          <w:i/>
+          <w:iCs/>
+        </w:rPr>
+        <w:t xml:space="preserve">, then </w:t>
+      </w:r>
+      <w:proofErr w:type="spellStart"/>
+      <w:r>
+        <w:rPr>
+          <w:i/>
+          <w:iCs/>
+        </w:rPr>
+        <w:t>its</w:t>
+      </w:r>
+      <w:proofErr w:type="spellEnd"/>
+      <w:r>
+        <w:rPr>
+          <w:i/>
+          <w:iCs/>
+        </w:rPr>
+        <w:t xml:space="preserve"> worth just checking if you switch the surge/sway orientations then which one produces most </w:t>
+      </w:r>
+      <w:proofErr w:type="spellStart"/>
+      <w:r>
+        <w:rPr>
+          <w:i/>
+          <w:iCs/>
+        </w:rPr>
+        <w:t>realsitic</w:t>
+      </w:r>
+      <w:proofErr w:type="spellEnd"/>
+      <w:r>
+        <w:rPr>
+          <w:i/>
+          <w:iCs/>
+        </w:rPr>
+        <w:t xml:space="preserve"> DR track relative to GPS... by deciphering the heave axis and dimension of measured g, you already have homed in on just a few possible orientations it could be...</w:t>
       </w:r>
     </w:p>
     <w:p>
@@ -9280,8 +10383,29 @@
           <w:numId w:val="2"/>
         </w:numPr>
       </w:pPr>
-      <w:r>
-        <w:t>acc_orientation &lt;- "NWU",   mag_orientation &lt;- "NED",   gravity_direction &lt;- "down",   pitch &lt;- 0#-48</w:t>
+      <w:proofErr w:type="spellStart"/>
+      <w:r>
+        <w:t>acc_orientation</w:t>
+      </w:r>
+      <w:proofErr w:type="spellEnd"/>
+      <w:r>
+        <w:t xml:space="preserve"> &lt;- "NWU",   </w:t>
+      </w:r>
+      <w:proofErr w:type="spellStart"/>
+      <w:r>
+        <w:t>mag_orientation</w:t>
+      </w:r>
+      <w:proofErr w:type="spellEnd"/>
+      <w:r>
+        <w:t xml:space="preserve"> &lt;- "NED",   </w:t>
+      </w:r>
+      <w:proofErr w:type="spellStart"/>
+      <w:r>
+        <w:t>gravity_direction</w:t>
+      </w:r>
+      <w:proofErr w:type="spellEnd"/>
+      <w:r>
+        <w:t xml:space="preserve"> &lt;- "down",   pitch &lt;- 0#-48</w:t>
       </w:r>
     </w:p>
     <w:p>
@@ -9606,7 +10730,15 @@
     <w:p/>
     <w:p>
       <w:r>
-        <w:t>X = "salmon", Y = "turquoise", Z = "darkblue"</w:t>
+        <w:t>X = "salmon", Y = "turquoise", Z = "</w:t>
+      </w:r>
+      <w:proofErr w:type="spellStart"/>
+      <w:r>
+        <w:t>darkblue</w:t>
+      </w:r>
+      <w:proofErr w:type="spellEnd"/>
+      <w:r>
+        <w:t>"</w:t>
       </w:r>
     </w:p>
     <w:p>
@@ -10094,7 +11226,23 @@
           <w:rFonts w:asciiTheme="minorHAnsi" w:hAnsiTheme="minorHAnsi"/>
           <w:lang w:val="en-GB"/>
         </w:rPr>
-        <w:t>Plotted it to see what units the devices are in and holy fuck, why are they all different??? What evil tomfoolery is this?????? Messaged ChrisB to ask what the heck is going on.</w:t>
+        <w:t xml:space="preserve">Plotted it to see what units the devices are in and holy fuck, why are they all different??? What evil tomfoolery is this?????? Messaged </w:t>
+      </w:r>
+      <w:proofErr w:type="spellStart"/>
+      <w:r>
+        <w:rPr>
+          <w:rFonts w:asciiTheme="minorHAnsi" w:hAnsiTheme="minorHAnsi"/>
+          <w:lang w:val="en-GB"/>
+        </w:rPr>
+        <w:t>ChrisB</w:t>
+      </w:r>
+      <w:proofErr w:type="spellEnd"/>
+      <w:r>
+        <w:rPr>
+          <w:rFonts w:asciiTheme="minorHAnsi" w:hAnsiTheme="minorHAnsi"/>
+          <w:lang w:val="en-GB"/>
+        </w:rPr>
+        <w:t xml:space="preserve"> to ask what the heck is going on.</w:t>
       </w:r>
     </w:p>
     <w:p>
@@ -10397,7 +11545,23 @@
           <w:rFonts w:asciiTheme="minorHAnsi" w:hAnsiTheme="minorHAnsi"/>
           <w:lang w:val="en-GB"/>
         </w:rPr>
-        <w:t xml:space="preserve">Basically I found that there are 3 settings. Either the device is already in G (either 16 or 4) or its in raw units and has to be converted. The cropping at 4g means I am going to have to match and join it to the Axivity </w:t>
+        <w:t xml:space="preserve">Basically I found that there are 3 settings. Either the device is already in G (either 16 or 4) or its in raw units and has to be converted. The cropping at 4g means I am going to have to match and join it to the </w:t>
+      </w:r>
+      <w:proofErr w:type="spellStart"/>
+      <w:r>
+        <w:rPr>
+          <w:rFonts w:asciiTheme="minorHAnsi" w:hAnsiTheme="minorHAnsi"/>
+          <w:lang w:val="en-GB"/>
+        </w:rPr>
+        <w:t>Axivity</w:t>
+      </w:r>
+      <w:proofErr w:type="spellEnd"/>
+      <w:r>
+        <w:rPr>
+          <w:rFonts w:asciiTheme="minorHAnsi" w:hAnsiTheme="minorHAnsi"/>
+          <w:lang w:val="en-GB"/>
+        </w:rPr>
+        <w:t xml:space="preserve"> </w:t>
       </w:r>
       <w:r>
         <w:rPr>
@@ -10406,12 +11570,21 @@
         </w:rPr>
         <w:t>😢</w:t>
       </w:r>
+      <w:proofErr w:type="spellStart"/>
       <w:r>
         <w:rPr>
           <w:rFonts w:asciiTheme="minorHAnsi" w:hAnsiTheme="minorHAnsi"/>
           <w:lang w:val="en-GB"/>
         </w:rPr>
-        <w:t>ChrisC says this code exists and already works… but I’ve heard that often enough to know that means “this will be hard”.</w:t>
+        <w:t>ChrisC</w:t>
+      </w:r>
+      <w:proofErr w:type="spellEnd"/>
+      <w:r>
+        <w:rPr>
+          <w:rFonts w:asciiTheme="minorHAnsi" w:hAnsiTheme="minorHAnsi"/>
+          <w:lang w:val="en-GB"/>
+        </w:rPr>
+        <w:t xml:space="preserve"> says this code exists and already works… but I’ve heard that often enough to know that means “this will be hard”.</w:t>
       </w:r>
     </w:p>
     <w:tbl>
@@ -10484,6 +11657,7 @@
                 <w14:ligatures w14:val="none"/>
               </w:rPr>
             </w:pPr>
+            <w:proofErr w:type="spellStart"/>
             <w:r>
               <w:rPr>
                 <w:rFonts w:ascii="Aptos Narrow" w:eastAsia="Times New Roman" w:hAnsi="Aptos Narrow" w:cs="Times New Roman"/>
@@ -10496,6 +11670,7 @@
               </w:rPr>
               <w:t>avg_hz</w:t>
             </w:r>
+            <w:proofErr w:type="spellEnd"/>
           </w:p>
         </w:tc>
         <w:tc>
@@ -10517,6 +11692,7 @@
                 <w14:ligatures w14:val="none"/>
               </w:rPr>
             </w:pPr>
+            <w:proofErr w:type="spellStart"/>
             <w:r>
               <w:rPr>
                 <w:rFonts w:ascii="Aptos Narrow" w:eastAsia="Times New Roman" w:hAnsi="Aptos Narrow" w:cs="Times New Roman"/>
@@ -10529,6 +11705,7 @@
               </w:rPr>
               <w:t>Acc_Conv</w:t>
             </w:r>
+            <w:proofErr w:type="spellEnd"/>
           </w:p>
         </w:tc>
         <w:tc>
@@ -10550,6 +11727,7 @@
                 <w14:ligatures w14:val="none"/>
               </w:rPr>
             </w:pPr>
+            <w:proofErr w:type="spellStart"/>
             <w:r>
               <w:rPr>
                 <w:rFonts w:ascii="Aptos Narrow" w:eastAsia="Times New Roman" w:hAnsi="Aptos Narrow" w:cs="Times New Roman"/>
@@ -10562,6 +11740,7 @@
               </w:rPr>
               <w:t>Mag_Conv</w:t>
             </w:r>
+            <w:proofErr w:type="spellEnd"/>
           </w:p>
         </w:tc>
       </w:tr>
@@ -12202,8 +13381,13 @@
             </w:r>
           </w:p>
           <w:p>
+            <w:proofErr w:type="spellStart"/>
             <w:r>
-              <w:t>accel_data[1445000:1452000]</w:t>
+              <w:t>accel_data</w:t>
+            </w:r>
+            <w:proofErr w:type="spellEnd"/>
+            <w:r>
+              <w:t>[1445000:1452000]</w:t>
             </w:r>
           </w:p>
         </w:tc>
@@ -12306,8 +13490,13 @@
             </w:r>
           </w:p>
           <w:p>
+            <w:proofErr w:type="spellStart"/>
             <w:r>
-              <w:t>accel_data[1660000:1670000]</w:t>
+              <w:t>accel_data</w:t>
+            </w:r>
+            <w:proofErr w:type="spellEnd"/>
+            <w:r>
+              <w:t>[1660000:1670000]</w:t>
             </w:r>
           </w:p>
         </w:tc>
@@ -12411,8 +13600,13 @@
             </w:r>
           </w:p>
           <w:p>
+            <w:proofErr w:type="spellStart"/>
             <w:r>
-              <w:t>accel_data[90000:91000]</w:t>
+              <w:t>accel_data</w:t>
+            </w:r>
+            <w:proofErr w:type="spellEnd"/>
+            <w:r>
+              <w:t>[90000:91000]</w:t>
             </w:r>
           </w:p>
         </w:tc>
@@ -13252,7 +14446,23 @@
           <w:rFonts w:asciiTheme="minorHAnsi" w:hAnsiTheme="minorHAnsi"/>
           <w:lang w:val="en-GB"/>
         </w:rPr>
-        <w:t>Therefore, I went through and made sure they’re now on the same scale (other than the ones that capped at 4g and therefore have to be matched with the Axivity before behavioural and VDBA analysis). I then re-extracted the training data for those periods based on the times of the original unsmoothed data. That code is now running. I will check the output tomorrow.</w:t>
+        <w:t xml:space="preserve">Therefore, I went through and made sure they’re now on the same scale (other than the ones that capped at 4g and therefore have to be matched with the </w:t>
+      </w:r>
+      <w:proofErr w:type="spellStart"/>
+      <w:r>
+        <w:rPr>
+          <w:rFonts w:asciiTheme="minorHAnsi" w:hAnsiTheme="minorHAnsi"/>
+          <w:lang w:val="en-GB"/>
+        </w:rPr>
+        <w:t>Axivity</w:t>
+      </w:r>
+      <w:proofErr w:type="spellEnd"/>
+      <w:r>
+        <w:rPr>
+          <w:rFonts w:asciiTheme="minorHAnsi" w:hAnsiTheme="minorHAnsi"/>
+          <w:lang w:val="en-GB"/>
+        </w:rPr>
+        <w:t xml:space="preserve"> before behavioural and VDBA analysis). I then re-extracted the training data for those periods based on the times of the original unsmoothed data. That code is now running. I will check the output tomorrow.</w:t>
       </w:r>
     </w:p>
     <w:p>
@@ -13305,7 +14515,23 @@
           <w:rFonts w:asciiTheme="minorHAnsi" w:hAnsiTheme="minorHAnsi"/>
           <w:lang w:val="en-GB"/>
         </w:rPr>
-        <w:t xml:space="preserve">… They did need to be divided after all. Weird? Message CB and he said that things can change or if it reset/rebooted it might have gone back to default. Whatevvvvvvver man. I can’t keep up with all this. Converted everything to the right scale for real now and then proceeded. </w:t>
+        <w:t xml:space="preserve">… They did need to be divided after all. Weird? Message CB and he said that things can change or if it reset/rebooted it might have gone back to default. </w:t>
+      </w:r>
+      <w:proofErr w:type="spellStart"/>
+      <w:r>
+        <w:rPr>
+          <w:rFonts w:asciiTheme="minorHAnsi" w:hAnsiTheme="minorHAnsi"/>
+          <w:lang w:val="en-GB"/>
+        </w:rPr>
+        <w:t>Whatevvvvvvver</w:t>
+      </w:r>
+      <w:proofErr w:type="spellEnd"/>
+      <w:r>
+        <w:rPr>
+          <w:rFonts w:asciiTheme="minorHAnsi" w:hAnsiTheme="minorHAnsi"/>
+          <w:lang w:val="en-GB"/>
+        </w:rPr>
+        <w:t xml:space="preserve"> man. I can’t keep up with all this. Converted everything to the right scale for real now and then proceeded. </w:t>
       </w:r>
     </w:p>
     <w:p>
@@ -13382,8 +14608,17 @@
           <w:rFonts w:asciiTheme="minorHAnsi" w:hAnsiTheme="minorHAnsi"/>
           <w:lang w:val="en-GB"/>
         </w:rPr>
-        <w:t xml:space="preserve"> Some errors I can see, but these will be cleaned out in the next step of the second matlab</w:t>
-      </w:r>
+        <w:t xml:space="preserve"> Some errors I can see, but these will be cleaned out in the next step of the second </w:t>
+      </w:r>
+      <w:proofErr w:type="spellStart"/>
+      <w:r>
+        <w:rPr>
+          <w:rFonts w:asciiTheme="minorHAnsi" w:hAnsiTheme="minorHAnsi"/>
+          <w:lang w:val="en-GB"/>
+        </w:rPr>
+        <w:t>matlab</w:t>
+      </w:r>
+      <w:proofErr w:type="spellEnd"/>
       <w:r>
         <w:rPr>
           <w:rFonts w:asciiTheme="minorHAnsi" w:hAnsiTheme="minorHAnsi"/>
@@ -13902,7 +15137,25 @@
           <w:highlight w:val="yellow"/>
           <w:lang w:val="en-GB"/>
         </w:rPr>
-        <w:t xml:space="preserve">Need to build in some cleaning logic for when the collars flip… ie. When the Y axis is on average higher than the Z axis, </w:t>
+        <w:t xml:space="preserve">Need to build in some cleaning logic for when the collars flip… </w:t>
+      </w:r>
+      <w:proofErr w:type="spellStart"/>
+      <w:r>
+        <w:rPr>
+          <w:rFonts w:asciiTheme="minorHAnsi" w:hAnsiTheme="minorHAnsi"/>
+          <w:highlight w:val="yellow"/>
+          <w:lang w:val="en-GB"/>
+        </w:rPr>
+        <w:t>ie</w:t>
+      </w:r>
+      <w:proofErr w:type="spellEnd"/>
+      <w:r>
+        <w:rPr>
+          <w:rFonts w:asciiTheme="minorHAnsi" w:hAnsiTheme="minorHAnsi"/>
+          <w:highlight w:val="yellow"/>
+          <w:lang w:val="en-GB"/>
+        </w:rPr>
+        <w:t xml:space="preserve">. When the Y axis is on average higher than the Z axis, </w:t>
       </w:r>
       <w:r>
         <w:rPr>
@@ -14018,7 +15271,23 @@
           <w:rFonts w:asciiTheme="minorHAnsi" w:hAnsiTheme="minorHAnsi"/>
           <w:lang w:val="en-GB"/>
         </w:rPr>
-        <w:t>The models are doing reeaaaaallly badly</w:t>
+        <w:t xml:space="preserve">The models are doing </w:t>
+      </w:r>
+      <w:proofErr w:type="spellStart"/>
+      <w:r>
+        <w:rPr>
+          <w:rFonts w:asciiTheme="minorHAnsi" w:hAnsiTheme="minorHAnsi"/>
+          <w:lang w:val="en-GB"/>
+        </w:rPr>
+        <w:t>reeaaaaallly</w:t>
+      </w:r>
+      <w:proofErr w:type="spellEnd"/>
+      <w:r>
+        <w:rPr>
+          <w:rFonts w:asciiTheme="minorHAnsi" w:hAnsiTheme="minorHAnsi"/>
+          <w:lang w:val="en-GB"/>
+        </w:rPr>
+        <w:t xml:space="preserve"> badly</w:t>
       </w:r>
       <w:r>
         <w:rPr>
@@ -14052,7 +15321,23 @@
           <w:rFonts w:asciiTheme="minorHAnsi" w:hAnsiTheme="minorHAnsi"/>
           <w:lang w:val="en-GB"/>
         </w:rPr>
-        <w:t xml:space="preserve">From what I could see, the confusion between grazing_headlevel and walking was total. I collapsed those classes into one. There was also a lot of confusion between vigilance and </w:t>
+        <w:t xml:space="preserve">From what I could see, the confusion between </w:t>
+      </w:r>
+      <w:proofErr w:type="spellStart"/>
+      <w:r>
+        <w:rPr>
+          <w:rFonts w:asciiTheme="minorHAnsi" w:hAnsiTheme="minorHAnsi"/>
+          <w:lang w:val="en-GB"/>
+        </w:rPr>
+        <w:t>grazing_headlevel</w:t>
+      </w:r>
+      <w:proofErr w:type="spellEnd"/>
+      <w:r>
+        <w:rPr>
+          <w:rFonts w:asciiTheme="minorHAnsi" w:hAnsiTheme="minorHAnsi"/>
+          <w:lang w:val="en-GB"/>
+        </w:rPr>
+        <w:t xml:space="preserve"> and walking was total. I collapsed those classes into one. There was also a lot of confusion between vigilance and </w:t>
       </w:r>
       <w:r>
         <w:rPr>
@@ -14107,7 +15392,23 @@
           <w:rFonts w:asciiTheme="minorHAnsi" w:hAnsiTheme="minorHAnsi"/>
           <w:lang w:val="en-GB"/>
         </w:rPr>
-        <w:t>Looking at the behavioural model results so far, there is such a massive confusion between some of the classes. Before I collapse the classes, I want to try training a more powerful model: 1) XGBoost, 2) a basic NN.</w:t>
+        <w:t xml:space="preserve">Looking at the behavioural model results so far, there is such a massive confusion between some of the classes. Before I collapse the classes, I want to try training a more powerful model: 1) </w:t>
+      </w:r>
+      <w:proofErr w:type="spellStart"/>
+      <w:r>
+        <w:rPr>
+          <w:rFonts w:asciiTheme="minorHAnsi" w:hAnsiTheme="minorHAnsi"/>
+          <w:lang w:val="en-GB"/>
+        </w:rPr>
+        <w:t>XGBoost</w:t>
+      </w:r>
+      <w:proofErr w:type="spellEnd"/>
+      <w:r>
+        <w:rPr>
+          <w:rFonts w:asciiTheme="minorHAnsi" w:hAnsiTheme="minorHAnsi"/>
+          <w:lang w:val="en-GB"/>
+        </w:rPr>
+        <w:t>, 2) a basic NN.</w:t>
       </w:r>
     </w:p>
     <w:p>
@@ -14128,7 +15429,23 @@
           <w:rFonts w:asciiTheme="minorHAnsi" w:hAnsiTheme="minorHAnsi"/>
           <w:lang w:val="en-GB"/>
         </w:rPr>
-        <w:t>The XGBoost is doing terrible, with a below chance performance. I must be doing something wrong in the code…</w:t>
+        <w:t xml:space="preserve">The </w:t>
+      </w:r>
+      <w:proofErr w:type="spellStart"/>
+      <w:r>
+        <w:rPr>
+          <w:rFonts w:asciiTheme="minorHAnsi" w:hAnsiTheme="minorHAnsi"/>
+          <w:lang w:val="en-GB"/>
+        </w:rPr>
+        <w:t>XGBoost</w:t>
+      </w:r>
+      <w:proofErr w:type="spellEnd"/>
+      <w:r>
+        <w:rPr>
+          <w:rFonts w:asciiTheme="minorHAnsi" w:hAnsiTheme="minorHAnsi"/>
+          <w:lang w:val="en-GB"/>
+        </w:rPr>
+        <w:t xml:space="preserve"> is doing terrible, with a below chance performance. I must be doing something wrong in the code…</w:t>
       </w:r>
     </w:p>
     <w:p>
@@ -14149,7 +15466,23 @@
           <w:rFonts w:asciiTheme="minorHAnsi" w:hAnsiTheme="minorHAnsi"/>
           <w:lang w:val="en-GB"/>
         </w:rPr>
-        <w:t>Currently fighting for my life to get keras working so I can use deep learning models. I want to try the NN at least once before I move on.</w:t>
+        <w:t xml:space="preserve">Currently fighting for my life to get </w:t>
+      </w:r>
+      <w:proofErr w:type="spellStart"/>
+      <w:r>
+        <w:rPr>
+          <w:rFonts w:asciiTheme="minorHAnsi" w:hAnsiTheme="minorHAnsi"/>
+          <w:lang w:val="en-GB"/>
+        </w:rPr>
+        <w:t>keras</w:t>
+      </w:r>
+      <w:proofErr w:type="spellEnd"/>
+      <w:r>
+        <w:rPr>
+          <w:rFonts w:asciiTheme="minorHAnsi" w:hAnsiTheme="minorHAnsi"/>
+          <w:lang w:val="en-GB"/>
+        </w:rPr>
+        <w:t xml:space="preserve"> working so I can use deep learning models. I want to try the NN at least once before I move on.</w:t>
       </w:r>
     </w:p>
     <w:p>
@@ -14170,7 +15503,39 @@
           <w:rFonts w:asciiTheme="minorHAnsi" w:hAnsiTheme="minorHAnsi"/>
           <w:lang w:val="en-GB"/>
         </w:rPr>
-        <w:t>Gave up on keras and used neuralnet a simpler version instead.</w:t>
+        <w:t xml:space="preserve">Gave up on </w:t>
+      </w:r>
+      <w:proofErr w:type="spellStart"/>
+      <w:r>
+        <w:rPr>
+          <w:rFonts w:asciiTheme="minorHAnsi" w:hAnsiTheme="minorHAnsi"/>
+          <w:lang w:val="en-GB"/>
+        </w:rPr>
+        <w:t>keras</w:t>
+      </w:r>
+      <w:proofErr w:type="spellEnd"/>
+      <w:r>
+        <w:rPr>
+          <w:rFonts w:asciiTheme="minorHAnsi" w:hAnsiTheme="minorHAnsi"/>
+          <w:lang w:val="en-GB"/>
+        </w:rPr>
+        <w:t xml:space="preserve"> and used </w:t>
+      </w:r>
+      <w:proofErr w:type="spellStart"/>
+      <w:r>
+        <w:rPr>
+          <w:rFonts w:asciiTheme="minorHAnsi" w:hAnsiTheme="minorHAnsi"/>
+          <w:lang w:val="en-GB"/>
+        </w:rPr>
+        <w:t>neuralnet</w:t>
+      </w:r>
+      <w:proofErr w:type="spellEnd"/>
+      <w:r>
+        <w:rPr>
+          <w:rFonts w:asciiTheme="minorHAnsi" w:hAnsiTheme="minorHAnsi"/>
+          <w:lang w:val="en-GB"/>
+        </w:rPr>
+        <w:t xml:space="preserve"> a simpler version instead.</w:t>
       </w:r>
     </w:p>
     <w:p>
@@ -14851,7 +16216,15 @@
         <w:t>the Madgwick method</w:t>
       </w:r>
       <w:r>
-        <w:t xml:space="preserve"> to replace the tilt-adjusting Gundog.Compass (still use Tracks)</w:t>
+        <w:t xml:space="preserve"> to replace the tilt-adjusting </w:t>
+      </w:r>
+      <w:proofErr w:type="spellStart"/>
+      <w:r>
+        <w:t>Gundog.Compass</w:t>
+      </w:r>
+      <w:proofErr w:type="spellEnd"/>
+      <w:r>
+        <w:t xml:space="preserve"> (still use Tracks)</w:t>
       </w:r>
       <w:r>
         <w:t xml:space="preserve"> for dead reckoning re-orientation</w:t>
@@ -14974,7 +16347,23 @@
         </w:numPr>
       </w:pPr>
       <w:r>
-        <w:t xml:space="preserve">The Magwick equation assumes NED but I am not in NED. I am in acc = </w:t>
+        <w:t xml:space="preserve">The </w:t>
+      </w:r>
+      <w:proofErr w:type="spellStart"/>
+      <w:r>
+        <w:t>Magwick</w:t>
+      </w:r>
+      <w:proofErr w:type="spellEnd"/>
+      <w:r>
+        <w:t xml:space="preserve"> equation assumes NED but I am not in NED. I am in </w:t>
+      </w:r>
+      <w:proofErr w:type="spellStart"/>
+      <w:r>
+        <w:t>acc</w:t>
+      </w:r>
+      <w:proofErr w:type="spellEnd"/>
+      <w:r>
+        <w:t xml:space="preserve"> = </w:t>
       </w:r>
       <w:r>
         <w:t>"NWU"</w:t>
@@ -15033,7 +16422,15 @@
         </w:numPr>
       </w:pPr>
       <w:r>
-        <w:t>Wait wait. What am I doing. Stop. What is the problem, what do I have, and what am I doing?</w:t>
+        <w:t xml:space="preserve">Wait </w:t>
+      </w:r>
+      <w:proofErr w:type="spellStart"/>
+      <w:r>
+        <w:t>wait</w:t>
+      </w:r>
+      <w:proofErr w:type="spellEnd"/>
+      <w:r>
+        <w:t>. What am I doing. Stop. What is the problem, what do I have, and what am I doing?</w:t>
       </w:r>
     </w:p>
     <w:p>
@@ -15124,8 +16521,13 @@
           <w:numId w:val="2"/>
         </w:numPr>
       </w:pPr>
-      <w:r>
-        <w:t>ChrisC said that I should make a speed distribution of the DR track that we calculated so far and see whether we are getting reasonable speeds</w:t>
+      <w:proofErr w:type="spellStart"/>
+      <w:r>
+        <w:t>ChrisC</w:t>
+      </w:r>
+      <w:proofErr w:type="spellEnd"/>
+      <w:r>
+        <w:t xml:space="preserve"> said that I should make a speed distribution of the DR track that we calculated so far and see whether we are getting reasonable speeds</w:t>
       </w:r>
       <w:r>
         <w:t>. If they are reasonable, I am going to call it.</w:t>
@@ -15143,7 +16545,15 @@
         <w:t>Okay, went to make my old method again and it broke completely. Lmao?</w:t>
       </w:r>
       <w:r>
-        <w:t xml:space="preserve"> Back to the beginning to rescale the accels and mags and stuff.</w:t>
+        <w:t xml:space="preserve"> Back to the beginning to rescale the </w:t>
+      </w:r>
+      <w:proofErr w:type="spellStart"/>
+      <w:r>
+        <w:t>accels</w:t>
+      </w:r>
+      <w:proofErr w:type="spellEnd"/>
+      <w:r>
+        <w:t xml:space="preserve"> and mags and stuff.</w:t>
       </w:r>
     </w:p>
     <w:p>
@@ -15158,7 +16568,15 @@
         <w:t>I am going back to the very beginning</w:t>
       </w:r>
       <w:r>
-        <w:t xml:space="preserve"> and saving each change as a new column and then sending it to ChrisB to figure out while I’m away.</w:t>
+        <w:t xml:space="preserve"> and saving each change as a new column and then sending it to </w:t>
+      </w:r>
+      <w:proofErr w:type="spellStart"/>
+      <w:r>
+        <w:t>ChrisB</w:t>
+      </w:r>
+      <w:proofErr w:type="spellEnd"/>
+      <w:r>
+        <w:t xml:space="preserve"> to figure out while I’m away.</w:t>
       </w:r>
     </w:p>
     <w:p>
@@ -15329,17 +16747,30 @@
         <w:t xml:space="preserve">Note that I tried to use the quaternion components onboard </w:t>
       </w:r>
       <w:r>
-        <w:t xml:space="preserve">but found that they aren’t normalised, which means you can’t calculate the w component (which we don’t have)… so that means we cannnn’t use the </w:t>
+        <w:t xml:space="preserve">but found that they aren’t normalised, which means you can’t calculate the w component (which we don’t have)… so that means we </w:t>
+      </w:r>
+      <w:proofErr w:type="spellStart"/>
+      <w:r>
+        <w:t>cannnn’t</w:t>
+      </w:r>
+      <w:proofErr w:type="spellEnd"/>
+      <w:r>
+        <w:t xml:space="preserve"> use the </w:t>
       </w:r>
       <w:r>
         <w:t>on board calculated ones</w:t>
       </w:r>
       <w:r>
-        <w:t>???? Have messaged Chris</w:t>
+        <w:t xml:space="preserve">???? Have messaged </w:t>
+      </w:r>
+      <w:proofErr w:type="spellStart"/>
+      <w:r>
+        <w:t>Chris</w:t>
       </w:r>
       <w:r>
         <w:t>B</w:t>
       </w:r>
+      <w:proofErr w:type="spellEnd"/>
       <w:r>
         <w:t xml:space="preserve"> to ask.</w:t>
       </w:r>
@@ -15433,9 +16864,70 @@
         </w:numPr>
       </w:pPr>
       <w:r>
-        <w:t>Assuming that Birdy will figure out the quaternions while I’m away, my task for now is to get the behavioural model working.</w:t>
-      </w:r>
-    </w:p>
+        <w:t xml:space="preserve">Checked the next day and </w:t>
+      </w:r>
+      <w:r>
+        <w:t>the compass</w:t>
+      </w:r>
+      <w:r>
+        <w:t xml:space="preserve"> was balls lmao.</w:t>
+      </w:r>
+      <w:r>
+        <w:t xml:space="preserve"> But the quaternion is pretty close, </w:t>
+      </w:r>
+      <w:proofErr w:type="spellStart"/>
+      <w:r>
+        <w:t>tbh</w:t>
+      </w:r>
+      <w:proofErr w:type="spellEnd"/>
+      <w:r>
+        <w:t>.(Quat below). Therefore we are officially moving over to the quat method from now on. I have set up a workflow for Bird to check them and play around with them while I’m away.</w:t>
+      </w:r>
+    </w:p>
+    <w:p>
+      <w:pPr>
+        <w:jc w:val="center"/>
+      </w:pPr>
+      <w:r>
+        <w:drawing>
+          <wp:inline distT="0" distB="0" distL="0" distR="0" wp14:anchorId="26B60A56" wp14:editId="5A4516D8">
+            <wp:extent cx="3581400" cy="1446156"/>
+            <wp:effectExtent l="0" t="0" r="0" b="1905"/>
+            <wp:docPr id="564110143" name="Picture 1"/>
+            <wp:cNvGraphicFramePr>
+              <a:graphicFrameLocks xmlns:a="http://schemas.openxmlformats.org/drawingml/2006/main" noChangeAspect="1"/>
+            </wp:cNvGraphicFramePr>
+            <a:graphic xmlns:a="http://schemas.openxmlformats.org/drawingml/2006/main">
+              <a:graphicData uri="http://schemas.openxmlformats.org/drawingml/2006/picture">
+                <pic:pic xmlns:pic="http://schemas.openxmlformats.org/drawingml/2006/picture">
+                  <pic:nvPicPr>
+                    <pic:cNvPr id="564110143" name=""/>
+                    <pic:cNvPicPr/>
+                  </pic:nvPicPr>
+                  <pic:blipFill>
+                    <a:blip r:embed="rId117"/>
+                    <a:stretch>
+                      <a:fillRect/>
+                    </a:stretch>
+                  </pic:blipFill>
+                  <pic:spPr>
+                    <a:xfrm>
+                      <a:off x="0" y="0"/>
+                      <a:ext cx="3593891" cy="1451200"/>
+                    </a:xfrm>
+                    <a:prstGeom prst="rect">
+                      <a:avLst/>
+                    </a:prstGeom>
+                  </pic:spPr>
+                </pic:pic>
+              </a:graphicData>
+            </a:graphic>
+          </wp:inline>
+        </w:drawing>
+      </w:r>
+    </w:p>
+    <w:p/>
+    <w:p/>
     <w:p>
       <w:pPr>
         <w:pStyle w:val="ListParagraph"/>
@@ -15445,7 +16937,13 @@
         </w:numPr>
       </w:pPr>
       <w:r>
-        <w:t>I got started on generating the features for the impala deployment data collar 8 – intending this to be my example collar for the conference.</w:t>
+        <w:t>In the meantime, I should start processing the model to get the behaviours. I</w:t>
+      </w:r>
+      <w:r>
+        <w:t xml:space="preserve"> got started on generating the features for the impala deployment data collar 8 – intending this to be my example collar for the conference.</w:t>
+      </w:r>
+      <w:r>
+        <w:t xml:space="preserve"> Tomorrow I will finalise the model that I want to use and then make the predictions while I’m in FG. </w:t>
       </w:r>
     </w:p>
     <w:p>
@@ -15477,9 +16975,13 @@
         </w:numPr>
       </w:pPr>
       <w:r>
-        <w:lastRenderedPageBreak/>
-        <w:t>Leaving the quaternions for now and just focusing on what I got with Gundog.Compass</w:t>
-      </w:r>
+        <w:t xml:space="preserve">Leaving the quaternions for now and just focusing on what I got with </w:t>
+      </w:r>
+      <w:proofErr w:type="spellStart"/>
+      <w:r>
+        <w:t>Gundog.Compass</w:t>
+      </w:r>
+      <w:proofErr w:type="spellEnd"/>
       <w:r>
         <w:t>.</w:t>
       </w:r>
@@ -15569,7 +17071,15 @@
         <w:t>This looks reasonable… lets</w:t>
       </w:r>
       <w:r>
-        <w:t xml:space="preserve"> do the next day’s worth of data to see what we get.</w:t>
+        <w:t xml:space="preserve"> do the next </w:t>
+      </w:r>
+      <w:proofErr w:type="spellStart"/>
+      <w:r>
+        <w:t>day’s worth</w:t>
+      </w:r>
+      <w:proofErr w:type="spellEnd"/>
+      <w:r>
+        <w:t xml:space="preserve"> of data to see what we get.</w:t>
       </w:r>
     </w:p>
     <w:p/>
@@ -15580,7 +17090,7 @@
     <w:p/>
     <w:p/>
     <w:p>
-      <w:hyperlink r:id="rId117" w:history="1">
+      <w:hyperlink r:id="rId118" w:history="1">
         <w:r>
           <w:rPr>
             <w:rStyle w:val="Hyperlink"/>
@@ -15876,7 +17386,25 @@
           <w:strike/>
           <w:lang w:val="en-GB"/>
         </w:rPr>
-        <w:t>Convert all the accels to g force and mag units</w:t>
+        <w:t xml:space="preserve">Convert all the </w:t>
+      </w:r>
+      <w:proofErr w:type="spellStart"/>
+      <w:r>
+        <w:rPr>
+          <w:rFonts w:asciiTheme="minorHAnsi" w:hAnsiTheme="minorHAnsi"/>
+          <w:strike/>
+          <w:lang w:val="en-GB"/>
+        </w:rPr>
+        <w:t>accels</w:t>
+      </w:r>
+      <w:proofErr w:type="spellEnd"/>
+      <w:r>
+        <w:rPr>
+          <w:rFonts w:asciiTheme="minorHAnsi" w:hAnsiTheme="minorHAnsi"/>
+          <w:strike/>
+          <w:lang w:val="en-GB"/>
+        </w:rPr>
+        <w:t xml:space="preserve"> to g force and mag units</w:t>
       </w:r>
     </w:p>
     <w:p>
@@ -15924,7 +17452,39 @@
           <w:rFonts w:asciiTheme="minorHAnsi" w:hAnsiTheme="minorHAnsi"/>
           <w:lang w:val="en-GB"/>
         </w:rPr>
-        <w:t>Join the cropped 4g accels with the axivity uncropped data to complete the peaks</w:t>
+        <w:t xml:space="preserve">Join the cropped 4g </w:t>
+      </w:r>
+      <w:proofErr w:type="spellStart"/>
+      <w:r>
+        <w:rPr>
+          <w:rFonts w:asciiTheme="minorHAnsi" w:hAnsiTheme="minorHAnsi"/>
+          <w:lang w:val="en-GB"/>
+        </w:rPr>
+        <w:t>accels</w:t>
+      </w:r>
+      <w:proofErr w:type="spellEnd"/>
+      <w:r>
+        <w:rPr>
+          <w:rFonts w:asciiTheme="minorHAnsi" w:hAnsiTheme="minorHAnsi"/>
+          <w:lang w:val="en-GB"/>
+        </w:rPr>
+        <w:t xml:space="preserve"> with the </w:t>
+      </w:r>
+      <w:proofErr w:type="spellStart"/>
+      <w:r>
+        <w:rPr>
+          <w:rFonts w:asciiTheme="minorHAnsi" w:hAnsiTheme="minorHAnsi"/>
+          <w:lang w:val="en-GB"/>
+        </w:rPr>
+        <w:t>axivity</w:t>
+      </w:r>
+      <w:proofErr w:type="spellEnd"/>
+      <w:r>
+        <w:rPr>
+          <w:rFonts w:asciiTheme="minorHAnsi" w:hAnsiTheme="minorHAnsi"/>
+          <w:lang w:val="en-GB"/>
+        </w:rPr>
+        <w:t xml:space="preserve"> uncropped data to complete the peaks</w:t>
       </w:r>
     </w:p>
     <w:p>
@@ -16056,7 +17616,7 @@
     </w:p>
     <w:p/>
     <w:sectPr>
-      <w:headerReference w:type="default" r:id="rId118"/>
+      <w:headerReference w:type="default" r:id="rId119"/>
       <w:pgSz w:w="12240" w:h="15840"/>
       <w:pgMar w:top="720" w:right="720" w:bottom="720" w:left="720" w:header="720" w:footer="720" w:gutter="0"/>
       <w:cols w:space="720"/>

</xml_diff>

<commit_message>
making the data smaller for ChrisBird
</commit_message>
<xml_diff>
--- a/Notes/Worklog.docx
+++ b/Notes/Worklog.docx
@@ -12,15 +12,7 @@
     </w:p>
     <w:p>
       <w:r>
-        <w:t xml:space="preserve">The impala data was collected by Chris Clemente, Jasmin Annett, Robin Maag, Chris Bird, and Taylor Dick across 3 field deployments in South Africa: 2024, April 2025, and July 2025.  The idea behind the project was to put our custom-designed collars (including an Artemis board which logged GPS and accelerometer data, as well as a stand-alone </w:t>
-      </w:r>
-      <w:proofErr w:type="spellStart"/>
-      <w:r>
-        <w:t>Axivity</w:t>
-      </w:r>
-      <w:proofErr w:type="spellEnd"/>
-      <w:r>
-        <w:t>) on impalas, record their behaviours with a drone, and then reconstruct their exact behaviours and paths from the acceleration data.</w:t>
+        <w:t>The impala data was collected by Chris Clemente, Jasmin Annett, Robin Maag, Chris Bird, and Taylor Dick across 3 field deployments in South Africa: 2024, April 2025, and July 2025.  The idea behind the project was to put our custom-designed collars (including an Artemis board which logged GPS and accelerometer data, as well as a stand-alone Axivity) on impalas, record their behaviours with a drone, and then reconstruct their exact behaviours and paths from the acceleration data.</w:t>
       </w:r>
       <w:r>
         <w:t xml:space="preserve"> Luke Jessup and Jojo Schultz begun the process of understanding the dead reckoning workflow.</w:t>
@@ -552,23 +544,7 @@
         <w:t>synchronised</w:t>
       </w:r>
       <w:r>
-        <w:t xml:space="preserve">” boards were, in fact, not time synchronised. </w:t>
-      </w:r>
-      <w:proofErr w:type="spellStart"/>
-      <w:r>
-        <w:t>ChrisC</w:t>
-      </w:r>
-      <w:proofErr w:type="spellEnd"/>
-      <w:r>
-        <w:t xml:space="preserve"> and I spent several weeks trying to align the board with the associated behavioural videos. That work is detailed in this </w:t>
-      </w:r>
-      <w:proofErr w:type="spellStart"/>
-      <w:r>
-        <w:t>googledoc</w:t>
-      </w:r>
-      <w:proofErr w:type="spellEnd"/>
-      <w:r>
-        <w:t xml:space="preserve">: </w:t>
+        <w:t xml:space="preserve">” boards were, in fact, not time synchronised. ChrisC and I spent several weeks trying to align the board with the associated behavioural videos. That work is detailed in this googledoc: </w:t>
       </w:r>
       <w:hyperlink r:id="rId8" w:history="1">
         <w:r>
@@ -696,15 +672,7 @@
         <w:spacing w:line="276" w:lineRule="auto"/>
       </w:pPr>
       <w:r>
-        <w:t xml:space="preserve">What this tells me is that my next most valuable endeavour is to figure out the alignment from Robin’s camera. Going to have a crack at that this </w:t>
-      </w:r>
-      <w:proofErr w:type="spellStart"/>
-      <w:r>
-        <w:t>arvo</w:t>
-      </w:r>
-      <w:proofErr w:type="spellEnd"/>
-      <w:r>
-        <w:t xml:space="preserve">. </w:t>
+        <w:t xml:space="preserve">What this tells me is that my next most valuable endeavour is to figure out the alignment from Robin’s camera. Going to have a crack at that this arvo. </w:t>
       </w:r>
       <w:r>
         <w:rPr>
@@ -869,15 +837,7 @@
         <w:spacing w:line="276" w:lineRule="auto"/>
       </w:pPr>
       <w:r>
-        <w:t xml:space="preserve">I reverted all my changes to the plotting method and got the same result. Therefore, either the video times are incorrect or the </w:t>
-      </w:r>
-      <w:proofErr w:type="spellStart"/>
-      <w:r>
-        <w:t>gps</w:t>
-      </w:r>
-      <w:proofErr w:type="spellEnd"/>
-      <w:r>
-        <w:t xml:space="preserve"> times are incorrect.</w:t>
+        <w:t>I reverted all my changes to the plotting method and got the same result. Therefore, either the video times are incorrect or the gps times are incorrect.</w:t>
       </w:r>
     </w:p>
     <w:p>
@@ -890,15 +850,7 @@
         <w:spacing w:line="276" w:lineRule="auto"/>
       </w:pPr>
       <w:r>
-        <w:t xml:space="preserve">I rechecked the video times and no joy. Therefore, I think the </w:t>
-      </w:r>
-      <w:proofErr w:type="spellStart"/>
-      <w:r>
-        <w:t>gps</w:t>
-      </w:r>
-      <w:proofErr w:type="spellEnd"/>
-      <w:r>
-        <w:t xml:space="preserve"> times are wrong. Going to revert all the work I did yesterday back to the original versions. </w:t>
+        <w:t xml:space="preserve">I rechecked the video times and no joy. Therefore, I think the gps times are wrong. Going to revert all the work I did yesterday back to the original versions. </w:t>
       </w:r>
     </w:p>
     <w:p>
@@ -914,15 +866,7 @@
         <w:sym w:font="Wingdings" w:char="F0E0"/>
       </w:r>
       <w:r>
-        <w:t xml:space="preserve"> Note that the kangaroo data had a lot of error not encountered in the impala data (e.g., multiple board resets, skipped reads, incorrect GPS writes, etc). The fact that using the “cleaning code” I wrote for the </w:t>
-      </w:r>
-      <w:proofErr w:type="spellStart"/>
-      <w:r>
-        <w:t>kangies</w:t>
-      </w:r>
-      <w:proofErr w:type="spellEnd"/>
-      <w:r>
-        <w:t xml:space="preserve"> on the impala caused the impala to break indicates that there is something wrong with the cleaning code…</w:t>
+        <w:t xml:space="preserve"> Note that the kangaroo data had a lot of error not encountered in the impala data (e.g., multiple board resets, skipped reads, incorrect GPS writes, etc). The fact that using the “cleaning code” I wrote for the kangies on the impala caused the impala to break indicates that there is something wrong with the cleaning code…</w:t>
       </w:r>
     </w:p>
     <w:p>
@@ -1066,13 +1010,8 @@
         <w:spacing w:line="276" w:lineRule="auto"/>
       </w:pPr>
       <w:r>
-        <w:t xml:space="preserve">Reordered the dataset by the reset events and then removed the misreads where there was an uneven increment between the internal and external times on the </w:t>
-      </w:r>
-      <w:proofErr w:type="spellStart"/>
-      <w:r>
-        <w:t>gps_board</w:t>
-      </w:r>
-      <w:proofErr w:type="spellEnd"/>
+        <w:t>Reordered the dataset by the reset events and then removed the misreads where there was an uneven increment between the internal and external times on the gps_board</w:t>
+      </w:r>
     </w:p>
     <w:p>
       <w:pPr>
@@ -1124,15 +1063,7 @@
         <w:spacing w:line="276" w:lineRule="auto"/>
       </w:pPr>
       <w:r>
-        <w:t xml:space="preserve">Below confirmed that the </w:t>
-      </w:r>
-      <w:proofErr w:type="spellStart"/>
-      <w:r>
-        <w:t>gps</w:t>
-      </w:r>
-      <w:proofErr w:type="spellEnd"/>
-      <w:r>
-        <w:t xml:space="preserve"> timestamps stay the same after writing and reading but also converted everything to numeric to be safe.</w:t>
+        <w:t>Below confirmed that the gps timestamps stay the same after writing and reading but also converted everything to numeric to be safe.</w:t>
       </w:r>
     </w:p>
     <w:p>
@@ -1307,15 +1238,7 @@
         <w:spacing w:line="276" w:lineRule="auto"/>
       </w:pPr>
       <w:r>
-        <w:t xml:space="preserve">But somehow they are then getting back mixed together after I combine the accel and </w:t>
-      </w:r>
-      <w:proofErr w:type="spellStart"/>
-      <w:r>
-        <w:t>gps</w:t>
-      </w:r>
-      <w:proofErr w:type="spellEnd"/>
-      <w:r>
-        <w:t>?</w:t>
+        <w:t>But somehow they are then getting back mixed together after I combine the accel and gps?</w:t>
       </w:r>
     </w:p>
     <w:p>
@@ -2594,21 +2517,7 @@
         <w:rPr>
           <w:bdr w:val="none" w:sz="0" w:space="0" w:color="auto" w:frame="1"/>
         </w:rPr>
-        <w:t xml:space="preserve"> Not much, </w:t>
-      </w:r>
-      <w:proofErr w:type="spellStart"/>
-      <w:r>
-        <w:rPr>
-          <w:bdr w:val="none" w:sz="0" w:space="0" w:color="auto" w:frame="1"/>
-        </w:rPr>
-        <w:t>tbh</w:t>
-      </w:r>
-      <w:proofErr w:type="spellEnd"/>
-      <w:r>
-        <w:rPr>
-          <w:bdr w:val="none" w:sz="0" w:space="0" w:color="auto" w:frame="1"/>
-        </w:rPr>
-        <w:t>.</w:t>
+        <w:t xml:space="preserve"> Not much, tbh.</w:t>
       </w:r>
     </w:p>
     <w:p>
@@ -2708,15 +2617,7 @@
         </w:numPr>
       </w:pPr>
       <w:r>
-        <w:t>Raw tri-axial magnetometer data (</w:t>
-      </w:r>
-      <w:proofErr w:type="spellStart"/>
-      <w:r>
-        <w:t>mag.x,y,z</w:t>
-      </w:r>
-      <w:proofErr w:type="spellEnd"/>
-      <w:r>
-        <w:t>)</w:t>
+        <w:t>Raw tri-axial magnetometer data (mag.x,y,z)</w:t>
       </w:r>
     </w:p>
     <w:p>
@@ -2728,15 +2629,7 @@
         </w:numPr>
       </w:pPr>
       <w:r>
-        <w:t>Tri-axial static acceleration data (</w:t>
-      </w:r>
-      <w:proofErr w:type="spellStart"/>
-      <w:r>
-        <w:t>acc.x,y,z</w:t>
-      </w:r>
-      <w:proofErr w:type="spellEnd"/>
-      <w:r>
-        <w:t>) (the smoothed values)</w:t>
+        <w:t>Tri-axial static acceleration data (acc.x,y,z) (the smoothed values)</w:t>
       </w:r>
     </w:p>
     <w:p>
@@ -2784,15 +2677,7 @@
         </w:numPr>
       </w:pPr>
       <w:r>
-        <w:t xml:space="preserve">Estimated pitch offset: Approximately how much was it rotated by? * algorithm = “standard” (standard </w:t>
-      </w:r>
-      <w:proofErr w:type="spellStart"/>
-      <w:r>
-        <w:t>euler</w:t>
-      </w:r>
-      <w:proofErr w:type="spellEnd"/>
-      <w:r>
-        <w:t xml:space="preserve"> angle approach) or “SAAM” (using quaternions)</w:t>
+        <w:t>Estimated pitch offset: Approximately how much was it rotated by? * algorithm = “standard” (standard euler angle approach) or “SAAM” (using quaternions)</w:t>
       </w:r>
     </w:p>
     <w:p>
@@ -2934,39 +2819,7 @@
     </w:p>
     <w:p>
       <w:r>
-        <w:t xml:space="preserve">The default orientation of the Gundog system is North-East-Down (NED) where the axes readings would be X = 0, Y = 0, and Z = -1. Before we could use data from our hand accelerometer we would have to flip it upside down. Some devices may have a different local coordinate frame, e.g., the END (East-North-Down) coordinate system assume the surge dimension of movement is represented by the z-channel, and the sway and heave dimension, by the x- and y-channels, respectively. Providing the original coordinate system allows the Gundogs system to convert your local system to the global system. The </w:t>
-      </w:r>
-      <w:proofErr w:type="spellStart"/>
-      <w:r>
-        <w:t>Gundog.Compass</w:t>
-      </w:r>
-      <w:proofErr w:type="spellEnd"/>
-      <w:r>
-        <w:t xml:space="preserve"> function comes with three inputs to allow the user to transform their device’s coordinate frame into the NED that the specific Direction Cosine Matrix (DCM) and quaternion augmentation uses to compute angles:‘</w:t>
-      </w:r>
-      <w:proofErr w:type="spellStart"/>
-      <w:r>
-        <w:t>acc.ref.frame</w:t>
-      </w:r>
-      <w:proofErr w:type="spellEnd"/>
-      <w:r>
-        <w:t>’, ‘</w:t>
-      </w:r>
-      <w:proofErr w:type="spellStart"/>
-      <w:r>
-        <w:t>positive.g</w:t>
-      </w:r>
-      <w:proofErr w:type="spellEnd"/>
-      <w:r>
-        <w:t>’, and ‘</w:t>
-      </w:r>
-      <w:proofErr w:type="spellStart"/>
-      <w:r>
-        <w:t>mag.ref.frame</w:t>
-      </w:r>
-      <w:proofErr w:type="spellEnd"/>
-      <w:r>
-        <w:t>’</w:t>
+        <w:t>The default orientation of the Gundog system is North-East-Down (NED) where the axes readings would be X = 0, Y = 0, and Z = -1. Before we could use data from our hand accelerometer we would have to flip it upside down. Some devices may have a different local coordinate frame, e.g., the END (East-North-Down) coordinate system assume the surge dimension of movement is represented by the z-channel, and the sway and heave dimension, by the x- and y-channels, respectively. Providing the original coordinate system allows the Gundogs system to convert your local system to the global system. The Gundog.Compass function comes with three inputs to allow the user to transform their device’s coordinate frame into the NED that the specific Direction Cosine Matrix (DCM) and quaternion augmentation uses to compute angles:‘acc.ref.frame’, ‘positive.g’, and ‘mag.ref.frame’</w:t>
       </w:r>
     </w:p>
     <w:p>
@@ -3346,21 +3199,7 @@
         <w:rPr>
           <w:highlight w:val="yellow"/>
         </w:rPr>
-        <w:t xml:space="preserve">by 0.15 to give me what </w:t>
-      </w:r>
-      <w:proofErr w:type="spellStart"/>
-      <w:r>
-        <w:rPr>
-          <w:highlight w:val="yellow"/>
-        </w:rPr>
-        <w:t>jojo</w:t>
-      </w:r>
-      <w:proofErr w:type="spellEnd"/>
-      <w:r>
-        <w:rPr>
-          <w:highlight w:val="yellow"/>
-        </w:rPr>
-        <w:t xml:space="preserve"> had</w:t>
+        <w:t>by 0.15 to give me what jojo had</w:t>
       </w:r>
       <w:r>
         <w:t>. So…</w:t>
@@ -3375,323 +3214,63 @@
           <w:szCs w:val="20"/>
         </w:rPr>
       </w:pPr>
-      <w:proofErr w:type="spellStart"/>
       <w:r>
         <w:rPr>
           <w:sz w:val="20"/>
           <w:szCs w:val="20"/>
         </w:rPr>
-        <w:t>mine.flat</w:t>
-      </w:r>
-      <w:proofErr w:type="spellEnd"/>
-      <w:r>
+        <w:t>mine.flat[, c("RawAX", "RawAY", "RawAZ")] &lt;- mine.flat[, c("RawAX", "RawAY", "RawAZ")] / 2048</w:t>
+      </w:r>
+    </w:p>
+    <w:p>
+      <w:pPr>
+        <w:pStyle w:val="ListParagraph"/>
+        <w:ind w:left="2160"/>
         <w:rPr>
           <w:sz w:val="20"/>
           <w:szCs w:val="20"/>
         </w:rPr>
-        <w:t>[, c("</w:t>
-      </w:r>
-      <w:proofErr w:type="spellStart"/>
+      </w:pPr>
       <w:r>
         <w:rPr>
           <w:sz w:val="20"/>
           <w:szCs w:val="20"/>
         </w:rPr>
-        <w:t>RawAX</w:t>
-      </w:r>
-      <w:proofErr w:type="spellEnd"/>
-      <w:r>
+        <w:t>mine.flat[, c("RawMX", "RawMY", "RawMZ")] &lt;- mine.flat[, c("RawMX", "RawMY", "RawMZ")] * 0.15</w:t>
+      </w:r>
+    </w:p>
+    <w:p>
+      <w:pPr>
+        <w:pStyle w:val="ListParagraph"/>
+        <w:ind w:left="2160"/>
         <w:rPr>
           <w:sz w:val="20"/>
           <w:szCs w:val="20"/>
         </w:rPr>
-        <w:t>", "RawAY", "</w:t>
-      </w:r>
-      <w:proofErr w:type="spellStart"/>
+      </w:pPr>
       <w:r>
         <w:rPr>
           <w:sz w:val="20"/>
           <w:szCs w:val="20"/>
         </w:rPr>
-        <w:t>RawAZ</w:t>
-      </w:r>
-      <w:proofErr w:type="spellEnd"/>
-      <w:r>
+        <w:t>jojo_df &lt;- df.flat[1:77009, ]</w:t>
+      </w:r>
+    </w:p>
+    <w:p>
+      <w:pPr>
+        <w:pStyle w:val="ListParagraph"/>
+        <w:ind w:left="2160"/>
         <w:rPr>
           <w:sz w:val="20"/>
           <w:szCs w:val="20"/>
         </w:rPr>
-        <w:t xml:space="preserve">")] &lt;- </w:t>
-      </w:r>
-      <w:proofErr w:type="spellStart"/>
+      </w:pPr>
       <w:r>
         <w:rPr>
           <w:sz w:val="20"/>
           <w:szCs w:val="20"/>
         </w:rPr>
-        <w:t>mine.flat</w:t>
-      </w:r>
-      <w:proofErr w:type="spellEnd"/>
-      <w:r>
-        <w:rPr>
-          <w:sz w:val="20"/>
-          <w:szCs w:val="20"/>
-        </w:rPr>
-        <w:t>[, c("</w:t>
-      </w:r>
-      <w:proofErr w:type="spellStart"/>
-      <w:r>
-        <w:rPr>
-          <w:sz w:val="20"/>
-          <w:szCs w:val="20"/>
-        </w:rPr>
-        <w:t>RawAX</w:t>
-      </w:r>
-      <w:proofErr w:type="spellEnd"/>
-      <w:r>
-        <w:rPr>
-          <w:sz w:val="20"/>
-          <w:szCs w:val="20"/>
-        </w:rPr>
-        <w:t>", "RawAY", "</w:t>
-      </w:r>
-      <w:proofErr w:type="spellStart"/>
-      <w:r>
-        <w:rPr>
-          <w:sz w:val="20"/>
-          <w:szCs w:val="20"/>
-        </w:rPr>
-        <w:t>RawAZ</w:t>
-      </w:r>
-      <w:proofErr w:type="spellEnd"/>
-      <w:r>
-        <w:rPr>
-          <w:sz w:val="20"/>
-          <w:szCs w:val="20"/>
-        </w:rPr>
-        <w:t>")] / 2048</w:t>
-      </w:r>
-    </w:p>
-    <w:p>
-      <w:pPr>
-        <w:pStyle w:val="ListParagraph"/>
-        <w:ind w:left="2160"/>
-        <w:rPr>
-          <w:sz w:val="20"/>
-          <w:szCs w:val="20"/>
-        </w:rPr>
-      </w:pPr>
-      <w:proofErr w:type="spellStart"/>
-      <w:r>
-        <w:rPr>
-          <w:sz w:val="20"/>
-          <w:szCs w:val="20"/>
-        </w:rPr>
-        <w:t>mine.flat</w:t>
-      </w:r>
-      <w:proofErr w:type="spellEnd"/>
-      <w:r>
-        <w:rPr>
-          <w:sz w:val="20"/>
-          <w:szCs w:val="20"/>
-        </w:rPr>
-        <w:t>[, c("</w:t>
-      </w:r>
-      <w:proofErr w:type="spellStart"/>
-      <w:r>
-        <w:rPr>
-          <w:sz w:val="20"/>
-          <w:szCs w:val="20"/>
-        </w:rPr>
-        <w:t>RawMX</w:t>
-      </w:r>
-      <w:proofErr w:type="spellEnd"/>
-      <w:r>
-        <w:rPr>
-          <w:sz w:val="20"/>
-          <w:szCs w:val="20"/>
-        </w:rPr>
-        <w:t>", "</w:t>
-      </w:r>
-      <w:proofErr w:type="spellStart"/>
-      <w:r>
-        <w:rPr>
-          <w:sz w:val="20"/>
-          <w:szCs w:val="20"/>
-        </w:rPr>
-        <w:t>RawMY</w:t>
-      </w:r>
-      <w:proofErr w:type="spellEnd"/>
-      <w:r>
-        <w:rPr>
-          <w:sz w:val="20"/>
-          <w:szCs w:val="20"/>
-        </w:rPr>
-        <w:t>", "</w:t>
-      </w:r>
-      <w:proofErr w:type="spellStart"/>
-      <w:r>
-        <w:rPr>
-          <w:sz w:val="20"/>
-          <w:szCs w:val="20"/>
-        </w:rPr>
-        <w:t>RawMZ</w:t>
-      </w:r>
-      <w:proofErr w:type="spellEnd"/>
-      <w:r>
-        <w:rPr>
-          <w:sz w:val="20"/>
-          <w:szCs w:val="20"/>
-        </w:rPr>
-        <w:t xml:space="preserve">")] &lt;- </w:t>
-      </w:r>
-      <w:proofErr w:type="spellStart"/>
-      <w:r>
-        <w:rPr>
-          <w:sz w:val="20"/>
-          <w:szCs w:val="20"/>
-        </w:rPr>
-        <w:t>mine.flat</w:t>
-      </w:r>
-      <w:proofErr w:type="spellEnd"/>
-      <w:r>
-        <w:rPr>
-          <w:sz w:val="20"/>
-          <w:szCs w:val="20"/>
-        </w:rPr>
-        <w:t>[, c("</w:t>
-      </w:r>
-      <w:proofErr w:type="spellStart"/>
-      <w:r>
-        <w:rPr>
-          <w:sz w:val="20"/>
-          <w:szCs w:val="20"/>
-        </w:rPr>
-        <w:t>RawMX</w:t>
-      </w:r>
-      <w:proofErr w:type="spellEnd"/>
-      <w:r>
-        <w:rPr>
-          <w:sz w:val="20"/>
-          <w:szCs w:val="20"/>
-        </w:rPr>
-        <w:t>", "</w:t>
-      </w:r>
-      <w:proofErr w:type="spellStart"/>
-      <w:r>
-        <w:rPr>
-          <w:sz w:val="20"/>
-          <w:szCs w:val="20"/>
-        </w:rPr>
-        <w:t>RawMY</w:t>
-      </w:r>
-      <w:proofErr w:type="spellEnd"/>
-      <w:r>
-        <w:rPr>
-          <w:sz w:val="20"/>
-          <w:szCs w:val="20"/>
-        </w:rPr>
-        <w:t>", "</w:t>
-      </w:r>
-      <w:proofErr w:type="spellStart"/>
-      <w:r>
-        <w:rPr>
-          <w:sz w:val="20"/>
-          <w:szCs w:val="20"/>
-        </w:rPr>
-        <w:t>RawMZ</w:t>
-      </w:r>
-      <w:proofErr w:type="spellEnd"/>
-      <w:r>
-        <w:rPr>
-          <w:sz w:val="20"/>
-          <w:szCs w:val="20"/>
-        </w:rPr>
-        <w:t>")] * 0.15</w:t>
-      </w:r>
-    </w:p>
-    <w:p>
-      <w:pPr>
-        <w:pStyle w:val="ListParagraph"/>
-        <w:ind w:left="2160"/>
-        <w:rPr>
-          <w:sz w:val="20"/>
-          <w:szCs w:val="20"/>
-        </w:rPr>
-      </w:pPr>
-      <w:proofErr w:type="spellStart"/>
-      <w:r>
-        <w:rPr>
-          <w:sz w:val="20"/>
-          <w:szCs w:val="20"/>
-        </w:rPr>
-        <w:t>jojo_df</w:t>
-      </w:r>
-      <w:proofErr w:type="spellEnd"/>
-      <w:r>
-        <w:rPr>
-          <w:sz w:val="20"/>
-          <w:szCs w:val="20"/>
-        </w:rPr>
-        <w:t xml:space="preserve"> &lt;- </w:t>
-      </w:r>
-      <w:proofErr w:type="spellStart"/>
-      <w:r>
-        <w:rPr>
-          <w:sz w:val="20"/>
-          <w:szCs w:val="20"/>
-        </w:rPr>
-        <w:t>df.flat</w:t>
-      </w:r>
-      <w:proofErr w:type="spellEnd"/>
-      <w:r>
-        <w:rPr>
-          <w:sz w:val="20"/>
-          <w:szCs w:val="20"/>
-        </w:rPr>
-        <w:t>[1:77009, ]</w:t>
-      </w:r>
-    </w:p>
-    <w:p>
-      <w:pPr>
-        <w:pStyle w:val="ListParagraph"/>
-        <w:ind w:left="2160"/>
-        <w:rPr>
-          <w:sz w:val="20"/>
-          <w:szCs w:val="20"/>
-        </w:rPr>
-      </w:pPr>
-      <w:proofErr w:type="spellStart"/>
-      <w:r>
-        <w:rPr>
-          <w:sz w:val="20"/>
-          <w:szCs w:val="20"/>
-        </w:rPr>
-        <w:t>oak_df</w:t>
-      </w:r>
-      <w:proofErr w:type="spellEnd"/>
-      <w:r>
-        <w:rPr>
-          <w:sz w:val="20"/>
-          <w:szCs w:val="20"/>
-        </w:rPr>
-        <w:t xml:space="preserve"> &lt;- </w:t>
-      </w:r>
-      <w:proofErr w:type="spellStart"/>
-      <w:r>
-        <w:rPr>
-          <w:sz w:val="20"/>
-          <w:szCs w:val="20"/>
-        </w:rPr>
-        <w:t>mine.flat</w:t>
-      </w:r>
-      <w:proofErr w:type="spellEnd"/>
-      <w:r>
-        <w:rPr>
-          <w:sz w:val="20"/>
-          <w:szCs w:val="20"/>
-        </w:rPr>
-        <w:t>[3064:80072, ]</w:t>
+        <w:t>oak_df &lt;- mine.flat[3064:80072, ]</w:t>
       </w:r>
     </w:p>
     <w:p>
@@ -3845,15 +3424,7 @@
         </w:numPr>
       </w:pPr>
       <w:r>
-        <w:t xml:space="preserve">I think I should presume that they’re not. That is, </w:t>
-      </w:r>
-      <w:proofErr w:type="spellStart"/>
-      <w:r>
-        <w:t>jojo</w:t>
-      </w:r>
-      <w:proofErr w:type="spellEnd"/>
-      <w:r>
-        <w:t xml:space="preserve"> figured out that the </w:t>
+        <w:t xml:space="preserve">I think I should presume that they’re not. That is, jojo figured out that the </w:t>
       </w:r>
       <w:r>
         <w:t>accel was NED and the mag was NWU. Whatever my accel orientation is determined to be, the mag will probably be an equivalent rotation.</w:t>
@@ -3911,15 +3482,7 @@
         <w:t xml:space="preserve"> the orientation</w:t>
       </w:r>
       <w:r>
-        <w:t xml:space="preserve"> of the </w:t>
-      </w:r>
-      <w:proofErr w:type="spellStart"/>
-      <w:r>
-        <w:t>accels</w:t>
-      </w:r>
-      <w:proofErr w:type="spellEnd"/>
-      <w:r>
-        <w:t xml:space="preserve"> are</w:t>
+        <w:t xml:space="preserve"> of the accels are</w:t>
       </w:r>
       <w:r>
         <w:t xml:space="preserve"> written on the </w:t>
@@ -4172,26 +3735,10 @@
         </w:numPr>
       </w:pPr>
       <w:r>
-        <w:t xml:space="preserve">Was having an issue where there were a lot of unmatched </w:t>
-      </w:r>
-      <w:proofErr w:type="spellStart"/>
-      <w:r>
-        <w:t>gps</w:t>
-      </w:r>
-      <w:proofErr w:type="spellEnd"/>
-      <w:r>
-        <w:t xml:space="preserve"> pings. </w:t>
-      </w:r>
-      <w:r>
-        <w:t xml:space="preserve">Fixed this by switching the order of the </w:t>
-      </w:r>
-      <w:proofErr w:type="spellStart"/>
-      <w:r>
-        <w:t>kets</w:t>
-      </w:r>
-      <w:proofErr w:type="spellEnd"/>
-      <w:r>
-        <w:t xml:space="preserve"> for the rolling join. But I nearly kms before figuring that out.</w:t>
+        <w:t xml:space="preserve">Was having an issue where there were a lot of unmatched gps pings. </w:t>
+      </w:r>
+      <w:r>
+        <w:t>Fixed this by switching the order of the kets for the rolling join. But I nearly kms before figuring that out.</w:t>
       </w:r>
     </w:p>
     <w:p>
@@ -4369,15 +3916,7 @@
         <w:t>Unfortunately,</w:t>
       </w:r>
       <w:r>
-        <w:t xml:space="preserve"> I didn’t wait long enough to get a proper </w:t>
-      </w:r>
-      <w:proofErr w:type="spellStart"/>
-      <w:r>
-        <w:t>gps</w:t>
-      </w:r>
-      <w:proofErr w:type="spellEnd"/>
-      <w:r>
-        <w:t xml:space="preserve"> </w:t>
+        <w:t xml:space="preserve"> I didn’t wait long enough to get a proper gps </w:t>
       </w:r>
       <w:r>
         <w:t>hit but</w:t>
@@ -4487,15 +4026,7 @@
         </w:numPr>
       </w:pPr>
       <w:r>
-        <w:t xml:space="preserve">If the original collar trials had an </w:t>
-      </w:r>
-      <w:proofErr w:type="spellStart"/>
-      <w:r>
-        <w:t>acc</w:t>
-      </w:r>
-      <w:proofErr w:type="spellEnd"/>
-      <w:r>
-        <w:t xml:space="preserve"> of NED and a mag of NWU then… I need to reverse the Y and Z directions for the mag of the true collar orientation. So would be… DES. </w:t>
+        <w:t xml:space="preserve">If the original collar trials had an acc of NED and a mag of NWU then… I need to reverse the Y and Z directions for the mag of the true collar orientation. So would be… DES. </w:t>
       </w:r>
     </w:p>
     <w:p>
@@ -4646,23 +4177,7 @@
         </w:numPr>
       </w:pPr>
       <w:r>
-        <w:t xml:space="preserve">Basically, the calibration event occurs at 28.06.24 18:16:00 local time but the first recorded </w:t>
-      </w:r>
-      <w:proofErr w:type="spellStart"/>
-      <w:r>
-        <w:t>gps</w:t>
-      </w:r>
-      <w:proofErr w:type="spellEnd"/>
-      <w:r>
-        <w:t xml:space="preserve"> time is "2024-06-28 16:28:48 UTC" (about 10 minutes after). Jaz says </w:t>
-      </w:r>
-      <w:proofErr w:type="spellStart"/>
-      <w:r>
-        <w:t>its</w:t>
-      </w:r>
-      <w:proofErr w:type="spellEnd"/>
-      <w:r>
-        <w:t xml:space="preserve"> not possible for the calibration event to have occurred before the first ping… but </w:t>
+        <w:t xml:space="preserve">Basically, the calibration event occurs at 28.06.24 18:16:00 local time but the first recorded gps time is "2024-06-28 16:28:48 UTC" (about 10 minutes after). Jaz says its not possible for the calibration event to have occurred before the first ping… but </w:t>
       </w:r>
       <w:r>
         <w:t>stuff</w:t>
@@ -4731,15 +4246,7 @@
         <w:t>th</w:t>
       </w:r>
       <w:r>
-        <w:t xml:space="preserve"> (first </w:t>
-      </w:r>
-      <w:proofErr w:type="spellStart"/>
-      <w:r>
-        <w:t>gps</w:t>
-      </w:r>
-      <w:proofErr w:type="spellEnd"/>
-      <w:r>
-        <w:t xml:space="preserve"> hit)</w:t>
+        <w:t xml:space="preserve"> (first gps hit)</w:t>
       </w:r>
     </w:p>
     <w:p>
@@ -4751,26 +4258,10 @@
         </w:numPr>
       </w:pPr>
       <w:r>
-        <w:t xml:space="preserve">Yep. Even when I don’t crop the accel, the interpolation sends it forward in time from the first </w:t>
-      </w:r>
-      <w:proofErr w:type="spellStart"/>
-      <w:r>
-        <w:t>gps</w:t>
-      </w:r>
-      <w:proofErr w:type="spellEnd"/>
-      <w:r>
-        <w:t xml:space="preserve"> hit. Interesting. </w:t>
-      </w:r>
-      <w:r>
-        <w:t xml:space="preserve">Where the time jumps backwards in the first </w:t>
-      </w:r>
-      <w:proofErr w:type="spellStart"/>
-      <w:r>
-        <w:t>gps</w:t>
-      </w:r>
-      <w:proofErr w:type="spellEnd"/>
-      <w:r>
-        <w:t xml:space="preserve"> hit. So what the heck went wrong with the reverse interpolation?</w:t>
+        <w:t xml:space="preserve">Yep. Even when I don’t crop the accel, the interpolation sends it forward in time from the first gps hit. Interesting. </w:t>
+      </w:r>
+      <w:r>
+        <w:t>Where the time jumps backwards in the first gps hit. So what the heck went wrong with the reverse interpolation?</w:t>
       </w:r>
     </w:p>
     <w:p>
@@ -4782,23 +4273,7 @@
         </w:numPr>
       </w:pPr>
       <w:r>
-        <w:t xml:space="preserve">RTC accel (left) and the </w:t>
-      </w:r>
-      <w:proofErr w:type="spellStart"/>
-      <w:r>
-        <w:t>gps</w:t>
-      </w:r>
-      <w:proofErr w:type="spellEnd"/>
-      <w:r>
-        <w:t xml:space="preserve"> times look correct, however the conversion to the </w:t>
-      </w:r>
-      <w:proofErr w:type="spellStart"/>
-      <w:r>
-        <w:t>gps</w:t>
-      </w:r>
-      <w:proofErr w:type="spellEnd"/>
-      <w:r>
-        <w:t xml:space="preserve"> time using interpolation is way out (right) where it jumps several days. </w:t>
+        <w:t xml:space="preserve">RTC accel (left) and the gps times look correct, however the conversion to the gps time using interpolation is way out (right) where it jumps several days. </w:t>
       </w:r>
     </w:p>
     <w:p>
@@ -4959,23 +4434,7 @@
         </w:numPr>
       </w:pPr>
       <w:r>
-        <w:t xml:space="preserve">Ah. </w:t>
-      </w:r>
-      <w:proofErr w:type="spellStart"/>
-      <w:r>
-        <w:t>So.</w:t>
-      </w:r>
-      <w:proofErr w:type="spellEnd"/>
-      <w:r>
-        <w:t xml:space="preserve"> The GPS only had 1 reset but the accel had 2 and it cropped the accel too small… </w:t>
-      </w:r>
-      <w:proofErr w:type="spellStart"/>
-      <w:r>
-        <w:t>So.</w:t>
-      </w:r>
-      <w:proofErr w:type="spellEnd"/>
-      <w:r>
-        <w:t xml:space="preserve"> That is an issue. I have to change my joining logic.</w:t>
+        <w:t>Ah. So. The GPS only had 1 reset but the accel had 2 and it cropped the accel too small… So. That is an issue. I have to change my joining logic.</w:t>
       </w:r>
     </w:p>
     <w:p>
@@ -4987,23 +4446,7 @@
         </w:numPr>
       </w:pPr>
       <w:r>
-        <w:t xml:space="preserve">Changed the </w:t>
-      </w:r>
-      <w:proofErr w:type="spellStart"/>
-      <w:r>
-        <w:t>gps</w:t>
-      </w:r>
-      <w:proofErr w:type="spellEnd"/>
-      <w:r>
-        <w:t xml:space="preserve"> </w:t>
-      </w:r>
-      <w:proofErr w:type="spellStart"/>
-      <w:r>
-        <w:t>reset_events</w:t>
-      </w:r>
-      <w:proofErr w:type="spellEnd"/>
-      <w:r>
-        <w:t xml:space="preserve"> manually over to the longest accel sampling period number.</w:t>
+        <w:t>Changed the gps reset_events manually over to the longest accel sampling period number.</w:t>
       </w:r>
     </w:p>
     <w:p>
@@ -5038,13 +4481,8 @@
           <w:numId w:val="2"/>
         </w:numPr>
       </w:pPr>
-      <w:proofErr w:type="spellStart"/>
-      <w:r>
-        <w:t>Jk</w:t>
-      </w:r>
-      <w:proofErr w:type="spellEnd"/>
-      <w:r>
-        <w:t>. The next collar ran into a new problem. It never ends with this BS.</w:t>
+      <w:r>
+        <w:t>Jk. The next collar ran into a new problem. It never ends with this BS.</w:t>
       </w:r>
     </w:p>
     <w:p>
@@ -5195,15 +4633,7 @@
         </w:numPr>
       </w:pPr>
       <w:r>
-        <w:t xml:space="preserve">So am I meant to remove these files or not? When I leave them in, there’s issues. When I take them out, it works… But they </w:t>
-      </w:r>
-      <w:proofErr w:type="spellStart"/>
-      <w:r>
-        <w:t>seeeeeem</w:t>
-      </w:r>
-      <w:proofErr w:type="spellEnd"/>
-      <w:r>
-        <w:t xml:space="preserve"> like they’re correct</w:t>
+        <w:t>So am I meant to remove these files or not? When I leave them in, there’s issues. When I take them out, it works… But they seeeeeem like they’re correct</w:t>
       </w:r>
       <w:r>
         <w:t>? Until we understand how they got there, I’m reluctant to do anything</w:t>
@@ -5603,15 +5033,7 @@
         </w:numPr>
       </w:pPr>
       <w:r>
-        <w:t xml:space="preserve">“good mag </w:t>
-      </w:r>
-      <w:proofErr w:type="spellStart"/>
-      <w:r>
-        <w:t>cal</w:t>
-      </w:r>
-      <w:proofErr w:type="spellEnd"/>
-      <w:r>
-        <w:t xml:space="preserve"> (ensure not wearing watches /have phones/any magnetic interfering stuff on person etc. nearby when doing this)”</w:t>
+        <w:t>“good mag cal (ensure not wearing watches /have phones/any magnetic interfering stuff on person etc. nearby when doing this)”</w:t>
       </w:r>
     </w:p>
     <w:p>
@@ -5623,23 +5045,7 @@
         </w:numPr>
       </w:pPr>
       <w:r>
-        <w:t xml:space="preserve">“In terms of movement bouts, the simple approach would be to use some sort of acceleration magnitude threshold (e.g. </w:t>
-      </w:r>
-      <w:proofErr w:type="spellStart"/>
-      <w:r>
-        <w:t>VeDBA</w:t>
-      </w:r>
-      <w:proofErr w:type="spellEnd"/>
-      <w:r>
-        <w:t xml:space="preserve">)... but for example, something like a kangaroo should be very obvious with jumping behaviour that should come out in acceleration traces as clear stylised patterns which could be manually discerned or via machine learning if you were able to do some </w:t>
-      </w:r>
-      <w:proofErr w:type="spellStart"/>
-      <w:r>
-        <w:t>groundtruthing</w:t>
-      </w:r>
-      <w:proofErr w:type="spellEnd"/>
-      <w:r>
-        <w:t xml:space="preserve"> of behaviours during the data acquisition period.” </w:t>
+        <w:t xml:space="preserve">“In terms of movement bouts, the simple approach would be to use some sort of acceleration magnitude threshold (e.g. VeDBA)... but for example, something like a kangaroo should be very obvious with jumping behaviour that should come out in acceleration traces as clear stylised patterns which could be manually discerned or via machine learning if you were able to do some groundtruthing of behaviours during the data acquisition period.” </w:t>
       </w:r>
       <w:r>
         <w:sym w:font="Wingdings" w:char="F0E0"/>
@@ -5669,29 +5075,13 @@
         </w:numPr>
       </w:pPr>
       <w:r>
-        <w:t xml:space="preserve">“When the penguin is walking, the tag will be nearly vertical, while during swimming, it will be more horizontal. In both cases, the tag’s coordinate frame relative to the penguin’s natural movement (and the ground or water surface) will be different. To ensure accurate heading calculations, I would need to define different tag coordinate systems for walking and swimming and compute the heading separately for each period—on land and at sea—otherwise, my dead-reckoned (DR) tracks could be very </w:t>
-      </w:r>
-      <w:proofErr w:type="spellStart"/>
-      <w:r>
-        <w:t>innacurate</w:t>
-      </w:r>
-      <w:proofErr w:type="spellEnd"/>
-      <w:r>
-        <w:t xml:space="preserve">.” </w:t>
+        <w:t xml:space="preserve">“When the penguin is walking, the tag will be nearly vertical, while during swimming, it will be more horizontal. In both cases, the tag’s coordinate frame relative to the penguin’s natural movement (and the ground or water surface) will be different. To ensure accurate heading calculations, I would need to define different tag coordinate systems for walking and swimming and compute the heading separately for each period—on land and at sea—otherwise, my dead-reckoned (DR) tracks could be very innacurate.” </w:t>
       </w:r>
       <w:r>
         <w:sym w:font="Wingdings" w:char="F0E0"/>
       </w:r>
       <w:r>
-        <w:t xml:space="preserve"> no WONDER my flippy </w:t>
-      </w:r>
-      <w:proofErr w:type="spellStart"/>
-      <w:r>
-        <w:t>flippy</w:t>
-      </w:r>
-      <w:proofErr w:type="spellEnd"/>
-      <w:r>
-        <w:t xml:space="preserve"> stuff doesn’t work.</w:t>
+        <w:t xml:space="preserve"> no WONDER my flippy flippy stuff doesn’t work.</w:t>
       </w:r>
     </w:p>
     <w:p>
@@ -5703,15 +5093,7 @@
         </w:numPr>
       </w:pPr>
       <w:r>
-        <w:t xml:space="preserve">“If you know there’s a specific yaw offset in the tag placement, you can specify it in the compass function. If you’re unsure, you could compare the heading correction factors from </w:t>
-      </w:r>
-      <w:proofErr w:type="spellStart"/>
-      <w:r>
-        <w:t>Gundog.Tracks</w:t>
-      </w:r>
-      <w:proofErr w:type="spellEnd"/>
-      <w:r>
-        <w:t xml:space="preserve">. If the headings are consistently biased in one direction, it could indicate a tag yaw offset or the need for magnetic declination adjustment. But again, if the tag’s yaw offset is minor and consistent, it’s not essential to correct this, as the dead-reckoned track will be consistently biased (in theory, the patterns and scales of tortuosity between GPS points should remain the same, just </w:t>
+        <w:t xml:space="preserve">“If you know there’s a specific yaw offset in the tag placement, you can specify it in the compass function. If you’re unsure, you could compare the heading correction factors from Gundog.Tracks. If the headings are consistently biased in one direction, it could indicate a tag yaw offset or the need for magnetic declination adjustment. But again, if the tag’s yaw offset is minor and consistent, it’s not essential to correct this, as the dead-reckoned track will be consistently biased (in theory, the patterns and scales of tortuosity between GPS points should remain the same, just </w:t>
       </w:r>
       <w:r>
         <w:lastRenderedPageBreak/>
@@ -5727,31 +5109,7 @@
         </w:numPr>
       </w:pPr>
       <w:r>
-        <w:t xml:space="preserve">“What I suggest is to first run the compass function without any offsets applied to derive the pitch and roll angles. Then, determine the mean values of both during periods where you believe the animal and collar are in a normal position, such as during low-activity, steady-state </w:t>
-      </w:r>
-      <w:proofErr w:type="spellStart"/>
-      <w:r>
-        <w:t>behavior</w:t>
-      </w:r>
-      <w:proofErr w:type="spellEnd"/>
-      <w:r>
-        <w:t>. Once you have these values, re-run the function and input them as the '</w:t>
-      </w:r>
-      <w:proofErr w:type="spellStart"/>
-      <w:r>
-        <w:t>pitch.offset</w:t>
-      </w:r>
-      <w:proofErr w:type="spellEnd"/>
-      <w:r>
-        <w:t>' and '</w:t>
-      </w:r>
-      <w:proofErr w:type="spellStart"/>
-      <w:r>
-        <w:t>roll.offset</w:t>
-      </w:r>
-      <w:proofErr w:type="spellEnd"/>
-      <w:r>
-        <w:t>' parameters.”</w:t>
+        <w:t>“What I suggest is to first run the compass function without any offsets applied to derive the pitch and roll angles. Then, determine the mean values of both during periods where you believe the animal and collar are in a normal position, such as during low-activity, steady-state behavior. Once you have these values, re-run the function and input them as the 'pitch.offset' and 'roll.offset' parameters.”</w:t>
       </w:r>
     </w:p>
     <w:p>
@@ -5763,15 +5121,7 @@
         </w:numPr>
       </w:pPr>
       <w:r>
-        <w:t xml:space="preserve">“if you supply a positive pitch offset value of 45°, this reflects that the device is pitched up by 45° from the level, and the function will de-rotate the supplied (smoothed) </w:t>
-      </w:r>
-      <w:proofErr w:type="spellStart"/>
-      <w:r>
-        <w:t>acc</w:t>
-      </w:r>
-      <w:proofErr w:type="spellEnd"/>
-      <w:r>
-        <w:t xml:space="preserve"> and mag (normalised) values by this amount. Similarly, a positive roll value indicates a rightward tilt (bank angle), and a positive yaw value represents a clockwise rotational offset”</w:t>
+        <w:t>“if you supply a positive pitch offset value of 45°, this reflects that the device is pitched up by 45° from the level, and the function will de-rotate the supplied (smoothed) acc and mag (normalised) values by this amount. Similarly, a positive roll value indicates a rightward tilt (bank angle), and a positive yaw value represents a clockwise rotational offset”</w:t>
       </w:r>
     </w:p>
     <w:p>
@@ -5824,95 +5174,7 @@
         </w:numPr>
       </w:pPr>
       <w:r>
-        <w:t xml:space="preserve">“The short answer is, yes - if a wrong ref frame was chosen then DR path </w:t>
-      </w:r>
-      <w:proofErr w:type="spellStart"/>
-      <w:r>
-        <w:t>wil</w:t>
-      </w:r>
-      <w:proofErr w:type="spellEnd"/>
-      <w:r>
-        <w:t xml:space="preserve"> be </w:t>
-      </w:r>
-      <w:proofErr w:type="spellStart"/>
-      <w:r>
-        <w:t>innacurate</w:t>
-      </w:r>
-      <w:proofErr w:type="spellEnd"/>
-      <w:r>
-        <w:t xml:space="preserve">. But comparing subsets with GPS pre-correction will help debug if chosen orientation was correct. The patterns and directions of travel should be similar even if scale is not when compared to GPS. I had some lions where I had to 'figure' out the orientation post release. But visually it should be easy to decipher the heave axis of </w:t>
-      </w:r>
-      <w:proofErr w:type="spellStart"/>
-      <w:r>
-        <w:t>movmement</w:t>
-      </w:r>
-      <w:proofErr w:type="spellEnd"/>
-      <w:r>
-        <w:t xml:space="preserve"> in </w:t>
-      </w:r>
-      <w:proofErr w:type="spellStart"/>
-      <w:r>
-        <w:t>acc</w:t>
-      </w:r>
-      <w:proofErr w:type="spellEnd"/>
-      <w:r>
-        <w:t xml:space="preserve"> and mag (</w:t>
-      </w:r>
-      <w:proofErr w:type="spellStart"/>
-      <w:r>
-        <w:t>acc</w:t>
-      </w:r>
-      <w:proofErr w:type="spellEnd"/>
-      <w:r>
-        <w:t xml:space="preserve"> will be the one closest to +/-1 g most of the time, and mag will the one changing the least)... In terms of deciphering the </w:t>
-      </w:r>
-      <w:proofErr w:type="spellStart"/>
-      <w:r>
-        <w:t>acc</w:t>
-      </w:r>
-      <w:proofErr w:type="spellEnd"/>
-      <w:r>
-        <w:t xml:space="preserve">/mag surge and sway dimensions, this may be more challenging. But for the </w:t>
-      </w:r>
-      <w:proofErr w:type="spellStart"/>
-      <w:r>
-        <w:t>acc</w:t>
-      </w:r>
-      <w:proofErr w:type="spellEnd"/>
-      <w:r>
-        <w:t xml:space="preserve">, you would expect greater variation in surge dimension because they stick their head to ground to forage and then stick their head back up when travelling and </w:t>
-      </w:r>
-      <w:proofErr w:type="spellStart"/>
-      <w:r>
-        <w:t>vigalence</w:t>
-      </w:r>
-      <w:proofErr w:type="spellEnd"/>
-      <w:r>
-        <w:t xml:space="preserve">, so that may help. If mag is different orientation set up to </w:t>
-      </w:r>
-      <w:proofErr w:type="spellStart"/>
-      <w:r>
-        <w:t>acc</w:t>
-      </w:r>
-      <w:proofErr w:type="spellEnd"/>
-      <w:r>
-        <w:t xml:space="preserve">, then </w:t>
-      </w:r>
-      <w:proofErr w:type="spellStart"/>
-      <w:r>
-        <w:t>its</w:t>
-      </w:r>
-      <w:proofErr w:type="spellEnd"/>
-      <w:r>
-        <w:t xml:space="preserve"> worth just checking if you switch the surge/sway orientations then which one produces most </w:t>
-      </w:r>
-      <w:proofErr w:type="spellStart"/>
-      <w:r>
-        <w:t>realsitic</w:t>
-      </w:r>
-      <w:proofErr w:type="spellEnd"/>
-      <w:r>
-        <w:t xml:space="preserve"> DR track relative to GPS... by deciphering the heave axis and dimension of measured g, you already have homed in on just a few possible orientations it could be...”</w:t>
+        <w:t>“The short answer is, yes - if a wrong ref frame was chosen then DR path wil be innacurate. But comparing subsets with GPS pre-correction will help debug if chosen orientation was correct. The patterns and directions of travel should be similar even if scale is not when compared to GPS. I had some lions where I had to 'figure' out the orientation post release. But visually it should be easy to decipher the heave axis of movmement in acc and mag (acc will be the one closest to +/-1 g most of the time, and mag will the one changing the least)... In terms of deciphering the acc/mag surge and sway dimensions, this may be more challenging. But for the acc, you would expect greater variation in surge dimension because they stick their head to ground to forage and then stick their head back up when travelling and vigalence, so that may help. If mag is different orientation set up to acc, then its worth just checking if you switch the surge/sway orientations then which one produces most realsitic DR track relative to GPS... by deciphering the heave axis and dimension of measured g, you already have homed in on just a few possible orientations it could be...”</w:t>
       </w:r>
     </w:p>
     <w:p>
@@ -5974,16 +5236,8 @@
           <w:rPr>
             <w:rStyle w:val="Hyperlink"/>
           </w:rPr>
-          <w:t xml:space="preserve">Dead-reckoning animal movements in R: a reappraisal using </w:t>
+          <w:t>Dead-reckoning animal movements in R: a reappraisal using Gundog.Tracks</w:t>
         </w:r>
-        <w:proofErr w:type="spellStart"/>
-        <w:r>
-          <w:rPr>
-            <w:rStyle w:val="Hyperlink"/>
-          </w:rPr>
-          <w:t>Gundog.Tracks</w:t>
-        </w:r>
-        <w:proofErr w:type="spellEnd"/>
       </w:hyperlink>
       <w:r>
         <w:t xml:space="preserve"> </w:t>
@@ -6048,28 +5302,36 @@
           <w:rFonts w:ascii="Cambria Math" w:hAnsi="Cambria Math"/>
         </w:rPr>
       </w:pPr>
-      <w:proofErr w:type="spellStart"/>
       <w:r>
         <w:rPr>
           <w:rFonts w:ascii="Cambria Math" w:hAnsi="Cambria Math"/>
         </w:rPr>
-        <w:t>Gundog.Tracks</w:t>
-      </w:r>
-      <w:proofErr w:type="spellEnd"/>
+        <w:t>Gundog.Tracks(TS, h, v, elv</w:t>
+      </w:r>
+      <w:r>
+        <w:rPr>
+          <w:rFonts w:ascii="Cambria Math" w:hAnsi="Cambria Math" w:cs="Arial"/>
+        </w:rPr>
+        <w:t> </w:t>
+      </w:r>
       <w:r>
         <w:rPr>
           <w:rFonts w:ascii="Cambria Math" w:hAnsi="Cambria Math"/>
         </w:rPr>
-        <w:t xml:space="preserve">(TS, h, v, </w:t>
-      </w:r>
-      <w:proofErr w:type="spellStart"/>
+        <w:t>=</w:t>
+      </w:r>
+      <w:r>
+        <w:rPr>
+          <w:rFonts w:ascii="Cambria Math" w:hAnsi="Cambria Math" w:cs="Arial"/>
+        </w:rPr>
+        <w:t> </w:t>
+      </w:r>
       <w:r>
         <w:rPr>
           <w:rFonts w:ascii="Cambria Math" w:hAnsi="Cambria Math"/>
         </w:rPr>
-        <w:t>elv</w:t>
-      </w:r>
-      <w:proofErr w:type="spellEnd"/>
+        <w:t>0, p</w:t>
+      </w:r>
       <w:r>
         <w:rPr>
           <w:rFonts w:ascii="Cambria Math" w:hAnsi="Cambria Math" w:cs="Arial"/>
@@ -6092,7 +5354,7 @@
         <w:rPr>
           <w:rFonts w:ascii="Cambria Math" w:hAnsi="Cambria Math"/>
         </w:rPr>
-        <w:t>0, p</w:t>
+        <w:t>NULL, cs</w:t>
       </w:r>
       <w:r>
         <w:rPr>
@@ -6116,7 +5378,7 @@
         <w:rPr>
           <w:rFonts w:ascii="Cambria Math" w:hAnsi="Cambria Math"/>
         </w:rPr>
-        <w:t>NULL, cs</w:t>
+        <w:t>NULL, ch</w:t>
       </w:r>
       <w:r>
         <w:rPr>
@@ -6140,16 +5402,20 @@
         <w:rPr>
           <w:rFonts w:ascii="Cambria Math" w:hAnsi="Cambria Math"/>
         </w:rPr>
-        <w:t xml:space="preserve">NULL, </w:t>
-      </w:r>
-      <w:proofErr w:type="spellStart"/>
+        <w:t>NULL, m</w:t>
+      </w:r>
+      <w:r>
+        <w:rPr>
+          <w:rFonts w:ascii="Cambria Math" w:hAnsi="Cambria Math" w:cs="Arial"/>
+        </w:rPr>
+        <w:t> </w:t>
+      </w:r>
       <w:r>
         <w:rPr>
           <w:rFonts w:ascii="Cambria Math" w:hAnsi="Cambria Math"/>
         </w:rPr>
-        <w:t>ch</w:t>
-      </w:r>
-      <w:proofErr w:type="spellEnd"/>
+        <w:t>=</w:t>
+      </w:r>
       <w:r>
         <w:rPr>
           <w:rFonts w:ascii="Cambria Math" w:hAnsi="Cambria Math" w:cs="Arial"/>
@@ -6160,6 +5426,18 @@
         <w:rPr>
           <w:rFonts w:ascii="Cambria Math" w:hAnsi="Cambria Math"/>
         </w:rPr>
+        <w:t>1, c</w:t>
+      </w:r>
+      <w:r>
+        <w:rPr>
+          <w:rFonts w:ascii="Cambria Math" w:hAnsi="Cambria Math" w:cs="Arial"/>
+        </w:rPr>
+        <w:t> </w:t>
+      </w:r>
+      <w:r>
+        <w:rPr>
+          <w:rFonts w:ascii="Cambria Math" w:hAnsi="Cambria Math"/>
+        </w:rPr>
         <w:t>=</w:t>
       </w:r>
       <w:r>
@@ -6172,7 +5450,7 @@
         <w:rPr>
           <w:rFonts w:ascii="Cambria Math" w:hAnsi="Cambria Math"/>
         </w:rPr>
-        <w:t>NULL, m</w:t>
+        <w:t>0, ME</w:t>
       </w:r>
       <w:r>
         <w:rPr>
@@ -6196,343 +5474,492 @@
         <w:rPr>
           <w:rFonts w:ascii="Cambria Math" w:hAnsi="Cambria Math"/>
         </w:rPr>
+        <w:t>1, lo</w:t>
+      </w:r>
+      <w:r>
+        <w:rPr>
+          <w:rFonts w:ascii="Cambria Math" w:hAnsi="Cambria Math" w:cs="Arial"/>
+        </w:rPr>
+        <w:t> </w:t>
+      </w:r>
+      <w:r>
+        <w:rPr>
+          <w:rFonts w:ascii="Cambria Math" w:hAnsi="Cambria Math"/>
+        </w:rPr>
+        <w:t>=</w:t>
+      </w:r>
+      <w:r>
+        <w:rPr>
+          <w:rFonts w:ascii="Cambria Math" w:hAnsi="Cambria Math" w:cs="Arial"/>
+        </w:rPr>
+        <w:t> </w:t>
+      </w:r>
+      <w:r>
+        <w:rPr>
+          <w:rFonts w:ascii="Cambria Math" w:hAnsi="Cambria Math"/>
+        </w:rPr>
+        <w:t>0, la</w:t>
+      </w:r>
+      <w:r>
+        <w:rPr>
+          <w:rFonts w:ascii="Cambria Math" w:hAnsi="Cambria Math" w:cs="Arial"/>
+        </w:rPr>
+        <w:t> </w:t>
+      </w:r>
+      <w:r>
+        <w:rPr>
+          <w:rFonts w:ascii="Cambria Math" w:hAnsi="Cambria Math"/>
+        </w:rPr>
+        <w:t>=</w:t>
+      </w:r>
+      <w:r>
+        <w:rPr>
+          <w:rFonts w:ascii="Cambria Math" w:hAnsi="Cambria Math" w:cs="Arial"/>
+        </w:rPr>
+        <w:t> </w:t>
+      </w:r>
+      <w:r>
+        <w:rPr>
+          <w:rFonts w:ascii="Cambria Math" w:hAnsi="Cambria Math"/>
+        </w:rPr>
+        <w:t>0, VP.lon</w:t>
+      </w:r>
+      <w:r>
+        <w:rPr>
+          <w:rFonts w:ascii="Cambria Math" w:hAnsi="Cambria Math" w:cs="Arial"/>
+        </w:rPr>
+        <w:t> </w:t>
+      </w:r>
+      <w:r>
+        <w:rPr>
+          <w:rFonts w:ascii="Cambria Math" w:hAnsi="Cambria Math"/>
+        </w:rPr>
+        <w:t>=</w:t>
+      </w:r>
+      <w:r>
+        <w:rPr>
+          <w:rFonts w:ascii="Cambria Math" w:hAnsi="Cambria Math" w:cs="Arial"/>
+        </w:rPr>
+        <w:t> </w:t>
+      </w:r>
+      <w:r>
+        <w:rPr>
+          <w:rFonts w:ascii="Cambria Math" w:hAnsi="Cambria Math"/>
+        </w:rPr>
+        <w:t>NULL, VP.lat</w:t>
+      </w:r>
+      <w:r>
+        <w:rPr>
+          <w:rFonts w:ascii="Cambria Math" w:hAnsi="Cambria Math" w:cs="Arial"/>
+        </w:rPr>
+        <w:t> </w:t>
+      </w:r>
+      <w:r>
+        <w:rPr>
+          <w:rFonts w:ascii="Cambria Math" w:hAnsi="Cambria Math"/>
+        </w:rPr>
+        <w:t>=</w:t>
+      </w:r>
+      <w:r>
+        <w:rPr>
+          <w:rFonts w:ascii="Cambria Math" w:hAnsi="Cambria Math" w:cs="Arial"/>
+        </w:rPr>
+        <w:t> </w:t>
+      </w:r>
+      <w:r>
+        <w:rPr>
+          <w:rFonts w:ascii="Cambria Math" w:hAnsi="Cambria Math"/>
+        </w:rPr>
+        <w:t>NULL, VP.ME</w:t>
+      </w:r>
+      <w:r>
+        <w:rPr>
+          <w:rFonts w:ascii="Cambria Math" w:hAnsi="Cambria Math" w:cs="Arial"/>
+        </w:rPr>
+        <w:t> </w:t>
+      </w:r>
+      <w:r>
+        <w:rPr>
+          <w:rFonts w:ascii="Cambria Math" w:hAnsi="Cambria Math"/>
+        </w:rPr>
+        <w:t>=</w:t>
+      </w:r>
+      <w:r>
+        <w:rPr>
+          <w:rFonts w:ascii="Cambria Math" w:hAnsi="Cambria Math" w:cs="Arial"/>
+        </w:rPr>
+        <w:t> </w:t>
+      </w:r>
+      <w:r>
+        <w:rPr>
+          <w:rFonts w:ascii="Cambria Math" w:hAnsi="Cambria Math"/>
+        </w:rPr>
+        <w:t>FALSE, method</w:t>
+      </w:r>
+      <w:r>
+        <w:rPr>
+          <w:rFonts w:ascii="Cambria Math" w:hAnsi="Cambria Math" w:cs="Arial"/>
+        </w:rPr>
+        <w:t> </w:t>
+      </w:r>
+      <w:r>
+        <w:rPr>
+          <w:rFonts w:ascii="Cambria Math" w:hAnsi="Cambria Math"/>
+        </w:rPr>
+        <w:t>=</w:t>
+      </w:r>
+      <w:r>
+        <w:rPr>
+          <w:rFonts w:ascii="Cambria Math" w:hAnsi="Cambria Math" w:cs="Arial"/>
+        </w:rPr>
+        <w:t> </w:t>
+      </w:r>
+      <w:r>
+        <w:rPr>
+          <w:rFonts w:ascii="Cambria Math" w:hAnsi="Cambria Math"/>
+        </w:rPr>
+        <w:t>NULL, thresh</w:t>
+      </w:r>
+      <w:r>
+        <w:rPr>
+          <w:rFonts w:ascii="Cambria Math" w:hAnsi="Cambria Math" w:cs="Arial"/>
+        </w:rPr>
+        <w:t> </w:t>
+      </w:r>
+      <w:r>
+        <w:rPr>
+          <w:rFonts w:ascii="Cambria Math" w:hAnsi="Cambria Math"/>
+        </w:rPr>
+        <w:t>=</w:t>
+      </w:r>
+      <w:r>
+        <w:rPr>
+          <w:rFonts w:ascii="Cambria Math" w:hAnsi="Cambria Math" w:cs="Arial"/>
+        </w:rPr>
+        <w:t> </w:t>
+      </w:r>
+      <w:r>
+        <w:rPr>
+          <w:rFonts w:ascii="Cambria Math" w:hAnsi="Cambria Math"/>
+        </w:rPr>
+        <w:t>1, dist.step</w:t>
+      </w:r>
+      <w:r>
+        <w:rPr>
+          <w:rFonts w:ascii="Cambria Math" w:hAnsi="Cambria Math" w:cs="Arial"/>
+        </w:rPr>
+        <w:t> </w:t>
+      </w:r>
+      <w:r>
+        <w:rPr>
+          <w:rFonts w:ascii="Cambria Math" w:hAnsi="Cambria Math"/>
+        </w:rPr>
+        <w:t>=</w:t>
+      </w:r>
+      <w:r>
+        <w:rPr>
+          <w:rFonts w:ascii="Cambria Math" w:hAnsi="Cambria Math" w:cs="Arial"/>
+        </w:rPr>
+        <w:t> </w:t>
+      </w:r>
+      <w:r>
+        <w:rPr>
+          <w:rFonts w:ascii="Cambria Math" w:hAnsi="Cambria Math"/>
+        </w:rPr>
+        <w:t>1, bound</w:t>
+      </w:r>
+      <w:r>
+        <w:rPr>
+          <w:rFonts w:ascii="Cambria Math" w:hAnsi="Cambria Math" w:cs="Arial"/>
+        </w:rPr>
+        <w:t> </w:t>
+      </w:r>
+      <w:r>
+        <w:rPr>
+          <w:rFonts w:ascii="Cambria Math" w:hAnsi="Cambria Math"/>
+        </w:rPr>
+        <w:t>=</w:t>
+      </w:r>
+      <w:r>
+        <w:rPr>
+          <w:rFonts w:ascii="Cambria Math" w:hAnsi="Cambria Math" w:cs="Arial"/>
+        </w:rPr>
+        <w:t> </w:t>
+      </w:r>
+      <w:r>
+        <w:rPr>
+          <w:rFonts w:ascii="Cambria Math" w:hAnsi="Cambria Math"/>
+        </w:rPr>
+        <w:t>TRUE, Outgoing</w:t>
+      </w:r>
+      <w:r>
+        <w:rPr>
+          <w:rFonts w:ascii="Cambria Math" w:hAnsi="Cambria Math" w:cs="Arial"/>
+        </w:rPr>
+        <w:t> </w:t>
+      </w:r>
+      <w:r>
+        <w:rPr>
+          <w:rFonts w:ascii="Cambria Math" w:hAnsi="Cambria Math"/>
+        </w:rPr>
+        <w:t>=</w:t>
+      </w:r>
+      <w:r>
+        <w:rPr>
+          <w:rFonts w:ascii="Cambria Math" w:hAnsi="Cambria Math" w:cs="Arial"/>
+        </w:rPr>
+        <w:t> </w:t>
+      </w:r>
+      <w:r>
+        <w:rPr>
+          <w:rFonts w:ascii="Cambria Math" w:hAnsi="Cambria Math"/>
+        </w:rPr>
+        <w:t>TRUE, plot</w:t>
+      </w:r>
+      <w:r>
+        <w:rPr>
+          <w:rFonts w:ascii="Cambria Math" w:hAnsi="Cambria Math" w:cs="Arial"/>
+        </w:rPr>
+        <w:t> </w:t>
+      </w:r>
+      <w:r>
+        <w:rPr>
+          <w:rFonts w:ascii="Cambria Math" w:hAnsi="Cambria Math"/>
+        </w:rPr>
+        <w:t>=</w:t>
+      </w:r>
+      <w:r>
+        <w:rPr>
+          <w:rFonts w:ascii="Cambria Math" w:hAnsi="Cambria Math" w:cs="Arial"/>
+        </w:rPr>
+        <w:t> </w:t>
+      </w:r>
+      <w:r>
+        <w:rPr>
+          <w:rFonts w:ascii="Cambria Math" w:hAnsi="Cambria Math"/>
+        </w:rPr>
+        <w:t>FALSE)</w:t>
+      </w:r>
+    </w:p>
+    <w:p>
+      <w:pPr>
+        <w:pStyle w:val="ListParagraph"/>
+        <w:numPr>
+          <w:ilvl w:val="1"/>
+          <w:numId w:val="2"/>
+        </w:numPr>
+        <w:ind w:left="1080"/>
+      </w:pPr>
+      <w:r>
+        <w:t>See image below for all the possible variables.</w:t>
+      </w:r>
+    </w:p>
+    <w:p>
+      <w:pPr>
+        <w:pStyle w:val="ListParagraph"/>
+        <w:numPr>
+          <w:ilvl w:val="2"/>
+          <w:numId w:val="2"/>
+        </w:numPr>
+        <w:ind w:left="1800"/>
+      </w:pPr>
+      <w:r>
+        <w:t xml:space="preserve">Note that Marked Events (ME) is meant to denote when the animal is and isn’t moving. 0 for </w:t>
+      </w:r>
+      <w:r>
+        <w:t>stationary</w:t>
+      </w:r>
+      <w:r>
+        <w:t>, and 1 for movement.</w:t>
+      </w:r>
+    </w:p>
+    <w:p>
+      <w:pPr>
+        <w:pStyle w:val="ListParagraph"/>
+        <w:numPr>
+          <w:ilvl w:val="3"/>
+          <w:numId w:val="2"/>
+        </w:numPr>
+        <w:ind w:left="2520"/>
+      </w:pPr>
+      <w:r>
+        <w:t>The user may also opt to supply a ‘marked events’ (ME) vector (a marked event is a term we use that refers to a number of sequential (in time) data points within a dataset coded by integer values) to ensure dead-reckoned tracks are not advanced with non-animal movement behaviours.</w:t>
+      </w:r>
+    </w:p>
+    <w:p>
+      <w:pPr>
+        <w:pStyle w:val="ListParagraph"/>
+        <w:numPr>
+          <w:ilvl w:val="3"/>
+          <w:numId w:val="2"/>
+        </w:numPr>
+        <w:ind w:left="2520"/>
+        <w:rPr>
+          <w:highlight w:val="yellow"/>
+        </w:rPr>
+      </w:pPr>
+      <w:r>
+        <w:rPr>
+          <w:highlight w:val="yellow"/>
+        </w:rPr>
+        <w:t>NOTE: If we have been doing this wrong in our trials, why did they work?</w:t>
+      </w:r>
+      <w:r>
+        <w:rPr>
+          <w:highlight w:val="yellow"/>
+        </w:rPr>
+        <w:t xml:space="preserve"> I should switch that over and see what happens…</w:t>
+      </w:r>
+    </w:p>
+    <w:p>
+      <w:pPr>
+        <w:pStyle w:val="ListParagraph"/>
+        <w:numPr>
+          <w:ilvl w:val="2"/>
+          <w:numId w:val="2"/>
+        </w:numPr>
+        <w:ind w:left="1800"/>
+      </w:pPr>
+      <w:r>
+        <w:t xml:space="preserve">high-resolution VP data are available (e.g., 0.01–10 Hz GPS) </w:t>
+      </w:r>
+      <w:r>
+        <w:sym w:font="Wingdings" w:char="F0E0"/>
+      </w:r>
+      <w:r>
+        <w:t xml:space="preserve"> okay, nevermind, we aren’t high frequency enough for this to matter</w:t>
+      </w:r>
+    </w:p>
+    <w:p>
+      <w:pPr>
+        <w:pStyle w:val="ListParagraph"/>
+        <w:numPr>
+          <w:ilvl w:val="2"/>
+          <w:numId w:val="2"/>
+        </w:numPr>
+        <w:ind w:left="1800"/>
+      </w:pPr>
+      <w:r>
+        <w:t>VP.ME when TRUE removes the GPS points when the animal is not moving.</w:t>
+      </w:r>
+    </w:p>
+    <w:p>
+      <w:pPr>
+        <w:pStyle w:val="ListParagraph"/>
+        <w:numPr>
+          <w:ilvl w:val="2"/>
+          <w:numId w:val="2"/>
+        </w:numPr>
+        <w:ind w:left="1800"/>
+      </w:pPr>
+      <w:r>
+        <w:t>Method == “all” will retain all GPS points (rather than selecting only a subset)</w:t>
+      </w:r>
+    </w:p>
+    <w:p>
+      <w:pPr>
+        <w:pStyle w:val="ListParagraph"/>
+        <w:numPr>
+          <w:ilvl w:val="1"/>
+          <w:numId w:val="2"/>
+        </w:numPr>
+        <w:ind w:left="1080"/>
+      </w:pPr>
+      <w:r>
+        <w:t>Within Gundog.Tracks, the user can modulate m, c and ME values to switch between predetermined speed (m</w:t>
+      </w:r>
+      <w:r>
+        <w:rPr>
+          <w:rFonts w:ascii="Arial" w:hAnsi="Arial" w:cs="Arial"/>
+        </w:rPr>
+        <w:t> </w:t>
+      </w:r>
+      <w:r>
+        <w:t>=</w:t>
+      </w:r>
+      <w:r>
+        <w:rPr>
+          <w:rFonts w:ascii="Arial" w:hAnsi="Arial" w:cs="Arial"/>
+        </w:rPr>
+        <w:t> </w:t>
+      </w:r>
+      <w:r>
         <w:t>1, c</w:t>
       </w:r>
       <w:r>
         <w:rPr>
-          <w:rFonts w:ascii="Cambria Math" w:hAnsi="Cambria Math" w:cs="Arial"/>
+          <w:rFonts w:ascii="Arial" w:hAnsi="Arial" w:cs="Arial"/>
         </w:rPr>
         <w:t> </w:t>
       </w:r>
       <w:r>
-        <w:rPr>
-          <w:rFonts w:ascii="Cambria Math" w:hAnsi="Cambria Math"/>
-        </w:rPr>
         <w:t>=</w:t>
       </w:r>
       <w:r>
         <w:rPr>
-          <w:rFonts w:ascii="Cambria Math" w:hAnsi="Cambria Math" w:cs="Arial"/>
+          <w:rFonts w:ascii="Arial" w:hAnsi="Arial" w:cs="Arial"/>
         </w:rPr>
         <w:t> </w:t>
       </w:r>
       <w:r>
-        <w:rPr>
-          <w:rFonts w:ascii="Cambria Math" w:hAnsi="Cambria Math"/>
-        </w:rPr>
-        <w:t>0, ME</w:t>
-      </w:r>
-      <w:r>
-        <w:rPr>
-          <w:rFonts w:ascii="Cambria Math" w:hAnsi="Cambria Math" w:cs="Arial"/>
+        <w:t>0), DBA-derived speed (m</w:t>
+      </w:r>
+      <w:r>
+        <w:rPr>
+          <w:rFonts w:ascii="Arial" w:hAnsi="Arial" w:cs="Arial"/>
         </w:rPr>
         <w:t> </w:t>
       </w:r>
       <w:r>
-        <w:rPr>
-          <w:rFonts w:ascii="Cambria Math" w:hAnsi="Cambria Math"/>
-        </w:rPr>
+        <w:t>&gt;</w:t>
+      </w:r>
+      <w:r>
+        <w:rPr>
+          <w:rFonts w:ascii="Arial" w:hAnsi="Arial" w:cs="Arial"/>
+        </w:rPr>
+        <w:t> </w:t>
+      </w:r>
+      <w:r>
+        <w:t>0, c</w:t>
+      </w:r>
+      <w:r>
+        <w:rPr>
+          <w:rFonts w:ascii="Arial" w:hAnsi="Arial" w:cs="Arial"/>
+        </w:rPr>
+        <w:t> </w:t>
+      </w:r>
+      <w:r>
+        <w:rPr>
+          <w:rFonts w:ascii="Aptos" w:hAnsi="Aptos" w:cs="Aptos"/>
+        </w:rPr>
+        <w:t>≥</w:t>
+      </w:r>
+      <w:r>
+        <w:rPr>
+          <w:rFonts w:ascii="Arial" w:hAnsi="Arial" w:cs="Arial"/>
+        </w:rPr>
+        <w:t> </w:t>
+      </w:r>
+      <w:r>
+        <w:t>0) and stationary behaviour (ME</w:t>
+      </w:r>
+      <w:r>
+        <w:rPr>
+          <w:rFonts w:ascii="Arial" w:hAnsi="Arial" w:cs="Arial"/>
+        </w:rPr>
+        <w:t> </w:t>
+      </w:r>
+      <w:r>
         <w:t>=</w:t>
       </w:r>
       <w:r>
         <w:rPr>
-          <w:rFonts w:ascii="Cambria Math" w:hAnsi="Cambria Math" w:cs="Arial"/>
+          <w:rFonts w:ascii="Arial" w:hAnsi="Arial" w:cs="Arial"/>
         </w:rPr>
         <w:t> </w:t>
       </w:r>
       <w:r>
-        <w:rPr>
-          <w:rFonts w:ascii="Cambria Math" w:hAnsi="Cambria Math"/>
-        </w:rPr>
-        <w:t>1, lo</w:t>
-      </w:r>
-      <w:r>
-        <w:rPr>
-          <w:rFonts w:ascii="Cambria Math" w:hAnsi="Cambria Math" w:cs="Arial"/>
-        </w:rPr>
-        <w:t> </w:t>
-      </w:r>
-      <w:r>
-        <w:rPr>
-          <w:rFonts w:ascii="Cambria Math" w:hAnsi="Cambria Math"/>
-        </w:rPr>
-        <w:t>=</w:t>
-      </w:r>
-      <w:r>
-        <w:rPr>
-          <w:rFonts w:ascii="Cambria Math" w:hAnsi="Cambria Math" w:cs="Arial"/>
-        </w:rPr>
-        <w:t> </w:t>
-      </w:r>
-      <w:r>
-        <w:rPr>
-          <w:rFonts w:ascii="Cambria Math" w:hAnsi="Cambria Math"/>
-        </w:rPr>
-        <w:t>0, la</w:t>
-      </w:r>
-      <w:r>
-        <w:rPr>
-          <w:rFonts w:ascii="Cambria Math" w:hAnsi="Cambria Math" w:cs="Arial"/>
-        </w:rPr>
-        <w:t> </w:t>
-      </w:r>
-      <w:r>
-        <w:rPr>
-          <w:rFonts w:ascii="Cambria Math" w:hAnsi="Cambria Math"/>
-        </w:rPr>
-        <w:t>=</w:t>
-      </w:r>
-      <w:r>
-        <w:rPr>
-          <w:rFonts w:ascii="Cambria Math" w:hAnsi="Cambria Math" w:cs="Arial"/>
-        </w:rPr>
-        <w:t> </w:t>
-      </w:r>
-      <w:r>
-        <w:rPr>
-          <w:rFonts w:ascii="Cambria Math" w:hAnsi="Cambria Math"/>
-        </w:rPr>
-        <w:t xml:space="preserve">0, </w:t>
-      </w:r>
-      <w:proofErr w:type="spellStart"/>
-      <w:r>
-        <w:rPr>
-          <w:rFonts w:ascii="Cambria Math" w:hAnsi="Cambria Math"/>
-        </w:rPr>
-        <w:t>VP.lon</w:t>
-      </w:r>
-      <w:proofErr w:type="spellEnd"/>
-      <w:r>
-        <w:rPr>
-          <w:rFonts w:ascii="Cambria Math" w:hAnsi="Cambria Math" w:cs="Arial"/>
-        </w:rPr>
-        <w:t> </w:t>
-      </w:r>
-      <w:r>
-        <w:rPr>
-          <w:rFonts w:ascii="Cambria Math" w:hAnsi="Cambria Math"/>
-        </w:rPr>
-        <w:t>=</w:t>
-      </w:r>
-      <w:r>
-        <w:rPr>
-          <w:rFonts w:ascii="Cambria Math" w:hAnsi="Cambria Math" w:cs="Arial"/>
-        </w:rPr>
-        <w:t> </w:t>
-      </w:r>
-      <w:r>
-        <w:rPr>
-          <w:rFonts w:ascii="Cambria Math" w:hAnsi="Cambria Math"/>
-        </w:rPr>
-        <w:t xml:space="preserve">NULL, </w:t>
-      </w:r>
-      <w:proofErr w:type="spellStart"/>
-      <w:r>
-        <w:rPr>
-          <w:rFonts w:ascii="Cambria Math" w:hAnsi="Cambria Math"/>
-        </w:rPr>
-        <w:t>VP.lat</w:t>
-      </w:r>
-      <w:proofErr w:type="spellEnd"/>
-      <w:r>
-        <w:rPr>
-          <w:rFonts w:ascii="Cambria Math" w:hAnsi="Cambria Math" w:cs="Arial"/>
-        </w:rPr>
-        <w:t> </w:t>
-      </w:r>
-      <w:r>
-        <w:rPr>
-          <w:rFonts w:ascii="Cambria Math" w:hAnsi="Cambria Math"/>
-        </w:rPr>
-        <w:t>=</w:t>
-      </w:r>
-      <w:r>
-        <w:rPr>
-          <w:rFonts w:ascii="Cambria Math" w:hAnsi="Cambria Math" w:cs="Arial"/>
-        </w:rPr>
-        <w:t> </w:t>
-      </w:r>
-      <w:r>
-        <w:rPr>
-          <w:rFonts w:ascii="Cambria Math" w:hAnsi="Cambria Math"/>
-        </w:rPr>
-        <w:t>NULL, VP.ME</w:t>
-      </w:r>
-      <w:r>
-        <w:rPr>
-          <w:rFonts w:ascii="Cambria Math" w:hAnsi="Cambria Math" w:cs="Arial"/>
-        </w:rPr>
-        <w:t> </w:t>
-      </w:r>
-      <w:r>
-        <w:rPr>
-          <w:rFonts w:ascii="Cambria Math" w:hAnsi="Cambria Math"/>
-        </w:rPr>
-        <w:t>=</w:t>
-      </w:r>
-      <w:r>
-        <w:rPr>
-          <w:rFonts w:ascii="Cambria Math" w:hAnsi="Cambria Math" w:cs="Arial"/>
-        </w:rPr>
-        <w:t> </w:t>
-      </w:r>
-      <w:r>
-        <w:rPr>
-          <w:rFonts w:ascii="Cambria Math" w:hAnsi="Cambria Math"/>
-        </w:rPr>
-        <w:t>FALSE, method</w:t>
-      </w:r>
-      <w:r>
-        <w:rPr>
-          <w:rFonts w:ascii="Cambria Math" w:hAnsi="Cambria Math" w:cs="Arial"/>
-        </w:rPr>
-        <w:t> </w:t>
-      </w:r>
-      <w:r>
-        <w:rPr>
-          <w:rFonts w:ascii="Cambria Math" w:hAnsi="Cambria Math"/>
-        </w:rPr>
-        <w:t>=</w:t>
-      </w:r>
-      <w:r>
-        <w:rPr>
-          <w:rFonts w:ascii="Cambria Math" w:hAnsi="Cambria Math" w:cs="Arial"/>
-        </w:rPr>
-        <w:t> </w:t>
-      </w:r>
-      <w:r>
-        <w:rPr>
-          <w:rFonts w:ascii="Cambria Math" w:hAnsi="Cambria Math"/>
-        </w:rPr>
-        <w:t>NULL, thresh</w:t>
-      </w:r>
-      <w:r>
-        <w:rPr>
-          <w:rFonts w:ascii="Cambria Math" w:hAnsi="Cambria Math" w:cs="Arial"/>
-        </w:rPr>
-        <w:t> </w:t>
-      </w:r>
-      <w:r>
-        <w:rPr>
-          <w:rFonts w:ascii="Cambria Math" w:hAnsi="Cambria Math"/>
-        </w:rPr>
-        <w:t>=</w:t>
-      </w:r>
-      <w:r>
-        <w:rPr>
-          <w:rFonts w:ascii="Cambria Math" w:hAnsi="Cambria Math" w:cs="Arial"/>
-        </w:rPr>
-        <w:t> </w:t>
-      </w:r>
-      <w:r>
-        <w:rPr>
-          <w:rFonts w:ascii="Cambria Math" w:hAnsi="Cambria Math"/>
-        </w:rPr>
-        <w:t xml:space="preserve">1, </w:t>
-      </w:r>
-      <w:proofErr w:type="spellStart"/>
-      <w:r>
-        <w:rPr>
-          <w:rFonts w:ascii="Cambria Math" w:hAnsi="Cambria Math"/>
-        </w:rPr>
-        <w:t>dist.step</w:t>
-      </w:r>
-      <w:proofErr w:type="spellEnd"/>
-      <w:r>
-        <w:rPr>
-          <w:rFonts w:ascii="Cambria Math" w:hAnsi="Cambria Math" w:cs="Arial"/>
-        </w:rPr>
-        <w:t> </w:t>
-      </w:r>
-      <w:r>
-        <w:rPr>
-          <w:rFonts w:ascii="Cambria Math" w:hAnsi="Cambria Math"/>
-        </w:rPr>
-        <w:t>=</w:t>
-      </w:r>
-      <w:r>
-        <w:rPr>
-          <w:rFonts w:ascii="Cambria Math" w:hAnsi="Cambria Math" w:cs="Arial"/>
-        </w:rPr>
-        <w:t> </w:t>
-      </w:r>
-      <w:r>
-        <w:rPr>
-          <w:rFonts w:ascii="Cambria Math" w:hAnsi="Cambria Math"/>
-        </w:rPr>
-        <w:t>1, bound</w:t>
-      </w:r>
-      <w:r>
-        <w:rPr>
-          <w:rFonts w:ascii="Cambria Math" w:hAnsi="Cambria Math" w:cs="Arial"/>
-        </w:rPr>
-        <w:t> </w:t>
-      </w:r>
-      <w:r>
-        <w:rPr>
-          <w:rFonts w:ascii="Cambria Math" w:hAnsi="Cambria Math"/>
-        </w:rPr>
-        <w:t>=</w:t>
-      </w:r>
-      <w:r>
-        <w:rPr>
-          <w:rFonts w:ascii="Cambria Math" w:hAnsi="Cambria Math" w:cs="Arial"/>
-        </w:rPr>
-        <w:t> </w:t>
-      </w:r>
-      <w:r>
-        <w:rPr>
-          <w:rFonts w:ascii="Cambria Math" w:hAnsi="Cambria Math"/>
-        </w:rPr>
-        <w:t>TRUE, Outgoing</w:t>
-      </w:r>
-      <w:r>
-        <w:rPr>
-          <w:rFonts w:ascii="Cambria Math" w:hAnsi="Cambria Math" w:cs="Arial"/>
-        </w:rPr>
-        <w:t> </w:t>
-      </w:r>
-      <w:r>
-        <w:rPr>
-          <w:rFonts w:ascii="Cambria Math" w:hAnsi="Cambria Math"/>
-        </w:rPr>
-        <w:t>=</w:t>
-      </w:r>
-      <w:r>
-        <w:rPr>
-          <w:rFonts w:ascii="Cambria Math" w:hAnsi="Cambria Math" w:cs="Arial"/>
-        </w:rPr>
-        <w:t> </w:t>
-      </w:r>
-      <w:r>
-        <w:rPr>
-          <w:rFonts w:ascii="Cambria Math" w:hAnsi="Cambria Math"/>
-        </w:rPr>
-        <w:t>TRUE, plot</w:t>
-      </w:r>
-      <w:r>
-        <w:rPr>
-          <w:rFonts w:ascii="Cambria Math" w:hAnsi="Cambria Math" w:cs="Arial"/>
-        </w:rPr>
-        <w:t> </w:t>
-      </w:r>
-      <w:r>
-        <w:rPr>
-          <w:rFonts w:ascii="Cambria Math" w:hAnsi="Cambria Math"/>
-        </w:rPr>
-        <w:t>=</w:t>
-      </w:r>
-      <w:r>
-        <w:rPr>
-          <w:rFonts w:ascii="Cambria Math" w:hAnsi="Cambria Math" w:cs="Arial"/>
-        </w:rPr>
-        <w:t> </w:t>
-      </w:r>
-      <w:r>
-        <w:rPr>
-          <w:rFonts w:ascii="Cambria Math" w:hAnsi="Cambria Math"/>
-        </w:rPr>
-        <w:t>FALSE)</w:t>
+        <w:t>0).</w:t>
       </w:r>
     </w:p>
     <w:p>
@@ -6545,252 +5972,7 @@
         <w:ind w:left="1080"/>
       </w:pPr>
       <w:r>
-        <w:t>See image below for all the possible variables.</w:t>
-      </w:r>
-    </w:p>
-    <w:p>
-      <w:pPr>
-        <w:pStyle w:val="ListParagraph"/>
-        <w:numPr>
-          <w:ilvl w:val="2"/>
-          <w:numId w:val="2"/>
-        </w:numPr>
-        <w:ind w:left="1800"/>
-      </w:pPr>
-      <w:r>
-        <w:t xml:space="preserve">Note that Marked Events (ME) is meant to denote when the animal is and isn’t moving. 0 for </w:t>
-      </w:r>
-      <w:r>
-        <w:t>stationary</w:t>
-      </w:r>
-      <w:r>
-        <w:t>, and 1 for movement.</w:t>
-      </w:r>
-    </w:p>
-    <w:p>
-      <w:pPr>
-        <w:pStyle w:val="ListParagraph"/>
-        <w:numPr>
-          <w:ilvl w:val="3"/>
-          <w:numId w:val="2"/>
-        </w:numPr>
-        <w:ind w:left="2520"/>
-      </w:pPr>
-      <w:r>
-        <w:t>The user may also opt to supply a ‘marked events’ (ME) vector (a marked event is a term we use that refers to a number of sequential (in time) data points within a dataset coded by integer values) to ensure dead-reckoned tracks are not advanced with non-animal movement behaviours.</w:t>
-      </w:r>
-    </w:p>
-    <w:p>
-      <w:pPr>
-        <w:pStyle w:val="ListParagraph"/>
-        <w:numPr>
-          <w:ilvl w:val="3"/>
-          <w:numId w:val="2"/>
-        </w:numPr>
-        <w:ind w:left="2520"/>
-        <w:rPr>
-          <w:highlight w:val="yellow"/>
-        </w:rPr>
-      </w:pPr>
-      <w:r>
-        <w:rPr>
-          <w:highlight w:val="yellow"/>
-        </w:rPr>
-        <w:t>NOTE: If we have been doing this wrong in our trials, why did they work?</w:t>
-      </w:r>
-      <w:r>
-        <w:rPr>
-          <w:highlight w:val="yellow"/>
-        </w:rPr>
-        <w:t xml:space="preserve"> I should switch that over and see what happens…</w:t>
-      </w:r>
-    </w:p>
-    <w:p>
-      <w:pPr>
-        <w:pStyle w:val="ListParagraph"/>
-        <w:numPr>
-          <w:ilvl w:val="2"/>
-          <w:numId w:val="2"/>
-        </w:numPr>
-        <w:ind w:left="1800"/>
-      </w:pPr>
-      <w:r>
-        <w:t xml:space="preserve">high-resolution VP data are available (e.g., 0.01–10 Hz GPS) </w:t>
-      </w:r>
-      <w:r>
-        <w:sym w:font="Wingdings" w:char="F0E0"/>
-      </w:r>
-      <w:r>
-        <w:t xml:space="preserve"> okay, </w:t>
-      </w:r>
-      <w:proofErr w:type="spellStart"/>
-      <w:r>
-        <w:t>nevermind</w:t>
-      </w:r>
-      <w:proofErr w:type="spellEnd"/>
-      <w:r>
-        <w:t>, we aren’t high frequency enough for this to matter</w:t>
-      </w:r>
-    </w:p>
-    <w:p>
-      <w:pPr>
-        <w:pStyle w:val="ListParagraph"/>
-        <w:numPr>
-          <w:ilvl w:val="2"/>
-          <w:numId w:val="2"/>
-        </w:numPr>
-        <w:ind w:left="1800"/>
-      </w:pPr>
-      <w:r>
-        <w:t>VP.ME when TRUE removes the GPS points when the animal is not moving.</w:t>
-      </w:r>
-    </w:p>
-    <w:p>
-      <w:pPr>
-        <w:pStyle w:val="ListParagraph"/>
-        <w:numPr>
-          <w:ilvl w:val="2"/>
-          <w:numId w:val="2"/>
-        </w:numPr>
-        <w:ind w:left="1800"/>
-      </w:pPr>
-      <w:r>
-        <w:t>Method == “all” will retain all GPS points (rather than selecting only a subset)</w:t>
-      </w:r>
-    </w:p>
-    <w:p>
-      <w:pPr>
-        <w:pStyle w:val="ListParagraph"/>
-        <w:numPr>
-          <w:ilvl w:val="1"/>
-          <w:numId w:val="2"/>
-        </w:numPr>
-        <w:ind w:left="1080"/>
-      </w:pPr>
-      <w:r>
-        <w:t xml:space="preserve">Within </w:t>
-      </w:r>
-      <w:proofErr w:type="spellStart"/>
-      <w:r>
-        <w:t>Gundog.Tracks</w:t>
-      </w:r>
-      <w:proofErr w:type="spellEnd"/>
-      <w:r>
-        <w:t>, the user can modulate m, c and ME values to switch between predetermined speed (m</w:t>
-      </w:r>
-      <w:r>
-        <w:rPr>
-          <w:rFonts w:ascii="Arial" w:hAnsi="Arial" w:cs="Arial"/>
-        </w:rPr>
-        <w:t> </w:t>
-      </w:r>
-      <w:r>
-        <w:t>=</w:t>
-      </w:r>
-      <w:r>
-        <w:rPr>
-          <w:rFonts w:ascii="Arial" w:hAnsi="Arial" w:cs="Arial"/>
-        </w:rPr>
-        <w:t> </w:t>
-      </w:r>
-      <w:r>
-        <w:t>1, c</w:t>
-      </w:r>
-      <w:r>
-        <w:rPr>
-          <w:rFonts w:ascii="Arial" w:hAnsi="Arial" w:cs="Arial"/>
-        </w:rPr>
-        <w:t> </w:t>
-      </w:r>
-      <w:r>
-        <w:t>=</w:t>
-      </w:r>
-      <w:r>
-        <w:rPr>
-          <w:rFonts w:ascii="Arial" w:hAnsi="Arial" w:cs="Arial"/>
-        </w:rPr>
-        <w:t> </w:t>
-      </w:r>
-      <w:r>
-        <w:t>0), DBA-derived speed (m</w:t>
-      </w:r>
-      <w:r>
-        <w:rPr>
-          <w:rFonts w:ascii="Arial" w:hAnsi="Arial" w:cs="Arial"/>
-        </w:rPr>
-        <w:t> </w:t>
-      </w:r>
-      <w:r>
-        <w:t>&gt;</w:t>
-      </w:r>
-      <w:r>
-        <w:rPr>
-          <w:rFonts w:ascii="Arial" w:hAnsi="Arial" w:cs="Arial"/>
-        </w:rPr>
-        <w:t> </w:t>
-      </w:r>
-      <w:r>
-        <w:t>0, c</w:t>
-      </w:r>
-      <w:r>
-        <w:rPr>
-          <w:rFonts w:ascii="Arial" w:hAnsi="Arial" w:cs="Arial"/>
-        </w:rPr>
-        <w:t> </w:t>
-      </w:r>
-      <w:r>
-        <w:rPr>
-          <w:rFonts w:ascii="Aptos" w:hAnsi="Aptos" w:cs="Aptos"/>
-        </w:rPr>
-        <w:t>≥</w:t>
-      </w:r>
-      <w:r>
-        <w:rPr>
-          <w:rFonts w:ascii="Arial" w:hAnsi="Arial" w:cs="Arial"/>
-        </w:rPr>
-        <w:t> </w:t>
-      </w:r>
-      <w:r>
-        <w:t>0) and stationary behaviour (ME</w:t>
-      </w:r>
-      <w:r>
-        <w:rPr>
-          <w:rFonts w:ascii="Arial" w:hAnsi="Arial" w:cs="Arial"/>
-        </w:rPr>
-        <w:t> </w:t>
-      </w:r>
-      <w:r>
-        <w:t>=</w:t>
-      </w:r>
-      <w:r>
-        <w:rPr>
-          <w:rFonts w:ascii="Arial" w:hAnsi="Arial" w:cs="Arial"/>
-        </w:rPr>
-        <w:t> </w:t>
-      </w:r>
-      <w:r>
-        <w:t>0).</w:t>
-      </w:r>
-    </w:p>
-    <w:p>
-      <w:pPr>
-        <w:pStyle w:val="ListParagraph"/>
-        <w:numPr>
-          <w:ilvl w:val="1"/>
-          <w:numId w:val="2"/>
-        </w:numPr>
-        <w:ind w:left="1080"/>
-      </w:pPr>
-      <w:r>
-        <w:t xml:space="preserve">Here an </w:t>
-      </w:r>
-      <w:proofErr w:type="spellStart"/>
-      <w:r>
-        <w:t>an</w:t>
-      </w:r>
-      <w:proofErr w:type="spellEnd"/>
-      <w:r>
-        <w:t xml:space="preserve"> example from his data that shows the expected error… if he’s using it in the paper then it must be considered good:</w:t>
+        <w:t>Here an an example from his data that shows the expected error… if he’s using it in the paper then it must be considered good:</w:t>
       </w:r>
     </w:p>
     <w:p>
@@ -6973,21 +6155,7 @@
         <w:rPr>
           <w:highlight w:val="yellow"/>
         </w:rPr>
-        <w:t xml:space="preserve">Should I be </w:t>
-      </w:r>
-      <w:proofErr w:type="spellStart"/>
-      <w:r>
-        <w:rPr>
-          <w:highlight w:val="yellow"/>
-        </w:rPr>
-        <w:t>downsampling</w:t>
-      </w:r>
-      <w:proofErr w:type="spellEnd"/>
-      <w:r>
-        <w:rPr>
-          <w:highlight w:val="yellow"/>
-        </w:rPr>
-        <w:t xml:space="preserve"> my accelerometer? Have I missed that?</w:t>
+        <w:t>Should I be downsampling my accelerometer? Have I missed that?</w:t>
       </w:r>
     </w:p>
     <w:p>
@@ -7104,15 +6272,7 @@
         <w:ind w:left="1080"/>
       </w:pPr>
       <w:r>
-        <w:t xml:space="preserve">We recommend implementing a running mean (cf. Eq. 1, R1:4) to raw </w:t>
-      </w:r>
-      <w:proofErr w:type="spellStart"/>
-      <w:r>
-        <w:t>VeDBA</w:t>
-      </w:r>
-      <w:proofErr w:type="spellEnd"/>
-      <w:r>
-        <w:t xml:space="preserve"> values to ensure that both acceleration and deceleration components of a stride cycle are incorporated together per unit time and to reduce the magnitude of small temporal spikes</w:t>
+        <w:t>We recommend implementing a running mean (cf. Eq. 1, R1:4) to raw VeDBA values to ensure that both acceleration and deceleration components of a stride cycle are incorporated together per unit time and to reduce the magnitude of small temporal spikes</w:t>
       </w:r>
     </w:p>
     <w:p>
@@ -7477,13 +6637,8 @@
           </w:tcPr>
           <w:p>
             <w:r>
-              <w:t xml:space="preserve">X </w:t>
+              <w:t>X acc</w:t>
             </w:r>
-            <w:proofErr w:type="spellStart"/>
-            <w:r>
-              <w:t>acc</w:t>
-            </w:r>
-            <w:proofErr w:type="spellEnd"/>
           </w:p>
         </w:tc>
         <w:tc>
@@ -7527,13 +6682,8 @@
           </w:tcPr>
           <w:p>
             <w:r>
-              <w:t xml:space="preserve">Y </w:t>
+              <w:t>Y acc</w:t>
             </w:r>
-            <w:proofErr w:type="spellStart"/>
-            <w:r>
-              <w:t>acc</w:t>
-            </w:r>
-            <w:proofErr w:type="spellEnd"/>
           </w:p>
         </w:tc>
         <w:tc>
@@ -7577,13 +6727,8 @@
           </w:tcPr>
           <w:p>
             <w:r>
-              <w:t xml:space="preserve">Z </w:t>
+              <w:t>Z acc</w:t>
             </w:r>
-            <w:proofErr w:type="spellStart"/>
-            <w:r>
-              <w:t>acc</w:t>
-            </w:r>
-            <w:proofErr w:type="spellEnd"/>
           </w:p>
         </w:tc>
         <w:tc>
@@ -7751,15 +6896,7 @@
         </w:numPr>
       </w:pPr>
       <w:r>
-        <w:t>I then tried to verify this by looking at the accelerometer data when the animal was standing up (ground-</w:t>
-      </w:r>
-      <w:proofErr w:type="spellStart"/>
-      <w:r>
-        <w:t>truthed</w:t>
-      </w:r>
-      <w:proofErr w:type="spellEnd"/>
-      <w:r>
-        <w:t xml:space="preserve"> with video). Red is X, Blue is Y, Green is Z. When the animal is standing up, the X axis has close to 0 gravity. The gravity is shared over the Y and Z, with the most on the Z. This indicates that the collar is tipped forwards. </w:t>
+        <w:t xml:space="preserve">I then tried to verify this by looking at the accelerometer data when the animal was standing up (ground-truthed with video). Red is X, Blue is Y, Green is Z. When the animal is standing up, the X axis has close to 0 gravity. The gravity is shared over the Y and Z, with the most on the Z. This indicates that the collar is tipped forwards. </w:t>
       </w:r>
     </w:p>
     <w:p>
@@ -7919,15 +7056,7 @@
         </w:numPr>
       </w:pPr>
       <w:r>
-        <w:t xml:space="preserve">Therefore, I propose the orientation is: </w:t>
-      </w:r>
-      <w:proofErr w:type="spellStart"/>
-      <w:r>
-        <w:t>acc</w:t>
-      </w:r>
-      <w:proofErr w:type="spellEnd"/>
-      <w:r>
-        <w:t xml:space="preserve"> EUS, mag EDN, gravity down, and a pitch forward of about 48 degrees…</w:t>
+        <w:t>Therefore, I propose the orientation is: acc EUS, mag EDN, gravity down, and a pitch forward of about 48 degrees…</w:t>
       </w:r>
     </w:p>
     <w:p>
@@ -8201,15 +7330,7 @@
         <w:t>I have seen information about the Median Filter come up</w:t>
       </w:r>
       <w:r>
-        <w:t xml:space="preserve">… </w:t>
-      </w:r>
-      <w:proofErr w:type="spellStart"/>
-      <w:r>
-        <w:t>trialing</w:t>
-      </w:r>
-      <w:proofErr w:type="spellEnd"/>
-      <w:r>
-        <w:t xml:space="preserve"> that now.</w:t>
+        <w:t>… trialing that now.</w:t>
       </w:r>
     </w:p>
     <w:p>
@@ -8768,15 +7889,7 @@
         </w:numPr>
       </w:pPr>
       <w:r>
-        <w:t xml:space="preserve">I have put message in chat to get </w:t>
-      </w:r>
-      <w:proofErr w:type="spellStart"/>
-      <w:r>
-        <w:t>ChrisB</w:t>
-      </w:r>
-      <w:proofErr w:type="spellEnd"/>
-      <w:r>
-        <w:t xml:space="preserve"> thoughts but in the meantime I will work towards what I think the next step will be: finding all the misread sections and removing them. Similar to the kangaroo data (though that’s worse), we have to go through and chop up the data into good sections with NA’s in between</w:t>
+        <w:t>I have put message in chat to get ChrisB thoughts but in the meantime I will work towards what I think the next step will be: finding all the misread sections and removing them. Similar to the kangaroo data (though that’s worse), we have to go through and chop up the data into good sections with NA’s in between</w:t>
       </w:r>
       <w:r>
         <w:t>?</w:t>
@@ -8983,15 +8096,7 @@
         </w:numPr>
       </w:pPr>
       <w:r>
-        <w:t xml:space="preserve">Then </w:t>
-      </w:r>
-      <w:proofErr w:type="spellStart"/>
-      <w:r>
-        <w:t>ChrisB</w:t>
-      </w:r>
-      <w:proofErr w:type="spellEnd"/>
-      <w:r>
-        <w:t xml:space="preserve"> pointed out that this was happening over hours not minutes, and is therefore more likely to be sleeping. He said “</w:t>
+        <w:t>Then ChrisB pointed out that this was happening over hours not minutes, and is therefore more likely to be sleeping. He said “</w:t>
       </w:r>
       <w:r>
         <w:rPr>
@@ -9000,15 +8105,7 @@
         <w:t>In that static accelerometer region it's likely just measuring gravity, but if the rotation of the collar isn't pointing the right way it will see that as an acceleration in the wrong direction and pick that up as movement”</w:t>
       </w:r>
       <w:r>
-        <w:t xml:space="preserve">. </w:t>
-      </w:r>
-      <w:proofErr w:type="spellStart"/>
-      <w:r>
-        <w:t>Ahhhh</w:t>
-      </w:r>
-      <w:proofErr w:type="spellEnd"/>
-      <w:r>
-        <w:t xml:space="preserve"> brilliant man has saved me once again. So if I can detect that as sleeping then I can set to no movement and no DR during that period. </w:t>
+        <w:t xml:space="preserve">. Ahhhh brilliant man has saved me once again. So if I can detect that as sleeping then I can set to no movement and no DR during that period. </w:t>
       </w:r>
     </w:p>
     <w:p>
@@ -9156,15 +8253,7 @@
         <w:sym w:font="Wingdings" w:char="F0E0"/>
       </w:r>
       <w:r>
-        <w:t xml:space="preserve"> </w:t>
-      </w:r>
-      <w:proofErr w:type="spellStart"/>
-      <w:r>
-        <w:t>ifelse</w:t>
-      </w:r>
-      <w:proofErr w:type="spellEnd"/>
-      <w:r>
-        <w:t>(VDBA.sm &gt; 0.015, 0, 1) &amp; most common level in 60 seconds (3000 samples)</w:t>
+        <w:t xml:space="preserve"> ifelse(VDBA.sm &gt; 0.015, 0, 1) &amp; most common level in 60 seconds (3000 samples)</w:t>
       </w:r>
       <w:r>
         <w:t>)</w:t>
@@ -9182,15 +8271,7 @@
         <w:t xml:space="preserve">Testing that </w:t>
       </w:r>
       <w:r>
-        <w:t xml:space="preserve">however showed no difference and the </w:t>
-      </w:r>
-      <w:proofErr w:type="spellStart"/>
-      <w:r>
-        <w:t>gps</w:t>
-      </w:r>
-      <w:proofErr w:type="spellEnd"/>
-      <w:r>
-        <w:t xml:space="preserve"> is moving consistently through the period???</w:t>
+        <w:t>however showed no difference and the gps is moving consistently through the period???</w:t>
       </w:r>
     </w:p>
     <w:p>
@@ -9429,15 +8510,7 @@
         </w:numPr>
       </w:pPr>
       <w:r>
-        <w:t xml:space="preserve">Firstly I continued with the cleaning by adding a lowpass </w:t>
-      </w:r>
-      <w:proofErr w:type="spellStart"/>
-      <w:r>
-        <w:t>butterworth</w:t>
-      </w:r>
-      <w:proofErr w:type="spellEnd"/>
-      <w:r>
-        <w:t xml:space="preserve"> filter with a cutoff of 10Hz. The results of the 3 steps of smoothing shown in right plot below.</w:t>
+        <w:t>Firstly I continued with the cleaning by adding a lowpass butterworth filter with a cutoff of 10Hz. The results of the 3 steps of smoothing shown in right plot below.</w:t>
       </w:r>
     </w:p>
     <w:p>
@@ -9573,15 +8646,7 @@
         <w:t>For example, in this case, there are 2 stationary periods where there should be no GPS changes.</w:t>
       </w:r>
       <w:r>
-        <w:t xml:space="preserve"> The dark blue dots in the </w:t>
-      </w:r>
-      <w:proofErr w:type="spellStart"/>
-      <w:r>
-        <w:t>gps</w:t>
-      </w:r>
-      <w:proofErr w:type="spellEnd"/>
-      <w:r>
-        <w:t xml:space="preserve"> graph right show the stationary periods. The green dots are what got fed to the spline and the red is the spline path.</w:t>
+        <w:t xml:space="preserve"> The dark blue dots in the gps graph right show the stationary periods. The green dots are what got fed to the spline and the red is the spline path.</w:t>
       </w:r>
       <w:r>
         <w:t xml:space="preserve"> Note there are only 2 black dots because all the stationary got grouped.</w:t>
@@ -9841,15 +8906,7 @@
         </w:numPr>
       </w:pPr>
       <w:r>
-        <w:t xml:space="preserve">Then </w:t>
-      </w:r>
-      <w:proofErr w:type="spellStart"/>
-      <w:r>
-        <w:t>ChrisB</w:t>
-      </w:r>
-      <w:proofErr w:type="spellEnd"/>
-      <w:r>
-        <w:t xml:space="preserve"> helped me for a few hours, figuring out many things. For example, he found that everything was scaled by 4 because the settings of the accelerometer weren’t what I thought. (They were 16 for the kangaroos but 4 for the impala) </w:t>
+        <w:t xml:space="preserve">Then ChrisB helped me for a few hours, figuring out many things. For example, he found that everything was scaled by 4 because the settings of the accelerometer weren’t what I thought. (They were 16 for the kangaroos but 4 for the impala) </w:t>
       </w:r>
     </w:p>
     <w:p>
@@ -9941,15 +8998,7 @@
         </w:numPr>
       </w:pPr>
       <w:r>
-        <w:t xml:space="preserve">Chris Bird also doesn’t believe in tilt-corrected accelerometer based DR and thinks we should have to use the gyroscope (pronounced </w:t>
-      </w:r>
-      <w:proofErr w:type="spellStart"/>
-      <w:r>
-        <w:t>guyroscope</w:t>
-      </w:r>
-      <w:proofErr w:type="spellEnd"/>
-      <w:r>
-        <w:t>… as I learnt today)</w:t>
+        <w:t>Chris Bird also doesn’t believe in tilt-corrected accelerometer based DR and thinks we should have to use the gyroscope (pronounced guyroscope… as I learnt today)</w:t>
       </w:r>
     </w:p>
     <w:p>
@@ -9993,39 +9042,7 @@
           <w:i/>
           <w:iCs/>
         </w:rPr>
-        <w:t xml:space="preserve">The short answer is, yes - if a wrong ref frame was chosen then DR path </w:t>
-      </w:r>
-      <w:proofErr w:type="spellStart"/>
-      <w:r>
-        <w:rPr>
-          <w:i/>
-          <w:iCs/>
-        </w:rPr>
-        <w:t>wil</w:t>
-      </w:r>
-      <w:proofErr w:type="spellEnd"/>
-      <w:r>
-        <w:rPr>
-          <w:i/>
-          <w:iCs/>
-        </w:rPr>
-        <w:t xml:space="preserve"> be </w:t>
-      </w:r>
-      <w:proofErr w:type="spellStart"/>
-      <w:r>
-        <w:rPr>
-          <w:i/>
-          <w:iCs/>
-        </w:rPr>
-        <w:t>innacurate</w:t>
-      </w:r>
-      <w:proofErr w:type="spellEnd"/>
-      <w:r>
-        <w:rPr>
-          <w:i/>
-          <w:iCs/>
-        </w:rPr>
-        <w:t xml:space="preserve">. But comparing subsets with GPS pre-correction will help debug if chosen orientation was </w:t>
+        <w:t xml:space="preserve">The short answer is, yes - if a wrong ref frame was chosen then DR path wil be innacurate. But comparing subsets with GPS pre-correction will help debug if chosen orientation was </w:t>
       </w:r>
       <w:r>
         <w:rPr>
@@ -10041,164 +9058,44 @@
           <w:iCs/>
           <w:highlight w:val="green"/>
         </w:rPr>
-        <w:t xml:space="preserve">heave axis of </w:t>
-      </w:r>
-      <w:proofErr w:type="spellStart"/>
+        <w:t>heave axis of movmement</w:t>
+      </w:r>
+      <w:r>
+        <w:rPr>
+          <w:i/>
+          <w:iCs/>
+        </w:rPr>
+        <w:t xml:space="preserve"> in acc and mag (</w:t>
+      </w:r>
       <w:r>
         <w:rPr>
           <w:i/>
           <w:iCs/>
           <w:highlight w:val="green"/>
         </w:rPr>
-        <w:t>movmement</w:t>
-      </w:r>
-      <w:proofErr w:type="spellEnd"/>
+        <w:t>acc will be the one closest to +/-1 g most of the time, and mag will the one changing the least</w:t>
+      </w:r>
       <w:r>
         <w:rPr>
           <w:i/>
           <w:iCs/>
         </w:rPr>
-        <w:t xml:space="preserve"> in </w:t>
-      </w:r>
-      <w:proofErr w:type="spellStart"/>
-      <w:r>
-        <w:rPr>
-          <w:i/>
-          <w:iCs/>
-        </w:rPr>
-        <w:t>acc</w:t>
-      </w:r>
-      <w:proofErr w:type="spellEnd"/>
-      <w:r>
-        <w:rPr>
-          <w:i/>
-          <w:iCs/>
-        </w:rPr>
-        <w:t xml:space="preserve"> and mag (</w:t>
-      </w:r>
-      <w:proofErr w:type="spellStart"/>
-      <w:r>
-        <w:rPr>
-          <w:i/>
-          <w:iCs/>
-          <w:highlight w:val="green"/>
-        </w:rPr>
-        <w:t>acc</w:t>
-      </w:r>
-      <w:proofErr w:type="spellEnd"/>
-      <w:r>
-        <w:rPr>
-          <w:i/>
-          <w:iCs/>
-          <w:highlight w:val="green"/>
-        </w:rPr>
-        <w:t xml:space="preserve"> will be the one closest to +/-1 g most of the time, and mag will the one changing the least</w:t>
-      </w:r>
-      <w:r>
-        <w:rPr>
-          <w:i/>
-          <w:iCs/>
-        </w:rPr>
-        <w:t xml:space="preserve">)... In terms of deciphering the </w:t>
-      </w:r>
-      <w:proofErr w:type="spellStart"/>
-      <w:r>
-        <w:rPr>
-          <w:i/>
-          <w:iCs/>
-        </w:rPr>
-        <w:t>acc</w:t>
-      </w:r>
-      <w:proofErr w:type="spellEnd"/>
-      <w:r>
-        <w:rPr>
-          <w:i/>
-          <w:iCs/>
-        </w:rPr>
-        <w:t xml:space="preserve">/mag surge and sway dimensions, this may be more challenging. But for the </w:t>
-      </w:r>
-      <w:proofErr w:type="spellStart"/>
+        <w:t xml:space="preserve">)... In terms of deciphering the acc/mag surge and sway dimensions, this may be more challenging. But for the </w:t>
+      </w:r>
       <w:r>
         <w:rPr>
           <w:i/>
           <w:iCs/>
           <w:highlight w:val="yellow"/>
         </w:rPr>
-        <w:t>acc</w:t>
-      </w:r>
-      <w:proofErr w:type="spellEnd"/>
+        <w:t>acc, you would expect greater variation in surge dimension because they stick their head to ground to forage and then stick their head back up when travelling and vigalence</w:t>
+      </w:r>
       <w:r>
         <w:rPr>
           <w:i/>
           <w:iCs/>
-          <w:highlight w:val="yellow"/>
-        </w:rPr>
-        <w:t xml:space="preserve">, you would expect greater variation in surge dimension because they stick their head to ground to forage and then stick their head back up when travelling and </w:t>
-      </w:r>
-      <w:proofErr w:type="spellStart"/>
-      <w:r>
-        <w:rPr>
-          <w:i/>
-          <w:iCs/>
-          <w:highlight w:val="yellow"/>
-        </w:rPr>
-        <w:t>vigalence</w:t>
-      </w:r>
-      <w:proofErr w:type="spellEnd"/>
-      <w:r>
-        <w:rPr>
-          <w:i/>
-          <w:iCs/>
-        </w:rPr>
-        <w:t xml:space="preserve">, so that may help. If mag is different orientation set up to </w:t>
-      </w:r>
-      <w:proofErr w:type="spellStart"/>
-      <w:r>
-        <w:rPr>
-          <w:i/>
-          <w:iCs/>
-        </w:rPr>
-        <w:t>acc</w:t>
-      </w:r>
-      <w:proofErr w:type="spellEnd"/>
-      <w:r>
-        <w:rPr>
-          <w:i/>
-          <w:iCs/>
-        </w:rPr>
-        <w:t xml:space="preserve">, then </w:t>
-      </w:r>
-      <w:proofErr w:type="spellStart"/>
-      <w:r>
-        <w:rPr>
-          <w:i/>
-          <w:iCs/>
-        </w:rPr>
-        <w:t>its</w:t>
-      </w:r>
-      <w:proofErr w:type="spellEnd"/>
-      <w:r>
-        <w:rPr>
-          <w:i/>
-          <w:iCs/>
-        </w:rPr>
-        <w:t xml:space="preserve"> worth just checking if you switch the surge/sway orientations then which one produces most </w:t>
-      </w:r>
-      <w:proofErr w:type="spellStart"/>
-      <w:r>
-        <w:rPr>
-          <w:i/>
-          <w:iCs/>
-        </w:rPr>
-        <w:t>realsitic</w:t>
-      </w:r>
-      <w:proofErr w:type="spellEnd"/>
-      <w:r>
-        <w:rPr>
-          <w:i/>
-          <w:iCs/>
-        </w:rPr>
-        <w:t xml:space="preserve"> DR track relative to GPS... by deciphering the heave axis and dimension of measured g, you already have homed in on just a few possible orientations it could be...</w:t>
+        </w:rPr>
+        <w:t>, so that may help. If mag is different orientation set up to acc, then its worth just checking if you switch the surge/sway orientations then which one produces most realsitic DR track relative to GPS... by deciphering the heave axis and dimension of measured g, you already have homed in on just a few possible orientations it could be...</w:t>
       </w:r>
     </w:p>
     <w:p>
@@ -10383,29 +9280,8 @@
           <w:numId w:val="2"/>
         </w:numPr>
       </w:pPr>
-      <w:proofErr w:type="spellStart"/>
-      <w:r>
-        <w:t>acc_orientation</w:t>
-      </w:r>
-      <w:proofErr w:type="spellEnd"/>
-      <w:r>
-        <w:t xml:space="preserve"> &lt;- "NWU",   </w:t>
-      </w:r>
-      <w:proofErr w:type="spellStart"/>
-      <w:r>
-        <w:t>mag_orientation</w:t>
-      </w:r>
-      <w:proofErr w:type="spellEnd"/>
-      <w:r>
-        <w:t xml:space="preserve"> &lt;- "NED",   </w:t>
-      </w:r>
-      <w:proofErr w:type="spellStart"/>
-      <w:r>
-        <w:t>gravity_direction</w:t>
-      </w:r>
-      <w:proofErr w:type="spellEnd"/>
-      <w:r>
-        <w:t xml:space="preserve"> &lt;- "down",   pitch &lt;- 0#-48</w:t>
+      <w:r>
+        <w:t>acc_orientation &lt;- "NWU",   mag_orientation &lt;- "NED",   gravity_direction &lt;- "down",   pitch &lt;- 0#-48</w:t>
       </w:r>
     </w:p>
     <w:p>
@@ -10730,15 +9606,7 @@
     <w:p/>
     <w:p>
       <w:r>
-        <w:t>X = "salmon", Y = "turquoise", Z = "</w:t>
-      </w:r>
-      <w:proofErr w:type="spellStart"/>
-      <w:r>
-        <w:t>darkblue</w:t>
-      </w:r>
-      <w:proofErr w:type="spellEnd"/>
-      <w:r>
-        <w:t>"</w:t>
+        <w:t>X = "salmon", Y = "turquoise", Z = "darkblue"</w:t>
       </w:r>
     </w:p>
     <w:p>
@@ -11226,23 +10094,7 @@
           <w:rFonts w:asciiTheme="minorHAnsi" w:hAnsiTheme="minorHAnsi"/>
           <w:lang w:val="en-GB"/>
         </w:rPr>
-        <w:t xml:space="preserve">Plotted it to see what units the devices are in and holy fuck, why are they all different??? What evil tomfoolery is this?????? Messaged </w:t>
-      </w:r>
-      <w:proofErr w:type="spellStart"/>
-      <w:r>
-        <w:rPr>
-          <w:rFonts w:asciiTheme="minorHAnsi" w:hAnsiTheme="minorHAnsi"/>
-          <w:lang w:val="en-GB"/>
-        </w:rPr>
-        <w:t>ChrisB</w:t>
-      </w:r>
-      <w:proofErr w:type="spellEnd"/>
-      <w:r>
-        <w:rPr>
-          <w:rFonts w:asciiTheme="minorHAnsi" w:hAnsiTheme="minorHAnsi"/>
-          <w:lang w:val="en-GB"/>
-        </w:rPr>
-        <w:t xml:space="preserve"> to ask what the heck is going on.</w:t>
+        <w:t>Plotted it to see what units the devices are in and holy fuck, why are they all different??? What evil tomfoolery is this?????? Messaged ChrisB to ask what the heck is going on.</w:t>
       </w:r>
     </w:p>
     <w:p>
@@ -11545,46 +10397,21 @@
           <w:rFonts w:asciiTheme="minorHAnsi" w:hAnsiTheme="minorHAnsi"/>
           <w:lang w:val="en-GB"/>
         </w:rPr>
-        <w:t xml:space="preserve">Basically I found that there are 3 settings. Either the device is already in G (either 16 or 4) or its in raw units and has to be converted. The cropping at 4g means I am going to have to match and join it to the </w:t>
-      </w:r>
-      <w:proofErr w:type="spellStart"/>
+        <w:t xml:space="preserve">Basically I found that there are 3 settings. Either the device is already in G (either 16 or 4) or its in raw units and has to be converted. The cropping at 4g means I am going to have to match and join it to the Axivity </w:t>
+      </w:r>
+      <w:r>
+        <w:rPr>
+          <w:rFonts w:ascii="Segoe UI Emoji" w:hAnsi="Segoe UI Emoji" w:cs="Segoe UI Emoji"/>
+          <w:lang w:val="en-GB"/>
+        </w:rPr>
+        <w:t>😢</w:t>
+      </w:r>
       <w:r>
         <w:rPr>
           <w:rFonts w:asciiTheme="minorHAnsi" w:hAnsiTheme="minorHAnsi"/>
           <w:lang w:val="en-GB"/>
         </w:rPr>
-        <w:t>Axivity</w:t>
-      </w:r>
-      <w:proofErr w:type="spellEnd"/>
-      <w:r>
-        <w:rPr>
-          <w:rFonts w:asciiTheme="minorHAnsi" w:hAnsiTheme="minorHAnsi"/>
-          <w:lang w:val="en-GB"/>
-        </w:rPr>
-        <w:t xml:space="preserve"> </w:t>
-      </w:r>
-      <w:r>
-        <w:rPr>
-          <w:rFonts w:ascii="Segoe UI Emoji" w:hAnsi="Segoe UI Emoji" w:cs="Segoe UI Emoji"/>
-          <w:lang w:val="en-GB"/>
-        </w:rPr>
-        <w:t>😢</w:t>
-      </w:r>
-      <w:proofErr w:type="spellStart"/>
-      <w:r>
-        <w:rPr>
-          <w:rFonts w:asciiTheme="minorHAnsi" w:hAnsiTheme="minorHAnsi"/>
-          <w:lang w:val="en-GB"/>
-        </w:rPr>
-        <w:t>ChrisC</w:t>
-      </w:r>
-      <w:proofErr w:type="spellEnd"/>
-      <w:r>
-        <w:rPr>
-          <w:rFonts w:asciiTheme="minorHAnsi" w:hAnsiTheme="minorHAnsi"/>
-          <w:lang w:val="en-GB"/>
-        </w:rPr>
-        <w:t xml:space="preserve"> says this code exists and already works… but I’ve heard that often enough to know that means “this will be hard”.</w:t>
+        <w:t>ChrisC says this code exists and already works… but I’ve heard that often enough to know that means “this will be hard”.</w:t>
       </w:r>
     </w:p>
     <w:tbl>
@@ -11657,7 +10484,6 @@
                 <w14:ligatures w14:val="none"/>
               </w:rPr>
             </w:pPr>
-            <w:proofErr w:type="spellStart"/>
             <w:r>
               <w:rPr>
                 <w:rFonts w:ascii="Aptos Narrow" w:eastAsia="Times New Roman" w:hAnsi="Aptos Narrow" w:cs="Times New Roman"/>
@@ -11670,7 +10496,6 @@
               </w:rPr>
               <w:t>avg_hz</w:t>
             </w:r>
-            <w:proofErr w:type="spellEnd"/>
           </w:p>
         </w:tc>
         <w:tc>
@@ -11692,7 +10517,6 @@
                 <w14:ligatures w14:val="none"/>
               </w:rPr>
             </w:pPr>
-            <w:proofErr w:type="spellStart"/>
             <w:r>
               <w:rPr>
                 <w:rFonts w:ascii="Aptos Narrow" w:eastAsia="Times New Roman" w:hAnsi="Aptos Narrow" w:cs="Times New Roman"/>
@@ -11705,7 +10529,6 @@
               </w:rPr>
               <w:t>Acc_Conv</w:t>
             </w:r>
-            <w:proofErr w:type="spellEnd"/>
           </w:p>
         </w:tc>
         <w:tc>
@@ -11727,7 +10550,6 @@
                 <w14:ligatures w14:val="none"/>
               </w:rPr>
             </w:pPr>
-            <w:proofErr w:type="spellStart"/>
             <w:r>
               <w:rPr>
                 <w:rFonts w:ascii="Aptos Narrow" w:eastAsia="Times New Roman" w:hAnsi="Aptos Narrow" w:cs="Times New Roman"/>
@@ -11740,7 +10562,6 @@
               </w:rPr>
               <w:t>Mag_Conv</w:t>
             </w:r>
-            <w:proofErr w:type="spellEnd"/>
           </w:p>
         </w:tc>
       </w:tr>
@@ -13381,13 +12202,8 @@
             </w:r>
           </w:p>
           <w:p>
-            <w:proofErr w:type="spellStart"/>
             <w:r>
-              <w:t>accel_data</w:t>
-            </w:r>
-            <w:proofErr w:type="spellEnd"/>
-            <w:r>
-              <w:t>[1445000:1452000]</w:t>
+              <w:t>accel_data[1445000:1452000]</w:t>
             </w:r>
           </w:p>
         </w:tc>
@@ -13490,13 +12306,8 @@
             </w:r>
           </w:p>
           <w:p>
-            <w:proofErr w:type="spellStart"/>
             <w:r>
-              <w:t>accel_data</w:t>
-            </w:r>
-            <w:proofErr w:type="spellEnd"/>
-            <w:r>
-              <w:t>[1660000:1670000]</w:t>
+              <w:t>accel_data[1660000:1670000]</w:t>
             </w:r>
           </w:p>
         </w:tc>
@@ -13600,13 +12411,8 @@
             </w:r>
           </w:p>
           <w:p>
-            <w:proofErr w:type="spellStart"/>
             <w:r>
-              <w:t>accel_data</w:t>
-            </w:r>
-            <w:proofErr w:type="spellEnd"/>
-            <w:r>
-              <w:t>[90000:91000]</w:t>
+              <w:t>accel_data[90000:91000]</w:t>
             </w:r>
           </w:p>
         </w:tc>
@@ -14446,179 +13252,138 @@
           <w:rFonts w:asciiTheme="minorHAnsi" w:hAnsiTheme="minorHAnsi"/>
           <w:lang w:val="en-GB"/>
         </w:rPr>
-        <w:t xml:space="preserve">Therefore, I went through and made sure they’re now on the same scale (other than the ones that capped at 4g and therefore have to be matched with the </w:t>
-      </w:r>
-      <w:proofErr w:type="spellStart"/>
-      <w:r>
+        <w:t>Therefore, I went through and made sure they’re now on the same scale (other than the ones that capped at 4g and therefore have to be matched with the Axivity before behavioural and VDBA analysis). I then re-extracted the training data for those periods based on the times of the original unsmoothed data. That code is now running. I will check the output tomorrow.</w:t>
+      </w:r>
+    </w:p>
+    <w:p>
+      <w:pPr>
+        <w:pStyle w:val="Heading3"/>
+        <w:rPr>
+          <w:rFonts w:cs="Arial"/>
+        </w:rPr>
+      </w:pPr>
+      <w:r>
+        <w:rPr>
+          <w:rFonts w:cs="Arial"/>
+        </w:rPr>
+        <w:t>1</w:t>
+      </w:r>
+      <w:r>
+        <w:rPr>
+          <w:rFonts w:cs="Arial"/>
+        </w:rPr>
+        <w:t>4</w:t>
+      </w:r>
+      <w:r>
+        <w:rPr>
+          <w:rFonts w:cs="Arial"/>
+        </w:rPr>
+        <w:t>/05</w:t>
+      </w:r>
+    </w:p>
+    <w:p>
+      <w:pPr>
+        <w:pStyle w:val="NormalWeb"/>
+        <w:numPr>
+          <w:ilvl w:val="0"/>
+          <w:numId w:val="2"/>
+        </w:numPr>
         <w:rPr>
           <w:rFonts w:asciiTheme="minorHAnsi" w:hAnsiTheme="minorHAnsi"/>
           <w:lang w:val="en-GB"/>
         </w:rPr>
-        <w:t>Axivity</w:t>
-      </w:r>
-      <w:proofErr w:type="spellEnd"/>
+      </w:pPr>
       <w:r>
         <w:rPr>
           <w:rFonts w:asciiTheme="minorHAnsi" w:hAnsiTheme="minorHAnsi"/>
           <w:lang w:val="en-GB"/>
         </w:rPr>
-        <w:t xml:space="preserve"> before behavioural and VDBA analysis). I then re-extracted the training data for those periods based on the times of the original unsmoothed data. That code is now running. I will check the output tomorrow.</w:t>
-      </w:r>
-    </w:p>
-    <w:p>
-      <w:pPr>
-        <w:pStyle w:val="Heading3"/>
-        <w:rPr>
-          <w:rFonts w:cs="Arial"/>
-        </w:rPr>
-      </w:pPr>
-      <w:r>
-        <w:rPr>
-          <w:rFonts w:cs="Arial"/>
-        </w:rPr>
-        <w:t>1</w:t>
-      </w:r>
-      <w:r>
-        <w:rPr>
-          <w:rFonts w:cs="Arial"/>
-        </w:rPr>
-        <w:t>4</w:t>
-      </w:r>
-      <w:r>
-        <w:rPr>
-          <w:rFonts w:cs="Arial"/>
-        </w:rPr>
-        <w:t>/05</w:t>
-      </w:r>
-    </w:p>
-    <w:p>
-      <w:pPr>
-        <w:pStyle w:val="NormalWeb"/>
-        <w:numPr>
-          <w:ilvl w:val="0"/>
-          <w:numId w:val="2"/>
-        </w:numPr>
+        <w:t>After all that conversion work, it wasn’t correct</w:t>
+      </w:r>
+      <w:r>
         <w:rPr>
           <w:rFonts w:asciiTheme="minorHAnsi" w:hAnsiTheme="minorHAnsi"/>
           <w:lang w:val="en-GB"/>
         </w:rPr>
-      </w:pPr>
-      <w:r>
+        <w:t xml:space="preserve">… They did need to be divided after all. Weird? Message CB and he said that things can change or if it reset/rebooted it might have gone back to default. Whatevvvvvvver man. I can’t keep up with all this. Converted everything to the right scale for real now and then proceeded. </w:t>
+      </w:r>
+    </w:p>
+    <w:p>
+      <w:pPr>
+        <w:pStyle w:val="Heading2"/>
+      </w:pPr>
+      <w:bookmarkStart w:id="3" w:name="_Toc230165021"/>
+      <w:r>
+        <w:t>Training the model</w:t>
+      </w:r>
+      <w:bookmarkEnd w:id="3"/>
+    </w:p>
+    <w:p>
+      <w:pPr>
+        <w:pStyle w:val="Heading3"/>
+        <w:rPr>
+          <w:rFonts w:cs="Arial"/>
+        </w:rPr>
+      </w:pPr>
+      <w:r>
+        <w:rPr>
+          <w:rFonts w:cs="Arial"/>
+        </w:rPr>
+        <w:t>1</w:t>
+      </w:r>
+      <w:r>
+        <w:rPr>
+          <w:rFonts w:cs="Arial"/>
+        </w:rPr>
+        <w:t>5</w:t>
+      </w:r>
+      <w:r>
+        <w:rPr>
+          <w:rFonts w:cs="Arial"/>
+        </w:rPr>
+        <w:t>/05</w:t>
+      </w:r>
+    </w:p>
+    <w:p>
+      <w:pPr>
+        <w:pStyle w:val="NormalWeb"/>
+        <w:numPr>
+          <w:ilvl w:val="0"/>
+          <w:numId w:val="2"/>
+        </w:numPr>
         <w:rPr>
           <w:rFonts w:asciiTheme="minorHAnsi" w:hAnsiTheme="minorHAnsi"/>
           <w:lang w:val="en-GB"/>
         </w:rPr>
-        <w:t>After all that conversion work, it wasn’t correct</w:t>
-      </w:r>
+      </w:pPr>
       <w:r>
         <w:rPr>
           <w:rFonts w:asciiTheme="minorHAnsi" w:hAnsiTheme="minorHAnsi"/>
           <w:lang w:val="en-GB"/>
         </w:rPr>
-        <w:t xml:space="preserve">… They did need to be divided after all. Weird? Message CB and he said that things can change or if it reset/rebooted it might have gone back to default. </w:t>
-      </w:r>
-      <w:proofErr w:type="spellStart"/>
+        <w:t xml:space="preserve">Yesterday I extracted a tonne of data and checked it all. </w:t>
+      </w:r>
       <w:r>
         <w:rPr>
           <w:rFonts w:asciiTheme="minorHAnsi" w:hAnsiTheme="minorHAnsi"/>
           <w:lang w:val="en-GB"/>
         </w:rPr>
-        <w:t>Whatevvvvvvver</w:t>
-      </w:r>
-      <w:proofErr w:type="spellEnd"/>
+        <w:t>Looks mostly good</w:t>
+      </w:r>
       <w:r>
         <w:rPr>
           <w:rFonts w:asciiTheme="minorHAnsi" w:hAnsiTheme="minorHAnsi"/>
           <w:lang w:val="en-GB"/>
         </w:rPr>
-        <w:t xml:space="preserve"> man. I can’t keep up with all this. Converted everything to the right scale for real now and then proceeded. </w:t>
-      </w:r>
-    </w:p>
-    <w:p>
-      <w:pPr>
-        <w:pStyle w:val="Heading2"/>
-      </w:pPr>
-      <w:bookmarkStart w:id="3" w:name="_Toc230165021"/>
-      <w:r>
-        <w:t>Training the model</w:t>
-      </w:r>
-      <w:bookmarkEnd w:id="3"/>
-    </w:p>
-    <w:p>
-      <w:pPr>
-        <w:pStyle w:val="Heading3"/>
-        <w:rPr>
-          <w:rFonts w:cs="Arial"/>
-        </w:rPr>
-      </w:pPr>
-      <w:r>
-        <w:rPr>
-          <w:rFonts w:cs="Arial"/>
-        </w:rPr>
-        <w:t>1</w:t>
-      </w:r>
-      <w:r>
-        <w:rPr>
-          <w:rFonts w:cs="Arial"/>
-        </w:rPr>
-        <w:t>5</w:t>
-      </w:r>
-      <w:r>
-        <w:rPr>
-          <w:rFonts w:cs="Arial"/>
-        </w:rPr>
-        <w:t>/05</w:t>
-      </w:r>
-    </w:p>
-    <w:p>
-      <w:pPr>
-        <w:pStyle w:val="NormalWeb"/>
-        <w:numPr>
-          <w:ilvl w:val="0"/>
-          <w:numId w:val="2"/>
-        </w:numPr>
+        <w:t>.</w:t>
+      </w:r>
+      <w:r>
         <w:rPr>
           <w:rFonts w:asciiTheme="minorHAnsi" w:hAnsiTheme="minorHAnsi"/>
           <w:lang w:val="en-GB"/>
         </w:rPr>
-      </w:pPr>
-      <w:r>
-        <w:rPr>
-          <w:rFonts w:asciiTheme="minorHAnsi" w:hAnsiTheme="minorHAnsi"/>
-          <w:lang w:val="en-GB"/>
-        </w:rPr>
-        <w:t xml:space="preserve">Yesterday I extracted a tonne of data and checked it all. </w:t>
-      </w:r>
-      <w:r>
-        <w:rPr>
-          <w:rFonts w:asciiTheme="minorHAnsi" w:hAnsiTheme="minorHAnsi"/>
-          <w:lang w:val="en-GB"/>
-        </w:rPr>
-        <w:t>Looks mostly good</w:t>
-      </w:r>
-      <w:r>
-        <w:rPr>
-          <w:rFonts w:asciiTheme="minorHAnsi" w:hAnsiTheme="minorHAnsi"/>
-          <w:lang w:val="en-GB"/>
-        </w:rPr>
-        <w:t>.</w:t>
-      </w:r>
-      <w:r>
-        <w:rPr>
-          <w:rFonts w:asciiTheme="minorHAnsi" w:hAnsiTheme="minorHAnsi"/>
-          <w:lang w:val="en-GB"/>
-        </w:rPr>
-        <w:t xml:space="preserve"> Some errors I can see, but these will be cleaned out in the next step of the second </w:t>
-      </w:r>
-      <w:proofErr w:type="spellStart"/>
-      <w:r>
-        <w:rPr>
-          <w:rFonts w:asciiTheme="minorHAnsi" w:hAnsiTheme="minorHAnsi"/>
-          <w:lang w:val="en-GB"/>
-        </w:rPr>
-        <w:t>matlab</w:t>
-      </w:r>
-      <w:proofErr w:type="spellEnd"/>
+        <w:t xml:space="preserve"> Some errors I can see, but these will be cleaned out in the next step of the second matlab</w:t>
+      </w:r>
       <w:r>
         <w:rPr>
           <w:rFonts w:asciiTheme="minorHAnsi" w:hAnsiTheme="minorHAnsi"/>
@@ -15137,54 +13902,36 @@
           <w:highlight w:val="yellow"/>
           <w:lang w:val="en-GB"/>
         </w:rPr>
-        <w:t xml:space="preserve">Need to build in some cleaning logic for when the collars flip… </w:t>
-      </w:r>
-      <w:proofErr w:type="spellStart"/>
+        <w:t xml:space="preserve">Need to build in some cleaning logic for when the collars flip… ie. When the Y axis is on average higher than the Z axis, </w:t>
+      </w:r>
       <w:r>
         <w:rPr>
           <w:rFonts w:asciiTheme="minorHAnsi" w:hAnsiTheme="minorHAnsi"/>
           <w:highlight w:val="yellow"/>
           <w:lang w:val="en-GB"/>
         </w:rPr>
-        <w:t>ie</w:t>
-      </w:r>
-      <w:proofErr w:type="spellEnd"/>
-      <w:r>
+        <w:t>remove as a collar flip.</w:t>
+      </w:r>
+    </w:p>
+    <w:p>
+      <w:pPr>
+        <w:pStyle w:val="NormalWeb"/>
+        <w:numPr>
+          <w:ilvl w:val="0"/>
+          <w:numId w:val="2"/>
+        </w:numPr>
         <w:rPr>
           <w:rFonts w:asciiTheme="minorHAnsi" w:hAnsiTheme="minorHAnsi"/>
           <w:highlight w:val="yellow"/>
           <w:lang w:val="en-GB"/>
         </w:rPr>
-        <w:t xml:space="preserve">. When the Y axis is on average higher than the Z axis, </w:t>
-      </w:r>
+      </w:pPr>
       <w:r>
         <w:rPr>
           <w:rFonts w:asciiTheme="minorHAnsi" w:hAnsiTheme="minorHAnsi"/>
           <w:highlight w:val="yellow"/>
           <w:lang w:val="en-GB"/>
         </w:rPr>
-        <w:t>remove as a collar flip.</w:t>
-      </w:r>
-    </w:p>
-    <w:p>
-      <w:pPr>
-        <w:pStyle w:val="NormalWeb"/>
-        <w:numPr>
-          <w:ilvl w:val="0"/>
-          <w:numId w:val="2"/>
-        </w:numPr>
-        <w:rPr>
-          <w:rFonts w:asciiTheme="minorHAnsi" w:hAnsiTheme="minorHAnsi"/>
-          <w:highlight w:val="yellow"/>
-          <w:lang w:val="en-GB"/>
-        </w:rPr>
-      </w:pPr>
-      <w:r>
-        <w:rPr>
-          <w:rFonts w:asciiTheme="minorHAnsi" w:hAnsiTheme="minorHAnsi"/>
-          <w:highlight w:val="yellow"/>
-          <w:lang w:val="en-GB"/>
-        </w:rPr>
         <w:t xml:space="preserve">And then logic the dead reckoning based on the behavioural analysis. </w:t>
       </w:r>
     </w:p>
@@ -15271,107 +14018,117 @@
           <w:rFonts w:asciiTheme="minorHAnsi" w:hAnsiTheme="minorHAnsi"/>
           <w:lang w:val="en-GB"/>
         </w:rPr>
-        <w:t xml:space="preserve">The models are doing </w:t>
-      </w:r>
-      <w:proofErr w:type="spellStart"/>
+        <w:t>The models are doing reeaaaaallly badly</w:t>
+      </w:r>
       <w:r>
         <w:rPr>
           <w:rFonts w:asciiTheme="minorHAnsi" w:hAnsiTheme="minorHAnsi"/>
           <w:lang w:val="en-GB"/>
         </w:rPr>
-        <w:t>reeaaaaallly</w:t>
-      </w:r>
-      <w:proofErr w:type="spellEnd"/>
+        <w:t xml:space="preserve"> with the limited features</w:t>
+      </w:r>
       <w:r>
         <w:rPr>
           <w:rFonts w:asciiTheme="minorHAnsi" w:hAnsiTheme="minorHAnsi"/>
           <w:lang w:val="en-GB"/>
         </w:rPr>
-        <w:t xml:space="preserve"> badly</w:t>
-      </w:r>
-      <w:r>
+        <w:t xml:space="preserve">. Even the RF only got 26%. </w:t>
+      </w:r>
+    </w:p>
+    <w:p>
+      <w:pPr>
+        <w:pStyle w:val="NormalWeb"/>
+        <w:numPr>
+          <w:ilvl w:val="1"/>
+          <w:numId w:val="2"/>
+        </w:numPr>
         <w:rPr>
           <w:rFonts w:asciiTheme="minorHAnsi" w:hAnsiTheme="minorHAnsi"/>
           <w:lang w:val="en-GB"/>
         </w:rPr>
-        <w:t xml:space="preserve"> with the limited features</w:t>
-      </w:r>
+      </w:pPr>
       <w:r>
         <w:rPr>
           <w:rFonts w:asciiTheme="minorHAnsi" w:hAnsiTheme="minorHAnsi"/>
           <w:lang w:val="en-GB"/>
         </w:rPr>
-        <w:t xml:space="preserve">. Even the RF only got 26%. </w:t>
-      </w:r>
-    </w:p>
-    <w:p>
-      <w:pPr>
-        <w:pStyle w:val="NormalWeb"/>
-        <w:numPr>
-          <w:ilvl w:val="1"/>
-          <w:numId w:val="2"/>
-        </w:numPr>
+        <w:t xml:space="preserve">From what I could see, the confusion between grazing_headlevel and walking was total. I collapsed those classes into one. There was also a lot of confusion between vigilance and </w:t>
+      </w:r>
+      <w:r>
         <w:rPr>
           <w:rFonts w:asciiTheme="minorHAnsi" w:hAnsiTheme="minorHAnsi"/>
           <w:lang w:val="en-GB"/>
         </w:rPr>
-      </w:pPr>
-      <w:r>
+        <w:lastRenderedPageBreak/>
+        <w:t>vibrating. I also collapsed those categories together as well. I am rerunning the rest of the feature generation overnight and will check again tomorrow.</w:t>
+      </w:r>
+    </w:p>
+    <w:p>
+      <w:pPr>
+        <w:pStyle w:val="Heading3"/>
+        <w:rPr>
+          <w:rFonts w:cs="Arial"/>
+        </w:rPr>
+      </w:pPr>
+      <w:r>
+        <w:rPr>
+          <w:rFonts w:cs="Arial"/>
+        </w:rPr>
+        <w:t>20</w:t>
+      </w:r>
+      <w:r>
+        <w:rPr>
+          <w:rFonts w:cs="Arial"/>
+        </w:rPr>
+        <w:t>/</w:t>
+      </w:r>
+      <w:r>
+        <w:rPr>
+          <w:rFonts w:cs="Arial"/>
+        </w:rPr>
+        <w:t>05</w:t>
+      </w:r>
+    </w:p>
+    <w:p>
+      <w:pPr>
+        <w:pStyle w:val="NormalWeb"/>
+        <w:numPr>
+          <w:ilvl w:val="0"/>
+          <w:numId w:val="2"/>
+        </w:numPr>
+        <w:spacing w:after="0" w:afterAutospacing="0"/>
         <w:rPr>
           <w:rFonts w:asciiTheme="minorHAnsi" w:hAnsiTheme="minorHAnsi"/>
           <w:lang w:val="en-GB"/>
         </w:rPr>
-        <w:t xml:space="preserve">From what I could see, the confusion between </w:t>
-      </w:r>
-      <w:proofErr w:type="spellStart"/>
+      </w:pPr>
       <w:r>
         <w:rPr>
           <w:rFonts w:asciiTheme="minorHAnsi" w:hAnsiTheme="minorHAnsi"/>
           <w:lang w:val="en-GB"/>
         </w:rPr>
-        <w:t>grazing_headlevel</w:t>
-      </w:r>
-      <w:proofErr w:type="spellEnd"/>
-      <w:r>
+        <w:t>Looking at the behavioural model results so far, there is such a massive confusion between some of the classes. Before I collapse the classes, I want to try training a more powerful model: 1) XGBoost, 2) a basic NN.</w:t>
+      </w:r>
+    </w:p>
+    <w:p>
+      <w:pPr>
+        <w:pStyle w:val="NormalWeb"/>
+        <w:numPr>
+          <w:ilvl w:val="1"/>
+          <w:numId w:val="2"/>
+        </w:numPr>
+        <w:spacing w:after="0" w:afterAutospacing="0"/>
         <w:rPr>
           <w:rFonts w:asciiTheme="minorHAnsi" w:hAnsiTheme="minorHAnsi"/>
           <w:lang w:val="en-GB"/>
         </w:rPr>
-        <w:t xml:space="preserve"> and walking was total. I collapsed those classes into one. There was also a lot of confusion between vigilance and </w:t>
-      </w:r>
+      </w:pPr>
       <w:r>
         <w:rPr>
           <w:rFonts w:asciiTheme="minorHAnsi" w:hAnsiTheme="minorHAnsi"/>
           <w:lang w:val="en-GB"/>
         </w:rPr>
-        <w:lastRenderedPageBreak/>
-        <w:t>vibrating. I also collapsed those categories together as well. I am rerunning the rest of the feature generation overnight and will check again tomorrow.</w:t>
-      </w:r>
-    </w:p>
-    <w:p>
-      <w:pPr>
-        <w:pStyle w:val="Heading3"/>
-        <w:rPr>
-          <w:rFonts w:cs="Arial"/>
-        </w:rPr>
-      </w:pPr>
-      <w:r>
-        <w:rPr>
-          <w:rFonts w:cs="Arial"/>
-        </w:rPr>
-        <w:t>20</w:t>
-      </w:r>
-      <w:r>
-        <w:rPr>
-          <w:rFonts w:cs="Arial"/>
-        </w:rPr>
-        <w:t>/</w:t>
-      </w:r>
-      <w:r>
-        <w:rPr>
-          <w:rFonts w:cs="Arial"/>
-        </w:rPr>
-        <w:t>05</w:t>
+        <w:t>The XGBoost is doing terrible, with a below chance performance. I must be doing something wrong in the code…</w:t>
       </w:r>
     </w:p>
     <w:p>
@@ -15392,150 +14149,28 @@
           <w:rFonts w:asciiTheme="minorHAnsi" w:hAnsiTheme="minorHAnsi"/>
           <w:lang w:val="en-GB"/>
         </w:rPr>
-        <w:t xml:space="preserve">Looking at the behavioural model results so far, there is such a massive confusion between some of the classes. Before I collapse the classes, I want to try training a more powerful model: 1) </w:t>
-      </w:r>
-      <w:proofErr w:type="spellStart"/>
-      <w:r>
+        <w:t>Currently fighting for my life to get keras working so I can use deep learning models. I want to try the NN at least once before I move on.</w:t>
+      </w:r>
+    </w:p>
+    <w:p>
+      <w:pPr>
+        <w:pStyle w:val="NormalWeb"/>
+        <w:numPr>
+          <w:ilvl w:val="1"/>
+          <w:numId w:val="2"/>
+        </w:numPr>
+        <w:spacing w:after="0" w:afterAutospacing="0"/>
         <w:rPr>
           <w:rFonts w:asciiTheme="minorHAnsi" w:hAnsiTheme="minorHAnsi"/>
           <w:lang w:val="en-GB"/>
         </w:rPr>
-        <w:t>XGBoost</w:t>
-      </w:r>
-      <w:proofErr w:type="spellEnd"/>
+      </w:pPr>
       <w:r>
         <w:rPr>
           <w:rFonts w:asciiTheme="minorHAnsi" w:hAnsiTheme="minorHAnsi"/>
           <w:lang w:val="en-GB"/>
         </w:rPr>
-        <w:t>, 2) a basic NN.</w:t>
-      </w:r>
-    </w:p>
-    <w:p>
-      <w:pPr>
-        <w:pStyle w:val="NormalWeb"/>
-        <w:numPr>
-          <w:ilvl w:val="1"/>
-          <w:numId w:val="2"/>
-        </w:numPr>
-        <w:spacing w:after="0" w:afterAutospacing="0"/>
-        <w:rPr>
-          <w:rFonts w:asciiTheme="minorHAnsi" w:hAnsiTheme="minorHAnsi"/>
-          <w:lang w:val="en-GB"/>
-        </w:rPr>
-      </w:pPr>
-      <w:r>
-        <w:rPr>
-          <w:rFonts w:asciiTheme="minorHAnsi" w:hAnsiTheme="minorHAnsi"/>
-          <w:lang w:val="en-GB"/>
-        </w:rPr>
-        <w:t xml:space="preserve">The </w:t>
-      </w:r>
-      <w:proofErr w:type="spellStart"/>
-      <w:r>
-        <w:rPr>
-          <w:rFonts w:asciiTheme="minorHAnsi" w:hAnsiTheme="minorHAnsi"/>
-          <w:lang w:val="en-GB"/>
-        </w:rPr>
-        <w:t>XGBoost</w:t>
-      </w:r>
-      <w:proofErr w:type="spellEnd"/>
-      <w:r>
-        <w:rPr>
-          <w:rFonts w:asciiTheme="minorHAnsi" w:hAnsiTheme="minorHAnsi"/>
-          <w:lang w:val="en-GB"/>
-        </w:rPr>
-        <w:t xml:space="preserve"> is doing terrible, with a below chance performance. I must be doing something wrong in the code…</w:t>
-      </w:r>
-    </w:p>
-    <w:p>
-      <w:pPr>
-        <w:pStyle w:val="NormalWeb"/>
-        <w:numPr>
-          <w:ilvl w:val="0"/>
-          <w:numId w:val="2"/>
-        </w:numPr>
-        <w:spacing w:after="0" w:afterAutospacing="0"/>
-        <w:rPr>
-          <w:rFonts w:asciiTheme="minorHAnsi" w:hAnsiTheme="minorHAnsi"/>
-          <w:lang w:val="en-GB"/>
-        </w:rPr>
-      </w:pPr>
-      <w:r>
-        <w:rPr>
-          <w:rFonts w:asciiTheme="minorHAnsi" w:hAnsiTheme="minorHAnsi"/>
-          <w:lang w:val="en-GB"/>
-        </w:rPr>
-        <w:t xml:space="preserve">Currently fighting for my life to get </w:t>
-      </w:r>
-      <w:proofErr w:type="spellStart"/>
-      <w:r>
-        <w:rPr>
-          <w:rFonts w:asciiTheme="minorHAnsi" w:hAnsiTheme="minorHAnsi"/>
-          <w:lang w:val="en-GB"/>
-        </w:rPr>
-        <w:t>keras</w:t>
-      </w:r>
-      <w:proofErr w:type="spellEnd"/>
-      <w:r>
-        <w:rPr>
-          <w:rFonts w:asciiTheme="minorHAnsi" w:hAnsiTheme="minorHAnsi"/>
-          <w:lang w:val="en-GB"/>
-        </w:rPr>
-        <w:t xml:space="preserve"> working so I can use deep learning models. I want to try the NN at least once before I move on.</w:t>
-      </w:r>
-    </w:p>
-    <w:p>
-      <w:pPr>
-        <w:pStyle w:val="NormalWeb"/>
-        <w:numPr>
-          <w:ilvl w:val="1"/>
-          <w:numId w:val="2"/>
-        </w:numPr>
-        <w:spacing w:after="0" w:afterAutospacing="0"/>
-        <w:rPr>
-          <w:rFonts w:asciiTheme="minorHAnsi" w:hAnsiTheme="minorHAnsi"/>
-          <w:lang w:val="en-GB"/>
-        </w:rPr>
-      </w:pPr>
-      <w:r>
-        <w:rPr>
-          <w:rFonts w:asciiTheme="minorHAnsi" w:hAnsiTheme="minorHAnsi"/>
-          <w:lang w:val="en-GB"/>
-        </w:rPr>
-        <w:t xml:space="preserve">Gave up on </w:t>
-      </w:r>
-      <w:proofErr w:type="spellStart"/>
-      <w:r>
-        <w:rPr>
-          <w:rFonts w:asciiTheme="minorHAnsi" w:hAnsiTheme="minorHAnsi"/>
-          <w:lang w:val="en-GB"/>
-        </w:rPr>
-        <w:t>keras</w:t>
-      </w:r>
-      <w:proofErr w:type="spellEnd"/>
-      <w:r>
-        <w:rPr>
-          <w:rFonts w:asciiTheme="minorHAnsi" w:hAnsiTheme="minorHAnsi"/>
-          <w:lang w:val="en-GB"/>
-        </w:rPr>
-        <w:t xml:space="preserve"> and used </w:t>
-      </w:r>
-      <w:proofErr w:type="spellStart"/>
-      <w:r>
-        <w:rPr>
-          <w:rFonts w:asciiTheme="minorHAnsi" w:hAnsiTheme="minorHAnsi"/>
-          <w:lang w:val="en-GB"/>
-        </w:rPr>
-        <w:t>neuralnet</w:t>
-      </w:r>
-      <w:proofErr w:type="spellEnd"/>
-      <w:r>
-        <w:rPr>
-          <w:rFonts w:asciiTheme="minorHAnsi" w:hAnsiTheme="minorHAnsi"/>
-          <w:lang w:val="en-GB"/>
-        </w:rPr>
-        <w:t xml:space="preserve"> a simpler version instead.</w:t>
+        <w:t>Gave up on keras and used neuralnet a simpler version instead.</w:t>
       </w:r>
     </w:p>
     <w:p>
@@ -16216,15 +14851,7 @@
         <w:t>the Madgwick method</w:t>
       </w:r>
       <w:r>
-        <w:t xml:space="preserve"> to replace the tilt-adjusting </w:t>
-      </w:r>
-      <w:proofErr w:type="spellStart"/>
-      <w:r>
-        <w:t>Gundog.Compass</w:t>
-      </w:r>
-      <w:proofErr w:type="spellEnd"/>
-      <w:r>
-        <w:t xml:space="preserve"> (still use Tracks)</w:t>
+        <w:t xml:space="preserve"> to replace the tilt-adjusting Gundog.Compass (still use Tracks)</w:t>
       </w:r>
       <w:r>
         <w:t xml:space="preserve"> for dead reckoning re-orientation</w:t>
@@ -16347,23 +14974,7 @@
         </w:numPr>
       </w:pPr>
       <w:r>
-        <w:t xml:space="preserve">The </w:t>
-      </w:r>
-      <w:proofErr w:type="spellStart"/>
-      <w:r>
-        <w:t>Magwick</w:t>
-      </w:r>
-      <w:proofErr w:type="spellEnd"/>
-      <w:r>
-        <w:t xml:space="preserve"> equation assumes NED but I am not in NED. I am in </w:t>
-      </w:r>
-      <w:proofErr w:type="spellStart"/>
-      <w:r>
-        <w:t>acc</w:t>
-      </w:r>
-      <w:proofErr w:type="spellEnd"/>
-      <w:r>
-        <w:t xml:space="preserve"> = </w:t>
+        <w:t xml:space="preserve">The Magwick equation assumes NED but I am not in NED. I am in acc = </w:t>
       </w:r>
       <w:r>
         <w:t>"NWU"</w:t>
@@ -16422,15 +15033,7 @@
         </w:numPr>
       </w:pPr>
       <w:r>
-        <w:t xml:space="preserve">Wait </w:t>
-      </w:r>
-      <w:proofErr w:type="spellStart"/>
-      <w:r>
-        <w:t>wait</w:t>
-      </w:r>
-      <w:proofErr w:type="spellEnd"/>
-      <w:r>
-        <w:t>. What am I doing. Stop. What is the problem, what do I have, and what am I doing?</w:t>
+        <w:t>Wait wait. What am I doing. Stop. What is the problem, what do I have, and what am I doing?</w:t>
       </w:r>
     </w:p>
     <w:p>
@@ -16521,13 +15124,8 @@
           <w:numId w:val="2"/>
         </w:numPr>
       </w:pPr>
-      <w:proofErr w:type="spellStart"/>
-      <w:r>
-        <w:t>ChrisC</w:t>
-      </w:r>
-      <w:proofErr w:type="spellEnd"/>
-      <w:r>
-        <w:t xml:space="preserve"> said that I should make a speed distribution of the DR track that we calculated so far and see whether we are getting reasonable speeds</w:t>
+      <w:r>
+        <w:t>ChrisC said that I should make a speed distribution of the DR track that we calculated so far and see whether we are getting reasonable speeds</w:t>
       </w:r>
       <w:r>
         <w:t>. If they are reasonable, I am going to call it.</w:t>
@@ -16545,15 +15143,7 @@
         <w:t>Okay, went to make my old method again and it broke completely. Lmao?</w:t>
       </w:r>
       <w:r>
-        <w:t xml:space="preserve"> Back to the beginning to rescale the </w:t>
-      </w:r>
-      <w:proofErr w:type="spellStart"/>
-      <w:r>
-        <w:t>accels</w:t>
-      </w:r>
-      <w:proofErr w:type="spellEnd"/>
-      <w:r>
-        <w:t xml:space="preserve"> and mags and stuff.</w:t>
+        <w:t xml:space="preserve"> Back to the beginning to rescale the accels and mags and stuff.</w:t>
       </w:r>
     </w:p>
     <w:p>
@@ -16568,15 +15158,7 @@
         <w:t>I am going back to the very beginning</w:t>
       </w:r>
       <w:r>
-        <w:t xml:space="preserve"> and saving each change as a new column and then sending it to </w:t>
-      </w:r>
-      <w:proofErr w:type="spellStart"/>
-      <w:r>
-        <w:t>ChrisB</w:t>
-      </w:r>
-      <w:proofErr w:type="spellEnd"/>
-      <w:r>
-        <w:t xml:space="preserve"> to figure out while I’m away.</w:t>
+        <w:t xml:space="preserve"> and saving each change as a new column and then sending it to ChrisB to figure out while I’m away.</w:t>
       </w:r>
     </w:p>
     <w:p>
@@ -16747,30 +15329,17 @@
         <w:t xml:space="preserve">Note that I tried to use the quaternion components onboard </w:t>
       </w:r>
       <w:r>
-        <w:t xml:space="preserve">but found that they aren’t normalised, which means you can’t calculate the w component (which we don’t have)… so that means we </w:t>
-      </w:r>
-      <w:proofErr w:type="spellStart"/>
-      <w:r>
-        <w:t>cannnn’t</w:t>
-      </w:r>
-      <w:proofErr w:type="spellEnd"/>
-      <w:r>
-        <w:t xml:space="preserve"> use the </w:t>
+        <w:t xml:space="preserve">but found that they aren’t normalised, which means you can’t calculate the w component (which we don’t have)… so that means we cannnn’t use the </w:t>
       </w:r>
       <w:r>
         <w:t>on board calculated ones</w:t>
       </w:r>
       <w:r>
-        <w:t xml:space="preserve">???? Have messaged </w:t>
-      </w:r>
-      <w:proofErr w:type="spellStart"/>
-      <w:r>
-        <w:t>Chris</w:t>
+        <w:t>???? Have messaged Chris</w:t>
       </w:r>
       <w:r>
         <w:t>B</w:t>
       </w:r>
-      <w:proofErr w:type="spellEnd"/>
       <w:r>
         <w:t xml:space="preserve"> to ask.</w:t>
       </w:r>
@@ -16805,9 +15374,9 @@
       </w:pPr>
       <w:r>
         <w:drawing>
-          <wp:inline distT="0" distB="0" distL="0" distR="0" wp14:anchorId="6682595D" wp14:editId="2879E9C4">
-            <wp:extent cx="4829175" cy="2017522"/>
-            <wp:effectExtent l="0" t="0" r="0" b="1905"/>
+          <wp:inline distT="0" distB="0" distL="0" distR="0" wp14:anchorId="6682595D" wp14:editId="7277B1D9">
+            <wp:extent cx="3943350" cy="1647444"/>
+            <wp:effectExtent l="0" t="0" r="0" b="0"/>
             <wp:docPr id="1137280435" name="Picture 1"/>
             <wp:cNvGraphicFramePr>
               <a:graphicFrameLocks xmlns:a="http://schemas.openxmlformats.org/drawingml/2006/main" noChangeAspect="1"/>
@@ -16828,7 +15397,7 @@
                   <pic:spPr>
                     <a:xfrm>
                       <a:off x="0" y="0"/>
-                      <a:ext cx="4842135" cy="2022936"/>
+                      <a:ext cx="3960570" cy="1654638"/>
                     </a:xfrm>
                     <a:prstGeom prst="rect">
                       <a:avLst/>
@@ -16873,15 +15442,7 @@
         <w:t xml:space="preserve"> was balls lmao.</w:t>
       </w:r>
       <w:r>
-        <w:t xml:space="preserve"> But the quaternion is pretty close, </w:t>
-      </w:r>
-      <w:proofErr w:type="spellStart"/>
-      <w:r>
-        <w:t>tbh</w:t>
-      </w:r>
-      <w:proofErr w:type="spellEnd"/>
-      <w:r>
-        <w:t>.(Quat below). Therefore we are officially moving over to the quat method from now on. I have set up a workflow for Bird to check them and play around with them while I’m away.</w:t>
+        <w:t xml:space="preserve"> But the quaternion is pretty close, tbh.(Quat below). Therefore we are officially moving over to the quat method from now on. I have set up a workflow for Bird to check them and play around with them while I’m away.</w:t>
       </w:r>
     </w:p>
     <w:p>
@@ -16948,23 +15509,17 @@
     </w:p>
     <w:p>
       <w:pPr>
-        <w:ind w:left="360"/>
-      </w:pPr>
-    </w:p>
-    <w:p>
-      <w:pPr>
-        <w:ind w:left="360"/>
-      </w:pPr>
-    </w:p>
-    <w:p>
-      <w:pPr>
-        <w:ind w:left="360"/>
-      </w:pPr>
-    </w:p>
-    <w:p>
-      <w:pPr>
-        <w:ind w:left="360"/>
-      </w:pPr>
+        <w:pStyle w:val="Heading3"/>
+      </w:pPr>
+      <w:r>
+        <w:t>2</w:t>
+      </w:r>
+      <w:r>
+        <w:t>9</w:t>
+      </w:r>
+      <w:r>
+        <w:t>/05</w:t>
+      </w:r>
     </w:p>
     <w:p>
       <w:pPr>
@@ -16975,116 +15530,33 @@
         </w:numPr>
       </w:pPr>
       <w:r>
-        <w:t xml:space="preserve">Leaving the quaternions for now and just focusing on what I got with </w:t>
-      </w:r>
-      <w:proofErr w:type="spellStart"/>
-      <w:r>
-        <w:t>Gundog.Compass</w:t>
-      </w:r>
-      <w:proofErr w:type="spellEnd"/>
-      <w:r>
-        <w:t>.</w:t>
-      </w:r>
-      <w:r>
-        <w:t xml:space="preserve"> If </w:t>
-      </w:r>
-      <w:r>
-        <w:t>the speed estimates</w:t>
-      </w:r>
-      <w:r>
-        <w:t xml:space="preserve"> are reasonable, I’m moving onto behaviours and then finalising for the presentation.</w:t>
+        <w:t xml:space="preserve">Updated the workflow to save the features in 1hr increments (file was just taking too long otherwise)… Would be good to get the HPC working for this tbh… </w:t>
+      </w:r>
+      <w:r>
+        <w:sym w:font="Wingdings" w:char="F0E0"/>
+      </w:r>
+      <w:r>
+        <w:t xml:space="preserve"> NOTE: Action this.</w:t>
       </w:r>
     </w:p>
     <w:p>
       <w:pPr>
         <w:pStyle w:val="ListParagraph"/>
         <w:numPr>
-          <w:ilvl w:val="1"/>
-          <w:numId w:val="2"/>
-        </w:numPr>
-      </w:pPr>
-      <w:r>
-        <w:t>The speeds from the moving sections are:</w:t>
-      </w:r>
-    </w:p>
-    <w:p>
-      <w:pPr>
-        <w:pStyle w:val="HTMLPreformatted"/>
-        <w:numPr>
           <w:ilvl w:val="0"/>
           <w:numId w:val="2"/>
         </w:numPr>
-        <w:shd w:val="clear" w:color="auto" w:fill="2D2D2D"/>
-        <w:wordWrap w:val="0"/>
-        <w:spacing w:line="240" w:lineRule="atLeast"/>
-        <w:rPr>
-          <w:rStyle w:val="gbqs1kebk5b"/>
-          <w:rFonts w:ascii="Lucida Console" w:hAnsi="Lucida Console"/>
-          <w:color w:val="CCCCCC"/>
-          <w:bdr w:val="none" w:sz="0" w:space="0" w:color="auto" w:frame="1"/>
-        </w:rPr>
-      </w:pPr>
-      <w:r>
-        <w:rPr>
-          <w:rStyle w:val="gbqs1kebk5b"/>
-          <w:rFonts w:ascii="Lucida Console" w:hAnsi="Lucida Console"/>
-          <w:color w:val="CCCCCC"/>
-          <w:bdr w:val="none" w:sz="0" w:space="0" w:color="auto" w:frame="1"/>
-        </w:rPr>
-        <w:t xml:space="preserve">    Min.  1st Qu.   Median     Mean  3rd Qu.     Max. </w:t>
-      </w:r>
-    </w:p>
-    <w:p>
-      <w:pPr>
-        <w:pStyle w:val="HTMLPreformatted"/>
-        <w:numPr>
-          <w:ilvl w:val="0"/>
-          <w:numId w:val="2"/>
-        </w:numPr>
-        <w:shd w:val="clear" w:color="auto" w:fill="2D2D2D"/>
-        <w:wordWrap w:val="0"/>
-        <w:spacing w:line="240" w:lineRule="atLeast"/>
-        <w:rPr>
-          <w:rFonts w:ascii="Lucida Console" w:hAnsi="Lucida Console"/>
-          <w:color w:val="CCCCCC"/>
-        </w:rPr>
-      </w:pPr>
-      <w:r>
-        <w:rPr>
-          <w:rStyle w:val="gbqs1kebk5b"/>
-          <w:rFonts w:ascii="Lucida Console" w:hAnsi="Lucida Console"/>
-          <w:color w:val="CCCCCC"/>
-          <w:bdr w:val="none" w:sz="0" w:space="0" w:color="auto" w:frame="1"/>
-        </w:rPr>
-        <w:t xml:space="preserve"> 0.00009  0.03132  0.07815  0.18160  0.18677 17.06187 </w:t>
-      </w:r>
-    </w:p>
-    <w:p>
-      <w:pPr>
-        <w:pStyle w:val="ListParagraph"/>
-        <w:numPr>
-          <w:ilvl w:val="1"/>
-          <w:numId w:val="2"/>
-        </w:numPr>
-      </w:pPr>
-      <w:r>
-        <w:t>This looks reasonable… lets</w:t>
-      </w:r>
-      <w:r>
-        <w:t xml:space="preserve"> do the next </w:t>
-      </w:r>
-      <w:proofErr w:type="spellStart"/>
-      <w:r>
-        <w:t>day’s worth</w:t>
-      </w:r>
-      <w:proofErr w:type="spellEnd"/>
-      <w:r>
-        <w:t xml:space="preserve"> of data to see what we get.</w:t>
-      </w:r>
-    </w:p>
-    <w:p/>
-    <w:p/>
-    <w:p/>
+      </w:pPr>
+      <w:r>
+        <w:t>In the meantime, I should finalise the behavioural model I intend to use</w:t>
+      </w:r>
+      <w:r>
+        <w:t>… Will transfer onto laptop for that so I can take it to FG with me.</w:t>
+      </w:r>
+      <w:r>
+        <w:t xml:space="preserve"> </w:t>
+      </w:r>
+    </w:p>
     <w:p/>
     <w:p/>
     <w:p/>
@@ -17386,39 +15858,21 @@
           <w:strike/>
           <w:lang w:val="en-GB"/>
         </w:rPr>
-        <w:t xml:space="preserve">Convert all the </w:t>
-      </w:r>
-      <w:proofErr w:type="spellStart"/>
-      <w:r>
+        <w:t>Convert all the accels to g force and mag units</w:t>
+      </w:r>
+    </w:p>
+    <w:p>
+      <w:pPr>
+        <w:pStyle w:val="NormalWeb"/>
+        <w:numPr>
+          <w:ilvl w:val="1"/>
+          <w:numId w:val="2"/>
+        </w:numPr>
         <w:rPr>
           <w:rFonts w:asciiTheme="minorHAnsi" w:hAnsiTheme="minorHAnsi"/>
           <w:strike/>
           <w:lang w:val="en-GB"/>
         </w:rPr>
-        <w:t>accels</w:t>
-      </w:r>
-      <w:proofErr w:type="spellEnd"/>
-      <w:r>
-        <w:rPr>
-          <w:rFonts w:asciiTheme="minorHAnsi" w:hAnsiTheme="minorHAnsi"/>
-          <w:strike/>
-          <w:lang w:val="en-GB"/>
-        </w:rPr>
-        <w:t xml:space="preserve"> to g force and mag units</w:t>
-      </w:r>
-    </w:p>
-    <w:p>
-      <w:pPr>
-        <w:pStyle w:val="NormalWeb"/>
-        <w:numPr>
-          <w:ilvl w:val="1"/>
-          <w:numId w:val="2"/>
-        </w:numPr>
-        <w:rPr>
-          <w:rFonts w:asciiTheme="minorHAnsi" w:hAnsiTheme="minorHAnsi"/>
-          <w:strike/>
-          <w:lang w:val="en-GB"/>
-        </w:rPr>
       </w:pPr>
       <w:r>
         <w:rPr>
@@ -17452,39 +15906,7 @@
           <w:rFonts w:asciiTheme="minorHAnsi" w:hAnsiTheme="minorHAnsi"/>
           <w:lang w:val="en-GB"/>
         </w:rPr>
-        <w:t xml:space="preserve">Join the cropped 4g </w:t>
-      </w:r>
-      <w:proofErr w:type="spellStart"/>
-      <w:r>
-        <w:rPr>
-          <w:rFonts w:asciiTheme="minorHAnsi" w:hAnsiTheme="minorHAnsi"/>
-          <w:lang w:val="en-GB"/>
-        </w:rPr>
-        <w:t>accels</w:t>
-      </w:r>
-      <w:proofErr w:type="spellEnd"/>
-      <w:r>
-        <w:rPr>
-          <w:rFonts w:asciiTheme="minorHAnsi" w:hAnsiTheme="minorHAnsi"/>
-          <w:lang w:val="en-GB"/>
-        </w:rPr>
-        <w:t xml:space="preserve"> with the </w:t>
-      </w:r>
-      <w:proofErr w:type="spellStart"/>
-      <w:r>
-        <w:rPr>
-          <w:rFonts w:asciiTheme="minorHAnsi" w:hAnsiTheme="minorHAnsi"/>
-          <w:lang w:val="en-GB"/>
-        </w:rPr>
-        <w:t>axivity</w:t>
-      </w:r>
-      <w:proofErr w:type="spellEnd"/>
-      <w:r>
-        <w:rPr>
-          <w:rFonts w:asciiTheme="minorHAnsi" w:hAnsiTheme="minorHAnsi"/>
-          <w:lang w:val="en-GB"/>
-        </w:rPr>
-        <w:t xml:space="preserve"> uncropped data to complete the peaks</w:t>
+        <w:t>Join the cropped 4g accels with the axivity uncropped data to complete the peaks</w:t>
       </w:r>
     </w:p>
     <w:p>

</xml_diff>

<commit_message>
finalising model and adding postprocessing
</commit_message>
<xml_diff>
--- a/Notes/Worklog.docx
+++ b/Notes/Worklog.docx
@@ -69,7 +69,9 @@
           <w:tab w:val="right" w:leader="dot" w:pos="10790"/>
         </w:tabs>
         <w:rPr>
+          <w:rFonts w:eastAsiaTheme="minorEastAsia"/>
           <w:noProof/>
+          <w:lang w:val="en-US"/>
         </w:rPr>
       </w:pPr>
       <w:r>
@@ -90,7 +92,7 @@
         </w:rPr>
         <w:fldChar w:fldCharType="separate"/>
       </w:r>
-      <w:hyperlink w:anchor="_Toc230165018" w:history="1">
+      <w:hyperlink w:anchor="_Toc232412270" w:history="1">
         <w:r>
           <w:rPr>
             <w:rStyle w:val="Hyperlink"/>
@@ -117,7 +119,7 @@
             <w:noProof/>
             <w:webHidden/>
           </w:rPr>
-          <w:instrText xml:space="preserve"> PAGEREF _Toc230165018 \h </w:instrText>
+          <w:instrText xml:space="preserve"> PAGEREF _Toc232412270 \h </w:instrText>
         </w:r>
         <w:r>
           <w:rPr>
@@ -155,10 +157,12 @@
           <w:tab w:val="right" w:leader="dot" w:pos="10790"/>
         </w:tabs>
         <w:rPr>
+          <w:rFonts w:eastAsiaTheme="minorEastAsia"/>
           <w:noProof/>
-        </w:rPr>
-      </w:pPr>
-      <w:hyperlink w:anchor="_Toc230165019" w:history="1">
+          <w:lang w:val="en-US"/>
+        </w:rPr>
+      </w:pPr>
+      <w:hyperlink w:anchor="_Toc232412271" w:history="1">
         <w:r>
           <w:rPr>
             <w:rStyle w:val="Hyperlink"/>
@@ -185,7 +189,7 @@
             <w:noProof/>
             <w:webHidden/>
           </w:rPr>
-          <w:instrText xml:space="preserve"> PAGEREF _Toc230165019 \h </w:instrText>
+          <w:instrText xml:space="preserve"> PAGEREF _Toc232412271 \h </w:instrText>
         </w:r>
         <w:r>
           <w:rPr>
@@ -223,10 +227,12 @@
           <w:tab w:val="right" w:leader="dot" w:pos="10790"/>
         </w:tabs>
         <w:rPr>
+          <w:rFonts w:eastAsiaTheme="minorEastAsia"/>
           <w:noProof/>
-        </w:rPr>
-      </w:pPr>
-      <w:hyperlink w:anchor="_Toc230165020" w:history="1">
+          <w:lang w:val="en-US"/>
+        </w:rPr>
+      </w:pPr>
+      <w:hyperlink w:anchor="_Toc232412272" w:history="1">
         <w:r>
           <w:rPr>
             <w:rStyle w:val="Hyperlink"/>
@@ -253,7 +259,7 @@
             <w:noProof/>
             <w:webHidden/>
           </w:rPr>
-          <w:instrText xml:space="preserve"> PAGEREF _Toc230165020 \h </w:instrText>
+          <w:instrText xml:space="preserve"> PAGEREF _Toc232412272 \h </w:instrText>
         </w:r>
         <w:r>
           <w:rPr>
@@ -291,16 +297,32 @@
           <w:tab w:val="right" w:leader="dot" w:pos="10790"/>
         </w:tabs>
         <w:rPr>
+          <w:rFonts w:eastAsiaTheme="minorEastAsia"/>
           <w:noProof/>
-        </w:rPr>
-      </w:pPr>
-      <w:hyperlink w:anchor="_Toc230165021" w:history="1">
+          <w:lang w:val="en-US"/>
+        </w:rPr>
+      </w:pPr>
+      <w:hyperlink w:anchor="_Toc232412273" w:history="1">
         <w:r>
           <w:rPr>
             <w:rStyle w:val="Hyperlink"/>
             <w:noProof/>
           </w:rPr>
-          <w:t>Training the model</w:t>
+          <w:t>Training the mo</w:t>
+        </w:r>
+        <w:r>
+          <w:rPr>
+            <w:rStyle w:val="Hyperlink"/>
+            <w:noProof/>
+          </w:rPr>
+          <w:t>d</w:t>
+        </w:r>
+        <w:r>
+          <w:rPr>
+            <w:rStyle w:val="Hyperlink"/>
+            <w:noProof/>
+          </w:rPr>
+          <w:t>el</w:t>
         </w:r>
         <w:r>
           <w:rPr>
@@ -321,7 +343,7 @@
             <w:noProof/>
             <w:webHidden/>
           </w:rPr>
-          <w:instrText xml:space="preserve"> PAGEREF _Toc230165021 \h </w:instrText>
+          <w:instrText xml:space="preserve"> PAGEREF _Toc232412273 \h </w:instrText>
         </w:r>
         <w:r>
           <w:rPr>
@@ -359,16 +381,18 @@
           <w:tab w:val="right" w:leader="dot" w:pos="10790"/>
         </w:tabs>
         <w:rPr>
+          <w:rFonts w:eastAsiaTheme="minorEastAsia"/>
           <w:noProof/>
-        </w:rPr>
-      </w:pPr>
-      <w:hyperlink w:anchor="_Toc230165022" w:history="1">
+          <w:lang w:val="en-US"/>
+        </w:rPr>
+      </w:pPr>
+      <w:hyperlink w:anchor="_Toc232412274" w:history="1">
         <w:r>
           <w:rPr>
             <w:rStyle w:val="Hyperlink"/>
             <w:noProof/>
           </w:rPr>
-          <w:t>Integrating with Dead Reckoning</w:t>
+          <w:t>Restarting the Dead Reckoning</w:t>
         </w:r>
         <w:r>
           <w:rPr>
@@ -389,7 +413,7 @@
             <w:noProof/>
             <w:webHidden/>
           </w:rPr>
-          <w:instrText xml:space="preserve"> PAGEREF _Toc230165022 \h </w:instrText>
+          <w:instrText xml:space="preserve"> PAGEREF _Toc232412274 \h </w:instrText>
         </w:r>
         <w:r>
           <w:rPr>
@@ -423,17 +447,86 @@
     <w:p>
       <w:pPr>
         <w:pStyle w:val="TOC2"/>
-        <w:pBdr>
-          <w:bottom w:val="single" w:sz="12" w:space="1" w:color="auto"/>
-        </w:pBdr>
         <w:tabs>
           <w:tab w:val="right" w:leader="dot" w:pos="10790"/>
         </w:tabs>
         <w:rPr>
+          <w:rFonts w:eastAsiaTheme="minorEastAsia"/>
           <w:noProof/>
-        </w:rPr>
-      </w:pPr>
-      <w:hyperlink w:anchor="_Toc230165023" w:history="1">
+          <w:lang w:val="en-US"/>
+        </w:rPr>
+      </w:pPr>
+      <w:hyperlink w:anchor="_Toc232412275" w:history="1">
+        <w:r>
+          <w:rPr>
+            <w:rStyle w:val="Hyperlink"/>
+            <w:noProof/>
+          </w:rPr>
+          <w:t>In-field Dead Reckoning Experiments</w:t>
+        </w:r>
+        <w:r>
+          <w:rPr>
+            <w:noProof/>
+            <w:webHidden/>
+          </w:rPr>
+          <w:tab/>
+        </w:r>
+        <w:r>
+          <w:rPr>
+            <w:noProof/>
+            <w:webHidden/>
+          </w:rPr>
+          <w:fldChar w:fldCharType="begin"/>
+        </w:r>
+        <w:r>
+          <w:rPr>
+            <w:noProof/>
+            <w:webHidden/>
+          </w:rPr>
+          <w:instrText xml:space="preserve"> PAGEREF _Toc232412275 \h </w:instrText>
+        </w:r>
+        <w:r>
+          <w:rPr>
+            <w:noProof/>
+            <w:webHidden/>
+          </w:rPr>
+        </w:r>
+        <w:r>
+          <w:rPr>
+            <w:noProof/>
+            <w:webHidden/>
+          </w:rPr>
+          <w:fldChar w:fldCharType="separate"/>
+        </w:r>
+        <w:r>
+          <w:rPr>
+            <w:noProof/>
+            <w:webHidden/>
+          </w:rPr>
+          <w:t>41</w:t>
+        </w:r>
+        <w:r>
+          <w:rPr>
+            <w:noProof/>
+            <w:webHidden/>
+          </w:rPr>
+          <w:fldChar w:fldCharType="end"/>
+        </w:r>
+      </w:hyperlink>
+    </w:p>
+    <w:p>
+      <w:pPr>
+        <w:pStyle w:val="TOC2"/>
+        <w:tabs>
+          <w:tab w:val="right" w:leader="dot" w:pos="10790"/>
+        </w:tabs>
+        <w:rPr>
+          <w:rFonts w:eastAsiaTheme="minorEastAsia"/>
+          <w:noProof/>
+          <w:lang w:val="en-US"/>
+        </w:rPr>
+      </w:pPr>
+      <w:hyperlink w:anchor="_Toc232412276" w:history="1">
         <w:r>
           <w:rPr>
             <w:rStyle w:val="Hyperlink"/>
@@ -460,7 +553,7 @@
             <w:noProof/>
             <w:webHidden/>
           </w:rPr>
-          <w:instrText xml:space="preserve"> PAGEREF _Toc230165023 \h </w:instrText>
+          <w:instrText xml:space="preserve"> PAGEREF _Toc232412276 \h </w:instrText>
         </w:r>
         <w:r>
           <w:rPr>
@@ -480,7 +573,7 @@
             <w:noProof/>
             <w:webHidden/>
           </w:rPr>
-          <w:t>37</w:t>
+          <w:t>43</w:t>
         </w:r>
         <w:r>
           <w:rPr>
@@ -508,7 +601,7 @@
       <w:pPr>
         <w:pStyle w:val="Heading2"/>
       </w:pPr>
-      <w:bookmarkStart w:id="0" w:name="_Toc230165018"/>
+      <w:bookmarkStart w:id="0" w:name="_Toc232412270"/>
       <w:r>
         <w:t>Aligning Accel and GPS</w:t>
       </w:r>
@@ -1654,7 +1747,7 @@
       <w:pPr>
         <w:pStyle w:val="Heading2"/>
       </w:pPr>
-      <w:bookmarkStart w:id="1" w:name="_Toc230165019"/>
+      <w:bookmarkStart w:id="1" w:name="_Toc232412271"/>
       <w:r>
         <w:t>Dead Reckoning</w:t>
       </w:r>
@@ -2695,7 +2788,7 @@
         </w:rPr>
         <w:lastRenderedPageBreak/>
         <w:drawing>
-          <wp:inline distT="0" distB="0" distL="0" distR="0" wp14:anchorId="58B5C0DB" wp14:editId="584077EA">
+          <wp:inline distT="0" distB="0" distL="0" distR="0" wp14:anchorId="58B5C0DB" wp14:editId="25158F68">
             <wp:extent cx="3400425" cy="1743808"/>
             <wp:effectExtent l="0" t="0" r="0" b="8890"/>
             <wp:docPr id="1563100451" name="Picture 8" descr="Linking axes to biology"/>
@@ -2763,7 +2856,7 @@
           <w:noProof/>
         </w:rPr>
         <w:drawing>
-          <wp:inline distT="0" distB="0" distL="0" distR="0" wp14:anchorId="3BDC6625" wp14:editId="0DCEF959">
+          <wp:inline distT="0" distB="0" distL="0" distR="0" wp14:anchorId="3BDC6625" wp14:editId="52A1D281">
             <wp:extent cx="2901938" cy="1714500"/>
             <wp:effectExtent l="0" t="0" r="0" b="0"/>
             <wp:docPr id="1656144157" name="Picture 9" descr="Using your hand to determine orientation"/>
@@ -5140,19 +5233,7 @@
           <w:rPr>
             <w:rStyle w:val="Hyperlink"/>
           </w:rPr>
-          <w:t>https://invensen</w:t>
-        </w:r>
-        <w:r>
-          <w:rPr>
-            <w:rStyle w:val="Hyperlink"/>
-          </w:rPr>
-          <w:t>s</w:t>
-        </w:r>
-        <w:r>
-          <w:rPr>
-            <w:rStyle w:val="Hyperlink"/>
-          </w:rPr>
-          <w:t>e.tdk.com/wp-content/uploads/2024/03/DS-000189-ICM-20948-v1.6.pdf</w:t>
+          <w:t>https://invensense.tdk.com/wp-content/uploads/2024/03/DS-000189-ICM-20948-v1.6.pdf</w:t>
         </w:r>
       </w:hyperlink>
       <w:r>
@@ -8931,7 +9012,7 @@
           <w:noProof/>
         </w:rPr>
         <w:drawing>
-          <wp:inline distT="0" distB="0" distL="0" distR="0" wp14:anchorId="5A369B01" wp14:editId="42248354">
+          <wp:inline distT="0" distB="0" distL="0" distR="0" wp14:anchorId="5A369B01" wp14:editId="0F267D4E">
             <wp:extent cx="3370239" cy="2741078"/>
             <wp:effectExtent l="0" t="0" r="1905" b="2540"/>
             <wp:docPr id="745835413" name="Picture 11"/>
@@ -9450,7 +9531,7 @@
       <w:pPr>
         <w:pStyle w:val="Heading2"/>
       </w:pPr>
-      <w:bookmarkStart w:id="2" w:name="_Toc230165020"/>
+      <w:bookmarkStart w:id="2" w:name="_Toc232412272"/>
       <w:r>
         <w:lastRenderedPageBreak/>
         <w:t>Checking Data Scale and Orientation</w:t>
@@ -13007,6 +13088,7 @@
           </w:tcPr>
           <w:p>
             <w:r>
+              <w:lastRenderedPageBreak/>
               <w:t>14</w:t>
             </w:r>
           </w:p>
@@ -13312,7 +13394,7 @@
       <w:pPr>
         <w:pStyle w:val="Heading2"/>
       </w:pPr>
-      <w:bookmarkStart w:id="3" w:name="_Toc230165021"/>
+      <w:bookmarkStart w:id="3" w:name="_Toc232412273"/>
       <w:r>
         <w:t>Training the model</w:t>
       </w:r>
@@ -14304,9 +14386,11 @@
       <w:pPr>
         <w:pStyle w:val="Heading2"/>
       </w:pPr>
+      <w:bookmarkStart w:id="4" w:name="_Toc232412274"/>
       <w:r>
         <w:t>Restarting the Dead Reckoning</w:t>
       </w:r>
+      <w:bookmarkEnd w:id="4"/>
     </w:p>
     <w:p>
       <w:pPr>
@@ -14336,6 +14420,9 @@
         <w:jc w:val="center"/>
       </w:pPr>
       <w:r>
+        <w:rPr>
+          <w:noProof/>
+        </w:rPr>
         <w:lastRenderedPageBreak/>
         <w:drawing>
           <wp:inline distT="0" distB="0" distL="0" distR="0" wp14:anchorId="56A11BAE" wp14:editId="272CE5DA">
@@ -14886,6 +14973,9 @@
         <w:jc w:val="center"/>
       </w:pPr>
       <w:r>
+        <w:rPr>
+          <w:noProof/>
+        </w:rPr>
         <w:drawing>
           <wp:inline distT="0" distB="0" distL="0" distR="0" wp14:anchorId="77879F2A" wp14:editId="21874C03">
             <wp:extent cx="3568535" cy="3024664"/>
@@ -14929,13 +15019,7 @@
       </w:pPr>
       <w:r>
         <w:lastRenderedPageBreak/>
-        <w:t>2</w:t>
-      </w:r>
-      <w:r>
-        <w:t>5</w:t>
-      </w:r>
-      <w:r>
-        <w:t>/05</w:t>
+        <w:t>25/05</w:t>
       </w:r>
     </w:p>
     <w:p>
@@ -15193,13 +15277,7 @@
         <w:pStyle w:val="Heading3"/>
       </w:pPr>
       <w:r>
-        <w:t>2</w:t>
-      </w:r>
-      <w:r>
-        <w:t>7</w:t>
-      </w:r>
-      <w:r>
-        <w:t>/05</w:t>
+        <w:t>27/05</w:t>
       </w:r>
     </w:p>
     <w:p>
@@ -15271,6 +15349,9 @@
         <w:jc w:val="center"/>
       </w:pPr>
       <w:r>
+        <w:rPr>
+          <w:noProof/>
+        </w:rPr>
         <w:drawing>
           <wp:inline distT="0" distB="0" distL="0" distR="0" wp14:anchorId="722B83CB" wp14:editId="2676F31C">
             <wp:extent cx="5087565" cy="2143125"/>
@@ -15373,6 +15454,9 @@
         <w:jc w:val="center"/>
       </w:pPr>
       <w:r>
+        <w:rPr>
+          <w:noProof/>
+        </w:rPr>
         <w:drawing>
           <wp:inline distT="0" distB="0" distL="0" distR="0" wp14:anchorId="6682595D" wp14:editId="7277B1D9">
             <wp:extent cx="3943350" cy="1647444"/>
@@ -15415,13 +15499,7 @@
         <w:pStyle w:val="Heading3"/>
       </w:pPr>
       <w:r>
-        <w:t>2</w:t>
-      </w:r>
-      <w:r>
-        <w:t>8</w:t>
-      </w:r>
-      <w:r>
-        <w:t>/05</w:t>
+        <w:t>28/05</w:t>
       </w:r>
     </w:p>
     <w:p>
@@ -15450,6 +15528,9 @@
         <w:jc w:val="center"/>
       </w:pPr>
       <w:r>
+        <w:rPr>
+          <w:noProof/>
+        </w:rPr>
         <w:drawing>
           <wp:inline distT="0" distB="0" distL="0" distR="0" wp14:anchorId="26B60A56" wp14:editId="5A4516D8">
             <wp:extent cx="3581400" cy="1446156"/>
@@ -15512,13 +15593,7 @@
         <w:pStyle w:val="Heading3"/>
       </w:pPr>
       <w:r>
-        <w:t>2</w:t>
-      </w:r>
-      <w:r>
-        <w:t>9</w:t>
-      </w:r>
-      <w:r>
-        <w:t>/05</w:t>
+        <w:t>29/05</w:t>
       </w:r>
     </w:p>
     <w:p>
@@ -15556,13 +15631,1255 @@
       <w:r>
         <w:t xml:space="preserve"> </w:t>
       </w:r>
+    </w:p>
+    <w:p>
+      <w:pPr>
+        <w:pStyle w:val="ListParagraph"/>
+        <w:numPr>
+          <w:ilvl w:val="1"/>
+          <w:numId w:val="2"/>
+        </w:numPr>
+      </w:pPr>
+      <w:r>
+        <w:t>First I have to convert all the axes though for all individuals… running that code now</w:t>
+      </w:r>
+    </w:p>
+    <w:p>
+      <w:pPr>
+        <w:pStyle w:val="Heading2"/>
+      </w:pPr>
+      <w:bookmarkStart w:id="5" w:name="_Toc232412275"/>
+      <w:r>
+        <w:t>In-field Dead Reckoning Experiments</w:t>
+      </w:r>
+      <w:bookmarkEnd w:id="5"/>
+    </w:p>
+    <w:p>
+      <w:pPr>
+        <w:pStyle w:val="Heading3"/>
+      </w:pPr>
+      <w:r>
+        <w:t>11</w:t>
+      </w:r>
+      <w:r>
+        <w:t>/0</w:t>
+      </w:r>
+      <w:r>
+        <w:t>6</w:t>
+      </w:r>
+    </w:p>
+    <w:p>
+      <w:pPr>
+        <w:pStyle w:val="ListParagraph"/>
+        <w:numPr>
+          <w:ilvl w:val="0"/>
+          <w:numId w:val="2"/>
+        </w:numPr>
+      </w:pPr>
+      <w:r>
+        <w:t>I have spent the last 11 days in the field collecting kangaroo data and this afternoon I conducted in-field calibration tests with the devices in order to test whether the dead reckoning methods actually work (i.e., controlled routes). I am now organising the data so I can work on it when I get home next week.</w:t>
+      </w:r>
+    </w:p>
+    <w:p>
+      <w:pPr>
+        <w:pStyle w:val="ListParagraph"/>
+        <w:numPr>
+          <w:ilvl w:val="0"/>
+          <w:numId w:val="2"/>
+        </w:numPr>
+      </w:pPr>
+      <w:r>
+        <w:t>I feel like crying or vomiting. We haven’t stopped being “on” in 11 days and I need a break.</w:t>
+      </w:r>
+      <w:r>
+        <w:t xml:space="preserve"> Therefore, take the following work with a grain of salt. </w:t>
+      </w:r>
+    </w:p>
+    <w:p>
+      <w:pPr>
+        <w:pStyle w:val="ListParagraph"/>
+        <w:numPr>
+          <w:ilvl w:val="0"/>
+          <w:numId w:val="2"/>
+        </w:numPr>
+      </w:pPr>
+      <w:r>
+        <w:t>UUUUGHGHGHHGHGHGHGGHHGHGHGHG the stuff didn’t SAVE</w:t>
+      </w:r>
+    </w:p>
+    <w:p>
+      <w:pPr>
+        <w:pStyle w:val="ListParagraph"/>
+        <w:numPr>
+          <w:ilvl w:val="1"/>
+          <w:numId w:val="2"/>
+        </w:numPr>
+      </w:pPr>
+      <w:r>
+        <w:t>Here’s the accelerometer data. It looks to just be the magnetometer calibration and then the first walking trial (holding steady)</w:t>
+      </w:r>
+    </w:p>
+    <w:p>
+      <w:pPr>
+        <w:pStyle w:val="ListParagraph"/>
+        <w:numPr>
+          <w:ilvl w:val="1"/>
+          <w:numId w:val="2"/>
+        </w:numPr>
+      </w:pPr>
+      <w:r>
+        <w:t>So that meant… the ADDITIONAL 7 KMS I WALKED WERENT RECORDED. And also NO GPS RECORDED AT ALL</w:t>
+      </w:r>
+    </w:p>
+    <w:p>
+      <w:pPr>
+        <w:pStyle w:val="ListParagraph"/>
+        <w:numPr>
+          <w:ilvl w:val="1"/>
+          <w:numId w:val="2"/>
+        </w:numPr>
+      </w:pPr>
+      <w:r>
+        <w:t>Maybe this happened because  I didn’t unplug the battery first and therefore the second file truncated? But why would there be no GPS saved? The whole thing is weird. We’re putting them out overnight to see whether it logs overnight or whether something is really wrong.</w:t>
+      </w:r>
+    </w:p>
+    <w:p>
+      <w:pPr>
+        <w:jc w:val="center"/>
+      </w:pPr>
+      <w:r>
+        <w:rPr>
+          <w:noProof/>
+        </w:rPr>
+        <w:drawing>
+          <wp:inline distT="0" distB="0" distL="0" distR="0" wp14:anchorId="1533C385" wp14:editId="438C1C3F">
+            <wp:extent cx="4743450" cy="1951246"/>
+            <wp:effectExtent l="0" t="0" r="0" b="0"/>
+            <wp:docPr id="1943423396" name="Picture 3"/>
+            <wp:cNvGraphicFramePr>
+              <a:graphicFrameLocks xmlns:a="http://schemas.openxmlformats.org/drawingml/2006/main" noChangeAspect="1"/>
+            </wp:cNvGraphicFramePr>
+            <a:graphic xmlns:a="http://schemas.openxmlformats.org/drawingml/2006/main">
+              <a:graphicData uri="http://schemas.openxmlformats.org/drawingml/2006/picture">
+                <pic:pic xmlns:pic="http://schemas.openxmlformats.org/drawingml/2006/picture">
+                  <pic:nvPicPr>
+                    <pic:cNvPr id="0" name="Picture 2"/>
+                    <pic:cNvPicPr>
+                      <a:picLocks noChangeAspect="1" noChangeArrowheads="1"/>
+                    </pic:cNvPicPr>
+                  </pic:nvPicPr>
+                  <pic:blipFill>
+                    <a:blip r:embed="rId118">
+                      <a:extLst>
+                        <a:ext uri="{28A0092B-C50C-407E-A947-70E740481C1C}">
+                          <a14:useLocalDpi xmlns:a14="http://schemas.microsoft.com/office/drawing/2010/main" val="0"/>
+                        </a:ext>
+                      </a:extLst>
+                    </a:blip>
+                    <a:srcRect/>
+                    <a:stretch>
+                      <a:fillRect/>
+                    </a:stretch>
+                  </pic:blipFill>
+                  <pic:spPr bwMode="auto">
+                    <a:xfrm>
+                      <a:off x="0" y="0"/>
+                      <a:ext cx="4756498" cy="1956613"/>
+                    </a:xfrm>
+                    <a:prstGeom prst="rect">
+                      <a:avLst/>
+                    </a:prstGeom>
+                    <a:noFill/>
+                  </pic:spPr>
+                </pic:pic>
+              </a:graphicData>
+            </a:graphic>
+          </wp:inline>
+        </w:drawing>
+      </w:r>
+    </w:p>
+    <w:p/>
+    <w:p>
+      <w:pPr>
+        <w:pStyle w:val="Heading3"/>
+      </w:pPr>
+      <w:r>
+        <w:lastRenderedPageBreak/>
+        <w:t>1</w:t>
+      </w:r>
+      <w:r>
+        <w:t>5</w:t>
+      </w:r>
+      <w:r>
+        <w:t>/06</w:t>
+      </w:r>
+    </w:p>
+    <w:p>
+      <w:pPr>
+        <w:pStyle w:val="ListParagraph"/>
+        <w:numPr>
+          <w:ilvl w:val="0"/>
+          <w:numId w:val="2"/>
+        </w:numPr>
+      </w:pPr>
+      <w:r>
+        <w:t>I repeated the trial the next day and (again) one of the devices didn’t work, so I ended up with only 1 valid trial. Nevertheless, let me see how I go with it.</w:t>
+      </w:r>
+    </w:p>
+    <w:p>
+      <w:pPr>
+        <w:pStyle w:val="ListParagraph"/>
+        <w:numPr>
+          <w:ilvl w:val="0"/>
+          <w:numId w:val="2"/>
+        </w:numPr>
+      </w:pPr>
+      <w:r>
+        <w:t>Look at this perfect magnetometer calibration!!</w:t>
+      </w:r>
+    </w:p>
+    <w:p>
+      <w:pPr>
+        <w:jc w:val="center"/>
+      </w:pPr>
+      <w:r>
+        <w:drawing>
+          <wp:inline distT="0" distB="0" distL="0" distR="0" wp14:anchorId="25B3AABF" wp14:editId="20312EDF">
+            <wp:extent cx="824909" cy="2800350"/>
+            <wp:effectExtent l="2858" t="0" r="0" b="0"/>
+            <wp:docPr id="429677835" name="Picture 1"/>
+            <wp:cNvGraphicFramePr>
+              <a:graphicFrameLocks xmlns:a="http://schemas.openxmlformats.org/drawingml/2006/main" noChangeAspect="1"/>
+            </wp:cNvGraphicFramePr>
+            <a:graphic xmlns:a="http://schemas.openxmlformats.org/drawingml/2006/main">
+              <a:graphicData uri="http://schemas.openxmlformats.org/drawingml/2006/picture">
+                <pic:pic xmlns:pic="http://schemas.openxmlformats.org/drawingml/2006/picture">
+                  <pic:nvPicPr>
+                    <pic:cNvPr id="429677835" name=""/>
+                    <pic:cNvPicPr/>
+                  </pic:nvPicPr>
+                  <pic:blipFill>
+                    <a:blip r:embed="rId119"/>
+                    <a:stretch>
+                      <a:fillRect/>
+                    </a:stretch>
+                  </pic:blipFill>
+                  <pic:spPr>
+                    <a:xfrm rot="16200000">
+                      <a:off x="0" y="0"/>
+                      <a:ext cx="828382" cy="2812141"/>
+                    </a:xfrm>
+                    <a:prstGeom prst="rect">
+                      <a:avLst/>
+                    </a:prstGeom>
+                  </pic:spPr>
+                </pic:pic>
+              </a:graphicData>
+            </a:graphic>
+          </wp:inline>
+        </w:drawing>
+      </w:r>
+    </w:p>
+    <w:p>
+      <w:pPr>
+        <w:pStyle w:val="ListParagraph"/>
+        <w:numPr>
+          <w:ilvl w:val="0"/>
+          <w:numId w:val="2"/>
+        </w:numPr>
+      </w:pPr>
+      <w:r>
+        <w:t xml:space="preserve">However, I just remembered that because the collars are different this year, I would need to refigure out the pitch and orientation and everything. Therefore, going to pause this for now and go back to the behavioural stuff. </w:t>
+      </w:r>
+    </w:p>
+    <w:p>
+      <w:pPr>
+        <w:pStyle w:val="Heading2"/>
+      </w:pPr>
+      <w:r>
+        <w:t>Behavioural Model</w:t>
+      </w:r>
+      <w:r>
+        <w:t>, Postprocessing, and Applying to the Unlabelled</w:t>
+      </w:r>
+    </w:p>
+    <w:p>
+      <w:pPr>
+        <w:pStyle w:val="Heading3"/>
+        <w:rPr>
+          <w:rFonts w:cs="Arial"/>
+        </w:rPr>
+      </w:pPr>
+      <w:r>
+        <w:rPr>
+          <w:rFonts w:cs="Arial"/>
+        </w:rPr>
+        <w:t>1</w:t>
+      </w:r>
+      <w:r>
+        <w:rPr>
+          <w:rFonts w:cs="Arial"/>
+        </w:rPr>
+        <w:t>5</w:t>
+      </w:r>
+      <w:r>
+        <w:rPr>
+          <w:rFonts w:cs="Arial"/>
+        </w:rPr>
+        <w:t>/0</w:t>
+      </w:r>
+      <w:r>
+        <w:rPr>
+          <w:rFonts w:cs="Arial"/>
+        </w:rPr>
+        <w:t>6</w:t>
+      </w:r>
+    </w:p>
+    <w:p>
+      <w:pPr>
+        <w:pStyle w:val="ListParagraph"/>
+        <w:numPr>
+          <w:ilvl w:val="0"/>
+          <w:numId w:val="2"/>
+        </w:numPr>
+      </w:pPr>
+      <w:r>
+        <w:t>1 month on, I am back to refining the model again. Today I am going to finalise the ML model. I may even use binary classification for now.</w:t>
+      </w:r>
+    </w:p>
+    <w:p>
+      <w:pPr>
+        <w:pStyle w:val="ListParagraph"/>
+        <w:numPr>
+          <w:ilvl w:val="1"/>
+          <w:numId w:val="2"/>
+        </w:numPr>
+      </w:pPr>
+      <w:r>
+        <w:t xml:space="preserve">Have been reading a cool experiment someone did on reddit looking at the performance of basic models on small datasets: </w:t>
+      </w:r>
+      <w:hyperlink r:id="rId120" w:history="1">
+        <w:r>
+          <w:rPr>
+            <w:rStyle w:val="Hyperlink"/>
+          </w:rPr>
+          <w:t>https://www.reddit.com/r/MachineLearning/comments/kqm5pn/p_which_machine_learning_classifiers_are_best_for/</w:t>
+        </w:r>
+      </w:hyperlink>
+      <w:r>
+        <w:t xml:space="preserve"> </w:t>
+      </w:r>
+      <w:r>
+        <w:sym w:font="Wingdings" w:char="F0E0"/>
+      </w:r>
+      <w:r>
+        <w:t xml:space="preserve"> basically found that boost methods like XGB and RF are pretty damn good. So maybe I won’t deviate from this after all… Instead, I need to focus on asking a meaningful question with my current data.</w:t>
+      </w:r>
+    </w:p>
+    <w:p>
+      <w:pPr>
+        <w:pStyle w:val="ListParagraph"/>
+        <w:numPr>
+          <w:ilvl w:val="0"/>
+          <w:numId w:val="2"/>
+        </w:numPr>
+      </w:pPr>
+      <w:r>
+        <w:t xml:space="preserve">Here is a basic confusion matrix… </w:t>
+      </w:r>
+    </w:p>
+    <w:p>
+      <w:pPr>
+        <w:pStyle w:val="ListParagraph"/>
+        <w:numPr>
+          <w:ilvl w:val="1"/>
+          <w:numId w:val="2"/>
+        </w:numPr>
+      </w:pPr>
+      <w:r>
+        <w:t>My concerns are whenever locomotion behaviours are confused with non-locomotion.</w:t>
+      </w:r>
+    </w:p>
+    <w:p>
+      <w:pPr>
+        <w:pStyle w:val="ListParagraph"/>
+        <w:numPr>
+          <w:ilvl w:val="2"/>
+          <w:numId w:val="2"/>
+        </w:numPr>
+      </w:pPr>
+      <w:r>
+        <w:t xml:space="preserve">Stationary_Standing + Stationary_Vigilance </w:t>
+      </w:r>
+      <w:r>
+        <w:sym w:font="Wingdings" w:char="F0E0"/>
+      </w:r>
+      <w:r>
+        <w:t xml:space="preserve"> use logic to split</w:t>
+      </w:r>
+    </w:p>
+    <w:p>
+      <w:pPr>
+        <w:pStyle w:val="ListParagraph"/>
+        <w:numPr>
+          <w:ilvl w:val="2"/>
+          <w:numId w:val="2"/>
+        </w:numPr>
+      </w:pPr>
+      <w:r>
+        <w:t xml:space="preserve">Locomotion_Walk + Grooming </w:t>
+      </w:r>
+      <w:r>
+        <w:sym w:font="Wingdings" w:char="F0E0"/>
+      </w:r>
+      <w:r>
+        <w:t xml:space="preserve"> Bad</w:t>
+      </w:r>
+    </w:p>
+    <w:p>
+      <w:pPr>
+        <w:pStyle w:val="ListParagraph"/>
+        <w:numPr>
+          <w:ilvl w:val="2"/>
+          <w:numId w:val="2"/>
+        </w:numPr>
+      </w:pPr>
+      <w:r>
+        <w:t xml:space="preserve">Forgaing_Headdown + Stationary_Standing </w:t>
+      </w:r>
+      <w:r>
+        <w:sym w:font="Wingdings" w:char="F0E0"/>
+      </w:r>
+      <w:r>
+        <w:t xml:space="preserve"> Bad</w:t>
+      </w:r>
+    </w:p>
+    <w:p>
+      <w:pPr>
+        <w:pStyle w:val="ListParagraph"/>
+        <w:numPr>
+          <w:ilvl w:val="2"/>
+          <w:numId w:val="2"/>
+        </w:numPr>
+      </w:pPr>
+      <w:r>
+        <w:t xml:space="preserve">Locomotion_Walk + Forging_HeadUp </w:t>
+      </w:r>
+      <w:r>
+        <w:sym w:font="Wingdings" w:char="F0E0"/>
+      </w:r>
+      <w:r>
+        <w:t xml:space="preserve"> Bad</w:t>
+      </w:r>
+    </w:p>
+    <w:p>
+      <w:pPr>
+        <w:ind w:left="1080"/>
+      </w:pPr>
+      <w:r>
+        <w:rPr>
+          <w:noProof/>
+        </w:rPr>
+        <w:drawing>
+          <wp:inline distT="0" distB="0" distL="0" distR="0" wp14:anchorId="3EFF9F9B" wp14:editId="34CB8295">
+            <wp:extent cx="6144986" cy="2332358"/>
+            <wp:effectExtent l="0" t="0" r="8255" b="0"/>
+            <wp:docPr id="612214978" name="Picture 7"/>
+            <wp:cNvGraphicFramePr>
+              <a:graphicFrameLocks xmlns:a="http://schemas.openxmlformats.org/drawingml/2006/main" noChangeAspect="1"/>
+            </wp:cNvGraphicFramePr>
+            <a:graphic xmlns:a="http://schemas.openxmlformats.org/drawingml/2006/main">
+              <a:graphicData uri="http://schemas.openxmlformats.org/drawingml/2006/picture">
+                <pic:pic xmlns:pic="http://schemas.openxmlformats.org/drawingml/2006/picture">
+                  <pic:nvPicPr>
+                    <pic:cNvPr id="0" name="Picture 4"/>
+                    <pic:cNvPicPr>
+                      <a:picLocks noChangeAspect="1" noChangeArrowheads="1"/>
+                    </pic:cNvPicPr>
+                  </pic:nvPicPr>
+                  <pic:blipFill>
+                    <a:blip r:embed="rId121">
+                      <a:extLst>
+                        <a:ext uri="{28A0092B-C50C-407E-A947-70E740481C1C}">
+                          <a14:useLocalDpi xmlns:a14="http://schemas.microsoft.com/office/drawing/2010/main" val="0"/>
+                        </a:ext>
+                      </a:extLst>
+                    </a:blip>
+                    <a:srcRect/>
+                    <a:stretch>
+                      <a:fillRect/>
+                    </a:stretch>
+                  </pic:blipFill>
+                  <pic:spPr bwMode="auto">
+                    <a:xfrm>
+                      <a:off x="0" y="0"/>
+                      <a:ext cx="6156315" cy="2336658"/>
+                    </a:xfrm>
+                    <a:prstGeom prst="rect">
+                      <a:avLst/>
+                    </a:prstGeom>
+                    <a:noFill/>
+                  </pic:spPr>
+                </pic:pic>
+              </a:graphicData>
+            </a:graphic>
+          </wp:inline>
+        </w:drawing>
+      </w:r>
+    </w:p>
+    <w:p>
+      <w:pPr>
+        <w:pStyle w:val="ListParagraph"/>
+        <w:numPr>
+          <w:ilvl w:val="0"/>
+          <w:numId w:val="2"/>
+        </w:numPr>
+      </w:pPr>
+      <w:r>
+        <w:lastRenderedPageBreak/>
+        <w:t>However, given my personal philosophy that we don’t even understand the data we’re extracting, and in the spirit of OSR paper, I think I should simplify the question.</w:t>
+      </w:r>
+      <w:r>
+        <w:t xml:space="preserve"> Differentiating between foraging behaviours and non-foraging behaviours is hard. So what do we actually need to know?</w:t>
+      </w:r>
+    </w:p>
+    <w:p>
+      <w:pPr>
+        <w:pStyle w:val="ListParagraph"/>
+        <w:numPr>
+          <w:ilvl w:val="1"/>
+          <w:numId w:val="2"/>
+        </w:numPr>
+      </w:pPr>
+      <w:r>
+        <w:t>For the DR: Locomoting vs non-locomoting</w:t>
+      </w:r>
+    </w:p>
+    <w:p>
+      <w:pPr>
+        <w:pStyle w:val="ListParagraph"/>
+        <w:numPr>
+          <w:ilvl w:val="1"/>
+          <w:numId w:val="2"/>
+        </w:numPr>
+      </w:pPr>
+      <w:r>
+        <w:t>Behaviourally: Time in vigilance, locomotion, rest, and feeding</w:t>
+      </w:r>
+    </w:p>
+    <w:p>
+      <w:pPr>
+        <w:pStyle w:val="ListParagraph"/>
+        <w:numPr>
+          <w:ilvl w:val="1"/>
+          <w:numId w:val="2"/>
+        </w:numPr>
+      </w:pPr>
+      <w:r>
+        <w:t>And therefore, looking at it minimally, I should be finding: Running, Walking, Foraging, Vigilance and Rest.</w:t>
+      </w:r>
+    </w:p>
+    <w:p>
+      <w:pPr>
+        <w:pStyle w:val="ListParagraph"/>
+        <w:numPr>
+          <w:ilvl w:val="1"/>
+          <w:numId w:val="2"/>
+        </w:numPr>
+      </w:pPr>
+      <w:r>
+        <w:t xml:space="preserve">And thinking about it from a non-machine learning perspective, basic logic comes in clutch. </w:t>
+      </w:r>
+    </w:p>
+    <w:p>
+      <w:pPr>
+        <w:pStyle w:val="ListParagraph"/>
+        <w:numPr>
+          <w:ilvl w:val="2"/>
+          <w:numId w:val="2"/>
+        </w:numPr>
+      </w:pPr>
+      <w:r>
+        <w:t xml:space="preserve">Vigilance and Rest will be able to be found as low VDBA, with vigilance being when the head is raised. </w:t>
+      </w:r>
+      <w:r>
+        <w:t>(</w:t>
+      </w:r>
+      <w:r>
+        <w:t>Y &gt; = Z means the head is raise</w:t>
+      </w:r>
+      <w:r>
+        <w:t>d). Below graph shows the logic-based cleaning.</w:t>
+      </w:r>
+    </w:p>
+    <w:p>
+      <w:pPr>
+        <w:jc w:val="center"/>
+      </w:pPr>
+      <w:r>
+        <w:rPr>
+          <w:noProof/>
+        </w:rPr>
+        <w:drawing>
+          <wp:inline distT="0" distB="0" distL="0" distR="0" wp14:anchorId="6465D3EA" wp14:editId="2243164E">
+            <wp:extent cx="3657600" cy="1685013"/>
+            <wp:effectExtent l="0" t="0" r="0" b="0"/>
+            <wp:docPr id="1548116327" name="Picture 11"/>
+            <wp:cNvGraphicFramePr>
+              <a:graphicFrameLocks xmlns:a="http://schemas.openxmlformats.org/drawingml/2006/main" noChangeAspect="1"/>
+            </wp:cNvGraphicFramePr>
+            <a:graphic xmlns:a="http://schemas.openxmlformats.org/drawingml/2006/main">
+              <a:graphicData uri="http://schemas.openxmlformats.org/drawingml/2006/picture">
+                <pic:pic xmlns:pic="http://schemas.openxmlformats.org/drawingml/2006/picture">
+                  <pic:nvPicPr>
+                    <pic:cNvPr id="0" name="Picture 6"/>
+                    <pic:cNvPicPr>
+                      <a:picLocks noChangeAspect="1" noChangeArrowheads="1"/>
+                    </pic:cNvPicPr>
+                  </pic:nvPicPr>
+                  <pic:blipFill>
+                    <a:blip r:embed="rId122">
+                      <a:extLst>
+                        <a:ext uri="{28A0092B-C50C-407E-A947-70E740481C1C}">
+                          <a14:useLocalDpi xmlns:a14="http://schemas.microsoft.com/office/drawing/2010/main" val="0"/>
+                        </a:ext>
+                      </a:extLst>
+                    </a:blip>
+                    <a:srcRect/>
+                    <a:stretch>
+                      <a:fillRect/>
+                    </a:stretch>
+                  </pic:blipFill>
+                  <pic:spPr bwMode="auto">
+                    <a:xfrm>
+                      <a:off x="0" y="0"/>
+                      <a:ext cx="3685410" cy="1697825"/>
+                    </a:xfrm>
+                    <a:prstGeom prst="rect">
+                      <a:avLst/>
+                    </a:prstGeom>
+                    <a:noFill/>
+                  </pic:spPr>
+                </pic:pic>
+              </a:graphicData>
+            </a:graphic>
+          </wp:inline>
+        </w:drawing>
+      </w:r>
+    </w:p>
+    <w:p>
+      <w:pPr>
+        <w:pStyle w:val="ListParagraph"/>
+        <w:numPr>
+          <w:ilvl w:val="2"/>
+          <w:numId w:val="2"/>
+        </w:numPr>
+      </w:pPr>
+      <w:r>
+        <w:t>Splitting foraging and locomotion will be the hardest as these are often genuinely combined</w:t>
+      </w:r>
+    </w:p>
+    <w:p>
+      <w:pPr>
+        <w:pStyle w:val="ListParagraph"/>
+        <w:numPr>
+          <w:ilvl w:val="3"/>
+          <w:numId w:val="2"/>
+        </w:numPr>
+      </w:pPr>
+      <w:r>
+        <w:t>Some things for me to try: use the pitch based on the static gravity as the determiner, look if there is a regularity to the steps in the locomotiuon that is missing from the messier foraging bouts (which would be stop and start and tortuous)</w:t>
+      </w:r>
+    </w:p>
+    <w:p>
+      <w:pPr>
+        <w:pStyle w:val="ListParagraph"/>
+        <w:numPr>
+          <w:ilvl w:val="0"/>
+          <w:numId w:val="2"/>
+        </w:numPr>
+      </w:pPr>
+      <w:r>
+        <w:t>RawAX = "salmon", RawAY = "turquoise", RawAZ = "darkblue"</w:t>
+      </w:r>
+    </w:p>
+    <w:p>
+      <w:pPr>
+        <w:jc w:val="center"/>
+      </w:pPr>
+      <w:r>
+        <w:rPr>
+          <w:noProof/>
+        </w:rPr>
+        <w:drawing>
+          <wp:inline distT="0" distB="0" distL="0" distR="0" wp14:anchorId="513ED8D5" wp14:editId="658DC514">
+            <wp:extent cx="5317815" cy="2793308"/>
+            <wp:effectExtent l="0" t="0" r="0" b="7620"/>
+            <wp:docPr id="91718155" name="Picture 9"/>
+            <wp:cNvGraphicFramePr>
+              <a:graphicFrameLocks xmlns:a="http://schemas.openxmlformats.org/drawingml/2006/main" noChangeAspect="1"/>
+            </wp:cNvGraphicFramePr>
+            <a:graphic xmlns:a="http://schemas.openxmlformats.org/drawingml/2006/main">
+              <a:graphicData uri="http://schemas.openxmlformats.org/drawingml/2006/picture">
+                <pic:pic xmlns:pic="http://schemas.openxmlformats.org/drawingml/2006/picture">
+                  <pic:nvPicPr>
+                    <pic:cNvPr id="0" name="Picture 5"/>
+                    <pic:cNvPicPr>
+                      <a:picLocks noChangeAspect="1" noChangeArrowheads="1"/>
+                    </pic:cNvPicPr>
+                  </pic:nvPicPr>
+                  <pic:blipFill>
+                    <a:blip r:embed="rId123" cstate="print">
+                      <a:extLst>
+                        <a:ext uri="{28A0092B-C50C-407E-A947-70E740481C1C}">
+                          <a14:useLocalDpi xmlns:a14="http://schemas.microsoft.com/office/drawing/2010/main" val="0"/>
+                        </a:ext>
+                      </a:extLst>
+                    </a:blip>
+                    <a:srcRect/>
+                    <a:stretch>
+                      <a:fillRect/>
+                    </a:stretch>
+                  </pic:blipFill>
+                  <pic:spPr bwMode="auto">
+                    <a:xfrm>
+                      <a:off x="0" y="0"/>
+                      <a:ext cx="5350786" cy="2810627"/>
+                    </a:xfrm>
+                    <a:prstGeom prst="rect">
+                      <a:avLst/>
+                    </a:prstGeom>
+                    <a:noFill/>
+                  </pic:spPr>
+                </pic:pic>
+              </a:graphicData>
+            </a:graphic>
+          </wp:inline>
+        </w:drawing>
+      </w:r>
+    </w:p>
+    <w:p>
+      <w:pPr>
+        <w:pStyle w:val="ListParagraph"/>
+        <w:numPr>
+          <w:ilvl w:val="0"/>
+          <w:numId w:val="2"/>
+        </w:numPr>
+        <w:rPr>
+          <w:highlight w:val="yellow"/>
+        </w:rPr>
+      </w:pPr>
+      <w:r>
+        <w:rPr>
+          <w:highlight w:val="yellow"/>
+        </w:rPr>
+        <w:lastRenderedPageBreak/>
+        <w:t xml:space="preserve">Found a vintage paper on impala behaviour: </w:t>
+      </w:r>
+      <w:hyperlink r:id="rId124" w:history="1">
+        <w:r>
+          <w:rPr>
+            <w:rStyle w:val="Hyperlink"/>
+            <w:highlight w:val="yellow"/>
+          </w:rPr>
+          <w:t>Daily activity of impala, Jarman &amp; Jarman</w:t>
+        </w:r>
+      </w:hyperlink>
+      <w:r>
+        <w:rPr>
+          <w:highlight w:val="yellow"/>
+        </w:rPr>
+        <w:t xml:space="preserve"> </w:t>
+      </w:r>
+    </w:p>
+    <w:p>
+      <w:pPr>
+        <w:pStyle w:val="ListParagraph"/>
+        <w:numPr>
+          <w:ilvl w:val="1"/>
+          <w:numId w:val="2"/>
+        </w:numPr>
+      </w:pPr>
+      <w:r>
+        <w:t>“</w:t>
+      </w:r>
+      <w:r>
+        <w:t>Most</w:t>
+      </w:r>
+      <w:r>
+        <w:t xml:space="preserve"> </w:t>
+      </w:r>
+      <w:r>
+        <w:t>of their time was spent either feeding, or ruminating-standing, or lying down ; these</w:t>
+      </w:r>
+      <w:r>
+        <w:t xml:space="preserve"> </w:t>
+      </w:r>
+      <w:r>
+        <w:t>three major activities occupied between 18-58and 20.16 h a day in the sampled female</w:t>
+      </w:r>
+      <w:r>
+        <w:t xml:space="preserve"> </w:t>
+      </w:r>
+      <w:r>
+        <w:t>herds.</w:t>
+      </w:r>
+      <w:r>
+        <w:t>”</w:t>
+      </w:r>
+    </w:p>
+    <w:p>
+      <w:pPr>
+        <w:pStyle w:val="ListParagraph"/>
+        <w:numPr>
+          <w:ilvl w:val="1"/>
+          <w:numId w:val="2"/>
+        </w:numPr>
+      </w:pPr>
+      <w:r>
+        <w:t>“</w:t>
+      </w:r>
+      <w:r>
+        <w:t>At dawn nearly all the animals are lying down, but they quickly rise and begin to</w:t>
+      </w:r>
+      <w:r>
+        <w:t xml:space="preserve"> </w:t>
+      </w:r>
+      <w:r>
+        <w:t>feed after a short period of grooming.</w:t>
+      </w:r>
+      <w:r>
+        <w:t xml:space="preserve"> F</w:t>
+      </w:r>
+      <w:r>
+        <w:t>eeding lasts until about 10.00 or 1</w:t>
+      </w:r>
+      <w:r>
+        <w:t>1</w:t>
+      </w:r>
+      <w:r>
+        <w:t>.OO hours when it is succeeded by a</w:t>
+      </w:r>
+      <w:r>
+        <w:t xml:space="preserve"> </w:t>
+      </w:r>
+      <w:r>
+        <w:t>bout of ruminating during which most animals stand. This lasts until noon or later.</w:t>
+      </w:r>
+      <w:r>
+        <w:t xml:space="preserve"> </w:t>
+      </w:r>
+      <w:r>
+        <w:t>The afternoon is generally taken</w:t>
+      </w:r>
+      <w:r>
+        <w:t xml:space="preserve"> </w:t>
+      </w:r>
+      <w:r>
+        <w:t>up with a mixture of feeding and ruminating. There is often another well-defined period of ruminating in mid or late afternoon (1 5.00-17.00 hours), followed by a bout of synchronized feeding before sunset.</w:t>
+      </w:r>
+      <w:r>
+        <w:t xml:space="preserve"> A</w:t>
+      </w:r>
+      <w:r>
+        <w:t>t sunset as all animals</w:t>
+      </w:r>
+      <w:r>
+        <w:t xml:space="preserve"> </w:t>
+      </w:r>
+      <w:r>
+        <w:t>cease feeding and begin to ruminate, mostly lying down. There is a period of feeding at some</w:t>
+      </w:r>
+      <w:r>
+        <w:t xml:space="preserve"> </w:t>
+      </w:r>
+      <w:r>
+        <w:t>time during the night, generally between 23.00 and 03.00 or 04.00 hours</w:t>
+      </w:r>
+      <w:r>
+        <w:t xml:space="preserve">. </w:t>
+      </w:r>
+      <w:r>
+        <w:t>At the end of this feeding period the animals lie down again and</w:t>
+      </w:r>
+      <w:r>
+        <w:t xml:space="preserve"> </w:t>
+      </w:r>
+      <w:r>
+        <w:t>ruminate until dawn.</w:t>
+      </w:r>
+      <w:r>
+        <w:t>”</w:t>
+      </w:r>
+    </w:p>
+    <w:p>
+      <w:pPr>
+        <w:pStyle w:val="Heading3"/>
+        <w:rPr>
+          <w:rFonts w:cs="Arial"/>
+        </w:rPr>
+      </w:pPr>
+      <w:r>
+        <w:rPr>
+          <w:rFonts w:cs="Arial"/>
+        </w:rPr>
+        <w:t>1</w:t>
+      </w:r>
+      <w:r>
+        <w:rPr>
+          <w:rFonts w:cs="Arial"/>
+        </w:rPr>
+        <w:t>6</w:t>
+      </w:r>
+      <w:r>
+        <w:rPr>
+          <w:rFonts w:cs="Arial"/>
+        </w:rPr>
+        <w:t>/0</w:t>
+      </w:r>
+      <w:r>
+        <w:rPr>
+          <w:rFonts w:cs="Arial"/>
+        </w:rPr>
+        <w:t>6</w:t>
+      </w:r>
+    </w:p>
+    <w:p>
+      <w:pPr>
+        <w:pStyle w:val="ListParagraph"/>
+        <w:numPr>
+          <w:ilvl w:val="0"/>
+          <w:numId w:val="2"/>
+        </w:numPr>
+      </w:pPr>
+      <w:r>
+        <w:t>I regenerated the features last night with these logical changes and am now seeing what it will be like.</w:t>
+      </w:r>
+      <w:r>
+        <w:t xml:space="preserve"> </w:t>
+      </w:r>
+      <w:r>
+        <w:sym w:font="Wingdings" w:char="F0E0"/>
+      </w:r>
+      <w:r>
+        <w:t xml:space="preserve"> dealt with most of the confusion, except the Grooming and Locomotion mix. 45% of the grooming instances were confused with locomotion and 39% with other (which has 11% overlap with walking) which means we can’t </w:t>
+      </w:r>
+      <w:r>
+        <w:t>be sure of walking vs grooming</w:t>
+      </w:r>
+      <w:r>
+        <w:t>…</w:t>
+      </w:r>
+      <w:r>
+        <w:t xml:space="preserve"> </w:t>
+      </w:r>
+      <w:r>
+        <w:sym w:font="Wingdings" w:char="F0E0"/>
+      </w:r>
+      <w:r>
+        <w:t xml:space="preserve"> based on image below, this confusion is not surprising.</w:t>
+      </w:r>
+    </w:p>
+    <w:p>
+      <w:pPr>
+        <w:pStyle w:val="ListParagraph"/>
+        <w:numPr>
+          <w:ilvl w:val="1"/>
+          <w:numId w:val="2"/>
+        </w:numPr>
+      </w:pPr>
+      <w:r>
+        <w:t>However, I then looked at durations and the grooming is pretty much reliably shorter than the locomotion events, so I should be able to use post-processing to differentiate… Therefore, I can probably proceed.</w:t>
+      </w:r>
+    </w:p>
+    <w:p>
+      <w:pPr>
+        <w:ind w:left="360"/>
+        <w:jc w:val="center"/>
+      </w:pPr>
+      <w:r>
+        <w:rPr>
+          <w:noProof/>
+        </w:rPr>
+        <w:drawing>
+          <wp:inline distT="0" distB="0" distL="0" distR="0" wp14:anchorId="7B972A53" wp14:editId="6CED5B24">
+            <wp:extent cx="3610303" cy="2165011"/>
+            <wp:effectExtent l="0" t="0" r="0" b="6985"/>
+            <wp:docPr id="92269113" name="Picture 13"/>
+            <wp:cNvGraphicFramePr>
+              <a:graphicFrameLocks xmlns:a="http://schemas.openxmlformats.org/drawingml/2006/main" noChangeAspect="1"/>
+            </wp:cNvGraphicFramePr>
+            <a:graphic xmlns:a="http://schemas.openxmlformats.org/drawingml/2006/main">
+              <a:graphicData uri="http://schemas.openxmlformats.org/drawingml/2006/picture">
+                <pic:pic xmlns:pic="http://schemas.openxmlformats.org/drawingml/2006/picture">
+                  <pic:nvPicPr>
+                    <pic:cNvPr id="0" name="Picture 7"/>
+                    <pic:cNvPicPr>
+                      <a:picLocks noChangeAspect="1" noChangeArrowheads="1"/>
+                    </pic:cNvPicPr>
+                  </pic:nvPicPr>
+                  <pic:blipFill>
+                    <a:blip r:embed="rId125">
+                      <a:extLst>
+                        <a:ext uri="{28A0092B-C50C-407E-A947-70E740481C1C}">
+                          <a14:useLocalDpi xmlns:a14="http://schemas.microsoft.com/office/drawing/2010/main" val="0"/>
+                        </a:ext>
+                      </a:extLst>
+                    </a:blip>
+                    <a:srcRect/>
+                    <a:stretch>
+                      <a:fillRect/>
+                    </a:stretch>
+                  </pic:blipFill>
+                  <pic:spPr bwMode="auto">
+                    <a:xfrm>
+                      <a:off x="0" y="0"/>
+                      <a:ext cx="3624601" cy="2173585"/>
+                    </a:xfrm>
+                    <a:prstGeom prst="rect">
+                      <a:avLst/>
+                    </a:prstGeom>
+                    <a:noFill/>
+                  </pic:spPr>
+                </pic:pic>
+              </a:graphicData>
+            </a:graphic>
+          </wp:inline>
+        </w:drawing>
+      </w:r>
+      <w:r>
+        <w:rPr>
+          <w:noProof/>
+        </w:rPr>
+        <w:drawing>
+          <wp:inline distT="0" distB="0" distL="0" distR="0" wp14:anchorId="47BF946A" wp14:editId="41BF3E55">
+            <wp:extent cx="2288249" cy="2116630"/>
+            <wp:effectExtent l="0" t="0" r="0" b="0"/>
+            <wp:docPr id="1443424983" name="Picture 15"/>
+            <wp:cNvGraphicFramePr>
+              <a:graphicFrameLocks xmlns:a="http://schemas.openxmlformats.org/drawingml/2006/main" noChangeAspect="1"/>
+            </wp:cNvGraphicFramePr>
+            <a:graphic xmlns:a="http://schemas.openxmlformats.org/drawingml/2006/main">
+              <a:graphicData uri="http://schemas.openxmlformats.org/drawingml/2006/picture">
+                <pic:pic xmlns:pic="http://schemas.openxmlformats.org/drawingml/2006/picture">
+                  <pic:nvPicPr>
+                    <pic:cNvPr id="0" name="Picture 8"/>
+                    <pic:cNvPicPr>
+                      <a:picLocks noChangeAspect="1" noChangeArrowheads="1"/>
+                    </pic:cNvPicPr>
+                  </pic:nvPicPr>
+                  <pic:blipFill>
+                    <a:blip r:embed="rId126">
+                      <a:extLst>
+                        <a:ext uri="{28A0092B-C50C-407E-A947-70E740481C1C}">
+                          <a14:useLocalDpi xmlns:a14="http://schemas.microsoft.com/office/drawing/2010/main" val="0"/>
+                        </a:ext>
+                      </a:extLst>
+                    </a:blip>
+                    <a:srcRect/>
+                    <a:stretch>
+                      <a:fillRect/>
+                    </a:stretch>
+                  </pic:blipFill>
+                  <pic:spPr bwMode="auto">
+                    <a:xfrm>
+                      <a:off x="0" y="0"/>
+                      <a:ext cx="2292828" cy="2120865"/>
+                    </a:xfrm>
+                    <a:prstGeom prst="rect">
+                      <a:avLst/>
+                    </a:prstGeom>
+                    <a:noFill/>
+                  </pic:spPr>
+                </pic:pic>
+              </a:graphicData>
+            </a:graphic>
+          </wp:inline>
+        </w:drawing>
+      </w:r>
+    </w:p>
+    <w:p>
+      <w:pPr>
+        <w:pStyle w:val="ListParagraph"/>
+        <w:numPr>
+          <w:ilvl w:val="0"/>
+          <w:numId w:val="2"/>
+        </w:numPr>
+      </w:pPr>
+      <w:r>
+        <w:t>Resolving the issue of multiple optimum hyperparameters by only tuning inside the first fold.</w:t>
+      </w:r>
+    </w:p>
+    <w:p>
+      <w:pPr>
+        <w:pStyle w:val="ListParagraph"/>
+        <w:numPr>
+          <w:ilvl w:val="0"/>
+          <w:numId w:val="2"/>
+        </w:numPr>
+      </w:pPr>
+      <w:r>
+        <w:t>The performance metrics I get from this model prior to post-processing controls are:</w:t>
+      </w:r>
+    </w:p>
+    <w:p>
+      <w:pPr>
+        <w:pStyle w:val="ListParagraph"/>
+        <w:numPr>
+          <w:ilvl w:val="1"/>
+          <w:numId w:val="2"/>
+        </w:numPr>
+      </w:pPr>
+      <w:r>
+        <w:t xml:space="preserve">Macro F1:    0.648 </w:t>
+      </w:r>
+    </w:p>
+    <w:p>
+      <w:pPr>
+        <w:pStyle w:val="ListParagraph"/>
+        <w:numPr>
+          <w:ilvl w:val="1"/>
+          <w:numId w:val="2"/>
+        </w:numPr>
+      </w:pPr>
+      <w:r>
+        <w:t xml:space="preserve">Weighted F1: 0.721 </w:t>
+      </w:r>
+    </w:p>
+    <w:p>
+      <w:pPr>
+        <w:pStyle w:val="ListParagraph"/>
+        <w:numPr>
+          <w:ilvl w:val="1"/>
+          <w:numId w:val="2"/>
+        </w:numPr>
+      </w:pPr>
+      <w:r>
+        <w:t>Micro F1:    0.674 (approx)</w:t>
+      </w:r>
+    </w:p>
+    <w:p>
+      <w:pPr>
+        <w:pStyle w:val="ListParagraph"/>
+        <w:numPr>
+          <w:ilvl w:val="0"/>
+          <w:numId w:val="2"/>
+        </w:numPr>
+      </w:pPr>
+      <w:r>
+        <w:t xml:space="preserve">Now working on the </w:t>
+      </w:r>
+      <w:r>
+        <w:rPr>
+          <w:b/>
+          <w:bCs/>
+        </w:rPr>
+        <w:t>post-processing</w:t>
+      </w:r>
+      <w:r>
+        <w:t>…</w:t>
+      </w:r>
+    </w:p>
+    <w:p>
+      <w:pPr>
+        <w:pStyle w:val="ListParagraph"/>
+        <w:numPr>
+          <w:ilvl w:val="1"/>
+          <w:numId w:val="2"/>
+        </w:numPr>
+      </w:pPr>
+      <w:r>
+        <w:t>The Bayesian method made it worse subtly lmao</w:t>
+      </w:r>
+    </w:p>
+    <w:p>
+      <w:pPr>
+        <w:pStyle w:val="ListParagraph"/>
+        <w:numPr>
+          <w:ilvl w:val="1"/>
+          <w:numId w:val="2"/>
+        </w:numPr>
+      </w:pPr>
+      <w:r>
+        <w:lastRenderedPageBreak/>
+        <w:t>Hidden Markov got a 0.27 point performance gain to the weighted F1. This is a 4% increase)</w:t>
+      </w:r>
+    </w:p>
+    <w:p>
+      <w:pPr>
+        <w:pStyle w:val="ListParagraph"/>
+        <w:numPr>
+          <w:ilvl w:val="1"/>
+          <w:numId w:val="2"/>
+        </w:numPr>
+      </w:pPr>
+      <w:r>
+        <w:t>Transition improved it by such a small amount, not worth it (less than HMM)</w:t>
+      </w:r>
+    </w:p>
+    <w:p>
+      <w:pPr>
+        <w:pStyle w:val="ListParagraph"/>
+        <w:numPr>
+          <w:ilvl w:val="1"/>
+          <w:numId w:val="2"/>
+        </w:numPr>
+      </w:pPr>
+      <w:r>
+        <w:t>Mode is slightly worse as well</w:t>
+      </w:r>
+    </w:p>
+    <w:p>
+      <w:pPr>
+        <w:pStyle w:val="ListParagraph"/>
+        <w:numPr>
+          <w:ilvl w:val="1"/>
+          <w:numId w:val="2"/>
+        </w:numPr>
+      </w:pPr>
+    </w:p>
+    <w:p>
+      <w:pPr>
+        <w:ind w:left="360"/>
+      </w:pPr>
+    </w:p>
+    <w:p>
+      <w:pPr>
+        <w:ind w:left="360"/>
+      </w:pPr>
     </w:p>
     <w:p/>
     <w:p/>
     <w:p/>
     <w:p/>
-    <w:p>
-      <w:hyperlink r:id="rId118" w:history="1">
+    <w:p/>
+    <w:p>
+      <w:r>
+        <w:rPr>
+          <w:highlight w:val="yellow"/>
+        </w:rPr>
+        <w:t xml:space="preserve">Notes: Due to the similarity of the signals and small sample sizes, differentiating grooming from walking was challenging. Instead, though the model confused instances of grooming with locomotion, </w:t>
+      </w:r>
+      <w:r>
+        <w:rPr>
+          <w:highlight w:val="yellow"/>
+        </w:rPr>
+        <w:t>post-processing was uysed to logically differentiate between these classes as grooming instances in the training data were reliably shorter than those of locomotion.</w:t>
+      </w:r>
+      <w:r>
+        <w:t xml:space="preserve"> </w:t>
+      </w:r>
+    </w:p>
+    <w:p>
+      <w:r>
+        <w:t>Gave it 30 rounds of Bayesian optimisation, 3 cross-validations</w:t>
+      </w:r>
+    </w:p>
+    <w:p/>
+    <w:p/>
+    <w:p/>
+    <w:p>
+      <w:hyperlink r:id="rId127" w:history="1">
         <w:r>
           <w:rPr>
             <w:rStyle w:val="Hyperlink"/>
@@ -15906,6 +17223,7 @@
           <w:rFonts w:asciiTheme="minorHAnsi" w:hAnsiTheme="minorHAnsi"/>
           <w:lang w:val="en-GB"/>
         </w:rPr>
+        <w:lastRenderedPageBreak/>
         <w:t>Join the cropped 4g accels with the axivity uncropped data to complete the peaks</w:t>
       </w:r>
     </w:p>
@@ -15994,11 +17312,11 @@
       <w:pPr>
         <w:pStyle w:val="Heading2"/>
       </w:pPr>
-      <w:bookmarkStart w:id="4" w:name="_Toc230165023"/>
+      <w:bookmarkStart w:id="6" w:name="_Toc232412276"/>
       <w:r>
         <w:t>What I learnt and Workflow for next time</w:t>
       </w:r>
-      <w:bookmarkEnd w:id="4"/>
+      <w:bookmarkEnd w:id="6"/>
     </w:p>
     <w:p>
       <w:pPr>
@@ -16038,7 +17356,7 @@
     </w:p>
     <w:p/>
     <w:sectPr>
-      <w:headerReference w:type="default" r:id="rId119"/>
+      <w:headerReference w:type="default" r:id="rId128"/>
       <w:pgSz w:w="12240" w:h="15840"/>
       <w:pgMar w:top="720" w:right="720" w:bottom="720" w:left="720" w:header="720" w:footer="720" w:gutter="0"/>
       <w:cols w:space="720"/>
@@ -16934,6 +18252,7 @@
   <w:style w:type="character" w:default="1" w:styleId="DefaultParagraphFont">
     <w:name w:val="Default Paragraph Font"/>
     <w:uiPriority w:val="1"/>
+    <w:semiHidden/>
     <w:unhideWhenUsed/>
   </w:style>
   <w:style w:type="table" w:default="1" w:styleId="TableNormal">

</xml_diff>